<commit_message>
Documenta o encerramento de vinculo de projeto via TEP
Espelha a mudanca de producao: Central de Ajuda e Manual de Uso
(v2.40) atualizados, cache-busting incrementado para v=27.

Co-Authored-By: Claude Sonnet 5 <noreply@anthropic.com>
</commit_message>
<xml_diff>
--- a/Manual de Uso - Ferramenta de Gestao de Projetos.docx
+++ b/Manual de Uso - Ferramenta de Gestao de Projetos.docx
@@ -229,7 +229,7 @@
         <w:rPr>
           <w:noProof/>
         </w:rPr>
-        <w:instrText xml:space="preserve"> PAGEREF _Toc238810044 \h </w:instrText>
+        <w:instrText xml:space="preserve"> PAGEREF _Toc239253958 \h </w:instrText>
       </w:r>
       <w:r>
         <w:rPr>
@@ -290,7 +290,7 @@
         <w:rPr>
           <w:noProof/>
         </w:rPr>
-        <w:instrText xml:space="preserve"> PAGEREF _Toc238810045 \h </w:instrText>
+        <w:instrText xml:space="preserve"> PAGEREF _Toc239253959 \h </w:instrText>
       </w:r>
       <w:r>
         <w:rPr>
@@ -351,7 +351,7 @@
         <w:rPr>
           <w:noProof/>
         </w:rPr>
-        <w:instrText xml:space="preserve"> PAGEREF _Toc238810046 \h </w:instrText>
+        <w:instrText xml:space="preserve"> PAGEREF _Toc239253960 \h </w:instrText>
       </w:r>
       <w:r>
         <w:rPr>
@@ -412,7 +412,7 @@
         <w:rPr>
           <w:noProof/>
         </w:rPr>
-        <w:instrText xml:space="preserve"> PAGEREF _Toc238810047 \h </w:instrText>
+        <w:instrText xml:space="preserve"> PAGEREF _Toc239253961 \h </w:instrText>
       </w:r>
       <w:r>
         <w:rPr>
@@ -473,7 +473,7 @@
         <w:rPr>
           <w:noProof/>
         </w:rPr>
-        <w:instrText xml:space="preserve"> PAGEREF _Toc238810048 \h </w:instrText>
+        <w:instrText xml:space="preserve"> PAGEREF _Toc239253962 \h </w:instrText>
       </w:r>
       <w:r>
         <w:rPr>
@@ -534,7 +534,7 @@
         <w:rPr>
           <w:noProof/>
         </w:rPr>
-        <w:instrText xml:space="preserve"> PAGEREF _Toc238810049 \h </w:instrText>
+        <w:instrText xml:space="preserve"> PAGEREF _Toc239253963 \h </w:instrText>
       </w:r>
       <w:r>
         <w:rPr>
@@ -595,7 +595,7 @@
         <w:rPr>
           <w:noProof/>
         </w:rPr>
-        <w:instrText xml:space="preserve"> PAGEREF _Toc238810050 \h </w:instrText>
+        <w:instrText xml:space="preserve"> PAGEREF _Toc239253964 \h </w:instrText>
       </w:r>
       <w:r>
         <w:rPr>
@@ -656,7 +656,7 @@
         <w:rPr>
           <w:noProof/>
         </w:rPr>
-        <w:instrText xml:space="preserve"> PAGEREF _Toc238810051 \h </w:instrText>
+        <w:instrText xml:space="preserve"> PAGEREF _Toc239253965 \h </w:instrText>
       </w:r>
       <w:r>
         <w:rPr>
@@ -717,7 +717,7 @@
         <w:rPr>
           <w:noProof/>
         </w:rPr>
-        <w:instrText xml:space="preserve"> PAGEREF _Toc238810052 \h </w:instrText>
+        <w:instrText xml:space="preserve"> PAGEREF _Toc239253966 \h </w:instrText>
       </w:r>
       <w:r>
         <w:rPr>
@@ -778,7 +778,7 @@
         <w:rPr>
           <w:noProof/>
         </w:rPr>
-        <w:instrText xml:space="preserve"> PAGEREF _Toc238810053 \h </w:instrText>
+        <w:instrText xml:space="preserve"> PAGEREF _Toc239253967 \h </w:instrText>
       </w:r>
       <w:r>
         <w:rPr>
@@ -839,7 +839,7 @@
         <w:rPr>
           <w:noProof/>
         </w:rPr>
-        <w:instrText xml:space="preserve"> PAGEREF _Toc238810054 \h </w:instrText>
+        <w:instrText xml:space="preserve"> PAGEREF _Toc239253968 \h </w:instrText>
       </w:r>
       <w:r>
         <w:rPr>
@@ -900,7 +900,7 @@
         <w:rPr>
           <w:noProof/>
         </w:rPr>
-        <w:instrText xml:space="preserve"> PAGEREF _Toc238810055 \h </w:instrText>
+        <w:instrText xml:space="preserve"> PAGEREF _Toc239253969 \h </w:instrText>
       </w:r>
       <w:r>
         <w:rPr>
@@ -961,7 +961,7 @@
         <w:rPr>
           <w:noProof/>
         </w:rPr>
-        <w:instrText xml:space="preserve"> PAGEREF _Toc238810056 \h </w:instrText>
+        <w:instrText xml:space="preserve"> PAGEREF _Toc239253970 \h </w:instrText>
       </w:r>
       <w:r>
         <w:rPr>
@@ -1022,7 +1022,7 @@
         <w:rPr>
           <w:noProof/>
         </w:rPr>
-        <w:instrText xml:space="preserve"> PAGEREF _Toc238810057 \h </w:instrText>
+        <w:instrText xml:space="preserve"> PAGEREF _Toc239253971 \h </w:instrText>
       </w:r>
       <w:r>
         <w:rPr>
@@ -1083,7 +1083,7 @@
         <w:rPr>
           <w:noProof/>
         </w:rPr>
-        <w:instrText xml:space="preserve"> PAGEREF _Toc238810058 \h </w:instrText>
+        <w:instrText xml:space="preserve"> PAGEREF _Toc239253972 \h </w:instrText>
       </w:r>
       <w:r>
         <w:rPr>
@@ -1144,7 +1144,7 @@
         <w:rPr>
           <w:noProof/>
         </w:rPr>
-        <w:instrText xml:space="preserve"> PAGEREF _Toc238810059 \h </w:instrText>
+        <w:instrText xml:space="preserve"> PAGEREF _Toc239253973 \h </w:instrText>
       </w:r>
       <w:r>
         <w:rPr>
@@ -1205,7 +1205,7 @@
         <w:rPr>
           <w:noProof/>
         </w:rPr>
-        <w:instrText xml:space="preserve"> PAGEREF _Toc238810060 \h </w:instrText>
+        <w:instrText xml:space="preserve"> PAGEREF _Toc239253974 \h </w:instrText>
       </w:r>
       <w:r>
         <w:rPr>
@@ -1266,7 +1266,7 @@
         <w:rPr>
           <w:noProof/>
         </w:rPr>
-        <w:instrText xml:space="preserve"> PAGEREF _Toc238810061 \h </w:instrText>
+        <w:instrText xml:space="preserve"> PAGEREF _Toc239253975 \h </w:instrText>
       </w:r>
       <w:r>
         <w:rPr>
@@ -1327,7 +1327,7 @@
         <w:rPr>
           <w:noProof/>
         </w:rPr>
-        <w:instrText xml:space="preserve"> PAGEREF _Toc238810062 \h </w:instrText>
+        <w:instrText xml:space="preserve"> PAGEREF _Toc239253976 \h </w:instrText>
       </w:r>
       <w:r>
         <w:rPr>
@@ -1388,7 +1388,7 @@
         <w:rPr>
           <w:noProof/>
         </w:rPr>
-        <w:instrText xml:space="preserve"> PAGEREF _Toc238810063 \h </w:instrText>
+        <w:instrText xml:space="preserve"> PAGEREF _Toc239253977 \h </w:instrText>
       </w:r>
       <w:r>
         <w:rPr>
@@ -1449,7 +1449,7 @@
         <w:rPr>
           <w:noProof/>
         </w:rPr>
-        <w:instrText xml:space="preserve"> PAGEREF _Toc238810064 \h </w:instrText>
+        <w:instrText xml:space="preserve"> PAGEREF _Toc239253978 \h </w:instrText>
       </w:r>
       <w:r>
         <w:rPr>
@@ -1510,7 +1510,7 @@
         <w:rPr>
           <w:noProof/>
         </w:rPr>
-        <w:instrText xml:space="preserve"> PAGEREF _Toc238810065 \h </w:instrText>
+        <w:instrText xml:space="preserve"> PAGEREF _Toc239253979 \h </w:instrText>
       </w:r>
       <w:r>
         <w:rPr>
@@ -1571,7 +1571,7 @@
         <w:rPr>
           <w:noProof/>
         </w:rPr>
-        <w:instrText xml:space="preserve"> PAGEREF _Toc238810066 \h </w:instrText>
+        <w:instrText xml:space="preserve"> PAGEREF _Toc239253980 \h </w:instrText>
       </w:r>
       <w:r>
         <w:rPr>
@@ -1632,7 +1632,7 @@
         <w:rPr>
           <w:noProof/>
         </w:rPr>
-        <w:instrText xml:space="preserve"> PAGEREF _Toc238810067 \h </w:instrText>
+        <w:instrText xml:space="preserve"> PAGEREF _Toc239253981 \h </w:instrText>
       </w:r>
       <w:r>
         <w:rPr>
@@ -1693,7 +1693,7 @@
         <w:rPr>
           <w:noProof/>
         </w:rPr>
-        <w:instrText xml:space="preserve"> PAGEREF _Toc238810068 \h </w:instrText>
+        <w:instrText xml:space="preserve"> PAGEREF _Toc239253982 \h </w:instrText>
       </w:r>
       <w:r>
         <w:rPr>
@@ -1755,7 +1755,7 @@
         <w:rPr>
           <w:noProof/>
         </w:rPr>
-        <w:instrText xml:space="preserve"> PAGEREF _Toc238810069 \h </w:instrText>
+        <w:instrText xml:space="preserve"> PAGEREF _Toc239253983 \h </w:instrText>
       </w:r>
       <w:r>
         <w:rPr>
@@ -1816,7 +1816,7 @@
         <w:rPr>
           <w:noProof/>
         </w:rPr>
-        <w:instrText xml:space="preserve"> PAGEREF _Toc238810070 \h </w:instrText>
+        <w:instrText xml:space="preserve"> PAGEREF _Toc239253984 \h </w:instrText>
       </w:r>
       <w:r>
         <w:rPr>
@@ -1877,7 +1877,7 @@
         <w:rPr>
           <w:noProof/>
         </w:rPr>
-        <w:instrText xml:space="preserve"> PAGEREF _Toc238810071 \h </w:instrText>
+        <w:instrText xml:space="preserve"> PAGEREF _Toc239253985 \h </w:instrText>
       </w:r>
       <w:r>
         <w:rPr>
@@ -1938,7 +1938,7 @@
         <w:rPr>
           <w:noProof/>
         </w:rPr>
-        <w:instrText xml:space="preserve"> PAGEREF _Toc238810072 \h </w:instrText>
+        <w:instrText xml:space="preserve"> PAGEREF _Toc239253986 \h </w:instrText>
       </w:r>
       <w:r>
         <w:rPr>
@@ -1999,7 +1999,7 @@
         <w:rPr>
           <w:noProof/>
         </w:rPr>
-        <w:instrText xml:space="preserve"> PAGEREF _Toc238810073 \h </w:instrText>
+        <w:instrText xml:space="preserve"> PAGEREF _Toc239253987 \h </w:instrText>
       </w:r>
       <w:r>
         <w:rPr>
@@ -2060,7 +2060,7 @@
         <w:rPr>
           <w:noProof/>
         </w:rPr>
-        <w:instrText xml:space="preserve"> PAGEREF _Toc238810074 \h </w:instrText>
+        <w:instrText xml:space="preserve"> PAGEREF _Toc239253988 \h </w:instrText>
       </w:r>
       <w:r>
         <w:rPr>
@@ -2121,7 +2121,7 @@
         <w:rPr>
           <w:noProof/>
         </w:rPr>
-        <w:instrText xml:space="preserve"> PAGEREF _Toc238810075 \h </w:instrText>
+        <w:instrText xml:space="preserve"> PAGEREF _Toc239253989 \h </w:instrText>
       </w:r>
       <w:r>
         <w:rPr>
@@ -2182,7 +2182,7 @@
         <w:rPr>
           <w:noProof/>
         </w:rPr>
-        <w:instrText xml:space="preserve"> PAGEREF _Toc238810076 \h </w:instrText>
+        <w:instrText xml:space="preserve"> PAGEREF _Toc239253990 \h </w:instrText>
       </w:r>
       <w:r>
         <w:rPr>
@@ -2243,7 +2243,7 @@
         <w:rPr>
           <w:noProof/>
         </w:rPr>
-        <w:instrText xml:space="preserve"> PAGEREF _Toc238810077 \h </w:instrText>
+        <w:instrText xml:space="preserve"> PAGEREF _Toc239253991 \h </w:instrText>
       </w:r>
       <w:r>
         <w:rPr>
@@ -2304,7 +2304,7 @@
         <w:rPr>
           <w:noProof/>
         </w:rPr>
-        <w:instrText xml:space="preserve"> PAGEREF _Toc238810078 \h </w:instrText>
+        <w:instrText xml:space="preserve"> PAGEREF _Toc239253992 \h </w:instrText>
       </w:r>
       <w:r>
         <w:rPr>
@@ -2365,7 +2365,7 @@
         <w:rPr>
           <w:noProof/>
         </w:rPr>
-        <w:instrText xml:space="preserve"> PAGEREF _Toc238810079 \h </w:instrText>
+        <w:instrText xml:space="preserve"> PAGEREF _Toc239253993 \h </w:instrText>
       </w:r>
       <w:r>
         <w:rPr>
@@ -2426,7 +2426,7 @@
         <w:rPr>
           <w:noProof/>
         </w:rPr>
-        <w:instrText xml:space="preserve"> PAGEREF _Toc238810080 \h </w:instrText>
+        <w:instrText xml:space="preserve"> PAGEREF _Toc239253994 \h </w:instrText>
       </w:r>
       <w:r>
         <w:rPr>
@@ -2487,7 +2487,7 @@
         <w:rPr>
           <w:noProof/>
         </w:rPr>
-        <w:instrText xml:space="preserve"> PAGEREF _Toc238810081 \h </w:instrText>
+        <w:instrText xml:space="preserve"> PAGEREF _Toc239253995 \h </w:instrText>
       </w:r>
       <w:r>
         <w:rPr>
@@ -2548,7 +2548,7 @@
         <w:rPr>
           <w:noProof/>
         </w:rPr>
-        <w:instrText xml:space="preserve"> PAGEREF _Toc238810082 \h </w:instrText>
+        <w:instrText xml:space="preserve"> PAGEREF _Toc239253996 \h </w:instrText>
       </w:r>
       <w:r>
         <w:rPr>
@@ -2609,7 +2609,7 @@
         <w:rPr>
           <w:noProof/>
         </w:rPr>
-        <w:instrText xml:space="preserve"> PAGEREF _Toc238810083 \h </w:instrText>
+        <w:instrText xml:space="preserve"> PAGEREF _Toc239253997 \h </w:instrText>
       </w:r>
       <w:r>
         <w:rPr>
@@ -2670,7 +2670,7 @@
         <w:rPr>
           <w:noProof/>
         </w:rPr>
-        <w:instrText xml:space="preserve"> PAGEREF _Toc238810084 \h </w:instrText>
+        <w:instrText xml:space="preserve"> PAGEREF _Toc239253998 \h </w:instrText>
       </w:r>
       <w:r>
         <w:rPr>
@@ -2731,7 +2731,7 @@
         <w:rPr>
           <w:noProof/>
         </w:rPr>
-        <w:instrText xml:space="preserve"> PAGEREF _Toc238810085 \h </w:instrText>
+        <w:instrText xml:space="preserve"> PAGEREF _Toc239253999 \h </w:instrText>
       </w:r>
       <w:r>
         <w:rPr>
@@ -2792,7 +2792,7 @@
         <w:rPr>
           <w:noProof/>
         </w:rPr>
-        <w:instrText xml:space="preserve"> PAGEREF _Toc238810086 \h </w:instrText>
+        <w:instrText xml:space="preserve"> PAGEREF _Toc239254000 \h </w:instrText>
       </w:r>
       <w:r>
         <w:rPr>
@@ -2853,7 +2853,7 @@
         <w:rPr>
           <w:noProof/>
         </w:rPr>
-        <w:instrText xml:space="preserve"> PAGEREF _Toc238810087 \h </w:instrText>
+        <w:instrText xml:space="preserve"> PAGEREF _Toc239254001 \h </w:instrText>
       </w:r>
       <w:r>
         <w:rPr>
@@ -2914,7 +2914,7 @@
         <w:rPr>
           <w:noProof/>
         </w:rPr>
-        <w:instrText xml:space="preserve"> PAGEREF _Toc238810088 \h </w:instrText>
+        <w:instrText xml:space="preserve"> PAGEREF _Toc239254002 \h </w:instrText>
       </w:r>
       <w:r>
         <w:rPr>
@@ -2975,7 +2975,7 @@
         <w:rPr>
           <w:noProof/>
         </w:rPr>
-        <w:instrText xml:space="preserve"> PAGEREF _Toc238810089 \h </w:instrText>
+        <w:instrText xml:space="preserve"> PAGEREF _Toc239254003 \h </w:instrText>
       </w:r>
       <w:r>
         <w:rPr>
@@ -2992,7 +2992,7 @@
         <w:rPr>
           <w:noProof/>
         </w:rPr>
-        <w:t>81</w:t>
+        <w:t>80</w:t>
       </w:r>
       <w:r>
         <w:rPr>
@@ -3036,7 +3036,7 @@
         <w:rPr>
           <w:noProof/>
         </w:rPr>
-        <w:instrText xml:space="preserve"> PAGEREF _Toc238810090 \h </w:instrText>
+        <w:instrText xml:space="preserve"> PAGEREF _Toc239254004 \h </w:instrText>
       </w:r>
       <w:r>
         <w:rPr>
@@ -3053,7 +3053,7 @@
         <w:rPr>
           <w:noProof/>
         </w:rPr>
-        <w:t>82</w:t>
+        <w:t>81</w:t>
       </w:r>
       <w:r>
         <w:rPr>
@@ -3112,7 +3112,7 @@
           <w:sz w:val="34"/>
         </w:rPr>
       </w:pPr>
-      <w:bookmarkStart w:id="0" w:name="_Toc238810044"/>
+      <w:bookmarkStart w:id="0" w:name="_Toc239253958"/>
       <w:r>
         <w:rPr>
           <w:rFonts w:ascii="Montserrat" w:hAnsi="Montserrat"/>
@@ -3136,7 +3136,7 @@
           <w:sz w:val="27"/>
         </w:rPr>
       </w:pPr>
-      <w:bookmarkStart w:id="1" w:name="_Toc238810045"/>
+      <w:bookmarkStart w:id="1" w:name="_Toc239253959"/>
       <w:r>
         <w:rPr>
           <w:rFonts w:ascii="Montserrat" w:hAnsi="Montserrat"/>
@@ -3948,6 +3948,24 @@
           <w:color w:val="1A1A1A"/>
           <w:sz w:val="22"/>
         </w:rPr>
+        <w:t>Esta e a versao 2.40 do manual. Em relacao a versao 2.39 (28/08/2026), o registro de um TEP (Passo 8) passou a encerrar o projeto no cadastro compartilhado (secao 2.5): o campo Projeto vinculado dos 9 formularios que o usam (Canvas, TAP, Planejamento, EAP, SMP, TEP, RLA, Relatorio de Situacao e Relatorio de Entregas) so oferece projetos ainda ativos para novos vinculos - antes, um projeto encerrado continuava aparecendo para sempre. Documentos ja vinculados antes do encerramento continuam mostrando o vinculo normalmente. O Painel Executivo (secao 6.4) ganhou o card Encerrados no Portfolio de projetos.</w:t>
+      </w:r>
+    </w:p>
+    <w:p>
+      <w:pPr>
+        <w:spacing w:line="280" w:lineRule="auto"/>
+        <w:rPr>
+          <w:rFonts w:ascii="Montserrat" w:hAnsi="Montserrat"/>
+          <w:color w:val="1A1A1A"/>
+          <w:sz w:val="22"/>
+        </w:rPr>
+      </w:pPr>
+      <w:r>
+        <w:rPr>
+          <w:rFonts w:ascii="Montserrat" w:hAnsi="Montserrat"/>
+          <w:color w:val="1A1A1A"/>
+          <w:sz w:val="22"/>
+        </w:rPr>
         <w:t>O manual nao substitui as Diretrizes para a Gestao de Projetos da UNIALFA (documento institucional que define o framework D01 a D07) nem o documento Regras de Acesso e Permissoes (que detalha cada regra de controle de acesso); ele e o guia operacional de como usar cada ferramenta na pratica.</w:t>
       </w:r>
     </w:p>
@@ -3962,7 +3980,7 @@
           <w:sz w:val="27"/>
         </w:rPr>
       </w:pPr>
-      <w:bookmarkStart w:id="2" w:name="_Toc238810046"/>
+      <w:bookmarkStart w:id="2" w:name="_Toc239253960"/>
       <w:r>
         <w:rPr>
           <w:rFonts w:ascii="Montserrat" w:hAnsi="Montserrat"/>
@@ -4121,6 +4139,7 @@
           <w:color w:val="1A1A1A"/>
           <w:sz w:val="22"/>
         </w:rPr>
+        <w:lastRenderedPageBreak/>
         <w:t>O Mapa de Diretrizes (pagina inicial) apresenta visualmente as 7 diretrizes (D01 a D07) e mostra, para cada etapa do processo, quais ferramentas usar. E o ponto de partida recomendado para quem quer entender o processo antes de preencher os formularios - e a unica pagina, junto com o Validador de Projetos, que nao exige login.</w:t>
       </w:r>
     </w:p>
@@ -4133,18 +4152,17 @@
         <w:rPr>
           <w:noProof/>
         </w:rPr>
-        <w:lastRenderedPageBreak/>
         <w:drawing>
-          <wp:inline distT="0" distB="0" distL="0" distR="0" wp14:anchorId="1A33DBE8" wp14:editId="6F581BF6">
+          <wp:inline distT="0" distB="0" distL="0" distR="0" wp14:anchorId="1DE560BA" wp14:editId="54CC261A">
             <wp:extent cx="5303520" cy="4792851"/>
             <wp:effectExtent l="19050" t="19050" r="11430" b="27305"/>
-            <wp:docPr id="1862917344" name="Imagem 1"/>
+            <wp:docPr id="1464180055" name="Imagem 1"/>
             <wp:cNvGraphicFramePr/>
             <a:graphic xmlns:a="http://schemas.openxmlformats.org/drawingml/2006/main">
               <a:graphicData uri="http://schemas.openxmlformats.org/drawingml/2006/picture">
                 <pic:pic xmlns:pic="http://schemas.openxmlformats.org/drawingml/2006/picture">
                   <pic:nvPicPr>
-                    <pic:cNvPr id="1862917344" name=""/>
+                    <pic:cNvPr id="1464180055" name=""/>
                     <pic:cNvPicPr/>
                   </pic:nvPicPr>
                   <pic:blipFill>
@@ -4212,7 +4230,7 @@
           <w:sz w:val="27"/>
         </w:rPr>
       </w:pPr>
-      <w:bookmarkStart w:id="3" w:name="_Toc238810047"/>
+      <w:bookmarkStart w:id="3" w:name="_Toc239253961"/>
       <w:r>
         <w:rPr>
           <w:rFonts w:ascii="Montserrat" w:hAnsi="Montserrat"/>
@@ -4253,16 +4271,16 @@
         </w:rPr>
         <w:lastRenderedPageBreak/>
         <w:drawing>
-          <wp:inline distT="0" distB="0" distL="0" distR="0" wp14:anchorId="7FE87390" wp14:editId="69878100">
+          <wp:inline distT="0" distB="0" distL="0" distR="0" wp14:anchorId="09AAC3B3" wp14:editId="5539DF78">
             <wp:extent cx="4206240" cy="3801227"/>
             <wp:effectExtent l="19050" t="19050" r="22860" b="27940"/>
-            <wp:docPr id="1350602249" name="Imagem 2"/>
+            <wp:docPr id="1972641334" name="Imagem 2"/>
             <wp:cNvGraphicFramePr/>
             <a:graphic xmlns:a="http://schemas.openxmlformats.org/drawingml/2006/main">
               <a:graphicData uri="http://schemas.openxmlformats.org/drawingml/2006/picture">
                 <pic:pic xmlns:pic="http://schemas.openxmlformats.org/drawingml/2006/picture">
                   <pic:nvPicPr>
-                    <pic:cNvPr id="1350602249" name=""/>
+                    <pic:cNvPr id="1972641334" name=""/>
                     <pic:cNvPicPr/>
                   </pic:nvPicPr>
                   <pic:blipFill>
@@ -4435,7 +4453,7 @@
           <w:sz w:val="27"/>
         </w:rPr>
       </w:pPr>
-      <w:bookmarkStart w:id="4" w:name="_Toc238810048"/>
+      <w:bookmarkStart w:id="4" w:name="_Toc239253962"/>
       <w:r>
         <w:rPr>
           <w:rFonts w:ascii="Montserrat" w:hAnsi="Montserrat"/>
@@ -5674,7 +5692,7 @@
           <w:sz w:val="34"/>
         </w:rPr>
       </w:pPr>
-      <w:bookmarkStart w:id="5" w:name="_Toc238810049"/>
+      <w:bookmarkStart w:id="5" w:name="_Toc239253963"/>
       <w:r>
         <w:rPr>
           <w:rFonts w:ascii="Montserrat" w:hAnsi="Montserrat"/>
@@ -5698,7 +5716,7 @@
           <w:sz w:val="27"/>
         </w:rPr>
       </w:pPr>
-      <w:bookmarkStart w:id="6" w:name="_Toc238810050"/>
+      <w:bookmarkStart w:id="6" w:name="_Toc239253964"/>
       <w:r>
         <w:rPr>
           <w:rFonts w:ascii="Montserrat" w:hAnsi="Montserrat"/>
@@ -5739,7 +5757,7 @@
           <w:sz w:val="27"/>
         </w:rPr>
       </w:pPr>
-      <w:bookmarkStart w:id="7" w:name="_Toc238810051"/>
+      <w:bookmarkStart w:id="7" w:name="_Toc239253965"/>
       <w:r>
         <w:rPr>
           <w:rFonts w:ascii="Montserrat" w:hAnsi="Montserrat"/>
@@ -5858,7 +5876,7 @@
           <w:sz w:val="27"/>
         </w:rPr>
       </w:pPr>
-      <w:bookmarkStart w:id="8" w:name="_Toc238810052"/>
+      <w:bookmarkStart w:id="8" w:name="_Toc239253966"/>
       <w:r>
         <w:rPr>
           <w:rFonts w:ascii="Montserrat" w:hAnsi="Montserrat"/>
@@ -6471,7 +6489,7 @@
           <w:sz w:val="27"/>
         </w:rPr>
       </w:pPr>
-      <w:bookmarkStart w:id="9" w:name="_Toc238810053"/>
+      <w:bookmarkStart w:id="9" w:name="_Toc239253967"/>
       <w:r>
         <w:rPr>
           <w:rFonts w:ascii="Montserrat" w:hAnsi="Montserrat"/>
@@ -6560,16 +6578,16 @@
         </w:rPr>
         <w:lastRenderedPageBreak/>
         <w:drawing>
-          <wp:inline distT="0" distB="0" distL="0" distR="0" wp14:anchorId="2255BA65" wp14:editId="3322FDF2">
+          <wp:inline distT="0" distB="0" distL="0" distR="0" wp14:anchorId="54B3FF4F" wp14:editId="423C9176">
             <wp:extent cx="4937760" cy="4462310"/>
             <wp:effectExtent l="19050" t="19050" r="15240" b="14605"/>
-            <wp:docPr id="2048034849" name="Imagem 3"/>
+            <wp:docPr id="461332337" name="Imagem 3"/>
             <wp:cNvGraphicFramePr/>
             <a:graphic xmlns:a="http://schemas.openxmlformats.org/drawingml/2006/main">
               <a:graphicData uri="http://schemas.openxmlformats.org/drawingml/2006/picture">
                 <pic:pic xmlns:pic="http://schemas.openxmlformats.org/drawingml/2006/picture">
                   <pic:nvPicPr>
-                    <pic:cNvPr id="2048034849" name=""/>
+                    <pic:cNvPr id="461332337" name=""/>
                     <pic:cNvPicPr/>
                   </pic:nvPicPr>
                   <pic:blipFill>
@@ -6637,7 +6655,7 @@
           <w:sz w:val="27"/>
         </w:rPr>
       </w:pPr>
-      <w:bookmarkStart w:id="10" w:name="_Toc238810054"/>
+      <w:bookmarkStart w:id="10" w:name="_Toc239253968"/>
       <w:r>
         <w:rPr>
           <w:rFonts w:ascii="Montserrat" w:hAnsi="Montserrat"/>
@@ -6678,16 +6696,16 @@
         </w:rPr>
         <w:lastRenderedPageBreak/>
         <w:drawing>
-          <wp:inline distT="0" distB="0" distL="0" distR="0" wp14:anchorId="2D96D9FC" wp14:editId="3E9A7EB2">
+          <wp:inline distT="0" distB="0" distL="0" distR="0" wp14:anchorId="308A4DA8" wp14:editId="3BBADD0B">
             <wp:extent cx="5120640" cy="4627581"/>
             <wp:effectExtent l="19050" t="19050" r="22860" b="20955"/>
-            <wp:docPr id="707232837" name="Imagem 4"/>
+            <wp:docPr id="1835549698" name="Imagem 4"/>
             <wp:cNvGraphicFramePr/>
             <a:graphic xmlns:a="http://schemas.openxmlformats.org/drawingml/2006/main">
               <a:graphicData uri="http://schemas.openxmlformats.org/drawingml/2006/picture">
                 <pic:pic xmlns:pic="http://schemas.openxmlformats.org/drawingml/2006/picture">
                   <pic:nvPicPr>
-                    <pic:cNvPr id="707232837" name=""/>
+                    <pic:cNvPr id="1835549698" name=""/>
                     <pic:cNvPicPr/>
                   </pic:nvPicPr>
                   <pic:blipFill>
@@ -6815,6 +6833,37 @@
     </w:p>
     <w:p>
       <w:pPr>
+        <w:spacing w:before="160" w:after="200"/>
+        <w:ind w:left="283"/>
+        <w:rPr>
+          <w:rFonts w:ascii="Montserrat" w:hAnsi="Montserrat"/>
+          <w:i/>
+          <w:color w:val="6A6A70"/>
+          <w:sz w:val="21"/>
+        </w:rPr>
+      </w:pPr>
+      <w:r>
+        <w:rPr>
+          <w:rFonts w:ascii="Montserrat" w:hAnsi="Montserrat"/>
+          <w:i/>
+          <w:color w:val="6A6A70"/>
+          <w:sz w:val="21"/>
+        </w:rPr>
+        <w:t xml:space="preserve">Lista mostra so projetos ativos: o campo Projeto vinculado so oferece projetos ainda em andamento para NOVOS vinculos - assim que um TEP e registrado para um projeto (Passo 8), ele some da lista de opcoes em todos os formularios, </w:t>
+      </w:r>
+      <w:r>
+        <w:rPr>
+          <w:rFonts w:ascii="Montserrat" w:hAnsi="Montserrat"/>
+          <w:i/>
+          <w:color w:val="6A6A70"/>
+          <w:sz w:val="21"/>
+        </w:rPr>
+        <w:lastRenderedPageBreak/>
+        <w:t>inclusive Relatorio de Situacao e Relatorio de Entregas. Um documento que ja estava vinculado a esse projeto antes dele encerrar continua mostrando o vinculo normalmente, so que com o status ao lado (ex.: Nome do Projeto - Concluido).</w:t>
+      </w:r>
+    </w:p>
+    <w:p>
+      <w:pPr>
         <w:pStyle w:val="Ttulo2"/>
         <w:spacing w:before="320" w:after="120"/>
         <w:rPr>
@@ -6824,7 +6873,7 @@
           <w:sz w:val="27"/>
         </w:rPr>
       </w:pPr>
-      <w:bookmarkStart w:id="11" w:name="_Toc238810055"/>
+      <w:bookmarkStart w:id="11" w:name="_Toc239253969"/>
       <w:r>
         <w:rPr>
           <w:rFonts w:ascii="Montserrat" w:hAnsi="Montserrat"/>
@@ -6832,7 +6881,6 @@
           <w:color w:val="B91D2E"/>
           <w:sz w:val="27"/>
         </w:rPr>
-        <w:lastRenderedPageBreak/>
         <w:t>2.6 Acesso sem login - Solicitacao de Demanda e Ata de Reuniao</w:t>
       </w:r>
       <w:bookmarkEnd w:id="11"/>
@@ -6865,16 +6913,16 @@
           <w:noProof/>
         </w:rPr>
         <w:drawing>
-          <wp:inline distT="0" distB="0" distL="0" distR="0" wp14:anchorId="2EB78DE5" wp14:editId="079B3D33">
+          <wp:inline distT="0" distB="0" distL="0" distR="0" wp14:anchorId="4C0526B4" wp14:editId="7D8E3FFE">
             <wp:extent cx="4206240" cy="3801227"/>
             <wp:effectExtent l="19050" t="19050" r="22860" b="27940"/>
-            <wp:docPr id="1549794869" name="Imagem 5"/>
+            <wp:docPr id="846247722" name="Imagem 5"/>
             <wp:cNvGraphicFramePr/>
             <a:graphic xmlns:a="http://schemas.openxmlformats.org/drawingml/2006/main">
               <a:graphicData uri="http://schemas.openxmlformats.org/drawingml/2006/picture">
                 <pic:pic xmlns:pic="http://schemas.openxmlformats.org/drawingml/2006/picture">
                   <pic:nvPicPr>
-                    <pic:cNvPr id="1549794869" name=""/>
+                    <pic:cNvPr id="846247722" name=""/>
                     <pic:cNvPicPr/>
                   </pic:nvPicPr>
                   <pic:blipFill>
@@ -6942,16 +6990,16 @@
         </w:rPr>
         <w:lastRenderedPageBreak/>
         <w:drawing>
-          <wp:inline distT="0" distB="0" distL="0" distR="0" wp14:anchorId="225B5123" wp14:editId="1CE13AD8">
+          <wp:inline distT="0" distB="0" distL="0" distR="0" wp14:anchorId="2F2AC2A5" wp14:editId="084C98CA">
             <wp:extent cx="4206240" cy="3801227"/>
             <wp:effectExtent l="19050" t="19050" r="22860" b="27940"/>
-            <wp:docPr id="731436609" name="Imagem 6"/>
+            <wp:docPr id="870625429" name="Imagem 6"/>
             <wp:cNvGraphicFramePr/>
             <a:graphic xmlns:a="http://schemas.openxmlformats.org/drawingml/2006/main">
               <a:graphicData uri="http://schemas.openxmlformats.org/drawingml/2006/picture">
                 <pic:pic xmlns:pic="http://schemas.openxmlformats.org/drawingml/2006/picture">
                   <pic:nvPicPr>
-                    <pic:cNvPr id="731436609" name=""/>
+                    <pic:cNvPr id="870625429" name=""/>
                     <pic:cNvPicPr/>
                   </pic:nvPicPr>
                   <pic:blipFill>
@@ -7067,7 +7115,7 @@
           <w:sz w:val="27"/>
         </w:rPr>
       </w:pPr>
-      <w:bookmarkStart w:id="12" w:name="_Toc238810056"/>
+      <w:bookmarkStart w:id="12" w:name="_Toc239253970"/>
       <w:r>
         <w:rPr>
           <w:rFonts w:ascii="Montserrat" w:hAnsi="Montserrat"/>
@@ -7135,7 +7183,7 @@
           <w:sz w:val="27"/>
         </w:rPr>
       </w:pPr>
-      <w:bookmarkStart w:id="13" w:name="_Toc238810057"/>
+      <w:bookmarkStart w:id="13" w:name="_Toc239253971"/>
       <w:r>
         <w:rPr>
           <w:rFonts w:ascii="Montserrat" w:hAnsi="Montserrat"/>
@@ -7362,7 +7410,7 @@
           <w:sz w:val="27"/>
         </w:rPr>
       </w:pPr>
-      <w:bookmarkStart w:id="14" w:name="_Toc238810058"/>
+      <w:bookmarkStart w:id="14" w:name="_Toc239253972"/>
       <w:r>
         <w:rPr>
           <w:rFonts w:ascii="Montserrat" w:hAnsi="Montserrat"/>
@@ -7521,7 +7569,7 @@
           <w:sz w:val="27"/>
         </w:rPr>
       </w:pPr>
-      <w:bookmarkStart w:id="15" w:name="_Toc238810059"/>
+      <w:bookmarkStart w:id="15" w:name="_Toc239253973"/>
       <w:r>
         <w:rPr>
           <w:rFonts w:ascii="Montserrat" w:hAnsi="Montserrat"/>
@@ -7713,7 +7761,7 @@
           <w:sz w:val="27"/>
         </w:rPr>
       </w:pPr>
-      <w:bookmarkStart w:id="16" w:name="_Toc238810060"/>
+      <w:bookmarkStart w:id="16" w:name="_Toc239253974"/>
       <w:r>
         <w:rPr>
           <w:rFonts w:ascii="Montserrat" w:hAnsi="Montserrat"/>
@@ -7841,7 +7889,7 @@
           <w:sz w:val="27"/>
         </w:rPr>
       </w:pPr>
-      <w:bookmarkStart w:id="17" w:name="_Toc238810061"/>
+      <w:bookmarkStart w:id="17" w:name="_Toc239253975"/>
       <w:r>
         <w:rPr>
           <w:rFonts w:ascii="Montserrat" w:hAnsi="Montserrat"/>
@@ -7890,14 +7938,12 @@
         <w:spacing w:after="80" w:line="260" w:lineRule="auto"/>
         <w:ind w:left="700"/>
         <w:rPr>
-          <w:rFonts w:ascii="Montserrat" w:hAnsi="Montserrat"/>
-          <w:color w:val="1A1A1A"/>
-          <w:sz w:val="22"/>
-        </w:rPr>
-      </w:pPr>
-      <w:r>
-        <w:rPr>
-          <w:rFonts w:ascii="Montserrat" w:hAnsi="Montserrat"/>
+          <w:color w:val="1A1A1A"/>
+          <w:sz w:val="22"/>
+        </w:rPr>
+      </w:pPr>
+      <w:r>
+        <w:rPr>
           <w:color w:val="1A1A1A"/>
           <w:sz w:val="22"/>
         </w:rPr>
@@ -8171,7 +8217,7 @@
           <w:sz w:val="27"/>
         </w:rPr>
       </w:pPr>
-      <w:bookmarkStart w:id="18" w:name="_Toc238810062"/>
+      <w:bookmarkStart w:id="18" w:name="_Toc239253976"/>
       <w:r>
         <w:rPr>
           <w:rFonts w:ascii="Montserrat" w:hAnsi="Montserrat"/>
@@ -8312,7 +8358,7 @@
           <w:sz w:val="34"/>
         </w:rPr>
       </w:pPr>
-      <w:bookmarkStart w:id="19" w:name="_Toc238810063"/>
+      <w:bookmarkStart w:id="19" w:name="_Toc239253977"/>
       <w:r>
         <w:rPr>
           <w:rFonts w:ascii="Montserrat" w:hAnsi="Montserrat"/>
@@ -8354,7 +8400,7 @@
           <w:sz w:val="27"/>
         </w:rPr>
       </w:pPr>
-      <w:bookmarkStart w:id="20" w:name="_Toc238810064"/>
+      <w:bookmarkStart w:id="20" w:name="_Toc239253978"/>
       <w:r>
         <w:rPr>
           <w:rFonts w:ascii="Montserrat" w:hAnsi="Montserrat"/>
@@ -9434,16 +9480,16 @@
         </w:rPr>
         <w:lastRenderedPageBreak/>
         <w:drawing>
-          <wp:inline distT="0" distB="0" distL="0" distR="0" wp14:anchorId="19F8EEC6" wp14:editId="6521EA81">
+          <wp:inline distT="0" distB="0" distL="0" distR="0" wp14:anchorId="60DCF48D" wp14:editId="76CC6940">
             <wp:extent cx="5120640" cy="4627581"/>
             <wp:effectExtent l="19050" t="19050" r="22860" b="20955"/>
-            <wp:docPr id="601815107" name="Imagem 7"/>
+            <wp:docPr id="1344747972" name="Imagem 7"/>
             <wp:cNvGraphicFramePr/>
             <a:graphic xmlns:a="http://schemas.openxmlformats.org/drawingml/2006/main">
               <a:graphicData uri="http://schemas.openxmlformats.org/drawingml/2006/picture">
                 <pic:pic xmlns:pic="http://schemas.openxmlformats.org/drawingml/2006/picture">
                   <pic:nvPicPr>
-                    <pic:cNvPr id="601815107" name=""/>
+                    <pic:cNvPr id="1344747972" name=""/>
                     <pic:cNvPicPr/>
                   </pic:nvPicPr>
                   <pic:blipFill>
@@ -9511,16 +9557,16 @@
         </w:rPr>
         <w:lastRenderedPageBreak/>
         <w:drawing>
-          <wp:inline distT="0" distB="0" distL="0" distR="0" wp14:anchorId="6F7906F2" wp14:editId="0A719349">
+          <wp:inline distT="0" distB="0" distL="0" distR="0" wp14:anchorId="500100C4" wp14:editId="6C82B78D">
             <wp:extent cx="5120640" cy="4627581"/>
             <wp:effectExtent l="19050" t="19050" r="22860" b="20955"/>
-            <wp:docPr id="1553906728" name="Imagem 8"/>
+            <wp:docPr id="1771663108" name="Imagem 8"/>
             <wp:cNvGraphicFramePr/>
             <a:graphic xmlns:a="http://schemas.openxmlformats.org/drawingml/2006/main">
               <a:graphicData uri="http://schemas.openxmlformats.org/drawingml/2006/picture">
                 <pic:pic xmlns:pic="http://schemas.openxmlformats.org/drawingml/2006/picture">
                   <pic:nvPicPr>
-                    <pic:cNvPr id="1553906728" name=""/>
+                    <pic:cNvPr id="1771663108" name=""/>
                     <pic:cNvPicPr/>
                   </pic:nvPicPr>
                   <pic:blipFill>
@@ -9728,7 +9774,7 @@
           <w:sz w:val="27"/>
         </w:rPr>
       </w:pPr>
-      <w:bookmarkStart w:id="21" w:name="_Toc238810065"/>
+      <w:bookmarkStart w:id="21" w:name="_Toc239253979"/>
       <w:r>
         <w:rPr>
           <w:rFonts w:ascii="Montserrat" w:hAnsi="Montserrat"/>
@@ -10654,16 +10700,16 @@
         </w:rPr>
         <w:lastRenderedPageBreak/>
         <w:drawing>
-          <wp:inline distT="0" distB="0" distL="0" distR="0" wp14:anchorId="1212512A" wp14:editId="785BB763">
+          <wp:inline distT="0" distB="0" distL="0" distR="0" wp14:anchorId="240FC7BA" wp14:editId="58AC0AD3">
             <wp:extent cx="5120640" cy="4627581"/>
             <wp:effectExtent l="19050" t="19050" r="22860" b="20955"/>
-            <wp:docPr id="1492975300" name="Imagem 9"/>
+            <wp:docPr id="894063419" name="Imagem 9"/>
             <wp:cNvGraphicFramePr/>
             <a:graphic xmlns:a="http://schemas.openxmlformats.org/drawingml/2006/main">
               <a:graphicData uri="http://schemas.openxmlformats.org/drawingml/2006/picture">
                 <pic:pic xmlns:pic="http://schemas.openxmlformats.org/drawingml/2006/picture">
                   <pic:nvPicPr>
-                    <pic:cNvPr id="1492975300" name=""/>
+                    <pic:cNvPr id="894063419" name=""/>
                     <pic:cNvPicPr/>
                   </pic:nvPicPr>
                   <pic:blipFill>
@@ -10731,16 +10777,16 @@
         </w:rPr>
         <w:lastRenderedPageBreak/>
         <w:drawing>
-          <wp:inline distT="0" distB="0" distL="0" distR="0" wp14:anchorId="54153D94" wp14:editId="71F8034F">
+          <wp:inline distT="0" distB="0" distL="0" distR="0" wp14:anchorId="617A552D" wp14:editId="211AFF99">
             <wp:extent cx="5120640" cy="4627581"/>
             <wp:effectExtent l="19050" t="19050" r="22860" b="20955"/>
-            <wp:docPr id="1573446699" name="Imagem 10"/>
+            <wp:docPr id="832383562" name="Imagem 10"/>
             <wp:cNvGraphicFramePr/>
             <a:graphic xmlns:a="http://schemas.openxmlformats.org/drawingml/2006/main">
               <a:graphicData uri="http://schemas.openxmlformats.org/drawingml/2006/picture">
                 <pic:pic xmlns:pic="http://schemas.openxmlformats.org/drawingml/2006/picture">
                   <pic:nvPicPr>
-                    <pic:cNvPr id="1573446699" name=""/>
+                    <pic:cNvPr id="832383562" name=""/>
                     <pic:cNvPicPr/>
                   </pic:nvPicPr>
                   <pic:blipFill>
@@ -10874,7 +10920,7 @@
           <w:sz w:val="27"/>
         </w:rPr>
       </w:pPr>
-      <w:bookmarkStart w:id="22" w:name="_Toc238810066"/>
+      <w:bookmarkStart w:id="22" w:name="_Toc239253980"/>
       <w:r>
         <w:rPr>
           <w:rFonts w:ascii="Montserrat" w:hAnsi="Montserrat"/>
@@ -11930,16 +11976,16 @@
           <w:noProof/>
         </w:rPr>
         <w:drawing>
-          <wp:inline distT="0" distB="0" distL="0" distR="0" wp14:anchorId="7F59018A" wp14:editId="64F6EAB5">
+          <wp:inline distT="0" distB="0" distL="0" distR="0" wp14:anchorId="2D135FCE" wp14:editId="48B4BC56">
             <wp:extent cx="5120640" cy="3282818"/>
             <wp:effectExtent l="19050" t="19050" r="22860" b="13335"/>
-            <wp:docPr id="406473069" name="Imagem 11"/>
+            <wp:docPr id="1553707525" name="Imagem 11"/>
             <wp:cNvGraphicFramePr/>
             <a:graphic xmlns:a="http://schemas.openxmlformats.org/drawingml/2006/main">
               <a:graphicData uri="http://schemas.openxmlformats.org/drawingml/2006/picture">
                 <pic:pic xmlns:pic="http://schemas.openxmlformats.org/drawingml/2006/picture">
                   <pic:nvPicPr>
-                    <pic:cNvPr id="406473069" name=""/>
+                    <pic:cNvPr id="1553707525" name=""/>
                     <pic:cNvPicPr/>
                   </pic:nvPicPr>
                   <pic:blipFill>
@@ -12007,16 +12053,16 @@
         </w:rPr>
         <w:lastRenderedPageBreak/>
         <w:drawing>
-          <wp:inline distT="0" distB="0" distL="0" distR="0" wp14:anchorId="6F7309DC" wp14:editId="6CB596AA">
+          <wp:inline distT="0" distB="0" distL="0" distR="0" wp14:anchorId="179B29A2" wp14:editId="477D1F83">
             <wp:extent cx="5120640" cy="4627581"/>
             <wp:effectExtent l="19050" t="19050" r="22860" b="20955"/>
-            <wp:docPr id="193764557" name="Imagem 12"/>
+            <wp:docPr id="592723166" name="Imagem 12"/>
             <wp:cNvGraphicFramePr/>
             <a:graphic xmlns:a="http://schemas.openxmlformats.org/drawingml/2006/main">
               <a:graphicData uri="http://schemas.openxmlformats.org/drawingml/2006/picture">
                 <pic:pic xmlns:pic="http://schemas.openxmlformats.org/drawingml/2006/picture">
                   <pic:nvPicPr>
-                    <pic:cNvPr id="193764557" name=""/>
+                    <pic:cNvPr id="592723166" name=""/>
                     <pic:cNvPicPr/>
                   </pic:nvPicPr>
                   <pic:blipFill>
@@ -12150,7 +12196,7 @@
           <w:sz w:val="27"/>
         </w:rPr>
       </w:pPr>
-      <w:bookmarkStart w:id="23" w:name="_Toc238810067"/>
+      <w:bookmarkStart w:id="23" w:name="_Toc239253981"/>
       <w:r>
         <w:rPr>
           <w:rFonts w:ascii="Montserrat" w:hAnsi="Montserrat"/>
@@ -12712,16 +12758,16 @@
         </w:rPr>
         <w:lastRenderedPageBreak/>
         <w:drawing>
-          <wp:inline distT="0" distB="0" distL="0" distR="0" wp14:anchorId="0F9223EC" wp14:editId="4953D63A">
+          <wp:inline distT="0" distB="0" distL="0" distR="0" wp14:anchorId="7257772A" wp14:editId="1EFD32CE">
             <wp:extent cx="5120640" cy="4627581"/>
             <wp:effectExtent l="19050" t="19050" r="22860" b="20955"/>
-            <wp:docPr id="1446935888" name="Imagem 13"/>
+            <wp:docPr id="2107008908" name="Imagem 13"/>
             <wp:cNvGraphicFramePr/>
             <a:graphic xmlns:a="http://schemas.openxmlformats.org/drawingml/2006/main">
               <a:graphicData uri="http://schemas.openxmlformats.org/drawingml/2006/picture">
                 <pic:pic xmlns:pic="http://schemas.openxmlformats.org/drawingml/2006/picture">
                   <pic:nvPicPr>
-                    <pic:cNvPr id="1446935888" name=""/>
+                    <pic:cNvPr id="2107008908" name=""/>
                     <pic:cNvPicPr/>
                   </pic:nvPicPr>
                   <pic:blipFill>
@@ -12789,16 +12835,16 @@
         </w:rPr>
         <w:lastRenderedPageBreak/>
         <w:drawing>
-          <wp:inline distT="0" distB="0" distL="0" distR="0" wp14:anchorId="38EDF021" wp14:editId="1FA782BC">
+          <wp:inline distT="0" distB="0" distL="0" distR="0" wp14:anchorId="24081F73" wp14:editId="2D41331C">
             <wp:extent cx="5120640" cy="4627581"/>
             <wp:effectExtent l="19050" t="19050" r="22860" b="20955"/>
-            <wp:docPr id="10691147" name="Imagem 14"/>
+            <wp:docPr id="1088602963" name="Imagem 14"/>
             <wp:cNvGraphicFramePr/>
             <a:graphic xmlns:a="http://schemas.openxmlformats.org/drawingml/2006/main">
               <a:graphicData uri="http://schemas.openxmlformats.org/drawingml/2006/picture">
                 <pic:pic xmlns:pic="http://schemas.openxmlformats.org/drawingml/2006/picture">
                   <pic:nvPicPr>
-                    <pic:cNvPr id="10691147" name=""/>
+                    <pic:cNvPr id="1088602963" name=""/>
                     <pic:cNvPicPr/>
                   </pic:nvPicPr>
                   <pic:blipFill>
@@ -12932,7 +12978,7 @@
           <w:sz w:val="27"/>
         </w:rPr>
       </w:pPr>
-      <w:bookmarkStart w:id="24" w:name="_Toc238810068"/>
+      <w:bookmarkStart w:id="24" w:name="_Toc239253982"/>
       <w:r>
         <w:rPr>
           <w:rFonts w:ascii="Montserrat" w:hAnsi="Montserrat"/>
@@ -12973,16 +13019,16 @@
           <w:noProof/>
         </w:rPr>
         <w:drawing>
-          <wp:inline distT="0" distB="0" distL="0" distR="0" wp14:anchorId="65D92ACE" wp14:editId="372AFCDB">
+          <wp:inline distT="0" distB="0" distL="0" distR="0" wp14:anchorId="3228AD5C" wp14:editId="3C6453CE">
             <wp:extent cx="5120640" cy="4627581"/>
             <wp:effectExtent l="19050" t="19050" r="22860" b="20955"/>
-            <wp:docPr id="739529757" name="Imagem 15"/>
+            <wp:docPr id="1701509819" name="Imagem 15"/>
             <wp:cNvGraphicFramePr/>
             <a:graphic xmlns:a="http://schemas.openxmlformats.org/drawingml/2006/main">
               <a:graphicData uri="http://schemas.openxmlformats.org/drawingml/2006/picture">
                 <pic:pic xmlns:pic="http://schemas.openxmlformats.org/drawingml/2006/picture">
                   <pic:nvPicPr>
-                    <pic:cNvPr id="739529757" name=""/>
+                    <pic:cNvPr id="1701509819" name=""/>
                     <pic:cNvPicPr/>
                   </pic:nvPicPr>
                   <pic:blipFill>
@@ -13050,16 +13096,16 @@
         </w:rPr>
         <w:lastRenderedPageBreak/>
         <w:drawing>
-          <wp:inline distT="0" distB="0" distL="0" distR="0" wp14:anchorId="2AF8673C" wp14:editId="448F69C5">
+          <wp:inline distT="0" distB="0" distL="0" distR="0" wp14:anchorId="719F66B4" wp14:editId="75A669E4">
             <wp:extent cx="5120640" cy="4627581"/>
             <wp:effectExtent l="19050" t="19050" r="22860" b="20955"/>
-            <wp:docPr id="1883910192" name="Imagem 16"/>
+            <wp:docPr id="1439614163" name="Imagem 16"/>
             <wp:cNvGraphicFramePr/>
             <a:graphic xmlns:a="http://schemas.openxmlformats.org/drawingml/2006/main">
               <a:graphicData uri="http://schemas.openxmlformats.org/drawingml/2006/picture">
                 <pic:pic xmlns:pic="http://schemas.openxmlformats.org/drawingml/2006/picture">
                   <pic:nvPicPr>
-                    <pic:cNvPr id="1883910192" name=""/>
+                    <pic:cNvPr id="1439614163" name=""/>
                     <pic:cNvPicPr/>
                   </pic:nvPicPr>
                   <pic:blipFill>
@@ -13223,16 +13269,16 @@
         </w:rPr>
         <w:lastRenderedPageBreak/>
         <w:drawing>
-          <wp:inline distT="0" distB="0" distL="0" distR="0" wp14:anchorId="18DEC1F9" wp14:editId="38F57A86">
+          <wp:inline distT="0" distB="0" distL="0" distR="0" wp14:anchorId="58A3FC61" wp14:editId="216B3CBC">
             <wp:extent cx="5120640" cy="3282818"/>
             <wp:effectExtent l="19050" t="19050" r="22860" b="13335"/>
-            <wp:docPr id="1201841536" name="Imagem 17"/>
+            <wp:docPr id="1829284717" name="Imagem 17"/>
             <wp:cNvGraphicFramePr/>
             <a:graphic xmlns:a="http://schemas.openxmlformats.org/drawingml/2006/main">
               <a:graphicData uri="http://schemas.openxmlformats.org/drawingml/2006/picture">
                 <pic:pic xmlns:pic="http://schemas.openxmlformats.org/drawingml/2006/picture">
                   <pic:nvPicPr>
-                    <pic:cNvPr id="1201841536" name=""/>
+                    <pic:cNvPr id="1829284717" name=""/>
                     <pic:cNvPicPr/>
                   </pic:nvPicPr>
                   <pic:blipFill>
@@ -13366,7 +13412,7 @@
           <w:sz w:val="27"/>
         </w:rPr>
       </w:pPr>
-      <w:bookmarkStart w:id="25" w:name="_Toc238810069"/>
+      <w:bookmarkStart w:id="25" w:name="_Toc239253983"/>
       <w:r>
         <w:rPr>
           <w:rFonts w:ascii="Montserrat" w:hAnsi="Montserrat"/>
@@ -13407,16 +13453,16 @@
         </w:rPr>
         <w:lastRenderedPageBreak/>
         <w:drawing>
-          <wp:inline distT="0" distB="0" distL="0" distR="0" wp14:anchorId="0CDE6096" wp14:editId="466BECE8">
+          <wp:inline distT="0" distB="0" distL="0" distR="0" wp14:anchorId="5AC4E991" wp14:editId="3B46B94E">
             <wp:extent cx="5120640" cy="4627581"/>
             <wp:effectExtent l="19050" t="19050" r="22860" b="20955"/>
-            <wp:docPr id="2104006382" name="Imagem 18"/>
+            <wp:docPr id="1662322128" name="Imagem 18"/>
             <wp:cNvGraphicFramePr/>
             <a:graphic xmlns:a="http://schemas.openxmlformats.org/drawingml/2006/main">
               <a:graphicData uri="http://schemas.openxmlformats.org/drawingml/2006/picture">
                 <pic:pic xmlns:pic="http://schemas.openxmlformats.org/drawingml/2006/picture">
                   <pic:nvPicPr>
-                    <pic:cNvPr id="2104006382" name=""/>
+                    <pic:cNvPr id="1662322128" name=""/>
                     <pic:cNvPicPr/>
                   </pic:nvPicPr>
                   <pic:blipFill>
@@ -13484,16 +13530,16 @@
         </w:rPr>
         <w:lastRenderedPageBreak/>
         <w:drawing>
-          <wp:inline distT="0" distB="0" distL="0" distR="0" wp14:anchorId="18C0491C" wp14:editId="07389126">
+          <wp:inline distT="0" distB="0" distL="0" distR="0" wp14:anchorId="710C7FB4" wp14:editId="42C20744">
             <wp:extent cx="5120640" cy="4627581"/>
             <wp:effectExtent l="19050" t="19050" r="22860" b="20955"/>
-            <wp:docPr id="1102430558" name="Imagem 19"/>
+            <wp:docPr id="302295589" name="Imagem 19"/>
             <wp:cNvGraphicFramePr/>
             <a:graphic xmlns:a="http://schemas.openxmlformats.org/drawingml/2006/main">
               <a:graphicData uri="http://schemas.openxmlformats.org/drawingml/2006/picture">
                 <pic:pic xmlns:pic="http://schemas.openxmlformats.org/drawingml/2006/picture">
                   <pic:nvPicPr>
-                    <pic:cNvPr id="1102430558" name=""/>
+                    <pic:cNvPr id="302295589" name=""/>
                     <pic:cNvPicPr/>
                   </pic:nvPicPr>
                   <pic:blipFill>
@@ -13676,7 +13722,7 @@
           <w:sz w:val="27"/>
         </w:rPr>
       </w:pPr>
-      <w:bookmarkStart w:id="26" w:name="_Toc238810070"/>
+      <w:bookmarkStart w:id="26" w:name="_Toc239253984"/>
       <w:r>
         <w:rPr>
           <w:rFonts w:ascii="Montserrat" w:hAnsi="Montserrat"/>
@@ -13716,16 +13762,16 @@
           <w:noProof/>
         </w:rPr>
         <w:drawing>
-          <wp:inline distT="0" distB="0" distL="0" distR="0" wp14:anchorId="33FD1732" wp14:editId="700E075E">
+          <wp:inline distT="0" distB="0" distL="0" distR="0" wp14:anchorId="05A9A9B7" wp14:editId="401CFF76">
             <wp:extent cx="5120640" cy="4627581"/>
             <wp:effectExtent l="19050" t="19050" r="22860" b="20955"/>
-            <wp:docPr id="1985113788" name="Imagem 20"/>
+            <wp:docPr id="1486435993" name="Imagem 20"/>
             <wp:cNvGraphicFramePr/>
             <a:graphic xmlns:a="http://schemas.openxmlformats.org/drawingml/2006/main">
               <a:graphicData uri="http://schemas.openxmlformats.org/drawingml/2006/picture">
                 <pic:pic xmlns:pic="http://schemas.openxmlformats.org/drawingml/2006/picture">
                   <pic:nvPicPr>
-                    <pic:cNvPr id="1985113788" name=""/>
+                    <pic:cNvPr id="1486435993" name=""/>
                     <pic:cNvPicPr/>
                   </pic:nvPicPr>
                   <pic:blipFill>
@@ -13793,16 +13839,16 @@
         </w:rPr>
         <w:lastRenderedPageBreak/>
         <w:drawing>
-          <wp:inline distT="0" distB="0" distL="0" distR="0" wp14:anchorId="3CD01882" wp14:editId="75E11F30">
+          <wp:inline distT="0" distB="0" distL="0" distR="0" wp14:anchorId="334B00B3" wp14:editId="64ABA656">
             <wp:extent cx="5120640" cy="4627581"/>
             <wp:effectExtent l="19050" t="19050" r="22860" b="20955"/>
-            <wp:docPr id="240959370" name="Imagem 21"/>
+            <wp:docPr id="1740564297" name="Imagem 21"/>
             <wp:cNvGraphicFramePr/>
             <a:graphic xmlns:a="http://schemas.openxmlformats.org/drawingml/2006/main">
               <a:graphicData uri="http://schemas.openxmlformats.org/drawingml/2006/picture">
                 <pic:pic xmlns:pic="http://schemas.openxmlformats.org/drawingml/2006/picture">
                   <pic:nvPicPr>
-                    <pic:cNvPr id="240959370" name=""/>
+                    <pic:cNvPr id="1740564297" name=""/>
                     <pic:cNvPicPr/>
                   </pic:nvPicPr>
                   <pic:blipFill>
@@ -14030,7 +14076,7 @@
           <w:sz w:val="27"/>
         </w:rPr>
       </w:pPr>
-      <w:bookmarkStart w:id="27" w:name="_Toc238810071"/>
+      <w:bookmarkStart w:id="27" w:name="_Toc239253985"/>
       <w:r>
         <w:rPr>
           <w:rFonts w:ascii="Montserrat" w:hAnsi="Montserrat"/>
@@ -14071,16 +14117,16 @@
         </w:rPr>
         <w:lastRenderedPageBreak/>
         <w:drawing>
-          <wp:inline distT="0" distB="0" distL="0" distR="0" wp14:anchorId="0D407B20" wp14:editId="3F9E7D47">
+          <wp:inline distT="0" distB="0" distL="0" distR="0" wp14:anchorId="7DDEAEA2" wp14:editId="134176BA">
             <wp:extent cx="5120640" cy="4627581"/>
             <wp:effectExtent l="19050" t="19050" r="22860" b="20955"/>
-            <wp:docPr id="328246442" name="Imagem 22"/>
+            <wp:docPr id="1138552284" name="Imagem 22"/>
             <wp:cNvGraphicFramePr/>
             <a:graphic xmlns:a="http://schemas.openxmlformats.org/drawingml/2006/main">
               <a:graphicData uri="http://schemas.openxmlformats.org/drawingml/2006/picture">
                 <pic:pic xmlns:pic="http://schemas.openxmlformats.org/drawingml/2006/picture">
                   <pic:nvPicPr>
-                    <pic:cNvPr id="328246442" name=""/>
+                    <pic:cNvPr id="1138552284" name=""/>
                     <pic:cNvPicPr/>
                   </pic:nvPicPr>
                   <pic:blipFill>
@@ -14148,16 +14194,16 @@
         </w:rPr>
         <w:lastRenderedPageBreak/>
         <w:drawing>
-          <wp:inline distT="0" distB="0" distL="0" distR="0" wp14:anchorId="6DF357F8" wp14:editId="7E2323B5">
+          <wp:inline distT="0" distB="0" distL="0" distR="0" wp14:anchorId="792BB93E" wp14:editId="1D1476BF">
             <wp:extent cx="5120640" cy="4627581"/>
             <wp:effectExtent l="19050" t="19050" r="22860" b="20955"/>
-            <wp:docPr id="737244896" name="Imagem 23"/>
+            <wp:docPr id="154391526" name="Imagem 23"/>
             <wp:cNvGraphicFramePr/>
             <a:graphic xmlns:a="http://schemas.openxmlformats.org/drawingml/2006/main">
               <a:graphicData uri="http://schemas.openxmlformats.org/drawingml/2006/picture">
                 <pic:pic xmlns:pic="http://schemas.openxmlformats.org/drawingml/2006/picture">
                   <pic:nvPicPr>
-                    <pic:cNvPr id="737244896" name=""/>
+                    <pic:cNvPr id="154391526" name=""/>
                     <pic:cNvPicPr/>
                   </pic:nvPicPr>
                   <pic:blipFill>
@@ -14330,6 +14376,37 @@
     </w:p>
     <w:p>
       <w:pPr>
+        <w:spacing w:before="160" w:after="200"/>
+        <w:ind w:left="283"/>
+        <w:rPr>
+          <w:rFonts w:ascii="Montserrat" w:hAnsi="Montserrat"/>
+          <w:i/>
+          <w:color w:val="6A6A70"/>
+          <w:sz w:val="21"/>
+        </w:rPr>
+      </w:pPr>
+      <w:r>
+        <w:rPr>
+          <w:rFonts w:ascii="Montserrat" w:hAnsi="Montserrat"/>
+          <w:i/>
+          <w:color w:val="6A6A70"/>
+          <w:sz w:val="21"/>
+        </w:rPr>
+        <w:t xml:space="preserve">Encerra o projeto no cadastro compartilhado: ao registrar o TEP, o projeto vinculado passa a refletir o tipo de encerramento escolhido </w:t>
+      </w:r>
+      <w:r>
+        <w:rPr>
+          <w:rFonts w:ascii="Montserrat" w:hAnsi="Montserrat"/>
+          <w:i/>
+          <w:color w:val="6A6A70"/>
+          <w:sz w:val="21"/>
+        </w:rPr>
+        <w:lastRenderedPageBreak/>
+        <w:t>(Concluido/Paralisado/Cancelado) e some da lista de Projeto vinculado para novos registros nos demais formularios (secao 2.5).</w:t>
+      </w:r>
+    </w:p>
+    <w:p>
+      <w:pPr>
         <w:pStyle w:val="PargrafodaLista"/>
         <w:numPr>
           <w:ilvl w:val="0"/>
@@ -14349,7 +14426,6 @@
           <w:color w:val="1A1A1A"/>
           <w:sz w:val="22"/>
         </w:rPr>
-        <w:lastRenderedPageBreak/>
         <w:t>No rodape do painel de detalhes de um TEP, os botoes Imprimir e Exportar Word geram o documento no formato oficial do FORALF00341, pronto para impressao ou para abrir no Word.</w:t>
       </w:r>
     </w:p>
@@ -14364,7 +14440,7 @@
           <w:sz w:val="27"/>
         </w:rPr>
       </w:pPr>
-      <w:bookmarkStart w:id="28" w:name="_Toc238810072"/>
+      <w:bookmarkStart w:id="28" w:name="_Toc239253986"/>
       <w:r>
         <w:rPr>
           <w:rFonts w:ascii="Montserrat" w:hAnsi="Montserrat"/>
@@ -14404,16 +14480,16 @@
           <w:noProof/>
         </w:rPr>
         <w:drawing>
-          <wp:inline distT="0" distB="0" distL="0" distR="0" wp14:anchorId="3B5447E5" wp14:editId="7435E25D">
+          <wp:inline distT="0" distB="0" distL="0" distR="0" wp14:anchorId="0E09C075" wp14:editId="5BFFD54C">
             <wp:extent cx="5120640" cy="4627581"/>
             <wp:effectExtent l="19050" t="19050" r="22860" b="20955"/>
-            <wp:docPr id="1257781107" name="Imagem 24"/>
+            <wp:docPr id="288339764" name="Imagem 24"/>
             <wp:cNvGraphicFramePr/>
             <a:graphic xmlns:a="http://schemas.openxmlformats.org/drawingml/2006/main">
               <a:graphicData uri="http://schemas.openxmlformats.org/drawingml/2006/picture">
                 <pic:pic xmlns:pic="http://schemas.openxmlformats.org/drawingml/2006/picture">
                   <pic:nvPicPr>
-                    <pic:cNvPr id="1257781107" name=""/>
+                    <pic:cNvPr id="288339764" name=""/>
                     <pic:cNvPicPr/>
                   </pic:nvPicPr>
                   <pic:blipFill>
@@ -14481,16 +14557,16 @@
         </w:rPr>
         <w:lastRenderedPageBreak/>
         <w:drawing>
-          <wp:inline distT="0" distB="0" distL="0" distR="0" wp14:anchorId="6E7EB5C6" wp14:editId="4CAC2E92">
+          <wp:inline distT="0" distB="0" distL="0" distR="0" wp14:anchorId="302FAD81" wp14:editId="0D3BF0DE">
             <wp:extent cx="5120640" cy="4627581"/>
             <wp:effectExtent l="19050" t="19050" r="22860" b="20955"/>
-            <wp:docPr id="105172425" name="Imagem 25"/>
+            <wp:docPr id="2003309070" name="Imagem 25"/>
             <wp:cNvGraphicFramePr/>
             <a:graphic xmlns:a="http://schemas.openxmlformats.org/drawingml/2006/main">
               <a:graphicData uri="http://schemas.openxmlformats.org/drawingml/2006/picture">
                 <pic:pic xmlns:pic="http://schemas.openxmlformats.org/drawingml/2006/picture">
                   <pic:nvPicPr>
-                    <pic:cNvPr id="105172425" name=""/>
+                    <pic:cNvPr id="2003309070" name=""/>
                     <pic:cNvPicPr/>
                   </pic:nvPicPr>
                   <pic:blipFill>
@@ -14681,7 +14757,7 @@
           <w:sz w:val="27"/>
         </w:rPr>
       </w:pPr>
-      <w:bookmarkStart w:id="29" w:name="_Toc238810073"/>
+      <w:bookmarkStart w:id="29" w:name="_Toc239253987"/>
       <w:r>
         <w:rPr>
           <w:rFonts w:ascii="Montserrat" w:hAnsi="Montserrat"/>
@@ -14721,16 +14797,16 @@
           <w:noProof/>
         </w:rPr>
         <w:drawing>
-          <wp:inline distT="0" distB="0" distL="0" distR="0" wp14:anchorId="6E5C7AE6" wp14:editId="1C0F9559">
+          <wp:inline distT="0" distB="0" distL="0" distR="0" wp14:anchorId="389013BD" wp14:editId="735468FD">
             <wp:extent cx="5120640" cy="4000682"/>
             <wp:effectExtent l="19050" t="19050" r="22860" b="19050"/>
-            <wp:docPr id="1798921334" name="Imagem 26"/>
+            <wp:docPr id="706078724" name="Imagem 26"/>
             <wp:cNvGraphicFramePr/>
             <a:graphic xmlns:a="http://schemas.openxmlformats.org/drawingml/2006/main">
               <a:graphicData uri="http://schemas.openxmlformats.org/drawingml/2006/picture">
                 <pic:pic xmlns:pic="http://schemas.openxmlformats.org/drawingml/2006/picture">
                   <pic:nvPicPr>
-                    <pic:cNvPr id="1798921334" name=""/>
+                    <pic:cNvPr id="706078724" name=""/>
                     <pic:cNvPicPr/>
                   </pic:nvPicPr>
                   <pic:blipFill>
@@ -15254,7 +15330,7 @@
           <w:sz w:val="34"/>
         </w:rPr>
       </w:pPr>
-      <w:bookmarkStart w:id="30" w:name="_Toc238810074"/>
+      <w:bookmarkStart w:id="30" w:name="_Toc239253988"/>
       <w:r>
         <w:rPr>
           <w:rFonts w:ascii="Montserrat" w:hAnsi="Montserrat"/>
@@ -15296,7 +15372,7 @@
           <w:sz w:val="27"/>
         </w:rPr>
       </w:pPr>
-      <w:bookmarkStart w:id="31" w:name="_Toc238810075"/>
+      <w:bookmarkStart w:id="31" w:name="_Toc239253989"/>
       <w:r>
         <w:rPr>
           <w:rFonts w:ascii="Montserrat" w:hAnsi="Montserrat"/>
@@ -15336,16 +15412,16 @@
           <w:noProof/>
         </w:rPr>
         <w:drawing>
-          <wp:inline distT="0" distB="0" distL="0" distR="0" wp14:anchorId="23E296F2" wp14:editId="79CF231D">
+          <wp:inline distT="0" distB="0" distL="0" distR="0" wp14:anchorId="44E5E94D" wp14:editId="379D3C55">
             <wp:extent cx="5120640" cy="4627581"/>
             <wp:effectExtent l="19050" t="19050" r="22860" b="20955"/>
-            <wp:docPr id="659920663" name="Imagem 27"/>
+            <wp:docPr id="477897239" name="Imagem 27"/>
             <wp:cNvGraphicFramePr/>
             <a:graphic xmlns:a="http://schemas.openxmlformats.org/drawingml/2006/main">
               <a:graphicData uri="http://schemas.openxmlformats.org/drawingml/2006/picture">
                 <pic:pic xmlns:pic="http://schemas.openxmlformats.org/drawingml/2006/picture">
                   <pic:nvPicPr>
-                    <pic:cNvPr id="659920663" name=""/>
+                    <pic:cNvPr id="477897239" name=""/>
                     <pic:cNvPicPr/>
                   </pic:nvPicPr>
                   <pic:blipFill>
@@ -15413,16 +15489,16 @@
         </w:rPr>
         <w:lastRenderedPageBreak/>
         <w:drawing>
-          <wp:inline distT="0" distB="0" distL="0" distR="0" wp14:anchorId="14B51451" wp14:editId="03DEE222">
+          <wp:inline distT="0" distB="0" distL="0" distR="0" wp14:anchorId="7BCAAB6A" wp14:editId="4E5882C0">
             <wp:extent cx="5120640" cy="4627581"/>
             <wp:effectExtent l="19050" t="19050" r="22860" b="20955"/>
-            <wp:docPr id="1694405173" name="Imagem 28"/>
+            <wp:docPr id="1661036263" name="Imagem 28"/>
             <wp:cNvGraphicFramePr/>
             <a:graphic xmlns:a="http://schemas.openxmlformats.org/drawingml/2006/main">
               <a:graphicData uri="http://schemas.openxmlformats.org/drawingml/2006/picture">
                 <pic:pic xmlns:pic="http://schemas.openxmlformats.org/drawingml/2006/picture">
                   <pic:nvPicPr>
-                    <pic:cNvPr id="1694405173" name=""/>
+                    <pic:cNvPr id="1661036263" name=""/>
                     <pic:cNvPicPr/>
                   </pic:nvPicPr>
                   <pic:blipFill>
@@ -15490,16 +15566,16 @@
         </w:rPr>
         <w:lastRenderedPageBreak/>
         <w:drawing>
-          <wp:inline distT="0" distB="0" distL="0" distR="0" wp14:anchorId="56DAC536" wp14:editId="0E8554DB">
+          <wp:inline distT="0" distB="0" distL="0" distR="0" wp14:anchorId="48FDA9C4" wp14:editId="67599B7E">
             <wp:extent cx="5120640" cy="4627581"/>
             <wp:effectExtent l="19050" t="19050" r="22860" b="20955"/>
-            <wp:docPr id="882872045" name="Imagem 29"/>
+            <wp:docPr id="1268070844" name="Imagem 29"/>
             <wp:cNvGraphicFramePr/>
             <a:graphic xmlns:a="http://schemas.openxmlformats.org/drawingml/2006/main">
               <a:graphicData uri="http://schemas.openxmlformats.org/drawingml/2006/picture">
                 <pic:pic xmlns:pic="http://schemas.openxmlformats.org/drawingml/2006/picture">
                   <pic:nvPicPr>
-                    <pic:cNvPr id="882872045" name=""/>
+                    <pic:cNvPr id="1268070844" name=""/>
                     <pic:cNvPicPr/>
                   </pic:nvPicPr>
                   <pic:blipFill>
@@ -15693,16 +15769,16 @@
           <w:noProof/>
         </w:rPr>
         <w:drawing>
-          <wp:inline distT="0" distB="0" distL="0" distR="0" wp14:anchorId="0EF73048" wp14:editId="48BF9722">
+          <wp:inline distT="0" distB="0" distL="0" distR="0" wp14:anchorId="6ACC4DB0" wp14:editId="04BCDE8D">
             <wp:extent cx="5120640" cy="1715571"/>
             <wp:effectExtent l="19050" t="19050" r="22860" b="18415"/>
-            <wp:docPr id="197700631" name="Imagem 30"/>
+            <wp:docPr id="127259375" name="Imagem 30"/>
             <wp:cNvGraphicFramePr/>
             <a:graphic xmlns:a="http://schemas.openxmlformats.org/drawingml/2006/main">
               <a:graphicData uri="http://schemas.openxmlformats.org/drawingml/2006/picture">
                 <pic:pic xmlns:pic="http://schemas.openxmlformats.org/drawingml/2006/picture">
                   <pic:nvPicPr>
-                    <pic:cNvPr id="197700631" name=""/>
+                    <pic:cNvPr id="127259375" name=""/>
                     <pic:cNvPicPr/>
                   </pic:nvPicPr>
                   <pic:blipFill>
@@ -15848,16 +15924,16 @@
           <w:noProof/>
         </w:rPr>
         <w:drawing>
-          <wp:inline distT="0" distB="0" distL="0" distR="0" wp14:anchorId="77B80195" wp14:editId="4CBE7B11">
+          <wp:inline distT="0" distB="0" distL="0" distR="0" wp14:anchorId="1CA40FF1" wp14:editId="50236B8C">
             <wp:extent cx="5120640" cy="3282818"/>
             <wp:effectExtent l="19050" t="19050" r="22860" b="13335"/>
-            <wp:docPr id="770262770" name="Imagem 31"/>
+            <wp:docPr id="713882823" name="Imagem 31"/>
             <wp:cNvGraphicFramePr/>
             <a:graphic xmlns:a="http://schemas.openxmlformats.org/drawingml/2006/main">
               <a:graphicData uri="http://schemas.openxmlformats.org/drawingml/2006/picture">
                 <pic:pic xmlns:pic="http://schemas.openxmlformats.org/drawingml/2006/picture">
                   <pic:nvPicPr>
-                    <pic:cNvPr id="770262770" name=""/>
+                    <pic:cNvPr id="713882823" name=""/>
                     <pic:cNvPicPr/>
                   </pic:nvPicPr>
                   <pic:blipFill>
@@ -15970,16 +16046,16 @@
         </w:rPr>
         <w:lastRenderedPageBreak/>
         <w:drawing>
-          <wp:inline distT="0" distB="0" distL="0" distR="0" wp14:anchorId="2EC34B30" wp14:editId="526A1E66">
+          <wp:inline distT="0" distB="0" distL="0" distR="0" wp14:anchorId="43276090" wp14:editId="1AD6390F">
             <wp:extent cx="5120640" cy="951357"/>
             <wp:effectExtent l="19050" t="19050" r="22860" b="20320"/>
-            <wp:docPr id="851323461" name="Imagem 32"/>
+            <wp:docPr id="411698989" name="Imagem 32"/>
             <wp:cNvGraphicFramePr/>
             <a:graphic xmlns:a="http://schemas.openxmlformats.org/drawingml/2006/main">
               <a:graphicData uri="http://schemas.openxmlformats.org/drawingml/2006/picture">
                 <pic:pic xmlns:pic="http://schemas.openxmlformats.org/drawingml/2006/picture">
                   <pic:nvPicPr>
-                    <pic:cNvPr id="851323461" name=""/>
+                    <pic:cNvPr id="411698989" name=""/>
                     <pic:cNvPicPr/>
                   </pic:nvPicPr>
                   <pic:blipFill>
@@ -16091,16 +16167,16 @@
           <w:noProof/>
         </w:rPr>
         <w:drawing>
-          <wp:inline distT="0" distB="0" distL="0" distR="0" wp14:anchorId="01347213" wp14:editId="69888312">
+          <wp:inline distT="0" distB="0" distL="0" distR="0" wp14:anchorId="7BD59E9A" wp14:editId="2A75D860">
             <wp:extent cx="5120640" cy="1515102"/>
             <wp:effectExtent l="19050" t="19050" r="22860" b="28575"/>
-            <wp:docPr id="1002219494" name="Imagem 33"/>
+            <wp:docPr id="354362647" name="Imagem 33"/>
             <wp:cNvGraphicFramePr/>
             <a:graphic xmlns:a="http://schemas.openxmlformats.org/drawingml/2006/main">
               <a:graphicData uri="http://schemas.openxmlformats.org/drawingml/2006/picture">
                 <pic:pic xmlns:pic="http://schemas.openxmlformats.org/drawingml/2006/picture">
                   <pic:nvPicPr>
-                    <pic:cNvPr id="1002219494" name=""/>
+                    <pic:cNvPr id="354362647" name=""/>
                     <pic:cNvPicPr/>
                   </pic:nvPicPr>
                   <pic:blipFill>
@@ -16222,16 +16298,16 @@
           <w:noProof/>
         </w:rPr>
         <w:drawing>
-          <wp:inline distT="0" distB="0" distL="0" distR="0" wp14:anchorId="2887728D" wp14:editId="0FA6FA2E">
+          <wp:inline distT="0" distB="0" distL="0" distR="0" wp14:anchorId="2F454B8E" wp14:editId="5120595B">
             <wp:extent cx="5120640" cy="1391113"/>
             <wp:effectExtent l="19050" t="19050" r="22860" b="19050"/>
-            <wp:docPr id="1808126420" name="Imagem 34"/>
+            <wp:docPr id="2103464804" name="Imagem 34"/>
             <wp:cNvGraphicFramePr/>
             <a:graphic xmlns:a="http://schemas.openxmlformats.org/drawingml/2006/main">
               <a:graphicData uri="http://schemas.openxmlformats.org/drawingml/2006/picture">
                 <pic:pic xmlns:pic="http://schemas.openxmlformats.org/drawingml/2006/picture">
                   <pic:nvPicPr>
-                    <pic:cNvPr id="1808126420" name=""/>
+                    <pic:cNvPr id="2103464804" name=""/>
                     <pic:cNvPicPr/>
                   </pic:nvPicPr>
                   <pic:blipFill>
@@ -16343,16 +16419,16 @@
           <w:noProof/>
         </w:rPr>
         <w:drawing>
-          <wp:inline distT="0" distB="0" distL="0" distR="0" wp14:anchorId="599665C7" wp14:editId="0743AE28">
+          <wp:inline distT="0" distB="0" distL="0" distR="0" wp14:anchorId="5B7CCF80" wp14:editId="7D99DFC8">
             <wp:extent cx="5120640" cy="1125174"/>
             <wp:effectExtent l="19050" t="19050" r="22860" b="18415"/>
-            <wp:docPr id="1973179036" name="Imagem 35"/>
+            <wp:docPr id="1717937400" name="Imagem 35"/>
             <wp:cNvGraphicFramePr/>
             <a:graphic xmlns:a="http://schemas.openxmlformats.org/drawingml/2006/main">
               <a:graphicData uri="http://schemas.openxmlformats.org/drawingml/2006/picture">
                 <pic:pic xmlns:pic="http://schemas.openxmlformats.org/drawingml/2006/picture">
                   <pic:nvPicPr>
-                    <pic:cNvPr id="1973179036" name=""/>
+                    <pic:cNvPr id="1717937400" name=""/>
                     <pic:cNvPicPr/>
                   </pic:nvPicPr>
                   <pic:blipFill>
@@ -16441,7 +16517,7 @@
           <w:sz w:val="27"/>
         </w:rPr>
       </w:pPr>
-      <w:bookmarkStart w:id="32" w:name="_Toc238810076"/>
+      <w:bookmarkStart w:id="32" w:name="_Toc239253990"/>
       <w:r>
         <w:rPr>
           <w:rFonts w:ascii="Montserrat" w:hAnsi="Montserrat"/>
@@ -16482,16 +16558,16 @@
           <w:noProof/>
         </w:rPr>
         <w:drawing>
-          <wp:inline distT="0" distB="0" distL="0" distR="0" wp14:anchorId="675D2640" wp14:editId="489FE601">
+          <wp:inline distT="0" distB="0" distL="0" distR="0" wp14:anchorId="0A54BA36" wp14:editId="3FDC9D3D">
             <wp:extent cx="5120640" cy="4627581"/>
             <wp:effectExtent l="19050" t="19050" r="22860" b="20955"/>
-            <wp:docPr id="1628550013" name="Imagem 36"/>
+            <wp:docPr id="1634054343" name="Imagem 36"/>
             <wp:cNvGraphicFramePr/>
             <a:graphic xmlns:a="http://schemas.openxmlformats.org/drawingml/2006/main">
               <a:graphicData uri="http://schemas.openxmlformats.org/drawingml/2006/picture">
                 <pic:pic xmlns:pic="http://schemas.openxmlformats.org/drawingml/2006/picture">
                   <pic:nvPicPr>
-                    <pic:cNvPr id="1628550013" name=""/>
+                    <pic:cNvPr id="1634054343" name=""/>
                     <pic:cNvPicPr/>
                   </pic:nvPicPr>
                   <pic:blipFill>
@@ -16559,16 +16635,16 @@
         </w:rPr>
         <w:lastRenderedPageBreak/>
         <w:drawing>
-          <wp:inline distT="0" distB="0" distL="0" distR="0" wp14:anchorId="4EE003AC" wp14:editId="77C6F9E5">
+          <wp:inline distT="0" distB="0" distL="0" distR="0" wp14:anchorId="72EBDB10" wp14:editId="32E7669C">
             <wp:extent cx="5120640" cy="4627581"/>
             <wp:effectExtent l="19050" t="19050" r="22860" b="20955"/>
-            <wp:docPr id="1723858051" name="Imagem 37"/>
+            <wp:docPr id="739307387" name="Imagem 37"/>
             <wp:cNvGraphicFramePr/>
             <a:graphic xmlns:a="http://schemas.openxmlformats.org/drawingml/2006/main">
               <a:graphicData uri="http://schemas.openxmlformats.org/drawingml/2006/picture">
                 <pic:pic xmlns:pic="http://schemas.openxmlformats.org/drawingml/2006/picture">
                   <pic:nvPicPr>
-                    <pic:cNvPr id="1723858051" name=""/>
+                    <pic:cNvPr id="739307387" name=""/>
                     <pic:cNvPicPr/>
                   </pic:nvPicPr>
                   <pic:blipFill>
@@ -16737,16 +16813,16 @@
           <w:noProof/>
         </w:rPr>
         <w:drawing>
-          <wp:inline distT="0" distB="0" distL="0" distR="0" wp14:anchorId="3EB776F2" wp14:editId="1DDE2F11">
+          <wp:inline distT="0" distB="0" distL="0" distR="0" wp14:anchorId="33915A51" wp14:editId="7B1BA890">
             <wp:extent cx="5120640" cy="2144319"/>
             <wp:effectExtent l="19050" t="19050" r="22860" b="27940"/>
-            <wp:docPr id="2112151373" name="Imagem 38"/>
+            <wp:docPr id="701758113" name="Imagem 38"/>
             <wp:cNvGraphicFramePr/>
             <a:graphic xmlns:a="http://schemas.openxmlformats.org/drawingml/2006/main">
               <a:graphicData uri="http://schemas.openxmlformats.org/drawingml/2006/picture">
                 <pic:pic xmlns:pic="http://schemas.openxmlformats.org/drawingml/2006/picture">
                   <pic:nvPicPr>
-                    <pic:cNvPr id="2112151373" name=""/>
+                    <pic:cNvPr id="701758113" name=""/>
                     <pic:cNvPicPr/>
                   </pic:nvPicPr>
                   <pic:blipFill>
@@ -16834,16 +16910,16 @@
           <w:noProof/>
         </w:rPr>
         <w:drawing>
-          <wp:inline distT="0" distB="0" distL="0" distR="0" wp14:anchorId="0C94B5A5" wp14:editId="6D132944">
+          <wp:inline distT="0" distB="0" distL="0" distR="0" wp14:anchorId="4E678F53" wp14:editId="19B132D4">
             <wp:extent cx="5120640" cy="1055647"/>
             <wp:effectExtent l="19050" t="19050" r="22860" b="11430"/>
-            <wp:docPr id="667339529" name="Imagem 39"/>
+            <wp:docPr id="651668827" name="Imagem 39"/>
             <wp:cNvGraphicFramePr/>
             <a:graphic xmlns:a="http://schemas.openxmlformats.org/drawingml/2006/main">
               <a:graphicData uri="http://schemas.openxmlformats.org/drawingml/2006/picture">
                 <pic:pic xmlns:pic="http://schemas.openxmlformats.org/drawingml/2006/picture">
                   <pic:nvPicPr>
-                    <pic:cNvPr id="667339529" name=""/>
+                    <pic:cNvPr id="651668827" name=""/>
                     <pic:cNvPicPr/>
                   </pic:nvPicPr>
                   <pic:blipFill>
@@ -16965,16 +17041,16 @@
           <w:noProof/>
         </w:rPr>
         <w:drawing>
-          <wp:inline distT="0" distB="0" distL="0" distR="0" wp14:anchorId="31C1AE4B" wp14:editId="293E897A">
+          <wp:inline distT="0" distB="0" distL="0" distR="0" wp14:anchorId="558DD292" wp14:editId="05981981">
             <wp:extent cx="5120640" cy="3282818"/>
             <wp:effectExtent l="19050" t="19050" r="22860" b="13335"/>
-            <wp:docPr id="224820029" name="Imagem 40"/>
+            <wp:docPr id="964608866" name="Imagem 40"/>
             <wp:cNvGraphicFramePr/>
             <a:graphic xmlns:a="http://schemas.openxmlformats.org/drawingml/2006/main">
               <a:graphicData uri="http://schemas.openxmlformats.org/drawingml/2006/picture">
                 <pic:pic xmlns:pic="http://schemas.openxmlformats.org/drawingml/2006/picture">
                   <pic:nvPicPr>
-                    <pic:cNvPr id="224820029" name=""/>
+                    <pic:cNvPr id="964608866" name=""/>
                     <pic:cNvPicPr/>
                   </pic:nvPicPr>
                   <pic:blipFill>
@@ -17108,16 +17184,16 @@
         </w:rPr>
         <w:lastRenderedPageBreak/>
         <w:drawing>
-          <wp:inline distT="0" distB="0" distL="0" distR="0" wp14:anchorId="0763103E" wp14:editId="187285F7">
+          <wp:inline distT="0" distB="0" distL="0" distR="0" wp14:anchorId="446204EC" wp14:editId="00DD9D26">
             <wp:extent cx="5120640" cy="1978034"/>
             <wp:effectExtent l="19050" t="19050" r="22860" b="22225"/>
-            <wp:docPr id="1580103680" name="Imagem 41"/>
+            <wp:docPr id="1141227819" name="Imagem 41"/>
             <wp:cNvGraphicFramePr/>
             <a:graphic xmlns:a="http://schemas.openxmlformats.org/drawingml/2006/main">
               <a:graphicData uri="http://schemas.openxmlformats.org/drawingml/2006/picture">
                 <pic:pic xmlns:pic="http://schemas.openxmlformats.org/drawingml/2006/picture">
                   <pic:nvPicPr>
-                    <pic:cNvPr id="1580103680" name=""/>
+                    <pic:cNvPr id="1141227819" name=""/>
                     <pic:cNvPicPr/>
                   </pic:nvPicPr>
                   <pic:blipFill>
@@ -17189,7 +17265,7 @@
           <w:sz w:val="34"/>
         </w:rPr>
       </w:pPr>
-      <w:bookmarkStart w:id="33" w:name="_Toc238810077"/>
+      <w:bookmarkStart w:id="33" w:name="_Toc239253991"/>
       <w:r>
         <w:rPr>
           <w:rFonts w:ascii="Montserrat" w:hAnsi="Montserrat"/>
@@ -17249,7 +17325,7 @@
           <w:sz w:val="27"/>
         </w:rPr>
       </w:pPr>
-      <w:bookmarkStart w:id="34" w:name="_Toc238810078"/>
+      <w:bookmarkStart w:id="34" w:name="_Toc239253992"/>
       <w:r>
         <w:rPr>
           <w:rFonts w:ascii="Montserrat" w:hAnsi="Montserrat"/>
@@ -17289,16 +17365,16 @@
           <w:noProof/>
         </w:rPr>
         <w:drawing>
-          <wp:inline distT="0" distB="0" distL="0" distR="0" wp14:anchorId="7BBACF74" wp14:editId="57EC8F35">
+          <wp:inline distT="0" distB="0" distL="0" distR="0" wp14:anchorId="6C2E9EE3" wp14:editId="1E1FCF19">
             <wp:extent cx="5303520" cy="4792851"/>
             <wp:effectExtent l="19050" t="19050" r="11430" b="27305"/>
-            <wp:docPr id="782988182" name="Imagem 42"/>
+            <wp:docPr id="1733971746" name="Imagem 42"/>
             <wp:cNvGraphicFramePr/>
             <a:graphic xmlns:a="http://schemas.openxmlformats.org/drawingml/2006/main">
               <a:graphicData uri="http://schemas.openxmlformats.org/drawingml/2006/picture">
                 <pic:pic xmlns:pic="http://schemas.openxmlformats.org/drawingml/2006/picture">
                   <pic:nvPicPr>
-                    <pic:cNvPr id="782988182" name=""/>
+                    <pic:cNvPr id="1733971746" name=""/>
                     <pic:cNvPicPr/>
                   </pic:nvPicPr>
                   <pic:blipFill>
@@ -17367,7 +17443,7 @@
           <w:sz w:val="27"/>
         </w:rPr>
       </w:pPr>
-      <w:bookmarkStart w:id="35" w:name="_Toc238810079"/>
+      <w:bookmarkStart w:id="35" w:name="_Toc239253993"/>
       <w:r>
         <w:rPr>
           <w:rFonts w:ascii="Montserrat" w:hAnsi="Montserrat"/>
@@ -17407,16 +17483,16 @@
           <w:noProof/>
         </w:rPr>
         <w:drawing>
-          <wp:inline distT="0" distB="0" distL="0" distR="0" wp14:anchorId="3866AC4D" wp14:editId="024EA41F">
+          <wp:inline distT="0" distB="0" distL="0" distR="0" wp14:anchorId="279A2194" wp14:editId="1FB5CBE9">
             <wp:extent cx="5303520" cy="4792851"/>
             <wp:effectExtent l="19050" t="19050" r="11430" b="27305"/>
-            <wp:docPr id="2133618531" name="Imagem 43"/>
+            <wp:docPr id="349252520" name="Imagem 43"/>
             <wp:cNvGraphicFramePr/>
             <a:graphic xmlns:a="http://schemas.openxmlformats.org/drawingml/2006/main">
               <a:graphicData uri="http://schemas.openxmlformats.org/drawingml/2006/picture">
                 <pic:pic xmlns:pic="http://schemas.openxmlformats.org/drawingml/2006/picture">
                   <pic:nvPicPr>
-                    <pic:cNvPr id="2133618531" name=""/>
+                    <pic:cNvPr id="349252520" name=""/>
                     <pic:cNvPicPr/>
                   </pic:nvPicPr>
                   <pic:blipFill>
@@ -17484,7 +17560,7 @@
           <w:sz w:val="27"/>
         </w:rPr>
       </w:pPr>
-      <w:bookmarkStart w:id="36" w:name="_Toc238810080"/>
+      <w:bookmarkStart w:id="36" w:name="_Toc239253994"/>
       <w:r>
         <w:rPr>
           <w:rFonts w:ascii="Montserrat" w:hAnsi="Montserrat"/>
@@ -17525,16 +17601,16 @@
         </w:rPr>
         <w:lastRenderedPageBreak/>
         <w:drawing>
-          <wp:inline distT="0" distB="0" distL="0" distR="0" wp14:anchorId="50C7E6BE" wp14:editId="17E8D486">
+          <wp:inline distT="0" distB="0" distL="0" distR="0" wp14:anchorId="2F3D0802" wp14:editId="600079B2">
             <wp:extent cx="5303520" cy="4792851"/>
             <wp:effectExtent l="19050" t="19050" r="11430" b="27305"/>
-            <wp:docPr id="1650128614" name="Imagem 44"/>
+            <wp:docPr id="2131701849" name="Imagem 44"/>
             <wp:cNvGraphicFramePr/>
             <a:graphic xmlns:a="http://schemas.openxmlformats.org/drawingml/2006/main">
               <a:graphicData uri="http://schemas.openxmlformats.org/drawingml/2006/picture">
                 <pic:pic xmlns:pic="http://schemas.openxmlformats.org/drawingml/2006/picture">
                   <pic:nvPicPr>
-                    <pic:cNvPr id="1650128614" name=""/>
+                    <pic:cNvPr id="2131701849" name=""/>
                     <pic:cNvPicPr/>
                   </pic:nvPicPr>
                   <pic:blipFill>
@@ -17602,16 +17678,16 @@
         </w:rPr>
         <w:lastRenderedPageBreak/>
         <w:drawing>
-          <wp:inline distT="0" distB="0" distL="0" distR="0" wp14:anchorId="6C1013FE" wp14:editId="38A05E4C">
+          <wp:inline distT="0" distB="0" distL="0" distR="0" wp14:anchorId="355FFF39" wp14:editId="5BA04646">
             <wp:extent cx="5303520" cy="4792851"/>
             <wp:effectExtent l="19050" t="19050" r="11430" b="27305"/>
-            <wp:docPr id="1821180458" name="Imagem 45"/>
+            <wp:docPr id="1390991006" name="Imagem 45"/>
             <wp:cNvGraphicFramePr/>
             <a:graphic xmlns:a="http://schemas.openxmlformats.org/drawingml/2006/main">
               <a:graphicData uri="http://schemas.openxmlformats.org/drawingml/2006/picture">
                 <pic:pic xmlns:pic="http://schemas.openxmlformats.org/drawingml/2006/picture">
                   <pic:nvPicPr>
-                    <pic:cNvPr id="1821180458" name=""/>
+                    <pic:cNvPr id="1390991006" name=""/>
                     <pic:cNvPicPr/>
                   </pic:nvPicPr>
                   <pic:blipFill>
@@ -17704,7 +17780,7 @@
           <w:sz w:val="34"/>
         </w:rPr>
       </w:pPr>
-      <w:bookmarkStart w:id="37" w:name="_Toc238810081"/>
+      <w:bookmarkStart w:id="37" w:name="_Toc239253995"/>
       <w:r>
         <w:rPr>
           <w:rFonts w:ascii="Montserrat" w:hAnsi="Montserrat"/>
@@ -17746,7 +17822,7 @@
           <w:sz w:val="27"/>
         </w:rPr>
       </w:pPr>
-      <w:bookmarkStart w:id="38" w:name="_Toc238810082"/>
+      <w:bookmarkStart w:id="38" w:name="_Toc239253996"/>
       <w:r>
         <w:rPr>
           <w:rFonts w:ascii="Montserrat" w:hAnsi="Montserrat"/>
@@ -17786,16 +17862,16 @@
           <w:noProof/>
         </w:rPr>
         <w:drawing>
-          <wp:inline distT="0" distB="0" distL="0" distR="0" wp14:anchorId="65075FAC" wp14:editId="490CD7BC">
+          <wp:inline distT="0" distB="0" distL="0" distR="0" wp14:anchorId="004F70FF" wp14:editId="697F4B31">
             <wp:extent cx="5303520" cy="4792851"/>
             <wp:effectExtent l="19050" t="19050" r="11430" b="27305"/>
-            <wp:docPr id="1832814079" name="Imagem 46"/>
+            <wp:docPr id="2070087872" name="Imagem 46"/>
             <wp:cNvGraphicFramePr/>
             <a:graphic xmlns:a="http://schemas.openxmlformats.org/drawingml/2006/main">
               <a:graphicData uri="http://schemas.openxmlformats.org/drawingml/2006/picture">
                 <pic:pic xmlns:pic="http://schemas.openxmlformats.org/drawingml/2006/picture">
                   <pic:nvPicPr>
-                    <pic:cNvPr id="1832814079" name=""/>
+                    <pic:cNvPr id="2070087872" name=""/>
                     <pic:cNvPicPr/>
                   </pic:nvPicPr>
                   <pic:blipFill>
@@ -17942,7 +18018,7 @@
           <w:sz w:val="27"/>
         </w:rPr>
       </w:pPr>
-      <w:bookmarkStart w:id="39" w:name="_Toc238810083"/>
+      <w:bookmarkStart w:id="39" w:name="_Toc239253997"/>
       <w:r>
         <w:rPr>
           <w:rFonts w:ascii="Montserrat" w:hAnsi="Montserrat"/>
@@ -17983,16 +18059,16 @@
         </w:rPr>
         <w:lastRenderedPageBreak/>
         <w:drawing>
-          <wp:inline distT="0" distB="0" distL="0" distR="0" wp14:anchorId="44ACBC67" wp14:editId="77E64736">
+          <wp:inline distT="0" distB="0" distL="0" distR="0" wp14:anchorId="0ADD1197" wp14:editId="4DF01527">
             <wp:extent cx="5303520" cy="4792851"/>
             <wp:effectExtent l="19050" t="19050" r="11430" b="27305"/>
-            <wp:docPr id="1683001088" name="Imagem 47"/>
+            <wp:docPr id="660491423" name="Imagem 47"/>
             <wp:cNvGraphicFramePr/>
             <a:graphic xmlns:a="http://schemas.openxmlformats.org/drawingml/2006/main">
               <a:graphicData uri="http://schemas.openxmlformats.org/drawingml/2006/picture">
                 <pic:pic xmlns:pic="http://schemas.openxmlformats.org/drawingml/2006/picture">
                   <pic:nvPicPr>
-                    <pic:cNvPr id="1683001088" name=""/>
+                    <pic:cNvPr id="660491423" name=""/>
                     <pic:cNvPicPr/>
                   </pic:nvPicPr>
                   <pic:blipFill>
@@ -18060,7 +18136,7 @@
           <w:sz w:val="27"/>
         </w:rPr>
       </w:pPr>
-      <w:bookmarkStart w:id="40" w:name="_Toc238810084"/>
+      <w:bookmarkStart w:id="40" w:name="_Toc239253998"/>
       <w:r>
         <w:rPr>
           <w:rFonts w:ascii="Montserrat" w:hAnsi="Montserrat"/>
@@ -18101,16 +18177,16 @@
         </w:rPr>
         <w:lastRenderedPageBreak/>
         <w:drawing>
-          <wp:inline distT="0" distB="0" distL="0" distR="0" wp14:anchorId="21F4FB7B" wp14:editId="2DBD6BD7">
+          <wp:inline distT="0" distB="0" distL="0" distR="0" wp14:anchorId="4D7E3288" wp14:editId="0F9DC00C">
             <wp:extent cx="5303520" cy="4792851"/>
             <wp:effectExtent l="19050" t="19050" r="11430" b="27305"/>
-            <wp:docPr id="1943739547" name="Imagem 48"/>
+            <wp:docPr id="615263573" name="Imagem 48"/>
             <wp:cNvGraphicFramePr/>
             <a:graphic xmlns:a="http://schemas.openxmlformats.org/drawingml/2006/main">
               <a:graphicData uri="http://schemas.openxmlformats.org/drawingml/2006/picture">
                 <pic:pic xmlns:pic="http://schemas.openxmlformats.org/drawingml/2006/picture">
                   <pic:nvPicPr>
-                    <pic:cNvPr id="1943739547" name=""/>
+                    <pic:cNvPr id="615263573" name=""/>
                     <pic:cNvPicPr/>
                   </pic:nvPicPr>
                   <pic:blipFill>
@@ -18254,7 +18330,7 @@
           <w:sz w:val="27"/>
         </w:rPr>
       </w:pPr>
-      <w:bookmarkStart w:id="41" w:name="_Toc238810085"/>
+      <w:bookmarkStart w:id="41" w:name="_Toc239253999"/>
       <w:r>
         <w:rPr>
           <w:rFonts w:ascii="Montserrat" w:hAnsi="Montserrat"/>
@@ -18377,7 +18453,7 @@
           <w:color w:val="1A1A1A"/>
           <w:sz w:val="22"/>
         </w:rPr>
-        <w:t>Portfolio de projetos: contagem de projetos Aprovados, Reprovados e em avaliacao no Gate 1, a partir do cadastro compartilhado (secao 2.5).</w:t>
+        <w:t>Portfolio de projetos: contagem de projetos Aprovados, Encerrados (Concluido/Paralisado/Cancelado, via TEP), Reprovados e em avaliacao no Gate 1, a partir do cadastro compartilhado (secao 2.5).</w:t>
       </w:r>
     </w:p>
     <w:p>
@@ -18391,16 +18467,16 @@
         </w:rPr>
         <w:lastRenderedPageBreak/>
         <w:drawing>
-          <wp:inline distT="0" distB="0" distL="0" distR="0" wp14:anchorId="2304F115" wp14:editId="2B9C4469">
+          <wp:inline distT="0" distB="0" distL="0" distR="0" wp14:anchorId="1B397918" wp14:editId="25853B61">
             <wp:extent cx="5303520" cy="4267180"/>
             <wp:effectExtent l="19050" t="19050" r="11430" b="19685"/>
-            <wp:docPr id="1633666146" name="Imagem 49"/>
+            <wp:docPr id="1640963411" name="Imagem 49"/>
             <wp:cNvGraphicFramePr/>
             <a:graphic xmlns:a="http://schemas.openxmlformats.org/drawingml/2006/main">
               <a:graphicData uri="http://schemas.openxmlformats.org/drawingml/2006/picture">
                 <pic:pic xmlns:pic="http://schemas.openxmlformats.org/drawingml/2006/picture">
                   <pic:nvPicPr>
-                    <pic:cNvPr id="1633666146" name=""/>
+                    <pic:cNvPr id="1640963411" name=""/>
                     <pic:cNvPicPr/>
                   </pic:nvPicPr>
                   <pic:blipFill>
@@ -18468,16 +18544,16 @@
         </w:rPr>
         <w:lastRenderedPageBreak/>
         <w:drawing>
-          <wp:inline distT="0" distB="0" distL="0" distR="0" wp14:anchorId="4800A0A8" wp14:editId="2D43870D">
-            <wp:extent cx="5303520" cy="3962338"/>
-            <wp:effectExtent l="19050" t="19050" r="11430" b="19685"/>
-            <wp:docPr id="1026392382" name="Imagem 50"/>
+          <wp:inline distT="0" distB="0" distL="0" distR="0" wp14:anchorId="793BD07C" wp14:editId="14E2EF43">
+            <wp:extent cx="5303520" cy="3382059"/>
+            <wp:effectExtent l="19050" t="19050" r="11430" b="27940"/>
+            <wp:docPr id="217483707" name="Imagem 50"/>
             <wp:cNvGraphicFramePr/>
             <a:graphic xmlns:a="http://schemas.openxmlformats.org/drawingml/2006/main">
               <a:graphicData uri="http://schemas.openxmlformats.org/drawingml/2006/picture">
                 <pic:pic xmlns:pic="http://schemas.openxmlformats.org/drawingml/2006/picture">
                   <pic:nvPicPr>
-                    <pic:cNvPr id="1026392382" name=""/>
+                    <pic:cNvPr id="217483707" name=""/>
                     <pic:cNvPicPr/>
                   </pic:nvPicPr>
                   <pic:blipFill>
@@ -18495,7 +18571,7 @@
                   <pic:spPr>
                     <a:xfrm>
                       <a:off x="0" y="0"/>
-                      <a:ext cx="5303520" cy="3962338"/>
+                      <a:ext cx="5303520" cy="3382059"/>
                     </a:xfrm>
                     <a:prstGeom prst="rect">
                       <a:avLst/>
@@ -18566,7 +18642,7 @@
           <w:sz w:val="27"/>
         </w:rPr>
       </w:pPr>
-      <w:bookmarkStart w:id="42" w:name="_Toc238810086"/>
+      <w:bookmarkStart w:id="42" w:name="_Toc239254000"/>
       <w:r>
         <w:rPr>
           <w:rFonts w:ascii="Montserrat" w:hAnsi="Montserrat"/>
@@ -18611,16 +18687,7 @@
           <w:color w:val="1A1A1A"/>
           <w:sz w:val="22"/>
         </w:rPr>
-        <w:t xml:space="preserve">Quando a Administracao e acessada em producao, aparece uma quarta aba, Ambiente de Treino, com um unico botao: Resetar ambiente de treinamento. Ao clicar (e confirmar o aviso), o sistema apaga todos os projetos e registros de formulario atualmente no ambiente de treinamento e recria os 7 projetos de </w:t>
-      </w:r>
-      <w:r>
-        <w:rPr>
-          <w:rFonts w:ascii="Montserrat" w:hAnsi="Montserrat"/>
-          <w:color w:val="1A1A1A"/>
-          <w:sz w:val="22"/>
-        </w:rPr>
-        <w:lastRenderedPageBreak/>
-        <w:t>exemplo do zero - util para deixar o ambiente limpo antes de uma nova turma, sem precisar rodar nenhum comando manualmente.</w:t>
+        <w:t>Quando a Administracao e acessada em producao, aparece uma quarta aba, Ambiente de Treino, com um unico botao: Resetar ambiente de treinamento. Ao clicar (e confirmar o aviso), o sistema apaga todos os projetos e registros de formulario atualmente no ambiente de treinamento e recria os 7 projetos de exemplo do zero - util para deixar o ambiente limpo antes de uma nova turma, sem precisar rodar nenhum comando manualmente.</w:t>
       </w:r>
     </w:p>
     <w:p>
@@ -18644,6 +18711,7 @@
           <w:color w:val="1A1A1A"/>
           <w:sz w:val="22"/>
         </w:rPr>
+        <w:lastRenderedPageBreak/>
         <w:t>A aba so aparece quando a Administracao e acessada pelo endereco de producao - quem acessa a Administracao pelo proprio ambiente de treinamento nao ve essa opcao.</w:t>
       </w:r>
     </w:p>
@@ -18727,7 +18795,7 @@
           <w:sz w:val="27"/>
         </w:rPr>
       </w:pPr>
-      <w:bookmarkStart w:id="43" w:name="_Toc238810087"/>
+      <w:bookmarkStart w:id="43" w:name="_Toc239254001"/>
       <w:r>
         <w:rPr>
           <w:rFonts w:ascii="Montserrat" w:hAnsi="Montserrat"/>
@@ -18967,7 +19035,7 @@
           <w:color w:val="6A6A70"/>
           <w:sz w:val="21"/>
         </w:rPr>
-        <w:t xml:space="preserve">Esta tela define os parametros - quem efetivamente le essas configuracoes e executa a copia dos dados e uma rotina agendada fora do sistema (GitHub </w:t>
+        <w:t xml:space="preserve">Esta tela define os parametros - quem efetivamente le essas configuracoes e executa a copia dos dados e uma rotina agendada fora do sistema (GitHub Actions). Como o agendamento desse tipo de rotina roda em horarios fixos (nao pode ser alterado em tempo real por este formulario), ela e programada para rodar com frequencia maior do que o necessario e, a cada execucao, checar </w:t>
       </w:r>
       <w:r>
         <w:rPr>
@@ -18977,7 +19045,7 @@
           <w:sz w:val="21"/>
         </w:rPr>
         <w:lastRenderedPageBreak/>
-        <w:t>Actions). Como o agendamento desse tipo de rotina roda em horarios fixos (nao pode ser alterado em tempo real por este formulario), ela e programada para rodar com frequencia maior do que o necessario e, a cada execucao, checar aqui se ja esta na hora de rodar de acordo com a frequencia configurada - na pratica, o efeito para quem usa a tela e o mesmo de definir a frequencia diretamente.</w:t>
+        <w:t>aqui se ja esta na hora de rodar de acordo com a frequencia configurada - na pratica, o efeito para quem usa a tela e o mesmo de definir a frequencia diretamente.</w:t>
       </w:r>
     </w:p>
     <w:p>
@@ -19029,16 +19097,16 @@
           <w:noProof/>
         </w:rPr>
         <w:drawing>
-          <wp:inline distT="0" distB="0" distL="0" distR="0" wp14:anchorId="5DDBB67A" wp14:editId="39FC85CA">
+          <wp:inline distT="0" distB="0" distL="0" distR="0" wp14:anchorId="344E3DEA" wp14:editId="05B8599F">
             <wp:extent cx="5303520" cy="1351384"/>
             <wp:effectExtent l="19050" t="19050" r="11430" b="20320"/>
-            <wp:docPr id="288905834" name="Imagem 51"/>
+            <wp:docPr id="1907411327" name="Imagem 51"/>
             <wp:cNvGraphicFramePr/>
             <a:graphic xmlns:a="http://schemas.openxmlformats.org/drawingml/2006/main">
               <a:graphicData uri="http://schemas.openxmlformats.org/drawingml/2006/picture">
                 <pic:pic xmlns:pic="http://schemas.openxmlformats.org/drawingml/2006/picture">
                   <pic:nvPicPr>
-                    <pic:cNvPr id="288905834" name=""/>
+                    <pic:cNvPr id="1907411327" name=""/>
                     <pic:cNvPicPr/>
                   </pic:nvPicPr>
                   <pic:blipFill>
@@ -19106,7 +19174,7 @@
           <w:sz w:val="27"/>
         </w:rPr>
       </w:pPr>
-      <w:bookmarkStart w:id="44" w:name="_Toc238810088"/>
+      <w:bookmarkStart w:id="44" w:name="_Toc239254002"/>
       <w:r>
         <w:rPr>
           <w:rFonts w:ascii="Montserrat" w:hAnsi="Montserrat"/>
@@ -19205,7 +19273,6 @@
           <w:color w:val="1A1A1A"/>
           <w:sz w:val="22"/>
         </w:rPr>
-        <w:lastRenderedPageBreak/>
         <w:t>Entraves resolvidos: dos entraves que estavam Aberto no ultimo salvamento do Relatorio de Situacao, quantos ja aparecem como Resolvido agora.</w:t>
       </w:r>
     </w:p>
@@ -19218,17 +19285,18 @@
         <w:rPr>
           <w:noProof/>
         </w:rPr>
+        <w:lastRenderedPageBreak/>
         <w:drawing>
-          <wp:inline distT="0" distB="0" distL="0" distR="0" wp14:anchorId="3DEC227F" wp14:editId="3136F57F">
+          <wp:inline distT="0" distB="0" distL="0" distR="0" wp14:anchorId="07CB1421" wp14:editId="7B8E250A">
             <wp:extent cx="5303520" cy="1422793"/>
             <wp:effectExtent l="19050" t="19050" r="11430" b="25400"/>
-            <wp:docPr id="1015542416" name="Imagem 52"/>
+            <wp:docPr id="1334703540" name="Imagem 52"/>
             <wp:cNvGraphicFramePr/>
             <a:graphic xmlns:a="http://schemas.openxmlformats.org/drawingml/2006/main">
               <a:graphicData uri="http://schemas.openxmlformats.org/drawingml/2006/picture">
                 <pic:pic xmlns:pic="http://schemas.openxmlformats.org/drawingml/2006/picture">
                   <pic:nvPicPr>
-                    <pic:cNvPr id="1015542416" name=""/>
+                    <pic:cNvPr id="1334703540" name=""/>
                     <pic:cNvPicPr/>
                   </pic:nvPicPr>
                   <pic:blipFill>
@@ -19381,18 +19449,17 @@
         <w:rPr>
           <w:noProof/>
         </w:rPr>
-        <w:lastRenderedPageBreak/>
         <w:drawing>
-          <wp:inline distT="0" distB="0" distL="0" distR="0" wp14:anchorId="5B1BFF0D" wp14:editId="77A290B2">
+          <wp:inline distT="0" distB="0" distL="0" distR="0" wp14:anchorId="48DD2C48" wp14:editId="15A33397">
             <wp:extent cx="5303520" cy="1841050"/>
             <wp:effectExtent l="19050" t="19050" r="11430" b="26035"/>
-            <wp:docPr id="1898183554" name="Imagem 53"/>
+            <wp:docPr id="171770825" name="Imagem 53"/>
             <wp:cNvGraphicFramePr/>
             <a:graphic xmlns:a="http://schemas.openxmlformats.org/drawingml/2006/main">
               <a:graphicData uri="http://schemas.openxmlformats.org/drawingml/2006/picture">
                 <pic:pic xmlns:pic="http://schemas.openxmlformats.org/drawingml/2006/picture">
                   <pic:nvPicPr>
-                    <pic:cNvPr id="1898183554" name=""/>
+                    <pic:cNvPr id="171770825" name=""/>
                     <pic:cNvPicPr/>
                   </pic:nvPicPr>
                   <pic:blipFill>
@@ -19467,6 +19534,7 @@
           <w:color w:val="6A6A70"/>
           <w:sz w:val="21"/>
         </w:rPr>
+        <w:lastRenderedPageBreak/>
         <w:t>O rotulo Atualizado em no topo da pagina mostra quando os dados foram lidos - esta pagina e uma foto em tempo real, assim como o Painel Executivo, nao um fechamento formal de mes.</w:t>
       </w:r>
     </w:p>
@@ -19546,16 +19614,16 @@
           <w:noProof/>
         </w:rPr>
         <w:drawing>
-          <wp:inline distT="0" distB="0" distL="0" distR="0" wp14:anchorId="262DD0FD" wp14:editId="28DFB87A">
+          <wp:inline distT="0" distB="0" distL="0" distR="0" wp14:anchorId="42BC234D" wp14:editId="73E1FC64">
             <wp:extent cx="5303520" cy="303041"/>
             <wp:effectExtent l="19050" t="19050" r="11430" b="20955"/>
-            <wp:docPr id="1074768849" name="Imagem 54"/>
+            <wp:docPr id="1633524374" name="Imagem 54"/>
             <wp:cNvGraphicFramePr/>
             <a:graphic xmlns:a="http://schemas.openxmlformats.org/drawingml/2006/main">
               <a:graphicData uri="http://schemas.openxmlformats.org/drawingml/2006/picture">
                 <pic:pic xmlns:pic="http://schemas.openxmlformats.org/drawingml/2006/picture">
                   <pic:nvPicPr>
-                    <pic:cNvPr id="1074768849" name=""/>
+                    <pic:cNvPr id="1633524374" name=""/>
                     <pic:cNvPicPr/>
                   </pic:nvPicPr>
                   <pic:blipFill>
@@ -19621,18 +19689,17 @@
         <w:rPr>
           <w:noProof/>
         </w:rPr>
-        <w:lastRenderedPageBreak/>
         <w:drawing>
-          <wp:inline distT="0" distB="0" distL="0" distR="0" wp14:anchorId="3410A6E5" wp14:editId="50C7CCFB">
+          <wp:inline distT="0" distB="0" distL="0" distR="0" wp14:anchorId="6D5E629D" wp14:editId="44D3258D">
             <wp:extent cx="5303520" cy="2983005"/>
             <wp:effectExtent l="19050" t="19050" r="11430" b="27305"/>
-            <wp:docPr id="1147687267" name="Imagem 55"/>
+            <wp:docPr id="684232424" name="Imagem 55"/>
             <wp:cNvGraphicFramePr/>
             <a:graphic xmlns:a="http://schemas.openxmlformats.org/drawingml/2006/main">
               <a:graphicData uri="http://schemas.openxmlformats.org/drawingml/2006/picture">
                 <pic:pic xmlns:pic="http://schemas.openxmlformats.org/drawingml/2006/picture">
                   <pic:nvPicPr>
-                    <pic:cNvPr id="1147687267" name=""/>
+                    <pic:cNvPr id="684232424" name=""/>
                     <pic:cNvPicPr/>
                   </pic:nvPicPr>
                   <pic:blipFill>
@@ -19704,7 +19771,7 @@
           <w:sz w:val="34"/>
         </w:rPr>
       </w:pPr>
-      <w:bookmarkStart w:id="45" w:name="_Toc238810089"/>
+      <w:bookmarkStart w:id="45" w:name="_Toc239254003"/>
       <w:r>
         <w:rPr>
           <w:rFonts w:ascii="Montserrat" w:hAnsi="Montserrat"/>
@@ -19948,7 +20015,7 @@
           <w:sz w:val="34"/>
         </w:rPr>
       </w:pPr>
-      <w:bookmarkStart w:id="46" w:name="_Toc238810090"/>
+      <w:bookmarkStart w:id="46" w:name="_Toc239254004"/>
       <w:r>
         <w:rPr>
           <w:rFonts w:ascii="Montserrat" w:hAnsi="Montserrat"/>
@@ -21736,7 +21803,7 @@
 <file path=word/numbering.xml><?xml version="1.0" encoding="utf-8"?>
 <w:numbering xmlns:wpc="http://schemas.microsoft.com/office/word/2010/wordprocessingCanvas" xmlns:cx="http://schemas.microsoft.com/office/drawing/2014/chartex" xmlns:cx1="http://schemas.microsoft.com/office/drawing/2015/9/8/chartex" xmlns:cx2="http://schemas.microsoft.com/office/drawing/2015/10/21/chartex" xmlns:cx3="http://schemas.microsoft.com/office/drawing/2016/5/9/chartex" xmlns:cx4="http://schemas.microsoft.com/office/drawing/2016/5/10/chartex" xmlns:cx5="http://schemas.microsoft.com/office/drawing/2016/5/11/chartex" xmlns:cx6="http://schemas.microsoft.com/office/drawing/2016/5/12/chartex" xmlns:cx7="http://schemas.microsoft.com/office/drawing/2016/5/13/chartex" xmlns:cx8="http://schemas.microsoft.com/office/drawing/2016/5/14/chartex" xmlns:mc="http://schemas.openxmlformats.org/markup-compatibility/2006" xmlns:aink="http://schemas.microsoft.com/office/drawing/2016/ink" xmlns:am3d="http://schemas.microsoft.com/office/drawing/2017/model3d" xmlns:o="urn:schemas-microsoft-com:office:office" xmlns:oel="http://schemas.microsoft.com/office/2019/extlst" xmlns:r="http://schemas.openxmlformats.org/officeDocument/2006/relationships" xmlns:m="http://schemas.openxmlformats.org/officeDocument/2006/math" xmlns:v="urn:schemas-microsoft-com:vml" xmlns:wp14="http://schemas.microsoft.com/office/word/2010/wordprocessingDrawing" xmlns:wp="http://schemas.openxmlformats.org/drawingml/2006/wordprocessingDrawing" xmlns:w10="urn:schemas-microsoft-com:office:word" xmlns:w="http://schemas.openxmlformats.org/wordprocessingml/2006/main" xmlns:w14="http://schemas.microsoft.com/office/word/2010/wordml" xmlns:w15="http://schemas.microsoft.com/office/word/2012/wordml" xmlns:w16cex="http://schemas.microsoft.com/office/word/2018/wordml/cex" xmlns:w16cid="http://schemas.microsoft.com/office/word/2016/wordml/cid" xmlns:w16="http://schemas.microsoft.com/office/word/2018/wordml" xmlns:w16du="http://schemas.microsoft.com/office/word/2023/wordml/word16du" xmlns:w16sdtdh="http://schemas.microsoft.com/office/word/2020/wordml/sdtdatahash" xmlns:w16sdtfl="http://schemas.microsoft.com/office/word/2024/wordml/sdtformatlock" xmlns:w16se="http://schemas.microsoft.com/office/word/2015/wordml/symex" xmlns:wpg="http://schemas.microsoft.com/office/word/2010/wordprocessingGroup" xmlns:wpi="http://schemas.microsoft.com/office/word/2010/wordprocessingInk" xmlns:wne="http://schemas.microsoft.com/office/word/2006/wordml" xmlns:wps="http://schemas.microsoft.com/office/word/2010/wordprocessingShape" mc:Ignorable="w14 w15 w16se w16cid w16 w16cex w16sdtdh w16sdtfl w16du wp14">
   <w:abstractNum w:abstractNumId="0" w15:restartNumberingAfterBreak="0">
-    <w:nsid w:val="00200B11"/>
+    <w:nsid w:val="036F6E7B"/>
     <w:multiLevelType w:val="singleLevel"/>
     <w:tmpl w:val="04160001"/>
     <w:lvl w:ilvl="0">
@@ -21753,7 +21820,7 @@
     </w:lvl>
   </w:abstractNum>
   <w:abstractNum w:abstractNumId="1" w15:restartNumberingAfterBreak="0">
-    <w:nsid w:val="025F1A59"/>
+    <w:nsid w:val="03D07A91"/>
     <w:multiLevelType w:val="singleLevel"/>
     <w:tmpl w:val="04160001"/>
     <w:lvl w:ilvl="0">
@@ -21770,7 +21837,7 @@
     </w:lvl>
   </w:abstractNum>
   <w:abstractNum w:abstractNumId="2" w15:restartNumberingAfterBreak="0">
-    <w:nsid w:val="088A3BA9"/>
+    <w:nsid w:val="06BE660A"/>
     <w:multiLevelType w:val="singleLevel"/>
     <w:tmpl w:val="04160001"/>
     <w:lvl w:ilvl="0">
@@ -21787,7 +21854,7 @@
     </w:lvl>
   </w:abstractNum>
   <w:abstractNum w:abstractNumId="3" w15:restartNumberingAfterBreak="0">
-    <w:nsid w:val="09AC400A"/>
+    <w:nsid w:val="1A01490B"/>
     <w:multiLevelType w:val="singleLevel"/>
     <w:tmpl w:val="04160001"/>
     <w:lvl w:ilvl="0">
@@ -21804,7 +21871,7 @@
     </w:lvl>
   </w:abstractNum>
   <w:abstractNum w:abstractNumId="4" w15:restartNumberingAfterBreak="0">
-    <w:nsid w:val="0AD07CB2"/>
+    <w:nsid w:val="1D72571C"/>
     <w:multiLevelType w:val="singleLevel"/>
     <w:tmpl w:val="04160001"/>
     <w:lvl w:ilvl="0">
@@ -21821,7 +21888,7 @@
     </w:lvl>
   </w:abstractNum>
   <w:abstractNum w:abstractNumId="5" w15:restartNumberingAfterBreak="0">
-    <w:nsid w:val="0BD33E05"/>
+    <w:nsid w:val="1FB510FE"/>
     <w:multiLevelType w:val="singleLevel"/>
     <w:tmpl w:val="04160001"/>
     <w:lvl w:ilvl="0">
@@ -21838,7 +21905,7 @@
     </w:lvl>
   </w:abstractNum>
   <w:abstractNum w:abstractNumId="6" w15:restartNumberingAfterBreak="0">
-    <w:nsid w:val="1054232D"/>
+    <w:nsid w:val="20FC2210"/>
     <w:multiLevelType w:val="singleLevel"/>
     <w:tmpl w:val="04160001"/>
     <w:lvl w:ilvl="0">
@@ -21855,7 +21922,7 @@
     </w:lvl>
   </w:abstractNum>
   <w:abstractNum w:abstractNumId="7" w15:restartNumberingAfterBreak="0">
-    <w:nsid w:val="10DB6415"/>
+    <w:nsid w:val="230C3C58"/>
     <w:multiLevelType w:val="singleLevel"/>
     <w:tmpl w:val="04160001"/>
     <w:lvl w:ilvl="0">
@@ -21872,7 +21939,7 @@
     </w:lvl>
   </w:abstractNum>
   <w:abstractNum w:abstractNumId="8" w15:restartNumberingAfterBreak="0">
-    <w:nsid w:val="12B31592"/>
+    <w:nsid w:val="283B1E5C"/>
     <w:multiLevelType w:val="singleLevel"/>
     <w:tmpl w:val="04160001"/>
     <w:lvl w:ilvl="0">
@@ -21889,7 +21956,7 @@
     </w:lvl>
   </w:abstractNum>
   <w:abstractNum w:abstractNumId="9" w15:restartNumberingAfterBreak="0">
-    <w:nsid w:val="14D012A6"/>
+    <w:nsid w:val="30A31B67"/>
     <w:multiLevelType w:val="singleLevel"/>
     <w:tmpl w:val="04160001"/>
     <w:lvl w:ilvl="0">
@@ -21906,7 +21973,7 @@
     </w:lvl>
   </w:abstractNum>
   <w:abstractNum w:abstractNumId="10" w15:restartNumberingAfterBreak="0">
-    <w:nsid w:val="19B56B24"/>
+    <w:nsid w:val="347F3771"/>
     <w:multiLevelType w:val="singleLevel"/>
     <w:tmpl w:val="04160001"/>
     <w:lvl w:ilvl="0">
@@ -21923,7 +21990,7 @@
     </w:lvl>
   </w:abstractNum>
   <w:abstractNum w:abstractNumId="11" w15:restartNumberingAfterBreak="0">
-    <w:nsid w:val="1F1A56DF"/>
+    <w:nsid w:val="36BF737F"/>
     <w:multiLevelType w:val="singleLevel"/>
     <w:tmpl w:val="04160001"/>
     <w:lvl w:ilvl="0">
@@ -21940,7 +22007,7 @@
     </w:lvl>
   </w:abstractNum>
   <w:abstractNum w:abstractNumId="12" w15:restartNumberingAfterBreak="0">
-    <w:nsid w:val="225E2E02"/>
+    <w:nsid w:val="38944129"/>
     <w:multiLevelType w:val="singleLevel"/>
     <w:tmpl w:val="04160001"/>
     <w:lvl w:ilvl="0">
@@ -21957,7 +22024,7 @@
     </w:lvl>
   </w:abstractNum>
   <w:abstractNum w:abstractNumId="13" w15:restartNumberingAfterBreak="0">
-    <w:nsid w:val="234A14DB"/>
+    <w:nsid w:val="38CA59AA"/>
     <w:multiLevelType w:val="singleLevel"/>
     <w:tmpl w:val="04160001"/>
     <w:lvl w:ilvl="0">
@@ -21974,7 +22041,7 @@
     </w:lvl>
   </w:abstractNum>
   <w:abstractNum w:abstractNumId="14" w15:restartNumberingAfterBreak="0">
-    <w:nsid w:val="23872F21"/>
+    <w:nsid w:val="414944E6"/>
     <w:multiLevelType w:val="singleLevel"/>
     <w:tmpl w:val="04160001"/>
     <w:lvl w:ilvl="0">
@@ -21991,7 +22058,7 @@
     </w:lvl>
   </w:abstractNum>
   <w:abstractNum w:abstractNumId="15" w15:restartNumberingAfterBreak="0">
-    <w:nsid w:val="32F92AA8"/>
+    <w:nsid w:val="450B0B8D"/>
     <w:multiLevelType w:val="singleLevel"/>
     <w:tmpl w:val="04160001"/>
     <w:lvl w:ilvl="0">
@@ -22008,7 +22075,7 @@
     </w:lvl>
   </w:abstractNum>
   <w:abstractNum w:abstractNumId="16" w15:restartNumberingAfterBreak="0">
-    <w:nsid w:val="348C19BF"/>
+    <w:nsid w:val="48814E7A"/>
     <w:multiLevelType w:val="singleLevel"/>
     <w:tmpl w:val="04160001"/>
     <w:lvl w:ilvl="0">
@@ -22025,7 +22092,7 @@
     </w:lvl>
   </w:abstractNum>
   <w:abstractNum w:abstractNumId="17" w15:restartNumberingAfterBreak="0">
-    <w:nsid w:val="360C3A96"/>
+    <w:nsid w:val="495C0D4B"/>
     <w:multiLevelType w:val="singleLevel"/>
     <w:tmpl w:val="04160001"/>
     <w:lvl w:ilvl="0">
@@ -22042,7 +22109,7 @@
     </w:lvl>
   </w:abstractNum>
   <w:abstractNum w:abstractNumId="18" w15:restartNumberingAfterBreak="0">
-    <w:nsid w:val="3B3F17DC"/>
+    <w:nsid w:val="4D7124F0"/>
     <w:multiLevelType w:val="singleLevel"/>
     <w:tmpl w:val="04160001"/>
     <w:lvl w:ilvl="0">
@@ -22059,7 +22126,7 @@
     </w:lvl>
   </w:abstractNum>
   <w:abstractNum w:abstractNumId="19" w15:restartNumberingAfterBreak="0">
-    <w:nsid w:val="40682266"/>
+    <w:nsid w:val="4EA0125C"/>
     <w:multiLevelType w:val="singleLevel"/>
     <w:tmpl w:val="04160001"/>
     <w:lvl w:ilvl="0">
@@ -22076,7 +22143,7 @@
     </w:lvl>
   </w:abstractNum>
   <w:abstractNum w:abstractNumId="20" w15:restartNumberingAfterBreak="0">
-    <w:nsid w:val="4245123F"/>
+    <w:nsid w:val="526379C6"/>
     <w:multiLevelType w:val="singleLevel"/>
     <w:tmpl w:val="04160001"/>
     <w:lvl w:ilvl="0">
@@ -22093,7 +22160,7 @@
     </w:lvl>
   </w:abstractNum>
   <w:abstractNum w:abstractNumId="21" w15:restartNumberingAfterBreak="0">
-    <w:nsid w:val="45A518ED"/>
+    <w:nsid w:val="56F82A7E"/>
     <w:multiLevelType w:val="singleLevel"/>
     <w:tmpl w:val="04160001"/>
     <w:lvl w:ilvl="0">
@@ -22110,7 +22177,7 @@
     </w:lvl>
   </w:abstractNum>
   <w:abstractNum w:abstractNumId="22" w15:restartNumberingAfterBreak="0">
-    <w:nsid w:val="59874D97"/>
+    <w:nsid w:val="58416E52"/>
     <w:multiLevelType w:val="singleLevel"/>
     <w:tmpl w:val="04160001"/>
     <w:lvl w:ilvl="0">
@@ -22127,7 +22194,7 @@
     </w:lvl>
   </w:abstractNum>
   <w:abstractNum w:abstractNumId="23" w15:restartNumberingAfterBreak="0">
-    <w:nsid w:val="5D566F74"/>
+    <w:nsid w:val="584F0E78"/>
     <w:multiLevelType w:val="singleLevel"/>
     <w:tmpl w:val="04160001"/>
     <w:lvl w:ilvl="0">
@@ -22144,7 +22211,7 @@
     </w:lvl>
   </w:abstractNum>
   <w:abstractNum w:abstractNumId="24" w15:restartNumberingAfterBreak="0">
-    <w:nsid w:val="60D34E22"/>
+    <w:nsid w:val="5CB6083B"/>
     <w:multiLevelType w:val="singleLevel"/>
     <w:tmpl w:val="04160001"/>
     <w:lvl w:ilvl="0">
@@ -22161,7 +22228,7 @@
     </w:lvl>
   </w:abstractNum>
   <w:abstractNum w:abstractNumId="25" w15:restartNumberingAfterBreak="0">
-    <w:nsid w:val="6335344D"/>
+    <w:nsid w:val="5DAD7199"/>
     <w:multiLevelType w:val="singleLevel"/>
     <w:tmpl w:val="04160001"/>
     <w:lvl w:ilvl="0">
@@ -22178,7 +22245,7 @@
     </w:lvl>
   </w:abstractNum>
   <w:abstractNum w:abstractNumId="26" w15:restartNumberingAfterBreak="0">
-    <w:nsid w:val="656E7B16"/>
+    <w:nsid w:val="6AC72E3D"/>
     <w:multiLevelType w:val="singleLevel"/>
     <w:tmpl w:val="04160001"/>
     <w:lvl w:ilvl="0">
@@ -22195,7 +22262,7 @@
     </w:lvl>
   </w:abstractNum>
   <w:abstractNum w:abstractNumId="27" w15:restartNumberingAfterBreak="0">
-    <w:nsid w:val="68A004DB"/>
+    <w:nsid w:val="6C110E67"/>
     <w:multiLevelType w:val="singleLevel"/>
     <w:tmpl w:val="04160001"/>
     <w:lvl w:ilvl="0">
@@ -22212,7 +22279,7 @@
     </w:lvl>
   </w:abstractNum>
   <w:abstractNum w:abstractNumId="28" w15:restartNumberingAfterBreak="0">
-    <w:nsid w:val="6F3F1369"/>
+    <w:nsid w:val="6DF0710E"/>
     <w:multiLevelType w:val="singleLevel"/>
     <w:tmpl w:val="04160001"/>
     <w:lvl w:ilvl="0">
@@ -22229,7 +22296,7 @@
     </w:lvl>
   </w:abstractNum>
   <w:abstractNum w:abstractNumId="29" w15:restartNumberingAfterBreak="0">
-    <w:nsid w:val="73472A6D"/>
+    <w:nsid w:val="71121170"/>
     <w:multiLevelType w:val="singleLevel"/>
     <w:tmpl w:val="04160001"/>
     <w:lvl w:ilvl="0">
@@ -22246,7 +22313,7 @@
     </w:lvl>
   </w:abstractNum>
   <w:abstractNum w:abstractNumId="30" w15:restartNumberingAfterBreak="0">
-    <w:nsid w:val="7CF2171F"/>
+    <w:nsid w:val="72142C01"/>
     <w:multiLevelType w:val="singleLevel"/>
     <w:tmpl w:val="04160001"/>
     <w:lvl w:ilvl="0">
@@ -22263,7 +22330,7 @@
     </w:lvl>
   </w:abstractNum>
   <w:abstractNum w:abstractNumId="31" w15:restartNumberingAfterBreak="0">
-    <w:nsid w:val="7FD42D37"/>
+    <w:nsid w:val="7D2F5ADD"/>
     <w:multiLevelType w:val="singleLevel"/>
     <w:tmpl w:val="04160001"/>
     <w:lvl w:ilvl="0">
@@ -22279,101 +22346,101 @@
       </w:rPr>
     </w:lvl>
   </w:abstractNum>
-  <w:num w:numId="1" w16cid:durableId="345979428">
+  <w:num w:numId="1" w16cid:durableId="1816600926">
+    <w:abstractNumId w:val="14"/>
+  </w:num>
+  <w:num w:numId="2" w16cid:durableId="1097408815">
+    <w:abstractNumId w:val="10"/>
+  </w:num>
+  <w:num w:numId="3" w16cid:durableId="346446510">
+    <w:abstractNumId w:val="4"/>
+  </w:num>
+  <w:num w:numId="4" w16cid:durableId="380522507">
+    <w:abstractNumId w:val="29"/>
+  </w:num>
+  <w:num w:numId="5" w16cid:durableId="1960792668">
+    <w:abstractNumId w:val="24"/>
+  </w:num>
+  <w:num w:numId="6" w16cid:durableId="1683120610">
+    <w:abstractNumId w:val="28"/>
+  </w:num>
+  <w:num w:numId="7" w16cid:durableId="194775011">
+    <w:abstractNumId w:val="13"/>
+  </w:num>
+  <w:num w:numId="8" w16cid:durableId="147136593">
+    <w:abstractNumId w:val="2"/>
+  </w:num>
+  <w:num w:numId="9" w16cid:durableId="1758624612">
+    <w:abstractNumId w:val="27"/>
+  </w:num>
+  <w:num w:numId="10" w16cid:durableId="232738986">
+    <w:abstractNumId w:val="19"/>
+  </w:num>
+  <w:num w:numId="11" w16cid:durableId="804467440">
+    <w:abstractNumId w:val="20"/>
+  </w:num>
+  <w:num w:numId="12" w16cid:durableId="1023168971">
+    <w:abstractNumId w:val="5"/>
+  </w:num>
+  <w:num w:numId="13" w16cid:durableId="775755361">
+    <w:abstractNumId w:val="9"/>
+  </w:num>
+  <w:num w:numId="14" w16cid:durableId="467861988">
+    <w:abstractNumId w:val="8"/>
+  </w:num>
+  <w:num w:numId="15" w16cid:durableId="1049494701">
+    <w:abstractNumId w:val="3"/>
+  </w:num>
+  <w:num w:numId="16" w16cid:durableId="929311741">
+    <w:abstractNumId w:val="15"/>
+  </w:num>
+  <w:num w:numId="17" w16cid:durableId="2434711">
+    <w:abstractNumId w:val="6"/>
+  </w:num>
+  <w:num w:numId="18" w16cid:durableId="1097483884">
+    <w:abstractNumId w:val="26"/>
+  </w:num>
+  <w:num w:numId="19" w16cid:durableId="2005929841">
+    <w:abstractNumId w:val="0"/>
+  </w:num>
+  <w:num w:numId="20" w16cid:durableId="1502114504">
+    <w:abstractNumId w:val="11"/>
+  </w:num>
+  <w:num w:numId="21" w16cid:durableId="663123434">
     <w:abstractNumId w:val="21"/>
   </w:num>
-  <w:num w:numId="2" w16cid:durableId="180440477">
+  <w:num w:numId="22" w16cid:durableId="1874466005">
+    <w:abstractNumId w:val="25"/>
+  </w:num>
+  <w:num w:numId="23" w16cid:durableId="2044287660">
+    <w:abstractNumId w:val="17"/>
+  </w:num>
+  <w:num w:numId="24" w16cid:durableId="119810570">
+    <w:abstractNumId w:val="31"/>
+  </w:num>
+  <w:num w:numId="25" w16cid:durableId="758867839">
+    <w:abstractNumId w:val="12"/>
+  </w:num>
+  <w:num w:numId="26" w16cid:durableId="2027560837">
+    <w:abstractNumId w:val="30"/>
+  </w:num>
+  <w:num w:numId="27" w16cid:durableId="1862275968">
+    <w:abstractNumId w:val="23"/>
+  </w:num>
+  <w:num w:numId="28" w16cid:durableId="1602451101">
     <w:abstractNumId w:val="16"/>
   </w:num>
-  <w:num w:numId="3" w16cid:durableId="1758866178">
-    <w:abstractNumId w:val="12"/>
+  <w:num w:numId="29" w16cid:durableId="2126193027">
+    <w:abstractNumId w:val="22"/>
   </w:num>
-  <w:num w:numId="4" w16cid:durableId="1071778808">
-    <w:abstractNumId w:val="26"/>
+  <w:num w:numId="30" w16cid:durableId="1897086043">
+    <w:abstractNumId w:val="7"/>
   </w:num>
-  <w:num w:numId="5" w16cid:durableId="152114017">
-    <w:abstractNumId w:val="15"/>
-  </w:num>
-  <w:num w:numId="6" w16cid:durableId="98721938">
-    <w:abstractNumId w:val="4"/>
-  </w:num>
-  <w:num w:numId="7" w16cid:durableId="1034043307">
-    <w:abstractNumId w:val="20"/>
-  </w:num>
-  <w:num w:numId="8" w16cid:durableId="833492079">
-    <w:abstractNumId w:val="6"/>
-  </w:num>
-  <w:num w:numId="9" w16cid:durableId="1194074594">
+  <w:num w:numId="31" w16cid:durableId="1817841434">
     <w:abstractNumId w:val="1"/>
   </w:num>
-  <w:num w:numId="10" w16cid:durableId="912473479">
-    <w:abstractNumId w:val="9"/>
-  </w:num>
-  <w:num w:numId="11" w16cid:durableId="1216549055">
-    <w:abstractNumId w:val="10"/>
-  </w:num>
-  <w:num w:numId="12" w16cid:durableId="2117747389">
-    <w:abstractNumId w:val="2"/>
-  </w:num>
-  <w:num w:numId="13" w16cid:durableId="2001274029">
-    <w:abstractNumId w:val="0"/>
-  </w:num>
-  <w:num w:numId="14" w16cid:durableId="1861621674">
-    <w:abstractNumId w:val="3"/>
-  </w:num>
-  <w:num w:numId="15" w16cid:durableId="1056776367">
-    <w:abstractNumId w:val="31"/>
-  </w:num>
-  <w:num w:numId="16" w16cid:durableId="2093820595">
-    <w:abstractNumId w:val="23"/>
-  </w:num>
-  <w:num w:numId="17" w16cid:durableId="1834249561">
-    <w:abstractNumId w:val="17"/>
-  </w:num>
-  <w:num w:numId="18" w16cid:durableId="559560634">
-    <w:abstractNumId w:val="13"/>
-  </w:num>
-  <w:num w:numId="19" w16cid:durableId="1363356450">
-    <w:abstractNumId w:val="25"/>
-  </w:num>
-  <w:num w:numId="20" w16cid:durableId="1494570035">
-    <w:abstractNumId w:val="24"/>
-  </w:num>
-  <w:num w:numId="21" w16cid:durableId="1754815364">
-    <w:abstractNumId w:val="8"/>
-  </w:num>
-  <w:num w:numId="22" w16cid:durableId="136187726">
-    <w:abstractNumId w:val="27"/>
-  </w:num>
-  <w:num w:numId="23" w16cid:durableId="2006203138">
-    <w:abstractNumId w:val="5"/>
-  </w:num>
-  <w:num w:numId="24" w16cid:durableId="1942297864">
-    <w:abstractNumId w:val="29"/>
-  </w:num>
-  <w:num w:numId="25" w16cid:durableId="1664502415">
-    <w:abstractNumId w:val="7"/>
-  </w:num>
-  <w:num w:numId="26" w16cid:durableId="1011682158">
+  <w:num w:numId="32" w16cid:durableId="1067217999">
     <w:abstractNumId w:val="18"/>
-  </w:num>
-  <w:num w:numId="27" w16cid:durableId="834883688">
-    <w:abstractNumId w:val="30"/>
-  </w:num>
-  <w:num w:numId="28" w16cid:durableId="727723434">
-    <w:abstractNumId w:val="11"/>
-  </w:num>
-  <w:num w:numId="29" w16cid:durableId="1976718587">
-    <w:abstractNumId w:val="22"/>
-  </w:num>
-  <w:num w:numId="30" w16cid:durableId="1139960014">
-    <w:abstractNumId w:val="28"/>
-  </w:num>
-  <w:num w:numId="31" w16cid:durableId="54358858">
-    <w:abstractNumId w:val="14"/>
-  </w:num>
-  <w:num w:numId="32" w16cid:durableId="1249732943">
-    <w:abstractNumId w:val="19"/>
   </w:num>
 </w:numbering>
 </file>
@@ -22786,7 +22853,7 @@
     <w:link w:val="Ttulo1Char"/>
     <w:uiPriority w:val="9"/>
     <w:qFormat/>
-    <w:rsid w:val="00B474D0"/>
+    <w:rsid w:val="00C54814"/>
     <w:pPr>
       <w:keepNext/>
       <w:keepLines/>
@@ -22808,7 +22875,7 @@
     <w:uiPriority w:val="9"/>
     <w:unhideWhenUsed/>
     <w:qFormat/>
-    <w:rsid w:val="00B474D0"/>
+    <w:rsid w:val="00C54814"/>
     <w:pPr>
       <w:keepNext/>
       <w:keepLines/>
@@ -22831,7 +22898,7 @@
     <w:semiHidden/>
     <w:unhideWhenUsed/>
     <w:qFormat/>
-    <w:rsid w:val="00B474D0"/>
+    <w:rsid w:val="00C54814"/>
     <w:pPr>
       <w:keepNext/>
       <w:keepLines/>
@@ -22854,7 +22921,7 @@
     <w:semiHidden/>
     <w:unhideWhenUsed/>
     <w:qFormat/>
-    <w:rsid w:val="00B474D0"/>
+    <w:rsid w:val="00C54814"/>
     <w:pPr>
       <w:keepNext/>
       <w:keepLines/>
@@ -22877,7 +22944,7 @@
     <w:semiHidden/>
     <w:unhideWhenUsed/>
     <w:qFormat/>
-    <w:rsid w:val="00B474D0"/>
+    <w:rsid w:val="00C54814"/>
     <w:pPr>
       <w:keepNext/>
       <w:keepLines/>
@@ -22898,7 +22965,7 @@
     <w:semiHidden/>
     <w:unhideWhenUsed/>
     <w:qFormat/>
-    <w:rsid w:val="00B474D0"/>
+    <w:rsid w:val="00C54814"/>
     <w:pPr>
       <w:keepNext/>
       <w:keepLines/>
@@ -22921,7 +22988,7 @@
     <w:semiHidden/>
     <w:unhideWhenUsed/>
     <w:qFormat/>
-    <w:rsid w:val="00B474D0"/>
+    <w:rsid w:val="00C54814"/>
     <w:pPr>
       <w:keepNext/>
       <w:keepLines/>
@@ -22942,7 +23009,7 @@
     <w:semiHidden/>
     <w:unhideWhenUsed/>
     <w:qFormat/>
-    <w:rsid w:val="00B474D0"/>
+    <w:rsid w:val="00C54814"/>
     <w:pPr>
       <w:keepNext/>
       <w:keepLines/>
@@ -22965,7 +23032,7 @@
     <w:semiHidden/>
     <w:unhideWhenUsed/>
     <w:qFormat/>
-    <w:rsid w:val="00B474D0"/>
+    <w:rsid w:val="00C54814"/>
     <w:pPr>
       <w:keepNext/>
       <w:keepLines/>
@@ -23009,7 +23076,7 @@
     <w:basedOn w:val="Fontepargpadro"/>
     <w:link w:val="Ttulo1"/>
     <w:uiPriority w:val="9"/>
-    <w:rsid w:val="00B474D0"/>
+    <w:rsid w:val="00C54814"/>
     <w:rPr>
       <w:rFonts w:asciiTheme="majorHAnsi" w:eastAsiaTheme="majorEastAsia" w:hAnsiTheme="majorHAnsi" w:cstheme="majorBidi"/>
       <w:color w:val="0F4761" w:themeColor="accent1" w:themeShade="BF"/>
@@ -23022,7 +23089,7 @@
     <w:basedOn w:val="Fontepargpadro"/>
     <w:link w:val="Ttulo2"/>
     <w:uiPriority w:val="9"/>
-    <w:rsid w:val="00B474D0"/>
+    <w:rsid w:val="00C54814"/>
     <w:rPr>
       <w:rFonts w:asciiTheme="majorHAnsi" w:eastAsiaTheme="majorEastAsia" w:hAnsiTheme="majorHAnsi" w:cstheme="majorBidi"/>
       <w:color w:val="0F4761" w:themeColor="accent1" w:themeShade="BF"/>
@@ -23036,7 +23103,7 @@
     <w:link w:val="Ttulo3"/>
     <w:uiPriority w:val="9"/>
     <w:semiHidden/>
-    <w:rsid w:val="00B474D0"/>
+    <w:rsid w:val="00C54814"/>
     <w:rPr>
       <w:rFonts w:eastAsiaTheme="majorEastAsia" w:cstheme="majorBidi"/>
       <w:color w:val="0F4761" w:themeColor="accent1" w:themeShade="BF"/>
@@ -23050,7 +23117,7 @@
     <w:link w:val="Ttulo4"/>
     <w:uiPriority w:val="9"/>
     <w:semiHidden/>
-    <w:rsid w:val="00B474D0"/>
+    <w:rsid w:val="00C54814"/>
     <w:rPr>
       <w:rFonts w:eastAsiaTheme="majorEastAsia" w:cstheme="majorBidi"/>
       <w:i/>
@@ -23064,7 +23131,7 @@
     <w:link w:val="Ttulo5"/>
     <w:uiPriority w:val="9"/>
     <w:semiHidden/>
-    <w:rsid w:val="00B474D0"/>
+    <w:rsid w:val="00C54814"/>
     <w:rPr>
       <w:rFonts w:eastAsiaTheme="majorEastAsia" w:cstheme="majorBidi"/>
       <w:color w:val="0F4761" w:themeColor="accent1" w:themeShade="BF"/>
@@ -23076,7 +23143,7 @@
     <w:link w:val="Ttulo6"/>
     <w:uiPriority w:val="9"/>
     <w:semiHidden/>
-    <w:rsid w:val="00B474D0"/>
+    <w:rsid w:val="00C54814"/>
     <w:rPr>
       <w:rFonts w:eastAsiaTheme="majorEastAsia" w:cstheme="majorBidi"/>
       <w:i/>
@@ -23090,7 +23157,7 @@
     <w:link w:val="Ttulo7"/>
     <w:uiPriority w:val="9"/>
     <w:semiHidden/>
-    <w:rsid w:val="00B474D0"/>
+    <w:rsid w:val="00C54814"/>
     <w:rPr>
       <w:rFonts w:eastAsiaTheme="majorEastAsia" w:cstheme="majorBidi"/>
       <w:color w:val="595959" w:themeColor="text1" w:themeTint="A6"/>
@@ -23102,7 +23169,7 @@
     <w:link w:val="Ttulo8"/>
     <w:uiPriority w:val="9"/>
     <w:semiHidden/>
-    <w:rsid w:val="00B474D0"/>
+    <w:rsid w:val="00C54814"/>
     <w:rPr>
       <w:rFonts w:eastAsiaTheme="majorEastAsia" w:cstheme="majorBidi"/>
       <w:i/>
@@ -23116,7 +23183,7 @@
     <w:link w:val="Ttulo9"/>
     <w:uiPriority w:val="9"/>
     <w:semiHidden/>
-    <w:rsid w:val="00B474D0"/>
+    <w:rsid w:val="00C54814"/>
     <w:rPr>
       <w:rFonts w:eastAsiaTheme="majorEastAsia" w:cstheme="majorBidi"/>
       <w:color w:val="272727" w:themeColor="text1" w:themeTint="D8"/>
@@ -23129,7 +23196,7 @@
     <w:link w:val="TtuloChar"/>
     <w:uiPriority w:val="10"/>
     <w:qFormat/>
-    <w:rsid w:val="00B474D0"/>
+    <w:rsid w:val="00C54814"/>
     <w:pPr>
       <w:spacing w:after="80" w:line="240" w:lineRule="auto"/>
       <w:contextualSpacing/>
@@ -23147,7 +23214,7 @@
     <w:basedOn w:val="Fontepargpadro"/>
     <w:link w:val="Ttulo"/>
     <w:uiPriority w:val="10"/>
-    <w:rsid w:val="00B474D0"/>
+    <w:rsid w:val="00C54814"/>
     <w:rPr>
       <w:rFonts w:asciiTheme="majorHAnsi" w:eastAsiaTheme="majorEastAsia" w:hAnsiTheme="majorHAnsi" w:cstheme="majorBidi"/>
       <w:spacing w:val="-10"/>
@@ -23163,7 +23230,7 @@
     <w:link w:val="SubttuloChar"/>
     <w:uiPriority w:val="11"/>
     <w:qFormat/>
-    <w:rsid w:val="00B474D0"/>
+    <w:rsid w:val="00C54814"/>
     <w:pPr>
       <w:numPr>
         <w:ilvl w:val="1"/>
@@ -23182,7 +23249,7 @@
     <w:basedOn w:val="Fontepargpadro"/>
     <w:link w:val="Subttulo"/>
     <w:uiPriority w:val="11"/>
-    <w:rsid w:val="00B474D0"/>
+    <w:rsid w:val="00C54814"/>
     <w:rPr>
       <w:rFonts w:eastAsiaTheme="majorEastAsia" w:cstheme="majorBidi"/>
       <w:color w:val="595959" w:themeColor="text1" w:themeTint="A6"/>
@@ -23198,7 +23265,7 @@
     <w:link w:val="CitaoChar"/>
     <w:uiPriority w:val="29"/>
     <w:qFormat/>
-    <w:rsid w:val="00B474D0"/>
+    <w:rsid w:val="00C54814"/>
     <w:pPr>
       <w:spacing w:before="160"/>
       <w:jc w:val="center"/>
@@ -23214,7 +23281,7 @@
     <w:basedOn w:val="Fontepargpadro"/>
     <w:link w:val="Citao"/>
     <w:uiPriority w:val="29"/>
-    <w:rsid w:val="00B474D0"/>
+    <w:rsid w:val="00C54814"/>
     <w:rPr>
       <w:i/>
       <w:iCs/>
@@ -23226,7 +23293,7 @@
     <w:basedOn w:val="Normal"/>
     <w:uiPriority w:val="34"/>
     <w:qFormat/>
-    <w:rsid w:val="00B474D0"/>
+    <w:rsid w:val="00C54814"/>
     <w:pPr>
       <w:ind w:left="720"/>
       <w:contextualSpacing/>
@@ -23237,7 +23304,7 @@
     <w:basedOn w:val="Fontepargpadro"/>
     <w:uiPriority w:val="21"/>
     <w:qFormat/>
-    <w:rsid w:val="00B474D0"/>
+    <w:rsid w:val="00C54814"/>
     <w:rPr>
       <w:i/>
       <w:iCs/>
@@ -23251,7 +23318,7 @@
     <w:link w:val="CitaoIntensaChar"/>
     <w:uiPriority w:val="30"/>
     <w:qFormat/>
-    <w:rsid w:val="00B474D0"/>
+    <w:rsid w:val="00C54814"/>
     <w:pPr>
       <w:pBdr>
         <w:top w:val="single" w:sz="4" w:space="10" w:color="0F4761" w:themeColor="accent1" w:themeShade="BF"/>
@@ -23272,7 +23339,7 @@
     <w:basedOn w:val="Fontepargpadro"/>
     <w:link w:val="CitaoIntensa"/>
     <w:uiPriority w:val="30"/>
-    <w:rsid w:val="00B474D0"/>
+    <w:rsid w:val="00C54814"/>
     <w:rPr>
       <w:i/>
       <w:iCs/>
@@ -23284,7 +23351,7 @@
     <w:basedOn w:val="Fontepargpadro"/>
     <w:uiPriority w:val="32"/>
     <w:qFormat/>
-    <w:rsid w:val="00B474D0"/>
+    <w:rsid w:val="00C54814"/>
     <w:rPr>
       <w:b/>
       <w:bCs/>
@@ -23299,7 +23366,7 @@
     <w:link w:val="CabealhoChar"/>
     <w:uiPriority w:val="99"/>
     <w:unhideWhenUsed/>
-    <w:rsid w:val="00B474D0"/>
+    <w:rsid w:val="00C54814"/>
     <w:pPr>
       <w:tabs>
         <w:tab w:val="center" w:pos="4252"/>
@@ -23313,7 +23380,7 @@
     <w:basedOn w:val="Fontepargpadro"/>
     <w:link w:val="Cabealho"/>
     <w:uiPriority w:val="99"/>
-    <w:rsid w:val="00B474D0"/>
+    <w:rsid w:val="00C54814"/>
   </w:style>
   <w:style w:type="paragraph" w:styleId="Rodap">
     <w:name w:val="footer"/>
@@ -23321,7 +23388,7 @@
     <w:link w:val="RodapChar"/>
     <w:uiPriority w:val="99"/>
     <w:unhideWhenUsed/>
-    <w:rsid w:val="00B474D0"/>
+    <w:rsid w:val="00C54814"/>
     <w:pPr>
       <w:tabs>
         <w:tab w:val="center" w:pos="4252"/>
@@ -23335,7 +23402,7 @@
     <w:basedOn w:val="Fontepargpadro"/>
     <w:link w:val="Rodap"/>
     <w:uiPriority w:val="99"/>
-    <w:rsid w:val="00B474D0"/>
+    <w:rsid w:val="00C54814"/>
   </w:style>
   <w:style w:type="paragraph" w:styleId="Sumrio1">
     <w:name w:val="toc 1"/>
@@ -23344,7 +23411,7 @@
     <w:autoRedefine/>
     <w:uiPriority w:val="39"/>
     <w:unhideWhenUsed/>
-    <w:rsid w:val="00B474D0"/>
+    <w:rsid w:val="00C54814"/>
     <w:pPr>
       <w:spacing w:after="100"/>
     </w:pPr>
@@ -23356,7 +23423,7 @@
     <w:autoRedefine/>
     <w:uiPriority w:val="39"/>
     <w:unhideWhenUsed/>
-    <w:rsid w:val="00B474D0"/>
+    <w:rsid w:val="00C54814"/>
     <w:pPr>
       <w:spacing w:after="100"/>
       <w:ind w:left="240"/>

</xml_diff>

<commit_message>
Sincroniza Manual de Uso - Visao atual por projeto (v2.41)
Espelha a atualizacao do Manual de Uso feita em producao (secao 6.4,
Painel Executivo) documentando a Fase 1 da Visao atual por projeto.

Co-Authored-By: Claude Sonnet 5 <noreply@anthropic.com>
</commit_message>
<xml_diff>
--- a/Manual de Uso - Ferramenta de Gestao de Projetos.docx
+++ b/Manual de Uso - Ferramenta de Gestao de Projetos.docx
@@ -229,7 +229,7 @@
         <w:rPr>
           <w:noProof/>
         </w:rPr>
-        <w:instrText xml:space="preserve"> PAGEREF _Toc239253958 \h </w:instrText>
+        <w:instrText xml:space="preserve"> PAGEREF _Toc239320766 \h </w:instrText>
       </w:r>
       <w:r>
         <w:rPr>
@@ -290,7 +290,7 @@
         <w:rPr>
           <w:noProof/>
         </w:rPr>
-        <w:instrText xml:space="preserve"> PAGEREF _Toc239253959 \h </w:instrText>
+        <w:instrText xml:space="preserve"> PAGEREF _Toc239320767 \h </w:instrText>
       </w:r>
       <w:r>
         <w:rPr>
@@ -351,7 +351,7 @@
         <w:rPr>
           <w:noProof/>
         </w:rPr>
-        <w:instrText xml:space="preserve"> PAGEREF _Toc239253960 \h </w:instrText>
+        <w:instrText xml:space="preserve"> PAGEREF _Toc239320768 \h </w:instrText>
       </w:r>
       <w:r>
         <w:rPr>
@@ -412,7 +412,7 @@
         <w:rPr>
           <w:noProof/>
         </w:rPr>
-        <w:instrText xml:space="preserve"> PAGEREF _Toc239253961 \h </w:instrText>
+        <w:instrText xml:space="preserve"> PAGEREF _Toc239320769 \h </w:instrText>
       </w:r>
       <w:r>
         <w:rPr>
@@ -429,7 +429,7 @@
         <w:rPr>
           <w:noProof/>
         </w:rPr>
-        <w:t>12</w:t>
+        <w:t>13</w:t>
       </w:r>
       <w:r>
         <w:rPr>
@@ -473,7 +473,7 @@
         <w:rPr>
           <w:noProof/>
         </w:rPr>
-        <w:instrText xml:space="preserve"> PAGEREF _Toc239253962 \h </w:instrText>
+        <w:instrText xml:space="preserve"> PAGEREF _Toc239320770 \h </w:instrText>
       </w:r>
       <w:r>
         <w:rPr>
@@ -490,7 +490,7 @@
         <w:rPr>
           <w:noProof/>
         </w:rPr>
-        <w:t>13</w:t>
+        <w:t>14</w:t>
       </w:r>
       <w:r>
         <w:rPr>
@@ -534,7 +534,7 @@
         <w:rPr>
           <w:noProof/>
         </w:rPr>
-        <w:instrText xml:space="preserve"> PAGEREF _Toc239253963 \h </w:instrText>
+        <w:instrText xml:space="preserve"> PAGEREF _Toc239320771 \h </w:instrText>
       </w:r>
       <w:r>
         <w:rPr>
@@ -595,7 +595,7 @@
         <w:rPr>
           <w:noProof/>
         </w:rPr>
-        <w:instrText xml:space="preserve"> PAGEREF _Toc239253964 \h </w:instrText>
+        <w:instrText xml:space="preserve"> PAGEREF _Toc239320772 \h </w:instrText>
       </w:r>
       <w:r>
         <w:rPr>
@@ -656,7 +656,7 @@
         <w:rPr>
           <w:noProof/>
         </w:rPr>
-        <w:instrText xml:space="preserve"> PAGEREF _Toc239253965 \h </w:instrText>
+        <w:instrText xml:space="preserve"> PAGEREF _Toc239320773 \h </w:instrText>
       </w:r>
       <w:r>
         <w:rPr>
@@ -717,7 +717,7 @@
         <w:rPr>
           <w:noProof/>
         </w:rPr>
-        <w:instrText xml:space="preserve"> PAGEREF _Toc239253966 \h </w:instrText>
+        <w:instrText xml:space="preserve"> PAGEREF _Toc239320774 \h </w:instrText>
       </w:r>
       <w:r>
         <w:rPr>
@@ -778,7 +778,7 @@
         <w:rPr>
           <w:noProof/>
         </w:rPr>
-        <w:instrText xml:space="preserve"> PAGEREF _Toc239253967 \h </w:instrText>
+        <w:instrText xml:space="preserve"> PAGEREF _Toc239320775 \h </w:instrText>
       </w:r>
       <w:r>
         <w:rPr>
@@ -839,7 +839,7 @@
         <w:rPr>
           <w:noProof/>
         </w:rPr>
-        <w:instrText xml:space="preserve"> PAGEREF _Toc239253968 \h </w:instrText>
+        <w:instrText xml:space="preserve"> PAGEREF _Toc239320776 \h </w:instrText>
       </w:r>
       <w:r>
         <w:rPr>
@@ -900,7 +900,7 @@
         <w:rPr>
           <w:noProof/>
         </w:rPr>
-        <w:instrText xml:space="preserve"> PAGEREF _Toc239253969 \h </w:instrText>
+        <w:instrText xml:space="preserve"> PAGEREF _Toc239320777 \h </w:instrText>
       </w:r>
       <w:r>
         <w:rPr>
@@ -961,7 +961,7 @@
         <w:rPr>
           <w:noProof/>
         </w:rPr>
-        <w:instrText xml:space="preserve"> PAGEREF _Toc239253970 \h </w:instrText>
+        <w:instrText xml:space="preserve"> PAGEREF _Toc239320778 \h </w:instrText>
       </w:r>
       <w:r>
         <w:rPr>
@@ -1022,7 +1022,7 @@
         <w:rPr>
           <w:noProof/>
         </w:rPr>
-        <w:instrText xml:space="preserve"> PAGEREF _Toc239253971 \h </w:instrText>
+        <w:instrText xml:space="preserve"> PAGEREF _Toc239320779 \h </w:instrText>
       </w:r>
       <w:r>
         <w:rPr>
@@ -1083,7 +1083,7 @@
         <w:rPr>
           <w:noProof/>
         </w:rPr>
-        <w:instrText xml:space="preserve"> PAGEREF _Toc239253972 \h </w:instrText>
+        <w:instrText xml:space="preserve"> PAGEREF _Toc239320780 \h </w:instrText>
       </w:r>
       <w:r>
         <w:rPr>
@@ -1144,7 +1144,7 @@
         <w:rPr>
           <w:noProof/>
         </w:rPr>
-        <w:instrText xml:space="preserve"> PAGEREF _Toc239253973 \h </w:instrText>
+        <w:instrText xml:space="preserve"> PAGEREF _Toc239320781 \h </w:instrText>
       </w:r>
       <w:r>
         <w:rPr>
@@ -1205,7 +1205,7 @@
         <w:rPr>
           <w:noProof/>
         </w:rPr>
-        <w:instrText xml:space="preserve"> PAGEREF _Toc239253974 \h </w:instrText>
+        <w:instrText xml:space="preserve"> PAGEREF _Toc239320782 \h </w:instrText>
       </w:r>
       <w:r>
         <w:rPr>
@@ -1266,7 +1266,7 @@
         <w:rPr>
           <w:noProof/>
         </w:rPr>
-        <w:instrText xml:space="preserve"> PAGEREF _Toc239253975 \h </w:instrText>
+        <w:instrText xml:space="preserve"> PAGEREF _Toc239320783 \h </w:instrText>
       </w:r>
       <w:r>
         <w:rPr>
@@ -1327,7 +1327,7 @@
         <w:rPr>
           <w:noProof/>
         </w:rPr>
-        <w:instrText xml:space="preserve"> PAGEREF _Toc239253976 \h </w:instrText>
+        <w:instrText xml:space="preserve"> PAGEREF _Toc239320784 \h </w:instrText>
       </w:r>
       <w:r>
         <w:rPr>
@@ -1388,7 +1388,7 @@
         <w:rPr>
           <w:noProof/>
         </w:rPr>
-        <w:instrText xml:space="preserve"> PAGEREF _Toc239253977 \h </w:instrText>
+        <w:instrText xml:space="preserve"> PAGEREF _Toc239320785 \h </w:instrText>
       </w:r>
       <w:r>
         <w:rPr>
@@ -1449,7 +1449,7 @@
         <w:rPr>
           <w:noProof/>
         </w:rPr>
-        <w:instrText xml:space="preserve"> PAGEREF _Toc239253978 \h </w:instrText>
+        <w:instrText xml:space="preserve"> PAGEREF _Toc239320786 \h </w:instrText>
       </w:r>
       <w:r>
         <w:rPr>
@@ -1510,7 +1510,7 @@
         <w:rPr>
           <w:noProof/>
         </w:rPr>
-        <w:instrText xml:space="preserve"> PAGEREF _Toc239253979 \h </w:instrText>
+        <w:instrText xml:space="preserve"> PAGEREF _Toc239320787 \h </w:instrText>
       </w:r>
       <w:r>
         <w:rPr>
@@ -1571,7 +1571,7 @@
         <w:rPr>
           <w:noProof/>
         </w:rPr>
-        <w:instrText xml:space="preserve"> PAGEREF _Toc239253980 \h </w:instrText>
+        <w:instrText xml:space="preserve"> PAGEREF _Toc239320788 \h </w:instrText>
       </w:r>
       <w:r>
         <w:rPr>
@@ -1632,7 +1632,7 @@
         <w:rPr>
           <w:noProof/>
         </w:rPr>
-        <w:instrText xml:space="preserve"> PAGEREF _Toc239253981 \h </w:instrText>
+        <w:instrText xml:space="preserve"> PAGEREF _Toc239320789 \h </w:instrText>
       </w:r>
       <w:r>
         <w:rPr>
@@ -1693,7 +1693,7 @@
         <w:rPr>
           <w:noProof/>
         </w:rPr>
-        <w:instrText xml:space="preserve"> PAGEREF _Toc239253982 \h </w:instrText>
+        <w:instrText xml:space="preserve"> PAGEREF _Toc239320790 \h </w:instrText>
       </w:r>
       <w:r>
         <w:rPr>
@@ -1755,7 +1755,7 @@
         <w:rPr>
           <w:noProof/>
         </w:rPr>
-        <w:instrText xml:space="preserve"> PAGEREF _Toc239253983 \h </w:instrText>
+        <w:instrText xml:space="preserve"> PAGEREF _Toc239320791 \h </w:instrText>
       </w:r>
       <w:r>
         <w:rPr>
@@ -1816,7 +1816,7 @@
         <w:rPr>
           <w:noProof/>
         </w:rPr>
-        <w:instrText xml:space="preserve"> PAGEREF _Toc239253984 \h </w:instrText>
+        <w:instrText xml:space="preserve"> PAGEREF _Toc239320792 \h </w:instrText>
       </w:r>
       <w:r>
         <w:rPr>
@@ -1877,7 +1877,7 @@
         <w:rPr>
           <w:noProof/>
         </w:rPr>
-        <w:instrText xml:space="preserve"> PAGEREF _Toc239253985 \h </w:instrText>
+        <w:instrText xml:space="preserve"> PAGEREF _Toc239320793 \h </w:instrText>
       </w:r>
       <w:r>
         <w:rPr>
@@ -1938,7 +1938,7 @@
         <w:rPr>
           <w:noProof/>
         </w:rPr>
-        <w:instrText xml:space="preserve"> PAGEREF _Toc239253986 \h </w:instrText>
+        <w:instrText xml:space="preserve"> PAGEREF _Toc239320794 \h </w:instrText>
       </w:r>
       <w:r>
         <w:rPr>
@@ -1999,7 +1999,7 @@
         <w:rPr>
           <w:noProof/>
         </w:rPr>
-        <w:instrText xml:space="preserve"> PAGEREF _Toc239253987 \h </w:instrText>
+        <w:instrText xml:space="preserve"> PAGEREF _Toc239320795 \h </w:instrText>
       </w:r>
       <w:r>
         <w:rPr>
@@ -2060,7 +2060,7 @@
         <w:rPr>
           <w:noProof/>
         </w:rPr>
-        <w:instrText xml:space="preserve"> PAGEREF _Toc239253988 \h </w:instrText>
+        <w:instrText xml:space="preserve"> PAGEREF _Toc239320796 \h </w:instrText>
       </w:r>
       <w:r>
         <w:rPr>
@@ -2121,7 +2121,7 @@
         <w:rPr>
           <w:noProof/>
         </w:rPr>
-        <w:instrText xml:space="preserve"> PAGEREF _Toc239253989 \h </w:instrText>
+        <w:instrText xml:space="preserve"> PAGEREF _Toc239320797 \h </w:instrText>
       </w:r>
       <w:r>
         <w:rPr>
@@ -2182,7 +2182,7 @@
         <w:rPr>
           <w:noProof/>
         </w:rPr>
-        <w:instrText xml:space="preserve"> PAGEREF _Toc239253990 \h </w:instrText>
+        <w:instrText xml:space="preserve"> PAGEREF _Toc239320798 \h </w:instrText>
       </w:r>
       <w:r>
         <w:rPr>
@@ -2243,7 +2243,7 @@
         <w:rPr>
           <w:noProof/>
         </w:rPr>
-        <w:instrText xml:space="preserve"> PAGEREF _Toc239253991 \h </w:instrText>
+        <w:instrText xml:space="preserve"> PAGEREF _Toc239320799 \h </w:instrText>
       </w:r>
       <w:r>
         <w:rPr>
@@ -2304,7 +2304,7 @@
         <w:rPr>
           <w:noProof/>
         </w:rPr>
-        <w:instrText xml:space="preserve"> PAGEREF _Toc239253992 \h </w:instrText>
+        <w:instrText xml:space="preserve"> PAGEREF _Toc239320800 \h </w:instrText>
       </w:r>
       <w:r>
         <w:rPr>
@@ -2365,7 +2365,7 @@
         <w:rPr>
           <w:noProof/>
         </w:rPr>
-        <w:instrText xml:space="preserve"> PAGEREF _Toc239253993 \h </w:instrText>
+        <w:instrText xml:space="preserve"> PAGEREF _Toc239320801 \h </w:instrText>
       </w:r>
       <w:r>
         <w:rPr>
@@ -2426,7 +2426,7 @@
         <w:rPr>
           <w:noProof/>
         </w:rPr>
-        <w:instrText xml:space="preserve"> PAGEREF _Toc239253994 \h </w:instrText>
+        <w:instrText xml:space="preserve"> PAGEREF _Toc239320802 \h </w:instrText>
       </w:r>
       <w:r>
         <w:rPr>
@@ -2487,7 +2487,7 @@
         <w:rPr>
           <w:noProof/>
         </w:rPr>
-        <w:instrText xml:space="preserve"> PAGEREF _Toc239253995 \h </w:instrText>
+        <w:instrText xml:space="preserve"> PAGEREF _Toc239320803 \h </w:instrText>
       </w:r>
       <w:r>
         <w:rPr>
@@ -2548,7 +2548,7 @@
         <w:rPr>
           <w:noProof/>
         </w:rPr>
-        <w:instrText xml:space="preserve"> PAGEREF _Toc239253996 \h </w:instrText>
+        <w:instrText xml:space="preserve"> PAGEREF _Toc239320804 \h </w:instrText>
       </w:r>
       <w:r>
         <w:rPr>
@@ -2609,7 +2609,7 @@
         <w:rPr>
           <w:noProof/>
         </w:rPr>
-        <w:instrText xml:space="preserve"> PAGEREF _Toc239253997 \h </w:instrText>
+        <w:instrText xml:space="preserve"> PAGEREF _Toc239320805 \h </w:instrText>
       </w:r>
       <w:r>
         <w:rPr>
@@ -2670,7 +2670,7 @@
         <w:rPr>
           <w:noProof/>
         </w:rPr>
-        <w:instrText xml:space="preserve"> PAGEREF _Toc239253998 \h </w:instrText>
+        <w:instrText xml:space="preserve"> PAGEREF _Toc239320806 \h </w:instrText>
       </w:r>
       <w:r>
         <w:rPr>
@@ -2731,7 +2731,7 @@
         <w:rPr>
           <w:noProof/>
         </w:rPr>
-        <w:instrText xml:space="preserve"> PAGEREF _Toc239253999 \h </w:instrText>
+        <w:instrText xml:space="preserve"> PAGEREF _Toc239320807 \h </w:instrText>
       </w:r>
       <w:r>
         <w:rPr>
@@ -2792,7 +2792,7 @@
         <w:rPr>
           <w:noProof/>
         </w:rPr>
-        <w:instrText xml:space="preserve"> PAGEREF _Toc239254000 \h </w:instrText>
+        <w:instrText xml:space="preserve"> PAGEREF _Toc239320808 \h </w:instrText>
       </w:r>
       <w:r>
         <w:rPr>
@@ -2809,7 +2809,7 @@
         <w:rPr>
           <w:noProof/>
         </w:rPr>
-        <w:t>75</w:t>
+        <w:t>76</w:t>
       </w:r>
       <w:r>
         <w:rPr>
@@ -2853,7 +2853,7 @@
         <w:rPr>
           <w:noProof/>
         </w:rPr>
-        <w:instrText xml:space="preserve"> PAGEREF _Toc239254001 \h </w:instrText>
+        <w:instrText xml:space="preserve"> PAGEREF _Toc239320809 \h </w:instrText>
       </w:r>
       <w:r>
         <w:rPr>
@@ -2870,7 +2870,7 @@
         <w:rPr>
           <w:noProof/>
         </w:rPr>
-        <w:t>76</w:t>
+        <w:t>77</w:t>
       </w:r>
       <w:r>
         <w:rPr>
@@ -2914,7 +2914,7 @@
         <w:rPr>
           <w:noProof/>
         </w:rPr>
-        <w:instrText xml:space="preserve"> PAGEREF _Toc239254002 \h </w:instrText>
+        <w:instrText xml:space="preserve"> PAGEREF _Toc239320810 \h </w:instrText>
       </w:r>
       <w:r>
         <w:rPr>
@@ -2931,7 +2931,7 @@
         <w:rPr>
           <w:noProof/>
         </w:rPr>
-        <w:t>77</w:t>
+        <w:t>78</w:t>
       </w:r>
       <w:r>
         <w:rPr>
@@ -2975,7 +2975,7 @@
         <w:rPr>
           <w:noProof/>
         </w:rPr>
-        <w:instrText xml:space="preserve"> PAGEREF _Toc239254003 \h </w:instrText>
+        <w:instrText xml:space="preserve"> PAGEREF _Toc239320811 \h </w:instrText>
       </w:r>
       <w:r>
         <w:rPr>
@@ -2992,7 +2992,7 @@
         <w:rPr>
           <w:noProof/>
         </w:rPr>
-        <w:t>80</w:t>
+        <w:t>81</w:t>
       </w:r>
       <w:r>
         <w:rPr>
@@ -3036,7 +3036,7 @@
         <w:rPr>
           <w:noProof/>
         </w:rPr>
-        <w:instrText xml:space="preserve"> PAGEREF _Toc239254004 \h </w:instrText>
+        <w:instrText xml:space="preserve"> PAGEREF _Toc239320812 \h </w:instrText>
       </w:r>
       <w:r>
         <w:rPr>
@@ -3053,7 +3053,7 @@
         <w:rPr>
           <w:noProof/>
         </w:rPr>
-        <w:t>81</w:t>
+        <w:t>82</w:t>
       </w:r>
       <w:r>
         <w:rPr>
@@ -3112,7 +3112,7 @@
           <w:sz w:val="34"/>
         </w:rPr>
       </w:pPr>
-      <w:bookmarkStart w:id="0" w:name="_Toc239253958"/>
+      <w:bookmarkStart w:id="0" w:name="_Toc239320766"/>
       <w:r>
         <w:rPr>
           <w:rFonts w:ascii="Montserrat" w:hAnsi="Montserrat"/>
@@ -3136,7 +3136,7 @@
           <w:sz w:val="27"/>
         </w:rPr>
       </w:pPr>
-      <w:bookmarkStart w:id="1" w:name="_Toc239253959"/>
+      <w:bookmarkStart w:id="1" w:name="_Toc239320767"/>
       <w:r>
         <w:rPr>
           <w:rFonts w:ascii="Montserrat" w:hAnsi="Montserrat"/>
@@ -3966,6 +3966,24 @@
           <w:color w:val="1A1A1A"/>
           <w:sz w:val="22"/>
         </w:rPr>
+        <w:t>Esta e a versao 2.41 do manual. Em relacao a versao 2.40 (02/09/2026), o Painel Executivo (secao 6.4) ganhou a nova secao Visao atual por projeto - Fase 1 de uma proposta em fases para dar visibilidade por projeto individual, nao so agregada. Uma linha por projeto do cadastro compartilhado (secao 2.5), cruzando o Status do cadastro, a Situacao mais recente do Relatorio de Situacao (secao 4.1, com o percentual concluido quando reportado) e o Progresso do ciclo de vida (quantos dos 9 formularios ja tem registro vinculado aquele projeto, com a lista do que falta).</w:t>
+      </w:r>
+    </w:p>
+    <w:p>
+      <w:pPr>
+        <w:spacing w:line="280" w:lineRule="auto"/>
+        <w:rPr>
+          <w:rFonts w:ascii="Montserrat" w:hAnsi="Montserrat"/>
+          <w:color w:val="1A1A1A"/>
+          <w:sz w:val="22"/>
+        </w:rPr>
+      </w:pPr>
+      <w:r>
+        <w:rPr>
+          <w:rFonts w:ascii="Montserrat" w:hAnsi="Montserrat"/>
+          <w:color w:val="1A1A1A"/>
+          <w:sz w:val="22"/>
+        </w:rPr>
         <w:t>O manual nao substitui as Diretrizes para a Gestao de Projetos da UNIALFA (documento institucional que define o framework D01 a D07) nem o documento Regras de Acesso e Permissoes (que detalha cada regra de controle de acesso); ele e o guia operacional de como usar cada ferramenta na pratica.</w:t>
       </w:r>
     </w:p>
@@ -3980,7 +3998,7 @@
           <w:sz w:val="27"/>
         </w:rPr>
       </w:pPr>
-      <w:bookmarkStart w:id="2" w:name="_Toc239253960"/>
+      <w:bookmarkStart w:id="2" w:name="_Toc239320768"/>
       <w:r>
         <w:rPr>
           <w:rFonts w:ascii="Montserrat" w:hAnsi="Montserrat"/>
@@ -4055,6 +4073,7 @@
           <w:color w:val="1A1A1A"/>
           <w:sz w:val="22"/>
         </w:rPr>
+        <w:lastRenderedPageBreak/>
         <w:t>1 ferramenta de apoio a decisao, o Validador de Projetos, que nao gera registros de artefato mas ajuda a avaliar projetos.</w:t>
       </w:r>
     </w:p>
@@ -4139,7 +4158,6 @@
           <w:color w:val="1A1A1A"/>
           <w:sz w:val="22"/>
         </w:rPr>
-        <w:lastRenderedPageBreak/>
         <w:t>O Mapa de Diretrizes (pagina inicial) apresenta visualmente as 7 diretrizes (D01 a D07) e mostra, para cada etapa do processo, quais ferramentas usar. E o ponto de partida recomendado para quem quer entender o processo antes de preencher os formularios - e a unica pagina, junto com o Validador de Projetos, que nao exige login.</w:t>
       </w:r>
     </w:p>
@@ -4153,16 +4171,16 @@
           <w:noProof/>
         </w:rPr>
         <w:drawing>
-          <wp:inline distT="0" distB="0" distL="0" distR="0" wp14:anchorId="1DE560BA" wp14:editId="54CC261A">
+          <wp:inline distT="0" distB="0" distL="0" distR="0" wp14:anchorId="56FFD3D9" wp14:editId="6170CD5C">
             <wp:extent cx="5303520" cy="4792851"/>
             <wp:effectExtent l="19050" t="19050" r="11430" b="27305"/>
-            <wp:docPr id="1464180055" name="Imagem 1"/>
+            <wp:docPr id="958089499" name="Imagem 1"/>
             <wp:cNvGraphicFramePr/>
             <a:graphic xmlns:a="http://schemas.openxmlformats.org/drawingml/2006/main">
               <a:graphicData uri="http://schemas.openxmlformats.org/drawingml/2006/picture">
                 <pic:pic xmlns:pic="http://schemas.openxmlformats.org/drawingml/2006/picture">
                   <pic:nvPicPr>
-                    <pic:cNvPr id="1464180055" name=""/>
+                    <pic:cNvPr id="958089499" name=""/>
                     <pic:cNvPicPr/>
                   </pic:nvPicPr>
                   <pic:blipFill>
@@ -4230,7 +4248,7 @@
           <w:sz w:val="27"/>
         </w:rPr>
       </w:pPr>
-      <w:bookmarkStart w:id="3" w:name="_Toc239253961"/>
+      <w:bookmarkStart w:id="3" w:name="_Toc239320769"/>
       <w:r>
         <w:rPr>
           <w:rFonts w:ascii="Montserrat" w:hAnsi="Montserrat"/>
@@ -4238,6 +4256,7 @@
           <w:color w:val="B91D2E"/>
           <w:sz w:val="27"/>
         </w:rPr>
+        <w:lastRenderedPageBreak/>
         <w:t>1.3 Como acessar e fazer login</w:t>
       </w:r>
       <w:bookmarkEnd w:id="3"/>
@@ -4269,18 +4288,17 @@
         <w:rPr>
           <w:noProof/>
         </w:rPr>
-        <w:lastRenderedPageBreak/>
         <w:drawing>
-          <wp:inline distT="0" distB="0" distL="0" distR="0" wp14:anchorId="09AAC3B3" wp14:editId="5539DF78">
+          <wp:inline distT="0" distB="0" distL="0" distR="0" wp14:anchorId="583D2379" wp14:editId="3E0CA4C1">
             <wp:extent cx="4206240" cy="3801227"/>
             <wp:effectExtent l="19050" t="19050" r="22860" b="27940"/>
-            <wp:docPr id="1972641334" name="Imagem 2"/>
+            <wp:docPr id="1097473605" name="Imagem 2"/>
             <wp:cNvGraphicFramePr/>
             <a:graphic xmlns:a="http://schemas.openxmlformats.org/drawingml/2006/main">
               <a:graphicData uri="http://schemas.openxmlformats.org/drawingml/2006/picture">
                 <pic:pic xmlns:pic="http://schemas.openxmlformats.org/drawingml/2006/picture">
                   <pic:nvPicPr>
-                    <pic:cNvPr id="1972641334" name=""/>
+                    <pic:cNvPr id="1097473605" name=""/>
                     <pic:cNvPicPr/>
                   </pic:nvPicPr>
                   <pic:blipFill>
@@ -4453,7 +4471,7 @@
           <w:sz w:val="27"/>
         </w:rPr>
       </w:pPr>
-      <w:bookmarkStart w:id="4" w:name="_Toc239253962"/>
+      <w:bookmarkStart w:id="4" w:name="_Toc239320770"/>
       <w:r>
         <w:rPr>
           <w:rFonts w:ascii="Montserrat" w:hAnsi="Montserrat"/>
@@ -4461,6 +4479,7 @@
           <w:color w:val="B91D2E"/>
           <w:sz w:val="27"/>
         </w:rPr>
+        <w:lastRenderedPageBreak/>
         <w:t>1.4 Como a ferramenta se relaciona com as Diretrizes (D01-D07)</w:t>
       </w:r>
       <w:bookmarkEnd w:id="4"/>
@@ -4535,7 +4554,6 @@
                 <w:color w:val="FFFFFF"/>
                 <w:sz w:val="19"/>
               </w:rPr>
-              <w:lastRenderedPageBreak/>
               <w:t>Passo</w:t>
             </w:r>
           </w:p>
@@ -5692,7 +5710,7 @@
           <w:sz w:val="34"/>
         </w:rPr>
       </w:pPr>
-      <w:bookmarkStart w:id="5" w:name="_Toc239253963"/>
+      <w:bookmarkStart w:id="5" w:name="_Toc239320771"/>
       <w:r>
         <w:rPr>
           <w:rFonts w:ascii="Montserrat" w:hAnsi="Montserrat"/>
@@ -5716,7 +5734,7 @@
           <w:sz w:val="27"/>
         </w:rPr>
       </w:pPr>
-      <w:bookmarkStart w:id="6" w:name="_Toc239253964"/>
+      <w:bookmarkStart w:id="6" w:name="_Toc239320772"/>
       <w:r>
         <w:rPr>
           <w:rFonts w:ascii="Montserrat" w:hAnsi="Montserrat"/>
@@ -5757,7 +5775,7 @@
           <w:sz w:val="27"/>
         </w:rPr>
       </w:pPr>
-      <w:bookmarkStart w:id="7" w:name="_Toc239253965"/>
+      <w:bookmarkStart w:id="7" w:name="_Toc239320773"/>
       <w:r>
         <w:rPr>
           <w:rFonts w:ascii="Montserrat" w:hAnsi="Montserrat"/>
@@ -5876,7 +5894,7 @@
           <w:sz w:val="27"/>
         </w:rPr>
       </w:pPr>
-      <w:bookmarkStart w:id="8" w:name="_Toc239253966"/>
+      <w:bookmarkStart w:id="8" w:name="_Toc239320774"/>
       <w:r>
         <w:rPr>
           <w:rFonts w:ascii="Montserrat" w:hAnsi="Montserrat"/>
@@ -6489,7 +6507,7 @@
           <w:sz w:val="27"/>
         </w:rPr>
       </w:pPr>
-      <w:bookmarkStart w:id="9" w:name="_Toc239253967"/>
+      <w:bookmarkStart w:id="9" w:name="_Toc239320775"/>
       <w:r>
         <w:rPr>
           <w:rFonts w:ascii="Montserrat" w:hAnsi="Montserrat"/>
@@ -6578,16 +6596,16 @@
         </w:rPr>
         <w:lastRenderedPageBreak/>
         <w:drawing>
-          <wp:inline distT="0" distB="0" distL="0" distR="0" wp14:anchorId="54B3FF4F" wp14:editId="423C9176">
+          <wp:inline distT="0" distB="0" distL="0" distR="0" wp14:anchorId="1ECC659B" wp14:editId="0B2F41AE">
             <wp:extent cx="4937760" cy="4462310"/>
             <wp:effectExtent l="19050" t="19050" r="15240" b="14605"/>
-            <wp:docPr id="461332337" name="Imagem 3"/>
+            <wp:docPr id="319118527" name="Imagem 3"/>
             <wp:cNvGraphicFramePr/>
             <a:graphic xmlns:a="http://schemas.openxmlformats.org/drawingml/2006/main">
               <a:graphicData uri="http://schemas.openxmlformats.org/drawingml/2006/picture">
                 <pic:pic xmlns:pic="http://schemas.openxmlformats.org/drawingml/2006/picture">
                   <pic:nvPicPr>
-                    <pic:cNvPr id="461332337" name=""/>
+                    <pic:cNvPr id="319118527" name=""/>
                     <pic:cNvPicPr/>
                   </pic:nvPicPr>
                   <pic:blipFill>
@@ -6655,7 +6673,7 @@
           <w:sz w:val="27"/>
         </w:rPr>
       </w:pPr>
-      <w:bookmarkStart w:id="10" w:name="_Toc239253968"/>
+      <w:bookmarkStart w:id="10" w:name="_Toc239320776"/>
       <w:r>
         <w:rPr>
           <w:rFonts w:ascii="Montserrat" w:hAnsi="Montserrat"/>
@@ -6696,16 +6714,16 @@
         </w:rPr>
         <w:lastRenderedPageBreak/>
         <w:drawing>
-          <wp:inline distT="0" distB="0" distL="0" distR="0" wp14:anchorId="308A4DA8" wp14:editId="3BBADD0B">
+          <wp:inline distT="0" distB="0" distL="0" distR="0" wp14:anchorId="40481262" wp14:editId="418E5848">
             <wp:extent cx="5120640" cy="4627581"/>
             <wp:effectExtent l="19050" t="19050" r="22860" b="20955"/>
-            <wp:docPr id="1835549698" name="Imagem 4"/>
+            <wp:docPr id="932943175" name="Imagem 4"/>
             <wp:cNvGraphicFramePr/>
             <a:graphic xmlns:a="http://schemas.openxmlformats.org/drawingml/2006/main">
               <a:graphicData uri="http://schemas.openxmlformats.org/drawingml/2006/picture">
                 <pic:pic xmlns:pic="http://schemas.openxmlformats.org/drawingml/2006/picture">
                   <pic:nvPicPr>
-                    <pic:cNvPr id="1835549698" name=""/>
+                    <pic:cNvPr id="932943175" name=""/>
                     <pic:cNvPicPr/>
                   </pic:nvPicPr>
                   <pic:blipFill>
@@ -6873,7 +6891,7 @@
           <w:sz w:val="27"/>
         </w:rPr>
       </w:pPr>
-      <w:bookmarkStart w:id="11" w:name="_Toc239253969"/>
+      <w:bookmarkStart w:id="11" w:name="_Toc239320777"/>
       <w:r>
         <w:rPr>
           <w:rFonts w:ascii="Montserrat" w:hAnsi="Montserrat"/>
@@ -6913,16 +6931,16 @@
           <w:noProof/>
         </w:rPr>
         <w:drawing>
-          <wp:inline distT="0" distB="0" distL="0" distR="0" wp14:anchorId="4C0526B4" wp14:editId="7D8E3FFE">
+          <wp:inline distT="0" distB="0" distL="0" distR="0" wp14:anchorId="59886475" wp14:editId="5958C865">
             <wp:extent cx="4206240" cy="3801227"/>
             <wp:effectExtent l="19050" t="19050" r="22860" b="27940"/>
-            <wp:docPr id="846247722" name="Imagem 5"/>
+            <wp:docPr id="1703507762" name="Imagem 5"/>
             <wp:cNvGraphicFramePr/>
             <a:graphic xmlns:a="http://schemas.openxmlformats.org/drawingml/2006/main">
               <a:graphicData uri="http://schemas.openxmlformats.org/drawingml/2006/picture">
                 <pic:pic xmlns:pic="http://schemas.openxmlformats.org/drawingml/2006/picture">
                   <pic:nvPicPr>
-                    <pic:cNvPr id="846247722" name=""/>
+                    <pic:cNvPr id="1703507762" name=""/>
                     <pic:cNvPicPr/>
                   </pic:nvPicPr>
                   <pic:blipFill>
@@ -6990,16 +7008,16 @@
         </w:rPr>
         <w:lastRenderedPageBreak/>
         <w:drawing>
-          <wp:inline distT="0" distB="0" distL="0" distR="0" wp14:anchorId="2F2AC2A5" wp14:editId="084C98CA">
+          <wp:inline distT="0" distB="0" distL="0" distR="0" wp14:anchorId="44446558" wp14:editId="42C34C74">
             <wp:extent cx="4206240" cy="3801227"/>
             <wp:effectExtent l="19050" t="19050" r="22860" b="27940"/>
-            <wp:docPr id="870625429" name="Imagem 6"/>
+            <wp:docPr id="1787872774" name="Imagem 6"/>
             <wp:cNvGraphicFramePr/>
             <a:graphic xmlns:a="http://schemas.openxmlformats.org/drawingml/2006/main">
               <a:graphicData uri="http://schemas.openxmlformats.org/drawingml/2006/picture">
                 <pic:pic xmlns:pic="http://schemas.openxmlformats.org/drawingml/2006/picture">
                   <pic:nvPicPr>
-                    <pic:cNvPr id="870625429" name=""/>
+                    <pic:cNvPr id="1787872774" name=""/>
                     <pic:cNvPicPr/>
                   </pic:nvPicPr>
                   <pic:blipFill>
@@ -7115,7 +7133,7 @@
           <w:sz w:val="27"/>
         </w:rPr>
       </w:pPr>
-      <w:bookmarkStart w:id="12" w:name="_Toc239253970"/>
+      <w:bookmarkStart w:id="12" w:name="_Toc239320778"/>
       <w:r>
         <w:rPr>
           <w:rFonts w:ascii="Montserrat" w:hAnsi="Montserrat"/>
@@ -7183,7 +7201,7 @@
           <w:sz w:val="27"/>
         </w:rPr>
       </w:pPr>
-      <w:bookmarkStart w:id="13" w:name="_Toc239253971"/>
+      <w:bookmarkStart w:id="13" w:name="_Toc239320779"/>
       <w:r>
         <w:rPr>
           <w:rFonts w:ascii="Montserrat" w:hAnsi="Montserrat"/>
@@ -7410,7 +7428,7 @@
           <w:sz w:val="27"/>
         </w:rPr>
       </w:pPr>
-      <w:bookmarkStart w:id="14" w:name="_Toc239253972"/>
+      <w:bookmarkStart w:id="14" w:name="_Toc239320780"/>
       <w:r>
         <w:rPr>
           <w:rFonts w:ascii="Montserrat" w:hAnsi="Montserrat"/>
@@ -7569,7 +7587,7 @@
           <w:sz w:val="27"/>
         </w:rPr>
       </w:pPr>
-      <w:bookmarkStart w:id="15" w:name="_Toc239253973"/>
+      <w:bookmarkStart w:id="15" w:name="_Toc239320781"/>
       <w:r>
         <w:rPr>
           <w:rFonts w:ascii="Montserrat" w:hAnsi="Montserrat"/>
@@ -7761,7 +7779,7 @@
           <w:sz w:val="27"/>
         </w:rPr>
       </w:pPr>
-      <w:bookmarkStart w:id="16" w:name="_Toc239253974"/>
+      <w:bookmarkStart w:id="16" w:name="_Toc239320782"/>
       <w:r>
         <w:rPr>
           <w:rFonts w:ascii="Montserrat" w:hAnsi="Montserrat"/>
@@ -7889,7 +7907,7 @@
           <w:sz w:val="27"/>
         </w:rPr>
       </w:pPr>
-      <w:bookmarkStart w:id="17" w:name="_Toc239253975"/>
+      <w:bookmarkStart w:id="17" w:name="_Toc239320783"/>
       <w:r>
         <w:rPr>
           <w:rFonts w:ascii="Montserrat" w:hAnsi="Montserrat"/>
@@ -7938,12 +7956,14 @@
         <w:spacing w:after="80" w:line="260" w:lineRule="auto"/>
         <w:ind w:left="700"/>
         <w:rPr>
-          <w:color w:val="1A1A1A"/>
-          <w:sz w:val="22"/>
-        </w:rPr>
-      </w:pPr>
-      <w:r>
-        <w:rPr>
+          <w:rFonts w:ascii="Montserrat" w:hAnsi="Montserrat"/>
+          <w:color w:val="1A1A1A"/>
+          <w:sz w:val="22"/>
+        </w:rPr>
+      </w:pPr>
+      <w:r>
+        <w:rPr>
+          <w:rFonts w:ascii="Montserrat" w:hAnsi="Montserrat"/>
           <w:color w:val="1A1A1A"/>
           <w:sz w:val="22"/>
         </w:rPr>
@@ -8217,7 +8237,7 @@
           <w:sz w:val="27"/>
         </w:rPr>
       </w:pPr>
-      <w:bookmarkStart w:id="18" w:name="_Toc239253976"/>
+      <w:bookmarkStart w:id="18" w:name="_Toc239320784"/>
       <w:r>
         <w:rPr>
           <w:rFonts w:ascii="Montserrat" w:hAnsi="Montserrat"/>
@@ -8358,7 +8378,7 @@
           <w:sz w:val="34"/>
         </w:rPr>
       </w:pPr>
-      <w:bookmarkStart w:id="19" w:name="_Toc239253977"/>
+      <w:bookmarkStart w:id="19" w:name="_Toc239320785"/>
       <w:r>
         <w:rPr>
           <w:rFonts w:ascii="Montserrat" w:hAnsi="Montserrat"/>
@@ -8400,7 +8420,7 @@
           <w:sz w:val="27"/>
         </w:rPr>
       </w:pPr>
-      <w:bookmarkStart w:id="20" w:name="_Toc239253978"/>
+      <w:bookmarkStart w:id="20" w:name="_Toc239320786"/>
       <w:r>
         <w:rPr>
           <w:rFonts w:ascii="Montserrat" w:hAnsi="Montserrat"/>
@@ -9480,16 +9500,16 @@
         </w:rPr>
         <w:lastRenderedPageBreak/>
         <w:drawing>
-          <wp:inline distT="0" distB="0" distL="0" distR="0" wp14:anchorId="60DCF48D" wp14:editId="76CC6940">
+          <wp:inline distT="0" distB="0" distL="0" distR="0" wp14:anchorId="0E7A21FB" wp14:editId="73A07AD7">
             <wp:extent cx="5120640" cy="4627581"/>
             <wp:effectExtent l="19050" t="19050" r="22860" b="20955"/>
-            <wp:docPr id="1344747972" name="Imagem 7"/>
+            <wp:docPr id="1500728780" name="Imagem 7"/>
             <wp:cNvGraphicFramePr/>
             <a:graphic xmlns:a="http://schemas.openxmlformats.org/drawingml/2006/main">
               <a:graphicData uri="http://schemas.openxmlformats.org/drawingml/2006/picture">
                 <pic:pic xmlns:pic="http://schemas.openxmlformats.org/drawingml/2006/picture">
                   <pic:nvPicPr>
-                    <pic:cNvPr id="1344747972" name=""/>
+                    <pic:cNvPr id="1500728780" name=""/>
                     <pic:cNvPicPr/>
                   </pic:nvPicPr>
                   <pic:blipFill>
@@ -9557,16 +9577,16 @@
         </w:rPr>
         <w:lastRenderedPageBreak/>
         <w:drawing>
-          <wp:inline distT="0" distB="0" distL="0" distR="0" wp14:anchorId="500100C4" wp14:editId="6C82B78D">
+          <wp:inline distT="0" distB="0" distL="0" distR="0" wp14:anchorId="0E162A52" wp14:editId="08B10736">
             <wp:extent cx="5120640" cy="4627581"/>
             <wp:effectExtent l="19050" t="19050" r="22860" b="20955"/>
-            <wp:docPr id="1771663108" name="Imagem 8"/>
+            <wp:docPr id="1292551292" name="Imagem 8"/>
             <wp:cNvGraphicFramePr/>
             <a:graphic xmlns:a="http://schemas.openxmlformats.org/drawingml/2006/main">
               <a:graphicData uri="http://schemas.openxmlformats.org/drawingml/2006/picture">
                 <pic:pic xmlns:pic="http://schemas.openxmlformats.org/drawingml/2006/picture">
                   <pic:nvPicPr>
-                    <pic:cNvPr id="1771663108" name=""/>
+                    <pic:cNvPr id="1292551292" name=""/>
                     <pic:cNvPicPr/>
                   </pic:nvPicPr>
                   <pic:blipFill>
@@ -9774,7 +9794,7 @@
           <w:sz w:val="27"/>
         </w:rPr>
       </w:pPr>
-      <w:bookmarkStart w:id="21" w:name="_Toc239253979"/>
+      <w:bookmarkStart w:id="21" w:name="_Toc239320787"/>
       <w:r>
         <w:rPr>
           <w:rFonts w:ascii="Montserrat" w:hAnsi="Montserrat"/>
@@ -10700,16 +10720,16 @@
         </w:rPr>
         <w:lastRenderedPageBreak/>
         <w:drawing>
-          <wp:inline distT="0" distB="0" distL="0" distR="0" wp14:anchorId="240FC7BA" wp14:editId="58AC0AD3">
+          <wp:inline distT="0" distB="0" distL="0" distR="0" wp14:anchorId="13814B0B" wp14:editId="67FD2B72">
             <wp:extent cx="5120640" cy="4627581"/>
             <wp:effectExtent l="19050" t="19050" r="22860" b="20955"/>
-            <wp:docPr id="894063419" name="Imagem 9"/>
+            <wp:docPr id="1814146263" name="Imagem 9"/>
             <wp:cNvGraphicFramePr/>
             <a:graphic xmlns:a="http://schemas.openxmlformats.org/drawingml/2006/main">
               <a:graphicData uri="http://schemas.openxmlformats.org/drawingml/2006/picture">
                 <pic:pic xmlns:pic="http://schemas.openxmlformats.org/drawingml/2006/picture">
                   <pic:nvPicPr>
-                    <pic:cNvPr id="894063419" name=""/>
+                    <pic:cNvPr id="1814146263" name=""/>
                     <pic:cNvPicPr/>
                   </pic:nvPicPr>
                   <pic:blipFill>
@@ -10777,16 +10797,16 @@
         </w:rPr>
         <w:lastRenderedPageBreak/>
         <w:drawing>
-          <wp:inline distT="0" distB="0" distL="0" distR="0" wp14:anchorId="617A552D" wp14:editId="211AFF99">
+          <wp:inline distT="0" distB="0" distL="0" distR="0" wp14:anchorId="5A3F4B82" wp14:editId="1301B3E1">
             <wp:extent cx="5120640" cy="4627581"/>
             <wp:effectExtent l="19050" t="19050" r="22860" b="20955"/>
-            <wp:docPr id="832383562" name="Imagem 10"/>
+            <wp:docPr id="1901915263" name="Imagem 10"/>
             <wp:cNvGraphicFramePr/>
             <a:graphic xmlns:a="http://schemas.openxmlformats.org/drawingml/2006/main">
               <a:graphicData uri="http://schemas.openxmlformats.org/drawingml/2006/picture">
                 <pic:pic xmlns:pic="http://schemas.openxmlformats.org/drawingml/2006/picture">
                   <pic:nvPicPr>
-                    <pic:cNvPr id="832383562" name=""/>
+                    <pic:cNvPr id="1901915263" name=""/>
                     <pic:cNvPicPr/>
                   </pic:nvPicPr>
                   <pic:blipFill>
@@ -10920,7 +10940,7 @@
           <w:sz w:val="27"/>
         </w:rPr>
       </w:pPr>
-      <w:bookmarkStart w:id="22" w:name="_Toc239253980"/>
+      <w:bookmarkStart w:id="22" w:name="_Toc239320788"/>
       <w:r>
         <w:rPr>
           <w:rFonts w:ascii="Montserrat" w:hAnsi="Montserrat"/>
@@ -11976,16 +11996,16 @@
           <w:noProof/>
         </w:rPr>
         <w:drawing>
-          <wp:inline distT="0" distB="0" distL="0" distR="0" wp14:anchorId="2D135FCE" wp14:editId="48B4BC56">
+          <wp:inline distT="0" distB="0" distL="0" distR="0" wp14:anchorId="210E2482" wp14:editId="767D9258">
             <wp:extent cx="5120640" cy="3282818"/>
             <wp:effectExtent l="19050" t="19050" r="22860" b="13335"/>
-            <wp:docPr id="1553707525" name="Imagem 11"/>
+            <wp:docPr id="667105246" name="Imagem 11"/>
             <wp:cNvGraphicFramePr/>
             <a:graphic xmlns:a="http://schemas.openxmlformats.org/drawingml/2006/main">
               <a:graphicData uri="http://schemas.openxmlformats.org/drawingml/2006/picture">
                 <pic:pic xmlns:pic="http://schemas.openxmlformats.org/drawingml/2006/picture">
                   <pic:nvPicPr>
-                    <pic:cNvPr id="1553707525" name=""/>
+                    <pic:cNvPr id="667105246" name=""/>
                     <pic:cNvPicPr/>
                   </pic:nvPicPr>
                   <pic:blipFill>
@@ -12053,16 +12073,16 @@
         </w:rPr>
         <w:lastRenderedPageBreak/>
         <w:drawing>
-          <wp:inline distT="0" distB="0" distL="0" distR="0" wp14:anchorId="179B29A2" wp14:editId="477D1F83">
+          <wp:inline distT="0" distB="0" distL="0" distR="0" wp14:anchorId="601904A6" wp14:editId="1E15379B">
             <wp:extent cx="5120640" cy="4627581"/>
             <wp:effectExtent l="19050" t="19050" r="22860" b="20955"/>
-            <wp:docPr id="592723166" name="Imagem 12"/>
+            <wp:docPr id="2100668784" name="Imagem 12"/>
             <wp:cNvGraphicFramePr/>
             <a:graphic xmlns:a="http://schemas.openxmlformats.org/drawingml/2006/main">
               <a:graphicData uri="http://schemas.openxmlformats.org/drawingml/2006/picture">
                 <pic:pic xmlns:pic="http://schemas.openxmlformats.org/drawingml/2006/picture">
                   <pic:nvPicPr>
-                    <pic:cNvPr id="592723166" name=""/>
+                    <pic:cNvPr id="2100668784" name=""/>
                     <pic:cNvPicPr/>
                   </pic:nvPicPr>
                   <pic:blipFill>
@@ -12196,7 +12216,7 @@
           <w:sz w:val="27"/>
         </w:rPr>
       </w:pPr>
-      <w:bookmarkStart w:id="23" w:name="_Toc239253981"/>
+      <w:bookmarkStart w:id="23" w:name="_Toc239320789"/>
       <w:r>
         <w:rPr>
           <w:rFonts w:ascii="Montserrat" w:hAnsi="Montserrat"/>
@@ -12758,16 +12778,16 @@
         </w:rPr>
         <w:lastRenderedPageBreak/>
         <w:drawing>
-          <wp:inline distT="0" distB="0" distL="0" distR="0" wp14:anchorId="7257772A" wp14:editId="1EFD32CE">
+          <wp:inline distT="0" distB="0" distL="0" distR="0" wp14:anchorId="1AF21012" wp14:editId="51A57672">
             <wp:extent cx="5120640" cy="4627581"/>
             <wp:effectExtent l="19050" t="19050" r="22860" b="20955"/>
-            <wp:docPr id="2107008908" name="Imagem 13"/>
+            <wp:docPr id="1557739730" name="Imagem 13"/>
             <wp:cNvGraphicFramePr/>
             <a:graphic xmlns:a="http://schemas.openxmlformats.org/drawingml/2006/main">
               <a:graphicData uri="http://schemas.openxmlformats.org/drawingml/2006/picture">
                 <pic:pic xmlns:pic="http://schemas.openxmlformats.org/drawingml/2006/picture">
                   <pic:nvPicPr>
-                    <pic:cNvPr id="2107008908" name=""/>
+                    <pic:cNvPr id="1557739730" name=""/>
                     <pic:cNvPicPr/>
                   </pic:nvPicPr>
                   <pic:blipFill>
@@ -12835,16 +12855,16 @@
         </w:rPr>
         <w:lastRenderedPageBreak/>
         <w:drawing>
-          <wp:inline distT="0" distB="0" distL="0" distR="0" wp14:anchorId="24081F73" wp14:editId="2D41331C">
+          <wp:inline distT="0" distB="0" distL="0" distR="0" wp14:anchorId="4DE6A535" wp14:editId="3B23CC2F">
             <wp:extent cx="5120640" cy="4627581"/>
             <wp:effectExtent l="19050" t="19050" r="22860" b="20955"/>
-            <wp:docPr id="1088602963" name="Imagem 14"/>
+            <wp:docPr id="182594798" name="Imagem 14"/>
             <wp:cNvGraphicFramePr/>
             <a:graphic xmlns:a="http://schemas.openxmlformats.org/drawingml/2006/main">
               <a:graphicData uri="http://schemas.openxmlformats.org/drawingml/2006/picture">
                 <pic:pic xmlns:pic="http://schemas.openxmlformats.org/drawingml/2006/picture">
                   <pic:nvPicPr>
-                    <pic:cNvPr id="1088602963" name=""/>
+                    <pic:cNvPr id="182594798" name=""/>
                     <pic:cNvPicPr/>
                   </pic:nvPicPr>
                   <pic:blipFill>
@@ -12978,7 +12998,7 @@
           <w:sz w:val="27"/>
         </w:rPr>
       </w:pPr>
-      <w:bookmarkStart w:id="24" w:name="_Toc239253982"/>
+      <w:bookmarkStart w:id="24" w:name="_Toc239320790"/>
       <w:r>
         <w:rPr>
           <w:rFonts w:ascii="Montserrat" w:hAnsi="Montserrat"/>
@@ -13019,16 +13039,16 @@
           <w:noProof/>
         </w:rPr>
         <w:drawing>
-          <wp:inline distT="0" distB="0" distL="0" distR="0" wp14:anchorId="3228AD5C" wp14:editId="3C6453CE">
+          <wp:inline distT="0" distB="0" distL="0" distR="0" wp14:anchorId="5A43D55A" wp14:editId="3D635882">
             <wp:extent cx="5120640" cy="4627581"/>
             <wp:effectExtent l="19050" t="19050" r="22860" b="20955"/>
-            <wp:docPr id="1701509819" name="Imagem 15"/>
+            <wp:docPr id="85880191" name="Imagem 15"/>
             <wp:cNvGraphicFramePr/>
             <a:graphic xmlns:a="http://schemas.openxmlformats.org/drawingml/2006/main">
               <a:graphicData uri="http://schemas.openxmlformats.org/drawingml/2006/picture">
                 <pic:pic xmlns:pic="http://schemas.openxmlformats.org/drawingml/2006/picture">
                   <pic:nvPicPr>
-                    <pic:cNvPr id="1701509819" name=""/>
+                    <pic:cNvPr id="85880191" name=""/>
                     <pic:cNvPicPr/>
                   </pic:nvPicPr>
                   <pic:blipFill>
@@ -13096,16 +13116,16 @@
         </w:rPr>
         <w:lastRenderedPageBreak/>
         <w:drawing>
-          <wp:inline distT="0" distB="0" distL="0" distR="0" wp14:anchorId="719F66B4" wp14:editId="75A669E4">
+          <wp:inline distT="0" distB="0" distL="0" distR="0" wp14:anchorId="312A34EF" wp14:editId="432621B9">
             <wp:extent cx="5120640" cy="4627581"/>
             <wp:effectExtent l="19050" t="19050" r="22860" b="20955"/>
-            <wp:docPr id="1439614163" name="Imagem 16"/>
+            <wp:docPr id="29637826" name="Imagem 16"/>
             <wp:cNvGraphicFramePr/>
             <a:graphic xmlns:a="http://schemas.openxmlformats.org/drawingml/2006/main">
               <a:graphicData uri="http://schemas.openxmlformats.org/drawingml/2006/picture">
                 <pic:pic xmlns:pic="http://schemas.openxmlformats.org/drawingml/2006/picture">
                   <pic:nvPicPr>
-                    <pic:cNvPr id="1439614163" name=""/>
+                    <pic:cNvPr id="29637826" name=""/>
                     <pic:cNvPicPr/>
                   </pic:nvPicPr>
                   <pic:blipFill>
@@ -13269,16 +13289,16 @@
         </w:rPr>
         <w:lastRenderedPageBreak/>
         <w:drawing>
-          <wp:inline distT="0" distB="0" distL="0" distR="0" wp14:anchorId="58A3FC61" wp14:editId="216B3CBC">
+          <wp:inline distT="0" distB="0" distL="0" distR="0" wp14:anchorId="5B8F42E2" wp14:editId="1728CFD3">
             <wp:extent cx="5120640" cy="3282818"/>
             <wp:effectExtent l="19050" t="19050" r="22860" b="13335"/>
-            <wp:docPr id="1829284717" name="Imagem 17"/>
+            <wp:docPr id="1738485440" name="Imagem 17"/>
             <wp:cNvGraphicFramePr/>
             <a:graphic xmlns:a="http://schemas.openxmlformats.org/drawingml/2006/main">
               <a:graphicData uri="http://schemas.openxmlformats.org/drawingml/2006/picture">
                 <pic:pic xmlns:pic="http://schemas.openxmlformats.org/drawingml/2006/picture">
                   <pic:nvPicPr>
-                    <pic:cNvPr id="1829284717" name=""/>
+                    <pic:cNvPr id="1738485440" name=""/>
                     <pic:cNvPicPr/>
                   </pic:nvPicPr>
                   <pic:blipFill>
@@ -13412,7 +13432,7 @@
           <w:sz w:val="27"/>
         </w:rPr>
       </w:pPr>
-      <w:bookmarkStart w:id="25" w:name="_Toc239253983"/>
+      <w:bookmarkStart w:id="25" w:name="_Toc239320791"/>
       <w:r>
         <w:rPr>
           <w:rFonts w:ascii="Montserrat" w:hAnsi="Montserrat"/>
@@ -13453,16 +13473,16 @@
         </w:rPr>
         <w:lastRenderedPageBreak/>
         <w:drawing>
-          <wp:inline distT="0" distB="0" distL="0" distR="0" wp14:anchorId="5AC4E991" wp14:editId="3B46B94E">
+          <wp:inline distT="0" distB="0" distL="0" distR="0" wp14:anchorId="7702CD41" wp14:editId="4494ABD6">
             <wp:extent cx="5120640" cy="4627581"/>
             <wp:effectExtent l="19050" t="19050" r="22860" b="20955"/>
-            <wp:docPr id="1662322128" name="Imagem 18"/>
+            <wp:docPr id="1190874562" name="Imagem 18"/>
             <wp:cNvGraphicFramePr/>
             <a:graphic xmlns:a="http://schemas.openxmlformats.org/drawingml/2006/main">
               <a:graphicData uri="http://schemas.openxmlformats.org/drawingml/2006/picture">
                 <pic:pic xmlns:pic="http://schemas.openxmlformats.org/drawingml/2006/picture">
                   <pic:nvPicPr>
-                    <pic:cNvPr id="1662322128" name=""/>
+                    <pic:cNvPr id="1190874562" name=""/>
                     <pic:cNvPicPr/>
                   </pic:nvPicPr>
                   <pic:blipFill>
@@ -13530,16 +13550,16 @@
         </w:rPr>
         <w:lastRenderedPageBreak/>
         <w:drawing>
-          <wp:inline distT="0" distB="0" distL="0" distR="0" wp14:anchorId="710C7FB4" wp14:editId="42C20744">
+          <wp:inline distT="0" distB="0" distL="0" distR="0" wp14:anchorId="4E29EB9A" wp14:editId="7DC7D0A3">
             <wp:extent cx="5120640" cy="4627581"/>
             <wp:effectExtent l="19050" t="19050" r="22860" b="20955"/>
-            <wp:docPr id="302295589" name="Imagem 19"/>
+            <wp:docPr id="2059940236" name="Imagem 19"/>
             <wp:cNvGraphicFramePr/>
             <a:graphic xmlns:a="http://schemas.openxmlformats.org/drawingml/2006/main">
               <a:graphicData uri="http://schemas.openxmlformats.org/drawingml/2006/picture">
                 <pic:pic xmlns:pic="http://schemas.openxmlformats.org/drawingml/2006/picture">
                   <pic:nvPicPr>
-                    <pic:cNvPr id="302295589" name=""/>
+                    <pic:cNvPr id="2059940236" name=""/>
                     <pic:cNvPicPr/>
                   </pic:nvPicPr>
                   <pic:blipFill>
@@ -13722,7 +13742,7 @@
           <w:sz w:val="27"/>
         </w:rPr>
       </w:pPr>
-      <w:bookmarkStart w:id="26" w:name="_Toc239253984"/>
+      <w:bookmarkStart w:id="26" w:name="_Toc239320792"/>
       <w:r>
         <w:rPr>
           <w:rFonts w:ascii="Montserrat" w:hAnsi="Montserrat"/>
@@ -13762,16 +13782,16 @@
           <w:noProof/>
         </w:rPr>
         <w:drawing>
-          <wp:inline distT="0" distB="0" distL="0" distR="0" wp14:anchorId="05A9A9B7" wp14:editId="401CFF76">
+          <wp:inline distT="0" distB="0" distL="0" distR="0" wp14:anchorId="10330B99" wp14:editId="3D53F866">
             <wp:extent cx="5120640" cy="4627581"/>
             <wp:effectExtent l="19050" t="19050" r="22860" b="20955"/>
-            <wp:docPr id="1486435993" name="Imagem 20"/>
+            <wp:docPr id="1255858406" name="Imagem 20"/>
             <wp:cNvGraphicFramePr/>
             <a:graphic xmlns:a="http://schemas.openxmlformats.org/drawingml/2006/main">
               <a:graphicData uri="http://schemas.openxmlformats.org/drawingml/2006/picture">
                 <pic:pic xmlns:pic="http://schemas.openxmlformats.org/drawingml/2006/picture">
                   <pic:nvPicPr>
-                    <pic:cNvPr id="1486435993" name=""/>
+                    <pic:cNvPr id="1255858406" name=""/>
                     <pic:cNvPicPr/>
                   </pic:nvPicPr>
                   <pic:blipFill>
@@ -13839,16 +13859,16 @@
         </w:rPr>
         <w:lastRenderedPageBreak/>
         <w:drawing>
-          <wp:inline distT="0" distB="0" distL="0" distR="0" wp14:anchorId="334B00B3" wp14:editId="64ABA656">
+          <wp:inline distT="0" distB="0" distL="0" distR="0" wp14:anchorId="1BAA92EF" wp14:editId="4F97A2CB">
             <wp:extent cx="5120640" cy="4627581"/>
             <wp:effectExtent l="19050" t="19050" r="22860" b="20955"/>
-            <wp:docPr id="1740564297" name="Imagem 21"/>
+            <wp:docPr id="1545648003" name="Imagem 21"/>
             <wp:cNvGraphicFramePr/>
             <a:graphic xmlns:a="http://schemas.openxmlformats.org/drawingml/2006/main">
               <a:graphicData uri="http://schemas.openxmlformats.org/drawingml/2006/picture">
                 <pic:pic xmlns:pic="http://schemas.openxmlformats.org/drawingml/2006/picture">
                   <pic:nvPicPr>
-                    <pic:cNvPr id="1740564297" name=""/>
+                    <pic:cNvPr id="1545648003" name=""/>
                     <pic:cNvPicPr/>
                   </pic:nvPicPr>
                   <pic:blipFill>
@@ -14076,7 +14096,7 @@
           <w:sz w:val="27"/>
         </w:rPr>
       </w:pPr>
-      <w:bookmarkStart w:id="27" w:name="_Toc239253985"/>
+      <w:bookmarkStart w:id="27" w:name="_Toc239320793"/>
       <w:r>
         <w:rPr>
           <w:rFonts w:ascii="Montserrat" w:hAnsi="Montserrat"/>
@@ -14117,16 +14137,16 @@
         </w:rPr>
         <w:lastRenderedPageBreak/>
         <w:drawing>
-          <wp:inline distT="0" distB="0" distL="0" distR="0" wp14:anchorId="7DDEAEA2" wp14:editId="134176BA">
+          <wp:inline distT="0" distB="0" distL="0" distR="0" wp14:anchorId="12638BFE" wp14:editId="5CABF737">
             <wp:extent cx="5120640" cy="4627581"/>
             <wp:effectExtent l="19050" t="19050" r="22860" b="20955"/>
-            <wp:docPr id="1138552284" name="Imagem 22"/>
+            <wp:docPr id="2064613589" name="Imagem 22"/>
             <wp:cNvGraphicFramePr/>
             <a:graphic xmlns:a="http://schemas.openxmlformats.org/drawingml/2006/main">
               <a:graphicData uri="http://schemas.openxmlformats.org/drawingml/2006/picture">
                 <pic:pic xmlns:pic="http://schemas.openxmlformats.org/drawingml/2006/picture">
                   <pic:nvPicPr>
-                    <pic:cNvPr id="1138552284" name=""/>
+                    <pic:cNvPr id="2064613589" name=""/>
                     <pic:cNvPicPr/>
                   </pic:nvPicPr>
                   <pic:blipFill>
@@ -14194,16 +14214,16 @@
         </w:rPr>
         <w:lastRenderedPageBreak/>
         <w:drawing>
-          <wp:inline distT="0" distB="0" distL="0" distR="0" wp14:anchorId="792BB93E" wp14:editId="1D1476BF">
+          <wp:inline distT="0" distB="0" distL="0" distR="0" wp14:anchorId="193FB4CA" wp14:editId="5A767898">
             <wp:extent cx="5120640" cy="4627581"/>
             <wp:effectExtent l="19050" t="19050" r="22860" b="20955"/>
-            <wp:docPr id="154391526" name="Imagem 23"/>
+            <wp:docPr id="746817490" name="Imagem 23"/>
             <wp:cNvGraphicFramePr/>
             <a:graphic xmlns:a="http://schemas.openxmlformats.org/drawingml/2006/main">
               <a:graphicData uri="http://schemas.openxmlformats.org/drawingml/2006/picture">
                 <pic:pic xmlns:pic="http://schemas.openxmlformats.org/drawingml/2006/picture">
                   <pic:nvPicPr>
-                    <pic:cNvPr id="154391526" name=""/>
+                    <pic:cNvPr id="746817490" name=""/>
                     <pic:cNvPicPr/>
                   </pic:nvPicPr>
                   <pic:blipFill>
@@ -14440,7 +14460,7 @@
           <w:sz w:val="27"/>
         </w:rPr>
       </w:pPr>
-      <w:bookmarkStart w:id="28" w:name="_Toc239253986"/>
+      <w:bookmarkStart w:id="28" w:name="_Toc239320794"/>
       <w:r>
         <w:rPr>
           <w:rFonts w:ascii="Montserrat" w:hAnsi="Montserrat"/>
@@ -14480,16 +14500,16 @@
           <w:noProof/>
         </w:rPr>
         <w:drawing>
-          <wp:inline distT="0" distB="0" distL="0" distR="0" wp14:anchorId="0E09C075" wp14:editId="5BFFD54C">
+          <wp:inline distT="0" distB="0" distL="0" distR="0" wp14:anchorId="2AE63F73" wp14:editId="038D79B9">
             <wp:extent cx="5120640" cy="4627581"/>
             <wp:effectExtent l="19050" t="19050" r="22860" b="20955"/>
-            <wp:docPr id="288339764" name="Imagem 24"/>
+            <wp:docPr id="1860080890" name="Imagem 24"/>
             <wp:cNvGraphicFramePr/>
             <a:graphic xmlns:a="http://schemas.openxmlformats.org/drawingml/2006/main">
               <a:graphicData uri="http://schemas.openxmlformats.org/drawingml/2006/picture">
                 <pic:pic xmlns:pic="http://schemas.openxmlformats.org/drawingml/2006/picture">
                   <pic:nvPicPr>
-                    <pic:cNvPr id="288339764" name=""/>
+                    <pic:cNvPr id="1860080890" name=""/>
                     <pic:cNvPicPr/>
                   </pic:nvPicPr>
                   <pic:blipFill>
@@ -14557,16 +14577,16 @@
         </w:rPr>
         <w:lastRenderedPageBreak/>
         <w:drawing>
-          <wp:inline distT="0" distB="0" distL="0" distR="0" wp14:anchorId="302FAD81" wp14:editId="0D3BF0DE">
+          <wp:inline distT="0" distB="0" distL="0" distR="0" wp14:anchorId="4899FCD3" wp14:editId="501469EB">
             <wp:extent cx="5120640" cy="4627581"/>
             <wp:effectExtent l="19050" t="19050" r="22860" b="20955"/>
-            <wp:docPr id="2003309070" name="Imagem 25"/>
+            <wp:docPr id="1799548190" name="Imagem 25"/>
             <wp:cNvGraphicFramePr/>
             <a:graphic xmlns:a="http://schemas.openxmlformats.org/drawingml/2006/main">
               <a:graphicData uri="http://schemas.openxmlformats.org/drawingml/2006/picture">
                 <pic:pic xmlns:pic="http://schemas.openxmlformats.org/drawingml/2006/picture">
                   <pic:nvPicPr>
-                    <pic:cNvPr id="2003309070" name=""/>
+                    <pic:cNvPr id="1799548190" name=""/>
                     <pic:cNvPicPr/>
                   </pic:nvPicPr>
                   <pic:blipFill>
@@ -14757,7 +14777,7 @@
           <w:sz w:val="27"/>
         </w:rPr>
       </w:pPr>
-      <w:bookmarkStart w:id="29" w:name="_Toc239253987"/>
+      <w:bookmarkStart w:id="29" w:name="_Toc239320795"/>
       <w:r>
         <w:rPr>
           <w:rFonts w:ascii="Montserrat" w:hAnsi="Montserrat"/>
@@ -14797,16 +14817,16 @@
           <w:noProof/>
         </w:rPr>
         <w:drawing>
-          <wp:inline distT="0" distB="0" distL="0" distR="0" wp14:anchorId="389013BD" wp14:editId="735468FD">
+          <wp:inline distT="0" distB="0" distL="0" distR="0" wp14:anchorId="240AEA65" wp14:editId="0C520CD7">
             <wp:extent cx="5120640" cy="4000682"/>
             <wp:effectExtent l="19050" t="19050" r="22860" b="19050"/>
-            <wp:docPr id="706078724" name="Imagem 26"/>
+            <wp:docPr id="1741859472" name="Imagem 26"/>
             <wp:cNvGraphicFramePr/>
             <a:graphic xmlns:a="http://schemas.openxmlformats.org/drawingml/2006/main">
               <a:graphicData uri="http://schemas.openxmlformats.org/drawingml/2006/picture">
                 <pic:pic xmlns:pic="http://schemas.openxmlformats.org/drawingml/2006/picture">
                   <pic:nvPicPr>
-                    <pic:cNvPr id="706078724" name=""/>
+                    <pic:cNvPr id="1741859472" name=""/>
                     <pic:cNvPicPr/>
                   </pic:nvPicPr>
                   <pic:blipFill>
@@ -15330,7 +15350,7 @@
           <w:sz w:val="34"/>
         </w:rPr>
       </w:pPr>
-      <w:bookmarkStart w:id="30" w:name="_Toc239253988"/>
+      <w:bookmarkStart w:id="30" w:name="_Toc239320796"/>
       <w:r>
         <w:rPr>
           <w:rFonts w:ascii="Montserrat" w:hAnsi="Montserrat"/>
@@ -15372,7 +15392,7 @@
           <w:sz w:val="27"/>
         </w:rPr>
       </w:pPr>
-      <w:bookmarkStart w:id="31" w:name="_Toc239253989"/>
+      <w:bookmarkStart w:id="31" w:name="_Toc239320797"/>
       <w:r>
         <w:rPr>
           <w:rFonts w:ascii="Montserrat" w:hAnsi="Montserrat"/>
@@ -15412,16 +15432,16 @@
           <w:noProof/>
         </w:rPr>
         <w:drawing>
-          <wp:inline distT="0" distB="0" distL="0" distR="0" wp14:anchorId="44E5E94D" wp14:editId="379D3C55">
+          <wp:inline distT="0" distB="0" distL="0" distR="0" wp14:anchorId="2CFC2E55" wp14:editId="492B8972">
             <wp:extent cx="5120640" cy="4627581"/>
             <wp:effectExtent l="19050" t="19050" r="22860" b="20955"/>
-            <wp:docPr id="477897239" name="Imagem 27"/>
+            <wp:docPr id="1290359619" name="Imagem 27"/>
             <wp:cNvGraphicFramePr/>
             <a:graphic xmlns:a="http://schemas.openxmlformats.org/drawingml/2006/main">
               <a:graphicData uri="http://schemas.openxmlformats.org/drawingml/2006/picture">
                 <pic:pic xmlns:pic="http://schemas.openxmlformats.org/drawingml/2006/picture">
                   <pic:nvPicPr>
-                    <pic:cNvPr id="477897239" name=""/>
+                    <pic:cNvPr id="1290359619" name=""/>
                     <pic:cNvPicPr/>
                   </pic:nvPicPr>
                   <pic:blipFill>
@@ -15489,16 +15509,16 @@
         </w:rPr>
         <w:lastRenderedPageBreak/>
         <w:drawing>
-          <wp:inline distT="0" distB="0" distL="0" distR="0" wp14:anchorId="7BCAAB6A" wp14:editId="4E5882C0">
+          <wp:inline distT="0" distB="0" distL="0" distR="0" wp14:anchorId="3DE1F347" wp14:editId="2B12159E">
             <wp:extent cx="5120640" cy="4627581"/>
             <wp:effectExtent l="19050" t="19050" r="22860" b="20955"/>
-            <wp:docPr id="1661036263" name="Imagem 28"/>
+            <wp:docPr id="1783975082" name="Imagem 28"/>
             <wp:cNvGraphicFramePr/>
             <a:graphic xmlns:a="http://schemas.openxmlformats.org/drawingml/2006/main">
               <a:graphicData uri="http://schemas.openxmlformats.org/drawingml/2006/picture">
                 <pic:pic xmlns:pic="http://schemas.openxmlformats.org/drawingml/2006/picture">
                   <pic:nvPicPr>
-                    <pic:cNvPr id="1661036263" name=""/>
+                    <pic:cNvPr id="1783975082" name=""/>
                     <pic:cNvPicPr/>
                   </pic:nvPicPr>
                   <pic:blipFill>
@@ -15566,16 +15586,16 @@
         </w:rPr>
         <w:lastRenderedPageBreak/>
         <w:drawing>
-          <wp:inline distT="0" distB="0" distL="0" distR="0" wp14:anchorId="48FDA9C4" wp14:editId="67599B7E">
+          <wp:inline distT="0" distB="0" distL="0" distR="0" wp14:anchorId="12BAF5AF" wp14:editId="06FC4A13">
             <wp:extent cx="5120640" cy="4627581"/>
             <wp:effectExtent l="19050" t="19050" r="22860" b="20955"/>
-            <wp:docPr id="1268070844" name="Imagem 29"/>
+            <wp:docPr id="972895359" name="Imagem 29"/>
             <wp:cNvGraphicFramePr/>
             <a:graphic xmlns:a="http://schemas.openxmlformats.org/drawingml/2006/main">
               <a:graphicData uri="http://schemas.openxmlformats.org/drawingml/2006/picture">
                 <pic:pic xmlns:pic="http://schemas.openxmlformats.org/drawingml/2006/picture">
                   <pic:nvPicPr>
-                    <pic:cNvPr id="1268070844" name=""/>
+                    <pic:cNvPr id="972895359" name=""/>
                     <pic:cNvPicPr/>
                   </pic:nvPicPr>
                   <pic:blipFill>
@@ -15769,16 +15789,16 @@
           <w:noProof/>
         </w:rPr>
         <w:drawing>
-          <wp:inline distT="0" distB="0" distL="0" distR="0" wp14:anchorId="6ACC4DB0" wp14:editId="04BCDE8D">
+          <wp:inline distT="0" distB="0" distL="0" distR="0" wp14:anchorId="216A994B" wp14:editId="7DAAD814">
             <wp:extent cx="5120640" cy="1715571"/>
             <wp:effectExtent l="19050" t="19050" r="22860" b="18415"/>
-            <wp:docPr id="127259375" name="Imagem 30"/>
+            <wp:docPr id="740493832" name="Imagem 30"/>
             <wp:cNvGraphicFramePr/>
             <a:graphic xmlns:a="http://schemas.openxmlformats.org/drawingml/2006/main">
               <a:graphicData uri="http://schemas.openxmlformats.org/drawingml/2006/picture">
                 <pic:pic xmlns:pic="http://schemas.openxmlformats.org/drawingml/2006/picture">
                   <pic:nvPicPr>
-                    <pic:cNvPr id="127259375" name=""/>
+                    <pic:cNvPr id="740493832" name=""/>
                     <pic:cNvPicPr/>
                   </pic:nvPicPr>
                   <pic:blipFill>
@@ -15924,16 +15944,16 @@
           <w:noProof/>
         </w:rPr>
         <w:drawing>
-          <wp:inline distT="0" distB="0" distL="0" distR="0" wp14:anchorId="1CA40FF1" wp14:editId="50236B8C">
+          <wp:inline distT="0" distB="0" distL="0" distR="0" wp14:anchorId="4845732B" wp14:editId="442B1676">
             <wp:extent cx="5120640" cy="3282818"/>
             <wp:effectExtent l="19050" t="19050" r="22860" b="13335"/>
-            <wp:docPr id="713882823" name="Imagem 31"/>
+            <wp:docPr id="369037922" name="Imagem 31"/>
             <wp:cNvGraphicFramePr/>
             <a:graphic xmlns:a="http://schemas.openxmlformats.org/drawingml/2006/main">
               <a:graphicData uri="http://schemas.openxmlformats.org/drawingml/2006/picture">
                 <pic:pic xmlns:pic="http://schemas.openxmlformats.org/drawingml/2006/picture">
                   <pic:nvPicPr>
-                    <pic:cNvPr id="713882823" name=""/>
+                    <pic:cNvPr id="369037922" name=""/>
                     <pic:cNvPicPr/>
                   </pic:nvPicPr>
                   <pic:blipFill>
@@ -16046,16 +16066,16 @@
         </w:rPr>
         <w:lastRenderedPageBreak/>
         <w:drawing>
-          <wp:inline distT="0" distB="0" distL="0" distR="0" wp14:anchorId="43276090" wp14:editId="1AD6390F">
+          <wp:inline distT="0" distB="0" distL="0" distR="0" wp14:anchorId="463D3E50" wp14:editId="0B252A4E">
             <wp:extent cx="5120640" cy="951357"/>
             <wp:effectExtent l="19050" t="19050" r="22860" b="20320"/>
-            <wp:docPr id="411698989" name="Imagem 32"/>
+            <wp:docPr id="494743936" name="Imagem 32"/>
             <wp:cNvGraphicFramePr/>
             <a:graphic xmlns:a="http://schemas.openxmlformats.org/drawingml/2006/main">
               <a:graphicData uri="http://schemas.openxmlformats.org/drawingml/2006/picture">
                 <pic:pic xmlns:pic="http://schemas.openxmlformats.org/drawingml/2006/picture">
                   <pic:nvPicPr>
-                    <pic:cNvPr id="411698989" name=""/>
+                    <pic:cNvPr id="494743936" name=""/>
                     <pic:cNvPicPr/>
                   </pic:nvPicPr>
                   <pic:blipFill>
@@ -16167,16 +16187,16 @@
           <w:noProof/>
         </w:rPr>
         <w:drawing>
-          <wp:inline distT="0" distB="0" distL="0" distR="0" wp14:anchorId="7BD59E9A" wp14:editId="2A75D860">
+          <wp:inline distT="0" distB="0" distL="0" distR="0" wp14:anchorId="5A9C651A" wp14:editId="093AB214">
             <wp:extent cx="5120640" cy="1515102"/>
             <wp:effectExtent l="19050" t="19050" r="22860" b="28575"/>
-            <wp:docPr id="354362647" name="Imagem 33"/>
+            <wp:docPr id="1293114512" name="Imagem 33"/>
             <wp:cNvGraphicFramePr/>
             <a:graphic xmlns:a="http://schemas.openxmlformats.org/drawingml/2006/main">
               <a:graphicData uri="http://schemas.openxmlformats.org/drawingml/2006/picture">
                 <pic:pic xmlns:pic="http://schemas.openxmlformats.org/drawingml/2006/picture">
                   <pic:nvPicPr>
-                    <pic:cNvPr id="354362647" name=""/>
+                    <pic:cNvPr id="1293114512" name=""/>
                     <pic:cNvPicPr/>
                   </pic:nvPicPr>
                   <pic:blipFill>
@@ -16298,16 +16318,16 @@
           <w:noProof/>
         </w:rPr>
         <w:drawing>
-          <wp:inline distT="0" distB="0" distL="0" distR="0" wp14:anchorId="2F454B8E" wp14:editId="5120595B">
+          <wp:inline distT="0" distB="0" distL="0" distR="0" wp14:anchorId="15F24F99" wp14:editId="2347C273">
             <wp:extent cx="5120640" cy="1391113"/>
             <wp:effectExtent l="19050" t="19050" r="22860" b="19050"/>
-            <wp:docPr id="2103464804" name="Imagem 34"/>
+            <wp:docPr id="1897693707" name="Imagem 34"/>
             <wp:cNvGraphicFramePr/>
             <a:graphic xmlns:a="http://schemas.openxmlformats.org/drawingml/2006/main">
               <a:graphicData uri="http://schemas.openxmlformats.org/drawingml/2006/picture">
                 <pic:pic xmlns:pic="http://schemas.openxmlformats.org/drawingml/2006/picture">
                   <pic:nvPicPr>
-                    <pic:cNvPr id="2103464804" name=""/>
+                    <pic:cNvPr id="1897693707" name=""/>
                     <pic:cNvPicPr/>
                   </pic:nvPicPr>
                   <pic:blipFill>
@@ -16419,16 +16439,16 @@
           <w:noProof/>
         </w:rPr>
         <w:drawing>
-          <wp:inline distT="0" distB="0" distL="0" distR="0" wp14:anchorId="5B7CCF80" wp14:editId="7D99DFC8">
+          <wp:inline distT="0" distB="0" distL="0" distR="0" wp14:anchorId="00380C55" wp14:editId="1B8759DF">
             <wp:extent cx="5120640" cy="1125174"/>
             <wp:effectExtent l="19050" t="19050" r="22860" b="18415"/>
-            <wp:docPr id="1717937400" name="Imagem 35"/>
+            <wp:docPr id="283674900" name="Imagem 35"/>
             <wp:cNvGraphicFramePr/>
             <a:graphic xmlns:a="http://schemas.openxmlformats.org/drawingml/2006/main">
               <a:graphicData uri="http://schemas.openxmlformats.org/drawingml/2006/picture">
                 <pic:pic xmlns:pic="http://schemas.openxmlformats.org/drawingml/2006/picture">
                   <pic:nvPicPr>
-                    <pic:cNvPr id="1717937400" name=""/>
+                    <pic:cNvPr id="283674900" name=""/>
                     <pic:cNvPicPr/>
                   </pic:nvPicPr>
                   <pic:blipFill>
@@ -16517,7 +16537,7 @@
           <w:sz w:val="27"/>
         </w:rPr>
       </w:pPr>
-      <w:bookmarkStart w:id="32" w:name="_Toc239253990"/>
+      <w:bookmarkStart w:id="32" w:name="_Toc239320798"/>
       <w:r>
         <w:rPr>
           <w:rFonts w:ascii="Montserrat" w:hAnsi="Montserrat"/>
@@ -16558,16 +16578,16 @@
           <w:noProof/>
         </w:rPr>
         <w:drawing>
-          <wp:inline distT="0" distB="0" distL="0" distR="0" wp14:anchorId="0A54BA36" wp14:editId="3FDC9D3D">
+          <wp:inline distT="0" distB="0" distL="0" distR="0" wp14:anchorId="388DAE59" wp14:editId="10D89679">
             <wp:extent cx="5120640" cy="4627581"/>
             <wp:effectExtent l="19050" t="19050" r="22860" b="20955"/>
-            <wp:docPr id="1634054343" name="Imagem 36"/>
+            <wp:docPr id="1462506478" name="Imagem 36"/>
             <wp:cNvGraphicFramePr/>
             <a:graphic xmlns:a="http://schemas.openxmlformats.org/drawingml/2006/main">
               <a:graphicData uri="http://schemas.openxmlformats.org/drawingml/2006/picture">
                 <pic:pic xmlns:pic="http://schemas.openxmlformats.org/drawingml/2006/picture">
                   <pic:nvPicPr>
-                    <pic:cNvPr id="1634054343" name=""/>
+                    <pic:cNvPr id="1462506478" name=""/>
                     <pic:cNvPicPr/>
                   </pic:nvPicPr>
                   <pic:blipFill>
@@ -16635,16 +16655,16 @@
         </w:rPr>
         <w:lastRenderedPageBreak/>
         <w:drawing>
-          <wp:inline distT="0" distB="0" distL="0" distR="0" wp14:anchorId="72EBDB10" wp14:editId="32E7669C">
+          <wp:inline distT="0" distB="0" distL="0" distR="0" wp14:anchorId="4DB07FFD" wp14:editId="07FE8CFF">
             <wp:extent cx="5120640" cy="4627581"/>
             <wp:effectExtent l="19050" t="19050" r="22860" b="20955"/>
-            <wp:docPr id="739307387" name="Imagem 37"/>
+            <wp:docPr id="2033823869" name="Imagem 37"/>
             <wp:cNvGraphicFramePr/>
             <a:graphic xmlns:a="http://schemas.openxmlformats.org/drawingml/2006/main">
               <a:graphicData uri="http://schemas.openxmlformats.org/drawingml/2006/picture">
                 <pic:pic xmlns:pic="http://schemas.openxmlformats.org/drawingml/2006/picture">
                   <pic:nvPicPr>
-                    <pic:cNvPr id="739307387" name=""/>
+                    <pic:cNvPr id="2033823869" name=""/>
                     <pic:cNvPicPr/>
                   </pic:nvPicPr>
                   <pic:blipFill>
@@ -16813,16 +16833,16 @@
           <w:noProof/>
         </w:rPr>
         <w:drawing>
-          <wp:inline distT="0" distB="0" distL="0" distR="0" wp14:anchorId="33915A51" wp14:editId="7B1BA890">
+          <wp:inline distT="0" distB="0" distL="0" distR="0" wp14:anchorId="6A4E2DC2" wp14:editId="7B5766D3">
             <wp:extent cx="5120640" cy="2144319"/>
             <wp:effectExtent l="19050" t="19050" r="22860" b="27940"/>
-            <wp:docPr id="701758113" name="Imagem 38"/>
+            <wp:docPr id="810161999" name="Imagem 38"/>
             <wp:cNvGraphicFramePr/>
             <a:graphic xmlns:a="http://schemas.openxmlformats.org/drawingml/2006/main">
               <a:graphicData uri="http://schemas.openxmlformats.org/drawingml/2006/picture">
                 <pic:pic xmlns:pic="http://schemas.openxmlformats.org/drawingml/2006/picture">
                   <pic:nvPicPr>
-                    <pic:cNvPr id="701758113" name=""/>
+                    <pic:cNvPr id="810161999" name=""/>
                     <pic:cNvPicPr/>
                   </pic:nvPicPr>
                   <pic:blipFill>
@@ -16910,16 +16930,16 @@
           <w:noProof/>
         </w:rPr>
         <w:drawing>
-          <wp:inline distT="0" distB="0" distL="0" distR="0" wp14:anchorId="4E678F53" wp14:editId="19B132D4">
+          <wp:inline distT="0" distB="0" distL="0" distR="0" wp14:anchorId="47651A2C" wp14:editId="66A0D901">
             <wp:extent cx="5120640" cy="1055647"/>
             <wp:effectExtent l="19050" t="19050" r="22860" b="11430"/>
-            <wp:docPr id="651668827" name="Imagem 39"/>
+            <wp:docPr id="1349228460" name="Imagem 39"/>
             <wp:cNvGraphicFramePr/>
             <a:graphic xmlns:a="http://schemas.openxmlformats.org/drawingml/2006/main">
               <a:graphicData uri="http://schemas.openxmlformats.org/drawingml/2006/picture">
                 <pic:pic xmlns:pic="http://schemas.openxmlformats.org/drawingml/2006/picture">
                   <pic:nvPicPr>
-                    <pic:cNvPr id="651668827" name=""/>
+                    <pic:cNvPr id="1349228460" name=""/>
                     <pic:cNvPicPr/>
                   </pic:nvPicPr>
                   <pic:blipFill>
@@ -17041,16 +17061,16 @@
           <w:noProof/>
         </w:rPr>
         <w:drawing>
-          <wp:inline distT="0" distB="0" distL="0" distR="0" wp14:anchorId="558DD292" wp14:editId="05981981">
+          <wp:inline distT="0" distB="0" distL="0" distR="0" wp14:anchorId="4F96D348" wp14:editId="7FE11553">
             <wp:extent cx="5120640" cy="3282818"/>
             <wp:effectExtent l="19050" t="19050" r="22860" b="13335"/>
-            <wp:docPr id="964608866" name="Imagem 40"/>
+            <wp:docPr id="858754859" name="Imagem 40"/>
             <wp:cNvGraphicFramePr/>
             <a:graphic xmlns:a="http://schemas.openxmlformats.org/drawingml/2006/main">
               <a:graphicData uri="http://schemas.openxmlformats.org/drawingml/2006/picture">
                 <pic:pic xmlns:pic="http://schemas.openxmlformats.org/drawingml/2006/picture">
                   <pic:nvPicPr>
-                    <pic:cNvPr id="964608866" name=""/>
+                    <pic:cNvPr id="858754859" name=""/>
                     <pic:cNvPicPr/>
                   </pic:nvPicPr>
                   <pic:blipFill>
@@ -17184,16 +17204,16 @@
         </w:rPr>
         <w:lastRenderedPageBreak/>
         <w:drawing>
-          <wp:inline distT="0" distB="0" distL="0" distR="0" wp14:anchorId="446204EC" wp14:editId="00DD9D26">
+          <wp:inline distT="0" distB="0" distL="0" distR="0" wp14:anchorId="43C0FD9E" wp14:editId="6B09C6BE">
             <wp:extent cx="5120640" cy="1978034"/>
             <wp:effectExtent l="19050" t="19050" r="22860" b="22225"/>
-            <wp:docPr id="1141227819" name="Imagem 41"/>
+            <wp:docPr id="2077547401" name="Imagem 41"/>
             <wp:cNvGraphicFramePr/>
             <a:graphic xmlns:a="http://schemas.openxmlformats.org/drawingml/2006/main">
               <a:graphicData uri="http://schemas.openxmlformats.org/drawingml/2006/picture">
                 <pic:pic xmlns:pic="http://schemas.openxmlformats.org/drawingml/2006/picture">
                   <pic:nvPicPr>
-                    <pic:cNvPr id="1141227819" name=""/>
+                    <pic:cNvPr id="2077547401" name=""/>
                     <pic:cNvPicPr/>
                   </pic:nvPicPr>
                   <pic:blipFill>
@@ -17265,7 +17285,7 @@
           <w:sz w:val="34"/>
         </w:rPr>
       </w:pPr>
-      <w:bookmarkStart w:id="33" w:name="_Toc239253991"/>
+      <w:bookmarkStart w:id="33" w:name="_Toc239320799"/>
       <w:r>
         <w:rPr>
           <w:rFonts w:ascii="Montserrat" w:hAnsi="Montserrat"/>
@@ -17325,7 +17345,7 @@
           <w:sz w:val="27"/>
         </w:rPr>
       </w:pPr>
-      <w:bookmarkStart w:id="34" w:name="_Toc239253992"/>
+      <w:bookmarkStart w:id="34" w:name="_Toc239320800"/>
       <w:r>
         <w:rPr>
           <w:rFonts w:ascii="Montserrat" w:hAnsi="Montserrat"/>
@@ -17365,16 +17385,16 @@
           <w:noProof/>
         </w:rPr>
         <w:drawing>
-          <wp:inline distT="0" distB="0" distL="0" distR="0" wp14:anchorId="6C2E9EE3" wp14:editId="1E1FCF19">
+          <wp:inline distT="0" distB="0" distL="0" distR="0" wp14:anchorId="030AA41D" wp14:editId="7052EE58">
             <wp:extent cx="5303520" cy="4792851"/>
             <wp:effectExtent l="19050" t="19050" r="11430" b="27305"/>
-            <wp:docPr id="1733971746" name="Imagem 42"/>
+            <wp:docPr id="1651237231" name="Imagem 42"/>
             <wp:cNvGraphicFramePr/>
             <a:graphic xmlns:a="http://schemas.openxmlformats.org/drawingml/2006/main">
               <a:graphicData uri="http://schemas.openxmlformats.org/drawingml/2006/picture">
                 <pic:pic xmlns:pic="http://schemas.openxmlformats.org/drawingml/2006/picture">
                   <pic:nvPicPr>
-                    <pic:cNvPr id="1733971746" name=""/>
+                    <pic:cNvPr id="1651237231" name=""/>
                     <pic:cNvPicPr/>
                   </pic:nvPicPr>
                   <pic:blipFill>
@@ -17443,7 +17463,7 @@
           <w:sz w:val="27"/>
         </w:rPr>
       </w:pPr>
-      <w:bookmarkStart w:id="35" w:name="_Toc239253993"/>
+      <w:bookmarkStart w:id="35" w:name="_Toc239320801"/>
       <w:r>
         <w:rPr>
           <w:rFonts w:ascii="Montserrat" w:hAnsi="Montserrat"/>
@@ -17483,16 +17503,16 @@
           <w:noProof/>
         </w:rPr>
         <w:drawing>
-          <wp:inline distT="0" distB="0" distL="0" distR="0" wp14:anchorId="279A2194" wp14:editId="1FB5CBE9">
+          <wp:inline distT="0" distB="0" distL="0" distR="0" wp14:anchorId="7A21B4AB" wp14:editId="7E533851">
             <wp:extent cx="5303520" cy="4792851"/>
             <wp:effectExtent l="19050" t="19050" r="11430" b="27305"/>
-            <wp:docPr id="349252520" name="Imagem 43"/>
+            <wp:docPr id="1196866986" name="Imagem 43"/>
             <wp:cNvGraphicFramePr/>
             <a:graphic xmlns:a="http://schemas.openxmlformats.org/drawingml/2006/main">
               <a:graphicData uri="http://schemas.openxmlformats.org/drawingml/2006/picture">
                 <pic:pic xmlns:pic="http://schemas.openxmlformats.org/drawingml/2006/picture">
                   <pic:nvPicPr>
-                    <pic:cNvPr id="349252520" name=""/>
+                    <pic:cNvPr id="1196866986" name=""/>
                     <pic:cNvPicPr/>
                   </pic:nvPicPr>
                   <pic:blipFill>
@@ -17560,7 +17580,7 @@
           <w:sz w:val="27"/>
         </w:rPr>
       </w:pPr>
-      <w:bookmarkStart w:id="36" w:name="_Toc239253994"/>
+      <w:bookmarkStart w:id="36" w:name="_Toc239320802"/>
       <w:r>
         <w:rPr>
           <w:rFonts w:ascii="Montserrat" w:hAnsi="Montserrat"/>
@@ -17601,16 +17621,16 @@
         </w:rPr>
         <w:lastRenderedPageBreak/>
         <w:drawing>
-          <wp:inline distT="0" distB="0" distL="0" distR="0" wp14:anchorId="2F3D0802" wp14:editId="600079B2">
+          <wp:inline distT="0" distB="0" distL="0" distR="0" wp14:anchorId="411B5322" wp14:editId="254373E9">
             <wp:extent cx="5303520" cy="4792851"/>
             <wp:effectExtent l="19050" t="19050" r="11430" b="27305"/>
-            <wp:docPr id="2131701849" name="Imagem 44"/>
+            <wp:docPr id="354836604" name="Imagem 44"/>
             <wp:cNvGraphicFramePr/>
             <a:graphic xmlns:a="http://schemas.openxmlformats.org/drawingml/2006/main">
               <a:graphicData uri="http://schemas.openxmlformats.org/drawingml/2006/picture">
                 <pic:pic xmlns:pic="http://schemas.openxmlformats.org/drawingml/2006/picture">
                   <pic:nvPicPr>
-                    <pic:cNvPr id="2131701849" name=""/>
+                    <pic:cNvPr id="354836604" name=""/>
                     <pic:cNvPicPr/>
                   </pic:nvPicPr>
                   <pic:blipFill>
@@ -17678,16 +17698,16 @@
         </w:rPr>
         <w:lastRenderedPageBreak/>
         <w:drawing>
-          <wp:inline distT="0" distB="0" distL="0" distR="0" wp14:anchorId="355FFF39" wp14:editId="5BA04646">
+          <wp:inline distT="0" distB="0" distL="0" distR="0" wp14:anchorId="1E1A20BA" wp14:editId="27EEF211">
             <wp:extent cx="5303520" cy="4792851"/>
             <wp:effectExtent l="19050" t="19050" r="11430" b="27305"/>
-            <wp:docPr id="1390991006" name="Imagem 45"/>
+            <wp:docPr id="2015870479" name="Imagem 45"/>
             <wp:cNvGraphicFramePr/>
             <a:graphic xmlns:a="http://schemas.openxmlformats.org/drawingml/2006/main">
               <a:graphicData uri="http://schemas.openxmlformats.org/drawingml/2006/picture">
                 <pic:pic xmlns:pic="http://schemas.openxmlformats.org/drawingml/2006/picture">
                   <pic:nvPicPr>
-                    <pic:cNvPr id="1390991006" name=""/>
+                    <pic:cNvPr id="2015870479" name=""/>
                     <pic:cNvPicPr/>
                   </pic:nvPicPr>
                   <pic:blipFill>
@@ -17780,7 +17800,7 @@
           <w:sz w:val="34"/>
         </w:rPr>
       </w:pPr>
-      <w:bookmarkStart w:id="37" w:name="_Toc239253995"/>
+      <w:bookmarkStart w:id="37" w:name="_Toc239320803"/>
       <w:r>
         <w:rPr>
           <w:rFonts w:ascii="Montserrat" w:hAnsi="Montserrat"/>
@@ -17822,7 +17842,7 @@
           <w:sz w:val="27"/>
         </w:rPr>
       </w:pPr>
-      <w:bookmarkStart w:id="38" w:name="_Toc239253996"/>
+      <w:bookmarkStart w:id="38" w:name="_Toc239320804"/>
       <w:r>
         <w:rPr>
           <w:rFonts w:ascii="Montserrat" w:hAnsi="Montserrat"/>
@@ -17862,16 +17882,16 @@
           <w:noProof/>
         </w:rPr>
         <w:drawing>
-          <wp:inline distT="0" distB="0" distL="0" distR="0" wp14:anchorId="004F70FF" wp14:editId="697F4B31">
+          <wp:inline distT="0" distB="0" distL="0" distR="0" wp14:anchorId="3E0DD414" wp14:editId="602C1983">
             <wp:extent cx="5303520" cy="4792851"/>
             <wp:effectExtent l="19050" t="19050" r="11430" b="27305"/>
-            <wp:docPr id="2070087872" name="Imagem 46"/>
+            <wp:docPr id="558819028" name="Imagem 46"/>
             <wp:cNvGraphicFramePr/>
             <a:graphic xmlns:a="http://schemas.openxmlformats.org/drawingml/2006/main">
               <a:graphicData uri="http://schemas.openxmlformats.org/drawingml/2006/picture">
                 <pic:pic xmlns:pic="http://schemas.openxmlformats.org/drawingml/2006/picture">
                   <pic:nvPicPr>
-                    <pic:cNvPr id="2070087872" name=""/>
+                    <pic:cNvPr id="558819028" name=""/>
                     <pic:cNvPicPr/>
                   </pic:nvPicPr>
                   <pic:blipFill>
@@ -18018,7 +18038,7 @@
           <w:sz w:val="27"/>
         </w:rPr>
       </w:pPr>
-      <w:bookmarkStart w:id="39" w:name="_Toc239253997"/>
+      <w:bookmarkStart w:id="39" w:name="_Toc239320805"/>
       <w:r>
         <w:rPr>
           <w:rFonts w:ascii="Montserrat" w:hAnsi="Montserrat"/>
@@ -18059,16 +18079,16 @@
         </w:rPr>
         <w:lastRenderedPageBreak/>
         <w:drawing>
-          <wp:inline distT="0" distB="0" distL="0" distR="0" wp14:anchorId="0ADD1197" wp14:editId="4DF01527">
+          <wp:inline distT="0" distB="0" distL="0" distR="0" wp14:anchorId="1118CFA2" wp14:editId="730F79F8">
             <wp:extent cx="5303520" cy="4792851"/>
             <wp:effectExtent l="19050" t="19050" r="11430" b="27305"/>
-            <wp:docPr id="660491423" name="Imagem 47"/>
+            <wp:docPr id="813872876" name="Imagem 47"/>
             <wp:cNvGraphicFramePr/>
             <a:graphic xmlns:a="http://schemas.openxmlformats.org/drawingml/2006/main">
               <a:graphicData uri="http://schemas.openxmlformats.org/drawingml/2006/picture">
                 <pic:pic xmlns:pic="http://schemas.openxmlformats.org/drawingml/2006/picture">
                   <pic:nvPicPr>
-                    <pic:cNvPr id="660491423" name=""/>
+                    <pic:cNvPr id="813872876" name=""/>
                     <pic:cNvPicPr/>
                   </pic:nvPicPr>
                   <pic:blipFill>
@@ -18136,7 +18156,7 @@
           <w:sz w:val="27"/>
         </w:rPr>
       </w:pPr>
-      <w:bookmarkStart w:id="40" w:name="_Toc239253998"/>
+      <w:bookmarkStart w:id="40" w:name="_Toc239320806"/>
       <w:r>
         <w:rPr>
           <w:rFonts w:ascii="Montserrat" w:hAnsi="Montserrat"/>
@@ -18177,16 +18197,16 @@
         </w:rPr>
         <w:lastRenderedPageBreak/>
         <w:drawing>
-          <wp:inline distT="0" distB="0" distL="0" distR="0" wp14:anchorId="4D7E3288" wp14:editId="0F9DC00C">
+          <wp:inline distT="0" distB="0" distL="0" distR="0" wp14:anchorId="3E31DF71" wp14:editId="4C9A630C">
             <wp:extent cx="5303520" cy="4792851"/>
             <wp:effectExtent l="19050" t="19050" r="11430" b="27305"/>
-            <wp:docPr id="615263573" name="Imagem 48"/>
+            <wp:docPr id="753130295" name="Imagem 48"/>
             <wp:cNvGraphicFramePr/>
             <a:graphic xmlns:a="http://schemas.openxmlformats.org/drawingml/2006/main">
               <a:graphicData uri="http://schemas.openxmlformats.org/drawingml/2006/picture">
                 <pic:pic xmlns:pic="http://schemas.openxmlformats.org/drawingml/2006/picture">
                   <pic:nvPicPr>
-                    <pic:cNvPr id="615263573" name=""/>
+                    <pic:cNvPr id="753130295" name=""/>
                     <pic:cNvPicPr/>
                   </pic:nvPicPr>
                   <pic:blipFill>
@@ -18330,7 +18350,7 @@
           <w:sz w:val="27"/>
         </w:rPr>
       </w:pPr>
-      <w:bookmarkStart w:id="41" w:name="_Toc239253999"/>
+      <w:bookmarkStart w:id="41" w:name="_Toc239320807"/>
       <w:r>
         <w:rPr>
           <w:rFonts w:ascii="Montserrat" w:hAnsi="Montserrat"/>
@@ -18458,6 +18478,30 @@
     </w:p>
     <w:p>
       <w:pPr>
+        <w:pStyle w:val="PargrafodaLista"/>
+        <w:numPr>
+          <w:ilvl w:val="0"/>
+          <w:numId w:val="28"/>
+        </w:numPr>
+        <w:spacing w:after="80" w:line="260" w:lineRule="auto"/>
+        <w:ind w:left="700"/>
+        <w:rPr>
+          <w:rFonts w:ascii="Montserrat" w:hAnsi="Montserrat"/>
+          <w:color w:val="1A1A1A"/>
+          <w:sz w:val="22"/>
+        </w:rPr>
+      </w:pPr>
+      <w:r>
+        <w:rPr>
+          <w:rFonts w:ascii="Montserrat" w:hAnsi="Montserrat"/>
+          <w:color w:val="1A1A1A"/>
+          <w:sz w:val="22"/>
+        </w:rPr>
+        <w:t>Visao atual por projeto: uma linha por projeto do cadastro compartilhado, com Status do cadastro, Situacao mais recente do Relatorio de Situacao (secao 4.1, com o percentual concluido quando ja reportado) e Progresso do ciclo de vida - quantos dos 9 formularios (Demanda a RLA) ja tem registro vinculado aquele projeto, com a lista do que ainda falta.</w:t>
+      </w:r>
+    </w:p>
+    <w:p>
+      <w:pPr>
         <w:spacing w:before="120" w:after="40"/>
         <w:jc w:val="center"/>
       </w:pPr>
@@ -18467,16 +18511,16 @@
         </w:rPr>
         <w:lastRenderedPageBreak/>
         <w:drawing>
-          <wp:inline distT="0" distB="0" distL="0" distR="0" wp14:anchorId="1B397918" wp14:editId="25853B61">
+          <wp:inline distT="0" distB="0" distL="0" distR="0" wp14:anchorId="0A5D892A" wp14:editId="616579A1">
             <wp:extent cx="5303520" cy="4267180"/>
             <wp:effectExtent l="19050" t="19050" r="11430" b="19685"/>
-            <wp:docPr id="1640963411" name="Imagem 49"/>
+            <wp:docPr id="1513263851" name="Imagem 49"/>
             <wp:cNvGraphicFramePr/>
             <a:graphic xmlns:a="http://schemas.openxmlformats.org/drawingml/2006/main">
               <a:graphicData uri="http://schemas.openxmlformats.org/drawingml/2006/picture">
                 <pic:pic xmlns:pic="http://schemas.openxmlformats.org/drawingml/2006/picture">
                   <pic:nvPicPr>
-                    <pic:cNvPr id="1640963411" name=""/>
+                    <pic:cNvPr id="1513263851" name=""/>
                     <pic:cNvPicPr/>
                   </pic:nvPicPr>
                   <pic:blipFill>
@@ -18544,16 +18588,16 @@
         </w:rPr>
         <w:lastRenderedPageBreak/>
         <w:drawing>
-          <wp:inline distT="0" distB="0" distL="0" distR="0" wp14:anchorId="793BD07C" wp14:editId="14E2EF43">
+          <wp:inline distT="0" distB="0" distL="0" distR="0" wp14:anchorId="28EE6663" wp14:editId="12820211">
             <wp:extent cx="5303520" cy="3382059"/>
             <wp:effectExtent l="19050" t="19050" r="11430" b="27940"/>
-            <wp:docPr id="217483707" name="Imagem 50"/>
+            <wp:docPr id="495659021" name="Imagem 50"/>
             <wp:cNvGraphicFramePr/>
             <a:graphic xmlns:a="http://schemas.openxmlformats.org/drawingml/2006/main">
               <a:graphicData uri="http://schemas.openxmlformats.org/drawingml/2006/picture">
                 <pic:pic xmlns:pic="http://schemas.openxmlformats.org/drawingml/2006/picture">
                   <pic:nvPicPr>
-                    <pic:cNvPr id="217483707" name=""/>
+                    <pic:cNvPr id="495659021" name=""/>
                     <pic:cNvPicPr/>
                   </pic:nvPicPr>
                   <pic:blipFill>
@@ -18612,6 +18656,83 @@
     </w:p>
     <w:p>
       <w:pPr>
+        <w:spacing w:before="120" w:after="40"/>
+        <w:jc w:val="center"/>
+      </w:pPr>
+      <w:r>
+        <w:rPr>
+          <w:noProof/>
+        </w:rPr>
+        <w:drawing>
+          <wp:inline distT="0" distB="0" distL="0" distR="0" wp14:anchorId="234026BD" wp14:editId="5CEA7CAF">
+            <wp:extent cx="5303520" cy="4053550"/>
+            <wp:effectExtent l="19050" t="19050" r="11430" b="23495"/>
+            <wp:docPr id="1192652817" name="Imagem 51"/>
+            <wp:cNvGraphicFramePr/>
+            <a:graphic xmlns:a="http://schemas.openxmlformats.org/drawingml/2006/main">
+              <a:graphicData uri="http://schemas.openxmlformats.org/drawingml/2006/picture">
+                <pic:pic xmlns:pic="http://schemas.openxmlformats.org/drawingml/2006/picture">
+                  <pic:nvPicPr>
+                    <pic:cNvPr id="1192652817" name=""/>
+                    <pic:cNvPicPr/>
+                  </pic:nvPicPr>
+                  <pic:blipFill>
+                    <a:blip r:embed="rId57">
+                      <a:extLst>
+                        <a:ext uri="{28A0092B-C50C-407E-A947-70E740481C1C}">
+                          <a14:useLocalDpi xmlns:a14="http://schemas.microsoft.com/office/drawing/2010/main" val="0"/>
+                        </a:ext>
+                      </a:extLst>
+                    </a:blip>
+                    <a:stretch>
+                      <a:fillRect/>
+                    </a:stretch>
+                  </pic:blipFill>
+                  <pic:spPr>
+                    <a:xfrm>
+                      <a:off x="0" y="0"/>
+                      <a:ext cx="5303520" cy="4053550"/>
+                    </a:xfrm>
+                    <a:prstGeom prst="rect">
+                      <a:avLst/>
+                    </a:prstGeom>
+                    <a:ln w="9525">
+                      <a:solidFill>
+                        <a:srgbClr val="D1D5DB"/>
+                      </a:solidFill>
+                    </a:ln>
+                  </pic:spPr>
+                </pic:pic>
+              </a:graphicData>
+            </a:graphic>
+          </wp:inline>
+        </w:drawing>
+      </w:r>
+    </w:p>
+    <w:p>
+      <w:pPr>
+        <w:spacing w:before="120" w:after="280"/>
+        <w:jc w:val="center"/>
+        <w:rPr>
+          <w:rFonts w:ascii="Montserrat" w:hAnsi="Montserrat"/>
+          <w:i/>
+          <w:color w:val="6A6A70"/>
+          <w:sz w:val="19"/>
+        </w:rPr>
+      </w:pPr>
+      <w:r>
+        <w:rPr>
+          <w:rFonts w:ascii="Montserrat" w:hAnsi="Montserrat"/>
+          <w:i/>
+          <w:color w:val="6A6A70"/>
+          <w:sz w:val="19"/>
+        </w:rPr>
+        <w:lastRenderedPageBreak/>
+        <w:t>Visao atual por projeto: status do cadastro, situacao do Relatorio de Situacao e progresso do ciclo de vida, projeto a projeto.</w:t>
+      </w:r>
+    </w:p>
+    <w:p>
+      <w:pPr>
         <w:spacing w:before="160" w:after="200"/>
         <w:ind w:left="283"/>
         <w:rPr>
@@ -18633,6 +18754,27 @@
     </w:p>
     <w:p>
       <w:pPr>
+        <w:spacing w:before="160" w:after="200"/>
+        <w:ind w:left="283"/>
+        <w:rPr>
+          <w:rFonts w:ascii="Montserrat" w:hAnsi="Montserrat"/>
+          <w:i/>
+          <w:color w:val="6A6A70"/>
+          <w:sz w:val="21"/>
+        </w:rPr>
+      </w:pPr>
+      <w:r>
+        <w:rPr>
+          <w:rFonts w:ascii="Montserrat" w:hAnsi="Montserrat"/>
+          <w:i/>
+          <w:color w:val="6A6A70"/>
+          <w:sz w:val="21"/>
+        </w:rPr>
+        <w:t>Na coluna Situacao, o selo Nao reportado significa que o projeto ainda nao tem uma linha propria no Relatorio de Situacao - nao e um erro, apenas indica que ninguem preencheu o acompanhamento daquele projeto ainda.</w:t>
+      </w:r>
+    </w:p>
+    <w:p>
+      <w:pPr>
         <w:pStyle w:val="Ttulo2"/>
         <w:spacing w:before="320" w:after="120"/>
         <w:rPr>
@@ -18642,7 +18784,7 @@
           <w:sz w:val="27"/>
         </w:rPr>
       </w:pPr>
-      <w:bookmarkStart w:id="42" w:name="_Toc239254000"/>
+      <w:bookmarkStart w:id="42" w:name="_Toc239320808"/>
       <w:r>
         <w:rPr>
           <w:rFonts w:ascii="Montserrat" w:hAnsi="Montserrat"/>
@@ -18711,7 +18853,6 @@
           <w:color w:val="1A1A1A"/>
           <w:sz w:val="22"/>
         </w:rPr>
-        <w:lastRenderedPageBreak/>
         <w:t>A aba so aparece quando a Administracao e acessada pelo endereco de producao - quem acessa a Administracao pelo proprio ambiente de treinamento nao ve essa opcao.</w:t>
       </w:r>
     </w:p>
@@ -18795,7 +18936,7 @@
           <w:sz w:val="27"/>
         </w:rPr>
       </w:pPr>
-      <w:bookmarkStart w:id="43" w:name="_Toc239254001"/>
+      <w:bookmarkStart w:id="43" w:name="_Toc239320809"/>
       <w:r>
         <w:rPr>
           <w:rFonts w:ascii="Montserrat" w:hAnsi="Montserrat"/>
@@ -18803,6 +18944,7 @@
           <w:color w:val="B91D2E"/>
           <w:sz w:val="27"/>
         </w:rPr>
+        <w:lastRenderedPageBreak/>
         <w:t>6.6 Backup automatizado</w:t>
       </w:r>
       <w:bookmarkEnd w:id="43"/>
@@ -19035,37 +19177,27 @@
           <w:color w:val="6A6A70"/>
           <w:sz w:val="21"/>
         </w:rPr>
-        <w:t xml:space="preserve">Esta tela define os parametros - quem efetivamente le essas configuracoes e executa a copia dos dados e uma rotina agendada fora do sistema (GitHub Actions). Como o agendamento desse tipo de rotina roda em horarios fixos (nao pode ser alterado em tempo real por este formulario), ela e programada para rodar com frequencia maior do que o necessario e, a cada execucao, checar </w:t>
-      </w:r>
-      <w:r>
+        <w:t>Esta tela define os parametros - quem efetivamente le essas configuracoes e executa a copia dos dados e uma rotina agendada fora do sistema (GitHub Actions). Como o agendamento desse tipo de rotina roda em horarios fixos (nao pode ser alterado em tempo real por este formulario), ela e programada para rodar com frequencia maior do que o necessario e, a cada execucao, checar aqui se ja esta na hora de rodar de acordo com a frequencia configurada - na pratica, o efeito para quem usa a tela e o mesmo de definir a frequencia diretamente.</w:t>
+      </w:r>
+    </w:p>
+    <w:p>
+      <w:pPr>
+        <w:spacing w:before="160" w:after="200"/>
+        <w:ind w:left="283"/>
         <w:rPr>
           <w:rFonts w:ascii="Montserrat" w:hAnsi="Montserrat"/>
           <w:i/>
           <w:color w:val="6A6A70"/>
           <w:sz w:val="21"/>
         </w:rPr>
-        <w:lastRenderedPageBreak/>
-        <w:t>aqui se ja esta na hora de rodar de acordo com a frequencia configurada - na pratica, o efeito para quem usa a tela e o mesmo de definir a frequencia diretamente.</w:t>
-      </w:r>
-    </w:p>
-    <w:p>
-      <w:pPr>
-        <w:spacing w:before="160" w:after="200"/>
-        <w:ind w:left="283"/>
+      </w:pPr>
+      <w:r>
         <w:rPr>
           <w:rFonts w:ascii="Montserrat" w:hAnsi="Montserrat"/>
           <w:i/>
           <w:color w:val="6A6A70"/>
           <w:sz w:val="21"/>
         </w:rPr>
-      </w:pPr>
-      <w:r>
-        <w:rPr>
-          <w:rFonts w:ascii="Montserrat" w:hAnsi="Montserrat"/>
-          <w:i/>
-          <w:color w:val="6A6A70"/>
-          <w:sz w:val="21"/>
-        </w:rPr>
         <w:t>Destino no SharePoint confirmado: desde 28/08/2026, o envio da copia externa para o SharePoint institucional esta confirmado funcionando de ponta a ponta, com o aplicativo usando apenas a permissao Sites.Selected (acesso restrito a um unico site, o modelo de menor privilegio recomendado desde o inicio) - sem depender de nenhuma permissao ampla sobre todos os sites da instituicao.</w:t>
       </w:r>
     </w:p>
@@ -19084,7 +19216,16 @@
           <w:color w:val="1A1A1A"/>
           <w:sz w:val="22"/>
         </w:rPr>
-        <w:t>Por ultimo, um bloco Metas dos indicadores estrategicos define a meta em % de cada um dos 3 indicadores do Relatorio de Resultados (secao 6.7) - Marcos no prazo, Projetos dentro do orcamento e Entraves resolvidos. Enquanto uma meta ficar vazia, o cartao correspondente mostra Meta nao definida em vez de um selo de status.</w:t>
+        <w:t xml:space="preserve">Por ultimo, um bloco Metas dos indicadores estrategicos define a meta em % de cada um dos 3 indicadores do Relatorio de Resultados (secao 6.7) - Marcos no prazo, Projetos dentro do orcamento e Entraves resolvidos. Enquanto uma meta </w:t>
+      </w:r>
+      <w:r>
+        <w:rPr>
+          <w:rFonts w:ascii="Montserrat" w:hAnsi="Montserrat"/>
+          <w:color w:val="1A1A1A"/>
+          <w:sz w:val="22"/>
+        </w:rPr>
+        <w:lastRenderedPageBreak/>
+        <w:t>ficar vazia, o cartao correspondente mostra Meta nao definida em vez de um selo de status.</w:t>
       </w:r>
     </w:p>
     <w:p>
@@ -19097,20 +19238,20 @@
           <w:noProof/>
         </w:rPr>
         <w:drawing>
-          <wp:inline distT="0" distB="0" distL="0" distR="0" wp14:anchorId="344E3DEA" wp14:editId="05B8599F">
+          <wp:inline distT="0" distB="0" distL="0" distR="0" wp14:anchorId="2043A386" wp14:editId="3182AA97">
             <wp:extent cx="5303520" cy="1351384"/>
             <wp:effectExtent l="19050" t="19050" r="11430" b="20320"/>
-            <wp:docPr id="1907411327" name="Imagem 51"/>
+            <wp:docPr id="2008166925" name="Imagem 52"/>
             <wp:cNvGraphicFramePr/>
             <a:graphic xmlns:a="http://schemas.openxmlformats.org/drawingml/2006/main">
               <a:graphicData uri="http://schemas.openxmlformats.org/drawingml/2006/picture">
                 <pic:pic xmlns:pic="http://schemas.openxmlformats.org/drawingml/2006/picture">
                   <pic:nvPicPr>
-                    <pic:cNvPr id="1907411327" name=""/>
+                    <pic:cNvPr id="2008166925" name=""/>
                     <pic:cNvPicPr/>
                   </pic:nvPicPr>
                   <pic:blipFill>
-                    <a:blip r:embed="rId57">
+                    <a:blip r:embed="rId58">
                       <a:extLst>
                         <a:ext uri="{28A0092B-C50C-407E-A947-70E740481C1C}">
                           <a14:useLocalDpi xmlns:a14="http://schemas.microsoft.com/office/drawing/2010/main" val="0"/>
@@ -19174,7 +19315,7 @@
           <w:sz w:val="27"/>
         </w:rPr>
       </w:pPr>
-      <w:bookmarkStart w:id="44" w:name="_Toc239254002"/>
+      <w:bookmarkStart w:id="44" w:name="_Toc239320810"/>
       <w:r>
         <w:rPr>
           <w:rFonts w:ascii="Montserrat" w:hAnsi="Montserrat"/>
@@ -19285,22 +19426,21 @@
         <w:rPr>
           <w:noProof/>
         </w:rPr>
-        <w:lastRenderedPageBreak/>
         <w:drawing>
-          <wp:inline distT="0" distB="0" distL="0" distR="0" wp14:anchorId="07CB1421" wp14:editId="7B8E250A">
+          <wp:inline distT="0" distB="0" distL="0" distR="0" wp14:anchorId="2569AA91" wp14:editId="4AA07F48">
             <wp:extent cx="5303520" cy="1422793"/>
             <wp:effectExtent l="19050" t="19050" r="11430" b="25400"/>
-            <wp:docPr id="1334703540" name="Imagem 52"/>
+            <wp:docPr id="459279105" name="Imagem 53"/>
             <wp:cNvGraphicFramePr/>
             <a:graphic xmlns:a="http://schemas.openxmlformats.org/drawingml/2006/main">
               <a:graphicData uri="http://schemas.openxmlformats.org/drawingml/2006/picture">
                 <pic:pic xmlns:pic="http://schemas.openxmlformats.org/drawingml/2006/picture">
                   <pic:nvPicPr>
-                    <pic:cNvPr id="1334703540" name=""/>
+                    <pic:cNvPr id="459279105" name=""/>
                     <pic:cNvPicPr/>
                   </pic:nvPicPr>
                   <pic:blipFill>
-                    <a:blip r:embed="rId58">
+                    <a:blip r:embed="rId59">
                       <a:extLst>
                         <a:ext uri="{28A0092B-C50C-407E-A947-70E740481C1C}">
                           <a14:useLocalDpi xmlns:a14="http://schemas.microsoft.com/office/drawing/2010/main" val="0"/>
@@ -19371,7 +19511,17 @@
           <w:color w:val="6A6A70"/>
           <w:sz w:val="21"/>
         </w:rPr>
-        <w:t>Meta e selo de status (Normal/Atencao/Critico): cada indicador compara o realizado com a meta definida pelo Admin (secao 6.3). Sem meta definida, o cartao mostra Meta nao definida em vez de um selo - nunca inventa um status. Com meta definida: Normal na meta ou acima; Atencao ate 15 pontos percentuais abaixo da meta; Critico alem disso.</w:t>
+        <w:t xml:space="preserve">Meta e selo de status (Normal/Atencao/Critico): cada indicador compara o realizado com a meta definida pelo Admin (secao 6.3). Sem meta definida, o </w:t>
+      </w:r>
+      <w:r>
+        <w:rPr>
+          <w:rFonts w:ascii="Montserrat" w:hAnsi="Montserrat"/>
+          <w:i/>
+          <w:color w:val="6A6A70"/>
+          <w:sz w:val="21"/>
+        </w:rPr>
+        <w:lastRenderedPageBreak/>
+        <w:t>cartao mostra Meta nao definida em vez de um selo - nunca inventa um status. Com meta definida: Normal na meta ou acima; Atencao ate 15 pontos percentuais abaixo da meta; Critico alem disso.</w:t>
       </w:r>
     </w:p>
     <w:p>
@@ -19450,20 +19600,20 @@
           <w:noProof/>
         </w:rPr>
         <w:drawing>
-          <wp:inline distT="0" distB="0" distL="0" distR="0" wp14:anchorId="48DD2C48" wp14:editId="15A33397">
+          <wp:inline distT="0" distB="0" distL="0" distR="0" wp14:anchorId="75A546A0" wp14:editId="1FF3E095">
             <wp:extent cx="5303520" cy="1841050"/>
             <wp:effectExtent l="19050" t="19050" r="11430" b="26035"/>
-            <wp:docPr id="171770825" name="Imagem 53"/>
+            <wp:docPr id="836707223" name="Imagem 54"/>
             <wp:cNvGraphicFramePr/>
             <a:graphic xmlns:a="http://schemas.openxmlformats.org/drawingml/2006/main">
               <a:graphicData uri="http://schemas.openxmlformats.org/drawingml/2006/picture">
                 <pic:pic xmlns:pic="http://schemas.openxmlformats.org/drawingml/2006/picture">
                   <pic:nvPicPr>
-                    <pic:cNvPr id="171770825" name=""/>
+                    <pic:cNvPr id="836707223" name=""/>
                     <pic:cNvPicPr/>
                   </pic:nvPicPr>
                   <pic:blipFill>
-                    <a:blip r:embed="rId59">
+                    <a:blip r:embed="rId60">
                       <a:extLst>
                         <a:ext uri="{28A0092B-C50C-407E-A947-70E740481C1C}">
                           <a14:useLocalDpi xmlns:a14="http://schemas.microsoft.com/office/drawing/2010/main" val="0"/>
@@ -19534,7 +19684,6 @@
           <w:color w:val="6A6A70"/>
           <w:sz w:val="21"/>
         </w:rPr>
-        <w:lastRenderedPageBreak/>
         <w:t>O rotulo Atualizado em no topo da pagina mostra quando os dados foram lidos - esta pagina e uma foto em tempo real, assim como o Painel Executivo, nao um fechamento formal de mes.</w:t>
       </w:r>
     </w:p>
@@ -19601,6 +19750,7 @@
           <w:color w:val="1A1A1A"/>
           <w:sz w:val="22"/>
         </w:rPr>
+        <w:lastRenderedPageBreak/>
         <w:t>Gerar Apresentacao (PPTX): monta, inteiramente no navegador, uma apresentacao de 3 slides - capa, os indicadores estrategicos (com meta, barra de progresso, selo de status e tendencia) e o Plano de Acao - usando os mesmos numeros exibidos na tela naquele momento. Uma biblioteca de geracao e carregada sob demanda na primeira vez que o botao e usado (pode levar alguns segundos).</w:t>
       </w:r>
     </w:p>
@@ -19614,20 +19764,20 @@
           <w:noProof/>
         </w:rPr>
         <w:drawing>
-          <wp:inline distT="0" distB="0" distL="0" distR="0" wp14:anchorId="42BC234D" wp14:editId="73E1FC64">
+          <wp:inline distT="0" distB="0" distL="0" distR="0" wp14:anchorId="56BA010C" wp14:editId="1AA61CF7">
             <wp:extent cx="5303520" cy="303041"/>
             <wp:effectExtent l="19050" t="19050" r="11430" b="20955"/>
-            <wp:docPr id="1633524374" name="Imagem 54"/>
+            <wp:docPr id="1716905821" name="Imagem 55"/>
             <wp:cNvGraphicFramePr/>
             <a:graphic xmlns:a="http://schemas.openxmlformats.org/drawingml/2006/main">
               <a:graphicData uri="http://schemas.openxmlformats.org/drawingml/2006/picture">
                 <pic:pic xmlns:pic="http://schemas.openxmlformats.org/drawingml/2006/picture">
                   <pic:nvPicPr>
-                    <pic:cNvPr id="1633524374" name=""/>
+                    <pic:cNvPr id="1716905821" name=""/>
                     <pic:cNvPicPr/>
                   </pic:nvPicPr>
                   <pic:blipFill>
-                    <a:blip r:embed="rId60">
+                    <a:blip r:embed="rId61">
                       <a:extLst>
                         <a:ext uri="{28A0092B-C50C-407E-A947-70E740481C1C}">
                           <a14:useLocalDpi xmlns:a14="http://schemas.microsoft.com/office/drawing/2010/main" val="0"/>
@@ -19690,20 +19840,20 @@
           <w:noProof/>
         </w:rPr>
         <w:drawing>
-          <wp:inline distT="0" distB="0" distL="0" distR="0" wp14:anchorId="6D5E629D" wp14:editId="44D3258D">
+          <wp:inline distT="0" distB="0" distL="0" distR="0" wp14:anchorId="0C0636D7" wp14:editId="09E0B37A">
             <wp:extent cx="5303520" cy="2983005"/>
             <wp:effectExtent l="19050" t="19050" r="11430" b="27305"/>
-            <wp:docPr id="684232424" name="Imagem 55"/>
+            <wp:docPr id="60302753" name="Imagem 56"/>
             <wp:cNvGraphicFramePr/>
             <a:graphic xmlns:a="http://schemas.openxmlformats.org/drawingml/2006/main">
               <a:graphicData uri="http://schemas.openxmlformats.org/drawingml/2006/picture">
                 <pic:pic xmlns:pic="http://schemas.openxmlformats.org/drawingml/2006/picture">
                   <pic:nvPicPr>
-                    <pic:cNvPr id="684232424" name=""/>
+                    <pic:cNvPr id="60302753" name=""/>
                     <pic:cNvPicPr/>
                   </pic:nvPicPr>
                   <pic:blipFill>
-                    <a:blip r:embed="rId61" cstate="print">
+                    <a:blip r:embed="rId62" cstate="print">
                       <a:extLst>
                         <a:ext uri="{28A0092B-C50C-407E-A947-70E740481C1C}">
                           <a14:useLocalDpi xmlns:a14="http://schemas.microsoft.com/office/drawing/2010/main" val="0"/>
@@ -19771,7 +19921,7 @@
           <w:sz w:val="34"/>
         </w:rPr>
       </w:pPr>
-      <w:bookmarkStart w:id="45" w:name="_Toc239254003"/>
+      <w:bookmarkStart w:id="45" w:name="_Toc239320811"/>
       <w:r>
         <w:rPr>
           <w:rFonts w:ascii="Montserrat" w:hAnsi="Montserrat"/>
@@ -20015,7 +20165,7 @@
           <w:sz w:val="34"/>
         </w:rPr>
       </w:pPr>
-      <w:bookmarkStart w:id="46" w:name="_Toc239254004"/>
+      <w:bookmarkStart w:id="46" w:name="_Toc239320812"/>
       <w:r>
         <w:rPr>
           <w:rFonts w:ascii="Montserrat" w:hAnsi="Montserrat"/>
@@ -21639,12 +21789,12 @@
       </w:pPr>
     </w:p>
     <w:sectPr>
-      <w:headerReference w:type="even" r:id="rId62"/>
-      <w:headerReference w:type="default" r:id="rId63"/>
-      <w:footerReference w:type="even" r:id="rId64"/>
-      <w:footerReference w:type="default" r:id="rId65"/>
-      <w:headerReference w:type="first" r:id="rId66"/>
-      <w:footerReference w:type="first" r:id="rId67"/>
+      <w:headerReference w:type="even" r:id="rId63"/>
+      <w:headerReference w:type="default" r:id="rId64"/>
+      <w:footerReference w:type="even" r:id="rId65"/>
+      <w:footerReference w:type="default" r:id="rId66"/>
+      <w:headerReference w:type="first" r:id="rId67"/>
+      <w:footerReference w:type="first" r:id="rId68"/>
       <w:pgSz w:w="12240" w:h="15840"/>
       <w:pgMar w:top="1417" w:right="1701" w:bottom="1417" w:left="1701" w:header="708" w:footer="708" w:gutter="0"/>
       <w:cols w:space="708"/>
@@ -21803,7 +21953,7 @@
 <file path=word/numbering.xml><?xml version="1.0" encoding="utf-8"?>
 <w:numbering xmlns:wpc="http://schemas.microsoft.com/office/word/2010/wordprocessingCanvas" xmlns:cx="http://schemas.microsoft.com/office/drawing/2014/chartex" xmlns:cx1="http://schemas.microsoft.com/office/drawing/2015/9/8/chartex" xmlns:cx2="http://schemas.microsoft.com/office/drawing/2015/10/21/chartex" xmlns:cx3="http://schemas.microsoft.com/office/drawing/2016/5/9/chartex" xmlns:cx4="http://schemas.microsoft.com/office/drawing/2016/5/10/chartex" xmlns:cx5="http://schemas.microsoft.com/office/drawing/2016/5/11/chartex" xmlns:cx6="http://schemas.microsoft.com/office/drawing/2016/5/12/chartex" xmlns:cx7="http://schemas.microsoft.com/office/drawing/2016/5/13/chartex" xmlns:cx8="http://schemas.microsoft.com/office/drawing/2016/5/14/chartex" xmlns:mc="http://schemas.openxmlformats.org/markup-compatibility/2006" xmlns:aink="http://schemas.microsoft.com/office/drawing/2016/ink" xmlns:am3d="http://schemas.microsoft.com/office/drawing/2017/model3d" xmlns:o="urn:schemas-microsoft-com:office:office" xmlns:oel="http://schemas.microsoft.com/office/2019/extlst" xmlns:r="http://schemas.openxmlformats.org/officeDocument/2006/relationships" xmlns:m="http://schemas.openxmlformats.org/officeDocument/2006/math" xmlns:v="urn:schemas-microsoft-com:vml" xmlns:wp14="http://schemas.microsoft.com/office/word/2010/wordprocessingDrawing" xmlns:wp="http://schemas.openxmlformats.org/drawingml/2006/wordprocessingDrawing" xmlns:w10="urn:schemas-microsoft-com:office:word" xmlns:w="http://schemas.openxmlformats.org/wordprocessingml/2006/main" xmlns:w14="http://schemas.microsoft.com/office/word/2010/wordml" xmlns:w15="http://schemas.microsoft.com/office/word/2012/wordml" xmlns:w16cex="http://schemas.microsoft.com/office/word/2018/wordml/cex" xmlns:w16cid="http://schemas.microsoft.com/office/word/2016/wordml/cid" xmlns:w16="http://schemas.microsoft.com/office/word/2018/wordml" xmlns:w16du="http://schemas.microsoft.com/office/word/2023/wordml/word16du" xmlns:w16sdtdh="http://schemas.microsoft.com/office/word/2020/wordml/sdtdatahash" xmlns:w16sdtfl="http://schemas.microsoft.com/office/word/2024/wordml/sdtformatlock" xmlns:w16se="http://schemas.microsoft.com/office/word/2015/wordml/symex" xmlns:wpg="http://schemas.microsoft.com/office/word/2010/wordprocessingGroup" xmlns:wpi="http://schemas.microsoft.com/office/word/2010/wordprocessingInk" xmlns:wne="http://schemas.microsoft.com/office/word/2006/wordml" xmlns:wps="http://schemas.microsoft.com/office/word/2010/wordprocessingShape" mc:Ignorable="w14 w15 w16se w16cid w16 w16cex w16sdtdh w16sdtfl w16du wp14">
   <w:abstractNum w:abstractNumId="0" w15:restartNumberingAfterBreak="0">
-    <w:nsid w:val="036F6E7B"/>
+    <w:nsid w:val="0478213A"/>
     <w:multiLevelType w:val="singleLevel"/>
     <w:tmpl w:val="04160001"/>
     <w:lvl w:ilvl="0">
@@ -21820,7 +21970,7 @@
     </w:lvl>
   </w:abstractNum>
   <w:abstractNum w:abstractNumId="1" w15:restartNumberingAfterBreak="0">
-    <w:nsid w:val="03D07A91"/>
+    <w:nsid w:val="0E1F61B0"/>
     <w:multiLevelType w:val="singleLevel"/>
     <w:tmpl w:val="04160001"/>
     <w:lvl w:ilvl="0">
@@ -21837,7 +21987,7 @@
     </w:lvl>
   </w:abstractNum>
   <w:abstractNum w:abstractNumId="2" w15:restartNumberingAfterBreak="0">
-    <w:nsid w:val="06BE660A"/>
+    <w:nsid w:val="116A31EE"/>
     <w:multiLevelType w:val="singleLevel"/>
     <w:tmpl w:val="04160001"/>
     <w:lvl w:ilvl="0">
@@ -21854,7 +22004,7 @@
     </w:lvl>
   </w:abstractNum>
   <w:abstractNum w:abstractNumId="3" w15:restartNumberingAfterBreak="0">
-    <w:nsid w:val="1A01490B"/>
+    <w:nsid w:val="147345FC"/>
     <w:multiLevelType w:val="singleLevel"/>
     <w:tmpl w:val="04160001"/>
     <w:lvl w:ilvl="0">
@@ -21871,7 +22021,7 @@
     </w:lvl>
   </w:abstractNum>
   <w:abstractNum w:abstractNumId="4" w15:restartNumberingAfterBreak="0">
-    <w:nsid w:val="1D72571C"/>
+    <w:nsid w:val="179A2B8E"/>
     <w:multiLevelType w:val="singleLevel"/>
     <w:tmpl w:val="04160001"/>
     <w:lvl w:ilvl="0">
@@ -21888,7 +22038,7 @@
     </w:lvl>
   </w:abstractNum>
   <w:abstractNum w:abstractNumId="5" w15:restartNumberingAfterBreak="0">
-    <w:nsid w:val="1FB510FE"/>
+    <w:nsid w:val="1A446474"/>
     <w:multiLevelType w:val="singleLevel"/>
     <w:tmpl w:val="04160001"/>
     <w:lvl w:ilvl="0">
@@ -21905,7 +22055,7 @@
     </w:lvl>
   </w:abstractNum>
   <w:abstractNum w:abstractNumId="6" w15:restartNumberingAfterBreak="0">
-    <w:nsid w:val="20FC2210"/>
+    <w:nsid w:val="1DC42520"/>
     <w:multiLevelType w:val="singleLevel"/>
     <w:tmpl w:val="04160001"/>
     <w:lvl w:ilvl="0">
@@ -21922,7 +22072,7 @@
     </w:lvl>
   </w:abstractNum>
   <w:abstractNum w:abstractNumId="7" w15:restartNumberingAfterBreak="0">
-    <w:nsid w:val="230C3C58"/>
+    <w:nsid w:val="21E50D95"/>
     <w:multiLevelType w:val="singleLevel"/>
     <w:tmpl w:val="04160001"/>
     <w:lvl w:ilvl="0">
@@ -21939,7 +22089,7 @@
     </w:lvl>
   </w:abstractNum>
   <w:abstractNum w:abstractNumId="8" w15:restartNumberingAfterBreak="0">
-    <w:nsid w:val="283B1E5C"/>
+    <w:nsid w:val="24C37E68"/>
     <w:multiLevelType w:val="singleLevel"/>
     <w:tmpl w:val="04160001"/>
     <w:lvl w:ilvl="0">
@@ -21956,7 +22106,7 @@
     </w:lvl>
   </w:abstractNum>
   <w:abstractNum w:abstractNumId="9" w15:restartNumberingAfterBreak="0">
-    <w:nsid w:val="30A31B67"/>
+    <w:nsid w:val="26537D80"/>
     <w:multiLevelType w:val="singleLevel"/>
     <w:tmpl w:val="04160001"/>
     <w:lvl w:ilvl="0">
@@ -21973,7 +22123,7 @@
     </w:lvl>
   </w:abstractNum>
   <w:abstractNum w:abstractNumId="10" w15:restartNumberingAfterBreak="0">
-    <w:nsid w:val="347F3771"/>
+    <w:nsid w:val="26C57DC0"/>
     <w:multiLevelType w:val="singleLevel"/>
     <w:tmpl w:val="04160001"/>
     <w:lvl w:ilvl="0">
@@ -21990,7 +22140,7 @@
     </w:lvl>
   </w:abstractNum>
   <w:abstractNum w:abstractNumId="11" w15:restartNumberingAfterBreak="0">
-    <w:nsid w:val="36BF737F"/>
+    <w:nsid w:val="29793BE6"/>
     <w:multiLevelType w:val="singleLevel"/>
     <w:tmpl w:val="04160001"/>
     <w:lvl w:ilvl="0">
@@ -22007,7 +22157,7 @@
     </w:lvl>
   </w:abstractNum>
   <w:abstractNum w:abstractNumId="12" w15:restartNumberingAfterBreak="0">
-    <w:nsid w:val="38944129"/>
+    <w:nsid w:val="31D33897"/>
     <w:multiLevelType w:val="singleLevel"/>
     <w:tmpl w:val="04160001"/>
     <w:lvl w:ilvl="0">
@@ -22024,7 +22174,7 @@
     </w:lvl>
   </w:abstractNum>
   <w:abstractNum w:abstractNumId="13" w15:restartNumberingAfterBreak="0">
-    <w:nsid w:val="38CA59AA"/>
+    <w:nsid w:val="32594AE1"/>
     <w:multiLevelType w:val="singleLevel"/>
     <w:tmpl w:val="04160001"/>
     <w:lvl w:ilvl="0">
@@ -22041,7 +22191,7 @@
     </w:lvl>
   </w:abstractNum>
   <w:abstractNum w:abstractNumId="14" w15:restartNumberingAfterBreak="0">
-    <w:nsid w:val="414944E6"/>
+    <w:nsid w:val="38526F18"/>
     <w:multiLevelType w:val="singleLevel"/>
     <w:tmpl w:val="04160001"/>
     <w:lvl w:ilvl="0">
@@ -22058,7 +22208,7 @@
     </w:lvl>
   </w:abstractNum>
   <w:abstractNum w:abstractNumId="15" w15:restartNumberingAfterBreak="0">
-    <w:nsid w:val="450B0B8D"/>
+    <w:nsid w:val="471B235E"/>
     <w:multiLevelType w:val="singleLevel"/>
     <w:tmpl w:val="04160001"/>
     <w:lvl w:ilvl="0">
@@ -22075,7 +22225,7 @@
     </w:lvl>
   </w:abstractNum>
   <w:abstractNum w:abstractNumId="16" w15:restartNumberingAfterBreak="0">
-    <w:nsid w:val="48814E7A"/>
+    <w:nsid w:val="4CCE3CEC"/>
     <w:multiLevelType w:val="singleLevel"/>
     <w:tmpl w:val="04160001"/>
     <w:lvl w:ilvl="0">
@@ -22092,7 +22242,7 @@
     </w:lvl>
   </w:abstractNum>
   <w:abstractNum w:abstractNumId="17" w15:restartNumberingAfterBreak="0">
-    <w:nsid w:val="495C0D4B"/>
+    <w:nsid w:val="531A5A50"/>
     <w:multiLevelType w:val="singleLevel"/>
     <w:tmpl w:val="04160001"/>
     <w:lvl w:ilvl="0">
@@ -22109,7 +22259,7 @@
     </w:lvl>
   </w:abstractNum>
   <w:abstractNum w:abstractNumId="18" w15:restartNumberingAfterBreak="0">
-    <w:nsid w:val="4D7124F0"/>
+    <w:nsid w:val="5A1175EE"/>
     <w:multiLevelType w:val="singleLevel"/>
     <w:tmpl w:val="04160001"/>
     <w:lvl w:ilvl="0">
@@ -22126,7 +22276,7 @@
     </w:lvl>
   </w:abstractNum>
   <w:abstractNum w:abstractNumId="19" w15:restartNumberingAfterBreak="0">
-    <w:nsid w:val="4EA0125C"/>
+    <w:nsid w:val="5AB110BD"/>
     <w:multiLevelType w:val="singleLevel"/>
     <w:tmpl w:val="04160001"/>
     <w:lvl w:ilvl="0">
@@ -22143,7 +22293,7 @@
     </w:lvl>
   </w:abstractNum>
   <w:abstractNum w:abstractNumId="20" w15:restartNumberingAfterBreak="0">
-    <w:nsid w:val="526379C6"/>
+    <w:nsid w:val="5FC302A0"/>
     <w:multiLevelType w:val="singleLevel"/>
     <w:tmpl w:val="04160001"/>
     <w:lvl w:ilvl="0">
@@ -22160,7 +22310,7 @@
     </w:lvl>
   </w:abstractNum>
   <w:abstractNum w:abstractNumId="21" w15:restartNumberingAfterBreak="0">
-    <w:nsid w:val="56F82A7E"/>
+    <w:nsid w:val="621F0F7F"/>
     <w:multiLevelType w:val="singleLevel"/>
     <w:tmpl w:val="04160001"/>
     <w:lvl w:ilvl="0">
@@ -22177,7 +22327,7 @@
     </w:lvl>
   </w:abstractNum>
   <w:abstractNum w:abstractNumId="22" w15:restartNumberingAfterBreak="0">
-    <w:nsid w:val="58416E52"/>
+    <w:nsid w:val="63FE60A9"/>
     <w:multiLevelType w:val="singleLevel"/>
     <w:tmpl w:val="04160001"/>
     <w:lvl w:ilvl="0">
@@ -22194,7 +22344,7 @@
     </w:lvl>
   </w:abstractNum>
   <w:abstractNum w:abstractNumId="23" w15:restartNumberingAfterBreak="0">
-    <w:nsid w:val="584F0E78"/>
+    <w:nsid w:val="6CE435E8"/>
     <w:multiLevelType w:val="singleLevel"/>
     <w:tmpl w:val="04160001"/>
     <w:lvl w:ilvl="0">
@@ -22211,7 +22361,7 @@
     </w:lvl>
   </w:abstractNum>
   <w:abstractNum w:abstractNumId="24" w15:restartNumberingAfterBreak="0">
-    <w:nsid w:val="5CB6083B"/>
+    <w:nsid w:val="6EC142E2"/>
     <w:multiLevelType w:val="singleLevel"/>
     <w:tmpl w:val="04160001"/>
     <w:lvl w:ilvl="0">
@@ -22228,7 +22378,7 @@
     </w:lvl>
   </w:abstractNum>
   <w:abstractNum w:abstractNumId="25" w15:restartNumberingAfterBreak="0">
-    <w:nsid w:val="5DAD7199"/>
+    <w:nsid w:val="70F2506F"/>
     <w:multiLevelType w:val="singleLevel"/>
     <w:tmpl w:val="04160001"/>
     <w:lvl w:ilvl="0">
@@ -22245,7 +22395,7 @@
     </w:lvl>
   </w:abstractNum>
   <w:abstractNum w:abstractNumId="26" w15:restartNumberingAfterBreak="0">
-    <w:nsid w:val="6AC72E3D"/>
+    <w:nsid w:val="71D42310"/>
     <w:multiLevelType w:val="singleLevel"/>
     <w:tmpl w:val="04160001"/>
     <w:lvl w:ilvl="0">
@@ -22262,7 +22412,7 @@
     </w:lvl>
   </w:abstractNum>
   <w:abstractNum w:abstractNumId="27" w15:restartNumberingAfterBreak="0">
-    <w:nsid w:val="6C110E67"/>
+    <w:nsid w:val="73141ED0"/>
     <w:multiLevelType w:val="singleLevel"/>
     <w:tmpl w:val="04160001"/>
     <w:lvl w:ilvl="0">
@@ -22279,7 +22429,7 @@
     </w:lvl>
   </w:abstractNum>
   <w:abstractNum w:abstractNumId="28" w15:restartNumberingAfterBreak="0">
-    <w:nsid w:val="6DF0710E"/>
+    <w:nsid w:val="74F367AA"/>
     <w:multiLevelType w:val="singleLevel"/>
     <w:tmpl w:val="04160001"/>
     <w:lvl w:ilvl="0">
@@ -22296,7 +22446,7 @@
     </w:lvl>
   </w:abstractNum>
   <w:abstractNum w:abstractNumId="29" w15:restartNumberingAfterBreak="0">
-    <w:nsid w:val="71121170"/>
+    <w:nsid w:val="75841750"/>
     <w:multiLevelType w:val="singleLevel"/>
     <w:tmpl w:val="04160001"/>
     <w:lvl w:ilvl="0">
@@ -22313,7 +22463,7 @@
     </w:lvl>
   </w:abstractNum>
   <w:abstractNum w:abstractNumId="30" w15:restartNumberingAfterBreak="0">
-    <w:nsid w:val="72142C01"/>
+    <w:nsid w:val="75FD4E63"/>
     <w:multiLevelType w:val="singleLevel"/>
     <w:tmpl w:val="04160001"/>
     <w:lvl w:ilvl="0">
@@ -22330,7 +22480,7 @@
     </w:lvl>
   </w:abstractNum>
   <w:abstractNum w:abstractNumId="31" w15:restartNumberingAfterBreak="0">
-    <w:nsid w:val="7D2F5ADD"/>
+    <w:nsid w:val="780D6166"/>
     <w:multiLevelType w:val="singleLevel"/>
     <w:tmpl w:val="04160001"/>
     <w:lvl w:ilvl="0">
@@ -22346,101 +22496,101 @@
       </w:rPr>
     </w:lvl>
   </w:abstractNum>
-  <w:num w:numId="1" w16cid:durableId="1816600926">
+  <w:num w:numId="1" w16cid:durableId="763916970">
+    <w:abstractNumId w:val="12"/>
+  </w:num>
+  <w:num w:numId="2" w16cid:durableId="424689029">
+    <w:abstractNumId w:val="20"/>
+  </w:num>
+  <w:num w:numId="3" w16cid:durableId="1513446344">
+    <w:abstractNumId w:val="17"/>
+  </w:num>
+  <w:num w:numId="4" w16cid:durableId="691952419">
+    <w:abstractNumId w:val="7"/>
+  </w:num>
+  <w:num w:numId="5" w16cid:durableId="364134319">
+    <w:abstractNumId w:val="19"/>
+  </w:num>
+  <w:num w:numId="6" w16cid:durableId="93795408">
+    <w:abstractNumId w:val="6"/>
+  </w:num>
+  <w:num w:numId="7" w16cid:durableId="1449884701">
+    <w:abstractNumId w:val="9"/>
+  </w:num>
+  <w:num w:numId="8" w16cid:durableId="1923835502">
+    <w:abstractNumId w:val="18"/>
+  </w:num>
+  <w:num w:numId="9" w16cid:durableId="294221522">
+    <w:abstractNumId w:val="8"/>
+  </w:num>
+  <w:num w:numId="10" w16cid:durableId="373777587">
+    <w:abstractNumId w:val="23"/>
+  </w:num>
+  <w:num w:numId="11" w16cid:durableId="949628329">
+    <w:abstractNumId w:val="24"/>
+  </w:num>
+  <w:num w:numId="12" w16cid:durableId="1661032429">
+    <w:abstractNumId w:val="29"/>
+  </w:num>
+  <w:num w:numId="13" w16cid:durableId="688919175">
+    <w:abstractNumId w:val="27"/>
+  </w:num>
+  <w:num w:numId="14" w16cid:durableId="544684018">
+    <w:abstractNumId w:val="26"/>
+  </w:num>
+  <w:num w:numId="15" w16cid:durableId="600407168">
+    <w:abstractNumId w:val="5"/>
+  </w:num>
+  <w:num w:numId="16" w16cid:durableId="16278235">
+    <w:abstractNumId w:val="15"/>
+  </w:num>
+  <w:num w:numId="17" w16cid:durableId="1628122395">
+    <w:abstractNumId w:val="11"/>
+  </w:num>
+  <w:num w:numId="18" w16cid:durableId="1036999762">
+    <w:abstractNumId w:val="1"/>
+  </w:num>
+  <w:num w:numId="19" w16cid:durableId="1117875285">
+    <w:abstractNumId w:val="16"/>
+  </w:num>
+  <w:num w:numId="20" w16cid:durableId="104155667">
+    <w:abstractNumId w:val="28"/>
+  </w:num>
+  <w:num w:numId="21" w16cid:durableId="115370424">
+    <w:abstractNumId w:val="4"/>
+  </w:num>
+  <w:num w:numId="22" w16cid:durableId="881019967">
+    <w:abstractNumId w:val="22"/>
+  </w:num>
+  <w:num w:numId="23" w16cid:durableId="115804980">
+    <w:abstractNumId w:val="30"/>
+  </w:num>
+  <w:num w:numId="24" w16cid:durableId="1221357452">
+    <w:abstractNumId w:val="2"/>
+  </w:num>
+  <w:num w:numId="25" w16cid:durableId="1716924181">
+    <w:abstractNumId w:val="25"/>
+  </w:num>
+  <w:num w:numId="26" w16cid:durableId="56099012">
+    <w:abstractNumId w:val="3"/>
+  </w:num>
+  <w:num w:numId="27" w16cid:durableId="805438973">
+    <w:abstractNumId w:val="31"/>
+  </w:num>
+  <w:num w:numId="28" w16cid:durableId="1165316498">
+    <w:abstractNumId w:val="10"/>
+  </w:num>
+  <w:num w:numId="29" w16cid:durableId="1840852410">
+    <w:abstractNumId w:val="0"/>
+  </w:num>
+  <w:num w:numId="30" w16cid:durableId="2055350956">
     <w:abstractNumId w:val="14"/>
   </w:num>
-  <w:num w:numId="2" w16cid:durableId="1097408815">
-    <w:abstractNumId w:val="10"/>
-  </w:num>
-  <w:num w:numId="3" w16cid:durableId="346446510">
-    <w:abstractNumId w:val="4"/>
-  </w:num>
-  <w:num w:numId="4" w16cid:durableId="380522507">
-    <w:abstractNumId w:val="29"/>
-  </w:num>
-  <w:num w:numId="5" w16cid:durableId="1960792668">
-    <w:abstractNumId w:val="24"/>
-  </w:num>
-  <w:num w:numId="6" w16cid:durableId="1683120610">
-    <w:abstractNumId w:val="28"/>
-  </w:num>
-  <w:num w:numId="7" w16cid:durableId="194775011">
+  <w:num w:numId="31" w16cid:durableId="1034892652">
     <w:abstractNumId w:val="13"/>
   </w:num>
-  <w:num w:numId="8" w16cid:durableId="147136593">
-    <w:abstractNumId w:val="2"/>
-  </w:num>
-  <w:num w:numId="9" w16cid:durableId="1758624612">
-    <w:abstractNumId w:val="27"/>
-  </w:num>
-  <w:num w:numId="10" w16cid:durableId="232738986">
-    <w:abstractNumId w:val="19"/>
-  </w:num>
-  <w:num w:numId="11" w16cid:durableId="804467440">
-    <w:abstractNumId w:val="20"/>
-  </w:num>
-  <w:num w:numId="12" w16cid:durableId="1023168971">
-    <w:abstractNumId w:val="5"/>
-  </w:num>
-  <w:num w:numId="13" w16cid:durableId="775755361">
-    <w:abstractNumId w:val="9"/>
-  </w:num>
-  <w:num w:numId="14" w16cid:durableId="467861988">
-    <w:abstractNumId w:val="8"/>
-  </w:num>
-  <w:num w:numId="15" w16cid:durableId="1049494701">
-    <w:abstractNumId w:val="3"/>
-  </w:num>
-  <w:num w:numId="16" w16cid:durableId="929311741">
-    <w:abstractNumId w:val="15"/>
-  </w:num>
-  <w:num w:numId="17" w16cid:durableId="2434711">
-    <w:abstractNumId w:val="6"/>
-  </w:num>
-  <w:num w:numId="18" w16cid:durableId="1097483884">
-    <w:abstractNumId w:val="26"/>
-  </w:num>
-  <w:num w:numId="19" w16cid:durableId="2005929841">
-    <w:abstractNumId w:val="0"/>
-  </w:num>
-  <w:num w:numId="20" w16cid:durableId="1502114504">
-    <w:abstractNumId w:val="11"/>
-  </w:num>
-  <w:num w:numId="21" w16cid:durableId="663123434">
+  <w:num w:numId="32" w16cid:durableId="1784954262">
     <w:abstractNumId w:val="21"/>
-  </w:num>
-  <w:num w:numId="22" w16cid:durableId="1874466005">
-    <w:abstractNumId w:val="25"/>
-  </w:num>
-  <w:num w:numId="23" w16cid:durableId="2044287660">
-    <w:abstractNumId w:val="17"/>
-  </w:num>
-  <w:num w:numId="24" w16cid:durableId="119810570">
-    <w:abstractNumId w:val="31"/>
-  </w:num>
-  <w:num w:numId="25" w16cid:durableId="758867839">
-    <w:abstractNumId w:val="12"/>
-  </w:num>
-  <w:num w:numId="26" w16cid:durableId="2027560837">
-    <w:abstractNumId w:val="30"/>
-  </w:num>
-  <w:num w:numId="27" w16cid:durableId="1862275968">
-    <w:abstractNumId w:val="23"/>
-  </w:num>
-  <w:num w:numId="28" w16cid:durableId="1602451101">
-    <w:abstractNumId w:val="16"/>
-  </w:num>
-  <w:num w:numId="29" w16cid:durableId="2126193027">
-    <w:abstractNumId w:val="22"/>
-  </w:num>
-  <w:num w:numId="30" w16cid:durableId="1897086043">
-    <w:abstractNumId w:val="7"/>
-  </w:num>
-  <w:num w:numId="31" w16cid:durableId="1817841434">
-    <w:abstractNumId w:val="1"/>
-  </w:num>
-  <w:num w:numId="32" w16cid:durableId="1067217999">
-    <w:abstractNumId w:val="18"/>
   </w:num>
 </w:numbering>
 </file>
@@ -22853,7 +23003,7 @@
     <w:link w:val="Ttulo1Char"/>
     <w:uiPriority w:val="9"/>
     <w:qFormat/>
-    <w:rsid w:val="00C54814"/>
+    <w:rsid w:val="0092155D"/>
     <w:pPr>
       <w:keepNext/>
       <w:keepLines/>
@@ -22875,7 +23025,7 @@
     <w:uiPriority w:val="9"/>
     <w:unhideWhenUsed/>
     <w:qFormat/>
-    <w:rsid w:val="00C54814"/>
+    <w:rsid w:val="0092155D"/>
     <w:pPr>
       <w:keepNext/>
       <w:keepLines/>
@@ -22898,7 +23048,7 @@
     <w:semiHidden/>
     <w:unhideWhenUsed/>
     <w:qFormat/>
-    <w:rsid w:val="00C54814"/>
+    <w:rsid w:val="0092155D"/>
     <w:pPr>
       <w:keepNext/>
       <w:keepLines/>
@@ -22921,7 +23071,7 @@
     <w:semiHidden/>
     <w:unhideWhenUsed/>
     <w:qFormat/>
-    <w:rsid w:val="00C54814"/>
+    <w:rsid w:val="0092155D"/>
     <w:pPr>
       <w:keepNext/>
       <w:keepLines/>
@@ -22944,7 +23094,7 @@
     <w:semiHidden/>
     <w:unhideWhenUsed/>
     <w:qFormat/>
-    <w:rsid w:val="00C54814"/>
+    <w:rsid w:val="0092155D"/>
     <w:pPr>
       <w:keepNext/>
       <w:keepLines/>
@@ -22965,7 +23115,7 @@
     <w:semiHidden/>
     <w:unhideWhenUsed/>
     <w:qFormat/>
-    <w:rsid w:val="00C54814"/>
+    <w:rsid w:val="0092155D"/>
     <w:pPr>
       <w:keepNext/>
       <w:keepLines/>
@@ -22988,7 +23138,7 @@
     <w:semiHidden/>
     <w:unhideWhenUsed/>
     <w:qFormat/>
-    <w:rsid w:val="00C54814"/>
+    <w:rsid w:val="0092155D"/>
     <w:pPr>
       <w:keepNext/>
       <w:keepLines/>
@@ -23009,7 +23159,7 @@
     <w:semiHidden/>
     <w:unhideWhenUsed/>
     <w:qFormat/>
-    <w:rsid w:val="00C54814"/>
+    <w:rsid w:val="0092155D"/>
     <w:pPr>
       <w:keepNext/>
       <w:keepLines/>
@@ -23032,7 +23182,7 @@
     <w:semiHidden/>
     <w:unhideWhenUsed/>
     <w:qFormat/>
-    <w:rsid w:val="00C54814"/>
+    <w:rsid w:val="0092155D"/>
     <w:pPr>
       <w:keepNext/>
       <w:keepLines/>
@@ -23076,7 +23226,7 @@
     <w:basedOn w:val="Fontepargpadro"/>
     <w:link w:val="Ttulo1"/>
     <w:uiPriority w:val="9"/>
-    <w:rsid w:val="00C54814"/>
+    <w:rsid w:val="0092155D"/>
     <w:rPr>
       <w:rFonts w:asciiTheme="majorHAnsi" w:eastAsiaTheme="majorEastAsia" w:hAnsiTheme="majorHAnsi" w:cstheme="majorBidi"/>
       <w:color w:val="0F4761" w:themeColor="accent1" w:themeShade="BF"/>
@@ -23089,7 +23239,7 @@
     <w:basedOn w:val="Fontepargpadro"/>
     <w:link w:val="Ttulo2"/>
     <w:uiPriority w:val="9"/>
-    <w:rsid w:val="00C54814"/>
+    <w:rsid w:val="0092155D"/>
     <w:rPr>
       <w:rFonts w:asciiTheme="majorHAnsi" w:eastAsiaTheme="majorEastAsia" w:hAnsiTheme="majorHAnsi" w:cstheme="majorBidi"/>
       <w:color w:val="0F4761" w:themeColor="accent1" w:themeShade="BF"/>
@@ -23103,7 +23253,7 @@
     <w:link w:val="Ttulo3"/>
     <w:uiPriority w:val="9"/>
     <w:semiHidden/>
-    <w:rsid w:val="00C54814"/>
+    <w:rsid w:val="0092155D"/>
     <w:rPr>
       <w:rFonts w:eastAsiaTheme="majorEastAsia" w:cstheme="majorBidi"/>
       <w:color w:val="0F4761" w:themeColor="accent1" w:themeShade="BF"/>
@@ -23117,7 +23267,7 @@
     <w:link w:val="Ttulo4"/>
     <w:uiPriority w:val="9"/>
     <w:semiHidden/>
-    <w:rsid w:val="00C54814"/>
+    <w:rsid w:val="0092155D"/>
     <w:rPr>
       <w:rFonts w:eastAsiaTheme="majorEastAsia" w:cstheme="majorBidi"/>
       <w:i/>
@@ -23131,7 +23281,7 @@
     <w:link w:val="Ttulo5"/>
     <w:uiPriority w:val="9"/>
     <w:semiHidden/>
-    <w:rsid w:val="00C54814"/>
+    <w:rsid w:val="0092155D"/>
     <w:rPr>
       <w:rFonts w:eastAsiaTheme="majorEastAsia" w:cstheme="majorBidi"/>
       <w:color w:val="0F4761" w:themeColor="accent1" w:themeShade="BF"/>
@@ -23143,7 +23293,7 @@
     <w:link w:val="Ttulo6"/>
     <w:uiPriority w:val="9"/>
     <w:semiHidden/>
-    <w:rsid w:val="00C54814"/>
+    <w:rsid w:val="0092155D"/>
     <w:rPr>
       <w:rFonts w:eastAsiaTheme="majorEastAsia" w:cstheme="majorBidi"/>
       <w:i/>
@@ -23157,7 +23307,7 @@
     <w:link w:val="Ttulo7"/>
     <w:uiPriority w:val="9"/>
     <w:semiHidden/>
-    <w:rsid w:val="00C54814"/>
+    <w:rsid w:val="0092155D"/>
     <w:rPr>
       <w:rFonts w:eastAsiaTheme="majorEastAsia" w:cstheme="majorBidi"/>
       <w:color w:val="595959" w:themeColor="text1" w:themeTint="A6"/>
@@ -23169,7 +23319,7 @@
     <w:link w:val="Ttulo8"/>
     <w:uiPriority w:val="9"/>
     <w:semiHidden/>
-    <w:rsid w:val="00C54814"/>
+    <w:rsid w:val="0092155D"/>
     <w:rPr>
       <w:rFonts w:eastAsiaTheme="majorEastAsia" w:cstheme="majorBidi"/>
       <w:i/>
@@ -23183,7 +23333,7 @@
     <w:link w:val="Ttulo9"/>
     <w:uiPriority w:val="9"/>
     <w:semiHidden/>
-    <w:rsid w:val="00C54814"/>
+    <w:rsid w:val="0092155D"/>
     <w:rPr>
       <w:rFonts w:eastAsiaTheme="majorEastAsia" w:cstheme="majorBidi"/>
       <w:color w:val="272727" w:themeColor="text1" w:themeTint="D8"/>
@@ -23196,7 +23346,7 @@
     <w:link w:val="TtuloChar"/>
     <w:uiPriority w:val="10"/>
     <w:qFormat/>
-    <w:rsid w:val="00C54814"/>
+    <w:rsid w:val="0092155D"/>
     <w:pPr>
       <w:spacing w:after="80" w:line="240" w:lineRule="auto"/>
       <w:contextualSpacing/>
@@ -23214,7 +23364,7 @@
     <w:basedOn w:val="Fontepargpadro"/>
     <w:link w:val="Ttulo"/>
     <w:uiPriority w:val="10"/>
-    <w:rsid w:val="00C54814"/>
+    <w:rsid w:val="0092155D"/>
     <w:rPr>
       <w:rFonts w:asciiTheme="majorHAnsi" w:eastAsiaTheme="majorEastAsia" w:hAnsiTheme="majorHAnsi" w:cstheme="majorBidi"/>
       <w:spacing w:val="-10"/>
@@ -23230,7 +23380,7 @@
     <w:link w:val="SubttuloChar"/>
     <w:uiPriority w:val="11"/>
     <w:qFormat/>
-    <w:rsid w:val="00C54814"/>
+    <w:rsid w:val="0092155D"/>
     <w:pPr>
       <w:numPr>
         <w:ilvl w:val="1"/>
@@ -23249,7 +23399,7 @@
     <w:basedOn w:val="Fontepargpadro"/>
     <w:link w:val="Subttulo"/>
     <w:uiPriority w:val="11"/>
-    <w:rsid w:val="00C54814"/>
+    <w:rsid w:val="0092155D"/>
     <w:rPr>
       <w:rFonts w:eastAsiaTheme="majorEastAsia" w:cstheme="majorBidi"/>
       <w:color w:val="595959" w:themeColor="text1" w:themeTint="A6"/>
@@ -23265,7 +23415,7 @@
     <w:link w:val="CitaoChar"/>
     <w:uiPriority w:val="29"/>
     <w:qFormat/>
-    <w:rsid w:val="00C54814"/>
+    <w:rsid w:val="0092155D"/>
     <w:pPr>
       <w:spacing w:before="160"/>
       <w:jc w:val="center"/>
@@ -23281,7 +23431,7 @@
     <w:basedOn w:val="Fontepargpadro"/>
     <w:link w:val="Citao"/>
     <w:uiPriority w:val="29"/>
-    <w:rsid w:val="00C54814"/>
+    <w:rsid w:val="0092155D"/>
     <w:rPr>
       <w:i/>
       <w:iCs/>
@@ -23293,7 +23443,7 @@
     <w:basedOn w:val="Normal"/>
     <w:uiPriority w:val="34"/>
     <w:qFormat/>
-    <w:rsid w:val="00C54814"/>
+    <w:rsid w:val="0092155D"/>
     <w:pPr>
       <w:ind w:left="720"/>
       <w:contextualSpacing/>
@@ -23304,7 +23454,7 @@
     <w:basedOn w:val="Fontepargpadro"/>
     <w:uiPriority w:val="21"/>
     <w:qFormat/>
-    <w:rsid w:val="00C54814"/>
+    <w:rsid w:val="0092155D"/>
     <w:rPr>
       <w:i/>
       <w:iCs/>
@@ -23318,7 +23468,7 @@
     <w:link w:val="CitaoIntensaChar"/>
     <w:uiPriority w:val="30"/>
     <w:qFormat/>
-    <w:rsid w:val="00C54814"/>
+    <w:rsid w:val="0092155D"/>
     <w:pPr>
       <w:pBdr>
         <w:top w:val="single" w:sz="4" w:space="10" w:color="0F4761" w:themeColor="accent1" w:themeShade="BF"/>
@@ -23339,7 +23489,7 @@
     <w:basedOn w:val="Fontepargpadro"/>
     <w:link w:val="CitaoIntensa"/>
     <w:uiPriority w:val="30"/>
-    <w:rsid w:val="00C54814"/>
+    <w:rsid w:val="0092155D"/>
     <w:rPr>
       <w:i/>
       <w:iCs/>
@@ -23351,7 +23501,7 @@
     <w:basedOn w:val="Fontepargpadro"/>
     <w:uiPriority w:val="32"/>
     <w:qFormat/>
-    <w:rsid w:val="00C54814"/>
+    <w:rsid w:val="0092155D"/>
     <w:rPr>
       <w:b/>
       <w:bCs/>
@@ -23366,7 +23516,7 @@
     <w:link w:val="CabealhoChar"/>
     <w:uiPriority w:val="99"/>
     <w:unhideWhenUsed/>
-    <w:rsid w:val="00C54814"/>
+    <w:rsid w:val="0092155D"/>
     <w:pPr>
       <w:tabs>
         <w:tab w:val="center" w:pos="4252"/>
@@ -23380,7 +23530,7 @@
     <w:basedOn w:val="Fontepargpadro"/>
     <w:link w:val="Cabealho"/>
     <w:uiPriority w:val="99"/>
-    <w:rsid w:val="00C54814"/>
+    <w:rsid w:val="0092155D"/>
   </w:style>
   <w:style w:type="paragraph" w:styleId="Rodap">
     <w:name w:val="footer"/>
@@ -23388,7 +23538,7 @@
     <w:link w:val="RodapChar"/>
     <w:uiPriority w:val="99"/>
     <w:unhideWhenUsed/>
-    <w:rsid w:val="00C54814"/>
+    <w:rsid w:val="0092155D"/>
     <w:pPr>
       <w:tabs>
         <w:tab w:val="center" w:pos="4252"/>
@@ -23402,7 +23552,7 @@
     <w:basedOn w:val="Fontepargpadro"/>
     <w:link w:val="Rodap"/>
     <w:uiPriority w:val="99"/>
-    <w:rsid w:val="00C54814"/>
+    <w:rsid w:val="0092155D"/>
   </w:style>
   <w:style w:type="paragraph" w:styleId="Sumrio1">
     <w:name w:val="toc 1"/>
@@ -23411,7 +23561,7 @@
     <w:autoRedefine/>
     <w:uiPriority w:val="39"/>
     <w:unhideWhenUsed/>
-    <w:rsid w:val="00C54814"/>
+    <w:rsid w:val="0092155D"/>
     <w:pPr>
       <w:spacing w:after="100"/>
     </w:pPr>
@@ -23423,7 +23573,7 @@
     <w:autoRedefine/>
     <w:uiPriority w:val="39"/>
     <w:unhideWhenUsed/>
-    <w:rsid w:val="00C54814"/>
+    <w:rsid w:val="0092155D"/>
     <w:pPr>
       <w:spacing w:after="100"/>
       <w:ind w:left="240"/>

</xml_diff>

<commit_message>
Sincroniza Manual de Uso - Ficha do Projeto (v2.42)
Espelha a atualizacao do Manual de Uso feita em producao (secao
6.4.1) documentando a Fase 2 da Visao atual por projeto.

Co-Authored-By: Claude Sonnet 5 <noreply@anthropic.com>
</commit_message>
<xml_diff>
--- a/Manual de Uso - Ferramenta de Gestao de Projetos.docx
+++ b/Manual de Uso - Ferramenta de Gestao de Projetos.docx
@@ -229,7 +229,7 @@
         <w:rPr>
           <w:noProof/>
         </w:rPr>
-        <w:instrText xml:space="preserve"> PAGEREF _Toc239320766 \h </w:instrText>
+        <w:instrText xml:space="preserve"> PAGEREF _Toc239322502 \h </w:instrText>
       </w:r>
       <w:r>
         <w:rPr>
@@ -290,7 +290,7 @@
         <w:rPr>
           <w:noProof/>
         </w:rPr>
-        <w:instrText xml:space="preserve"> PAGEREF _Toc239320767 \h </w:instrText>
+        <w:instrText xml:space="preserve"> PAGEREF _Toc239322503 \h </w:instrText>
       </w:r>
       <w:r>
         <w:rPr>
@@ -351,7 +351,7 @@
         <w:rPr>
           <w:noProof/>
         </w:rPr>
-        <w:instrText xml:space="preserve"> PAGEREF _Toc239320768 \h </w:instrText>
+        <w:instrText xml:space="preserve"> PAGEREF _Toc239322504 \h </w:instrText>
       </w:r>
       <w:r>
         <w:rPr>
@@ -368,7 +368,7 @@
         <w:rPr>
           <w:noProof/>
         </w:rPr>
-        <w:t>11</w:t>
+        <w:t>12</w:t>
       </w:r>
       <w:r>
         <w:rPr>
@@ -412,7 +412,7 @@
         <w:rPr>
           <w:noProof/>
         </w:rPr>
-        <w:instrText xml:space="preserve"> PAGEREF _Toc239320769 \h </w:instrText>
+        <w:instrText xml:space="preserve"> PAGEREF _Toc239322505 \h </w:instrText>
       </w:r>
       <w:r>
         <w:rPr>
@@ -473,7 +473,7 @@
         <w:rPr>
           <w:noProof/>
         </w:rPr>
-        <w:instrText xml:space="preserve"> PAGEREF _Toc239320770 \h </w:instrText>
+        <w:instrText xml:space="preserve"> PAGEREF _Toc239322506 \h </w:instrText>
       </w:r>
       <w:r>
         <w:rPr>
@@ -534,7 +534,7 @@
         <w:rPr>
           <w:noProof/>
         </w:rPr>
-        <w:instrText xml:space="preserve"> PAGEREF _Toc239320771 \h </w:instrText>
+        <w:instrText xml:space="preserve"> PAGEREF _Toc239322507 \h </w:instrText>
       </w:r>
       <w:r>
         <w:rPr>
@@ -551,7 +551,7 @@
         <w:rPr>
           <w:noProof/>
         </w:rPr>
-        <w:t>15</w:t>
+        <w:t>16</w:t>
       </w:r>
       <w:r>
         <w:rPr>
@@ -595,7 +595,7 @@
         <w:rPr>
           <w:noProof/>
         </w:rPr>
-        <w:instrText xml:space="preserve"> PAGEREF _Toc239320772 \h </w:instrText>
+        <w:instrText xml:space="preserve"> PAGEREF _Toc239322508 \h </w:instrText>
       </w:r>
       <w:r>
         <w:rPr>
@@ -612,7 +612,7 @@
         <w:rPr>
           <w:noProof/>
         </w:rPr>
-        <w:t>15</w:t>
+        <w:t>16</w:t>
       </w:r>
       <w:r>
         <w:rPr>
@@ -656,7 +656,7 @@
         <w:rPr>
           <w:noProof/>
         </w:rPr>
-        <w:instrText xml:space="preserve"> PAGEREF _Toc239320773 \h </w:instrText>
+        <w:instrText xml:space="preserve"> PAGEREF _Toc239322509 \h </w:instrText>
       </w:r>
       <w:r>
         <w:rPr>
@@ -673,7 +673,7 @@
         <w:rPr>
           <w:noProof/>
         </w:rPr>
-        <w:t>15</w:t>
+        <w:t>16</w:t>
       </w:r>
       <w:r>
         <w:rPr>
@@ -717,7 +717,7 @@
         <w:rPr>
           <w:noProof/>
         </w:rPr>
-        <w:instrText xml:space="preserve"> PAGEREF _Toc239320774 \h </w:instrText>
+        <w:instrText xml:space="preserve"> PAGEREF _Toc239322510 \h </w:instrText>
       </w:r>
       <w:r>
         <w:rPr>
@@ -734,7 +734,7 @@
         <w:rPr>
           <w:noProof/>
         </w:rPr>
-        <w:t>15</w:t>
+        <w:t>16</w:t>
       </w:r>
       <w:r>
         <w:rPr>
@@ -778,7 +778,7 @@
         <w:rPr>
           <w:noProof/>
         </w:rPr>
-        <w:instrText xml:space="preserve"> PAGEREF _Toc239320775 \h </w:instrText>
+        <w:instrText xml:space="preserve"> PAGEREF _Toc239322511 \h </w:instrText>
       </w:r>
       <w:r>
         <w:rPr>
@@ -795,7 +795,7 @@
         <w:rPr>
           <w:noProof/>
         </w:rPr>
-        <w:t>16</w:t>
+        <w:t>17</w:t>
       </w:r>
       <w:r>
         <w:rPr>
@@ -839,7 +839,7 @@
         <w:rPr>
           <w:noProof/>
         </w:rPr>
-        <w:instrText xml:space="preserve"> PAGEREF _Toc239320776 \h </w:instrText>
+        <w:instrText xml:space="preserve"> PAGEREF _Toc239322512 \h </w:instrText>
       </w:r>
       <w:r>
         <w:rPr>
@@ -856,7 +856,7 @@
         <w:rPr>
           <w:noProof/>
         </w:rPr>
-        <w:t>17</w:t>
+        <w:t>18</w:t>
       </w:r>
       <w:r>
         <w:rPr>
@@ -900,7 +900,7 @@
         <w:rPr>
           <w:noProof/>
         </w:rPr>
-        <w:instrText xml:space="preserve"> PAGEREF _Toc239320777 \h </w:instrText>
+        <w:instrText xml:space="preserve"> PAGEREF _Toc239322513 \h </w:instrText>
       </w:r>
       <w:r>
         <w:rPr>
@@ -917,7 +917,7 @@
         <w:rPr>
           <w:noProof/>
         </w:rPr>
-        <w:t>19</w:t>
+        <w:t>20</w:t>
       </w:r>
       <w:r>
         <w:rPr>
@@ -961,7 +961,7 @@
         <w:rPr>
           <w:noProof/>
         </w:rPr>
-        <w:instrText xml:space="preserve"> PAGEREF _Toc239320778 \h </w:instrText>
+        <w:instrText xml:space="preserve"> PAGEREF _Toc239322514 \h </w:instrText>
       </w:r>
       <w:r>
         <w:rPr>
@@ -978,7 +978,7 @@
         <w:rPr>
           <w:noProof/>
         </w:rPr>
-        <w:t>20</w:t>
+        <w:t>21</w:t>
       </w:r>
       <w:r>
         <w:rPr>
@@ -1022,7 +1022,7 @@
         <w:rPr>
           <w:noProof/>
         </w:rPr>
-        <w:instrText xml:space="preserve"> PAGEREF _Toc239320779 \h </w:instrText>
+        <w:instrText xml:space="preserve"> PAGEREF _Toc239322515 \h </w:instrText>
       </w:r>
       <w:r>
         <w:rPr>
@@ -1039,7 +1039,7 @@
         <w:rPr>
           <w:noProof/>
         </w:rPr>
-        <w:t>21</w:t>
+        <w:t>22</w:t>
       </w:r>
       <w:r>
         <w:rPr>
@@ -1083,7 +1083,7 @@
         <w:rPr>
           <w:noProof/>
         </w:rPr>
-        <w:instrText xml:space="preserve"> PAGEREF _Toc239320780 \h </w:instrText>
+        <w:instrText xml:space="preserve"> PAGEREF _Toc239322516 \h </w:instrText>
       </w:r>
       <w:r>
         <w:rPr>
@@ -1100,7 +1100,7 @@
         <w:rPr>
           <w:noProof/>
         </w:rPr>
-        <w:t>21</w:t>
+        <w:t>22</w:t>
       </w:r>
       <w:r>
         <w:rPr>
@@ -1144,7 +1144,7 @@
         <w:rPr>
           <w:noProof/>
         </w:rPr>
-        <w:instrText xml:space="preserve"> PAGEREF _Toc239320781 \h </w:instrText>
+        <w:instrText xml:space="preserve"> PAGEREF _Toc239322517 \h </w:instrText>
       </w:r>
       <w:r>
         <w:rPr>
@@ -1161,7 +1161,7 @@
         <w:rPr>
           <w:noProof/>
         </w:rPr>
-        <w:t>22</w:t>
+        <w:t>23</w:t>
       </w:r>
       <w:r>
         <w:rPr>
@@ -1205,7 +1205,7 @@
         <w:rPr>
           <w:noProof/>
         </w:rPr>
-        <w:instrText xml:space="preserve"> PAGEREF _Toc239320782 \h </w:instrText>
+        <w:instrText xml:space="preserve"> PAGEREF _Toc239322518 \h </w:instrText>
       </w:r>
       <w:r>
         <w:rPr>
@@ -1222,7 +1222,7 @@
         <w:rPr>
           <w:noProof/>
         </w:rPr>
-        <w:t>23</w:t>
+        <w:t>24</w:t>
       </w:r>
       <w:r>
         <w:rPr>
@@ -1266,7 +1266,7 @@
         <w:rPr>
           <w:noProof/>
         </w:rPr>
-        <w:instrText xml:space="preserve"> PAGEREF _Toc239320783 \h </w:instrText>
+        <w:instrText xml:space="preserve"> PAGEREF _Toc239322519 \h </w:instrText>
       </w:r>
       <w:r>
         <w:rPr>
@@ -1283,7 +1283,7 @@
         <w:rPr>
           <w:noProof/>
         </w:rPr>
-        <w:t>23</w:t>
+        <w:t>24</w:t>
       </w:r>
       <w:r>
         <w:rPr>
@@ -1327,7 +1327,7 @@
         <w:rPr>
           <w:noProof/>
         </w:rPr>
-        <w:instrText xml:space="preserve"> PAGEREF _Toc239320784 \h </w:instrText>
+        <w:instrText xml:space="preserve"> PAGEREF _Toc239322520 \h </w:instrText>
       </w:r>
       <w:r>
         <w:rPr>
@@ -1344,7 +1344,7 @@
         <w:rPr>
           <w:noProof/>
         </w:rPr>
-        <w:t>25</w:t>
+        <w:t>26</w:t>
       </w:r>
       <w:r>
         <w:rPr>
@@ -1388,7 +1388,7 @@
         <w:rPr>
           <w:noProof/>
         </w:rPr>
-        <w:instrText xml:space="preserve"> PAGEREF _Toc239320785 \h </w:instrText>
+        <w:instrText xml:space="preserve"> PAGEREF _Toc239322521 \h </w:instrText>
       </w:r>
       <w:r>
         <w:rPr>
@@ -1405,7 +1405,7 @@
         <w:rPr>
           <w:noProof/>
         </w:rPr>
-        <w:t>27</w:t>
+        <w:t>28</w:t>
       </w:r>
       <w:r>
         <w:rPr>
@@ -1449,7 +1449,7 @@
         <w:rPr>
           <w:noProof/>
         </w:rPr>
-        <w:instrText xml:space="preserve"> PAGEREF _Toc239320786 \h </w:instrText>
+        <w:instrText xml:space="preserve"> PAGEREF _Toc239322522 \h </w:instrText>
       </w:r>
       <w:r>
         <w:rPr>
@@ -1466,7 +1466,7 @@
         <w:rPr>
           <w:noProof/>
         </w:rPr>
-        <w:t>27</w:t>
+        <w:t>28</w:t>
       </w:r>
       <w:r>
         <w:rPr>
@@ -1510,7 +1510,7 @@
         <w:rPr>
           <w:noProof/>
         </w:rPr>
-        <w:instrText xml:space="preserve"> PAGEREF _Toc239320787 \h </w:instrText>
+        <w:instrText xml:space="preserve"> PAGEREF _Toc239322523 \h </w:instrText>
       </w:r>
       <w:r>
         <w:rPr>
@@ -1527,7 +1527,7 @@
         <w:rPr>
           <w:noProof/>
         </w:rPr>
-        <w:t>30</w:t>
+        <w:t>31</w:t>
       </w:r>
       <w:r>
         <w:rPr>
@@ -1571,7 +1571,7 @@
         <w:rPr>
           <w:noProof/>
         </w:rPr>
-        <w:instrText xml:space="preserve"> PAGEREF _Toc239320788 \h </w:instrText>
+        <w:instrText xml:space="preserve"> PAGEREF _Toc239322524 \h </w:instrText>
       </w:r>
       <w:r>
         <w:rPr>
@@ -1588,7 +1588,7 @@
         <w:rPr>
           <w:noProof/>
         </w:rPr>
-        <w:t>32</w:t>
+        <w:t>33</w:t>
       </w:r>
       <w:r>
         <w:rPr>
@@ -1632,7 +1632,7 @@
         <w:rPr>
           <w:noProof/>
         </w:rPr>
-        <w:instrText xml:space="preserve"> PAGEREF _Toc239320789 \h </w:instrText>
+        <w:instrText xml:space="preserve"> PAGEREF _Toc239322525 \h </w:instrText>
       </w:r>
       <w:r>
         <w:rPr>
@@ -1649,7 +1649,7 @@
         <w:rPr>
           <w:noProof/>
         </w:rPr>
-        <w:t>36</w:t>
+        <w:t>37</w:t>
       </w:r>
       <w:r>
         <w:rPr>
@@ -1693,7 +1693,7 @@
         <w:rPr>
           <w:noProof/>
         </w:rPr>
-        <w:instrText xml:space="preserve"> PAGEREF _Toc239320790 \h </w:instrText>
+        <w:instrText xml:space="preserve"> PAGEREF _Toc239322526 \h </w:instrText>
       </w:r>
       <w:r>
         <w:rPr>
@@ -1710,7 +1710,7 @@
         <w:rPr>
           <w:noProof/>
         </w:rPr>
-        <w:t>39</w:t>
+        <w:t>40</w:t>
       </w:r>
       <w:r>
         <w:rPr>
@@ -1755,7 +1755,7 @@
         <w:rPr>
           <w:noProof/>
         </w:rPr>
-        <w:instrText xml:space="preserve"> PAGEREF _Toc239320791 \h </w:instrText>
+        <w:instrText xml:space="preserve"> PAGEREF _Toc239322527 \h </w:instrText>
       </w:r>
       <w:r>
         <w:rPr>
@@ -1772,7 +1772,7 @@
         <w:rPr>
           <w:noProof/>
         </w:rPr>
-        <w:t>41</w:t>
+        <w:t>42</w:t>
       </w:r>
       <w:r>
         <w:rPr>
@@ -1816,7 +1816,7 @@
         <w:rPr>
           <w:noProof/>
         </w:rPr>
-        <w:instrText xml:space="preserve"> PAGEREF _Toc239320792 \h </w:instrText>
+        <w:instrText xml:space="preserve"> PAGEREF _Toc239322528 \h </w:instrText>
       </w:r>
       <w:r>
         <w:rPr>
@@ -1833,7 +1833,7 @@
         <w:rPr>
           <w:noProof/>
         </w:rPr>
-        <w:t>44</w:t>
+        <w:t>45</w:t>
       </w:r>
       <w:r>
         <w:rPr>
@@ -1877,7 +1877,7 @@
         <w:rPr>
           <w:noProof/>
         </w:rPr>
-        <w:instrText xml:space="preserve"> PAGEREF _Toc239320793 \h </w:instrText>
+        <w:instrText xml:space="preserve"> PAGEREF _Toc239322529 \h </w:instrText>
       </w:r>
       <w:r>
         <w:rPr>
@@ -1894,7 +1894,7 @@
         <w:rPr>
           <w:noProof/>
         </w:rPr>
-        <w:t>46</w:t>
+        <w:t>47</w:t>
       </w:r>
       <w:r>
         <w:rPr>
@@ -1938,7 +1938,7 @@
         <w:rPr>
           <w:noProof/>
         </w:rPr>
-        <w:instrText xml:space="preserve"> PAGEREF _Toc239320794 \h </w:instrText>
+        <w:instrText xml:space="preserve"> PAGEREF _Toc239322530 \h </w:instrText>
       </w:r>
       <w:r>
         <w:rPr>
@@ -1955,7 +1955,7 @@
         <w:rPr>
           <w:noProof/>
         </w:rPr>
-        <w:t>49</w:t>
+        <w:t>50</w:t>
       </w:r>
       <w:r>
         <w:rPr>
@@ -1999,7 +1999,7 @@
         <w:rPr>
           <w:noProof/>
         </w:rPr>
-        <w:instrText xml:space="preserve"> PAGEREF _Toc239320795 \h </w:instrText>
+        <w:instrText xml:space="preserve"> PAGEREF _Toc239322531 \h </w:instrText>
       </w:r>
       <w:r>
         <w:rPr>
@@ -2016,7 +2016,7 @@
         <w:rPr>
           <w:noProof/>
         </w:rPr>
-        <w:t>51</w:t>
+        <w:t>52</w:t>
       </w:r>
       <w:r>
         <w:rPr>
@@ -2060,7 +2060,7 @@
         <w:rPr>
           <w:noProof/>
         </w:rPr>
-        <w:instrText xml:space="preserve"> PAGEREF _Toc239320796 \h </w:instrText>
+        <w:instrText xml:space="preserve"> PAGEREF _Toc239322532 \h </w:instrText>
       </w:r>
       <w:r>
         <w:rPr>
@@ -2077,7 +2077,7 @@
         <w:rPr>
           <w:noProof/>
         </w:rPr>
-        <w:t>53</w:t>
+        <w:t>54</w:t>
       </w:r>
       <w:r>
         <w:rPr>
@@ -2121,7 +2121,7 @@
         <w:rPr>
           <w:noProof/>
         </w:rPr>
-        <w:instrText xml:space="preserve"> PAGEREF _Toc239320797 \h </w:instrText>
+        <w:instrText xml:space="preserve"> PAGEREF _Toc239322533 \h </w:instrText>
       </w:r>
       <w:r>
         <w:rPr>
@@ -2138,7 +2138,7 @@
         <w:rPr>
           <w:noProof/>
         </w:rPr>
-        <w:t>53</w:t>
+        <w:t>54</w:t>
       </w:r>
       <w:r>
         <w:rPr>
@@ -2182,7 +2182,7 @@
         <w:rPr>
           <w:noProof/>
         </w:rPr>
-        <w:instrText xml:space="preserve"> PAGEREF _Toc239320798 \h </w:instrText>
+        <w:instrText xml:space="preserve"> PAGEREF _Toc239322534 \h </w:instrText>
       </w:r>
       <w:r>
         <w:rPr>
@@ -2199,7 +2199,7 @@
         <w:rPr>
           <w:noProof/>
         </w:rPr>
-        <w:t>60</w:t>
+        <w:t>61</w:t>
       </w:r>
       <w:r>
         <w:rPr>
@@ -2243,7 +2243,7 @@
         <w:rPr>
           <w:noProof/>
         </w:rPr>
-        <w:instrText xml:space="preserve"> PAGEREF _Toc239320799 \h </w:instrText>
+        <w:instrText xml:space="preserve"> PAGEREF _Toc239322535 \h </w:instrText>
       </w:r>
       <w:r>
         <w:rPr>
@@ -2260,7 +2260,7 @@
         <w:rPr>
           <w:noProof/>
         </w:rPr>
-        <w:t>65</w:t>
+        <w:t>66</w:t>
       </w:r>
       <w:r>
         <w:rPr>
@@ -2304,7 +2304,7 @@
         <w:rPr>
           <w:noProof/>
         </w:rPr>
-        <w:instrText xml:space="preserve"> PAGEREF _Toc239320800 \h </w:instrText>
+        <w:instrText xml:space="preserve"> PAGEREF _Toc239322536 \h </w:instrText>
       </w:r>
       <w:r>
         <w:rPr>
@@ -2321,7 +2321,7 @@
         <w:rPr>
           <w:noProof/>
         </w:rPr>
-        <w:t>65</w:t>
+        <w:t>66</w:t>
       </w:r>
       <w:r>
         <w:rPr>
@@ -2365,7 +2365,7 @@
         <w:rPr>
           <w:noProof/>
         </w:rPr>
-        <w:instrText xml:space="preserve"> PAGEREF _Toc239320801 \h </w:instrText>
+        <w:instrText xml:space="preserve"> PAGEREF _Toc239322537 \h </w:instrText>
       </w:r>
       <w:r>
         <w:rPr>
@@ -2382,7 +2382,7 @@
         <w:rPr>
           <w:noProof/>
         </w:rPr>
-        <w:t>66</w:t>
+        <w:t>67</w:t>
       </w:r>
       <w:r>
         <w:rPr>
@@ -2426,7 +2426,7 @@
         <w:rPr>
           <w:noProof/>
         </w:rPr>
-        <w:instrText xml:space="preserve"> PAGEREF _Toc239320802 \h </w:instrText>
+        <w:instrText xml:space="preserve"> PAGEREF _Toc239322538 \h </w:instrText>
       </w:r>
       <w:r>
         <w:rPr>
@@ -2443,7 +2443,7 @@
         <w:rPr>
           <w:noProof/>
         </w:rPr>
-        <w:t>66</w:t>
+        <w:t>67</w:t>
       </w:r>
       <w:r>
         <w:rPr>
@@ -2487,7 +2487,7 @@
         <w:rPr>
           <w:noProof/>
         </w:rPr>
-        <w:instrText xml:space="preserve"> PAGEREF _Toc239320803 \h </w:instrText>
+        <w:instrText xml:space="preserve"> PAGEREF _Toc239322539 \h </w:instrText>
       </w:r>
       <w:r>
         <w:rPr>
@@ -2504,7 +2504,7 @@
         <w:rPr>
           <w:noProof/>
         </w:rPr>
-        <w:t>69</w:t>
+        <w:t>70</w:t>
       </w:r>
       <w:r>
         <w:rPr>
@@ -2548,7 +2548,7 @@
         <w:rPr>
           <w:noProof/>
         </w:rPr>
-        <w:instrText xml:space="preserve"> PAGEREF _Toc239320804 \h </w:instrText>
+        <w:instrText xml:space="preserve"> PAGEREF _Toc239322540 \h </w:instrText>
       </w:r>
       <w:r>
         <w:rPr>
@@ -2565,7 +2565,7 @@
         <w:rPr>
           <w:noProof/>
         </w:rPr>
-        <w:t>69</w:t>
+        <w:t>70</w:t>
       </w:r>
       <w:r>
         <w:rPr>
@@ -2609,7 +2609,7 @@
         <w:rPr>
           <w:noProof/>
         </w:rPr>
-        <w:instrText xml:space="preserve"> PAGEREF _Toc239320805 \h </w:instrText>
+        <w:instrText xml:space="preserve"> PAGEREF _Toc239322541 \h </w:instrText>
       </w:r>
       <w:r>
         <w:rPr>
@@ -2626,7 +2626,7 @@
         <w:rPr>
           <w:noProof/>
         </w:rPr>
-        <w:t>70</w:t>
+        <w:t>71</w:t>
       </w:r>
       <w:r>
         <w:rPr>
@@ -2670,7 +2670,7 @@
         <w:rPr>
           <w:noProof/>
         </w:rPr>
-        <w:instrText xml:space="preserve"> PAGEREF _Toc239320806 \h </w:instrText>
+        <w:instrText xml:space="preserve"> PAGEREF _Toc239322542 \h </w:instrText>
       </w:r>
       <w:r>
         <w:rPr>
@@ -2687,7 +2687,7 @@
         <w:rPr>
           <w:noProof/>
         </w:rPr>
-        <w:t>71</w:t>
+        <w:t>72</w:t>
       </w:r>
       <w:r>
         <w:rPr>
@@ -2731,7 +2731,7 @@
         <w:rPr>
           <w:noProof/>
         </w:rPr>
-        <w:instrText xml:space="preserve"> PAGEREF _Toc239320807 \h </w:instrText>
+        <w:instrText xml:space="preserve"> PAGEREF _Toc239322543 \h </w:instrText>
       </w:r>
       <w:r>
         <w:rPr>
@@ -2748,7 +2748,7 @@
         <w:rPr>
           <w:noProof/>
         </w:rPr>
-        <w:t>73</w:t>
+        <w:t>74</w:t>
       </w:r>
       <w:r>
         <w:rPr>
@@ -2774,7 +2774,7 @@
           <w:noProof/>
           <w:color w:val="B91D2E"/>
         </w:rPr>
-        <w:t>6.5 Ambiente de Treino</w:t>
+        <w:t>6.4.1 Ficha do Projeto</w:t>
       </w:r>
       <w:r>
         <w:rPr>
@@ -2792,7 +2792,7 @@
         <w:rPr>
           <w:noProof/>
         </w:rPr>
-        <w:instrText xml:space="preserve"> PAGEREF _Toc239320808 \h </w:instrText>
+        <w:instrText xml:space="preserve"> PAGEREF _Toc239322544 \h </w:instrText>
       </w:r>
       <w:r>
         <w:rPr>
@@ -2809,7 +2809,7 @@
         <w:rPr>
           <w:noProof/>
         </w:rPr>
-        <w:t>76</w:t>
+        <w:t>77</w:t>
       </w:r>
       <w:r>
         <w:rPr>
@@ -2835,7 +2835,7 @@
           <w:noProof/>
           <w:color w:val="B91D2E"/>
         </w:rPr>
-        <w:t>6.6 Backup automatizado</w:t>
+        <w:t>6.5 Ambiente de Treino</w:t>
       </w:r>
       <w:r>
         <w:rPr>
@@ -2853,7 +2853,7 @@
         <w:rPr>
           <w:noProof/>
         </w:rPr>
-        <w:instrText xml:space="preserve"> PAGEREF _Toc239320809 \h </w:instrText>
+        <w:instrText xml:space="preserve"> PAGEREF _Toc239322545 \h </w:instrText>
       </w:r>
       <w:r>
         <w:rPr>
@@ -2870,7 +2870,7 @@
         <w:rPr>
           <w:noProof/>
         </w:rPr>
-        <w:t>77</w:t>
+        <w:t>79</w:t>
       </w:r>
       <w:r>
         <w:rPr>
@@ -2896,6 +2896,67 @@
           <w:noProof/>
           <w:color w:val="B91D2E"/>
         </w:rPr>
+        <w:t>6.6 Backup automatizado</w:t>
+      </w:r>
+      <w:r>
+        <w:rPr>
+          <w:noProof/>
+        </w:rPr>
+        <w:tab/>
+      </w:r>
+      <w:r>
+        <w:rPr>
+          <w:noProof/>
+        </w:rPr>
+        <w:fldChar w:fldCharType="begin"/>
+      </w:r>
+      <w:r>
+        <w:rPr>
+          <w:noProof/>
+        </w:rPr>
+        <w:instrText xml:space="preserve"> PAGEREF _Toc239322546 \h </w:instrText>
+      </w:r>
+      <w:r>
+        <w:rPr>
+          <w:noProof/>
+        </w:rPr>
+      </w:r>
+      <w:r>
+        <w:rPr>
+          <w:noProof/>
+        </w:rPr>
+        <w:fldChar w:fldCharType="separate"/>
+      </w:r>
+      <w:r>
+        <w:rPr>
+          <w:noProof/>
+        </w:rPr>
+        <w:t>79</w:t>
+      </w:r>
+      <w:r>
+        <w:rPr>
+          <w:noProof/>
+        </w:rPr>
+        <w:fldChar w:fldCharType="end"/>
+      </w:r>
+    </w:p>
+    <w:p>
+      <w:pPr>
+        <w:pStyle w:val="Sumrio2"/>
+        <w:tabs>
+          <w:tab w:val="right" w:leader="dot" w:pos="8828"/>
+        </w:tabs>
+        <w:rPr>
+          <w:noProof/>
+        </w:rPr>
+      </w:pPr>
+      <w:r>
+        <w:rPr>
+          <w:rFonts w:ascii="Montserrat" w:hAnsi="Montserrat"/>
+          <w:b/>
+          <w:noProof/>
+          <w:color w:val="B91D2E"/>
+        </w:rPr>
         <w:t>6.7 Relatorio de Resultados</w:t>
       </w:r>
       <w:r>
@@ -2914,7 +2975,7 @@
         <w:rPr>
           <w:noProof/>
         </w:rPr>
-        <w:instrText xml:space="preserve"> PAGEREF _Toc239320810 \h </w:instrText>
+        <w:instrText xml:space="preserve"> PAGEREF _Toc239322547 \h </w:instrText>
       </w:r>
       <w:r>
         <w:rPr>
@@ -2931,7 +2992,7 @@
         <w:rPr>
           <w:noProof/>
         </w:rPr>
-        <w:t>78</w:t>
+        <w:t>81</w:t>
       </w:r>
       <w:r>
         <w:rPr>
@@ -2975,7 +3036,7 @@
         <w:rPr>
           <w:noProof/>
         </w:rPr>
-        <w:instrText xml:space="preserve"> PAGEREF _Toc239320811 \h </w:instrText>
+        <w:instrText xml:space="preserve"> PAGEREF _Toc239322548 \h </w:instrText>
       </w:r>
       <w:r>
         <w:rPr>
@@ -2992,7 +3053,7 @@
         <w:rPr>
           <w:noProof/>
         </w:rPr>
-        <w:t>81</w:t>
+        <w:t>84</w:t>
       </w:r>
       <w:r>
         <w:rPr>
@@ -3036,7 +3097,7 @@
         <w:rPr>
           <w:noProof/>
         </w:rPr>
-        <w:instrText xml:space="preserve"> PAGEREF _Toc239320812 \h </w:instrText>
+        <w:instrText xml:space="preserve"> PAGEREF _Toc239322549 \h </w:instrText>
       </w:r>
       <w:r>
         <w:rPr>
@@ -3053,7 +3114,7 @@
         <w:rPr>
           <w:noProof/>
         </w:rPr>
-        <w:t>82</w:t>
+        <w:t>85</w:t>
       </w:r>
       <w:r>
         <w:rPr>
@@ -3112,7 +3173,7 @@
           <w:sz w:val="34"/>
         </w:rPr>
       </w:pPr>
-      <w:bookmarkStart w:id="0" w:name="_Toc239320766"/>
+      <w:bookmarkStart w:id="0" w:name="_Toc239322502"/>
       <w:r>
         <w:rPr>
           <w:rFonts w:ascii="Montserrat" w:hAnsi="Montserrat"/>
@@ -3136,7 +3197,7 @@
           <w:sz w:val="27"/>
         </w:rPr>
       </w:pPr>
-      <w:bookmarkStart w:id="1" w:name="_Toc239320767"/>
+      <w:bookmarkStart w:id="1" w:name="_Toc239322503"/>
       <w:r>
         <w:rPr>
           <w:rFonts w:ascii="Montserrat" w:hAnsi="Montserrat"/>
@@ -3984,7 +4045,34 @@
           <w:color w:val="1A1A1A"/>
           <w:sz w:val="22"/>
         </w:rPr>
-        <w:t>O manual nao substitui as Diretrizes para a Gestao de Projetos da UNIALFA (documento institucional que define o framework D01 a D07) nem o documento Regras de Acesso e Permissoes (que detalha cada regra de controle de acesso); ele e o guia operacional de como usar cada ferramenta na pratica.</w:t>
+        <w:t>Esta e a versao 2.42 do manual. Em relacao a versao 2.41 (03/09/2026), foi adicionada a nova pagina Ficha do Projeto (secao 6.4.1) - Fase 2 da proposta de visao por projeto. Aberta clicando no nome de um projeto na tabela Visao atual por projeto do Painel Executivo, reune numa unica tela os dados do cadastro, a situacao mais recente do Relatorio de Situacao (status, %, marcos, custos realizados), o cronograma e custos planejados do TAP, o progresso do projeto em cada um dos 9 formularios do ciclo de vida (com link direto para cada um), a equipe do projeto e o historico de alteracoes - sem restricao por papel, aberta a qualquer usuario autenticado.</w:t>
+      </w:r>
+    </w:p>
+    <w:p>
+      <w:pPr>
+        <w:spacing w:line="280" w:lineRule="auto"/>
+        <w:rPr>
+          <w:rFonts w:ascii="Montserrat" w:hAnsi="Montserrat"/>
+          <w:color w:val="1A1A1A"/>
+          <w:sz w:val="22"/>
+        </w:rPr>
+      </w:pPr>
+      <w:r>
+        <w:rPr>
+          <w:rFonts w:ascii="Montserrat" w:hAnsi="Montserrat"/>
+          <w:color w:val="1A1A1A"/>
+          <w:sz w:val="22"/>
+        </w:rPr>
+        <w:t xml:space="preserve">O manual nao substitui as Diretrizes para a Gestao de Projetos da UNIALFA (documento institucional que define o framework D01 a D07) nem o </w:t>
+      </w:r>
+      <w:r>
+        <w:rPr>
+          <w:rFonts w:ascii="Montserrat" w:hAnsi="Montserrat"/>
+          <w:color w:val="1A1A1A"/>
+          <w:sz w:val="22"/>
+        </w:rPr>
+        <w:lastRenderedPageBreak/>
+        <w:t>documento Regras de Acesso e Permissoes (que detalha cada regra de controle de acesso); ele e o guia operacional de como usar cada ferramenta na pratica.</w:t>
       </w:r>
     </w:p>
     <w:p>
@@ -3998,7 +4086,7 @@
           <w:sz w:val="27"/>
         </w:rPr>
       </w:pPr>
-      <w:bookmarkStart w:id="2" w:name="_Toc239320768"/>
+      <w:bookmarkStart w:id="2" w:name="_Toc239322504"/>
       <w:r>
         <w:rPr>
           <w:rFonts w:ascii="Montserrat" w:hAnsi="Montserrat"/>
@@ -4025,7 +4113,7 @@
           <w:color w:val="1A1A1A"/>
           <w:sz w:val="22"/>
         </w:rPr>
-        <w:t>A ferramenta e composta por 15 paginas eletronicas independentes:</w:t>
+        <w:t>A ferramenta e composta por 16 paginas eletronicas independentes:</w:t>
       </w:r>
     </w:p>
     <w:p>
@@ -4073,7 +4161,6 @@
           <w:color w:val="1A1A1A"/>
           <w:sz w:val="22"/>
         </w:rPr>
-        <w:lastRenderedPageBreak/>
         <w:t>1 ferramenta de apoio a decisao, o Validador de Projetos, que nao gera registros de artefato mas ajuda a avaliar projetos.</w:t>
       </w:r>
     </w:p>
@@ -4127,6 +4214,30 @@
     </w:p>
     <w:p>
       <w:pPr>
+        <w:pStyle w:val="PargrafodaLista"/>
+        <w:numPr>
+          <w:ilvl w:val="0"/>
+          <w:numId w:val="1"/>
+        </w:numPr>
+        <w:spacing w:after="80" w:line="260" w:lineRule="auto"/>
+        <w:ind w:left="700"/>
+        <w:rPr>
+          <w:rFonts w:ascii="Montserrat" w:hAnsi="Montserrat"/>
+          <w:color w:val="1A1A1A"/>
+          <w:sz w:val="22"/>
+        </w:rPr>
+      </w:pPr>
+      <w:r>
+        <w:rPr>
+          <w:rFonts w:ascii="Montserrat" w:hAnsi="Montserrat"/>
+          <w:color w:val="1A1A1A"/>
+          <w:sz w:val="22"/>
+        </w:rPr>
+        <w:t>1 Ficha do Projeto, a visao consolidada de um unico projeto, aberta a partir do Painel Executivo e sem restricao por papel (secao 6.4.1).</w:t>
+      </w:r>
+    </w:p>
+    <w:p>
+      <w:pPr>
         <w:spacing w:line="280" w:lineRule="auto"/>
         <w:rPr>
           <w:rFonts w:ascii="Montserrat" w:hAnsi="Montserrat"/>
@@ -4170,17 +4281,18 @@
         <w:rPr>
           <w:noProof/>
         </w:rPr>
+        <w:lastRenderedPageBreak/>
         <w:drawing>
-          <wp:inline distT="0" distB="0" distL="0" distR="0" wp14:anchorId="56FFD3D9" wp14:editId="6170CD5C">
+          <wp:inline distT="0" distB="0" distL="0" distR="0" wp14:anchorId="72218026" wp14:editId="6A1C6886">
             <wp:extent cx="5303520" cy="4792851"/>
             <wp:effectExtent l="19050" t="19050" r="11430" b="27305"/>
-            <wp:docPr id="958089499" name="Imagem 1"/>
+            <wp:docPr id="904852714" name="Imagem 1"/>
             <wp:cNvGraphicFramePr/>
             <a:graphic xmlns:a="http://schemas.openxmlformats.org/drawingml/2006/main">
               <a:graphicData uri="http://schemas.openxmlformats.org/drawingml/2006/picture">
                 <pic:pic xmlns:pic="http://schemas.openxmlformats.org/drawingml/2006/picture">
                   <pic:nvPicPr>
-                    <pic:cNvPr id="958089499" name=""/>
+                    <pic:cNvPr id="904852714" name=""/>
                     <pic:cNvPicPr/>
                   </pic:nvPicPr>
                   <pic:blipFill>
@@ -4248,7 +4360,7 @@
           <w:sz w:val="27"/>
         </w:rPr>
       </w:pPr>
-      <w:bookmarkStart w:id="3" w:name="_Toc239320769"/>
+      <w:bookmarkStart w:id="3" w:name="_Toc239322505"/>
       <w:r>
         <w:rPr>
           <w:rFonts w:ascii="Montserrat" w:hAnsi="Montserrat"/>
@@ -4256,7 +4368,6 @@
           <w:color w:val="B91D2E"/>
           <w:sz w:val="27"/>
         </w:rPr>
-        <w:lastRenderedPageBreak/>
         <w:t>1.3 Como acessar e fazer login</w:t>
       </w:r>
       <w:bookmarkEnd w:id="3"/>
@@ -4288,17 +4399,18 @@
         <w:rPr>
           <w:noProof/>
         </w:rPr>
+        <w:lastRenderedPageBreak/>
         <w:drawing>
-          <wp:inline distT="0" distB="0" distL="0" distR="0" wp14:anchorId="583D2379" wp14:editId="3E0CA4C1">
+          <wp:inline distT="0" distB="0" distL="0" distR="0" wp14:anchorId="36BB9004" wp14:editId="1F25EC21">
             <wp:extent cx="4206240" cy="3801227"/>
             <wp:effectExtent l="19050" t="19050" r="22860" b="27940"/>
-            <wp:docPr id="1097473605" name="Imagem 2"/>
+            <wp:docPr id="1563826369" name="Imagem 2"/>
             <wp:cNvGraphicFramePr/>
             <a:graphic xmlns:a="http://schemas.openxmlformats.org/drawingml/2006/main">
               <a:graphicData uri="http://schemas.openxmlformats.org/drawingml/2006/picture">
                 <pic:pic xmlns:pic="http://schemas.openxmlformats.org/drawingml/2006/picture">
                   <pic:nvPicPr>
-                    <pic:cNvPr id="1097473605" name=""/>
+                    <pic:cNvPr id="1563826369" name=""/>
                     <pic:cNvPicPr/>
                   </pic:nvPicPr>
                   <pic:blipFill>
@@ -4471,7 +4583,7 @@
           <w:sz w:val="27"/>
         </w:rPr>
       </w:pPr>
-      <w:bookmarkStart w:id="4" w:name="_Toc239320770"/>
+      <w:bookmarkStart w:id="4" w:name="_Toc239322506"/>
       <w:r>
         <w:rPr>
           <w:rFonts w:ascii="Montserrat" w:hAnsi="Montserrat"/>
@@ -4479,7 +4591,6 @@
           <w:color w:val="B91D2E"/>
           <w:sz w:val="27"/>
         </w:rPr>
-        <w:lastRenderedPageBreak/>
         <w:t>1.4 Como a ferramenta se relaciona com as Diretrizes (D01-D07)</w:t>
       </w:r>
       <w:bookmarkEnd w:id="4"/>
@@ -4554,6 +4665,7 @@
                 <w:color w:val="FFFFFF"/>
                 <w:sz w:val="19"/>
               </w:rPr>
+              <w:lastRenderedPageBreak/>
               <w:t>Passo</w:t>
             </w:r>
           </w:p>
@@ -5710,7 +5822,7 @@
           <w:sz w:val="34"/>
         </w:rPr>
       </w:pPr>
-      <w:bookmarkStart w:id="5" w:name="_Toc239320771"/>
+      <w:bookmarkStart w:id="5" w:name="_Toc239322507"/>
       <w:r>
         <w:rPr>
           <w:rFonts w:ascii="Montserrat" w:hAnsi="Montserrat"/>
@@ -5734,7 +5846,7 @@
           <w:sz w:val="27"/>
         </w:rPr>
       </w:pPr>
-      <w:bookmarkStart w:id="6" w:name="_Toc239320772"/>
+      <w:bookmarkStart w:id="6" w:name="_Toc239322508"/>
       <w:r>
         <w:rPr>
           <w:rFonts w:ascii="Montserrat" w:hAnsi="Montserrat"/>
@@ -5775,7 +5887,7 @@
           <w:sz w:val="27"/>
         </w:rPr>
       </w:pPr>
-      <w:bookmarkStart w:id="7" w:name="_Toc239320773"/>
+      <w:bookmarkStart w:id="7" w:name="_Toc239322509"/>
       <w:r>
         <w:rPr>
           <w:rFonts w:ascii="Montserrat" w:hAnsi="Montserrat"/>
@@ -5894,7 +6006,7 @@
           <w:sz w:val="27"/>
         </w:rPr>
       </w:pPr>
-      <w:bookmarkStart w:id="8" w:name="_Toc239320774"/>
+      <w:bookmarkStart w:id="8" w:name="_Toc239322510"/>
       <w:r>
         <w:rPr>
           <w:rFonts w:ascii="Montserrat" w:hAnsi="Montserrat"/>
@@ -6507,7 +6619,7 @@
           <w:sz w:val="27"/>
         </w:rPr>
       </w:pPr>
-      <w:bookmarkStart w:id="9" w:name="_Toc239320775"/>
+      <w:bookmarkStart w:id="9" w:name="_Toc239322511"/>
       <w:r>
         <w:rPr>
           <w:rFonts w:ascii="Montserrat" w:hAnsi="Montserrat"/>
@@ -6596,16 +6708,16 @@
         </w:rPr>
         <w:lastRenderedPageBreak/>
         <w:drawing>
-          <wp:inline distT="0" distB="0" distL="0" distR="0" wp14:anchorId="1ECC659B" wp14:editId="0B2F41AE">
+          <wp:inline distT="0" distB="0" distL="0" distR="0" wp14:anchorId="399FB927" wp14:editId="4B315908">
             <wp:extent cx="4937760" cy="4462310"/>
             <wp:effectExtent l="19050" t="19050" r="15240" b="14605"/>
-            <wp:docPr id="319118527" name="Imagem 3"/>
+            <wp:docPr id="1865919035" name="Imagem 3"/>
             <wp:cNvGraphicFramePr/>
             <a:graphic xmlns:a="http://schemas.openxmlformats.org/drawingml/2006/main">
               <a:graphicData uri="http://schemas.openxmlformats.org/drawingml/2006/picture">
                 <pic:pic xmlns:pic="http://schemas.openxmlformats.org/drawingml/2006/picture">
                   <pic:nvPicPr>
-                    <pic:cNvPr id="319118527" name=""/>
+                    <pic:cNvPr id="1865919035" name=""/>
                     <pic:cNvPicPr/>
                   </pic:nvPicPr>
                   <pic:blipFill>
@@ -6673,7 +6785,7 @@
           <w:sz w:val="27"/>
         </w:rPr>
       </w:pPr>
-      <w:bookmarkStart w:id="10" w:name="_Toc239320776"/>
+      <w:bookmarkStart w:id="10" w:name="_Toc239322512"/>
       <w:r>
         <w:rPr>
           <w:rFonts w:ascii="Montserrat" w:hAnsi="Montserrat"/>
@@ -6714,16 +6826,16 @@
         </w:rPr>
         <w:lastRenderedPageBreak/>
         <w:drawing>
-          <wp:inline distT="0" distB="0" distL="0" distR="0" wp14:anchorId="40481262" wp14:editId="418E5848">
+          <wp:inline distT="0" distB="0" distL="0" distR="0" wp14:anchorId="6261F4BA" wp14:editId="41E32F72">
             <wp:extent cx="5120640" cy="4627581"/>
             <wp:effectExtent l="19050" t="19050" r="22860" b="20955"/>
-            <wp:docPr id="932943175" name="Imagem 4"/>
+            <wp:docPr id="879874611" name="Imagem 4"/>
             <wp:cNvGraphicFramePr/>
             <a:graphic xmlns:a="http://schemas.openxmlformats.org/drawingml/2006/main">
               <a:graphicData uri="http://schemas.openxmlformats.org/drawingml/2006/picture">
                 <pic:pic xmlns:pic="http://schemas.openxmlformats.org/drawingml/2006/picture">
                   <pic:nvPicPr>
-                    <pic:cNvPr id="932943175" name=""/>
+                    <pic:cNvPr id="879874611" name=""/>
                     <pic:cNvPicPr/>
                   </pic:nvPicPr>
                   <pic:blipFill>
@@ -6891,7 +7003,7 @@
           <w:sz w:val="27"/>
         </w:rPr>
       </w:pPr>
-      <w:bookmarkStart w:id="11" w:name="_Toc239320777"/>
+      <w:bookmarkStart w:id="11" w:name="_Toc239322513"/>
       <w:r>
         <w:rPr>
           <w:rFonts w:ascii="Montserrat" w:hAnsi="Montserrat"/>
@@ -6931,16 +7043,16 @@
           <w:noProof/>
         </w:rPr>
         <w:drawing>
-          <wp:inline distT="0" distB="0" distL="0" distR="0" wp14:anchorId="59886475" wp14:editId="5958C865">
+          <wp:inline distT="0" distB="0" distL="0" distR="0" wp14:anchorId="46339755" wp14:editId="769DCF48">
             <wp:extent cx="4206240" cy="3801227"/>
             <wp:effectExtent l="19050" t="19050" r="22860" b="27940"/>
-            <wp:docPr id="1703507762" name="Imagem 5"/>
+            <wp:docPr id="2118299696" name="Imagem 5"/>
             <wp:cNvGraphicFramePr/>
             <a:graphic xmlns:a="http://schemas.openxmlformats.org/drawingml/2006/main">
               <a:graphicData uri="http://schemas.openxmlformats.org/drawingml/2006/picture">
                 <pic:pic xmlns:pic="http://schemas.openxmlformats.org/drawingml/2006/picture">
                   <pic:nvPicPr>
-                    <pic:cNvPr id="1703507762" name=""/>
+                    <pic:cNvPr id="2118299696" name=""/>
                     <pic:cNvPicPr/>
                   </pic:nvPicPr>
                   <pic:blipFill>
@@ -7008,16 +7120,16 @@
         </w:rPr>
         <w:lastRenderedPageBreak/>
         <w:drawing>
-          <wp:inline distT="0" distB="0" distL="0" distR="0" wp14:anchorId="44446558" wp14:editId="42C34C74">
+          <wp:inline distT="0" distB="0" distL="0" distR="0" wp14:anchorId="2E362094" wp14:editId="55FD6F25">
             <wp:extent cx="4206240" cy="3801227"/>
             <wp:effectExtent l="19050" t="19050" r="22860" b="27940"/>
-            <wp:docPr id="1787872774" name="Imagem 6"/>
+            <wp:docPr id="222764969" name="Imagem 6"/>
             <wp:cNvGraphicFramePr/>
             <a:graphic xmlns:a="http://schemas.openxmlformats.org/drawingml/2006/main">
               <a:graphicData uri="http://schemas.openxmlformats.org/drawingml/2006/picture">
                 <pic:pic xmlns:pic="http://schemas.openxmlformats.org/drawingml/2006/picture">
                   <pic:nvPicPr>
-                    <pic:cNvPr id="1787872774" name=""/>
+                    <pic:cNvPr id="222764969" name=""/>
                     <pic:cNvPicPr/>
                   </pic:nvPicPr>
                   <pic:blipFill>
@@ -7133,7 +7245,7 @@
           <w:sz w:val="27"/>
         </w:rPr>
       </w:pPr>
-      <w:bookmarkStart w:id="12" w:name="_Toc239320778"/>
+      <w:bookmarkStart w:id="12" w:name="_Toc239322514"/>
       <w:r>
         <w:rPr>
           <w:rFonts w:ascii="Montserrat" w:hAnsi="Montserrat"/>
@@ -7201,7 +7313,7 @@
           <w:sz w:val="27"/>
         </w:rPr>
       </w:pPr>
-      <w:bookmarkStart w:id="13" w:name="_Toc239320779"/>
+      <w:bookmarkStart w:id="13" w:name="_Toc239322515"/>
       <w:r>
         <w:rPr>
           <w:rFonts w:ascii="Montserrat" w:hAnsi="Montserrat"/>
@@ -7428,7 +7540,7 @@
           <w:sz w:val="27"/>
         </w:rPr>
       </w:pPr>
-      <w:bookmarkStart w:id="14" w:name="_Toc239320780"/>
+      <w:bookmarkStart w:id="14" w:name="_Toc239322516"/>
       <w:r>
         <w:rPr>
           <w:rFonts w:ascii="Montserrat" w:hAnsi="Montserrat"/>
@@ -7587,7 +7699,7 @@
           <w:sz w:val="27"/>
         </w:rPr>
       </w:pPr>
-      <w:bookmarkStart w:id="15" w:name="_Toc239320781"/>
+      <w:bookmarkStart w:id="15" w:name="_Toc239322517"/>
       <w:r>
         <w:rPr>
           <w:rFonts w:ascii="Montserrat" w:hAnsi="Montserrat"/>
@@ -7779,7 +7891,7 @@
           <w:sz w:val="27"/>
         </w:rPr>
       </w:pPr>
-      <w:bookmarkStart w:id="16" w:name="_Toc239320782"/>
+      <w:bookmarkStart w:id="16" w:name="_Toc239322518"/>
       <w:r>
         <w:rPr>
           <w:rFonts w:ascii="Montserrat" w:hAnsi="Montserrat"/>
@@ -7907,7 +8019,7 @@
           <w:sz w:val="27"/>
         </w:rPr>
       </w:pPr>
-      <w:bookmarkStart w:id="17" w:name="_Toc239320783"/>
+      <w:bookmarkStart w:id="17" w:name="_Toc239322519"/>
       <w:r>
         <w:rPr>
           <w:rFonts w:ascii="Montserrat" w:hAnsi="Montserrat"/>
@@ -8237,7 +8349,7 @@
           <w:sz w:val="27"/>
         </w:rPr>
       </w:pPr>
-      <w:bookmarkStart w:id="18" w:name="_Toc239320784"/>
+      <w:bookmarkStart w:id="18" w:name="_Toc239322520"/>
       <w:r>
         <w:rPr>
           <w:rFonts w:ascii="Montserrat" w:hAnsi="Montserrat"/>
@@ -8378,7 +8490,7 @@
           <w:sz w:val="34"/>
         </w:rPr>
       </w:pPr>
-      <w:bookmarkStart w:id="19" w:name="_Toc239320785"/>
+      <w:bookmarkStart w:id="19" w:name="_Toc239322521"/>
       <w:r>
         <w:rPr>
           <w:rFonts w:ascii="Montserrat" w:hAnsi="Montserrat"/>
@@ -8420,7 +8532,7 @@
           <w:sz w:val="27"/>
         </w:rPr>
       </w:pPr>
-      <w:bookmarkStart w:id="20" w:name="_Toc239320786"/>
+      <w:bookmarkStart w:id="20" w:name="_Toc239322522"/>
       <w:r>
         <w:rPr>
           <w:rFonts w:ascii="Montserrat" w:hAnsi="Montserrat"/>
@@ -9500,16 +9612,16 @@
         </w:rPr>
         <w:lastRenderedPageBreak/>
         <w:drawing>
-          <wp:inline distT="0" distB="0" distL="0" distR="0" wp14:anchorId="0E7A21FB" wp14:editId="73A07AD7">
+          <wp:inline distT="0" distB="0" distL="0" distR="0" wp14:anchorId="272E5FE7" wp14:editId="385E19B3">
             <wp:extent cx="5120640" cy="4627581"/>
             <wp:effectExtent l="19050" t="19050" r="22860" b="20955"/>
-            <wp:docPr id="1500728780" name="Imagem 7"/>
+            <wp:docPr id="2110116584" name="Imagem 7"/>
             <wp:cNvGraphicFramePr/>
             <a:graphic xmlns:a="http://schemas.openxmlformats.org/drawingml/2006/main">
               <a:graphicData uri="http://schemas.openxmlformats.org/drawingml/2006/picture">
                 <pic:pic xmlns:pic="http://schemas.openxmlformats.org/drawingml/2006/picture">
                   <pic:nvPicPr>
-                    <pic:cNvPr id="1500728780" name=""/>
+                    <pic:cNvPr id="2110116584" name=""/>
                     <pic:cNvPicPr/>
                   </pic:nvPicPr>
                   <pic:blipFill>
@@ -9577,16 +9689,16 @@
         </w:rPr>
         <w:lastRenderedPageBreak/>
         <w:drawing>
-          <wp:inline distT="0" distB="0" distL="0" distR="0" wp14:anchorId="0E162A52" wp14:editId="08B10736">
+          <wp:inline distT="0" distB="0" distL="0" distR="0" wp14:anchorId="2176ECDA" wp14:editId="4D5D196D">
             <wp:extent cx="5120640" cy="4627581"/>
             <wp:effectExtent l="19050" t="19050" r="22860" b="20955"/>
-            <wp:docPr id="1292551292" name="Imagem 8"/>
+            <wp:docPr id="404933119" name="Imagem 8"/>
             <wp:cNvGraphicFramePr/>
             <a:graphic xmlns:a="http://schemas.openxmlformats.org/drawingml/2006/main">
               <a:graphicData uri="http://schemas.openxmlformats.org/drawingml/2006/picture">
                 <pic:pic xmlns:pic="http://schemas.openxmlformats.org/drawingml/2006/picture">
                   <pic:nvPicPr>
-                    <pic:cNvPr id="1292551292" name=""/>
+                    <pic:cNvPr id="404933119" name=""/>
                     <pic:cNvPicPr/>
                   </pic:nvPicPr>
                   <pic:blipFill>
@@ -9794,7 +9906,7 @@
           <w:sz w:val="27"/>
         </w:rPr>
       </w:pPr>
-      <w:bookmarkStart w:id="21" w:name="_Toc239320787"/>
+      <w:bookmarkStart w:id="21" w:name="_Toc239322523"/>
       <w:r>
         <w:rPr>
           <w:rFonts w:ascii="Montserrat" w:hAnsi="Montserrat"/>
@@ -10720,16 +10832,16 @@
         </w:rPr>
         <w:lastRenderedPageBreak/>
         <w:drawing>
-          <wp:inline distT="0" distB="0" distL="0" distR="0" wp14:anchorId="13814B0B" wp14:editId="67FD2B72">
+          <wp:inline distT="0" distB="0" distL="0" distR="0" wp14:anchorId="6766480A" wp14:editId="7A1794AC">
             <wp:extent cx="5120640" cy="4627581"/>
             <wp:effectExtent l="19050" t="19050" r="22860" b="20955"/>
-            <wp:docPr id="1814146263" name="Imagem 9"/>
+            <wp:docPr id="1879647737" name="Imagem 9"/>
             <wp:cNvGraphicFramePr/>
             <a:graphic xmlns:a="http://schemas.openxmlformats.org/drawingml/2006/main">
               <a:graphicData uri="http://schemas.openxmlformats.org/drawingml/2006/picture">
                 <pic:pic xmlns:pic="http://schemas.openxmlformats.org/drawingml/2006/picture">
                   <pic:nvPicPr>
-                    <pic:cNvPr id="1814146263" name=""/>
+                    <pic:cNvPr id="1879647737" name=""/>
                     <pic:cNvPicPr/>
                   </pic:nvPicPr>
                   <pic:blipFill>
@@ -10797,16 +10909,16 @@
         </w:rPr>
         <w:lastRenderedPageBreak/>
         <w:drawing>
-          <wp:inline distT="0" distB="0" distL="0" distR="0" wp14:anchorId="5A3F4B82" wp14:editId="1301B3E1">
+          <wp:inline distT="0" distB="0" distL="0" distR="0" wp14:anchorId="30A28F35" wp14:editId="4BA593B5">
             <wp:extent cx="5120640" cy="4627581"/>
             <wp:effectExtent l="19050" t="19050" r="22860" b="20955"/>
-            <wp:docPr id="1901915263" name="Imagem 10"/>
+            <wp:docPr id="908364396" name="Imagem 10"/>
             <wp:cNvGraphicFramePr/>
             <a:graphic xmlns:a="http://schemas.openxmlformats.org/drawingml/2006/main">
               <a:graphicData uri="http://schemas.openxmlformats.org/drawingml/2006/picture">
                 <pic:pic xmlns:pic="http://schemas.openxmlformats.org/drawingml/2006/picture">
                   <pic:nvPicPr>
-                    <pic:cNvPr id="1901915263" name=""/>
+                    <pic:cNvPr id="908364396" name=""/>
                     <pic:cNvPicPr/>
                   </pic:nvPicPr>
                   <pic:blipFill>
@@ -10940,7 +11052,7 @@
           <w:sz w:val="27"/>
         </w:rPr>
       </w:pPr>
-      <w:bookmarkStart w:id="22" w:name="_Toc239320788"/>
+      <w:bookmarkStart w:id="22" w:name="_Toc239322524"/>
       <w:r>
         <w:rPr>
           <w:rFonts w:ascii="Montserrat" w:hAnsi="Montserrat"/>
@@ -11996,16 +12108,16 @@
           <w:noProof/>
         </w:rPr>
         <w:drawing>
-          <wp:inline distT="0" distB="0" distL="0" distR="0" wp14:anchorId="210E2482" wp14:editId="767D9258">
+          <wp:inline distT="0" distB="0" distL="0" distR="0" wp14:anchorId="4A39FA4E" wp14:editId="2CC9002F">
             <wp:extent cx="5120640" cy="3282818"/>
             <wp:effectExtent l="19050" t="19050" r="22860" b="13335"/>
-            <wp:docPr id="667105246" name="Imagem 11"/>
+            <wp:docPr id="613129965" name="Imagem 11"/>
             <wp:cNvGraphicFramePr/>
             <a:graphic xmlns:a="http://schemas.openxmlformats.org/drawingml/2006/main">
               <a:graphicData uri="http://schemas.openxmlformats.org/drawingml/2006/picture">
                 <pic:pic xmlns:pic="http://schemas.openxmlformats.org/drawingml/2006/picture">
                   <pic:nvPicPr>
-                    <pic:cNvPr id="667105246" name=""/>
+                    <pic:cNvPr id="613129965" name=""/>
                     <pic:cNvPicPr/>
                   </pic:nvPicPr>
                   <pic:blipFill>
@@ -12073,16 +12185,16 @@
         </w:rPr>
         <w:lastRenderedPageBreak/>
         <w:drawing>
-          <wp:inline distT="0" distB="0" distL="0" distR="0" wp14:anchorId="601904A6" wp14:editId="1E15379B">
+          <wp:inline distT="0" distB="0" distL="0" distR="0" wp14:anchorId="4F2C2373" wp14:editId="74C62A28">
             <wp:extent cx="5120640" cy="4627581"/>
             <wp:effectExtent l="19050" t="19050" r="22860" b="20955"/>
-            <wp:docPr id="2100668784" name="Imagem 12"/>
+            <wp:docPr id="184903087" name="Imagem 12"/>
             <wp:cNvGraphicFramePr/>
             <a:graphic xmlns:a="http://schemas.openxmlformats.org/drawingml/2006/main">
               <a:graphicData uri="http://schemas.openxmlformats.org/drawingml/2006/picture">
                 <pic:pic xmlns:pic="http://schemas.openxmlformats.org/drawingml/2006/picture">
                   <pic:nvPicPr>
-                    <pic:cNvPr id="2100668784" name=""/>
+                    <pic:cNvPr id="184903087" name=""/>
                     <pic:cNvPicPr/>
                   </pic:nvPicPr>
                   <pic:blipFill>
@@ -12216,7 +12328,7 @@
           <w:sz w:val="27"/>
         </w:rPr>
       </w:pPr>
-      <w:bookmarkStart w:id="23" w:name="_Toc239320789"/>
+      <w:bookmarkStart w:id="23" w:name="_Toc239322525"/>
       <w:r>
         <w:rPr>
           <w:rFonts w:ascii="Montserrat" w:hAnsi="Montserrat"/>
@@ -12778,16 +12890,16 @@
         </w:rPr>
         <w:lastRenderedPageBreak/>
         <w:drawing>
-          <wp:inline distT="0" distB="0" distL="0" distR="0" wp14:anchorId="1AF21012" wp14:editId="51A57672">
+          <wp:inline distT="0" distB="0" distL="0" distR="0" wp14:anchorId="35E7B06F" wp14:editId="186F625E">
             <wp:extent cx="5120640" cy="4627581"/>
             <wp:effectExtent l="19050" t="19050" r="22860" b="20955"/>
-            <wp:docPr id="1557739730" name="Imagem 13"/>
+            <wp:docPr id="1484556291" name="Imagem 13"/>
             <wp:cNvGraphicFramePr/>
             <a:graphic xmlns:a="http://schemas.openxmlformats.org/drawingml/2006/main">
               <a:graphicData uri="http://schemas.openxmlformats.org/drawingml/2006/picture">
                 <pic:pic xmlns:pic="http://schemas.openxmlformats.org/drawingml/2006/picture">
                   <pic:nvPicPr>
-                    <pic:cNvPr id="1557739730" name=""/>
+                    <pic:cNvPr id="1484556291" name=""/>
                     <pic:cNvPicPr/>
                   </pic:nvPicPr>
                   <pic:blipFill>
@@ -12855,16 +12967,16 @@
         </w:rPr>
         <w:lastRenderedPageBreak/>
         <w:drawing>
-          <wp:inline distT="0" distB="0" distL="0" distR="0" wp14:anchorId="4DE6A535" wp14:editId="3B23CC2F">
+          <wp:inline distT="0" distB="0" distL="0" distR="0" wp14:anchorId="44B5E5C8" wp14:editId="026E2782">
             <wp:extent cx="5120640" cy="4627581"/>
             <wp:effectExtent l="19050" t="19050" r="22860" b="20955"/>
-            <wp:docPr id="182594798" name="Imagem 14"/>
+            <wp:docPr id="581215068" name="Imagem 14"/>
             <wp:cNvGraphicFramePr/>
             <a:graphic xmlns:a="http://schemas.openxmlformats.org/drawingml/2006/main">
               <a:graphicData uri="http://schemas.openxmlformats.org/drawingml/2006/picture">
                 <pic:pic xmlns:pic="http://schemas.openxmlformats.org/drawingml/2006/picture">
                   <pic:nvPicPr>
-                    <pic:cNvPr id="182594798" name=""/>
+                    <pic:cNvPr id="581215068" name=""/>
                     <pic:cNvPicPr/>
                   </pic:nvPicPr>
                   <pic:blipFill>
@@ -12998,7 +13110,7 @@
           <w:sz w:val="27"/>
         </w:rPr>
       </w:pPr>
-      <w:bookmarkStart w:id="24" w:name="_Toc239320790"/>
+      <w:bookmarkStart w:id="24" w:name="_Toc239322526"/>
       <w:r>
         <w:rPr>
           <w:rFonts w:ascii="Montserrat" w:hAnsi="Montserrat"/>
@@ -13039,16 +13151,16 @@
           <w:noProof/>
         </w:rPr>
         <w:drawing>
-          <wp:inline distT="0" distB="0" distL="0" distR="0" wp14:anchorId="5A43D55A" wp14:editId="3D635882">
+          <wp:inline distT="0" distB="0" distL="0" distR="0" wp14:anchorId="5900C4B2" wp14:editId="533B0A37">
             <wp:extent cx="5120640" cy="4627581"/>
             <wp:effectExtent l="19050" t="19050" r="22860" b="20955"/>
-            <wp:docPr id="85880191" name="Imagem 15"/>
+            <wp:docPr id="1953154726" name="Imagem 15"/>
             <wp:cNvGraphicFramePr/>
             <a:graphic xmlns:a="http://schemas.openxmlformats.org/drawingml/2006/main">
               <a:graphicData uri="http://schemas.openxmlformats.org/drawingml/2006/picture">
                 <pic:pic xmlns:pic="http://schemas.openxmlformats.org/drawingml/2006/picture">
                   <pic:nvPicPr>
-                    <pic:cNvPr id="85880191" name=""/>
+                    <pic:cNvPr id="1953154726" name=""/>
                     <pic:cNvPicPr/>
                   </pic:nvPicPr>
                   <pic:blipFill>
@@ -13116,16 +13228,16 @@
         </w:rPr>
         <w:lastRenderedPageBreak/>
         <w:drawing>
-          <wp:inline distT="0" distB="0" distL="0" distR="0" wp14:anchorId="312A34EF" wp14:editId="432621B9">
+          <wp:inline distT="0" distB="0" distL="0" distR="0" wp14:anchorId="658B2101" wp14:editId="2717452E">
             <wp:extent cx="5120640" cy="4627581"/>
             <wp:effectExtent l="19050" t="19050" r="22860" b="20955"/>
-            <wp:docPr id="29637826" name="Imagem 16"/>
+            <wp:docPr id="706455902" name="Imagem 16"/>
             <wp:cNvGraphicFramePr/>
             <a:graphic xmlns:a="http://schemas.openxmlformats.org/drawingml/2006/main">
               <a:graphicData uri="http://schemas.openxmlformats.org/drawingml/2006/picture">
                 <pic:pic xmlns:pic="http://schemas.openxmlformats.org/drawingml/2006/picture">
                   <pic:nvPicPr>
-                    <pic:cNvPr id="29637826" name=""/>
+                    <pic:cNvPr id="706455902" name=""/>
                     <pic:cNvPicPr/>
                   </pic:nvPicPr>
                   <pic:blipFill>
@@ -13289,16 +13401,16 @@
         </w:rPr>
         <w:lastRenderedPageBreak/>
         <w:drawing>
-          <wp:inline distT="0" distB="0" distL="0" distR="0" wp14:anchorId="5B8F42E2" wp14:editId="1728CFD3">
+          <wp:inline distT="0" distB="0" distL="0" distR="0" wp14:anchorId="5E433D7C" wp14:editId="3D0455A7">
             <wp:extent cx="5120640" cy="3282818"/>
             <wp:effectExtent l="19050" t="19050" r="22860" b="13335"/>
-            <wp:docPr id="1738485440" name="Imagem 17"/>
+            <wp:docPr id="1514760960" name="Imagem 17"/>
             <wp:cNvGraphicFramePr/>
             <a:graphic xmlns:a="http://schemas.openxmlformats.org/drawingml/2006/main">
               <a:graphicData uri="http://schemas.openxmlformats.org/drawingml/2006/picture">
                 <pic:pic xmlns:pic="http://schemas.openxmlformats.org/drawingml/2006/picture">
                   <pic:nvPicPr>
-                    <pic:cNvPr id="1738485440" name=""/>
+                    <pic:cNvPr id="1514760960" name=""/>
                     <pic:cNvPicPr/>
                   </pic:nvPicPr>
                   <pic:blipFill>
@@ -13432,7 +13544,7 @@
           <w:sz w:val="27"/>
         </w:rPr>
       </w:pPr>
-      <w:bookmarkStart w:id="25" w:name="_Toc239320791"/>
+      <w:bookmarkStart w:id="25" w:name="_Toc239322527"/>
       <w:r>
         <w:rPr>
           <w:rFonts w:ascii="Montserrat" w:hAnsi="Montserrat"/>
@@ -13473,16 +13585,16 @@
         </w:rPr>
         <w:lastRenderedPageBreak/>
         <w:drawing>
-          <wp:inline distT="0" distB="0" distL="0" distR="0" wp14:anchorId="7702CD41" wp14:editId="4494ABD6">
+          <wp:inline distT="0" distB="0" distL="0" distR="0" wp14:anchorId="53B007CF" wp14:editId="6FA1FEB6">
             <wp:extent cx="5120640" cy="4627581"/>
             <wp:effectExtent l="19050" t="19050" r="22860" b="20955"/>
-            <wp:docPr id="1190874562" name="Imagem 18"/>
+            <wp:docPr id="1136853612" name="Imagem 18"/>
             <wp:cNvGraphicFramePr/>
             <a:graphic xmlns:a="http://schemas.openxmlformats.org/drawingml/2006/main">
               <a:graphicData uri="http://schemas.openxmlformats.org/drawingml/2006/picture">
                 <pic:pic xmlns:pic="http://schemas.openxmlformats.org/drawingml/2006/picture">
                   <pic:nvPicPr>
-                    <pic:cNvPr id="1190874562" name=""/>
+                    <pic:cNvPr id="1136853612" name=""/>
                     <pic:cNvPicPr/>
                   </pic:nvPicPr>
                   <pic:blipFill>
@@ -13550,16 +13662,16 @@
         </w:rPr>
         <w:lastRenderedPageBreak/>
         <w:drawing>
-          <wp:inline distT="0" distB="0" distL="0" distR="0" wp14:anchorId="4E29EB9A" wp14:editId="7DC7D0A3">
+          <wp:inline distT="0" distB="0" distL="0" distR="0" wp14:anchorId="1287E58B" wp14:editId="2619D6C2">
             <wp:extent cx="5120640" cy="4627581"/>
             <wp:effectExtent l="19050" t="19050" r="22860" b="20955"/>
-            <wp:docPr id="2059940236" name="Imagem 19"/>
+            <wp:docPr id="83114608" name="Imagem 19"/>
             <wp:cNvGraphicFramePr/>
             <a:graphic xmlns:a="http://schemas.openxmlformats.org/drawingml/2006/main">
               <a:graphicData uri="http://schemas.openxmlformats.org/drawingml/2006/picture">
                 <pic:pic xmlns:pic="http://schemas.openxmlformats.org/drawingml/2006/picture">
                   <pic:nvPicPr>
-                    <pic:cNvPr id="2059940236" name=""/>
+                    <pic:cNvPr id="83114608" name=""/>
                     <pic:cNvPicPr/>
                   </pic:nvPicPr>
                   <pic:blipFill>
@@ -13742,7 +13854,7 @@
           <w:sz w:val="27"/>
         </w:rPr>
       </w:pPr>
-      <w:bookmarkStart w:id="26" w:name="_Toc239320792"/>
+      <w:bookmarkStart w:id="26" w:name="_Toc239322528"/>
       <w:r>
         <w:rPr>
           <w:rFonts w:ascii="Montserrat" w:hAnsi="Montserrat"/>
@@ -13782,16 +13894,16 @@
           <w:noProof/>
         </w:rPr>
         <w:drawing>
-          <wp:inline distT="0" distB="0" distL="0" distR="0" wp14:anchorId="10330B99" wp14:editId="3D53F866">
+          <wp:inline distT="0" distB="0" distL="0" distR="0" wp14:anchorId="6CC8A97D" wp14:editId="10233ED2">
             <wp:extent cx="5120640" cy="4627581"/>
             <wp:effectExtent l="19050" t="19050" r="22860" b="20955"/>
-            <wp:docPr id="1255858406" name="Imagem 20"/>
+            <wp:docPr id="1693443406" name="Imagem 20"/>
             <wp:cNvGraphicFramePr/>
             <a:graphic xmlns:a="http://schemas.openxmlformats.org/drawingml/2006/main">
               <a:graphicData uri="http://schemas.openxmlformats.org/drawingml/2006/picture">
                 <pic:pic xmlns:pic="http://schemas.openxmlformats.org/drawingml/2006/picture">
                   <pic:nvPicPr>
-                    <pic:cNvPr id="1255858406" name=""/>
+                    <pic:cNvPr id="1693443406" name=""/>
                     <pic:cNvPicPr/>
                   </pic:nvPicPr>
                   <pic:blipFill>
@@ -13859,16 +13971,16 @@
         </w:rPr>
         <w:lastRenderedPageBreak/>
         <w:drawing>
-          <wp:inline distT="0" distB="0" distL="0" distR="0" wp14:anchorId="1BAA92EF" wp14:editId="4F97A2CB">
+          <wp:inline distT="0" distB="0" distL="0" distR="0" wp14:anchorId="243E56F4" wp14:editId="783E916C">
             <wp:extent cx="5120640" cy="4627581"/>
             <wp:effectExtent l="19050" t="19050" r="22860" b="20955"/>
-            <wp:docPr id="1545648003" name="Imagem 21"/>
+            <wp:docPr id="1481139633" name="Imagem 21"/>
             <wp:cNvGraphicFramePr/>
             <a:graphic xmlns:a="http://schemas.openxmlformats.org/drawingml/2006/main">
               <a:graphicData uri="http://schemas.openxmlformats.org/drawingml/2006/picture">
                 <pic:pic xmlns:pic="http://schemas.openxmlformats.org/drawingml/2006/picture">
                   <pic:nvPicPr>
-                    <pic:cNvPr id="1545648003" name=""/>
+                    <pic:cNvPr id="1481139633" name=""/>
                     <pic:cNvPicPr/>
                   </pic:nvPicPr>
                   <pic:blipFill>
@@ -14096,7 +14208,7 @@
           <w:sz w:val="27"/>
         </w:rPr>
       </w:pPr>
-      <w:bookmarkStart w:id="27" w:name="_Toc239320793"/>
+      <w:bookmarkStart w:id="27" w:name="_Toc239322529"/>
       <w:r>
         <w:rPr>
           <w:rFonts w:ascii="Montserrat" w:hAnsi="Montserrat"/>
@@ -14137,16 +14249,16 @@
         </w:rPr>
         <w:lastRenderedPageBreak/>
         <w:drawing>
-          <wp:inline distT="0" distB="0" distL="0" distR="0" wp14:anchorId="12638BFE" wp14:editId="5CABF737">
+          <wp:inline distT="0" distB="0" distL="0" distR="0" wp14:anchorId="1EDFB48F" wp14:editId="3D371E00">
             <wp:extent cx="5120640" cy="4627581"/>
             <wp:effectExtent l="19050" t="19050" r="22860" b="20955"/>
-            <wp:docPr id="2064613589" name="Imagem 22"/>
+            <wp:docPr id="463964285" name="Imagem 22"/>
             <wp:cNvGraphicFramePr/>
             <a:graphic xmlns:a="http://schemas.openxmlformats.org/drawingml/2006/main">
               <a:graphicData uri="http://schemas.openxmlformats.org/drawingml/2006/picture">
                 <pic:pic xmlns:pic="http://schemas.openxmlformats.org/drawingml/2006/picture">
                   <pic:nvPicPr>
-                    <pic:cNvPr id="2064613589" name=""/>
+                    <pic:cNvPr id="463964285" name=""/>
                     <pic:cNvPicPr/>
                   </pic:nvPicPr>
                   <pic:blipFill>
@@ -14214,16 +14326,16 @@
         </w:rPr>
         <w:lastRenderedPageBreak/>
         <w:drawing>
-          <wp:inline distT="0" distB="0" distL="0" distR="0" wp14:anchorId="193FB4CA" wp14:editId="5A767898">
+          <wp:inline distT="0" distB="0" distL="0" distR="0" wp14:anchorId="6BD37EB3" wp14:editId="2905D539">
             <wp:extent cx="5120640" cy="4627581"/>
             <wp:effectExtent l="19050" t="19050" r="22860" b="20955"/>
-            <wp:docPr id="746817490" name="Imagem 23"/>
+            <wp:docPr id="1722508211" name="Imagem 23"/>
             <wp:cNvGraphicFramePr/>
             <a:graphic xmlns:a="http://schemas.openxmlformats.org/drawingml/2006/main">
               <a:graphicData uri="http://schemas.openxmlformats.org/drawingml/2006/picture">
                 <pic:pic xmlns:pic="http://schemas.openxmlformats.org/drawingml/2006/picture">
                   <pic:nvPicPr>
-                    <pic:cNvPr id="746817490" name=""/>
+                    <pic:cNvPr id="1722508211" name=""/>
                     <pic:cNvPicPr/>
                   </pic:nvPicPr>
                   <pic:blipFill>
@@ -14460,7 +14572,7 @@
           <w:sz w:val="27"/>
         </w:rPr>
       </w:pPr>
-      <w:bookmarkStart w:id="28" w:name="_Toc239320794"/>
+      <w:bookmarkStart w:id="28" w:name="_Toc239322530"/>
       <w:r>
         <w:rPr>
           <w:rFonts w:ascii="Montserrat" w:hAnsi="Montserrat"/>
@@ -14500,16 +14612,16 @@
           <w:noProof/>
         </w:rPr>
         <w:drawing>
-          <wp:inline distT="0" distB="0" distL="0" distR="0" wp14:anchorId="2AE63F73" wp14:editId="038D79B9">
+          <wp:inline distT="0" distB="0" distL="0" distR="0" wp14:anchorId="171859C2" wp14:editId="6E48983F">
             <wp:extent cx="5120640" cy="4627581"/>
             <wp:effectExtent l="19050" t="19050" r="22860" b="20955"/>
-            <wp:docPr id="1860080890" name="Imagem 24"/>
+            <wp:docPr id="1718950681" name="Imagem 24"/>
             <wp:cNvGraphicFramePr/>
             <a:graphic xmlns:a="http://schemas.openxmlformats.org/drawingml/2006/main">
               <a:graphicData uri="http://schemas.openxmlformats.org/drawingml/2006/picture">
                 <pic:pic xmlns:pic="http://schemas.openxmlformats.org/drawingml/2006/picture">
                   <pic:nvPicPr>
-                    <pic:cNvPr id="1860080890" name=""/>
+                    <pic:cNvPr id="1718950681" name=""/>
                     <pic:cNvPicPr/>
                   </pic:nvPicPr>
                   <pic:blipFill>
@@ -14577,16 +14689,16 @@
         </w:rPr>
         <w:lastRenderedPageBreak/>
         <w:drawing>
-          <wp:inline distT="0" distB="0" distL="0" distR="0" wp14:anchorId="4899FCD3" wp14:editId="501469EB">
+          <wp:inline distT="0" distB="0" distL="0" distR="0" wp14:anchorId="4FBF665A" wp14:editId="50F47F25">
             <wp:extent cx="5120640" cy="4627581"/>
             <wp:effectExtent l="19050" t="19050" r="22860" b="20955"/>
-            <wp:docPr id="1799548190" name="Imagem 25"/>
+            <wp:docPr id="2049325487" name="Imagem 25"/>
             <wp:cNvGraphicFramePr/>
             <a:graphic xmlns:a="http://schemas.openxmlformats.org/drawingml/2006/main">
               <a:graphicData uri="http://schemas.openxmlformats.org/drawingml/2006/picture">
                 <pic:pic xmlns:pic="http://schemas.openxmlformats.org/drawingml/2006/picture">
                   <pic:nvPicPr>
-                    <pic:cNvPr id="1799548190" name=""/>
+                    <pic:cNvPr id="2049325487" name=""/>
                     <pic:cNvPicPr/>
                   </pic:nvPicPr>
                   <pic:blipFill>
@@ -14777,7 +14889,7 @@
           <w:sz w:val="27"/>
         </w:rPr>
       </w:pPr>
-      <w:bookmarkStart w:id="29" w:name="_Toc239320795"/>
+      <w:bookmarkStart w:id="29" w:name="_Toc239322531"/>
       <w:r>
         <w:rPr>
           <w:rFonts w:ascii="Montserrat" w:hAnsi="Montserrat"/>
@@ -14817,16 +14929,16 @@
           <w:noProof/>
         </w:rPr>
         <w:drawing>
-          <wp:inline distT="0" distB="0" distL="0" distR="0" wp14:anchorId="240AEA65" wp14:editId="0C520CD7">
+          <wp:inline distT="0" distB="0" distL="0" distR="0" wp14:anchorId="26B8954D" wp14:editId="40D8BDFD">
             <wp:extent cx="5120640" cy="4000682"/>
             <wp:effectExtent l="19050" t="19050" r="22860" b="19050"/>
-            <wp:docPr id="1741859472" name="Imagem 26"/>
+            <wp:docPr id="360682297" name="Imagem 26"/>
             <wp:cNvGraphicFramePr/>
             <a:graphic xmlns:a="http://schemas.openxmlformats.org/drawingml/2006/main">
               <a:graphicData uri="http://schemas.openxmlformats.org/drawingml/2006/picture">
                 <pic:pic xmlns:pic="http://schemas.openxmlformats.org/drawingml/2006/picture">
                   <pic:nvPicPr>
-                    <pic:cNvPr id="1741859472" name=""/>
+                    <pic:cNvPr id="360682297" name=""/>
                     <pic:cNvPicPr/>
                   </pic:nvPicPr>
                   <pic:blipFill>
@@ -15350,7 +15462,7 @@
           <w:sz w:val="34"/>
         </w:rPr>
       </w:pPr>
-      <w:bookmarkStart w:id="30" w:name="_Toc239320796"/>
+      <w:bookmarkStart w:id="30" w:name="_Toc239322532"/>
       <w:r>
         <w:rPr>
           <w:rFonts w:ascii="Montserrat" w:hAnsi="Montserrat"/>
@@ -15392,7 +15504,7 @@
           <w:sz w:val="27"/>
         </w:rPr>
       </w:pPr>
-      <w:bookmarkStart w:id="31" w:name="_Toc239320797"/>
+      <w:bookmarkStart w:id="31" w:name="_Toc239322533"/>
       <w:r>
         <w:rPr>
           <w:rFonts w:ascii="Montserrat" w:hAnsi="Montserrat"/>
@@ -15432,16 +15544,16 @@
           <w:noProof/>
         </w:rPr>
         <w:drawing>
-          <wp:inline distT="0" distB="0" distL="0" distR="0" wp14:anchorId="2CFC2E55" wp14:editId="492B8972">
+          <wp:inline distT="0" distB="0" distL="0" distR="0" wp14:anchorId="5ABA3FEF" wp14:editId="29D184FE">
             <wp:extent cx="5120640" cy="4627581"/>
             <wp:effectExtent l="19050" t="19050" r="22860" b="20955"/>
-            <wp:docPr id="1290359619" name="Imagem 27"/>
+            <wp:docPr id="904874114" name="Imagem 27"/>
             <wp:cNvGraphicFramePr/>
             <a:graphic xmlns:a="http://schemas.openxmlformats.org/drawingml/2006/main">
               <a:graphicData uri="http://schemas.openxmlformats.org/drawingml/2006/picture">
                 <pic:pic xmlns:pic="http://schemas.openxmlformats.org/drawingml/2006/picture">
                   <pic:nvPicPr>
-                    <pic:cNvPr id="1290359619" name=""/>
+                    <pic:cNvPr id="904874114" name=""/>
                     <pic:cNvPicPr/>
                   </pic:nvPicPr>
                   <pic:blipFill>
@@ -15509,16 +15621,16 @@
         </w:rPr>
         <w:lastRenderedPageBreak/>
         <w:drawing>
-          <wp:inline distT="0" distB="0" distL="0" distR="0" wp14:anchorId="3DE1F347" wp14:editId="2B12159E">
+          <wp:inline distT="0" distB="0" distL="0" distR="0" wp14:anchorId="58FBB610" wp14:editId="5FFB5A54">
             <wp:extent cx="5120640" cy="4627581"/>
             <wp:effectExtent l="19050" t="19050" r="22860" b="20955"/>
-            <wp:docPr id="1783975082" name="Imagem 28"/>
+            <wp:docPr id="185244080" name="Imagem 28"/>
             <wp:cNvGraphicFramePr/>
             <a:graphic xmlns:a="http://schemas.openxmlformats.org/drawingml/2006/main">
               <a:graphicData uri="http://schemas.openxmlformats.org/drawingml/2006/picture">
                 <pic:pic xmlns:pic="http://schemas.openxmlformats.org/drawingml/2006/picture">
                   <pic:nvPicPr>
-                    <pic:cNvPr id="1783975082" name=""/>
+                    <pic:cNvPr id="185244080" name=""/>
                     <pic:cNvPicPr/>
                   </pic:nvPicPr>
                   <pic:blipFill>
@@ -15586,16 +15698,16 @@
         </w:rPr>
         <w:lastRenderedPageBreak/>
         <w:drawing>
-          <wp:inline distT="0" distB="0" distL="0" distR="0" wp14:anchorId="12BAF5AF" wp14:editId="06FC4A13">
+          <wp:inline distT="0" distB="0" distL="0" distR="0" wp14:anchorId="2DC30EF3" wp14:editId="300C18A9">
             <wp:extent cx="5120640" cy="4627581"/>
             <wp:effectExtent l="19050" t="19050" r="22860" b="20955"/>
-            <wp:docPr id="972895359" name="Imagem 29"/>
+            <wp:docPr id="2088747033" name="Imagem 29"/>
             <wp:cNvGraphicFramePr/>
             <a:graphic xmlns:a="http://schemas.openxmlformats.org/drawingml/2006/main">
               <a:graphicData uri="http://schemas.openxmlformats.org/drawingml/2006/picture">
                 <pic:pic xmlns:pic="http://schemas.openxmlformats.org/drawingml/2006/picture">
                   <pic:nvPicPr>
-                    <pic:cNvPr id="972895359" name=""/>
+                    <pic:cNvPr id="2088747033" name=""/>
                     <pic:cNvPicPr/>
                   </pic:nvPicPr>
                   <pic:blipFill>
@@ -15764,18 +15876,8 @@
         </w:numPr>
         <w:spacing w:after="80" w:line="260" w:lineRule="auto"/>
         <w:ind w:left="700"/>
-        <w:rPr>
-          <w:rFonts w:ascii="Montserrat" w:hAnsi="Montserrat"/>
-          <w:color w:val="1A1A1A"/>
-          <w:sz w:val="22"/>
-        </w:rPr>
-      </w:pPr>
-      <w:r>
-        <w:rPr>
-          <w:rFonts w:ascii="Montserrat" w:hAnsi="Montserrat"/>
-          <w:color w:val="1A1A1A"/>
-          <w:sz w:val="22"/>
-        </w:rPr>
+      </w:pPr>
+      <w:r>
         <w:t>Importar marcos do TAP: na secao Marcos de cada linha, o botao Importar marcos do TAP (visivel com um Projeto vinculado selecionado) traz os marcos do cronograma de entregas macro do TAP daquele projeto - o nome do marco vira o Nome do marco aqui, o Termino previsto vira a Data, e o Status comeca sempre como A iniciar (o TAP nao registra se um marco ja foi concluido). Marcos com o mesmo nome que ja estiverem na lista nao sao duplicados - o botao pode ser clicado varias vezes com seguranca, assim como o Importar do TAP dos Indicadores (secao 4.2).</w:t>
       </w:r>
     </w:p>
@@ -15789,16 +15891,16 @@
           <w:noProof/>
         </w:rPr>
         <w:drawing>
-          <wp:inline distT="0" distB="0" distL="0" distR="0" wp14:anchorId="216A994B" wp14:editId="7DAAD814">
+          <wp:inline distT="0" distB="0" distL="0" distR="0" wp14:anchorId="7D66F989" wp14:editId="0F56FED1">
             <wp:extent cx="5120640" cy="1715571"/>
             <wp:effectExtent l="19050" t="19050" r="22860" b="18415"/>
-            <wp:docPr id="740493832" name="Imagem 30"/>
+            <wp:docPr id="1352739964" name="Imagem 30"/>
             <wp:cNvGraphicFramePr/>
             <a:graphic xmlns:a="http://schemas.openxmlformats.org/drawingml/2006/main">
               <a:graphicData uri="http://schemas.openxmlformats.org/drawingml/2006/picture">
                 <pic:pic xmlns:pic="http://schemas.openxmlformats.org/drawingml/2006/picture">
                   <pic:nvPicPr>
-                    <pic:cNvPr id="740493832" name=""/>
+                    <pic:cNvPr id="1352739964" name=""/>
                     <pic:cNvPicPr/>
                   </pic:nvPicPr>
                   <pic:blipFill>
@@ -15944,16 +16046,16 @@
           <w:noProof/>
         </w:rPr>
         <w:drawing>
-          <wp:inline distT="0" distB="0" distL="0" distR="0" wp14:anchorId="4845732B" wp14:editId="442B1676">
+          <wp:inline distT="0" distB="0" distL="0" distR="0" wp14:anchorId="3D1B6889" wp14:editId="2942E812">
             <wp:extent cx="5120640" cy="3282818"/>
             <wp:effectExtent l="19050" t="19050" r="22860" b="13335"/>
-            <wp:docPr id="369037922" name="Imagem 31"/>
+            <wp:docPr id="1691382879" name="Imagem 31"/>
             <wp:cNvGraphicFramePr/>
             <a:graphic xmlns:a="http://schemas.openxmlformats.org/drawingml/2006/main">
               <a:graphicData uri="http://schemas.openxmlformats.org/drawingml/2006/picture">
                 <pic:pic xmlns:pic="http://schemas.openxmlformats.org/drawingml/2006/picture">
                   <pic:nvPicPr>
-                    <pic:cNvPr id="369037922" name=""/>
+                    <pic:cNvPr id="1691382879" name=""/>
                     <pic:cNvPicPr/>
                   </pic:nvPicPr>
                   <pic:blipFill>
@@ -16066,16 +16168,16 @@
         </w:rPr>
         <w:lastRenderedPageBreak/>
         <w:drawing>
-          <wp:inline distT="0" distB="0" distL="0" distR="0" wp14:anchorId="463D3E50" wp14:editId="0B252A4E">
+          <wp:inline distT="0" distB="0" distL="0" distR="0" wp14:anchorId="43B693D1" wp14:editId="4608681B">
             <wp:extent cx="5120640" cy="951357"/>
             <wp:effectExtent l="19050" t="19050" r="22860" b="20320"/>
-            <wp:docPr id="494743936" name="Imagem 32"/>
+            <wp:docPr id="1564412887" name="Imagem 32"/>
             <wp:cNvGraphicFramePr/>
             <a:graphic xmlns:a="http://schemas.openxmlformats.org/drawingml/2006/main">
               <a:graphicData uri="http://schemas.openxmlformats.org/drawingml/2006/picture">
                 <pic:pic xmlns:pic="http://schemas.openxmlformats.org/drawingml/2006/picture">
                   <pic:nvPicPr>
-                    <pic:cNvPr id="494743936" name=""/>
+                    <pic:cNvPr id="1564412887" name=""/>
                     <pic:cNvPicPr/>
                   </pic:nvPicPr>
                   <pic:blipFill>
@@ -16187,16 +16289,16 @@
           <w:noProof/>
         </w:rPr>
         <w:drawing>
-          <wp:inline distT="0" distB="0" distL="0" distR="0" wp14:anchorId="5A9C651A" wp14:editId="093AB214">
+          <wp:inline distT="0" distB="0" distL="0" distR="0" wp14:anchorId="504DA65D" wp14:editId="2DF0AC6B">
             <wp:extent cx="5120640" cy="1515102"/>
             <wp:effectExtent l="19050" t="19050" r="22860" b="28575"/>
-            <wp:docPr id="1293114512" name="Imagem 33"/>
+            <wp:docPr id="842060178" name="Imagem 33"/>
             <wp:cNvGraphicFramePr/>
             <a:graphic xmlns:a="http://schemas.openxmlformats.org/drawingml/2006/main">
               <a:graphicData uri="http://schemas.openxmlformats.org/drawingml/2006/picture">
                 <pic:pic xmlns:pic="http://schemas.openxmlformats.org/drawingml/2006/picture">
                   <pic:nvPicPr>
-                    <pic:cNvPr id="1293114512" name=""/>
+                    <pic:cNvPr id="842060178" name=""/>
                     <pic:cNvPicPr/>
                   </pic:nvPicPr>
                   <pic:blipFill>
@@ -16318,16 +16420,16 @@
           <w:noProof/>
         </w:rPr>
         <w:drawing>
-          <wp:inline distT="0" distB="0" distL="0" distR="0" wp14:anchorId="15F24F99" wp14:editId="2347C273">
+          <wp:inline distT="0" distB="0" distL="0" distR="0" wp14:anchorId="0FF57468" wp14:editId="6FEFDB06">
             <wp:extent cx="5120640" cy="1391113"/>
             <wp:effectExtent l="19050" t="19050" r="22860" b="19050"/>
-            <wp:docPr id="1897693707" name="Imagem 34"/>
+            <wp:docPr id="1759685300" name="Imagem 34"/>
             <wp:cNvGraphicFramePr/>
             <a:graphic xmlns:a="http://schemas.openxmlformats.org/drawingml/2006/main">
               <a:graphicData uri="http://schemas.openxmlformats.org/drawingml/2006/picture">
                 <pic:pic xmlns:pic="http://schemas.openxmlformats.org/drawingml/2006/picture">
                   <pic:nvPicPr>
-                    <pic:cNvPr id="1897693707" name=""/>
+                    <pic:cNvPr id="1759685300" name=""/>
                     <pic:cNvPicPr/>
                   </pic:nvPicPr>
                   <pic:blipFill>
@@ -16439,16 +16541,16 @@
           <w:noProof/>
         </w:rPr>
         <w:drawing>
-          <wp:inline distT="0" distB="0" distL="0" distR="0" wp14:anchorId="00380C55" wp14:editId="1B8759DF">
+          <wp:inline distT="0" distB="0" distL="0" distR="0" wp14:anchorId="0FD2CBA2" wp14:editId="44A214D0">
             <wp:extent cx="5120640" cy="1125174"/>
             <wp:effectExtent l="19050" t="19050" r="22860" b="18415"/>
-            <wp:docPr id="283674900" name="Imagem 35"/>
+            <wp:docPr id="667775819" name="Imagem 35"/>
             <wp:cNvGraphicFramePr/>
             <a:graphic xmlns:a="http://schemas.openxmlformats.org/drawingml/2006/main">
               <a:graphicData uri="http://schemas.openxmlformats.org/drawingml/2006/picture">
                 <pic:pic xmlns:pic="http://schemas.openxmlformats.org/drawingml/2006/picture">
                   <pic:nvPicPr>
-                    <pic:cNvPr id="283674900" name=""/>
+                    <pic:cNvPr id="667775819" name=""/>
                     <pic:cNvPicPr/>
                   </pic:nvPicPr>
                   <pic:blipFill>
@@ -16537,7 +16639,7 @@
           <w:sz w:val="27"/>
         </w:rPr>
       </w:pPr>
-      <w:bookmarkStart w:id="32" w:name="_Toc239320798"/>
+      <w:bookmarkStart w:id="32" w:name="_Toc239322534"/>
       <w:r>
         <w:rPr>
           <w:rFonts w:ascii="Montserrat" w:hAnsi="Montserrat"/>
@@ -16578,16 +16680,16 @@
           <w:noProof/>
         </w:rPr>
         <w:drawing>
-          <wp:inline distT="0" distB="0" distL="0" distR="0" wp14:anchorId="388DAE59" wp14:editId="10D89679">
+          <wp:inline distT="0" distB="0" distL="0" distR="0" wp14:anchorId="7C315101" wp14:editId="5C46247A">
             <wp:extent cx="5120640" cy="4627581"/>
             <wp:effectExtent l="19050" t="19050" r="22860" b="20955"/>
-            <wp:docPr id="1462506478" name="Imagem 36"/>
+            <wp:docPr id="81909716" name="Imagem 36"/>
             <wp:cNvGraphicFramePr/>
             <a:graphic xmlns:a="http://schemas.openxmlformats.org/drawingml/2006/main">
               <a:graphicData uri="http://schemas.openxmlformats.org/drawingml/2006/picture">
                 <pic:pic xmlns:pic="http://schemas.openxmlformats.org/drawingml/2006/picture">
                   <pic:nvPicPr>
-                    <pic:cNvPr id="1462506478" name=""/>
+                    <pic:cNvPr id="81909716" name=""/>
                     <pic:cNvPicPr/>
                   </pic:nvPicPr>
                   <pic:blipFill>
@@ -16655,16 +16757,16 @@
         </w:rPr>
         <w:lastRenderedPageBreak/>
         <w:drawing>
-          <wp:inline distT="0" distB="0" distL="0" distR="0" wp14:anchorId="4DB07FFD" wp14:editId="07FE8CFF">
+          <wp:inline distT="0" distB="0" distL="0" distR="0" wp14:anchorId="29B795C8" wp14:editId="64567CE3">
             <wp:extent cx="5120640" cy="4627581"/>
             <wp:effectExtent l="19050" t="19050" r="22860" b="20955"/>
-            <wp:docPr id="2033823869" name="Imagem 37"/>
+            <wp:docPr id="335442111" name="Imagem 37"/>
             <wp:cNvGraphicFramePr/>
             <a:graphic xmlns:a="http://schemas.openxmlformats.org/drawingml/2006/main">
               <a:graphicData uri="http://schemas.openxmlformats.org/drawingml/2006/picture">
                 <pic:pic xmlns:pic="http://schemas.openxmlformats.org/drawingml/2006/picture">
                   <pic:nvPicPr>
-                    <pic:cNvPr id="2033823869" name=""/>
+                    <pic:cNvPr id="335442111" name=""/>
                     <pic:cNvPicPr/>
                   </pic:nvPicPr>
                   <pic:blipFill>
@@ -16833,16 +16935,16 @@
           <w:noProof/>
         </w:rPr>
         <w:drawing>
-          <wp:inline distT="0" distB="0" distL="0" distR="0" wp14:anchorId="6A4E2DC2" wp14:editId="7B5766D3">
+          <wp:inline distT="0" distB="0" distL="0" distR="0" wp14:anchorId="09B6606B" wp14:editId="26EECDF0">
             <wp:extent cx="5120640" cy="2144319"/>
             <wp:effectExtent l="19050" t="19050" r="22860" b="27940"/>
-            <wp:docPr id="810161999" name="Imagem 38"/>
+            <wp:docPr id="906362347" name="Imagem 38"/>
             <wp:cNvGraphicFramePr/>
             <a:graphic xmlns:a="http://schemas.openxmlformats.org/drawingml/2006/main">
               <a:graphicData uri="http://schemas.openxmlformats.org/drawingml/2006/picture">
                 <pic:pic xmlns:pic="http://schemas.openxmlformats.org/drawingml/2006/picture">
                   <pic:nvPicPr>
-                    <pic:cNvPr id="810161999" name=""/>
+                    <pic:cNvPr id="906362347" name=""/>
                     <pic:cNvPicPr/>
                   </pic:nvPicPr>
                   <pic:blipFill>
@@ -16930,16 +17032,16 @@
           <w:noProof/>
         </w:rPr>
         <w:drawing>
-          <wp:inline distT="0" distB="0" distL="0" distR="0" wp14:anchorId="47651A2C" wp14:editId="66A0D901">
+          <wp:inline distT="0" distB="0" distL="0" distR="0" wp14:anchorId="62AFE213" wp14:editId="2AD38443">
             <wp:extent cx="5120640" cy="1055647"/>
             <wp:effectExtent l="19050" t="19050" r="22860" b="11430"/>
-            <wp:docPr id="1349228460" name="Imagem 39"/>
+            <wp:docPr id="742801291" name="Imagem 39"/>
             <wp:cNvGraphicFramePr/>
             <a:graphic xmlns:a="http://schemas.openxmlformats.org/drawingml/2006/main">
               <a:graphicData uri="http://schemas.openxmlformats.org/drawingml/2006/picture">
                 <pic:pic xmlns:pic="http://schemas.openxmlformats.org/drawingml/2006/picture">
                   <pic:nvPicPr>
-                    <pic:cNvPr id="1349228460" name=""/>
+                    <pic:cNvPr id="742801291" name=""/>
                     <pic:cNvPicPr/>
                   </pic:nvPicPr>
                   <pic:blipFill>
@@ -17061,16 +17163,16 @@
           <w:noProof/>
         </w:rPr>
         <w:drawing>
-          <wp:inline distT="0" distB="0" distL="0" distR="0" wp14:anchorId="4F96D348" wp14:editId="7FE11553">
+          <wp:inline distT="0" distB="0" distL="0" distR="0" wp14:anchorId="4DAA0941" wp14:editId="2299A4DE">
             <wp:extent cx="5120640" cy="3282818"/>
             <wp:effectExtent l="19050" t="19050" r="22860" b="13335"/>
-            <wp:docPr id="858754859" name="Imagem 40"/>
+            <wp:docPr id="1443760472" name="Imagem 40"/>
             <wp:cNvGraphicFramePr/>
             <a:graphic xmlns:a="http://schemas.openxmlformats.org/drawingml/2006/main">
               <a:graphicData uri="http://schemas.openxmlformats.org/drawingml/2006/picture">
                 <pic:pic xmlns:pic="http://schemas.openxmlformats.org/drawingml/2006/picture">
                   <pic:nvPicPr>
-                    <pic:cNvPr id="858754859" name=""/>
+                    <pic:cNvPr id="1443760472" name=""/>
                     <pic:cNvPicPr/>
                   </pic:nvPicPr>
                   <pic:blipFill>
@@ -17204,16 +17306,16 @@
         </w:rPr>
         <w:lastRenderedPageBreak/>
         <w:drawing>
-          <wp:inline distT="0" distB="0" distL="0" distR="0" wp14:anchorId="43C0FD9E" wp14:editId="6B09C6BE">
+          <wp:inline distT="0" distB="0" distL="0" distR="0" wp14:anchorId="2D03AA79" wp14:editId="172B8695">
             <wp:extent cx="5120640" cy="1978034"/>
             <wp:effectExtent l="19050" t="19050" r="22860" b="22225"/>
-            <wp:docPr id="2077547401" name="Imagem 41"/>
+            <wp:docPr id="52590645" name="Imagem 41"/>
             <wp:cNvGraphicFramePr/>
             <a:graphic xmlns:a="http://schemas.openxmlformats.org/drawingml/2006/main">
               <a:graphicData uri="http://schemas.openxmlformats.org/drawingml/2006/picture">
                 <pic:pic xmlns:pic="http://schemas.openxmlformats.org/drawingml/2006/picture">
                   <pic:nvPicPr>
-                    <pic:cNvPr id="2077547401" name=""/>
+                    <pic:cNvPr id="52590645" name=""/>
                     <pic:cNvPicPr/>
                   </pic:nvPicPr>
                   <pic:blipFill>
@@ -17285,7 +17387,7 @@
           <w:sz w:val="34"/>
         </w:rPr>
       </w:pPr>
-      <w:bookmarkStart w:id="33" w:name="_Toc239320799"/>
+      <w:bookmarkStart w:id="33" w:name="_Toc239322535"/>
       <w:r>
         <w:rPr>
           <w:rFonts w:ascii="Montserrat" w:hAnsi="Montserrat"/>
@@ -17345,7 +17447,7 @@
           <w:sz w:val="27"/>
         </w:rPr>
       </w:pPr>
-      <w:bookmarkStart w:id="34" w:name="_Toc239320800"/>
+      <w:bookmarkStart w:id="34" w:name="_Toc239322536"/>
       <w:r>
         <w:rPr>
           <w:rFonts w:ascii="Montserrat" w:hAnsi="Montserrat"/>
@@ -17385,16 +17487,16 @@
           <w:noProof/>
         </w:rPr>
         <w:drawing>
-          <wp:inline distT="0" distB="0" distL="0" distR="0" wp14:anchorId="030AA41D" wp14:editId="7052EE58">
+          <wp:inline distT="0" distB="0" distL="0" distR="0" wp14:anchorId="147762EF" wp14:editId="2AD475C1">
             <wp:extent cx="5303520" cy="4792851"/>
             <wp:effectExtent l="19050" t="19050" r="11430" b="27305"/>
-            <wp:docPr id="1651237231" name="Imagem 42"/>
+            <wp:docPr id="729140051" name="Imagem 42"/>
             <wp:cNvGraphicFramePr/>
             <a:graphic xmlns:a="http://schemas.openxmlformats.org/drawingml/2006/main">
               <a:graphicData uri="http://schemas.openxmlformats.org/drawingml/2006/picture">
                 <pic:pic xmlns:pic="http://schemas.openxmlformats.org/drawingml/2006/picture">
                   <pic:nvPicPr>
-                    <pic:cNvPr id="1651237231" name=""/>
+                    <pic:cNvPr id="729140051" name=""/>
                     <pic:cNvPicPr/>
                   </pic:nvPicPr>
                   <pic:blipFill>
@@ -17463,7 +17565,7 @@
           <w:sz w:val="27"/>
         </w:rPr>
       </w:pPr>
-      <w:bookmarkStart w:id="35" w:name="_Toc239320801"/>
+      <w:bookmarkStart w:id="35" w:name="_Toc239322537"/>
       <w:r>
         <w:rPr>
           <w:rFonts w:ascii="Montserrat" w:hAnsi="Montserrat"/>
@@ -17503,16 +17605,16 @@
           <w:noProof/>
         </w:rPr>
         <w:drawing>
-          <wp:inline distT="0" distB="0" distL="0" distR="0" wp14:anchorId="7A21B4AB" wp14:editId="7E533851">
+          <wp:inline distT="0" distB="0" distL="0" distR="0" wp14:anchorId="44D70F4E" wp14:editId="5A9CF671">
             <wp:extent cx="5303520" cy="4792851"/>
             <wp:effectExtent l="19050" t="19050" r="11430" b="27305"/>
-            <wp:docPr id="1196866986" name="Imagem 43"/>
+            <wp:docPr id="1934871556" name="Imagem 43"/>
             <wp:cNvGraphicFramePr/>
             <a:graphic xmlns:a="http://schemas.openxmlformats.org/drawingml/2006/main">
               <a:graphicData uri="http://schemas.openxmlformats.org/drawingml/2006/picture">
                 <pic:pic xmlns:pic="http://schemas.openxmlformats.org/drawingml/2006/picture">
                   <pic:nvPicPr>
-                    <pic:cNvPr id="1196866986" name=""/>
+                    <pic:cNvPr id="1934871556" name=""/>
                     <pic:cNvPicPr/>
                   </pic:nvPicPr>
                   <pic:blipFill>
@@ -17580,7 +17682,7 @@
           <w:sz w:val="27"/>
         </w:rPr>
       </w:pPr>
-      <w:bookmarkStart w:id="36" w:name="_Toc239320802"/>
+      <w:bookmarkStart w:id="36" w:name="_Toc239322538"/>
       <w:r>
         <w:rPr>
           <w:rFonts w:ascii="Montserrat" w:hAnsi="Montserrat"/>
@@ -17621,16 +17723,16 @@
         </w:rPr>
         <w:lastRenderedPageBreak/>
         <w:drawing>
-          <wp:inline distT="0" distB="0" distL="0" distR="0" wp14:anchorId="411B5322" wp14:editId="254373E9">
+          <wp:inline distT="0" distB="0" distL="0" distR="0" wp14:anchorId="6288F6A6" wp14:editId="6C17A131">
             <wp:extent cx="5303520" cy="4792851"/>
             <wp:effectExtent l="19050" t="19050" r="11430" b="27305"/>
-            <wp:docPr id="354836604" name="Imagem 44"/>
+            <wp:docPr id="1463125616" name="Imagem 44"/>
             <wp:cNvGraphicFramePr/>
             <a:graphic xmlns:a="http://schemas.openxmlformats.org/drawingml/2006/main">
               <a:graphicData uri="http://schemas.openxmlformats.org/drawingml/2006/picture">
                 <pic:pic xmlns:pic="http://schemas.openxmlformats.org/drawingml/2006/picture">
                   <pic:nvPicPr>
-                    <pic:cNvPr id="354836604" name=""/>
+                    <pic:cNvPr id="1463125616" name=""/>
                     <pic:cNvPicPr/>
                   </pic:nvPicPr>
                   <pic:blipFill>
@@ -17698,16 +17800,16 @@
         </w:rPr>
         <w:lastRenderedPageBreak/>
         <w:drawing>
-          <wp:inline distT="0" distB="0" distL="0" distR="0" wp14:anchorId="1E1A20BA" wp14:editId="27EEF211">
+          <wp:inline distT="0" distB="0" distL="0" distR="0" wp14:anchorId="02AE93A5" wp14:editId="6B2ACFEC">
             <wp:extent cx="5303520" cy="4792851"/>
             <wp:effectExtent l="19050" t="19050" r="11430" b="27305"/>
-            <wp:docPr id="2015870479" name="Imagem 45"/>
+            <wp:docPr id="1279450066" name="Imagem 45"/>
             <wp:cNvGraphicFramePr/>
             <a:graphic xmlns:a="http://schemas.openxmlformats.org/drawingml/2006/main">
               <a:graphicData uri="http://schemas.openxmlformats.org/drawingml/2006/picture">
                 <pic:pic xmlns:pic="http://schemas.openxmlformats.org/drawingml/2006/picture">
                   <pic:nvPicPr>
-                    <pic:cNvPr id="2015870479" name=""/>
+                    <pic:cNvPr id="1279450066" name=""/>
                     <pic:cNvPicPr/>
                   </pic:nvPicPr>
                   <pic:blipFill>
@@ -17800,7 +17902,7 @@
           <w:sz w:val="34"/>
         </w:rPr>
       </w:pPr>
-      <w:bookmarkStart w:id="37" w:name="_Toc239320803"/>
+      <w:bookmarkStart w:id="37" w:name="_Toc239322539"/>
       <w:r>
         <w:rPr>
           <w:rFonts w:ascii="Montserrat" w:hAnsi="Montserrat"/>
@@ -17842,7 +17944,7 @@
           <w:sz w:val="27"/>
         </w:rPr>
       </w:pPr>
-      <w:bookmarkStart w:id="38" w:name="_Toc239320804"/>
+      <w:bookmarkStart w:id="38" w:name="_Toc239322540"/>
       <w:r>
         <w:rPr>
           <w:rFonts w:ascii="Montserrat" w:hAnsi="Montserrat"/>
@@ -17882,16 +17984,16 @@
           <w:noProof/>
         </w:rPr>
         <w:drawing>
-          <wp:inline distT="0" distB="0" distL="0" distR="0" wp14:anchorId="3E0DD414" wp14:editId="602C1983">
+          <wp:inline distT="0" distB="0" distL="0" distR="0" wp14:anchorId="5E83E410" wp14:editId="5B3F377B">
             <wp:extent cx="5303520" cy="4792851"/>
             <wp:effectExtent l="19050" t="19050" r="11430" b="27305"/>
-            <wp:docPr id="558819028" name="Imagem 46"/>
+            <wp:docPr id="1496280295" name="Imagem 46"/>
             <wp:cNvGraphicFramePr/>
             <a:graphic xmlns:a="http://schemas.openxmlformats.org/drawingml/2006/main">
               <a:graphicData uri="http://schemas.openxmlformats.org/drawingml/2006/picture">
                 <pic:pic xmlns:pic="http://schemas.openxmlformats.org/drawingml/2006/picture">
                   <pic:nvPicPr>
-                    <pic:cNvPr id="558819028" name=""/>
+                    <pic:cNvPr id="1496280295" name=""/>
                     <pic:cNvPicPr/>
                   </pic:nvPicPr>
                   <pic:blipFill>
@@ -18038,7 +18140,7 @@
           <w:sz w:val="27"/>
         </w:rPr>
       </w:pPr>
-      <w:bookmarkStart w:id="39" w:name="_Toc239320805"/>
+      <w:bookmarkStart w:id="39" w:name="_Toc239322541"/>
       <w:r>
         <w:rPr>
           <w:rFonts w:ascii="Montserrat" w:hAnsi="Montserrat"/>
@@ -18079,16 +18181,16 @@
         </w:rPr>
         <w:lastRenderedPageBreak/>
         <w:drawing>
-          <wp:inline distT="0" distB="0" distL="0" distR="0" wp14:anchorId="1118CFA2" wp14:editId="730F79F8">
+          <wp:inline distT="0" distB="0" distL="0" distR="0" wp14:anchorId="0BDFB56E" wp14:editId="1E3A33AE">
             <wp:extent cx="5303520" cy="4792851"/>
             <wp:effectExtent l="19050" t="19050" r="11430" b="27305"/>
-            <wp:docPr id="813872876" name="Imagem 47"/>
+            <wp:docPr id="1332962767" name="Imagem 47"/>
             <wp:cNvGraphicFramePr/>
             <a:graphic xmlns:a="http://schemas.openxmlformats.org/drawingml/2006/main">
               <a:graphicData uri="http://schemas.openxmlformats.org/drawingml/2006/picture">
                 <pic:pic xmlns:pic="http://schemas.openxmlformats.org/drawingml/2006/picture">
                   <pic:nvPicPr>
-                    <pic:cNvPr id="813872876" name=""/>
+                    <pic:cNvPr id="1332962767" name=""/>
                     <pic:cNvPicPr/>
                   </pic:nvPicPr>
                   <pic:blipFill>
@@ -18156,7 +18258,7 @@
           <w:sz w:val="27"/>
         </w:rPr>
       </w:pPr>
-      <w:bookmarkStart w:id="40" w:name="_Toc239320806"/>
+      <w:bookmarkStart w:id="40" w:name="_Toc239322542"/>
       <w:r>
         <w:rPr>
           <w:rFonts w:ascii="Montserrat" w:hAnsi="Montserrat"/>
@@ -18197,16 +18299,16 @@
         </w:rPr>
         <w:lastRenderedPageBreak/>
         <w:drawing>
-          <wp:inline distT="0" distB="0" distL="0" distR="0" wp14:anchorId="3E31DF71" wp14:editId="4C9A630C">
+          <wp:inline distT="0" distB="0" distL="0" distR="0" wp14:anchorId="5CFD2ED3" wp14:editId="66F1B311">
             <wp:extent cx="5303520" cy="4792851"/>
             <wp:effectExtent l="19050" t="19050" r="11430" b="27305"/>
-            <wp:docPr id="753130295" name="Imagem 48"/>
+            <wp:docPr id="222928919" name="Imagem 48"/>
             <wp:cNvGraphicFramePr/>
             <a:graphic xmlns:a="http://schemas.openxmlformats.org/drawingml/2006/main">
               <a:graphicData uri="http://schemas.openxmlformats.org/drawingml/2006/picture">
                 <pic:pic xmlns:pic="http://schemas.openxmlformats.org/drawingml/2006/picture">
                   <pic:nvPicPr>
-                    <pic:cNvPr id="753130295" name=""/>
+                    <pic:cNvPr id="222928919" name=""/>
                     <pic:cNvPicPr/>
                   </pic:nvPicPr>
                   <pic:blipFill>
@@ -18350,7 +18452,7 @@
           <w:sz w:val="27"/>
         </w:rPr>
       </w:pPr>
-      <w:bookmarkStart w:id="41" w:name="_Toc239320807"/>
+      <w:bookmarkStart w:id="41" w:name="_Toc239322543"/>
       <w:r>
         <w:rPr>
           <w:rFonts w:ascii="Montserrat" w:hAnsi="Montserrat"/>
@@ -18511,16 +18613,16 @@
         </w:rPr>
         <w:lastRenderedPageBreak/>
         <w:drawing>
-          <wp:inline distT="0" distB="0" distL="0" distR="0" wp14:anchorId="0A5D892A" wp14:editId="616579A1">
+          <wp:inline distT="0" distB="0" distL="0" distR="0" wp14:anchorId="2BF856D3" wp14:editId="23E2DB17">
             <wp:extent cx="5303520" cy="4267180"/>
             <wp:effectExtent l="19050" t="19050" r="11430" b="19685"/>
-            <wp:docPr id="1513263851" name="Imagem 49"/>
+            <wp:docPr id="1106003073" name="Imagem 49"/>
             <wp:cNvGraphicFramePr/>
             <a:graphic xmlns:a="http://schemas.openxmlformats.org/drawingml/2006/main">
               <a:graphicData uri="http://schemas.openxmlformats.org/drawingml/2006/picture">
                 <pic:pic xmlns:pic="http://schemas.openxmlformats.org/drawingml/2006/picture">
                   <pic:nvPicPr>
-                    <pic:cNvPr id="1513263851" name=""/>
+                    <pic:cNvPr id="1106003073" name=""/>
                     <pic:cNvPicPr/>
                   </pic:nvPicPr>
                   <pic:blipFill>
@@ -18588,16 +18690,16 @@
         </w:rPr>
         <w:lastRenderedPageBreak/>
         <w:drawing>
-          <wp:inline distT="0" distB="0" distL="0" distR="0" wp14:anchorId="28EE6663" wp14:editId="12820211">
+          <wp:inline distT="0" distB="0" distL="0" distR="0" wp14:anchorId="39DF0AF6" wp14:editId="668F86E9">
             <wp:extent cx="5303520" cy="3382059"/>
             <wp:effectExtent l="19050" t="19050" r="11430" b="27940"/>
-            <wp:docPr id="495659021" name="Imagem 50"/>
+            <wp:docPr id="705673440" name="Imagem 50"/>
             <wp:cNvGraphicFramePr/>
             <a:graphic xmlns:a="http://schemas.openxmlformats.org/drawingml/2006/main">
               <a:graphicData uri="http://schemas.openxmlformats.org/drawingml/2006/picture">
                 <pic:pic xmlns:pic="http://schemas.openxmlformats.org/drawingml/2006/picture">
                   <pic:nvPicPr>
-                    <pic:cNvPr id="495659021" name=""/>
+                    <pic:cNvPr id="705673440" name=""/>
                     <pic:cNvPicPr/>
                   </pic:nvPicPr>
                   <pic:blipFill>
@@ -18664,16 +18766,16 @@
           <w:noProof/>
         </w:rPr>
         <w:drawing>
-          <wp:inline distT="0" distB="0" distL="0" distR="0" wp14:anchorId="234026BD" wp14:editId="5CEA7CAF">
+          <wp:inline distT="0" distB="0" distL="0" distR="0" wp14:anchorId="1DA18DE1" wp14:editId="5358957A">
             <wp:extent cx="5303520" cy="4053550"/>
             <wp:effectExtent l="19050" t="19050" r="11430" b="23495"/>
-            <wp:docPr id="1192652817" name="Imagem 51"/>
+            <wp:docPr id="143373221" name="Imagem 51"/>
             <wp:cNvGraphicFramePr/>
             <a:graphic xmlns:a="http://schemas.openxmlformats.org/drawingml/2006/main">
               <a:graphicData uri="http://schemas.openxmlformats.org/drawingml/2006/picture">
                 <pic:pic xmlns:pic="http://schemas.openxmlformats.org/drawingml/2006/picture">
                   <pic:nvPicPr>
-                    <pic:cNvPr id="1192652817" name=""/>
+                    <pic:cNvPr id="143373221" name=""/>
                     <pic:cNvPicPr/>
                   </pic:nvPicPr>
                   <pic:blipFill>
@@ -18784,7 +18886,7 @@
           <w:sz w:val="27"/>
         </w:rPr>
       </w:pPr>
-      <w:bookmarkStart w:id="42" w:name="_Toc239320808"/>
+      <w:bookmarkStart w:id="42" w:name="_Toc239322544"/>
       <w:r>
         <w:rPr>
           <w:rFonts w:ascii="Montserrat" w:hAnsi="Montserrat"/>
@@ -18792,7 +18894,7 @@
           <w:color w:val="B91D2E"/>
           <w:sz w:val="27"/>
         </w:rPr>
-        <w:t>6.5 Ambiente de Treino</w:t>
+        <w:t>6.4.1 Ficha do Projeto</w:t>
       </w:r>
       <w:bookmarkEnd w:id="42"/>
     </w:p>
@@ -18811,25 +18913,7 @@
           <w:color w:val="1A1A1A"/>
           <w:sz w:val="22"/>
         </w:rPr>
-        <w:t>O sistema tem um ambiente de treinamento/demonstracao totalmente separado da producao - mesma ferramenta, mesmo schema de dados, mas um banco proprio, populado com 7 projetos ficticios cobrindo o ciclo completo (de uma Solicitacao de Demanda ainda pendente ate um projeto totalmente encerrado com TEP e RLA). Serve para apresentacoes, estudo e capacitacao sem tocar em nenhum dado real. Veja o roteiro Como rodar o Ambiente de Treinamento para o endereco, as contas de acesso e o passo a passo completo.</w:t>
-      </w:r>
-    </w:p>
-    <w:p>
-      <w:pPr>
-        <w:spacing w:line="280" w:lineRule="auto"/>
-        <w:rPr>
-          <w:rFonts w:ascii="Montserrat" w:hAnsi="Montserrat"/>
-          <w:color w:val="1A1A1A"/>
-          <w:sz w:val="22"/>
-        </w:rPr>
-      </w:pPr>
-      <w:r>
-        <w:rPr>
-          <w:rFonts w:ascii="Montserrat" w:hAnsi="Montserrat"/>
-          <w:color w:val="1A1A1A"/>
-          <w:sz w:val="22"/>
-        </w:rPr>
-        <w:t>Quando a Administracao e acessada em producao, aparece uma quarta aba, Ambiente de Treino, com um unico botao: Resetar ambiente de treinamento. Ao clicar (e confirmar o aviso), o sistema apaga todos os projetos e registros de formulario atualmente no ambiente de treinamento e recria os 7 projetos de exemplo do zero - util para deixar o ambiente limpo antes de uma nova turma, sem precisar rodar nenhum comando manualmente.</w:t>
+        <w:t>Visao consolidada de um unico projeto, reunindo em uma tela so o que hoje esta espalhado pelos 9 formularios do ciclo de vida. Aberta clicando no nome de um projeto na tabela Visao atual por projeto do Painel Executivo (secao 6.4); abrir a pagina direto, sem escolher um projeto antes, mostra um seletor com todos os projetos cadastrados. Diferente do Painel Executivo, nao tem restricao por papel - qualquer usuario autenticado pode ver a ficha de qualquer projeto, a mesma logica ja usada pelo botao Ver historico em cada formulario.</w:t>
       </w:r>
     </w:p>
     <w:p>
@@ -18853,7 +18937,7 @@
           <w:color w:val="1A1A1A"/>
           <w:sz w:val="22"/>
         </w:rPr>
-        <w:t>A aba so aparece quando a Administracao e acessada pelo endereco de producao - quem acessa a Administracao pelo proprio ambiente de treinamento nao ve essa opcao.</w:t>
+        <w:t>Dados do projeto: nome, unidade, gerente, status do cadastro compartilhado e quando foi criado/atualizado pela ultima vez.</w:t>
       </w:r>
     </w:p>
     <w:p>
@@ -18877,7 +18961,7 @@
           <w:color w:val="1A1A1A"/>
           <w:sz w:val="22"/>
         </w:rPr>
-        <w:t>Nao afeta nenhum dado de producao em nenhuma hipotese - a acao roda numa Edge Function que so tem permissao de escrita no banco do ambiente de treinamento.</w:t>
+        <w:t>Situacao atual: a linha desse projeto no Relatorio de Situacao - status, % concluido, datas previstas, marcos, custos realizados e os campos Merece destaque/Merece atencao, quando preenchidos.</w:t>
       </w:r>
     </w:p>
     <w:p>
@@ -18901,7 +18985,156 @@
           <w:color w:val="1A1A1A"/>
           <w:sz w:val="22"/>
         </w:rPr>
-        <w:t>As 6 contas fixas de treinamento e as configuracoes do ambiente de treino nao sao apagadas pelo reset - so os projetos e os registros de formulario.</w:t>
+        <w:t>Progresso do ciclo de vida: quantos registros existem em cada um dos 9 formularios (Demanda a RLA) para esse projeto, com o status de cada um e um link para abrir o formulario correspondente.</w:t>
+      </w:r>
+    </w:p>
+    <w:p>
+      <w:pPr>
+        <w:pStyle w:val="PargrafodaLista"/>
+        <w:numPr>
+          <w:ilvl w:val="0"/>
+          <w:numId w:val="29"/>
+        </w:numPr>
+        <w:spacing w:after="80" w:line="260" w:lineRule="auto"/>
+        <w:ind w:left="700"/>
+        <w:rPr>
+          <w:rFonts w:ascii="Montserrat" w:hAnsi="Montserrat"/>
+          <w:color w:val="1A1A1A"/>
+          <w:sz w:val="22"/>
+        </w:rPr>
+      </w:pPr>
+      <w:r>
+        <w:rPr>
+          <w:rFonts w:ascii="Montserrat" w:hAnsi="Montserrat"/>
+          <w:color w:val="1A1A1A"/>
+          <w:sz w:val="22"/>
+        </w:rPr>
+        <w:t>Cronograma e custos planejados (TAP): o cronograma de entregas macro e o custo total estimado do TAP desse projeto, para comparar com os custos realizados do Relatorio de Situacao.</w:t>
+      </w:r>
+    </w:p>
+    <w:p>
+      <w:pPr>
+        <w:pStyle w:val="PargrafodaLista"/>
+        <w:numPr>
+          <w:ilvl w:val="0"/>
+          <w:numId w:val="29"/>
+        </w:numPr>
+        <w:spacing w:after="80" w:line="260" w:lineRule="auto"/>
+        <w:ind w:left="700"/>
+        <w:rPr>
+          <w:rFonts w:ascii="Montserrat" w:hAnsi="Montserrat"/>
+          <w:color w:val="1A1A1A"/>
+          <w:sz w:val="22"/>
+        </w:rPr>
+      </w:pPr>
+      <w:r>
+        <w:rPr>
+          <w:rFonts w:ascii="Montserrat" w:hAnsi="Montserrat"/>
+          <w:color w:val="1A1A1A"/>
+          <w:sz w:val="22"/>
+        </w:rPr>
+        <w:t>Equipe do projeto: mesma lista de Administracao &gt; Equipes (secao 6.2), com o papel de cada membro vindo do cadastro global de usuarios.</w:t>
+      </w:r>
+    </w:p>
+    <w:p>
+      <w:pPr>
+        <w:pStyle w:val="PargrafodaLista"/>
+        <w:numPr>
+          <w:ilvl w:val="0"/>
+          <w:numId w:val="29"/>
+        </w:numPr>
+        <w:spacing w:after="80" w:line="260" w:lineRule="auto"/>
+        <w:ind w:left="700"/>
+        <w:rPr>
+          <w:rFonts w:ascii="Montserrat" w:hAnsi="Montserrat"/>
+          <w:color w:val="1A1A1A"/>
+          <w:sz w:val="22"/>
+        </w:rPr>
+      </w:pPr>
+      <w:r>
+        <w:rPr>
+          <w:rFonts w:ascii="Montserrat" w:hAnsi="Montserrat"/>
+          <w:color w:val="1A1A1A"/>
+          <w:sz w:val="22"/>
+        </w:rPr>
+        <w:t>Historico de alteracoes: o mesmo Ver historico ja disponivel em cada formulario vinculado a esse projeto.</w:t>
+      </w:r>
+    </w:p>
+    <w:p>
+      <w:pPr>
+        <w:spacing w:before="120" w:after="40"/>
+        <w:jc w:val="center"/>
+      </w:pPr>
+      <w:r>
+        <w:rPr>
+          <w:noProof/>
+        </w:rPr>
+        <w:lastRenderedPageBreak/>
+        <w:drawing>
+          <wp:inline distT="0" distB="0" distL="0" distR="0" wp14:anchorId="2950D338" wp14:editId="1D0E11AC">
+            <wp:extent cx="5303520" cy="6875734"/>
+            <wp:effectExtent l="19050" t="19050" r="11430" b="20955"/>
+            <wp:docPr id="264019860" name="Imagem 52"/>
+            <wp:cNvGraphicFramePr/>
+            <a:graphic xmlns:a="http://schemas.openxmlformats.org/drawingml/2006/main">
+              <a:graphicData uri="http://schemas.openxmlformats.org/drawingml/2006/picture">
+                <pic:pic xmlns:pic="http://schemas.openxmlformats.org/drawingml/2006/picture">
+                  <pic:nvPicPr>
+                    <pic:cNvPr id="264019860" name=""/>
+                    <pic:cNvPicPr/>
+                  </pic:nvPicPr>
+                  <pic:blipFill>
+                    <a:blip r:embed="rId58">
+                      <a:extLst>
+                        <a:ext uri="{28A0092B-C50C-407E-A947-70E740481C1C}">
+                          <a14:useLocalDpi xmlns:a14="http://schemas.microsoft.com/office/drawing/2010/main" val="0"/>
+                        </a:ext>
+                      </a:extLst>
+                    </a:blip>
+                    <a:stretch>
+                      <a:fillRect/>
+                    </a:stretch>
+                  </pic:blipFill>
+                  <pic:spPr>
+                    <a:xfrm>
+                      <a:off x="0" y="0"/>
+                      <a:ext cx="5303520" cy="6875734"/>
+                    </a:xfrm>
+                    <a:prstGeom prst="rect">
+                      <a:avLst/>
+                    </a:prstGeom>
+                    <a:ln w="9525">
+                      <a:solidFill>
+                        <a:srgbClr val="D1D5DB"/>
+                      </a:solidFill>
+                    </a:ln>
+                  </pic:spPr>
+                </pic:pic>
+              </a:graphicData>
+            </a:graphic>
+          </wp:inline>
+        </w:drawing>
+      </w:r>
+    </w:p>
+    <w:p>
+      <w:pPr>
+        <w:spacing w:before="120" w:after="280"/>
+        <w:jc w:val="center"/>
+        <w:rPr>
+          <w:rFonts w:ascii="Montserrat" w:hAnsi="Montserrat"/>
+          <w:i/>
+          <w:color w:val="6A6A70"/>
+          <w:sz w:val="19"/>
+        </w:rPr>
+      </w:pPr>
+      <w:r>
+        <w:rPr>
+          <w:rFonts w:ascii="Montserrat" w:hAnsi="Montserrat"/>
+          <w:i/>
+          <w:color w:val="6A6A70"/>
+          <w:sz w:val="19"/>
+        </w:rPr>
+        <w:t>Ficha do Projeto: dados do cadastro, situacao atual, progresso do ciclo de vida e cronograma do TAP.</w:t>
       </w:r>
     </w:p>
     <w:p>
@@ -18922,7 +19155,7 @@
           <w:color w:val="6A6A70"/>
           <w:sz w:val="21"/>
         </w:rPr>
-        <w:t>Assim como as outras acoes exclusivas de Admin, a Edge Function confere o papel do usuario direto no banco de producao antes de fazer qualquer alteracao - nao basta ver o botao na tela.</w:t>
+        <w:t>Cada secao mostra um estado vazio proprio quando nao ha dado ainda (ex.: Nenhum TAP encontrado para este projeto ainda) - nunca um erro, apenas indica que aquela etapa ainda nao foi preenchida.</w:t>
       </w:r>
     </w:p>
     <w:p>
@@ -18936,7 +19169,7 @@
           <w:sz w:val="27"/>
         </w:rPr>
       </w:pPr>
-      <w:bookmarkStart w:id="43" w:name="_Toc239320809"/>
+      <w:bookmarkStart w:id="43" w:name="_Toc239322545"/>
       <w:r>
         <w:rPr>
           <w:rFonts w:ascii="Montserrat" w:hAnsi="Montserrat"/>
@@ -18945,7 +19178,7 @@
           <w:sz w:val="27"/>
         </w:rPr>
         <w:lastRenderedPageBreak/>
-        <w:t>6.6 Backup automatizado</w:t>
+        <w:t>6.5 Ambiente de Treino</w:t>
       </w:r>
       <w:bookmarkEnd w:id="43"/>
     </w:p>
@@ -18964,7 +19197,25 @@
           <w:color w:val="1A1A1A"/>
           <w:sz w:val="22"/>
         </w:rPr>
-        <w:t>No fim da aba Configuracoes (secao 6.3), um bloco separado deixa o Admin/PMO definir os parametros de uma rotina de backup periodico do sistema inteiro (banco de dados, arquivos anexados e codigo-fonte) para um destino fora do GitHub - complemento operacional a proposta Backup Automatizado entregue separadamente.</w:t>
+        <w:t>O sistema tem um ambiente de treinamento/demonstracao totalmente separado da producao - mesma ferramenta, mesmo schema de dados, mas um banco proprio, populado com 7 projetos ficticios cobrindo o ciclo completo (de uma Solicitacao de Demanda ainda pendente ate um projeto totalmente encerrado com TEP e RLA). Serve para apresentacoes, estudo e capacitacao sem tocar em nenhum dado real. Veja o roteiro Como rodar o Ambiente de Treinamento para o endereco, as contas de acesso e o passo a passo completo.</w:t>
+      </w:r>
+    </w:p>
+    <w:p>
+      <w:pPr>
+        <w:spacing w:line="280" w:lineRule="auto"/>
+        <w:rPr>
+          <w:rFonts w:ascii="Montserrat" w:hAnsi="Montserrat"/>
+          <w:color w:val="1A1A1A"/>
+          <w:sz w:val="22"/>
+        </w:rPr>
+      </w:pPr>
+      <w:r>
+        <w:rPr>
+          <w:rFonts w:ascii="Montserrat" w:hAnsi="Montserrat"/>
+          <w:color w:val="1A1A1A"/>
+          <w:sz w:val="22"/>
+        </w:rPr>
+        <w:t>Quando a Administracao e acessada em producao, aparece uma quarta aba, Ambiente de Treino, com um unico botao: Resetar ambiente de treinamento. Ao clicar (e confirmar o aviso), o sistema apaga todos os projetos e registros de formulario atualmente no ambiente de treinamento e recria os 7 projetos de exemplo do zero - util para deixar o ambiente limpo antes de uma nova turma, sem precisar rodar nenhum comando manualmente.</w:t>
       </w:r>
     </w:p>
     <w:p>
@@ -18988,7 +19239,7 @@
           <w:color w:val="1A1A1A"/>
           <w:sz w:val="22"/>
         </w:rPr>
-        <w:t>Habilitar backup automatizado: interruptor geral da rotina.</w:t>
+        <w:t>A aba so aparece quando a Administracao e acessada pelo endereco de producao - quem acessa a Administracao pelo proprio ambiente de treinamento nao ve essa opcao.</w:t>
       </w:r>
     </w:p>
     <w:p>
@@ -19012,7 +19263,7 @@
           <w:color w:val="1A1A1A"/>
           <w:sz w:val="22"/>
         </w:rPr>
-        <w:t>Destino: OneDrive/SharePoint institucional, outro armazenamento de nuvem ou servidor da instituicao, mais o caminho/pasta exato onde gravar.</w:t>
+        <w:t>Nao afeta nenhum dado de producao em nenhuma hipotese - a acao roda numa Edge Function que so tem permissao de escrita no banco do ambiente de treinamento.</w:t>
       </w:r>
     </w:p>
     <w:p>
@@ -19036,7 +19287,69 @@
           <w:color w:val="1A1A1A"/>
           <w:sz w:val="22"/>
         </w:rPr>
-        <w:t>Frequencia: diaria ou semanal.</w:t>
+        <w:t>As 6 contas fixas de treinamento e as configuracoes do ambiente de treino nao sao apagadas pelo reset - so os projetos e os registros de formulario.</w:t>
+      </w:r>
+    </w:p>
+    <w:p>
+      <w:pPr>
+        <w:spacing w:before="160" w:after="200"/>
+        <w:ind w:left="283"/>
+        <w:rPr>
+          <w:rFonts w:ascii="Montserrat" w:hAnsi="Montserrat"/>
+          <w:i/>
+          <w:color w:val="6A6A70"/>
+          <w:sz w:val="21"/>
+        </w:rPr>
+      </w:pPr>
+      <w:r>
+        <w:rPr>
+          <w:rFonts w:ascii="Montserrat" w:hAnsi="Montserrat"/>
+          <w:i/>
+          <w:color w:val="6A6A70"/>
+          <w:sz w:val="21"/>
+        </w:rPr>
+        <w:t>Assim como as outras acoes exclusivas de Admin, a Edge Function confere o papel do usuario direto no banco de producao antes de fazer qualquer alteracao - nao basta ver o botao na tela.</w:t>
+      </w:r>
+    </w:p>
+    <w:p>
+      <w:pPr>
+        <w:pStyle w:val="Ttulo2"/>
+        <w:spacing w:before="320" w:after="120"/>
+        <w:rPr>
+          <w:rFonts w:ascii="Montserrat" w:hAnsi="Montserrat"/>
+          <w:b/>
+          <w:color w:val="B91D2E"/>
+          <w:sz w:val="27"/>
+        </w:rPr>
+      </w:pPr>
+      <w:bookmarkStart w:id="44" w:name="_Toc239322546"/>
+      <w:r>
+        <w:rPr>
+          <w:rFonts w:ascii="Montserrat" w:hAnsi="Montserrat"/>
+          <w:b/>
+          <w:color w:val="B91D2E"/>
+          <w:sz w:val="27"/>
+        </w:rPr>
+        <w:t>6.6 Backup automatizado</w:t>
+      </w:r>
+      <w:bookmarkEnd w:id="44"/>
+    </w:p>
+    <w:p>
+      <w:pPr>
+        <w:spacing w:line="280" w:lineRule="auto"/>
+        <w:rPr>
+          <w:rFonts w:ascii="Montserrat" w:hAnsi="Montserrat"/>
+          <w:color w:val="1A1A1A"/>
+          <w:sz w:val="22"/>
+        </w:rPr>
+      </w:pPr>
+      <w:r>
+        <w:rPr>
+          <w:rFonts w:ascii="Montserrat" w:hAnsi="Montserrat"/>
+          <w:color w:val="1A1A1A"/>
+          <w:sz w:val="22"/>
+        </w:rPr>
+        <w:t>No fim da aba Configuracoes (secao 6.3), um bloco separado deixa o Admin/PMO definir os parametros de uma rotina de backup periodico do sistema inteiro (banco de dados, arquivos anexados e codigo-fonte) para um destino fora do GitHub - complemento operacional a proposta Backup Automatizado entregue separadamente.</w:t>
       </w:r>
     </w:p>
     <w:p>
@@ -19044,7 +19357,7 @@
         <w:pStyle w:val="PargrafodaLista"/>
         <w:numPr>
           <w:ilvl w:val="0"/>
-          <w:numId w:val="30"/>
+          <w:numId w:val="31"/>
         </w:numPr>
         <w:spacing w:after="80" w:line="260" w:lineRule="auto"/>
         <w:ind w:left="700"/>
@@ -19060,7 +19373,7 @@
           <w:color w:val="1A1A1A"/>
           <w:sz w:val="22"/>
         </w:rPr>
-        <w:t>Retencao (dias, opcional): depois de quantos dias os backups antigos podem ser descartados; vazio mantem tudo indefinidamente.</w:t>
+        <w:t>Habilitar backup automatizado: interruptor geral da rotina.</w:t>
       </w:r>
     </w:p>
     <w:p>
@@ -19068,7 +19381,7 @@
         <w:pStyle w:val="PargrafodaLista"/>
         <w:numPr>
           <w:ilvl w:val="0"/>
-          <w:numId w:val="30"/>
+          <w:numId w:val="31"/>
         </w:numPr>
         <w:spacing w:after="80" w:line="260" w:lineRule="auto"/>
         <w:ind w:left="700"/>
@@ -19084,7 +19397,7 @@
           <w:color w:val="1A1A1A"/>
           <w:sz w:val="22"/>
         </w:rPr>
-        <w:t>E-mail de alerta: para onde avisar automaticamente se uma execucao falhar.</w:t>
+        <w:t>Destino: OneDrive/SharePoint institucional, outro armazenamento de nuvem ou servidor da instituicao, mais o caminho/pasta exato onde gravar.</w:t>
       </w:r>
     </w:p>
     <w:p>
@@ -19092,7 +19405,7 @@
         <w:pStyle w:val="PargrafodaLista"/>
         <w:numPr>
           <w:ilvl w:val="0"/>
-          <w:numId w:val="30"/>
+          <w:numId w:val="31"/>
         </w:numPr>
         <w:spacing w:after="80" w:line="260" w:lineRule="auto"/>
         <w:ind w:left="700"/>
@@ -19108,7 +19421,7 @@
           <w:color w:val="1A1A1A"/>
           <w:sz w:val="22"/>
         </w:rPr>
-        <w:t>E-mails com acesso ao destino externo: campo de registro/referencia de quem deveria ter permissao na pasta de destino - conceder esse acesso de fato continua sendo feito manualmente onde o destino estiver (OneDrive, repositorio etc.).</w:t>
+        <w:t>Frequencia: diaria ou semanal.</w:t>
       </w:r>
     </w:p>
     <w:p>
@@ -19116,7 +19429,7 @@
         <w:pStyle w:val="PargrafodaLista"/>
         <w:numPr>
           <w:ilvl w:val="0"/>
-          <w:numId w:val="30"/>
+          <w:numId w:val="31"/>
         </w:numPr>
         <w:spacing w:after="80" w:line="260" w:lineRule="auto"/>
         <w:ind w:left="700"/>
@@ -19132,7 +19445,8 @@
           <w:color w:val="1A1A1A"/>
           <w:sz w:val="22"/>
         </w:rPr>
-        <w:t>Quem pode gerenciar essas configuracoes: papeis liberados para alterar esta tela, alem do PMO/Admin, que sempre tem acesso.</w:t>
+        <w:lastRenderedPageBreak/>
+        <w:t>Retencao (dias, opcional): depois de quantos dias os backups antigos podem ser descartados; vazio mantem tudo indefinidamente.</w:t>
       </w:r>
     </w:p>
     <w:p>
@@ -19140,7 +19454,7 @@
         <w:pStyle w:val="PargrafodaLista"/>
         <w:numPr>
           <w:ilvl w:val="0"/>
-          <w:numId w:val="30"/>
+          <w:numId w:val="31"/>
         </w:numPr>
         <w:spacing w:after="80" w:line="260" w:lineRule="auto"/>
         <w:ind w:left="700"/>
@@ -19156,6 +19470,78 @@
           <w:color w:val="1A1A1A"/>
           <w:sz w:val="22"/>
         </w:rPr>
+        <w:t>E-mail de alerta: para onde avisar automaticamente se uma execucao falhar.</w:t>
+      </w:r>
+    </w:p>
+    <w:p>
+      <w:pPr>
+        <w:pStyle w:val="PargrafodaLista"/>
+        <w:numPr>
+          <w:ilvl w:val="0"/>
+          <w:numId w:val="31"/>
+        </w:numPr>
+        <w:spacing w:after="80" w:line="260" w:lineRule="auto"/>
+        <w:ind w:left="700"/>
+        <w:rPr>
+          <w:rFonts w:ascii="Montserrat" w:hAnsi="Montserrat"/>
+          <w:color w:val="1A1A1A"/>
+          <w:sz w:val="22"/>
+        </w:rPr>
+      </w:pPr>
+      <w:r>
+        <w:rPr>
+          <w:rFonts w:ascii="Montserrat" w:hAnsi="Montserrat"/>
+          <w:color w:val="1A1A1A"/>
+          <w:sz w:val="22"/>
+        </w:rPr>
+        <w:t>E-mails com acesso ao destino externo: campo de registro/referencia de quem deveria ter permissao na pasta de destino - conceder esse acesso de fato continua sendo feito manualmente onde o destino estiver (OneDrive, repositorio etc.).</w:t>
+      </w:r>
+    </w:p>
+    <w:p>
+      <w:pPr>
+        <w:pStyle w:val="PargrafodaLista"/>
+        <w:numPr>
+          <w:ilvl w:val="0"/>
+          <w:numId w:val="31"/>
+        </w:numPr>
+        <w:spacing w:after="80" w:line="260" w:lineRule="auto"/>
+        <w:ind w:left="700"/>
+        <w:rPr>
+          <w:rFonts w:ascii="Montserrat" w:hAnsi="Montserrat"/>
+          <w:color w:val="1A1A1A"/>
+          <w:sz w:val="22"/>
+        </w:rPr>
+      </w:pPr>
+      <w:r>
+        <w:rPr>
+          <w:rFonts w:ascii="Montserrat" w:hAnsi="Montserrat"/>
+          <w:color w:val="1A1A1A"/>
+          <w:sz w:val="22"/>
+        </w:rPr>
+        <w:t>Quem pode gerenciar essas configuracoes: papeis liberados para alterar esta tela, alem do PMO/Admin, que sempre tem acesso.</w:t>
+      </w:r>
+    </w:p>
+    <w:p>
+      <w:pPr>
+        <w:pStyle w:val="PargrafodaLista"/>
+        <w:numPr>
+          <w:ilvl w:val="0"/>
+          <w:numId w:val="31"/>
+        </w:numPr>
+        <w:spacing w:after="80" w:line="260" w:lineRule="auto"/>
+        <w:ind w:left="700"/>
+        <w:rPr>
+          <w:rFonts w:ascii="Montserrat" w:hAnsi="Montserrat"/>
+          <w:color w:val="1A1A1A"/>
+          <w:sz w:val="22"/>
+        </w:rPr>
+      </w:pPr>
+      <w:r>
+        <w:rPr>
+          <w:rFonts w:ascii="Montserrat" w:hAnsi="Montserrat"/>
+          <w:color w:val="1A1A1A"/>
+          <w:sz w:val="22"/>
+        </w:rPr>
         <w:t>Ultima execucao: data/hora e status (sucesso ou falha) da ultima vez que a rotina automatizada rodou, preenchido por ela mesma.</w:t>
       </w:r>
     </w:p>
@@ -19216,16 +19602,7 @@
           <w:color w:val="1A1A1A"/>
           <w:sz w:val="22"/>
         </w:rPr>
-        <w:t xml:space="preserve">Por ultimo, um bloco Metas dos indicadores estrategicos define a meta em % de cada um dos 3 indicadores do Relatorio de Resultados (secao 6.7) - Marcos no prazo, Projetos dentro do orcamento e Entraves resolvidos. Enquanto uma meta </w:t>
-      </w:r>
-      <w:r>
-        <w:rPr>
-          <w:rFonts w:ascii="Montserrat" w:hAnsi="Montserrat"/>
-          <w:color w:val="1A1A1A"/>
-          <w:sz w:val="22"/>
-        </w:rPr>
-        <w:lastRenderedPageBreak/>
-        <w:t>ficar vazia, o cartao correspondente mostra Meta nao definida em vez de um selo de status.</w:t>
+        <w:t>Por ultimo, um bloco Metas dos indicadores estrategicos define a meta em % de cada um dos 3 indicadores do Relatorio de Resultados (secao 6.7) - Marcos no prazo, Projetos dentro do orcamento e Entraves resolvidos. Enquanto uma meta ficar vazia, o cartao correspondente mostra Meta nao definida em vez de um selo de status.</w:t>
       </w:r>
     </w:p>
     <w:p>
@@ -19238,20 +19615,20 @@
           <w:noProof/>
         </w:rPr>
         <w:drawing>
-          <wp:inline distT="0" distB="0" distL="0" distR="0" wp14:anchorId="2043A386" wp14:editId="3182AA97">
+          <wp:inline distT="0" distB="0" distL="0" distR="0" wp14:anchorId="5AC7B559" wp14:editId="29E6B7AB">
             <wp:extent cx="5303520" cy="1351384"/>
             <wp:effectExtent l="19050" t="19050" r="11430" b="20320"/>
-            <wp:docPr id="2008166925" name="Imagem 52"/>
+            <wp:docPr id="1676620157" name="Imagem 53"/>
             <wp:cNvGraphicFramePr/>
             <a:graphic xmlns:a="http://schemas.openxmlformats.org/drawingml/2006/main">
               <a:graphicData uri="http://schemas.openxmlformats.org/drawingml/2006/picture">
                 <pic:pic xmlns:pic="http://schemas.openxmlformats.org/drawingml/2006/picture">
                   <pic:nvPicPr>
-                    <pic:cNvPr id="2008166925" name=""/>
+                    <pic:cNvPr id="1676620157" name=""/>
                     <pic:cNvPicPr/>
                   </pic:nvPicPr>
                   <pic:blipFill>
-                    <a:blip r:embed="rId58">
+                    <a:blip r:embed="rId59">
                       <a:extLst>
                         <a:ext uri="{28A0092B-C50C-407E-A947-70E740481C1C}">
                           <a14:useLocalDpi xmlns:a14="http://schemas.microsoft.com/office/drawing/2010/main" val="0"/>
@@ -19315,7 +19692,7 @@
           <w:sz w:val="27"/>
         </w:rPr>
       </w:pPr>
-      <w:bookmarkStart w:id="44" w:name="_Toc239320810"/>
+      <w:bookmarkStart w:id="45" w:name="_Toc239322547"/>
       <w:r>
         <w:rPr>
           <w:rFonts w:ascii="Montserrat" w:hAnsi="Montserrat"/>
@@ -19323,9 +19700,10 @@
           <w:color w:val="B91D2E"/>
           <w:sz w:val="27"/>
         </w:rPr>
+        <w:lastRenderedPageBreak/>
         <w:t>6.7 Relatorio de Resultados</w:t>
       </w:r>
-      <w:bookmarkEnd w:id="44"/>
+      <w:bookmarkEnd w:id="45"/>
     </w:p>
     <w:p>
       <w:pPr>
@@ -19350,7 +19728,7 @@
         <w:pStyle w:val="PargrafodaLista"/>
         <w:numPr>
           <w:ilvl w:val="0"/>
-          <w:numId w:val="31"/>
+          <w:numId w:val="32"/>
         </w:numPr>
         <w:spacing w:after="80" w:line="260" w:lineRule="auto"/>
         <w:ind w:left="700"/>
@@ -19374,7 +19752,7 @@
         <w:pStyle w:val="PargrafodaLista"/>
         <w:numPr>
           <w:ilvl w:val="0"/>
-          <w:numId w:val="31"/>
+          <w:numId w:val="32"/>
         </w:numPr>
         <w:spacing w:after="80" w:line="260" w:lineRule="auto"/>
         <w:ind w:left="700"/>
@@ -19398,7 +19776,7 @@
         <w:pStyle w:val="PargrafodaLista"/>
         <w:numPr>
           <w:ilvl w:val="0"/>
-          <w:numId w:val="31"/>
+          <w:numId w:val="32"/>
         </w:numPr>
         <w:spacing w:after="80" w:line="260" w:lineRule="auto"/>
         <w:ind w:left="700"/>
@@ -19427,20 +19805,20 @@
           <w:noProof/>
         </w:rPr>
         <w:drawing>
-          <wp:inline distT="0" distB="0" distL="0" distR="0" wp14:anchorId="2569AA91" wp14:editId="4AA07F48">
+          <wp:inline distT="0" distB="0" distL="0" distR="0" wp14:anchorId="1BE0A0D1" wp14:editId="6A1EE491">
             <wp:extent cx="5303520" cy="1422793"/>
             <wp:effectExtent l="19050" t="19050" r="11430" b="25400"/>
-            <wp:docPr id="459279105" name="Imagem 53"/>
+            <wp:docPr id="2126665728" name="Imagem 54"/>
             <wp:cNvGraphicFramePr/>
             <a:graphic xmlns:a="http://schemas.openxmlformats.org/drawingml/2006/main">
               <a:graphicData uri="http://schemas.openxmlformats.org/drawingml/2006/picture">
                 <pic:pic xmlns:pic="http://schemas.openxmlformats.org/drawingml/2006/picture">
                   <pic:nvPicPr>
-                    <pic:cNvPr id="459279105" name=""/>
+                    <pic:cNvPr id="2126665728" name=""/>
                     <pic:cNvPicPr/>
                   </pic:nvPicPr>
                   <pic:blipFill>
-                    <a:blip r:embed="rId59">
+                    <a:blip r:embed="rId60">
                       <a:extLst>
                         <a:ext uri="{28A0092B-C50C-407E-A947-70E740481C1C}">
                           <a14:useLocalDpi xmlns:a14="http://schemas.microsoft.com/office/drawing/2010/main" val="0"/>
@@ -19511,51 +19889,50 @@
           <w:color w:val="6A6A70"/>
           <w:sz w:val="21"/>
         </w:rPr>
-        <w:t xml:space="preserve">Meta e selo de status (Normal/Atencao/Critico): cada indicador compara o realizado com a meta definida pelo Admin (secao 6.3). Sem meta definida, o </w:t>
-      </w:r>
-      <w:r>
+        <w:t>Meta e selo de status (Normal/Atencao/Critico): cada indicador compara o realizado com a meta definida pelo Admin (secao 6.3). Sem meta definida, o cartao mostra Meta nao definida em vez de um selo - nunca inventa um status. Com meta definida: Normal na meta ou acima; Atencao ate 15 pontos percentuais abaixo da meta; Critico alem disso.</w:t>
+      </w:r>
+    </w:p>
+    <w:p>
+      <w:pPr>
+        <w:spacing w:before="160" w:after="200"/>
+        <w:ind w:left="283"/>
         <w:rPr>
           <w:rFonts w:ascii="Montserrat" w:hAnsi="Montserrat"/>
           <w:i/>
           <w:color w:val="6A6A70"/>
           <w:sz w:val="21"/>
         </w:rPr>
-        <w:lastRenderedPageBreak/>
-        <w:t>cartao mostra Meta nao definida em vez de um selo - nunca inventa um status. Com meta definida: Normal na meta ou acima; Atencao ate 15 pontos percentuais abaixo da meta; Critico alem disso.</w:t>
-      </w:r>
-    </w:p>
-    <w:p>
-      <w:pPr>
-        <w:spacing w:before="160" w:after="200"/>
-        <w:ind w:left="283"/>
+      </w:pPr>
+      <w:r>
         <w:rPr>
           <w:rFonts w:ascii="Montserrat" w:hAnsi="Montserrat"/>
           <w:i/>
           <w:color w:val="6A6A70"/>
           <w:sz w:val="21"/>
         </w:rPr>
-      </w:pPr>
-      <w:r>
+        <w:t>Tendencia: Marcos no prazo e Projetos dentro do orcamento mostram a evolucao dos ultimos salvamentos do Relatorio de Situacao (ex.: 81% -&gt; 85% -&gt; 87%), recalculada a partir do historico de versoes que esse relatorio ja mantinha (secao 4.1) - nao e um fechamento de calendario mes a mes, e sim uma tendencia de ultimos salvamentos.</w:t>
+      </w:r>
+    </w:p>
+    <w:p>
+      <w:pPr>
+        <w:spacing w:before="160" w:after="200"/>
+        <w:ind w:left="283"/>
         <w:rPr>
           <w:rFonts w:ascii="Montserrat" w:hAnsi="Montserrat"/>
           <w:i/>
           <w:color w:val="6A6A70"/>
           <w:sz w:val="21"/>
         </w:rPr>
-        <w:t>Tendencia: Marcos no prazo e Projetos dentro do orcamento mostram a evolucao dos ultimos salvamentos do Relatorio de Situacao (ex.: 81% -&gt; 85% -&gt; 87%), recalculada a partir do historico de versoes que esse relatorio ja mantinha (secao 4.1) - nao e um fechamento de calendario mes a mes, e sim uma tendencia de ultimos salvamentos.</w:t>
-      </w:r>
-    </w:p>
-    <w:p>
-      <w:pPr>
-        <w:spacing w:before="160" w:after="200"/>
-        <w:ind w:left="283"/>
+      </w:pPr>
+      <w:r>
         <w:rPr>
           <w:rFonts w:ascii="Montserrat" w:hAnsi="Montserrat"/>
           <w:i/>
           <w:color w:val="6A6A70"/>
           <w:sz w:val="21"/>
         </w:rPr>
-      </w:pPr>
+        <w:t xml:space="preserve">Marcos no prazo nao e o mesmo que concluido no prazo: o sistema guarda a data-alvo do marco, nao uma data separada de quando ele foi de fato concluido - por isso o indicador mede ausencia de atraso atual, o dado mais </w:t>
+      </w:r>
       <w:r>
         <w:rPr>
           <w:rFonts w:ascii="Montserrat" w:hAnsi="Montserrat"/>
@@ -19563,7 +19940,8 @@
           <w:color w:val="6A6A70"/>
           <w:sz w:val="21"/>
         </w:rPr>
-        <w:t>Marcos no prazo nao e o mesmo que concluido no prazo: o sistema guarda a data-alvo do marco, nao uma data separada de quando ele foi de fato concluido - por isso o indicador mede ausencia de atraso atual, o dado mais honesto disponivel hoje. Da mesma forma, Projetos dentro do orcamento e Entraves resolvidos aparecem como travessao (-) quando nao ha dado suficiente para calcular, em vez de mostrar um numero sem base.</w:t>
+        <w:lastRenderedPageBreak/>
+        <w:t>honesto disponivel hoje. Da mesma forma, Projetos dentro do orcamento e Entraves resolvidos aparecem como travessao (-) quando nao ha dado suficiente para calcular, em vez de mostrar um numero sem base.</w:t>
       </w:r>
     </w:p>
     <w:p>
@@ -19571,7 +19949,7 @@
         <w:pStyle w:val="PargrafodaLista"/>
         <w:numPr>
           <w:ilvl w:val="0"/>
-          <w:numId w:val="32"/>
+          <w:numId w:val="33"/>
         </w:numPr>
         <w:spacing w:after="80" w:line="260" w:lineRule="auto"/>
         <w:ind w:left="700"/>
@@ -19600,20 +19978,20 @@
           <w:noProof/>
         </w:rPr>
         <w:drawing>
-          <wp:inline distT="0" distB="0" distL="0" distR="0" wp14:anchorId="75A546A0" wp14:editId="1FF3E095">
+          <wp:inline distT="0" distB="0" distL="0" distR="0" wp14:anchorId="601EB1BF" wp14:editId="54D71766">
             <wp:extent cx="5303520" cy="1841050"/>
             <wp:effectExtent l="19050" t="19050" r="11430" b="26035"/>
-            <wp:docPr id="836707223" name="Imagem 54"/>
+            <wp:docPr id="1122850467" name="Imagem 55"/>
             <wp:cNvGraphicFramePr/>
             <a:graphic xmlns:a="http://schemas.openxmlformats.org/drawingml/2006/main">
               <a:graphicData uri="http://schemas.openxmlformats.org/drawingml/2006/picture">
                 <pic:pic xmlns:pic="http://schemas.openxmlformats.org/drawingml/2006/picture">
                   <pic:nvPicPr>
-                    <pic:cNvPr id="836707223" name=""/>
+                    <pic:cNvPr id="1122850467" name=""/>
                     <pic:cNvPicPr/>
                   </pic:nvPicPr>
                   <pic:blipFill>
-                    <a:blip r:embed="rId60">
+                    <a:blip r:embed="rId61">
                       <a:extLst>
                         <a:ext uri="{28A0092B-C50C-407E-A947-70E740481C1C}">
                           <a14:useLocalDpi xmlns:a14="http://schemas.microsoft.com/office/drawing/2010/main" val="0"/>
@@ -19710,7 +20088,7 @@
         <w:pStyle w:val="PargrafodaLista"/>
         <w:numPr>
           <w:ilvl w:val="0"/>
-          <w:numId w:val="32"/>
+          <w:numId w:val="33"/>
         </w:numPr>
         <w:spacing w:after="80" w:line="260" w:lineRule="auto"/>
         <w:ind w:left="700"/>
@@ -19734,7 +20112,7 @@
         <w:pStyle w:val="PargrafodaLista"/>
         <w:numPr>
           <w:ilvl w:val="0"/>
-          <w:numId w:val="32"/>
+          <w:numId w:val="33"/>
         </w:numPr>
         <w:spacing w:after="80" w:line="260" w:lineRule="auto"/>
         <w:ind w:left="700"/>
@@ -19750,7 +20128,6 @@
           <w:color w:val="1A1A1A"/>
           <w:sz w:val="22"/>
         </w:rPr>
-        <w:lastRenderedPageBreak/>
         <w:t>Gerar Apresentacao (PPTX): monta, inteiramente no navegador, uma apresentacao de 3 slides - capa, os indicadores estrategicos (com meta, barra de progresso, selo de status e tendencia) e o Plano de Acao - usando os mesmos numeros exibidos na tela naquele momento. Uma biblioteca de geracao e carregada sob demanda na primeira vez que o botao e usado (pode levar alguns segundos).</w:t>
       </w:r>
     </w:p>
@@ -19764,20 +20141,20 @@
           <w:noProof/>
         </w:rPr>
         <w:drawing>
-          <wp:inline distT="0" distB="0" distL="0" distR="0" wp14:anchorId="56BA010C" wp14:editId="1AA61CF7">
+          <wp:inline distT="0" distB="0" distL="0" distR="0" wp14:anchorId="209D853E" wp14:editId="08C9DCE3">
             <wp:extent cx="5303520" cy="303041"/>
             <wp:effectExtent l="19050" t="19050" r="11430" b="20955"/>
-            <wp:docPr id="1716905821" name="Imagem 55"/>
+            <wp:docPr id="1514105913" name="Imagem 56"/>
             <wp:cNvGraphicFramePr/>
             <a:graphic xmlns:a="http://schemas.openxmlformats.org/drawingml/2006/main">
               <a:graphicData uri="http://schemas.openxmlformats.org/drawingml/2006/picture">
                 <pic:pic xmlns:pic="http://schemas.openxmlformats.org/drawingml/2006/picture">
                   <pic:nvPicPr>
-                    <pic:cNvPr id="1716905821" name=""/>
+                    <pic:cNvPr id="1514105913" name=""/>
                     <pic:cNvPicPr/>
                   </pic:nvPicPr>
                   <pic:blipFill>
-                    <a:blip r:embed="rId61">
+                    <a:blip r:embed="rId62">
                       <a:extLst>
                         <a:ext uri="{28A0092B-C50C-407E-A947-70E740481C1C}">
                           <a14:useLocalDpi xmlns:a14="http://schemas.microsoft.com/office/drawing/2010/main" val="0"/>
@@ -19839,21 +20216,22 @@
         <w:rPr>
           <w:noProof/>
         </w:rPr>
+        <w:lastRenderedPageBreak/>
         <w:drawing>
-          <wp:inline distT="0" distB="0" distL="0" distR="0" wp14:anchorId="0C0636D7" wp14:editId="09E0B37A">
+          <wp:inline distT="0" distB="0" distL="0" distR="0" wp14:anchorId="76EAA49F" wp14:editId="6595D9FD">
             <wp:extent cx="5303520" cy="2983005"/>
             <wp:effectExtent l="19050" t="19050" r="11430" b="27305"/>
-            <wp:docPr id="60302753" name="Imagem 56"/>
+            <wp:docPr id="1875282869" name="Imagem 57"/>
             <wp:cNvGraphicFramePr/>
             <a:graphic xmlns:a="http://schemas.openxmlformats.org/drawingml/2006/main">
               <a:graphicData uri="http://schemas.openxmlformats.org/drawingml/2006/picture">
                 <pic:pic xmlns:pic="http://schemas.openxmlformats.org/drawingml/2006/picture">
                   <pic:nvPicPr>
-                    <pic:cNvPr id="60302753" name=""/>
+                    <pic:cNvPr id="1875282869" name=""/>
                     <pic:cNvPicPr/>
                   </pic:nvPicPr>
                   <pic:blipFill>
-                    <a:blip r:embed="rId62" cstate="print">
+                    <a:blip r:embed="rId63" cstate="print">
                       <a:extLst>
                         <a:ext uri="{28A0092B-C50C-407E-A947-70E740481C1C}">
                           <a14:useLocalDpi xmlns:a14="http://schemas.microsoft.com/office/drawing/2010/main" val="0"/>
@@ -19921,7 +20299,7 @@
           <w:sz w:val="34"/>
         </w:rPr>
       </w:pPr>
-      <w:bookmarkStart w:id="45" w:name="_Toc239320811"/>
+      <w:bookmarkStart w:id="46" w:name="_Toc239322548"/>
       <w:r>
         <w:rPr>
           <w:rFonts w:ascii="Montserrat" w:hAnsi="Montserrat"/>
@@ -19932,7 +20310,7 @@
         <w:lastRenderedPageBreak/>
         <w:t>7. Perguntas frequentes</w:t>
       </w:r>
-      <w:bookmarkEnd w:id="45"/>
+      <w:bookmarkEnd w:id="46"/>
     </w:p>
     <w:p>
       <w:pPr>
@@ -20165,7 +20543,7 @@
           <w:sz w:val="34"/>
         </w:rPr>
       </w:pPr>
-      <w:bookmarkStart w:id="46" w:name="_Toc239320812"/>
+      <w:bookmarkStart w:id="47" w:name="_Toc239322549"/>
       <w:r>
         <w:rPr>
           <w:rFonts w:ascii="Montserrat" w:hAnsi="Montserrat"/>
@@ -20176,7 +20554,7 @@
         <w:lastRenderedPageBreak/>
         <w:t>8. Anexo - Tabela de artefatos</w:t>
       </w:r>
-      <w:bookmarkEnd w:id="46"/>
+      <w:bookmarkEnd w:id="47"/>
     </w:p>
     <w:tbl>
       <w:tblPr>
@@ -21789,12 +22167,12 @@
       </w:pPr>
     </w:p>
     <w:sectPr>
-      <w:headerReference w:type="even" r:id="rId63"/>
-      <w:headerReference w:type="default" r:id="rId64"/>
-      <w:footerReference w:type="even" r:id="rId65"/>
-      <w:footerReference w:type="default" r:id="rId66"/>
-      <w:headerReference w:type="first" r:id="rId67"/>
-      <w:footerReference w:type="first" r:id="rId68"/>
+      <w:headerReference w:type="even" r:id="rId64"/>
+      <w:headerReference w:type="default" r:id="rId65"/>
+      <w:footerReference w:type="even" r:id="rId66"/>
+      <w:footerReference w:type="default" r:id="rId67"/>
+      <w:headerReference w:type="first" r:id="rId68"/>
+      <w:footerReference w:type="first" r:id="rId69"/>
       <w:pgSz w:w="12240" w:h="15840"/>
       <w:pgMar w:top="1417" w:right="1701" w:bottom="1417" w:left="1701" w:header="708" w:footer="708" w:gutter="0"/>
       <w:cols w:space="708"/>
@@ -21953,7 +22331,7 @@
 <file path=word/numbering.xml><?xml version="1.0" encoding="utf-8"?>
 <w:numbering xmlns:wpc="http://schemas.microsoft.com/office/word/2010/wordprocessingCanvas" xmlns:cx="http://schemas.microsoft.com/office/drawing/2014/chartex" xmlns:cx1="http://schemas.microsoft.com/office/drawing/2015/9/8/chartex" xmlns:cx2="http://schemas.microsoft.com/office/drawing/2015/10/21/chartex" xmlns:cx3="http://schemas.microsoft.com/office/drawing/2016/5/9/chartex" xmlns:cx4="http://schemas.microsoft.com/office/drawing/2016/5/10/chartex" xmlns:cx5="http://schemas.microsoft.com/office/drawing/2016/5/11/chartex" xmlns:cx6="http://schemas.microsoft.com/office/drawing/2016/5/12/chartex" xmlns:cx7="http://schemas.microsoft.com/office/drawing/2016/5/13/chartex" xmlns:cx8="http://schemas.microsoft.com/office/drawing/2016/5/14/chartex" xmlns:mc="http://schemas.openxmlformats.org/markup-compatibility/2006" xmlns:aink="http://schemas.microsoft.com/office/drawing/2016/ink" xmlns:am3d="http://schemas.microsoft.com/office/drawing/2017/model3d" xmlns:o="urn:schemas-microsoft-com:office:office" xmlns:oel="http://schemas.microsoft.com/office/2019/extlst" xmlns:r="http://schemas.openxmlformats.org/officeDocument/2006/relationships" xmlns:m="http://schemas.openxmlformats.org/officeDocument/2006/math" xmlns:v="urn:schemas-microsoft-com:vml" xmlns:wp14="http://schemas.microsoft.com/office/word/2010/wordprocessingDrawing" xmlns:wp="http://schemas.openxmlformats.org/drawingml/2006/wordprocessingDrawing" xmlns:w10="urn:schemas-microsoft-com:office:word" xmlns:w="http://schemas.openxmlformats.org/wordprocessingml/2006/main" xmlns:w14="http://schemas.microsoft.com/office/word/2010/wordml" xmlns:w15="http://schemas.microsoft.com/office/word/2012/wordml" xmlns:w16cex="http://schemas.microsoft.com/office/word/2018/wordml/cex" xmlns:w16cid="http://schemas.microsoft.com/office/word/2016/wordml/cid" xmlns:w16="http://schemas.microsoft.com/office/word/2018/wordml" xmlns:w16du="http://schemas.microsoft.com/office/word/2023/wordml/word16du" xmlns:w16sdtdh="http://schemas.microsoft.com/office/word/2020/wordml/sdtdatahash" xmlns:w16sdtfl="http://schemas.microsoft.com/office/word/2024/wordml/sdtformatlock" xmlns:w16se="http://schemas.microsoft.com/office/word/2015/wordml/symex" xmlns:wpg="http://schemas.microsoft.com/office/word/2010/wordprocessingGroup" xmlns:wpi="http://schemas.microsoft.com/office/word/2010/wordprocessingInk" xmlns:wne="http://schemas.microsoft.com/office/word/2006/wordml" xmlns:wps="http://schemas.microsoft.com/office/word/2010/wordprocessingShape" mc:Ignorable="w14 w15 w16se w16cid w16 w16cex w16sdtdh w16sdtfl w16du wp14">
   <w:abstractNum w:abstractNumId="0" w15:restartNumberingAfterBreak="0">
-    <w:nsid w:val="0478213A"/>
+    <w:nsid w:val="01873837"/>
     <w:multiLevelType w:val="singleLevel"/>
     <w:tmpl w:val="04160001"/>
     <w:lvl w:ilvl="0">
@@ -21970,7 +22348,7 @@
     </w:lvl>
   </w:abstractNum>
   <w:abstractNum w:abstractNumId="1" w15:restartNumberingAfterBreak="0">
-    <w:nsid w:val="0E1F61B0"/>
+    <w:nsid w:val="04D46F88"/>
     <w:multiLevelType w:val="singleLevel"/>
     <w:tmpl w:val="04160001"/>
     <w:lvl w:ilvl="0">
@@ -21987,7 +22365,7 @@
     </w:lvl>
   </w:abstractNum>
   <w:abstractNum w:abstractNumId="2" w15:restartNumberingAfterBreak="0">
-    <w:nsid w:val="116A31EE"/>
+    <w:nsid w:val="04E568D3"/>
     <w:multiLevelType w:val="singleLevel"/>
     <w:tmpl w:val="04160001"/>
     <w:lvl w:ilvl="0">
@@ -22004,7 +22382,7 @@
     </w:lvl>
   </w:abstractNum>
   <w:abstractNum w:abstractNumId="3" w15:restartNumberingAfterBreak="0">
-    <w:nsid w:val="147345FC"/>
+    <w:nsid w:val="0753235D"/>
     <w:multiLevelType w:val="singleLevel"/>
     <w:tmpl w:val="04160001"/>
     <w:lvl w:ilvl="0">
@@ -22021,7 +22399,7 @@
     </w:lvl>
   </w:abstractNum>
   <w:abstractNum w:abstractNumId="4" w15:restartNumberingAfterBreak="0">
-    <w:nsid w:val="179A2B8E"/>
+    <w:nsid w:val="0D4D7A80"/>
     <w:multiLevelType w:val="singleLevel"/>
     <w:tmpl w:val="04160001"/>
     <w:lvl w:ilvl="0">
@@ -22038,7 +22416,7 @@
     </w:lvl>
   </w:abstractNum>
   <w:abstractNum w:abstractNumId="5" w15:restartNumberingAfterBreak="0">
-    <w:nsid w:val="1A446474"/>
+    <w:nsid w:val="0DC73F11"/>
     <w:multiLevelType w:val="singleLevel"/>
     <w:tmpl w:val="04160001"/>
     <w:lvl w:ilvl="0">
@@ -22055,7 +22433,7 @@
     </w:lvl>
   </w:abstractNum>
   <w:abstractNum w:abstractNumId="6" w15:restartNumberingAfterBreak="0">
-    <w:nsid w:val="1DC42520"/>
+    <w:nsid w:val="12EC216D"/>
     <w:multiLevelType w:val="singleLevel"/>
     <w:tmpl w:val="04160001"/>
     <w:lvl w:ilvl="0">
@@ -22072,7 +22450,7 @@
     </w:lvl>
   </w:abstractNum>
   <w:abstractNum w:abstractNumId="7" w15:restartNumberingAfterBreak="0">
-    <w:nsid w:val="21E50D95"/>
+    <w:nsid w:val="16737C95"/>
     <w:multiLevelType w:val="singleLevel"/>
     <w:tmpl w:val="04160001"/>
     <w:lvl w:ilvl="0">
@@ -22089,7 +22467,7 @@
     </w:lvl>
   </w:abstractNum>
   <w:abstractNum w:abstractNumId="8" w15:restartNumberingAfterBreak="0">
-    <w:nsid w:val="24C37E68"/>
+    <w:nsid w:val="17A07CCB"/>
     <w:multiLevelType w:val="singleLevel"/>
     <w:tmpl w:val="04160001"/>
     <w:lvl w:ilvl="0">
@@ -22106,7 +22484,7 @@
     </w:lvl>
   </w:abstractNum>
   <w:abstractNum w:abstractNumId="9" w15:restartNumberingAfterBreak="0">
-    <w:nsid w:val="26537D80"/>
+    <w:nsid w:val="193714DB"/>
     <w:multiLevelType w:val="singleLevel"/>
     <w:tmpl w:val="04160001"/>
     <w:lvl w:ilvl="0">
@@ -22123,7 +22501,7 @@
     </w:lvl>
   </w:abstractNum>
   <w:abstractNum w:abstractNumId="10" w15:restartNumberingAfterBreak="0">
-    <w:nsid w:val="26C57DC0"/>
+    <w:nsid w:val="1FF405FA"/>
     <w:multiLevelType w:val="singleLevel"/>
     <w:tmpl w:val="04160001"/>
     <w:lvl w:ilvl="0">
@@ -22140,7 +22518,7 @@
     </w:lvl>
   </w:abstractNum>
   <w:abstractNum w:abstractNumId="11" w15:restartNumberingAfterBreak="0">
-    <w:nsid w:val="29793BE6"/>
+    <w:nsid w:val="289C32C5"/>
     <w:multiLevelType w:val="singleLevel"/>
     <w:tmpl w:val="04160001"/>
     <w:lvl w:ilvl="0">
@@ -22157,7 +22535,7 @@
     </w:lvl>
   </w:abstractNum>
   <w:abstractNum w:abstractNumId="12" w15:restartNumberingAfterBreak="0">
-    <w:nsid w:val="31D33897"/>
+    <w:nsid w:val="302D7BC4"/>
     <w:multiLevelType w:val="singleLevel"/>
     <w:tmpl w:val="04160001"/>
     <w:lvl w:ilvl="0">
@@ -22174,7 +22552,7 @@
     </w:lvl>
   </w:abstractNum>
   <w:abstractNum w:abstractNumId="13" w15:restartNumberingAfterBreak="0">
-    <w:nsid w:val="32594AE1"/>
+    <w:nsid w:val="35F4028B"/>
     <w:multiLevelType w:val="singleLevel"/>
     <w:tmpl w:val="04160001"/>
     <w:lvl w:ilvl="0">
@@ -22191,7 +22569,7 @@
     </w:lvl>
   </w:abstractNum>
   <w:abstractNum w:abstractNumId="14" w15:restartNumberingAfterBreak="0">
-    <w:nsid w:val="38526F18"/>
+    <w:nsid w:val="39C27569"/>
     <w:multiLevelType w:val="singleLevel"/>
     <w:tmpl w:val="04160001"/>
     <w:lvl w:ilvl="0">
@@ -22208,7 +22586,7 @@
     </w:lvl>
   </w:abstractNum>
   <w:abstractNum w:abstractNumId="15" w15:restartNumberingAfterBreak="0">
-    <w:nsid w:val="471B235E"/>
+    <w:nsid w:val="39DA119E"/>
     <w:multiLevelType w:val="singleLevel"/>
     <w:tmpl w:val="04160001"/>
     <w:lvl w:ilvl="0">
@@ -22225,7 +22603,7 @@
     </w:lvl>
   </w:abstractNum>
   <w:abstractNum w:abstractNumId="16" w15:restartNumberingAfterBreak="0">
-    <w:nsid w:val="4CCE3CEC"/>
+    <w:nsid w:val="42987391"/>
     <w:multiLevelType w:val="singleLevel"/>
     <w:tmpl w:val="04160001"/>
     <w:lvl w:ilvl="0">
@@ -22242,7 +22620,7 @@
     </w:lvl>
   </w:abstractNum>
   <w:abstractNum w:abstractNumId="17" w15:restartNumberingAfterBreak="0">
-    <w:nsid w:val="531A5A50"/>
+    <w:nsid w:val="4AF60AF9"/>
     <w:multiLevelType w:val="singleLevel"/>
     <w:tmpl w:val="04160001"/>
     <w:lvl w:ilvl="0">
@@ -22259,7 +22637,7 @@
     </w:lvl>
   </w:abstractNum>
   <w:abstractNum w:abstractNumId="18" w15:restartNumberingAfterBreak="0">
-    <w:nsid w:val="5A1175EE"/>
+    <w:nsid w:val="4E4E55AA"/>
     <w:multiLevelType w:val="singleLevel"/>
     <w:tmpl w:val="04160001"/>
     <w:lvl w:ilvl="0">
@@ -22276,7 +22654,7 @@
     </w:lvl>
   </w:abstractNum>
   <w:abstractNum w:abstractNumId="19" w15:restartNumberingAfterBreak="0">
-    <w:nsid w:val="5AB110BD"/>
+    <w:nsid w:val="4FB51D77"/>
     <w:multiLevelType w:val="singleLevel"/>
     <w:tmpl w:val="04160001"/>
     <w:lvl w:ilvl="0">
@@ -22293,7 +22671,7 @@
     </w:lvl>
   </w:abstractNum>
   <w:abstractNum w:abstractNumId="20" w15:restartNumberingAfterBreak="0">
-    <w:nsid w:val="5FC302A0"/>
+    <w:nsid w:val="50D94CC9"/>
     <w:multiLevelType w:val="singleLevel"/>
     <w:tmpl w:val="04160001"/>
     <w:lvl w:ilvl="0">
@@ -22310,7 +22688,7 @@
     </w:lvl>
   </w:abstractNum>
   <w:abstractNum w:abstractNumId="21" w15:restartNumberingAfterBreak="0">
-    <w:nsid w:val="621F0F7F"/>
+    <w:nsid w:val="52804235"/>
     <w:multiLevelType w:val="singleLevel"/>
     <w:tmpl w:val="04160001"/>
     <w:lvl w:ilvl="0">
@@ -22327,7 +22705,7 @@
     </w:lvl>
   </w:abstractNum>
   <w:abstractNum w:abstractNumId="22" w15:restartNumberingAfterBreak="0">
-    <w:nsid w:val="63FE60A9"/>
+    <w:nsid w:val="53F05C78"/>
     <w:multiLevelType w:val="singleLevel"/>
     <w:tmpl w:val="04160001"/>
     <w:lvl w:ilvl="0">
@@ -22344,7 +22722,7 @@
     </w:lvl>
   </w:abstractNum>
   <w:abstractNum w:abstractNumId="23" w15:restartNumberingAfterBreak="0">
-    <w:nsid w:val="6CE435E8"/>
+    <w:nsid w:val="546039E8"/>
     <w:multiLevelType w:val="singleLevel"/>
     <w:tmpl w:val="04160001"/>
     <w:lvl w:ilvl="0">
@@ -22361,7 +22739,7 @@
     </w:lvl>
   </w:abstractNum>
   <w:abstractNum w:abstractNumId="24" w15:restartNumberingAfterBreak="0">
-    <w:nsid w:val="6EC142E2"/>
+    <w:nsid w:val="5B580326"/>
     <w:multiLevelType w:val="singleLevel"/>
     <w:tmpl w:val="04160001"/>
     <w:lvl w:ilvl="0">
@@ -22378,7 +22756,7 @@
     </w:lvl>
   </w:abstractNum>
   <w:abstractNum w:abstractNumId="25" w15:restartNumberingAfterBreak="0">
-    <w:nsid w:val="70F2506F"/>
+    <w:nsid w:val="5F8B1F78"/>
     <w:multiLevelType w:val="singleLevel"/>
     <w:tmpl w:val="04160001"/>
     <w:lvl w:ilvl="0">
@@ -22395,7 +22773,7 @@
     </w:lvl>
   </w:abstractNum>
   <w:abstractNum w:abstractNumId="26" w15:restartNumberingAfterBreak="0">
-    <w:nsid w:val="71D42310"/>
+    <w:nsid w:val="608647C8"/>
     <w:multiLevelType w:val="singleLevel"/>
     <w:tmpl w:val="04160001"/>
     <w:lvl w:ilvl="0">
@@ -22412,7 +22790,7 @@
     </w:lvl>
   </w:abstractNum>
   <w:abstractNum w:abstractNumId="27" w15:restartNumberingAfterBreak="0">
-    <w:nsid w:val="73141ED0"/>
+    <w:nsid w:val="64665D29"/>
     <w:multiLevelType w:val="singleLevel"/>
     <w:tmpl w:val="04160001"/>
     <w:lvl w:ilvl="0">
@@ -22429,7 +22807,7 @@
     </w:lvl>
   </w:abstractNum>
   <w:abstractNum w:abstractNumId="28" w15:restartNumberingAfterBreak="0">
-    <w:nsid w:val="74F367AA"/>
+    <w:nsid w:val="6D0E0E0B"/>
     <w:multiLevelType w:val="singleLevel"/>
     <w:tmpl w:val="04160001"/>
     <w:lvl w:ilvl="0">
@@ -22446,7 +22824,7 @@
     </w:lvl>
   </w:abstractNum>
   <w:abstractNum w:abstractNumId="29" w15:restartNumberingAfterBreak="0">
-    <w:nsid w:val="75841750"/>
+    <w:nsid w:val="75092B75"/>
     <w:multiLevelType w:val="singleLevel"/>
     <w:tmpl w:val="04160001"/>
     <w:lvl w:ilvl="0">
@@ -22463,7 +22841,7 @@
     </w:lvl>
   </w:abstractNum>
   <w:abstractNum w:abstractNumId="30" w15:restartNumberingAfterBreak="0">
-    <w:nsid w:val="75FD4E63"/>
+    <w:nsid w:val="75D4278E"/>
     <w:multiLevelType w:val="singleLevel"/>
     <w:tmpl w:val="04160001"/>
     <w:lvl w:ilvl="0">
@@ -22480,7 +22858,7 @@
     </w:lvl>
   </w:abstractNum>
   <w:abstractNum w:abstractNumId="31" w15:restartNumberingAfterBreak="0">
-    <w:nsid w:val="780D6166"/>
+    <w:nsid w:val="77A71351"/>
     <w:multiLevelType w:val="singleLevel"/>
     <w:tmpl w:val="04160001"/>
     <w:lvl w:ilvl="0">
@@ -22496,101 +22874,121 @@
       </w:rPr>
     </w:lvl>
   </w:abstractNum>
-  <w:num w:numId="1" w16cid:durableId="763916970">
+  <w:abstractNum w:abstractNumId="32" w15:restartNumberingAfterBreak="0">
+    <w:nsid w:val="77D92212"/>
+    <w:multiLevelType w:val="singleLevel"/>
+    <w:tmpl w:val="04160001"/>
+    <w:lvl w:ilvl="0">
+      <w:start w:val="1"/>
+      <w:numFmt w:val="bullet"/>
+      <w:lvlText w:val=""/>
+      <w:lvlJc w:val="left"/>
+      <w:pPr>
+        <w:ind w:left="720" w:hanging="360"/>
+      </w:pPr>
+      <w:rPr>
+        <w:rFonts w:ascii="Symbol" w:hAnsi="Symbol" w:hint="default"/>
+      </w:rPr>
+    </w:lvl>
+  </w:abstractNum>
+  <w:num w:numId="1" w16cid:durableId="1865558028">
+    <w:abstractNumId w:val="7"/>
+  </w:num>
+  <w:num w:numId="2" w16cid:durableId="851186651">
+    <w:abstractNumId w:val="24"/>
+  </w:num>
+  <w:num w:numId="3" w16cid:durableId="1411926627">
+    <w:abstractNumId w:val="3"/>
+  </w:num>
+  <w:num w:numId="4" w16cid:durableId="191000589">
+    <w:abstractNumId w:val="27"/>
+  </w:num>
+  <w:num w:numId="5" w16cid:durableId="1470978130">
+    <w:abstractNumId w:val="2"/>
+  </w:num>
+  <w:num w:numId="6" w16cid:durableId="1286083037">
+    <w:abstractNumId w:val="29"/>
+  </w:num>
+  <w:num w:numId="7" w16cid:durableId="1116948769">
+    <w:abstractNumId w:val="14"/>
+  </w:num>
+  <w:num w:numId="8" w16cid:durableId="1235891306">
+    <w:abstractNumId w:val="32"/>
+  </w:num>
+  <w:num w:numId="9" w16cid:durableId="1632857063">
+    <w:abstractNumId w:val="22"/>
+  </w:num>
+  <w:num w:numId="10" w16cid:durableId="1196889578">
+    <w:abstractNumId w:val="31"/>
+  </w:num>
+  <w:num w:numId="11" w16cid:durableId="2053340977">
+    <w:abstractNumId w:val="17"/>
+  </w:num>
+  <w:num w:numId="12" w16cid:durableId="1529490663">
+    <w:abstractNumId w:val="23"/>
+  </w:num>
+  <w:num w:numId="13" w16cid:durableId="2066448209">
+    <w:abstractNumId w:val="11"/>
+  </w:num>
+  <w:num w:numId="14" w16cid:durableId="1613435968">
+    <w:abstractNumId w:val="8"/>
+  </w:num>
+  <w:num w:numId="15" w16cid:durableId="1424956581">
+    <w:abstractNumId w:val="6"/>
+  </w:num>
+  <w:num w:numId="16" w16cid:durableId="678898064">
+    <w:abstractNumId w:val="13"/>
+  </w:num>
+  <w:num w:numId="17" w16cid:durableId="1233275631">
+    <w:abstractNumId w:val="28"/>
+  </w:num>
+  <w:num w:numId="18" w16cid:durableId="246311130">
     <w:abstractNumId w:val="12"/>
   </w:num>
-  <w:num w:numId="2" w16cid:durableId="424689029">
+  <w:num w:numId="19" w16cid:durableId="211616957">
+    <w:abstractNumId w:val="30"/>
+  </w:num>
+  <w:num w:numId="20" w16cid:durableId="2087142558">
+    <w:abstractNumId w:val="10"/>
+  </w:num>
+  <w:num w:numId="21" w16cid:durableId="340200221">
+    <w:abstractNumId w:val="0"/>
+  </w:num>
+  <w:num w:numId="22" w16cid:durableId="57214277">
+    <w:abstractNumId w:val="21"/>
+  </w:num>
+  <w:num w:numId="23" w16cid:durableId="542904585">
+    <w:abstractNumId w:val="15"/>
+  </w:num>
+  <w:num w:numId="24" w16cid:durableId="648629496">
+    <w:abstractNumId w:val="5"/>
+  </w:num>
+  <w:num w:numId="25" w16cid:durableId="1659914905">
+    <w:abstractNumId w:val="4"/>
+  </w:num>
+  <w:num w:numId="26" w16cid:durableId="1807818466">
+    <w:abstractNumId w:val="1"/>
+  </w:num>
+  <w:num w:numId="27" w16cid:durableId="1354695245">
+    <w:abstractNumId w:val="26"/>
+  </w:num>
+  <w:num w:numId="28" w16cid:durableId="1853647971">
+    <w:abstractNumId w:val="19"/>
+  </w:num>
+  <w:num w:numId="29" w16cid:durableId="805046427">
+    <w:abstractNumId w:val="18"/>
+  </w:num>
+  <w:num w:numId="30" w16cid:durableId="1620836395">
+    <w:abstractNumId w:val="9"/>
+  </w:num>
+  <w:num w:numId="31" w16cid:durableId="1255629475">
     <w:abstractNumId w:val="20"/>
   </w:num>
-  <w:num w:numId="3" w16cid:durableId="1513446344">
-    <w:abstractNumId w:val="17"/>
-  </w:num>
-  <w:num w:numId="4" w16cid:durableId="691952419">
-    <w:abstractNumId w:val="7"/>
-  </w:num>
-  <w:num w:numId="5" w16cid:durableId="364134319">
-    <w:abstractNumId w:val="19"/>
-  </w:num>
-  <w:num w:numId="6" w16cid:durableId="93795408">
-    <w:abstractNumId w:val="6"/>
-  </w:num>
-  <w:num w:numId="7" w16cid:durableId="1449884701">
-    <w:abstractNumId w:val="9"/>
-  </w:num>
-  <w:num w:numId="8" w16cid:durableId="1923835502">
-    <w:abstractNumId w:val="18"/>
-  </w:num>
-  <w:num w:numId="9" w16cid:durableId="294221522">
-    <w:abstractNumId w:val="8"/>
-  </w:num>
-  <w:num w:numId="10" w16cid:durableId="373777587">
-    <w:abstractNumId w:val="23"/>
-  </w:num>
-  <w:num w:numId="11" w16cid:durableId="949628329">
-    <w:abstractNumId w:val="24"/>
-  </w:num>
-  <w:num w:numId="12" w16cid:durableId="1661032429">
-    <w:abstractNumId w:val="29"/>
-  </w:num>
-  <w:num w:numId="13" w16cid:durableId="688919175">
-    <w:abstractNumId w:val="27"/>
-  </w:num>
-  <w:num w:numId="14" w16cid:durableId="544684018">
-    <w:abstractNumId w:val="26"/>
-  </w:num>
-  <w:num w:numId="15" w16cid:durableId="600407168">
-    <w:abstractNumId w:val="5"/>
-  </w:num>
-  <w:num w:numId="16" w16cid:durableId="16278235">
-    <w:abstractNumId w:val="15"/>
-  </w:num>
-  <w:num w:numId="17" w16cid:durableId="1628122395">
-    <w:abstractNumId w:val="11"/>
-  </w:num>
-  <w:num w:numId="18" w16cid:durableId="1036999762">
-    <w:abstractNumId w:val="1"/>
-  </w:num>
-  <w:num w:numId="19" w16cid:durableId="1117875285">
-    <w:abstractNumId w:val="16"/>
-  </w:num>
-  <w:num w:numId="20" w16cid:durableId="104155667">
-    <w:abstractNumId w:val="28"/>
-  </w:num>
-  <w:num w:numId="21" w16cid:durableId="115370424">
-    <w:abstractNumId w:val="4"/>
-  </w:num>
-  <w:num w:numId="22" w16cid:durableId="881019967">
-    <w:abstractNumId w:val="22"/>
-  </w:num>
-  <w:num w:numId="23" w16cid:durableId="115804980">
-    <w:abstractNumId w:val="30"/>
-  </w:num>
-  <w:num w:numId="24" w16cid:durableId="1221357452">
-    <w:abstractNumId w:val="2"/>
-  </w:num>
-  <w:num w:numId="25" w16cid:durableId="1716924181">
+  <w:num w:numId="32" w16cid:durableId="1770810263">
     <w:abstractNumId w:val="25"/>
   </w:num>
-  <w:num w:numId="26" w16cid:durableId="56099012">
-    <w:abstractNumId w:val="3"/>
-  </w:num>
-  <w:num w:numId="27" w16cid:durableId="805438973">
-    <w:abstractNumId w:val="31"/>
-  </w:num>
-  <w:num w:numId="28" w16cid:durableId="1165316498">
-    <w:abstractNumId w:val="10"/>
-  </w:num>
-  <w:num w:numId="29" w16cid:durableId="1840852410">
-    <w:abstractNumId w:val="0"/>
-  </w:num>
-  <w:num w:numId="30" w16cid:durableId="2055350956">
-    <w:abstractNumId w:val="14"/>
-  </w:num>
-  <w:num w:numId="31" w16cid:durableId="1034892652">
-    <w:abstractNumId w:val="13"/>
-  </w:num>
-  <w:num w:numId="32" w16cid:durableId="1784954262">
-    <w:abstractNumId w:val="21"/>
+  <w:num w:numId="33" w16cid:durableId="1589921894">
+    <w:abstractNumId w:val="16"/>
   </w:num>
 </w:numbering>
 </file>
@@ -23003,7 +23401,7 @@
     <w:link w:val="Ttulo1Char"/>
     <w:uiPriority w:val="9"/>
     <w:qFormat/>
-    <w:rsid w:val="0092155D"/>
+    <w:rsid w:val="00AD6861"/>
     <w:pPr>
       <w:keepNext/>
       <w:keepLines/>
@@ -23025,7 +23423,7 @@
     <w:uiPriority w:val="9"/>
     <w:unhideWhenUsed/>
     <w:qFormat/>
-    <w:rsid w:val="0092155D"/>
+    <w:rsid w:val="00AD6861"/>
     <w:pPr>
       <w:keepNext/>
       <w:keepLines/>
@@ -23048,7 +23446,7 @@
     <w:semiHidden/>
     <w:unhideWhenUsed/>
     <w:qFormat/>
-    <w:rsid w:val="0092155D"/>
+    <w:rsid w:val="00AD6861"/>
     <w:pPr>
       <w:keepNext/>
       <w:keepLines/>
@@ -23071,7 +23469,7 @@
     <w:semiHidden/>
     <w:unhideWhenUsed/>
     <w:qFormat/>
-    <w:rsid w:val="0092155D"/>
+    <w:rsid w:val="00AD6861"/>
     <w:pPr>
       <w:keepNext/>
       <w:keepLines/>
@@ -23094,7 +23492,7 @@
     <w:semiHidden/>
     <w:unhideWhenUsed/>
     <w:qFormat/>
-    <w:rsid w:val="0092155D"/>
+    <w:rsid w:val="00AD6861"/>
     <w:pPr>
       <w:keepNext/>
       <w:keepLines/>
@@ -23115,7 +23513,7 @@
     <w:semiHidden/>
     <w:unhideWhenUsed/>
     <w:qFormat/>
-    <w:rsid w:val="0092155D"/>
+    <w:rsid w:val="00AD6861"/>
     <w:pPr>
       <w:keepNext/>
       <w:keepLines/>
@@ -23138,7 +23536,7 @@
     <w:semiHidden/>
     <w:unhideWhenUsed/>
     <w:qFormat/>
-    <w:rsid w:val="0092155D"/>
+    <w:rsid w:val="00AD6861"/>
     <w:pPr>
       <w:keepNext/>
       <w:keepLines/>
@@ -23159,7 +23557,7 @@
     <w:semiHidden/>
     <w:unhideWhenUsed/>
     <w:qFormat/>
-    <w:rsid w:val="0092155D"/>
+    <w:rsid w:val="00AD6861"/>
     <w:pPr>
       <w:keepNext/>
       <w:keepLines/>
@@ -23182,7 +23580,7 @@
     <w:semiHidden/>
     <w:unhideWhenUsed/>
     <w:qFormat/>
-    <w:rsid w:val="0092155D"/>
+    <w:rsid w:val="00AD6861"/>
     <w:pPr>
       <w:keepNext/>
       <w:keepLines/>
@@ -23226,7 +23624,7 @@
     <w:basedOn w:val="Fontepargpadro"/>
     <w:link w:val="Ttulo1"/>
     <w:uiPriority w:val="9"/>
-    <w:rsid w:val="0092155D"/>
+    <w:rsid w:val="00AD6861"/>
     <w:rPr>
       <w:rFonts w:asciiTheme="majorHAnsi" w:eastAsiaTheme="majorEastAsia" w:hAnsiTheme="majorHAnsi" w:cstheme="majorBidi"/>
       <w:color w:val="0F4761" w:themeColor="accent1" w:themeShade="BF"/>
@@ -23239,7 +23637,7 @@
     <w:basedOn w:val="Fontepargpadro"/>
     <w:link w:val="Ttulo2"/>
     <w:uiPriority w:val="9"/>
-    <w:rsid w:val="0092155D"/>
+    <w:rsid w:val="00AD6861"/>
     <w:rPr>
       <w:rFonts w:asciiTheme="majorHAnsi" w:eastAsiaTheme="majorEastAsia" w:hAnsiTheme="majorHAnsi" w:cstheme="majorBidi"/>
       <w:color w:val="0F4761" w:themeColor="accent1" w:themeShade="BF"/>
@@ -23253,7 +23651,7 @@
     <w:link w:val="Ttulo3"/>
     <w:uiPriority w:val="9"/>
     <w:semiHidden/>
-    <w:rsid w:val="0092155D"/>
+    <w:rsid w:val="00AD6861"/>
     <w:rPr>
       <w:rFonts w:eastAsiaTheme="majorEastAsia" w:cstheme="majorBidi"/>
       <w:color w:val="0F4761" w:themeColor="accent1" w:themeShade="BF"/>
@@ -23267,7 +23665,7 @@
     <w:link w:val="Ttulo4"/>
     <w:uiPriority w:val="9"/>
     <w:semiHidden/>
-    <w:rsid w:val="0092155D"/>
+    <w:rsid w:val="00AD6861"/>
     <w:rPr>
       <w:rFonts w:eastAsiaTheme="majorEastAsia" w:cstheme="majorBidi"/>
       <w:i/>
@@ -23281,7 +23679,7 @@
     <w:link w:val="Ttulo5"/>
     <w:uiPriority w:val="9"/>
     <w:semiHidden/>
-    <w:rsid w:val="0092155D"/>
+    <w:rsid w:val="00AD6861"/>
     <w:rPr>
       <w:rFonts w:eastAsiaTheme="majorEastAsia" w:cstheme="majorBidi"/>
       <w:color w:val="0F4761" w:themeColor="accent1" w:themeShade="BF"/>
@@ -23293,7 +23691,7 @@
     <w:link w:val="Ttulo6"/>
     <w:uiPriority w:val="9"/>
     <w:semiHidden/>
-    <w:rsid w:val="0092155D"/>
+    <w:rsid w:val="00AD6861"/>
     <w:rPr>
       <w:rFonts w:eastAsiaTheme="majorEastAsia" w:cstheme="majorBidi"/>
       <w:i/>
@@ -23307,7 +23705,7 @@
     <w:link w:val="Ttulo7"/>
     <w:uiPriority w:val="9"/>
     <w:semiHidden/>
-    <w:rsid w:val="0092155D"/>
+    <w:rsid w:val="00AD6861"/>
     <w:rPr>
       <w:rFonts w:eastAsiaTheme="majorEastAsia" w:cstheme="majorBidi"/>
       <w:color w:val="595959" w:themeColor="text1" w:themeTint="A6"/>
@@ -23319,7 +23717,7 @@
     <w:link w:val="Ttulo8"/>
     <w:uiPriority w:val="9"/>
     <w:semiHidden/>
-    <w:rsid w:val="0092155D"/>
+    <w:rsid w:val="00AD6861"/>
     <w:rPr>
       <w:rFonts w:eastAsiaTheme="majorEastAsia" w:cstheme="majorBidi"/>
       <w:i/>
@@ -23333,7 +23731,7 @@
     <w:link w:val="Ttulo9"/>
     <w:uiPriority w:val="9"/>
     <w:semiHidden/>
-    <w:rsid w:val="0092155D"/>
+    <w:rsid w:val="00AD6861"/>
     <w:rPr>
       <w:rFonts w:eastAsiaTheme="majorEastAsia" w:cstheme="majorBidi"/>
       <w:color w:val="272727" w:themeColor="text1" w:themeTint="D8"/>
@@ -23346,7 +23744,7 @@
     <w:link w:val="TtuloChar"/>
     <w:uiPriority w:val="10"/>
     <w:qFormat/>
-    <w:rsid w:val="0092155D"/>
+    <w:rsid w:val="00AD6861"/>
     <w:pPr>
       <w:spacing w:after="80" w:line="240" w:lineRule="auto"/>
       <w:contextualSpacing/>
@@ -23364,7 +23762,7 @@
     <w:basedOn w:val="Fontepargpadro"/>
     <w:link w:val="Ttulo"/>
     <w:uiPriority w:val="10"/>
-    <w:rsid w:val="0092155D"/>
+    <w:rsid w:val="00AD6861"/>
     <w:rPr>
       <w:rFonts w:asciiTheme="majorHAnsi" w:eastAsiaTheme="majorEastAsia" w:hAnsiTheme="majorHAnsi" w:cstheme="majorBidi"/>
       <w:spacing w:val="-10"/>
@@ -23380,7 +23778,7 @@
     <w:link w:val="SubttuloChar"/>
     <w:uiPriority w:val="11"/>
     <w:qFormat/>
-    <w:rsid w:val="0092155D"/>
+    <w:rsid w:val="00AD6861"/>
     <w:pPr>
       <w:numPr>
         <w:ilvl w:val="1"/>
@@ -23399,7 +23797,7 @@
     <w:basedOn w:val="Fontepargpadro"/>
     <w:link w:val="Subttulo"/>
     <w:uiPriority w:val="11"/>
-    <w:rsid w:val="0092155D"/>
+    <w:rsid w:val="00AD6861"/>
     <w:rPr>
       <w:rFonts w:eastAsiaTheme="majorEastAsia" w:cstheme="majorBidi"/>
       <w:color w:val="595959" w:themeColor="text1" w:themeTint="A6"/>
@@ -23415,7 +23813,7 @@
     <w:link w:val="CitaoChar"/>
     <w:uiPriority w:val="29"/>
     <w:qFormat/>
-    <w:rsid w:val="0092155D"/>
+    <w:rsid w:val="00AD6861"/>
     <w:pPr>
       <w:spacing w:before="160"/>
       <w:jc w:val="center"/>
@@ -23431,7 +23829,7 @@
     <w:basedOn w:val="Fontepargpadro"/>
     <w:link w:val="Citao"/>
     <w:uiPriority w:val="29"/>
-    <w:rsid w:val="0092155D"/>
+    <w:rsid w:val="00AD6861"/>
     <w:rPr>
       <w:i/>
       <w:iCs/>
@@ -23443,7 +23841,7 @@
     <w:basedOn w:val="Normal"/>
     <w:uiPriority w:val="34"/>
     <w:qFormat/>
-    <w:rsid w:val="0092155D"/>
+    <w:rsid w:val="00AD6861"/>
     <w:pPr>
       <w:ind w:left="720"/>
       <w:contextualSpacing/>
@@ -23454,7 +23852,7 @@
     <w:basedOn w:val="Fontepargpadro"/>
     <w:uiPriority w:val="21"/>
     <w:qFormat/>
-    <w:rsid w:val="0092155D"/>
+    <w:rsid w:val="00AD6861"/>
     <w:rPr>
       <w:i/>
       <w:iCs/>
@@ -23468,7 +23866,7 @@
     <w:link w:val="CitaoIntensaChar"/>
     <w:uiPriority w:val="30"/>
     <w:qFormat/>
-    <w:rsid w:val="0092155D"/>
+    <w:rsid w:val="00AD6861"/>
     <w:pPr>
       <w:pBdr>
         <w:top w:val="single" w:sz="4" w:space="10" w:color="0F4761" w:themeColor="accent1" w:themeShade="BF"/>
@@ -23489,7 +23887,7 @@
     <w:basedOn w:val="Fontepargpadro"/>
     <w:link w:val="CitaoIntensa"/>
     <w:uiPriority w:val="30"/>
-    <w:rsid w:val="0092155D"/>
+    <w:rsid w:val="00AD6861"/>
     <w:rPr>
       <w:i/>
       <w:iCs/>
@@ -23501,7 +23899,7 @@
     <w:basedOn w:val="Fontepargpadro"/>
     <w:uiPriority w:val="32"/>
     <w:qFormat/>
-    <w:rsid w:val="0092155D"/>
+    <w:rsid w:val="00AD6861"/>
     <w:rPr>
       <w:b/>
       <w:bCs/>
@@ -23516,7 +23914,7 @@
     <w:link w:val="CabealhoChar"/>
     <w:uiPriority w:val="99"/>
     <w:unhideWhenUsed/>
-    <w:rsid w:val="0092155D"/>
+    <w:rsid w:val="00AD6861"/>
     <w:pPr>
       <w:tabs>
         <w:tab w:val="center" w:pos="4252"/>
@@ -23530,7 +23928,7 @@
     <w:basedOn w:val="Fontepargpadro"/>
     <w:link w:val="Cabealho"/>
     <w:uiPriority w:val="99"/>
-    <w:rsid w:val="0092155D"/>
+    <w:rsid w:val="00AD6861"/>
   </w:style>
   <w:style w:type="paragraph" w:styleId="Rodap">
     <w:name w:val="footer"/>
@@ -23538,7 +23936,7 @@
     <w:link w:val="RodapChar"/>
     <w:uiPriority w:val="99"/>
     <w:unhideWhenUsed/>
-    <w:rsid w:val="0092155D"/>
+    <w:rsid w:val="00AD6861"/>
     <w:pPr>
       <w:tabs>
         <w:tab w:val="center" w:pos="4252"/>
@@ -23552,7 +23950,7 @@
     <w:basedOn w:val="Fontepargpadro"/>
     <w:link w:val="Rodap"/>
     <w:uiPriority w:val="99"/>
-    <w:rsid w:val="0092155D"/>
+    <w:rsid w:val="00AD6861"/>
   </w:style>
   <w:style w:type="paragraph" w:styleId="Sumrio1">
     <w:name w:val="toc 1"/>
@@ -23561,7 +23959,7 @@
     <w:autoRedefine/>
     <w:uiPriority w:val="39"/>
     <w:unhideWhenUsed/>
-    <w:rsid w:val="0092155D"/>
+    <w:rsid w:val="00AD6861"/>
     <w:pPr>
       <w:spacing w:after="100"/>
     </w:pPr>
@@ -23573,7 +23971,7 @@
     <w:autoRedefine/>
     <w:uiPriority w:val="39"/>
     <w:unhideWhenUsed/>
-    <w:rsid w:val="0092155D"/>
+    <w:rsid w:val="00AD6861"/>
     <w:pPr>
       <w:spacing w:after="100"/>
       <w:ind w:left="240"/>

</xml_diff>

<commit_message>
Sincroniza Manual de Uso - Saude do projeto (v2.43)
Espelha a atualizacao do Manual de Uso feita em producao (secao
6.4.1) documentando a Fase 3 da Visao atual por projeto.

Co-Authored-By: Claude Sonnet 5 <noreply@anthropic.com>
</commit_message>
<xml_diff>
--- a/Manual de Uso - Ferramenta de Gestao de Projetos.docx
+++ b/Manual de Uso - Ferramenta de Gestao de Projetos.docx
@@ -229,7 +229,7 @@
         <w:rPr>
           <w:noProof/>
         </w:rPr>
-        <w:instrText xml:space="preserve"> PAGEREF _Toc239322502 \h </w:instrText>
+        <w:instrText xml:space="preserve"> PAGEREF _Toc239326852 \h </w:instrText>
       </w:r>
       <w:r>
         <w:rPr>
@@ -290,7 +290,7 @@
         <w:rPr>
           <w:noProof/>
         </w:rPr>
-        <w:instrText xml:space="preserve"> PAGEREF _Toc239322503 \h </w:instrText>
+        <w:instrText xml:space="preserve"> PAGEREF _Toc239326853 \h </w:instrText>
       </w:r>
       <w:r>
         <w:rPr>
@@ -351,7 +351,7 @@
         <w:rPr>
           <w:noProof/>
         </w:rPr>
-        <w:instrText xml:space="preserve"> PAGEREF _Toc239322504 \h </w:instrText>
+        <w:instrText xml:space="preserve"> PAGEREF _Toc239326854 \h </w:instrText>
       </w:r>
       <w:r>
         <w:rPr>
@@ -412,7 +412,7 @@
         <w:rPr>
           <w:noProof/>
         </w:rPr>
-        <w:instrText xml:space="preserve"> PAGEREF _Toc239322505 \h </w:instrText>
+        <w:instrText xml:space="preserve"> PAGEREF _Toc239326855 \h </w:instrText>
       </w:r>
       <w:r>
         <w:rPr>
@@ -473,7 +473,7 @@
         <w:rPr>
           <w:noProof/>
         </w:rPr>
-        <w:instrText xml:space="preserve"> PAGEREF _Toc239322506 \h </w:instrText>
+        <w:instrText xml:space="preserve"> PAGEREF _Toc239326856 \h </w:instrText>
       </w:r>
       <w:r>
         <w:rPr>
@@ -534,7 +534,7 @@
         <w:rPr>
           <w:noProof/>
         </w:rPr>
-        <w:instrText xml:space="preserve"> PAGEREF _Toc239322507 \h </w:instrText>
+        <w:instrText xml:space="preserve"> PAGEREF _Toc239326857 \h </w:instrText>
       </w:r>
       <w:r>
         <w:rPr>
@@ -595,7 +595,7 @@
         <w:rPr>
           <w:noProof/>
         </w:rPr>
-        <w:instrText xml:space="preserve"> PAGEREF _Toc239322508 \h </w:instrText>
+        <w:instrText xml:space="preserve"> PAGEREF _Toc239326858 \h </w:instrText>
       </w:r>
       <w:r>
         <w:rPr>
@@ -656,7 +656,7 @@
         <w:rPr>
           <w:noProof/>
         </w:rPr>
-        <w:instrText xml:space="preserve"> PAGEREF _Toc239322509 \h </w:instrText>
+        <w:instrText xml:space="preserve"> PAGEREF _Toc239326859 \h </w:instrText>
       </w:r>
       <w:r>
         <w:rPr>
@@ -717,7 +717,7 @@
         <w:rPr>
           <w:noProof/>
         </w:rPr>
-        <w:instrText xml:space="preserve"> PAGEREF _Toc239322510 \h </w:instrText>
+        <w:instrText xml:space="preserve"> PAGEREF _Toc239326860 \h </w:instrText>
       </w:r>
       <w:r>
         <w:rPr>
@@ -778,7 +778,7 @@
         <w:rPr>
           <w:noProof/>
         </w:rPr>
-        <w:instrText xml:space="preserve"> PAGEREF _Toc239322511 \h </w:instrText>
+        <w:instrText xml:space="preserve"> PAGEREF _Toc239326861 \h </w:instrText>
       </w:r>
       <w:r>
         <w:rPr>
@@ -839,7 +839,7 @@
         <w:rPr>
           <w:noProof/>
         </w:rPr>
-        <w:instrText xml:space="preserve"> PAGEREF _Toc239322512 \h </w:instrText>
+        <w:instrText xml:space="preserve"> PAGEREF _Toc239326862 \h </w:instrText>
       </w:r>
       <w:r>
         <w:rPr>
@@ -900,7 +900,7 @@
         <w:rPr>
           <w:noProof/>
         </w:rPr>
-        <w:instrText xml:space="preserve"> PAGEREF _Toc239322513 \h </w:instrText>
+        <w:instrText xml:space="preserve"> PAGEREF _Toc239326863 \h </w:instrText>
       </w:r>
       <w:r>
         <w:rPr>
@@ -961,7 +961,7 @@
         <w:rPr>
           <w:noProof/>
         </w:rPr>
-        <w:instrText xml:space="preserve"> PAGEREF _Toc239322514 \h </w:instrText>
+        <w:instrText xml:space="preserve"> PAGEREF _Toc239326864 \h </w:instrText>
       </w:r>
       <w:r>
         <w:rPr>
@@ -1022,7 +1022,7 @@
         <w:rPr>
           <w:noProof/>
         </w:rPr>
-        <w:instrText xml:space="preserve"> PAGEREF _Toc239322515 \h </w:instrText>
+        <w:instrText xml:space="preserve"> PAGEREF _Toc239326865 \h </w:instrText>
       </w:r>
       <w:r>
         <w:rPr>
@@ -1083,7 +1083,7 @@
         <w:rPr>
           <w:noProof/>
         </w:rPr>
-        <w:instrText xml:space="preserve"> PAGEREF _Toc239322516 \h </w:instrText>
+        <w:instrText xml:space="preserve"> PAGEREF _Toc239326866 \h </w:instrText>
       </w:r>
       <w:r>
         <w:rPr>
@@ -1144,7 +1144,7 @@
         <w:rPr>
           <w:noProof/>
         </w:rPr>
-        <w:instrText xml:space="preserve"> PAGEREF _Toc239322517 \h </w:instrText>
+        <w:instrText xml:space="preserve"> PAGEREF _Toc239326867 \h </w:instrText>
       </w:r>
       <w:r>
         <w:rPr>
@@ -1205,7 +1205,7 @@
         <w:rPr>
           <w:noProof/>
         </w:rPr>
-        <w:instrText xml:space="preserve"> PAGEREF _Toc239322518 \h </w:instrText>
+        <w:instrText xml:space="preserve"> PAGEREF _Toc239326868 \h </w:instrText>
       </w:r>
       <w:r>
         <w:rPr>
@@ -1266,7 +1266,7 @@
         <w:rPr>
           <w:noProof/>
         </w:rPr>
-        <w:instrText xml:space="preserve"> PAGEREF _Toc239322519 \h </w:instrText>
+        <w:instrText xml:space="preserve"> PAGEREF _Toc239326869 \h </w:instrText>
       </w:r>
       <w:r>
         <w:rPr>
@@ -1327,7 +1327,7 @@
         <w:rPr>
           <w:noProof/>
         </w:rPr>
-        <w:instrText xml:space="preserve"> PAGEREF _Toc239322520 \h </w:instrText>
+        <w:instrText xml:space="preserve"> PAGEREF _Toc239326870 \h </w:instrText>
       </w:r>
       <w:r>
         <w:rPr>
@@ -1388,7 +1388,7 @@
         <w:rPr>
           <w:noProof/>
         </w:rPr>
-        <w:instrText xml:space="preserve"> PAGEREF _Toc239322521 \h </w:instrText>
+        <w:instrText xml:space="preserve"> PAGEREF _Toc239326871 \h </w:instrText>
       </w:r>
       <w:r>
         <w:rPr>
@@ -1449,7 +1449,7 @@
         <w:rPr>
           <w:noProof/>
         </w:rPr>
-        <w:instrText xml:space="preserve"> PAGEREF _Toc239322522 \h </w:instrText>
+        <w:instrText xml:space="preserve"> PAGEREF _Toc239326872 \h </w:instrText>
       </w:r>
       <w:r>
         <w:rPr>
@@ -1510,7 +1510,7 @@
         <w:rPr>
           <w:noProof/>
         </w:rPr>
-        <w:instrText xml:space="preserve"> PAGEREF _Toc239322523 \h </w:instrText>
+        <w:instrText xml:space="preserve"> PAGEREF _Toc239326873 \h </w:instrText>
       </w:r>
       <w:r>
         <w:rPr>
@@ -1571,7 +1571,7 @@
         <w:rPr>
           <w:noProof/>
         </w:rPr>
-        <w:instrText xml:space="preserve"> PAGEREF _Toc239322524 \h </w:instrText>
+        <w:instrText xml:space="preserve"> PAGEREF _Toc239326874 \h </w:instrText>
       </w:r>
       <w:r>
         <w:rPr>
@@ -1632,7 +1632,7 @@
         <w:rPr>
           <w:noProof/>
         </w:rPr>
-        <w:instrText xml:space="preserve"> PAGEREF _Toc239322525 \h </w:instrText>
+        <w:instrText xml:space="preserve"> PAGEREF _Toc239326875 \h </w:instrText>
       </w:r>
       <w:r>
         <w:rPr>
@@ -1693,7 +1693,7 @@
         <w:rPr>
           <w:noProof/>
         </w:rPr>
-        <w:instrText xml:space="preserve"> PAGEREF _Toc239322526 \h </w:instrText>
+        <w:instrText xml:space="preserve"> PAGEREF _Toc239326876 \h </w:instrText>
       </w:r>
       <w:r>
         <w:rPr>
@@ -1755,7 +1755,7 @@
         <w:rPr>
           <w:noProof/>
         </w:rPr>
-        <w:instrText xml:space="preserve"> PAGEREF _Toc239322527 \h </w:instrText>
+        <w:instrText xml:space="preserve"> PAGEREF _Toc239326877 \h </w:instrText>
       </w:r>
       <w:r>
         <w:rPr>
@@ -1816,7 +1816,7 @@
         <w:rPr>
           <w:noProof/>
         </w:rPr>
-        <w:instrText xml:space="preserve"> PAGEREF _Toc239322528 \h </w:instrText>
+        <w:instrText xml:space="preserve"> PAGEREF _Toc239326878 \h </w:instrText>
       </w:r>
       <w:r>
         <w:rPr>
@@ -1877,7 +1877,7 @@
         <w:rPr>
           <w:noProof/>
         </w:rPr>
-        <w:instrText xml:space="preserve"> PAGEREF _Toc239322529 \h </w:instrText>
+        <w:instrText xml:space="preserve"> PAGEREF _Toc239326879 \h </w:instrText>
       </w:r>
       <w:r>
         <w:rPr>
@@ -1938,7 +1938,7 @@
         <w:rPr>
           <w:noProof/>
         </w:rPr>
-        <w:instrText xml:space="preserve"> PAGEREF _Toc239322530 \h </w:instrText>
+        <w:instrText xml:space="preserve"> PAGEREF _Toc239326880 \h </w:instrText>
       </w:r>
       <w:r>
         <w:rPr>
@@ -1999,7 +1999,7 @@
         <w:rPr>
           <w:noProof/>
         </w:rPr>
-        <w:instrText xml:space="preserve"> PAGEREF _Toc239322531 \h </w:instrText>
+        <w:instrText xml:space="preserve"> PAGEREF _Toc239326881 \h </w:instrText>
       </w:r>
       <w:r>
         <w:rPr>
@@ -2060,7 +2060,7 @@
         <w:rPr>
           <w:noProof/>
         </w:rPr>
-        <w:instrText xml:space="preserve"> PAGEREF _Toc239322532 \h </w:instrText>
+        <w:instrText xml:space="preserve"> PAGEREF _Toc239326882 \h </w:instrText>
       </w:r>
       <w:r>
         <w:rPr>
@@ -2121,7 +2121,7 @@
         <w:rPr>
           <w:noProof/>
         </w:rPr>
-        <w:instrText xml:space="preserve"> PAGEREF _Toc239322533 \h </w:instrText>
+        <w:instrText xml:space="preserve"> PAGEREF _Toc239326883 \h </w:instrText>
       </w:r>
       <w:r>
         <w:rPr>
@@ -2182,7 +2182,7 @@
         <w:rPr>
           <w:noProof/>
         </w:rPr>
-        <w:instrText xml:space="preserve"> PAGEREF _Toc239322534 \h </w:instrText>
+        <w:instrText xml:space="preserve"> PAGEREF _Toc239326884 \h </w:instrText>
       </w:r>
       <w:r>
         <w:rPr>
@@ -2199,7 +2199,7 @@
         <w:rPr>
           <w:noProof/>
         </w:rPr>
-        <w:t>61</w:t>
+        <w:t>60</w:t>
       </w:r>
       <w:r>
         <w:rPr>
@@ -2243,7 +2243,7 @@
         <w:rPr>
           <w:noProof/>
         </w:rPr>
-        <w:instrText xml:space="preserve"> PAGEREF _Toc239322535 \h </w:instrText>
+        <w:instrText xml:space="preserve"> PAGEREF _Toc239326885 \h </w:instrText>
       </w:r>
       <w:r>
         <w:rPr>
@@ -2304,7 +2304,7 @@
         <w:rPr>
           <w:noProof/>
         </w:rPr>
-        <w:instrText xml:space="preserve"> PAGEREF _Toc239322536 \h </w:instrText>
+        <w:instrText xml:space="preserve"> PAGEREF _Toc239326886 \h </w:instrText>
       </w:r>
       <w:r>
         <w:rPr>
@@ -2365,7 +2365,7 @@
         <w:rPr>
           <w:noProof/>
         </w:rPr>
-        <w:instrText xml:space="preserve"> PAGEREF _Toc239322537 \h </w:instrText>
+        <w:instrText xml:space="preserve"> PAGEREF _Toc239326887 \h </w:instrText>
       </w:r>
       <w:r>
         <w:rPr>
@@ -2426,7 +2426,7 @@
         <w:rPr>
           <w:noProof/>
         </w:rPr>
-        <w:instrText xml:space="preserve"> PAGEREF _Toc239322538 \h </w:instrText>
+        <w:instrText xml:space="preserve"> PAGEREF _Toc239326888 \h </w:instrText>
       </w:r>
       <w:r>
         <w:rPr>
@@ -2487,7 +2487,7 @@
         <w:rPr>
           <w:noProof/>
         </w:rPr>
-        <w:instrText xml:space="preserve"> PAGEREF _Toc239322539 \h </w:instrText>
+        <w:instrText xml:space="preserve"> PAGEREF _Toc239326889 \h </w:instrText>
       </w:r>
       <w:r>
         <w:rPr>
@@ -2548,7 +2548,7 @@
         <w:rPr>
           <w:noProof/>
         </w:rPr>
-        <w:instrText xml:space="preserve"> PAGEREF _Toc239322540 \h </w:instrText>
+        <w:instrText xml:space="preserve"> PAGEREF _Toc239326890 \h </w:instrText>
       </w:r>
       <w:r>
         <w:rPr>
@@ -2609,7 +2609,7 @@
         <w:rPr>
           <w:noProof/>
         </w:rPr>
-        <w:instrText xml:space="preserve"> PAGEREF _Toc239322541 \h </w:instrText>
+        <w:instrText xml:space="preserve"> PAGEREF _Toc239326891 \h </w:instrText>
       </w:r>
       <w:r>
         <w:rPr>
@@ -2670,7 +2670,7 @@
         <w:rPr>
           <w:noProof/>
         </w:rPr>
-        <w:instrText xml:space="preserve"> PAGEREF _Toc239322542 \h </w:instrText>
+        <w:instrText xml:space="preserve"> PAGEREF _Toc239326892 \h </w:instrText>
       </w:r>
       <w:r>
         <w:rPr>
@@ -2731,7 +2731,7 @@
         <w:rPr>
           <w:noProof/>
         </w:rPr>
-        <w:instrText xml:space="preserve"> PAGEREF _Toc239322543 \h </w:instrText>
+        <w:instrText xml:space="preserve"> PAGEREF _Toc239326893 \h </w:instrText>
       </w:r>
       <w:r>
         <w:rPr>
@@ -2792,7 +2792,7 @@
         <w:rPr>
           <w:noProof/>
         </w:rPr>
-        <w:instrText xml:space="preserve"> PAGEREF _Toc239322544 \h </w:instrText>
+        <w:instrText xml:space="preserve"> PAGEREF _Toc239326894 \h </w:instrText>
       </w:r>
       <w:r>
         <w:rPr>
@@ -2853,7 +2853,7 @@
         <w:rPr>
           <w:noProof/>
         </w:rPr>
-        <w:instrText xml:space="preserve"> PAGEREF _Toc239322545 \h </w:instrText>
+        <w:instrText xml:space="preserve"> PAGEREF _Toc239326895 \h </w:instrText>
       </w:r>
       <w:r>
         <w:rPr>
@@ -2870,7 +2870,7 @@
         <w:rPr>
           <w:noProof/>
         </w:rPr>
-        <w:t>79</w:t>
+        <w:t>80</w:t>
       </w:r>
       <w:r>
         <w:rPr>
@@ -2914,7 +2914,7 @@
         <w:rPr>
           <w:noProof/>
         </w:rPr>
-        <w:instrText xml:space="preserve"> PAGEREF _Toc239322546 \h </w:instrText>
+        <w:instrText xml:space="preserve"> PAGEREF _Toc239326896 \h </w:instrText>
       </w:r>
       <w:r>
         <w:rPr>
@@ -2931,7 +2931,7 @@
         <w:rPr>
           <w:noProof/>
         </w:rPr>
-        <w:t>79</w:t>
+        <w:t>81</w:t>
       </w:r>
       <w:r>
         <w:rPr>
@@ -2975,7 +2975,7 @@
         <w:rPr>
           <w:noProof/>
         </w:rPr>
-        <w:instrText xml:space="preserve"> PAGEREF _Toc239322547 \h </w:instrText>
+        <w:instrText xml:space="preserve"> PAGEREF _Toc239326897 \h </w:instrText>
       </w:r>
       <w:r>
         <w:rPr>
@@ -2992,7 +2992,7 @@
         <w:rPr>
           <w:noProof/>
         </w:rPr>
-        <w:t>81</w:t>
+        <w:t>82</w:t>
       </w:r>
       <w:r>
         <w:rPr>
@@ -3036,7 +3036,7 @@
         <w:rPr>
           <w:noProof/>
         </w:rPr>
-        <w:instrText xml:space="preserve"> PAGEREF _Toc239322548 \h </w:instrText>
+        <w:instrText xml:space="preserve"> PAGEREF _Toc239326898 \h </w:instrText>
       </w:r>
       <w:r>
         <w:rPr>
@@ -3053,7 +3053,7 @@
         <w:rPr>
           <w:noProof/>
         </w:rPr>
-        <w:t>84</w:t>
+        <w:t>85</w:t>
       </w:r>
       <w:r>
         <w:rPr>
@@ -3097,7 +3097,7 @@
         <w:rPr>
           <w:noProof/>
         </w:rPr>
-        <w:instrText xml:space="preserve"> PAGEREF _Toc239322549 \h </w:instrText>
+        <w:instrText xml:space="preserve"> PAGEREF _Toc239326899 \h </w:instrText>
       </w:r>
       <w:r>
         <w:rPr>
@@ -3114,7 +3114,7 @@
         <w:rPr>
           <w:noProof/>
         </w:rPr>
-        <w:t>85</w:t>
+        <w:t>86</w:t>
       </w:r>
       <w:r>
         <w:rPr>
@@ -3173,7 +3173,7 @@
           <w:sz w:val="34"/>
         </w:rPr>
       </w:pPr>
-      <w:bookmarkStart w:id="0" w:name="_Toc239322502"/>
+      <w:bookmarkStart w:id="0" w:name="_Toc239326852"/>
       <w:r>
         <w:rPr>
           <w:rFonts w:ascii="Montserrat" w:hAnsi="Montserrat"/>
@@ -3197,7 +3197,7 @@
           <w:sz w:val="27"/>
         </w:rPr>
       </w:pPr>
-      <w:bookmarkStart w:id="1" w:name="_Toc239322503"/>
+      <w:bookmarkStart w:id="1" w:name="_Toc239326853"/>
       <w:r>
         <w:rPr>
           <w:rFonts w:ascii="Montserrat" w:hAnsi="Montserrat"/>
@@ -4063,7 +4063,7 @@
           <w:color w:val="1A1A1A"/>
           <w:sz w:val="22"/>
         </w:rPr>
-        <w:t xml:space="preserve">O manual nao substitui as Diretrizes para a Gestao de Projetos da UNIALFA (documento institucional que define o framework D01 a D07) nem o </w:t>
+        <w:t xml:space="preserve">Esta e a versao 2.43 do manual. Em relacao a versao 2.42 (03/09/2026), foi adicionada a Saude do projeto (secao 6.4.1) - Fase 3 da proposta de visao por projeto. Um selo geral (Normal/Atencao/Critico/Encerrado/Sem dados) calculado </w:t>
       </w:r>
       <w:r>
         <w:rPr>
@@ -4072,7 +4072,25 @@
           <w:sz w:val="22"/>
         </w:rPr>
         <w:lastRenderedPageBreak/>
-        <w:t>documento Regras de Acesso e Permissoes (que detalha cada regra de controle de acesso); ele e o guia operacional de como usar cada ferramenta na pratica.</w:t>
+        <w:t>a partir de tres sinais - situacao atrasada, marco ativo com data-alvo vencida e orcamento estourado (custo realizado acima do estimado no TAP) - alem de tres numeros de apoio: % de marcos concluidos, atraso em dias do marco mais atrasado e % do orcamento realizado. Aparece na Ficha do Projeto e como nova coluna Saude na tabela Visao atual por projeto do Painel Executivo (secao 6.4). Nenhum dado novo no banco - tudo calculado em cima do que ja era lido pela Ficha (Fase 2).</w:t>
+      </w:r>
+    </w:p>
+    <w:p>
+      <w:pPr>
+        <w:spacing w:line="280" w:lineRule="auto"/>
+        <w:rPr>
+          <w:rFonts w:ascii="Montserrat" w:hAnsi="Montserrat"/>
+          <w:color w:val="1A1A1A"/>
+          <w:sz w:val="22"/>
+        </w:rPr>
+      </w:pPr>
+      <w:r>
+        <w:rPr>
+          <w:rFonts w:ascii="Montserrat" w:hAnsi="Montserrat"/>
+          <w:color w:val="1A1A1A"/>
+          <w:sz w:val="22"/>
+        </w:rPr>
+        <w:t>O manual nao substitui as Diretrizes para a Gestao de Projetos da UNIALFA (documento institucional que define o framework D01 a D07) nem o documento Regras de Acesso e Permissoes (que detalha cada regra de controle de acesso); ele e o guia operacional de como usar cada ferramenta na pratica.</w:t>
       </w:r>
     </w:p>
     <w:p>
@@ -4086,7 +4104,7 @@
           <w:sz w:val="27"/>
         </w:rPr>
       </w:pPr>
-      <w:bookmarkStart w:id="2" w:name="_Toc239322504"/>
+      <w:bookmarkStart w:id="2" w:name="_Toc239326854"/>
       <w:r>
         <w:rPr>
           <w:rFonts w:ascii="Montserrat" w:hAnsi="Montserrat"/>
@@ -4283,16 +4301,16 @@
         </w:rPr>
         <w:lastRenderedPageBreak/>
         <w:drawing>
-          <wp:inline distT="0" distB="0" distL="0" distR="0" wp14:anchorId="72218026" wp14:editId="6A1C6886">
+          <wp:inline distT="0" distB="0" distL="0" distR="0" wp14:anchorId="33BD6AA3" wp14:editId="3C3B5EC4">
             <wp:extent cx="5303520" cy="4792851"/>
             <wp:effectExtent l="19050" t="19050" r="11430" b="27305"/>
-            <wp:docPr id="904852714" name="Imagem 1"/>
+            <wp:docPr id="1672794307" name="Imagem 1"/>
             <wp:cNvGraphicFramePr/>
             <a:graphic xmlns:a="http://schemas.openxmlformats.org/drawingml/2006/main">
               <a:graphicData uri="http://schemas.openxmlformats.org/drawingml/2006/picture">
                 <pic:pic xmlns:pic="http://schemas.openxmlformats.org/drawingml/2006/picture">
                   <pic:nvPicPr>
-                    <pic:cNvPr id="904852714" name=""/>
+                    <pic:cNvPr id="1672794307" name=""/>
                     <pic:cNvPicPr/>
                   </pic:nvPicPr>
                   <pic:blipFill>
@@ -4360,7 +4378,7 @@
           <w:sz w:val="27"/>
         </w:rPr>
       </w:pPr>
-      <w:bookmarkStart w:id="3" w:name="_Toc239322505"/>
+      <w:bookmarkStart w:id="3" w:name="_Toc239326855"/>
       <w:r>
         <w:rPr>
           <w:rFonts w:ascii="Montserrat" w:hAnsi="Montserrat"/>
@@ -4401,16 +4419,16 @@
         </w:rPr>
         <w:lastRenderedPageBreak/>
         <w:drawing>
-          <wp:inline distT="0" distB="0" distL="0" distR="0" wp14:anchorId="36BB9004" wp14:editId="1F25EC21">
+          <wp:inline distT="0" distB="0" distL="0" distR="0" wp14:anchorId="531F6450" wp14:editId="7C68164E">
             <wp:extent cx="4206240" cy="3801227"/>
             <wp:effectExtent l="19050" t="19050" r="22860" b="27940"/>
-            <wp:docPr id="1563826369" name="Imagem 2"/>
+            <wp:docPr id="808201884" name="Imagem 2"/>
             <wp:cNvGraphicFramePr/>
             <a:graphic xmlns:a="http://schemas.openxmlformats.org/drawingml/2006/main">
               <a:graphicData uri="http://schemas.openxmlformats.org/drawingml/2006/picture">
                 <pic:pic xmlns:pic="http://schemas.openxmlformats.org/drawingml/2006/picture">
                   <pic:nvPicPr>
-                    <pic:cNvPr id="1563826369" name=""/>
+                    <pic:cNvPr id="808201884" name=""/>
                     <pic:cNvPicPr/>
                   </pic:nvPicPr>
                   <pic:blipFill>
@@ -4583,7 +4601,7 @@
           <w:sz w:val="27"/>
         </w:rPr>
       </w:pPr>
-      <w:bookmarkStart w:id="4" w:name="_Toc239322506"/>
+      <w:bookmarkStart w:id="4" w:name="_Toc239326856"/>
       <w:r>
         <w:rPr>
           <w:rFonts w:ascii="Montserrat" w:hAnsi="Montserrat"/>
@@ -5822,7 +5840,7 @@
           <w:sz w:val="34"/>
         </w:rPr>
       </w:pPr>
-      <w:bookmarkStart w:id="5" w:name="_Toc239322507"/>
+      <w:bookmarkStart w:id="5" w:name="_Toc239326857"/>
       <w:r>
         <w:rPr>
           <w:rFonts w:ascii="Montserrat" w:hAnsi="Montserrat"/>
@@ -5846,7 +5864,7 @@
           <w:sz w:val="27"/>
         </w:rPr>
       </w:pPr>
-      <w:bookmarkStart w:id="6" w:name="_Toc239322508"/>
+      <w:bookmarkStart w:id="6" w:name="_Toc239326858"/>
       <w:r>
         <w:rPr>
           <w:rFonts w:ascii="Montserrat" w:hAnsi="Montserrat"/>
@@ -5887,7 +5905,7 @@
           <w:sz w:val="27"/>
         </w:rPr>
       </w:pPr>
-      <w:bookmarkStart w:id="7" w:name="_Toc239322509"/>
+      <w:bookmarkStart w:id="7" w:name="_Toc239326859"/>
       <w:r>
         <w:rPr>
           <w:rFonts w:ascii="Montserrat" w:hAnsi="Montserrat"/>
@@ -6006,7 +6024,7 @@
           <w:sz w:val="27"/>
         </w:rPr>
       </w:pPr>
-      <w:bookmarkStart w:id="8" w:name="_Toc239322510"/>
+      <w:bookmarkStart w:id="8" w:name="_Toc239326860"/>
       <w:r>
         <w:rPr>
           <w:rFonts w:ascii="Montserrat" w:hAnsi="Montserrat"/>
@@ -6619,7 +6637,7 @@
           <w:sz w:val="27"/>
         </w:rPr>
       </w:pPr>
-      <w:bookmarkStart w:id="9" w:name="_Toc239322511"/>
+      <w:bookmarkStart w:id="9" w:name="_Toc239326861"/>
       <w:r>
         <w:rPr>
           <w:rFonts w:ascii="Montserrat" w:hAnsi="Montserrat"/>
@@ -6708,16 +6726,16 @@
         </w:rPr>
         <w:lastRenderedPageBreak/>
         <w:drawing>
-          <wp:inline distT="0" distB="0" distL="0" distR="0" wp14:anchorId="399FB927" wp14:editId="4B315908">
+          <wp:inline distT="0" distB="0" distL="0" distR="0" wp14:anchorId="479109DF" wp14:editId="66C4910E">
             <wp:extent cx="4937760" cy="4462310"/>
             <wp:effectExtent l="19050" t="19050" r="15240" b="14605"/>
-            <wp:docPr id="1865919035" name="Imagem 3"/>
+            <wp:docPr id="1409207753" name="Imagem 3"/>
             <wp:cNvGraphicFramePr/>
             <a:graphic xmlns:a="http://schemas.openxmlformats.org/drawingml/2006/main">
               <a:graphicData uri="http://schemas.openxmlformats.org/drawingml/2006/picture">
                 <pic:pic xmlns:pic="http://schemas.openxmlformats.org/drawingml/2006/picture">
                   <pic:nvPicPr>
-                    <pic:cNvPr id="1865919035" name=""/>
+                    <pic:cNvPr id="1409207753" name=""/>
                     <pic:cNvPicPr/>
                   </pic:nvPicPr>
                   <pic:blipFill>
@@ -6785,7 +6803,7 @@
           <w:sz w:val="27"/>
         </w:rPr>
       </w:pPr>
-      <w:bookmarkStart w:id="10" w:name="_Toc239322512"/>
+      <w:bookmarkStart w:id="10" w:name="_Toc239326862"/>
       <w:r>
         <w:rPr>
           <w:rFonts w:ascii="Montserrat" w:hAnsi="Montserrat"/>
@@ -6826,16 +6844,16 @@
         </w:rPr>
         <w:lastRenderedPageBreak/>
         <w:drawing>
-          <wp:inline distT="0" distB="0" distL="0" distR="0" wp14:anchorId="6261F4BA" wp14:editId="41E32F72">
+          <wp:inline distT="0" distB="0" distL="0" distR="0" wp14:anchorId="487A269C" wp14:editId="1E97FD48">
             <wp:extent cx="5120640" cy="4627581"/>
             <wp:effectExtent l="19050" t="19050" r="22860" b="20955"/>
-            <wp:docPr id="879874611" name="Imagem 4"/>
+            <wp:docPr id="64512504" name="Imagem 4"/>
             <wp:cNvGraphicFramePr/>
             <a:graphic xmlns:a="http://schemas.openxmlformats.org/drawingml/2006/main">
               <a:graphicData uri="http://schemas.openxmlformats.org/drawingml/2006/picture">
                 <pic:pic xmlns:pic="http://schemas.openxmlformats.org/drawingml/2006/picture">
                   <pic:nvPicPr>
-                    <pic:cNvPr id="879874611" name=""/>
+                    <pic:cNvPr id="64512504" name=""/>
                     <pic:cNvPicPr/>
                   </pic:nvPicPr>
                   <pic:blipFill>
@@ -7003,7 +7021,7 @@
           <w:sz w:val="27"/>
         </w:rPr>
       </w:pPr>
-      <w:bookmarkStart w:id="11" w:name="_Toc239322513"/>
+      <w:bookmarkStart w:id="11" w:name="_Toc239326863"/>
       <w:r>
         <w:rPr>
           <w:rFonts w:ascii="Montserrat" w:hAnsi="Montserrat"/>
@@ -7043,16 +7061,16 @@
           <w:noProof/>
         </w:rPr>
         <w:drawing>
-          <wp:inline distT="0" distB="0" distL="0" distR="0" wp14:anchorId="46339755" wp14:editId="769DCF48">
+          <wp:inline distT="0" distB="0" distL="0" distR="0" wp14:anchorId="7B617001" wp14:editId="2C9F7569">
             <wp:extent cx="4206240" cy="3801227"/>
             <wp:effectExtent l="19050" t="19050" r="22860" b="27940"/>
-            <wp:docPr id="2118299696" name="Imagem 5"/>
+            <wp:docPr id="1919286263" name="Imagem 5"/>
             <wp:cNvGraphicFramePr/>
             <a:graphic xmlns:a="http://schemas.openxmlformats.org/drawingml/2006/main">
               <a:graphicData uri="http://schemas.openxmlformats.org/drawingml/2006/picture">
                 <pic:pic xmlns:pic="http://schemas.openxmlformats.org/drawingml/2006/picture">
                   <pic:nvPicPr>
-                    <pic:cNvPr id="2118299696" name=""/>
+                    <pic:cNvPr id="1919286263" name=""/>
                     <pic:cNvPicPr/>
                   </pic:nvPicPr>
                   <pic:blipFill>
@@ -7120,16 +7138,16 @@
         </w:rPr>
         <w:lastRenderedPageBreak/>
         <w:drawing>
-          <wp:inline distT="0" distB="0" distL="0" distR="0" wp14:anchorId="2E362094" wp14:editId="55FD6F25">
+          <wp:inline distT="0" distB="0" distL="0" distR="0" wp14:anchorId="398EB049" wp14:editId="2F500A14">
             <wp:extent cx="4206240" cy="3801227"/>
             <wp:effectExtent l="19050" t="19050" r="22860" b="27940"/>
-            <wp:docPr id="222764969" name="Imagem 6"/>
+            <wp:docPr id="1079160629" name="Imagem 6"/>
             <wp:cNvGraphicFramePr/>
             <a:graphic xmlns:a="http://schemas.openxmlformats.org/drawingml/2006/main">
               <a:graphicData uri="http://schemas.openxmlformats.org/drawingml/2006/picture">
                 <pic:pic xmlns:pic="http://schemas.openxmlformats.org/drawingml/2006/picture">
                   <pic:nvPicPr>
-                    <pic:cNvPr id="222764969" name=""/>
+                    <pic:cNvPr id="1079160629" name=""/>
                     <pic:cNvPicPr/>
                   </pic:nvPicPr>
                   <pic:blipFill>
@@ -7245,7 +7263,7 @@
           <w:sz w:val="27"/>
         </w:rPr>
       </w:pPr>
-      <w:bookmarkStart w:id="12" w:name="_Toc239322514"/>
+      <w:bookmarkStart w:id="12" w:name="_Toc239326864"/>
       <w:r>
         <w:rPr>
           <w:rFonts w:ascii="Montserrat" w:hAnsi="Montserrat"/>
@@ -7313,7 +7331,7 @@
           <w:sz w:val="27"/>
         </w:rPr>
       </w:pPr>
-      <w:bookmarkStart w:id="13" w:name="_Toc239322515"/>
+      <w:bookmarkStart w:id="13" w:name="_Toc239326865"/>
       <w:r>
         <w:rPr>
           <w:rFonts w:ascii="Montserrat" w:hAnsi="Montserrat"/>
@@ -7540,7 +7558,7 @@
           <w:sz w:val="27"/>
         </w:rPr>
       </w:pPr>
-      <w:bookmarkStart w:id="14" w:name="_Toc239322516"/>
+      <w:bookmarkStart w:id="14" w:name="_Toc239326866"/>
       <w:r>
         <w:rPr>
           <w:rFonts w:ascii="Montserrat" w:hAnsi="Montserrat"/>
@@ -7699,7 +7717,7 @@
           <w:sz w:val="27"/>
         </w:rPr>
       </w:pPr>
-      <w:bookmarkStart w:id="15" w:name="_Toc239322517"/>
+      <w:bookmarkStart w:id="15" w:name="_Toc239326867"/>
       <w:r>
         <w:rPr>
           <w:rFonts w:ascii="Montserrat" w:hAnsi="Montserrat"/>
@@ -7891,7 +7909,7 @@
           <w:sz w:val="27"/>
         </w:rPr>
       </w:pPr>
-      <w:bookmarkStart w:id="16" w:name="_Toc239322518"/>
+      <w:bookmarkStart w:id="16" w:name="_Toc239326868"/>
       <w:r>
         <w:rPr>
           <w:rFonts w:ascii="Montserrat" w:hAnsi="Montserrat"/>
@@ -8019,7 +8037,7 @@
           <w:sz w:val="27"/>
         </w:rPr>
       </w:pPr>
-      <w:bookmarkStart w:id="17" w:name="_Toc239322519"/>
+      <w:bookmarkStart w:id="17" w:name="_Toc239326869"/>
       <w:r>
         <w:rPr>
           <w:rFonts w:ascii="Montserrat" w:hAnsi="Montserrat"/>
@@ -8349,7 +8367,7 @@
           <w:sz w:val="27"/>
         </w:rPr>
       </w:pPr>
-      <w:bookmarkStart w:id="18" w:name="_Toc239322520"/>
+      <w:bookmarkStart w:id="18" w:name="_Toc239326870"/>
       <w:r>
         <w:rPr>
           <w:rFonts w:ascii="Montserrat" w:hAnsi="Montserrat"/>
@@ -8490,7 +8508,7 @@
           <w:sz w:val="34"/>
         </w:rPr>
       </w:pPr>
-      <w:bookmarkStart w:id="19" w:name="_Toc239322521"/>
+      <w:bookmarkStart w:id="19" w:name="_Toc239326871"/>
       <w:r>
         <w:rPr>
           <w:rFonts w:ascii="Montserrat" w:hAnsi="Montserrat"/>
@@ -8532,7 +8550,7 @@
           <w:sz w:val="27"/>
         </w:rPr>
       </w:pPr>
-      <w:bookmarkStart w:id="20" w:name="_Toc239322522"/>
+      <w:bookmarkStart w:id="20" w:name="_Toc239326872"/>
       <w:r>
         <w:rPr>
           <w:rFonts w:ascii="Montserrat" w:hAnsi="Montserrat"/>
@@ -9612,16 +9630,16 @@
         </w:rPr>
         <w:lastRenderedPageBreak/>
         <w:drawing>
-          <wp:inline distT="0" distB="0" distL="0" distR="0" wp14:anchorId="272E5FE7" wp14:editId="385E19B3">
+          <wp:inline distT="0" distB="0" distL="0" distR="0" wp14:anchorId="23A901AE" wp14:editId="26A58B45">
             <wp:extent cx="5120640" cy="4627581"/>
             <wp:effectExtent l="19050" t="19050" r="22860" b="20955"/>
-            <wp:docPr id="2110116584" name="Imagem 7"/>
+            <wp:docPr id="799260839" name="Imagem 7"/>
             <wp:cNvGraphicFramePr/>
             <a:graphic xmlns:a="http://schemas.openxmlformats.org/drawingml/2006/main">
               <a:graphicData uri="http://schemas.openxmlformats.org/drawingml/2006/picture">
                 <pic:pic xmlns:pic="http://schemas.openxmlformats.org/drawingml/2006/picture">
                   <pic:nvPicPr>
-                    <pic:cNvPr id="2110116584" name=""/>
+                    <pic:cNvPr id="799260839" name=""/>
                     <pic:cNvPicPr/>
                   </pic:nvPicPr>
                   <pic:blipFill>
@@ -9689,16 +9707,16 @@
         </w:rPr>
         <w:lastRenderedPageBreak/>
         <w:drawing>
-          <wp:inline distT="0" distB="0" distL="0" distR="0" wp14:anchorId="2176ECDA" wp14:editId="4D5D196D">
+          <wp:inline distT="0" distB="0" distL="0" distR="0" wp14:anchorId="1D7CBD48" wp14:editId="24967E33">
             <wp:extent cx="5120640" cy="4627581"/>
             <wp:effectExtent l="19050" t="19050" r="22860" b="20955"/>
-            <wp:docPr id="404933119" name="Imagem 8"/>
+            <wp:docPr id="1181242768" name="Imagem 8"/>
             <wp:cNvGraphicFramePr/>
             <a:graphic xmlns:a="http://schemas.openxmlformats.org/drawingml/2006/main">
               <a:graphicData uri="http://schemas.openxmlformats.org/drawingml/2006/picture">
                 <pic:pic xmlns:pic="http://schemas.openxmlformats.org/drawingml/2006/picture">
                   <pic:nvPicPr>
-                    <pic:cNvPr id="404933119" name=""/>
+                    <pic:cNvPr id="1181242768" name=""/>
                     <pic:cNvPicPr/>
                   </pic:nvPicPr>
                   <pic:blipFill>
@@ -9906,7 +9924,7 @@
           <w:sz w:val="27"/>
         </w:rPr>
       </w:pPr>
-      <w:bookmarkStart w:id="21" w:name="_Toc239322523"/>
+      <w:bookmarkStart w:id="21" w:name="_Toc239326873"/>
       <w:r>
         <w:rPr>
           <w:rFonts w:ascii="Montserrat" w:hAnsi="Montserrat"/>
@@ -10832,16 +10850,16 @@
         </w:rPr>
         <w:lastRenderedPageBreak/>
         <w:drawing>
-          <wp:inline distT="0" distB="0" distL="0" distR="0" wp14:anchorId="6766480A" wp14:editId="7A1794AC">
+          <wp:inline distT="0" distB="0" distL="0" distR="0" wp14:anchorId="7738C458" wp14:editId="708E0451">
             <wp:extent cx="5120640" cy="4627581"/>
             <wp:effectExtent l="19050" t="19050" r="22860" b="20955"/>
-            <wp:docPr id="1879647737" name="Imagem 9"/>
+            <wp:docPr id="1002116264" name="Imagem 9"/>
             <wp:cNvGraphicFramePr/>
             <a:graphic xmlns:a="http://schemas.openxmlformats.org/drawingml/2006/main">
               <a:graphicData uri="http://schemas.openxmlformats.org/drawingml/2006/picture">
                 <pic:pic xmlns:pic="http://schemas.openxmlformats.org/drawingml/2006/picture">
                   <pic:nvPicPr>
-                    <pic:cNvPr id="1879647737" name=""/>
+                    <pic:cNvPr id="1002116264" name=""/>
                     <pic:cNvPicPr/>
                   </pic:nvPicPr>
                   <pic:blipFill>
@@ -10909,16 +10927,16 @@
         </w:rPr>
         <w:lastRenderedPageBreak/>
         <w:drawing>
-          <wp:inline distT="0" distB="0" distL="0" distR="0" wp14:anchorId="30A28F35" wp14:editId="4BA593B5">
+          <wp:inline distT="0" distB="0" distL="0" distR="0" wp14:anchorId="5C0FBB89" wp14:editId="02A9F841">
             <wp:extent cx="5120640" cy="4627581"/>
             <wp:effectExtent l="19050" t="19050" r="22860" b="20955"/>
-            <wp:docPr id="908364396" name="Imagem 10"/>
+            <wp:docPr id="1207552098" name="Imagem 10"/>
             <wp:cNvGraphicFramePr/>
             <a:graphic xmlns:a="http://schemas.openxmlformats.org/drawingml/2006/main">
               <a:graphicData uri="http://schemas.openxmlformats.org/drawingml/2006/picture">
                 <pic:pic xmlns:pic="http://schemas.openxmlformats.org/drawingml/2006/picture">
                   <pic:nvPicPr>
-                    <pic:cNvPr id="908364396" name=""/>
+                    <pic:cNvPr id="1207552098" name=""/>
                     <pic:cNvPicPr/>
                   </pic:nvPicPr>
                   <pic:blipFill>
@@ -11052,7 +11070,7 @@
           <w:sz w:val="27"/>
         </w:rPr>
       </w:pPr>
-      <w:bookmarkStart w:id="22" w:name="_Toc239322524"/>
+      <w:bookmarkStart w:id="22" w:name="_Toc239326874"/>
       <w:r>
         <w:rPr>
           <w:rFonts w:ascii="Montserrat" w:hAnsi="Montserrat"/>
@@ -12108,16 +12126,16 @@
           <w:noProof/>
         </w:rPr>
         <w:drawing>
-          <wp:inline distT="0" distB="0" distL="0" distR="0" wp14:anchorId="4A39FA4E" wp14:editId="2CC9002F">
+          <wp:inline distT="0" distB="0" distL="0" distR="0" wp14:anchorId="5164C513" wp14:editId="7C76769A">
             <wp:extent cx="5120640" cy="3282818"/>
             <wp:effectExtent l="19050" t="19050" r="22860" b="13335"/>
-            <wp:docPr id="613129965" name="Imagem 11"/>
+            <wp:docPr id="1870671795" name="Imagem 11"/>
             <wp:cNvGraphicFramePr/>
             <a:graphic xmlns:a="http://schemas.openxmlformats.org/drawingml/2006/main">
               <a:graphicData uri="http://schemas.openxmlformats.org/drawingml/2006/picture">
                 <pic:pic xmlns:pic="http://schemas.openxmlformats.org/drawingml/2006/picture">
                   <pic:nvPicPr>
-                    <pic:cNvPr id="613129965" name=""/>
+                    <pic:cNvPr id="1870671795" name=""/>
                     <pic:cNvPicPr/>
                   </pic:nvPicPr>
                   <pic:blipFill>
@@ -12185,16 +12203,16 @@
         </w:rPr>
         <w:lastRenderedPageBreak/>
         <w:drawing>
-          <wp:inline distT="0" distB="0" distL="0" distR="0" wp14:anchorId="4F2C2373" wp14:editId="74C62A28">
+          <wp:inline distT="0" distB="0" distL="0" distR="0" wp14:anchorId="15A3CC45" wp14:editId="4C15A941">
             <wp:extent cx="5120640" cy="4627581"/>
             <wp:effectExtent l="19050" t="19050" r="22860" b="20955"/>
-            <wp:docPr id="184903087" name="Imagem 12"/>
+            <wp:docPr id="1665556068" name="Imagem 12"/>
             <wp:cNvGraphicFramePr/>
             <a:graphic xmlns:a="http://schemas.openxmlformats.org/drawingml/2006/main">
               <a:graphicData uri="http://schemas.openxmlformats.org/drawingml/2006/picture">
                 <pic:pic xmlns:pic="http://schemas.openxmlformats.org/drawingml/2006/picture">
                   <pic:nvPicPr>
-                    <pic:cNvPr id="184903087" name=""/>
+                    <pic:cNvPr id="1665556068" name=""/>
                     <pic:cNvPicPr/>
                   </pic:nvPicPr>
                   <pic:blipFill>
@@ -12328,7 +12346,7 @@
           <w:sz w:val="27"/>
         </w:rPr>
       </w:pPr>
-      <w:bookmarkStart w:id="23" w:name="_Toc239322525"/>
+      <w:bookmarkStart w:id="23" w:name="_Toc239326875"/>
       <w:r>
         <w:rPr>
           <w:rFonts w:ascii="Montserrat" w:hAnsi="Montserrat"/>
@@ -12890,16 +12908,16 @@
         </w:rPr>
         <w:lastRenderedPageBreak/>
         <w:drawing>
-          <wp:inline distT="0" distB="0" distL="0" distR="0" wp14:anchorId="35E7B06F" wp14:editId="186F625E">
+          <wp:inline distT="0" distB="0" distL="0" distR="0" wp14:anchorId="7BB64EAA" wp14:editId="0151995A">
             <wp:extent cx="5120640" cy="4627581"/>
             <wp:effectExtent l="19050" t="19050" r="22860" b="20955"/>
-            <wp:docPr id="1484556291" name="Imagem 13"/>
+            <wp:docPr id="1945420970" name="Imagem 13"/>
             <wp:cNvGraphicFramePr/>
             <a:graphic xmlns:a="http://schemas.openxmlformats.org/drawingml/2006/main">
               <a:graphicData uri="http://schemas.openxmlformats.org/drawingml/2006/picture">
                 <pic:pic xmlns:pic="http://schemas.openxmlformats.org/drawingml/2006/picture">
                   <pic:nvPicPr>
-                    <pic:cNvPr id="1484556291" name=""/>
+                    <pic:cNvPr id="1945420970" name=""/>
                     <pic:cNvPicPr/>
                   </pic:nvPicPr>
                   <pic:blipFill>
@@ -12967,16 +12985,16 @@
         </w:rPr>
         <w:lastRenderedPageBreak/>
         <w:drawing>
-          <wp:inline distT="0" distB="0" distL="0" distR="0" wp14:anchorId="44B5E5C8" wp14:editId="026E2782">
+          <wp:inline distT="0" distB="0" distL="0" distR="0" wp14:anchorId="7899F398" wp14:editId="6CFAD2D1">
             <wp:extent cx="5120640" cy="4627581"/>
             <wp:effectExtent l="19050" t="19050" r="22860" b="20955"/>
-            <wp:docPr id="581215068" name="Imagem 14"/>
+            <wp:docPr id="1582068105" name="Imagem 14"/>
             <wp:cNvGraphicFramePr/>
             <a:graphic xmlns:a="http://schemas.openxmlformats.org/drawingml/2006/main">
               <a:graphicData uri="http://schemas.openxmlformats.org/drawingml/2006/picture">
                 <pic:pic xmlns:pic="http://schemas.openxmlformats.org/drawingml/2006/picture">
                   <pic:nvPicPr>
-                    <pic:cNvPr id="581215068" name=""/>
+                    <pic:cNvPr id="1582068105" name=""/>
                     <pic:cNvPicPr/>
                   </pic:nvPicPr>
                   <pic:blipFill>
@@ -13110,7 +13128,7 @@
           <w:sz w:val="27"/>
         </w:rPr>
       </w:pPr>
-      <w:bookmarkStart w:id="24" w:name="_Toc239322526"/>
+      <w:bookmarkStart w:id="24" w:name="_Toc239326876"/>
       <w:r>
         <w:rPr>
           <w:rFonts w:ascii="Montserrat" w:hAnsi="Montserrat"/>
@@ -13151,16 +13169,16 @@
           <w:noProof/>
         </w:rPr>
         <w:drawing>
-          <wp:inline distT="0" distB="0" distL="0" distR="0" wp14:anchorId="5900C4B2" wp14:editId="533B0A37">
+          <wp:inline distT="0" distB="0" distL="0" distR="0" wp14:anchorId="30DC6F23" wp14:editId="3649EC3D">
             <wp:extent cx="5120640" cy="4627581"/>
             <wp:effectExtent l="19050" t="19050" r="22860" b="20955"/>
-            <wp:docPr id="1953154726" name="Imagem 15"/>
+            <wp:docPr id="1867266904" name="Imagem 15"/>
             <wp:cNvGraphicFramePr/>
             <a:graphic xmlns:a="http://schemas.openxmlformats.org/drawingml/2006/main">
               <a:graphicData uri="http://schemas.openxmlformats.org/drawingml/2006/picture">
                 <pic:pic xmlns:pic="http://schemas.openxmlformats.org/drawingml/2006/picture">
                   <pic:nvPicPr>
-                    <pic:cNvPr id="1953154726" name=""/>
+                    <pic:cNvPr id="1867266904" name=""/>
                     <pic:cNvPicPr/>
                   </pic:nvPicPr>
                   <pic:blipFill>
@@ -13228,16 +13246,16 @@
         </w:rPr>
         <w:lastRenderedPageBreak/>
         <w:drawing>
-          <wp:inline distT="0" distB="0" distL="0" distR="0" wp14:anchorId="658B2101" wp14:editId="2717452E">
+          <wp:inline distT="0" distB="0" distL="0" distR="0" wp14:anchorId="53E4DC4C" wp14:editId="3CAD11D4">
             <wp:extent cx="5120640" cy="4627581"/>
             <wp:effectExtent l="19050" t="19050" r="22860" b="20955"/>
-            <wp:docPr id="706455902" name="Imagem 16"/>
+            <wp:docPr id="228746495" name="Imagem 16"/>
             <wp:cNvGraphicFramePr/>
             <a:graphic xmlns:a="http://schemas.openxmlformats.org/drawingml/2006/main">
               <a:graphicData uri="http://schemas.openxmlformats.org/drawingml/2006/picture">
                 <pic:pic xmlns:pic="http://schemas.openxmlformats.org/drawingml/2006/picture">
                   <pic:nvPicPr>
-                    <pic:cNvPr id="706455902" name=""/>
+                    <pic:cNvPr id="228746495" name=""/>
                     <pic:cNvPicPr/>
                   </pic:nvPicPr>
                   <pic:blipFill>
@@ -13401,16 +13419,16 @@
         </w:rPr>
         <w:lastRenderedPageBreak/>
         <w:drawing>
-          <wp:inline distT="0" distB="0" distL="0" distR="0" wp14:anchorId="5E433D7C" wp14:editId="3D0455A7">
+          <wp:inline distT="0" distB="0" distL="0" distR="0" wp14:anchorId="1B750577" wp14:editId="50094850">
             <wp:extent cx="5120640" cy="3282818"/>
             <wp:effectExtent l="19050" t="19050" r="22860" b="13335"/>
-            <wp:docPr id="1514760960" name="Imagem 17"/>
+            <wp:docPr id="1979911092" name="Imagem 17"/>
             <wp:cNvGraphicFramePr/>
             <a:graphic xmlns:a="http://schemas.openxmlformats.org/drawingml/2006/main">
               <a:graphicData uri="http://schemas.openxmlformats.org/drawingml/2006/picture">
                 <pic:pic xmlns:pic="http://schemas.openxmlformats.org/drawingml/2006/picture">
                   <pic:nvPicPr>
-                    <pic:cNvPr id="1514760960" name=""/>
+                    <pic:cNvPr id="1979911092" name=""/>
                     <pic:cNvPicPr/>
                   </pic:nvPicPr>
                   <pic:blipFill>
@@ -13544,7 +13562,7 @@
           <w:sz w:val="27"/>
         </w:rPr>
       </w:pPr>
-      <w:bookmarkStart w:id="25" w:name="_Toc239322527"/>
+      <w:bookmarkStart w:id="25" w:name="_Toc239326877"/>
       <w:r>
         <w:rPr>
           <w:rFonts w:ascii="Montserrat" w:hAnsi="Montserrat"/>
@@ -13585,16 +13603,16 @@
         </w:rPr>
         <w:lastRenderedPageBreak/>
         <w:drawing>
-          <wp:inline distT="0" distB="0" distL="0" distR="0" wp14:anchorId="53B007CF" wp14:editId="6FA1FEB6">
+          <wp:inline distT="0" distB="0" distL="0" distR="0" wp14:anchorId="0F55F509" wp14:editId="0728240D">
             <wp:extent cx="5120640" cy="4627581"/>
             <wp:effectExtent l="19050" t="19050" r="22860" b="20955"/>
-            <wp:docPr id="1136853612" name="Imagem 18"/>
+            <wp:docPr id="1906065402" name="Imagem 18"/>
             <wp:cNvGraphicFramePr/>
             <a:graphic xmlns:a="http://schemas.openxmlformats.org/drawingml/2006/main">
               <a:graphicData uri="http://schemas.openxmlformats.org/drawingml/2006/picture">
                 <pic:pic xmlns:pic="http://schemas.openxmlformats.org/drawingml/2006/picture">
                   <pic:nvPicPr>
-                    <pic:cNvPr id="1136853612" name=""/>
+                    <pic:cNvPr id="1906065402" name=""/>
                     <pic:cNvPicPr/>
                   </pic:nvPicPr>
                   <pic:blipFill>
@@ -13662,16 +13680,16 @@
         </w:rPr>
         <w:lastRenderedPageBreak/>
         <w:drawing>
-          <wp:inline distT="0" distB="0" distL="0" distR="0" wp14:anchorId="1287E58B" wp14:editId="2619D6C2">
+          <wp:inline distT="0" distB="0" distL="0" distR="0" wp14:anchorId="661184E9" wp14:editId="2225FDAA">
             <wp:extent cx="5120640" cy="4627581"/>
             <wp:effectExtent l="19050" t="19050" r="22860" b="20955"/>
-            <wp:docPr id="83114608" name="Imagem 19"/>
+            <wp:docPr id="741346551" name="Imagem 19"/>
             <wp:cNvGraphicFramePr/>
             <a:graphic xmlns:a="http://schemas.openxmlformats.org/drawingml/2006/main">
               <a:graphicData uri="http://schemas.openxmlformats.org/drawingml/2006/picture">
                 <pic:pic xmlns:pic="http://schemas.openxmlformats.org/drawingml/2006/picture">
                   <pic:nvPicPr>
-                    <pic:cNvPr id="83114608" name=""/>
+                    <pic:cNvPr id="741346551" name=""/>
                     <pic:cNvPicPr/>
                   </pic:nvPicPr>
                   <pic:blipFill>
@@ -13854,7 +13872,7 @@
           <w:sz w:val="27"/>
         </w:rPr>
       </w:pPr>
-      <w:bookmarkStart w:id="26" w:name="_Toc239322528"/>
+      <w:bookmarkStart w:id="26" w:name="_Toc239326878"/>
       <w:r>
         <w:rPr>
           <w:rFonts w:ascii="Montserrat" w:hAnsi="Montserrat"/>
@@ -13894,16 +13912,16 @@
           <w:noProof/>
         </w:rPr>
         <w:drawing>
-          <wp:inline distT="0" distB="0" distL="0" distR="0" wp14:anchorId="6CC8A97D" wp14:editId="10233ED2">
+          <wp:inline distT="0" distB="0" distL="0" distR="0" wp14:anchorId="6250B769" wp14:editId="0B987659">
             <wp:extent cx="5120640" cy="4627581"/>
             <wp:effectExtent l="19050" t="19050" r="22860" b="20955"/>
-            <wp:docPr id="1693443406" name="Imagem 20"/>
+            <wp:docPr id="166718452" name="Imagem 20"/>
             <wp:cNvGraphicFramePr/>
             <a:graphic xmlns:a="http://schemas.openxmlformats.org/drawingml/2006/main">
               <a:graphicData uri="http://schemas.openxmlformats.org/drawingml/2006/picture">
                 <pic:pic xmlns:pic="http://schemas.openxmlformats.org/drawingml/2006/picture">
                   <pic:nvPicPr>
-                    <pic:cNvPr id="1693443406" name=""/>
+                    <pic:cNvPr id="166718452" name=""/>
                     <pic:cNvPicPr/>
                   </pic:nvPicPr>
                   <pic:blipFill>
@@ -13971,16 +13989,16 @@
         </w:rPr>
         <w:lastRenderedPageBreak/>
         <w:drawing>
-          <wp:inline distT="0" distB="0" distL="0" distR="0" wp14:anchorId="243E56F4" wp14:editId="783E916C">
+          <wp:inline distT="0" distB="0" distL="0" distR="0" wp14:anchorId="2F5314C1" wp14:editId="792E6875">
             <wp:extent cx="5120640" cy="4627581"/>
             <wp:effectExtent l="19050" t="19050" r="22860" b="20955"/>
-            <wp:docPr id="1481139633" name="Imagem 21"/>
+            <wp:docPr id="780636535" name="Imagem 21"/>
             <wp:cNvGraphicFramePr/>
             <a:graphic xmlns:a="http://schemas.openxmlformats.org/drawingml/2006/main">
               <a:graphicData uri="http://schemas.openxmlformats.org/drawingml/2006/picture">
                 <pic:pic xmlns:pic="http://schemas.openxmlformats.org/drawingml/2006/picture">
                   <pic:nvPicPr>
-                    <pic:cNvPr id="1481139633" name=""/>
+                    <pic:cNvPr id="780636535" name=""/>
                     <pic:cNvPicPr/>
                   </pic:nvPicPr>
                   <pic:blipFill>
@@ -14208,7 +14226,7 @@
           <w:sz w:val="27"/>
         </w:rPr>
       </w:pPr>
-      <w:bookmarkStart w:id="27" w:name="_Toc239322529"/>
+      <w:bookmarkStart w:id="27" w:name="_Toc239326879"/>
       <w:r>
         <w:rPr>
           <w:rFonts w:ascii="Montserrat" w:hAnsi="Montserrat"/>
@@ -14249,16 +14267,16 @@
         </w:rPr>
         <w:lastRenderedPageBreak/>
         <w:drawing>
-          <wp:inline distT="0" distB="0" distL="0" distR="0" wp14:anchorId="1EDFB48F" wp14:editId="3D371E00">
+          <wp:inline distT="0" distB="0" distL="0" distR="0" wp14:anchorId="3F223956" wp14:editId="7A5CBF13">
             <wp:extent cx="5120640" cy="4627581"/>
             <wp:effectExtent l="19050" t="19050" r="22860" b="20955"/>
-            <wp:docPr id="463964285" name="Imagem 22"/>
+            <wp:docPr id="982578141" name="Imagem 22"/>
             <wp:cNvGraphicFramePr/>
             <a:graphic xmlns:a="http://schemas.openxmlformats.org/drawingml/2006/main">
               <a:graphicData uri="http://schemas.openxmlformats.org/drawingml/2006/picture">
                 <pic:pic xmlns:pic="http://schemas.openxmlformats.org/drawingml/2006/picture">
                   <pic:nvPicPr>
-                    <pic:cNvPr id="463964285" name=""/>
+                    <pic:cNvPr id="982578141" name=""/>
                     <pic:cNvPicPr/>
                   </pic:nvPicPr>
                   <pic:blipFill>
@@ -14326,16 +14344,16 @@
         </w:rPr>
         <w:lastRenderedPageBreak/>
         <w:drawing>
-          <wp:inline distT="0" distB="0" distL="0" distR="0" wp14:anchorId="6BD37EB3" wp14:editId="2905D539">
+          <wp:inline distT="0" distB="0" distL="0" distR="0" wp14:anchorId="41BD92A9" wp14:editId="12F57850">
             <wp:extent cx="5120640" cy="4627581"/>
             <wp:effectExtent l="19050" t="19050" r="22860" b="20955"/>
-            <wp:docPr id="1722508211" name="Imagem 23"/>
+            <wp:docPr id="1985867535" name="Imagem 23"/>
             <wp:cNvGraphicFramePr/>
             <a:graphic xmlns:a="http://schemas.openxmlformats.org/drawingml/2006/main">
               <a:graphicData uri="http://schemas.openxmlformats.org/drawingml/2006/picture">
                 <pic:pic xmlns:pic="http://schemas.openxmlformats.org/drawingml/2006/picture">
                   <pic:nvPicPr>
-                    <pic:cNvPr id="1722508211" name=""/>
+                    <pic:cNvPr id="1985867535" name=""/>
                     <pic:cNvPicPr/>
                   </pic:nvPicPr>
                   <pic:blipFill>
@@ -14572,7 +14590,7 @@
           <w:sz w:val="27"/>
         </w:rPr>
       </w:pPr>
-      <w:bookmarkStart w:id="28" w:name="_Toc239322530"/>
+      <w:bookmarkStart w:id="28" w:name="_Toc239326880"/>
       <w:r>
         <w:rPr>
           <w:rFonts w:ascii="Montserrat" w:hAnsi="Montserrat"/>
@@ -14612,16 +14630,16 @@
           <w:noProof/>
         </w:rPr>
         <w:drawing>
-          <wp:inline distT="0" distB="0" distL="0" distR="0" wp14:anchorId="171859C2" wp14:editId="6E48983F">
+          <wp:inline distT="0" distB="0" distL="0" distR="0" wp14:anchorId="34BC979A" wp14:editId="5B11059F">
             <wp:extent cx="5120640" cy="4627581"/>
             <wp:effectExtent l="19050" t="19050" r="22860" b="20955"/>
-            <wp:docPr id="1718950681" name="Imagem 24"/>
+            <wp:docPr id="676302089" name="Imagem 24"/>
             <wp:cNvGraphicFramePr/>
             <a:graphic xmlns:a="http://schemas.openxmlformats.org/drawingml/2006/main">
               <a:graphicData uri="http://schemas.openxmlformats.org/drawingml/2006/picture">
                 <pic:pic xmlns:pic="http://schemas.openxmlformats.org/drawingml/2006/picture">
                   <pic:nvPicPr>
-                    <pic:cNvPr id="1718950681" name=""/>
+                    <pic:cNvPr id="676302089" name=""/>
                     <pic:cNvPicPr/>
                   </pic:nvPicPr>
                   <pic:blipFill>
@@ -14689,16 +14707,16 @@
         </w:rPr>
         <w:lastRenderedPageBreak/>
         <w:drawing>
-          <wp:inline distT="0" distB="0" distL="0" distR="0" wp14:anchorId="4FBF665A" wp14:editId="50F47F25">
+          <wp:inline distT="0" distB="0" distL="0" distR="0" wp14:anchorId="40F3C809" wp14:editId="627DC555">
             <wp:extent cx="5120640" cy="4627581"/>
             <wp:effectExtent l="19050" t="19050" r="22860" b="20955"/>
-            <wp:docPr id="2049325487" name="Imagem 25"/>
+            <wp:docPr id="511013142" name="Imagem 25"/>
             <wp:cNvGraphicFramePr/>
             <a:graphic xmlns:a="http://schemas.openxmlformats.org/drawingml/2006/main">
               <a:graphicData uri="http://schemas.openxmlformats.org/drawingml/2006/picture">
                 <pic:pic xmlns:pic="http://schemas.openxmlformats.org/drawingml/2006/picture">
                   <pic:nvPicPr>
-                    <pic:cNvPr id="2049325487" name=""/>
+                    <pic:cNvPr id="511013142" name=""/>
                     <pic:cNvPicPr/>
                   </pic:nvPicPr>
                   <pic:blipFill>
@@ -14889,7 +14907,7 @@
           <w:sz w:val="27"/>
         </w:rPr>
       </w:pPr>
-      <w:bookmarkStart w:id="29" w:name="_Toc239322531"/>
+      <w:bookmarkStart w:id="29" w:name="_Toc239326881"/>
       <w:r>
         <w:rPr>
           <w:rFonts w:ascii="Montserrat" w:hAnsi="Montserrat"/>
@@ -14929,16 +14947,16 @@
           <w:noProof/>
         </w:rPr>
         <w:drawing>
-          <wp:inline distT="0" distB="0" distL="0" distR="0" wp14:anchorId="26B8954D" wp14:editId="40D8BDFD">
+          <wp:inline distT="0" distB="0" distL="0" distR="0" wp14:anchorId="016263C1" wp14:editId="76CCF140">
             <wp:extent cx="5120640" cy="4000682"/>
             <wp:effectExtent l="19050" t="19050" r="22860" b="19050"/>
-            <wp:docPr id="360682297" name="Imagem 26"/>
+            <wp:docPr id="441680831" name="Imagem 26"/>
             <wp:cNvGraphicFramePr/>
             <a:graphic xmlns:a="http://schemas.openxmlformats.org/drawingml/2006/main">
               <a:graphicData uri="http://schemas.openxmlformats.org/drawingml/2006/picture">
                 <pic:pic xmlns:pic="http://schemas.openxmlformats.org/drawingml/2006/picture">
                   <pic:nvPicPr>
-                    <pic:cNvPr id="360682297" name=""/>
+                    <pic:cNvPr id="441680831" name=""/>
                     <pic:cNvPicPr/>
                   </pic:nvPicPr>
                   <pic:blipFill>
@@ -15462,7 +15480,7 @@
           <w:sz w:val="34"/>
         </w:rPr>
       </w:pPr>
-      <w:bookmarkStart w:id="30" w:name="_Toc239322532"/>
+      <w:bookmarkStart w:id="30" w:name="_Toc239326882"/>
       <w:r>
         <w:rPr>
           <w:rFonts w:ascii="Montserrat" w:hAnsi="Montserrat"/>
@@ -15504,7 +15522,7 @@
           <w:sz w:val="27"/>
         </w:rPr>
       </w:pPr>
-      <w:bookmarkStart w:id="31" w:name="_Toc239322533"/>
+      <w:bookmarkStart w:id="31" w:name="_Toc239326883"/>
       <w:r>
         <w:rPr>
           <w:rFonts w:ascii="Montserrat" w:hAnsi="Montserrat"/>
@@ -15544,16 +15562,16 @@
           <w:noProof/>
         </w:rPr>
         <w:drawing>
-          <wp:inline distT="0" distB="0" distL="0" distR="0" wp14:anchorId="5ABA3FEF" wp14:editId="29D184FE">
+          <wp:inline distT="0" distB="0" distL="0" distR="0" wp14:anchorId="4774E9AF" wp14:editId="2A605EAD">
             <wp:extent cx="5120640" cy="4627581"/>
             <wp:effectExtent l="19050" t="19050" r="22860" b="20955"/>
-            <wp:docPr id="904874114" name="Imagem 27"/>
+            <wp:docPr id="302334660" name="Imagem 27"/>
             <wp:cNvGraphicFramePr/>
             <a:graphic xmlns:a="http://schemas.openxmlformats.org/drawingml/2006/main">
               <a:graphicData uri="http://schemas.openxmlformats.org/drawingml/2006/picture">
                 <pic:pic xmlns:pic="http://schemas.openxmlformats.org/drawingml/2006/picture">
                   <pic:nvPicPr>
-                    <pic:cNvPr id="904874114" name=""/>
+                    <pic:cNvPr id="302334660" name=""/>
                     <pic:cNvPicPr/>
                   </pic:nvPicPr>
                   <pic:blipFill>
@@ -15621,16 +15639,16 @@
         </w:rPr>
         <w:lastRenderedPageBreak/>
         <w:drawing>
-          <wp:inline distT="0" distB="0" distL="0" distR="0" wp14:anchorId="58FBB610" wp14:editId="5FFB5A54">
+          <wp:inline distT="0" distB="0" distL="0" distR="0" wp14:anchorId="3A88D575" wp14:editId="7F56DB4B">
             <wp:extent cx="5120640" cy="4627581"/>
             <wp:effectExtent l="19050" t="19050" r="22860" b="20955"/>
-            <wp:docPr id="185244080" name="Imagem 28"/>
+            <wp:docPr id="1952845298" name="Imagem 28"/>
             <wp:cNvGraphicFramePr/>
             <a:graphic xmlns:a="http://schemas.openxmlformats.org/drawingml/2006/main">
               <a:graphicData uri="http://schemas.openxmlformats.org/drawingml/2006/picture">
                 <pic:pic xmlns:pic="http://schemas.openxmlformats.org/drawingml/2006/picture">
                   <pic:nvPicPr>
-                    <pic:cNvPr id="185244080" name=""/>
+                    <pic:cNvPr id="1952845298" name=""/>
                     <pic:cNvPicPr/>
                   </pic:nvPicPr>
                   <pic:blipFill>
@@ -15698,16 +15716,16 @@
         </w:rPr>
         <w:lastRenderedPageBreak/>
         <w:drawing>
-          <wp:inline distT="0" distB="0" distL="0" distR="0" wp14:anchorId="2DC30EF3" wp14:editId="300C18A9">
+          <wp:inline distT="0" distB="0" distL="0" distR="0" wp14:anchorId="04EF40C3" wp14:editId="52AF7305">
             <wp:extent cx="5120640" cy="4627581"/>
             <wp:effectExtent l="19050" t="19050" r="22860" b="20955"/>
-            <wp:docPr id="2088747033" name="Imagem 29"/>
+            <wp:docPr id="1161470843" name="Imagem 29"/>
             <wp:cNvGraphicFramePr/>
             <a:graphic xmlns:a="http://schemas.openxmlformats.org/drawingml/2006/main">
               <a:graphicData uri="http://schemas.openxmlformats.org/drawingml/2006/picture">
                 <pic:pic xmlns:pic="http://schemas.openxmlformats.org/drawingml/2006/picture">
                   <pic:nvPicPr>
-                    <pic:cNvPr id="2088747033" name=""/>
+                    <pic:cNvPr id="1161470843" name=""/>
                     <pic:cNvPicPr/>
                   </pic:nvPicPr>
                   <pic:blipFill>
@@ -15876,8 +15894,16 @@
         </w:numPr>
         <w:spacing w:after="80" w:line="260" w:lineRule="auto"/>
         <w:ind w:left="700"/>
-      </w:pPr>
-      <w:r>
+        <w:rPr>
+          <w:color w:val="1A1A1A"/>
+          <w:sz w:val="22"/>
+        </w:rPr>
+      </w:pPr>
+      <w:r>
+        <w:rPr>
+          <w:color w:val="1A1A1A"/>
+          <w:sz w:val="22"/>
+        </w:rPr>
         <w:t>Importar marcos do TAP: na secao Marcos de cada linha, o botao Importar marcos do TAP (visivel com um Projeto vinculado selecionado) traz os marcos do cronograma de entregas macro do TAP daquele projeto - o nome do marco vira o Nome do marco aqui, o Termino previsto vira a Data, e o Status comeca sempre como A iniciar (o TAP nao registra se um marco ja foi concluido). Marcos com o mesmo nome que ja estiverem na lista nao sao duplicados - o botao pode ser clicado varias vezes com seguranca, assim como o Importar do TAP dos Indicadores (secao 4.2).</w:t>
       </w:r>
     </w:p>
@@ -15891,16 +15917,16 @@
           <w:noProof/>
         </w:rPr>
         <w:drawing>
-          <wp:inline distT="0" distB="0" distL="0" distR="0" wp14:anchorId="7D66F989" wp14:editId="0F56FED1">
+          <wp:inline distT="0" distB="0" distL="0" distR="0" wp14:anchorId="0D20379A" wp14:editId="7FBE997F">
             <wp:extent cx="5120640" cy="1715571"/>
             <wp:effectExtent l="19050" t="19050" r="22860" b="18415"/>
-            <wp:docPr id="1352739964" name="Imagem 30"/>
+            <wp:docPr id="977168106" name="Imagem 30"/>
             <wp:cNvGraphicFramePr/>
             <a:graphic xmlns:a="http://schemas.openxmlformats.org/drawingml/2006/main">
               <a:graphicData uri="http://schemas.openxmlformats.org/drawingml/2006/picture">
                 <pic:pic xmlns:pic="http://schemas.openxmlformats.org/drawingml/2006/picture">
                   <pic:nvPicPr>
-                    <pic:cNvPr id="1352739964" name=""/>
+                    <pic:cNvPr id="977168106" name=""/>
                     <pic:cNvPicPr/>
                   </pic:nvPicPr>
                   <pic:blipFill>
@@ -16023,7 +16049,7 @@
           <w:color w:val="6A6A70"/>
           <w:sz w:val="21"/>
         </w:rPr>
-        <w:t xml:space="preserve">Sinalizacao automatica: a tabela de projetos do Painel ganhou a coluna Sinalizacao e o quadro de indicadores ganhou o card Em risco de atraso. E um calculo automatico, independente do campo Status manual: compara o % </w:t>
+        <w:t xml:space="preserve">Sinalizacao automatica: a tabela de projetos do Painel ganhou a coluna Sinalizacao e o quadro de indicadores ganhou o card Em risco de atraso. E um calculo automatico, independente do campo Status manual: compara o % Execucao informado com o % que seria esperado pelo tempo ja decorrido entre o Inicio previsto e o Termino previsto do projeto. Se a defasagem for de 15 pontos </w:t>
       </w:r>
       <w:r>
         <w:rPr>
@@ -16033,7 +16059,7 @@
           <w:sz w:val="21"/>
         </w:rPr>
         <w:lastRenderedPageBreak/>
-        <w:t>Execucao informado com o % que seria esperado pelo tempo ja decorrido entre o Inicio previsto e o Termino previsto do projeto. Se a defasagem for de 15 pontos percentuais ou mais, aparece Risco de atraso; se o Termino previsto ja passou e o projeto nao esta em 100%, aparece Prazo vencido. Projetos Concluido, Cancelado ou Paralisado ficam fora desse calculo. O resultado tambem sai no documento exportado.</w:t>
+        <w:t>percentuais ou mais, aparece Risco de atraso; se o Termino previsto ja passou e o projeto nao esta em 100%, aparece Prazo vencido. Projetos Concluido, Cancelado ou Paralisado ficam fora desse calculo. O resultado tambem sai no documento exportado.</w:t>
       </w:r>
     </w:p>
     <w:p>
@@ -16046,16 +16072,16 @@
           <w:noProof/>
         </w:rPr>
         <w:drawing>
-          <wp:inline distT="0" distB="0" distL="0" distR="0" wp14:anchorId="3D1B6889" wp14:editId="2942E812">
+          <wp:inline distT="0" distB="0" distL="0" distR="0" wp14:anchorId="1B429D5C" wp14:editId="67038A26">
             <wp:extent cx="5120640" cy="3282818"/>
             <wp:effectExtent l="19050" t="19050" r="22860" b="13335"/>
-            <wp:docPr id="1691382879" name="Imagem 31"/>
+            <wp:docPr id="820270356" name="Imagem 31"/>
             <wp:cNvGraphicFramePr/>
             <a:graphic xmlns:a="http://schemas.openxmlformats.org/drawingml/2006/main">
               <a:graphicData uri="http://schemas.openxmlformats.org/drawingml/2006/picture">
                 <pic:pic xmlns:pic="http://schemas.openxmlformats.org/drawingml/2006/picture">
                   <pic:nvPicPr>
-                    <pic:cNvPr id="1691382879" name=""/>
+                    <pic:cNvPr id="820270356" name=""/>
                     <pic:cNvPicPr/>
                   </pic:nvPicPr>
                   <pic:blipFill>
@@ -16166,18 +16192,17 @@
         <w:rPr>
           <w:noProof/>
         </w:rPr>
-        <w:lastRenderedPageBreak/>
         <w:drawing>
-          <wp:inline distT="0" distB="0" distL="0" distR="0" wp14:anchorId="43B693D1" wp14:editId="4608681B">
+          <wp:inline distT="0" distB="0" distL="0" distR="0" wp14:anchorId="315FC053" wp14:editId="3CC5E24B">
             <wp:extent cx="5120640" cy="951357"/>
             <wp:effectExtent l="19050" t="19050" r="22860" b="20320"/>
-            <wp:docPr id="1564412887" name="Imagem 32"/>
+            <wp:docPr id="39748078" name="Imagem 32"/>
             <wp:cNvGraphicFramePr/>
             <a:graphic xmlns:a="http://schemas.openxmlformats.org/drawingml/2006/main">
               <a:graphicData uri="http://schemas.openxmlformats.org/drawingml/2006/picture">
                 <pic:pic xmlns:pic="http://schemas.openxmlformats.org/drawingml/2006/picture">
                   <pic:nvPicPr>
-                    <pic:cNvPr id="1564412887" name=""/>
+                    <pic:cNvPr id="39748078" name=""/>
                     <pic:cNvPicPr/>
                   </pic:nvPicPr>
                   <pic:blipFill>
@@ -16231,6 +16256,7 @@
           <w:color w:val="6A6A70"/>
           <w:sz w:val="19"/>
         </w:rPr>
+        <w:lastRenderedPageBreak/>
         <w:t>Secao Custos realizados de um projeto, apos importar as categorias do TAP e preencher os valores gastos.</w:t>
       </w:r>
     </w:p>
@@ -16289,16 +16315,16 @@
           <w:noProof/>
         </w:rPr>
         <w:drawing>
-          <wp:inline distT="0" distB="0" distL="0" distR="0" wp14:anchorId="504DA65D" wp14:editId="2DF0AC6B">
+          <wp:inline distT="0" distB="0" distL="0" distR="0" wp14:anchorId="13EF4239" wp14:editId="430E3D81">
             <wp:extent cx="5120640" cy="1515102"/>
             <wp:effectExtent l="19050" t="19050" r="22860" b="28575"/>
-            <wp:docPr id="842060178" name="Imagem 33"/>
+            <wp:docPr id="2069385827" name="Imagem 33"/>
             <wp:cNvGraphicFramePr/>
             <a:graphic xmlns:a="http://schemas.openxmlformats.org/drawingml/2006/main">
               <a:graphicData uri="http://schemas.openxmlformats.org/drawingml/2006/picture">
                 <pic:pic xmlns:pic="http://schemas.openxmlformats.org/drawingml/2006/picture">
                   <pic:nvPicPr>
-                    <pic:cNvPr id="842060178" name=""/>
+                    <pic:cNvPr id="2069385827" name=""/>
                     <pic:cNvPicPr/>
                   </pic:nvPicPr>
                   <pic:blipFill>
@@ -16397,7 +16423,7 @@
           <w:color w:val="6A6A70"/>
           <w:sz w:val="21"/>
         </w:rPr>
-        <w:t xml:space="preserve">Reporte de Resultados (D06.5): este cartao e a base do momento em que o Gerente de Projetos e o Dono do Negocio apresentam as instancias de decisao no que o projeto foi alcancado - nao so o que foi planejado, mas indicadores, entregas e beneficios de fato realizados, lado a lado com a meta original. E uma </w:t>
+        <w:t xml:space="preserve">Reporte de Resultados (D06.5): este cartao e a base do momento em que o Gerente de Projetos e o Dono do Negocio apresentam as instancias de decisao no que o projeto foi alcancado - nao so o que foi planejado, mas indicadores, entregas e beneficios de fato realizados, lado a lado com a meta original. E uma lista simples, independente dos projetos cadastrados, com o mesmo comportamento de Entraves e Encaminhamentos: continua visivel no Painel mesmo sem nenhum projeto informado, e sai no documento exportado. Junto com os Entraves e Encaminhamentos (D06.6/D06.7), completa os tres artefatos </w:t>
       </w:r>
       <w:r>
         <w:rPr>
@@ -16407,7 +16433,7 @@
           <w:sz w:val="21"/>
         </w:rPr>
         <w:lastRenderedPageBreak/>
-        <w:t>lista simples, independente dos projetos cadastrados, com o mesmo comportamento de Entraves e Encaminhamentos: continua visivel no Painel mesmo sem nenhum projeto informado, e sai no documento exportado. Junto com os Entraves e Encaminhamentos (D06.6/D06.7), completa os tres artefatos de governanca da Diretriz D06 sem exigir um 13o formulario separado - o Reporte de Resultados e atendido dentro do proprio Relatorio de Situacao.</w:t>
+        <w:t>de governanca da Diretriz D06 sem exigir um 13o formulario separado - o Reporte de Resultados e atendido dentro do proprio Relatorio de Situacao.</w:t>
       </w:r>
     </w:p>
     <w:p>
@@ -16420,16 +16446,16 @@
           <w:noProof/>
         </w:rPr>
         <w:drawing>
-          <wp:inline distT="0" distB="0" distL="0" distR="0" wp14:anchorId="0FF57468" wp14:editId="6FEFDB06">
+          <wp:inline distT="0" distB="0" distL="0" distR="0" wp14:anchorId="0FFF334C" wp14:editId="21960736">
             <wp:extent cx="5120640" cy="1391113"/>
             <wp:effectExtent l="19050" t="19050" r="22860" b="19050"/>
-            <wp:docPr id="1759685300" name="Imagem 34"/>
+            <wp:docPr id="1858044050" name="Imagem 34"/>
             <wp:cNvGraphicFramePr/>
             <a:graphic xmlns:a="http://schemas.openxmlformats.org/drawingml/2006/main">
               <a:graphicData uri="http://schemas.openxmlformats.org/drawingml/2006/picture">
                 <pic:pic xmlns:pic="http://schemas.openxmlformats.org/drawingml/2006/picture">
                   <pic:nvPicPr>
-                    <pic:cNvPr id="1759685300" name=""/>
+                    <pic:cNvPr id="1858044050" name=""/>
                     <pic:cNvPicPr/>
                   </pic:nvPicPr>
                   <pic:blipFill>
@@ -16541,16 +16567,16 @@
           <w:noProof/>
         </w:rPr>
         <w:drawing>
-          <wp:inline distT="0" distB="0" distL="0" distR="0" wp14:anchorId="0FD2CBA2" wp14:editId="44A214D0">
+          <wp:inline distT="0" distB="0" distL="0" distR="0" wp14:anchorId="726189F6" wp14:editId="651C0F57">
             <wp:extent cx="5120640" cy="1125174"/>
             <wp:effectExtent l="19050" t="19050" r="22860" b="18415"/>
-            <wp:docPr id="667775819" name="Imagem 35"/>
+            <wp:docPr id="266704066" name="Imagem 35"/>
             <wp:cNvGraphicFramePr/>
             <a:graphic xmlns:a="http://schemas.openxmlformats.org/drawingml/2006/main">
               <a:graphicData uri="http://schemas.openxmlformats.org/drawingml/2006/picture">
                 <pic:pic xmlns:pic="http://schemas.openxmlformats.org/drawingml/2006/picture">
                   <pic:nvPicPr>
-                    <pic:cNvPr id="667775819" name=""/>
+                    <pic:cNvPr id="266704066" name=""/>
                     <pic:cNvPicPr/>
                   </pic:nvPicPr>
                   <pic:blipFill>
@@ -16639,7 +16665,7 @@
           <w:sz w:val="27"/>
         </w:rPr>
       </w:pPr>
-      <w:bookmarkStart w:id="32" w:name="_Toc239322534"/>
+      <w:bookmarkStart w:id="32" w:name="_Toc239326884"/>
       <w:r>
         <w:rPr>
           <w:rFonts w:ascii="Montserrat" w:hAnsi="Montserrat"/>
@@ -16647,7 +16673,6 @@
           <w:color w:val="B91D2E"/>
           <w:sz w:val="27"/>
         </w:rPr>
-        <w:lastRenderedPageBreak/>
         <w:t>4.2 Relatorio de Entregas e Beneficios (FORALF12)</w:t>
       </w:r>
       <w:bookmarkEnd w:id="32"/>
@@ -16679,17 +16704,18 @@
         <w:rPr>
           <w:noProof/>
         </w:rPr>
+        <w:lastRenderedPageBreak/>
         <w:drawing>
-          <wp:inline distT="0" distB="0" distL="0" distR="0" wp14:anchorId="7C315101" wp14:editId="5C46247A">
+          <wp:inline distT="0" distB="0" distL="0" distR="0" wp14:anchorId="0ED3B39E" wp14:editId="61F4AC9E">
             <wp:extent cx="5120640" cy="4627581"/>
             <wp:effectExtent l="19050" t="19050" r="22860" b="20955"/>
-            <wp:docPr id="81909716" name="Imagem 36"/>
+            <wp:docPr id="788643633" name="Imagem 36"/>
             <wp:cNvGraphicFramePr/>
             <a:graphic xmlns:a="http://schemas.openxmlformats.org/drawingml/2006/main">
               <a:graphicData uri="http://schemas.openxmlformats.org/drawingml/2006/picture">
                 <pic:pic xmlns:pic="http://schemas.openxmlformats.org/drawingml/2006/picture">
                   <pic:nvPicPr>
-                    <pic:cNvPr id="81909716" name=""/>
+                    <pic:cNvPr id="788643633" name=""/>
                     <pic:cNvPicPr/>
                   </pic:nvPicPr>
                   <pic:blipFill>
@@ -16757,16 +16783,16 @@
         </w:rPr>
         <w:lastRenderedPageBreak/>
         <w:drawing>
-          <wp:inline distT="0" distB="0" distL="0" distR="0" wp14:anchorId="29B795C8" wp14:editId="64567CE3">
+          <wp:inline distT="0" distB="0" distL="0" distR="0" wp14:anchorId="588B5701" wp14:editId="6DE6F912">
             <wp:extent cx="5120640" cy="4627581"/>
             <wp:effectExtent l="19050" t="19050" r="22860" b="20955"/>
-            <wp:docPr id="335442111" name="Imagem 37"/>
+            <wp:docPr id="1962814659" name="Imagem 37"/>
             <wp:cNvGraphicFramePr/>
             <a:graphic xmlns:a="http://schemas.openxmlformats.org/drawingml/2006/main">
               <a:graphicData uri="http://schemas.openxmlformats.org/drawingml/2006/picture">
                 <pic:pic xmlns:pic="http://schemas.openxmlformats.org/drawingml/2006/picture">
                   <pic:nvPicPr>
-                    <pic:cNvPr id="335442111" name=""/>
+                    <pic:cNvPr id="1962814659" name=""/>
                     <pic:cNvPicPr/>
                   </pic:nvPicPr>
                   <pic:blipFill>
@@ -16935,16 +16961,16 @@
           <w:noProof/>
         </w:rPr>
         <w:drawing>
-          <wp:inline distT="0" distB="0" distL="0" distR="0" wp14:anchorId="09B6606B" wp14:editId="26EECDF0">
+          <wp:inline distT="0" distB="0" distL="0" distR="0" wp14:anchorId="21DB2B5F" wp14:editId="29C8C1B2">
             <wp:extent cx="5120640" cy="2144319"/>
             <wp:effectExtent l="19050" t="19050" r="22860" b="27940"/>
-            <wp:docPr id="906362347" name="Imagem 38"/>
+            <wp:docPr id="491021564" name="Imagem 38"/>
             <wp:cNvGraphicFramePr/>
             <a:graphic xmlns:a="http://schemas.openxmlformats.org/drawingml/2006/main">
               <a:graphicData uri="http://schemas.openxmlformats.org/drawingml/2006/picture">
                 <pic:pic xmlns:pic="http://schemas.openxmlformats.org/drawingml/2006/picture">
                   <pic:nvPicPr>
-                    <pic:cNvPr id="906362347" name=""/>
+                    <pic:cNvPr id="491021564" name=""/>
                     <pic:cNvPicPr/>
                   </pic:nvPicPr>
                   <pic:blipFill>
@@ -17032,16 +17058,16 @@
           <w:noProof/>
         </w:rPr>
         <w:drawing>
-          <wp:inline distT="0" distB="0" distL="0" distR="0" wp14:anchorId="62AFE213" wp14:editId="2AD38443">
+          <wp:inline distT="0" distB="0" distL="0" distR="0" wp14:anchorId="15E8E817" wp14:editId="367EAECE">
             <wp:extent cx="5120640" cy="1055647"/>
             <wp:effectExtent l="19050" t="19050" r="22860" b="11430"/>
-            <wp:docPr id="742801291" name="Imagem 39"/>
+            <wp:docPr id="1104869725" name="Imagem 39"/>
             <wp:cNvGraphicFramePr/>
             <a:graphic xmlns:a="http://schemas.openxmlformats.org/drawingml/2006/main">
               <a:graphicData uri="http://schemas.openxmlformats.org/drawingml/2006/picture">
                 <pic:pic xmlns:pic="http://schemas.openxmlformats.org/drawingml/2006/picture">
                   <pic:nvPicPr>
-                    <pic:cNvPr id="742801291" name=""/>
+                    <pic:cNvPr id="1104869725" name=""/>
                     <pic:cNvPicPr/>
                   </pic:nvPicPr>
                   <pic:blipFill>
@@ -17163,16 +17189,16 @@
           <w:noProof/>
         </w:rPr>
         <w:drawing>
-          <wp:inline distT="0" distB="0" distL="0" distR="0" wp14:anchorId="4DAA0941" wp14:editId="2299A4DE">
+          <wp:inline distT="0" distB="0" distL="0" distR="0" wp14:anchorId="28FE914F" wp14:editId="1438393F">
             <wp:extent cx="5120640" cy="3282818"/>
             <wp:effectExtent l="19050" t="19050" r="22860" b="13335"/>
-            <wp:docPr id="1443760472" name="Imagem 40"/>
+            <wp:docPr id="228748274" name="Imagem 40"/>
             <wp:cNvGraphicFramePr/>
             <a:graphic xmlns:a="http://schemas.openxmlformats.org/drawingml/2006/main">
               <a:graphicData uri="http://schemas.openxmlformats.org/drawingml/2006/picture">
                 <pic:pic xmlns:pic="http://schemas.openxmlformats.org/drawingml/2006/picture">
                   <pic:nvPicPr>
-                    <pic:cNvPr id="1443760472" name=""/>
+                    <pic:cNvPr id="228748274" name=""/>
                     <pic:cNvPicPr/>
                   </pic:nvPicPr>
                   <pic:blipFill>
@@ -17306,16 +17332,16 @@
         </w:rPr>
         <w:lastRenderedPageBreak/>
         <w:drawing>
-          <wp:inline distT="0" distB="0" distL="0" distR="0" wp14:anchorId="2D03AA79" wp14:editId="172B8695">
+          <wp:inline distT="0" distB="0" distL="0" distR="0" wp14:anchorId="0FB825CF" wp14:editId="7DD7517C">
             <wp:extent cx="5120640" cy="1978034"/>
             <wp:effectExtent l="19050" t="19050" r="22860" b="22225"/>
-            <wp:docPr id="52590645" name="Imagem 41"/>
+            <wp:docPr id="858540774" name="Imagem 41"/>
             <wp:cNvGraphicFramePr/>
             <a:graphic xmlns:a="http://schemas.openxmlformats.org/drawingml/2006/main">
               <a:graphicData uri="http://schemas.openxmlformats.org/drawingml/2006/picture">
                 <pic:pic xmlns:pic="http://schemas.openxmlformats.org/drawingml/2006/picture">
                   <pic:nvPicPr>
-                    <pic:cNvPr id="52590645" name=""/>
+                    <pic:cNvPr id="858540774" name=""/>
                     <pic:cNvPicPr/>
                   </pic:nvPicPr>
                   <pic:blipFill>
@@ -17387,7 +17413,7 @@
           <w:sz w:val="34"/>
         </w:rPr>
       </w:pPr>
-      <w:bookmarkStart w:id="33" w:name="_Toc239322535"/>
+      <w:bookmarkStart w:id="33" w:name="_Toc239326885"/>
       <w:r>
         <w:rPr>
           <w:rFonts w:ascii="Montserrat" w:hAnsi="Montserrat"/>
@@ -17447,7 +17473,7 @@
           <w:sz w:val="27"/>
         </w:rPr>
       </w:pPr>
-      <w:bookmarkStart w:id="34" w:name="_Toc239322536"/>
+      <w:bookmarkStart w:id="34" w:name="_Toc239326886"/>
       <w:r>
         <w:rPr>
           <w:rFonts w:ascii="Montserrat" w:hAnsi="Montserrat"/>
@@ -17487,16 +17513,16 @@
           <w:noProof/>
         </w:rPr>
         <w:drawing>
-          <wp:inline distT="0" distB="0" distL="0" distR="0" wp14:anchorId="147762EF" wp14:editId="2AD475C1">
+          <wp:inline distT="0" distB="0" distL="0" distR="0" wp14:anchorId="64C4A830" wp14:editId="49E2ED46">
             <wp:extent cx="5303520" cy="4792851"/>
             <wp:effectExtent l="19050" t="19050" r="11430" b="27305"/>
-            <wp:docPr id="729140051" name="Imagem 42"/>
+            <wp:docPr id="884891732" name="Imagem 42"/>
             <wp:cNvGraphicFramePr/>
             <a:graphic xmlns:a="http://schemas.openxmlformats.org/drawingml/2006/main">
               <a:graphicData uri="http://schemas.openxmlformats.org/drawingml/2006/picture">
                 <pic:pic xmlns:pic="http://schemas.openxmlformats.org/drawingml/2006/picture">
                   <pic:nvPicPr>
-                    <pic:cNvPr id="729140051" name=""/>
+                    <pic:cNvPr id="884891732" name=""/>
                     <pic:cNvPicPr/>
                   </pic:nvPicPr>
                   <pic:blipFill>
@@ -17565,7 +17591,7 @@
           <w:sz w:val="27"/>
         </w:rPr>
       </w:pPr>
-      <w:bookmarkStart w:id="35" w:name="_Toc239322537"/>
+      <w:bookmarkStart w:id="35" w:name="_Toc239326887"/>
       <w:r>
         <w:rPr>
           <w:rFonts w:ascii="Montserrat" w:hAnsi="Montserrat"/>
@@ -17605,16 +17631,16 @@
           <w:noProof/>
         </w:rPr>
         <w:drawing>
-          <wp:inline distT="0" distB="0" distL="0" distR="0" wp14:anchorId="44D70F4E" wp14:editId="5A9CF671">
+          <wp:inline distT="0" distB="0" distL="0" distR="0" wp14:anchorId="34B11C5E" wp14:editId="50183BDC">
             <wp:extent cx="5303520" cy="4792851"/>
             <wp:effectExtent l="19050" t="19050" r="11430" b="27305"/>
-            <wp:docPr id="1934871556" name="Imagem 43"/>
+            <wp:docPr id="1629378487" name="Imagem 43"/>
             <wp:cNvGraphicFramePr/>
             <a:graphic xmlns:a="http://schemas.openxmlformats.org/drawingml/2006/main">
               <a:graphicData uri="http://schemas.openxmlformats.org/drawingml/2006/picture">
                 <pic:pic xmlns:pic="http://schemas.openxmlformats.org/drawingml/2006/picture">
                   <pic:nvPicPr>
-                    <pic:cNvPr id="1934871556" name=""/>
+                    <pic:cNvPr id="1629378487" name=""/>
                     <pic:cNvPicPr/>
                   </pic:nvPicPr>
                   <pic:blipFill>
@@ -17682,7 +17708,7 @@
           <w:sz w:val="27"/>
         </w:rPr>
       </w:pPr>
-      <w:bookmarkStart w:id="36" w:name="_Toc239322538"/>
+      <w:bookmarkStart w:id="36" w:name="_Toc239326888"/>
       <w:r>
         <w:rPr>
           <w:rFonts w:ascii="Montserrat" w:hAnsi="Montserrat"/>
@@ -17723,16 +17749,16 @@
         </w:rPr>
         <w:lastRenderedPageBreak/>
         <w:drawing>
-          <wp:inline distT="0" distB="0" distL="0" distR="0" wp14:anchorId="6288F6A6" wp14:editId="6C17A131">
+          <wp:inline distT="0" distB="0" distL="0" distR="0" wp14:anchorId="766E6AF6" wp14:editId="6DDAC2E0">
             <wp:extent cx="5303520" cy="4792851"/>
             <wp:effectExtent l="19050" t="19050" r="11430" b="27305"/>
-            <wp:docPr id="1463125616" name="Imagem 44"/>
+            <wp:docPr id="2062448468" name="Imagem 44"/>
             <wp:cNvGraphicFramePr/>
             <a:graphic xmlns:a="http://schemas.openxmlformats.org/drawingml/2006/main">
               <a:graphicData uri="http://schemas.openxmlformats.org/drawingml/2006/picture">
                 <pic:pic xmlns:pic="http://schemas.openxmlformats.org/drawingml/2006/picture">
                   <pic:nvPicPr>
-                    <pic:cNvPr id="1463125616" name=""/>
+                    <pic:cNvPr id="2062448468" name=""/>
                     <pic:cNvPicPr/>
                   </pic:nvPicPr>
                   <pic:blipFill>
@@ -17800,16 +17826,16 @@
         </w:rPr>
         <w:lastRenderedPageBreak/>
         <w:drawing>
-          <wp:inline distT="0" distB="0" distL="0" distR="0" wp14:anchorId="02AE93A5" wp14:editId="6B2ACFEC">
+          <wp:inline distT="0" distB="0" distL="0" distR="0" wp14:anchorId="010495C1" wp14:editId="176E73DF">
             <wp:extent cx="5303520" cy="4792851"/>
             <wp:effectExtent l="19050" t="19050" r="11430" b="27305"/>
-            <wp:docPr id="1279450066" name="Imagem 45"/>
+            <wp:docPr id="3774853" name="Imagem 45"/>
             <wp:cNvGraphicFramePr/>
             <a:graphic xmlns:a="http://schemas.openxmlformats.org/drawingml/2006/main">
               <a:graphicData uri="http://schemas.openxmlformats.org/drawingml/2006/picture">
                 <pic:pic xmlns:pic="http://schemas.openxmlformats.org/drawingml/2006/picture">
                   <pic:nvPicPr>
-                    <pic:cNvPr id="1279450066" name=""/>
+                    <pic:cNvPr id="3774853" name=""/>
                     <pic:cNvPicPr/>
                   </pic:nvPicPr>
                   <pic:blipFill>
@@ -17902,7 +17928,7 @@
           <w:sz w:val="34"/>
         </w:rPr>
       </w:pPr>
-      <w:bookmarkStart w:id="37" w:name="_Toc239322539"/>
+      <w:bookmarkStart w:id="37" w:name="_Toc239326889"/>
       <w:r>
         <w:rPr>
           <w:rFonts w:ascii="Montserrat" w:hAnsi="Montserrat"/>
@@ -17944,7 +17970,7 @@
           <w:sz w:val="27"/>
         </w:rPr>
       </w:pPr>
-      <w:bookmarkStart w:id="38" w:name="_Toc239322540"/>
+      <w:bookmarkStart w:id="38" w:name="_Toc239326890"/>
       <w:r>
         <w:rPr>
           <w:rFonts w:ascii="Montserrat" w:hAnsi="Montserrat"/>
@@ -17984,16 +18010,16 @@
           <w:noProof/>
         </w:rPr>
         <w:drawing>
-          <wp:inline distT="0" distB="0" distL="0" distR="0" wp14:anchorId="5E83E410" wp14:editId="5B3F377B">
+          <wp:inline distT="0" distB="0" distL="0" distR="0" wp14:anchorId="3E3A3AA3" wp14:editId="7B213705">
             <wp:extent cx="5303520" cy="4792851"/>
             <wp:effectExtent l="19050" t="19050" r="11430" b="27305"/>
-            <wp:docPr id="1496280295" name="Imagem 46"/>
+            <wp:docPr id="1792933856" name="Imagem 46"/>
             <wp:cNvGraphicFramePr/>
             <a:graphic xmlns:a="http://schemas.openxmlformats.org/drawingml/2006/main">
               <a:graphicData uri="http://schemas.openxmlformats.org/drawingml/2006/picture">
                 <pic:pic xmlns:pic="http://schemas.openxmlformats.org/drawingml/2006/picture">
                   <pic:nvPicPr>
-                    <pic:cNvPr id="1496280295" name=""/>
+                    <pic:cNvPr id="1792933856" name=""/>
                     <pic:cNvPicPr/>
                   </pic:nvPicPr>
                   <pic:blipFill>
@@ -18140,7 +18166,7 @@
           <w:sz w:val="27"/>
         </w:rPr>
       </w:pPr>
-      <w:bookmarkStart w:id="39" w:name="_Toc239322541"/>
+      <w:bookmarkStart w:id="39" w:name="_Toc239326891"/>
       <w:r>
         <w:rPr>
           <w:rFonts w:ascii="Montserrat" w:hAnsi="Montserrat"/>
@@ -18181,16 +18207,16 @@
         </w:rPr>
         <w:lastRenderedPageBreak/>
         <w:drawing>
-          <wp:inline distT="0" distB="0" distL="0" distR="0" wp14:anchorId="0BDFB56E" wp14:editId="1E3A33AE">
+          <wp:inline distT="0" distB="0" distL="0" distR="0" wp14:anchorId="1BCA6623" wp14:editId="1F54B8E1">
             <wp:extent cx="5303520" cy="4792851"/>
             <wp:effectExtent l="19050" t="19050" r="11430" b="27305"/>
-            <wp:docPr id="1332962767" name="Imagem 47"/>
+            <wp:docPr id="112603290" name="Imagem 47"/>
             <wp:cNvGraphicFramePr/>
             <a:graphic xmlns:a="http://schemas.openxmlformats.org/drawingml/2006/main">
               <a:graphicData uri="http://schemas.openxmlformats.org/drawingml/2006/picture">
                 <pic:pic xmlns:pic="http://schemas.openxmlformats.org/drawingml/2006/picture">
                   <pic:nvPicPr>
-                    <pic:cNvPr id="1332962767" name=""/>
+                    <pic:cNvPr id="112603290" name=""/>
                     <pic:cNvPicPr/>
                   </pic:nvPicPr>
                   <pic:blipFill>
@@ -18258,7 +18284,7 @@
           <w:sz w:val="27"/>
         </w:rPr>
       </w:pPr>
-      <w:bookmarkStart w:id="40" w:name="_Toc239322542"/>
+      <w:bookmarkStart w:id="40" w:name="_Toc239326892"/>
       <w:r>
         <w:rPr>
           <w:rFonts w:ascii="Montserrat" w:hAnsi="Montserrat"/>
@@ -18299,16 +18325,16 @@
         </w:rPr>
         <w:lastRenderedPageBreak/>
         <w:drawing>
-          <wp:inline distT="0" distB="0" distL="0" distR="0" wp14:anchorId="5CFD2ED3" wp14:editId="66F1B311">
+          <wp:inline distT="0" distB="0" distL="0" distR="0" wp14:anchorId="504B6B59" wp14:editId="5531BCEF">
             <wp:extent cx="5303520" cy="4792851"/>
             <wp:effectExtent l="19050" t="19050" r="11430" b="27305"/>
-            <wp:docPr id="222928919" name="Imagem 48"/>
+            <wp:docPr id="741295134" name="Imagem 48"/>
             <wp:cNvGraphicFramePr/>
             <a:graphic xmlns:a="http://schemas.openxmlformats.org/drawingml/2006/main">
               <a:graphicData uri="http://schemas.openxmlformats.org/drawingml/2006/picture">
                 <pic:pic xmlns:pic="http://schemas.openxmlformats.org/drawingml/2006/picture">
                   <pic:nvPicPr>
-                    <pic:cNvPr id="222928919" name=""/>
+                    <pic:cNvPr id="741295134" name=""/>
                     <pic:cNvPicPr/>
                   </pic:nvPicPr>
                   <pic:blipFill>
@@ -18452,7 +18478,7 @@
           <w:sz w:val="27"/>
         </w:rPr>
       </w:pPr>
-      <w:bookmarkStart w:id="41" w:name="_Toc239322543"/>
+      <w:bookmarkStart w:id="41" w:name="_Toc239326893"/>
       <w:r>
         <w:rPr>
           <w:rFonts w:ascii="Montserrat" w:hAnsi="Montserrat"/>
@@ -18599,7 +18625,7 @@
           <w:color w:val="1A1A1A"/>
           <w:sz w:val="22"/>
         </w:rPr>
-        <w:t>Visao atual por projeto: uma linha por projeto do cadastro compartilhado, com Status do cadastro, Situacao mais recente do Relatorio de Situacao (secao 4.1, com o percentual concluido quando ja reportado) e Progresso do ciclo de vida - quantos dos 9 formularios (Demanda a RLA) ja tem registro vinculado aquele projeto, com a lista do que ainda falta.</w:t>
+        <w:t>Visao atual por projeto: uma linha por projeto do cadastro compartilhado, com Status do cadastro, Situacao mais recente do Relatorio de Situacao (secao 4.1, com o percentual concluido quando ja reportado), Saude do projeto (secao 6.4.1) e Progresso do ciclo de vida - quantos dos 9 formularios (Demanda a RLA) ja tem registro vinculado aquele projeto, com a lista do que ainda falta.</w:t>
       </w:r>
     </w:p>
     <w:p>
@@ -18613,16 +18639,16 @@
         </w:rPr>
         <w:lastRenderedPageBreak/>
         <w:drawing>
-          <wp:inline distT="0" distB="0" distL="0" distR="0" wp14:anchorId="2BF856D3" wp14:editId="23E2DB17">
+          <wp:inline distT="0" distB="0" distL="0" distR="0" wp14:anchorId="3A7418EA" wp14:editId="0D227067">
             <wp:extent cx="5303520" cy="4267180"/>
             <wp:effectExtent l="19050" t="19050" r="11430" b="19685"/>
-            <wp:docPr id="1106003073" name="Imagem 49"/>
+            <wp:docPr id="1489441297" name="Imagem 49"/>
             <wp:cNvGraphicFramePr/>
             <a:graphic xmlns:a="http://schemas.openxmlformats.org/drawingml/2006/main">
               <a:graphicData uri="http://schemas.openxmlformats.org/drawingml/2006/picture">
                 <pic:pic xmlns:pic="http://schemas.openxmlformats.org/drawingml/2006/picture">
                   <pic:nvPicPr>
-                    <pic:cNvPr id="1106003073" name=""/>
+                    <pic:cNvPr id="1489441297" name=""/>
                     <pic:cNvPicPr/>
                   </pic:nvPicPr>
                   <pic:blipFill>
@@ -18690,16 +18716,16 @@
         </w:rPr>
         <w:lastRenderedPageBreak/>
         <w:drawing>
-          <wp:inline distT="0" distB="0" distL="0" distR="0" wp14:anchorId="39DF0AF6" wp14:editId="668F86E9">
+          <wp:inline distT="0" distB="0" distL="0" distR="0" wp14:anchorId="0ECDE63F" wp14:editId="561324E7">
             <wp:extent cx="5303520" cy="3382059"/>
             <wp:effectExtent l="19050" t="19050" r="11430" b="27940"/>
-            <wp:docPr id="705673440" name="Imagem 50"/>
+            <wp:docPr id="1711384601" name="Imagem 50"/>
             <wp:cNvGraphicFramePr/>
             <a:graphic xmlns:a="http://schemas.openxmlformats.org/drawingml/2006/main">
               <a:graphicData uri="http://schemas.openxmlformats.org/drawingml/2006/picture">
                 <pic:pic xmlns:pic="http://schemas.openxmlformats.org/drawingml/2006/picture">
                   <pic:nvPicPr>
-                    <pic:cNvPr id="705673440" name=""/>
+                    <pic:cNvPr id="1711384601" name=""/>
                     <pic:cNvPicPr/>
                   </pic:nvPicPr>
                   <pic:blipFill>
@@ -18765,17 +18791,18 @@
         <w:rPr>
           <w:noProof/>
         </w:rPr>
+        <w:lastRenderedPageBreak/>
         <w:drawing>
-          <wp:inline distT="0" distB="0" distL="0" distR="0" wp14:anchorId="1DA18DE1" wp14:editId="5358957A">
-            <wp:extent cx="5303520" cy="4053550"/>
-            <wp:effectExtent l="19050" t="19050" r="11430" b="23495"/>
-            <wp:docPr id="143373221" name="Imagem 51"/>
+          <wp:inline distT="0" distB="0" distL="0" distR="0" wp14:anchorId="1B6CD252" wp14:editId="11690398">
+            <wp:extent cx="5303520" cy="4417800"/>
+            <wp:effectExtent l="19050" t="19050" r="11430" b="20955"/>
+            <wp:docPr id="944699226" name="Imagem 51"/>
             <wp:cNvGraphicFramePr/>
             <a:graphic xmlns:a="http://schemas.openxmlformats.org/drawingml/2006/main">
               <a:graphicData uri="http://schemas.openxmlformats.org/drawingml/2006/picture">
                 <pic:pic xmlns:pic="http://schemas.openxmlformats.org/drawingml/2006/picture">
                   <pic:nvPicPr>
-                    <pic:cNvPr id="143373221" name=""/>
+                    <pic:cNvPr id="944699226" name=""/>
                     <pic:cNvPicPr/>
                   </pic:nvPicPr>
                   <pic:blipFill>
@@ -18793,7 +18820,7 @@
                   <pic:spPr>
                     <a:xfrm>
                       <a:off x="0" y="0"/>
-                      <a:ext cx="5303520" cy="4053550"/>
+                      <a:ext cx="5303520" cy="4417800"/>
                     </a:xfrm>
                     <a:prstGeom prst="rect">
                       <a:avLst/>
@@ -18829,8 +18856,7 @@
           <w:color w:val="6A6A70"/>
           <w:sz w:val="19"/>
         </w:rPr>
-        <w:lastRenderedPageBreak/>
-        <w:t>Visao atual por projeto: status do cadastro, situacao do Relatorio de Situacao e progresso do ciclo de vida, projeto a projeto.</w:t>
+        <w:t>Visao atual por projeto: status do cadastro, situacao do Relatorio de Situacao, saude do projeto e progresso do ciclo de vida, projeto a projeto.</w:t>
       </w:r>
     </w:p>
     <w:p>
@@ -18886,7 +18912,7 @@
           <w:sz w:val="27"/>
         </w:rPr>
       </w:pPr>
-      <w:bookmarkStart w:id="42" w:name="_Toc239322544"/>
+      <w:bookmarkStart w:id="42" w:name="_Toc239326894"/>
       <w:r>
         <w:rPr>
           <w:rFonts w:ascii="Montserrat" w:hAnsi="Montserrat"/>
@@ -18913,7 +18939,16 @@
           <w:color w:val="1A1A1A"/>
           <w:sz w:val="22"/>
         </w:rPr>
-        <w:t>Visao consolidada de um unico projeto, reunindo em uma tela so o que hoje esta espalhado pelos 9 formularios do ciclo de vida. Aberta clicando no nome de um projeto na tabela Visao atual por projeto do Painel Executivo (secao 6.4); abrir a pagina direto, sem escolher um projeto antes, mostra um seletor com todos os projetos cadastrados. Diferente do Painel Executivo, nao tem restricao por papel - qualquer usuario autenticado pode ver a ficha de qualquer projeto, a mesma logica ja usada pelo botao Ver historico em cada formulario.</w:t>
+        <w:t xml:space="preserve">Visao consolidada de um unico projeto, reunindo em uma tela so o que hoje esta espalhado pelos 9 formularios do ciclo de vida. Aberta clicando no nome de um projeto na tabela Visao atual por projeto do Painel Executivo (secao 6.4); abrir a pagina direto, sem escolher um projeto antes, mostra um seletor com todos os projetos cadastrados. Diferente do Painel Executivo, nao tem restricao </w:t>
+      </w:r>
+      <w:r>
+        <w:rPr>
+          <w:rFonts w:ascii="Montserrat" w:hAnsi="Montserrat"/>
+          <w:color w:val="1A1A1A"/>
+          <w:sz w:val="22"/>
+        </w:rPr>
+        <w:lastRenderedPageBreak/>
+        <w:t>por papel - qualquer usuario autenticado pode ver a ficha de qualquer projeto, a mesma logica ja usada pelo botao Ver historico em cada formulario.</w:t>
       </w:r>
     </w:p>
     <w:p>
@@ -18961,7 +18996,7 @@
           <w:color w:val="1A1A1A"/>
           <w:sz w:val="22"/>
         </w:rPr>
-        <w:t>Situacao atual: a linha desse projeto no Relatorio de Situacao - status, % concluido, datas previstas, marcos, custos realizados e os campos Merece destaque/Merece atencao, quando preenchidos.</w:t>
+        <w:t>Saude do projeto: selo geral (Normal/Atencao/Critico/Encerrado/Sem dados), % de marcos concluidos, atraso do marco mais atrasado (em dias) e % do orcamento realizado frente ao estimado no TAP - ver detalhe do calculo logo abaixo.</w:t>
       </w:r>
     </w:p>
     <w:p>
@@ -18985,7 +19020,7 @@
           <w:color w:val="1A1A1A"/>
           <w:sz w:val="22"/>
         </w:rPr>
-        <w:t>Progresso do ciclo de vida: quantos registros existem em cada um dos 9 formularios (Demanda a RLA) para esse projeto, com o status de cada um e um link para abrir o formulario correspondente.</w:t>
+        <w:t>Situacao atual: a linha desse projeto no Relatorio de Situacao - status, % concluido, datas previstas, marcos, custos realizados e os campos Merece destaque/Merece atencao, quando preenchidos.</w:t>
       </w:r>
     </w:p>
     <w:p>
@@ -19009,7 +19044,7 @@
           <w:color w:val="1A1A1A"/>
           <w:sz w:val="22"/>
         </w:rPr>
-        <w:t>Cronograma e custos planejados (TAP): o cronograma de entregas macro e o custo total estimado do TAP desse projeto, para comparar com os custos realizados do Relatorio de Situacao.</w:t>
+        <w:t>Progresso do ciclo de vida: quantos registros existem em cada um dos 9 formularios (Demanda a RLA) para esse projeto, com o status de cada um e um link para abrir o formulario correspondente.</w:t>
       </w:r>
     </w:p>
     <w:p>
@@ -19033,7 +19068,7 @@
           <w:color w:val="1A1A1A"/>
           <w:sz w:val="22"/>
         </w:rPr>
-        <w:t>Equipe do projeto: mesma lista de Administracao &gt; Equipes (secao 6.2), com o papel de cada membro vindo do cadastro global de usuarios.</w:t>
+        <w:t>Cronograma e custos planejados (TAP): o cronograma de entregas macro e o custo total estimado do TAP desse projeto, para comparar com os custos realizados do Relatorio de Situacao.</w:t>
       </w:r>
     </w:p>
     <w:p>
@@ -19057,6 +19092,30 @@
           <w:color w:val="1A1A1A"/>
           <w:sz w:val="22"/>
         </w:rPr>
+        <w:t>Equipe do projeto: mesma lista de Administracao &gt; Equipes (secao 6.2), com o papel de cada membro vindo do cadastro global de usuarios.</w:t>
+      </w:r>
+    </w:p>
+    <w:p>
+      <w:pPr>
+        <w:pStyle w:val="PargrafodaLista"/>
+        <w:numPr>
+          <w:ilvl w:val="0"/>
+          <w:numId w:val="29"/>
+        </w:numPr>
+        <w:spacing w:after="80" w:line="260" w:lineRule="auto"/>
+        <w:ind w:left="700"/>
+        <w:rPr>
+          <w:rFonts w:ascii="Montserrat" w:hAnsi="Montserrat"/>
+          <w:color w:val="1A1A1A"/>
+          <w:sz w:val="22"/>
+        </w:rPr>
+      </w:pPr>
+      <w:r>
+        <w:rPr>
+          <w:rFonts w:ascii="Montserrat" w:hAnsi="Montserrat"/>
+          <w:color w:val="1A1A1A"/>
+          <w:sz w:val="22"/>
+        </w:rPr>
         <w:t>Historico de alteracoes: o mesmo Ver historico ja disponivel em cada formulario vinculado a esse projeto.</w:t>
       </w:r>
     </w:p>
@@ -19071,16 +19130,16 @@
         </w:rPr>
         <w:lastRenderedPageBreak/>
         <w:drawing>
-          <wp:inline distT="0" distB="0" distL="0" distR="0" wp14:anchorId="2950D338" wp14:editId="1D0E11AC">
-            <wp:extent cx="5303520" cy="6875734"/>
-            <wp:effectExtent l="19050" t="19050" r="11430" b="20955"/>
-            <wp:docPr id="264019860" name="Imagem 52"/>
+          <wp:inline distT="0" distB="0" distL="0" distR="0" wp14:anchorId="16A7FB19" wp14:editId="08B26AE4">
+            <wp:extent cx="5303520" cy="7628836"/>
+            <wp:effectExtent l="19050" t="19050" r="11430" b="10795"/>
+            <wp:docPr id="307747033" name="Imagem 52"/>
             <wp:cNvGraphicFramePr/>
             <a:graphic xmlns:a="http://schemas.openxmlformats.org/drawingml/2006/main">
               <a:graphicData uri="http://schemas.openxmlformats.org/drawingml/2006/picture">
                 <pic:pic xmlns:pic="http://schemas.openxmlformats.org/drawingml/2006/picture">
                   <pic:nvPicPr>
-                    <pic:cNvPr id="264019860" name=""/>
+                    <pic:cNvPr id="307747033" name=""/>
                     <pic:cNvPicPr/>
                   </pic:nvPicPr>
                   <pic:blipFill>
@@ -19098,7 +19157,7 @@
                   <pic:spPr>
                     <a:xfrm>
                       <a:off x="0" y="0"/>
-                      <a:ext cx="5303520" cy="6875734"/>
+                      <a:ext cx="5303520" cy="7628836"/>
                     </a:xfrm>
                     <a:prstGeom prst="rect">
                       <a:avLst/>
@@ -19134,7 +19193,7 @@
           <w:color w:val="6A6A70"/>
           <w:sz w:val="19"/>
         </w:rPr>
-        <w:t>Ficha do Projeto: dados do cadastro, situacao atual, progresso do ciclo de vida e cronograma do TAP.</w:t>
+        <w:t>Ficha do Projeto: dados do cadastro, saude do projeto, situacao atual, progresso do ciclo de vida e cronograma do TAP.</w:t>
       </w:r>
     </w:p>
     <w:p>
@@ -19155,6 +19214,28 @@
           <w:color w:val="6A6A70"/>
           <w:sz w:val="21"/>
         </w:rPr>
+        <w:lastRenderedPageBreak/>
+        <w:t>Como o selo de saude e calculado: compara tres sinais - a situacao do projeto esta Atrasado no Relatorio de Situacao; existe pelo menos um marco ativo (nao Concluido/Cancelado) cuja data-alvo ja passou (mesma definicao usada no indicador Marcos no prazo do Relatorio de Resultados, secao 6.7 - o que conta e a data-alvo, nao o status manual do marco); e o custo realizado ultrapassa o estimado no TAP. Dois ou mais sinais ruins = Critico; um sinal = Atencao; nenhum = Normal. Projetos Concluido/Cancelado mostram Encerrado, e projetos sem nenhuma linha no Relatorio de Situacao mostram Sem dados - nunca inventa um status a partir de dado ausente. A mesma coluna Saude aparece na tabela Visao atual por projeto do Painel Executivo (secao 6.4), com o mesmo calculo.</w:t>
+      </w:r>
+    </w:p>
+    <w:p>
+      <w:pPr>
+        <w:spacing w:before="160" w:after="200"/>
+        <w:ind w:left="283"/>
+        <w:rPr>
+          <w:rFonts w:ascii="Montserrat" w:hAnsi="Montserrat"/>
+          <w:i/>
+          <w:color w:val="6A6A70"/>
+          <w:sz w:val="21"/>
+        </w:rPr>
+      </w:pPr>
+      <w:r>
+        <w:rPr>
+          <w:rFonts w:ascii="Montserrat" w:hAnsi="Montserrat"/>
+          <w:i/>
+          <w:color w:val="6A6A70"/>
+          <w:sz w:val="21"/>
+        </w:rPr>
         <w:t>Cada secao mostra um estado vazio proprio quando nao ha dado ainda (ex.: Nenhum TAP encontrado para este projeto ainda) - nunca um erro, apenas indica que aquela etapa ainda nao foi preenchida.</w:t>
       </w:r>
     </w:p>
@@ -19169,7 +19250,7 @@
           <w:sz w:val="27"/>
         </w:rPr>
       </w:pPr>
-      <w:bookmarkStart w:id="43" w:name="_Toc239322545"/>
+      <w:bookmarkStart w:id="43" w:name="_Toc239326895"/>
       <w:r>
         <w:rPr>
           <w:rFonts w:ascii="Montserrat" w:hAnsi="Montserrat"/>
@@ -19177,7 +19258,6 @@
           <w:color w:val="B91D2E"/>
           <w:sz w:val="27"/>
         </w:rPr>
-        <w:lastRenderedPageBreak/>
         <w:t>6.5 Ambiente de Treino</w:t>
       </w:r>
       <w:bookmarkEnd w:id="43"/>
@@ -19308,6 +19388,7 @@
           <w:color w:val="6A6A70"/>
           <w:sz w:val="21"/>
         </w:rPr>
+        <w:lastRenderedPageBreak/>
         <w:t>Assim como as outras acoes exclusivas de Admin, a Edge Function confere o papel do usuario direto no banco de producao antes de fazer qualquer alteracao - nao basta ver o botao na tela.</w:t>
       </w:r>
     </w:p>
@@ -19322,7 +19403,7 @@
           <w:sz w:val="27"/>
         </w:rPr>
       </w:pPr>
-      <w:bookmarkStart w:id="44" w:name="_Toc239322546"/>
+      <w:bookmarkStart w:id="44" w:name="_Toc239326896"/>
       <w:r>
         <w:rPr>
           <w:rFonts w:ascii="Montserrat" w:hAnsi="Montserrat"/>
@@ -19445,7 +19526,6 @@
           <w:color w:val="1A1A1A"/>
           <w:sz w:val="22"/>
         </w:rPr>
-        <w:lastRenderedPageBreak/>
         <w:t>Retencao (dias, opcional): depois de quantos dias os backups antigos podem ser descartados; vazio mantem tudo indefinidamente.</w:t>
       </w:r>
     </w:p>
@@ -19602,6 +19682,7 @@
           <w:color w:val="1A1A1A"/>
           <w:sz w:val="22"/>
         </w:rPr>
+        <w:lastRenderedPageBreak/>
         <w:t>Por ultimo, um bloco Metas dos indicadores estrategicos define a meta em % de cada um dos 3 indicadores do Relatorio de Resultados (secao 6.7) - Marcos no prazo, Projetos dentro do orcamento e Entraves resolvidos. Enquanto uma meta ficar vazia, o cartao correspondente mostra Meta nao definida em vez de um selo de status.</w:t>
       </w:r>
     </w:p>
@@ -19615,16 +19696,16 @@
           <w:noProof/>
         </w:rPr>
         <w:drawing>
-          <wp:inline distT="0" distB="0" distL="0" distR="0" wp14:anchorId="5AC7B559" wp14:editId="29E6B7AB">
+          <wp:inline distT="0" distB="0" distL="0" distR="0" wp14:anchorId="69E864F7" wp14:editId="21008074">
             <wp:extent cx="5303520" cy="1351384"/>
             <wp:effectExtent l="19050" t="19050" r="11430" b="20320"/>
-            <wp:docPr id="1676620157" name="Imagem 53"/>
+            <wp:docPr id="51727168" name="Imagem 53"/>
             <wp:cNvGraphicFramePr/>
             <a:graphic xmlns:a="http://schemas.openxmlformats.org/drawingml/2006/main">
               <a:graphicData uri="http://schemas.openxmlformats.org/drawingml/2006/picture">
                 <pic:pic xmlns:pic="http://schemas.openxmlformats.org/drawingml/2006/picture">
                   <pic:nvPicPr>
-                    <pic:cNvPr id="1676620157" name=""/>
+                    <pic:cNvPr id="51727168" name=""/>
                     <pic:cNvPicPr/>
                   </pic:nvPicPr>
                   <pic:blipFill>
@@ -19692,7 +19773,7 @@
           <w:sz w:val="27"/>
         </w:rPr>
       </w:pPr>
-      <w:bookmarkStart w:id="45" w:name="_Toc239322547"/>
+      <w:bookmarkStart w:id="45" w:name="_Toc239326897"/>
       <w:r>
         <w:rPr>
           <w:rFonts w:ascii="Montserrat" w:hAnsi="Montserrat"/>
@@ -19700,7 +19781,6 @@
           <w:color w:val="B91D2E"/>
           <w:sz w:val="27"/>
         </w:rPr>
-        <w:lastRenderedPageBreak/>
         <w:t>6.7 Relatorio de Resultados</w:t>
       </w:r>
       <w:bookmarkEnd w:id="45"/>
@@ -19805,16 +19885,16 @@
           <w:noProof/>
         </w:rPr>
         <w:drawing>
-          <wp:inline distT="0" distB="0" distL="0" distR="0" wp14:anchorId="1BE0A0D1" wp14:editId="6A1EE491">
+          <wp:inline distT="0" distB="0" distL="0" distR="0" wp14:anchorId="1A8DE161" wp14:editId="58E481C9">
             <wp:extent cx="5303520" cy="1422793"/>
             <wp:effectExtent l="19050" t="19050" r="11430" b="25400"/>
-            <wp:docPr id="2126665728" name="Imagem 54"/>
+            <wp:docPr id="1278264165" name="Imagem 54"/>
             <wp:cNvGraphicFramePr/>
             <a:graphic xmlns:a="http://schemas.openxmlformats.org/drawingml/2006/main">
               <a:graphicData uri="http://schemas.openxmlformats.org/drawingml/2006/picture">
                 <pic:pic xmlns:pic="http://schemas.openxmlformats.org/drawingml/2006/picture">
                   <pic:nvPicPr>
-                    <pic:cNvPr id="2126665728" name=""/>
+                    <pic:cNvPr id="1278264165" name=""/>
                     <pic:cNvPicPr/>
                   </pic:nvPicPr>
                   <pic:blipFill>
@@ -19889,6 +19969,7 @@
           <w:color w:val="6A6A70"/>
           <w:sz w:val="21"/>
         </w:rPr>
+        <w:lastRenderedPageBreak/>
         <w:t>Meta e selo de status (Normal/Atencao/Critico): cada indicador compara o realizado com a meta definida pelo Admin (secao 6.3). Sem meta definida, o cartao mostra Meta nao definida em vez de um selo - nunca inventa um status. Com meta definida: Normal na meta ou acima; Atencao ate 15 pontos percentuais abaixo da meta; Critico alem disso.</w:t>
       </w:r>
     </w:p>
@@ -19931,17 +20012,7 @@
           <w:color w:val="6A6A70"/>
           <w:sz w:val="21"/>
         </w:rPr>
-        <w:t xml:space="preserve">Marcos no prazo nao e o mesmo que concluido no prazo: o sistema guarda a data-alvo do marco, nao uma data separada de quando ele foi de fato concluido - por isso o indicador mede ausencia de atraso atual, o dado mais </w:t>
-      </w:r>
-      <w:r>
-        <w:rPr>
-          <w:rFonts w:ascii="Montserrat" w:hAnsi="Montserrat"/>
-          <w:i/>
-          <w:color w:val="6A6A70"/>
-          <w:sz w:val="21"/>
-        </w:rPr>
-        <w:lastRenderedPageBreak/>
-        <w:t>honesto disponivel hoje. Da mesma forma, Projetos dentro do orcamento e Entraves resolvidos aparecem como travessao (-) quando nao ha dado suficiente para calcular, em vez de mostrar um numero sem base.</w:t>
+        <w:t>Marcos no prazo nao e o mesmo que concluido no prazo: o sistema guarda a data-alvo do marco, nao uma data separada de quando ele foi de fato concluido - por isso o indicador mede ausencia de atraso atual, o dado mais honesto disponivel hoje. Da mesma forma, Projetos dentro do orcamento e Entraves resolvidos aparecem como travessao (-) quando nao ha dado suficiente para calcular, em vez de mostrar um numero sem base.</w:t>
       </w:r>
     </w:p>
     <w:p>
@@ -19978,16 +20049,16 @@
           <w:noProof/>
         </w:rPr>
         <w:drawing>
-          <wp:inline distT="0" distB="0" distL="0" distR="0" wp14:anchorId="601EB1BF" wp14:editId="54D71766">
+          <wp:inline distT="0" distB="0" distL="0" distR="0" wp14:anchorId="06AC0DF4" wp14:editId="15E81807">
             <wp:extent cx="5303520" cy="1841050"/>
             <wp:effectExtent l="19050" t="19050" r="11430" b="26035"/>
-            <wp:docPr id="1122850467" name="Imagem 55"/>
+            <wp:docPr id="1654279155" name="Imagem 55"/>
             <wp:cNvGraphicFramePr/>
             <a:graphic xmlns:a="http://schemas.openxmlformats.org/drawingml/2006/main">
               <a:graphicData uri="http://schemas.openxmlformats.org/drawingml/2006/picture">
                 <pic:pic xmlns:pic="http://schemas.openxmlformats.org/drawingml/2006/picture">
                   <pic:nvPicPr>
-                    <pic:cNvPr id="1122850467" name=""/>
+                    <pic:cNvPr id="1654279155" name=""/>
                     <pic:cNvPicPr/>
                   </pic:nvPicPr>
                   <pic:blipFill>
@@ -20104,7 +20175,16 @@
           <w:color w:val="1A1A1A"/>
           <w:sz w:val="22"/>
         </w:rPr>
-        <w:t>Exportar PDF: abre a caixa de impressao do navegador com o conteudo da pagina pronto para salvar como PDF - mesmo mecanismo Imprimir ja usado nos demais relatorios (esconde a barra de autenticacao e os botoes antes de imprimir).</w:t>
+        <w:t xml:space="preserve">Exportar PDF: abre a caixa de impressao do navegador com o conteudo da pagina pronto para salvar como PDF - mesmo mecanismo Imprimir ja </w:t>
+      </w:r>
+      <w:r>
+        <w:rPr>
+          <w:rFonts w:ascii="Montserrat" w:hAnsi="Montserrat"/>
+          <w:color w:val="1A1A1A"/>
+          <w:sz w:val="22"/>
+        </w:rPr>
+        <w:lastRenderedPageBreak/>
+        <w:t>usado nos demais relatorios (esconde a barra de autenticacao e os botoes antes de imprimir).</w:t>
       </w:r>
     </w:p>
     <w:p>
@@ -20141,16 +20221,16 @@
           <w:noProof/>
         </w:rPr>
         <w:drawing>
-          <wp:inline distT="0" distB="0" distL="0" distR="0" wp14:anchorId="209D853E" wp14:editId="08C9DCE3">
+          <wp:inline distT="0" distB="0" distL="0" distR="0" wp14:anchorId="466E850D" wp14:editId="1EE6BF49">
             <wp:extent cx="5303520" cy="303041"/>
             <wp:effectExtent l="19050" t="19050" r="11430" b="20955"/>
-            <wp:docPr id="1514105913" name="Imagem 56"/>
+            <wp:docPr id="1710624756" name="Imagem 56"/>
             <wp:cNvGraphicFramePr/>
             <a:graphic xmlns:a="http://schemas.openxmlformats.org/drawingml/2006/main">
               <a:graphicData uri="http://schemas.openxmlformats.org/drawingml/2006/picture">
                 <pic:pic xmlns:pic="http://schemas.openxmlformats.org/drawingml/2006/picture">
                   <pic:nvPicPr>
-                    <pic:cNvPr id="1514105913" name=""/>
+                    <pic:cNvPr id="1710624756" name=""/>
                     <pic:cNvPicPr/>
                   </pic:nvPicPr>
                   <pic:blipFill>
@@ -20216,18 +20296,17 @@
         <w:rPr>
           <w:noProof/>
         </w:rPr>
-        <w:lastRenderedPageBreak/>
         <w:drawing>
-          <wp:inline distT="0" distB="0" distL="0" distR="0" wp14:anchorId="76EAA49F" wp14:editId="6595D9FD">
+          <wp:inline distT="0" distB="0" distL="0" distR="0" wp14:anchorId="00CB1E43" wp14:editId="3467379A">
             <wp:extent cx="5303520" cy="2983005"/>
             <wp:effectExtent l="19050" t="19050" r="11430" b="27305"/>
-            <wp:docPr id="1875282869" name="Imagem 57"/>
+            <wp:docPr id="38549841" name="Imagem 57"/>
             <wp:cNvGraphicFramePr/>
             <a:graphic xmlns:a="http://schemas.openxmlformats.org/drawingml/2006/main">
               <a:graphicData uri="http://schemas.openxmlformats.org/drawingml/2006/picture">
                 <pic:pic xmlns:pic="http://schemas.openxmlformats.org/drawingml/2006/picture">
                   <pic:nvPicPr>
-                    <pic:cNvPr id="1875282869" name=""/>
+                    <pic:cNvPr id="38549841" name=""/>
                     <pic:cNvPicPr/>
                   </pic:nvPicPr>
                   <pic:blipFill>
@@ -20299,7 +20378,7 @@
           <w:sz w:val="34"/>
         </w:rPr>
       </w:pPr>
-      <w:bookmarkStart w:id="46" w:name="_Toc239322548"/>
+      <w:bookmarkStart w:id="46" w:name="_Toc239326898"/>
       <w:r>
         <w:rPr>
           <w:rFonts w:ascii="Montserrat" w:hAnsi="Montserrat"/>
@@ -20543,7 +20622,7 @@
           <w:sz w:val="34"/>
         </w:rPr>
       </w:pPr>
-      <w:bookmarkStart w:id="47" w:name="_Toc239322549"/>
+      <w:bookmarkStart w:id="47" w:name="_Toc239326899"/>
       <w:r>
         <w:rPr>
           <w:rFonts w:ascii="Montserrat" w:hAnsi="Montserrat"/>
@@ -22331,7 +22410,7 @@
 <file path=word/numbering.xml><?xml version="1.0" encoding="utf-8"?>
 <w:numbering xmlns:wpc="http://schemas.microsoft.com/office/word/2010/wordprocessingCanvas" xmlns:cx="http://schemas.microsoft.com/office/drawing/2014/chartex" xmlns:cx1="http://schemas.microsoft.com/office/drawing/2015/9/8/chartex" xmlns:cx2="http://schemas.microsoft.com/office/drawing/2015/10/21/chartex" xmlns:cx3="http://schemas.microsoft.com/office/drawing/2016/5/9/chartex" xmlns:cx4="http://schemas.microsoft.com/office/drawing/2016/5/10/chartex" xmlns:cx5="http://schemas.microsoft.com/office/drawing/2016/5/11/chartex" xmlns:cx6="http://schemas.microsoft.com/office/drawing/2016/5/12/chartex" xmlns:cx7="http://schemas.microsoft.com/office/drawing/2016/5/13/chartex" xmlns:cx8="http://schemas.microsoft.com/office/drawing/2016/5/14/chartex" xmlns:mc="http://schemas.openxmlformats.org/markup-compatibility/2006" xmlns:aink="http://schemas.microsoft.com/office/drawing/2016/ink" xmlns:am3d="http://schemas.microsoft.com/office/drawing/2017/model3d" xmlns:o="urn:schemas-microsoft-com:office:office" xmlns:oel="http://schemas.microsoft.com/office/2019/extlst" xmlns:r="http://schemas.openxmlformats.org/officeDocument/2006/relationships" xmlns:m="http://schemas.openxmlformats.org/officeDocument/2006/math" xmlns:v="urn:schemas-microsoft-com:vml" xmlns:wp14="http://schemas.microsoft.com/office/word/2010/wordprocessingDrawing" xmlns:wp="http://schemas.openxmlformats.org/drawingml/2006/wordprocessingDrawing" xmlns:w10="urn:schemas-microsoft-com:office:word" xmlns:w="http://schemas.openxmlformats.org/wordprocessingml/2006/main" xmlns:w14="http://schemas.microsoft.com/office/word/2010/wordml" xmlns:w15="http://schemas.microsoft.com/office/word/2012/wordml" xmlns:w16cex="http://schemas.microsoft.com/office/word/2018/wordml/cex" xmlns:w16cid="http://schemas.microsoft.com/office/word/2016/wordml/cid" xmlns:w16="http://schemas.microsoft.com/office/word/2018/wordml" xmlns:w16du="http://schemas.microsoft.com/office/word/2023/wordml/word16du" xmlns:w16sdtdh="http://schemas.microsoft.com/office/word/2020/wordml/sdtdatahash" xmlns:w16sdtfl="http://schemas.microsoft.com/office/word/2024/wordml/sdtformatlock" xmlns:w16se="http://schemas.microsoft.com/office/word/2015/wordml/symex" xmlns:wpg="http://schemas.microsoft.com/office/word/2010/wordprocessingGroup" xmlns:wpi="http://schemas.microsoft.com/office/word/2010/wordprocessingInk" xmlns:wne="http://schemas.microsoft.com/office/word/2006/wordml" xmlns:wps="http://schemas.microsoft.com/office/word/2010/wordprocessingShape" mc:Ignorable="w14 w15 w16se w16cid w16 w16cex w16sdtdh w16sdtfl w16du wp14">
   <w:abstractNum w:abstractNumId="0" w15:restartNumberingAfterBreak="0">
-    <w:nsid w:val="01873837"/>
+    <w:nsid w:val="00D87FF1"/>
     <w:multiLevelType w:val="singleLevel"/>
     <w:tmpl w:val="04160001"/>
     <w:lvl w:ilvl="0">
@@ -22348,7 +22427,7 @@
     </w:lvl>
   </w:abstractNum>
   <w:abstractNum w:abstractNumId="1" w15:restartNumberingAfterBreak="0">
-    <w:nsid w:val="04D46F88"/>
+    <w:nsid w:val="02CC753D"/>
     <w:multiLevelType w:val="singleLevel"/>
     <w:tmpl w:val="04160001"/>
     <w:lvl w:ilvl="0">
@@ -22365,7 +22444,7 @@
     </w:lvl>
   </w:abstractNum>
   <w:abstractNum w:abstractNumId="2" w15:restartNumberingAfterBreak="0">
-    <w:nsid w:val="04E568D3"/>
+    <w:nsid w:val="03EC224A"/>
     <w:multiLevelType w:val="singleLevel"/>
     <w:tmpl w:val="04160001"/>
     <w:lvl w:ilvl="0">
@@ -22382,7 +22461,7 @@
     </w:lvl>
   </w:abstractNum>
   <w:abstractNum w:abstractNumId="3" w15:restartNumberingAfterBreak="0">
-    <w:nsid w:val="0753235D"/>
+    <w:nsid w:val="05356DE4"/>
     <w:multiLevelType w:val="singleLevel"/>
     <w:tmpl w:val="04160001"/>
     <w:lvl w:ilvl="0">
@@ -22399,7 +22478,7 @@
     </w:lvl>
   </w:abstractNum>
   <w:abstractNum w:abstractNumId="4" w15:restartNumberingAfterBreak="0">
-    <w:nsid w:val="0D4D7A80"/>
+    <w:nsid w:val="0EFE691A"/>
     <w:multiLevelType w:val="singleLevel"/>
     <w:tmpl w:val="04160001"/>
     <w:lvl w:ilvl="0">
@@ -22416,7 +22495,7 @@
     </w:lvl>
   </w:abstractNum>
   <w:abstractNum w:abstractNumId="5" w15:restartNumberingAfterBreak="0">
-    <w:nsid w:val="0DC73F11"/>
+    <w:nsid w:val="1B733A1B"/>
     <w:multiLevelType w:val="singleLevel"/>
     <w:tmpl w:val="04160001"/>
     <w:lvl w:ilvl="0">
@@ -22433,7 +22512,7 @@
     </w:lvl>
   </w:abstractNum>
   <w:abstractNum w:abstractNumId="6" w15:restartNumberingAfterBreak="0">
-    <w:nsid w:val="12EC216D"/>
+    <w:nsid w:val="1B734A7A"/>
     <w:multiLevelType w:val="singleLevel"/>
     <w:tmpl w:val="04160001"/>
     <w:lvl w:ilvl="0">
@@ -22450,7 +22529,7 @@
     </w:lvl>
   </w:abstractNum>
   <w:abstractNum w:abstractNumId="7" w15:restartNumberingAfterBreak="0">
-    <w:nsid w:val="16737C95"/>
+    <w:nsid w:val="1CF3567A"/>
     <w:multiLevelType w:val="singleLevel"/>
     <w:tmpl w:val="04160001"/>
     <w:lvl w:ilvl="0">
@@ -22467,7 +22546,7 @@
     </w:lvl>
   </w:abstractNum>
   <w:abstractNum w:abstractNumId="8" w15:restartNumberingAfterBreak="0">
-    <w:nsid w:val="17A07CCB"/>
+    <w:nsid w:val="1E304943"/>
     <w:multiLevelType w:val="singleLevel"/>
     <w:tmpl w:val="04160001"/>
     <w:lvl w:ilvl="0">
@@ -22484,7 +22563,7 @@
     </w:lvl>
   </w:abstractNum>
   <w:abstractNum w:abstractNumId="9" w15:restartNumberingAfterBreak="0">
-    <w:nsid w:val="193714DB"/>
+    <w:nsid w:val="1F117414"/>
     <w:multiLevelType w:val="singleLevel"/>
     <w:tmpl w:val="04160001"/>
     <w:lvl w:ilvl="0">
@@ -22501,7 +22580,7 @@
     </w:lvl>
   </w:abstractNum>
   <w:abstractNum w:abstractNumId="10" w15:restartNumberingAfterBreak="0">
-    <w:nsid w:val="1FF405FA"/>
+    <w:nsid w:val="2386099A"/>
     <w:multiLevelType w:val="singleLevel"/>
     <w:tmpl w:val="04160001"/>
     <w:lvl w:ilvl="0">
@@ -22518,7 +22597,7 @@
     </w:lvl>
   </w:abstractNum>
   <w:abstractNum w:abstractNumId="11" w15:restartNumberingAfterBreak="0">
-    <w:nsid w:val="289C32C5"/>
+    <w:nsid w:val="23DC7647"/>
     <w:multiLevelType w:val="singleLevel"/>
     <w:tmpl w:val="04160001"/>
     <w:lvl w:ilvl="0">
@@ -22535,7 +22614,7 @@
     </w:lvl>
   </w:abstractNum>
   <w:abstractNum w:abstractNumId="12" w15:restartNumberingAfterBreak="0">
-    <w:nsid w:val="302D7BC4"/>
+    <w:nsid w:val="23E24662"/>
     <w:multiLevelType w:val="singleLevel"/>
     <w:tmpl w:val="04160001"/>
     <w:lvl w:ilvl="0">
@@ -22552,7 +22631,7 @@
     </w:lvl>
   </w:abstractNum>
   <w:abstractNum w:abstractNumId="13" w15:restartNumberingAfterBreak="0">
-    <w:nsid w:val="35F4028B"/>
+    <w:nsid w:val="27290AB7"/>
     <w:multiLevelType w:val="singleLevel"/>
     <w:tmpl w:val="04160001"/>
     <w:lvl w:ilvl="0">
@@ -22569,7 +22648,7 @@
     </w:lvl>
   </w:abstractNum>
   <w:abstractNum w:abstractNumId="14" w15:restartNumberingAfterBreak="0">
-    <w:nsid w:val="39C27569"/>
+    <w:nsid w:val="27396104"/>
     <w:multiLevelType w:val="singleLevel"/>
     <w:tmpl w:val="04160001"/>
     <w:lvl w:ilvl="0">
@@ -22586,7 +22665,7 @@
     </w:lvl>
   </w:abstractNum>
   <w:abstractNum w:abstractNumId="15" w15:restartNumberingAfterBreak="0">
-    <w:nsid w:val="39DA119E"/>
+    <w:nsid w:val="332A1073"/>
     <w:multiLevelType w:val="singleLevel"/>
     <w:tmpl w:val="04160001"/>
     <w:lvl w:ilvl="0">
@@ -22603,7 +22682,7 @@
     </w:lvl>
   </w:abstractNum>
   <w:abstractNum w:abstractNumId="16" w15:restartNumberingAfterBreak="0">
-    <w:nsid w:val="42987391"/>
+    <w:nsid w:val="338B0E9A"/>
     <w:multiLevelType w:val="singleLevel"/>
     <w:tmpl w:val="04160001"/>
     <w:lvl w:ilvl="0">
@@ -22620,7 +22699,7 @@
     </w:lvl>
   </w:abstractNum>
   <w:abstractNum w:abstractNumId="17" w15:restartNumberingAfterBreak="0">
-    <w:nsid w:val="4AF60AF9"/>
+    <w:nsid w:val="36837A65"/>
     <w:multiLevelType w:val="singleLevel"/>
     <w:tmpl w:val="04160001"/>
     <w:lvl w:ilvl="0">
@@ -22637,7 +22716,7 @@
     </w:lvl>
   </w:abstractNum>
   <w:abstractNum w:abstractNumId="18" w15:restartNumberingAfterBreak="0">
-    <w:nsid w:val="4E4E55AA"/>
+    <w:nsid w:val="3D2A26E8"/>
     <w:multiLevelType w:val="singleLevel"/>
     <w:tmpl w:val="04160001"/>
     <w:lvl w:ilvl="0">
@@ -22654,7 +22733,7 @@
     </w:lvl>
   </w:abstractNum>
   <w:abstractNum w:abstractNumId="19" w15:restartNumberingAfterBreak="0">
-    <w:nsid w:val="4FB51D77"/>
+    <w:nsid w:val="3F197014"/>
     <w:multiLevelType w:val="singleLevel"/>
     <w:tmpl w:val="04160001"/>
     <w:lvl w:ilvl="0">
@@ -22671,7 +22750,7 @@
     </w:lvl>
   </w:abstractNum>
   <w:abstractNum w:abstractNumId="20" w15:restartNumberingAfterBreak="0">
-    <w:nsid w:val="50D94CC9"/>
+    <w:nsid w:val="429630AF"/>
     <w:multiLevelType w:val="singleLevel"/>
     <w:tmpl w:val="04160001"/>
     <w:lvl w:ilvl="0">
@@ -22688,7 +22767,7 @@
     </w:lvl>
   </w:abstractNum>
   <w:abstractNum w:abstractNumId="21" w15:restartNumberingAfterBreak="0">
-    <w:nsid w:val="52804235"/>
+    <w:nsid w:val="4C0068E5"/>
     <w:multiLevelType w:val="singleLevel"/>
     <w:tmpl w:val="04160001"/>
     <w:lvl w:ilvl="0">
@@ -22705,7 +22784,7 @@
     </w:lvl>
   </w:abstractNum>
   <w:abstractNum w:abstractNumId="22" w15:restartNumberingAfterBreak="0">
-    <w:nsid w:val="53F05C78"/>
+    <w:nsid w:val="4F9F5155"/>
     <w:multiLevelType w:val="singleLevel"/>
     <w:tmpl w:val="04160001"/>
     <w:lvl w:ilvl="0">
@@ -22722,7 +22801,7 @@
     </w:lvl>
   </w:abstractNum>
   <w:abstractNum w:abstractNumId="23" w15:restartNumberingAfterBreak="0">
-    <w:nsid w:val="546039E8"/>
+    <w:nsid w:val="53007303"/>
     <w:multiLevelType w:val="singleLevel"/>
     <w:tmpl w:val="04160001"/>
     <w:lvl w:ilvl="0">
@@ -22739,7 +22818,7 @@
     </w:lvl>
   </w:abstractNum>
   <w:abstractNum w:abstractNumId="24" w15:restartNumberingAfterBreak="0">
-    <w:nsid w:val="5B580326"/>
+    <w:nsid w:val="581D18A2"/>
     <w:multiLevelType w:val="singleLevel"/>
     <w:tmpl w:val="04160001"/>
     <w:lvl w:ilvl="0">
@@ -22756,7 +22835,7 @@
     </w:lvl>
   </w:abstractNum>
   <w:abstractNum w:abstractNumId="25" w15:restartNumberingAfterBreak="0">
-    <w:nsid w:val="5F8B1F78"/>
+    <w:nsid w:val="6156737F"/>
     <w:multiLevelType w:val="singleLevel"/>
     <w:tmpl w:val="04160001"/>
     <w:lvl w:ilvl="0">
@@ -22773,7 +22852,7 @@
     </w:lvl>
   </w:abstractNum>
   <w:abstractNum w:abstractNumId="26" w15:restartNumberingAfterBreak="0">
-    <w:nsid w:val="608647C8"/>
+    <w:nsid w:val="64DA59BA"/>
     <w:multiLevelType w:val="singleLevel"/>
     <w:tmpl w:val="04160001"/>
     <w:lvl w:ilvl="0">
@@ -22790,7 +22869,7 @@
     </w:lvl>
   </w:abstractNum>
   <w:abstractNum w:abstractNumId="27" w15:restartNumberingAfterBreak="0">
-    <w:nsid w:val="64665D29"/>
+    <w:nsid w:val="6C262F31"/>
     <w:multiLevelType w:val="singleLevel"/>
     <w:tmpl w:val="04160001"/>
     <w:lvl w:ilvl="0">
@@ -22807,7 +22886,7 @@
     </w:lvl>
   </w:abstractNum>
   <w:abstractNum w:abstractNumId="28" w15:restartNumberingAfterBreak="0">
-    <w:nsid w:val="6D0E0E0B"/>
+    <w:nsid w:val="6EAD30E6"/>
     <w:multiLevelType w:val="singleLevel"/>
     <w:tmpl w:val="04160001"/>
     <w:lvl w:ilvl="0">
@@ -22824,7 +22903,7 @@
     </w:lvl>
   </w:abstractNum>
   <w:abstractNum w:abstractNumId="29" w15:restartNumberingAfterBreak="0">
-    <w:nsid w:val="75092B75"/>
+    <w:nsid w:val="725D2842"/>
     <w:multiLevelType w:val="singleLevel"/>
     <w:tmpl w:val="04160001"/>
     <w:lvl w:ilvl="0">
@@ -22841,7 +22920,7 @@
     </w:lvl>
   </w:abstractNum>
   <w:abstractNum w:abstractNumId="30" w15:restartNumberingAfterBreak="0">
-    <w:nsid w:val="75D4278E"/>
+    <w:nsid w:val="731C4BBE"/>
     <w:multiLevelType w:val="singleLevel"/>
     <w:tmpl w:val="04160001"/>
     <w:lvl w:ilvl="0">
@@ -22858,7 +22937,7 @@
     </w:lvl>
   </w:abstractNum>
   <w:abstractNum w:abstractNumId="31" w15:restartNumberingAfterBreak="0">
-    <w:nsid w:val="77A71351"/>
+    <w:nsid w:val="77FF52CB"/>
     <w:multiLevelType w:val="singleLevel"/>
     <w:tmpl w:val="04160001"/>
     <w:lvl w:ilvl="0">
@@ -22875,7 +22954,7 @@
     </w:lvl>
   </w:abstractNum>
   <w:abstractNum w:abstractNumId="32" w15:restartNumberingAfterBreak="0">
-    <w:nsid w:val="77D92212"/>
+    <w:nsid w:val="7B7A3F1C"/>
     <w:multiLevelType w:val="singleLevel"/>
     <w:tmpl w:val="04160001"/>
     <w:lvl w:ilvl="0">
@@ -22891,104 +22970,104 @@
       </w:rPr>
     </w:lvl>
   </w:abstractNum>
-  <w:num w:numId="1" w16cid:durableId="1865558028">
+  <w:num w:numId="1" w16cid:durableId="1348630911">
+    <w:abstractNumId w:val="18"/>
+  </w:num>
+  <w:num w:numId="2" w16cid:durableId="1135180924">
+    <w:abstractNumId w:val="2"/>
+  </w:num>
+  <w:num w:numId="3" w16cid:durableId="1825199703">
+    <w:abstractNumId w:val="5"/>
+  </w:num>
+  <w:num w:numId="4" w16cid:durableId="1110245954">
+    <w:abstractNumId w:val="24"/>
+  </w:num>
+  <w:num w:numId="5" w16cid:durableId="2002269433">
+    <w:abstractNumId w:val="31"/>
+  </w:num>
+  <w:num w:numId="6" w16cid:durableId="768427854">
+    <w:abstractNumId w:val="22"/>
+  </w:num>
+  <w:num w:numId="7" w16cid:durableId="116879285">
+    <w:abstractNumId w:val="20"/>
+  </w:num>
+  <w:num w:numId="8" w16cid:durableId="488442774">
+    <w:abstractNumId w:val="13"/>
+  </w:num>
+  <w:num w:numId="9" w16cid:durableId="626593553">
+    <w:abstractNumId w:val="10"/>
+  </w:num>
+  <w:num w:numId="10" w16cid:durableId="2117172833">
     <w:abstractNumId w:val="7"/>
   </w:num>
-  <w:num w:numId="2" w16cid:durableId="851186651">
-    <w:abstractNumId w:val="24"/>
+  <w:num w:numId="11" w16cid:durableId="2060085021">
+    <w:abstractNumId w:val="4"/>
   </w:num>
-  <w:num w:numId="3" w16cid:durableId="1411926627">
+  <w:num w:numId="12" w16cid:durableId="293096109">
+    <w:abstractNumId w:val="8"/>
+  </w:num>
+  <w:num w:numId="13" w16cid:durableId="831065387">
+    <w:abstractNumId w:val="25"/>
+  </w:num>
+  <w:num w:numId="14" w16cid:durableId="2045404256">
+    <w:abstractNumId w:val="32"/>
+  </w:num>
+  <w:num w:numId="15" w16cid:durableId="256014271">
+    <w:abstractNumId w:val="17"/>
+  </w:num>
+  <w:num w:numId="16" w16cid:durableId="1799760947">
+    <w:abstractNumId w:val="23"/>
+  </w:num>
+  <w:num w:numId="17" w16cid:durableId="1331446198">
+    <w:abstractNumId w:val="15"/>
+  </w:num>
+  <w:num w:numId="18" w16cid:durableId="2133857692">
+    <w:abstractNumId w:val="19"/>
+  </w:num>
+  <w:num w:numId="19" w16cid:durableId="1355690978">
+    <w:abstractNumId w:val="12"/>
+  </w:num>
+  <w:num w:numId="20" w16cid:durableId="776095841">
+    <w:abstractNumId w:val="0"/>
+  </w:num>
+  <w:num w:numId="21" w16cid:durableId="814681657">
+    <w:abstractNumId w:val="21"/>
+  </w:num>
+  <w:num w:numId="22" w16cid:durableId="419176974">
+    <w:abstractNumId w:val="9"/>
+  </w:num>
+  <w:num w:numId="23" w16cid:durableId="2011055711">
+    <w:abstractNumId w:val="27"/>
+  </w:num>
+  <w:num w:numId="24" w16cid:durableId="1935045123">
+    <w:abstractNumId w:val="6"/>
+  </w:num>
+  <w:num w:numId="25" w16cid:durableId="2009088463">
+    <w:abstractNumId w:val="28"/>
+  </w:num>
+  <w:num w:numId="26" w16cid:durableId="122579175">
+    <w:abstractNumId w:val="14"/>
+  </w:num>
+  <w:num w:numId="27" w16cid:durableId="1058937766">
+    <w:abstractNumId w:val="29"/>
+  </w:num>
+  <w:num w:numId="28" w16cid:durableId="1770352970">
+    <w:abstractNumId w:val="26"/>
+  </w:num>
+  <w:num w:numId="29" w16cid:durableId="1999310508">
     <w:abstractNumId w:val="3"/>
   </w:num>
-  <w:num w:numId="4" w16cid:durableId="191000589">
-    <w:abstractNumId w:val="27"/>
-  </w:num>
-  <w:num w:numId="5" w16cid:durableId="1470978130">
-    <w:abstractNumId w:val="2"/>
-  </w:num>
-  <w:num w:numId="6" w16cid:durableId="1286083037">
-    <w:abstractNumId w:val="29"/>
-  </w:num>
-  <w:num w:numId="7" w16cid:durableId="1116948769">
-    <w:abstractNumId w:val="14"/>
-  </w:num>
-  <w:num w:numId="8" w16cid:durableId="1235891306">
-    <w:abstractNumId w:val="32"/>
-  </w:num>
-  <w:num w:numId="9" w16cid:durableId="1632857063">
-    <w:abstractNumId w:val="22"/>
-  </w:num>
-  <w:num w:numId="10" w16cid:durableId="1196889578">
-    <w:abstractNumId w:val="31"/>
-  </w:num>
-  <w:num w:numId="11" w16cid:durableId="2053340977">
-    <w:abstractNumId w:val="17"/>
-  </w:num>
-  <w:num w:numId="12" w16cid:durableId="1529490663">
-    <w:abstractNumId w:val="23"/>
-  </w:num>
-  <w:num w:numId="13" w16cid:durableId="2066448209">
+  <w:num w:numId="30" w16cid:durableId="497694187">
     <w:abstractNumId w:val="11"/>
   </w:num>
-  <w:num w:numId="14" w16cid:durableId="1613435968">
-    <w:abstractNumId w:val="8"/>
+  <w:num w:numId="31" w16cid:durableId="11614356">
+    <w:abstractNumId w:val="16"/>
   </w:num>
-  <w:num w:numId="15" w16cid:durableId="1424956581">
-    <w:abstractNumId w:val="6"/>
-  </w:num>
-  <w:num w:numId="16" w16cid:durableId="678898064">
-    <w:abstractNumId w:val="13"/>
-  </w:num>
-  <w:num w:numId="17" w16cid:durableId="1233275631">
-    <w:abstractNumId w:val="28"/>
-  </w:num>
-  <w:num w:numId="18" w16cid:durableId="246311130">
-    <w:abstractNumId w:val="12"/>
-  </w:num>
-  <w:num w:numId="19" w16cid:durableId="211616957">
+  <w:num w:numId="32" w16cid:durableId="519322006">
     <w:abstractNumId w:val="30"/>
   </w:num>
-  <w:num w:numId="20" w16cid:durableId="2087142558">
-    <w:abstractNumId w:val="10"/>
-  </w:num>
-  <w:num w:numId="21" w16cid:durableId="340200221">
-    <w:abstractNumId w:val="0"/>
-  </w:num>
-  <w:num w:numId="22" w16cid:durableId="57214277">
-    <w:abstractNumId w:val="21"/>
-  </w:num>
-  <w:num w:numId="23" w16cid:durableId="542904585">
-    <w:abstractNumId w:val="15"/>
-  </w:num>
-  <w:num w:numId="24" w16cid:durableId="648629496">
-    <w:abstractNumId w:val="5"/>
-  </w:num>
-  <w:num w:numId="25" w16cid:durableId="1659914905">
-    <w:abstractNumId w:val="4"/>
-  </w:num>
-  <w:num w:numId="26" w16cid:durableId="1807818466">
+  <w:num w:numId="33" w16cid:durableId="1062631405">
     <w:abstractNumId w:val="1"/>
-  </w:num>
-  <w:num w:numId="27" w16cid:durableId="1354695245">
-    <w:abstractNumId w:val="26"/>
-  </w:num>
-  <w:num w:numId="28" w16cid:durableId="1853647971">
-    <w:abstractNumId w:val="19"/>
-  </w:num>
-  <w:num w:numId="29" w16cid:durableId="805046427">
-    <w:abstractNumId w:val="18"/>
-  </w:num>
-  <w:num w:numId="30" w16cid:durableId="1620836395">
-    <w:abstractNumId w:val="9"/>
-  </w:num>
-  <w:num w:numId="31" w16cid:durableId="1255629475">
-    <w:abstractNumId w:val="20"/>
-  </w:num>
-  <w:num w:numId="32" w16cid:durableId="1770810263">
-    <w:abstractNumId w:val="25"/>
-  </w:num>
-  <w:num w:numId="33" w16cid:durableId="1589921894">
-    <w:abstractNumId w:val="16"/>
   </w:num>
 </w:numbering>
 </file>
@@ -23401,7 +23480,7 @@
     <w:link w:val="Ttulo1Char"/>
     <w:uiPriority w:val="9"/>
     <w:qFormat/>
-    <w:rsid w:val="00AD6861"/>
+    <w:rsid w:val="003F56B9"/>
     <w:pPr>
       <w:keepNext/>
       <w:keepLines/>
@@ -23423,7 +23502,7 @@
     <w:uiPriority w:val="9"/>
     <w:unhideWhenUsed/>
     <w:qFormat/>
-    <w:rsid w:val="00AD6861"/>
+    <w:rsid w:val="003F56B9"/>
     <w:pPr>
       <w:keepNext/>
       <w:keepLines/>
@@ -23446,7 +23525,7 @@
     <w:semiHidden/>
     <w:unhideWhenUsed/>
     <w:qFormat/>
-    <w:rsid w:val="00AD6861"/>
+    <w:rsid w:val="003F56B9"/>
     <w:pPr>
       <w:keepNext/>
       <w:keepLines/>
@@ -23469,7 +23548,7 @@
     <w:semiHidden/>
     <w:unhideWhenUsed/>
     <w:qFormat/>
-    <w:rsid w:val="00AD6861"/>
+    <w:rsid w:val="003F56B9"/>
     <w:pPr>
       <w:keepNext/>
       <w:keepLines/>
@@ -23492,7 +23571,7 @@
     <w:semiHidden/>
     <w:unhideWhenUsed/>
     <w:qFormat/>
-    <w:rsid w:val="00AD6861"/>
+    <w:rsid w:val="003F56B9"/>
     <w:pPr>
       <w:keepNext/>
       <w:keepLines/>
@@ -23513,7 +23592,7 @@
     <w:semiHidden/>
     <w:unhideWhenUsed/>
     <w:qFormat/>
-    <w:rsid w:val="00AD6861"/>
+    <w:rsid w:val="003F56B9"/>
     <w:pPr>
       <w:keepNext/>
       <w:keepLines/>
@@ -23536,7 +23615,7 @@
     <w:semiHidden/>
     <w:unhideWhenUsed/>
     <w:qFormat/>
-    <w:rsid w:val="00AD6861"/>
+    <w:rsid w:val="003F56B9"/>
     <w:pPr>
       <w:keepNext/>
       <w:keepLines/>
@@ -23557,7 +23636,7 @@
     <w:semiHidden/>
     <w:unhideWhenUsed/>
     <w:qFormat/>
-    <w:rsid w:val="00AD6861"/>
+    <w:rsid w:val="003F56B9"/>
     <w:pPr>
       <w:keepNext/>
       <w:keepLines/>
@@ -23580,7 +23659,7 @@
     <w:semiHidden/>
     <w:unhideWhenUsed/>
     <w:qFormat/>
-    <w:rsid w:val="00AD6861"/>
+    <w:rsid w:val="003F56B9"/>
     <w:pPr>
       <w:keepNext/>
       <w:keepLines/>
@@ -23624,7 +23703,7 @@
     <w:basedOn w:val="Fontepargpadro"/>
     <w:link w:val="Ttulo1"/>
     <w:uiPriority w:val="9"/>
-    <w:rsid w:val="00AD6861"/>
+    <w:rsid w:val="003F56B9"/>
     <w:rPr>
       <w:rFonts w:asciiTheme="majorHAnsi" w:eastAsiaTheme="majorEastAsia" w:hAnsiTheme="majorHAnsi" w:cstheme="majorBidi"/>
       <w:color w:val="0F4761" w:themeColor="accent1" w:themeShade="BF"/>
@@ -23637,7 +23716,7 @@
     <w:basedOn w:val="Fontepargpadro"/>
     <w:link w:val="Ttulo2"/>
     <w:uiPriority w:val="9"/>
-    <w:rsid w:val="00AD6861"/>
+    <w:rsid w:val="003F56B9"/>
     <w:rPr>
       <w:rFonts w:asciiTheme="majorHAnsi" w:eastAsiaTheme="majorEastAsia" w:hAnsiTheme="majorHAnsi" w:cstheme="majorBidi"/>
       <w:color w:val="0F4761" w:themeColor="accent1" w:themeShade="BF"/>
@@ -23651,7 +23730,7 @@
     <w:link w:val="Ttulo3"/>
     <w:uiPriority w:val="9"/>
     <w:semiHidden/>
-    <w:rsid w:val="00AD6861"/>
+    <w:rsid w:val="003F56B9"/>
     <w:rPr>
       <w:rFonts w:eastAsiaTheme="majorEastAsia" w:cstheme="majorBidi"/>
       <w:color w:val="0F4761" w:themeColor="accent1" w:themeShade="BF"/>
@@ -23665,7 +23744,7 @@
     <w:link w:val="Ttulo4"/>
     <w:uiPriority w:val="9"/>
     <w:semiHidden/>
-    <w:rsid w:val="00AD6861"/>
+    <w:rsid w:val="003F56B9"/>
     <w:rPr>
       <w:rFonts w:eastAsiaTheme="majorEastAsia" w:cstheme="majorBidi"/>
       <w:i/>
@@ -23679,7 +23758,7 @@
     <w:link w:val="Ttulo5"/>
     <w:uiPriority w:val="9"/>
     <w:semiHidden/>
-    <w:rsid w:val="00AD6861"/>
+    <w:rsid w:val="003F56B9"/>
     <w:rPr>
       <w:rFonts w:eastAsiaTheme="majorEastAsia" w:cstheme="majorBidi"/>
       <w:color w:val="0F4761" w:themeColor="accent1" w:themeShade="BF"/>
@@ -23691,7 +23770,7 @@
     <w:link w:val="Ttulo6"/>
     <w:uiPriority w:val="9"/>
     <w:semiHidden/>
-    <w:rsid w:val="00AD6861"/>
+    <w:rsid w:val="003F56B9"/>
     <w:rPr>
       <w:rFonts w:eastAsiaTheme="majorEastAsia" w:cstheme="majorBidi"/>
       <w:i/>
@@ -23705,7 +23784,7 @@
     <w:link w:val="Ttulo7"/>
     <w:uiPriority w:val="9"/>
     <w:semiHidden/>
-    <w:rsid w:val="00AD6861"/>
+    <w:rsid w:val="003F56B9"/>
     <w:rPr>
       <w:rFonts w:eastAsiaTheme="majorEastAsia" w:cstheme="majorBidi"/>
       <w:color w:val="595959" w:themeColor="text1" w:themeTint="A6"/>
@@ -23717,7 +23796,7 @@
     <w:link w:val="Ttulo8"/>
     <w:uiPriority w:val="9"/>
     <w:semiHidden/>
-    <w:rsid w:val="00AD6861"/>
+    <w:rsid w:val="003F56B9"/>
     <w:rPr>
       <w:rFonts w:eastAsiaTheme="majorEastAsia" w:cstheme="majorBidi"/>
       <w:i/>
@@ -23731,7 +23810,7 @@
     <w:link w:val="Ttulo9"/>
     <w:uiPriority w:val="9"/>
     <w:semiHidden/>
-    <w:rsid w:val="00AD6861"/>
+    <w:rsid w:val="003F56B9"/>
     <w:rPr>
       <w:rFonts w:eastAsiaTheme="majorEastAsia" w:cstheme="majorBidi"/>
       <w:color w:val="272727" w:themeColor="text1" w:themeTint="D8"/>
@@ -23744,7 +23823,7 @@
     <w:link w:val="TtuloChar"/>
     <w:uiPriority w:val="10"/>
     <w:qFormat/>
-    <w:rsid w:val="00AD6861"/>
+    <w:rsid w:val="003F56B9"/>
     <w:pPr>
       <w:spacing w:after="80" w:line="240" w:lineRule="auto"/>
       <w:contextualSpacing/>
@@ -23762,7 +23841,7 @@
     <w:basedOn w:val="Fontepargpadro"/>
     <w:link w:val="Ttulo"/>
     <w:uiPriority w:val="10"/>
-    <w:rsid w:val="00AD6861"/>
+    <w:rsid w:val="003F56B9"/>
     <w:rPr>
       <w:rFonts w:asciiTheme="majorHAnsi" w:eastAsiaTheme="majorEastAsia" w:hAnsiTheme="majorHAnsi" w:cstheme="majorBidi"/>
       <w:spacing w:val="-10"/>
@@ -23778,7 +23857,7 @@
     <w:link w:val="SubttuloChar"/>
     <w:uiPriority w:val="11"/>
     <w:qFormat/>
-    <w:rsid w:val="00AD6861"/>
+    <w:rsid w:val="003F56B9"/>
     <w:pPr>
       <w:numPr>
         <w:ilvl w:val="1"/>
@@ -23797,7 +23876,7 @@
     <w:basedOn w:val="Fontepargpadro"/>
     <w:link w:val="Subttulo"/>
     <w:uiPriority w:val="11"/>
-    <w:rsid w:val="00AD6861"/>
+    <w:rsid w:val="003F56B9"/>
     <w:rPr>
       <w:rFonts w:eastAsiaTheme="majorEastAsia" w:cstheme="majorBidi"/>
       <w:color w:val="595959" w:themeColor="text1" w:themeTint="A6"/>
@@ -23813,7 +23892,7 @@
     <w:link w:val="CitaoChar"/>
     <w:uiPriority w:val="29"/>
     <w:qFormat/>
-    <w:rsid w:val="00AD6861"/>
+    <w:rsid w:val="003F56B9"/>
     <w:pPr>
       <w:spacing w:before="160"/>
       <w:jc w:val="center"/>
@@ -23829,7 +23908,7 @@
     <w:basedOn w:val="Fontepargpadro"/>
     <w:link w:val="Citao"/>
     <w:uiPriority w:val="29"/>
-    <w:rsid w:val="00AD6861"/>
+    <w:rsid w:val="003F56B9"/>
     <w:rPr>
       <w:i/>
       <w:iCs/>
@@ -23841,7 +23920,7 @@
     <w:basedOn w:val="Normal"/>
     <w:uiPriority w:val="34"/>
     <w:qFormat/>
-    <w:rsid w:val="00AD6861"/>
+    <w:rsid w:val="003F56B9"/>
     <w:pPr>
       <w:ind w:left="720"/>
       <w:contextualSpacing/>
@@ -23852,7 +23931,7 @@
     <w:basedOn w:val="Fontepargpadro"/>
     <w:uiPriority w:val="21"/>
     <w:qFormat/>
-    <w:rsid w:val="00AD6861"/>
+    <w:rsid w:val="003F56B9"/>
     <w:rPr>
       <w:i/>
       <w:iCs/>
@@ -23866,7 +23945,7 @@
     <w:link w:val="CitaoIntensaChar"/>
     <w:uiPriority w:val="30"/>
     <w:qFormat/>
-    <w:rsid w:val="00AD6861"/>
+    <w:rsid w:val="003F56B9"/>
     <w:pPr>
       <w:pBdr>
         <w:top w:val="single" w:sz="4" w:space="10" w:color="0F4761" w:themeColor="accent1" w:themeShade="BF"/>
@@ -23887,7 +23966,7 @@
     <w:basedOn w:val="Fontepargpadro"/>
     <w:link w:val="CitaoIntensa"/>
     <w:uiPriority w:val="30"/>
-    <w:rsid w:val="00AD6861"/>
+    <w:rsid w:val="003F56B9"/>
     <w:rPr>
       <w:i/>
       <w:iCs/>
@@ -23899,7 +23978,7 @@
     <w:basedOn w:val="Fontepargpadro"/>
     <w:uiPriority w:val="32"/>
     <w:qFormat/>
-    <w:rsid w:val="00AD6861"/>
+    <w:rsid w:val="003F56B9"/>
     <w:rPr>
       <w:b/>
       <w:bCs/>
@@ -23914,7 +23993,7 @@
     <w:link w:val="CabealhoChar"/>
     <w:uiPriority w:val="99"/>
     <w:unhideWhenUsed/>
-    <w:rsid w:val="00AD6861"/>
+    <w:rsid w:val="003F56B9"/>
     <w:pPr>
       <w:tabs>
         <w:tab w:val="center" w:pos="4252"/>
@@ -23928,7 +24007,7 @@
     <w:basedOn w:val="Fontepargpadro"/>
     <w:link w:val="Cabealho"/>
     <w:uiPriority w:val="99"/>
-    <w:rsid w:val="00AD6861"/>
+    <w:rsid w:val="003F56B9"/>
   </w:style>
   <w:style w:type="paragraph" w:styleId="Rodap">
     <w:name w:val="footer"/>
@@ -23936,7 +24015,7 @@
     <w:link w:val="RodapChar"/>
     <w:uiPriority w:val="99"/>
     <w:unhideWhenUsed/>
-    <w:rsid w:val="00AD6861"/>
+    <w:rsid w:val="003F56B9"/>
     <w:pPr>
       <w:tabs>
         <w:tab w:val="center" w:pos="4252"/>
@@ -23950,7 +24029,7 @@
     <w:basedOn w:val="Fontepargpadro"/>
     <w:link w:val="Rodap"/>
     <w:uiPriority w:val="99"/>
-    <w:rsid w:val="00AD6861"/>
+    <w:rsid w:val="003F56B9"/>
   </w:style>
   <w:style w:type="paragraph" w:styleId="Sumrio1">
     <w:name w:val="toc 1"/>
@@ -23959,7 +24038,7 @@
     <w:autoRedefine/>
     <w:uiPriority w:val="39"/>
     <w:unhideWhenUsed/>
-    <w:rsid w:val="00AD6861"/>
+    <w:rsid w:val="003F56B9"/>
     <w:pPr>
       <w:spacing w:after="100"/>
     </w:pPr>
@@ -23971,7 +24050,7 @@
     <w:autoRedefine/>
     <w:uiPriority w:val="39"/>
     <w:unhideWhenUsed/>
-    <w:rsid w:val="00AD6861"/>
+    <w:rsid w:val="003F56B9"/>
     <w:pPr>
       <w:spacing w:after="100"/>
       <w:ind w:left="240"/>

</xml_diff>

<commit_message>
Sincroniza Manual de Uso - anexos da SMP (v2.44)
Espelha a atualizacao do Manual de Uso feita em producao (Passo 7)
documentando a secao Anexos da SMP.

Co-Authored-By: Claude Sonnet 5 <noreply@anthropic.com>
</commit_message>
<xml_diff>
--- a/Manual de Uso - Ferramenta de Gestao de Projetos.docx
+++ b/Manual de Uso - Ferramenta de Gestao de Projetos.docx
@@ -229,7 +229,7 @@
         <w:rPr>
           <w:noProof/>
         </w:rPr>
-        <w:instrText xml:space="preserve"> PAGEREF _Toc239326852 \h </w:instrText>
+        <w:instrText xml:space="preserve"> PAGEREF _Toc239349584 \h </w:instrText>
       </w:r>
       <w:r>
         <w:rPr>
@@ -290,7 +290,7 @@
         <w:rPr>
           <w:noProof/>
         </w:rPr>
-        <w:instrText xml:space="preserve"> PAGEREF _Toc239326853 \h </w:instrText>
+        <w:instrText xml:space="preserve"> PAGEREF _Toc239349585 \h </w:instrText>
       </w:r>
       <w:r>
         <w:rPr>
@@ -351,7 +351,7 @@
         <w:rPr>
           <w:noProof/>
         </w:rPr>
-        <w:instrText xml:space="preserve"> PAGEREF _Toc239326854 \h </w:instrText>
+        <w:instrText xml:space="preserve"> PAGEREF _Toc239349586 \h </w:instrText>
       </w:r>
       <w:r>
         <w:rPr>
@@ -412,7 +412,7 @@
         <w:rPr>
           <w:noProof/>
         </w:rPr>
-        <w:instrText xml:space="preserve"> PAGEREF _Toc239326855 \h </w:instrText>
+        <w:instrText xml:space="preserve"> PAGEREF _Toc239349587 \h </w:instrText>
       </w:r>
       <w:r>
         <w:rPr>
@@ -473,7 +473,7 @@
         <w:rPr>
           <w:noProof/>
         </w:rPr>
-        <w:instrText xml:space="preserve"> PAGEREF _Toc239326856 \h </w:instrText>
+        <w:instrText xml:space="preserve"> PAGEREF _Toc239349588 \h </w:instrText>
       </w:r>
       <w:r>
         <w:rPr>
@@ -534,7 +534,7 @@
         <w:rPr>
           <w:noProof/>
         </w:rPr>
-        <w:instrText xml:space="preserve"> PAGEREF _Toc239326857 \h </w:instrText>
+        <w:instrText xml:space="preserve"> PAGEREF _Toc239349589 \h </w:instrText>
       </w:r>
       <w:r>
         <w:rPr>
@@ -595,7 +595,7 @@
         <w:rPr>
           <w:noProof/>
         </w:rPr>
-        <w:instrText xml:space="preserve"> PAGEREF _Toc239326858 \h </w:instrText>
+        <w:instrText xml:space="preserve"> PAGEREF _Toc239349590 \h </w:instrText>
       </w:r>
       <w:r>
         <w:rPr>
@@ -656,7 +656,7 @@
         <w:rPr>
           <w:noProof/>
         </w:rPr>
-        <w:instrText xml:space="preserve"> PAGEREF _Toc239326859 \h </w:instrText>
+        <w:instrText xml:space="preserve"> PAGEREF _Toc239349591 \h </w:instrText>
       </w:r>
       <w:r>
         <w:rPr>
@@ -717,7 +717,7 @@
         <w:rPr>
           <w:noProof/>
         </w:rPr>
-        <w:instrText xml:space="preserve"> PAGEREF _Toc239326860 \h </w:instrText>
+        <w:instrText xml:space="preserve"> PAGEREF _Toc239349592 \h </w:instrText>
       </w:r>
       <w:r>
         <w:rPr>
@@ -778,7 +778,7 @@
         <w:rPr>
           <w:noProof/>
         </w:rPr>
-        <w:instrText xml:space="preserve"> PAGEREF _Toc239326861 \h </w:instrText>
+        <w:instrText xml:space="preserve"> PAGEREF _Toc239349593 \h </w:instrText>
       </w:r>
       <w:r>
         <w:rPr>
@@ -839,7 +839,7 @@
         <w:rPr>
           <w:noProof/>
         </w:rPr>
-        <w:instrText xml:space="preserve"> PAGEREF _Toc239326862 \h </w:instrText>
+        <w:instrText xml:space="preserve"> PAGEREF _Toc239349594 \h </w:instrText>
       </w:r>
       <w:r>
         <w:rPr>
@@ -900,7 +900,7 @@
         <w:rPr>
           <w:noProof/>
         </w:rPr>
-        <w:instrText xml:space="preserve"> PAGEREF _Toc239326863 \h </w:instrText>
+        <w:instrText xml:space="preserve"> PAGEREF _Toc239349595 \h </w:instrText>
       </w:r>
       <w:r>
         <w:rPr>
@@ -961,7 +961,7 @@
         <w:rPr>
           <w:noProof/>
         </w:rPr>
-        <w:instrText xml:space="preserve"> PAGEREF _Toc239326864 \h </w:instrText>
+        <w:instrText xml:space="preserve"> PAGEREF _Toc239349596 \h </w:instrText>
       </w:r>
       <w:r>
         <w:rPr>
@@ -1022,7 +1022,7 @@
         <w:rPr>
           <w:noProof/>
         </w:rPr>
-        <w:instrText xml:space="preserve"> PAGEREF _Toc239326865 \h </w:instrText>
+        <w:instrText xml:space="preserve"> PAGEREF _Toc239349597 \h </w:instrText>
       </w:r>
       <w:r>
         <w:rPr>
@@ -1083,7 +1083,7 @@
         <w:rPr>
           <w:noProof/>
         </w:rPr>
-        <w:instrText xml:space="preserve"> PAGEREF _Toc239326866 \h </w:instrText>
+        <w:instrText xml:space="preserve"> PAGEREF _Toc239349598 \h </w:instrText>
       </w:r>
       <w:r>
         <w:rPr>
@@ -1144,7 +1144,7 @@
         <w:rPr>
           <w:noProof/>
         </w:rPr>
-        <w:instrText xml:space="preserve"> PAGEREF _Toc239326867 \h </w:instrText>
+        <w:instrText xml:space="preserve"> PAGEREF _Toc239349599 \h </w:instrText>
       </w:r>
       <w:r>
         <w:rPr>
@@ -1205,7 +1205,7 @@
         <w:rPr>
           <w:noProof/>
         </w:rPr>
-        <w:instrText xml:space="preserve"> PAGEREF _Toc239326868 \h </w:instrText>
+        <w:instrText xml:space="preserve"> PAGEREF _Toc239349600 \h </w:instrText>
       </w:r>
       <w:r>
         <w:rPr>
@@ -1266,7 +1266,7 @@
         <w:rPr>
           <w:noProof/>
         </w:rPr>
-        <w:instrText xml:space="preserve"> PAGEREF _Toc239326869 \h </w:instrText>
+        <w:instrText xml:space="preserve"> PAGEREF _Toc239349601 \h </w:instrText>
       </w:r>
       <w:r>
         <w:rPr>
@@ -1327,7 +1327,7 @@
         <w:rPr>
           <w:noProof/>
         </w:rPr>
-        <w:instrText xml:space="preserve"> PAGEREF _Toc239326870 \h </w:instrText>
+        <w:instrText xml:space="preserve"> PAGEREF _Toc239349602 \h </w:instrText>
       </w:r>
       <w:r>
         <w:rPr>
@@ -1388,7 +1388,7 @@
         <w:rPr>
           <w:noProof/>
         </w:rPr>
-        <w:instrText xml:space="preserve"> PAGEREF _Toc239326871 \h </w:instrText>
+        <w:instrText xml:space="preserve"> PAGEREF _Toc239349603 \h </w:instrText>
       </w:r>
       <w:r>
         <w:rPr>
@@ -1449,7 +1449,7 @@
         <w:rPr>
           <w:noProof/>
         </w:rPr>
-        <w:instrText xml:space="preserve"> PAGEREF _Toc239326872 \h </w:instrText>
+        <w:instrText xml:space="preserve"> PAGEREF _Toc239349604 \h </w:instrText>
       </w:r>
       <w:r>
         <w:rPr>
@@ -1510,7 +1510,7 @@
         <w:rPr>
           <w:noProof/>
         </w:rPr>
-        <w:instrText xml:space="preserve"> PAGEREF _Toc239326873 \h </w:instrText>
+        <w:instrText xml:space="preserve"> PAGEREF _Toc239349605 \h </w:instrText>
       </w:r>
       <w:r>
         <w:rPr>
@@ -1571,7 +1571,7 @@
         <w:rPr>
           <w:noProof/>
         </w:rPr>
-        <w:instrText xml:space="preserve"> PAGEREF _Toc239326874 \h </w:instrText>
+        <w:instrText xml:space="preserve"> PAGEREF _Toc239349606 \h </w:instrText>
       </w:r>
       <w:r>
         <w:rPr>
@@ -1632,7 +1632,7 @@
         <w:rPr>
           <w:noProof/>
         </w:rPr>
-        <w:instrText xml:space="preserve"> PAGEREF _Toc239326875 \h </w:instrText>
+        <w:instrText xml:space="preserve"> PAGEREF _Toc239349607 \h </w:instrText>
       </w:r>
       <w:r>
         <w:rPr>
@@ -1693,7 +1693,7 @@
         <w:rPr>
           <w:noProof/>
         </w:rPr>
-        <w:instrText xml:space="preserve"> PAGEREF _Toc239326876 \h </w:instrText>
+        <w:instrText xml:space="preserve"> PAGEREF _Toc239349608 \h </w:instrText>
       </w:r>
       <w:r>
         <w:rPr>
@@ -1755,7 +1755,7 @@
         <w:rPr>
           <w:noProof/>
         </w:rPr>
-        <w:instrText xml:space="preserve"> PAGEREF _Toc239326877 \h </w:instrText>
+        <w:instrText xml:space="preserve"> PAGEREF _Toc239349609 \h </w:instrText>
       </w:r>
       <w:r>
         <w:rPr>
@@ -1816,7 +1816,7 @@
         <w:rPr>
           <w:noProof/>
         </w:rPr>
-        <w:instrText xml:space="preserve"> PAGEREF _Toc239326878 \h </w:instrText>
+        <w:instrText xml:space="preserve"> PAGEREF _Toc239349610 \h </w:instrText>
       </w:r>
       <w:r>
         <w:rPr>
@@ -1877,7 +1877,7 @@
         <w:rPr>
           <w:noProof/>
         </w:rPr>
-        <w:instrText xml:space="preserve"> PAGEREF _Toc239326879 \h </w:instrText>
+        <w:instrText xml:space="preserve"> PAGEREF _Toc239349611 \h </w:instrText>
       </w:r>
       <w:r>
         <w:rPr>
@@ -1938,7 +1938,7 @@
         <w:rPr>
           <w:noProof/>
         </w:rPr>
-        <w:instrText xml:space="preserve"> PAGEREF _Toc239326880 \h </w:instrText>
+        <w:instrText xml:space="preserve"> PAGEREF _Toc239349612 \h </w:instrText>
       </w:r>
       <w:r>
         <w:rPr>
@@ -1999,7 +1999,7 @@
         <w:rPr>
           <w:noProof/>
         </w:rPr>
-        <w:instrText xml:space="preserve"> PAGEREF _Toc239326881 \h </w:instrText>
+        <w:instrText xml:space="preserve"> PAGEREF _Toc239349613 \h </w:instrText>
       </w:r>
       <w:r>
         <w:rPr>
@@ -2060,7 +2060,7 @@
         <w:rPr>
           <w:noProof/>
         </w:rPr>
-        <w:instrText xml:space="preserve"> PAGEREF _Toc239326882 \h </w:instrText>
+        <w:instrText xml:space="preserve"> PAGEREF _Toc239349614 \h </w:instrText>
       </w:r>
       <w:r>
         <w:rPr>
@@ -2121,7 +2121,7 @@
         <w:rPr>
           <w:noProof/>
         </w:rPr>
-        <w:instrText xml:space="preserve"> PAGEREF _Toc239326883 \h </w:instrText>
+        <w:instrText xml:space="preserve"> PAGEREF _Toc239349615 \h </w:instrText>
       </w:r>
       <w:r>
         <w:rPr>
@@ -2182,7 +2182,7 @@
         <w:rPr>
           <w:noProof/>
         </w:rPr>
-        <w:instrText xml:space="preserve"> PAGEREF _Toc239326884 \h </w:instrText>
+        <w:instrText xml:space="preserve"> PAGEREF _Toc239349616 \h </w:instrText>
       </w:r>
       <w:r>
         <w:rPr>
@@ -2199,7 +2199,7 @@
         <w:rPr>
           <w:noProof/>
         </w:rPr>
-        <w:t>60</w:t>
+        <w:t>61</w:t>
       </w:r>
       <w:r>
         <w:rPr>
@@ -2243,7 +2243,7 @@
         <w:rPr>
           <w:noProof/>
         </w:rPr>
-        <w:instrText xml:space="preserve"> PAGEREF _Toc239326885 \h </w:instrText>
+        <w:instrText xml:space="preserve"> PAGEREF _Toc239349617 \h </w:instrText>
       </w:r>
       <w:r>
         <w:rPr>
@@ -2304,7 +2304,7 @@
         <w:rPr>
           <w:noProof/>
         </w:rPr>
-        <w:instrText xml:space="preserve"> PAGEREF _Toc239326886 \h </w:instrText>
+        <w:instrText xml:space="preserve"> PAGEREF _Toc239349618 \h </w:instrText>
       </w:r>
       <w:r>
         <w:rPr>
@@ -2365,7 +2365,7 @@
         <w:rPr>
           <w:noProof/>
         </w:rPr>
-        <w:instrText xml:space="preserve"> PAGEREF _Toc239326887 \h </w:instrText>
+        <w:instrText xml:space="preserve"> PAGEREF _Toc239349619 \h </w:instrText>
       </w:r>
       <w:r>
         <w:rPr>
@@ -2426,7 +2426,7 @@
         <w:rPr>
           <w:noProof/>
         </w:rPr>
-        <w:instrText xml:space="preserve"> PAGEREF _Toc239326888 \h </w:instrText>
+        <w:instrText xml:space="preserve"> PAGEREF _Toc239349620 \h </w:instrText>
       </w:r>
       <w:r>
         <w:rPr>
@@ -2487,7 +2487,7 @@
         <w:rPr>
           <w:noProof/>
         </w:rPr>
-        <w:instrText xml:space="preserve"> PAGEREF _Toc239326889 \h </w:instrText>
+        <w:instrText xml:space="preserve"> PAGEREF _Toc239349621 \h </w:instrText>
       </w:r>
       <w:r>
         <w:rPr>
@@ -2548,7 +2548,7 @@
         <w:rPr>
           <w:noProof/>
         </w:rPr>
-        <w:instrText xml:space="preserve"> PAGEREF _Toc239326890 \h </w:instrText>
+        <w:instrText xml:space="preserve"> PAGEREF _Toc239349622 \h </w:instrText>
       </w:r>
       <w:r>
         <w:rPr>
@@ -2609,7 +2609,7 @@
         <w:rPr>
           <w:noProof/>
         </w:rPr>
-        <w:instrText xml:space="preserve"> PAGEREF _Toc239326891 \h </w:instrText>
+        <w:instrText xml:space="preserve"> PAGEREF _Toc239349623 \h </w:instrText>
       </w:r>
       <w:r>
         <w:rPr>
@@ -2670,7 +2670,7 @@
         <w:rPr>
           <w:noProof/>
         </w:rPr>
-        <w:instrText xml:space="preserve"> PAGEREF _Toc239326892 \h </w:instrText>
+        <w:instrText xml:space="preserve"> PAGEREF _Toc239349624 \h </w:instrText>
       </w:r>
       <w:r>
         <w:rPr>
@@ -2731,7 +2731,7 @@
         <w:rPr>
           <w:noProof/>
         </w:rPr>
-        <w:instrText xml:space="preserve"> PAGEREF _Toc239326893 \h </w:instrText>
+        <w:instrText xml:space="preserve"> PAGEREF _Toc239349625 \h </w:instrText>
       </w:r>
       <w:r>
         <w:rPr>
@@ -2792,7 +2792,7 @@
         <w:rPr>
           <w:noProof/>
         </w:rPr>
-        <w:instrText xml:space="preserve"> PAGEREF _Toc239326894 \h </w:instrText>
+        <w:instrText xml:space="preserve"> PAGEREF _Toc239349626 \h </w:instrText>
       </w:r>
       <w:r>
         <w:rPr>
@@ -2853,7 +2853,7 @@
         <w:rPr>
           <w:noProof/>
         </w:rPr>
-        <w:instrText xml:space="preserve"> PAGEREF _Toc239326895 \h </w:instrText>
+        <w:instrText xml:space="preserve"> PAGEREF _Toc239349627 \h </w:instrText>
       </w:r>
       <w:r>
         <w:rPr>
@@ -2914,7 +2914,7 @@
         <w:rPr>
           <w:noProof/>
         </w:rPr>
-        <w:instrText xml:space="preserve"> PAGEREF _Toc239326896 \h </w:instrText>
+        <w:instrText xml:space="preserve"> PAGEREF _Toc239349628 \h </w:instrText>
       </w:r>
       <w:r>
         <w:rPr>
@@ -2975,7 +2975,7 @@
         <w:rPr>
           <w:noProof/>
         </w:rPr>
-        <w:instrText xml:space="preserve"> PAGEREF _Toc239326897 \h </w:instrText>
+        <w:instrText xml:space="preserve"> PAGEREF _Toc239349629 \h </w:instrText>
       </w:r>
       <w:r>
         <w:rPr>
@@ -3036,7 +3036,7 @@
         <w:rPr>
           <w:noProof/>
         </w:rPr>
-        <w:instrText xml:space="preserve"> PAGEREF _Toc239326898 \h </w:instrText>
+        <w:instrText xml:space="preserve"> PAGEREF _Toc239349630 \h </w:instrText>
       </w:r>
       <w:r>
         <w:rPr>
@@ -3097,7 +3097,7 @@
         <w:rPr>
           <w:noProof/>
         </w:rPr>
-        <w:instrText xml:space="preserve"> PAGEREF _Toc239326899 \h </w:instrText>
+        <w:instrText xml:space="preserve"> PAGEREF _Toc239349631 \h </w:instrText>
       </w:r>
       <w:r>
         <w:rPr>
@@ -3173,7 +3173,7 @@
           <w:sz w:val="34"/>
         </w:rPr>
       </w:pPr>
-      <w:bookmarkStart w:id="0" w:name="_Toc239326852"/>
+      <w:bookmarkStart w:id="0" w:name="_Toc239349584"/>
       <w:r>
         <w:rPr>
           <w:rFonts w:ascii="Montserrat" w:hAnsi="Montserrat"/>
@@ -3197,7 +3197,7 @@
           <w:sz w:val="27"/>
         </w:rPr>
       </w:pPr>
-      <w:bookmarkStart w:id="1" w:name="_Toc239326853"/>
+      <w:bookmarkStart w:id="1" w:name="_Toc239349585"/>
       <w:r>
         <w:rPr>
           <w:rFonts w:ascii="Montserrat" w:hAnsi="Montserrat"/>
@@ -4090,6 +4090,32 @@
           <w:color w:val="1A1A1A"/>
           <w:sz w:val="22"/>
         </w:rPr>
+        <w:t xml:space="preserve">Esta e a versao 2.44 do manual. Em relacao a versao 2.43 (03/09/2026), a SMP - Solicitacao de Mudanca de Projeto (Passo 7) ganhou a mesma secao Anexos ja existente na Solicitacao de Demanda (Passo 1, versao 2.29): upload real de arquivo (.txt, .docx ou .pdf, ate 15 MB) guardado num repositorio proprio do sistema (Supabase Storage, bucket dedicado </w:t>
+      </w:r>
+      <w:r>
+        <w:rPr>
+          <w:rFonts w:ascii="Montserrat" w:hAnsi="Montserrat"/>
+          <w:color w:val="1A1A1A"/>
+          <w:sz w:val="22"/>
+        </w:rPr>
+        <w:t>nexos-smp) e disponivel para download por quem acessar o registro, alem do campo de texto livre Links de documentos para referencias que nao sao um arquivo enviado.</w:t>
+      </w:r>
+    </w:p>
+    <w:p>
+      <w:pPr>
+        <w:spacing w:line="280" w:lineRule="auto"/>
+        <w:rPr>
+          <w:rFonts w:ascii="Montserrat" w:hAnsi="Montserrat"/>
+          <w:color w:val="1A1A1A"/>
+          <w:sz w:val="22"/>
+        </w:rPr>
+      </w:pPr>
+      <w:r>
+        <w:rPr>
+          <w:rFonts w:ascii="Montserrat" w:hAnsi="Montserrat"/>
+          <w:color w:val="1A1A1A"/>
+          <w:sz w:val="22"/>
+        </w:rPr>
         <w:t>O manual nao substitui as Diretrizes para a Gestao de Projetos da UNIALFA (documento institucional que define o framework D01 a D07) nem o documento Regras de Acesso e Permissoes (que detalha cada regra de controle de acesso); ele e o guia operacional de como usar cada ferramenta na pratica.</w:t>
       </w:r>
     </w:p>
@@ -4104,7 +4130,7 @@
           <w:sz w:val="27"/>
         </w:rPr>
       </w:pPr>
-      <w:bookmarkStart w:id="2" w:name="_Toc239326854"/>
+      <w:bookmarkStart w:id="2" w:name="_Toc239349586"/>
       <w:r>
         <w:rPr>
           <w:rFonts w:ascii="Montserrat" w:hAnsi="Montserrat"/>
@@ -4287,7 +4313,16 @@
           <w:color w:val="1A1A1A"/>
           <w:sz w:val="22"/>
         </w:rPr>
-        <w:t>O Mapa de Diretrizes (pagina inicial) apresenta visualmente as 7 diretrizes (D01 a D07) e mostra, para cada etapa do processo, quais ferramentas usar. E o ponto de partida recomendado para quem quer entender o processo antes de preencher os formularios - e a unica pagina, junto com o Validador de Projetos, que nao exige login.</w:t>
+        <w:t xml:space="preserve">O Mapa de Diretrizes (pagina inicial) apresenta visualmente as 7 diretrizes (D01 a D07) e mostra, para cada etapa do processo, quais ferramentas usar. E o ponto de partida recomendado para quem quer entender o processo antes de </w:t>
+      </w:r>
+      <w:r>
+        <w:rPr>
+          <w:rFonts w:ascii="Montserrat" w:hAnsi="Montserrat"/>
+          <w:color w:val="1A1A1A"/>
+          <w:sz w:val="22"/>
+        </w:rPr>
+        <w:lastRenderedPageBreak/>
+        <w:t>preencher os formularios - e a unica pagina, junto com o Validador de Projetos, que nao exige login.</w:t>
       </w:r>
     </w:p>
     <w:p>
@@ -4299,18 +4334,17 @@
         <w:rPr>
           <w:noProof/>
         </w:rPr>
-        <w:lastRenderedPageBreak/>
         <w:drawing>
-          <wp:inline distT="0" distB="0" distL="0" distR="0" wp14:anchorId="33BD6AA3" wp14:editId="3C3B5EC4">
+          <wp:inline distT="0" distB="0" distL="0" distR="0" wp14:anchorId="050F53C5" wp14:editId="4EA76910">
             <wp:extent cx="5303520" cy="4792851"/>
             <wp:effectExtent l="19050" t="19050" r="11430" b="27305"/>
-            <wp:docPr id="1672794307" name="Imagem 1"/>
+            <wp:docPr id="1390228984" name="Imagem 1"/>
             <wp:cNvGraphicFramePr/>
             <a:graphic xmlns:a="http://schemas.openxmlformats.org/drawingml/2006/main">
               <a:graphicData uri="http://schemas.openxmlformats.org/drawingml/2006/picture">
                 <pic:pic xmlns:pic="http://schemas.openxmlformats.org/drawingml/2006/picture">
                   <pic:nvPicPr>
-                    <pic:cNvPr id="1672794307" name=""/>
+                    <pic:cNvPr id="1390228984" name=""/>
                     <pic:cNvPicPr/>
                   </pic:nvPicPr>
                   <pic:blipFill>
@@ -4378,7 +4412,7 @@
           <w:sz w:val="27"/>
         </w:rPr>
       </w:pPr>
-      <w:bookmarkStart w:id="3" w:name="_Toc239326855"/>
+      <w:bookmarkStart w:id="3" w:name="_Toc239349587"/>
       <w:r>
         <w:rPr>
           <w:rFonts w:ascii="Montserrat" w:hAnsi="Montserrat"/>
@@ -4419,16 +4453,16 @@
         </w:rPr>
         <w:lastRenderedPageBreak/>
         <w:drawing>
-          <wp:inline distT="0" distB="0" distL="0" distR="0" wp14:anchorId="531F6450" wp14:editId="7C68164E">
+          <wp:inline distT="0" distB="0" distL="0" distR="0" wp14:anchorId="644A7D6C" wp14:editId="120B7DCC">
             <wp:extent cx="4206240" cy="3801227"/>
             <wp:effectExtent l="19050" t="19050" r="22860" b="27940"/>
-            <wp:docPr id="808201884" name="Imagem 2"/>
+            <wp:docPr id="2803510" name="Imagem 2"/>
             <wp:cNvGraphicFramePr/>
             <a:graphic xmlns:a="http://schemas.openxmlformats.org/drawingml/2006/main">
               <a:graphicData uri="http://schemas.openxmlformats.org/drawingml/2006/picture">
                 <pic:pic xmlns:pic="http://schemas.openxmlformats.org/drawingml/2006/picture">
                   <pic:nvPicPr>
-                    <pic:cNvPr id="808201884" name=""/>
+                    <pic:cNvPr id="2803510" name=""/>
                     <pic:cNvPicPr/>
                   </pic:nvPicPr>
                   <pic:blipFill>
@@ -4601,7 +4635,7 @@
           <w:sz w:val="27"/>
         </w:rPr>
       </w:pPr>
-      <w:bookmarkStart w:id="4" w:name="_Toc239326856"/>
+      <w:bookmarkStart w:id="4" w:name="_Toc239349588"/>
       <w:r>
         <w:rPr>
           <w:rFonts w:ascii="Montserrat" w:hAnsi="Montserrat"/>
@@ -5840,7 +5874,7 @@
           <w:sz w:val="34"/>
         </w:rPr>
       </w:pPr>
-      <w:bookmarkStart w:id="5" w:name="_Toc239326857"/>
+      <w:bookmarkStart w:id="5" w:name="_Toc239349589"/>
       <w:r>
         <w:rPr>
           <w:rFonts w:ascii="Montserrat" w:hAnsi="Montserrat"/>
@@ -5864,7 +5898,7 @@
           <w:sz w:val="27"/>
         </w:rPr>
       </w:pPr>
-      <w:bookmarkStart w:id="6" w:name="_Toc239326858"/>
+      <w:bookmarkStart w:id="6" w:name="_Toc239349590"/>
       <w:r>
         <w:rPr>
           <w:rFonts w:ascii="Montserrat" w:hAnsi="Montserrat"/>
@@ -5905,7 +5939,7 @@
           <w:sz w:val="27"/>
         </w:rPr>
       </w:pPr>
-      <w:bookmarkStart w:id="7" w:name="_Toc239326859"/>
+      <w:bookmarkStart w:id="7" w:name="_Toc239349591"/>
       <w:r>
         <w:rPr>
           <w:rFonts w:ascii="Montserrat" w:hAnsi="Montserrat"/>
@@ -6024,7 +6058,7 @@
           <w:sz w:val="27"/>
         </w:rPr>
       </w:pPr>
-      <w:bookmarkStart w:id="8" w:name="_Toc239326860"/>
+      <w:bookmarkStart w:id="8" w:name="_Toc239349592"/>
       <w:r>
         <w:rPr>
           <w:rFonts w:ascii="Montserrat" w:hAnsi="Montserrat"/>
@@ -6637,7 +6671,7 @@
           <w:sz w:val="27"/>
         </w:rPr>
       </w:pPr>
-      <w:bookmarkStart w:id="9" w:name="_Toc239326861"/>
+      <w:bookmarkStart w:id="9" w:name="_Toc239349593"/>
       <w:r>
         <w:rPr>
           <w:rFonts w:ascii="Montserrat" w:hAnsi="Montserrat"/>
@@ -6726,16 +6760,16 @@
         </w:rPr>
         <w:lastRenderedPageBreak/>
         <w:drawing>
-          <wp:inline distT="0" distB="0" distL="0" distR="0" wp14:anchorId="479109DF" wp14:editId="66C4910E">
+          <wp:inline distT="0" distB="0" distL="0" distR="0" wp14:anchorId="0309CFC1" wp14:editId="4B9A703D">
             <wp:extent cx="4937760" cy="4462310"/>
             <wp:effectExtent l="19050" t="19050" r="15240" b="14605"/>
-            <wp:docPr id="1409207753" name="Imagem 3"/>
+            <wp:docPr id="401436499" name="Imagem 3"/>
             <wp:cNvGraphicFramePr/>
             <a:graphic xmlns:a="http://schemas.openxmlformats.org/drawingml/2006/main">
               <a:graphicData uri="http://schemas.openxmlformats.org/drawingml/2006/picture">
                 <pic:pic xmlns:pic="http://schemas.openxmlformats.org/drawingml/2006/picture">
                   <pic:nvPicPr>
-                    <pic:cNvPr id="1409207753" name=""/>
+                    <pic:cNvPr id="401436499" name=""/>
                     <pic:cNvPicPr/>
                   </pic:nvPicPr>
                   <pic:blipFill>
@@ -6803,7 +6837,7 @@
           <w:sz w:val="27"/>
         </w:rPr>
       </w:pPr>
-      <w:bookmarkStart w:id="10" w:name="_Toc239326862"/>
+      <w:bookmarkStart w:id="10" w:name="_Toc239349594"/>
       <w:r>
         <w:rPr>
           <w:rFonts w:ascii="Montserrat" w:hAnsi="Montserrat"/>
@@ -6844,16 +6878,16 @@
         </w:rPr>
         <w:lastRenderedPageBreak/>
         <w:drawing>
-          <wp:inline distT="0" distB="0" distL="0" distR="0" wp14:anchorId="487A269C" wp14:editId="1E97FD48">
+          <wp:inline distT="0" distB="0" distL="0" distR="0" wp14:anchorId="33FF0778" wp14:editId="4A7F9D61">
             <wp:extent cx="5120640" cy="4627581"/>
             <wp:effectExtent l="19050" t="19050" r="22860" b="20955"/>
-            <wp:docPr id="64512504" name="Imagem 4"/>
+            <wp:docPr id="1746374136" name="Imagem 4"/>
             <wp:cNvGraphicFramePr/>
             <a:graphic xmlns:a="http://schemas.openxmlformats.org/drawingml/2006/main">
               <a:graphicData uri="http://schemas.openxmlformats.org/drawingml/2006/picture">
                 <pic:pic xmlns:pic="http://schemas.openxmlformats.org/drawingml/2006/picture">
                   <pic:nvPicPr>
-                    <pic:cNvPr id="64512504" name=""/>
+                    <pic:cNvPr id="1746374136" name=""/>
                     <pic:cNvPicPr/>
                   </pic:nvPicPr>
                   <pic:blipFill>
@@ -7021,7 +7055,7 @@
           <w:sz w:val="27"/>
         </w:rPr>
       </w:pPr>
-      <w:bookmarkStart w:id="11" w:name="_Toc239326863"/>
+      <w:bookmarkStart w:id="11" w:name="_Toc239349595"/>
       <w:r>
         <w:rPr>
           <w:rFonts w:ascii="Montserrat" w:hAnsi="Montserrat"/>
@@ -7061,16 +7095,16 @@
           <w:noProof/>
         </w:rPr>
         <w:drawing>
-          <wp:inline distT="0" distB="0" distL="0" distR="0" wp14:anchorId="7B617001" wp14:editId="2C9F7569">
+          <wp:inline distT="0" distB="0" distL="0" distR="0" wp14:anchorId="010D40ED" wp14:editId="0C396CB1">
             <wp:extent cx="4206240" cy="3801227"/>
             <wp:effectExtent l="19050" t="19050" r="22860" b="27940"/>
-            <wp:docPr id="1919286263" name="Imagem 5"/>
+            <wp:docPr id="2095227687" name="Imagem 5"/>
             <wp:cNvGraphicFramePr/>
             <a:graphic xmlns:a="http://schemas.openxmlformats.org/drawingml/2006/main">
               <a:graphicData uri="http://schemas.openxmlformats.org/drawingml/2006/picture">
                 <pic:pic xmlns:pic="http://schemas.openxmlformats.org/drawingml/2006/picture">
                   <pic:nvPicPr>
-                    <pic:cNvPr id="1919286263" name=""/>
+                    <pic:cNvPr id="2095227687" name=""/>
                     <pic:cNvPicPr/>
                   </pic:nvPicPr>
                   <pic:blipFill>
@@ -7138,16 +7172,16 @@
         </w:rPr>
         <w:lastRenderedPageBreak/>
         <w:drawing>
-          <wp:inline distT="0" distB="0" distL="0" distR="0" wp14:anchorId="398EB049" wp14:editId="2F500A14">
+          <wp:inline distT="0" distB="0" distL="0" distR="0" wp14:anchorId="1CDA5055" wp14:editId="618A2850">
             <wp:extent cx="4206240" cy="3801227"/>
             <wp:effectExtent l="19050" t="19050" r="22860" b="27940"/>
-            <wp:docPr id="1079160629" name="Imagem 6"/>
+            <wp:docPr id="753755158" name="Imagem 6"/>
             <wp:cNvGraphicFramePr/>
             <a:graphic xmlns:a="http://schemas.openxmlformats.org/drawingml/2006/main">
               <a:graphicData uri="http://schemas.openxmlformats.org/drawingml/2006/picture">
                 <pic:pic xmlns:pic="http://schemas.openxmlformats.org/drawingml/2006/picture">
                   <pic:nvPicPr>
-                    <pic:cNvPr id="1079160629" name=""/>
+                    <pic:cNvPr id="753755158" name=""/>
                     <pic:cNvPicPr/>
                   </pic:nvPicPr>
                   <pic:blipFill>
@@ -7263,7 +7297,7 @@
           <w:sz w:val="27"/>
         </w:rPr>
       </w:pPr>
-      <w:bookmarkStart w:id="12" w:name="_Toc239326864"/>
+      <w:bookmarkStart w:id="12" w:name="_Toc239349596"/>
       <w:r>
         <w:rPr>
           <w:rFonts w:ascii="Montserrat" w:hAnsi="Montserrat"/>
@@ -7331,7 +7365,7 @@
           <w:sz w:val="27"/>
         </w:rPr>
       </w:pPr>
-      <w:bookmarkStart w:id="13" w:name="_Toc239326865"/>
+      <w:bookmarkStart w:id="13" w:name="_Toc239349597"/>
       <w:r>
         <w:rPr>
           <w:rFonts w:ascii="Montserrat" w:hAnsi="Montserrat"/>
@@ -7558,7 +7592,7 @@
           <w:sz w:val="27"/>
         </w:rPr>
       </w:pPr>
-      <w:bookmarkStart w:id="14" w:name="_Toc239326866"/>
+      <w:bookmarkStart w:id="14" w:name="_Toc239349598"/>
       <w:r>
         <w:rPr>
           <w:rFonts w:ascii="Montserrat" w:hAnsi="Montserrat"/>
@@ -7717,7 +7751,7 @@
           <w:sz w:val="27"/>
         </w:rPr>
       </w:pPr>
-      <w:bookmarkStart w:id="15" w:name="_Toc239326867"/>
+      <w:bookmarkStart w:id="15" w:name="_Toc239349599"/>
       <w:r>
         <w:rPr>
           <w:rFonts w:ascii="Montserrat" w:hAnsi="Montserrat"/>
@@ -7909,7 +7943,7 @@
           <w:sz w:val="27"/>
         </w:rPr>
       </w:pPr>
-      <w:bookmarkStart w:id="16" w:name="_Toc239326868"/>
+      <w:bookmarkStart w:id="16" w:name="_Toc239349600"/>
       <w:r>
         <w:rPr>
           <w:rFonts w:ascii="Montserrat" w:hAnsi="Montserrat"/>
@@ -8037,7 +8071,7 @@
           <w:sz w:val="27"/>
         </w:rPr>
       </w:pPr>
-      <w:bookmarkStart w:id="17" w:name="_Toc239326869"/>
+      <w:bookmarkStart w:id="17" w:name="_Toc239349601"/>
       <w:r>
         <w:rPr>
           <w:rFonts w:ascii="Montserrat" w:hAnsi="Montserrat"/>
@@ -8367,7 +8401,7 @@
           <w:sz w:val="27"/>
         </w:rPr>
       </w:pPr>
-      <w:bookmarkStart w:id="18" w:name="_Toc239326870"/>
+      <w:bookmarkStart w:id="18" w:name="_Toc239349602"/>
       <w:r>
         <w:rPr>
           <w:rFonts w:ascii="Montserrat" w:hAnsi="Montserrat"/>
@@ -8508,7 +8542,7 @@
           <w:sz w:val="34"/>
         </w:rPr>
       </w:pPr>
-      <w:bookmarkStart w:id="19" w:name="_Toc239326871"/>
+      <w:bookmarkStart w:id="19" w:name="_Toc239349603"/>
       <w:r>
         <w:rPr>
           <w:rFonts w:ascii="Montserrat" w:hAnsi="Montserrat"/>
@@ -8550,7 +8584,7 @@
           <w:sz w:val="27"/>
         </w:rPr>
       </w:pPr>
-      <w:bookmarkStart w:id="20" w:name="_Toc239326872"/>
+      <w:bookmarkStart w:id="20" w:name="_Toc239349604"/>
       <w:r>
         <w:rPr>
           <w:rFonts w:ascii="Montserrat" w:hAnsi="Montserrat"/>
@@ -9630,16 +9664,16 @@
         </w:rPr>
         <w:lastRenderedPageBreak/>
         <w:drawing>
-          <wp:inline distT="0" distB="0" distL="0" distR="0" wp14:anchorId="23A901AE" wp14:editId="26A58B45">
+          <wp:inline distT="0" distB="0" distL="0" distR="0" wp14:anchorId="761BA258" wp14:editId="16471EF9">
             <wp:extent cx="5120640" cy="4627581"/>
             <wp:effectExtent l="19050" t="19050" r="22860" b="20955"/>
-            <wp:docPr id="799260839" name="Imagem 7"/>
+            <wp:docPr id="485092821" name="Imagem 7"/>
             <wp:cNvGraphicFramePr/>
             <a:graphic xmlns:a="http://schemas.openxmlformats.org/drawingml/2006/main">
               <a:graphicData uri="http://schemas.openxmlformats.org/drawingml/2006/picture">
                 <pic:pic xmlns:pic="http://schemas.openxmlformats.org/drawingml/2006/picture">
                   <pic:nvPicPr>
-                    <pic:cNvPr id="799260839" name=""/>
+                    <pic:cNvPr id="485092821" name=""/>
                     <pic:cNvPicPr/>
                   </pic:nvPicPr>
                   <pic:blipFill>
@@ -9707,16 +9741,16 @@
         </w:rPr>
         <w:lastRenderedPageBreak/>
         <w:drawing>
-          <wp:inline distT="0" distB="0" distL="0" distR="0" wp14:anchorId="1D7CBD48" wp14:editId="24967E33">
+          <wp:inline distT="0" distB="0" distL="0" distR="0" wp14:anchorId="589F4DD5" wp14:editId="4F760CCA">
             <wp:extent cx="5120640" cy="4627581"/>
             <wp:effectExtent l="19050" t="19050" r="22860" b="20955"/>
-            <wp:docPr id="1181242768" name="Imagem 8"/>
+            <wp:docPr id="1840361668" name="Imagem 8"/>
             <wp:cNvGraphicFramePr/>
             <a:graphic xmlns:a="http://schemas.openxmlformats.org/drawingml/2006/main">
               <a:graphicData uri="http://schemas.openxmlformats.org/drawingml/2006/picture">
                 <pic:pic xmlns:pic="http://schemas.openxmlformats.org/drawingml/2006/picture">
                   <pic:nvPicPr>
-                    <pic:cNvPr id="1181242768" name=""/>
+                    <pic:cNvPr id="1840361668" name=""/>
                     <pic:cNvPicPr/>
                   </pic:nvPicPr>
                   <pic:blipFill>
@@ -9924,7 +9958,7 @@
           <w:sz w:val="27"/>
         </w:rPr>
       </w:pPr>
-      <w:bookmarkStart w:id="21" w:name="_Toc239326873"/>
+      <w:bookmarkStart w:id="21" w:name="_Toc239349605"/>
       <w:r>
         <w:rPr>
           <w:rFonts w:ascii="Montserrat" w:hAnsi="Montserrat"/>
@@ -10850,16 +10884,16 @@
         </w:rPr>
         <w:lastRenderedPageBreak/>
         <w:drawing>
-          <wp:inline distT="0" distB="0" distL="0" distR="0" wp14:anchorId="7738C458" wp14:editId="708E0451">
+          <wp:inline distT="0" distB="0" distL="0" distR="0" wp14:anchorId="27D711CA" wp14:editId="08C25B08">
             <wp:extent cx="5120640" cy="4627581"/>
             <wp:effectExtent l="19050" t="19050" r="22860" b="20955"/>
-            <wp:docPr id="1002116264" name="Imagem 9"/>
+            <wp:docPr id="1953304151" name="Imagem 9"/>
             <wp:cNvGraphicFramePr/>
             <a:graphic xmlns:a="http://schemas.openxmlformats.org/drawingml/2006/main">
               <a:graphicData uri="http://schemas.openxmlformats.org/drawingml/2006/picture">
                 <pic:pic xmlns:pic="http://schemas.openxmlformats.org/drawingml/2006/picture">
                   <pic:nvPicPr>
-                    <pic:cNvPr id="1002116264" name=""/>
+                    <pic:cNvPr id="1953304151" name=""/>
                     <pic:cNvPicPr/>
                   </pic:nvPicPr>
                   <pic:blipFill>
@@ -10927,16 +10961,16 @@
         </w:rPr>
         <w:lastRenderedPageBreak/>
         <w:drawing>
-          <wp:inline distT="0" distB="0" distL="0" distR="0" wp14:anchorId="5C0FBB89" wp14:editId="02A9F841">
+          <wp:inline distT="0" distB="0" distL="0" distR="0" wp14:anchorId="3BEC25AF" wp14:editId="7EB4FFF8">
             <wp:extent cx="5120640" cy="4627581"/>
             <wp:effectExtent l="19050" t="19050" r="22860" b="20955"/>
-            <wp:docPr id="1207552098" name="Imagem 10"/>
+            <wp:docPr id="501889708" name="Imagem 10"/>
             <wp:cNvGraphicFramePr/>
             <a:graphic xmlns:a="http://schemas.openxmlformats.org/drawingml/2006/main">
               <a:graphicData uri="http://schemas.openxmlformats.org/drawingml/2006/picture">
                 <pic:pic xmlns:pic="http://schemas.openxmlformats.org/drawingml/2006/picture">
                   <pic:nvPicPr>
-                    <pic:cNvPr id="1207552098" name=""/>
+                    <pic:cNvPr id="501889708" name=""/>
                     <pic:cNvPicPr/>
                   </pic:nvPicPr>
                   <pic:blipFill>
@@ -11070,7 +11104,7 @@
           <w:sz w:val="27"/>
         </w:rPr>
       </w:pPr>
-      <w:bookmarkStart w:id="22" w:name="_Toc239326874"/>
+      <w:bookmarkStart w:id="22" w:name="_Toc239349606"/>
       <w:r>
         <w:rPr>
           <w:rFonts w:ascii="Montserrat" w:hAnsi="Montserrat"/>
@@ -12126,16 +12160,16 @@
           <w:noProof/>
         </w:rPr>
         <w:drawing>
-          <wp:inline distT="0" distB="0" distL="0" distR="0" wp14:anchorId="5164C513" wp14:editId="7C76769A">
+          <wp:inline distT="0" distB="0" distL="0" distR="0" wp14:anchorId="1A3CF887" wp14:editId="7C7B451E">
             <wp:extent cx="5120640" cy="3282818"/>
             <wp:effectExtent l="19050" t="19050" r="22860" b="13335"/>
-            <wp:docPr id="1870671795" name="Imagem 11"/>
+            <wp:docPr id="1962436441" name="Imagem 11"/>
             <wp:cNvGraphicFramePr/>
             <a:graphic xmlns:a="http://schemas.openxmlformats.org/drawingml/2006/main">
               <a:graphicData uri="http://schemas.openxmlformats.org/drawingml/2006/picture">
                 <pic:pic xmlns:pic="http://schemas.openxmlformats.org/drawingml/2006/picture">
                   <pic:nvPicPr>
-                    <pic:cNvPr id="1870671795" name=""/>
+                    <pic:cNvPr id="1962436441" name=""/>
                     <pic:cNvPicPr/>
                   </pic:nvPicPr>
                   <pic:blipFill>
@@ -12203,16 +12237,16 @@
         </w:rPr>
         <w:lastRenderedPageBreak/>
         <w:drawing>
-          <wp:inline distT="0" distB="0" distL="0" distR="0" wp14:anchorId="15A3CC45" wp14:editId="4C15A941">
+          <wp:inline distT="0" distB="0" distL="0" distR="0" wp14:anchorId="48E36474" wp14:editId="4B0AB5BA">
             <wp:extent cx="5120640" cy="4627581"/>
             <wp:effectExtent l="19050" t="19050" r="22860" b="20955"/>
-            <wp:docPr id="1665556068" name="Imagem 12"/>
+            <wp:docPr id="1456805062" name="Imagem 12"/>
             <wp:cNvGraphicFramePr/>
             <a:graphic xmlns:a="http://schemas.openxmlformats.org/drawingml/2006/main">
               <a:graphicData uri="http://schemas.openxmlformats.org/drawingml/2006/picture">
                 <pic:pic xmlns:pic="http://schemas.openxmlformats.org/drawingml/2006/picture">
                   <pic:nvPicPr>
-                    <pic:cNvPr id="1665556068" name=""/>
+                    <pic:cNvPr id="1456805062" name=""/>
                     <pic:cNvPicPr/>
                   </pic:nvPicPr>
                   <pic:blipFill>
@@ -12346,7 +12380,7 @@
           <w:sz w:val="27"/>
         </w:rPr>
       </w:pPr>
-      <w:bookmarkStart w:id="23" w:name="_Toc239326875"/>
+      <w:bookmarkStart w:id="23" w:name="_Toc239349607"/>
       <w:r>
         <w:rPr>
           <w:rFonts w:ascii="Montserrat" w:hAnsi="Montserrat"/>
@@ -12908,16 +12942,16 @@
         </w:rPr>
         <w:lastRenderedPageBreak/>
         <w:drawing>
-          <wp:inline distT="0" distB="0" distL="0" distR="0" wp14:anchorId="7BB64EAA" wp14:editId="0151995A">
+          <wp:inline distT="0" distB="0" distL="0" distR="0" wp14:anchorId="7C605BEE" wp14:editId="280F8BB3">
             <wp:extent cx="5120640" cy="4627581"/>
             <wp:effectExtent l="19050" t="19050" r="22860" b="20955"/>
-            <wp:docPr id="1945420970" name="Imagem 13"/>
+            <wp:docPr id="2134296621" name="Imagem 13"/>
             <wp:cNvGraphicFramePr/>
             <a:graphic xmlns:a="http://schemas.openxmlformats.org/drawingml/2006/main">
               <a:graphicData uri="http://schemas.openxmlformats.org/drawingml/2006/picture">
                 <pic:pic xmlns:pic="http://schemas.openxmlformats.org/drawingml/2006/picture">
                   <pic:nvPicPr>
-                    <pic:cNvPr id="1945420970" name=""/>
+                    <pic:cNvPr id="2134296621" name=""/>
                     <pic:cNvPicPr/>
                   </pic:nvPicPr>
                   <pic:blipFill>
@@ -12985,16 +13019,16 @@
         </w:rPr>
         <w:lastRenderedPageBreak/>
         <w:drawing>
-          <wp:inline distT="0" distB="0" distL="0" distR="0" wp14:anchorId="7899F398" wp14:editId="6CFAD2D1">
+          <wp:inline distT="0" distB="0" distL="0" distR="0" wp14:anchorId="2B5B3246" wp14:editId="09DC9D8C">
             <wp:extent cx="5120640" cy="4627581"/>
             <wp:effectExtent l="19050" t="19050" r="22860" b="20955"/>
-            <wp:docPr id="1582068105" name="Imagem 14"/>
+            <wp:docPr id="2109110879" name="Imagem 14"/>
             <wp:cNvGraphicFramePr/>
             <a:graphic xmlns:a="http://schemas.openxmlformats.org/drawingml/2006/main">
               <a:graphicData uri="http://schemas.openxmlformats.org/drawingml/2006/picture">
                 <pic:pic xmlns:pic="http://schemas.openxmlformats.org/drawingml/2006/picture">
                   <pic:nvPicPr>
-                    <pic:cNvPr id="1582068105" name=""/>
+                    <pic:cNvPr id="2109110879" name=""/>
                     <pic:cNvPicPr/>
                   </pic:nvPicPr>
                   <pic:blipFill>
@@ -13128,7 +13162,7 @@
           <w:sz w:val="27"/>
         </w:rPr>
       </w:pPr>
-      <w:bookmarkStart w:id="24" w:name="_Toc239326876"/>
+      <w:bookmarkStart w:id="24" w:name="_Toc239349608"/>
       <w:r>
         <w:rPr>
           <w:rFonts w:ascii="Montserrat" w:hAnsi="Montserrat"/>
@@ -13169,16 +13203,16 @@
           <w:noProof/>
         </w:rPr>
         <w:drawing>
-          <wp:inline distT="0" distB="0" distL="0" distR="0" wp14:anchorId="30DC6F23" wp14:editId="3649EC3D">
+          <wp:inline distT="0" distB="0" distL="0" distR="0" wp14:anchorId="31F68021" wp14:editId="3526023E">
             <wp:extent cx="5120640" cy="4627581"/>
             <wp:effectExtent l="19050" t="19050" r="22860" b="20955"/>
-            <wp:docPr id="1867266904" name="Imagem 15"/>
+            <wp:docPr id="956573530" name="Imagem 15"/>
             <wp:cNvGraphicFramePr/>
             <a:graphic xmlns:a="http://schemas.openxmlformats.org/drawingml/2006/main">
               <a:graphicData uri="http://schemas.openxmlformats.org/drawingml/2006/picture">
                 <pic:pic xmlns:pic="http://schemas.openxmlformats.org/drawingml/2006/picture">
                   <pic:nvPicPr>
-                    <pic:cNvPr id="1867266904" name=""/>
+                    <pic:cNvPr id="956573530" name=""/>
                     <pic:cNvPicPr/>
                   </pic:nvPicPr>
                   <pic:blipFill>
@@ -13246,16 +13280,16 @@
         </w:rPr>
         <w:lastRenderedPageBreak/>
         <w:drawing>
-          <wp:inline distT="0" distB="0" distL="0" distR="0" wp14:anchorId="53E4DC4C" wp14:editId="3CAD11D4">
+          <wp:inline distT="0" distB="0" distL="0" distR="0" wp14:anchorId="2B768C0D" wp14:editId="6A8A3DF0">
             <wp:extent cx="5120640" cy="4627581"/>
             <wp:effectExtent l="19050" t="19050" r="22860" b="20955"/>
-            <wp:docPr id="228746495" name="Imagem 16"/>
+            <wp:docPr id="1742159872" name="Imagem 16"/>
             <wp:cNvGraphicFramePr/>
             <a:graphic xmlns:a="http://schemas.openxmlformats.org/drawingml/2006/main">
               <a:graphicData uri="http://schemas.openxmlformats.org/drawingml/2006/picture">
                 <pic:pic xmlns:pic="http://schemas.openxmlformats.org/drawingml/2006/picture">
                   <pic:nvPicPr>
-                    <pic:cNvPr id="228746495" name=""/>
+                    <pic:cNvPr id="1742159872" name=""/>
                     <pic:cNvPicPr/>
                   </pic:nvPicPr>
                   <pic:blipFill>
@@ -13419,16 +13453,16 @@
         </w:rPr>
         <w:lastRenderedPageBreak/>
         <w:drawing>
-          <wp:inline distT="0" distB="0" distL="0" distR="0" wp14:anchorId="1B750577" wp14:editId="50094850">
+          <wp:inline distT="0" distB="0" distL="0" distR="0" wp14:anchorId="29FA5D8D" wp14:editId="6E871749">
             <wp:extent cx="5120640" cy="3282818"/>
             <wp:effectExtent l="19050" t="19050" r="22860" b="13335"/>
-            <wp:docPr id="1979911092" name="Imagem 17"/>
+            <wp:docPr id="572570131" name="Imagem 17"/>
             <wp:cNvGraphicFramePr/>
             <a:graphic xmlns:a="http://schemas.openxmlformats.org/drawingml/2006/main">
               <a:graphicData uri="http://schemas.openxmlformats.org/drawingml/2006/picture">
                 <pic:pic xmlns:pic="http://schemas.openxmlformats.org/drawingml/2006/picture">
                   <pic:nvPicPr>
-                    <pic:cNvPr id="1979911092" name=""/>
+                    <pic:cNvPr id="572570131" name=""/>
                     <pic:cNvPicPr/>
                   </pic:nvPicPr>
                   <pic:blipFill>
@@ -13562,7 +13596,7 @@
           <w:sz w:val="27"/>
         </w:rPr>
       </w:pPr>
-      <w:bookmarkStart w:id="25" w:name="_Toc239326877"/>
+      <w:bookmarkStart w:id="25" w:name="_Toc239349609"/>
       <w:r>
         <w:rPr>
           <w:rFonts w:ascii="Montserrat" w:hAnsi="Montserrat"/>
@@ -13603,16 +13637,16 @@
         </w:rPr>
         <w:lastRenderedPageBreak/>
         <w:drawing>
-          <wp:inline distT="0" distB="0" distL="0" distR="0" wp14:anchorId="0F55F509" wp14:editId="0728240D">
+          <wp:inline distT="0" distB="0" distL="0" distR="0" wp14:anchorId="31DF1E95" wp14:editId="0DEC243E">
             <wp:extent cx="5120640" cy="4627581"/>
             <wp:effectExtent l="19050" t="19050" r="22860" b="20955"/>
-            <wp:docPr id="1906065402" name="Imagem 18"/>
+            <wp:docPr id="232699584" name="Imagem 18"/>
             <wp:cNvGraphicFramePr/>
             <a:graphic xmlns:a="http://schemas.openxmlformats.org/drawingml/2006/main">
               <a:graphicData uri="http://schemas.openxmlformats.org/drawingml/2006/picture">
                 <pic:pic xmlns:pic="http://schemas.openxmlformats.org/drawingml/2006/picture">
                   <pic:nvPicPr>
-                    <pic:cNvPr id="1906065402" name=""/>
+                    <pic:cNvPr id="232699584" name=""/>
                     <pic:cNvPicPr/>
                   </pic:nvPicPr>
                   <pic:blipFill>
@@ -13680,16 +13714,16 @@
         </w:rPr>
         <w:lastRenderedPageBreak/>
         <w:drawing>
-          <wp:inline distT="0" distB="0" distL="0" distR="0" wp14:anchorId="661184E9" wp14:editId="2225FDAA">
+          <wp:inline distT="0" distB="0" distL="0" distR="0" wp14:anchorId="69276617" wp14:editId="655F8198">
             <wp:extent cx="5120640" cy="4627581"/>
             <wp:effectExtent l="19050" t="19050" r="22860" b="20955"/>
-            <wp:docPr id="741346551" name="Imagem 19"/>
+            <wp:docPr id="2069291221" name="Imagem 19"/>
             <wp:cNvGraphicFramePr/>
             <a:graphic xmlns:a="http://schemas.openxmlformats.org/drawingml/2006/main">
               <a:graphicData uri="http://schemas.openxmlformats.org/drawingml/2006/picture">
                 <pic:pic xmlns:pic="http://schemas.openxmlformats.org/drawingml/2006/picture">
                   <pic:nvPicPr>
-                    <pic:cNvPr id="741346551" name=""/>
+                    <pic:cNvPr id="2069291221" name=""/>
                     <pic:cNvPicPr/>
                   </pic:nvPicPr>
                   <pic:blipFill>
@@ -13872,7 +13906,7 @@
           <w:sz w:val="27"/>
         </w:rPr>
       </w:pPr>
-      <w:bookmarkStart w:id="26" w:name="_Toc239326878"/>
+      <w:bookmarkStart w:id="26" w:name="_Toc239349610"/>
       <w:r>
         <w:rPr>
           <w:rFonts w:ascii="Montserrat" w:hAnsi="Montserrat"/>
@@ -13912,16 +13946,16 @@
           <w:noProof/>
         </w:rPr>
         <w:drawing>
-          <wp:inline distT="0" distB="0" distL="0" distR="0" wp14:anchorId="6250B769" wp14:editId="0B987659">
+          <wp:inline distT="0" distB="0" distL="0" distR="0" wp14:anchorId="36BFADDB" wp14:editId="0B3B93DC">
             <wp:extent cx="5120640" cy="4627581"/>
             <wp:effectExtent l="19050" t="19050" r="22860" b="20955"/>
-            <wp:docPr id="166718452" name="Imagem 20"/>
+            <wp:docPr id="503830073" name="Imagem 20"/>
             <wp:cNvGraphicFramePr/>
             <a:graphic xmlns:a="http://schemas.openxmlformats.org/drawingml/2006/main">
               <a:graphicData uri="http://schemas.openxmlformats.org/drawingml/2006/picture">
                 <pic:pic xmlns:pic="http://schemas.openxmlformats.org/drawingml/2006/picture">
                   <pic:nvPicPr>
-                    <pic:cNvPr id="166718452" name=""/>
+                    <pic:cNvPr id="503830073" name=""/>
                     <pic:cNvPicPr/>
                   </pic:nvPicPr>
                   <pic:blipFill>
@@ -13989,16 +14023,16 @@
         </w:rPr>
         <w:lastRenderedPageBreak/>
         <w:drawing>
-          <wp:inline distT="0" distB="0" distL="0" distR="0" wp14:anchorId="2F5314C1" wp14:editId="792E6875">
+          <wp:inline distT="0" distB="0" distL="0" distR="0" wp14:anchorId="00D41128" wp14:editId="3E5C63D5">
             <wp:extent cx="5120640" cy="4627581"/>
             <wp:effectExtent l="19050" t="19050" r="22860" b="20955"/>
-            <wp:docPr id="780636535" name="Imagem 21"/>
+            <wp:docPr id="1073243003" name="Imagem 21"/>
             <wp:cNvGraphicFramePr/>
             <a:graphic xmlns:a="http://schemas.openxmlformats.org/drawingml/2006/main">
               <a:graphicData uri="http://schemas.openxmlformats.org/drawingml/2006/picture">
                 <pic:pic xmlns:pic="http://schemas.openxmlformats.org/drawingml/2006/picture">
                   <pic:nvPicPr>
-                    <pic:cNvPr id="780636535" name=""/>
+                    <pic:cNvPr id="1073243003" name=""/>
                     <pic:cNvPicPr/>
                   </pic:nvPicPr>
                   <pic:blipFill>
@@ -14191,69 +14225,7 @@
           <w:sz w:val="22"/>
         </w:rPr>
         <w:lastRenderedPageBreak/>
-        <w:t>No rodape do painel de detalhes de uma SMP, os botoes Imprimir e Exportar Word geram o documento no formato oficial do FORALF00343 (incluindo a analise das 8 dimensoes de impacto), pronto para impressao ou para abrir no Word.</w:t>
-      </w:r>
-    </w:p>
-    <w:p>
-      <w:pPr>
-        <w:spacing w:before="160" w:after="200"/>
-        <w:ind w:left="283"/>
-        <w:rPr>
-          <w:rFonts w:ascii="Montserrat" w:hAnsi="Montserrat"/>
-          <w:i/>
-          <w:color w:val="6A6A70"/>
-          <w:sz w:val="21"/>
-        </w:rPr>
-      </w:pPr>
-      <w:r>
-        <w:rPr>
-          <w:rFonts w:ascii="Montserrat" w:hAnsi="Montserrat"/>
-          <w:i/>
-          <w:color w:val="6A6A70"/>
-          <w:sz w:val="21"/>
-        </w:rPr>
-        <w:t>Propagacao para o projeto vinculado: sempre que a decisao da SMP e finalizada como Aprovada ou Nao aprovada (seja ao registrar/editar a SMP ou ao trocar o Status na tela de detalhes), o sistema grava automaticamente um evento no historico compartilhado do projeto vinculado (o mesmo historico acessivel pelo botao Ver historico em qualquer formulario com Projeto vinculado - secao 2.5). Isso torna as decisoes de mudanca visiveis para quem estiver no Canvas, TAP, Planejamento, EAP, TEP ou RLA daquele projeto, sem precisar abrir a SMP. Essa propagacao apenas registra o evento no historico - ela nao altera o Status do projeto usado no Gate 1 (Aprovado/Reprovado). A mesma decisao (Aprovada ou Nao aprovada) tambem dispara um e-mail de notificacao (secao 2.8).</w:t>
-      </w:r>
-    </w:p>
-    <w:p>
-      <w:pPr>
-        <w:pStyle w:val="Ttulo2"/>
-        <w:spacing w:before="320" w:after="120"/>
-        <w:rPr>
-          <w:rFonts w:ascii="Montserrat" w:hAnsi="Montserrat"/>
-          <w:b/>
-          <w:color w:val="B91D2E"/>
-          <w:sz w:val="27"/>
-        </w:rPr>
-      </w:pPr>
-      <w:bookmarkStart w:id="27" w:name="_Toc239326879"/>
-      <w:r>
-        <w:rPr>
-          <w:rFonts w:ascii="Montserrat" w:hAnsi="Montserrat"/>
-          <w:b/>
-          <w:color w:val="B91D2E"/>
-          <w:sz w:val="27"/>
-        </w:rPr>
-        <w:t>Passo 8 - TEP, Termo de Encerramento de Projeto (FORALF00341)</w:t>
-      </w:r>
-      <w:bookmarkEnd w:id="27"/>
-    </w:p>
-    <w:p>
-      <w:pPr>
-        <w:spacing w:line="280" w:lineRule="auto"/>
-        <w:rPr>
-          <w:rFonts w:ascii="Montserrat" w:hAnsi="Montserrat"/>
-          <w:color w:val="1A1A1A"/>
-          <w:sz w:val="22"/>
-        </w:rPr>
-      </w:pPr>
-      <w:r>
-        <w:rPr>
-          <w:rFonts w:ascii="Montserrat" w:hAnsi="Montserrat"/>
-          <w:color w:val="1A1A1A"/>
-          <w:sz w:val="22"/>
-        </w:rPr>
-        <w:t>Quando usar: ao encerrar o projeto, seja por conclusao, paralisacao ou cancelamento.</w:t>
+        <w:t>Anexos: mesmo recurso ja usado na Solicitacao de Demanda (Passo 1) - o botao Anexar arquivo, na secao Anexos, envia o arquivo direto para um repositorio proprio do sistema (ate 15 MB, .txt/.docx/.pdf), com opcoes Baixar e Remover tanto no formulario quanto no painel de detalhes do registro. O campo de texto Links de documentos continua disponivel a parte, para links que nao sao um arquivo enviado.</w:t>
       </w:r>
     </w:p>
     <w:p>
@@ -14265,18 +14237,17 @@
         <w:rPr>
           <w:noProof/>
         </w:rPr>
-        <w:lastRenderedPageBreak/>
         <w:drawing>
-          <wp:inline distT="0" distB="0" distL="0" distR="0" wp14:anchorId="3F223956" wp14:editId="7A5CBF13">
-            <wp:extent cx="5120640" cy="4627581"/>
-            <wp:effectExtent l="19050" t="19050" r="22860" b="20955"/>
-            <wp:docPr id="982578141" name="Imagem 22"/>
+          <wp:inline distT="0" distB="0" distL="0" distR="0" wp14:anchorId="42BE3812" wp14:editId="4D9BAA36">
+            <wp:extent cx="5120640" cy="1757287"/>
+            <wp:effectExtent l="19050" t="19050" r="22860" b="14605"/>
+            <wp:docPr id="975455518" name="Imagem 22"/>
             <wp:cNvGraphicFramePr/>
             <a:graphic xmlns:a="http://schemas.openxmlformats.org/drawingml/2006/main">
               <a:graphicData uri="http://schemas.openxmlformats.org/drawingml/2006/picture">
                 <pic:pic xmlns:pic="http://schemas.openxmlformats.org/drawingml/2006/picture">
                   <pic:nvPicPr>
-                    <pic:cNvPr id="982578141" name=""/>
+                    <pic:cNvPr id="975455518" name=""/>
                     <pic:cNvPicPr/>
                   </pic:nvPicPr>
                   <pic:blipFill>
@@ -14294,7 +14265,7 @@
                   <pic:spPr>
                     <a:xfrm>
                       <a:off x="0" y="0"/>
-                      <a:ext cx="5120640" cy="4627581"/>
+                      <a:ext cx="5120640" cy="1757287"/>
                     </a:xfrm>
                     <a:prstGeom prst="rect">
                       <a:avLst/>
@@ -14330,7 +14301,93 @@
           <w:color w:val="6A6A70"/>
           <w:sz w:val="19"/>
         </w:rPr>
-        <w:t>Tela de novo TEP.</w:t>
+        <w:t>Secao Anexos da SMP: arquivo enviado, com opcoes de baixar/remover, e o campo Links de documentos.</w:t>
+      </w:r>
+    </w:p>
+    <w:p>
+      <w:pPr>
+        <w:pStyle w:val="PargrafodaLista"/>
+        <w:numPr>
+          <w:ilvl w:val="0"/>
+          <w:numId w:val="22"/>
+        </w:numPr>
+        <w:spacing w:after="80" w:line="260" w:lineRule="auto"/>
+        <w:ind w:left="700"/>
+        <w:rPr>
+          <w:rFonts w:ascii="Montserrat" w:hAnsi="Montserrat"/>
+          <w:color w:val="1A1A1A"/>
+          <w:sz w:val="22"/>
+        </w:rPr>
+      </w:pPr>
+      <w:r>
+        <w:rPr>
+          <w:rFonts w:ascii="Montserrat" w:hAnsi="Montserrat"/>
+          <w:color w:val="1A1A1A"/>
+          <w:sz w:val="22"/>
+        </w:rPr>
+        <w:t>No rodape do painel de detalhes de uma SMP, os botoes Imprimir e Exportar Word geram o documento no formato oficial do FORALF00343 (incluindo a analise das 8 dimensoes de impacto), pronto para impressao ou para abrir no Word.</w:t>
+      </w:r>
+    </w:p>
+    <w:p>
+      <w:pPr>
+        <w:spacing w:before="160" w:after="200"/>
+        <w:ind w:left="283"/>
+        <w:rPr>
+          <w:rFonts w:ascii="Montserrat" w:hAnsi="Montserrat"/>
+          <w:i/>
+          <w:color w:val="6A6A70"/>
+          <w:sz w:val="21"/>
+        </w:rPr>
+      </w:pPr>
+      <w:r>
+        <w:rPr>
+          <w:rFonts w:ascii="Montserrat" w:hAnsi="Montserrat"/>
+          <w:i/>
+          <w:color w:val="6A6A70"/>
+          <w:sz w:val="21"/>
+        </w:rPr>
+        <w:t>Propagacao para o projeto vinculado: sempre que a decisao da SMP e finalizada como Aprovada ou Nao aprovada (seja ao registrar/editar a SMP ou ao trocar o Status na tela de detalhes), o sistema grava automaticamente um evento no historico compartilhado do projeto vinculado (o mesmo historico acessivel pelo botao Ver historico em qualquer formulario com Projeto vinculado - secao 2.5). Isso torna as decisoes de mudanca visiveis para quem estiver no Canvas, TAP, Planejamento, EAP, TEP ou RLA daquele projeto, sem precisar abrir a SMP. Essa propagacao apenas registra o evento no historico - ela nao altera o Status do projeto usado no Gate 1 (Aprovado/Reprovado). A mesma decisao (Aprovada ou Nao aprovada) tambem dispara um e-mail de notificacao (secao 2.8).</w:t>
+      </w:r>
+    </w:p>
+    <w:p>
+      <w:pPr>
+        <w:pStyle w:val="Ttulo2"/>
+        <w:spacing w:before="320" w:after="120"/>
+        <w:rPr>
+          <w:rFonts w:ascii="Montserrat" w:hAnsi="Montserrat"/>
+          <w:b/>
+          <w:color w:val="B91D2E"/>
+          <w:sz w:val="27"/>
+        </w:rPr>
+      </w:pPr>
+      <w:bookmarkStart w:id="27" w:name="_Toc239349611"/>
+      <w:r>
+        <w:rPr>
+          <w:rFonts w:ascii="Montserrat" w:hAnsi="Montserrat"/>
+          <w:b/>
+          <w:color w:val="B91D2E"/>
+          <w:sz w:val="27"/>
+        </w:rPr>
+        <w:t>Passo 8 - TEP, Termo de Encerramento de Projeto (FORALF00341)</w:t>
+      </w:r>
+      <w:bookmarkEnd w:id="27"/>
+    </w:p>
+    <w:p>
+      <w:pPr>
+        <w:spacing w:line="280" w:lineRule="auto"/>
+        <w:rPr>
+          <w:rFonts w:ascii="Montserrat" w:hAnsi="Montserrat"/>
+          <w:color w:val="1A1A1A"/>
+          <w:sz w:val="22"/>
+        </w:rPr>
+      </w:pPr>
+      <w:r>
+        <w:rPr>
+          <w:rFonts w:ascii="Montserrat" w:hAnsi="Montserrat"/>
+          <w:color w:val="1A1A1A"/>
+          <w:sz w:val="22"/>
+        </w:rPr>
+        <w:t>Quando usar: ao encerrar o projeto, seja por conclusao, paralisacao ou cancelamento.</w:t>
       </w:r>
     </w:p>
     <w:p>
@@ -14344,16 +14401,16 @@
         </w:rPr>
         <w:lastRenderedPageBreak/>
         <w:drawing>
-          <wp:inline distT="0" distB="0" distL="0" distR="0" wp14:anchorId="41BD92A9" wp14:editId="12F57850">
+          <wp:inline distT="0" distB="0" distL="0" distR="0" wp14:anchorId="459C2EFB" wp14:editId="337AAB30">
             <wp:extent cx="5120640" cy="4627581"/>
             <wp:effectExtent l="19050" t="19050" r="22860" b="20955"/>
-            <wp:docPr id="1985867535" name="Imagem 23"/>
+            <wp:docPr id="473429517" name="Imagem 23"/>
             <wp:cNvGraphicFramePr/>
             <a:graphic xmlns:a="http://schemas.openxmlformats.org/drawingml/2006/main">
               <a:graphicData uri="http://schemas.openxmlformats.org/drawingml/2006/picture">
                 <pic:pic xmlns:pic="http://schemas.openxmlformats.org/drawingml/2006/picture">
                   <pic:nvPicPr>
-                    <pic:cNvPr id="1985867535" name=""/>
+                    <pic:cNvPr id="473429517" name=""/>
                     <pic:cNvPicPr/>
                   </pic:nvPicPr>
                   <pic:blipFill>
@@ -14407,217 +14464,7 @@
           <w:color w:val="6A6A70"/>
           <w:sz w:val="19"/>
         </w:rPr>
-        <w:t>TEPs cadastrados (estado vazio).</w:t>
-      </w:r>
-    </w:p>
-    <w:p>
-      <w:pPr>
-        <w:pStyle w:val="PargrafodaLista"/>
-        <w:numPr>
-          <w:ilvl w:val="0"/>
-          <w:numId w:val="22"/>
-        </w:numPr>
-        <w:spacing w:after="80" w:line="260" w:lineRule="auto"/>
-        <w:ind w:left="700"/>
-        <w:rPr>
-          <w:rFonts w:ascii="Montserrat" w:hAnsi="Montserrat"/>
-          <w:color w:val="1A1A1A"/>
-          <w:sz w:val="22"/>
-        </w:rPr>
-      </w:pPr>
-      <w:r>
-        <w:rPr>
-          <w:rFonts w:ascii="Montserrat" w:hAnsi="Montserrat"/>
-          <w:color w:val="1A1A1A"/>
-          <w:sz w:val="22"/>
-        </w:rPr>
-        <w:t>Preencha a identificacao e o programa vinculado, se houver; selecione o tipo de encerramento (Concluido, Paralisado ou Cancelado).</w:t>
-      </w:r>
-    </w:p>
-    <w:p>
-      <w:pPr>
-        <w:pStyle w:val="PargrafodaLista"/>
-        <w:numPr>
-          <w:ilvl w:val="0"/>
-          <w:numId w:val="22"/>
-        </w:numPr>
-        <w:spacing w:after="80" w:line="260" w:lineRule="auto"/>
-        <w:ind w:left="700"/>
-        <w:rPr>
-          <w:rFonts w:ascii="Montserrat" w:hAnsi="Montserrat"/>
-          <w:color w:val="1A1A1A"/>
-          <w:sz w:val="22"/>
-        </w:rPr>
-      </w:pPr>
-      <w:r>
-        <w:rPr>
-          <w:rFonts w:ascii="Montserrat" w:hAnsi="Montserrat"/>
-          <w:color w:val="1A1A1A"/>
-          <w:sz w:val="22"/>
-        </w:rPr>
-        <w:t>Se Paralisado ou Cancelado, o campo Justificativa aparece automaticamente.</w:t>
-      </w:r>
-    </w:p>
-    <w:p>
-      <w:pPr>
-        <w:pStyle w:val="PargrafodaLista"/>
-        <w:numPr>
-          <w:ilvl w:val="0"/>
-          <w:numId w:val="22"/>
-        </w:numPr>
-        <w:spacing w:after="80" w:line="260" w:lineRule="auto"/>
-        <w:ind w:left="700"/>
-        <w:rPr>
-          <w:rFonts w:ascii="Montserrat" w:hAnsi="Montserrat"/>
-          <w:color w:val="1A1A1A"/>
-          <w:sz w:val="22"/>
-        </w:rPr>
-      </w:pPr>
-      <w:r>
-        <w:rPr>
-          <w:rFonts w:ascii="Montserrat" w:hAnsi="Montserrat"/>
-          <w:color w:val="1A1A1A"/>
-          <w:sz w:val="22"/>
-        </w:rPr>
-        <w:t>Registre entregas de resultados, atividades encerradas, o link da pasta do projeto e a analise de efetividade.</w:t>
-      </w:r>
-    </w:p>
-    <w:p>
-      <w:pPr>
-        <w:pStyle w:val="PargrafodaLista"/>
-        <w:numPr>
-          <w:ilvl w:val="0"/>
-          <w:numId w:val="22"/>
-        </w:numPr>
-        <w:spacing w:after="80" w:line="260" w:lineRule="auto"/>
-        <w:ind w:left="700"/>
-        <w:rPr>
-          <w:rFonts w:ascii="Montserrat" w:hAnsi="Montserrat"/>
-          <w:color w:val="1A1A1A"/>
-          <w:sz w:val="22"/>
-        </w:rPr>
-      </w:pPr>
-      <w:r>
-        <w:rPr>
-          <w:rFonts w:ascii="Montserrat" w:hAnsi="Montserrat"/>
-          <w:color w:val="1A1A1A"/>
-          <w:sz w:val="22"/>
-        </w:rPr>
-        <w:t>Assistente de preenchimento por IA: apos selecionar o Projeto vinculado, o botao Sugerir com IA compara o TAP, o Planejamento e a EAP com o que as Atas mais recentes confirmam realizado, sugerindo a justificativa de encerramento, as atividades encerradas e as consideracoes finais (secao 2.12).</w:t>
-      </w:r>
-    </w:p>
-    <w:p>
-      <w:pPr>
-        <w:spacing w:line="280" w:lineRule="auto"/>
-        <w:rPr>
-          <w:rFonts w:ascii="Montserrat" w:hAnsi="Montserrat"/>
-          <w:color w:val="1A1A1A"/>
-          <w:sz w:val="22"/>
-        </w:rPr>
-      </w:pPr>
-      <w:r>
-        <w:rPr>
-          <w:rFonts w:ascii="Montserrat" w:hAnsi="Montserrat"/>
-          <w:color w:val="1A1A1A"/>
-          <w:sz w:val="22"/>
-        </w:rPr>
-        <w:t>Clique em Registrar TEP para gerar o protocolo. O registro de um novo TEP dispara um e-mail de notificacao (secao 2.8).</w:t>
-      </w:r>
-    </w:p>
-    <w:p>
-      <w:pPr>
-        <w:spacing w:before="160" w:after="200"/>
-        <w:ind w:left="283"/>
-        <w:rPr>
-          <w:rFonts w:ascii="Montserrat" w:hAnsi="Montserrat"/>
-          <w:i/>
-          <w:color w:val="6A6A70"/>
-          <w:sz w:val="21"/>
-        </w:rPr>
-      </w:pPr>
-      <w:r>
-        <w:rPr>
-          <w:rFonts w:ascii="Montserrat" w:hAnsi="Montserrat"/>
-          <w:i/>
-          <w:color w:val="6A6A70"/>
-          <w:sz w:val="21"/>
-        </w:rPr>
-        <w:t xml:space="preserve">Encerra o projeto no cadastro compartilhado: ao registrar o TEP, o projeto vinculado passa a refletir o tipo de encerramento escolhido </w:t>
-      </w:r>
-      <w:r>
-        <w:rPr>
-          <w:rFonts w:ascii="Montserrat" w:hAnsi="Montserrat"/>
-          <w:i/>
-          <w:color w:val="6A6A70"/>
-          <w:sz w:val="21"/>
-        </w:rPr>
-        <w:lastRenderedPageBreak/>
-        <w:t>(Concluido/Paralisado/Cancelado) e some da lista de Projeto vinculado para novos registros nos demais formularios (secao 2.5).</w:t>
-      </w:r>
-    </w:p>
-    <w:p>
-      <w:pPr>
-        <w:pStyle w:val="PargrafodaLista"/>
-        <w:numPr>
-          <w:ilvl w:val="0"/>
-          <w:numId w:val="23"/>
-        </w:numPr>
-        <w:spacing w:after="80" w:line="260" w:lineRule="auto"/>
-        <w:ind w:left="700"/>
-        <w:rPr>
-          <w:rFonts w:ascii="Montserrat" w:hAnsi="Montserrat"/>
-          <w:color w:val="1A1A1A"/>
-          <w:sz w:val="22"/>
-        </w:rPr>
-      </w:pPr>
-      <w:r>
-        <w:rPr>
-          <w:rFonts w:ascii="Montserrat" w:hAnsi="Montserrat"/>
-          <w:color w:val="1A1A1A"/>
-          <w:sz w:val="22"/>
-        </w:rPr>
-        <w:t>No rodape do painel de detalhes de um TEP, os botoes Imprimir e Exportar Word geram o documento no formato oficial do FORALF00341, pronto para impressao ou para abrir no Word.</w:t>
-      </w:r>
-    </w:p>
-    <w:p>
-      <w:pPr>
-        <w:pStyle w:val="Ttulo2"/>
-        <w:spacing w:before="320" w:after="120"/>
-        <w:rPr>
-          <w:rFonts w:ascii="Montserrat" w:hAnsi="Montserrat"/>
-          <w:b/>
-          <w:color w:val="B91D2E"/>
-          <w:sz w:val="27"/>
-        </w:rPr>
-      </w:pPr>
-      <w:bookmarkStart w:id="28" w:name="_Toc239326880"/>
-      <w:r>
-        <w:rPr>
-          <w:rFonts w:ascii="Montserrat" w:hAnsi="Montserrat"/>
-          <w:b/>
-          <w:color w:val="B91D2E"/>
-          <w:sz w:val="27"/>
-        </w:rPr>
-        <w:t>Passo 9 - RLA, Registro de Licoes Aprendidas (FORALF00342)</w:t>
-      </w:r>
-      <w:bookmarkEnd w:id="28"/>
-    </w:p>
-    <w:p>
-      <w:pPr>
-        <w:spacing w:line="280" w:lineRule="auto"/>
-        <w:rPr>
-          <w:rFonts w:ascii="Montserrat" w:hAnsi="Montserrat"/>
-          <w:color w:val="1A1A1A"/>
-          <w:sz w:val="22"/>
-        </w:rPr>
-      </w:pPr>
-      <w:r>
-        <w:rPr>
-          <w:rFonts w:ascii="Montserrat" w:hAnsi="Montserrat"/>
-          <w:color w:val="1A1A1A"/>
-          <w:sz w:val="22"/>
-        </w:rPr>
-        <w:t>Quando usar: junto com o TEP, ao final do projeto (ou tambem em pontos intermediarios), para capturar o aprendizado organizacional.</w:t>
+        <w:t>Tela de novo TEP.</w:t>
       </w:r>
     </w:p>
     <w:p>
@@ -14629,17 +14476,18 @@
         <w:rPr>
           <w:noProof/>
         </w:rPr>
+        <w:lastRenderedPageBreak/>
         <w:drawing>
-          <wp:inline distT="0" distB="0" distL="0" distR="0" wp14:anchorId="34BC979A" wp14:editId="5B11059F">
+          <wp:inline distT="0" distB="0" distL="0" distR="0" wp14:anchorId="75B7C45B" wp14:editId="25413B7D">
             <wp:extent cx="5120640" cy="4627581"/>
             <wp:effectExtent l="19050" t="19050" r="22860" b="20955"/>
-            <wp:docPr id="676302089" name="Imagem 24"/>
+            <wp:docPr id="1761094441" name="Imagem 24"/>
             <wp:cNvGraphicFramePr/>
             <a:graphic xmlns:a="http://schemas.openxmlformats.org/drawingml/2006/main">
               <a:graphicData uri="http://schemas.openxmlformats.org/drawingml/2006/picture">
                 <pic:pic xmlns:pic="http://schemas.openxmlformats.org/drawingml/2006/picture">
                   <pic:nvPicPr>
-                    <pic:cNvPr id="676302089" name=""/>
+                    <pic:cNvPr id="1761094441" name=""/>
                     <pic:cNvPicPr/>
                   </pic:nvPicPr>
                   <pic:blipFill>
@@ -14693,7 +14541,217 @@
           <w:color w:val="6A6A70"/>
           <w:sz w:val="19"/>
         </w:rPr>
-        <w:t>Tela de novo RLA.</w:t>
+        <w:t>TEPs cadastrados (estado vazio).</w:t>
+      </w:r>
+    </w:p>
+    <w:p>
+      <w:pPr>
+        <w:pStyle w:val="PargrafodaLista"/>
+        <w:numPr>
+          <w:ilvl w:val="0"/>
+          <w:numId w:val="22"/>
+        </w:numPr>
+        <w:spacing w:after="80" w:line="260" w:lineRule="auto"/>
+        <w:ind w:left="700"/>
+        <w:rPr>
+          <w:rFonts w:ascii="Montserrat" w:hAnsi="Montserrat"/>
+          <w:color w:val="1A1A1A"/>
+          <w:sz w:val="22"/>
+        </w:rPr>
+      </w:pPr>
+      <w:r>
+        <w:rPr>
+          <w:rFonts w:ascii="Montserrat" w:hAnsi="Montserrat"/>
+          <w:color w:val="1A1A1A"/>
+          <w:sz w:val="22"/>
+        </w:rPr>
+        <w:t>Preencha a identificacao e o programa vinculado, se houver; selecione o tipo de encerramento (Concluido, Paralisado ou Cancelado).</w:t>
+      </w:r>
+    </w:p>
+    <w:p>
+      <w:pPr>
+        <w:pStyle w:val="PargrafodaLista"/>
+        <w:numPr>
+          <w:ilvl w:val="0"/>
+          <w:numId w:val="22"/>
+        </w:numPr>
+        <w:spacing w:after="80" w:line="260" w:lineRule="auto"/>
+        <w:ind w:left="700"/>
+        <w:rPr>
+          <w:rFonts w:ascii="Montserrat" w:hAnsi="Montserrat"/>
+          <w:color w:val="1A1A1A"/>
+          <w:sz w:val="22"/>
+        </w:rPr>
+      </w:pPr>
+      <w:r>
+        <w:rPr>
+          <w:rFonts w:ascii="Montserrat" w:hAnsi="Montserrat"/>
+          <w:color w:val="1A1A1A"/>
+          <w:sz w:val="22"/>
+        </w:rPr>
+        <w:t>Se Paralisado ou Cancelado, o campo Justificativa aparece automaticamente.</w:t>
+      </w:r>
+    </w:p>
+    <w:p>
+      <w:pPr>
+        <w:pStyle w:val="PargrafodaLista"/>
+        <w:numPr>
+          <w:ilvl w:val="0"/>
+          <w:numId w:val="22"/>
+        </w:numPr>
+        <w:spacing w:after="80" w:line="260" w:lineRule="auto"/>
+        <w:ind w:left="700"/>
+        <w:rPr>
+          <w:rFonts w:ascii="Montserrat" w:hAnsi="Montserrat"/>
+          <w:color w:val="1A1A1A"/>
+          <w:sz w:val="22"/>
+        </w:rPr>
+      </w:pPr>
+      <w:r>
+        <w:rPr>
+          <w:rFonts w:ascii="Montserrat" w:hAnsi="Montserrat"/>
+          <w:color w:val="1A1A1A"/>
+          <w:sz w:val="22"/>
+        </w:rPr>
+        <w:t>Registre entregas de resultados, atividades encerradas, o link da pasta do projeto e a analise de efetividade.</w:t>
+      </w:r>
+    </w:p>
+    <w:p>
+      <w:pPr>
+        <w:pStyle w:val="PargrafodaLista"/>
+        <w:numPr>
+          <w:ilvl w:val="0"/>
+          <w:numId w:val="22"/>
+        </w:numPr>
+        <w:spacing w:after="80" w:line="260" w:lineRule="auto"/>
+        <w:ind w:left="700"/>
+        <w:rPr>
+          <w:rFonts w:ascii="Montserrat" w:hAnsi="Montserrat"/>
+          <w:color w:val="1A1A1A"/>
+          <w:sz w:val="22"/>
+        </w:rPr>
+      </w:pPr>
+      <w:r>
+        <w:rPr>
+          <w:rFonts w:ascii="Montserrat" w:hAnsi="Montserrat"/>
+          <w:color w:val="1A1A1A"/>
+          <w:sz w:val="22"/>
+        </w:rPr>
+        <w:t>Assistente de preenchimento por IA: apos selecionar o Projeto vinculado, o botao Sugerir com IA compara o TAP, o Planejamento e a EAP com o que as Atas mais recentes confirmam realizado, sugerindo a justificativa de encerramento, as atividades encerradas e as consideracoes finais (secao 2.12).</w:t>
+      </w:r>
+    </w:p>
+    <w:p>
+      <w:pPr>
+        <w:spacing w:line="280" w:lineRule="auto"/>
+        <w:rPr>
+          <w:rFonts w:ascii="Montserrat" w:hAnsi="Montserrat"/>
+          <w:color w:val="1A1A1A"/>
+          <w:sz w:val="22"/>
+        </w:rPr>
+      </w:pPr>
+      <w:r>
+        <w:rPr>
+          <w:rFonts w:ascii="Montserrat" w:hAnsi="Montserrat"/>
+          <w:color w:val="1A1A1A"/>
+          <w:sz w:val="22"/>
+        </w:rPr>
+        <w:t>Clique em Registrar TEP para gerar o protocolo. O registro de um novo TEP dispara um e-mail de notificacao (secao 2.8).</w:t>
+      </w:r>
+    </w:p>
+    <w:p>
+      <w:pPr>
+        <w:spacing w:before="160" w:after="200"/>
+        <w:ind w:left="283"/>
+        <w:rPr>
+          <w:rFonts w:ascii="Montserrat" w:hAnsi="Montserrat"/>
+          <w:i/>
+          <w:color w:val="6A6A70"/>
+          <w:sz w:val="21"/>
+        </w:rPr>
+      </w:pPr>
+      <w:r>
+        <w:rPr>
+          <w:rFonts w:ascii="Montserrat" w:hAnsi="Montserrat"/>
+          <w:i/>
+          <w:color w:val="6A6A70"/>
+          <w:sz w:val="21"/>
+        </w:rPr>
+        <w:t xml:space="preserve">Encerra o projeto no cadastro compartilhado: ao registrar o TEP, o projeto vinculado passa a refletir o tipo de encerramento escolhido </w:t>
+      </w:r>
+      <w:r>
+        <w:rPr>
+          <w:rFonts w:ascii="Montserrat" w:hAnsi="Montserrat"/>
+          <w:i/>
+          <w:color w:val="6A6A70"/>
+          <w:sz w:val="21"/>
+        </w:rPr>
+        <w:lastRenderedPageBreak/>
+        <w:t>(Concluido/Paralisado/Cancelado) e some da lista de Projeto vinculado para novos registros nos demais formularios (secao 2.5).</w:t>
+      </w:r>
+    </w:p>
+    <w:p>
+      <w:pPr>
+        <w:pStyle w:val="PargrafodaLista"/>
+        <w:numPr>
+          <w:ilvl w:val="0"/>
+          <w:numId w:val="23"/>
+        </w:numPr>
+        <w:spacing w:after="80" w:line="260" w:lineRule="auto"/>
+        <w:ind w:left="700"/>
+        <w:rPr>
+          <w:rFonts w:ascii="Montserrat" w:hAnsi="Montserrat"/>
+          <w:color w:val="1A1A1A"/>
+          <w:sz w:val="22"/>
+        </w:rPr>
+      </w:pPr>
+      <w:r>
+        <w:rPr>
+          <w:rFonts w:ascii="Montserrat" w:hAnsi="Montserrat"/>
+          <w:color w:val="1A1A1A"/>
+          <w:sz w:val="22"/>
+        </w:rPr>
+        <w:t>No rodape do painel de detalhes de um TEP, os botoes Imprimir e Exportar Word geram o documento no formato oficial do FORALF00341, pronto para impressao ou para abrir no Word.</w:t>
+      </w:r>
+    </w:p>
+    <w:p>
+      <w:pPr>
+        <w:pStyle w:val="Ttulo2"/>
+        <w:spacing w:before="320" w:after="120"/>
+        <w:rPr>
+          <w:rFonts w:ascii="Montserrat" w:hAnsi="Montserrat"/>
+          <w:b/>
+          <w:color w:val="B91D2E"/>
+          <w:sz w:val="27"/>
+        </w:rPr>
+      </w:pPr>
+      <w:bookmarkStart w:id="28" w:name="_Toc239349612"/>
+      <w:r>
+        <w:rPr>
+          <w:rFonts w:ascii="Montserrat" w:hAnsi="Montserrat"/>
+          <w:b/>
+          <w:color w:val="B91D2E"/>
+          <w:sz w:val="27"/>
+        </w:rPr>
+        <w:t>Passo 9 - RLA, Registro de Licoes Aprendidas (FORALF00342)</w:t>
+      </w:r>
+      <w:bookmarkEnd w:id="28"/>
+    </w:p>
+    <w:p>
+      <w:pPr>
+        <w:spacing w:line="280" w:lineRule="auto"/>
+        <w:rPr>
+          <w:rFonts w:ascii="Montserrat" w:hAnsi="Montserrat"/>
+          <w:color w:val="1A1A1A"/>
+          <w:sz w:val="22"/>
+        </w:rPr>
+      </w:pPr>
+      <w:r>
+        <w:rPr>
+          <w:rFonts w:ascii="Montserrat" w:hAnsi="Montserrat"/>
+          <w:color w:val="1A1A1A"/>
+          <w:sz w:val="22"/>
+        </w:rPr>
+        <w:t>Quando usar: junto com o TEP, ao final do projeto (ou tambem em pontos intermediarios), para capturar o aprendizado organizacional.</w:t>
       </w:r>
     </w:p>
     <w:p>
@@ -14705,18 +14763,17 @@
         <w:rPr>
           <w:noProof/>
         </w:rPr>
-        <w:lastRenderedPageBreak/>
         <w:drawing>
-          <wp:inline distT="0" distB="0" distL="0" distR="0" wp14:anchorId="40F3C809" wp14:editId="627DC555">
+          <wp:inline distT="0" distB="0" distL="0" distR="0" wp14:anchorId="457E1F3C" wp14:editId="45C4719C">
             <wp:extent cx="5120640" cy="4627581"/>
             <wp:effectExtent l="19050" t="19050" r="22860" b="20955"/>
-            <wp:docPr id="511013142" name="Imagem 25"/>
+            <wp:docPr id="1763279065" name="Imagem 25"/>
             <wp:cNvGraphicFramePr/>
             <a:graphic xmlns:a="http://schemas.openxmlformats.org/drawingml/2006/main">
               <a:graphicData uri="http://schemas.openxmlformats.org/drawingml/2006/picture">
                 <pic:pic xmlns:pic="http://schemas.openxmlformats.org/drawingml/2006/picture">
                   <pic:nvPicPr>
-                    <pic:cNvPr id="511013142" name=""/>
+                    <pic:cNvPr id="1763279065" name=""/>
                     <pic:cNvPicPr/>
                   </pic:nvPicPr>
                   <pic:blipFill>
@@ -14770,6 +14827,83 @@
           <w:color w:val="6A6A70"/>
           <w:sz w:val="19"/>
         </w:rPr>
+        <w:t>Tela de novo RLA.</w:t>
+      </w:r>
+    </w:p>
+    <w:p>
+      <w:pPr>
+        <w:spacing w:before="120" w:after="40"/>
+        <w:jc w:val="center"/>
+      </w:pPr>
+      <w:r>
+        <w:rPr>
+          <w:noProof/>
+        </w:rPr>
+        <w:lastRenderedPageBreak/>
+        <w:drawing>
+          <wp:inline distT="0" distB="0" distL="0" distR="0" wp14:anchorId="369103E0" wp14:editId="7E9B3931">
+            <wp:extent cx="5120640" cy="4627581"/>
+            <wp:effectExtent l="19050" t="19050" r="22860" b="20955"/>
+            <wp:docPr id="962836616" name="Imagem 26"/>
+            <wp:cNvGraphicFramePr/>
+            <a:graphic xmlns:a="http://schemas.openxmlformats.org/drawingml/2006/main">
+              <a:graphicData uri="http://schemas.openxmlformats.org/drawingml/2006/picture">
+                <pic:pic xmlns:pic="http://schemas.openxmlformats.org/drawingml/2006/picture">
+                  <pic:nvPicPr>
+                    <pic:cNvPr id="962836616" name=""/>
+                    <pic:cNvPicPr/>
+                  </pic:nvPicPr>
+                  <pic:blipFill>
+                    <a:blip r:embed="rId32">
+                      <a:extLst>
+                        <a:ext uri="{28A0092B-C50C-407E-A947-70E740481C1C}">
+                          <a14:useLocalDpi xmlns:a14="http://schemas.microsoft.com/office/drawing/2010/main" val="0"/>
+                        </a:ext>
+                      </a:extLst>
+                    </a:blip>
+                    <a:stretch>
+                      <a:fillRect/>
+                    </a:stretch>
+                  </pic:blipFill>
+                  <pic:spPr>
+                    <a:xfrm>
+                      <a:off x="0" y="0"/>
+                      <a:ext cx="5120640" cy="4627581"/>
+                    </a:xfrm>
+                    <a:prstGeom prst="rect">
+                      <a:avLst/>
+                    </a:prstGeom>
+                    <a:ln w="9525">
+                      <a:solidFill>
+                        <a:srgbClr val="D1D5DB"/>
+                      </a:solidFill>
+                    </a:ln>
+                  </pic:spPr>
+                </pic:pic>
+              </a:graphicData>
+            </a:graphic>
+          </wp:inline>
+        </w:drawing>
+      </w:r>
+    </w:p>
+    <w:p>
+      <w:pPr>
+        <w:spacing w:before="120" w:after="280"/>
+        <w:jc w:val="center"/>
+        <w:rPr>
+          <w:rFonts w:ascii="Montserrat" w:hAnsi="Montserrat"/>
+          <w:i/>
+          <w:color w:val="6A6A70"/>
+          <w:sz w:val="19"/>
+        </w:rPr>
+      </w:pPr>
+      <w:r>
+        <w:rPr>
+          <w:rFonts w:ascii="Montserrat" w:hAnsi="Montserrat"/>
+          <w:i/>
+          <w:color w:val="6A6A70"/>
+          <w:sz w:val="19"/>
+        </w:rPr>
         <w:t>RLAs cadastrados (estado vazio).</w:t>
       </w:r>
     </w:p>
@@ -14907,7 +15041,7 @@
           <w:sz w:val="27"/>
         </w:rPr>
       </w:pPr>
-      <w:bookmarkStart w:id="29" w:name="_Toc239326881"/>
+      <w:bookmarkStart w:id="29" w:name="_Toc239349613"/>
       <w:r>
         <w:rPr>
           <w:rFonts w:ascii="Montserrat" w:hAnsi="Montserrat"/>
@@ -14947,20 +15081,20 @@
           <w:noProof/>
         </w:rPr>
         <w:drawing>
-          <wp:inline distT="0" distB="0" distL="0" distR="0" wp14:anchorId="016263C1" wp14:editId="76CCF140">
+          <wp:inline distT="0" distB="0" distL="0" distR="0" wp14:anchorId="1E77391E" wp14:editId="15045052">
             <wp:extent cx="5120640" cy="4000682"/>
             <wp:effectExtent l="19050" t="19050" r="22860" b="19050"/>
-            <wp:docPr id="441680831" name="Imagem 26"/>
+            <wp:docPr id="1017792603" name="Imagem 27"/>
             <wp:cNvGraphicFramePr/>
             <a:graphic xmlns:a="http://schemas.openxmlformats.org/drawingml/2006/main">
               <a:graphicData uri="http://schemas.openxmlformats.org/drawingml/2006/picture">
                 <pic:pic xmlns:pic="http://schemas.openxmlformats.org/drawingml/2006/picture">
                   <pic:nvPicPr>
-                    <pic:cNvPr id="441680831" name=""/>
+                    <pic:cNvPr id="1017792603" name=""/>
                     <pic:cNvPicPr/>
                   </pic:nvPicPr>
                   <pic:blipFill>
-                    <a:blip r:embed="rId32" cstate="print">
+                    <a:blip r:embed="rId33" cstate="print">
                       <a:extLst>
                         <a:ext uri="{28A0092B-C50C-407E-A947-70E740481C1C}">
                           <a14:useLocalDpi xmlns:a14="http://schemas.microsoft.com/office/drawing/2010/main" val="0"/>
@@ -15480,7 +15614,7 @@
           <w:sz w:val="34"/>
         </w:rPr>
       </w:pPr>
-      <w:bookmarkStart w:id="30" w:name="_Toc239326882"/>
+      <w:bookmarkStart w:id="30" w:name="_Toc239349614"/>
       <w:r>
         <w:rPr>
           <w:rFonts w:ascii="Montserrat" w:hAnsi="Montserrat"/>
@@ -15522,7 +15656,7 @@
           <w:sz w:val="27"/>
         </w:rPr>
       </w:pPr>
-      <w:bookmarkStart w:id="31" w:name="_Toc239326883"/>
+      <w:bookmarkStart w:id="31" w:name="_Toc239349615"/>
       <w:r>
         <w:rPr>
           <w:rFonts w:ascii="Montserrat" w:hAnsi="Montserrat"/>
@@ -15562,93 +15696,16 @@
           <w:noProof/>
         </w:rPr>
         <w:drawing>
-          <wp:inline distT="0" distB="0" distL="0" distR="0" wp14:anchorId="4774E9AF" wp14:editId="2A605EAD">
+          <wp:inline distT="0" distB="0" distL="0" distR="0" wp14:anchorId="4C054638" wp14:editId="165FBC0F">
             <wp:extent cx="5120640" cy="4627581"/>
             <wp:effectExtent l="19050" t="19050" r="22860" b="20955"/>
-            <wp:docPr id="302334660" name="Imagem 27"/>
+            <wp:docPr id="1153712640" name="Imagem 28"/>
             <wp:cNvGraphicFramePr/>
             <a:graphic xmlns:a="http://schemas.openxmlformats.org/drawingml/2006/main">
               <a:graphicData uri="http://schemas.openxmlformats.org/drawingml/2006/picture">
                 <pic:pic xmlns:pic="http://schemas.openxmlformats.org/drawingml/2006/picture">
                   <pic:nvPicPr>
-                    <pic:cNvPr id="302334660" name=""/>
-                    <pic:cNvPicPr/>
-                  </pic:nvPicPr>
-                  <pic:blipFill>
-                    <a:blip r:embed="rId33">
-                      <a:extLst>
-                        <a:ext uri="{28A0092B-C50C-407E-A947-70E740481C1C}">
-                          <a14:useLocalDpi xmlns:a14="http://schemas.microsoft.com/office/drawing/2010/main" val="0"/>
-                        </a:ext>
-                      </a:extLst>
-                    </a:blip>
-                    <a:stretch>
-                      <a:fillRect/>
-                    </a:stretch>
-                  </pic:blipFill>
-                  <pic:spPr>
-                    <a:xfrm>
-                      <a:off x="0" y="0"/>
-                      <a:ext cx="5120640" cy="4627581"/>
-                    </a:xfrm>
-                    <a:prstGeom prst="rect">
-                      <a:avLst/>
-                    </a:prstGeom>
-                    <a:ln w="9525">
-                      <a:solidFill>
-                        <a:srgbClr val="D1D5DB"/>
-                      </a:solidFill>
-                    </a:ln>
-                  </pic:spPr>
-                </pic:pic>
-              </a:graphicData>
-            </a:graphic>
-          </wp:inline>
-        </w:drawing>
-      </w:r>
-    </w:p>
-    <w:p>
-      <w:pPr>
-        <w:spacing w:before="120" w:after="280"/>
-        <w:jc w:val="center"/>
-        <w:rPr>
-          <w:rFonts w:ascii="Montserrat" w:hAnsi="Montserrat"/>
-          <w:i/>
-          <w:color w:val="6A6A70"/>
-          <w:sz w:val="19"/>
-        </w:rPr>
-      </w:pPr>
-      <w:r>
-        <w:rPr>
-          <w:rFonts w:ascii="Montserrat" w:hAnsi="Montserrat"/>
-          <w:i/>
-          <w:color w:val="6A6A70"/>
-          <w:sz w:val="19"/>
-        </w:rPr>
-        <w:t>Painel do Relatorio de Situacao (estado vazio, antes do primeiro preenchimento).</w:t>
-      </w:r>
-    </w:p>
-    <w:p>
-      <w:pPr>
-        <w:spacing w:before="120" w:after="40"/>
-        <w:jc w:val="center"/>
-      </w:pPr>
-      <w:r>
-        <w:rPr>
-          <w:noProof/>
-        </w:rPr>
-        <w:lastRenderedPageBreak/>
-        <w:drawing>
-          <wp:inline distT="0" distB="0" distL="0" distR="0" wp14:anchorId="3A88D575" wp14:editId="7F56DB4B">
-            <wp:extent cx="5120640" cy="4627581"/>
-            <wp:effectExtent l="19050" t="19050" r="22860" b="20955"/>
-            <wp:docPr id="1952845298" name="Imagem 28"/>
-            <wp:cNvGraphicFramePr/>
-            <a:graphic xmlns:a="http://schemas.openxmlformats.org/drawingml/2006/main">
-              <a:graphicData uri="http://schemas.openxmlformats.org/drawingml/2006/picture">
-                <pic:pic xmlns:pic="http://schemas.openxmlformats.org/drawingml/2006/picture">
-                  <pic:nvPicPr>
-                    <pic:cNvPr id="1952845298" name=""/>
+                    <pic:cNvPr id="1153712640" name=""/>
                     <pic:cNvPicPr/>
                   </pic:nvPicPr>
                   <pic:blipFill>
@@ -15702,7 +15759,7 @@
           <w:color w:val="6A6A70"/>
           <w:sz w:val="19"/>
         </w:rPr>
-        <w:t>Aba Editar dados: cabecalho do relatorio e botao para adicionar projetos/marcos.</w:t>
+        <w:t>Painel do Relatorio de Situacao (estado vazio, antes do primeiro preenchimento).</w:t>
       </w:r>
     </w:p>
     <w:p>
@@ -15716,16 +15773,16 @@
         </w:rPr>
         <w:lastRenderedPageBreak/>
         <w:drawing>
-          <wp:inline distT="0" distB="0" distL="0" distR="0" wp14:anchorId="04EF40C3" wp14:editId="52AF7305">
+          <wp:inline distT="0" distB="0" distL="0" distR="0" wp14:anchorId="1D4ADC25" wp14:editId="122E8229">
             <wp:extent cx="5120640" cy="4627581"/>
             <wp:effectExtent l="19050" t="19050" r="22860" b="20955"/>
-            <wp:docPr id="1161470843" name="Imagem 29"/>
+            <wp:docPr id="828246932" name="Imagem 29"/>
             <wp:cNvGraphicFramePr/>
             <a:graphic xmlns:a="http://schemas.openxmlformats.org/drawingml/2006/main">
               <a:graphicData uri="http://schemas.openxmlformats.org/drawingml/2006/picture">
                 <pic:pic xmlns:pic="http://schemas.openxmlformats.org/drawingml/2006/picture">
                   <pic:nvPicPr>
-                    <pic:cNvPr id="1161470843" name=""/>
+                    <pic:cNvPr id="828246932" name=""/>
                     <pic:cNvPicPr/>
                   </pic:nvPicPr>
                   <pic:blipFill>
@@ -15779,6 +15836,83 @@
           <w:color w:val="6A6A70"/>
           <w:sz w:val="19"/>
         </w:rPr>
+        <w:t>Aba Editar dados: cabecalho do relatorio e botao para adicionar projetos/marcos.</w:t>
+      </w:r>
+    </w:p>
+    <w:p>
+      <w:pPr>
+        <w:spacing w:before="120" w:after="40"/>
+        <w:jc w:val="center"/>
+      </w:pPr>
+      <w:r>
+        <w:rPr>
+          <w:noProof/>
+        </w:rPr>
+        <w:lastRenderedPageBreak/>
+        <w:drawing>
+          <wp:inline distT="0" distB="0" distL="0" distR="0" wp14:anchorId="39FFAC83" wp14:editId="6AC290F3">
+            <wp:extent cx="5120640" cy="4627581"/>
+            <wp:effectExtent l="19050" t="19050" r="22860" b="20955"/>
+            <wp:docPr id="467603036" name="Imagem 30"/>
+            <wp:cNvGraphicFramePr/>
+            <a:graphic xmlns:a="http://schemas.openxmlformats.org/drawingml/2006/main">
+              <a:graphicData uri="http://schemas.openxmlformats.org/drawingml/2006/picture">
+                <pic:pic xmlns:pic="http://schemas.openxmlformats.org/drawingml/2006/picture">
+                  <pic:nvPicPr>
+                    <pic:cNvPr id="467603036" name=""/>
+                    <pic:cNvPicPr/>
+                  </pic:nvPicPr>
+                  <pic:blipFill>
+                    <a:blip r:embed="rId36">
+                      <a:extLst>
+                        <a:ext uri="{28A0092B-C50C-407E-A947-70E740481C1C}">
+                          <a14:useLocalDpi xmlns:a14="http://schemas.microsoft.com/office/drawing/2010/main" val="0"/>
+                        </a:ext>
+                      </a:extLst>
+                    </a:blip>
+                    <a:stretch>
+                      <a:fillRect/>
+                    </a:stretch>
+                  </pic:blipFill>
+                  <pic:spPr>
+                    <a:xfrm>
+                      <a:off x="0" y="0"/>
+                      <a:ext cx="5120640" cy="4627581"/>
+                    </a:xfrm>
+                    <a:prstGeom prst="rect">
+                      <a:avLst/>
+                    </a:prstGeom>
+                    <a:ln w="9525">
+                      <a:solidFill>
+                        <a:srgbClr val="D1D5DB"/>
+                      </a:solidFill>
+                    </a:ln>
+                  </pic:spPr>
+                </pic:pic>
+              </a:graphicData>
+            </a:graphic>
+          </wp:inline>
+        </w:drawing>
+      </w:r>
+    </w:p>
+    <w:p>
+      <w:pPr>
+        <w:spacing w:before="120" w:after="280"/>
+        <w:jc w:val="center"/>
+        <w:rPr>
+          <w:rFonts w:ascii="Montserrat" w:hAnsi="Montserrat"/>
+          <w:i/>
+          <w:color w:val="6A6A70"/>
+          <w:sz w:val="19"/>
+        </w:rPr>
+      </w:pPr>
+      <w:r>
+        <w:rPr>
+          <w:rFonts w:ascii="Montserrat" w:hAnsi="Montserrat"/>
+          <w:i/>
+          <w:color w:val="6A6A70"/>
+          <w:sz w:val="19"/>
+        </w:rPr>
         <w:t>Aba Importar Project: arraste uma exportacao do MS Project (Excel ou CSV) para preencher em lote.</w:t>
       </w:r>
     </w:p>
@@ -15895,12 +16029,14 @@
         <w:spacing w:after="80" w:line="260" w:lineRule="auto"/>
         <w:ind w:left="700"/>
         <w:rPr>
-          <w:color w:val="1A1A1A"/>
-          <w:sz w:val="22"/>
-        </w:rPr>
-      </w:pPr>
-      <w:r>
-        <w:rPr>
+          <w:rFonts w:ascii="Montserrat" w:hAnsi="Montserrat"/>
+          <w:color w:val="1A1A1A"/>
+          <w:sz w:val="22"/>
+        </w:rPr>
+      </w:pPr>
+      <w:r>
+        <w:rPr>
+          <w:rFonts w:ascii="Montserrat" w:hAnsi="Montserrat"/>
           <w:color w:val="1A1A1A"/>
           <w:sz w:val="22"/>
         </w:rPr>
@@ -15917,20 +16053,20 @@
           <w:noProof/>
         </w:rPr>
         <w:drawing>
-          <wp:inline distT="0" distB="0" distL="0" distR="0" wp14:anchorId="0D20379A" wp14:editId="7FBE997F">
+          <wp:inline distT="0" distB="0" distL="0" distR="0" wp14:anchorId="1981C2D0" wp14:editId="499FF79B">
             <wp:extent cx="5120640" cy="1715571"/>
             <wp:effectExtent l="19050" t="19050" r="22860" b="18415"/>
-            <wp:docPr id="977168106" name="Imagem 30"/>
+            <wp:docPr id="2090306230" name="Imagem 31"/>
             <wp:cNvGraphicFramePr/>
             <a:graphic xmlns:a="http://schemas.openxmlformats.org/drawingml/2006/main">
               <a:graphicData uri="http://schemas.openxmlformats.org/drawingml/2006/picture">
                 <pic:pic xmlns:pic="http://schemas.openxmlformats.org/drawingml/2006/picture">
                   <pic:nvPicPr>
-                    <pic:cNvPr id="977168106" name=""/>
+                    <pic:cNvPr id="2090306230" name=""/>
                     <pic:cNvPicPr/>
                   </pic:nvPicPr>
                   <pic:blipFill>
-                    <a:blip r:embed="rId36">
+                    <a:blip r:embed="rId37">
                       <a:extLst>
                         <a:ext uri="{28A0092B-C50C-407E-A947-70E740481C1C}">
                           <a14:useLocalDpi xmlns:a14="http://schemas.microsoft.com/office/drawing/2010/main" val="0"/>
@@ -16049,7 +16185,7 @@
           <w:color w:val="6A6A70"/>
           <w:sz w:val="21"/>
         </w:rPr>
-        <w:t xml:space="preserve">Sinalizacao automatica: a tabela de projetos do Painel ganhou a coluna Sinalizacao e o quadro de indicadores ganhou o card Em risco de atraso. E um calculo automatico, independente do campo Status manual: compara o % Execucao informado com o % que seria esperado pelo tempo ja decorrido entre o Inicio previsto e o Termino previsto do projeto. Se a defasagem for de 15 pontos </w:t>
+        <w:t xml:space="preserve">Sinalizacao automatica: a tabela de projetos do Painel ganhou a coluna Sinalizacao e o quadro de indicadores ganhou o card Em risco de atraso. E um calculo automatico, independente do campo Status manual: compara o % </w:t>
       </w:r>
       <w:r>
         <w:rPr>
@@ -16059,7 +16195,7 @@
           <w:sz w:val="21"/>
         </w:rPr>
         <w:lastRenderedPageBreak/>
-        <w:t>percentuais ou mais, aparece Risco de atraso; se o Termino previsto ja passou e o projeto nao esta em 100%, aparece Prazo vencido. Projetos Concluido, Cancelado ou Paralisado ficam fora desse calculo. O resultado tambem sai no documento exportado.</w:t>
+        <w:t>Execucao informado com o % que seria esperado pelo tempo ja decorrido entre o Inicio previsto e o Termino previsto do projeto. Se a defasagem for de 15 pontos percentuais ou mais, aparece Risco de atraso; se o Termino previsto ja passou e o projeto nao esta em 100%, aparece Prazo vencido. Projetos Concluido, Cancelado ou Paralisado ficam fora desse calculo. O resultado tambem sai no documento exportado.</w:t>
       </w:r>
     </w:p>
     <w:p>
@@ -16072,20 +16208,20 @@
           <w:noProof/>
         </w:rPr>
         <w:drawing>
-          <wp:inline distT="0" distB="0" distL="0" distR="0" wp14:anchorId="1B429D5C" wp14:editId="67038A26">
+          <wp:inline distT="0" distB="0" distL="0" distR="0" wp14:anchorId="67B23C9A" wp14:editId="14433B83">
             <wp:extent cx="5120640" cy="3282818"/>
             <wp:effectExtent l="19050" t="19050" r="22860" b="13335"/>
-            <wp:docPr id="820270356" name="Imagem 31"/>
+            <wp:docPr id="906336956" name="Imagem 32"/>
             <wp:cNvGraphicFramePr/>
             <a:graphic xmlns:a="http://schemas.openxmlformats.org/drawingml/2006/main">
               <a:graphicData uri="http://schemas.openxmlformats.org/drawingml/2006/picture">
                 <pic:pic xmlns:pic="http://schemas.openxmlformats.org/drawingml/2006/picture">
                   <pic:nvPicPr>
-                    <pic:cNvPr id="820270356" name=""/>
+                    <pic:cNvPr id="906336956" name=""/>
                     <pic:cNvPicPr/>
                   </pic:nvPicPr>
                   <pic:blipFill>
-                    <a:blip r:embed="rId37">
+                    <a:blip r:embed="rId38">
                       <a:extLst>
                         <a:ext uri="{28A0092B-C50C-407E-A947-70E740481C1C}">
                           <a14:useLocalDpi xmlns:a14="http://schemas.microsoft.com/office/drawing/2010/main" val="0"/>
@@ -16192,21 +16328,22 @@
         <w:rPr>
           <w:noProof/>
         </w:rPr>
+        <w:lastRenderedPageBreak/>
         <w:drawing>
-          <wp:inline distT="0" distB="0" distL="0" distR="0" wp14:anchorId="315FC053" wp14:editId="3CC5E24B">
+          <wp:inline distT="0" distB="0" distL="0" distR="0" wp14:anchorId="499EC1DF" wp14:editId="3B07DB25">
             <wp:extent cx="5120640" cy="951357"/>
             <wp:effectExtent l="19050" t="19050" r="22860" b="20320"/>
-            <wp:docPr id="39748078" name="Imagem 32"/>
+            <wp:docPr id="264476405" name="Imagem 33"/>
             <wp:cNvGraphicFramePr/>
             <a:graphic xmlns:a="http://schemas.openxmlformats.org/drawingml/2006/main">
               <a:graphicData uri="http://schemas.openxmlformats.org/drawingml/2006/picture">
                 <pic:pic xmlns:pic="http://schemas.openxmlformats.org/drawingml/2006/picture">
                   <pic:nvPicPr>
-                    <pic:cNvPr id="39748078" name=""/>
+                    <pic:cNvPr id="264476405" name=""/>
                     <pic:cNvPicPr/>
                   </pic:nvPicPr>
                   <pic:blipFill>
-                    <a:blip r:embed="rId38">
+                    <a:blip r:embed="rId39">
                       <a:extLst>
                         <a:ext uri="{28A0092B-C50C-407E-A947-70E740481C1C}">
                           <a14:useLocalDpi xmlns:a14="http://schemas.microsoft.com/office/drawing/2010/main" val="0"/>
@@ -16256,7 +16393,6 @@
           <w:color w:val="6A6A70"/>
           <w:sz w:val="19"/>
         </w:rPr>
-        <w:lastRenderedPageBreak/>
         <w:t>Secao Custos realizados de um projeto, apos importar as categorias do TAP e preencher os valores gastos.</w:t>
       </w:r>
     </w:p>
@@ -16315,20 +16451,20 @@
           <w:noProof/>
         </w:rPr>
         <w:drawing>
-          <wp:inline distT="0" distB="0" distL="0" distR="0" wp14:anchorId="13EF4239" wp14:editId="430E3D81">
+          <wp:inline distT="0" distB="0" distL="0" distR="0" wp14:anchorId="7A2F24D2" wp14:editId="48E44D68">
             <wp:extent cx="5120640" cy="1515102"/>
             <wp:effectExtent l="19050" t="19050" r="22860" b="28575"/>
-            <wp:docPr id="2069385827" name="Imagem 33"/>
+            <wp:docPr id="1554514549" name="Imagem 34"/>
             <wp:cNvGraphicFramePr/>
             <a:graphic xmlns:a="http://schemas.openxmlformats.org/drawingml/2006/main">
               <a:graphicData uri="http://schemas.openxmlformats.org/drawingml/2006/picture">
                 <pic:pic xmlns:pic="http://schemas.openxmlformats.org/drawingml/2006/picture">
                   <pic:nvPicPr>
-                    <pic:cNvPr id="2069385827" name=""/>
+                    <pic:cNvPr id="1554514549" name=""/>
                     <pic:cNvPicPr/>
                   </pic:nvPicPr>
                   <pic:blipFill>
-                    <a:blip r:embed="rId39">
+                    <a:blip r:embed="rId40">
                       <a:extLst>
                         <a:ext uri="{28A0092B-C50C-407E-A947-70E740481C1C}">
                           <a14:useLocalDpi xmlns:a14="http://schemas.microsoft.com/office/drawing/2010/main" val="0"/>
@@ -16423,7 +16559,7 @@
           <w:color w:val="6A6A70"/>
           <w:sz w:val="21"/>
         </w:rPr>
-        <w:t xml:space="preserve">Reporte de Resultados (D06.5): este cartao e a base do momento em que o Gerente de Projetos e o Dono do Negocio apresentam as instancias de decisao no que o projeto foi alcancado - nao so o que foi planejado, mas indicadores, entregas e beneficios de fato realizados, lado a lado com a meta original. E uma lista simples, independente dos projetos cadastrados, com o mesmo comportamento de Entraves e Encaminhamentos: continua visivel no Painel mesmo sem nenhum projeto informado, e sai no documento exportado. Junto com os Entraves e Encaminhamentos (D06.6/D06.7), completa os tres artefatos </w:t>
+        <w:t xml:space="preserve">Reporte de Resultados (D06.5): este cartao e a base do momento em que o Gerente de Projetos e o Dono do Negocio apresentam as instancias de decisao no que o projeto foi alcancado - nao so o que foi planejado, mas indicadores, entregas e beneficios de fato realizados, lado a lado com a meta original. E uma </w:t>
       </w:r>
       <w:r>
         <w:rPr>
@@ -16433,7 +16569,7 @@
           <w:sz w:val="21"/>
         </w:rPr>
         <w:lastRenderedPageBreak/>
-        <w:t>de governanca da Diretriz D06 sem exigir um 13o formulario separado - o Reporte de Resultados e atendido dentro do proprio Relatorio de Situacao.</w:t>
+        <w:t>lista simples, independente dos projetos cadastrados, com o mesmo comportamento de Entraves e Encaminhamentos: continua visivel no Painel mesmo sem nenhum projeto informado, e sai no documento exportado. Junto com os Entraves e Encaminhamentos (D06.6/D06.7), completa os tres artefatos de governanca da Diretriz D06 sem exigir um 13o formulario separado - o Reporte de Resultados e atendido dentro do proprio Relatorio de Situacao.</w:t>
       </w:r>
     </w:p>
     <w:p>
@@ -16446,20 +16582,20 @@
           <w:noProof/>
         </w:rPr>
         <w:drawing>
-          <wp:inline distT="0" distB="0" distL="0" distR="0" wp14:anchorId="0FFF334C" wp14:editId="21960736">
+          <wp:inline distT="0" distB="0" distL="0" distR="0" wp14:anchorId="7B5308B3" wp14:editId="7FFB8A8B">
             <wp:extent cx="5120640" cy="1391113"/>
             <wp:effectExtent l="19050" t="19050" r="22860" b="19050"/>
-            <wp:docPr id="1858044050" name="Imagem 34"/>
+            <wp:docPr id="1738902828" name="Imagem 35"/>
             <wp:cNvGraphicFramePr/>
             <a:graphic xmlns:a="http://schemas.openxmlformats.org/drawingml/2006/main">
               <a:graphicData uri="http://schemas.openxmlformats.org/drawingml/2006/picture">
                 <pic:pic xmlns:pic="http://schemas.openxmlformats.org/drawingml/2006/picture">
                   <pic:nvPicPr>
-                    <pic:cNvPr id="1858044050" name=""/>
+                    <pic:cNvPr id="1738902828" name=""/>
                     <pic:cNvPicPr/>
                   </pic:nvPicPr>
                   <pic:blipFill>
-                    <a:blip r:embed="rId40">
+                    <a:blip r:embed="rId41">
                       <a:extLst>
                         <a:ext uri="{28A0092B-C50C-407E-A947-70E740481C1C}">
                           <a14:useLocalDpi xmlns:a14="http://schemas.microsoft.com/office/drawing/2010/main" val="0"/>
@@ -16567,20 +16703,20 @@
           <w:noProof/>
         </w:rPr>
         <w:drawing>
-          <wp:inline distT="0" distB="0" distL="0" distR="0" wp14:anchorId="726189F6" wp14:editId="651C0F57">
+          <wp:inline distT="0" distB="0" distL="0" distR="0" wp14:anchorId="36549AA1" wp14:editId="63C26583">
             <wp:extent cx="5120640" cy="1125174"/>
             <wp:effectExtent l="19050" t="19050" r="22860" b="18415"/>
-            <wp:docPr id="266704066" name="Imagem 35"/>
+            <wp:docPr id="610188058" name="Imagem 36"/>
             <wp:cNvGraphicFramePr/>
             <a:graphic xmlns:a="http://schemas.openxmlformats.org/drawingml/2006/main">
               <a:graphicData uri="http://schemas.openxmlformats.org/drawingml/2006/picture">
                 <pic:pic xmlns:pic="http://schemas.openxmlformats.org/drawingml/2006/picture">
                   <pic:nvPicPr>
-                    <pic:cNvPr id="266704066" name=""/>
+                    <pic:cNvPr id="610188058" name=""/>
                     <pic:cNvPicPr/>
                   </pic:nvPicPr>
                   <pic:blipFill>
-                    <a:blip r:embed="rId41">
+                    <a:blip r:embed="rId42">
                       <a:extLst>
                         <a:ext uri="{28A0092B-C50C-407E-A947-70E740481C1C}">
                           <a14:useLocalDpi xmlns:a14="http://schemas.microsoft.com/office/drawing/2010/main" val="0"/>
@@ -16665,7 +16801,7 @@
           <w:sz w:val="27"/>
         </w:rPr>
       </w:pPr>
-      <w:bookmarkStart w:id="32" w:name="_Toc239326884"/>
+      <w:bookmarkStart w:id="32" w:name="_Toc239349616"/>
       <w:r>
         <w:rPr>
           <w:rFonts w:ascii="Montserrat" w:hAnsi="Montserrat"/>
@@ -16673,6 +16809,7 @@
           <w:color w:val="B91D2E"/>
           <w:sz w:val="27"/>
         </w:rPr>
+        <w:lastRenderedPageBreak/>
         <w:t>4.2 Relatorio de Entregas e Beneficios (FORALF12)</w:t>
       </w:r>
       <w:bookmarkEnd w:id="32"/>
@@ -16704,95 +16841,17 @@
         <w:rPr>
           <w:noProof/>
         </w:rPr>
-        <w:lastRenderedPageBreak/>
         <w:drawing>
-          <wp:inline distT="0" distB="0" distL="0" distR="0" wp14:anchorId="0ED3B39E" wp14:editId="61F4AC9E">
+          <wp:inline distT="0" distB="0" distL="0" distR="0" wp14:anchorId="40715260" wp14:editId="1EF7F492">
             <wp:extent cx="5120640" cy="4627581"/>
             <wp:effectExtent l="19050" t="19050" r="22860" b="20955"/>
-            <wp:docPr id="788643633" name="Imagem 36"/>
+            <wp:docPr id="636157107" name="Imagem 37"/>
             <wp:cNvGraphicFramePr/>
             <a:graphic xmlns:a="http://schemas.openxmlformats.org/drawingml/2006/main">
               <a:graphicData uri="http://schemas.openxmlformats.org/drawingml/2006/picture">
                 <pic:pic xmlns:pic="http://schemas.openxmlformats.org/drawingml/2006/picture">
                   <pic:nvPicPr>
-                    <pic:cNvPr id="788643633" name=""/>
-                    <pic:cNvPicPr/>
-                  </pic:nvPicPr>
-                  <pic:blipFill>
-                    <a:blip r:embed="rId42">
-                      <a:extLst>
-                        <a:ext uri="{28A0092B-C50C-407E-A947-70E740481C1C}">
-                          <a14:useLocalDpi xmlns:a14="http://schemas.microsoft.com/office/drawing/2010/main" val="0"/>
-                        </a:ext>
-                      </a:extLst>
-                    </a:blip>
-                    <a:stretch>
-                      <a:fillRect/>
-                    </a:stretch>
-                  </pic:blipFill>
-                  <pic:spPr>
-                    <a:xfrm>
-                      <a:off x="0" y="0"/>
-                      <a:ext cx="5120640" cy="4627581"/>
-                    </a:xfrm>
-                    <a:prstGeom prst="rect">
-                      <a:avLst/>
-                    </a:prstGeom>
-                    <a:ln w="9525">
-                      <a:solidFill>
-                        <a:srgbClr val="D1D5DB"/>
-                      </a:solidFill>
-                    </a:ln>
-                  </pic:spPr>
-                </pic:pic>
-              </a:graphicData>
-            </a:graphic>
-          </wp:inline>
-        </w:drawing>
-      </w:r>
-    </w:p>
-    <w:p>
-      <w:pPr>
-        <w:spacing w:before="120" w:after="280"/>
-        <w:jc w:val="center"/>
-        <w:rPr>
-          <w:rFonts w:ascii="Montserrat" w:hAnsi="Montserrat"/>
-          <w:i/>
-          <w:color w:val="6A6A70"/>
-          <w:sz w:val="19"/>
-        </w:rPr>
-      </w:pPr>
-      <w:r>
-        <w:rPr>
-          <w:rFonts w:ascii="Montserrat" w:hAnsi="Montserrat"/>
-          <w:i/>
-          <w:color w:val="6A6A70"/>
-          <w:sz w:val="19"/>
-        </w:rPr>
-        <w:t>Painel do Relatorio de Entregas e Beneficios (estado vazio).</w:t>
-      </w:r>
-    </w:p>
-    <w:p>
-      <w:pPr>
-        <w:spacing w:before="120" w:after="40"/>
-        <w:jc w:val="center"/>
-      </w:pPr>
-      <w:r>
-        <w:rPr>
-          <w:noProof/>
-        </w:rPr>
-        <w:lastRenderedPageBreak/>
-        <w:drawing>
-          <wp:inline distT="0" distB="0" distL="0" distR="0" wp14:anchorId="588B5701" wp14:editId="6DE6F912">
-            <wp:extent cx="5120640" cy="4627581"/>
-            <wp:effectExtent l="19050" t="19050" r="22860" b="20955"/>
-            <wp:docPr id="1962814659" name="Imagem 37"/>
-            <wp:cNvGraphicFramePr/>
-            <a:graphic xmlns:a="http://schemas.openxmlformats.org/drawingml/2006/main">
-              <a:graphicData uri="http://schemas.openxmlformats.org/drawingml/2006/picture">
-                <pic:pic xmlns:pic="http://schemas.openxmlformats.org/drawingml/2006/picture">
-                  <pic:nvPicPr>
-                    <pic:cNvPr id="1962814659" name=""/>
+                    <pic:cNvPr id="636157107" name=""/>
                     <pic:cNvPicPr/>
                   </pic:nvPicPr>
                   <pic:blipFill>
@@ -16846,6 +16905,83 @@
           <w:color w:val="6A6A70"/>
           <w:sz w:val="19"/>
         </w:rPr>
+        <w:t>Painel do Relatorio de Entregas e Beneficios (estado vazio).</w:t>
+      </w:r>
+    </w:p>
+    <w:p>
+      <w:pPr>
+        <w:spacing w:before="120" w:after="40"/>
+        <w:jc w:val="center"/>
+      </w:pPr>
+      <w:r>
+        <w:rPr>
+          <w:noProof/>
+        </w:rPr>
+        <w:lastRenderedPageBreak/>
+        <w:drawing>
+          <wp:inline distT="0" distB="0" distL="0" distR="0" wp14:anchorId="7FDC49D2" wp14:editId="240E5141">
+            <wp:extent cx="5120640" cy="4627581"/>
+            <wp:effectExtent l="19050" t="19050" r="22860" b="20955"/>
+            <wp:docPr id="737837574" name="Imagem 38"/>
+            <wp:cNvGraphicFramePr/>
+            <a:graphic xmlns:a="http://schemas.openxmlformats.org/drawingml/2006/main">
+              <a:graphicData uri="http://schemas.openxmlformats.org/drawingml/2006/picture">
+                <pic:pic xmlns:pic="http://schemas.openxmlformats.org/drawingml/2006/picture">
+                  <pic:nvPicPr>
+                    <pic:cNvPr id="737837574" name=""/>
+                    <pic:cNvPicPr/>
+                  </pic:nvPicPr>
+                  <pic:blipFill>
+                    <a:blip r:embed="rId44">
+                      <a:extLst>
+                        <a:ext uri="{28A0092B-C50C-407E-A947-70E740481C1C}">
+                          <a14:useLocalDpi xmlns:a14="http://schemas.microsoft.com/office/drawing/2010/main" val="0"/>
+                        </a:ext>
+                      </a:extLst>
+                    </a:blip>
+                    <a:stretch>
+                      <a:fillRect/>
+                    </a:stretch>
+                  </pic:blipFill>
+                  <pic:spPr>
+                    <a:xfrm>
+                      <a:off x="0" y="0"/>
+                      <a:ext cx="5120640" cy="4627581"/>
+                    </a:xfrm>
+                    <a:prstGeom prst="rect">
+                      <a:avLst/>
+                    </a:prstGeom>
+                    <a:ln w="9525">
+                      <a:solidFill>
+                        <a:srgbClr val="D1D5DB"/>
+                      </a:solidFill>
+                    </a:ln>
+                  </pic:spPr>
+                </pic:pic>
+              </a:graphicData>
+            </a:graphic>
+          </wp:inline>
+        </w:drawing>
+      </w:r>
+    </w:p>
+    <w:p>
+      <w:pPr>
+        <w:spacing w:before="120" w:after="280"/>
+        <w:jc w:val="center"/>
+        <w:rPr>
+          <w:rFonts w:ascii="Montserrat" w:hAnsi="Montserrat"/>
+          <w:i/>
+          <w:color w:val="6A6A70"/>
+          <w:sz w:val="19"/>
+        </w:rPr>
+      </w:pPr>
+      <w:r>
+        <w:rPr>
+          <w:rFonts w:ascii="Montserrat" w:hAnsi="Montserrat"/>
+          <w:i/>
+          <w:color w:val="6A6A70"/>
+          <w:sz w:val="19"/>
+        </w:rPr>
         <w:t>Aba Editar dados: Ficha do Programa, o primeiro bloco a preencher.</w:t>
       </w:r>
     </w:p>
@@ -16961,20 +17097,20 @@
           <w:noProof/>
         </w:rPr>
         <w:drawing>
-          <wp:inline distT="0" distB="0" distL="0" distR="0" wp14:anchorId="21DB2B5F" wp14:editId="29C8C1B2">
+          <wp:inline distT="0" distB="0" distL="0" distR="0" wp14:anchorId="46E21251" wp14:editId="3080BB51">
             <wp:extent cx="5120640" cy="2144319"/>
             <wp:effectExtent l="19050" t="19050" r="22860" b="27940"/>
-            <wp:docPr id="491021564" name="Imagem 38"/>
+            <wp:docPr id="354964962" name="Imagem 39"/>
             <wp:cNvGraphicFramePr/>
             <a:graphic xmlns:a="http://schemas.openxmlformats.org/drawingml/2006/main">
               <a:graphicData uri="http://schemas.openxmlformats.org/drawingml/2006/picture">
                 <pic:pic xmlns:pic="http://schemas.openxmlformats.org/drawingml/2006/picture">
                   <pic:nvPicPr>
-                    <pic:cNvPr id="491021564" name=""/>
+                    <pic:cNvPr id="354964962" name=""/>
                     <pic:cNvPicPr/>
                   </pic:nvPicPr>
                   <pic:blipFill>
-                    <a:blip r:embed="rId44">
+                    <a:blip r:embed="rId45">
                       <a:extLst>
                         <a:ext uri="{28A0092B-C50C-407E-A947-70E740481C1C}">
                           <a14:useLocalDpi xmlns:a14="http://schemas.microsoft.com/office/drawing/2010/main" val="0"/>
@@ -17058,20 +17194,20 @@
           <w:noProof/>
         </w:rPr>
         <w:drawing>
-          <wp:inline distT="0" distB="0" distL="0" distR="0" wp14:anchorId="15E8E817" wp14:editId="367EAECE">
+          <wp:inline distT="0" distB="0" distL="0" distR="0" wp14:anchorId="456FBE45" wp14:editId="76E76B1C">
             <wp:extent cx="5120640" cy="1055647"/>
             <wp:effectExtent l="19050" t="19050" r="22860" b="11430"/>
-            <wp:docPr id="1104869725" name="Imagem 39"/>
+            <wp:docPr id="236511632" name="Imagem 40"/>
             <wp:cNvGraphicFramePr/>
             <a:graphic xmlns:a="http://schemas.openxmlformats.org/drawingml/2006/main">
               <a:graphicData uri="http://schemas.openxmlformats.org/drawingml/2006/picture">
                 <pic:pic xmlns:pic="http://schemas.openxmlformats.org/drawingml/2006/picture">
                   <pic:nvPicPr>
-                    <pic:cNvPr id="1104869725" name=""/>
+                    <pic:cNvPr id="236511632" name=""/>
                     <pic:cNvPicPr/>
                   </pic:nvPicPr>
                   <pic:blipFill>
-                    <a:blip r:embed="rId45">
+                    <a:blip r:embed="rId46">
                       <a:extLst>
                         <a:ext uri="{28A0092B-C50C-407E-A947-70E740481C1C}">
                           <a14:useLocalDpi xmlns:a14="http://schemas.microsoft.com/office/drawing/2010/main" val="0"/>
@@ -17189,20 +17325,20 @@
           <w:noProof/>
         </w:rPr>
         <w:drawing>
-          <wp:inline distT="0" distB="0" distL="0" distR="0" wp14:anchorId="28FE914F" wp14:editId="1438393F">
+          <wp:inline distT="0" distB="0" distL="0" distR="0" wp14:anchorId="035B833B" wp14:editId="2C348985">
             <wp:extent cx="5120640" cy="3282818"/>
             <wp:effectExtent l="19050" t="19050" r="22860" b="13335"/>
-            <wp:docPr id="228748274" name="Imagem 40"/>
+            <wp:docPr id="244509273" name="Imagem 41"/>
             <wp:cNvGraphicFramePr/>
             <a:graphic xmlns:a="http://schemas.openxmlformats.org/drawingml/2006/main">
               <a:graphicData uri="http://schemas.openxmlformats.org/drawingml/2006/picture">
                 <pic:pic xmlns:pic="http://schemas.openxmlformats.org/drawingml/2006/picture">
                   <pic:nvPicPr>
-                    <pic:cNvPr id="228748274" name=""/>
+                    <pic:cNvPr id="244509273" name=""/>
                     <pic:cNvPicPr/>
                   </pic:nvPicPr>
                   <pic:blipFill>
-                    <a:blip r:embed="rId46">
+                    <a:blip r:embed="rId47">
                       <a:extLst>
                         <a:ext uri="{28A0092B-C50C-407E-A947-70E740481C1C}">
                           <a14:useLocalDpi xmlns:a14="http://schemas.microsoft.com/office/drawing/2010/main" val="0"/>
@@ -17332,20 +17468,20 @@
         </w:rPr>
         <w:lastRenderedPageBreak/>
         <w:drawing>
-          <wp:inline distT="0" distB="0" distL="0" distR="0" wp14:anchorId="0FB825CF" wp14:editId="7DD7517C">
+          <wp:inline distT="0" distB="0" distL="0" distR="0" wp14:anchorId="7B251FF2" wp14:editId="5B3FAC26">
             <wp:extent cx="5120640" cy="1978034"/>
             <wp:effectExtent l="19050" t="19050" r="22860" b="22225"/>
-            <wp:docPr id="858540774" name="Imagem 41"/>
+            <wp:docPr id="1223050766" name="Imagem 42"/>
             <wp:cNvGraphicFramePr/>
             <a:graphic xmlns:a="http://schemas.openxmlformats.org/drawingml/2006/main">
               <a:graphicData uri="http://schemas.openxmlformats.org/drawingml/2006/picture">
                 <pic:pic xmlns:pic="http://schemas.openxmlformats.org/drawingml/2006/picture">
                   <pic:nvPicPr>
-                    <pic:cNvPr id="858540774" name=""/>
+                    <pic:cNvPr id="1223050766" name=""/>
                     <pic:cNvPicPr/>
                   </pic:nvPicPr>
                   <pic:blipFill>
-                    <a:blip r:embed="rId47">
+                    <a:blip r:embed="rId48">
                       <a:extLst>
                         <a:ext uri="{28A0092B-C50C-407E-A947-70E740481C1C}">
                           <a14:useLocalDpi xmlns:a14="http://schemas.microsoft.com/office/drawing/2010/main" val="0"/>
@@ -17413,7 +17549,7 @@
           <w:sz w:val="34"/>
         </w:rPr>
       </w:pPr>
-      <w:bookmarkStart w:id="33" w:name="_Toc239326885"/>
+      <w:bookmarkStart w:id="33" w:name="_Toc239349617"/>
       <w:r>
         <w:rPr>
           <w:rFonts w:ascii="Montserrat" w:hAnsi="Montserrat"/>
@@ -17473,7 +17609,7 @@
           <w:sz w:val="27"/>
         </w:rPr>
       </w:pPr>
-      <w:bookmarkStart w:id="34" w:name="_Toc239326886"/>
+      <w:bookmarkStart w:id="34" w:name="_Toc239349618"/>
       <w:r>
         <w:rPr>
           <w:rFonts w:ascii="Montserrat" w:hAnsi="Montserrat"/>
@@ -17513,134 +17649,16 @@
           <w:noProof/>
         </w:rPr>
         <w:drawing>
-          <wp:inline distT="0" distB="0" distL="0" distR="0" wp14:anchorId="64C4A830" wp14:editId="49E2ED46">
+          <wp:inline distT="0" distB="0" distL="0" distR="0" wp14:anchorId="508A4295" wp14:editId="20B233C3">
             <wp:extent cx="5303520" cy="4792851"/>
             <wp:effectExtent l="19050" t="19050" r="11430" b="27305"/>
-            <wp:docPr id="884891732" name="Imagem 42"/>
+            <wp:docPr id="657256037" name="Imagem 43"/>
             <wp:cNvGraphicFramePr/>
             <a:graphic xmlns:a="http://schemas.openxmlformats.org/drawingml/2006/main">
               <a:graphicData uri="http://schemas.openxmlformats.org/drawingml/2006/picture">
                 <pic:pic xmlns:pic="http://schemas.openxmlformats.org/drawingml/2006/picture">
                   <pic:nvPicPr>
-                    <pic:cNvPr id="884891732" name=""/>
-                    <pic:cNvPicPr/>
-                  </pic:nvPicPr>
-                  <pic:blipFill>
-                    <a:blip r:embed="rId48">
-                      <a:extLst>
-                        <a:ext uri="{28A0092B-C50C-407E-A947-70E740481C1C}">
-                          <a14:useLocalDpi xmlns:a14="http://schemas.microsoft.com/office/drawing/2010/main" val="0"/>
-                        </a:ext>
-                      </a:extLst>
-                    </a:blip>
-                    <a:stretch>
-                      <a:fillRect/>
-                    </a:stretch>
-                  </pic:blipFill>
-                  <pic:spPr>
-                    <a:xfrm>
-                      <a:off x="0" y="0"/>
-                      <a:ext cx="5303520" cy="4792851"/>
-                    </a:xfrm>
-                    <a:prstGeom prst="rect">
-                      <a:avLst/>
-                    </a:prstGeom>
-                    <a:ln w="9525">
-                      <a:solidFill>
-                        <a:srgbClr val="D1D5DB"/>
-                      </a:solidFill>
-                    </a:ln>
-                  </pic:spPr>
-                </pic:pic>
-              </a:graphicData>
-            </a:graphic>
-          </wp:inline>
-        </w:drawing>
-      </w:r>
-    </w:p>
-    <w:p>
-      <w:pPr>
-        <w:spacing w:before="120" w:after="280"/>
-        <w:jc w:val="center"/>
-        <w:rPr>
-          <w:rFonts w:ascii="Montserrat" w:hAnsi="Montserrat"/>
-          <w:i/>
-          <w:color w:val="6A6A70"/>
-          <w:sz w:val="19"/>
-        </w:rPr>
-      </w:pPr>
-      <w:r>
-        <w:rPr>
-          <w:rFonts w:ascii="Montserrat" w:hAnsi="Montserrat"/>
-          <w:i/>
-          <w:color w:val="6A6A70"/>
-          <w:sz w:val="19"/>
-        </w:rPr>
-        <w:lastRenderedPageBreak/>
-        <w:t>Quadro de conexoes com o fator F1 selecionado - o painel a direita mostra os beneficios que ele habilita.</w:t>
-      </w:r>
-    </w:p>
-    <w:p>
-      <w:pPr>
-        <w:pStyle w:val="Ttulo2"/>
-        <w:spacing w:before="320" w:after="120"/>
-        <w:rPr>
-          <w:rFonts w:ascii="Montserrat" w:hAnsi="Montserrat"/>
-          <w:b/>
-          <w:color w:val="B91D2E"/>
-          <w:sz w:val="27"/>
-        </w:rPr>
-      </w:pPr>
-      <w:bookmarkStart w:id="35" w:name="_Toc239326887"/>
-      <w:r>
-        <w:rPr>
-          <w:rFonts w:ascii="Montserrat" w:hAnsi="Montserrat"/>
-          <w:b/>
-          <w:color w:val="B91D2E"/>
-          <w:sz w:val="27"/>
-        </w:rPr>
-        <w:t>5.2 Simulador - e se...?</w:t>
-      </w:r>
-      <w:bookmarkEnd w:id="35"/>
-    </w:p>
-    <w:p>
-      <w:pPr>
-        <w:spacing w:line="280" w:lineRule="auto"/>
-        <w:rPr>
-          <w:rFonts w:ascii="Montserrat" w:hAnsi="Montserrat"/>
-          <w:color w:val="1A1A1A"/>
-          <w:sz w:val="22"/>
-        </w:rPr>
-      </w:pPr>
-      <w:r>
-        <w:rPr>
-          <w:rFonts w:ascii="Montserrat" w:hAnsi="Montserrat"/>
-          <w:color w:val="1A1A1A"/>
-          <w:sz w:val="22"/>
-        </w:rPr>
-        <w:t>Ajuste o quanto cada fator esta presente no seu projeto (0-100%) e veja o potencial estimado de cada dimensao de beneficio recalcular em tempo real.</w:t>
-      </w:r>
-    </w:p>
-    <w:p>
-      <w:pPr>
-        <w:spacing w:before="120" w:after="40"/>
-        <w:jc w:val="center"/>
-      </w:pPr>
-      <w:r>
-        <w:rPr>
-          <w:noProof/>
-        </w:rPr>
-        <w:drawing>
-          <wp:inline distT="0" distB="0" distL="0" distR="0" wp14:anchorId="34B11C5E" wp14:editId="50183BDC">
-            <wp:extent cx="5303520" cy="4792851"/>
-            <wp:effectExtent l="19050" t="19050" r="11430" b="27305"/>
-            <wp:docPr id="1629378487" name="Imagem 43"/>
-            <wp:cNvGraphicFramePr/>
-            <a:graphic xmlns:a="http://schemas.openxmlformats.org/drawingml/2006/main">
-              <a:graphicData uri="http://schemas.openxmlformats.org/drawingml/2006/picture">
-                <pic:pic xmlns:pic="http://schemas.openxmlformats.org/drawingml/2006/picture">
-                  <pic:nvPicPr>
-                    <pic:cNvPr id="1629378487" name=""/>
+                    <pic:cNvPr id="657256037" name=""/>
                     <pic:cNvPicPr/>
                   </pic:nvPicPr>
                   <pic:blipFill>
@@ -17694,7 +17712,8 @@
           <w:color w:val="6A6A70"/>
           <w:sz w:val="19"/>
         </w:rPr>
-        <w:t>Simulador de fatores x beneficios. Abaixo dele, o aviso de login para quem quiser vincular a um projeto.</w:t>
+        <w:lastRenderedPageBreak/>
+        <w:t>Quadro de conexoes com o fator F1 selecionado - o painel a direita mostra os beneficios que ele habilita.</w:t>
       </w:r>
     </w:p>
     <w:p>
@@ -17708,7 +17727,7 @@
           <w:sz w:val="27"/>
         </w:rPr>
       </w:pPr>
-      <w:bookmarkStart w:id="36" w:name="_Toc239326888"/>
+      <w:bookmarkStart w:id="35" w:name="_Toc239349619"/>
       <w:r>
         <w:rPr>
           <w:rFonts w:ascii="Montserrat" w:hAnsi="Montserrat"/>
@@ -17716,9 +17735,9 @@
           <w:color w:val="B91D2E"/>
           <w:sz w:val="27"/>
         </w:rPr>
-        <w:t>5.3 Assistente de decisao em 8 perguntas</w:t>
-      </w:r>
-      <w:bookmarkEnd w:id="36"/>
+        <w:t>5.2 Simulador - e se...?</w:t>
+      </w:r>
+      <w:bookmarkEnd w:id="35"/>
     </w:p>
     <w:p>
       <w:pPr>
@@ -17735,7 +17754,7 @@
           <w:color w:val="1A1A1A"/>
           <w:sz w:val="22"/>
         </w:rPr>
-        <w:t>Responda a oito perguntas do semaforo de decisao, uma de cada vez. Ao final, o painel devolve um veredito com a regra aplicada.</w:t>
+        <w:t>Ajuste o quanto cada fator esta presente no seu projeto (0-100%) e veja o potencial estimado de cada dimensao de beneficio recalcular em tempo real.</w:t>
       </w:r>
     </w:p>
     <w:p>
@@ -17747,18 +17766,17 @@
         <w:rPr>
           <w:noProof/>
         </w:rPr>
-        <w:lastRenderedPageBreak/>
         <w:drawing>
-          <wp:inline distT="0" distB="0" distL="0" distR="0" wp14:anchorId="766E6AF6" wp14:editId="6DDAC2E0">
+          <wp:inline distT="0" distB="0" distL="0" distR="0" wp14:anchorId="681BAE52" wp14:editId="7BE2FB53">
             <wp:extent cx="5303520" cy="4792851"/>
             <wp:effectExtent l="19050" t="19050" r="11430" b="27305"/>
-            <wp:docPr id="2062448468" name="Imagem 44"/>
+            <wp:docPr id="384904938" name="Imagem 44"/>
             <wp:cNvGraphicFramePr/>
             <a:graphic xmlns:a="http://schemas.openxmlformats.org/drawingml/2006/main">
               <a:graphicData uri="http://schemas.openxmlformats.org/drawingml/2006/picture">
                 <pic:pic xmlns:pic="http://schemas.openxmlformats.org/drawingml/2006/picture">
                   <pic:nvPicPr>
-                    <pic:cNvPr id="2062448468" name=""/>
+                    <pic:cNvPr id="384904938" name=""/>
                     <pic:cNvPicPr/>
                   </pic:nvPicPr>
                   <pic:blipFill>
@@ -17812,7 +17830,48 @@
           <w:color w:val="6A6A70"/>
           <w:sz w:val="19"/>
         </w:rPr>
-        <w:t>Primeira pergunta do assistente de decisao.</w:t>
+        <w:t>Simulador de fatores x beneficios. Abaixo dele, o aviso de login para quem quiser vincular a um projeto.</w:t>
+      </w:r>
+    </w:p>
+    <w:p>
+      <w:pPr>
+        <w:pStyle w:val="Ttulo2"/>
+        <w:spacing w:before="320" w:after="120"/>
+        <w:rPr>
+          <w:rFonts w:ascii="Montserrat" w:hAnsi="Montserrat"/>
+          <w:b/>
+          <w:color w:val="B91D2E"/>
+          <w:sz w:val="27"/>
+        </w:rPr>
+      </w:pPr>
+      <w:bookmarkStart w:id="36" w:name="_Toc239349620"/>
+      <w:r>
+        <w:rPr>
+          <w:rFonts w:ascii="Montserrat" w:hAnsi="Montserrat"/>
+          <w:b/>
+          <w:color w:val="B91D2E"/>
+          <w:sz w:val="27"/>
+        </w:rPr>
+        <w:t>5.3 Assistente de decisao em 8 perguntas</w:t>
+      </w:r>
+      <w:bookmarkEnd w:id="36"/>
+    </w:p>
+    <w:p>
+      <w:pPr>
+        <w:spacing w:line="280" w:lineRule="auto"/>
+        <w:rPr>
+          <w:rFonts w:ascii="Montserrat" w:hAnsi="Montserrat"/>
+          <w:color w:val="1A1A1A"/>
+          <w:sz w:val="22"/>
+        </w:rPr>
+      </w:pPr>
+      <w:r>
+        <w:rPr>
+          <w:rFonts w:ascii="Montserrat" w:hAnsi="Montserrat"/>
+          <w:color w:val="1A1A1A"/>
+          <w:sz w:val="22"/>
+        </w:rPr>
+        <w:t>Responda a oito perguntas do semaforo de decisao, uma de cada vez. Ao final, o painel devolve um veredito com a regra aplicada.</w:t>
       </w:r>
     </w:p>
     <w:p>
@@ -17826,16 +17885,16 @@
         </w:rPr>
         <w:lastRenderedPageBreak/>
         <w:drawing>
-          <wp:inline distT="0" distB="0" distL="0" distR="0" wp14:anchorId="010495C1" wp14:editId="176E73DF">
+          <wp:inline distT="0" distB="0" distL="0" distR="0" wp14:anchorId="4B175C44" wp14:editId="4CDF80B9">
             <wp:extent cx="5303520" cy="4792851"/>
             <wp:effectExtent l="19050" t="19050" r="11430" b="27305"/>
-            <wp:docPr id="3774853" name="Imagem 45"/>
+            <wp:docPr id="1014747246" name="Imagem 45"/>
             <wp:cNvGraphicFramePr/>
             <a:graphic xmlns:a="http://schemas.openxmlformats.org/drawingml/2006/main">
               <a:graphicData uri="http://schemas.openxmlformats.org/drawingml/2006/picture">
                 <pic:pic xmlns:pic="http://schemas.openxmlformats.org/drawingml/2006/picture">
                   <pic:nvPicPr>
-                    <pic:cNvPr id="3774853" name=""/>
+                    <pic:cNvPr id="1014747246" name=""/>
                     <pic:cNvPicPr/>
                   </pic:nvPicPr>
                   <pic:blipFill>
@@ -17889,115 +17948,7 @@
           <w:color w:val="6A6A70"/>
           <w:sz w:val="19"/>
         </w:rPr>
-        <w:t>Veredito final, com o placar de respostas verdes/amarelas/vermelhas.</w:t>
-      </w:r>
-    </w:p>
-    <w:p>
-      <w:pPr>
-        <w:spacing w:before="160" w:after="200"/>
-        <w:ind w:left="283"/>
-        <w:rPr>
-          <w:rFonts w:ascii="Montserrat" w:hAnsi="Montserrat"/>
-          <w:i/>
-          <w:color w:val="6A6A70"/>
-          <w:sz w:val="21"/>
-        </w:rPr>
-      </w:pPr>
-      <w:r>
-        <w:rPr>
-          <w:rFonts w:ascii="Montserrat" w:hAnsi="Montserrat"/>
-          <w:i/>
-          <w:color w:val="6A6A70"/>
-          <w:sz w:val="21"/>
-        </w:rPr>
-        <w:t>Regra aplicada: qualquer resposta vermelha leva a encerrar/repactuar; tres ou mais amarelas levam a replanejar; caso contrario, o veredito e concluir.</w:t>
-      </w:r>
-    </w:p>
-    <w:p>
-      <w:pPr>
-        <w:pStyle w:val="Ttulo1"/>
-        <w:pageBreakBefore/>
-        <w:pBdr>
-          <w:bottom w:val="single" w:sz="4" w:space="0" w:color="E4E4E7"/>
-        </w:pBdr>
-        <w:spacing w:before="80" w:after="200"/>
-        <w:rPr>
-          <w:rFonts w:ascii="Montserrat" w:hAnsi="Montserrat"/>
-          <w:b/>
-          <w:color w:val="1A1A1A"/>
-          <w:sz w:val="34"/>
-        </w:rPr>
-      </w:pPr>
-      <w:bookmarkStart w:id="37" w:name="_Toc239326889"/>
-      <w:r>
-        <w:rPr>
-          <w:rFonts w:ascii="Montserrat" w:hAnsi="Montserrat"/>
-          <w:b/>
-          <w:color w:val="1A1A1A"/>
-          <w:sz w:val="34"/>
-        </w:rPr>
-        <w:lastRenderedPageBreak/>
-        <w:t>6. Administracao e Painel Executivo</w:t>
-      </w:r>
-      <w:bookmarkEnd w:id="37"/>
-    </w:p>
-    <w:p>
-      <w:pPr>
-        <w:spacing w:line="280" w:lineRule="auto"/>
-        <w:rPr>
-          <w:rFonts w:ascii="Montserrat" w:hAnsi="Montserrat"/>
-          <w:color w:val="1A1A1A"/>
-          <w:sz w:val="22"/>
-        </w:rPr>
-      </w:pPr>
-      <w:r>
-        <w:rPr>
-          <w:rFonts w:ascii="Montserrat" w:hAnsi="Montserrat"/>
-          <w:color w:val="1A1A1A"/>
-          <w:sz w:val="22"/>
-        </w:rPr>
-        <w:t>Tres paginas independentes, listadas no menu lateral em Gestao: a Administracao (gerencia usuarios, equipes e configuracoes, sempre restrita a Admin - secao 2.3), o Painel Executivo (visao consolidada e agregada de todo o sistema, com acesso configuravel por papel - secao 6.3) e o Relatorio de Resultados (indicadores estrategicos e plano de acao para a reuniao mensal de resultados, tambem com acesso configuravel por papel - secoes 6.3 e 6.7).</w:t>
-      </w:r>
-    </w:p>
-    <w:p>
-      <w:pPr>
-        <w:pStyle w:val="Ttulo2"/>
-        <w:spacing w:before="320" w:after="120"/>
-        <w:rPr>
-          <w:rFonts w:ascii="Montserrat" w:hAnsi="Montserrat"/>
-          <w:b/>
-          <w:color w:val="B91D2E"/>
-          <w:sz w:val="27"/>
-        </w:rPr>
-      </w:pPr>
-      <w:bookmarkStart w:id="38" w:name="_Toc239326890"/>
-      <w:r>
-        <w:rPr>
-          <w:rFonts w:ascii="Montserrat" w:hAnsi="Montserrat"/>
-          <w:b/>
-          <w:color w:val="B91D2E"/>
-          <w:sz w:val="27"/>
-        </w:rPr>
-        <w:t>6.1 Usuarios</w:t>
-      </w:r>
-      <w:bookmarkEnd w:id="38"/>
-    </w:p>
-    <w:p>
-      <w:pPr>
-        <w:spacing w:line="280" w:lineRule="auto"/>
-        <w:rPr>
-          <w:rFonts w:ascii="Montserrat" w:hAnsi="Montserrat"/>
-          <w:color w:val="1A1A1A"/>
-          <w:sz w:val="22"/>
-        </w:rPr>
-      </w:pPr>
-      <w:r>
-        <w:rPr>
-          <w:rFonts w:ascii="Montserrat" w:hAnsi="Montserrat"/>
-          <w:color w:val="1A1A1A"/>
-          <w:sz w:val="22"/>
-        </w:rPr>
-        <w:t>Lista todos os usuarios que ja fizeram login pelo menos uma vez, com nome, telefone (editavel diretamente na lista) e um seletor para alterar o papel.</w:t>
+        <w:t>Primeira pergunta do assistente de decisao.</w:t>
       </w:r>
     </w:p>
     <w:p>
@@ -18009,17 +17960,18 @@
         <w:rPr>
           <w:noProof/>
         </w:rPr>
+        <w:lastRenderedPageBreak/>
         <w:drawing>
-          <wp:inline distT="0" distB="0" distL="0" distR="0" wp14:anchorId="3E3A3AA3" wp14:editId="7B213705">
+          <wp:inline distT="0" distB="0" distL="0" distR="0" wp14:anchorId="4E5E1477" wp14:editId="58FEC981">
             <wp:extent cx="5303520" cy="4792851"/>
             <wp:effectExtent l="19050" t="19050" r="11430" b="27305"/>
-            <wp:docPr id="1792933856" name="Imagem 46"/>
+            <wp:docPr id="1454967594" name="Imagem 46"/>
             <wp:cNvGraphicFramePr/>
             <a:graphic xmlns:a="http://schemas.openxmlformats.org/drawingml/2006/main">
               <a:graphicData uri="http://schemas.openxmlformats.org/drawingml/2006/picture">
                 <pic:pic xmlns:pic="http://schemas.openxmlformats.org/drawingml/2006/picture">
                   <pic:nvPicPr>
-                    <pic:cNvPr id="1792933856" name=""/>
+                    <pic:cNvPr id="1454967594" name=""/>
                     <pic:cNvPicPr/>
                   </pic:nvPicPr>
                   <pic:blipFill>
@@ -18073,26 +18025,7 @@
           <w:color w:val="6A6A70"/>
           <w:sz w:val="19"/>
         </w:rPr>
-        <w:t>Aba Usuarios: nome, telefone, papel atual e seletor de alteracao de papel por usuario.</w:t>
-      </w:r>
-    </w:p>
-    <w:p>
-      <w:pPr>
-        <w:spacing w:line="280" w:lineRule="auto"/>
-        <w:rPr>
-          <w:rFonts w:ascii="Montserrat" w:hAnsi="Montserrat"/>
-          <w:color w:val="1A1A1A"/>
-          <w:sz w:val="22"/>
-        </w:rPr>
-      </w:pPr>
-      <w:r>
-        <w:rPr>
-          <w:rFonts w:ascii="Montserrat" w:hAnsi="Montserrat"/>
-          <w:color w:val="1A1A1A"/>
-          <w:sz w:val="22"/>
-        </w:rPr>
-        <w:lastRenderedPageBreak/>
-        <w:t>No topo da lista, o Admin pode pre-cadastrar uma pessoa que ainda nao fez login, preenchendo nome, telefone (opcional), e-mail e papel e clicando em + Adicionar usuario. Enquanto a pessoa nao faz o primeiro login, ela aparece na lista com o selo Pendente - 1o login, e o Admin ainda pode ajustar telefone e papel ou remover o pre-cadastro pelo botao Remover.</w:t>
+        <w:t>Veredito final, com o placar de respostas verdes/amarelas/vermelhas.</w:t>
       </w:r>
     </w:p>
     <w:p>
@@ -18113,8 +18046,36 @@
           <w:color w:val="6A6A70"/>
           <w:sz w:val="21"/>
         </w:rPr>
-        <w:t>Quando a pessoa pre-cadastrada faz o primeiro login, o sistema aplica automaticamente o nome, telefone e papel definidos pelo Admin ao perfil recem-criado - ela nao entra mais como Solicitante por padrao, e o pre-cadastro pendente desaparece da lista.</w:t>
-      </w:r>
+        <w:t>Regra aplicada: qualquer resposta vermelha leva a encerrar/repactuar; tres ou mais amarelas levam a replanejar; caso contrario, o veredito e concluir.</w:t>
+      </w:r>
+    </w:p>
+    <w:p>
+      <w:pPr>
+        <w:pStyle w:val="Ttulo1"/>
+        <w:pageBreakBefore/>
+        <w:pBdr>
+          <w:bottom w:val="single" w:sz="4" w:space="0" w:color="E4E4E7"/>
+        </w:pBdr>
+        <w:spacing w:before="80" w:after="200"/>
+        <w:rPr>
+          <w:rFonts w:ascii="Montserrat" w:hAnsi="Montserrat"/>
+          <w:b/>
+          <w:color w:val="1A1A1A"/>
+          <w:sz w:val="34"/>
+        </w:rPr>
+      </w:pPr>
+      <w:bookmarkStart w:id="37" w:name="_Toc239349621"/>
+      <w:r>
+        <w:rPr>
+          <w:rFonts w:ascii="Montserrat" w:hAnsi="Montserrat"/>
+          <w:b/>
+          <w:color w:val="1A1A1A"/>
+          <w:sz w:val="34"/>
+        </w:rPr>
+        <w:lastRenderedPageBreak/>
+        <w:t>6. Administracao e Painel Executivo</w:t>
+      </w:r>
+      <w:bookmarkEnd w:id="37"/>
     </w:p>
     <w:p>
       <w:pPr>
@@ -18131,28 +18092,7 @@
           <w:color w:val="1A1A1A"/>
           <w:sz w:val="22"/>
         </w:rPr>
-        <w:t>Cada usuario ja cadastrado (menos o proprio Admin logado) tem um botao Remover na ultima coluna. Ao clicar, o sistema checa na hora se a pessoa faz parte da equipe de algum projeto, criou algum projeto, ou tem registro criado em seu nome em algum dos 9 formularios que gravam essa informacao. Se algum desses vinculos existir, a remocao e recusada e o Admin ve exatamente qual foi o motivo; caso contrario, pede confirmacao final antes de excluir o perfil.</w:t>
-      </w:r>
-    </w:p>
-    <w:p>
-      <w:pPr>
-        <w:spacing w:before="160" w:after="200"/>
-        <w:ind w:left="283"/>
-        <w:rPr>
-          <w:rFonts w:ascii="Montserrat" w:hAnsi="Montserrat"/>
-          <w:i/>
-          <w:color w:val="6A6A70"/>
-          <w:sz w:val="21"/>
-        </w:rPr>
-      </w:pPr>
-      <w:r>
-        <w:rPr>
-          <w:rFonts w:ascii="Montserrat" w:hAnsi="Montserrat"/>
-          <w:i/>
-          <w:color w:val="6A6A70"/>
-          <w:sz w:val="21"/>
-        </w:rPr>
-        <w:t>Remover aqui apaga so o perfil (papel, nome, telefone) do sistema - nao impede a pessoa de logar de novo depois; se logar, um perfil novo e criado do zero, com o papel padrao Solicitante. Os tres formularios que sao documentos unicos e compartilhados (Plano de Comunicacao, Relatorio de Situacao e Relatorio de Entregas) nao entram na checagem automatica, por nao terem o conceito de quem criou o registro.</w:t>
+        <w:t>Tres paginas independentes, listadas no menu lateral em Gestao: a Administracao (gerencia usuarios, equipes e configuracoes, sempre restrita a Admin - secao 2.3), o Painel Executivo (visao consolidada e agregada de todo o sistema, com acesso configuravel por papel - secao 6.3) e o Relatorio de Resultados (indicadores estrategicos e plano de acao para a reuniao mensal de resultados, tambem com acesso configuravel por papel - secoes 6.3 e 6.7).</w:t>
       </w:r>
     </w:p>
     <w:p>
@@ -18166,7 +18106,7 @@
           <w:sz w:val="27"/>
         </w:rPr>
       </w:pPr>
-      <w:bookmarkStart w:id="39" w:name="_Toc239326891"/>
+      <w:bookmarkStart w:id="38" w:name="_Toc239349622"/>
       <w:r>
         <w:rPr>
           <w:rFonts w:ascii="Montserrat" w:hAnsi="Montserrat"/>
@@ -18174,9 +18114,9 @@
           <w:color w:val="B91D2E"/>
           <w:sz w:val="27"/>
         </w:rPr>
-        <w:t>6.2 Equipes</w:t>
-      </w:r>
-      <w:bookmarkEnd w:id="39"/>
+        <w:t>6.1 Usuarios</w:t>
+      </w:r>
+      <w:bookmarkEnd w:id="38"/>
     </w:p>
     <w:p>
       <w:pPr>
@@ -18193,7 +18133,7 @@
           <w:color w:val="1A1A1A"/>
           <w:sz w:val="22"/>
         </w:rPr>
-        <w:t>Define quem faz parte da equipe de cada projeto - a base da restricao por equipe descrita na secao 2.5. Selecione um projeto, escolha um papel e clique em + Adicionar a equipe.</w:t>
+        <w:t>Lista todos os usuarios que ja fizeram login pelo menos uma vez, com nome, telefone (editavel diretamente na lista) e um seletor para alterar o papel.</w:t>
       </w:r>
     </w:p>
     <w:p>
@@ -18205,18 +18145,17 @@
         <w:rPr>
           <w:noProof/>
         </w:rPr>
-        <w:lastRenderedPageBreak/>
         <w:drawing>
-          <wp:inline distT="0" distB="0" distL="0" distR="0" wp14:anchorId="1BCA6623" wp14:editId="1F54B8E1">
+          <wp:inline distT="0" distB="0" distL="0" distR="0" wp14:anchorId="264BAD71" wp14:editId="5E179AEB">
             <wp:extent cx="5303520" cy="4792851"/>
             <wp:effectExtent l="19050" t="19050" r="11430" b="27305"/>
-            <wp:docPr id="112603290" name="Imagem 47"/>
+            <wp:docPr id="663275618" name="Imagem 47"/>
             <wp:cNvGraphicFramePr/>
             <a:graphic xmlns:a="http://schemas.openxmlformats.org/drawingml/2006/main">
               <a:graphicData uri="http://schemas.openxmlformats.org/drawingml/2006/picture">
                 <pic:pic xmlns:pic="http://schemas.openxmlformats.org/drawingml/2006/picture">
                   <pic:nvPicPr>
-                    <pic:cNvPr id="112603290" name=""/>
+                    <pic:cNvPr id="663275618" name=""/>
                     <pic:cNvPicPr/>
                   </pic:nvPicPr>
                   <pic:blipFill>
@@ -18270,7 +18209,86 @@
           <w:color w:val="6A6A70"/>
           <w:sz w:val="19"/>
         </w:rPr>
-        <w:t>Aba Equipes, com um projeto selecionado e um membro ja cadastrado.</w:t>
+        <w:t>Aba Usuarios: nome, telefone, papel atual e seletor de alteracao de papel por usuario.</w:t>
+      </w:r>
+    </w:p>
+    <w:p>
+      <w:pPr>
+        <w:spacing w:line="280" w:lineRule="auto"/>
+        <w:rPr>
+          <w:rFonts w:ascii="Montserrat" w:hAnsi="Montserrat"/>
+          <w:color w:val="1A1A1A"/>
+          <w:sz w:val="22"/>
+        </w:rPr>
+      </w:pPr>
+      <w:r>
+        <w:rPr>
+          <w:rFonts w:ascii="Montserrat" w:hAnsi="Montserrat"/>
+          <w:color w:val="1A1A1A"/>
+          <w:sz w:val="22"/>
+        </w:rPr>
+        <w:lastRenderedPageBreak/>
+        <w:t>No topo da lista, o Admin pode pre-cadastrar uma pessoa que ainda nao fez login, preenchendo nome, telefone (opcional), e-mail e papel e clicando em + Adicionar usuario. Enquanto a pessoa nao faz o primeiro login, ela aparece na lista com o selo Pendente - 1o login, e o Admin ainda pode ajustar telefone e papel ou remover o pre-cadastro pelo botao Remover.</w:t>
+      </w:r>
+    </w:p>
+    <w:p>
+      <w:pPr>
+        <w:spacing w:before="160" w:after="200"/>
+        <w:ind w:left="283"/>
+        <w:rPr>
+          <w:rFonts w:ascii="Montserrat" w:hAnsi="Montserrat"/>
+          <w:i/>
+          <w:color w:val="6A6A70"/>
+          <w:sz w:val="21"/>
+        </w:rPr>
+      </w:pPr>
+      <w:r>
+        <w:rPr>
+          <w:rFonts w:ascii="Montserrat" w:hAnsi="Montserrat"/>
+          <w:i/>
+          <w:color w:val="6A6A70"/>
+          <w:sz w:val="21"/>
+        </w:rPr>
+        <w:t>Quando a pessoa pre-cadastrada faz o primeiro login, o sistema aplica automaticamente o nome, telefone e papel definidos pelo Admin ao perfil recem-criado - ela nao entra mais como Solicitante por padrao, e o pre-cadastro pendente desaparece da lista.</w:t>
+      </w:r>
+    </w:p>
+    <w:p>
+      <w:pPr>
+        <w:spacing w:line="280" w:lineRule="auto"/>
+        <w:rPr>
+          <w:rFonts w:ascii="Montserrat" w:hAnsi="Montserrat"/>
+          <w:color w:val="1A1A1A"/>
+          <w:sz w:val="22"/>
+        </w:rPr>
+      </w:pPr>
+      <w:r>
+        <w:rPr>
+          <w:rFonts w:ascii="Montserrat" w:hAnsi="Montserrat"/>
+          <w:color w:val="1A1A1A"/>
+          <w:sz w:val="22"/>
+        </w:rPr>
+        <w:t>Cada usuario ja cadastrado (menos o proprio Admin logado) tem um botao Remover na ultima coluna. Ao clicar, o sistema checa na hora se a pessoa faz parte da equipe de algum projeto, criou algum projeto, ou tem registro criado em seu nome em algum dos 9 formularios que gravam essa informacao. Se algum desses vinculos existir, a remocao e recusada e o Admin ve exatamente qual foi o motivo; caso contrario, pede confirmacao final antes de excluir o perfil.</w:t>
+      </w:r>
+    </w:p>
+    <w:p>
+      <w:pPr>
+        <w:spacing w:before="160" w:after="200"/>
+        <w:ind w:left="283"/>
+        <w:rPr>
+          <w:rFonts w:ascii="Montserrat" w:hAnsi="Montserrat"/>
+          <w:i/>
+          <w:color w:val="6A6A70"/>
+          <w:sz w:val="21"/>
+        </w:rPr>
+      </w:pPr>
+      <w:r>
+        <w:rPr>
+          <w:rFonts w:ascii="Montserrat" w:hAnsi="Montserrat"/>
+          <w:i/>
+          <w:color w:val="6A6A70"/>
+          <w:sz w:val="21"/>
+        </w:rPr>
+        <w:t>Remover aqui apaga so o perfil (papel, nome, telefone) do sistema - nao impede a pessoa de logar de novo depois; se logar, um perfil novo e criado do zero, com o papel padrao Solicitante. Os tres formularios que sao documentos unicos e compartilhados (Plano de Comunicacao, Relatorio de Situacao e Relatorio de Entregas) nao entram na checagem automatica, por nao terem o conceito de quem criou o registro.</w:t>
       </w:r>
     </w:p>
     <w:p>
@@ -18284,7 +18302,7 @@
           <w:sz w:val="27"/>
         </w:rPr>
       </w:pPr>
-      <w:bookmarkStart w:id="40" w:name="_Toc239326892"/>
+      <w:bookmarkStart w:id="39" w:name="_Toc239349623"/>
       <w:r>
         <w:rPr>
           <w:rFonts w:ascii="Montserrat" w:hAnsi="Montserrat"/>
@@ -18292,9 +18310,9 @@
           <w:color w:val="B91D2E"/>
           <w:sz w:val="27"/>
         </w:rPr>
-        <w:t>6.3 Configuracoes</w:t>
-      </w:r>
-      <w:bookmarkEnd w:id="40"/>
+        <w:t>6.2 Equipes</w:t>
+      </w:r>
+      <w:bookmarkEnd w:id="39"/>
     </w:p>
     <w:p>
       <w:pPr>
@@ -18311,7 +18329,7 @@
           <w:color w:val="1A1A1A"/>
           <w:sz w:val="22"/>
         </w:rPr>
-        <w:t>Controla os dois interruptores de acesso sem login (Solicitacao de Demanda e Ata de Reuniao), descritos na secao 2.6.</w:t>
+        <w:t>Define quem faz parte da equipe de cada projeto - a base da restricao por equipe descrita na secao 2.5. Selecione um projeto, escolha um papel e clique em + Adicionar a equipe.</w:t>
       </w:r>
     </w:p>
     <w:p>
@@ -18325,16 +18343,16 @@
         </w:rPr>
         <w:lastRenderedPageBreak/>
         <w:drawing>
-          <wp:inline distT="0" distB="0" distL="0" distR="0" wp14:anchorId="504B6B59" wp14:editId="5531BCEF">
+          <wp:inline distT="0" distB="0" distL="0" distR="0" wp14:anchorId="0A42D3A2" wp14:editId="4753F15F">
             <wp:extent cx="5303520" cy="4792851"/>
             <wp:effectExtent l="19050" t="19050" r="11430" b="27305"/>
-            <wp:docPr id="741295134" name="Imagem 48"/>
+            <wp:docPr id="782181823" name="Imagem 48"/>
             <wp:cNvGraphicFramePr/>
             <a:graphic xmlns:a="http://schemas.openxmlformats.org/drawingml/2006/main">
               <a:graphicData uri="http://schemas.openxmlformats.org/drawingml/2006/picture">
                 <pic:pic xmlns:pic="http://schemas.openxmlformats.org/drawingml/2006/picture">
                   <pic:nvPicPr>
-                    <pic:cNvPr id="741295134" name=""/>
+                    <pic:cNvPr id="782181823" name=""/>
                     <pic:cNvPicPr/>
                   </pic:nvPicPr>
                   <pic:blipFill>
@@ -18388,6 +18406,124 @@
           <w:color w:val="6A6A70"/>
           <w:sz w:val="19"/>
         </w:rPr>
+        <w:t>Aba Equipes, com um projeto selecionado e um membro ja cadastrado.</w:t>
+      </w:r>
+    </w:p>
+    <w:p>
+      <w:pPr>
+        <w:pStyle w:val="Ttulo2"/>
+        <w:spacing w:before="320" w:after="120"/>
+        <w:rPr>
+          <w:rFonts w:ascii="Montserrat" w:hAnsi="Montserrat"/>
+          <w:b/>
+          <w:color w:val="B91D2E"/>
+          <w:sz w:val="27"/>
+        </w:rPr>
+      </w:pPr>
+      <w:bookmarkStart w:id="40" w:name="_Toc239349624"/>
+      <w:r>
+        <w:rPr>
+          <w:rFonts w:ascii="Montserrat" w:hAnsi="Montserrat"/>
+          <w:b/>
+          <w:color w:val="B91D2E"/>
+          <w:sz w:val="27"/>
+        </w:rPr>
+        <w:t>6.3 Configuracoes</w:t>
+      </w:r>
+      <w:bookmarkEnd w:id="40"/>
+    </w:p>
+    <w:p>
+      <w:pPr>
+        <w:spacing w:line="280" w:lineRule="auto"/>
+        <w:rPr>
+          <w:rFonts w:ascii="Montserrat" w:hAnsi="Montserrat"/>
+          <w:color w:val="1A1A1A"/>
+          <w:sz w:val="22"/>
+        </w:rPr>
+      </w:pPr>
+      <w:r>
+        <w:rPr>
+          <w:rFonts w:ascii="Montserrat" w:hAnsi="Montserrat"/>
+          <w:color w:val="1A1A1A"/>
+          <w:sz w:val="22"/>
+        </w:rPr>
+        <w:t>Controla os dois interruptores de acesso sem login (Solicitacao de Demanda e Ata de Reuniao), descritos na secao 2.6.</w:t>
+      </w:r>
+    </w:p>
+    <w:p>
+      <w:pPr>
+        <w:spacing w:before="120" w:after="40"/>
+        <w:jc w:val="center"/>
+      </w:pPr>
+      <w:r>
+        <w:rPr>
+          <w:noProof/>
+        </w:rPr>
+        <w:lastRenderedPageBreak/>
+        <w:drawing>
+          <wp:inline distT="0" distB="0" distL="0" distR="0" wp14:anchorId="19F6149B" wp14:editId="15760D7B">
+            <wp:extent cx="5303520" cy="4792851"/>
+            <wp:effectExtent l="19050" t="19050" r="11430" b="27305"/>
+            <wp:docPr id="808025748" name="Imagem 49"/>
+            <wp:cNvGraphicFramePr/>
+            <a:graphic xmlns:a="http://schemas.openxmlformats.org/drawingml/2006/main">
+              <a:graphicData uri="http://schemas.openxmlformats.org/drawingml/2006/picture">
+                <pic:pic xmlns:pic="http://schemas.openxmlformats.org/drawingml/2006/picture">
+                  <pic:nvPicPr>
+                    <pic:cNvPr id="808025748" name=""/>
+                    <pic:cNvPicPr/>
+                  </pic:nvPicPr>
+                  <pic:blipFill>
+                    <a:blip r:embed="rId55">
+                      <a:extLst>
+                        <a:ext uri="{28A0092B-C50C-407E-A947-70E740481C1C}">
+                          <a14:useLocalDpi xmlns:a14="http://schemas.microsoft.com/office/drawing/2010/main" val="0"/>
+                        </a:ext>
+                      </a:extLst>
+                    </a:blip>
+                    <a:stretch>
+                      <a:fillRect/>
+                    </a:stretch>
+                  </pic:blipFill>
+                  <pic:spPr>
+                    <a:xfrm>
+                      <a:off x="0" y="0"/>
+                      <a:ext cx="5303520" cy="4792851"/>
+                    </a:xfrm>
+                    <a:prstGeom prst="rect">
+                      <a:avLst/>
+                    </a:prstGeom>
+                    <a:ln w="9525">
+                      <a:solidFill>
+                        <a:srgbClr val="D1D5DB"/>
+                      </a:solidFill>
+                    </a:ln>
+                  </pic:spPr>
+                </pic:pic>
+              </a:graphicData>
+            </a:graphic>
+          </wp:inline>
+        </w:drawing>
+      </w:r>
+    </w:p>
+    <w:p>
+      <w:pPr>
+        <w:spacing w:before="120" w:after="280"/>
+        <w:jc w:val="center"/>
+        <w:rPr>
+          <w:rFonts w:ascii="Montserrat" w:hAnsi="Montserrat"/>
+          <w:i/>
+          <w:color w:val="6A6A70"/>
+          <w:sz w:val="19"/>
+        </w:rPr>
+      </w:pPr>
+      <w:r>
+        <w:rPr>
+          <w:rFonts w:ascii="Montserrat" w:hAnsi="Montserrat"/>
+          <w:i/>
+          <w:color w:val="6A6A70"/>
+          <w:sz w:val="19"/>
+        </w:rPr>
         <w:t>Aba Configuracoes: os dois interruptores de acesso sem login, hoje desativados.</w:t>
       </w:r>
     </w:p>
@@ -18478,7 +18614,7 @@
           <w:sz w:val="27"/>
         </w:rPr>
       </w:pPr>
-      <w:bookmarkStart w:id="41" w:name="_Toc239326893"/>
+      <w:bookmarkStart w:id="41" w:name="_Toc239349625"/>
       <w:r>
         <w:rPr>
           <w:rFonts w:ascii="Montserrat" w:hAnsi="Montserrat"/>
@@ -18639,20 +18775,20 @@
         </w:rPr>
         <w:lastRenderedPageBreak/>
         <w:drawing>
-          <wp:inline distT="0" distB="0" distL="0" distR="0" wp14:anchorId="3A7418EA" wp14:editId="0D227067">
+          <wp:inline distT="0" distB="0" distL="0" distR="0" wp14:anchorId="462609C4" wp14:editId="73C6C4BA">
             <wp:extent cx="5303520" cy="4267180"/>
             <wp:effectExtent l="19050" t="19050" r="11430" b="19685"/>
-            <wp:docPr id="1489441297" name="Imagem 49"/>
+            <wp:docPr id="1718897544" name="Imagem 50"/>
             <wp:cNvGraphicFramePr/>
             <a:graphic xmlns:a="http://schemas.openxmlformats.org/drawingml/2006/main">
               <a:graphicData uri="http://schemas.openxmlformats.org/drawingml/2006/picture">
                 <pic:pic xmlns:pic="http://schemas.openxmlformats.org/drawingml/2006/picture">
                   <pic:nvPicPr>
-                    <pic:cNvPr id="1489441297" name=""/>
+                    <pic:cNvPr id="1718897544" name=""/>
                     <pic:cNvPicPr/>
                   </pic:nvPicPr>
                   <pic:blipFill>
-                    <a:blip r:embed="rId55">
+                    <a:blip r:embed="rId56">
                       <a:extLst>
                         <a:ext uri="{28A0092B-C50C-407E-A947-70E740481C1C}">
                           <a14:useLocalDpi xmlns:a14="http://schemas.microsoft.com/office/drawing/2010/main" val="0"/>
@@ -18716,20 +18852,20 @@
         </w:rPr>
         <w:lastRenderedPageBreak/>
         <w:drawing>
-          <wp:inline distT="0" distB="0" distL="0" distR="0" wp14:anchorId="0ECDE63F" wp14:editId="561324E7">
+          <wp:inline distT="0" distB="0" distL="0" distR="0" wp14:anchorId="32BEA494" wp14:editId="0E64F1F1">
             <wp:extent cx="5303520" cy="3382059"/>
             <wp:effectExtent l="19050" t="19050" r="11430" b="27940"/>
-            <wp:docPr id="1711384601" name="Imagem 50"/>
+            <wp:docPr id="1418666857" name="Imagem 51"/>
             <wp:cNvGraphicFramePr/>
             <a:graphic xmlns:a="http://schemas.openxmlformats.org/drawingml/2006/main">
               <a:graphicData uri="http://schemas.openxmlformats.org/drawingml/2006/picture">
                 <pic:pic xmlns:pic="http://schemas.openxmlformats.org/drawingml/2006/picture">
                   <pic:nvPicPr>
-                    <pic:cNvPr id="1711384601" name=""/>
+                    <pic:cNvPr id="1418666857" name=""/>
                     <pic:cNvPicPr/>
                   </pic:nvPicPr>
                   <pic:blipFill>
-                    <a:blip r:embed="rId56">
+                    <a:blip r:embed="rId57">
                       <a:extLst>
                         <a:ext uri="{28A0092B-C50C-407E-A947-70E740481C1C}">
                           <a14:useLocalDpi xmlns:a14="http://schemas.microsoft.com/office/drawing/2010/main" val="0"/>
@@ -18793,20 +18929,20 @@
         </w:rPr>
         <w:lastRenderedPageBreak/>
         <w:drawing>
-          <wp:inline distT="0" distB="0" distL="0" distR="0" wp14:anchorId="1B6CD252" wp14:editId="11690398">
+          <wp:inline distT="0" distB="0" distL="0" distR="0" wp14:anchorId="404DD6D3" wp14:editId="3F6A5616">
             <wp:extent cx="5303520" cy="4417800"/>
             <wp:effectExtent l="19050" t="19050" r="11430" b="20955"/>
-            <wp:docPr id="944699226" name="Imagem 51"/>
+            <wp:docPr id="843471611" name="Imagem 52"/>
             <wp:cNvGraphicFramePr/>
             <a:graphic xmlns:a="http://schemas.openxmlformats.org/drawingml/2006/main">
               <a:graphicData uri="http://schemas.openxmlformats.org/drawingml/2006/picture">
                 <pic:pic xmlns:pic="http://schemas.openxmlformats.org/drawingml/2006/picture">
                   <pic:nvPicPr>
-                    <pic:cNvPr id="944699226" name=""/>
+                    <pic:cNvPr id="843471611" name=""/>
                     <pic:cNvPicPr/>
                   </pic:nvPicPr>
                   <pic:blipFill>
-                    <a:blip r:embed="rId57">
+                    <a:blip r:embed="rId58">
                       <a:extLst>
                         <a:ext uri="{28A0092B-C50C-407E-A947-70E740481C1C}">
                           <a14:useLocalDpi xmlns:a14="http://schemas.microsoft.com/office/drawing/2010/main" val="0"/>
@@ -18912,7 +19048,7 @@
           <w:sz w:val="27"/>
         </w:rPr>
       </w:pPr>
-      <w:bookmarkStart w:id="42" w:name="_Toc239326894"/>
+      <w:bookmarkStart w:id="42" w:name="_Toc239349626"/>
       <w:r>
         <w:rPr>
           <w:rFonts w:ascii="Montserrat" w:hAnsi="Montserrat"/>
@@ -19130,20 +19266,20 @@
         </w:rPr>
         <w:lastRenderedPageBreak/>
         <w:drawing>
-          <wp:inline distT="0" distB="0" distL="0" distR="0" wp14:anchorId="16A7FB19" wp14:editId="08B26AE4">
+          <wp:inline distT="0" distB="0" distL="0" distR="0" wp14:anchorId="2A0BC8E5" wp14:editId="44EC7859">
             <wp:extent cx="5303520" cy="7628836"/>
             <wp:effectExtent l="19050" t="19050" r="11430" b="10795"/>
-            <wp:docPr id="307747033" name="Imagem 52"/>
+            <wp:docPr id="1676662617" name="Imagem 53"/>
             <wp:cNvGraphicFramePr/>
             <a:graphic xmlns:a="http://schemas.openxmlformats.org/drawingml/2006/main">
               <a:graphicData uri="http://schemas.openxmlformats.org/drawingml/2006/picture">
                 <pic:pic xmlns:pic="http://schemas.openxmlformats.org/drawingml/2006/picture">
                   <pic:nvPicPr>
-                    <pic:cNvPr id="307747033" name=""/>
+                    <pic:cNvPr id="1676662617" name=""/>
                     <pic:cNvPicPr/>
                   </pic:nvPicPr>
                   <pic:blipFill>
-                    <a:blip r:embed="rId58">
+                    <a:blip r:embed="rId59">
                       <a:extLst>
                         <a:ext uri="{28A0092B-C50C-407E-A947-70E740481C1C}">
                           <a14:useLocalDpi xmlns:a14="http://schemas.microsoft.com/office/drawing/2010/main" val="0"/>
@@ -19250,7 +19386,7 @@
           <w:sz w:val="27"/>
         </w:rPr>
       </w:pPr>
-      <w:bookmarkStart w:id="43" w:name="_Toc239326895"/>
+      <w:bookmarkStart w:id="43" w:name="_Toc239349627"/>
       <w:r>
         <w:rPr>
           <w:rFonts w:ascii="Montserrat" w:hAnsi="Montserrat"/>
@@ -19403,7 +19539,7 @@
           <w:sz w:val="27"/>
         </w:rPr>
       </w:pPr>
-      <w:bookmarkStart w:id="44" w:name="_Toc239326896"/>
+      <w:bookmarkStart w:id="44" w:name="_Toc239349628"/>
       <w:r>
         <w:rPr>
           <w:rFonts w:ascii="Montserrat" w:hAnsi="Montserrat"/>
@@ -19696,20 +19832,20 @@
           <w:noProof/>
         </w:rPr>
         <w:drawing>
-          <wp:inline distT="0" distB="0" distL="0" distR="0" wp14:anchorId="69E864F7" wp14:editId="21008074">
+          <wp:inline distT="0" distB="0" distL="0" distR="0" wp14:anchorId="66DB7EB9" wp14:editId="0CB3F1D1">
             <wp:extent cx="5303520" cy="1351384"/>
             <wp:effectExtent l="19050" t="19050" r="11430" b="20320"/>
-            <wp:docPr id="51727168" name="Imagem 53"/>
+            <wp:docPr id="1972654652" name="Imagem 54"/>
             <wp:cNvGraphicFramePr/>
             <a:graphic xmlns:a="http://schemas.openxmlformats.org/drawingml/2006/main">
               <a:graphicData uri="http://schemas.openxmlformats.org/drawingml/2006/picture">
                 <pic:pic xmlns:pic="http://schemas.openxmlformats.org/drawingml/2006/picture">
                   <pic:nvPicPr>
-                    <pic:cNvPr id="51727168" name=""/>
+                    <pic:cNvPr id="1972654652" name=""/>
                     <pic:cNvPicPr/>
                   </pic:nvPicPr>
                   <pic:blipFill>
-                    <a:blip r:embed="rId59">
+                    <a:blip r:embed="rId60">
                       <a:extLst>
                         <a:ext uri="{28A0092B-C50C-407E-A947-70E740481C1C}">
                           <a14:useLocalDpi xmlns:a14="http://schemas.microsoft.com/office/drawing/2010/main" val="0"/>
@@ -19773,7 +19909,7 @@
           <w:sz w:val="27"/>
         </w:rPr>
       </w:pPr>
-      <w:bookmarkStart w:id="45" w:name="_Toc239326897"/>
+      <w:bookmarkStart w:id="45" w:name="_Toc239349629"/>
       <w:r>
         <w:rPr>
           <w:rFonts w:ascii="Montserrat" w:hAnsi="Montserrat"/>
@@ -19885,20 +20021,20 @@
           <w:noProof/>
         </w:rPr>
         <w:drawing>
-          <wp:inline distT="0" distB="0" distL="0" distR="0" wp14:anchorId="1A8DE161" wp14:editId="58E481C9">
+          <wp:inline distT="0" distB="0" distL="0" distR="0" wp14:anchorId="0FAF5051" wp14:editId="5E0EAD81">
             <wp:extent cx="5303520" cy="1422793"/>
             <wp:effectExtent l="19050" t="19050" r="11430" b="25400"/>
-            <wp:docPr id="1278264165" name="Imagem 54"/>
+            <wp:docPr id="378229175" name="Imagem 55"/>
             <wp:cNvGraphicFramePr/>
             <a:graphic xmlns:a="http://schemas.openxmlformats.org/drawingml/2006/main">
               <a:graphicData uri="http://schemas.openxmlformats.org/drawingml/2006/picture">
                 <pic:pic xmlns:pic="http://schemas.openxmlformats.org/drawingml/2006/picture">
                   <pic:nvPicPr>
-                    <pic:cNvPr id="1278264165" name=""/>
+                    <pic:cNvPr id="378229175" name=""/>
                     <pic:cNvPicPr/>
                   </pic:nvPicPr>
                   <pic:blipFill>
-                    <a:blip r:embed="rId60">
+                    <a:blip r:embed="rId61">
                       <a:extLst>
                         <a:ext uri="{28A0092B-C50C-407E-A947-70E740481C1C}">
                           <a14:useLocalDpi xmlns:a14="http://schemas.microsoft.com/office/drawing/2010/main" val="0"/>
@@ -20049,20 +20185,20 @@
           <w:noProof/>
         </w:rPr>
         <w:drawing>
-          <wp:inline distT="0" distB="0" distL="0" distR="0" wp14:anchorId="06AC0DF4" wp14:editId="15E81807">
+          <wp:inline distT="0" distB="0" distL="0" distR="0" wp14:anchorId="165132FE" wp14:editId="5E915EAD">
             <wp:extent cx="5303520" cy="1841050"/>
             <wp:effectExtent l="19050" t="19050" r="11430" b="26035"/>
-            <wp:docPr id="1654279155" name="Imagem 55"/>
+            <wp:docPr id="1192557278" name="Imagem 56"/>
             <wp:cNvGraphicFramePr/>
             <a:graphic xmlns:a="http://schemas.openxmlformats.org/drawingml/2006/main">
               <a:graphicData uri="http://schemas.openxmlformats.org/drawingml/2006/picture">
                 <pic:pic xmlns:pic="http://schemas.openxmlformats.org/drawingml/2006/picture">
                   <pic:nvPicPr>
-                    <pic:cNvPr id="1654279155" name=""/>
+                    <pic:cNvPr id="1192557278" name=""/>
                     <pic:cNvPicPr/>
                   </pic:nvPicPr>
                   <pic:blipFill>
-                    <a:blip r:embed="rId61">
+                    <a:blip r:embed="rId62">
                       <a:extLst>
                         <a:ext uri="{28A0092B-C50C-407E-A947-70E740481C1C}">
                           <a14:useLocalDpi xmlns:a14="http://schemas.microsoft.com/office/drawing/2010/main" val="0"/>
@@ -20221,20 +20357,20 @@
           <w:noProof/>
         </w:rPr>
         <w:drawing>
-          <wp:inline distT="0" distB="0" distL="0" distR="0" wp14:anchorId="466E850D" wp14:editId="1EE6BF49">
+          <wp:inline distT="0" distB="0" distL="0" distR="0" wp14:anchorId="20B1B761" wp14:editId="1313FF6D">
             <wp:extent cx="5303520" cy="303041"/>
             <wp:effectExtent l="19050" t="19050" r="11430" b="20955"/>
-            <wp:docPr id="1710624756" name="Imagem 56"/>
+            <wp:docPr id="1972747529" name="Imagem 57"/>
             <wp:cNvGraphicFramePr/>
             <a:graphic xmlns:a="http://schemas.openxmlformats.org/drawingml/2006/main">
               <a:graphicData uri="http://schemas.openxmlformats.org/drawingml/2006/picture">
                 <pic:pic xmlns:pic="http://schemas.openxmlformats.org/drawingml/2006/picture">
                   <pic:nvPicPr>
-                    <pic:cNvPr id="1710624756" name=""/>
+                    <pic:cNvPr id="1972747529" name=""/>
                     <pic:cNvPicPr/>
                   </pic:nvPicPr>
                   <pic:blipFill>
-                    <a:blip r:embed="rId62">
+                    <a:blip r:embed="rId63">
                       <a:extLst>
                         <a:ext uri="{28A0092B-C50C-407E-A947-70E740481C1C}">
                           <a14:useLocalDpi xmlns:a14="http://schemas.microsoft.com/office/drawing/2010/main" val="0"/>
@@ -20297,20 +20433,20 @@
           <w:noProof/>
         </w:rPr>
         <w:drawing>
-          <wp:inline distT="0" distB="0" distL="0" distR="0" wp14:anchorId="00CB1E43" wp14:editId="3467379A">
+          <wp:inline distT="0" distB="0" distL="0" distR="0" wp14:anchorId="26D4076D" wp14:editId="19560B83">
             <wp:extent cx="5303520" cy="2983005"/>
             <wp:effectExtent l="19050" t="19050" r="11430" b="27305"/>
-            <wp:docPr id="38549841" name="Imagem 57"/>
+            <wp:docPr id="1278612139" name="Imagem 58"/>
             <wp:cNvGraphicFramePr/>
             <a:graphic xmlns:a="http://schemas.openxmlformats.org/drawingml/2006/main">
               <a:graphicData uri="http://schemas.openxmlformats.org/drawingml/2006/picture">
                 <pic:pic xmlns:pic="http://schemas.openxmlformats.org/drawingml/2006/picture">
                   <pic:nvPicPr>
-                    <pic:cNvPr id="38549841" name=""/>
+                    <pic:cNvPr id="1278612139" name=""/>
                     <pic:cNvPicPr/>
                   </pic:nvPicPr>
                   <pic:blipFill>
-                    <a:blip r:embed="rId63" cstate="print">
+                    <a:blip r:embed="rId64" cstate="print">
                       <a:extLst>
                         <a:ext uri="{28A0092B-C50C-407E-A947-70E740481C1C}">
                           <a14:useLocalDpi xmlns:a14="http://schemas.microsoft.com/office/drawing/2010/main" val="0"/>
@@ -20378,7 +20514,7 @@
           <w:sz w:val="34"/>
         </w:rPr>
       </w:pPr>
-      <w:bookmarkStart w:id="46" w:name="_Toc239326898"/>
+      <w:bookmarkStart w:id="46" w:name="_Toc239349630"/>
       <w:r>
         <w:rPr>
           <w:rFonts w:ascii="Montserrat" w:hAnsi="Montserrat"/>
@@ -20622,7 +20758,7 @@
           <w:sz w:val="34"/>
         </w:rPr>
       </w:pPr>
-      <w:bookmarkStart w:id="47" w:name="_Toc239326899"/>
+      <w:bookmarkStart w:id="47" w:name="_Toc239349631"/>
       <w:r>
         <w:rPr>
           <w:rFonts w:ascii="Montserrat" w:hAnsi="Montserrat"/>
@@ -22246,12 +22382,12 @@
       </w:pPr>
     </w:p>
     <w:sectPr>
-      <w:headerReference w:type="even" r:id="rId64"/>
-      <w:headerReference w:type="default" r:id="rId65"/>
-      <w:footerReference w:type="even" r:id="rId66"/>
-      <w:footerReference w:type="default" r:id="rId67"/>
-      <w:headerReference w:type="first" r:id="rId68"/>
-      <w:footerReference w:type="first" r:id="rId69"/>
+      <w:headerReference w:type="even" r:id="rId65"/>
+      <w:headerReference w:type="default" r:id="rId66"/>
+      <w:footerReference w:type="even" r:id="rId67"/>
+      <w:footerReference w:type="default" r:id="rId68"/>
+      <w:headerReference w:type="first" r:id="rId69"/>
+      <w:footerReference w:type="first" r:id="rId70"/>
       <w:pgSz w:w="12240" w:h="15840"/>
       <w:pgMar w:top="1417" w:right="1701" w:bottom="1417" w:left="1701" w:header="708" w:footer="708" w:gutter="0"/>
       <w:cols w:space="708"/>
@@ -22410,7 +22546,7 @@
 <file path=word/numbering.xml><?xml version="1.0" encoding="utf-8"?>
 <w:numbering xmlns:wpc="http://schemas.microsoft.com/office/word/2010/wordprocessingCanvas" xmlns:cx="http://schemas.microsoft.com/office/drawing/2014/chartex" xmlns:cx1="http://schemas.microsoft.com/office/drawing/2015/9/8/chartex" xmlns:cx2="http://schemas.microsoft.com/office/drawing/2015/10/21/chartex" xmlns:cx3="http://schemas.microsoft.com/office/drawing/2016/5/9/chartex" xmlns:cx4="http://schemas.microsoft.com/office/drawing/2016/5/10/chartex" xmlns:cx5="http://schemas.microsoft.com/office/drawing/2016/5/11/chartex" xmlns:cx6="http://schemas.microsoft.com/office/drawing/2016/5/12/chartex" xmlns:cx7="http://schemas.microsoft.com/office/drawing/2016/5/13/chartex" xmlns:cx8="http://schemas.microsoft.com/office/drawing/2016/5/14/chartex" xmlns:mc="http://schemas.openxmlformats.org/markup-compatibility/2006" xmlns:aink="http://schemas.microsoft.com/office/drawing/2016/ink" xmlns:am3d="http://schemas.microsoft.com/office/drawing/2017/model3d" xmlns:o="urn:schemas-microsoft-com:office:office" xmlns:oel="http://schemas.microsoft.com/office/2019/extlst" xmlns:r="http://schemas.openxmlformats.org/officeDocument/2006/relationships" xmlns:m="http://schemas.openxmlformats.org/officeDocument/2006/math" xmlns:v="urn:schemas-microsoft-com:vml" xmlns:wp14="http://schemas.microsoft.com/office/word/2010/wordprocessingDrawing" xmlns:wp="http://schemas.openxmlformats.org/drawingml/2006/wordprocessingDrawing" xmlns:w10="urn:schemas-microsoft-com:office:word" xmlns:w="http://schemas.openxmlformats.org/wordprocessingml/2006/main" xmlns:w14="http://schemas.microsoft.com/office/word/2010/wordml" xmlns:w15="http://schemas.microsoft.com/office/word/2012/wordml" xmlns:w16cex="http://schemas.microsoft.com/office/word/2018/wordml/cex" xmlns:w16cid="http://schemas.microsoft.com/office/word/2016/wordml/cid" xmlns:w16="http://schemas.microsoft.com/office/word/2018/wordml" xmlns:w16du="http://schemas.microsoft.com/office/word/2023/wordml/word16du" xmlns:w16sdtdh="http://schemas.microsoft.com/office/word/2020/wordml/sdtdatahash" xmlns:w16sdtfl="http://schemas.microsoft.com/office/word/2024/wordml/sdtformatlock" xmlns:w16se="http://schemas.microsoft.com/office/word/2015/wordml/symex" xmlns:wpg="http://schemas.microsoft.com/office/word/2010/wordprocessingGroup" xmlns:wpi="http://schemas.microsoft.com/office/word/2010/wordprocessingInk" xmlns:wne="http://schemas.microsoft.com/office/word/2006/wordml" xmlns:wps="http://schemas.microsoft.com/office/word/2010/wordprocessingShape" mc:Ignorable="w14 w15 w16se w16cid w16 w16cex w16sdtdh w16sdtfl w16du wp14">
   <w:abstractNum w:abstractNumId="0" w15:restartNumberingAfterBreak="0">
-    <w:nsid w:val="00D87FF1"/>
+    <w:nsid w:val="029C5B1D"/>
     <w:multiLevelType w:val="singleLevel"/>
     <w:tmpl w:val="04160001"/>
     <w:lvl w:ilvl="0">
@@ -22427,7 +22563,7 @@
     </w:lvl>
   </w:abstractNum>
   <w:abstractNum w:abstractNumId="1" w15:restartNumberingAfterBreak="0">
-    <w:nsid w:val="02CC753D"/>
+    <w:nsid w:val="031C0856"/>
     <w:multiLevelType w:val="singleLevel"/>
     <w:tmpl w:val="04160001"/>
     <w:lvl w:ilvl="0">
@@ -22444,7 +22580,7 @@
     </w:lvl>
   </w:abstractNum>
   <w:abstractNum w:abstractNumId="2" w15:restartNumberingAfterBreak="0">
-    <w:nsid w:val="03EC224A"/>
+    <w:nsid w:val="03E940BA"/>
     <w:multiLevelType w:val="singleLevel"/>
     <w:tmpl w:val="04160001"/>
     <w:lvl w:ilvl="0">
@@ -22461,7 +22597,7 @@
     </w:lvl>
   </w:abstractNum>
   <w:abstractNum w:abstractNumId="3" w15:restartNumberingAfterBreak="0">
-    <w:nsid w:val="05356DE4"/>
+    <w:nsid w:val="08AC665B"/>
     <w:multiLevelType w:val="singleLevel"/>
     <w:tmpl w:val="04160001"/>
     <w:lvl w:ilvl="0">
@@ -22478,7 +22614,7 @@
     </w:lvl>
   </w:abstractNum>
   <w:abstractNum w:abstractNumId="4" w15:restartNumberingAfterBreak="0">
-    <w:nsid w:val="0EFE691A"/>
+    <w:nsid w:val="0AA92D74"/>
     <w:multiLevelType w:val="singleLevel"/>
     <w:tmpl w:val="04160001"/>
     <w:lvl w:ilvl="0">
@@ -22495,7 +22631,7 @@
     </w:lvl>
   </w:abstractNum>
   <w:abstractNum w:abstractNumId="5" w15:restartNumberingAfterBreak="0">
-    <w:nsid w:val="1B733A1B"/>
+    <w:nsid w:val="0B8769EE"/>
     <w:multiLevelType w:val="singleLevel"/>
     <w:tmpl w:val="04160001"/>
     <w:lvl w:ilvl="0">
@@ -22512,7 +22648,7 @@
     </w:lvl>
   </w:abstractNum>
   <w:abstractNum w:abstractNumId="6" w15:restartNumberingAfterBreak="0">
-    <w:nsid w:val="1B734A7A"/>
+    <w:nsid w:val="104737D2"/>
     <w:multiLevelType w:val="singleLevel"/>
     <w:tmpl w:val="04160001"/>
     <w:lvl w:ilvl="0">
@@ -22529,7 +22665,7 @@
     </w:lvl>
   </w:abstractNum>
   <w:abstractNum w:abstractNumId="7" w15:restartNumberingAfterBreak="0">
-    <w:nsid w:val="1CF3567A"/>
+    <w:nsid w:val="1122067C"/>
     <w:multiLevelType w:val="singleLevel"/>
     <w:tmpl w:val="04160001"/>
     <w:lvl w:ilvl="0">
@@ -22546,7 +22682,7 @@
     </w:lvl>
   </w:abstractNum>
   <w:abstractNum w:abstractNumId="8" w15:restartNumberingAfterBreak="0">
-    <w:nsid w:val="1E304943"/>
+    <w:nsid w:val="24936054"/>
     <w:multiLevelType w:val="singleLevel"/>
     <w:tmpl w:val="04160001"/>
     <w:lvl w:ilvl="0">
@@ -22563,7 +22699,7 @@
     </w:lvl>
   </w:abstractNum>
   <w:abstractNum w:abstractNumId="9" w15:restartNumberingAfterBreak="0">
-    <w:nsid w:val="1F117414"/>
+    <w:nsid w:val="271456D3"/>
     <w:multiLevelType w:val="singleLevel"/>
     <w:tmpl w:val="04160001"/>
     <w:lvl w:ilvl="0">
@@ -22580,7 +22716,7 @@
     </w:lvl>
   </w:abstractNum>
   <w:abstractNum w:abstractNumId="10" w15:restartNumberingAfterBreak="0">
-    <w:nsid w:val="2386099A"/>
+    <w:nsid w:val="2BF17681"/>
     <w:multiLevelType w:val="singleLevel"/>
     <w:tmpl w:val="04160001"/>
     <w:lvl w:ilvl="0">
@@ -22597,7 +22733,7 @@
     </w:lvl>
   </w:abstractNum>
   <w:abstractNum w:abstractNumId="11" w15:restartNumberingAfterBreak="0">
-    <w:nsid w:val="23DC7647"/>
+    <w:nsid w:val="306C6592"/>
     <w:multiLevelType w:val="singleLevel"/>
     <w:tmpl w:val="04160001"/>
     <w:lvl w:ilvl="0">
@@ -22614,7 +22750,7 @@
     </w:lvl>
   </w:abstractNum>
   <w:abstractNum w:abstractNumId="12" w15:restartNumberingAfterBreak="0">
-    <w:nsid w:val="23E24662"/>
+    <w:nsid w:val="337A1631"/>
     <w:multiLevelType w:val="singleLevel"/>
     <w:tmpl w:val="04160001"/>
     <w:lvl w:ilvl="0">
@@ -22631,7 +22767,7 @@
     </w:lvl>
   </w:abstractNum>
   <w:abstractNum w:abstractNumId="13" w15:restartNumberingAfterBreak="0">
-    <w:nsid w:val="27290AB7"/>
+    <w:nsid w:val="35C3492B"/>
     <w:multiLevelType w:val="singleLevel"/>
     <w:tmpl w:val="04160001"/>
     <w:lvl w:ilvl="0">
@@ -22648,7 +22784,7 @@
     </w:lvl>
   </w:abstractNum>
   <w:abstractNum w:abstractNumId="14" w15:restartNumberingAfterBreak="0">
-    <w:nsid w:val="27396104"/>
+    <w:nsid w:val="3D35628B"/>
     <w:multiLevelType w:val="singleLevel"/>
     <w:tmpl w:val="04160001"/>
     <w:lvl w:ilvl="0">
@@ -22665,7 +22801,7 @@
     </w:lvl>
   </w:abstractNum>
   <w:abstractNum w:abstractNumId="15" w15:restartNumberingAfterBreak="0">
-    <w:nsid w:val="332A1073"/>
+    <w:nsid w:val="3FE86E81"/>
     <w:multiLevelType w:val="singleLevel"/>
     <w:tmpl w:val="04160001"/>
     <w:lvl w:ilvl="0">
@@ -22682,7 +22818,7 @@
     </w:lvl>
   </w:abstractNum>
   <w:abstractNum w:abstractNumId="16" w15:restartNumberingAfterBreak="0">
-    <w:nsid w:val="338B0E9A"/>
+    <w:nsid w:val="40C15F07"/>
     <w:multiLevelType w:val="singleLevel"/>
     <w:tmpl w:val="04160001"/>
     <w:lvl w:ilvl="0">
@@ -22699,7 +22835,7 @@
     </w:lvl>
   </w:abstractNum>
   <w:abstractNum w:abstractNumId="17" w15:restartNumberingAfterBreak="0">
-    <w:nsid w:val="36837A65"/>
+    <w:nsid w:val="423124D3"/>
     <w:multiLevelType w:val="singleLevel"/>
     <w:tmpl w:val="04160001"/>
     <w:lvl w:ilvl="0">
@@ -22716,7 +22852,7 @@
     </w:lvl>
   </w:abstractNum>
   <w:abstractNum w:abstractNumId="18" w15:restartNumberingAfterBreak="0">
-    <w:nsid w:val="3D2A26E8"/>
+    <w:nsid w:val="4A6F39D1"/>
     <w:multiLevelType w:val="singleLevel"/>
     <w:tmpl w:val="04160001"/>
     <w:lvl w:ilvl="0">
@@ -22733,7 +22869,7 @@
     </w:lvl>
   </w:abstractNum>
   <w:abstractNum w:abstractNumId="19" w15:restartNumberingAfterBreak="0">
-    <w:nsid w:val="3F197014"/>
+    <w:nsid w:val="4C674229"/>
     <w:multiLevelType w:val="singleLevel"/>
     <w:tmpl w:val="04160001"/>
     <w:lvl w:ilvl="0">
@@ -22750,7 +22886,7 @@
     </w:lvl>
   </w:abstractNum>
   <w:abstractNum w:abstractNumId="20" w15:restartNumberingAfterBreak="0">
-    <w:nsid w:val="429630AF"/>
+    <w:nsid w:val="55153D88"/>
     <w:multiLevelType w:val="singleLevel"/>
     <w:tmpl w:val="04160001"/>
     <w:lvl w:ilvl="0">
@@ -22767,7 +22903,7 @@
     </w:lvl>
   </w:abstractNum>
   <w:abstractNum w:abstractNumId="21" w15:restartNumberingAfterBreak="0">
-    <w:nsid w:val="4C0068E5"/>
+    <w:nsid w:val="589D5431"/>
     <w:multiLevelType w:val="singleLevel"/>
     <w:tmpl w:val="04160001"/>
     <w:lvl w:ilvl="0">
@@ -22784,7 +22920,7 @@
     </w:lvl>
   </w:abstractNum>
   <w:abstractNum w:abstractNumId="22" w15:restartNumberingAfterBreak="0">
-    <w:nsid w:val="4F9F5155"/>
+    <w:nsid w:val="5C0574DF"/>
     <w:multiLevelType w:val="singleLevel"/>
     <w:tmpl w:val="04160001"/>
     <w:lvl w:ilvl="0">
@@ -22801,7 +22937,7 @@
     </w:lvl>
   </w:abstractNum>
   <w:abstractNum w:abstractNumId="23" w15:restartNumberingAfterBreak="0">
-    <w:nsid w:val="53007303"/>
+    <w:nsid w:val="5C171B3C"/>
     <w:multiLevelType w:val="singleLevel"/>
     <w:tmpl w:val="04160001"/>
     <w:lvl w:ilvl="0">
@@ -22818,7 +22954,7 @@
     </w:lvl>
   </w:abstractNum>
   <w:abstractNum w:abstractNumId="24" w15:restartNumberingAfterBreak="0">
-    <w:nsid w:val="581D18A2"/>
+    <w:nsid w:val="5FF201D3"/>
     <w:multiLevelType w:val="singleLevel"/>
     <w:tmpl w:val="04160001"/>
     <w:lvl w:ilvl="0">
@@ -22835,7 +22971,7 @@
     </w:lvl>
   </w:abstractNum>
   <w:abstractNum w:abstractNumId="25" w15:restartNumberingAfterBreak="0">
-    <w:nsid w:val="6156737F"/>
+    <w:nsid w:val="67F034DF"/>
     <w:multiLevelType w:val="singleLevel"/>
     <w:tmpl w:val="04160001"/>
     <w:lvl w:ilvl="0">
@@ -22852,7 +22988,7 @@
     </w:lvl>
   </w:abstractNum>
   <w:abstractNum w:abstractNumId="26" w15:restartNumberingAfterBreak="0">
-    <w:nsid w:val="64DA59BA"/>
+    <w:nsid w:val="68B23B36"/>
     <w:multiLevelType w:val="singleLevel"/>
     <w:tmpl w:val="04160001"/>
     <w:lvl w:ilvl="0">
@@ -22869,7 +23005,7 @@
     </w:lvl>
   </w:abstractNum>
   <w:abstractNum w:abstractNumId="27" w15:restartNumberingAfterBreak="0">
-    <w:nsid w:val="6C262F31"/>
+    <w:nsid w:val="69553F9E"/>
     <w:multiLevelType w:val="singleLevel"/>
     <w:tmpl w:val="04160001"/>
     <w:lvl w:ilvl="0">
@@ -22886,7 +23022,7 @@
     </w:lvl>
   </w:abstractNum>
   <w:abstractNum w:abstractNumId="28" w15:restartNumberingAfterBreak="0">
-    <w:nsid w:val="6EAD30E6"/>
+    <w:nsid w:val="6E3A777F"/>
     <w:multiLevelType w:val="singleLevel"/>
     <w:tmpl w:val="04160001"/>
     <w:lvl w:ilvl="0">
@@ -22903,7 +23039,7 @@
     </w:lvl>
   </w:abstractNum>
   <w:abstractNum w:abstractNumId="29" w15:restartNumberingAfterBreak="0">
-    <w:nsid w:val="725D2842"/>
+    <w:nsid w:val="72142D51"/>
     <w:multiLevelType w:val="singleLevel"/>
     <w:tmpl w:val="04160001"/>
     <w:lvl w:ilvl="0">
@@ -22920,7 +23056,7 @@
     </w:lvl>
   </w:abstractNum>
   <w:abstractNum w:abstractNumId="30" w15:restartNumberingAfterBreak="0">
-    <w:nsid w:val="731C4BBE"/>
+    <w:nsid w:val="75700941"/>
     <w:multiLevelType w:val="singleLevel"/>
     <w:tmpl w:val="04160001"/>
     <w:lvl w:ilvl="0">
@@ -22937,7 +23073,7 @@
     </w:lvl>
   </w:abstractNum>
   <w:abstractNum w:abstractNumId="31" w15:restartNumberingAfterBreak="0">
-    <w:nsid w:val="77FF52CB"/>
+    <w:nsid w:val="77DB4CC1"/>
     <w:multiLevelType w:val="singleLevel"/>
     <w:tmpl w:val="04160001"/>
     <w:lvl w:ilvl="0">
@@ -22954,7 +23090,7 @@
     </w:lvl>
   </w:abstractNum>
   <w:abstractNum w:abstractNumId="32" w15:restartNumberingAfterBreak="0">
-    <w:nsid w:val="7B7A3F1C"/>
+    <w:nsid w:val="799B061E"/>
     <w:multiLevelType w:val="singleLevel"/>
     <w:tmpl w:val="04160001"/>
     <w:lvl w:ilvl="0">
@@ -22970,104 +23106,104 @@
       </w:rPr>
     </w:lvl>
   </w:abstractNum>
-  <w:num w:numId="1" w16cid:durableId="1348630911">
-    <w:abstractNumId w:val="18"/>
+  <w:num w:numId="1" w16cid:durableId="1881822075">
+    <w:abstractNumId w:val="26"/>
   </w:num>
-  <w:num w:numId="2" w16cid:durableId="1135180924">
+  <w:num w:numId="2" w16cid:durableId="1922372802">
+    <w:abstractNumId w:val="1"/>
+  </w:num>
+  <w:num w:numId="3" w16cid:durableId="1318387927">
+    <w:abstractNumId w:val="27"/>
+  </w:num>
+  <w:num w:numId="4" w16cid:durableId="1063914088">
+    <w:abstractNumId w:val="25"/>
+  </w:num>
+  <w:num w:numId="5" w16cid:durableId="415051785">
+    <w:abstractNumId w:val="5"/>
+  </w:num>
+  <w:num w:numId="6" w16cid:durableId="767309222">
+    <w:abstractNumId w:val="28"/>
+  </w:num>
+  <w:num w:numId="7" w16cid:durableId="1679960932">
+    <w:abstractNumId w:val="22"/>
+  </w:num>
+  <w:num w:numId="8" w16cid:durableId="1453404397">
+    <w:abstractNumId w:val="13"/>
+  </w:num>
+  <w:num w:numId="9" w16cid:durableId="743600865">
+    <w:abstractNumId w:val="29"/>
+  </w:num>
+  <w:num w:numId="10" w16cid:durableId="175270020">
+    <w:abstractNumId w:val="20"/>
+  </w:num>
+  <w:num w:numId="11" w16cid:durableId="616182360">
+    <w:abstractNumId w:val="3"/>
+  </w:num>
+  <w:num w:numId="12" w16cid:durableId="1608736749">
+    <w:abstractNumId w:val="15"/>
+  </w:num>
+  <w:num w:numId="13" w16cid:durableId="999389773">
+    <w:abstractNumId w:val="14"/>
+  </w:num>
+  <w:num w:numId="14" w16cid:durableId="2009402179">
+    <w:abstractNumId w:val="16"/>
+  </w:num>
+  <w:num w:numId="15" w16cid:durableId="1945729529">
+    <w:abstractNumId w:val="8"/>
+  </w:num>
+  <w:num w:numId="16" w16cid:durableId="1839885036">
+    <w:abstractNumId w:val="11"/>
+  </w:num>
+  <w:num w:numId="17" w16cid:durableId="180361852">
+    <w:abstractNumId w:val="17"/>
+  </w:num>
+  <w:num w:numId="18" w16cid:durableId="986127123">
+    <w:abstractNumId w:val="19"/>
+  </w:num>
+  <w:num w:numId="19" w16cid:durableId="1917863503">
+    <w:abstractNumId w:val="4"/>
+  </w:num>
+  <w:num w:numId="20" w16cid:durableId="1488784639">
+    <w:abstractNumId w:val="12"/>
+  </w:num>
+  <w:num w:numId="21" w16cid:durableId="349795504">
+    <w:abstractNumId w:val="23"/>
+  </w:num>
+  <w:num w:numId="22" w16cid:durableId="540632315">
+    <w:abstractNumId w:val="10"/>
+  </w:num>
+  <w:num w:numId="23" w16cid:durableId="67775700">
     <w:abstractNumId w:val="2"/>
   </w:num>
-  <w:num w:numId="3" w16cid:durableId="1825199703">
-    <w:abstractNumId w:val="5"/>
+  <w:num w:numId="24" w16cid:durableId="400641405">
+    <w:abstractNumId w:val="31"/>
   </w:num>
-  <w:num w:numId="4" w16cid:durableId="1110245954">
+  <w:num w:numId="25" w16cid:durableId="1869485270">
+    <w:abstractNumId w:val="0"/>
+  </w:num>
+  <w:num w:numId="26" w16cid:durableId="1586449938">
     <w:abstractNumId w:val="24"/>
   </w:num>
-  <w:num w:numId="5" w16cid:durableId="2002269433">
-    <w:abstractNumId w:val="31"/>
+  <w:num w:numId="27" w16cid:durableId="535389522">
+    <w:abstractNumId w:val="21"/>
   </w:num>
-  <w:num w:numId="6" w16cid:durableId="768427854">
-    <w:abstractNumId w:val="22"/>
-  </w:num>
-  <w:num w:numId="7" w16cid:durableId="116879285">
-    <w:abstractNumId w:val="20"/>
-  </w:num>
-  <w:num w:numId="8" w16cid:durableId="488442774">
-    <w:abstractNumId w:val="13"/>
-  </w:num>
-  <w:num w:numId="9" w16cid:durableId="626593553">
-    <w:abstractNumId w:val="10"/>
-  </w:num>
-  <w:num w:numId="10" w16cid:durableId="2117172833">
+  <w:num w:numId="28" w16cid:durableId="1821456654">
     <w:abstractNumId w:val="7"/>
   </w:num>
-  <w:num w:numId="11" w16cid:durableId="2060085021">
-    <w:abstractNumId w:val="4"/>
+  <w:num w:numId="29" w16cid:durableId="2061787339">
+    <w:abstractNumId w:val="6"/>
   </w:num>
-  <w:num w:numId="12" w16cid:durableId="293096109">
-    <w:abstractNumId w:val="8"/>
-  </w:num>
-  <w:num w:numId="13" w16cid:durableId="831065387">
-    <w:abstractNumId w:val="25"/>
-  </w:num>
-  <w:num w:numId="14" w16cid:durableId="2045404256">
+  <w:num w:numId="30" w16cid:durableId="690689284">
     <w:abstractNumId w:val="32"/>
   </w:num>
-  <w:num w:numId="15" w16cid:durableId="256014271">
-    <w:abstractNumId w:val="17"/>
-  </w:num>
-  <w:num w:numId="16" w16cid:durableId="1799760947">
-    <w:abstractNumId w:val="23"/>
-  </w:num>
-  <w:num w:numId="17" w16cid:durableId="1331446198">
-    <w:abstractNumId w:val="15"/>
-  </w:num>
-  <w:num w:numId="18" w16cid:durableId="2133857692">
-    <w:abstractNumId w:val="19"/>
-  </w:num>
-  <w:num w:numId="19" w16cid:durableId="1355690978">
-    <w:abstractNumId w:val="12"/>
-  </w:num>
-  <w:num w:numId="20" w16cid:durableId="776095841">
-    <w:abstractNumId w:val="0"/>
-  </w:num>
-  <w:num w:numId="21" w16cid:durableId="814681657">
-    <w:abstractNumId w:val="21"/>
-  </w:num>
-  <w:num w:numId="22" w16cid:durableId="419176974">
+  <w:num w:numId="31" w16cid:durableId="1901206546">
     <w:abstractNumId w:val="9"/>
   </w:num>
-  <w:num w:numId="23" w16cid:durableId="2011055711">
-    <w:abstractNumId w:val="27"/>
-  </w:num>
-  <w:num w:numId="24" w16cid:durableId="1935045123">
-    <w:abstractNumId w:val="6"/>
-  </w:num>
-  <w:num w:numId="25" w16cid:durableId="2009088463">
-    <w:abstractNumId w:val="28"/>
-  </w:num>
-  <w:num w:numId="26" w16cid:durableId="122579175">
-    <w:abstractNumId w:val="14"/>
-  </w:num>
-  <w:num w:numId="27" w16cid:durableId="1058937766">
-    <w:abstractNumId w:val="29"/>
-  </w:num>
-  <w:num w:numId="28" w16cid:durableId="1770352970">
-    <w:abstractNumId w:val="26"/>
-  </w:num>
-  <w:num w:numId="29" w16cid:durableId="1999310508">
-    <w:abstractNumId w:val="3"/>
-  </w:num>
-  <w:num w:numId="30" w16cid:durableId="497694187">
-    <w:abstractNumId w:val="11"/>
-  </w:num>
-  <w:num w:numId="31" w16cid:durableId="11614356">
-    <w:abstractNumId w:val="16"/>
-  </w:num>
-  <w:num w:numId="32" w16cid:durableId="519322006">
+  <w:num w:numId="32" w16cid:durableId="1558853618">
     <w:abstractNumId w:val="30"/>
   </w:num>
-  <w:num w:numId="33" w16cid:durableId="1062631405">
-    <w:abstractNumId w:val="1"/>
+  <w:num w:numId="33" w16cid:durableId="1528448529">
+    <w:abstractNumId w:val="18"/>
   </w:num>
 </w:numbering>
 </file>
@@ -23480,7 +23616,7 @@
     <w:link w:val="Ttulo1Char"/>
     <w:uiPriority w:val="9"/>
     <w:qFormat/>
-    <w:rsid w:val="003F56B9"/>
+    <w:rsid w:val="008A4885"/>
     <w:pPr>
       <w:keepNext/>
       <w:keepLines/>
@@ -23502,7 +23638,7 @@
     <w:uiPriority w:val="9"/>
     <w:unhideWhenUsed/>
     <w:qFormat/>
-    <w:rsid w:val="003F56B9"/>
+    <w:rsid w:val="008A4885"/>
     <w:pPr>
       <w:keepNext/>
       <w:keepLines/>
@@ -23525,7 +23661,7 @@
     <w:semiHidden/>
     <w:unhideWhenUsed/>
     <w:qFormat/>
-    <w:rsid w:val="003F56B9"/>
+    <w:rsid w:val="008A4885"/>
     <w:pPr>
       <w:keepNext/>
       <w:keepLines/>
@@ -23548,7 +23684,7 @@
     <w:semiHidden/>
     <w:unhideWhenUsed/>
     <w:qFormat/>
-    <w:rsid w:val="003F56B9"/>
+    <w:rsid w:val="008A4885"/>
     <w:pPr>
       <w:keepNext/>
       <w:keepLines/>
@@ -23571,7 +23707,7 @@
     <w:semiHidden/>
     <w:unhideWhenUsed/>
     <w:qFormat/>
-    <w:rsid w:val="003F56B9"/>
+    <w:rsid w:val="008A4885"/>
     <w:pPr>
       <w:keepNext/>
       <w:keepLines/>
@@ -23592,7 +23728,7 @@
     <w:semiHidden/>
     <w:unhideWhenUsed/>
     <w:qFormat/>
-    <w:rsid w:val="003F56B9"/>
+    <w:rsid w:val="008A4885"/>
     <w:pPr>
       <w:keepNext/>
       <w:keepLines/>
@@ -23615,7 +23751,7 @@
     <w:semiHidden/>
     <w:unhideWhenUsed/>
     <w:qFormat/>
-    <w:rsid w:val="003F56B9"/>
+    <w:rsid w:val="008A4885"/>
     <w:pPr>
       <w:keepNext/>
       <w:keepLines/>
@@ -23636,7 +23772,7 @@
     <w:semiHidden/>
     <w:unhideWhenUsed/>
     <w:qFormat/>
-    <w:rsid w:val="003F56B9"/>
+    <w:rsid w:val="008A4885"/>
     <w:pPr>
       <w:keepNext/>
       <w:keepLines/>
@@ -23659,7 +23795,7 @@
     <w:semiHidden/>
     <w:unhideWhenUsed/>
     <w:qFormat/>
-    <w:rsid w:val="003F56B9"/>
+    <w:rsid w:val="008A4885"/>
     <w:pPr>
       <w:keepNext/>
       <w:keepLines/>
@@ -23703,7 +23839,7 @@
     <w:basedOn w:val="Fontepargpadro"/>
     <w:link w:val="Ttulo1"/>
     <w:uiPriority w:val="9"/>
-    <w:rsid w:val="003F56B9"/>
+    <w:rsid w:val="008A4885"/>
     <w:rPr>
       <w:rFonts w:asciiTheme="majorHAnsi" w:eastAsiaTheme="majorEastAsia" w:hAnsiTheme="majorHAnsi" w:cstheme="majorBidi"/>
       <w:color w:val="0F4761" w:themeColor="accent1" w:themeShade="BF"/>
@@ -23716,7 +23852,7 @@
     <w:basedOn w:val="Fontepargpadro"/>
     <w:link w:val="Ttulo2"/>
     <w:uiPriority w:val="9"/>
-    <w:rsid w:val="003F56B9"/>
+    <w:rsid w:val="008A4885"/>
     <w:rPr>
       <w:rFonts w:asciiTheme="majorHAnsi" w:eastAsiaTheme="majorEastAsia" w:hAnsiTheme="majorHAnsi" w:cstheme="majorBidi"/>
       <w:color w:val="0F4761" w:themeColor="accent1" w:themeShade="BF"/>
@@ -23730,7 +23866,7 @@
     <w:link w:val="Ttulo3"/>
     <w:uiPriority w:val="9"/>
     <w:semiHidden/>
-    <w:rsid w:val="003F56B9"/>
+    <w:rsid w:val="008A4885"/>
     <w:rPr>
       <w:rFonts w:eastAsiaTheme="majorEastAsia" w:cstheme="majorBidi"/>
       <w:color w:val="0F4761" w:themeColor="accent1" w:themeShade="BF"/>
@@ -23744,7 +23880,7 @@
     <w:link w:val="Ttulo4"/>
     <w:uiPriority w:val="9"/>
     <w:semiHidden/>
-    <w:rsid w:val="003F56B9"/>
+    <w:rsid w:val="008A4885"/>
     <w:rPr>
       <w:rFonts w:eastAsiaTheme="majorEastAsia" w:cstheme="majorBidi"/>
       <w:i/>
@@ -23758,7 +23894,7 @@
     <w:link w:val="Ttulo5"/>
     <w:uiPriority w:val="9"/>
     <w:semiHidden/>
-    <w:rsid w:val="003F56B9"/>
+    <w:rsid w:val="008A4885"/>
     <w:rPr>
       <w:rFonts w:eastAsiaTheme="majorEastAsia" w:cstheme="majorBidi"/>
       <w:color w:val="0F4761" w:themeColor="accent1" w:themeShade="BF"/>
@@ -23770,7 +23906,7 @@
     <w:link w:val="Ttulo6"/>
     <w:uiPriority w:val="9"/>
     <w:semiHidden/>
-    <w:rsid w:val="003F56B9"/>
+    <w:rsid w:val="008A4885"/>
     <w:rPr>
       <w:rFonts w:eastAsiaTheme="majorEastAsia" w:cstheme="majorBidi"/>
       <w:i/>
@@ -23784,7 +23920,7 @@
     <w:link w:val="Ttulo7"/>
     <w:uiPriority w:val="9"/>
     <w:semiHidden/>
-    <w:rsid w:val="003F56B9"/>
+    <w:rsid w:val="008A4885"/>
     <w:rPr>
       <w:rFonts w:eastAsiaTheme="majorEastAsia" w:cstheme="majorBidi"/>
       <w:color w:val="595959" w:themeColor="text1" w:themeTint="A6"/>
@@ -23796,7 +23932,7 @@
     <w:link w:val="Ttulo8"/>
     <w:uiPriority w:val="9"/>
     <w:semiHidden/>
-    <w:rsid w:val="003F56B9"/>
+    <w:rsid w:val="008A4885"/>
     <w:rPr>
       <w:rFonts w:eastAsiaTheme="majorEastAsia" w:cstheme="majorBidi"/>
       <w:i/>
@@ -23810,7 +23946,7 @@
     <w:link w:val="Ttulo9"/>
     <w:uiPriority w:val="9"/>
     <w:semiHidden/>
-    <w:rsid w:val="003F56B9"/>
+    <w:rsid w:val="008A4885"/>
     <w:rPr>
       <w:rFonts w:eastAsiaTheme="majorEastAsia" w:cstheme="majorBidi"/>
       <w:color w:val="272727" w:themeColor="text1" w:themeTint="D8"/>
@@ -23823,7 +23959,7 @@
     <w:link w:val="TtuloChar"/>
     <w:uiPriority w:val="10"/>
     <w:qFormat/>
-    <w:rsid w:val="003F56B9"/>
+    <w:rsid w:val="008A4885"/>
     <w:pPr>
       <w:spacing w:after="80" w:line="240" w:lineRule="auto"/>
       <w:contextualSpacing/>
@@ -23841,7 +23977,7 @@
     <w:basedOn w:val="Fontepargpadro"/>
     <w:link w:val="Ttulo"/>
     <w:uiPriority w:val="10"/>
-    <w:rsid w:val="003F56B9"/>
+    <w:rsid w:val="008A4885"/>
     <w:rPr>
       <w:rFonts w:asciiTheme="majorHAnsi" w:eastAsiaTheme="majorEastAsia" w:hAnsiTheme="majorHAnsi" w:cstheme="majorBidi"/>
       <w:spacing w:val="-10"/>
@@ -23857,7 +23993,7 @@
     <w:link w:val="SubttuloChar"/>
     <w:uiPriority w:val="11"/>
     <w:qFormat/>
-    <w:rsid w:val="003F56B9"/>
+    <w:rsid w:val="008A4885"/>
     <w:pPr>
       <w:numPr>
         <w:ilvl w:val="1"/>
@@ -23876,7 +24012,7 @@
     <w:basedOn w:val="Fontepargpadro"/>
     <w:link w:val="Subttulo"/>
     <w:uiPriority w:val="11"/>
-    <w:rsid w:val="003F56B9"/>
+    <w:rsid w:val="008A4885"/>
     <w:rPr>
       <w:rFonts w:eastAsiaTheme="majorEastAsia" w:cstheme="majorBidi"/>
       <w:color w:val="595959" w:themeColor="text1" w:themeTint="A6"/>
@@ -23892,7 +24028,7 @@
     <w:link w:val="CitaoChar"/>
     <w:uiPriority w:val="29"/>
     <w:qFormat/>
-    <w:rsid w:val="003F56B9"/>
+    <w:rsid w:val="008A4885"/>
     <w:pPr>
       <w:spacing w:before="160"/>
       <w:jc w:val="center"/>
@@ -23908,7 +24044,7 @@
     <w:basedOn w:val="Fontepargpadro"/>
     <w:link w:val="Citao"/>
     <w:uiPriority w:val="29"/>
-    <w:rsid w:val="003F56B9"/>
+    <w:rsid w:val="008A4885"/>
     <w:rPr>
       <w:i/>
       <w:iCs/>
@@ -23920,7 +24056,7 @@
     <w:basedOn w:val="Normal"/>
     <w:uiPriority w:val="34"/>
     <w:qFormat/>
-    <w:rsid w:val="003F56B9"/>
+    <w:rsid w:val="008A4885"/>
     <w:pPr>
       <w:ind w:left="720"/>
       <w:contextualSpacing/>
@@ -23931,7 +24067,7 @@
     <w:basedOn w:val="Fontepargpadro"/>
     <w:uiPriority w:val="21"/>
     <w:qFormat/>
-    <w:rsid w:val="003F56B9"/>
+    <w:rsid w:val="008A4885"/>
     <w:rPr>
       <w:i/>
       <w:iCs/>
@@ -23945,7 +24081,7 @@
     <w:link w:val="CitaoIntensaChar"/>
     <w:uiPriority w:val="30"/>
     <w:qFormat/>
-    <w:rsid w:val="003F56B9"/>
+    <w:rsid w:val="008A4885"/>
     <w:pPr>
       <w:pBdr>
         <w:top w:val="single" w:sz="4" w:space="10" w:color="0F4761" w:themeColor="accent1" w:themeShade="BF"/>
@@ -23966,7 +24102,7 @@
     <w:basedOn w:val="Fontepargpadro"/>
     <w:link w:val="CitaoIntensa"/>
     <w:uiPriority w:val="30"/>
-    <w:rsid w:val="003F56B9"/>
+    <w:rsid w:val="008A4885"/>
     <w:rPr>
       <w:i/>
       <w:iCs/>
@@ -23978,7 +24114,7 @@
     <w:basedOn w:val="Fontepargpadro"/>
     <w:uiPriority w:val="32"/>
     <w:qFormat/>
-    <w:rsid w:val="003F56B9"/>
+    <w:rsid w:val="008A4885"/>
     <w:rPr>
       <w:b/>
       <w:bCs/>
@@ -23993,7 +24129,7 @@
     <w:link w:val="CabealhoChar"/>
     <w:uiPriority w:val="99"/>
     <w:unhideWhenUsed/>
-    <w:rsid w:val="003F56B9"/>
+    <w:rsid w:val="008A4885"/>
     <w:pPr>
       <w:tabs>
         <w:tab w:val="center" w:pos="4252"/>
@@ -24007,7 +24143,7 @@
     <w:basedOn w:val="Fontepargpadro"/>
     <w:link w:val="Cabealho"/>
     <w:uiPriority w:val="99"/>
-    <w:rsid w:val="003F56B9"/>
+    <w:rsid w:val="008A4885"/>
   </w:style>
   <w:style w:type="paragraph" w:styleId="Rodap">
     <w:name w:val="footer"/>
@@ -24015,7 +24151,7 @@
     <w:link w:val="RodapChar"/>
     <w:uiPriority w:val="99"/>
     <w:unhideWhenUsed/>
-    <w:rsid w:val="003F56B9"/>
+    <w:rsid w:val="008A4885"/>
     <w:pPr>
       <w:tabs>
         <w:tab w:val="center" w:pos="4252"/>
@@ -24029,7 +24165,7 @@
     <w:basedOn w:val="Fontepargpadro"/>
     <w:link w:val="Rodap"/>
     <w:uiPriority w:val="99"/>
-    <w:rsid w:val="003F56B9"/>
+    <w:rsid w:val="008A4885"/>
   </w:style>
   <w:style w:type="paragraph" w:styleId="Sumrio1">
     <w:name w:val="toc 1"/>
@@ -24038,7 +24174,7 @@
     <w:autoRedefine/>
     <w:uiPriority w:val="39"/>
     <w:unhideWhenUsed/>
-    <w:rsid w:val="003F56B9"/>
+    <w:rsid w:val="008A4885"/>
     <w:pPr>
       <w:spacing w:after="100"/>
     </w:pPr>
@@ -24050,7 +24186,7 @@
     <w:autoRedefine/>
     <w:uiPriority w:val="39"/>
     <w:unhideWhenUsed/>
-    <w:rsid w:val="003F56B9"/>
+    <w:rsid w:val="008A4885"/>
     <w:pPr>
       <w:spacing w:after="100"/>
       <w:ind w:left="240"/>

</xml_diff>

<commit_message>
Sincroniza documentacao de Probabilidade/Impacto/Mitigacao no Manual de Uso (v2.45)
Co-Authored-By: Claude Sonnet 5 <noreply@anthropic.com>
</commit_message>
<xml_diff>
--- a/Manual de Uso - Ferramenta de Gestao de Projetos.docx
+++ b/Manual de Uso - Ferramenta de Gestao de Projetos.docx
@@ -229,7 +229,7 @@
         <w:rPr>
           <w:noProof/>
         </w:rPr>
-        <w:instrText xml:space="preserve"> PAGEREF _Toc239349584 \h </w:instrText>
+        <w:instrText xml:space="preserve"> PAGEREF _Toc239844044 \h </w:instrText>
       </w:r>
       <w:r>
         <w:rPr>
@@ -290,7 +290,7 @@
         <w:rPr>
           <w:noProof/>
         </w:rPr>
-        <w:instrText xml:space="preserve"> PAGEREF _Toc239349585 \h </w:instrText>
+        <w:instrText xml:space="preserve"> PAGEREF _Toc239844045 \h </w:instrText>
       </w:r>
       <w:r>
         <w:rPr>
@@ -351,7 +351,7 @@
         <w:rPr>
           <w:noProof/>
         </w:rPr>
-        <w:instrText xml:space="preserve"> PAGEREF _Toc239349586 \h </w:instrText>
+        <w:instrText xml:space="preserve"> PAGEREF _Toc239844046 \h </w:instrText>
       </w:r>
       <w:r>
         <w:rPr>
@@ -412,7 +412,7 @@
         <w:rPr>
           <w:noProof/>
         </w:rPr>
-        <w:instrText xml:space="preserve"> PAGEREF _Toc239349587 \h </w:instrText>
+        <w:instrText xml:space="preserve"> PAGEREF _Toc239844047 \h </w:instrText>
       </w:r>
       <w:r>
         <w:rPr>
@@ -429,7 +429,7 @@
         <w:rPr>
           <w:noProof/>
         </w:rPr>
-        <w:t>13</w:t>
+        <w:t>14</w:t>
       </w:r>
       <w:r>
         <w:rPr>
@@ -473,7 +473,7 @@
         <w:rPr>
           <w:noProof/>
         </w:rPr>
-        <w:instrText xml:space="preserve"> PAGEREF _Toc239349588 \h </w:instrText>
+        <w:instrText xml:space="preserve"> PAGEREF _Toc239844048 \h </w:instrText>
       </w:r>
       <w:r>
         <w:rPr>
@@ -490,7 +490,7 @@
         <w:rPr>
           <w:noProof/>
         </w:rPr>
-        <w:t>14</w:t>
+        <w:t>15</w:t>
       </w:r>
       <w:r>
         <w:rPr>
@@ -534,7 +534,7 @@
         <w:rPr>
           <w:noProof/>
         </w:rPr>
-        <w:instrText xml:space="preserve"> PAGEREF _Toc239349589 \h </w:instrText>
+        <w:instrText xml:space="preserve"> PAGEREF _Toc239844049 \h </w:instrText>
       </w:r>
       <w:r>
         <w:rPr>
@@ -595,7 +595,7 @@
         <w:rPr>
           <w:noProof/>
         </w:rPr>
-        <w:instrText xml:space="preserve"> PAGEREF _Toc239349590 \h </w:instrText>
+        <w:instrText xml:space="preserve"> PAGEREF _Toc239844050 \h </w:instrText>
       </w:r>
       <w:r>
         <w:rPr>
@@ -656,7 +656,7 @@
         <w:rPr>
           <w:noProof/>
         </w:rPr>
-        <w:instrText xml:space="preserve"> PAGEREF _Toc239349591 \h </w:instrText>
+        <w:instrText xml:space="preserve"> PAGEREF _Toc239844051 \h </w:instrText>
       </w:r>
       <w:r>
         <w:rPr>
@@ -717,7 +717,7 @@
         <w:rPr>
           <w:noProof/>
         </w:rPr>
-        <w:instrText xml:space="preserve"> PAGEREF _Toc239349592 \h </w:instrText>
+        <w:instrText xml:space="preserve"> PAGEREF _Toc239844052 \h </w:instrText>
       </w:r>
       <w:r>
         <w:rPr>
@@ -778,7 +778,7 @@
         <w:rPr>
           <w:noProof/>
         </w:rPr>
-        <w:instrText xml:space="preserve"> PAGEREF _Toc239349593 \h </w:instrText>
+        <w:instrText xml:space="preserve"> PAGEREF _Toc239844053 \h </w:instrText>
       </w:r>
       <w:r>
         <w:rPr>
@@ -839,7 +839,7 @@
         <w:rPr>
           <w:noProof/>
         </w:rPr>
-        <w:instrText xml:space="preserve"> PAGEREF _Toc239349594 \h </w:instrText>
+        <w:instrText xml:space="preserve"> PAGEREF _Toc239844054 \h </w:instrText>
       </w:r>
       <w:r>
         <w:rPr>
@@ -900,7 +900,7 @@
         <w:rPr>
           <w:noProof/>
         </w:rPr>
-        <w:instrText xml:space="preserve"> PAGEREF _Toc239349595 \h </w:instrText>
+        <w:instrText xml:space="preserve"> PAGEREF _Toc239844055 \h </w:instrText>
       </w:r>
       <w:r>
         <w:rPr>
@@ -961,7 +961,7 @@
         <w:rPr>
           <w:noProof/>
         </w:rPr>
-        <w:instrText xml:space="preserve"> PAGEREF _Toc239349596 \h </w:instrText>
+        <w:instrText xml:space="preserve"> PAGEREF _Toc239844056 \h </w:instrText>
       </w:r>
       <w:r>
         <w:rPr>
@@ -1022,7 +1022,7 @@
         <w:rPr>
           <w:noProof/>
         </w:rPr>
-        <w:instrText xml:space="preserve"> PAGEREF _Toc239349597 \h </w:instrText>
+        <w:instrText xml:space="preserve"> PAGEREF _Toc239844057 \h </w:instrText>
       </w:r>
       <w:r>
         <w:rPr>
@@ -1083,7 +1083,7 @@
         <w:rPr>
           <w:noProof/>
         </w:rPr>
-        <w:instrText xml:space="preserve"> PAGEREF _Toc239349598 \h </w:instrText>
+        <w:instrText xml:space="preserve"> PAGEREF _Toc239844058 \h </w:instrText>
       </w:r>
       <w:r>
         <w:rPr>
@@ -1144,7 +1144,7 @@
         <w:rPr>
           <w:noProof/>
         </w:rPr>
-        <w:instrText xml:space="preserve"> PAGEREF _Toc239349599 \h </w:instrText>
+        <w:instrText xml:space="preserve"> PAGEREF _Toc239844059 \h </w:instrText>
       </w:r>
       <w:r>
         <w:rPr>
@@ -1205,7 +1205,7 @@
         <w:rPr>
           <w:noProof/>
         </w:rPr>
-        <w:instrText xml:space="preserve"> PAGEREF _Toc239349600 \h </w:instrText>
+        <w:instrText xml:space="preserve"> PAGEREF _Toc239844060 \h </w:instrText>
       </w:r>
       <w:r>
         <w:rPr>
@@ -1266,7 +1266,7 @@
         <w:rPr>
           <w:noProof/>
         </w:rPr>
-        <w:instrText xml:space="preserve"> PAGEREF _Toc239349601 \h </w:instrText>
+        <w:instrText xml:space="preserve"> PAGEREF _Toc239844061 \h </w:instrText>
       </w:r>
       <w:r>
         <w:rPr>
@@ -1327,7 +1327,7 @@
         <w:rPr>
           <w:noProof/>
         </w:rPr>
-        <w:instrText xml:space="preserve"> PAGEREF _Toc239349602 \h </w:instrText>
+        <w:instrText xml:space="preserve"> PAGEREF _Toc239844062 \h </w:instrText>
       </w:r>
       <w:r>
         <w:rPr>
@@ -1388,7 +1388,7 @@
         <w:rPr>
           <w:noProof/>
         </w:rPr>
-        <w:instrText xml:space="preserve"> PAGEREF _Toc239349603 \h </w:instrText>
+        <w:instrText xml:space="preserve"> PAGEREF _Toc239844063 \h </w:instrText>
       </w:r>
       <w:r>
         <w:rPr>
@@ -1449,7 +1449,7 @@
         <w:rPr>
           <w:noProof/>
         </w:rPr>
-        <w:instrText xml:space="preserve"> PAGEREF _Toc239349604 \h </w:instrText>
+        <w:instrText xml:space="preserve"> PAGEREF _Toc239844064 \h </w:instrText>
       </w:r>
       <w:r>
         <w:rPr>
@@ -1510,7 +1510,7 @@
         <w:rPr>
           <w:noProof/>
         </w:rPr>
-        <w:instrText xml:space="preserve"> PAGEREF _Toc239349605 \h </w:instrText>
+        <w:instrText xml:space="preserve"> PAGEREF _Toc239844065 \h </w:instrText>
       </w:r>
       <w:r>
         <w:rPr>
@@ -1571,7 +1571,7 @@
         <w:rPr>
           <w:noProof/>
         </w:rPr>
-        <w:instrText xml:space="preserve"> PAGEREF _Toc239349606 \h </w:instrText>
+        <w:instrText xml:space="preserve"> PAGEREF _Toc239844066 \h </w:instrText>
       </w:r>
       <w:r>
         <w:rPr>
@@ -1632,7 +1632,7 @@
         <w:rPr>
           <w:noProof/>
         </w:rPr>
-        <w:instrText xml:space="preserve"> PAGEREF _Toc239349607 \h </w:instrText>
+        <w:instrText xml:space="preserve"> PAGEREF _Toc239844067 \h </w:instrText>
       </w:r>
       <w:r>
         <w:rPr>
@@ -1693,7 +1693,7 @@
         <w:rPr>
           <w:noProof/>
         </w:rPr>
-        <w:instrText xml:space="preserve"> PAGEREF _Toc239349608 \h </w:instrText>
+        <w:instrText xml:space="preserve"> PAGEREF _Toc239844068 \h </w:instrText>
       </w:r>
       <w:r>
         <w:rPr>
@@ -1755,7 +1755,7 @@
         <w:rPr>
           <w:noProof/>
         </w:rPr>
-        <w:instrText xml:space="preserve"> PAGEREF _Toc239349609 \h </w:instrText>
+        <w:instrText xml:space="preserve"> PAGEREF _Toc239844069 \h </w:instrText>
       </w:r>
       <w:r>
         <w:rPr>
@@ -1816,7 +1816,7 @@
         <w:rPr>
           <w:noProof/>
         </w:rPr>
-        <w:instrText xml:space="preserve"> PAGEREF _Toc239349610 \h </w:instrText>
+        <w:instrText xml:space="preserve"> PAGEREF _Toc239844070 \h </w:instrText>
       </w:r>
       <w:r>
         <w:rPr>
@@ -1877,7 +1877,7 @@
         <w:rPr>
           <w:noProof/>
         </w:rPr>
-        <w:instrText xml:space="preserve"> PAGEREF _Toc239349611 \h </w:instrText>
+        <w:instrText xml:space="preserve"> PAGEREF _Toc239844071 \h </w:instrText>
       </w:r>
       <w:r>
         <w:rPr>
@@ -1938,7 +1938,7 @@
         <w:rPr>
           <w:noProof/>
         </w:rPr>
-        <w:instrText xml:space="preserve"> PAGEREF _Toc239349612 \h </w:instrText>
+        <w:instrText xml:space="preserve"> PAGEREF _Toc239844072 \h </w:instrText>
       </w:r>
       <w:r>
         <w:rPr>
@@ -1999,7 +1999,7 @@
         <w:rPr>
           <w:noProof/>
         </w:rPr>
-        <w:instrText xml:space="preserve"> PAGEREF _Toc239349613 \h </w:instrText>
+        <w:instrText xml:space="preserve"> PAGEREF _Toc239844073 \h </w:instrText>
       </w:r>
       <w:r>
         <w:rPr>
@@ -2060,7 +2060,7 @@
         <w:rPr>
           <w:noProof/>
         </w:rPr>
-        <w:instrText xml:space="preserve"> PAGEREF _Toc239349614 \h </w:instrText>
+        <w:instrText xml:space="preserve"> PAGEREF _Toc239844074 \h </w:instrText>
       </w:r>
       <w:r>
         <w:rPr>
@@ -2121,7 +2121,7 @@
         <w:rPr>
           <w:noProof/>
         </w:rPr>
-        <w:instrText xml:space="preserve"> PAGEREF _Toc239349615 \h </w:instrText>
+        <w:instrText xml:space="preserve"> PAGEREF _Toc239844075 \h </w:instrText>
       </w:r>
       <w:r>
         <w:rPr>
@@ -2182,7 +2182,7 @@
         <w:rPr>
           <w:noProof/>
         </w:rPr>
-        <w:instrText xml:space="preserve"> PAGEREF _Toc239349616 \h </w:instrText>
+        <w:instrText xml:space="preserve"> PAGEREF _Toc239844076 \h </w:instrText>
       </w:r>
       <w:r>
         <w:rPr>
@@ -2243,7 +2243,7 @@
         <w:rPr>
           <w:noProof/>
         </w:rPr>
-        <w:instrText xml:space="preserve"> PAGEREF _Toc239349617 \h </w:instrText>
+        <w:instrText xml:space="preserve"> PAGEREF _Toc239844077 \h </w:instrText>
       </w:r>
       <w:r>
         <w:rPr>
@@ -2304,7 +2304,7 @@
         <w:rPr>
           <w:noProof/>
         </w:rPr>
-        <w:instrText xml:space="preserve"> PAGEREF _Toc239349618 \h </w:instrText>
+        <w:instrText xml:space="preserve"> PAGEREF _Toc239844078 \h </w:instrText>
       </w:r>
       <w:r>
         <w:rPr>
@@ -2365,7 +2365,7 @@
         <w:rPr>
           <w:noProof/>
         </w:rPr>
-        <w:instrText xml:space="preserve"> PAGEREF _Toc239349619 \h </w:instrText>
+        <w:instrText xml:space="preserve"> PAGEREF _Toc239844079 \h </w:instrText>
       </w:r>
       <w:r>
         <w:rPr>
@@ -2426,7 +2426,7 @@
         <w:rPr>
           <w:noProof/>
         </w:rPr>
-        <w:instrText xml:space="preserve"> PAGEREF _Toc239349620 \h </w:instrText>
+        <w:instrText xml:space="preserve"> PAGEREF _Toc239844080 \h </w:instrText>
       </w:r>
       <w:r>
         <w:rPr>
@@ -2487,7 +2487,7 @@
         <w:rPr>
           <w:noProof/>
         </w:rPr>
-        <w:instrText xml:space="preserve"> PAGEREF _Toc239349621 \h </w:instrText>
+        <w:instrText xml:space="preserve"> PAGEREF _Toc239844081 \h </w:instrText>
       </w:r>
       <w:r>
         <w:rPr>
@@ -2548,7 +2548,7 @@
         <w:rPr>
           <w:noProof/>
         </w:rPr>
-        <w:instrText xml:space="preserve"> PAGEREF _Toc239349622 \h </w:instrText>
+        <w:instrText xml:space="preserve"> PAGEREF _Toc239844082 \h </w:instrText>
       </w:r>
       <w:r>
         <w:rPr>
@@ -2609,7 +2609,7 @@
         <w:rPr>
           <w:noProof/>
         </w:rPr>
-        <w:instrText xml:space="preserve"> PAGEREF _Toc239349623 \h </w:instrText>
+        <w:instrText xml:space="preserve"> PAGEREF _Toc239844083 \h </w:instrText>
       </w:r>
       <w:r>
         <w:rPr>
@@ -2670,7 +2670,7 @@
         <w:rPr>
           <w:noProof/>
         </w:rPr>
-        <w:instrText xml:space="preserve"> PAGEREF _Toc239349624 \h </w:instrText>
+        <w:instrText xml:space="preserve"> PAGEREF _Toc239844084 \h </w:instrText>
       </w:r>
       <w:r>
         <w:rPr>
@@ -2731,7 +2731,7 @@
         <w:rPr>
           <w:noProof/>
         </w:rPr>
-        <w:instrText xml:space="preserve"> PAGEREF _Toc239349625 \h </w:instrText>
+        <w:instrText xml:space="preserve"> PAGEREF _Toc239844085 \h </w:instrText>
       </w:r>
       <w:r>
         <w:rPr>
@@ -2792,7 +2792,7 @@
         <w:rPr>
           <w:noProof/>
         </w:rPr>
-        <w:instrText xml:space="preserve"> PAGEREF _Toc239349626 \h </w:instrText>
+        <w:instrText xml:space="preserve"> PAGEREF _Toc239844086 \h </w:instrText>
       </w:r>
       <w:r>
         <w:rPr>
@@ -2853,7 +2853,7 @@
         <w:rPr>
           <w:noProof/>
         </w:rPr>
-        <w:instrText xml:space="preserve"> PAGEREF _Toc239349627 \h </w:instrText>
+        <w:instrText xml:space="preserve"> PAGEREF _Toc239844087 \h </w:instrText>
       </w:r>
       <w:r>
         <w:rPr>
@@ -2914,7 +2914,7 @@
         <w:rPr>
           <w:noProof/>
         </w:rPr>
-        <w:instrText xml:space="preserve"> PAGEREF _Toc239349628 \h </w:instrText>
+        <w:instrText xml:space="preserve"> PAGEREF _Toc239844088 \h </w:instrText>
       </w:r>
       <w:r>
         <w:rPr>
@@ -2975,7 +2975,7 @@
         <w:rPr>
           <w:noProof/>
         </w:rPr>
-        <w:instrText xml:space="preserve"> PAGEREF _Toc239349629 \h </w:instrText>
+        <w:instrText xml:space="preserve"> PAGEREF _Toc239844089 \h </w:instrText>
       </w:r>
       <w:r>
         <w:rPr>
@@ -3036,7 +3036,7 @@
         <w:rPr>
           <w:noProof/>
         </w:rPr>
-        <w:instrText xml:space="preserve"> PAGEREF _Toc239349630 \h </w:instrText>
+        <w:instrText xml:space="preserve"> PAGEREF _Toc239844090 \h </w:instrText>
       </w:r>
       <w:r>
         <w:rPr>
@@ -3097,7 +3097,7 @@
         <w:rPr>
           <w:noProof/>
         </w:rPr>
-        <w:instrText xml:space="preserve"> PAGEREF _Toc239349631 \h </w:instrText>
+        <w:instrText xml:space="preserve"> PAGEREF _Toc239844091 \h </w:instrText>
       </w:r>
       <w:r>
         <w:rPr>
@@ -3173,7 +3173,7 @@
           <w:sz w:val="34"/>
         </w:rPr>
       </w:pPr>
-      <w:bookmarkStart w:id="0" w:name="_Toc239349584"/>
+      <w:bookmarkStart w:id="0" w:name="_Toc239844044"/>
       <w:r>
         <w:rPr>
           <w:rFonts w:ascii="Montserrat" w:hAnsi="Montserrat"/>
@@ -3197,7 +3197,7 @@
           <w:sz w:val="27"/>
         </w:rPr>
       </w:pPr>
-      <w:bookmarkStart w:id="1" w:name="_Toc239349585"/>
+      <w:bookmarkStart w:id="1" w:name="_Toc239844045"/>
       <w:r>
         <w:rPr>
           <w:rFonts w:ascii="Montserrat" w:hAnsi="Montserrat"/>
@@ -4116,6 +4116,24 @@
           <w:color w:val="1A1A1A"/>
           <w:sz w:val="22"/>
         </w:rPr>
+        <w:t>Esta e a versao 2.45 do manual. Em relacao a versao 2.44 (03/09/2026), o Registro de riscos do TAP (Passo 3, secao 9) ganhou os campos Probabilidade (Baixa/Media/Alta), Impacto (Baixo/Medio/Alto) e Mitigacao (texto livre), complementares aos ja existentes Status, Responsavel e Ultima revisao - cada risco agora descreve tambem a chance de ocorrer, a gravidade do efeito e a resposta planejada, com Probabilidade e Impacto exibidos como selo colorido por severidade na tela de detalhes.</w:t>
+      </w:r>
+    </w:p>
+    <w:p>
+      <w:pPr>
+        <w:spacing w:line="280" w:lineRule="auto"/>
+        <w:rPr>
+          <w:rFonts w:ascii="Montserrat" w:hAnsi="Montserrat"/>
+          <w:color w:val="1A1A1A"/>
+          <w:sz w:val="22"/>
+        </w:rPr>
+      </w:pPr>
+      <w:r>
+        <w:rPr>
+          <w:rFonts w:ascii="Montserrat" w:hAnsi="Montserrat"/>
+          <w:color w:val="1A1A1A"/>
+          <w:sz w:val="22"/>
+        </w:rPr>
         <w:t>O manual nao substitui as Diretrizes para a Gestao de Projetos da UNIALFA (documento institucional que define o framework D01 a D07) nem o documento Regras de Acesso e Permissoes (que detalha cada regra de controle de acesso); ele e o guia operacional de como usar cada ferramenta na pratica.</w:t>
       </w:r>
     </w:p>
@@ -4130,7 +4148,7 @@
           <w:sz w:val="27"/>
         </w:rPr>
       </w:pPr>
-      <w:bookmarkStart w:id="2" w:name="_Toc239349586"/>
+      <w:bookmarkStart w:id="2" w:name="_Toc239844046"/>
       <w:r>
         <w:rPr>
           <w:rFonts w:ascii="Montserrat" w:hAnsi="Montserrat"/>
@@ -4277,6 +4295,7 @@
           <w:color w:val="1A1A1A"/>
           <w:sz w:val="22"/>
         </w:rPr>
+        <w:lastRenderedPageBreak/>
         <w:t>1 Ficha do Projeto, a visao consolidada de um unico projeto, aberta a partir do Painel Executivo e sem restricao por papel (secao 6.4.1).</w:t>
       </w:r>
     </w:p>
@@ -4313,16 +4332,7 @@
           <w:color w:val="1A1A1A"/>
           <w:sz w:val="22"/>
         </w:rPr>
-        <w:t xml:space="preserve">O Mapa de Diretrizes (pagina inicial) apresenta visualmente as 7 diretrizes (D01 a D07) e mostra, para cada etapa do processo, quais ferramentas usar. E o ponto de partida recomendado para quem quer entender o processo antes de </w:t>
-      </w:r>
-      <w:r>
-        <w:rPr>
-          <w:rFonts w:ascii="Montserrat" w:hAnsi="Montserrat"/>
-          <w:color w:val="1A1A1A"/>
-          <w:sz w:val="22"/>
-        </w:rPr>
-        <w:lastRenderedPageBreak/>
-        <w:t>preencher os formularios - e a unica pagina, junto com o Validador de Projetos, que nao exige login.</w:t>
+        <w:t>O Mapa de Diretrizes (pagina inicial) apresenta visualmente as 7 diretrizes (D01 a D07) e mostra, para cada etapa do processo, quais ferramentas usar. E o ponto de partida recomendado para quem quer entender o processo antes de preencher os formularios - e a unica pagina, junto com o Validador de Projetos, que nao exige login.</w:t>
       </w:r>
     </w:p>
     <w:p>
@@ -4335,16 +4345,16 @@
           <w:noProof/>
         </w:rPr>
         <w:drawing>
-          <wp:inline distT="0" distB="0" distL="0" distR="0" wp14:anchorId="050F53C5" wp14:editId="4EA76910">
+          <wp:inline distT="0" distB="0" distL="0" distR="0" wp14:anchorId="75467D37" wp14:editId="6941ECDE">
             <wp:extent cx="5303520" cy="4792851"/>
             <wp:effectExtent l="19050" t="19050" r="11430" b="27305"/>
-            <wp:docPr id="1390228984" name="Imagem 1"/>
+            <wp:docPr id="431075562" name="Imagem 1"/>
             <wp:cNvGraphicFramePr/>
             <a:graphic xmlns:a="http://schemas.openxmlformats.org/drawingml/2006/main">
               <a:graphicData uri="http://schemas.openxmlformats.org/drawingml/2006/picture">
                 <pic:pic xmlns:pic="http://schemas.openxmlformats.org/drawingml/2006/picture">
                   <pic:nvPicPr>
-                    <pic:cNvPr id="1390228984" name=""/>
+                    <pic:cNvPr id="431075562" name=""/>
                     <pic:cNvPicPr/>
                   </pic:nvPicPr>
                   <pic:blipFill>
@@ -4412,7 +4422,7 @@
           <w:sz w:val="27"/>
         </w:rPr>
       </w:pPr>
-      <w:bookmarkStart w:id="3" w:name="_Toc239349587"/>
+      <w:bookmarkStart w:id="3" w:name="_Toc239844047"/>
       <w:r>
         <w:rPr>
           <w:rFonts w:ascii="Montserrat" w:hAnsi="Montserrat"/>
@@ -4420,6 +4430,7 @@
           <w:color w:val="B91D2E"/>
           <w:sz w:val="27"/>
         </w:rPr>
+        <w:lastRenderedPageBreak/>
         <w:t>1.3 Como acessar e fazer login</w:t>
       </w:r>
       <w:bookmarkEnd w:id="3"/>
@@ -4451,18 +4462,17 @@
         <w:rPr>
           <w:noProof/>
         </w:rPr>
-        <w:lastRenderedPageBreak/>
         <w:drawing>
-          <wp:inline distT="0" distB="0" distL="0" distR="0" wp14:anchorId="644A7D6C" wp14:editId="120B7DCC">
+          <wp:inline distT="0" distB="0" distL="0" distR="0" wp14:anchorId="69F09B34" wp14:editId="527AACAF">
             <wp:extent cx="4206240" cy="3801227"/>
             <wp:effectExtent l="19050" t="19050" r="22860" b="27940"/>
-            <wp:docPr id="2803510" name="Imagem 2"/>
+            <wp:docPr id="305227725" name="Imagem 2"/>
             <wp:cNvGraphicFramePr/>
             <a:graphic xmlns:a="http://schemas.openxmlformats.org/drawingml/2006/main">
               <a:graphicData uri="http://schemas.openxmlformats.org/drawingml/2006/picture">
                 <pic:pic xmlns:pic="http://schemas.openxmlformats.org/drawingml/2006/picture">
                   <pic:nvPicPr>
-                    <pic:cNvPr id="2803510" name=""/>
+                    <pic:cNvPr id="305227725" name=""/>
                     <pic:cNvPicPr/>
                   </pic:nvPicPr>
                   <pic:blipFill>
@@ -4635,7 +4645,7 @@
           <w:sz w:val="27"/>
         </w:rPr>
       </w:pPr>
-      <w:bookmarkStart w:id="4" w:name="_Toc239349588"/>
+      <w:bookmarkStart w:id="4" w:name="_Toc239844048"/>
       <w:r>
         <w:rPr>
           <w:rFonts w:ascii="Montserrat" w:hAnsi="Montserrat"/>
@@ -4643,6 +4653,7 @@
           <w:color w:val="B91D2E"/>
           <w:sz w:val="27"/>
         </w:rPr>
+        <w:lastRenderedPageBreak/>
         <w:t>1.4 Como a ferramenta se relaciona com as Diretrizes (D01-D07)</w:t>
       </w:r>
       <w:bookmarkEnd w:id="4"/>
@@ -4717,7 +4728,6 @@
                 <w:color w:val="FFFFFF"/>
                 <w:sz w:val="19"/>
               </w:rPr>
-              <w:lastRenderedPageBreak/>
               <w:t>Passo</w:t>
             </w:r>
           </w:p>
@@ -5874,7 +5884,7 @@
           <w:sz w:val="34"/>
         </w:rPr>
       </w:pPr>
-      <w:bookmarkStart w:id="5" w:name="_Toc239349589"/>
+      <w:bookmarkStart w:id="5" w:name="_Toc239844049"/>
       <w:r>
         <w:rPr>
           <w:rFonts w:ascii="Montserrat" w:hAnsi="Montserrat"/>
@@ -5898,7 +5908,7 @@
           <w:sz w:val="27"/>
         </w:rPr>
       </w:pPr>
-      <w:bookmarkStart w:id="6" w:name="_Toc239349590"/>
+      <w:bookmarkStart w:id="6" w:name="_Toc239844050"/>
       <w:r>
         <w:rPr>
           <w:rFonts w:ascii="Montserrat" w:hAnsi="Montserrat"/>
@@ -5939,7 +5949,7 @@
           <w:sz w:val="27"/>
         </w:rPr>
       </w:pPr>
-      <w:bookmarkStart w:id="7" w:name="_Toc239349591"/>
+      <w:bookmarkStart w:id="7" w:name="_Toc239844051"/>
       <w:r>
         <w:rPr>
           <w:rFonts w:ascii="Montserrat" w:hAnsi="Montserrat"/>
@@ -6058,7 +6068,7 @@
           <w:sz w:val="27"/>
         </w:rPr>
       </w:pPr>
-      <w:bookmarkStart w:id="8" w:name="_Toc239349592"/>
+      <w:bookmarkStart w:id="8" w:name="_Toc239844052"/>
       <w:r>
         <w:rPr>
           <w:rFonts w:ascii="Montserrat" w:hAnsi="Montserrat"/>
@@ -6671,7 +6681,7 @@
           <w:sz w:val="27"/>
         </w:rPr>
       </w:pPr>
-      <w:bookmarkStart w:id="9" w:name="_Toc239349593"/>
+      <w:bookmarkStart w:id="9" w:name="_Toc239844053"/>
       <w:r>
         <w:rPr>
           <w:rFonts w:ascii="Montserrat" w:hAnsi="Montserrat"/>
@@ -6760,16 +6770,16 @@
         </w:rPr>
         <w:lastRenderedPageBreak/>
         <w:drawing>
-          <wp:inline distT="0" distB="0" distL="0" distR="0" wp14:anchorId="0309CFC1" wp14:editId="4B9A703D">
+          <wp:inline distT="0" distB="0" distL="0" distR="0" wp14:anchorId="4DB7E510" wp14:editId="26F2D5D3">
             <wp:extent cx="4937760" cy="4462310"/>
             <wp:effectExtent l="19050" t="19050" r="15240" b="14605"/>
-            <wp:docPr id="401436499" name="Imagem 3"/>
+            <wp:docPr id="832840884" name="Imagem 3"/>
             <wp:cNvGraphicFramePr/>
             <a:graphic xmlns:a="http://schemas.openxmlformats.org/drawingml/2006/main">
               <a:graphicData uri="http://schemas.openxmlformats.org/drawingml/2006/picture">
                 <pic:pic xmlns:pic="http://schemas.openxmlformats.org/drawingml/2006/picture">
                   <pic:nvPicPr>
-                    <pic:cNvPr id="401436499" name=""/>
+                    <pic:cNvPr id="832840884" name=""/>
                     <pic:cNvPicPr/>
                   </pic:nvPicPr>
                   <pic:blipFill>
@@ -6837,7 +6847,7 @@
           <w:sz w:val="27"/>
         </w:rPr>
       </w:pPr>
-      <w:bookmarkStart w:id="10" w:name="_Toc239349594"/>
+      <w:bookmarkStart w:id="10" w:name="_Toc239844054"/>
       <w:r>
         <w:rPr>
           <w:rFonts w:ascii="Montserrat" w:hAnsi="Montserrat"/>
@@ -6878,16 +6888,16 @@
         </w:rPr>
         <w:lastRenderedPageBreak/>
         <w:drawing>
-          <wp:inline distT="0" distB="0" distL="0" distR="0" wp14:anchorId="33FF0778" wp14:editId="4A7F9D61">
+          <wp:inline distT="0" distB="0" distL="0" distR="0" wp14:anchorId="1B287239" wp14:editId="6538A3A9">
             <wp:extent cx="5120640" cy="4627581"/>
             <wp:effectExtent l="19050" t="19050" r="22860" b="20955"/>
-            <wp:docPr id="1746374136" name="Imagem 4"/>
+            <wp:docPr id="1229823147" name="Imagem 4"/>
             <wp:cNvGraphicFramePr/>
             <a:graphic xmlns:a="http://schemas.openxmlformats.org/drawingml/2006/main">
               <a:graphicData uri="http://schemas.openxmlformats.org/drawingml/2006/picture">
                 <pic:pic xmlns:pic="http://schemas.openxmlformats.org/drawingml/2006/picture">
                   <pic:nvPicPr>
-                    <pic:cNvPr id="1746374136" name=""/>
+                    <pic:cNvPr id="1229823147" name=""/>
                     <pic:cNvPicPr/>
                   </pic:nvPicPr>
                   <pic:blipFill>
@@ -7055,7 +7065,7 @@
           <w:sz w:val="27"/>
         </w:rPr>
       </w:pPr>
-      <w:bookmarkStart w:id="11" w:name="_Toc239349595"/>
+      <w:bookmarkStart w:id="11" w:name="_Toc239844055"/>
       <w:r>
         <w:rPr>
           <w:rFonts w:ascii="Montserrat" w:hAnsi="Montserrat"/>
@@ -7095,16 +7105,16 @@
           <w:noProof/>
         </w:rPr>
         <w:drawing>
-          <wp:inline distT="0" distB="0" distL="0" distR="0" wp14:anchorId="010D40ED" wp14:editId="0C396CB1">
+          <wp:inline distT="0" distB="0" distL="0" distR="0" wp14:anchorId="0BD6D983" wp14:editId="2FE3D54D">
             <wp:extent cx="4206240" cy="3801227"/>
             <wp:effectExtent l="19050" t="19050" r="22860" b="27940"/>
-            <wp:docPr id="2095227687" name="Imagem 5"/>
+            <wp:docPr id="1322214682" name="Imagem 5"/>
             <wp:cNvGraphicFramePr/>
             <a:graphic xmlns:a="http://schemas.openxmlformats.org/drawingml/2006/main">
               <a:graphicData uri="http://schemas.openxmlformats.org/drawingml/2006/picture">
                 <pic:pic xmlns:pic="http://schemas.openxmlformats.org/drawingml/2006/picture">
                   <pic:nvPicPr>
-                    <pic:cNvPr id="2095227687" name=""/>
+                    <pic:cNvPr id="1322214682" name=""/>
                     <pic:cNvPicPr/>
                   </pic:nvPicPr>
                   <pic:blipFill>
@@ -7172,16 +7182,16 @@
         </w:rPr>
         <w:lastRenderedPageBreak/>
         <w:drawing>
-          <wp:inline distT="0" distB="0" distL="0" distR="0" wp14:anchorId="1CDA5055" wp14:editId="618A2850">
+          <wp:inline distT="0" distB="0" distL="0" distR="0" wp14:anchorId="4D6F2F50" wp14:editId="0BA40F18">
             <wp:extent cx="4206240" cy="3801227"/>
             <wp:effectExtent l="19050" t="19050" r="22860" b="27940"/>
-            <wp:docPr id="753755158" name="Imagem 6"/>
+            <wp:docPr id="1763707003" name="Imagem 6"/>
             <wp:cNvGraphicFramePr/>
             <a:graphic xmlns:a="http://schemas.openxmlformats.org/drawingml/2006/main">
               <a:graphicData uri="http://schemas.openxmlformats.org/drawingml/2006/picture">
                 <pic:pic xmlns:pic="http://schemas.openxmlformats.org/drawingml/2006/picture">
                   <pic:nvPicPr>
-                    <pic:cNvPr id="753755158" name=""/>
+                    <pic:cNvPr id="1763707003" name=""/>
                     <pic:cNvPicPr/>
                   </pic:nvPicPr>
                   <pic:blipFill>
@@ -7297,7 +7307,7 @@
           <w:sz w:val="27"/>
         </w:rPr>
       </w:pPr>
-      <w:bookmarkStart w:id="12" w:name="_Toc239349596"/>
+      <w:bookmarkStart w:id="12" w:name="_Toc239844056"/>
       <w:r>
         <w:rPr>
           <w:rFonts w:ascii="Montserrat" w:hAnsi="Montserrat"/>
@@ -7365,7 +7375,7 @@
           <w:sz w:val="27"/>
         </w:rPr>
       </w:pPr>
-      <w:bookmarkStart w:id="13" w:name="_Toc239349597"/>
+      <w:bookmarkStart w:id="13" w:name="_Toc239844057"/>
       <w:r>
         <w:rPr>
           <w:rFonts w:ascii="Montserrat" w:hAnsi="Montserrat"/>
@@ -7592,7 +7602,7 @@
           <w:sz w:val="27"/>
         </w:rPr>
       </w:pPr>
-      <w:bookmarkStart w:id="14" w:name="_Toc239349598"/>
+      <w:bookmarkStart w:id="14" w:name="_Toc239844058"/>
       <w:r>
         <w:rPr>
           <w:rFonts w:ascii="Montserrat" w:hAnsi="Montserrat"/>
@@ -7751,7 +7761,7 @@
           <w:sz w:val="27"/>
         </w:rPr>
       </w:pPr>
-      <w:bookmarkStart w:id="15" w:name="_Toc239349599"/>
+      <w:bookmarkStart w:id="15" w:name="_Toc239844059"/>
       <w:r>
         <w:rPr>
           <w:rFonts w:ascii="Montserrat" w:hAnsi="Montserrat"/>
@@ -7943,7 +7953,7 @@
           <w:sz w:val="27"/>
         </w:rPr>
       </w:pPr>
-      <w:bookmarkStart w:id="16" w:name="_Toc239349600"/>
+      <w:bookmarkStart w:id="16" w:name="_Toc239844060"/>
       <w:r>
         <w:rPr>
           <w:rFonts w:ascii="Montserrat" w:hAnsi="Montserrat"/>
@@ -8071,7 +8081,7 @@
           <w:sz w:val="27"/>
         </w:rPr>
       </w:pPr>
-      <w:bookmarkStart w:id="17" w:name="_Toc239349601"/>
+      <w:bookmarkStart w:id="17" w:name="_Toc239844061"/>
       <w:r>
         <w:rPr>
           <w:rFonts w:ascii="Montserrat" w:hAnsi="Montserrat"/>
@@ -8401,7 +8411,7 @@
           <w:sz w:val="27"/>
         </w:rPr>
       </w:pPr>
-      <w:bookmarkStart w:id="18" w:name="_Toc239349602"/>
+      <w:bookmarkStart w:id="18" w:name="_Toc239844062"/>
       <w:r>
         <w:rPr>
           <w:rFonts w:ascii="Montserrat" w:hAnsi="Montserrat"/>
@@ -8542,7 +8552,7 @@
           <w:sz w:val="34"/>
         </w:rPr>
       </w:pPr>
-      <w:bookmarkStart w:id="19" w:name="_Toc239349603"/>
+      <w:bookmarkStart w:id="19" w:name="_Toc239844063"/>
       <w:r>
         <w:rPr>
           <w:rFonts w:ascii="Montserrat" w:hAnsi="Montserrat"/>
@@ -8584,7 +8594,7 @@
           <w:sz w:val="27"/>
         </w:rPr>
       </w:pPr>
-      <w:bookmarkStart w:id="20" w:name="_Toc239349604"/>
+      <w:bookmarkStart w:id="20" w:name="_Toc239844064"/>
       <w:r>
         <w:rPr>
           <w:rFonts w:ascii="Montserrat" w:hAnsi="Montserrat"/>
@@ -9664,16 +9674,16 @@
         </w:rPr>
         <w:lastRenderedPageBreak/>
         <w:drawing>
-          <wp:inline distT="0" distB="0" distL="0" distR="0" wp14:anchorId="761BA258" wp14:editId="16471EF9">
+          <wp:inline distT="0" distB="0" distL="0" distR="0" wp14:anchorId="3D8BE9C0" wp14:editId="5B34B253">
             <wp:extent cx="5120640" cy="4627581"/>
             <wp:effectExtent l="19050" t="19050" r="22860" b="20955"/>
-            <wp:docPr id="485092821" name="Imagem 7"/>
+            <wp:docPr id="496666626" name="Imagem 7"/>
             <wp:cNvGraphicFramePr/>
             <a:graphic xmlns:a="http://schemas.openxmlformats.org/drawingml/2006/main">
               <a:graphicData uri="http://schemas.openxmlformats.org/drawingml/2006/picture">
                 <pic:pic xmlns:pic="http://schemas.openxmlformats.org/drawingml/2006/picture">
                   <pic:nvPicPr>
-                    <pic:cNvPr id="485092821" name=""/>
+                    <pic:cNvPr id="496666626" name=""/>
                     <pic:cNvPicPr/>
                   </pic:nvPicPr>
                   <pic:blipFill>
@@ -9741,16 +9751,16 @@
         </w:rPr>
         <w:lastRenderedPageBreak/>
         <w:drawing>
-          <wp:inline distT="0" distB="0" distL="0" distR="0" wp14:anchorId="589F4DD5" wp14:editId="4F760CCA">
+          <wp:inline distT="0" distB="0" distL="0" distR="0" wp14:anchorId="1C22A153" wp14:editId="6407B17C">
             <wp:extent cx="5120640" cy="4627581"/>
             <wp:effectExtent l="19050" t="19050" r="22860" b="20955"/>
-            <wp:docPr id="1840361668" name="Imagem 8"/>
+            <wp:docPr id="311296254" name="Imagem 8"/>
             <wp:cNvGraphicFramePr/>
             <a:graphic xmlns:a="http://schemas.openxmlformats.org/drawingml/2006/main">
               <a:graphicData uri="http://schemas.openxmlformats.org/drawingml/2006/picture">
                 <pic:pic xmlns:pic="http://schemas.openxmlformats.org/drawingml/2006/picture">
                   <pic:nvPicPr>
-                    <pic:cNvPr id="1840361668" name=""/>
+                    <pic:cNvPr id="311296254" name=""/>
                     <pic:cNvPicPr/>
                   </pic:nvPicPr>
                   <pic:blipFill>
@@ -9958,7 +9968,7 @@
           <w:sz w:val="27"/>
         </w:rPr>
       </w:pPr>
-      <w:bookmarkStart w:id="21" w:name="_Toc239349605"/>
+      <w:bookmarkStart w:id="21" w:name="_Toc239844065"/>
       <w:r>
         <w:rPr>
           <w:rFonts w:ascii="Montserrat" w:hAnsi="Montserrat"/>
@@ -10884,16 +10894,16 @@
         </w:rPr>
         <w:lastRenderedPageBreak/>
         <w:drawing>
-          <wp:inline distT="0" distB="0" distL="0" distR="0" wp14:anchorId="27D711CA" wp14:editId="08C25B08">
+          <wp:inline distT="0" distB="0" distL="0" distR="0" wp14:anchorId="2783B714" wp14:editId="118C6565">
             <wp:extent cx="5120640" cy="4627581"/>
             <wp:effectExtent l="19050" t="19050" r="22860" b="20955"/>
-            <wp:docPr id="1953304151" name="Imagem 9"/>
+            <wp:docPr id="1961801040" name="Imagem 9"/>
             <wp:cNvGraphicFramePr/>
             <a:graphic xmlns:a="http://schemas.openxmlformats.org/drawingml/2006/main">
               <a:graphicData uri="http://schemas.openxmlformats.org/drawingml/2006/picture">
                 <pic:pic xmlns:pic="http://schemas.openxmlformats.org/drawingml/2006/picture">
                   <pic:nvPicPr>
-                    <pic:cNvPr id="1953304151" name=""/>
+                    <pic:cNvPr id="1961801040" name=""/>
                     <pic:cNvPicPr/>
                   </pic:nvPicPr>
                   <pic:blipFill>
@@ -10961,16 +10971,16 @@
         </w:rPr>
         <w:lastRenderedPageBreak/>
         <w:drawing>
-          <wp:inline distT="0" distB="0" distL="0" distR="0" wp14:anchorId="3BEC25AF" wp14:editId="7EB4FFF8">
+          <wp:inline distT="0" distB="0" distL="0" distR="0" wp14:anchorId="42490D3E" wp14:editId="6CD14D04">
             <wp:extent cx="5120640" cy="4627581"/>
             <wp:effectExtent l="19050" t="19050" r="22860" b="20955"/>
-            <wp:docPr id="501889708" name="Imagem 10"/>
+            <wp:docPr id="752445539" name="Imagem 10"/>
             <wp:cNvGraphicFramePr/>
             <a:graphic xmlns:a="http://schemas.openxmlformats.org/drawingml/2006/main">
               <a:graphicData uri="http://schemas.openxmlformats.org/drawingml/2006/picture">
                 <pic:pic xmlns:pic="http://schemas.openxmlformats.org/drawingml/2006/picture">
                   <pic:nvPicPr>
-                    <pic:cNvPr id="501889708" name=""/>
+                    <pic:cNvPr id="752445539" name=""/>
                     <pic:cNvPicPr/>
                   </pic:nvPicPr>
                   <pic:blipFill>
@@ -11104,7 +11114,7 @@
           <w:sz w:val="27"/>
         </w:rPr>
       </w:pPr>
-      <w:bookmarkStart w:id="22" w:name="_Toc239349606"/>
+      <w:bookmarkStart w:id="22" w:name="_Toc239844066"/>
       <w:r>
         <w:rPr>
           <w:rFonts w:ascii="Montserrat" w:hAnsi="Montserrat"/>
@@ -11786,7 +11796,7 @@
                 <w:color w:val="1A1A1A"/>
                 <w:sz w:val="19"/>
               </w:rPr>
-              <w:t>Registro vivo: risco, status, responsavel e data da ultima revisao</w:t>
+              <w:t>Registro vivo: risco, probabilidade, impacto, mitigacao, status, responsavel e data da ultima revisao</w:t>
             </w:r>
           </w:p>
         </w:tc>
@@ -12120,7 +12130,7 @@
           <w:color w:val="1A1A1A"/>
           <w:sz w:val="22"/>
         </w:rPr>
-        <w:t>Registro de riscos (secao 9 do formulario): diferente dos demais campos do TAP, o registro de riscos e vivo - pode ser reaberto e atualizado a qualquer momento do projeto pelo botao Editar dados, sem se limitar ao preenchimento inicial. Cada linha da tabela tem Risco, Status (Aberto, Monitorando, Mitigado, Materializado ou Encerrado, exibido como selo colorido), Responsavel e Ultima revisao (data).</w:t>
+        <w:t>Registro de riscos (secao 9 do formulario): diferente dos demais campos do TAP, o registro de riscos e vivo - pode ser reaberto e atualizado a qualquer momento do projeto pelo botao Editar dados, sem se limitar ao preenchimento inicial. Cada linha da tabela tem Risco, Probabilidade (Baixa, Media ou Alta), Impacto (Baixo, Medio ou Alto), Mitigacao (texto livre com a resposta planejada para reduzir a chance ou o efeito do risco), Status (Aberto, Monitorando, Mitigado, Materializado ou Encerrado, exibido como selo colorido), Responsavel e Ultima revisao (data). Probabilidade e Impacto tambem sao exibidos como selo colorido (verde/laranja/vermelho por severidade) na tela de detalhes.</w:t>
       </w:r>
     </w:p>
     <w:p>
@@ -12138,7 +12148,7 @@
           <w:color w:val="1A1A1A"/>
           <w:sz w:val="22"/>
         </w:rPr>
-        <w:t xml:space="preserve">Sugestoes de riscos recorrentes: ao selecionar um Projeto vinculado, o formulario analisa automaticamente o campo Entraves de todas as Atas de Reuniao ja registradas para aquele projeto e destaca, logo abaixo da tabela de riscos, qualquer entrave que se repita em 2 ou mais atas diferentes - com a contagem de atas e um botao + Adicionar ao registro que insere a sugestao direto na tabela (status Aberto, revisao com a data de hoje). E uma regra </w:t>
+        <w:t xml:space="preserve">Sugestoes de riscos recorrentes: ao selecionar um Projeto vinculado, o formulario analisa automaticamente o campo Entraves de todas as Atas de </w:t>
       </w:r>
       <w:r>
         <w:rPr>
@@ -12147,7 +12157,7 @@
           <w:sz w:val="22"/>
         </w:rPr>
         <w:lastRenderedPageBreak/>
-        <w:t>automatica de comparacao de texto, sem chamar nenhuma IA - ela so aproveita entraves ja registrados nas atas, inclusive os que tiverem sido preenchidos via Importar transcricao da reuniao (Passo 6, secao 2.10).</w:t>
+        <w:t>Reuniao ja registradas para aquele projeto e destaca, logo abaixo da tabela de riscos, qualquer entrave que se repita em 2 ou mais atas diferentes - com a contagem de atas e um botao + Adicionar ao registro que insere a sugestao direto na tabela (status Aberto, revisao com a data de hoje). E uma regra automatica de comparacao de texto, sem chamar nenhuma IA - ela so aproveita entraves ja registrados nas atas, inclusive os que tiverem sido preenchidos via Importar transcricao da reuniao (Passo 6, secao 2.10).</w:t>
       </w:r>
     </w:p>
     <w:p>
@@ -12160,16 +12170,16 @@
           <w:noProof/>
         </w:rPr>
         <w:drawing>
-          <wp:inline distT="0" distB="0" distL="0" distR="0" wp14:anchorId="1A3CF887" wp14:editId="7C7B451E">
-            <wp:extent cx="5120640" cy="3282818"/>
-            <wp:effectExtent l="19050" t="19050" r="22860" b="13335"/>
-            <wp:docPr id="1962436441" name="Imagem 11"/>
+          <wp:inline distT="0" distB="0" distL="0" distR="0" wp14:anchorId="460BDC46" wp14:editId="439ACD1F">
+            <wp:extent cx="5120640" cy="2515128"/>
+            <wp:effectExtent l="19050" t="19050" r="22860" b="19050"/>
+            <wp:docPr id="1154764387" name="Imagem 11"/>
             <wp:cNvGraphicFramePr/>
             <a:graphic xmlns:a="http://schemas.openxmlformats.org/drawingml/2006/main">
               <a:graphicData uri="http://schemas.openxmlformats.org/drawingml/2006/picture">
                 <pic:pic xmlns:pic="http://schemas.openxmlformats.org/drawingml/2006/picture">
                   <pic:nvPicPr>
-                    <pic:cNvPr id="1962436441" name=""/>
+                    <pic:cNvPr id="1154764387" name=""/>
                     <pic:cNvPicPr/>
                   </pic:nvPicPr>
                   <pic:blipFill>
@@ -12187,7 +12197,7 @@
                   <pic:spPr>
                     <a:xfrm>
                       <a:off x="0" y="0"/>
-                      <a:ext cx="5120640" cy="3282818"/>
+                      <a:ext cx="5120640" cy="2515128"/>
                     </a:xfrm>
                     <a:prstGeom prst="rect">
                       <a:avLst/>
@@ -12223,7 +12233,7 @@
           <w:color w:val="6A6A70"/>
           <w:sz w:val="19"/>
         </w:rPr>
-        <w:t>Registro de riscos preenchido, com selos de status coloridos e a caixa de sugestoes de riscos recorrentes vindas das atas do projeto.</w:t>
+        <w:t>Registro de riscos preenchido, com os campos Probabilidade, Impacto e Mitigacao, alem de Status, Responsavel e Ultima revisao.</w:t>
       </w:r>
     </w:p>
     <w:p>
@@ -12237,16 +12247,16 @@
         </w:rPr>
         <w:lastRenderedPageBreak/>
         <w:drawing>
-          <wp:inline distT="0" distB="0" distL="0" distR="0" wp14:anchorId="48E36474" wp14:editId="4B0AB5BA">
+          <wp:inline distT="0" distB="0" distL="0" distR="0" wp14:anchorId="5AB4D1B7" wp14:editId="6F9299F8">
             <wp:extent cx="5120640" cy="4627581"/>
             <wp:effectExtent l="19050" t="19050" r="22860" b="20955"/>
-            <wp:docPr id="1456805062" name="Imagem 12"/>
+            <wp:docPr id="1283066845" name="Imagem 12"/>
             <wp:cNvGraphicFramePr/>
             <a:graphic xmlns:a="http://schemas.openxmlformats.org/drawingml/2006/main">
               <a:graphicData uri="http://schemas.openxmlformats.org/drawingml/2006/picture">
                 <pic:pic xmlns:pic="http://schemas.openxmlformats.org/drawingml/2006/picture">
                   <pic:nvPicPr>
-                    <pic:cNvPr id="1456805062" name=""/>
+                    <pic:cNvPr id="1283066845" name=""/>
                     <pic:cNvPicPr/>
                   </pic:nvPicPr>
                   <pic:blipFill>
@@ -12380,7 +12390,7 @@
           <w:sz w:val="27"/>
         </w:rPr>
       </w:pPr>
-      <w:bookmarkStart w:id="23" w:name="_Toc239349607"/>
+      <w:bookmarkStart w:id="23" w:name="_Toc239844067"/>
       <w:r>
         <w:rPr>
           <w:rFonts w:ascii="Montserrat" w:hAnsi="Montserrat"/>
@@ -12942,16 +12952,16 @@
         </w:rPr>
         <w:lastRenderedPageBreak/>
         <w:drawing>
-          <wp:inline distT="0" distB="0" distL="0" distR="0" wp14:anchorId="7C605BEE" wp14:editId="280F8BB3">
+          <wp:inline distT="0" distB="0" distL="0" distR="0" wp14:anchorId="5A9B8D34" wp14:editId="58206B09">
             <wp:extent cx="5120640" cy="4627581"/>
             <wp:effectExtent l="19050" t="19050" r="22860" b="20955"/>
-            <wp:docPr id="2134296621" name="Imagem 13"/>
+            <wp:docPr id="1417470873" name="Imagem 13"/>
             <wp:cNvGraphicFramePr/>
             <a:graphic xmlns:a="http://schemas.openxmlformats.org/drawingml/2006/main">
               <a:graphicData uri="http://schemas.openxmlformats.org/drawingml/2006/picture">
                 <pic:pic xmlns:pic="http://schemas.openxmlformats.org/drawingml/2006/picture">
                   <pic:nvPicPr>
-                    <pic:cNvPr id="2134296621" name=""/>
+                    <pic:cNvPr id="1417470873" name=""/>
                     <pic:cNvPicPr/>
                   </pic:nvPicPr>
                   <pic:blipFill>
@@ -13019,16 +13029,16 @@
         </w:rPr>
         <w:lastRenderedPageBreak/>
         <w:drawing>
-          <wp:inline distT="0" distB="0" distL="0" distR="0" wp14:anchorId="2B5B3246" wp14:editId="09DC9D8C">
+          <wp:inline distT="0" distB="0" distL="0" distR="0" wp14:anchorId="499DF891" wp14:editId="3E058EF0">
             <wp:extent cx="5120640" cy="4627581"/>
             <wp:effectExtent l="19050" t="19050" r="22860" b="20955"/>
-            <wp:docPr id="2109110879" name="Imagem 14"/>
+            <wp:docPr id="1658091239" name="Imagem 14"/>
             <wp:cNvGraphicFramePr/>
             <a:graphic xmlns:a="http://schemas.openxmlformats.org/drawingml/2006/main">
               <a:graphicData uri="http://schemas.openxmlformats.org/drawingml/2006/picture">
                 <pic:pic xmlns:pic="http://schemas.openxmlformats.org/drawingml/2006/picture">
                   <pic:nvPicPr>
-                    <pic:cNvPr id="2109110879" name=""/>
+                    <pic:cNvPr id="1658091239" name=""/>
                     <pic:cNvPicPr/>
                   </pic:nvPicPr>
                   <pic:blipFill>
@@ -13162,7 +13172,7 @@
           <w:sz w:val="27"/>
         </w:rPr>
       </w:pPr>
-      <w:bookmarkStart w:id="24" w:name="_Toc239349608"/>
+      <w:bookmarkStart w:id="24" w:name="_Toc239844068"/>
       <w:r>
         <w:rPr>
           <w:rFonts w:ascii="Montserrat" w:hAnsi="Montserrat"/>
@@ -13203,16 +13213,16 @@
           <w:noProof/>
         </w:rPr>
         <w:drawing>
-          <wp:inline distT="0" distB="0" distL="0" distR="0" wp14:anchorId="31F68021" wp14:editId="3526023E">
+          <wp:inline distT="0" distB="0" distL="0" distR="0" wp14:anchorId="62C7E3DF" wp14:editId="59391399">
             <wp:extent cx="5120640" cy="4627581"/>
             <wp:effectExtent l="19050" t="19050" r="22860" b="20955"/>
-            <wp:docPr id="956573530" name="Imagem 15"/>
+            <wp:docPr id="2135399228" name="Imagem 15"/>
             <wp:cNvGraphicFramePr/>
             <a:graphic xmlns:a="http://schemas.openxmlformats.org/drawingml/2006/main">
               <a:graphicData uri="http://schemas.openxmlformats.org/drawingml/2006/picture">
                 <pic:pic xmlns:pic="http://schemas.openxmlformats.org/drawingml/2006/picture">
                   <pic:nvPicPr>
-                    <pic:cNvPr id="956573530" name=""/>
+                    <pic:cNvPr id="2135399228" name=""/>
                     <pic:cNvPicPr/>
                   </pic:nvPicPr>
                   <pic:blipFill>
@@ -13280,16 +13290,16 @@
         </w:rPr>
         <w:lastRenderedPageBreak/>
         <w:drawing>
-          <wp:inline distT="0" distB="0" distL="0" distR="0" wp14:anchorId="2B768C0D" wp14:editId="6A8A3DF0">
+          <wp:inline distT="0" distB="0" distL="0" distR="0" wp14:anchorId="759938B7" wp14:editId="66E006DE">
             <wp:extent cx="5120640" cy="4627581"/>
             <wp:effectExtent l="19050" t="19050" r="22860" b="20955"/>
-            <wp:docPr id="1742159872" name="Imagem 16"/>
+            <wp:docPr id="187221708" name="Imagem 16"/>
             <wp:cNvGraphicFramePr/>
             <a:graphic xmlns:a="http://schemas.openxmlformats.org/drawingml/2006/main">
               <a:graphicData uri="http://schemas.openxmlformats.org/drawingml/2006/picture">
                 <pic:pic xmlns:pic="http://schemas.openxmlformats.org/drawingml/2006/picture">
                   <pic:nvPicPr>
-                    <pic:cNvPr id="1742159872" name=""/>
+                    <pic:cNvPr id="187221708" name=""/>
                     <pic:cNvPicPr/>
                   </pic:nvPicPr>
                   <pic:blipFill>
@@ -13453,16 +13463,16 @@
         </w:rPr>
         <w:lastRenderedPageBreak/>
         <w:drawing>
-          <wp:inline distT="0" distB="0" distL="0" distR="0" wp14:anchorId="29FA5D8D" wp14:editId="6E871749">
+          <wp:inline distT="0" distB="0" distL="0" distR="0" wp14:anchorId="1857E8A9" wp14:editId="651BF3C5">
             <wp:extent cx="5120640" cy="3282818"/>
             <wp:effectExtent l="19050" t="19050" r="22860" b="13335"/>
-            <wp:docPr id="572570131" name="Imagem 17"/>
+            <wp:docPr id="334648577" name="Imagem 17"/>
             <wp:cNvGraphicFramePr/>
             <a:graphic xmlns:a="http://schemas.openxmlformats.org/drawingml/2006/main">
               <a:graphicData uri="http://schemas.openxmlformats.org/drawingml/2006/picture">
                 <pic:pic xmlns:pic="http://schemas.openxmlformats.org/drawingml/2006/picture">
                   <pic:nvPicPr>
-                    <pic:cNvPr id="572570131" name=""/>
+                    <pic:cNvPr id="334648577" name=""/>
                     <pic:cNvPicPr/>
                   </pic:nvPicPr>
                   <pic:blipFill>
@@ -13596,7 +13606,7 @@
           <w:sz w:val="27"/>
         </w:rPr>
       </w:pPr>
-      <w:bookmarkStart w:id="25" w:name="_Toc239349609"/>
+      <w:bookmarkStart w:id="25" w:name="_Toc239844069"/>
       <w:r>
         <w:rPr>
           <w:rFonts w:ascii="Montserrat" w:hAnsi="Montserrat"/>
@@ -13637,16 +13647,16 @@
         </w:rPr>
         <w:lastRenderedPageBreak/>
         <w:drawing>
-          <wp:inline distT="0" distB="0" distL="0" distR="0" wp14:anchorId="31DF1E95" wp14:editId="0DEC243E">
+          <wp:inline distT="0" distB="0" distL="0" distR="0" wp14:anchorId="2E748787" wp14:editId="6A68A757">
             <wp:extent cx="5120640" cy="4627581"/>
             <wp:effectExtent l="19050" t="19050" r="22860" b="20955"/>
-            <wp:docPr id="232699584" name="Imagem 18"/>
+            <wp:docPr id="685896998" name="Imagem 18"/>
             <wp:cNvGraphicFramePr/>
             <a:graphic xmlns:a="http://schemas.openxmlformats.org/drawingml/2006/main">
               <a:graphicData uri="http://schemas.openxmlformats.org/drawingml/2006/picture">
                 <pic:pic xmlns:pic="http://schemas.openxmlformats.org/drawingml/2006/picture">
                   <pic:nvPicPr>
-                    <pic:cNvPr id="232699584" name=""/>
+                    <pic:cNvPr id="685896998" name=""/>
                     <pic:cNvPicPr/>
                   </pic:nvPicPr>
                   <pic:blipFill>
@@ -13714,16 +13724,16 @@
         </w:rPr>
         <w:lastRenderedPageBreak/>
         <w:drawing>
-          <wp:inline distT="0" distB="0" distL="0" distR="0" wp14:anchorId="69276617" wp14:editId="655F8198">
+          <wp:inline distT="0" distB="0" distL="0" distR="0" wp14:anchorId="19A84994" wp14:editId="76222D43">
             <wp:extent cx="5120640" cy="4627581"/>
             <wp:effectExtent l="19050" t="19050" r="22860" b="20955"/>
-            <wp:docPr id="2069291221" name="Imagem 19"/>
+            <wp:docPr id="303214286" name="Imagem 19"/>
             <wp:cNvGraphicFramePr/>
             <a:graphic xmlns:a="http://schemas.openxmlformats.org/drawingml/2006/main">
               <a:graphicData uri="http://schemas.openxmlformats.org/drawingml/2006/picture">
                 <pic:pic xmlns:pic="http://schemas.openxmlformats.org/drawingml/2006/picture">
                   <pic:nvPicPr>
-                    <pic:cNvPr id="2069291221" name=""/>
+                    <pic:cNvPr id="303214286" name=""/>
                     <pic:cNvPicPr/>
                   </pic:nvPicPr>
                   <pic:blipFill>
@@ -13906,7 +13916,7 @@
           <w:sz w:val="27"/>
         </w:rPr>
       </w:pPr>
-      <w:bookmarkStart w:id="26" w:name="_Toc239349610"/>
+      <w:bookmarkStart w:id="26" w:name="_Toc239844070"/>
       <w:r>
         <w:rPr>
           <w:rFonts w:ascii="Montserrat" w:hAnsi="Montserrat"/>
@@ -13946,16 +13956,16 @@
           <w:noProof/>
         </w:rPr>
         <w:drawing>
-          <wp:inline distT="0" distB="0" distL="0" distR="0" wp14:anchorId="36BFADDB" wp14:editId="0B3B93DC">
+          <wp:inline distT="0" distB="0" distL="0" distR="0" wp14:anchorId="22BE48C3" wp14:editId="4C6309FF">
             <wp:extent cx="5120640" cy="4627581"/>
             <wp:effectExtent l="19050" t="19050" r="22860" b="20955"/>
-            <wp:docPr id="503830073" name="Imagem 20"/>
+            <wp:docPr id="78168440" name="Imagem 20"/>
             <wp:cNvGraphicFramePr/>
             <a:graphic xmlns:a="http://schemas.openxmlformats.org/drawingml/2006/main">
               <a:graphicData uri="http://schemas.openxmlformats.org/drawingml/2006/picture">
                 <pic:pic xmlns:pic="http://schemas.openxmlformats.org/drawingml/2006/picture">
                   <pic:nvPicPr>
-                    <pic:cNvPr id="503830073" name=""/>
+                    <pic:cNvPr id="78168440" name=""/>
                     <pic:cNvPicPr/>
                   </pic:nvPicPr>
                   <pic:blipFill>
@@ -14023,16 +14033,16 @@
         </w:rPr>
         <w:lastRenderedPageBreak/>
         <w:drawing>
-          <wp:inline distT="0" distB="0" distL="0" distR="0" wp14:anchorId="00D41128" wp14:editId="3E5C63D5">
+          <wp:inline distT="0" distB="0" distL="0" distR="0" wp14:anchorId="666FFE6B" wp14:editId="3FD041CE">
             <wp:extent cx="5120640" cy="4627581"/>
             <wp:effectExtent l="19050" t="19050" r="22860" b="20955"/>
-            <wp:docPr id="1073243003" name="Imagem 21"/>
+            <wp:docPr id="2005286146" name="Imagem 21"/>
             <wp:cNvGraphicFramePr/>
             <a:graphic xmlns:a="http://schemas.openxmlformats.org/drawingml/2006/main">
               <a:graphicData uri="http://schemas.openxmlformats.org/drawingml/2006/picture">
                 <pic:pic xmlns:pic="http://schemas.openxmlformats.org/drawingml/2006/picture">
                   <pic:nvPicPr>
-                    <pic:cNvPr id="1073243003" name=""/>
+                    <pic:cNvPr id="2005286146" name=""/>
                     <pic:cNvPicPr/>
                   </pic:nvPicPr>
                   <pic:blipFill>
@@ -14238,16 +14248,16 @@
           <w:noProof/>
         </w:rPr>
         <w:drawing>
-          <wp:inline distT="0" distB="0" distL="0" distR="0" wp14:anchorId="42BE3812" wp14:editId="4D9BAA36">
+          <wp:inline distT="0" distB="0" distL="0" distR="0" wp14:anchorId="31403458" wp14:editId="12101B9C">
             <wp:extent cx="5120640" cy="1757287"/>
             <wp:effectExtent l="19050" t="19050" r="22860" b="14605"/>
-            <wp:docPr id="975455518" name="Imagem 22"/>
+            <wp:docPr id="2031624566" name="Imagem 22"/>
             <wp:cNvGraphicFramePr/>
             <a:graphic xmlns:a="http://schemas.openxmlformats.org/drawingml/2006/main">
               <a:graphicData uri="http://schemas.openxmlformats.org/drawingml/2006/picture">
                 <pic:pic xmlns:pic="http://schemas.openxmlformats.org/drawingml/2006/picture">
                   <pic:nvPicPr>
-                    <pic:cNvPr id="975455518" name=""/>
+                    <pic:cNvPr id="2031624566" name=""/>
                     <pic:cNvPicPr/>
                   </pic:nvPicPr>
                   <pic:blipFill>
@@ -14360,7 +14370,7 @@
           <w:sz w:val="27"/>
         </w:rPr>
       </w:pPr>
-      <w:bookmarkStart w:id="27" w:name="_Toc239349611"/>
+      <w:bookmarkStart w:id="27" w:name="_Toc239844071"/>
       <w:r>
         <w:rPr>
           <w:rFonts w:ascii="Montserrat" w:hAnsi="Montserrat"/>
@@ -14401,16 +14411,16 @@
         </w:rPr>
         <w:lastRenderedPageBreak/>
         <w:drawing>
-          <wp:inline distT="0" distB="0" distL="0" distR="0" wp14:anchorId="459C2EFB" wp14:editId="337AAB30">
+          <wp:inline distT="0" distB="0" distL="0" distR="0" wp14:anchorId="75C05841" wp14:editId="3091EBFA">
             <wp:extent cx="5120640" cy="4627581"/>
             <wp:effectExtent l="19050" t="19050" r="22860" b="20955"/>
-            <wp:docPr id="473429517" name="Imagem 23"/>
+            <wp:docPr id="1362138942" name="Imagem 23"/>
             <wp:cNvGraphicFramePr/>
             <a:graphic xmlns:a="http://schemas.openxmlformats.org/drawingml/2006/main">
               <a:graphicData uri="http://schemas.openxmlformats.org/drawingml/2006/picture">
                 <pic:pic xmlns:pic="http://schemas.openxmlformats.org/drawingml/2006/picture">
                   <pic:nvPicPr>
-                    <pic:cNvPr id="473429517" name=""/>
+                    <pic:cNvPr id="1362138942" name=""/>
                     <pic:cNvPicPr/>
                   </pic:nvPicPr>
                   <pic:blipFill>
@@ -14478,16 +14488,16 @@
         </w:rPr>
         <w:lastRenderedPageBreak/>
         <w:drawing>
-          <wp:inline distT="0" distB="0" distL="0" distR="0" wp14:anchorId="75B7C45B" wp14:editId="25413B7D">
+          <wp:inline distT="0" distB="0" distL="0" distR="0" wp14:anchorId="523E83D2" wp14:editId="5AD4E480">
             <wp:extent cx="5120640" cy="4627581"/>
             <wp:effectExtent l="19050" t="19050" r="22860" b="20955"/>
-            <wp:docPr id="1761094441" name="Imagem 24"/>
+            <wp:docPr id="1975628032" name="Imagem 24"/>
             <wp:cNvGraphicFramePr/>
             <a:graphic xmlns:a="http://schemas.openxmlformats.org/drawingml/2006/main">
               <a:graphicData uri="http://schemas.openxmlformats.org/drawingml/2006/picture">
                 <pic:pic xmlns:pic="http://schemas.openxmlformats.org/drawingml/2006/picture">
                   <pic:nvPicPr>
-                    <pic:cNvPr id="1761094441" name=""/>
+                    <pic:cNvPr id="1975628032" name=""/>
                     <pic:cNvPicPr/>
                   </pic:nvPicPr>
                   <pic:blipFill>
@@ -14724,7 +14734,7 @@
           <w:sz w:val="27"/>
         </w:rPr>
       </w:pPr>
-      <w:bookmarkStart w:id="28" w:name="_Toc239349612"/>
+      <w:bookmarkStart w:id="28" w:name="_Toc239844072"/>
       <w:r>
         <w:rPr>
           <w:rFonts w:ascii="Montserrat" w:hAnsi="Montserrat"/>
@@ -14764,16 +14774,16 @@
           <w:noProof/>
         </w:rPr>
         <w:drawing>
-          <wp:inline distT="0" distB="0" distL="0" distR="0" wp14:anchorId="457E1F3C" wp14:editId="45C4719C">
+          <wp:inline distT="0" distB="0" distL="0" distR="0" wp14:anchorId="122C576E" wp14:editId="16E08590">
             <wp:extent cx="5120640" cy="4627581"/>
             <wp:effectExtent l="19050" t="19050" r="22860" b="20955"/>
-            <wp:docPr id="1763279065" name="Imagem 25"/>
+            <wp:docPr id="1330245643" name="Imagem 25"/>
             <wp:cNvGraphicFramePr/>
             <a:graphic xmlns:a="http://schemas.openxmlformats.org/drawingml/2006/main">
               <a:graphicData uri="http://schemas.openxmlformats.org/drawingml/2006/picture">
                 <pic:pic xmlns:pic="http://schemas.openxmlformats.org/drawingml/2006/picture">
                   <pic:nvPicPr>
-                    <pic:cNvPr id="1763279065" name=""/>
+                    <pic:cNvPr id="1330245643" name=""/>
                     <pic:cNvPicPr/>
                   </pic:nvPicPr>
                   <pic:blipFill>
@@ -14841,16 +14851,16 @@
         </w:rPr>
         <w:lastRenderedPageBreak/>
         <w:drawing>
-          <wp:inline distT="0" distB="0" distL="0" distR="0" wp14:anchorId="369103E0" wp14:editId="7E9B3931">
+          <wp:inline distT="0" distB="0" distL="0" distR="0" wp14:anchorId="6C248371" wp14:editId="0C1F4EEA">
             <wp:extent cx="5120640" cy="4627581"/>
             <wp:effectExtent l="19050" t="19050" r="22860" b="20955"/>
-            <wp:docPr id="962836616" name="Imagem 26"/>
+            <wp:docPr id="1001674513" name="Imagem 26"/>
             <wp:cNvGraphicFramePr/>
             <a:graphic xmlns:a="http://schemas.openxmlformats.org/drawingml/2006/main">
               <a:graphicData uri="http://schemas.openxmlformats.org/drawingml/2006/picture">
                 <pic:pic xmlns:pic="http://schemas.openxmlformats.org/drawingml/2006/picture">
                   <pic:nvPicPr>
-                    <pic:cNvPr id="962836616" name=""/>
+                    <pic:cNvPr id="1001674513" name=""/>
                     <pic:cNvPicPr/>
                   </pic:nvPicPr>
                   <pic:blipFill>
@@ -15041,7 +15051,7 @@
           <w:sz w:val="27"/>
         </w:rPr>
       </w:pPr>
-      <w:bookmarkStart w:id="29" w:name="_Toc239349613"/>
+      <w:bookmarkStart w:id="29" w:name="_Toc239844073"/>
       <w:r>
         <w:rPr>
           <w:rFonts w:ascii="Montserrat" w:hAnsi="Montserrat"/>
@@ -15081,16 +15091,16 @@
           <w:noProof/>
         </w:rPr>
         <w:drawing>
-          <wp:inline distT="0" distB="0" distL="0" distR="0" wp14:anchorId="1E77391E" wp14:editId="15045052">
+          <wp:inline distT="0" distB="0" distL="0" distR="0" wp14:anchorId="44BA1D82" wp14:editId="551E6F63">
             <wp:extent cx="5120640" cy="4000682"/>
             <wp:effectExtent l="19050" t="19050" r="22860" b="19050"/>
-            <wp:docPr id="1017792603" name="Imagem 27"/>
+            <wp:docPr id="613733714" name="Imagem 27"/>
             <wp:cNvGraphicFramePr/>
             <a:graphic xmlns:a="http://schemas.openxmlformats.org/drawingml/2006/main">
               <a:graphicData uri="http://schemas.openxmlformats.org/drawingml/2006/picture">
                 <pic:pic xmlns:pic="http://schemas.openxmlformats.org/drawingml/2006/picture">
                   <pic:nvPicPr>
-                    <pic:cNvPr id="1017792603" name=""/>
+                    <pic:cNvPr id="613733714" name=""/>
                     <pic:cNvPicPr/>
                   </pic:nvPicPr>
                   <pic:blipFill>
@@ -15614,7 +15624,7 @@
           <w:sz w:val="34"/>
         </w:rPr>
       </w:pPr>
-      <w:bookmarkStart w:id="30" w:name="_Toc239349614"/>
+      <w:bookmarkStart w:id="30" w:name="_Toc239844074"/>
       <w:r>
         <w:rPr>
           <w:rFonts w:ascii="Montserrat" w:hAnsi="Montserrat"/>
@@ -15656,7 +15666,7 @@
           <w:sz w:val="27"/>
         </w:rPr>
       </w:pPr>
-      <w:bookmarkStart w:id="31" w:name="_Toc239349615"/>
+      <w:bookmarkStart w:id="31" w:name="_Toc239844075"/>
       <w:r>
         <w:rPr>
           <w:rFonts w:ascii="Montserrat" w:hAnsi="Montserrat"/>
@@ -15696,16 +15706,16 @@
           <w:noProof/>
         </w:rPr>
         <w:drawing>
-          <wp:inline distT="0" distB="0" distL="0" distR="0" wp14:anchorId="4C054638" wp14:editId="165FBC0F">
+          <wp:inline distT="0" distB="0" distL="0" distR="0" wp14:anchorId="2D9A8E1C" wp14:editId="6C23EAA8">
             <wp:extent cx="5120640" cy="4627581"/>
             <wp:effectExtent l="19050" t="19050" r="22860" b="20955"/>
-            <wp:docPr id="1153712640" name="Imagem 28"/>
+            <wp:docPr id="41595538" name="Imagem 28"/>
             <wp:cNvGraphicFramePr/>
             <a:graphic xmlns:a="http://schemas.openxmlformats.org/drawingml/2006/main">
               <a:graphicData uri="http://schemas.openxmlformats.org/drawingml/2006/picture">
                 <pic:pic xmlns:pic="http://schemas.openxmlformats.org/drawingml/2006/picture">
                   <pic:nvPicPr>
-                    <pic:cNvPr id="1153712640" name=""/>
+                    <pic:cNvPr id="41595538" name=""/>
                     <pic:cNvPicPr/>
                   </pic:nvPicPr>
                   <pic:blipFill>
@@ -15773,16 +15783,16 @@
         </w:rPr>
         <w:lastRenderedPageBreak/>
         <w:drawing>
-          <wp:inline distT="0" distB="0" distL="0" distR="0" wp14:anchorId="1D4ADC25" wp14:editId="122E8229">
+          <wp:inline distT="0" distB="0" distL="0" distR="0" wp14:anchorId="1A1AF69C" wp14:editId="6B0B7617">
             <wp:extent cx="5120640" cy="4627581"/>
             <wp:effectExtent l="19050" t="19050" r="22860" b="20955"/>
-            <wp:docPr id="828246932" name="Imagem 29"/>
+            <wp:docPr id="19668777" name="Imagem 29"/>
             <wp:cNvGraphicFramePr/>
             <a:graphic xmlns:a="http://schemas.openxmlformats.org/drawingml/2006/main">
               <a:graphicData uri="http://schemas.openxmlformats.org/drawingml/2006/picture">
                 <pic:pic xmlns:pic="http://schemas.openxmlformats.org/drawingml/2006/picture">
                   <pic:nvPicPr>
-                    <pic:cNvPr id="828246932" name=""/>
+                    <pic:cNvPr id="19668777" name=""/>
                     <pic:cNvPicPr/>
                   </pic:nvPicPr>
                   <pic:blipFill>
@@ -15850,16 +15860,16 @@
         </w:rPr>
         <w:lastRenderedPageBreak/>
         <w:drawing>
-          <wp:inline distT="0" distB="0" distL="0" distR="0" wp14:anchorId="39FFAC83" wp14:editId="6AC290F3">
+          <wp:inline distT="0" distB="0" distL="0" distR="0" wp14:anchorId="075BA656" wp14:editId="4A38F66B">
             <wp:extent cx="5120640" cy="4627581"/>
             <wp:effectExtent l="19050" t="19050" r="22860" b="20955"/>
-            <wp:docPr id="467603036" name="Imagem 30"/>
+            <wp:docPr id="1582443431" name="Imagem 30"/>
             <wp:cNvGraphicFramePr/>
             <a:graphic xmlns:a="http://schemas.openxmlformats.org/drawingml/2006/main">
               <a:graphicData uri="http://schemas.openxmlformats.org/drawingml/2006/picture">
                 <pic:pic xmlns:pic="http://schemas.openxmlformats.org/drawingml/2006/picture">
                   <pic:nvPicPr>
-                    <pic:cNvPr id="467603036" name=""/>
+                    <pic:cNvPr id="1582443431" name=""/>
                     <pic:cNvPicPr/>
                   </pic:nvPicPr>
                   <pic:blipFill>
@@ -15949,18 +15959,8 @@
         </w:numPr>
         <w:spacing w:after="80" w:line="260" w:lineRule="auto"/>
         <w:ind w:left="700"/>
-        <w:rPr>
-          <w:rFonts w:ascii="Montserrat" w:hAnsi="Montserrat"/>
-          <w:color w:val="1A1A1A"/>
-          <w:sz w:val="22"/>
-        </w:rPr>
-      </w:pPr>
-      <w:r>
-        <w:rPr>
-          <w:rFonts w:ascii="Montserrat" w:hAnsi="Montserrat"/>
-          <w:color w:val="1A1A1A"/>
-          <w:sz w:val="22"/>
-        </w:rPr>
+      </w:pPr>
+      <w:r>
         <w:t>Adicione cada projeto do portfolio, com status, % execucao, datas e os campos Merece atencao e Merece destaque.</w:t>
       </w:r>
     </w:p>
@@ -16053,16 +16053,16 @@
           <w:noProof/>
         </w:rPr>
         <w:drawing>
-          <wp:inline distT="0" distB="0" distL="0" distR="0" wp14:anchorId="1981C2D0" wp14:editId="499FF79B">
+          <wp:inline distT="0" distB="0" distL="0" distR="0" wp14:anchorId="2B1C12A3" wp14:editId="46535EBD">
             <wp:extent cx="5120640" cy="1715571"/>
             <wp:effectExtent l="19050" t="19050" r="22860" b="18415"/>
-            <wp:docPr id="2090306230" name="Imagem 31"/>
+            <wp:docPr id="974193430" name="Imagem 31"/>
             <wp:cNvGraphicFramePr/>
             <a:graphic xmlns:a="http://schemas.openxmlformats.org/drawingml/2006/main">
               <a:graphicData uri="http://schemas.openxmlformats.org/drawingml/2006/picture">
                 <pic:pic xmlns:pic="http://schemas.openxmlformats.org/drawingml/2006/picture">
                   <pic:nvPicPr>
-                    <pic:cNvPr id="2090306230" name=""/>
+                    <pic:cNvPr id="974193430" name=""/>
                     <pic:cNvPicPr/>
                   </pic:nvPicPr>
                   <pic:blipFill>
@@ -16208,16 +16208,16 @@
           <w:noProof/>
         </w:rPr>
         <w:drawing>
-          <wp:inline distT="0" distB="0" distL="0" distR="0" wp14:anchorId="67B23C9A" wp14:editId="14433B83">
+          <wp:inline distT="0" distB="0" distL="0" distR="0" wp14:anchorId="59AEB360" wp14:editId="0144FB7A">
             <wp:extent cx="5120640" cy="3282818"/>
             <wp:effectExtent l="19050" t="19050" r="22860" b="13335"/>
-            <wp:docPr id="906336956" name="Imagem 32"/>
+            <wp:docPr id="1590723803" name="Imagem 32"/>
             <wp:cNvGraphicFramePr/>
             <a:graphic xmlns:a="http://schemas.openxmlformats.org/drawingml/2006/main">
               <a:graphicData uri="http://schemas.openxmlformats.org/drawingml/2006/picture">
                 <pic:pic xmlns:pic="http://schemas.openxmlformats.org/drawingml/2006/picture">
                   <pic:nvPicPr>
-                    <pic:cNvPr id="906336956" name=""/>
+                    <pic:cNvPr id="1590723803" name=""/>
                     <pic:cNvPicPr/>
                   </pic:nvPicPr>
                   <pic:blipFill>
@@ -16330,16 +16330,16 @@
         </w:rPr>
         <w:lastRenderedPageBreak/>
         <w:drawing>
-          <wp:inline distT="0" distB="0" distL="0" distR="0" wp14:anchorId="499EC1DF" wp14:editId="3B07DB25">
+          <wp:inline distT="0" distB="0" distL="0" distR="0" wp14:anchorId="140180C7" wp14:editId="6E296119">
             <wp:extent cx="5120640" cy="951357"/>
             <wp:effectExtent l="19050" t="19050" r="22860" b="20320"/>
-            <wp:docPr id="264476405" name="Imagem 33"/>
+            <wp:docPr id="441644785" name="Imagem 33"/>
             <wp:cNvGraphicFramePr/>
             <a:graphic xmlns:a="http://schemas.openxmlformats.org/drawingml/2006/main">
               <a:graphicData uri="http://schemas.openxmlformats.org/drawingml/2006/picture">
                 <pic:pic xmlns:pic="http://schemas.openxmlformats.org/drawingml/2006/picture">
                   <pic:nvPicPr>
-                    <pic:cNvPr id="264476405" name=""/>
+                    <pic:cNvPr id="441644785" name=""/>
                     <pic:cNvPicPr/>
                   </pic:nvPicPr>
                   <pic:blipFill>
@@ -16451,16 +16451,16 @@
           <w:noProof/>
         </w:rPr>
         <w:drawing>
-          <wp:inline distT="0" distB="0" distL="0" distR="0" wp14:anchorId="7A2F24D2" wp14:editId="48E44D68">
+          <wp:inline distT="0" distB="0" distL="0" distR="0" wp14:anchorId="6CF089F6" wp14:editId="4C0C7E37">
             <wp:extent cx="5120640" cy="1515102"/>
             <wp:effectExtent l="19050" t="19050" r="22860" b="28575"/>
-            <wp:docPr id="1554514549" name="Imagem 34"/>
+            <wp:docPr id="582255396" name="Imagem 34"/>
             <wp:cNvGraphicFramePr/>
             <a:graphic xmlns:a="http://schemas.openxmlformats.org/drawingml/2006/main">
               <a:graphicData uri="http://schemas.openxmlformats.org/drawingml/2006/picture">
                 <pic:pic xmlns:pic="http://schemas.openxmlformats.org/drawingml/2006/picture">
                   <pic:nvPicPr>
-                    <pic:cNvPr id="1554514549" name=""/>
+                    <pic:cNvPr id="582255396" name=""/>
                     <pic:cNvPicPr/>
                   </pic:nvPicPr>
                   <pic:blipFill>
@@ -16582,16 +16582,16 @@
           <w:noProof/>
         </w:rPr>
         <w:drawing>
-          <wp:inline distT="0" distB="0" distL="0" distR="0" wp14:anchorId="7B5308B3" wp14:editId="7FFB8A8B">
+          <wp:inline distT="0" distB="0" distL="0" distR="0" wp14:anchorId="6091E3E1" wp14:editId="0EAE6AD6">
             <wp:extent cx="5120640" cy="1391113"/>
             <wp:effectExtent l="19050" t="19050" r="22860" b="19050"/>
-            <wp:docPr id="1738902828" name="Imagem 35"/>
+            <wp:docPr id="71622700" name="Imagem 35"/>
             <wp:cNvGraphicFramePr/>
             <a:graphic xmlns:a="http://schemas.openxmlformats.org/drawingml/2006/main">
               <a:graphicData uri="http://schemas.openxmlformats.org/drawingml/2006/picture">
                 <pic:pic xmlns:pic="http://schemas.openxmlformats.org/drawingml/2006/picture">
                   <pic:nvPicPr>
-                    <pic:cNvPr id="1738902828" name=""/>
+                    <pic:cNvPr id="71622700" name=""/>
                     <pic:cNvPicPr/>
                   </pic:nvPicPr>
                   <pic:blipFill>
@@ -16703,16 +16703,16 @@
           <w:noProof/>
         </w:rPr>
         <w:drawing>
-          <wp:inline distT="0" distB="0" distL="0" distR="0" wp14:anchorId="36549AA1" wp14:editId="63C26583">
+          <wp:inline distT="0" distB="0" distL="0" distR="0" wp14:anchorId="5D06A3FB" wp14:editId="60E6AC39">
             <wp:extent cx="5120640" cy="1125174"/>
             <wp:effectExtent l="19050" t="19050" r="22860" b="18415"/>
-            <wp:docPr id="610188058" name="Imagem 36"/>
+            <wp:docPr id="747574762" name="Imagem 36"/>
             <wp:cNvGraphicFramePr/>
             <a:graphic xmlns:a="http://schemas.openxmlformats.org/drawingml/2006/main">
               <a:graphicData uri="http://schemas.openxmlformats.org/drawingml/2006/picture">
                 <pic:pic xmlns:pic="http://schemas.openxmlformats.org/drawingml/2006/picture">
                   <pic:nvPicPr>
-                    <pic:cNvPr id="610188058" name=""/>
+                    <pic:cNvPr id="747574762" name=""/>
                     <pic:cNvPicPr/>
                   </pic:nvPicPr>
                   <pic:blipFill>
@@ -16801,7 +16801,7 @@
           <w:sz w:val="27"/>
         </w:rPr>
       </w:pPr>
-      <w:bookmarkStart w:id="32" w:name="_Toc239349616"/>
+      <w:bookmarkStart w:id="32" w:name="_Toc239844076"/>
       <w:r>
         <w:rPr>
           <w:rFonts w:ascii="Montserrat" w:hAnsi="Montserrat"/>
@@ -16842,16 +16842,16 @@
           <w:noProof/>
         </w:rPr>
         <w:drawing>
-          <wp:inline distT="0" distB="0" distL="0" distR="0" wp14:anchorId="40715260" wp14:editId="1EF7F492">
+          <wp:inline distT="0" distB="0" distL="0" distR="0" wp14:anchorId="1B0F707F" wp14:editId="3108093F">
             <wp:extent cx="5120640" cy="4627581"/>
             <wp:effectExtent l="19050" t="19050" r="22860" b="20955"/>
-            <wp:docPr id="636157107" name="Imagem 37"/>
+            <wp:docPr id="937185770" name="Imagem 37"/>
             <wp:cNvGraphicFramePr/>
             <a:graphic xmlns:a="http://schemas.openxmlformats.org/drawingml/2006/main">
               <a:graphicData uri="http://schemas.openxmlformats.org/drawingml/2006/picture">
                 <pic:pic xmlns:pic="http://schemas.openxmlformats.org/drawingml/2006/picture">
                   <pic:nvPicPr>
-                    <pic:cNvPr id="636157107" name=""/>
+                    <pic:cNvPr id="937185770" name=""/>
                     <pic:cNvPicPr/>
                   </pic:nvPicPr>
                   <pic:blipFill>
@@ -16919,16 +16919,16 @@
         </w:rPr>
         <w:lastRenderedPageBreak/>
         <w:drawing>
-          <wp:inline distT="0" distB="0" distL="0" distR="0" wp14:anchorId="7FDC49D2" wp14:editId="240E5141">
+          <wp:inline distT="0" distB="0" distL="0" distR="0" wp14:anchorId="2C1166AE" wp14:editId="673A644B">
             <wp:extent cx="5120640" cy="4627581"/>
             <wp:effectExtent l="19050" t="19050" r="22860" b="20955"/>
-            <wp:docPr id="737837574" name="Imagem 38"/>
+            <wp:docPr id="2083130722" name="Imagem 38"/>
             <wp:cNvGraphicFramePr/>
             <a:graphic xmlns:a="http://schemas.openxmlformats.org/drawingml/2006/main">
               <a:graphicData uri="http://schemas.openxmlformats.org/drawingml/2006/picture">
                 <pic:pic xmlns:pic="http://schemas.openxmlformats.org/drawingml/2006/picture">
                   <pic:nvPicPr>
-                    <pic:cNvPr id="737837574" name=""/>
+                    <pic:cNvPr id="2083130722" name=""/>
                     <pic:cNvPicPr/>
                   </pic:nvPicPr>
                   <pic:blipFill>
@@ -17097,16 +17097,16 @@
           <w:noProof/>
         </w:rPr>
         <w:drawing>
-          <wp:inline distT="0" distB="0" distL="0" distR="0" wp14:anchorId="46E21251" wp14:editId="3080BB51">
+          <wp:inline distT="0" distB="0" distL="0" distR="0" wp14:anchorId="641F7098" wp14:editId="7B96BD37">
             <wp:extent cx="5120640" cy="2144319"/>
             <wp:effectExtent l="19050" t="19050" r="22860" b="27940"/>
-            <wp:docPr id="354964962" name="Imagem 39"/>
+            <wp:docPr id="631924149" name="Imagem 39"/>
             <wp:cNvGraphicFramePr/>
             <a:graphic xmlns:a="http://schemas.openxmlformats.org/drawingml/2006/main">
               <a:graphicData uri="http://schemas.openxmlformats.org/drawingml/2006/picture">
                 <pic:pic xmlns:pic="http://schemas.openxmlformats.org/drawingml/2006/picture">
                   <pic:nvPicPr>
-                    <pic:cNvPr id="354964962" name=""/>
+                    <pic:cNvPr id="631924149" name=""/>
                     <pic:cNvPicPr/>
                   </pic:nvPicPr>
                   <pic:blipFill>
@@ -17194,16 +17194,16 @@
           <w:noProof/>
         </w:rPr>
         <w:drawing>
-          <wp:inline distT="0" distB="0" distL="0" distR="0" wp14:anchorId="456FBE45" wp14:editId="76E76B1C">
+          <wp:inline distT="0" distB="0" distL="0" distR="0" wp14:anchorId="5F601523" wp14:editId="2E64AC48">
             <wp:extent cx="5120640" cy="1055647"/>
             <wp:effectExtent l="19050" t="19050" r="22860" b="11430"/>
-            <wp:docPr id="236511632" name="Imagem 40"/>
+            <wp:docPr id="888816300" name="Imagem 40"/>
             <wp:cNvGraphicFramePr/>
             <a:graphic xmlns:a="http://schemas.openxmlformats.org/drawingml/2006/main">
               <a:graphicData uri="http://schemas.openxmlformats.org/drawingml/2006/picture">
                 <pic:pic xmlns:pic="http://schemas.openxmlformats.org/drawingml/2006/picture">
                   <pic:nvPicPr>
-                    <pic:cNvPr id="236511632" name=""/>
+                    <pic:cNvPr id="888816300" name=""/>
                     <pic:cNvPicPr/>
                   </pic:nvPicPr>
                   <pic:blipFill>
@@ -17325,16 +17325,16 @@
           <w:noProof/>
         </w:rPr>
         <w:drawing>
-          <wp:inline distT="0" distB="0" distL="0" distR="0" wp14:anchorId="035B833B" wp14:editId="2C348985">
+          <wp:inline distT="0" distB="0" distL="0" distR="0" wp14:anchorId="4F235BFD" wp14:editId="2F3A10AB">
             <wp:extent cx="5120640" cy="3282818"/>
             <wp:effectExtent l="19050" t="19050" r="22860" b="13335"/>
-            <wp:docPr id="244509273" name="Imagem 41"/>
+            <wp:docPr id="697569119" name="Imagem 41"/>
             <wp:cNvGraphicFramePr/>
             <a:graphic xmlns:a="http://schemas.openxmlformats.org/drawingml/2006/main">
               <a:graphicData uri="http://schemas.openxmlformats.org/drawingml/2006/picture">
                 <pic:pic xmlns:pic="http://schemas.openxmlformats.org/drawingml/2006/picture">
                   <pic:nvPicPr>
-                    <pic:cNvPr id="244509273" name=""/>
+                    <pic:cNvPr id="697569119" name=""/>
                     <pic:cNvPicPr/>
                   </pic:nvPicPr>
                   <pic:blipFill>
@@ -17468,16 +17468,16 @@
         </w:rPr>
         <w:lastRenderedPageBreak/>
         <w:drawing>
-          <wp:inline distT="0" distB="0" distL="0" distR="0" wp14:anchorId="7B251FF2" wp14:editId="5B3FAC26">
+          <wp:inline distT="0" distB="0" distL="0" distR="0" wp14:anchorId="385B65CC" wp14:editId="3FEAC73D">
             <wp:extent cx="5120640" cy="1978034"/>
             <wp:effectExtent l="19050" t="19050" r="22860" b="22225"/>
-            <wp:docPr id="1223050766" name="Imagem 42"/>
+            <wp:docPr id="2100161177" name="Imagem 42"/>
             <wp:cNvGraphicFramePr/>
             <a:graphic xmlns:a="http://schemas.openxmlformats.org/drawingml/2006/main">
               <a:graphicData uri="http://schemas.openxmlformats.org/drawingml/2006/picture">
                 <pic:pic xmlns:pic="http://schemas.openxmlformats.org/drawingml/2006/picture">
                   <pic:nvPicPr>
-                    <pic:cNvPr id="1223050766" name=""/>
+                    <pic:cNvPr id="2100161177" name=""/>
                     <pic:cNvPicPr/>
                   </pic:nvPicPr>
                   <pic:blipFill>
@@ -17549,7 +17549,7 @@
           <w:sz w:val="34"/>
         </w:rPr>
       </w:pPr>
-      <w:bookmarkStart w:id="33" w:name="_Toc239349617"/>
+      <w:bookmarkStart w:id="33" w:name="_Toc239844077"/>
       <w:r>
         <w:rPr>
           <w:rFonts w:ascii="Montserrat" w:hAnsi="Montserrat"/>
@@ -17609,7 +17609,7 @@
           <w:sz w:val="27"/>
         </w:rPr>
       </w:pPr>
-      <w:bookmarkStart w:id="34" w:name="_Toc239349618"/>
+      <w:bookmarkStart w:id="34" w:name="_Toc239844078"/>
       <w:r>
         <w:rPr>
           <w:rFonts w:ascii="Montserrat" w:hAnsi="Montserrat"/>
@@ -17649,16 +17649,16 @@
           <w:noProof/>
         </w:rPr>
         <w:drawing>
-          <wp:inline distT="0" distB="0" distL="0" distR="0" wp14:anchorId="508A4295" wp14:editId="20B233C3">
+          <wp:inline distT="0" distB="0" distL="0" distR="0" wp14:anchorId="5974C4FA" wp14:editId="67BBB17B">
             <wp:extent cx="5303520" cy="4792851"/>
             <wp:effectExtent l="19050" t="19050" r="11430" b="27305"/>
-            <wp:docPr id="657256037" name="Imagem 43"/>
+            <wp:docPr id="2034895483" name="Imagem 43"/>
             <wp:cNvGraphicFramePr/>
             <a:graphic xmlns:a="http://schemas.openxmlformats.org/drawingml/2006/main">
               <a:graphicData uri="http://schemas.openxmlformats.org/drawingml/2006/picture">
                 <pic:pic xmlns:pic="http://schemas.openxmlformats.org/drawingml/2006/picture">
                   <pic:nvPicPr>
-                    <pic:cNvPr id="657256037" name=""/>
+                    <pic:cNvPr id="2034895483" name=""/>
                     <pic:cNvPicPr/>
                   </pic:nvPicPr>
                   <pic:blipFill>
@@ -17727,7 +17727,7 @@
           <w:sz w:val="27"/>
         </w:rPr>
       </w:pPr>
-      <w:bookmarkStart w:id="35" w:name="_Toc239349619"/>
+      <w:bookmarkStart w:id="35" w:name="_Toc239844079"/>
       <w:r>
         <w:rPr>
           <w:rFonts w:ascii="Montserrat" w:hAnsi="Montserrat"/>
@@ -17767,16 +17767,16 @@
           <w:noProof/>
         </w:rPr>
         <w:drawing>
-          <wp:inline distT="0" distB="0" distL="0" distR="0" wp14:anchorId="681BAE52" wp14:editId="7BE2FB53">
+          <wp:inline distT="0" distB="0" distL="0" distR="0" wp14:anchorId="3F56AA3E" wp14:editId="3D82EC80">
             <wp:extent cx="5303520" cy="4792851"/>
             <wp:effectExtent l="19050" t="19050" r="11430" b="27305"/>
-            <wp:docPr id="384904938" name="Imagem 44"/>
+            <wp:docPr id="160348411" name="Imagem 44"/>
             <wp:cNvGraphicFramePr/>
             <a:graphic xmlns:a="http://schemas.openxmlformats.org/drawingml/2006/main">
               <a:graphicData uri="http://schemas.openxmlformats.org/drawingml/2006/picture">
                 <pic:pic xmlns:pic="http://schemas.openxmlformats.org/drawingml/2006/picture">
                   <pic:nvPicPr>
-                    <pic:cNvPr id="384904938" name=""/>
+                    <pic:cNvPr id="160348411" name=""/>
                     <pic:cNvPicPr/>
                   </pic:nvPicPr>
                   <pic:blipFill>
@@ -17844,7 +17844,7 @@
           <w:sz w:val="27"/>
         </w:rPr>
       </w:pPr>
-      <w:bookmarkStart w:id="36" w:name="_Toc239349620"/>
+      <w:bookmarkStart w:id="36" w:name="_Toc239844080"/>
       <w:r>
         <w:rPr>
           <w:rFonts w:ascii="Montserrat" w:hAnsi="Montserrat"/>
@@ -17885,16 +17885,16 @@
         </w:rPr>
         <w:lastRenderedPageBreak/>
         <w:drawing>
-          <wp:inline distT="0" distB="0" distL="0" distR="0" wp14:anchorId="4B175C44" wp14:editId="4CDF80B9">
+          <wp:inline distT="0" distB="0" distL="0" distR="0" wp14:anchorId="1473F461" wp14:editId="4228C6F5">
             <wp:extent cx="5303520" cy="4792851"/>
             <wp:effectExtent l="19050" t="19050" r="11430" b="27305"/>
-            <wp:docPr id="1014747246" name="Imagem 45"/>
+            <wp:docPr id="2047532790" name="Imagem 45"/>
             <wp:cNvGraphicFramePr/>
             <a:graphic xmlns:a="http://schemas.openxmlformats.org/drawingml/2006/main">
               <a:graphicData uri="http://schemas.openxmlformats.org/drawingml/2006/picture">
                 <pic:pic xmlns:pic="http://schemas.openxmlformats.org/drawingml/2006/picture">
                   <pic:nvPicPr>
-                    <pic:cNvPr id="1014747246" name=""/>
+                    <pic:cNvPr id="2047532790" name=""/>
                     <pic:cNvPicPr/>
                   </pic:nvPicPr>
                   <pic:blipFill>
@@ -17962,16 +17962,16 @@
         </w:rPr>
         <w:lastRenderedPageBreak/>
         <w:drawing>
-          <wp:inline distT="0" distB="0" distL="0" distR="0" wp14:anchorId="4E5E1477" wp14:editId="58FEC981">
+          <wp:inline distT="0" distB="0" distL="0" distR="0" wp14:anchorId="532CEFD5" wp14:editId="16025118">
             <wp:extent cx="5303520" cy="4792851"/>
             <wp:effectExtent l="19050" t="19050" r="11430" b="27305"/>
-            <wp:docPr id="1454967594" name="Imagem 46"/>
+            <wp:docPr id="534837359" name="Imagem 46"/>
             <wp:cNvGraphicFramePr/>
             <a:graphic xmlns:a="http://schemas.openxmlformats.org/drawingml/2006/main">
               <a:graphicData uri="http://schemas.openxmlformats.org/drawingml/2006/picture">
                 <pic:pic xmlns:pic="http://schemas.openxmlformats.org/drawingml/2006/picture">
                   <pic:nvPicPr>
-                    <pic:cNvPr id="1454967594" name=""/>
+                    <pic:cNvPr id="534837359" name=""/>
                     <pic:cNvPicPr/>
                   </pic:nvPicPr>
                   <pic:blipFill>
@@ -18064,7 +18064,7 @@
           <w:sz w:val="34"/>
         </w:rPr>
       </w:pPr>
-      <w:bookmarkStart w:id="37" w:name="_Toc239349621"/>
+      <w:bookmarkStart w:id="37" w:name="_Toc239844081"/>
       <w:r>
         <w:rPr>
           <w:rFonts w:ascii="Montserrat" w:hAnsi="Montserrat"/>
@@ -18106,7 +18106,7 @@
           <w:sz w:val="27"/>
         </w:rPr>
       </w:pPr>
-      <w:bookmarkStart w:id="38" w:name="_Toc239349622"/>
+      <w:bookmarkStart w:id="38" w:name="_Toc239844082"/>
       <w:r>
         <w:rPr>
           <w:rFonts w:ascii="Montserrat" w:hAnsi="Montserrat"/>
@@ -18146,16 +18146,16 @@
           <w:noProof/>
         </w:rPr>
         <w:drawing>
-          <wp:inline distT="0" distB="0" distL="0" distR="0" wp14:anchorId="264BAD71" wp14:editId="5E179AEB">
+          <wp:inline distT="0" distB="0" distL="0" distR="0" wp14:anchorId="5C12BD56" wp14:editId="4F96DCE4">
             <wp:extent cx="5303520" cy="4792851"/>
             <wp:effectExtent l="19050" t="19050" r="11430" b="27305"/>
-            <wp:docPr id="663275618" name="Imagem 47"/>
+            <wp:docPr id="2043399807" name="Imagem 47"/>
             <wp:cNvGraphicFramePr/>
             <a:graphic xmlns:a="http://schemas.openxmlformats.org/drawingml/2006/main">
               <a:graphicData uri="http://schemas.openxmlformats.org/drawingml/2006/picture">
                 <pic:pic xmlns:pic="http://schemas.openxmlformats.org/drawingml/2006/picture">
                   <pic:nvPicPr>
-                    <pic:cNvPr id="663275618" name=""/>
+                    <pic:cNvPr id="2043399807" name=""/>
                     <pic:cNvPicPr/>
                   </pic:nvPicPr>
                   <pic:blipFill>
@@ -18302,7 +18302,7 @@
           <w:sz w:val="27"/>
         </w:rPr>
       </w:pPr>
-      <w:bookmarkStart w:id="39" w:name="_Toc239349623"/>
+      <w:bookmarkStart w:id="39" w:name="_Toc239844083"/>
       <w:r>
         <w:rPr>
           <w:rFonts w:ascii="Montserrat" w:hAnsi="Montserrat"/>
@@ -18343,16 +18343,16 @@
         </w:rPr>
         <w:lastRenderedPageBreak/>
         <w:drawing>
-          <wp:inline distT="0" distB="0" distL="0" distR="0" wp14:anchorId="0A42D3A2" wp14:editId="4753F15F">
+          <wp:inline distT="0" distB="0" distL="0" distR="0" wp14:anchorId="6CAF807B" wp14:editId="299B43AB">
             <wp:extent cx="5303520" cy="4792851"/>
             <wp:effectExtent l="19050" t="19050" r="11430" b="27305"/>
-            <wp:docPr id="782181823" name="Imagem 48"/>
+            <wp:docPr id="62612261" name="Imagem 48"/>
             <wp:cNvGraphicFramePr/>
             <a:graphic xmlns:a="http://schemas.openxmlformats.org/drawingml/2006/main">
               <a:graphicData uri="http://schemas.openxmlformats.org/drawingml/2006/picture">
                 <pic:pic xmlns:pic="http://schemas.openxmlformats.org/drawingml/2006/picture">
                   <pic:nvPicPr>
-                    <pic:cNvPr id="782181823" name=""/>
+                    <pic:cNvPr id="62612261" name=""/>
                     <pic:cNvPicPr/>
                   </pic:nvPicPr>
                   <pic:blipFill>
@@ -18420,7 +18420,7 @@
           <w:sz w:val="27"/>
         </w:rPr>
       </w:pPr>
-      <w:bookmarkStart w:id="40" w:name="_Toc239349624"/>
+      <w:bookmarkStart w:id="40" w:name="_Toc239844084"/>
       <w:r>
         <w:rPr>
           <w:rFonts w:ascii="Montserrat" w:hAnsi="Montserrat"/>
@@ -18461,16 +18461,16 @@
         </w:rPr>
         <w:lastRenderedPageBreak/>
         <w:drawing>
-          <wp:inline distT="0" distB="0" distL="0" distR="0" wp14:anchorId="19F6149B" wp14:editId="15760D7B">
+          <wp:inline distT="0" distB="0" distL="0" distR="0" wp14:anchorId="2D334E28" wp14:editId="03B9D6DF">
             <wp:extent cx="5303520" cy="4792851"/>
             <wp:effectExtent l="19050" t="19050" r="11430" b="27305"/>
-            <wp:docPr id="808025748" name="Imagem 49"/>
+            <wp:docPr id="1702722348" name="Imagem 49"/>
             <wp:cNvGraphicFramePr/>
             <a:graphic xmlns:a="http://schemas.openxmlformats.org/drawingml/2006/main">
               <a:graphicData uri="http://schemas.openxmlformats.org/drawingml/2006/picture">
                 <pic:pic xmlns:pic="http://schemas.openxmlformats.org/drawingml/2006/picture">
                   <pic:nvPicPr>
-                    <pic:cNvPr id="808025748" name=""/>
+                    <pic:cNvPr id="1702722348" name=""/>
                     <pic:cNvPicPr/>
                   </pic:nvPicPr>
                   <pic:blipFill>
@@ -18614,7 +18614,7 @@
           <w:sz w:val="27"/>
         </w:rPr>
       </w:pPr>
-      <w:bookmarkStart w:id="41" w:name="_Toc239349625"/>
+      <w:bookmarkStart w:id="41" w:name="_Toc239844085"/>
       <w:r>
         <w:rPr>
           <w:rFonts w:ascii="Montserrat" w:hAnsi="Montserrat"/>
@@ -18775,16 +18775,16 @@
         </w:rPr>
         <w:lastRenderedPageBreak/>
         <w:drawing>
-          <wp:inline distT="0" distB="0" distL="0" distR="0" wp14:anchorId="462609C4" wp14:editId="73C6C4BA">
+          <wp:inline distT="0" distB="0" distL="0" distR="0" wp14:anchorId="0E352715" wp14:editId="54AA71CD">
             <wp:extent cx="5303520" cy="4267180"/>
             <wp:effectExtent l="19050" t="19050" r="11430" b="19685"/>
-            <wp:docPr id="1718897544" name="Imagem 50"/>
+            <wp:docPr id="304146826" name="Imagem 50"/>
             <wp:cNvGraphicFramePr/>
             <a:graphic xmlns:a="http://schemas.openxmlformats.org/drawingml/2006/main">
               <a:graphicData uri="http://schemas.openxmlformats.org/drawingml/2006/picture">
                 <pic:pic xmlns:pic="http://schemas.openxmlformats.org/drawingml/2006/picture">
                   <pic:nvPicPr>
-                    <pic:cNvPr id="1718897544" name=""/>
+                    <pic:cNvPr id="304146826" name=""/>
                     <pic:cNvPicPr/>
                   </pic:nvPicPr>
                   <pic:blipFill>
@@ -18852,16 +18852,16 @@
         </w:rPr>
         <w:lastRenderedPageBreak/>
         <w:drawing>
-          <wp:inline distT="0" distB="0" distL="0" distR="0" wp14:anchorId="32BEA494" wp14:editId="0E64F1F1">
+          <wp:inline distT="0" distB="0" distL="0" distR="0" wp14:anchorId="26B67B19" wp14:editId="44C6D13D">
             <wp:extent cx="5303520" cy="3382059"/>
             <wp:effectExtent l="19050" t="19050" r="11430" b="27940"/>
-            <wp:docPr id="1418666857" name="Imagem 51"/>
+            <wp:docPr id="2124199729" name="Imagem 51"/>
             <wp:cNvGraphicFramePr/>
             <a:graphic xmlns:a="http://schemas.openxmlformats.org/drawingml/2006/main">
               <a:graphicData uri="http://schemas.openxmlformats.org/drawingml/2006/picture">
                 <pic:pic xmlns:pic="http://schemas.openxmlformats.org/drawingml/2006/picture">
                   <pic:nvPicPr>
-                    <pic:cNvPr id="1418666857" name=""/>
+                    <pic:cNvPr id="2124199729" name=""/>
                     <pic:cNvPicPr/>
                   </pic:nvPicPr>
                   <pic:blipFill>
@@ -18929,16 +18929,16 @@
         </w:rPr>
         <w:lastRenderedPageBreak/>
         <w:drawing>
-          <wp:inline distT="0" distB="0" distL="0" distR="0" wp14:anchorId="404DD6D3" wp14:editId="3F6A5616">
+          <wp:inline distT="0" distB="0" distL="0" distR="0" wp14:anchorId="2F9B422F" wp14:editId="14B1C1FC">
             <wp:extent cx="5303520" cy="4417800"/>
             <wp:effectExtent l="19050" t="19050" r="11430" b="20955"/>
-            <wp:docPr id="843471611" name="Imagem 52"/>
+            <wp:docPr id="636472179" name="Imagem 52"/>
             <wp:cNvGraphicFramePr/>
             <a:graphic xmlns:a="http://schemas.openxmlformats.org/drawingml/2006/main">
               <a:graphicData uri="http://schemas.openxmlformats.org/drawingml/2006/picture">
                 <pic:pic xmlns:pic="http://schemas.openxmlformats.org/drawingml/2006/picture">
                   <pic:nvPicPr>
-                    <pic:cNvPr id="843471611" name=""/>
+                    <pic:cNvPr id="636472179" name=""/>
                     <pic:cNvPicPr/>
                   </pic:nvPicPr>
                   <pic:blipFill>
@@ -19048,7 +19048,7 @@
           <w:sz w:val="27"/>
         </w:rPr>
       </w:pPr>
-      <w:bookmarkStart w:id="42" w:name="_Toc239349626"/>
+      <w:bookmarkStart w:id="42" w:name="_Toc239844086"/>
       <w:r>
         <w:rPr>
           <w:rFonts w:ascii="Montserrat" w:hAnsi="Montserrat"/>
@@ -19266,16 +19266,16 @@
         </w:rPr>
         <w:lastRenderedPageBreak/>
         <w:drawing>
-          <wp:inline distT="0" distB="0" distL="0" distR="0" wp14:anchorId="2A0BC8E5" wp14:editId="44EC7859">
+          <wp:inline distT="0" distB="0" distL="0" distR="0" wp14:anchorId="47B87C46" wp14:editId="516F1E59">
             <wp:extent cx="5303520" cy="7628836"/>
             <wp:effectExtent l="19050" t="19050" r="11430" b="10795"/>
-            <wp:docPr id="1676662617" name="Imagem 53"/>
+            <wp:docPr id="1663583290" name="Imagem 53"/>
             <wp:cNvGraphicFramePr/>
             <a:graphic xmlns:a="http://schemas.openxmlformats.org/drawingml/2006/main">
               <a:graphicData uri="http://schemas.openxmlformats.org/drawingml/2006/picture">
                 <pic:pic xmlns:pic="http://schemas.openxmlformats.org/drawingml/2006/picture">
                   <pic:nvPicPr>
-                    <pic:cNvPr id="1676662617" name=""/>
+                    <pic:cNvPr id="1663583290" name=""/>
                     <pic:cNvPicPr/>
                   </pic:nvPicPr>
                   <pic:blipFill>
@@ -19386,7 +19386,7 @@
           <w:sz w:val="27"/>
         </w:rPr>
       </w:pPr>
-      <w:bookmarkStart w:id="43" w:name="_Toc239349627"/>
+      <w:bookmarkStart w:id="43" w:name="_Toc239844087"/>
       <w:r>
         <w:rPr>
           <w:rFonts w:ascii="Montserrat" w:hAnsi="Montserrat"/>
@@ -19539,7 +19539,7 @@
           <w:sz w:val="27"/>
         </w:rPr>
       </w:pPr>
-      <w:bookmarkStart w:id="44" w:name="_Toc239349628"/>
+      <w:bookmarkStart w:id="44" w:name="_Toc239844088"/>
       <w:r>
         <w:rPr>
           <w:rFonts w:ascii="Montserrat" w:hAnsi="Montserrat"/>
@@ -19832,16 +19832,16 @@
           <w:noProof/>
         </w:rPr>
         <w:drawing>
-          <wp:inline distT="0" distB="0" distL="0" distR="0" wp14:anchorId="66DB7EB9" wp14:editId="0CB3F1D1">
+          <wp:inline distT="0" distB="0" distL="0" distR="0" wp14:anchorId="4DC2F5F1" wp14:editId="00563AD7">
             <wp:extent cx="5303520" cy="1351384"/>
             <wp:effectExtent l="19050" t="19050" r="11430" b="20320"/>
-            <wp:docPr id="1972654652" name="Imagem 54"/>
+            <wp:docPr id="1459641474" name="Imagem 54"/>
             <wp:cNvGraphicFramePr/>
             <a:graphic xmlns:a="http://schemas.openxmlformats.org/drawingml/2006/main">
               <a:graphicData uri="http://schemas.openxmlformats.org/drawingml/2006/picture">
                 <pic:pic xmlns:pic="http://schemas.openxmlformats.org/drawingml/2006/picture">
                   <pic:nvPicPr>
-                    <pic:cNvPr id="1972654652" name=""/>
+                    <pic:cNvPr id="1459641474" name=""/>
                     <pic:cNvPicPr/>
                   </pic:nvPicPr>
                   <pic:blipFill>
@@ -19909,7 +19909,7 @@
           <w:sz w:val="27"/>
         </w:rPr>
       </w:pPr>
-      <w:bookmarkStart w:id="45" w:name="_Toc239349629"/>
+      <w:bookmarkStart w:id="45" w:name="_Toc239844089"/>
       <w:r>
         <w:rPr>
           <w:rFonts w:ascii="Montserrat" w:hAnsi="Montserrat"/>
@@ -20021,16 +20021,16 @@
           <w:noProof/>
         </w:rPr>
         <w:drawing>
-          <wp:inline distT="0" distB="0" distL="0" distR="0" wp14:anchorId="0FAF5051" wp14:editId="5E0EAD81">
+          <wp:inline distT="0" distB="0" distL="0" distR="0" wp14:anchorId="720C1A7A" wp14:editId="1B9EA377">
             <wp:extent cx="5303520" cy="1422793"/>
             <wp:effectExtent l="19050" t="19050" r="11430" b="25400"/>
-            <wp:docPr id="378229175" name="Imagem 55"/>
+            <wp:docPr id="32523952" name="Imagem 55"/>
             <wp:cNvGraphicFramePr/>
             <a:graphic xmlns:a="http://schemas.openxmlformats.org/drawingml/2006/main">
               <a:graphicData uri="http://schemas.openxmlformats.org/drawingml/2006/picture">
                 <pic:pic xmlns:pic="http://schemas.openxmlformats.org/drawingml/2006/picture">
                   <pic:nvPicPr>
-                    <pic:cNvPr id="378229175" name=""/>
+                    <pic:cNvPr id="32523952" name=""/>
                     <pic:cNvPicPr/>
                   </pic:nvPicPr>
                   <pic:blipFill>
@@ -20185,16 +20185,16 @@
           <w:noProof/>
         </w:rPr>
         <w:drawing>
-          <wp:inline distT="0" distB="0" distL="0" distR="0" wp14:anchorId="165132FE" wp14:editId="5E915EAD">
+          <wp:inline distT="0" distB="0" distL="0" distR="0" wp14:anchorId="112957C6" wp14:editId="6C64BEEF">
             <wp:extent cx="5303520" cy="1841050"/>
             <wp:effectExtent l="19050" t="19050" r="11430" b="26035"/>
-            <wp:docPr id="1192557278" name="Imagem 56"/>
+            <wp:docPr id="1878057802" name="Imagem 56"/>
             <wp:cNvGraphicFramePr/>
             <a:graphic xmlns:a="http://schemas.openxmlformats.org/drawingml/2006/main">
               <a:graphicData uri="http://schemas.openxmlformats.org/drawingml/2006/picture">
                 <pic:pic xmlns:pic="http://schemas.openxmlformats.org/drawingml/2006/picture">
                   <pic:nvPicPr>
-                    <pic:cNvPr id="1192557278" name=""/>
+                    <pic:cNvPr id="1878057802" name=""/>
                     <pic:cNvPicPr/>
                   </pic:nvPicPr>
                   <pic:blipFill>
@@ -20357,16 +20357,16 @@
           <w:noProof/>
         </w:rPr>
         <w:drawing>
-          <wp:inline distT="0" distB="0" distL="0" distR="0" wp14:anchorId="20B1B761" wp14:editId="1313FF6D">
+          <wp:inline distT="0" distB="0" distL="0" distR="0" wp14:anchorId="5F3B22A5" wp14:editId="38D2B886">
             <wp:extent cx="5303520" cy="303041"/>
             <wp:effectExtent l="19050" t="19050" r="11430" b="20955"/>
-            <wp:docPr id="1972747529" name="Imagem 57"/>
+            <wp:docPr id="757079993" name="Imagem 57"/>
             <wp:cNvGraphicFramePr/>
             <a:graphic xmlns:a="http://schemas.openxmlformats.org/drawingml/2006/main">
               <a:graphicData uri="http://schemas.openxmlformats.org/drawingml/2006/picture">
                 <pic:pic xmlns:pic="http://schemas.openxmlformats.org/drawingml/2006/picture">
                   <pic:nvPicPr>
-                    <pic:cNvPr id="1972747529" name=""/>
+                    <pic:cNvPr id="757079993" name=""/>
                     <pic:cNvPicPr/>
                   </pic:nvPicPr>
                   <pic:blipFill>
@@ -20433,16 +20433,16 @@
           <w:noProof/>
         </w:rPr>
         <w:drawing>
-          <wp:inline distT="0" distB="0" distL="0" distR="0" wp14:anchorId="26D4076D" wp14:editId="19560B83">
+          <wp:inline distT="0" distB="0" distL="0" distR="0" wp14:anchorId="56C34E3D" wp14:editId="7189F8E5">
             <wp:extent cx="5303520" cy="2983005"/>
             <wp:effectExtent l="19050" t="19050" r="11430" b="27305"/>
-            <wp:docPr id="1278612139" name="Imagem 58"/>
+            <wp:docPr id="833991181" name="Imagem 58"/>
             <wp:cNvGraphicFramePr/>
             <a:graphic xmlns:a="http://schemas.openxmlformats.org/drawingml/2006/main">
               <a:graphicData uri="http://schemas.openxmlformats.org/drawingml/2006/picture">
                 <pic:pic xmlns:pic="http://schemas.openxmlformats.org/drawingml/2006/picture">
                   <pic:nvPicPr>
-                    <pic:cNvPr id="1278612139" name=""/>
+                    <pic:cNvPr id="833991181" name=""/>
                     <pic:cNvPicPr/>
                   </pic:nvPicPr>
                   <pic:blipFill>
@@ -20514,7 +20514,7 @@
           <w:sz w:val="34"/>
         </w:rPr>
       </w:pPr>
-      <w:bookmarkStart w:id="46" w:name="_Toc239349630"/>
+      <w:bookmarkStart w:id="46" w:name="_Toc239844090"/>
       <w:r>
         <w:rPr>
           <w:rFonts w:ascii="Montserrat" w:hAnsi="Montserrat"/>
@@ -20758,7 +20758,7 @@
           <w:sz w:val="34"/>
         </w:rPr>
       </w:pPr>
-      <w:bookmarkStart w:id="47" w:name="_Toc239349631"/>
+      <w:bookmarkStart w:id="47" w:name="_Toc239844091"/>
       <w:r>
         <w:rPr>
           <w:rFonts w:ascii="Montserrat" w:hAnsi="Montserrat"/>
@@ -22546,7 +22546,7 @@
 <file path=word/numbering.xml><?xml version="1.0" encoding="utf-8"?>
 <w:numbering xmlns:wpc="http://schemas.microsoft.com/office/word/2010/wordprocessingCanvas" xmlns:cx="http://schemas.microsoft.com/office/drawing/2014/chartex" xmlns:cx1="http://schemas.microsoft.com/office/drawing/2015/9/8/chartex" xmlns:cx2="http://schemas.microsoft.com/office/drawing/2015/10/21/chartex" xmlns:cx3="http://schemas.microsoft.com/office/drawing/2016/5/9/chartex" xmlns:cx4="http://schemas.microsoft.com/office/drawing/2016/5/10/chartex" xmlns:cx5="http://schemas.microsoft.com/office/drawing/2016/5/11/chartex" xmlns:cx6="http://schemas.microsoft.com/office/drawing/2016/5/12/chartex" xmlns:cx7="http://schemas.microsoft.com/office/drawing/2016/5/13/chartex" xmlns:cx8="http://schemas.microsoft.com/office/drawing/2016/5/14/chartex" xmlns:mc="http://schemas.openxmlformats.org/markup-compatibility/2006" xmlns:aink="http://schemas.microsoft.com/office/drawing/2016/ink" xmlns:am3d="http://schemas.microsoft.com/office/drawing/2017/model3d" xmlns:o="urn:schemas-microsoft-com:office:office" xmlns:oel="http://schemas.microsoft.com/office/2019/extlst" xmlns:r="http://schemas.openxmlformats.org/officeDocument/2006/relationships" xmlns:m="http://schemas.openxmlformats.org/officeDocument/2006/math" xmlns:v="urn:schemas-microsoft-com:vml" xmlns:wp14="http://schemas.microsoft.com/office/word/2010/wordprocessingDrawing" xmlns:wp="http://schemas.openxmlformats.org/drawingml/2006/wordprocessingDrawing" xmlns:w10="urn:schemas-microsoft-com:office:word" xmlns:w="http://schemas.openxmlformats.org/wordprocessingml/2006/main" xmlns:w14="http://schemas.microsoft.com/office/word/2010/wordml" xmlns:w15="http://schemas.microsoft.com/office/word/2012/wordml" xmlns:w16cex="http://schemas.microsoft.com/office/word/2018/wordml/cex" xmlns:w16cid="http://schemas.microsoft.com/office/word/2016/wordml/cid" xmlns:w16="http://schemas.microsoft.com/office/word/2018/wordml" xmlns:w16du="http://schemas.microsoft.com/office/word/2023/wordml/word16du" xmlns:w16sdtdh="http://schemas.microsoft.com/office/word/2020/wordml/sdtdatahash" xmlns:w16sdtfl="http://schemas.microsoft.com/office/word/2024/wordml/sdtformatlock" xmlns:w16se="http://schemas.microsoft.com/office/word/2015/wordml/symex" xmlns:wpg="http://schemas.microsoft.com/office/word/2010/wordprocessingGroup" xmlns:wpi="http://schemas.microsoft.com/office/word/2010/wordprocessingInk" xmlns:wne="http://schemas.microsoft.com/office/word/2006/wordml" xmlns:wps="http://schemas.microsoft.com/office/word/2010/wordprocessingShape" mc:Ignorable="w14 w15 w16se w16cid w16 w16cex w16sdtdh w16sdtfl w16du wp14">
   <w:abstractNum w:abstractNumId="0" w15:restartNumberingAfterBreak="0">
-    <w:nsid w:val="029C5B1D"/>
+    <w:nsid w:val="070F6BFE"/>
     <w:multiLevelType w:val="singleLevel"/>
     <w:tmpl w:val="04160001"/>
     <w:lvl w:ilvl="0">
@@ -22563,7 +22563,7 @@
     </w:lvl>
   </w:abstractNum>
   <w:abstractNum w:abstractNumId="1" w15:restartNumberingAfterBreak="0">
-    <w:nsid w:val="031C0856"/>
+    <w:nsid w:val="0A807519"/>
     <w:multiLevelType w:val="singleLevel"/>
     <w:tmpl w:val="04160001"/>
     <w:lvl w:ilvl="0">
@@ -22580,7 +22580,7 @@
     </w:lvl>
   </w:abstractNum>
   <w:abstractNum w:abstractNumId="2" w15:restartNumberingAfterBreak="0">
-    <w:nsid w:val="03E940BA"/>
+    <w:nsid w:val="0FD7665C"/>
     <w:multiLevelType w:val="singleLevel"/>
     <w:tmpl w:val="04160001"/>
     <w:lvl w:ilvl="0">
@@ -22597,7 +22597,7 @@
     </w:lvl>
   </w:abstractNum>
   <w:abstractNum w:abstractNumId="3" w15:restartNumberingAfterBreak="0">
-    <w:nsid w:val="08AC665B"/>
+    <w:nsid w:val="159B0923"/>
     <w:multiLevelType w:val="singleLevel"/>
     <w:tmpl w:val="04160001"/>
     <w:lvl w:ilvl="0">
@@ -22614,7 +22614,7 @@
     </w:lvl>
   </w:abstractNum>
   <w:abstractNum w:abstractNumId="4" w15:restartNumberingAfterBreak="0">
-    <w:nsid w:val="0AA92D74"/>
+    <w:nsid w:val="15BB5D96"/>
     <w:multiLevelType w:val="singleLevel"/>
     <w:tmpl w:val="04160001"/>
     <w:lvl w:ilvl="0">
@@ -22631,7 +22631,7 @@
     </w:lvl>
   </w:abstractNum>
   <w:abstractNum w:abstractNumId="5" w15:restartNumberingAfterBreak="0">
-    <w:nsid w:val="0B8769EE"/>
+    <w:nsid w:val="1B3B5140"/>
     <w:multiLevelType w:val="singleLevel"/>
     <w:tmpl w:val="04160001"/>
     <w:lvl w:ilvl="0">
@@ -22648,7 +22648,7 @@
     </w:lvl>
   </w:abstractNum>
   <w:abstractNum w:abstractNumId="6" w15:restartNumberingAfterBreak="0">
-    <w:nsid w:val="104737D2"/>
+    <w:nsid w:val="1E1A7F6B"/>
     <w:multiLevelType w:val="singleLevel"/>
     <w:tmpl w:val="04160001"/>
     <w:lvl w:ilvl="0">
@@ -22665,7 +22665,7 @@
     </w:lvl>
   </w:abstractNum>
   <w:abstractNum w:abstractNumId="7" w15:restartNumberingAfterBreak="0">
-    <w:nsid w:val="1122067C"/>
+    <w:nsid w:val="269A0BEB"/>
     <w:multiLevelType w:val="singleLevel"/>
     <w:tmpl w:val="04160001"/>
     <w:lvl w:ilvl="0">
@@ -22682,7 +22682,7 @@
     </w:lvl>
   </w:abstractNum>
   <w:abstractNum w:abstractNumId="8" w15:restartNumberingAfterBreak="0">
-    <w:nsid w:val="24936054"/>
+    <w:nsid w:val="26E976A6"/>
     <w:multiLevelType w:val="singleLevel"/>
     <w:tmpl w:val="04160001"/>
     <w:lvl w:ilvl="0">
@@ -22699,7 +22699,7 @@
     </w:lvl>
   </w:abstractNum>
   <w:abstractNum w:abstractNumId="9" w15:restartNumberingAfterBreak="0">
-    <w:nsid w:val="271456D3"/>
+    <w:nsid w:val="271465AA"/>
     <w:multiLevelType w:val="singleLevel"/>
     <w:tmpl w:val="04160001"/>
     <w:lvl w:ilvl="0">
@@ -22716,7 +22716,7 @@
     </w:lvl>
   </w:abstractNum>
   <w:abstractNum w:abstractNumId="10" w15:restartNumberingAfterBreak="0">
-    <w:nsid w:val="2BF17681"/>
+    <w:nsid w:val="273B4DAA"/>
     <w:multiLevelType w:val="singleLevel"/>
     <w:tmpl w:val="04160001"/>
     <w:lvl w:ilvl="0">
@@ -22733,7 +22733,7 @@
     </w:lvl>
   </w:abstractNum>
   <w:abstractNum w:abstractNumId="11" w15:restartNumberingAfterBreak="0">
-    <w:nsid w:val="306C6592"/>
+    <w:nsid w:val="34056FAB"/>
     <w:multiLevelType w:val="singleLevel"/>
     <w:tmpl w:val="04160001"/>
     <w:lvl w:ilvl="0">
@@ -22750,7 +22750,7 @@
     </w:lvl>
   </w:abstractNum>
   <w:abstractNum w:abstractNumId="12" w15:restartNumberingAfterBreak="0">
-    <w:nsid w:val="337A1631"/>
+    <w:nsid w:val="349A3829"/>
     <w:multiLevelType w:val="singleLevel"/>
     <w:tmpl w:val="04160001"/>
     <w:lvl w:ilvl="0">
@@ -22767,7 +22767,7 @@
     </w:lvl>
   </w:abstractNum>
   <w:abstractNum w:abstractNumId="13" w15:restartNumberingAfterBreak="0">
-    <w:nsid w:val="35C3492B"/>
+    <w:nsid w:val="38846C65"/>
     <w:multiLevelType w:val="singleLevel"/>
     <w:tmpl w:val="04160001"/>
     <w:lvl w:ilvl="0">
@@ -22784,7 +22784,7 @@
     </w:lvl>
   </w:abstractNum>
   <w:abstractNum w:abstractNumId="14" w15:restartNumberingAfterBreak="0">
-    <w:nsid w:val="3D35628B"/>
+    <w:nsid w:val="3985598B"/>
     <w:multiLevelType w:val="singleLevel"/>
     <w:tmpl w:val="04160001"/>
     <w:lvl w:ilvl="0">
@@ -22801,7 +22801,7 @@
     </w:lvl>
   </w:abstractNum>
   <w:abstractNum w:abstractNumId="15" w15:restartNumberingAfterBreak="0">
-    <w:nsid w:val="3FE86E81"/>
+    <w:nsid w:val="3BA32CB8"/>
     <w:multiLevelType w:val="singleLevel"/>
     <w:tmpl w:val="04160001"/>
     <w:lvl w:ilvl="0">
@@ -22818,7 +22818,7 @@
     </w:lvl>
   </w:abstractNum>
   <w:abstractNum w:abstractNumId="16" w15:restartNumberingAfterBreak="0">
-    <w:nsid w:val="40C15F07"/>
+    <w:nsid w:val="3FE60E4F"/>
     <w:multiLevelType w:val="singleLevel"/>
     <w:tmpl w:val="04160001"/>
     <w:lvl w:ilvl="0">
@@ -22835,7 +22835,7 @@
     </w:lvl>
   </w:abstractNum>
   <w:abstractNum w:abstractNumId="17" w15:restartNumberingAfterBreak="0">
-    <w:nsid w:val="423124D3"/>
+    <w:nsid w:val="43A13CE6"/>
     <w:multiLevelType w:val="singleLevel"/>
     <w:tmpl w:val="04160001"/>
     <w:lvl w:ilvl="0">
@@ -22852,7 +22852,7 @@
     </w:lvl>
   </w:abstractNum>
   <w:abstractNum w:abstractNumId="18" w15:restartNumberingAfterBreak="0">
-    <w:nsid w:val="4A6F39D1"/>
+    <w:nsid w:val="46113017"/>
     <w:multiLevelType w:val="singleLevel"/>
     <w:tmpl w:val="04160001"/>
     <w:lvl w:ilvl="0">
@@ -22869,7 +22869,7 @@
     </w:lvl>
   </w:abstractNum>
   <w:abstractNum w:abstractNumId="19" w15:restartNumberingAfterBreak="0">
-    <w:nsid w:val="4C674229"/>
+    <w:nsid w:val="4B2768E7"/>
     <w:multiLevelType w:val="singleLevel"/>
     <w:tmpl w:val="04160001"/>
     <w:lvl w:ilvl="0">
@@ -22886,7 +22886,7 @@
     </w:lvl>
   </w:abstractNum>
   <w:abstractNum w:abstractNumId="20" w15:restartNumberingAfterBreak="0">
-    <w:nsid w:val="55153D88"/>
+    <w:nsid w:val="4DB56342"/>
     <w:multiLevelType w:val="singleLevel"/>
     <w:tmpl w:val="04160001"/>
     <w:lvl w:ilvl="0">
@@ -22903,7 +22903,7 @@
     </w:lvl>
   </w:abstractNum>
   <w:abstractNum w:abstractNumId="21" w15:restartNumberingAfterBreak="0">
-    <w:nsid w:val="589D5431"/>
+    <w:nsid w:val="509816C2"/>
     <w:multiLevelType w:val="singleLevel"/>
     <w:tmpl w:val="04160001"/>
     <w:lvl w:ilvl="0">
@@ -22920,7 +22920,7 @@
     </w:lvl>
   </w:abstractNum>
   <w:abstractNum w:abstractNumId="22" w15:restartNumberingAfterBreak="0">
-    <w:nsid w:val="5C0574DF"/>
+    <w:nsid w:val="517F29E4"/>
     <w:multiLevelType w:val="singleLevel"/>
     <w:tmpl w:val="04160001"/>
     <w:lvl w:ilvl="0">
@@ -22937,7 +22937,7 @@
     </w:lvl>
   </w:abstractNum>
   <w:abstractNum w:abstractNumId="23" w15:restartNumberingAfterBreak="0">
-    <w:nsid w:val="5C171B3C"/>
+    <w:nsid w:val="5B480FEB"/>
     <w:multiLevelType w:val="singleLevel"/>
     <w:tmpl w:val="04160001"/>
     <w:lvl w:ilvl="0">
@@ -22954,7 +22954,7 @@
     </w:lvl>
   </w:abstractNum>
   <w:abstractNum w:abstractNumId="24" w15:restartNumberingAfterBreak="0">
-    <w:nsid w:val="5FF201D3"/>
+    <w:nsid w:val="5BAA480A"/>
     <w:multiLevelType w:val="singleLevel"/>
     <w:tmpl w:val="04160001"/>
     <w:lvl w:ilvl="0">
@@ -22971,7 +22971,7 @@
     </w:lvl>
   </w:abstractNum>
   <w:abstractNum w:abstractNumId="25" w15:restartNumberingAfterBreak="0">
-    <w:nsid w:val="67F034DF"/>
+    <w:nsid w:val="5CE75EAC"/>
     <w:multiLevelType w:val="singleLevel"/>
     <w:tmpl w:val="04160001"/>
     <w:lvl w:ilvl="0">
@@ -22988,7 +22988,7 @@
     </w:lvl>
   </w:abstractNum>
   <w:abstractNum w:abstractNumId="26" w15:restartNumberingAfterBreak="0">
-    <w:nsid w:val="68B23B36"/>
+    <w:nsid w:val="5F35303B"/>
     <w:multiLevelType w:val="singleLevel"/>
     <w:tmpl w:val="04160001"/>
     <w:lvl w:ilvl="0">
@@ -23005,7 +23005,7 @@
     </w:lvl>
   </w:abstractNum>
   <w:abstractNum w:abstractNumId="27" w15:restartNumberingAfterBreak="0">
-    <w:nsid w:val="69553F9E"/>
+    <w:nsid w:val="618E4250"/>
     <w:multiLevelType w:val="singleLevel"/>
     <w:tmpl w:val="04160001"/>
     <w:lvl w:ilvl="0">
@@ -23022,7 +23022,7 @@
     </w:lvl>
   </w:abstractNum>
   <w:abstractNum w:abstractNumId="28" w15:restartNumberingAfterBreak="0">
-    <w:nsid w:val="6E3A777F"/>
+    <w:nsid w:val="64A60174"/>
     <w:multiLevelType w:val="singleLevel"/>
     <w:tmpl w:val="04160001"/>
     <w:lvl w:ilvl="0">
@@ -23039,7 +23039,7 @@
     </w:lvl>
   </w:abstractNum>
   <w:abstractNum w:abstractNumId="29" w15:restartNumberingAfterBreak="0">
-    <w:nsid w:val="72142D51"/>
+    <w:nsid w:val="6BD16CE9"/>
     <w:multiLevelType w:val="singleLevel"/>
     <w:tmpl w:val="04160001"/>
     <w:lvl w:ilvl="0">
@@ -23056,7 +23056,7 @@
     </w:lvl>
   </w:abstractNum>
   <w:abstractNum w:abstractNumId="30" w15:restartNumberingAfterBreak="0">
-    <w:nsid w:val="75700941"/>
+    <w:nsid w:val="6E852389"/>
     <w:multiLevelType w:val="singleLevel"/>
     <w:tmpl w:val="04160001"/>
     <w:lvl w:ilvl="0">
@@ -23073,7 +23073,7 @@
     </w:lvl>
   </w:abstractNum>
   <w:abstractNum w:abstractNumId="31" w15:restartNumberingAfterBreak="0">
-    <w:nsid w:val="77DB4CC1"/>
+    <w:nsid w:val="70815342"/>
     <w:multiLevelType w:val="singleLevel"/>
     <w:tmpl w:val="04160001"/>
     <w:lvl w:ilvl="0">
@@ -23090,7 +23090,7 @@
     </w:lvl>
   </w:abstractNum>
   <w:abstractNum w:abstractNumId="32" w15:restartNumberingAfterBreak="0">
-    <w:nsid w:val="799B061E"/>
+    <w:nsid w:val="74EC5DE5"/>
     <w:multiLevelType w:val="singleLevel"/>
     <w:tmpl w:val="04160001"/>
     <w:lvl w:ilvl="0">
@@ -23106,104 +23106,104 @@
       </w:rPr>
     </w:lvl>
   </w:abstractNum>
-  <w:num w:numId="1" w16cid:durableId="1881822075">
+  <w:num w:numId="1" w16cid:durableId="211158767">
+    <w:abstractNumId w:val="9"/>
+  </w:num>
+  <w:num w:numId="2" w16cid:durableId="1273048559">
+    <w:abstractNumId w:val="30"/>
+  </w:num>
+  <w:num w:numId="3" w16cid:durableId="1832135074">
+    <w:abstractNumId w:val="31"/>
+  </w:num>
+  <w:num w:numId="4" w16cid:durableId="531457032">
+    <w:abstractNumId w:val="22"/>
+  </w:num>
+  <w:num w:numId="5" w16cid:durableId="746802699">
+    <w:abstractNumId w:val="14"/>
+  </w:num>
+  <w:num w:numId="6" w16cid:durableId="1115757148">
+    <w:abstractNumId w:val="29"/>
+  </w:num>
+  <w:num w:numId="7" w16cid:durableId="2071998102">
+    <w:abstractNumId w:val="24"/>
+  </w:num>
+  <w:num w:numId="8" w16cid:durableId="1732071504">
+    <w:abstractNumId w:val="25"/>
+  </w:num>
+  <w:num w:numId="9" w16cid:durableId="1577008130">
+    <w:abstractNumId w:val="21"/>
+  </w:num>
+  <w:num w:numId="10" w16cid:durableId="1385445501">
+    <w:abstractNumId w:val="23"/>
+  </w:num>
+  <w:num w:numId="11" w16cid:durableId="2033260456">
+    <w:abstractNumId w:val="12"/>
+  </w:num>
+  <w:num w:numId="12" w16cid:durableId="1268737288">
+    <w:abstractNumId w:val="10"/>
+  </w:num>
+  <w:num w:numId="13" w16cid:durableId="971787937">
+    <w:abstractNumId w:val="20"/>
+  </w:num>
+  <w:num w:numId="14" w16cid:durableId="1133136588">
+    <w:abstractNumId w:val="8"/>
+  </w:num>
+  <w:num w:numId="15" w16cid:durableId="43068758">
+    <w:abstractNumId w:val="0"/>
+  </w:num>
+  <w:num w:numId="16" w16cid:durableId="1345984541">
+    <w:abstractNumId w:val="11"/>
+  </w:num>
+  <w:num w:numId="17" w16cid:durableId="256792051">
+    <w:abstractNumId w:val="6"/>
+  </w:num>
+  <w:num w:numId="18" w16cid:durableId="1390617073">
+    <w:abstractNumId w:val="17"/>
+  </w:num>
+  <w:num w:numId="19" w16cid:durableId="1495298193">
+    <w:abstractNumId w:val="16"/>
+  </w:num>
+  <w:num w:numId="20" w16cid:durableId="825323770">
+    <w:abstractNumId w:val="28"/>
+  </w:num>
+  <w:num w:numId="21" w16cid:durableId="165825291">
+    <w:abstractNumId w:val="13"/>
+  </w:num>
+  <w:num w:numId="22" w16cid:durableId="1189105421">
+    <w:abstractNumId w:val="27"/>
+  </w:num>
+  <w:num w:numId="23" w16cid:durableId="1778868971">
+    <w:abstractNumId w:val="7"/>
+  </w:num>
+  <w:num w:numId="24" w16cid:durableId="1759213222">
+    <w:abstractNumId w:val="4"/>
+  </w:num>
+  <w:num w:numId="25" w16cid:durableId="1869372062">
+    <w:abstractNumId w:val="5"/>
+  </w:num>
+  <w:num w:numId="26" w16cid:durableId="859975185">
+    <w:abstractNumId w:val="1"/>
+  </w:num>
+  <w:num w:numId="27" w16cid:durableId="558639846">
+    <w:abstractNumId w:val="32"/>
+  </w:num>
+  <w:num w:numId="28" w16cid:durableId="728262003">
+    <w:abstractNumId w:val="19"/>
+  </w:num>
+  <w:num w:numId="29" w16cid:durableId="1590652019">
+    <w:abstractNumId w:val="15"/>
+  </w:num>
+  <w:num w:numId="30" w16cid:durableId="1187597829">
     <w:abstractNumId w:val="26"/>
   </w:num>
-  <w:num w:numId="2" w16cid:durableId="1922372802">
-    <w:abstractNumId w:val="1"/>
+  <w:num w:numId="31" w16cid:durableId="466240621">
+    <w:abstractNumId w:val="18"/>
   </w:num>
-  <w:num w:numId="3" w16cid:durableId="1318387927">
-    <w:abstractNumId w:val="27"/>
-  </w:num>
-  <w:num w:numId="4" w16cid:durableId="1063914088">
-    <w:abstractNumId w:val="25"/>
-  </w:num>
-  <w:num w:numId="5" w16cid:durableId="415051785">
-    <w:abstractNumId w:val="5"/>
-  </w:num>
-  <w:num w:numId="6" w16cid:durableId="767309222">
-    <w:abstractNumId w:val="28"/>
-  </w:num>
-  <w:num w:numId="7" w16cid:durableId="1679960932">
-    <w:abstractNumId w:val="22"/>
-  </w:num>
-  <w:num w:numId="8" w16cid:durableId="1453404397">
-    <w:abstractNumId w:val="13"/>
-  </w:num>
-  <w:num w:numId="9" w16cid:durableId="743600865">
-    <w:abstractNumId w:val="29"/>
-  </w:num>
-  <w:num w:numId="10" w16cid:durableId="175270020">
-    <w:abstractNumId w:val="20"/>
-  </w:num>
-  <w:num w:numId="11" w16cid:durableId="616182360">
+  <w:num w:numId="32" w16cid:durableId="901676357">
     <w:abstractNumId w:val="3"/>
   </w:num>
-  <w:num w:numId="12" w16cid:durableId="1608736749">
-    <w:abstractNumId w:val="15"/>
-  </w:num>
-  <w:num w:numId="13" w16cid:durableId="999389773">
-    <w:abstractNumId w:val="14"/>
-  </w:num>
-  <w:num w:numId="14" w16cid:durableId="2009402179">
-    <w:abstractNumId w:val="16"/>
-  </w:num>
-  <w:num w:numId="15" w16cid:durableId="1945729529">
-    <w:abstractNumId w:val="8"/>
-  </w:num>
-  <w:num w:numId="16" w16cid:durableId="1839885036">
-    <w:abstractNumId w:val="11"/>
-  </w:num>
-  <w:num w:numId="17" w16cid:durableId="180361852">
-    <w:abstractNumId w:val="17"/>
-  </w:num>
-  <w:num w:numId="18" w16cid:durableId="986127123">
-    <w:abstractNumId w:val="19"/>
-  </w:num>
-  <w:num w:numId="19" w16cid:durableId="1917863503">
-    <w:abstractNumId w:val="4"/>
-  </w:num>
-  <w:num w:numId="20" w16cid:durableId="1488784639">
-    <w:abstractNumId w:val="12"/>
-  </w:num>
-  <w:num w:numId="21" w16cid:durableId="349795504">
-    <w:abstractNumId w:val="23"/>
-  </w:num>
-  <w:num w:numId="22" w16cid:durableId="540632315">
-    <w:abstractNumId w:val="10"/>
-  </w:num>
-  <w:num w:numId="23" w16cid:durableId="67775700">
+  <w:num w:numId="33" w16cid:durableId="1440370946">
     <w:abstractNumId w:val="2"/>
-  </w:num>
-  <w:num w:numId="24" w16cid:durableId="400641405">
-    <w:abstractNumId w:val="31"/>
-  </w:num>
-  <w:num w:numId="25" w16cid:durableId="1869485270">
-    <w:abstractNumId w:val="0"/>
-  </w:num>
-  <w:num w:numId="26" w16cid:durableId="1586449938">
-    <w:abstractNumId w:val="24"/>
-  </w:num>
-  <w:num w:numId="27" w16cid:durableId="535389522">
-    <w:abstractNumId w:val="21"/>
-  </w:num>
-  <w:num w:numId="28" w16cid:durableId="1821456654">
-    <w:abstractNumId w:val="7"/>
-  </w:num>
-  <w:num w:numId="29" w16cid:durableId="2061787339">
-    <w:abstractNumId w:val="6"/>
-  </w:num>
-  <w:num w:numId="30" w16cid:durableId="690689284">
-    <w:abstractNumId w:val="32"/>
-  </w:num>
-  <w:num w:numId="31" w16cid:durableId="1901206546">
-    <w:abstractNumId w:val="9"/>
-  </w:num>
-  <w:num w:numId="32" w16cid:durableId="1558853618">
-    <w:abstractNumId w:val="30"/>
-  </w:num>
-  <w:num w:numId="33" w16cid:durableId="1528448529">
-    <w:abstractNumId w:val="18"/>
   </w:num>
 </w:numbering>
 </file>
@@ -23616,7 +23616,7 @@
     <w:link w:val="Ttulo1Char"/>
     <w:uiPriority w:val="9"/>
     <w:qFormat/>
-    <w:rsid w:val="008A4885"/>
+    <w:rsid w:val="00435DA3"/>
     <w:pPr>
       <w:keepNext/>
       <w:keepLines/>
@@ -23638,7 +23638,7 @@
     <w:uiPriority w:val="9"/>
     <w:unhideWhenUsed/>
     <w:qFormat/>
-    <w:rsid w:val="008A4885"/>
+    <w:rsid w:val="00435DA3"/>
     <w:pPr>
       <w:keepNext/>
       <w:keepLines/>
@@ -23661,7 +23661,7 @@
     <w:semiHidden/>
     <w:unhideWhenUsed/>
     <w:qFormat/>
-    <w:rsid w:val="008A4885"/>
+    <w:rsid w:val="00435DA3"/>
     <w:pPr>
       <w:keepNext/>
       <w:keepLines/>
@@ -23684,7 +23684,7 @@
     <w:semiHidden/>
     <w:unhideWhenUsed/>
     <w:qFormat/>
-    <w:rsid w:val="008A4885"/>
+    <w:rsid w:val="00435DA3"/>
     <w:pPr>
       <w:keepNext/>
       <w:keepLines/>
@@ -23707,7 +23707,7 @@
     <w:semiHidden/>
     <w:unhideWhenUsed/>
     <w:qFormat/>
-    <w:rsid w:val="008A4885"/>
+    <w:rsid w:val="00435DA3"/>
     <w:pPr>
       <w:keepNext/>
       <w:keepLines/>
@@ -23728,7 +23728,7 @@
     <w:semiHidden/>
     <w:unhideWhenUsed/>
     <w:qFormat/>
-    <w:rsid w:val="008A4885"/>
+    <w:rsid w:val="00435DA3"/>
     <w:pPr>
       <w:keepNext/>
       <w:keepLines/>
@@ -23751,7 +23751,7 @@
     <w:semiHidden/>
     <w:unhideWhenUsed/>
     <w:qFormat/>
-    <w:rsid w:val="008A4885"/>
+    <w:rsid w:val="00435DA3"/>
     <w:pPr>
       <w:keepNext/>
       <w:keepLines/>
@@ -23772,7 +23772,7 @@
     <w:semiHidden/>
     <w:unhideWhenUsed/>
     <w:qFormat/>
-    <w:rsid w:val="008A4885"/>
+    <w:rsid w:val="00435DA3"/>
     <w:pPr>
       <w:keepNext/>
       <w:keepLines/>
@@ -23795,7 +23795,7 @@
     <w:semiHidden/>
     <w:unhideWhenUsed/>
     <w:qFormat/>
-    <w:rsid w:val="008A4885"/>
+    <w:rsid w:val="00435DA3"/>
     <w:pPr>
       <w:keepNext/>
       <w:keepLines/>
@@ -23839,7 +23839,7 @@
     <w:basedOn w:val="Fontepargpadro"/>
     <w:link w:val="Ttulo1"/>
     <w:uiPriority w:val="9"/>
-    <w:rsid w:val="008A4885"/>
+    <w:rsid w:val="00435DA3"/>
     <w:rPr>
       <w:rFonts w:asciiTheme="majorHAnsi" w:eastAsiaTheme="majorEastAsia" w:hAnsiTheme="majorHAnsi" w:cstheme="majorBidi"/>
       <w:color w:val="0F4761" w:themeColor="accent1" w:themeShade="BF"/>
@@ -23852,7 +23852,7 @@
     <w:basedOn w:val="Fontepargpadro"/>
     <w:link w:val="Ttulo2"/>
     <w:uiPriority w:val="9"/>
-    <w:rsid w:val="008A4885"/>
+    <w:rsid w:val="00435DA3"/>
     <w:rPr>
       <w:rFonts w:asciiTheme="majorHAnsi" w:eastAsiaTheme="majorEastAsia" w:hAnsiTheme="majorHAnsi" w:cstheme="majorBidi"/>
       <w:color w:val="0F4761" w:themeColor="accent1" w:themeShade="BF"/>
@@ -23866,7 +23866,7 @@
     <w:link w:val="Ttulo3"/>
     <w:uiPriority w:val="9"/>
     <w:semiHidden/>
-    <w:rsid w:val="008A4885"/>
+    <w:rsid w:val="00435DA3"/>
     <w:rPr>
       <w:rFonts w:eastAsiaTheme="majorEastAsia" w:cstheme="majorBidi"/>
       <w:color w:val="0F4761" w:themeColor="accent1" w:themeShade="BF"/>
@@ -23880,7 +23880,7 @@
     <w:link w:val="Ttulo4"/>
     <w:uiPriority w:val="9"/>
     <w:semiHidden/>
-    <w:rsid w:val="008A4885"/>
+    <w:rsid w:val="00435DA3"/>
     <w:rPr>
       <w:rFonts w:eastAsiaTheme="majorEastAsia" w:cstheme="majorBidi"/>
       <w:i/>
@@ -23894,7 +23894,7 @@
     <w:link w:val="Ttulo5"/>
     <w:uiPriority w:val="9"/>
     <w:semiHidden/>
-    <w:rsid w:val="008A4885"/>
+    <w:rsid w:val="00435DA3"/>
     <w:rPr>
       <w:rFonts w:eastAsiaTheme="majorEastAsia" w:cstheme="majorBidi"/>
       <w:color w:val="0F4761" w:themeColor="accent1" w:themeShade="BF"/>
@@ -23906,7 +23906,7 @@
     <w:link w:val="Ttulo6"/>
     <w:uiPriority w:val="9"/>
     <w:semiHidden/>
-    <w:rsid w:val="008A4885"/>
+    <w:rsid w:val="00435DA3"/>
     <w:rPr>
       <w:rFonts w:eastAsiaTheme="majorEastAsia" w:cstheme="majorBidi"/>
       <w:i/>
@@ -23920,7 +23920,7 @@
     <w:link w:val="Ttulo7"/>
     <w:uiPriority w:val="9"/>
     <w:semiHidden/>
-    <w:rsid w:val="008A4885"/>
+    <w:rsid w:val="00435DA3"/>
     <w:rPr>
       <w:rFonts w:eastAsiaTheme="majorEastAsia" w:cstheme="majorBidi"/>
       <w:color w:val="595959" w:themeColor="text1" w:themeTint="A6"/>
@@ -23932,7 +23932,7 @@
     <w:link w:val="Ttulo8"/>
     <w:uiPriority w:val="9"/>
     <w:semiHidden/>
-    <w:rsid w:val="008A4885"/>
+    <w:rsid w:val="00435DA3"/>
     <w:rPr>
       <w:rFonts w:eastAsiaTheme="majorEastAsia" w:cstheme="majorBidi"/>
       <w:i/>
@@ -23946,7 +23946,7 @@
     <w:link w:val="Ttulo9"/>
     <w:uiPriority w:val="9"/>
     <w:semiHidden/>
-    <w:rsid w:val="008A4885"/>
+    <w:rsid w:val="00435DA3"/>
     <w:rPr>
       <w:rFonts w:eastAsiaTheme="majorEastAsia" w:cstheme="majorBidi"/>
       <w:color w:val="272727" w:themeColor="text1" w:themeTint="D8"/>
@@ -23959,7 +23959,7 @@
     <w:link w:val="TtuloChar"/>
     <w:uiPriority w:val="10"/>
     <w:qFormat/>
-    <w:rsid w:val="008A4885"/>
+    <w:rsid w:val="00435DA3"/>
     <w:pPr>
       <w:spacing w:after="80" w:line="240" w:lineRule="auto"/>
       <w:contextualSpacing/>
@@ -23977,7 +23977,7 @@
     <w:basedOn w:val="Fontepargpadro"/>
     <w:link w:val="Ttulo"/>
     <w:uiPriority w:val="10"/>
-    <w:rsid w:val="008A4885"/>
+    <w:rsid w:val="00435DA3"/>
     <w:rPr>
       <w:rFonts w:asciiTheme="majorHAnsi" w:eastAsiaTheme="majorEastAsia" w:hAnsiTheme="majorHAnsi" w:cstheme="majorBidi"/>
       <w:spacing w:val="-10"/>
@@ -23993,7 +23993,7 @@
     <w:link w:val="SubttuloChar"/>
     <w:uiPriority w:val="11"/>
     <w:qFormat/>
-    <w:rsid w:val="008A4885"/>
+    <w:rsid w:val="00435DA3"/>
     <w:pPr>
       <w:numPr>
         <w:ilvl w:val="1"/>
@@ -24012,7 +24012,7 @@
     <w:basedOn w:val="Fontepargpadro"/>
     <w:link w:val="Subttulo"/>
     <w:uiPriority w:val="11"/>
-    <w:rsid w:val="008A4885"/>
+    <w:rsid w:val="00435DA3"/>
     <w:rPr>
       <w:rFonts w:eastAsiaTheme="majorEastAsia" w:cstheme="majorBidi"/>
       <w:color w:val="595959" w:themeColor="text1" w:themeTint="A6"/>
@@ -24028,7 +24028,7 @@
     <w:link w:val="CitaoChar"/>
     <w:uiPriority w:val="29"/>
     <w:qFormat/>
-    <w:rsid w:val="008A4885"/>
+    <w:rsid w:val="00435DA3"/>
     <w:pPr>
       <w:spacing w:before="160"/>
       <w:jc w:val="center"/>
@@ -24044,7 +24044,7 @@
     <w:basedOn w:val="Fontepargpadro"/>
     <w:link w:val="Citao"/>
     <w:uiPriority w:val="29"/>
-    <w:rsid w:val="008A4885"/>
+    <w:rsid w:val="00435DA3"/>
     <w:rPr>
       <w:i/>
       <w:iCs/>
@@ -24056,7 +24056,7 @@
     <w:basedOn w:val="Normal"/>
     <w:uiPriority w:val="34"/>
     <w:qFormat/>
-    <w:rsid w:val="008A4885"/>
+    <w:rsid w:val="00435DA3"/>
     <w:pPr>
       <w:ind w:left="720"/>
       <w:contextualSpacing/>
@@ -24067,7 +24067,7 @@
     <w:basedOn w:val="Fontepargpadro"/>
     <w:uiPriority w:val="21"/>
     <w:qFormat/>
-    <w:rsid w:val="008A4885"/>
+    <w:rsid w:val="00435DA3"/>
     <w:rPr>
       <w:i/>
       <w:iCs/>
@@ -24081,7 +24081,7 @@
     <w:link w:val="CitaoIntensaChar"/>
     <w:uiPriority w:val="30"/>
     <w:qFormat/>
-    <w:rsid w:val="008A4885"/>
+    <w:rsid w:val="00435DA3"/>
     <w:pPr>
       <w:pBdr>
         <w:top w:val="single" w:sz="4" w:space="10" w:color="0F4761" w:themeColor="accent1" w:themeShade="BF"/>
@@ -24102,7 +24102,7 @@
     <w:basedOn w:val="Fontepargpadro"/>
     <w:link w:val="CitaoIntensa"/>
     <w:uiPriority w:val="30"/>
-    <w:rsid w:val="008A4885"/>
+    <w:rsid w:val="00435DA3"/>
     <w:rPr>
       <w:i/>
       <w:iCs/>
@@ -24114,7 +24114,7 @@
     <w:basedOn w:val="Fontepargpadro"/>
     <w:uiPriority w:val="32"/>
     <w:qFormat/>
-    <w:rsid w:val="008A4885"/>
+    <w:rsid w:val="00435DA3"/>
     <w:rPr>
       <w:b/>
       <w:bCs/>
@@ -24129,7 +24129,7 @@
     <w:link w:val="CabealhoChar"/>
     <w:uiPriority w:val="99"/>
     <w:unhideWhenUsed/>
-    <w:rsid w:val="008A4885"/>
+    <w:rsid w:val="00435DA3"/>
     <w:pPr>
       <w:tabs>
         <w:tab w:val="center" w:pos="4252"/>
@@ -24143,7 +24143,7 @@
     <w:basedOn w:val="Fontepargpadro"/>
     <w:link w:val="Cabealho"/>
     <w:uiPriority w:val="99"/>
-    <w:rsid w:val="008A4885"/>
+    <w:rsid w:val="00435DA3"/>
   </w:style>
   <w:style w:type="paragraph" w:styleId="Rodap">
     <w:name w:val="footer"/>
@@ -24151,7 +24151,7 @@
     <w:link w:val="RodapChar"/>
     <w:uiPriority w:val="99"/>
     <w:unhideWhenUsed/>
-    <w:rsid w:val="008A4885"/>
+    <w:rsid w:val="00435DA3"/>
     <w:pPr>
       <w:tabs>
         <w:tab w:val="center" w:pos="4252"/>
@@ -24165,7 +24165,7 @@
     <w:basedOn w:val="Fontepargpadro"/>
     <w:link w:val="Rodap"/>
     <w:uiPriority w:val="99"/>
-    <w:rsid w:val="008A4885"/>
+    <w:rsid w:val="00435DA3"/>
   </w:style>
   <w:style w:type="paragraph" w:styleId="Sumrio1">
     <w:name w:val="toc 1"/>
@@ -24174,7 +24174,7 @@
     <w:autoRedefine/>
     <w:uiPriority w:val="39"/>
     <w:unhideWhenUsed/>
-    <w:rsid w:val="008A4885"/>
+    <w:rsid w:val="00435DA3"/>
     <w:pPr>
       <w:spacing w:after="100"/>
     </w:pPr>
@@ -24186,7 +24186,7 @@
     <w:autoRedefine/>
     <w:uiPriority w:val="39"/>
     <w:unhideWhenUsed/>
-    <w:rsid w:val="008A4885"/>
+    <w:rsid w:val="00435DA3"/>
     <w:pPr>
       <w:spacing w:after="100"/>
       <w:ind w:left="240"/>

</xml_diff>

<commit_message>
Sincroniza print atualizado do Registro de riscos no Manual de Uso
Co-Authored-By: Claude Sonnet 5 <noreply@anthropic.com>
</commit_message>
<xml_diff>
--- a/Manual de Uso - Ferramenta de Gestao de Projetos.docx
+++ b/Manual de Uso - Ferramenta de Gestao de Projetos.docx
@@ -229,7 +229,7 @@
         <w:rPr>
           <w:noProof/>
         </w:rPr>
-        <w:instrText xml:space="preserve"> PAGEREF _Toc239844044 \h </w:instrText>
+        <w:instrText xml:space="preserve"> PAGEREF _Toc239847879 \h </w:instrText>
       </w:r>
       <w:r>
         <w:rPr>
@@ -290,7 +290,7 @@
         <w:rPr>
           <w:noProof/>
         </w:rPr>
-        <w:instrText xml:space="preserve"> PAGEREF _Toc239844045 \h </w:instrText>
+        <w:instrText xml:space="preserve"> PAGEREF _Toc239847880 \h </w:instrText>
       </w:r>
       <w:r>
         <w:rPr>
@@ -351,7 +351,7 @@
         <w:rPr>
           <w:noProof/>
         </w:rPr>
-        <w:instrText xml:space="preserve"> PAGEREF _Toc239844046 \h </w:instrText>
+        <w:instrText xml:space="preserve"> PAGEREF _Toc239847881 \h </w:instrText>
       </w:r>
       <w:r>
         <w:rPr>
@@ -412,7 +412,7 @@
         <w:rPr>
           <w:noProof/>
         </w:rPr>
-        <w:instrText xml:space="preserve"> PAGEREF _Toc239844047 \h </w:instrText>
+        <w:instrText xml:space="preserve"> PAGEREF _Toc239847882 \h </w:instrText>
       </w:r>
       <w:r>
         <w:rPr>
@@ -473,7 +473,7 @@
         <w:rPr>
           <w:noProof/>
         </w:rPr>
-        <w:instrText xml:space="preserve"> PAGEREF _Toc239844048 \h </w:instrText>
+        <w:instrText xml:space="preserve"> PAGEREF _Toc239847883 \h </w:instrText>
       </w:r>
       <w:r>
         <w:rPr>
@@ -534,7 +534,7 @@
         <w:rPr>
           <w:noProof/>
         </w:rPr>
-        <w:instrText xml:space="preserve"> PAGEREF _Toc239844049 \h </w:instrText>
+        <w:instrText xml:space="preserve"> PAGEREF _Toc239847884 \h </w:instrText>
       </w:r>
       <w:r>
         <w:rPr>
@@ -595,7 +595,7 @@
         <w:rPr>
           <w:noProof/>
         </w:rPr>
-        <w:instrText xml:space="preserve"> PAGEREF _Toc239844050 \h </w:instrText>
+        <w:instrText xml:space="preserve"> PAGEREF _Toc239847885 \h </w:instrText>
       </w:r>
       <w:r>
         <w:rPr>
@@ -656,7 +656,7 @@
         <w:rPr>
           <w:noProof/>
         </w:rPr>
-        <w:instrText xml:space="preserve"> PAGEREF _Toc239844051 \h </w:instrText>
+        <w:instrText xml:space="preserve"> PAGEREF _Toc239847886 \h </w:instrText>
       </w:r>
       <w:r>
         <w:rPr>
@@ -717,7 +717,7 @@
         <w:rPr>
           <w:noProof/>
         </w:rPr>
-        <w:instrText xml:space="preserve"> PAGEREF _Toc239844052 \h </w:instrText>
+        <w:instrText xml:space="preserve"> PAGEREF _Toc239847887 \h </w:instrText>
       </w:r>
       <w:r>
         <w:rPr>
@@ -778,7 +778,7 @@
         <w:rPr>
           <w:noProof/>
         </w:rPr>
-        <w:instrText xml:space="preserve"> PAGEREF _Toc239844053 \h </w:instrText>
+        <w:instrText xml:space="preserve"> PAGEREF _Toc239847888 \h </w:instrText>
       </w:r>
       <w:r>
         <w:rPr>
@@ -839,7 +839,7 @@
         <w:rPr>
           <w:noProof/>
         </w:rPr>
-        <w:instrText xml:space="preserve"> PAGEREF _Toc239844054 \h </w:instrText>
+        <w:instrText xml:space="preserve"> PAGEREF _Toc239847889 \h </w:instrText>
       </w:r>
       <w:r>
         <w:rPr>
@@ -900,7 +900,7 @@
         <w:rPr>
           <w:noProof/>
         </w:rPr>
-        <w:instrText xml:space="preserve"> PAGEREF _Toc239844055 \h </w:instrText>
+        <w:instrText xml:space="preserve"> PAGEREF _Toc239847890 \h </w:instrText>
       </w:r>
       <w:r>
         <w:rPr>
@@ -961,7 +961,7 @@
         <w:rPr>
           <w:noProof/>
         </w:rPr>
-        <w:instrText xml:space="preserve"> PAGEREF _Toc239844056 \h </w:instrText>
+        <w:instrText xml:space="preserve"> PAGEREF _Toc239847891 \h </w:instrText>
       </w:r>
       <w:r>
         <w:rPr>
@@ -1022,7 +1022,7 @@
         <w:rPr>
           <w:noProof/>
         </w:rPr>
-        <w:instrText xml:space="preserve"> PAGEREF _Toc239844057 \h </w:instrText>
+        <w:instrText xml:space="preserve"> PAGEREF _Toc239847892 \h </w:instrText>
       </w:r>
       <w:r>
         <w:rPr>
@@ -1083,7 +1083,7 @@
         <w:rPr>
           <w:noProof/>
         </w:rPr>
-        <w:instrText xml:space="preserve"> PAGEREF _Toc239844058 \h </w:instrText>
+        <w:instrText xml:space="preserve"> PAGEREF _Toc239847893 \h </w:instrText>
       </w:r>
       <w:r>
         <w:rPr>
@@ -1144,7 +1144,7 @@
         <w:rPr>
           <w:noProof/>
         </w:rPr>
-        <w:instrText xml:space="preserve"> PAGEREF _Toc239844059 \h </w:instrText>
+        <w:instrText xml:space="preserve"> PAGEREF _Toc239847894 \h </w:instrText>
       </w:r>
       <w:r>
         <w:rPr>
@@ -1205,7 +1205,7 @@
         <w:rPr>
           <w:noProof/>
         </w:rPr>
-        <w:instrText xml:space="preserve"> PAGEREF _Toc239844060 \h </w:instrText>
+        <w:instrText xml:space="preserve"> PAGEREF _Toc239847895 \h </w:instrText>
       </w:r>
       <w:r>
         <w:rPr>
@@ -1266,7 +1266,7 @@
         <w:rPr>
           <w:noProof/>
         </w:rPr>
-        <w:instrText xml:space="preserve"> PAGEREF _Toc239844061 \h </w:instrText>
+        <w:instrText xml:space="preserve"> PAGEREF _Toc239847896 \h </w:instrText>
       </w:r>
       <w:r>
         <w:rPr>
@@ -1327,7 +1327,7 @@
         <w:rPr>
           <w:noProof/>
         </w:rPr>
-        <w:instrText xml:space="preserve"> PAGEREF _Toc239844062 \h </w:instrText>
+        <w:instrText xml:space="preserve"> PAGEREF _Toc239847897 \h </w:instrText>
       </w:r>
       <w:r>
         <w:rPr>
@@ -1388,7 +1388,7 @@
         <w:rPr>
           <w:noProof/>
         </w:rPr>
-        <w:instrText xml:space="preserve"> PAGEREF _Toc239844063 \h </w:instrText>
+        <w:instrText xml:space="preserve"> PAGEREF _Toc239847898 \h </w:instrText>
       </w:r>
       <w:r>
         <w:rPr>
@@ -1449,7 +1449,7 @@
         <w:rPr>
           <w:noProof/>
         </w:rPr>
-        <w:instrText xml:space="preserve"> PAGEREF _Toc239844064 \h </w:instrText>
+        <w:instrText xml:space="preserve"> PAGEREF _Toc239847899 \h </w:instrText>
       </w:r>
       <w:r>
         <w:rPr>
@@ -1510,7 +1510,7 @@
         <w:rPr>
           <w:noProof/>
         </w:rPr>
-        <w:instrText xml:space="preserve"> PAGEREF _Toc239844065 \h </w:instrText>
+        <w:instrText xml:space="preserve"> PAGEREF _Toc239847900 \h </w:instrText>
       </w:r>
       <w:r>
         <w:rPr>
@@ -1571,7 +1571,7 @@
         <w:rPr>
           <w:noProof/>
         </w:rPr>
-        <w:instrText xml:space="preserve"> PAGEREF _Toc239844066 \h </w:instrText>
+        <w:instrText xml:space="preserve"> PAGEREF _Toc239847901 \h </w:instrText>
       </w:r>
       <w:r>
         <w:rPr>
@@ -1632,7 +1632,7 @@
         <w:rPr>
           <w:noProof/>
         </w:rPr>
-        <w:instrText xml:space="preserve"> PAGEREF _Toc239844067 \h </w:instrText>
+        <w:instrText xml:space="preserve"> PAGEREF _Toc239847902 \h </w:instrText>
       </w:r>
       <w:r>
         <w:rPr>
@@ -1693,7 +1693,7 @@
         <w:rPr>
           <w:noProof/>
         </w:rPr>
-        <w:instrText xml:space="preserve"> PAGEREF _Toc239844068 \h </w:instrText>
+        <w:instrText xml:space="preserve"> PAGEREF _Toc239847903 \h </w:instrText>
       </w:r>
       <w:r>
         <w:rPr>
@@ -1755,7 +1755,7 @@
         <w:rPr>
           <w:noProof/>
         </w:rPr>
-        <w:instrText xml:space="preserve"> PAGEREF _Toc239844069 \h </w:instrText>
+        <w:instrText xml:space="preserve"> PAGEREF _Toc239847904 \h </w:instrText>
       </w:r>
       <w:r>
         <w:rPr>
@@ -1816,7 +1816,7 @@
         <w:rPr>
           <w:noProof/>
         </w:rPr>
-        <w:instrText xml:space="preserve"> PAGEREF _Toc239844070 \h </w:instrText>
+        <w:instrText xml:space="preserve"> PAGEREF _Toc239847905 \h </w:instrText>
       </w:r>
       <w:r>
         <w:rPr>
@@ -1877,7 +1877,7 @@
         <w:rPr>
           <w:noProof/>
         </w:rPr>
-        <w:instrText xml:space="preserve"> PAGEREF _Toc239844071 \h </w:instrText>
+        <w:instrText xml:space="preserve"> PAGEREF _Toc239847906 \h </w:instrText>
       </w:r>
       <w:r>
         <w:rPr>
@@ -1938,7 +1938,7 @@
         <w:rPr>
           <w:noProof/>
         </w:rPr>
-        <w:instrText xml:space="preserve"> PAGEREF _Toc239844072 \h </w:instrText>
+        <w:instrText xml:space="preserve"> PAGEREF _Toc239847907 \h </w:instrText>
       </w:r>
       <w:r>
         <w:rPr>
@@ -1999,7 +1999,7 @@
         <w:rPr>
           <w:noProof/>
         </w:rPr>
-        <w:instrText xml:space="preserve"> PAGEREF _Toc239844073 \h </w:instrText>
+        <w:instrText xml:space="preserve"> PAGEREF _Toc239847908 \h </w:instrText>
       </w:r>
       <w:r>
         <w:rPr>
@@ -2060,7 +2060,7 @@
         <w:rPr>
           <w:noProof/>
         </w:rPr>
-        <w:instrText xml:space="preserve"> PAGEREF _Toc239844074 \h </w:instrText>
+        <w:instrText xml:space="preserve"> PAGEREF _Toc239847909 \h </w:instrText>
       </w:r>
       <w:r>
         <w:rPr>
@@ -2121,7 +2121,7 @@
         <w:rPr>
           <w:noProof/>
         </w:rPr>
-        <w:instrText xml:space="preserve"> PAGEREF _Toc239844075 \h </w:instrText>
+        <w:instrText xml:space="preserve"> PAGEREF _Toc239847910 \h </w:instrText>
       </w:r>
       <w:r>
         <w:rPr>
@@ -2182,7 +2182,7 @@
         <w:rPr>
           <w:noProof/>
         </w:rPr>
-        <w:instrText xml:space="preserve"> PAGEREF _Toc239844076 \h </w:instrText>
+        <w:instrText xml:space="preserve"> PAGEREF _Toc239847911 \h </w:instrText>
       </w:r>
       <w:r>
         <w:rPr>
@@ -2243,7 +2243,7 @@
         <w:rPr>
           <w:noProof/>
         </w:rPr>
-        <w:instrText xml:space="preserve"> PAGEREF _Toc239844077 \h </w:instrText>
+        <w:instrText xml:space="preserve"> PAGEREF _Toc239847912 \h </w:instrText>
       </w:r>
       <w:r>
         <w:rPr>
@@ -2304,7 +2304,7 @@
         <w:rPr>
           <w:noProof/>
         </w:rPr>
-        <w:instrText xml:space="preserve"> PAGEREF _Toc239844078 \h </w:instrText>
+        <w:instrText xml:space="preserve"> PAGEREF _Toc239847913 \h </w:instrText>
       </w:r>
       <w:r>
         <w:rPr>
@@ -2365,7 +2365,7 @@
         <w:rPr>
           <w:noProof/>
         </w:rPr>
-        <w:instrText xml:space="preserve"> PAGEREF _Toc239844079 \h </w:instrText>
+        <w:instrText xml:space="preserve"> PAGEREF _Toc239847914 \h </w:instrText>
       </w:r>
       <w:r>
         <w:rPr>
@@ -2426,7 +2426,7 @@
         <w:rPr>
           <w:noProof/>
         </w:rPr>
-        <w:instrText xml:space="preserve"> PAGEREF _Toc239844080 \h </w:instrText>
+        <w:instrText xml:space="preserve"> PAGEREF _Toc239847915 \h </w:instrText>
       </w:r>
       <w:r>
         <w:rPr>
@@ -2487,7 +2487,7 @@
         <w:rPr>
           <w:noProof/>
         </w:rPr>
-        <w:instrText xml:space="preserve"> PAGEREF _Toc239844081 \h </w:instrText>
+        <w:instrText xml:space="preserve"> PAGEREF _Toc239847916 \h </w:instrText>
       </w:r>
       <w:r>
         <w:rPr>
@@ -2548,7 +2548,7 @@
         <w:rPr>
           <w:noProof/>
         </w:rPr>
-        <w:instrText xml:space="preserve"> PAGEREF _Toc239844082 \h </w:instrText>
+        <w:instrText xml:space="preserve"> PAGEREF _Toc239847917 \h </w:instrText>
       </w:r>
       <w:r>
         <w:rPr>
@@ -2609,7 +2609,7 @@
         <w:rPr>
           <w:noProof/>
         </w:rPr>
-        <w:instrText xml:space="preserve"> PAGEREF _Toc239844083 \h </w:instrText>
+        <w:instrText xml:space="preserve"> PAGEREF _Toc239847918 \h </w:instrText>
       </w:r>
       <w:r>
         <w:rPr>
@@ -2670,7 +2670,7 @@
         <w:rPr>
           <w:noProof/>
         </w:rPr>
-        <w:instrText xml:space="preserve"> PAGEREF _Toc239844084 \h </w:instrText>
+        <w:instrText xml:space="preserve"> PAGEREF _Toc239847919 \h </w:instrText>
       </w:r>
       <w:r>
         <w:rPr>
@@ -2731,7 +2731,7 @@
         <w:rPr>
           <w:noProof/>
         </w:rPr>
-        <w:instrText xml:space="preserve"> PAGEREF _Toc239844085 \h </w:instrText>
+        <w:instrText xml:space="preserve"> PAGEREF _Toc239847920 \h </w:instrText>
       </w:r>
       <w:r>
         <w:rPr>
@@ -2792,7 +2792,7 @@
         <w:rPr>
           <w:noProof/>
         </w:rPr>
-        <w:instrText xml:space="preserve"> PAGEREF _Toc239844086 \h </w:instrText>
+        <w:instrText xml:space="preserve"> PAGEREF _Toc239847921 \h </w:instrText>
       </w:r>
       <w:r>
         <w:rPr>
@@ -2853,7 +2853,7 @@
         <w:rPr>
           <w:noProof/>
         </w:rPr>
-        <w:instrText xml:space="preserve"> PAGEREF _Toc239844087 \h </w:instrText>
+        <w:instrText xml:space="preserve"> PAGEREF _Toc239847922 \h </w:instrText>
       </w:r>
       <w:r>
         <w:rPr>
@@ -2914,7 +2914,7 @@
         <w:rPr>
           <w:noProof/>
         </w:rPr>
-        <w:instrText xml:space="preserve"> PAGEREF _Toc239844088 \h </w:instrText>
+        <w:instrText xml:space="preserve"> PAGEREF _Toc239847923 \h </w:instrText>
       </w:r>
       <w:r>
         <w:rPr>
@@ -2975,7 +2975,7 @@
         <w:rPr>
           <w:noProof/>
         </w:rPr>
-        <w:instrText xml:space="preserve"> PAGEREF _Toc239844089 \h </w:instrText>
+        <w:instrText xml:space="preserve"> PAGEREF _Toc239847924 \h </w:instrText>
       </w:r>
       <w:r>
         <w:rPr>
@@ -3036,7 +3036,7 @@
         <w:rPr>
           <w:noProof/>
         </w:rPr>
-        <w:instrText xml:space="preserve"> PAGEREF _Toc239844090 \h </w:instrText>
+        <w:instrText xml:space="preserve"> PAGEREF _Toc239847925 \h </w:instrText>
       </w:r>
       <w:r>
         <w:rPr>
@@ -3097,7 +3097,7 @@
         <w:rPr>
           <w:noProof/>
         </w:rPr>
-        <w:instrText xml:space="preserve"> PAGEREF _Toc239844091 \h </w:instrText>
+        <w:instrText xml:space="preserve"> PAGEREF _Toc239847926 \h </w:instrText>
       </w:r>
       <w:r>
         <w:rPr>
@@ -3173,7 +3173,7 @@
           <w:sz w:val="34"/>
         </w:rPr>
       </w:pPr>
-      <w:bookmarkStart w:id="0" w:name="_Toc239844044"/>
+      <w:bookmarkStart w:id="0" w:name="_Toc239847879"/>
       <w:r>
         <w:rPr>
           <w:rFonts w:ascii="Montserrat" w:hAnsi="Montserrat"/>
@@ -3197,7 +3197,7 @@
           <w:sz w:val="27"/>
         </w:rPr>
       </w:pPr>
-      <w:bookmarkStart w:id="1" w:name="_Toc239844045"/>
+      <w:bookmarkStart w:id="1" w:name="_Toc239847880"/>
       <w:r>
         <w:rPr>
           <w:rFonts w:ascii="Montserrat" w:hAnsi="Montserrat"/>
@@ -4148,7 +4148,7 @@
           <w:sz w:val="27"/>
         </w:rPr>
       </w:pPr>
-      <w:bookmarkStart w:id="2" w:name="_Toc239844046"/>
+      <w:bookmarkStart w:id="2" w:name="_Toc239847881"/>
       <w:r>
         <w:rPr>
           <w:rFonts w:ascii="Montserrat" w:hAnsi="Montserrat"/>
@@ -4345,16 +4345,16 @@
           <w:noProof/>
         </w:rPr>
         <w:drawing>
-          <wp:inline distT="0" distB="0" distL="0" distR="0" wp14:anchorId="75467D37" wp14:editId="6941ECDE">
+          <wp:inline distT="0" distB="0" distL="0" distR="0" wp14:anchorId="66FF0CDF" wp14:editId="3C9BE6BB">
             <wp:extent cx="5303520" cy="4792851"/>
             <wp:effectExtent l="19050" t="19050" r="11430" b="27305"/>
-            <wp:docPr id="431075562" name="Imagem 1"/>
+            <wp:docPr id="2086195394" name="Imagem 1"/>
             <wp:cNvGraphicFramePr/>
             <a:graphic xmlns:a="http://schemas.openxmlformats.org/drawingml/2006/main">
               <a:graphicData uri="http://schemas.openxmlformats.org/drawingml/2006/picture">
                 <pic:pic xmlns:pic="http://schemas.openxmlformats.org/drawingml/2006/picture">
                   <pic:nvPicPr>
-                    <pic:cNvPr id="431075562" name=""/>
+                    <pic:cNvPr id="2086195394" name=""/>
                     <pic:cNvPicPr/>
                   </pic:nvPicPr>
                   <pic:blipFill>
@@ -4422,7 +4422,7 @@
           <w:sz w:val="27"/>
         </w:rPr>
       </w:pPr>
-      <w:bookmarkStart w:id="3" w:name="_Toc239844047"/>
+      <w:bookmarkStart w:id="3" w:name="_Toc239847882"/>
       <w:r>
         <w:rPr>
           <w:rFonts w:ascii="Montserrat" w:hAnsi="Montserrat"/>
@@ -4463,16 +4463,16 @@
           <w:noProof/>
         </w:rPr>
         <w:drawing>
-          <wp:inline distT="0" distB="0" distL="0" distR="0" wp14:anchorId="69F09B34" wp14:editId="527AACAF">
+          <wp:inline distT="0" distB="0" distL="0" distR="0" wp14:anchorId="7367F033" wp14:editId="0E30D91A">
             <wp:extent cx="4206240" cy="3801227"/>
             <wp:effectExtent l="19050" t="19050" r="22860" b="27940"/>
-            <wp:docPr id="305227725" name="Imagem 2"/>
+            <wp:docPr id="10250532" name="Imagem 2"/>
             <wp:cNvGraphicFramePr/>
             <a:graphic xmlns:a="http://schemas.openxmlformats.org/drawingml/2006/main">
               <a:graphicData uri="http://schemas.openxmlformats.org/drawingml/2006/picture">
                 <pic:pic xmlns:pic="http://schemas.openxmlformats.org/drawingml/2006/picture">
                   <pic:nvPicPr>
-                    <pic:cNvPr id="305227725" name=""/>
+                    <pic:cNvPr id="10250532" name=""/>
                     <pic:cNvPicPr/>
                   </pic:nvPicPr>
                   <pic:blipFill>
@@ -4645,7 +4645,7 @@
           <w:sz w:val="27"/>
         </w:rPr>
       </w:pPr>
-      <w:bookmarkStart w:id="4" w:name="_Toc239844048"/>
+      <w:bookmarkStart w:id="4" w:name="_Toc239847883"/>
       <w:r>
         <w:rPr>
           <w:rFonts w:ascii="Montserrat" w:hAnsi="Montserrat"/>
@@ -5884,7 +5884,7 @@
           <w:sz w:val="34"/>
         </w:rPr>
       </w:pPr>
-      <w:bookmarkStart w:id="5" w:name="_Toc239844049"/>
+      <w:bookmarkStart w:id="5" w:name="_Toc239847884"/>
       <w:r>
         <w:rPr>
           <w:rFonts w:ascii="Montserrat" w:hAnsi="Montserrat"/>
@@ -5908,7 +5908,7 @@
           <w:sz w:val="27"/>
         </w:rPr>
       </w:pPr>
-      <w:bookmarkStart w:id="6" w:name="_Toc239844050"/>
+      <w:bookmarkStart w:id="6" w:name="_Toc239847885"/>
       <w:r>
         <w:rPr>
           <w:rFonts w:ascii="Montserrat" w:hAnsi="Montserrat"/>
@@ -5949,7 +5949,7 @@
           <w:sz w:val="27"/>
         </w:rPr>
       </w:pPr>
-      <w:bookmarkStart w:id="7" w:name="_Toc239844051"/>
+      <w:bookmarkStart w:id="7" w:name="_Toc239847886"/>
       <w:r>
         <w:rPr>
           <w:rFonts w:ascii="Montserrat" w:hAnsi="Montserrat"/>
@@ -6068,7 +6068,7 @@
           <w:sz w:val="27"/>
         </w:rPr>
       </w:pPr>
-      <w:bookmarkStart w:id="8" w:name="_Toc239844052"/>
+      <w:bookmarkStart w:id="8" w:name="_Toc239847887"/>
       <w:r>
         <w:rPr>
           <w:rFonts w:ascii="Montserrat" w:hAnsi="Montserrat"/>
@@ -6681,7 +6681,7 @@
           <w:sz w:val="27"/>
         </w:rPr>
       </w:pPr>
-      <w:bookmarkStart w:id="9" w:name="_Toc239844053"/>
+      <w:bookmarkStart w:id="9" w:name="_Toc239847888"/>
       <w:r>
         <w:rPr>
           <w:rFonts w:ascii="Montserrat" w:hAnsi="Montserrat"/>
@@ -6770,16 +6770,16 @@
         </w:rPr>
         <w:lastRenderedPageBreak/>
         <w:drawing>
-          <wp:inline distT="0" distB="0" distL="0" distR="0" wp14:anchorId="4DB7E510" wp14:editId="26F2D5D3">
+          <wp:inline distT="0" distB="0" distL="0" distR="0" wp14:anchorId="06378603" wp14:editId="5F9F79D5">
             <wp:extent cx="4937760" cy="4462310"/>
             <wp:effectExtent l="19050" t="19050" r="15240" b="14605"/>
-            <wp:docPr id="832840884" name="Imagem 3"/>
+            <wp:docPr id="1475015087" name="Imagem 3"/>
             <wp:cNvGraphicFramePr/>
             <a:graphic xmlns:a="http://schemas.openxmlformats.org/drawingml/2006/main">
               <a:graphicData uri="http://schemas.openxmlformats.org/drawingml/2006/picture">
                 <pic:pic xmlns:pic="http://schemas.openxmlformats.org/drawingml/2006/picture">
                   <pic:nvPicPr>
-                    <pic:cNvPr id="832840884" name=""/>
+                    <pic:cNvPr id="1475015087" name=""/>
                     <pic:cNvPicPr/>
                   </pic:nvPicPr>
                   <pic:blipFill>
@@ -6847,7 +6847,7 @@
           <w:sz w:val="27"/>
         </w:rPr>
       </w:pPr>
-      <w:bookmarkStart w:id="10" w:name="_Toc239844054"/>
+      <w:bookmarkStart w:id="10" w:name="_Toc239847889"/>
       <w:r>
         <w:rPr>
           <w:rFonts w:ascii="Montserrat" w:hAnsi="Montserrat"/>
@@ -6888,16 +6888,16 @@
         </w:rPr>
         <w:lastRenderedPageBreak/>
         <w:drawing>
-          <wp:inline distT="0" distB="0" distL="0" distR="0" wp14:anchorId="1B287239" wp14:editId="6538A3A9">
+          <wp:inline distT="0" distB="0" distL="0" distR="0" wp14:anchorId="4506FFAE" wp14:editId="79D003E0">
             <wp:extent cx="5120640" cy="4627581"/>
             <wp:effectExtent l="19050" t="19050" r="22860" b="20955"/>
-            <wp:docPr id="1229823147" name="Imagem 4"/>
+            <wp:docPr id="1124612990" name="Imagem 4"/>
             <wp:cNvGraphicFramePr/>
             <a:graphic xmlns:a="http://schemas.openxmlformats.org/drawingml/2006/main">
               <a:graphicData uri="http://schemas.openxmlformats.org/drawingml/2006/picture">
                 <pic:pic xmlns:pic="http://schemas.openxmlformats.org/drawingml/2006/picture">
                   <pic:nvPicPr>
-                    <pic:cNvPr id="1229823147" name=""/>
+                    <pic:cNvPr id="1124612990" name=""/>
                     <pic:cNvPicPr/>
                   </pic:nvPicPr>
                   <pic:blipFill>
@@ -7065,7 +7065,7 @@
           <w:sz w:val="27"/>
         </w:rPr>
       </w:pPr>
-      <w:bookmarkStart w:id="11" w:name="_Toc239844055"/>
+      <w:bookmarkStart w:id="11" w:name="_Toc239847890"/>
       <w:r>
         <w:rPr>
           <w:rFonts w:ascii="Montserrat" w:hAnsi="Montserrat"/>
@@ -7105,16 +7105,16 @@
           <w:noProof/>
         </w:rPr>
         <w:drawing>
-          <wp:inline distT="0" distB="0" distL="0" distR="0" wp14:anchorId="0BD6D983" wp14:editId="2FE3D54D">
+          <wp:inline distT="0" distB="0" distL="0" distR="0" wp14:anchorId="0B74F693" wp14:editId="3658F80D">
             <wp:extent cx="4206240" cy="3801227"/>
             <wp:effectExtent l="19050" t="19050" r="22860" b="27940"/>
-            <wp:docPr id="1322214682" name="Imagem 5"/>
+            <wp:docPr id="20739176" name="Imagem 5"/>
             <wp:cNvGraphicFramePr/>
             <a:graphic xmlns:a="http://schemas.openxmlformats.org/drawingml/2006/main">
               <a:graphicData uri="http://schemas.openxmlformats.org/drawingml/2006/picture">
                 <pic:pic xmlns:pic="http://schemas.openxmlformats.org/drawingml/2006/picture">
                   <pic:nvPicPr>
-                    <pic:cNvPr id="1322214682" name=""/>
+                    <pic:cNvPr id="20739176" name=""/>
                     <pic:cNvPicPr/>
                   </pic:nvPicPr>
                   <pic:blipFill>
@@ -7182,16 +7182,16 @@
         </w:rPr>
         <w:lastRenderedPageBreak/>
         <w:drawing>
-          <wp:inline distT="0" distB="0" distL="0" distR="0" wp14:anchorId="4D6F2F50" wp14:editId="0BA40F18">
+          <wp:inline distT="0" distB="0" distL="0" distR="0" wp14:anchorId="1BC72FCE" wp14:editId="5A2E1E9B">
             <wp:extent cx="4206240" cy="3801227"/>
             <wp:effectExtent l="19050" t="19050" r="22860" b="27940"/>
-            <wp:docPr id="1763707003" name="Imagem 6"/>
+            <wp:docPr id="498508715" name="Imagem 6"/>
             <wp:cNvGraphicFramePr/>
             <a:graphic xmlns:a="http://schemas.openxmlformats.org/drawingml/2006/main">
               <a:graphicData uri="http://schemas.openxmlformats.org/drawingml/2006/picture">
                 <pic:pic xmlns:pic="http://schemas.openxmlformats.org/drawingml/2006/picture">
                   <pic:nvPicPr>
-                    <pic:cNvPr id="1763707003" name=""/>
+                    <pic:cNvPr id="498508715" name=""/>
                     <pic:cNvPicPr/>
                   </pic:nvPicPr>
                   <pic:blipFill>
@@ -7307,7 +7307,7 @@
           <w:sz w:val="27"/>
         </w:rPr>
       </w:pPr>
-      <w:bookmarkStart w:id="12" w:name="_Toc239844056"/>
+      <w:bookmarkStart w:id="12" w:name="_Toc239847891"/>
       <w:r>
         <w:rPr>
           <w:rFonts w:ascii="Montserrat" w:hAnsi="Montserrat"/>
@@ -7375,7 +7375,7 @@
           <w:sz w:val="27"/>
         </w:rPr>
       </w:pPr>
-      <w:bookmarkStart w:id="13" w:name="_Toc239844057"/>
+      <w:bookmarkStart w:id="13" w:name="_Toc239847892"/>
       <w:r>
         <w:rPr>
           <w:rFonts w:ascii="Montserrat" w:hAnsi="Montserrat"/>
@@ -7602,7 +7602,7 @@
           <w:sz w:val="27"/>
         </w:rPr>
       </w:pPr>
-      <w:bookmarkStart w:id="14" w:name="_Toc239844058"/>
+      <w:bookmarkStart w:id="14" w:name="_Toc239847893"/>
       <w:r>
         <w:rPr>
           <w:rFonts w:ascii="Montserrat" w:hAnsi="Montserrat"/>
@@ -7761,7 +7761,7 @@
           <w:sz w:val="27"/>
         </w:rPr>
       </w:pPr>
-      <w:bookmarkStart w:id="15" w:name="_Toc239844059"/>
+      <w:bookmarkStart w:id="15" w:name="_Toc239847894"/>
       <w:r>
         <w:rPr>
           <w:rFonts w:ascii="Montserrat" w:hAnsi="Montserrat"/>
@@ -7953,7 +7953,7 @@
           <w:sz w:val="27"/>
         </w:rPr>
       </w:pPr>
-      <w:bookmarkStart w:id="16" w:name="_Toc239844060"/>
+      <w:bookmarkStart w:id="16" w:name="_Toc239847895"/>
       <w:r>
         <w:rPr>
           <w:rFonts w:ascii="Montserrat" w:hAnsi="Montserrat"/>
@@ -8081,7 +8081,7 @@
           <w:sz w:val="27"/>
         </w:rPr>
       </w:pPr>
-      <w:bookmarkStart w:id="17" w:name="_Toc239844061"/>
+      <w:bookmarkStart w:id="17" w:name="_Toc239847896"/>
       <w:r>
         <w:rPr>
           <w:rFonts w:ascii="Montserrat" w:hAnsi="Montserrat"/>
@@ -8411,7 +8411,7 @@
           <w:sz w:val="27"/>
         </w:rPr>
       </w:pPr>
-      <w:bookmarkStart w:id="18" w:name="_Toc239844062"/>
+      <w:bookmarkStart w:id="18" w:name="_Toc239847897"/>
       <w:r>
         <w:rPr>
           <w:rFonts w:ascii="Montserrat" w:hAnsi="Montserrat"/>
@@ -8552,7 +8552,7 @@
           <w:sz w:val="34"/>
         </w:rPr>
       </w:pPr>
-      <w:bookmarkStart w:id="19" w:name="_Toc239844063"/>
+      <w:bookmarkStart w:id="19" w:name="_Toc239847898"/>
       <w:r>
         <w:rPr>
           <w:rFonts w:ascii="Montserrat" w:hAnsi="Montserrat"/>
@@ -8594,7 +8594,7 @@
           <w:sz w:val="27"/>
         </w:rPr>
       </w:pPr>
-      <w:bookmarkStart w:id="20" w:name="_Toc239844064"/>
+      <w:bookmarkStart w:id="20" w:name="_Toc239847899"/>
       <w:r>
         <w:rPr>
           <w:rFonts w:ascii="Montserrat" w:hAnsi="Montserrat"/>
@@ -9674,16 +9674,16 @@
         </w:rPr>
         <w:lastRenderedPageBreak/>
         <w:drawing>
-          <wp:inline distT="0" distB="0" distL="0" distR="0" wp14:anchorId="3D8BE9C0" wp14:editId="5B34B253">
+          <wp:inline distT="0" distB="0" distL="0" distR="0" wp14:anchorId="5033D07E" wp14:editId="011AD961">
             <wp:extent cx="5120640" cy="4627581"/>
             <wp:effectExtent l="19050" t="19050" r="22860" b="20955"/>
-            <wp:docPr id="496666626" name="Imagem 7"/>
+            <wp:docPr id="2013445599" name="Imagem 7"/>
             <wp:cNvGraphicFramePr/>
             <a:graphic xmlns:a="http://schemas.openxmlformats.org/drawingml/2006/main">
               <a:graphicData uri="http://schemas.openxmlformats.org/drawingml/2006/picture">
                 <pic:pic xmlns:pic="http://schemas.openxmlformats.org/drawingml/2006/picture">
                   <pic:nvPicPr>
-                    <pic:cNvPr id="496666626" name=""/>
+                    <pic:cNvPr id="2013445599" name=""/>
                     <pic:cNvPicPr/>
                   </pic:nvPicPr>
                   <pic:blipFill>
@@ -9751,16 +9751,16 @@
         </w:rPr>
         <w:lastRenderedPageBreak/>
         <w:drawing>
-          <wp:inline distT="0" distB="0" distL="0" distR="0" wp14:anchorId="1C22A153" wp14:editId="6407B17C">
+          <wp:inline distT="0" distB="0" distL="0" distR="0" wp14:anchorId="349C6276" wp14:editId="09CF6B58">
             <wp:extent cx="5120640" cy="4627581"/>
             <wp:effectExtent l="19050" t="19050" r="22860" b="20955"/>
-            <wp:docPr id="311296254" name="Imagem 8"/>
+            <wp:docPr id="436130140" name="Imagem 8"/>
             <wp:cNvGraphicFramePr/>
             <a:graphic xmlns:a="http://schemas.openxmlformats.org/drawingml/2006/main">
               <a:graphicData uri="http://schemas.openxmlformats.org/drawingml/2006/picture">
                 <pic:pic xmlns:pic="http://schemas.openxmlformats.org/drawingml/2006/picture">
                   <pic:nvPicPr>
-                    <pic:cNvPr id="311296254" name=""/>
+                    <pic:cNvPr id="436130140" name=""/>
                     <pic:cNvPicPr/>
                   </pic:nvPicPr>
                   <pic:blipFill>
@@ -9968,7 +9968,7 @@
           <w:sz w:val="27"/>
         </w:rPr>
       </w:pPr>
-      <w:bookmarkStart w:id="21" w:name="_Toc239844065"/>
+      <w:bookmarkStart w:id="21" w:name="_Toc239847900"/>
       <w:r>
         <w:rPr>
           <w:rFonts w:ascii="Montserrat" w:hAnsi="Montserrat"/>
@@ -10894,16 +10894,16 @@
         </w:rPr>
         <w:lastRenderedPageBreak/>
         <w:drawing>
-          <wp:inline distT="0" distB="0" distL="0" distR="0" wp14:anchorId="2783B714" wp14:editId="118C6565">
+          <wp:inline distT="0" distB="0" distL="0" distR="0" wp14:anchorId="3DF37AE2" wp14:editId="12972C52">
             <wp:extent cx="5120640" cy="4627581"/>
             <wp:effectExtent l="19050" t="19050" r="22860" b="20955"/>
-            <wp:docPr id="1961801040" name="Imagem 9"/>
+            <wp:docPr id="1386290952" name="Imagem 9"/>
             <wp:cNvGraphicFramePr/>
             <a:graphic xmlns:a="http://schemas.openxmlformats.org/drawingml/2006/main">
               <a:graphicData uri="http://schemas.openxmlformats.org/drawingml/2006/picture">
                 <pic:pic xmlns:pic="http://schemas.openxmlformats.org/drawingml/2006/picture">
                   <pic:nvPicPr>
-                    <pic:cNvPr id="1961801040" name=""/>
+                    <pic:cNvPr id="1386290952" name=""/>
                     <pic:cNvPicPr/>
                   </pic:nvPicPr>
                   <pic:blipFill>
@@ -10971,16 +10971,16 @@
         </w:rPr>
         <w:lastRenderedPageBreak/>
         <w:drawing>
-          <wp:inline distT="0" distB="0" distL="0" distR="0" wp14:anchorId="42490D3E" wp14:editId="6CD14D04">
+          <wp:inline distT="0" distB="0" distL="0" distR="0" wp14:anchorId="21412B95" wp14:editId="043F282D">
             <wp:extent cx="5120640" cy="4627581"/>
             <wp:effectExtent l="19050" t="19050" r="22860" b="20955"/>
-            <wp:docPr id="752445539" name="Imagem 10"/>
+            <wp:docPr id="994054140" name="Imagem 10"/>
             <wp:cNvGraphicFramePr/>
             <a:graphic xmlns:a="http://schemas.openxmlformats.org/drawingml/2006/main">
               <a:graphicData uri="http://schemas.openxmlformats.org/drawingml/2006/picture">
                 <pic:pic xmlns:pic="http://schemas.openxmlformats.org/drawingml/2006/picture">
                   <pic:nvPicPr>
-                    <pic:cNvPr id="752445539" name=""/>
+                    <pic:cNvPr id="994054140" name=""/>
                     <pic:cNvPicPr/>
                   </pic:nvPicPr>
                   <pic:blipFill>
@@ -11114,7 +11114,7 @@
           <w:sz w:val="27"/>
         </w:rPr>
       </w:pPr>
-      <w:bookmarkStart w:id="22" w:name="_Toc239844066"/>
+      <w:bookmarkStart w:id="22" w:name="_Toc239847901"/>
       <w:r>
         <w:rPr>
           <w:rFonts w:ascii="Montserrat" w:hAnsi="Montserrat"/>
@@ -12170,16 +12170,16 @@
           <w:noProof/>
         </w:rPr>
         <w:drawing>
-          <wp:inline distT="0" distB="0" distL="0" distR="0" wp14:anchorId="460BDC46" wp14:editId="439ACD1F">
-            <wp:extent cx="5120640" cy="2515128"/>
-            <wp:effectExtent l="19050" t="19050" r="22860" b="19050"/>
-            <wp:docPr id="1154764387" name="Imagem 11"/>
+          <wp:inline distT="0" distB="0" distL="0" distR="0" wp14:anchorId="1BAF7AE0" wp14:editId="35ADCA45">
+            <wp:extent cx="5120640" cy="3338440"/>
+            <wp:effectExtent l="19050" t="19050" r="22860" b="14605"/>
+            <wp:docPr id="1078874967" name="Imagem 11"/>
             <wp:cNvGraphicFramePr/>
             <a:graphic xmlns:a="http://schemas.openxmlformats.org/drawingml/2006/main">
               <a:graphicData uri="http://schemas.openxmlformats.org/drawingml/2006/picture">
                 <pic:pic xmlns:pic="http://schemas.openxmlformats.org/drawingml/2006/picture">
                   <pic:nvPicPr>
-                    <pic:cNvPr id="1154764387" name=""/>
+                    <pic:cNvPr id="1078874967" name=""/>
                     <pic:cNvPicPr/>
                   </pic:nvPicPr>
                   <pic:blipFill>
@@ -12197,7 +12197,7 @@
                   <pic:spPr>
                     <a:xfrm>
                       <a:off x="0" y="0"/>
-                      <a:ext cx="5120640" cy="2515128"/>
+                      <a:ext cx="5120640" cy="3338440"/>
                     </a:xfrm>
                     <a:prstGeom prst="rect">
                       <a:avLst/>
@@ -12247,16 +12247,16 @@
         </w:rPr>
         <w:lastRenderedPageBreak/>
         <w:drawing>
-          <wp:inline distT="0" distB="0" distL="0" distR="0" wp14:anchorId="5AB4D1B7" wp14:editId="6F9299F8">
+          <wp:inline distT="0" distB="0" distL="0" distR="0" wp14:anchorId="65FDE61F" wp14:editId="05707958">
             <wp:extent cx="5120640" cy="4627581"/>
             <wp:effectExtent l="19050" t="19050" r="22860" b="20955"/>
-            <wp:docPr id="1283066845" name="Imagem 12"/>
+            <wp:docPr id="779280650" name="Imagem 12"/>
             <wp:cNvGraphicFramePr/>
             <a:graphic xmlns:a="http://schemas.openxmlformats.org/drawingml/2006/main">
               <a:graphicData uri="http://schemas.openxmlformats.org/drawingml/2006/picture">
                 <pic:pic xmlns:pic="http://schemas.openxmlformats.org/drawingml/2006/picture">
                   <pic:nvPicPr>
-                    <pic:cNvPr id="1283066845" name=""/>
+                    <pic:cNvPr id="779280650" name=""/>
                     <pic:cNvPicPr/>
                   </pic:nvPicPr>
                   <pic:blipFill>
@@ -12390,7 +12390,7 @@
           <w:sz w:val="27"/>
         </w:rPr>
       </w:pPr>
-      <w:bookmarkStart w:id="23" w:name="_Toc239844067"/>
+      <w:bookmarkStart w:id="23" w:name="_Toc239847902"/>
       <w:r>
         <w:rPr>
           <w:rFonts w:ascii="Montserrat" w:hAnsi="Montserrat"/>
@@ -12952,16 +12952,16 @@
         </w:rPr>
         <w:lastRenderedPageBreak/>
         <w:drawing>
-          <wp:inline distT="0" distB="0" distL="0" distR="0" wp14:anchorId="5A9B8D34" wp14:editId="58206B09">
+          <wp:inline distT="0" distB="0" distL="0" distR="0" wp14:anchorId="12477B3B" wp14:editId="2AAB314B">
             <wp:extent cx="5120640" cy="4627581"/>
             <wp:effectExtent l="19050" t="19050" r="22860" b="20955"/>
-            <wp:docPr id="1417470873" name="Imagem 13"/>
+            <wp:docPr id="1074800433" name="Imagem 13"/>
             <wp:cNvGraphicFramePr/>
             <a:graphic xmlns:a="http://schemas.openxmlformats.org/drawingml/2006/main">
               <a:graphicData uri="http://schemas.openxmlformats.org/drawingml/2006/picture">
                 <pic:pic xmlns:pic="http://schemas.openxmlformats.org/drawingml/2006/picture">
                   <pic:nvPicPr>
-                    <pic:cNvPr id="1417470873" name=""/>
+                    <pic:cNvPr id="1074800433" name=""/>
                     <pic:cNvPicPr/>
                   </pic:nvPicPr>
                   <pic:blipFill>
@@ -13029,16 +13029,16 @@
         </w:rPr>
         <w:lastRenderedPageBreak/>
         <w:drawing>
-          <wp:inline distT="0" distB="0" distL="0" distR="0" wp14:anchorId="499DF891" wp14:editId="3E058EF0">
+          <wp:inline distT="0" distB="0" distL="0" distR="0" wp14:anchorId="2B159183" wp14:editId="0F01E9CC">
             <wp:extent cx="5120640" cy="4627581"/>
             <wp:effectExtent l="19050" t="19050" r="22860" b="20955"/>
-            <wp:docPr id="1658091239" name="Imagem 14"/>
+            <wp:docPr id="1395329167" name="Imagem 14"/>
             <wp:cNvGraphicFramePr/>
             <a:graphic xmlns:a="http://schemas.openxmlformats.org/drawingml/2006/main">
               <a:graphicData uri="http://schemas.openxmlformats.org/drawingml/2006/picture">
                 <pic:pic xmlns:pic="http://schemas.openxmlformats.org/drawingml/2006/picture">
                   <pic:nvPicPr>
-                    <pic:cNvPr id="1658091239" name=""/>
+                    <pic:cNvPr id="1395329167" name=""/>
                     <pic:cNvPicPr/>
                   </pic:nvPicPr>
                   <pic:blipFill>
@@ -13172,7 +13172,7 @@
           <w:sz w:val="27"/>
         </w:rPr>
       </w:pPr>
-      <w:bookmarkStart w:id="24" w:name="_Toc239844068"/>
+      <w:bookmarkStart w:id="24" w:name="_Toc239847903"/>
       <w:r>
         <w:rPr>
           <w:rFonts w:ascii="Montserrat" w:hAnsi="Montserrat"/>
@@ -13213,16 +13213,16 @@
           <w:noProof/>
         </w:rPr>
         <w:drawing>
-          <wp:inline distT="0" distB="0" distL="0" distR="0" wp14:anchorId="62C7E3DF" wp14:editId="59391399">
+          <wp:inline distT="0" distB="0" distL="0" distR="0" wp14:anchorId="0EF73ADA" wp14:editId="74731FF3">
             <wp:extent cx="5120640" cy="4627581"/>
             <wp:effectExtent l="19050" t="19050" r="22860" b="20955"/>
-            <wp:docPr id="2135399228" name="Imagem 15"/>
+            <wp:docPr id="608946009" name="Imagem 15"/>
             <wp:cNvGraphicFramePr/>
             <a:graphic xmlns:a="http://schemas.openxmlformats.org/drawingml/2006/main">
               <a:graphicData uri="http://schemas.openxmlformats.org/drawingml/2006/picture">
                 <pic:pic xmlns:pic="http://schemas.openxmlformats.org/drawingml/2006/picture">
                   <pic:nvPicPr>
-                    <pic:cNvPr id="2135399228" name=""/>
+                    <pic:cNvPr id="608946009" name=""/>
                     <pic:cNvPicPr/>
                   </pic:nvPicPr>
                   <pic:blipFill>
@@ -13290,16 +13290,16 @@
         </w:rPr>
         <w:lastRenderedPageBreak/>
         <w:drawing>
-          <wp:inline distT="0" distB="0" distL="0" distR="0" wp14:anchorId="759938B7" wp14:editId="66E006DE">
+          <wp:inline distT="0" distB="0" distL="0" distR="0" wp14:anchorId="7C5BE655" wp14:editId="305AAE7F">
             <wp:extent cx="5120640" cy="4627581"/>
             <wp:effectExtent l="19050" t="19050" r="22860" b="20955"/>
-            <wp:docPr id="187221708" name="Imagem 16"/>
+            <wp:docPr id="1437238471" name="Imagem 16"/>
             <wp:cNvGraphicFramePr/>
             <a:graphic xmlns:a="http://schemas.openxmlformats.org/drawingml/2006/main">
               <a:graphicData uri="http://schemas.openxmlformats.org/drawingml/2006/picture">
                 <pic:pic xmlns:pic="http://schemas.openxmlformats.org/drawingml/2006/picture">
                   <pic:nvPicPr>
-                    <pic:cNvPr id="187221708" name=""/>
+                    <pic:cNvPr id="1437238471" name=""/>
                     <pic:cNvPicPr/>
                   </pic:nvPicPr>
                   <pic:blipFill>
@@ -13463,16 +13463,16 @@
         </w:rPr>
         <w:lastRenderedPageBreak/>
         <w:drawing>
-          <wp:inline distT="0" distB="0" distL="0" distR="0" wp14:anchorId="1857E8A9" wp14:editId="651BF3C5">
+          <wp:inline distT="0" distB="0" distL="0" distR="0" wp14:anchorId="45B4CEA2" wp14:editId="236EA277">
             <wp:extent cx="5120640" cy="3282818"/>
             <wp:effectExtent l="19050" t="19050" r="22860" b="13335"/>
-            <wp:docPr id="334648577" name="Imagem 17"/>
+            <wp:docPr id="1026257946" name="Imagem 17"/>
             <wp:cNvGraphicFramePr/>
             <a:graphic xmlns:a="http://schemas.openxmlformats.org/drawingml/2006/main">
               <a:graphicData uri="http://schemas.openxmlformats.org/drawingml/2006/picture">
                 <pic:pic xmlns:pic="http://schemas.openxmlformats.org/drawingml/2006/picture">
                   <pic:nvPicPr>
-                    <pic:cNvPr id="334648577" name=""/>
+                    <pic:cNvPr id="1026257946" name=""/>
                     <pic:cNvPicPr/>
                   </pic:nvPicPr>
                   <pic:blipFill>
@@ -13606,7 +13606,7 @@
           <w:sz w:val="27"/>
         </w:rPr>
       </w:pPr>
-      <w:bookmarkStart w:id="25" w:name="_Toc239844069"/>
+      <w:bookmarkStart w:id="25" w:name="_Toc239847904"/>
       <w:r>
         <w:rPr>
           <w:rFonts w:ascii="Montserrat" w:hAnsi="Montserrat"/>
@@ -13647,16 +13647,16 @@
         </w:rPr>
         <w:lastRenderedPageBreak/>
         <w:drawing>
-          <wp:inline distT="0" distB="0" distL="0" distR="0" wp14:anchorId="2E748787" wp14:editId="6A68A757">
+          <wp:inline distT="0" distB="0" distL="0" distR="0" wp14:anchorId="7ADC48E9" wp14:editId="0D09774B">
             <wp:extent cx="5120640" cy="4627581"/>
             <wp:effectExtent l="19050" t="19050" r="22860" b="20955"/>
-            <wp:docPr id="685896998" name="Imagem 18"/>
+            <wp:docPr id="2086808795" name="Imagem 18"/>
             <wp:cNvGraphicFramePr/>
             <a:graphic xmlns:a="http://schemas.openxmlformats.org/drawingml/2006/main">
               <a:graphicData uri="http://schemas.openxmlformats.org/drawingml/2006/picture">
                 <pic:pic xmlns:pic="http://schemas.openxmlformats.org/drawingml/2006/picture">
                   <pic:nvPicPr>
-                    <pic:cNvPr id="685896998" name=""/>
+                    <pic:cNvPr id="2086808795" name=""/>
                     <pic:cNvPicPr/>
                   </pic:nvPicPr>
                   <pic:blipFill>
@@ -13724,16 +13724,16 @@
         </w:rPr>
         <w:lastRenderedPageBreak/>
         <w:drawing>
-          <wp:inline distT="0" distB="0" distL="0" distR="0" wp14:anchorId="19A84994" wp14:editId="76222D43">
+          <wp:inline distT="0" distB="0" distL="0" distR="0" wp14:anchorId="6B143774" wp14:editId="675D157F">
             <wp:extent cx="5120640" cy="4627581"/>
             <wp:effectExtent l="19050" t="19050" r="22860" b="20955"/>
-            <wp:docPr id="303214286" name="Imagem 19"/>
+            <wp:docPr id="1305222549" name="Imagem 19"/>
             <wp:cNvGraphicFramePr/>
             <a:graphic xmlns:a="http://schemas.openxmlformats.org/drawingml/2006/main">
               <a:graphicData uri="http://schemas.openxmlformats.org/drawingml/2006/picture">
                 <pic:pic xmlns:pic="http://schemas.openxmlformats.org/drawingml/2006/picture">
                   <pic:nvPicPr>
-                    <pic:cNvPr id="303214286" name=""/>
+                    <pic:cNvPr id="1305222549" name=""/>
                     <pic:cNvPicPr/>
                   </pic:nvPicPr>
                   <pic:blipFill>
@@ -13916,7 +13916,7 @@
           <w:sz w:val="27"/>
         </w:rPr>
       </w:pPr>
-      <w:bookmarkStart w:id="26" w:name="_Toc239844070"/>
+      <w:bookmarkStart w:id="26" w:name="_Toc239847905"/>
       <w:r>
         <w:rPr>
           <w:rFonts w:ascii="Montserrat" w:hAnsi="Montserrat"/>
@@ -13956,16 +13956,16 @@
           <w:noProof/>
         </w:rPr>
         <w:drawing>
-          <wp:inline distT="0" distB="0" distL="0" distR="0" wp14:anchorId="22BE48C3" wp14:editId="4C6309FF">
+          <wp:inline distT="0" distB="0" distL="0" distR="0" wp14:anchorId="6DDF730D" wp14:editId="357CDDAB">
             <wp:extent cx="5120640" cy="4627581"/>
             <wp:effectExtent l="19050" t="19050" r="22860" b="20955"/>
-            <wp:docPr id="78168440" name="Imagem 20"/>
+            <wp:docPr id="994127746" name="Imagem 20"/>
             <wp:cNvGraphicFramePr/>
             <a:graphic xmlns:a="http://schemas.openxmlformats.org/drawingml/2006/main">
               <a:graphicData uri="http://schemas.openxmlformats.org/drawingml/2006/picture">
                 <pic:pic xmlns:pic="http://schemas.openxmlformats.org/drawingml/2006/picture">
                   <pic:nvPicPr>
-                    <pic:cNvPr id="78168440" name=""/>
+                    <pic:cNvPr id="994127746" name=""/>
                     <pic:cNvPicPr/>
                   </pic:nvPicPr>
                   <pic:blipFill>
@@ -14033,16 +14033,16 @@
         </w:rPr>
         <w:lastRenderedPageBreak/>
         <w:drawing>
-          <wp:inline distT="0" distB="0" distL="0" distR="0" wp14:anchorId="666FFE6B" wp14:editId="3FD041CE">
+          <wp:inline distT="0" distB="0" distL="0" distR="0" wp14:anchorId="476BF7C9" wp14:editId="79CE1C49">
             <wp:extent cx="5120640" cy="4627581"/>
             <wp:effectExtent l="19050" t="19050" r="22860" b="20955"/>
-            <wp:docPr id="2005286146" name="Imagem 21"/>
+            <wp:docPr id="1351450997" name="Imagem 21"/>
             <wp:cNvGraphicFramePr/>
             <a:graphic xmlns:a="http://schemas.openxmlformats.org/drawingml/2006/main">
               <a:graphicData uri="http://schemas.openxmlformats.org/drawingml/2006/picture">
                 <pic:pic xmlns:pic="http://schemas.openxmlformats.org/drawingml/2006/picture">
                   <pic:nvPicPr>
-                    <pic:cNvPr id="2005286146" name=""/>
+                    <pic:cNvPr id="1351450997" name=""/>
                     <pic:cNvPicPr/>
                   </pic:nvPicPr>
                   <pic:blipFill>
@@ -14248,16 +14248,16 @@
           <w:noProof/>
         </w:rPr>
         <w:drawing>
-          <wp:inline distT="0" distB="0" distL="0" distR="0" wp14:anchorId="31403458" wp14:editId="12101B9C">
+          <wp:inline distT="0" distB="0" distL="0" distR="0" wp14:anchorId="0B1B59A3" wp14:editId="6A4B1527">
             <wp:extent cx="5120640" cy="1757287"/>
             <wp:effectExtent l="19050" t="19050" r="22860" b="14605"/>
-            <wp:docPr id="2031624566" name="Imagem 22"/>
+            <wp:docPr id="455716435" name="Imagem 22"/>
             <wp:cNvGraphicFramePr/>
             <a:graphic xmlns:a="http://schemas.openxmlformats.org/drawingml/2006/main">
               <a:graphicData uri="http://schemas.openxmlformats.org/drawingml/2006/picture">
                 <pic:pic xmlns:pic="http://schemas.openxmlformats.org/drawingml/2006/picture">
                   <pic:nvPicPr>
-                    <pic:cNvPr id="2031624566" name=""/>
+                    <pic:cNvPr id="455716435" name=""/>
                     <pic:cNvPicPr/>
                   </pic:nvPicPr>
                   <pic:blipFill>
@@ -14370,7 +14370,7 @@
           <w:sz w:val="27"/>
         </w:rPr>
       </w:pPr>
-      <w:bookmarkStart w:id="27" w:name="_Toc239844071"/>
+      <w:bookmarkStart w:id="27" w:name="_Toc239847906"/>
       <w:r>
         <w:rPr>
           <w:rFonts w:ascii="Montserrat" w:hAnsi="Montserrat"/>
@@ -14411,16 +14411,16 @@
         </w:rPr>
         <w:lastRenderedPageBreak/>
         <w:drawing>
-          <wp:inline distT="0" distB="0" distL="0" distR="0" wp14:anchorId="75C05841" wp14:editId="3091EBFA">
+          <wp:inline distT="0" distB="0" distL="0" distR="0" wp14:anchorId="0F5140ED" wp14:editId="0187F646">
             <wp:extent cx="5120640" cy="4627581"/>
             <wp:effectExtent l="19050" t="19050" r="22860" b="20955"/>
-            <wp:docPr id="1362138942" name="Imagem 23"/>
+            <wp:docPr id="2027106703" name="Imagem 23"/>
             <wp:cNvGraphicFramePr/>
             <a:graphic xmlns:a="http://schemas.openxmlformats.org/drawingml/2006/main">
               <a:graphicData uri="http://schemas.openxmlformats.org/drawingml/2006/picture">
                 <pic:pic xmlns:pic="http://schemas.openxmlformats.org/drawingml/2006/picture">
                   <pic:nvPicPr>
-                    <pic:cNvPr id="1362138942" name=""/>
+                    <pic:cNvPr id="2027106703" name=""/>
                     <pic:cNvPicPr/>
                   </pic:nvPicPr>
                   <pic:blipFill>
@@ -14488,16 +14488,16 @@
         </w:rPr>
         <w:lastRenderedPageBreak/>
         <w:drawing>
-          <wp:inline distT="0" distB="0" distL="0" distR="0" wp14:anchorId="523E83D2" wp14:editId="5AD4E480">
+          <wp:inline distT="0" distB="0" distL="0" distR="0" wp14:anchorId="146E7160" wp14:editId="4A52D020">
             <wp:extent cx="5120640" cy="4627581"/>
             <wp:effectExtent l="19050" t="19050" r="22860" b="20955"/>
-            <wp:docPr id="1975628032" name="Imagem 24"/>
+            <wp:docPr id="1372930038" name="Imagem 24"/>
             <wp:cNvGraphicFramePr/>
             <a:graphic xmlns:a="http://schemas.openxmlformats.org/drawingml/2006/main">
               <a:graphicData uri="http://schemas.openxmlformats.org/drawingml/2006/picture">
                 <pic:pic xmlns:pic="http://schemas.openxmlformats.org/drawingml/2006/picture">
                   <pic:nvPicPr>
-                    <pic:cNvPr id="1975628032" name=""/>
+                    <pic:cNvPr id="1372930038" name=""/>
                     <pic:cNvPicPr/>
                   </pic:nvPicPr>
                   <pic:blipFill>
@@ -14734,7 +14734,7 @@
           <w:sz w:val="27"/>
         </w:rPr>
       </w:pPr>
-      <w:bookmarkStart w:id="28" w:name="_Toc239844072"/>
+      <w:bookmarkStart w:id="28" w:name="_Toc239847907"/>
       <w:r>
         <w:rPr>
           <w:rFonts w:ascii="Montserrat" w:hAnsi="Montserrat"/>
@@ -14774,16 +14774,16 @@
           <w:noProof/>
         </w:rPr>
         <w:drawing>
-          <wp:inline distT="0" distB="0" distL="0" distR="0" wp14:anchorId="122C576E" wp14:editId="16E08590">
+          <wp:inline distT="0" distB="0" distL="0" distR="0" wp14:anchorId="7ADA413E" wp14:editId="23FF2F5D">
             <wp:extent cx="5120640" cy="4627581"/>
             <wp:effectExtent l="19050" t="19050" r="22860" b="20955"/>
-            <wp:docPr id="1330245643" name="Imagem 25"/>
+            <wp:docPr id="352772329" name="Imagem 25"/>
             <wp:cNvGraphicFramePr/>
             <a:graphic xmlns:a="http://schemas.openxmlformats.org/drawingml/2006/main">
               <a:graphicData uri="http://schemas.openxmlformats.org/drawingml/2006/picture">
                 <pic:pic xmlns:pic="http://schemas.openxmlformats.org/drawingml/2006/picture">
                   <pic:nvPicPr>
-                    <pic:cNvPr id="1330245643" name=""/>
+                    <pic:cNvPr id="352772329" name=""/>
                     <pic:cNvPicPr/>
                   </pic:nvPicPr>
                   <pic:blipFill>
@@ -14851,16 +14851,16 @@
         </w:rPr>
         <w:lastRenderedPageBreak/>
         <w:drawing>
-          <wp:inline distT="0" distB="0" distL="0" distR="0" wp14:anchorId="6C248371" wp14:editId="0C1F4EEA">
+          <wp:inline distT="0" distB="0" distL="0" distR="0" wp14:anchorId="151A21EE" wp14:editId="313550E1">
             <wp:extent cx="5120640" cy="4627581"/>
             <wp:effectExtent l="19050" t="19050" r="22860" b="20955"/>
-            <wp:docPr id="1001674513" name="Imagem 26"/>
+            <wp:docPr id="965010347" name="Imagem 26"/>
             <wp:cNvGraphicFramePr/>
             <a:graphic xmlns:a="http://schemas.openxmlformats.org/drawingml/2006/main">
               <a:graphicData uri="http://schemas.openxmlformats.org/drawingml/2006/picture">
                 <pic:pic xmlns:pic="http://schemas.openxmlformats.org/drawingml/2006/picture">
                   <pic:nvPicPr>
-                    <pic:cNvPr id="1001674513" name=""/>
+                    <pic:cNvPr id="965010347" name=""/>
                     <pic:cNvPicPr/>
                   </pic:nvPicPr>
                   <pic:blipFill>
@@ -15051,7 +15051,7 @@
           <w:sz w:val="27"/>
         </w:rPr>
       </w:pPr>
-      <w:bookmarkStart w:id="29" w:name="_Toc239844073"/>
+      <w:bookmarkStart w:id="29" w:name="_Toc239847908"/>
       <w:r>
         <w:rPr>
           <w:rFonts w:ascii="Montserrat" w:hAnsi="Montserrat"/>
@@ -15091,16 +15091,16 @@
           <w:noProof/>
         </w:rPr>
         <w:drawing>
-          <wp:inline distT="0" distB="0" distL="0" distR="0" wp14:anchorId="44BA1D82" wp14:editId="551E6F63">
+          <wp:inline distT="0" distB="0" distL="0" distR="0" wp14:anchorId="5738B545" wp14:editId="79695D52">
             <wp:extent cx="5120640" cy="4000682"/>
             <wp:effectExtent l="19050" t="19050" r="22860" b="19050"/>
-            <wp:docPr id="613733714" name="Imagem 27"/>
+            <wp:docPr id="951888096" name="Imagem 27"/>
             <wp:cNvGraphicFramePr/>
             <a:graphic xmlns:a="http://schemas.openxmlformats.org/drawingml/2006/main">
               <a:graphicData uri="http://schemas.openxmlformats.org/drawingml/2006/picture">
                 <pic:pic xmlns:pic="http://schemas.openxmlformats.org/drawingml/2006/picture">
                   <pic:nvPicPr>
-                    <pic:cNvPr id="613733714" name=""/>
+                    <pic:cNvPr id="951888096" name=""/>
                     <pic:cNvPicPr/>
                   </pic:nvPicPr>
                   <pic:blipFill>
@@ -15624,7 +15624,7 @@
           <w:sz w:val="34"/>
         </w:rPr>
       </w:pPr>
-      <w:bookmarkStart w:id="30" w:name="_Toc239844074"/>
+      <w:bookmarkStart w:id="30" w:name="_Toc239847909"/>
       <w:r>
         <w:rPr>
           <w:rFonts w:ascii="Montserrat" w:hAnsi="Montserrat"/>
@@ -15666,7 +15666,7 @@
           <w:sz w:val="27"/>
         </w:rPr>
       </w:pPr>
-      <w:bookmarkStart w:id="31" w:name="_Toc239844075"/>
+      <w:bookmarkStart w:id="31" w:name="_Toc239847910"/>
       <w:r>
         <w:rPr>
           <w:rFonts w:ascii="Montserrat" w:hAnsi="Montserrat"/>
@@ -15706,16 +15706,16 @@
           <w:noProof/>
         </w:rPr>
         <w:drawing>
-          <wp:inline distT="0" distB="0" distL="0" distR="0" wp14:anchorId="2D9A8E1C" wp14:editId="6C23EAA8">
+          <wp:inline distT="0" distB="0" distL="0" distR="0" wp14:anchorId="2899BF0B" wp14:editId="7C805621">
             <wp:extent cx="5120640" cy="4627581"/>
             <wp:effectExtent l="19050" t="19050" r="22860" b="20955"/>
-            <wp:docPr id="41595538" name="Imagem 28"/>
+            <wp:docPr id="149025975" name="Imagem 28"/>
             <wp:cNvGraphicFramePr/>
             <a:graphic xmlns:a="http://schemas.openxmlformats.org/drawingml/2006/main">
               <a:graphicData uri="http://schemas.openxmlformats.org/drawingml/2006/picture">
                 <pic:pic xmlns:pic="http://schemas.openxmlformats.org/drawingml/2006/picture">
                   <pic:nvPicPr>
-                    <pic:cNvPr id="41595538" name=""/>
+                    <pic:cNvPr id="149025975" name=""/>
                     <pic:cNvPicPr/>
                   </pic:nvPicPr>
                   <pic:blipFill>
@@ -15783,16 +15783,16 @@
         </w:rPr>
         <w:lastRenderedPageBreak/>
         <w:drawing>
-          <wp:inline distT="0" distB="0" distL="0" distR="0" wp14:anchorId="1A1AF69C" wp14:editId="6B0B7617">
+          <wp:inline distT="0" distB="0" distL="0" distR="0" wp14:anchorId="509D70F2" wp14:editId="6C749063">
             <wp:extent cx="5120640" cy="4627581"/>
             <wp:effectExtent l="19050" t="19050" r="22860" b="20955"/>
-            <wp:docPr id="19668777" name="Imagem 29"/>
+            <wp:docPr id="505302073" name="Imagem 29"/>
             <wp:cNvGraphicFramePr/>
             <a:graphic xmlns:a="http://schemas.openxmlformats.org/drawingml/2006/main">
               <a:graphicData uri="http://schemas.openxmlformats.org/drawingml/2006/picture">
                 <pic:pic xmlns:pic="http://schemas.openxmlformats.org/drawingml/2006/picture">
                   <pic:nvPicPr>
-                    <pic:cNvPr id="19668777" name=""/>
+                    <pic:cNvPr id="505302073" name=""/>
                     <pic:cNvPicPr/>
                   </pic:nvPicPr>
                   <pic:blipFill>
@@ -15860,16 +15860,16 @@
         </w:rPr>
         <w:lastRenderedPageBreak/>
         <w:drawing>
-          <wp:inline distT="0" distB="0" distL="0" distR="0" wp14:anchorId="075BA656" wp14:editId="4A38F66B">
+          <wp:inline distT="0" distB="0" distL="0" distR="0" wp14:anchorId="0CAE40DC" wp14:editId="64072058">
             <wp:extent cx="5120640" cy="4627581"/>
             <wp:effectExtent l="19050" t="19050" r="22860" b="20955"/>
-            <wp:docPr id="1582443431" name="Imagem 30"/>
+            <wp:docPr id="1624859002" name="Imagem 30"/>
             <wp:cNvGraphicFramePr/>
             <a:graphic xmlns:a="http://schemas.openxmlformats.org/drawingml/2006/main">
               <a:graphicData uri="http://schemas.openxmlformats.org/drawingml/2006/picture">
                 <pic:pic xmlns:pic="http://schemas.openxmlformats.org/drawingml/2006/picture">
                   <pic:nvPicPr>
-                    <pic:cNvPr id="1582443431" name=""/>
+                    <pic:cNvPr id="1624859002" name=""/>
                     <pic:cNvPicPr/>
                   </pic:nvPicPr>
                   <pic:blipFill>
@@ -16053,16 +16053,16 @@
           <w:noProof/>
         </w:rPr>
         <w:drawing>
-          <wp:inline distT="0" distB="0" distL="0" distR="0" wp14:anchorId="2B1C12A3" wp14:editId="46535EBD">
+          <wp:inline distT="0" distB="0" distL="0" distR="0" wp14:anchorId="578E0B31" wp14:editId="45617789">
             <wp:extent cx="5120640" cy="1715571"/>
             <wp:effectExtent l="19050" t="19050" r="22860" b="18415"/>
-            <wp:docPr id="974193430" name="Imagem 31"/>
+            <wp:docPr id="290912084" name="Imagem 31"/>
             <wp:cNvGraphicFramePr/>
             <a:graphic xmlns:a="http://schemas.openxmlformats.org/drawingml/2006/main">
               <a:graphicData uri="http://schemas.openxmlformats.org/drawingml/2006/picture">
                 <pic:pic xmlns:pic="http://schemas.openxmlformats.org/drawingml/2006/picture">
                   <pic:nvPicPr>
-                    <pic:cNvPr id="974193430" name=""/>
+                    <pic:cNvPr id="290912084" name=""/>
                     <pic:cNvPicPr/>
                   </pic:nvPicPr>
                   <pic:blipFill>
@@ -16208,16 +16208,16 @@
           <w:noProof/>
         </w:rPr>
         <w:drawing>
-          <wp:inline distT="0" distB="0" distL="0" distR="0" wp14:anchorId="59AEB360" wp14:editId="0144FB7A">
+          <wp:inline distT="0" distB="0" distL="0" distR="0" wp14:anchorId="4F9EB707" wp14:editId="7F2D05C0">
             <wp:extent cx="5120640" cy="3282818"/>
             <wp:effectExtent l="19050" t="19050" r="22860" b="13335"/>
-            <wp:docPr id="1590723803" name="Imagem 32"/>
+            <wp:docPr id="528327687" name="Imagem 32"/>
             <wp:cNvGraphicFramePr/>
             <a:graphic xmlns:a="http://schemas.openxmlformats.org/drawingml/2006/main">
               <a:graphicData uri="http://schemas.openxmlformats.org/drawingml/2006/picture">
                 <pic:pic xmlns:pic="http://schemas.openxmlformats.org/drawingml/2006/picture">
                   <pic:nvPicPr>
-                    <pic:cNvPr id="1590723803" name=""/>
+                    <pic:cNvPr id="528327687" name=""/>
                     <pic:cNvPicPr/>
                   </pic:nvPicPr>
                   <pic:blipFill>
@@ -16330,16 +16330,16 @@
         </w:rPr>
         <w:lastRenderedPageBreak/>
         <w:drawing>
-          <wp:inline distT="0" distB="0" distL="0" distR="0" wp14:anchorId="140180C7" wp14:editId="6E296119">
+          <wp:inline distT="0" distB="0" distL="0" distR="0" wp14:anchorId="174363D0" wp14:editId="735313EC">
             <wp:extent cx="5120640" cy="951357"/>
             <wp:effectExtent l="19050" t="19050" r="22860" b="20320"/>
-            <wp:docPr id="441644785" name="Imagem 33"/>
+            <wp:docPr id="1887136683" name="Imagem 33"/>
             <wp:cNvGraphicFramePr/>
             <a:graphic xmlns:a="http://schemas.openxmlformats.org/drawingml/2006/main">
               <a:graphicData uri="http://schemas.openxmlformats.org/drawingml/2006/picture">
                 <pic:pic xmlns:pic="http://schemas.openxmlformats.org/drawingml/2006/picture">
                   <pic:nvPicPr>
-                    <pic:cNvPr id="441644785" name=""/>
+                    <pic:cNvPr id="1887136683" name=""/>
                     <pic:cNvPicPr/>
                   </pic:nvPicPr>
                   <pic:blipFill>
@@ -16451,16 +16451,16 @@
           <w:noProof/>
         </w:rPr>
         <w:drawing>
-          <wp:inline distT="0" distB="0" distL="0" distR="0" wp14:anchorId="6CF089F6" wp14:editId="4C0C7E37">
+          <wp:inline distT="0" distB="0" distL="0" distR="0" wp14:anchorId="3603F623" wp14:editId="777C5056">
             <wp:extent cx="5120640" cy="1515102"/>
             <wp:effectExtent l="19050" t="19050" r="22860" b="28575"/>
-            <wp:docPr id="582255396" name="Imagem 34"/>
+            <wp:docPr id="212406431" name="Imagem 34"/>
             <wp:cNvGraphicFramePr/>
             <a:graphic xmlns:a="http://schemas.openxmlformats.org/drawingml/2006/main">
               <a:graphicData uri="http://schemas.openxmlformats.org/drawingml/2006/picture">
                 <pic:pic xmlns:pic="http://schemas.openxmlformats.org/drawingml/2006/picture">
                   <pic:nvPicPr>
-                    <pic:cNvPr id="582255396" name=""/>
+                    <pic:cNvPr id="212406431" name=""/>
                     <pic:cNvPicPr/>
                   </pic:nvPicPr>
                   <pic:blipFill>
@@ -16582,16 +16582,16 @@
           <w:noProof/>
         </w:rPr>
         <w:drawing>
-          <wp:inline distT="0" distB="0" distL="0" distR="0" wp14:anchorId="6091E3E1" wp14:editId="0EAE6AD6">
+          <wp:inline distT="0" distB="0" distL="0" distR="0" wp14:anchorId="55DE3A40" wp14:editId="667D7925">
             <wp:extent cx="5120640" cy="1391113"/>
             <wp:effectExtent l="19050" t="19050" r="22860" b="19050"/>
-            <wp:docPr id="71622700" name="Imagem 35"/>
+            <wp:docPr id="1646904943" name="Imagem 35"/>
             <wp:cNvGraphicFramePr/>
             <a:graphic xmlns:a="http://schemas.openxmlformats.org/drawingml/2006/main">
               <a:graphicData uri="http://schemas.openxmlformats.org/drawingml/2006/picture">
                 <pic:pic xmlns:pic="http://schemas.openxmlformats.org/drawingml/2006/picture">
                   <pic:nvPicPr>
-                    <pic:cNvPr id="71622700" name=""/>
+                    <pic:cNvPr id="1646904943" name=""/>
                     <pic:cNvPicPr/>
                   </pic:nvPicPr>
                   <pic:blipFill>
@@ -16703,16 +16703,16 @@
           <w:noProof/>
         </w:rPr>
         <w:drawing>
-          <wp:inline distT="0" distB="0" distL="0" distR="0" wp14:anchorId="5D06A3FB" wp14:editId="60E6AC39">
+          <wp:inline distT="0" distB="0" distL="0" distR="0" wp14:anchorId="03DB2AF9" wp14:editId="1CE09FAA">
             <wp:extent cx="5120640" cy="1125174"/>
             <wp:effectExtent l="19050" t="19050" r="22860" b="18415"/>
-            <wp:docPr id="747574762" name="Imagem 36"/>
+            <wp:docPr id="1265859384" name="Imagem 36"/>
             <wp:cNvGraphicFramePr/>
             <a:graphic xmlns:a="http://schemas.openxmlformats.org/drawingml/2006/main">
               <a:graphicData uri="http://schemas.openxmlformats.org/drawingml/2006/picture">
                 <pic:pic xmlns:pic="http://schemas.openxmlformats.org/drawingml/2006/picture">
                   <pic:nvPicPr>
-                    <pic:cNvPr id="747574762" name=""/>
+                    <pic:cNvPr id="1265859384" name=""/>
                     <pic:cNvPicPr/>
                   </pic:nvPicPr>
                   <pic:blipFill>
@@ -16801,7 +16801,7 @@
           <w:sz w:val="27"/>
         </w:rPr>
       </w:pPr>
-      <w:bookmarkStart w:id="32" w:name="_Toc239844076"/>
+      <w:bookmarkStart w:id="32" w:name="_Toc239847911"/>
       <w:r>
         <w:rPr>
           <w:rFonts w:ascii="Montserrat" w:hAnsi="Montserrat"/>
@@ -16842,16 +16842,16 @@
           <w:noProof/>
         </w:rPr>
         <w:drawing>
-          <wp:inline distT="0" distB="0" distL="0" distR="0" wp14:anchorId="1B0F707F" wp14:editId="3108093F">
+          <wp:inline distT="0" distB="0" distL="0" distR="0" wp14:anchorId="53F0B515" wp14:editId="0956FC0F">
             <wp:extent cx="5120640" cy="4627581"/>
             <wp:effectExtent l="19050" t="19050" r="22860" b="20955"/>
-            <wp:docPr id="937185770" name="Imagem 37"/>
+            <wp:docPr id="102325349" name="Imagem 37"/>
             <wp:cNvGraphicFramePr/>
             <a:graphic xmlns:a="http://schemas.openxmlformats.org/drawingml/2006/main">
               <a:graphicData uri="http://schemas.openxmlformats.org/drawingml/2006/picture">
                 <pic:pic xmlns:pic="http://schemas.openxmlformats.org/drawingml/2006/picture">
                   <pic:nvPicPr>
-                    <pic:cNvPr id="937185770" name=""/>
+                    <pic:cNvPr id="102325349" name=""/>
                     <pic:cNvPicPr/>
                   </pic:nvPicPr>
                   <pic:blipFill>
@@ -16919,16 +16919,16 @@
         </w:rPr>
         <w:lastRenderedPageBreak/>
         <w:drawing>
-          <wp:inline distT="0" distB="0" distL="0" distR="0" wp14:anchorId="2C1166AE" wp14:editId="673A644B">
+          <wp:inline distT="0" distB="0" distL="0" distR="0" wp14:anchorId="7AE12763" wp14:editId="52C9246B">
             <wp:extent cx="5120640" cy="4627581"/>
             <wp:effectExtent l="19050" t="19050" r="22860" b="20955"/>
-            <wp:docPr id="2083130722" name="Imagem 38"/>
+            <wp:docPr id="816520370" name="Imagem 38"/>
             <wp:cNvGraphicFramePr/>
             <a:graphic xmlns:a="http://schemas.openxmlformats.org/drawingml/2006/main">
               <a:graphicData uri="http://schemas.openxmlformats.org/drawingml/2006/picture">
                 <pic:pic xmlns:pic="http://schemas.openxmlformats.org/drawingml/2006/picture">
                   <pic:nvPicPr>
-                    <pic:cNvPr id="2083130722" name=""/>
+                    <pic:cNvPr id="816520370" name=""/>
                     <pic:cNvPicPr/>
                   </pic:nvPicPr>
                   <pic:blipFill>
@@ -17097,16 +17097,16 @@
           <w:noProof/>
         </w:rPr>
         <w:drawing>
-          <wp:inline distT="0" distB="0" distL="0" distR="0" wp14:anchorId="641F7098" wp14:editId="7B96BD37">
+          <wp:inline distT="0" distB="0" distL="0" distR="0" wp14:anchorId="796668F6" wp14:editId="4B5EBA53">
             <wp:extent cx="5120640" cy="2144319"/>
             <wp:effectExtent l="19050" t="19050" r="22860" b="27940"/>
-            <wp:docPr id="631924149" name="Imagem 39"/>
+            <wp:docPr id="1461527689" name="Imagem 39"/>
             <wp:cNvGraphicFramePr/>
             <a:graphic xmlns:a="http://schemas.openxmlformats.org/drawingml/2006/main">
               <a:graphicData uri="http://schemas.openxmlformats.org/drawingml/2006/picture">
                 <pic:pic xmlns:pic="http://schemas.openxmlformats.org/drawingml/2006/picture">
                   <pic:nvPicPr>
-                    <pic:cNvPr id="631924149" name=""/>
+                    <pic:cNvPr id="1461527689" name=""/>
                     <pic:cNvPicPr/>
                   </pic:nvPicPr>
                   <pic:blipFill>
@@ -17194,16 +17194,16 @@
           <w:noProof/>
         </w:rPr>
         <w:drawing>
-          <wp:inline distT="0" distB="0" distL="0" distR="0" wp14:anchorId="5F601523" wp14:editId="2E64AC48">
+          <wp:inline distT="0" distB="0" distL="0" distR="0" wp14:anchorId="0428DD72" wp14:editId="702C1C3A">
             <wp:extent cx="5120640" cy="1055647"/>
             <wp:effectExtent l="19050" t="19050" r="22860" b="11430"/>
-            <wp:docPr id="888816300" name="Imagem 40"/>
+            <wp:docPr id="1612904267" name="Imagem 40"/>
             <wp:cNvGraphicFramePr/>
             <a:graphic xmlns:a="http://schemas.openxmlformats.org/drawingml/2006/main">
               <a:graphicData uri="http://schemas.openxmlformats.org/drawingml/2006/picture">
                 <pic:pic xmlns:pic="http://schemas.openxmlformats.org/drawingml/2006/picture">
                   <pic:nvPicPr>
-                    <pic:cNvPr id="888816300" name=""/>
+                    <pic:cNvPr id="1612904267" name=""/>
                     <pic:cNvPicPr/>
                   </pic:nvPicPr>
                   <pic:blipFill>
@@ -17325,16 +17325,16 @@
           <w:noProof/>
         </w:rPr>
         <w:drawing>
-          <wp:inline distT="0" distB="0" distL="0" distR="0" wp14:anchorId="4F235BFD" wp14:editId="2F3A10AB">
+          <wp:inline distT="0" distB="0" distL="0" distR="0" wp14:anchorId="7EC50279" wp14:editId="21EA3865">
             <wp:extent cx="5120640" cy="3282818"/>
             <wp:effectExtent l="19050" t="19050" r="22860" b="13335"/>
-            <wp:docPr id="697569119" name="Imagem 41"/>
+            <wp:docPr id="9981754" name="Imagem 41"/>
             <wp:cNvGraphicFramePr/>
             <a:graphic xmlns:a="http://schemas.openxmlformats.org/drawingml/2006/main">
               <a:graphicData uri="http://schemas.openxmlformats.org/drawingml/2006/picture">
                 <pic:pic xmlns:pic="http://schemas.openxmlformats.org/drawingml/2006/picture">
                   <pic:nvPicPr>
-                    <pic:cNvPr id="697569119" name=""/>
+                    <pic:cNvPr id="9981754" name=""/>
                     <pic:cNvPicPr/>
                   </pic:nvPicPr>
                   <pic:blipFill>
@@ -17468,16 +17468,16 @@
         </w:rPr>
         <w:lastRenderedPageBreak/>
         <w:drawing>
-          <wp:inline distT="0" distB="0" distL="0" distR="0" wp14:anchorId="385B65CC" wp14:editId="3FEAC73D">
+          <wp:inline distT="0" distB="0" distL="0" distR="0" wp14:anchorId="28333BF5" wp14:editId="09936974">
             <wp:extent cx="5120640" cy="1978034"/>
             <wp:effectExtent l="19050" t="19050" r="22860" b="22225"/>
-            <wp:docPr id="2100161177" name="Imagem 42"/>
+            <wp:docPr id="1368370382" name="Imagem 42"/>
             <wp:cNvGraphicFramePr/>
             <a:graphic xmlns:a="http://schemas.openxmlformats.org/drawingml/2006/main">
               <a:graphicData uri="http://schemas.openxmlformats.org/drawingml/2006/picture">
                 <pic:pic xmlns:pic="http://schemas.openxmlformats.org/drawingml/2006/picture">
                   <pic:nvPicPr>
-                    <pic:cNvPr id="2100161177" name=""/>
+                    <pic:cNvPr id="1368370382" name=""/>
                     <pic:cNvPicPr/>
                   </pic:nvPicPr>
                   <pic:blipFill>
@@ -17549,7 +17549,7 @@
           <w:sz w:val="34"/>
         </w:rPr>
       </w:pPr>
-      <w:bookmarkStart w:id="33" w:name="_Toc239844077"/>
+      <w:bookmarkStart w:id="33" w:name="_Toc239847912"/>
       <w:r>
         <w:rPr>
           <w:rFonts w:ascii="Montserrat" w:hAnsi="Montserrat"/>
@@ -17609,7 +17609,7 @@
           <w:sz w:val="27"/>
         </w:rPr>
       </w:pPr>
-      <w:bookmarkStart w:id="34" w:name="_Toc239844078"/>
+      <w:bookmarkStart w:id="34" w:name="_Toc239847913"/>
       <w:r>
         <w:rPr>
           <w:rFonts w:ascii="Montserrat" w:hAnsi="Montserrat"/>
@@ -17649,16 +17649,16 @@
           <w:noProof/>
         </w:rPr>
         <w:drawing>
-          <wp:inline distT="0" distB="0" distL="0" distR="0" wp14:anchorId="5974C4FA" wp14:editId="67BBB17B">
+          <wp:inline distT="0" distB="0" distL="0" distR="0" wp14:anchorId="60CDEA55" wp14:editId="37F9D223">
             <wp:extent cx="5303520" cy="4792851"/>
             <wp:effectExtent l="19050" t="19050" r="11430" b="27305"/>
-            <wp:docPr id="2034895483" name="Imagem 43"/>
+            <wp:docPr id="342127375" name="Imagem 43"/>
             <wp:cNvGraphicFramePr/>
             <a:graphic xmlns:a="http://schemas.openxmlformats.org/drawingml/2006/main">
               <a:graphicData uri="http://schemas.openxmlformats.org/drawingml/2006/picture">
                 <pic:pic xmlns:pic="http://schemas.openxmlformats.org/drawingml/2006/picture">
                   <pic:nvPicPr>
-                    <pic:cNvPr id="2034895483" name=""/>
+                    <pic:cNvPr id="342127375" name=""/>
                     <pic:cNvPicPr/>
                   </pic:nvPicPr>
                   <pic:blipFill>
@@ -17727,7 +17727,7 @@
           <w:sz w:val="27"/>
         </w:rPr>
       </w:pPr>
-      <w:bookmarkStart w:id="35" w:name="_Toc239844079"/>
+      <w:bookmarkStart w:id="35" w:name="_Toc239847914"/>
       <w:r>
         <w:rPr>
           <w:rFonts w:ascii="Montserrat" w:hAnsi="Montserrat"/>
@@ -17767,16 +17767,16 @@
           <w:noProof/>
         </w:rPr>
         <w:drawing>
-          <wp:inline distT="0" distB="0" distL="0" distR="0" wp14:anchorId="3F56AA3E" wp14:editId="3D82EC80">
+          <wp:inline distT="0" distB="0" distL="0" distR="0" wp14:anchorId="4526A5E2" wp14:editId="4216979F">
             <wp:extent cx="5303520" cy="4792851"/>
             <wp:effectExtent l="19050" t="19050" r="11430" b="27305"/>
-            <wp:docPr id="160348411" name="Imagem 44"/>
+            <wp:docPr id="1024631369" name="Imagem 44"/>
             <wp:cNvGraphicFramePr/>
             <a:graphic xmlns:a="http://schemas.openxmlformats.org/drawingml/2006/main">
               <a:graphicData uri="http://schemas.openxmlformats.org/drawingml/2006/picture">
                 <pic:pic xmlns:pic="http://schemas.openxmlformats.org/drawingml/2006/picture">
                   <pic:nvPicPr>
-                    <pic:cNvPr id="160348411" name=""/>
+                    <pic:cNvPr id="1024631369" name=""/>
                     <pic:cNvPicPr/>
                   </pic:nvPicPr>
                   <pic:blipFill>
@@ -17844,7 +17844,7 @@
           <w:sz w:val="27"/>
         </w:rPr>
       </w:pPr>
-      <w:bookmarkStart w:id="36" w:name="_Toc239844080"/>
+      <w:bookmarkStart w:id="36" w:name="_Toc239847915"/>
       <w:r>
         <w:rPr>
           <w:rFonts w:ascii="Montserrat" w:hAnsi="Montserrat"/>
@@ -17885,16 +17885,16 @@
         </w:rPr>
         <w:lastRenderedPageBreak/>
         <w:drawing>
-          <wp:inline distT="0" distB="0" distL="0" distR="0" wp14:anchorId="1473F461" wp14:editId="4228C6F5">
+          <wp:inline distT="0" distB="0" distL="0" distR="0" wp14:anchorId="185B4787" wp14:editId="734A274C">
             <wp:extent cx="5303520" cy="4792851"/>
             <wp:effectExtent l="19050" t="19050" r="11430" b="27305"/>
-            <wp:docPr id="2047532790" name="Imagem 45"/>
+            <wp:docPr id="111536068" name="Imagem 45"/>
             <wp:cNvGraphicFramePr/>
             <a:graphic xmlns:a="http://schemas.openxmlformats.org/drawingml/2006/main">
               <a:graphicData uri="http://schemas.openxmlformats.org/drawingml/2006/picture">
                 <pic:pic xmlns:pic="http://schemas.openxmlformats.org/drawingml/2006/picture">
                   <pic:nvPicPr>
-                    <pic:cNvPr id="2047532790" name=""/>
+                    <pic:cNvPr id="111536068" name=""/>
                     <pic:cNvPicPr/>
                   </pic:nvPicPr>
                   <pic:blipFill>
@@ -17962,16 +17962,16 @@
         </w:rPr>
         <w:lastRenderedPageBreak/>
         <w:drawing>
-          <wp:inline distT="0" distB="0" distL="0" distR="0" wp14:anchorId="532CEFD5" wp14:editId="16025118">
+          <wp:inline distT="0" distB="0" distL="0" distR="0" wp14:anchorId="7B2F066C" wp14:editId="0506635E">
             <wp:extent cx="5303520" cy="4792851"/>
             <wp:effectExtent l="19050" t="19050" r="11430" b="27305"/>
-            <wp:docPr id="534837359" name="Imagem 46"/>
+            <wp:docPr id="2074928968" name="Imagem 46"/>
             <wp:cNvGraphicFramePr/>
             <a:graphic xmlns:a="http://schemas.openxmlformats.org/drawingml/2006/main">
               <a:graphicData uri="http://schemas.openxmlformats.org/drawingml/2006/picture">
                 <pic:pic xmlns:pic="http://schemas.openxmlformats.org/drawingml/2006/picture">
                   <pic:nvPicPr>
-                    <pic:cNvPr id="534837359" name=""/>
+                    <pic:cNvPr id="2074928968" name=""/>
                     <pic:cNvPicPr/>
                   </pic:nvPicPr>
                   <pic:blipFill>
@@ -18064,7 +18064,7 @@
           <w:sz w:val="34"/>
         </w:rPr>
       </w:pPr>
-      <w:bookmarkStart w:id="37" w:name="_Toc239844081"/>
+      <w:bookmarkStart w:id="37" w:name="_Toc239847916"/>
       <w:r>
         <w:rPr>
           <w:rFonts w:ascii="Montserrat" w:hAnsi="Montserrat"/>
@@ -18106,7 +18106,7 @@
           <w:sz w:val="27"/>
         </w:rPr>
       </w:pPr>
-      <w:bookmarkStart w:id="38" w:name="_Toc239844082"/>
+      <w:bookmarkStart w:id="38" w:name="_Toc239847917"/>
       <w:r>
         <w:rPr>
           <w:rFonts w:ascii="Montserrat" w:hAnsi="Montserrat"/>
@@ -18146,16 +18146,16 @@
           <w:noProof/>
         </w:rPr>
         <w:drawing>
-          <wp:inline distT="0" distB="0" distL="0" distR="0" wp14:anchorId="5C12BD56" wp14:editId="4F96DCE4">
+          <wp:inline distT="0" distB="0" distL="0" distR="0" wp14:anchorId="0EA24BC9" wp14:editId="623926F0">
             <wp:extent cx="5303520" cy="4792851"/>
             <wp:effectExtent l="19050" t="19050" r="11430" b="27305"/>
-            <wp:docPr id="2043399807" name="Imagem 47"/>
+            <wp:docPr id="837089918" name="Imagem 47"/>
             <wp:cNvGraphicFramePr/>
             <a:graphic xmlns:a="http://schemas.openxmlformats.org/drawingml/2006/main">
               <a:graphicData uri="http://schemas.openxmlformats.org/drawingml/2006/picture">
                 <pic:pic xmlns:pic="http://schemas.openxmlformats.org/drawingml/2006/picture">
                   <pic:nvPicPr>
-                    <pic:cNvPr id="2043399807" name=""/>
+                    <pic:cNvPr id="837089918" name=""/>
                     <pic:cNvPicPr/>
                   </pic:nvPicPr>
                   <pic:blipFill>
@@ -18302,7 +18302,7 @@
           <w:sz w:val="27"/>
         </w:rPr>
       </w:pPr>
-      <w:bookmarkStart w:id="39" w:name="_Toc239844083"/>
+      <w:bookmarkStart w:id="39" w:name="_Toc239847918"/>
       <w:r>
         <w:rPr>
           <w:rFonts w:ascii="Montserrat" w:hAnsi="Montserrat"/>
@@ -18343,16 +18343,16 @@
         </w:rPr>
         <w:lastRenderedPageBreak/>
         <w:drawing>
-          <wp:inline distT="0" distB="0" distL="0" distR="0" wp14:anchorId="6CAF807B" wp14:editId="299B43AB">
+          <wp:inline distT="0" distB="0" distL="0" distR="0" wp14:anchorId="5327D5FA" wp14:editId="2F3924BC">
             <wp:extent cx="5303520" cy="4792851"/>
             <wp:effectExtent l="19050" t="19050" r="11430" b="27305"/>
-            <wp:docPr id="62612261" name="Imagem 48"/>
+            <wp:docPr id="1281866737" name="Imagem 48"/>
             <wp:cNvGraphicFramePr/>
             <a:graphic xmlns:a="http://schemas.openxmlformats.org/drawingml/2006/main">
               <a:graphicData uri="http://schemas.openxmlformats.org/drawingml/2006/picture">
                 <pic:pic xmlns:pic="http://schemas.openxmlformats.org/drawingml/2006/picture">
                   <pic:nvPicPr>
-                    <pic:cNvPr id="62612261" name=""/>
+                    <pic:cNvPr id="1281866737" name=""/>
                     <pic:cNvPicPr/>
                   </pic:nvPicPr>
                   <pic:blipFill>
@@ -18420,7 +18420,7 @@
           <w:sz w:val="27"/>
         </w:rPr>
       </w:pPr>
-      <w:bookmarkStart w:id="40" w:name="_Toc239844084"/>
+      <w:bookmarkStart w:id="40" w:name="_Toc239847919"/>
       <w:r>
         <w:rPr>
           <w:rFonts w:ascii="Montserrat" w:hAnsi="Montserrat"/>
@@ -18461,16 +18461,16 @@
         </w:rPr>
         <w:lastRenderedPageBreak/>
         <w:drawing>
-          <wp:inline distT="0" distB="0" distL="0" distR="0" wp14:anchorId="2D334E28" wp14:editId="03B9D6DF">
+          <wp:inline distT="0" distB="0" distL="0" distR="0" wp14:anchorId="4C9E1B99" wp14:editId="01332D04">
             <wp:extent cx="5303520" cy="4792851"/>
             <wp:effectExtent l="19050" t="19050" r="11430" b="27305"/>
-            <wp:docPr id="1702722348" name="Imagem 49"/>
+            <wp:docPr id="1588685247" name="Imagem 49"/>
             <wp:cNvGraphicFramePr/>
             <a:graphic xmlns:a="http://schemas.openxmlformats.org/drawingml/2006/main">
               <a:graphicData uri="http://schemas.openxmlformats.org/drawingml/2006/picture">
                 <pic:pic xmlns:pic="http://schemas.openxmlformats.org/drawingml/2006/picture">
                   <pic:nvPicPr>
-                    <pic:cNvPr id="1702722348" name=""/>
+                    <pic:cNvPr id="1588685247" name=""/>
                     <pic:cNvPicPr/>
                   </pic:nvPicPr>
                   <pic:blipFill>
@@ -18614,7 +18614,7 @@
           <w:sz w:val="27"/>
         </w:rPr>
       </w:pPr>
-      <w:bookmarkStart w:id="41" w:name="_Toc239844085"/>
+      <w:bookmarkStart w:id="41" w:name="_Toc239847920"/>
       <w:r>
         <w:rPr>
           <w:rFonts w:ascii="Montserrat" w:hAnsi="Montserrat"/>
@@ -18775,16 +18775,16 @@
         </w:rPr>
         <w:lastRenderedPageBreak/>
         <w:drawing>
-          <wp:inline distT="0" distB="0" distL="0" distR="0" wp14:anchorId="0E352715" wp14:editId="54AA71CD">
+          <wp:inline distT="0" distB="0" distL="0" distR="0" wp14:anchorId="1284C54A" wp14:editId="634AF1BD">
             <wp:extent cx="5303520" cy="4267180"/>
             <wp:effectExtent l="19050" t="19050" r="11430" b="19685"/>
-            <wp:docPr id="304146826" name="Imagem 50"/>
+            <wp:docPr id="181020006" name="Imagem 50"/>
             <wp:cNvGraphicFramePr/>
             <a:graphic xmlns:a="http://schemas.openxmlformats.org/drawingml/2006/main">
               <a:graphicData uri="http://schemas.openxmlformats.org/drawingml/2006/picture">
                 <pic:pic xmlns:pic="http://schemas.openxmlformats.org/drawingml/2006/picture">
                   <pic:nvPicPr>
-                    <pic:cNvPr id="304146826" name=""/>
+                    <pic:cNvPr id="181020006" name=""/>
                     <pic:cNvPicPr/>
                   </pic:nvPicPr>
                   <pic:blipFill>
@@ -18852,16 +18852,16 @@
         </w:rPr>
         <w:lastRenderedPageBreak/>
         <w:drawing>
-          <wp:inline distT="0" distB="0" distL="0" distR="0" wp14:anchorId="26B67B19" wp14:editId="44C6D13D">
+          <wp:inline distT="0" distB="0" distL="0" distR="0" wp14:anchorId="56B0E415" wp14:editId="467993BC">
             <wp:extent cx="5303520" cy="3382059"/>
             <wp:effectExtent l="19050" t="19050" r="11430" b="27940"/>
-            <wp:docPr id="2124199729" name="Imagem 51"/>
+            <wp:docPr id="1012287196" name="Imagem 51"/>
             <wp:cNvGraphicFramePr/>
             <a:graphic xmlns:a="http://schemas.openxmlformats.org/drawingml/2006/main">
               <a:graphicData uri="http://schemas.openxmlformats.org/drawingml/2006/picture">
                 <pic:pic xmlns:pic="http://schemas.openxmlformats.org/drawingml/2006/picture">
                   <pic:nvPicPr>
-                    <pic:cNvPr id="2124199729" name=""/>
+                    <pic:cNvPr id="1012287196" name=""/>
                     <pic:cNvPicPr/>
                   </pic:nvPicPr>
                   <pic:blipFill>
@@ -18929,16 +18929,16 @@
         </w:rPr>
         <w:lastRenderedPageBreak/>
         <w:drawing>
-          <wp:inline distT="0" distB="0" distL="0" distR="0" wp14:anchorId="2F9B422F" wp14:editId="14B1C1FC">
+          <wp:inline distT="0" distB="0" distL="0" distR="0" wp14:anchorId="5397F96C" wp14:editId="4F3DFC52">
             <wp:extent cx="5303520" cy="4417800"/>
             <wp:effectExtent l="19050" t="19050" r="11430" b="20955"/>
-            <wp:docPr id="636472179" name="Imagem 52"/>
+            <wp:docPr id="691996541" name="Imagem 52"/>
             <wp:cNvGraphicFramePr/>
             <a:graphic xmlns:a="http://schemas.openxmlformats.org/drawingml/2006/main">
               <a:graphicData uri="http://schemas.openxmlformats.org/drawingml/2006/picture">
                 <pic:pic xmlns:pic="http://schemas.openxmlformats.org/drawingml/2006/picture">
                   <pic:nvPicPr>
-                    <pic:cNvPr id="636472179" name=""/>
+                    <pic:cNvPr id="691996541" name=""/>
                     <pic:cNvPicPr/>
                   </pic:nvPicPr>
                   <pic:blipFill>
@@ -19048,7 +19048,7 @@
           <w:sz w:val="27"/>
         </w:rPr>
       </w:pPr>
-      <w:bookmarkStart w:id="42" w:name="_Toc239844086"/>
+      <w:bookmarkStart w:id="42" w:name="_Toc239847921"/>
       <w:r>
         <w:rPr>
           <w:rFonts w:ascii="Montserrat" w:hAnsi="Montserrat"/>
@@ -19266,16 +19266,16 @@
         </w:rPr>
         <w:lastRenderedPageBreak/>
         <w:drawing>
-          <wp:inline distT="0" distB="0" distL="0" distR="0" wp14:anchorId="47B87C46" wp14:editId="516F1E59">
+          <wp:inline distT="0" distB="0" distL="0" distR="0" wp14:anchorId="61C969F7" wp14:editId="15F892E5">
             <wp:extent cx="5303520" cy="7628836"/>
             <wp:effectExtent l="19050" t="19050" r="11430" b="10795"/>
-            <wp:docPr id="1663583290" name="Imagem 53"/>
+            <wp:docPr id="269267044" name="Imagem 53"/>
             <wp:cNvGraphicFramePr/>
             <a:graphic xmlns:a="http://schemas.openxmlformats.org/drawingml/2006/main">
               <a:graphicData uri="http://schemas.openxmlformats.org/drawingml/2006/picture">
                 <pic:pic xmlns:pic="http://schemas.openxmlformats.org/drawingml/2006/picture">
                   <pic:nvPicPr>
-                    <pic:cNvPr id="1663583290" name=""/>
+                    <pic:cNvPr id="269267044" name=""/>
                     <pic:cNvPicPr/>
                   </pic:nvPicPr>
                   <pic:blipFill>
@@ -19386,7 +19386,7 @@
           <w:sz w:val="27"/>
         </w:rPr>
       </w:pPr>
-      <w:bookmarkStart w:id="43" w:name="_Toc239844087"/>
+      <w:bookmarkStart w:id="43" w:name="_Toc239847922"/>
       <w:r>
         <w:rPr>
           <w:rFonts w:ascii="Montserrat" w:hAnsi="Montserrat"/>
@@ -19539,7 +19539,7 @@
           <w:sz w:val="27"/>
         </w:rPr>
       </w:pPr>
-      <w:bookmarkStart w:id="44" w:name="_Toc239844088"/>
+      <w:bookmarkStart w:id="44" w:name="_Toc239847923"/>
       <w:r>
         <w:rPr>
           <w:rFonts w:ascii="Montserrat" w:hAnsi="Montserrat"/>
@@ -19832,16 +19832,16 @@
           <w:noProof/>
         </w:rPr>
         <w:drawing>
-          <wp:inline distT="0" distB="0" distL="0" distR="0" wp14:anchorId="4DC2F5F1" wp14:editId="00563AD7">
+          <wp:inline distT="0" distB="0" distL="0" distR="0" wp14:anchorId="132B5909" wp14:editId="17F3A9B2">
             <wp:extent cx="5303520" cy="1351384"/>
             <wp:effectExtent l="19050" t="19050" r="11430" b="20320"/>
-            <wp:docPr id="1459641474" name="Imagem 54"/>
+            <wp:docPr id="1677006029" name="Imagem 54"/>
             <wp:cNvGraphicFramePr/>
             <a:graphic xmlns:a="http://schemas.openxmlformats.org/drawingml/2006/main">
               <a:graphicData uri="http://schemas.openxmlformats.org/drawingml/2006/picture">
                 <pic:pic xmlns:pic="http://schemas.openxmlformats.org/drawingml/2006/picture">
                   <pic:nvPicPr>
-                    <pic:cNvPr id="1459641474" name=""/>
+                    <pic:cNvPr id="1677006029" name=""/>
                     <pic:cNvPicPr/>
                   </pic:nvPicPr>
                   <pic:blipFill>
@@ -19909,7 +19909,7 @@
           <w:sz w:val="27"/>
         </w:rPr>
       </w:pPr>
-      <w:bookmarkStart w:id="45" w:name="_Toc239844089"/>
+      <w:bookmarkStart w:id="45" w:name="_Toc239847924"/>
       <w:r>
         <w:rPr>
           <w:rFonts w:ascii="Montserrat" w:hAnsi="Montserrat"/>
@@ -20021,16 +20021,16 @@
           <w:noProof/>
         </w:rPr>
         <w:drawing>
-          <wp:inline distT="0" distB="0" distL="0" distR="0" wp14:anchorId="720C1A7A" wp14:editId="1B9EA377">
+          <wp:inline distT="0" distB="0" distL="0" distR="0" wp14:anchorId="5C2BF062" wp14:editId="03663994">
             <wp:extent cx="5303520" cy="1422793"/>
             <wp:effectExtent l="19050" t="19050" r="11430" b="25400"/>
-            <wp:docPr id="32523952" name="Imagem 55"/>
+            <wp:docPr id="1859223558" name="Imagem 55"/>
             <wp:cNvGraphicFramePr/>
             <a:graphic xmlns:a="http://schemas.openxmlformats.org/drawingml/2006/main">
               <a:graphicData uri="http://schemas.openxmlformats.org/drawingml/2006/picture">
                 <pic:pic xmlns:pic="http://schemas.openxmlformats.org/drawingml/2006/picture">
                   <pic:nvPicPr>
-                    <pic:cNvPr id="32523952" name=""/>
+                    <pic:cNvPr id="1859223558" name=""/>
                     <pic:cNvPicPr/>
                   </pic:nvPicPr>
                   <pic:blipFill>
@@ -20185,16 +20185,16 @@
           <w:noProof/>
         </w:rPr>
         <w:drawing>
-          <wp:inline distT="0" distB="0" distL="0" distR="0" wp14:anchorId="112957C6" wp14:editId="6C64BEEF">
+          <wp:inline distT="0" distB="0" distL="0" distR="0" wp14:anchorId="25540D45" wp14:editId="498DD31B">
             <wp:extent cx="5303520" cy="1841050"/>
             <wp:effectExtent l="19050" t="19050" r="11430" b="26035"/>
-            <wp:docPr id="1878057802" name="Imagem 56"/>
+            <wp:docPr id="2029845763" name="Imagem 56"/>
             <wp:cNvGraphicFramePr/>
             <a:graphic xmlns:a="http://schemas.openxmlformats.org/drawingml/2006/main">
               <a:graphicData uri="http://schemas.openxmlformats.org/drawingml/2006/picture">
                 <pic:pic xmlns:pic="http://schemas.openxmlformats.org/drawingml/2006/picture">
                   <pic:nvPicPr>
-                    <pic:cNvPr id="1878057802" name=""/>
+                    <pic:cNvPr id="2029845763" name=""/>
                     <pic:cNvPicPr/>
                   </pic:nvPicPr>
                   <pic:blipFill>
@@ -20357,16 +20357,16 @@
           <w:noProof/>
         </w:rPr>
         <w:drawing>
-          <wp:inline distT="0" distB="0" distL="0" distR="0" wp14:anchorId="5F3B22A5" wp14:editId="38D2B886">
+          <wp:inline distT="0" distB="0" distL="0" distR="0" wp14:anchorId="77ED0144" wp14:editId="430B4DAD">
             <wp:extent cx="5303520" cy="303041"/>
             <wp:effectExtent l="19050" t="19050" r="11430" b="20955"/>
-            <wp:docPr id="757079993" name="Imagem 57"/>
+            <wp:docPr id="1105315126" name="Imagem 57"/>
             <wp:cNvGraphicFramePr/>
             <a:graphic xmlns:a="http://schemas.openxmlformats.org/drawingml/2006/main">
               <a:graphicData uri="http://schemas.openxmlformats.org/drawingml/2006/picture">
                 <pic:pic xmlns:pic="http://schemas.openxmlformats.org/drawingml/2006/picture">
                   <pic:nvPicPr>
-                    <pic:cNvPr id="757079993" name=""/>
+                    <pic:cNvPr id="1105315126" name=""/>
                     <pic:cNvPicPr/>
                   </pic:nvPicPr>
                   <pic:blipFill>
@@ -20433,16 +20433,16 @@
           <w:noProof/>
         </w:rPr>
         <w:drawing>
-          <wp:inline distT="0" distB="0" distL="0" distR="0" wp14:anchorId="56C34E3D" wp14:editId="7189F8E5">
+          <wp:inline distT="0" distB="0" distL="0" distR="0" wp14:anchorId="52B0F1EA" wp14:editId="3348581F">
             <wp:extent cx="5303520" cy="2983005"/>
             <wp:effectExtent l="19050" t="19050" r="11430" b="27305"/>
-            <wp:docPr id="833991181" name="Imagem 58"/>
+            <wp:docPr id="1405935389" name="Imagem 58"/>
             <wp:cNvGraphicFramePr/>
             <a:graphic xmlns:a="http://schemas.openxmlformats.org/drawingml/2006/main">
               <a:graphicData uri="http://schemas.openxmlformats.org/drawingml/2006/picture">
                 <pic:pic xmlns:pic="http://schemas.openxmlformats.org/drawingml/2006/picture">
                   <pic:nvPicPr>
-                    <pic:cNvPr id="833991181" name=""/>
+                    <pic:cNvPr id="1405935389" name=""/>
                     <pic:cNvPicPr/>
                   </pic:nvPicPr>
                   <pic:blipFill>
@@ -20514,7 +20514,7 @@
           <w:sz w:val="34"/>
         </w:rPr>
       </w:pPr>
-      <w:bookmarkStart w:id="46" w:name="_Toc239844090"/>
+      <w:bookmarkStart w:id="46" w:name="_Toc239847925"/>
       <w:r>
         <w:rPr>
           <w:rFonts w:ascii="Montserrat" w:hAnsi="Montserrat"/>
@@ -20758,7 +20758,7 @@
           <w:sz w:val="34"/>
         </w:rPr>
       </w:pPr>
-      <w:bookmarkStart w:id="47" w:name="_Toc239844091"/>
+      <w:bookmarkStart w:id="47" w:name="_Toc239847926"/>
       <w:r>
         <w:rPr>
           <w:rFonts w:ascii="Montserrat" w:hAnsi="Montserrat"/>
@@ -22546,7 +22546,7 @@
 <file path=word/numbering.xml><?xml version="1.0" encoding="utf-8"?>
 <w:numbering xmlns:wpc="http://schemas.microsoft.com/office/word/2010/wordprocessingCanvas" xmlns:cx="http://schemas.microsoft.com/office/drawing/2014/chartex" xmlns:cx1="http://schemas.microsoft.com/office/drawing/2015/9/8/chartex" xmlns:cx2="http://schemas.microsoft.com/office/drawing/2015/10/21/chartex" xmlns:cx3="http://schemas.microsoft.com/office/drawing/2016/5/9/chartex" xmlns:cx4="http://schemas.microsoft.com/office/drawing/2016/5/10/chartex" xmlns:cx5="http://schemas.microsoft.com/office/drawing/2016/5/11/chartex" xmlns:cx6="http://schemas.microsoft.com/office/drawing/2016/5/12/chartex" xmlns:cx7="http://schemas.microsoft.com/office/drawing/2016/5/13/chartex" xmlns:cx8="http://schemas.microsoft.com/office/drawing/2016/5/14/chartex" xmlns:mc="http://schemas.openxmlformats.org/markup-compatibility/2006" xmlns:aink="http://schemas.microsoft.com/office/drawing/2016/ink" xmlns:am3d="http://schemas.microsoft.com/office/drawing/2017/model3d" xmlns:o="urn:schemas-microsoft-com:office:office" xmlns:oel="http://schemas.microsoft.com/office/2019/extlst" xmlns:r="http://schemas.openxmlformats.org/officeDocument/2006/relationships" xmlns:m="http://schemas.openxmlformats.org/officeDocument/2006/math" xmlns:v="urn:schemas-microsoft-com:vml" xmlns:wp14="http://schemas.microsoft.com/office/word/2010/wordprocessingDrawing" xmlns:wp="http://schemas.openxmlformats.org/drawingml/2006/wordprocessingDrawing" xmlns:w10="urn:schemas-microsoft-com:office:word" xmlns:w="http://schemas.openxmlformats.org/wordprocessingml/2006/main" xmlns:w14="http://schemas.microsoft.com/office/word/2010/wordml" xmlns:w15="http://schemas.microsoft.com/office/word/2012/wordml" xmlns:w16cex="http://schemas.microsoft.com/office/word/2018/wordml/cex" xmlns:w16cid="http://schemas.microsoft.com/office/word/2016/wordml/cid" xmlns:w16="http://schemas.microsoft.com/office/word/2018/wordml" xmlns:w16du="http://schemas.microsoft.com/office/word/2023/wordml/word16du" xmlns:w16sdtdh="http://schemas.microsoft.com/office/word/2020/wordml/sdtdatahash" xmlns:w16sdtfl="http://schemas.microsoft.com/office/word/2024/wordml/sdtformatlock" xmlns:w16se="http://schemas.microsoft.com/office/word/2015/wordml/symex" xmlns:wpg="http://schemas.microsoft.com/office/word/2010/wordprocessingGroup" xmlns:wpi="http://schemas.microsoft.com/office/word/2010/wordprocessingInk" xmlns:wne="http://schemas.microsoft.com/office/word/2006/wordml" xmlns:wps="http://schemas.microsoft.com/office/word/2010/wordprocessingShape" mc:Ignorable="w14 w15 w16se w16cid w16 w16cex w16sdtdh w16sdtfl w16du wp14">
   <w:abstractNum w:abstractNumId="0" w15:restartNumberingAfterBreak="0">
-    <w:nsid w:val="070F6BFE"/>
+    <w:nsid w:val="01B82D78"/>
     <w:multiLevelType w:val="singleLevel"/>
     <w:tmpl w:val="04160001"/>
     <w:lvl w:ilvl="0">
@@ -22563,7 +22563,7 @@
     </w:lvl>
   </w:abstractNum>
   <w:abstractNum w:abstractNumId="1" w15:restartNumberingAfterBreak="0">
-    <w:nsid w:val="0A807519"/>
+    <w:nsid w:val="02687251"/>
     <w:multiLevelType w:val="singleLevel"/>
     <w:tmpl w:val="04160001"/>
     <w:lvl w:ilvl="0">
@@ -22580,7 +22580,7 @@
     </w:lvl>
   </w:abstractNum>
   <w:abstractNum w:abstractNumId="2" w15:restartNumberingAfterBreak="0">
-    <w:nsid w:val="0FD7665C"/>
+    <w:nsid w:val="031314AA"/>
     <w:multiLevelType w:val="singleLevel"/>
     <w:tmpl w:val="04160001"/>
     <w:lvl w:ilvl="0">
@@ -22597,7 +22597,7 @@
     </w:lvl>
   </w:abstractNum>
   <w:abstractNum w:abstractNumId="3" w15:restartNumberingAfterBreak="0">
-    <w:nsid w:val="159B0923"/>
+    <w:nsid w:val="04137289"/>
     <w:multiLevelType w:val="singleLevel"/>
     <w:tmpl w:val="04160001"/>
     <w:lvl w:ilvl="0">
@@ -22614,7 +22614,7 @@
     </w:lvl>
   </w:abstractNum>
   <w:abstractNum w:abstractNumId="4" w15:restartNumberingAfterBreak="0">
-    <w:nsid w:val="15BB5D96"/>
+    <w:nsid w:val="09623020"/>
     <w:multiLevelType w:val="singleLevel"/>
     <w:tmpl w:val="04160001"/>
     <w:lvl w:ilvl="0">
@@ -22631,7 +22631,7 @@
     </w:lvl>
   </w:abstractNum>
   <w:abstractNum w:abstractNumId="5" w15:restartNumberingAfterBreak="0">
-    <w:nsid w:val="1B3B5140"/>
+    <w:nsid w:val="0AB91DFF"/>
     <w:multiLevelType w:val="singleLevel"/>
     <w:tmpl w:val="04160001"/>
     <w:lvl w:ilvl="0">
@@ -22648,7 +22648,7 @@
     </w:lvl>
   </w:abstractNum>
   <w:abstractNum w:abstractNumId="6" w15:restartNumberingAfterBreak="0">
-    <w:nsid w:val="1E1A7F6B"/>
+    <w:nsid w:val="0BF024C0"/>
     <w:multiLevelType w:val="singleLevel"/>
     <w:tmpl w:val="04160001"/>
     <w:lvl w:ilvl="0">
@@ -22665,7 +22665,7 @@
     </w:lvl>
   </w:abstractNum>
   <w:abstractNum w:abstractNumId="7" w15:restartNumberingAfterBreak="0">
-    <w:nsid w:val="269A0BEB"/>
+    <w:nsid w:val="0D2865B2"/>
     <w:multiLevelType w:val="singleLevel"/>
     <w:tmpl w:val="04160001"/>
     <w:lvl w:ilvl="0">
@@ -22682,7 +22682,7 @@
     </w:lvl>
   </w:abstractNum>
   <w:abstractNum w:abstractNumId="8" w15:restartNumberingAfterBreak="0">
-    <w:nsid w:val="26E976A6"/>
+    <w:nsid w:val="163F22D2"/>
     <w:multiLevelType w:val="singleLevel"/>
     <w:tmpl w:val="04160001"/>
     <w:lvl w:ilvl="0">
@@ -22699,7 +22699,7 @@
     </w:lvl>
   </w:abstractNum>
   <w:abstractNum w:abstractNumId="9" w15:restartNumberingAfterBreak="0">
-    <w:nsid w:val="271465AA"/>
+    <w:nsid w:val="19A7419B"/>
     <w:multiLevelType w:val="singleLevel"/>
     <w:tmpl w:val="04160001"/>
     <w:lvl w:ilvl="0">
@@ -22716,7 +22716,7 @@
     </w:lvl>
   </w:abstractNum>
   <w:abstractNum w:abstractNumId="10" w15:restartNumberingAfterBreak="0">
-    <w:nsid w:val="273B4DAA"/>
+    <w:nsid w:val="229E41D9"/>
     <w:multiLevelType w:val="singleLevel"/>
     <w:tmpl w:val="04160001"/>
     <w:lvl w:ilvl="0">
@@ -22733,7 +22733,7 @@
     </w:lvl>
   </w:abstractNum>
   <w:abstractNum w:abstractNumId="11" w15:restartNumberingAfterBreak="0">
-    <w:nsid w:val="34056FAB"/>
+    <w:nsid w:val="23791F8F"/>
     <w:multiLevelType w:val="singleLevel"/>
     <w:tmpl w:val="04160001"/>
     <w:lvl w:ilvl="0">
@@ -22750,7 +22750,7 @@
     </w:lvl>
   </w:abstractNum>
   <w:abstractNum w:abstractNumId="12" w15:restartNumberingAfterBreak="0">
-    <w:nsid w:val="349A3829"/>
+    <w:nsid w:val="2A00773D"/>
     <w:multiLevelType w:val="singleLevel"/>
     <w:tmpl w:val="04160001"/>
     <w:lvl w:ilvl="0">
@@ -22767,7 +22767,7 @@
     </w:lvl>
   </w:abstractNum>
   <w:abstractNum w:abstractNumId="13" w15:restartNumberingAfterBreak="0">
-    <w:nsid w:val="38846C65"/>
+    <w:nsid w:val="2CE34908"/>
     <w:multiLevelType w:val="singleLevel"/>
     <w:tmpl w:val="04160001"/>
     <w:lvl w:ilvl="0">
@@ -22784,7 +22784,7 @@
     </w:lvl>
   </w:abstractNum>
   <w:abstractNum w:abstractNumId="14" w15:restartNumberingAfterBreak="0">
-    <w:nsid w:val="3985598B"/>
+    <w:nsid w:val="2F226546"/>
     <w:multiLevelType w:val="singleLevel"/>
     <w:tmpl w:val="04160001"/>
     <w:lvl w:ilvl="0">
@@ -22801,7 +22801,7 @@
     </w:lvl>
   </w:abstractNum>
   <w:abstractNum w:abstractNumId="15" w15:restartNumberingAfterBreak="0">
-    <w:nsid w:val="3BA32CB8"/>
+    <w:nsid w:val="318D1A70"/>
     <w:multiLevelType w:val="singleLevel"/>
     <w:tmpl w:val="04160001"/>
     <w:lvl w:ilvl="0">
@@ -22818,7 +22818,7 @@
     </w:lvl>
   </w:abstractNum>
   <w:abstractNum w:abstractNumId="16" w15:restartNumberingAfterBreak="0">
-    <w:nsid w:val="3FE60E4F"/>
+    <w:nsid w:val="327E5148"/>
     <w:multiLevelType w:val="singleLevel"/>
     <w:tmpl w:val="04160001"/>
     <w:lvl w:ilvl="0">
@@ -22835,7 +22835,7 @@
     </w:lvl>
   </w:abstractNum>
   <w:abstractNum w:abstractNumId="17" w15:restartNumberingAfterBreak="0">
-    <w:nsid w:val="43A13CE6"/>
+    <w:nsid w:val="367D0845"/>
     <w:multiLevelType w:val="singleLevel"/>
     <w:tmpl w:val="04160001"/>
     <w:lvl w:ilvl="0">
@@ -22852,7 +22852,7 @@
     </w:lvl>
   </w:abstractNum>
   <w:abstractNum w:abstractNumId="18" w15:restartNumberingAfterBreak="0">
-    <w:nsid w:val="46113017"/>
+    <w:nsid w:val="3AFF15C4"/>
     <w:multiLevelType w:val="singleLevel"/>
     <w:tmpl w:val="04160001"/>
     <w:lvl w:ilvl="0">
@@ -22869,7 +22869,7 @@
     </w:lvl>
   </w:abstractNum>
   <w:abstractNum w:abstractNumId="19" w15:restartNumberingAfterBreak="0">
-    <w:nsid w:val="4B2768E7"/>
+    <w:nsid w:val="3D401069"/>
     <w:multiLevelType w:val="singleLevel"/>
     <w:tmpl w:val="04160001"/>
     <w:lvl w:ilvl="0">
@@ -22886,7 +22886,7 @@
     </w:lvl>
   </w:abstractNum>
   <w:abstractNum w:abstractNumId="20" w15:restartNumberingAfterBreak="0">
-    <w:nsid w:val="4DB56342"/>
+    <w:nsid w:val="48B625EF"/>
     <w:multiLevelType w:val="singleLevel"/>
     <w:tmpl w:val="04160001"/>
     <w:lvl w:ilvl="0">
@@ -22903,7 +22903,7 @@
     </w:lvl>
   </w:abstractNum>
   <w:abstractNum w:abstractNumId="21" w15:restartNumberingAfterBreak="0">
-    <w:nsid w:val="509816C2"/>
+    <w:nsid w:val="498D7120"/>
     <w:multiLevelType w:val="singleLevel"/>
     <w:tmpl w:val="04160001"/>
     <w:lvl w:ilvl="0">
@@ -22920,7 +22920,7 @@
     </w:lvl>
   </w:abstractNum>
   <w:abstractNum w:abstractNumId="22" w15:restartNumberingAfterBreak="0">
-    <w:nsid w:val="517F29E4"/>
+    <w:nsid w:val="4CB44CB5"/>
     <w:multiLevelType w:val="singleLevel"/>
     <w:tmpl w:val="04160001"/>
     <w:lvl w:ilvl="0">
@@ -22937,7 +22937,7 @@
     </w:lvl>
   </w:abstractNum>
   <w:abstractNum w:abstractNumId="23" w15:restartNumberingAfterBreak="0">
-    <w:nsid w:val="5B480FEB"/>
+    <w:nsid w:val="4D7D6CD3"/>
     <w:multiLevelType w:val="singleLevel"/>
     <w:tmpl w:val="04160001"/>
     <w:lvl w:ilvl="0">
@@ -22954,7 +22954,7 @@
     </w:lvl>
   </w:abstractNum>
   <w:abstractNum w:abstractNumId="24" w15:restartNumberingAfterBreak="0">
-    <w:nsid w:val="5BAA480A"/>
+    <w:nsid w:val="4D895659"/>
     <w:multiLevelType w:val="singleLevel"/>
     <w:tmpl w:val="04160001"/>
     <w:lvl w:ilvl="0">
@@ -22971,7 +22971,7 @@
     </w:lvl>
   </w:abstractNum>
   <w:abstractNum w:abstractNumId="25" w15:restartNumberingAfterBreak="0">
-    <w:nsid w:val="5CE75EAC"/>
+    <w:nsid w:val="4E5A2091"/>
     <w:multiLevelType w:val="singleLevel"/>
     <w:tmpl w:val="04160001"/>
     <w:lvl w:ilvl="0">
@@ -22988,7 +22988,7 @@
     </w:lvl>
   </w:abstractNum>
   <w:abstractNum w:abstractNumId="26" w15:restartNumberingAfterBreak="0">
-    <w:nsid w:val="5F35303B"/>
+    <w:nsid w:val="4FC20B32"/>
     <w:multiLevelType w:val="singleLevel"/>
     <w:tmpl w:val="04160001"/>
     <w:lvl w:ilvl="0">
@@ -23005,7 +23005,7 @@
     </w:lvl>
   </w:abstractNum>
   <w:abstractNum w:abstractNumId="27" w15:restartNumberingAfterBreak="0">
-    <w:nsid w:val="618E4250"/>
+    <w:nsid w:val="517A78AC"/>
     <w:multiLevelType w:val="singleLevel"/>
     <w:tmpl w:val="04160001"/>
     <w:lvl w:ilvl="0">
@@ -23022,7 +23022,7 @@
     </w:lvl>
   </w:abstractNum>
   <w:abstractNum w:abstractNumId="28" w15:restartNumberingAfterBreak="0">
-    <w:nsid w:val="64A60174"/>
+    <w:nsid w:val="520C5A57"/>
     <w:multiLevelType w:val="singleLevel"/>
     <w:tmpl w:val="04160001"/>
     <w:lvl w:ilvl="0">
@@ -23039,7 +23039,7 @@
     </w:lvl>
   </w:abstractNum>
   <w:abstractNum w:abstractNumId="29" w15:restartNumberingAfterBreak="0">
-    <w:nsid w:val="6BD16CE9"/>
+    <w:nsid w:val="58383435"/>
     <w:multiLevelType w:val="singleLevel"/>
     <w:tmpl w:val="04160001"/>
     <w:lvl w:ilvl="0">
@@ -23056,7 +23056,7 @@
     </w:lvl>
   </w:abstractNum>
   <w:abstractNum w:abstractNumId="30" w15:restartNumberingAfterBreak="0">
-    <w:nsid w:val="6E852389"/>
+    <w:nsid w:val="5F033EE5"/>
     <w:multiLevelType w:val="singleLevel"/>
     <w:tmpl w:val="04160001"/>
     <w:lvl w:ilvl="0">
@@ -23073,7 +23073,7 @@
     </w:lvl>
   </w:abstractNum>
   <w:abstractNum w:abstractNumId="31" w15:restartNumberingAfterBreak="0">
-    <w:nsid w:val="70815342"/>
+    <w:nsid w:val="73EC7450"/>
     <w:multiLevelType w:val="singleLevel"/>
     <w:tmpl w:val="04160001"/>
     <w:lvl w:ilvl="0">
@@ -23090,7 +23090,7 @@
     </w:lvl>
   </w:abstractNum>
   <w:abstractNum w:abstractNumId="32" w15:restartNumberingAfterBreak="0">
-    <w:nsid w:val="74EC5DE5"/>
+    <w:nsid w:val="78F644E4"/>
     <w:multiLevelType w:val="singleLevel"/>
     <w:tmpl w:val="04160001"/>
     <w:lvl w:ilvl="0">
@@ -23106,104 +23106,104 @@
       </w:rPr>
     </w:lvl>
   </w:abstractNum>
-  <w:num w:numId="1" w16cid:durableId="211158767">
+  <w:num w:numId="1" w16cid:durableId="1354267299">
     <w:abstractNumId w:val="9"/>
   </w:num>
-  <w:num w:numId="2" w16cid:durableId="1273048559">
+  <w:num w:numId="2" w16cid:durableId="837889814">
+    <w:abstractNumId w:val="8"/>
+  </w:num>
+  <w:num w:numId="3" w16cid:durableId="465121983">
+    <w:abstractNumId w:val="32"/>
+  </w:num>
+  <w:num w:numId="4" w16cid:durableId="40134757">
+    <w:abstractNumId w:val="21"/>
+  </w:num>
+  <w:num w:numId="5" w16cid:durableId="1023553367">
+    <w:abstractNumId w:val="29"/>
+  </w:num>
+  <w:num w:numId="6" w16cid:durableId="502011823">
+    <w:abstractNumId w:val="26"/>
+  </w:num>
+  <w:num w:numId="7" w16cid:durableId="136844400">
+    <w:abstractNumId w:val="20"/>
+  </w:num>
+  <w:num w:numId="8" w16cid:durableId="294795241">
+    <w:abstractNumId w:val="17"/>
+  </w:num>
+  <w:num w:numId="9" w16cid:durableId="202140412">
+    <w:abstractNumId w:val="2"/>
+  </w:num>
+  <w:num w:numId="10" w16cid:durableId="1425345269">
+    <w:abstractNumId w:val="6"/>
+  </w:num>
+  <w:num w:numId="11" w16cid:durableId="845246343">
     <w:abstractNumId w:val="30"/>
   </w:num>
-  <w:num w:numId="3" w16cid:durableId="1832135074">
+  <w:num w:numId="12" w16cid:durableId="657656173">
+    <w:abstractNumId w:val="27"/>
+  </w:num>
+  <w:num w:numId="13" w16cid:durableId="72701040">
+    <w:abstractNumId w:val="1"/>
+  </w:num>
+  <w:num w:numId="14" w16cid:durableId="1043023460">
+    <w:abstractNumId w:val="15"/>
+  </w:num>
+  <w:num w:numId="15" w16cid:durableId="353725654">
+    <w:abstractNumId w:val="10"/>
+  </w:num>
+  <w:num w:numId="16" w16cid:durableId="518205224">
+    <w:abstractNumId w:val="28"/>
+  </w:num>
+  <w:num w:numId="17" w16cid:durableId="1533416095">
+    <w:abstractNumId w:val="3"/>
+  </w:num>
+  <w:num w:numId="18" w16cid:durableId="1855876350">
+    <w:abstractNumId w:val="4"/>
+  </w:num>
+  <w:num w:numId="19" w16cid:durableId="366755166">
+    <w:abstractNumId w:val="5"/>
+  </w:num>
+  <w:num w:numId="20" w16cid:durableId="1267810729">
+    <w:abstractNumId w:val="16"/>
+  </w:num>
+  <w:num w:numId="21" w16cid:durableId="1044521835">
     <w:abstractNumId w:val="31"/>
   </w:num>
-  <w:num w:numId="4" w16cid:durableId="531457032">
+  <w:num w:numId="22" w16cid:durableId="1492599630">
+    <w:abstractNumId w:val="19"/>
+  </w:num>
+  <w:num w:numId="23" w16cid:durableId="234584266">
+    <w:abstractNumId w:val="12"/>
+  </w:num>
+  <w:num w:numId="24" w16cid:durableId="558705844">
+    <w:abstractNumId w:val="11"/>
+  </w:num>
+  <w:num w:numId="25" w16cid:durableId="171141839">
+    <w:abstractNumId w:val="23"/>
+  </w:num>
+  <w:num w:numId="26" w16cid:durableId="229004348">
     <w:abstractNumId w:val="22"/>
   </w:num>
-  <w:num w:numId="5" w16cid:durableId="746802699">
+  <w:num w:numId="27" w16cid:durableId="468473111">
+    <w:abstractNumId w:val="13"/>
+  </w:num>
+  <w:num w:numId="28" w16cid:durableId="1469401518">
+    <w:abstractNumId w:val="24"/>
+  </w:num>
+  <w:num w:numId="29" w16cid:durableId="437912676">
+    <w:abstractNumId w:val="7"/>
+  </w:num>
+  <w:num w:numId="30" w16cid:durableId="1292516360">
+    <w:abstractNumId w:val="25"/>
+  </w:num>
+  <w:num w:numId="31" w16cid:durableId="1956131032">
+    <w:abstractNumId w:val="0"/>
+  </w:num>
+  <w:num w:numId="32" w16cid:durableId="1888225975">
     <w:abstractNumId w:val="14"/>
   </w:num>
-  <w:num w:numId="6" w16cid:durableId="1115757148">
-    <w:abstractNumId w:val="29"/>
-  </w:num>
-  <w:num w:numId="7" w16cid:durableId="2071998102">
-    <w:abstractNumId w:val="24"/>
-  </w:num>
-  <w:num w:numId="8" w16cid:durableId="1732071504">
-    <w:abstractNumId w:val="25"/>
-  </w:num>
-  <w:num w:numId="9" w16cid:durableId="1577008130">
-    <w:abstractNumId w:val="21"/>
-  </w:num>
-  <w:num w:numId="10" w16cid:durableId="1385445501">
-    <w:abstractNumId w:val="23"/>
-  </w:num>
-  <w:num w:numId="11" w16cid:durableId="2033260456">
-    <w:abstractNumId w:val="12"/>
-  </w:num>
-  <w:num w:numId="12" w16cid:durableId="1268737288">
-    <w:abstractNumId w:val="10"/>
-  </w:num>
-  <w:num w:numId="13" w16cid:durableId="971787937">
-    <w:abstractNumId w:val="20"/>
-  </w:num>
-  <w:num w:numId="14" w16cid:durableId="1133136588">
-    <w:abstractNumId w:val="8"/>
-  </w:num>
-  <w:num w:numId="15" w16cid:durableId="43068758">
-    <w:abstractNumId w:val="0"/>
-  </w:num>
-  <w:num w:numId="16" w16cid:durableId="1345984541">
-    <w:abstractNumId w:val="11"/>
-  </w:num>
-  <w:num w:numId="17" w16cid:durableId="256792051">
-    <w:abstractNumId w:val="6"/>
-  </w:num>
-  <w:num w:numId="18" w16cid:durableId="1390617073">
-    <w:abstractNumId w:val="17"/>
-  </w:num>
-  <w:num w:numId="19" w16cid:durableId="1495298193">
-    <w:abstractNumId w:val="16"/>
-  </w:num>
-  <w:num w:numId="20" w16cid:durableId="825323770">
-    <w:abstractNumId w:val="28"/>
-  </w:num>
-  <w:num w:numId="21" w16cid:durableId="165825291">
-    <w:abstractNumId w:val="13"/>
-  </w:num>
-  <w:num w:numId="22" w16cid:durableId="1189105421">
-    <w:abstractNumId w:val="27"/>
-  </w:num>
-  <w:num w:numId="23" w16cid:durableId="1778868971">
-    <w:abstractNumId w:val="7"/>
-  </w:num>
-  <w:num w:numId="24" w16cid:durableId="1759213222">
-    <w:abstractNumId w:val="4"/>
-  </w:num>
-  <w:num w:numId="25" w16cid:durableId="1869372062">
-    <w:abstractNumId w:val="5"/>
-  </w:num>
-  <w:num w:numId="26" w16cid:durableId="859975185">
-    <w:abstractNumId w:val="1"/>
-  </w:num>
-  <w:num w:numId="27" w16cid:durableId="558639846">
-    <w:abstractNumId w:val="32"/>
-  </w:num>
-  <w:num w:numId="28" w16cid:durableId="728262003">
-    <w:abstractNumId w:val="19"/>
-  </w:num>
-  <w:num w:numId="29" w16cid:durableId="1590652019">
-    <w:abstractNumId w:val="15"/>
-  </w:num>
-  <w:num w:numId="30" w16cid:durableId="1187597829">
-    <w:abstractNumId w:val="26"/>
-  </w:num>
-  <w:num w:numId="31" w16cid:durableId="466240621">
+  <w:num w:numId="33" w16cid:durableId="662053027">
     <w:abstractNumId w:val="18"/>
-  </w:num>
-  <w:num w:numId="32" w16cid:durableId="901676357">
-    <w:abstractNumId w:val="3"/>
-  </w:num>
-  <w:num w:numId="33" w16cid:durableId="1440370946">
-    <w:abstractNumId w:val="2"/>
   </w:num>
 </w:numbering>
 </file>
@@ -23616,7 +23616,7 @@
     <w:link w:val="Ttulo1Char"/>
     <w:uiPriority w:val="9"/>
     <w:qFormat/>
-    <w:rsid w:val="00435DA3"/>
+    <w:rsid w:val="00452E99"/>
     <w:pPr>
       <w:keepNext/>
       <w:keepLines/>
@@ -23638,7 +23638,7 @@
     <w:uiPriority w:val="9"/>
     <w:unhideWhenUsed/>
     <w:qFormat/>
-    <w:rsid w:val="00435DA3"/>
+    <w:rsid w:val="00452E99"/>
     <w:pPr>
       <w:keepNext/>
       <w:keepLines/>
@@ -23661,7 +23661,7 @@
     <w:semiHidden/>
     <w:unhideWhenUsed/>
     <w:qFormat/>
-    <w:rsid w:val="00435DA3"/>
+    <w:rsid w:val="00452E99"/>
     <w:pPr>
       <w:keepNext/>
       <w:keepLines/>
@@ -23684,7 +23684,7 @@
     <w:semiHidden/>
     <w:unhideWhenUsed/>
     <w:qFormat/>
-    <w:rsid w:val="00435DA3"/>
+    <w:rsid w:val="00452E99"/>
     <w:pPr>
       <w:keepNext/>
       <w:keepLines/>
@@ -23707,7 +23707,7 @@
     <w:semiHidden/>
     <w:unhideWhenUsed/>
     <w:qFormat/>
-    <w:rsid w:val="00435DA3"/>
+    <w:rsid w:val="00452E99"/>
     <w:pPr>
       <w:keepNext/>
       <w:keepLines/>
@@ -23728,7 +23728,7 @@
     <w:semiHidden/>
     <w:unhideWhenUsed/>
     <w:qFormat/>
-    <w:rsid w:val="00435DA3"/>
+    <w:rsid w:val="00452E99"/>
     <w:pPr>
       <w:keepNext/>
       <w:keepLines/>
@@ -23751,7 +23751,7 @@
     <w:semiHidden/>
     <w:unhideWhenUsed/>
     <w:qFormat/>
-    <w:rsid w:val="00435DA3"/>
+    <w:rsid w:val="00452E99"/>
     <w:pPr>
       <w:keepNext/>
       <w:keepLines/>
@@ -23772,7 +23772,7 @@
     <w:semiHidden/>
     <w:unhideWhenUsed/>
     <w:qFormat/>
-    <w:rsid w:val="00435DA3"/>
+    <w:rsid w:val="00452E99"/>
     <w:pPr>
       <w:keepNext/>
       <w:keepLines/>
@@ -23795,7 +23795,7 @@
     <w:semiHidden/>
     <w:unhideWhenUsed/>
     <w:qFormat/>
-    <w:rsid w:val="00435DA3"/>
+    <w:rsid w:val="00452E99"/>
     <w:pPr>
       <w:keepNext/>
       <w:keepLines/>
@@ -23839,7 +23839,7 @@
     <w:basedOn w:val="Fontepargpadro"/>
     <w:link w:val="Ttulo1"/>
     <w:uiPriority w:val="9"/>
-    <w:rsid w:val="00435DA3"/>
+    <w:rsid w:val="00452E99"/>
     <w:rPr>
       <w:rFonts w:asciiTheme="majorHAnsi" w:eastAsiaTheme="majorEastAsia" w:hAnsiTheme="majorHAnsi" w:cstheme="majorBidi"/>
       <w:color w:val="0F4761" w:themeColor="accent1" w:themeShade="BF"/>
@@ -23852,7 +23852,7 @@
     <w:basedOn w:val="Fontepargpadro"/>
     <w:link w:val="Ttulo2"/>
     <w:uiPriority w:val="9"/>
-    <w:rsid w:val="00435DA3"/>
+    <w:rsid w:val="00452E99"/>
     <w:rPr>
       <w:rFonts w:asciiTheme="majorHAnsi" w:eastAsiaTheme="majorEastAsia" w:hAnsiTheme="majorHAnsi" w:cstheme="majorBidi"/>
       <w:color w:val="0F4761" w:themeColor="accent1" w:themeShade="BF"/>
@@ -23866,7 +23866,7 @@
     <w:link w:val="Ttulo3"/>
     <w:uiPriority w:val="9"/>
     <w:semiHidden/>
-    <w:rsid w:val="00435DA3"/>
+    <w:rsid w:val="00452E99"/>
     <w:rPr>
       <w:rFonts w:eastAsiaTheme="majorEastAsia" w:cstheme="majorBidi"/>
       <w:color w:val="0F4761" w:themeColor="accent1" w:themeShade="BF"/>
@@ -23880,7 +23880,7 @@
     <w:link w:val="Ttulo4"/>
     <w:uiPriority w:val="9"/>
     <w:semiHidden/>
-    <w:rsid w:val="00435DA3"/>
+    <w:rsid w:val="00452E99"/>
     <w:rPr>
       <w:rFonts w:eastAsiaTheme="majorEastAsia" w:cstheme="majorBidi"/>
       <w:i/>
@@ -23894,7 +23894,7 @@
     <w:link w:val="Ttulo5"/>
     <w:uiPriority w:val="9"/>
     <w:semiHidden/>
-    <w:rsid w:val="00435DA3"/>
+    <w:rsid w:val="00452E99"/>
     <w:rPr>
       <w:rFonts w:eastAsiaTheme="majorEastAsia" w:cstheme="majorBidi"/>
       <w:color w:val="0F4761" w:themeColor="accent1" w:themeShade="BF"/>
@@ -23906,7 +23906,7 @@
     <w:link w:val="Ttulo6"/>
     <w:uiPriority w:val="9"/>
     <w:semiHidden/>
-    <w:rsid w:val="00435DA3"/>
+    <w:rsid w:val="00452E99"/>
     <w:rPr>
       <w:rFonts w:eastAsiaTheme="majorEastAsia" w:cstheme="majorBidi"/>
       <w:i/>
@@ -23920,7 +23920,7 @@
     <w:link w:val="Ttulo7"/>
     <w:uiPriority w:val="9"/>
     <w:semiHidden/>
-    <w:rsid w:val="00435DA3"/>
+    <w:rsid w:val="00452E99"/>
     <w:rPr>
       <w:rFonts w:eastAsiaTheme="majorEastAsia" w:cstheme="majorBidi"/>
       <w:color w:val="595959" w:themeColor="text1" w:themeTint="A6"/>
@@ -23932,7 +23932,7 @@
     <w:link w:val="Ttulo8"/>
     <w:uiPriority w:val="9"/>
     <w:semiHidden/>
-    <w:rsid w:val="00435DA3"/>
+    <w:rsid w:val="00452E99"/>
     <w:rPr>
       <w:rFonts w:eastAsiaTheme="majorEastAsia" w:cstheme="majorBidi"/>
       <w:i/>
@@ -23946,7 +23946,7 @@
     <w:link w:val="Ttulo9"/>
     <w:uiPriority w:val="9"/>
     <w:semiHidden/>
-    <w:rsid w:val="00435DA3"/>
+    <w:rsid w:val="00452E99"/>
     <w:rPr>
       <w:rFonts w:eastAsiaTheme="majorEastAsia" w:cstheme="majorBidi"/>
       <w:color w:val="272727" w:themeColor="text1" w:themeTint="D8"/>
@@ -23959,7 +23959,7 @@
     <w:link w:val="TtuloChar"/>
     <w:uiPriority w:val="10"/>
     <w:qFormat/>
-    <w:rsid w:val="00435DA3"/>
+    <w:rsid w:val="00452E99"/>
     <w:pPr>
       <w:spacing w:after="80" w:line="240" w:lineRule="auto"/>
       <w:contextualSpacing/>
@@ -23977,7 +23977,7 @@
     <w:basedOn w:val="Fontepargpadro"/>
     <w:link w:val="Ttulo"/>
     <w:uiPriority w:val="10"/>
-    <w:rsid w:val="00435DA3"/>
+    <w:rsid w:val="00452E99"/>
     <w:rPr>
       <w:rFonts w:asciiTheme="majorHAnsi" w:eastAsiaTheme="majorEastAsia" w:hAnsiTheme="majorHAnsi" w:cstheme="majorBidi"/>
       <w:spacing w:val="-10"/>
@@ -23993,7 +23993,7 @@
     <w:link w:val="SubttuloChar"/>
     <w:uiPriority w:val="11"/>
     <w:qFormat/>
-    <w:rsid w:val="00435DA3"/>
+    <w:rsid w:val="00452E99"/>
     <w:pPr>
       <w:numPr>
         <w:ilvl w:val="1"/>
@@ -24012,7 +24012,7 @@
     <w:basedOn w:val="Fontepargpadro"/>
     <w:link w:val="Subttulo"/>
     <w:uiPriority w:val="11"/>
-    <w:rsid w:val="00435DA3"/>
+    <w:rsid w:val="00452E99"/>
     <w:rPr>
       <w:rFonts w:eastAsiaTheme="majorEastAsia" w:cstheme="majorBidi"/>
       <w:color w:val="595959" w:themeColor="text1" w:themeTint="A6"/>
@@ -24028,7 +24028,7 @@
     <w:link w:val="CitaoChar"/>
     <w:uiPriority w:val="29"/>
     <w:qFormat/>
-    <w:rsid w:val="00435DA3"/>
+    <w:rsid w:val="00452E99"/>
     <w:pPr>
       <w:spacing w:before="160"/>
       <w:jc w:val="center"/>
@@ -24044,7 +24044,7 @@
     <w:basedOn w:val="Fontepargpadro"/>
     <w:link w:val="Citao"/>
     <w:uiPriority w:val="29"/>
-    <w:rsid w:val="00435DA3"/>
+    <w:rsid w:val="00452E99"/>
     <w:rPr>
       <w:i/>
       <w:iCs/>
@@ -24056,7 +24056,7 @@
     <w:basedOn w:val="Normal"/>
     <w:uiPriority w:val="34"/>
     <w:qFormat/>
-    <w:rsid w:val="00435DA3"/>
+    <w:rsid w:val="00452E99"/>
     <w:pPr>
       <w:ind w:left="720"/>
       <w:contextualSpacing/>
@@ -24067,7 +24067,7 @@
     <w:basedOn w:val="Fontepargpadro"/>
     <w:uiPriority w:val="21"/>
     <w:qFormat/>
-    <w:rsid w:val="00435DA3"/>
+    <w:rsid w:val="00452E99"/>
     <w:rPr>
       <w:i/>
       <w:iCs/>
@@ -24081,7 +24081,7 @@
     <w:link w:val="CitaoIntensaChar"/>
     <w:uiPriority w:val="30"/>
     <w:qFormat/>
-    <w:rsid w:val="00435DA3"/>
+    <w:rsid w:val="00452E99"/>
     <w:pPr>
       <w:pBdr>
         <w:top w:val="single" w:sz="4" w:space="10" w:color="0F4761" w:themeColor="accent1" w:themeShade="BF"/>
@@ -24102,7 +24102,7 @@
     <w:basedOn w:val="Fontepargpadro"/>
     <w:link w:val="CitaoIntensa"/>
     <w:uiPriority w:val="30"/>
-    <w:rsid w:val="00435DA3"/>
+    <w:rsid w:val="00452E99"/>
     <w:rPr>
       <w:i/>
       <w:iCs/>
@@ -24114,7 +24114,7 @@
     <w:basedOn w:val="Fontepargpadro"/>
     <w:uiPriority w:val="32"/>
     <w:qFormat/>
-    <w:rsid w:val="00435DA3"/>
+    <w:rsid w:val="00452E99"/>
     <w:rPr>
       <w:b/>
       <w:bCs/>
@@ -24129,7 +24129,7 @@
     <w:link w:val="CabealhoChar"/>
     <w:uiPriority w:val="99"/>
     <w:unhideWhenUsed/>
-    <w:rsid w:val="00435DA3"/>
+    <w:rsid w:val="00452E99"/>
     <w:pPr>
       <w:tabs>
         <w:tab w:val="center" w:pos="4252"/>
@@ -24143,7 +24143,7 @@
     <w:basedOn w:val="Fontepargpadro"/>
     <w:link w:val="Cabealho"/>
     <w:uiPriority w:val="99"/>
-    <w:rsid w:val="00435DA3"/>
+    <w:rsid w:val="00452E99"/>
   </w:style>
   <w:style w:type="paragraph" w:styleId="Rodap">
     <w:name w:val="footer"/>
@@ -24151,7 +24151,7 @@
     <w:link w:val="RodapChar"/>
     <w:uiPriority w:val="99"/>
     <w:unhideWhenUsed/>
-    <w:rsid w:val="00435DA3"/>
+    <w:rsid w:val="00452E99"/>
     <w:pPr>
       <w:tabs>
         <w:tab w:val="center" w:pos="4252"/>
@@ -24165,7 +24165,7 @@
     <w:basedOn w:val="Fontepargpadro"/>
     <w:link w:val="Rodap"/>
     <w:uiPriority w:val="99"/>
-    <w:rsid w:val="00435DA3"/>
+    <w:rsid w:val="00452E99"/>
   </w:style>
   <w:style w:type="paragraph" w:styleId="Sumrio1">
     <w:name w:val="toc 1"/>
@@ -24174,7 +24174,7 @@
     <w:autoRedefine/>
     <w:uiPriority w:val="39"/>
     <w:unhideWhenUsed/>
-    <w:rsid w:val="00435DA3"/>
+    <w:rsid w:val="00452E99"/>
     <w:pPr>
       <w:spacing w:after="100"/>
     </w:pPr>
@@ -24186,7 +24186,7 @@
     <w:autoRedefine/>
     <w:uiPriority w:val="39"/>
     <w:unhideWhenUsed/>
-    <w:rsid w:val="00435DA3"/>
+    <w:rsid w:val="00452E99"/>
     <w:pPr>
       <w:spacing w:after="100"/>
       <w:ind w:left="240"/>

</xml_diff>

<commit_message>
Sincroniza documentacao da secao 10 - Aprovacao e novo logo no Manual de Uso
Co-Authored-By: Claude Sonnet 5 <noreply@anthropic.com>
</commit_message>
<xml_diff>
--- a/Manual de Uso - Ferramenta de Gestao de Projetos.docx
+++ b/Manual de Uso - Ferramenta de Gestao de Projetos.docx
@@ -229,7 +229,7 @@
         <w:rPr>
           <w:noProof/>
         </w:rPr>
-        <w:instrText xml:space="preserve"> PAGEREF _Toc239847879 \h </w:instrText>
+        <w:instrText xml:space="preserve"> PAGEREF _Toc239864436 \h </w:instrText>
       </w:r>
       <w:r>
         <w:rPr>
@@ -290,7 +290,7 @@
         <w:rPr>
           <w:noProof/>
         </w:rPr>
-        <w:instrText xml:space="preserve"> PAGEREF _Toc239847880 \h </w:instrText>
+        <w:instrText xml:space="preserve"> PAGEREF _Toc239864437 \h </w:instrText>
       </w:r>
       <w:r>
         <w:rPr>
@@ -351,7 +351,7 @@
         <w:rPr>
           <w:noProof/>
         </w:rPr>
-        <w:instrText xml:space="preserve"> PAGEREF _Toc239847881 \h </w:instrText>
+        <w:instrText xml:space="preserve"> PAGEREF _Toc239864438 \h </w:instrText>
       </w:r>
       <w:r>
         <w:rPr>
@@ -412,7 +412,7 @@
         <w:rPr>
           <w:noProof/>
         </w:rPr>
-        <w:instrText xml:space="preserve"> PAGEREF _Toc239847882 \h </w:instrText>
+        <w:instrText xml:space="preserve"> PAGEREF _Toc239864439 \h </w:instrText>
       </w:r>
       <w:r>
         <w:rPr>
@@ -473,7 +473,7 @@
         <w:rPr>
           <w:noProof/>
         </w:rPr>
-        <w:instrText xml:space="preserve"> PAGEREF _Toc239847883 \h </w:instrText>
+        <w:instrText xml:space="preserve"> PAGEREF _Toc239864440 \h </w:instrText>
       </w:r>
       <w:r>
         <w:rPr>
@@ -534,7 +534,7 @@
         <w:rPr>
           <w:noProof/>
         </w:rPr>
-        <w:instrText xml:space="preserve"> PAGEREF _Toc239847884 \h </w:instrText>
+        <w:instrText xml:space="preserve"> PAGEREF _Toc239864441 \h </w:instrText>
       </w:r>
       <w:r>
         <w:rPr>
@@ -551,7 +551,7 @@
         <w:rPr>
           <w:noProof/>
         </w:rPr>
-        <w:t>16</w:t>
+        <w:t>17</w:t>
       </w:r>
       <w:r>
         <w:rPr>
@@ -595,7 +595,7 @@
         <w:rPr>
           <w:noProof/>
         </w:rPr>
-        <w:instrText xml:space="preserve"> PAGEREF _Toc239847885 \h </w:instrText>
+        <w:instrText xml:space="preserve"> PAGEREF _Toc239864442 \h </w:instrText>
       </w:r>
       <w:r>
         <w:rPr>
@@ -612,7 +612,7 @@
         <w:rPr>
           <w:noProof/>
         </w:rPr>
-        <w:t>16</w:t>
+        <w:t>17</w:t>
       </w:r>
       <w:r>
         <w:rPr>
@@ -656,7 +656,7 @@
         <w:rPr>
           <w:noProof/>
         </w:rPr>
-        <w:instrText xml:space="preserve"> PAGEREF _Toc239847886 \h </w:instrText>
+        <w:instrText xml:space="preserve"> PAGEREF _Toc239864443 \h </w:instrText>
       </w:r>
       <w:r>
         <w:rPr>
@@ -673,7 +673,7 @@
         <w:rPr>
           <w:noProof/>
         </w:rPr>
-        <w:t>16</w:t>
+        <w:t>17</w:t>
       </w:r>
       <w:r>
         <w:rPr>
@@ -717,7 +717,7 @@
         <w:rPr>
           <w:noProof/>
         </w:rPr>
-        <w:instrText xml:space="preserve"> PAGEREF _Toc239847887 \h </w:instrText>
+        <w:instrText xml:space="preserve"> PAGEREF _Toc239864444 \h </w:instrText>
       </w:r>
       <w:r>
         <w:rPr>
@@ -734,7 +734,7 @@
         <w:rPr>
           <w:noProof/>
         </w:rPr>
-        <w:t>16</w:t>
+        <w:t>17</w:t>
       </w:r>
       <w:r>
         <w:rPr>
@@ -778,7 +778,7 @@
         <w:rPr>
           <w:noProof/>
         </w:rPr>
-        <w:instrText xml:space="preserve"> PAGEREF _Toc239847888 \h </w:instrText>
+        <w:instrText xml:space="preserve"> PAGEREF _Toc239864445 \h </w:instrText>
       </w:r>
       <w:r>
         <w:rPr>
@@ -795,7 +795,7 @@
         <w:rPr>
           <w:noProof/>
         </w:rPr>
-        <w:t>17</w:t>
+        <w:t>18</w:t>
       </w:r>
       <w:r>
         <w:rPr>
@@ -839,7 +839,7 @@
         <w:rPr>
           <w:noProof/>
         </w:rPr>
-        <w:instrText xml:space="preserve"> PAGEREF _Toc239847889 \h </w:instrText>
+        <w:instrText xml:space="preserve"> PAGEREF _Toc239864446 \h </w:instrText>
       </w:r>
       <w:r>
         <w:rPr>
@@ -856,7 +856,7 @@
         <w:rPr>
           <w:noProof/>
         </w:rPr>
-        <w:t>18</w:t>
+        <w:t>19</w:t>
       </w:r>
       <w:r>
         <w:rPr>
@@ -900,7 +900,7 @@
         <w:rPr>
           <w:noProof/>
         </w:rPr>
-        <w:instrText xml:space="preserve"> PAGEREF _Toc239847890 \h </w:instrText>
+        <w:instrText xml:space="preserve"> PAGEREF _Toc239864447 \h </w:instrText>
       </w:r>
       <w:r>
         <w:rPr>
@@ -917,7 +917,7 @@
         <w:rPr>
           <w:noProof/>
         </w:rPr>
-        <w:t>20</w:t>
+        <w:t>21</w:t>
       </w:r>
       <w:r>
         <w:rPr>
@@ -961,7 +961,7 @@
         <w:rPr>
           <w:noProof/>
         </w:rPr>
-        <w:instrText xml:space="preserve"> PAGEREF _Toc239847891 \h </w:instrText>
+        <w:instrText xml:space="preserve"> PAGEREF _Toc239864448 \h </w:instrText>
       </w:r>
       <w:r>
         <w:rPr>
@@ -978,7 +978,7 @@
         <w:rPr>
           <w:noProof/>
         </w:rPr>
-        <w:t>21</w:t>
+        <w:t>22</w:t>
       </w:r>
       <w:r>
         <w:rPr>
@@ -1022,7 +1022,7 @@
         <w:rPr>
           <w:noProof/>
         </w:rPr>
-        <w:instrText xml:space="preserve"> PAGEREF _Toc239847892 \h </w:instrText>
+        <w:instrText xml:space="preserve"> PAGEREF _Toc239864449 \h </w:instrText>
       </w:r>
       <w:r>
         <w:rPr>
@@ -1039,7 +1039,7 @@
         <w:rPr>
           <w:noProof/>
         </w:rPr>
-        <w:t>22</w:t>
+        <w:t>23</w:t>
       </w:r>
       <w:r>
         <w:rPr>
@@ -1083,7 +1083,7 @@
         <w:rPr>
           <w:noProof/>
         </w:rPr>
-        <w:instrText xml:space="preserve"> PAGEREF _Toc239847893 \h </w:instrText>
+        <w:instrText xml:space="preserve"> PAGEREF _Toc239864450 \h </w:instrText>
       </w:r>
       <w:r>
         <w:rPr>
@@ -1100,7 +1100,7 @@
         <w:rPr>
           <w:noProof/>
         </w:rPr>
-        <w:t>22</w:t>
+        <w:t>23</w:t>
       </w:r>
       <w:r>
         <w:rPr>
@@ -1144,7 +1144,7 @@
         <w:rPr>
           <w:noProof/>
         </w:rPr>
-        <w:instrText xml:space="preserve"> PAGEREF _Toc239847894 \h </w:instrText>
+        <w:instrText xml:space="preserve"> PAGEREF _Toc239864451 \h </w:instrText>
       </w:r>
       <w:r>
         <w:rPr>
@@ -1161,7 +1161,7 @@
         <w:rPr>
           <w:noProof/>
         </w:rPr>
-        <w:t>23</w:t>
+        <w:t>24</w:t>
       </w:r>
       <w:r>
         <w:rPr>
@@ -1205,7 +1205,7 @@
         <w:rPr>
           <w:noProof/>
         </w:rPr>
-        <w:instrText xml:space="preserve"> PAGEREF _Toc239847895 \h </w:instrText>
+        <w:instrText xml:space="preserve"> PAGEREF _Toc239864452 \h </w:instrText>
       </w:r>
       <w:r>
         <w:rPr>
@@ -1222,7 +1222,7 @@
         <w:rPr>
           <w:noProof/>
         </w:rPr>
-        <w:t>24</w:t>
+        <w:t>25</w:t>
       </w:r>
       <w:r>
         <w:rPr>
@@ -1266,7 +1266,7 @@
         <w:rPr>
           <w:noProof/>
         </w:rPr>
-        <w:instrText xml:space="preserve"> PAGEREF _Toc239847896 \h </w:instrText>
+        <w:instrText xml:space="preserve"> PAGEREF _Toc239864453 \h </w:instrText>
       </w:r>
       <w:r>
         <w:rPr>
@@ -1283,7 +1283,7 @@
         <w:rPr>
           <w:noProof/>
         </w:rPr>
-        <w:t>24</w:t>
+        <w:t>25</w:t>
       </w:r>
       <w:r>
         <w:rPr>
@@ -1327,7 +1327,7 @@
         <w:rPr>
           <w:noProof/>
         </w:rPr>
-        <w:instrText xml:space="preserve"> PAGEREF _Toc239847897 \h </w:instrText>
+        <w:instrText xml:space="preserve"> PAGEREF _Toc239864454 \h </w:instrText>
       </w:r>
       <w:r>
         <w:rPr>
@@ -1344,7 +1344,7 @@
         <w:rPr>
           <w:noProof/>
         </w:rPr>
-        <w:t>26</w:t>
+        <w:t>27</w:t>
       </w:r>
       <w:r>
         <w:rPr>
@@ -1388,7 +1388,7 @@
         <w:rPr>
           <w:noProof/>
         </w:rPr>
-        <w:instrText xml:space="preserve"> PAGEREF _Toc239847898 \h </w:instrText>
+        <w:instrText xml:space="preserve"> PAGEREF _Toc239864455 \h </w:instrText>
       </w:r>
       <w:r>
         <w:rPr>
@@ -1405,7 +1405,7 @@
         <w:rPr>
           <w:noProof/>
         </w:rPr>
-        <w:t>28</w:t>
+        <w:t>29</w:t>
       </w:r>
       <w:r>
         <w:rPr>
@@ -1449,7 +1449,7 @@
         <w:rPr>
           <w:noProof/>
         </w:rPr>
-        <w:instrText xml:space="preserve"> PAGEREF _Toc239847899 \h </w:instrText>
+        <w:instrText xml:space="preserve"> PAGEREF _Toc239864456 \h </w:instrText>
       </w:r>
       <w:r>
         <w:rPr>
@@ -1466,7 +1466,7 @@
         <w:rPr>
           <w:noProof/>
         </w:rPr>
-        <w:t>28</w:t>
+        <w:t>29</w:t>
       </w:r>
       <w:r>
         <w:rPr>
@@ -1510,7 +1510,7 @@
         <w:rPr>
           <w:noProof/>
         </w:rPr>
-        <w:instrText xml:space="preserve"> PAGEREF _Toc239847900 \h </w:instrText>
+        <w:instrText xml:space="preserve"> PAGEREF _Toc239864457 \h </w:instrText>
       </w:r>
       <w:r>
         <w:rPr>
@@ -1527,7 +1527,7 @@
         <w:rPr>
           <w:noProof/>
         </w:rPr>
-        <w:t>31</w:t>
+        <w:t>32</w:t>
       </w:r>
       <w:r>
         <w:rPr>
@@ -1571,7 +1571,7 @@
         <w:rPr>
           <w:noProof/>
         </w:rPr>
-        <w:instrText xml:space="preserve"> PAGEREF _Toc239847901 \h </w:instrText>
+        <w:instrText xml:space="preserve"> PAGEREF _Toc239864458 \h </w:instrText>
       </w:r>
       <w:r>
         <w:rPr>
@@ -1588,7 +1588,7 @@
         <w:rPr>
           <w:noProof/>
         </w:rPr>
-        <w:t>33</w:t>
+        <w:t>34</w:t>
       </w:r>
       <w:r>
         <w:rPr>
@@ -1632,7 +1632,7 @@
         <w:rPr>
           <w:noProof/>
         </w:rPr>
-        <w:instrText xml:space="preserve"> PAGEREF _Toc239847902 \h </w:instrText>
+        <w:instrText xml:space="preserve"> PAGEREF _Toc239864459 \h </w:instrText>
       </w:r>
       <w:r>
         <w:rPr>
@@ -1649,7 +1649,7 @@
         <w:rPr>
           <w:noProof/>
         </w:rPr>
-        <w:t>37</w:t>
+        <w:t>38</w:t>
       </w:r>
       <w:r>
         <w:rPr>
@@ -1693,7 +1693,7 @@
         <w:rPr>
           <w:noProof/>
         </w:rPr>
-        <w:instrText xml:space="preserve"> PAGEREF _Toc239847903 \h </w:instrText>
+        <w:instrText xml:space="preserve"> PAGEREF _Toc239864460 \h </w:instrText>
       </w:r>
       <w:r>
         <w:rPr>
@@ -1710,7 +1710,7 @@
         <w:rPr>
           <w:noProof/>
         </w:rPr>
-        <w:t>40</w:t>
+        <w:t>41</w:t>
       </w:r>
       <w:r>
         <w:rPr>
@@ -1755,7 +1755,7 @@
         <w:rPr>
           <w:noProof/>
         </w:rPr>
-        <w:instrText xml:space="preserve"> PAGEREF _Toc239847904 \h </w:instrText>
+        <w:instrText xml:space="preserve"> PAGEREF _Toc239864461 \h </w:instrText>
       </w:r>
       <w:r>
         <w:rPr>
@@ -1772,7 +1772,7 @@
         <w:rPr>
           <w:noProof/>
         </w:rPr>
-        <w:t>42</w:t>
+        <w:t>43</w:t>
       </w:r>
       <w:r>
         <w:rPr>
@@ -1816,7 +1816,7 @@
         <w:rPr>
           <w:noProof/>
         </w:rPr>
-        <w:instrText xml:space="preserve"> PAGEREF _Toc239847905 \h </w:instrText>
+        <w:instrText xml:space="preserve"> PAGEREF _Toc239864462 \h </w:instrText>
       </w:r>
       <w:r>
         <w:rPr>
@@ -1833,7 +1833,7 @@
         <w:rPr>
           <w:noProof/>
         </w:rPr>
-        <w:t>45</w:t>
+        <w:t>46</w:t>
       </w:r>
       <w:r>
         <w:rPr>
@@ -1877,7 +1877,7 @@
         <w:rPr>
           <w:noProof/>
         </w:rPr>
-        <w:instrText xml:space="preserve"> PAGEREF _Toc239847906 \h </w:instrText>
+        <w:instrText xml:space="preserve"> PAGEREF _Toc239864463 \h </w:instrText>
       </w:r>
       <w:r>
         <w:rPr>
@@ -1894,7 +1894,7 @@
         <w:rPr>
           <w:noProof/>
         </w:rPr>
-        <w:t>47</w:t>
+        <w:t>48</w:t>
       </w:r>
       <w:r>
         <w:rPr>
@@ -1938,7 +1938,7 @@
         <w:rPr>
           <w:noProof/>
         </w:rPr>
-        <w:instrText xml:space="preserve"> PAGEREF _Toc239847907 \h </w:instrText>
+        <w:instrText xml:space="preserve"> PAGEREF _Toc239864464 \h </w:instrText>
       </w:r>
       <w:r>
         <w:rPr>
@@ -1955,7 +1955,7 @@
         <w:rPr>
           <w:noProof/>
         </w:rPr>
-        <w:t>50</w:t>
+        <w:t>51</w:t>
       </w:r>
       <w:r>
         <w:rPr>
@@ -1999,7 +1999,7 @@
         <w:rPr>
           <w:noProof/>
         </w:rPr>
-        <w:instrText xml:space="preserve"> PAGEREF _Toc239847908 \h </w:instrText>
+        <w:instrText xml:space="preserve"> PAGEREF _Toc239864465 \h </w:instrText>
       </w:r>
       <w:r>
         <w:rPr>
@@ -2016,7 +2016,7 @@
         <w:rPr>
           <w:noProof/>
         </w:rPr>
-        <w:t>52</w:t>
+        <w:t>53</w:t>
       </w:r>
       <w:r>
         <w:rPr>
@@ -2060,7 +2060,7 @@
         <w:rPr>
           <w:noProof/>
         </w:rPr>
-        <w:instrText xml:space="preserve"> PAGEREF _Toc239847909 \h </w:instrText>
+        <w:instrText xml:space="preserve"> PAGEREF _Toc239864466 \h </w:instrText>
       </w:r>
       <w:r>
         <w:rPr>
@@ -2077,7 +2077,7 @@
         <w:rPr>
           <w:noProof/>
         </w:rPr>
-        <w:t>54</w:t>
+        <w:t>55</w:t>
       </w:r>
       <w:r>
         <w:rPr>
@@ -2121,7 +2121,7 @@
         <w:rPr>
           <w:noProof/>
         </w:rPr>
-        <w:instrText xml:space="preserve"> PAGEREF _Toc239847910 \h </w:instrText>
+        <w:instrText xml:space="preserve"> PAGEREF _Toc239864467 \h </w:instrText>
       </w:r>
       <w:r>
         <w:rPr>
@@ -2138,7 +2138,7 @@
         <w:rPr>
           <w:noProof/>
         </w:rPr>
-        <w:t>54</w:t>
+        <w:t>55</w:t>
       </w:r>
       <w:r>
         <w:rPr>
@@ -2182,7 +2182,7 @@
         <w:rPr>
           <w:noProof/>
         </w:rPr>
-        <w:instrText xml:space="preserve"> PAGEREF _Toc239847911 \h </w:instrText>
+        <w:instrText xml:space="preserve"> PAGEREF _Toc239864468 \h </w:instrText>
       </w:r>
       <w:r>
         <w:rPr>
@@ -2199,7 +2199,7 @@
         <w:rPr>
           <w:noProof/>
         </w:rPr>
-        <w:t>61</w:t>
+        <w:t>62</w:t>
       </w:r>
       <w:r>
         <w:rPr>
@@ -2243,7 +2243,7 @@
         <w:rPr>
           <w:noProof/>
         </w:rPr>
-        <w:instrText xml:space="preserve"> PAGEREF _Toc239847912 \h </w:instrText>
+        <w:instrText xml:space="preserve"> PAGEREF _Toc239864469 \h </w:instrText>
       </w:r>
       <w:r>
         <w:rPr>
@@ -2260,7 +2260,7 @@
         <w:rPr>
           <w:noProof/>
         </w:rPr>
-        <w:t>66</w:t>
+        <w:t>67</w:t>
       </w:r>
       <w:r>
         <w:rPr>
@@ -2304,7 +2304,7 @@
         <w:rPr>
           <w:noProof/>
         </w:rPr>
-        <w:instrText xml:space="preserve"> PAGEREF _Toc239847913 \h </w:instrText>
+        <w:instrText xml:space="preserve"> PAGEREF _Toc239864470 \h </w:instrText>
       </w:r>
       <w:r>
         <w:rPr>
@@ -2321,7 +2321,7 @@
         <w:rPr>
           <w:noProof/>
         </w:rPr>
-        <w:t>66</w:t>
+        <w:t>67</w:t>
       </w:r>
       <w:r>
         <w:rPr>
@@ -2365,7 +2365,7 @@
         <w:rPr>
           <w:noProof/>
         </w:rPr>
-        <w:instrText xml:space="preserve"> PAGEREF _Toc239847914 \h </w:instrText>
+        <w:instrText xml:space="preserve"> PAGEREF _Toc239864471 \h </w:instrText>
       </w:r>
       <w:r>
         <w:rPr>
@@ -2382,7 +2382,7 @@
         <w:rPr>
           <w:noProof/>
         </w:rPr>
-        <w:t>67</w:t>
+        <w:t>68</w:t>
       </w:r>
       <w:r>
         <w:rPr>
@@ -2426,7 +2426,7 @@
         <w:rPr>
           <w:noProof/>
         </w:rPr>
-        <w:instrText xml:space="preserve"> PAGEREF _Toc239847915 \h </w:instrText>
+        <w:instrText xml:space="preserve"> PAGEREF _Toc239864472 \h </w:instrText>
       </w:r>
       <w:r>
         <w:rPr>
@@ -2443,7 +2443,7 @@
         <w:rPr>
           <w:noProof/>
         </w:rPr>
-        <w:t>67</w:t>
+        <w:t>68</w:t>
       </w:r>
       <w:r>
         <w:rPr>
@@ -2487,7 +2487,7 @@
         <w:rPr>
           <w:noProof/>
         </w:rPr>
-        <w:instrText xml:space="preserve"> PAGEREF _Toc239847916 \h </w:instrText>
+        <w:instrText xml:space="preserve"> PAGEREF _Toc239864473 \h </w:instrText>
       </w:r>
       <w:r>
         <w:rPr>
@@ -2504,7 +2504,7 @@
         <w:rPr>
           <w:noProof/>
         </w:rPr>
-        <w:t>70</w:t>
+        <w:t>71</w:t>
       </w:r>
       <w:r>
         <w:rPr>
@@ -2548,7 +2548,7 @@
         <w:rPr>
           <w:noProof/>
         </w:rPr>
-        <w:instrText xml:space="preserve"> PAGEREF _Toc239847917 \h </w:instrText>
+        <w:instrText xml:space="preserve"> PAGEREF _Toc239864474 \h </w:instrText>
       </w:r>
       <w:r>
         <w:rPr>
@@ -2565,7 +2565,7 @@
         <w:rPr>
           <w:noProof/>
         </w:rPr>
-        <w:t>70</w:t>
+        <w:t>71</w:t>
       </w:r>
       <w:r>
         <w:rPr>
@@ -2609,7 +2609,7 @@
         <w:rPr>
           <w:noProof/>
         </w:rPr>
-        <w:instrText xml:space="preserve"> PAGEREF _Toc239847918 \h </w:instrText>
+        <w:instrText xml:space="preserve"> PAGEREF _Toc239864475 \h </w:instrText>
       </w:r>
       <w:r>
         <w:rPr>
@@ -2626,7 +2626,7 @@
         <w:rPr>
           <w:noProof/>
         </w:rPr>
-        <w:t>71</w:t>
+        <w:t>72</w:t>
       </w:r>
       <w:r>
         <w:rPr>
@@ -2670,7 +2670,7 @@
         <w:rPr>
           <w:noProof/>
         </w:rPr>
-        <w:instrText xml:space="preserve"> PAGEREF _Toc239847919 \h </w:instrText>
+        <w:instrText xml:space="preserve"> PAGEREF _Toc239864476 \h </w:instrText>
       </w:r>
       <w:r>
         <w:rPr>
@@ -2687,7 +2687,7 @@
         <w:rPr>
           <w:noProof/>
         </w:rPr>
-        <w:t>72</w:t>
+        <w:t>73</w:t>
       </w:r>
       <w:r>
         <w:rPr>
@@ -2731,7 +2731,7 @@
         <w:rPr>
           <w:noProof/>
         </w:rPr>
-        <w:instrText xml:space="preserve"> PAGEREF _Toc239847920 \h </w:instrText>
+        <w:instrText xml:space="preserve"> PAGEREF _Toc239864477 \h </w:instrText>
       </w:r>
       <w:r>
         <w:rPr>
@@ -2748,7 +2748,7 @@
         <w:rPr>
           <w:noProof/>
         </w:rPr>
-        <w:t>74</w:t>
+        <w:t>75</w:t>
       </w:r>
       <w:r>
         <w:rPr>
@@ -2792,7 +2792,7 @@
         <w:rPr>
           <w:noProof/>
         </w:rPr>
-        <w:instrText xml:space="preserve"> PAGEREF _Toc239847921 \h </w:instrText>
+        <w:instrText xml:space="preserve"> PAGEREF _Toc239864478 \h </w:instrText>
       </w:r>
       <w:r>
         <w:rPr>
@@ -2809,7 +2809,7 @@
         <w:rPr>
           <w:noProof/>
         </w:rPr>
-        <w:t>77</w:t>
+        <w:t>78</w:t>
       </w:r>
       <w:r>
         <w:rPr>
@@ -2853,7 +2853,7 @@
         <w:rPr>
           <w:noProof/>
         </w:rPr>
-        <w:instrText xml:space="preserve"> PAGEREF _Toc239847922 \h </w:instrText>
+        <w:instrText xml:space="preserve"> PAGEREF _Toc239864479 \h </w:instrText>
       </w:r>
       <w:r>
         <w:rPr>
@@ -2870,7 +2870,7 @@
         <w:rPr>
           <w:noProof/>
         </w:rPr>
-        <w:t>80</w:t>
+        <w:t>81</w:t>
       </w:r>
       <w:r>
         <w:rPr>
@@ -2914,7 +2914,7 @@
         <w:rPr>
           <w:noProof/>
         </w:rPr>
-        <w:instrText xml:space="preserve"> PAGEREF _Toc239847923 \h </w:instrText>
+        <w:instrText xml:space="preserve"> PAGEREF _Toc239864480 \h </w:instrText>
       </w:r>
       <w:r>
         <w:rPr>
@@ -2931,7 +2931,7 @@
         <w:rPr>
           <w:noProof/>
         </w:rPr>
-        <w:t>81</w:t>
+        <w:t>82</w:t>
       </w:r>
       <w:r>
         <w:rPr>
@@ -2975,7 +2975,7 @@
         <w:rPr>
           <w:noProof/>
         </w:rPr>
-        <w:instrText xml:space="preserve"> PAGEREF _Toc239847924 \h </w:instrText>
+        <w:instrText xml:space="preserve"> PAGEREF _Toc239864481 \h </w:instrText>
       </w:r>
       <w:r>
         <w:rPr>
@@ -2992,7 +2992,7 @@
         <w:rPr>
           <w:noProof/>
         </w:rPr>
-        <w:t>82</w:t>
+        <w:t>83</w:t>
       </w:r>
       <w:r>
         <w:rPr>
@@ -3036,7 +3036,7 @@
         <w:rPr>
           <w:noProof/>
         </w:rPr>
-        <w:instrText xml:space="preserve"> PAGEREF _Toc239847925 \h </w:instrText>
+        <w:instrText xml:space="preserve"> PAGEREF _Toc239864482 \h </w:instrText>
       </w:r>
       <w:r>
         <w:rPr>
@@ -3053,7 +3053,7 @@
         <w:rPr>
           <w:noProof/>
         </w:rPr>
-        <w:t>85</w:t>
+        <w:t>86</w:t>
       </w:r>
       <w:r>
         <w:rPr>
@@ -3097,7 +3097,7 @@
         <w:rPr>
           <w:noProof/>
         </w:rPr>
-        <w:instrText xml:space="preserve"> PAGEREF _Toc239847926 \h </w:instrText>
+        <w:instrText xml:space="preserve"> PAGEREF _Toc239864483 \h </w:instrText>
       </w:r>
       <w:r>
         <w:rPr>
@@ -3114,7 +3114,7 @@
         <w:rPr>
           <w:noProof/>
         </w:rPr>
-        <w:t>86</w:t>
+        <w:t>87</w:t>
       </w:r>
       <w:r>
         <w:rPr>
@@ -3173,7 +3173,7 @@
           <w:sz w:val="34"/>
         </w:rPr>
       </w:pPr>
-      <w:bookmarkStart w:id="0" w:name="_Toc239847879"/>
+      <w:bookmarkStart w:id="0" w:name="_Toc239864436"/>
       <w:r>
         <w:rPr>
           <w:rFonts w:ascii="Montserrat" w:hAnsi="Montserrat"/>
@@ -3197,7 +3197,7 @@
           <w:sz w:val="27"/>
         </w:rPr>
       </w:pPr>
-      <w:bookmarkStart w:id="1" w:name="_Toc239847880"/>
+      <w:bookmarkStart w:id="1" w:name="_Toc239864437"/>
       <w:r>
         <w:rPr>
           <w:rFonts w:ascii="Montserrat" w:hAnsi="Montserrat"/>
@@ -4134,6 +4134,24 @@
           <w:color w:val="1A1A1A"/>
           <w:sz w:val="22"/>
         </w:rPr>
+        <w:t>Esta e a versao 2.46 do manual. Em relacao a versao 2.45 (03/09/2026), o documento gerado pelos botoes Imprimir e Exportar Word da Solicitacao de Demanda (Passo 1) passou a incluir a secao 10 - Aprovacao ao final, com linhas para assinatura do Gestor Responsavel e do Responsavel, e a data - alinhando o documento gerado pelo sistema ao formulario oficial FORALF00339 em Word. O logo usado em todos os documentos gerados por Imprimir/Exportar Word (Solicitacao de Demanda, Canvas, TAP, Planejamento, EAP, SMP, Ata, TEP, RLA, Relatorio de Situacao e Relatorio de Entregas) tambem foi atualizado para a marca UNIALFA, conforme o template oficial.</w:t>
+      </w:r>
+    </w:p>
+    <w:p>
+      <w:pPr>
+        <w:spacing w:line="280" w:lineRule="auto"/>
+        <w:rPr>
+          <w:rFonts w:ascii="Montserrat" w:hAnsi="Montserrat"/>
+          <w:color w:val="1A1A1A"/>
+          <w:sz w:val="22"/>
+        </w:rPr>
+      </w:pPr>
+      <w:r>
+        <w:rPr>
+          <w:rFonts w:ascii="Montserrat" w:hAnsi="Montserrat"/>
+          <w:color w:val="1A1A1A"/>
+          <w:sz w:val="22"/>
+        </w:rPr>
         <w:t>O manual nao substitui as Diretrizes para a Gestao de Projetos da UNIALFA (documento institucional que define o framework D01 a D07) nem o documento Regras de Acesso e Permissoes (que detalha cada regra de controle de acesso); ele e o guia operacional de como usar cada ferramenta na pratica.</w:t>
       </w:r>
     </w:p>
@@ -4148,7 +4166,7 @@
           <w:sz w:val="27"/>
         </w:rPr>
       </w:pPr>
-      <w:bookmarkStart w:id="2" w:name="_Toc239847881"/>
+      <w:bookmarkStart w:id="2" w:name="_Toc239864438"/>
       <w:r>
         <w:rPr>
           <w:rFonts w:ascii="Montserrat" w:hAnsi="Montserrat"/>
@@ -4199,6 +4217,7 @@
           <w:color w:val="1A1A1A"/>
           <w:sz w:val="22"/>
         </w:rPr>
+        <w:lastRenderedPageBreak/>
         <w:t>12 formularios de registro (codigo FORALF), cada um correspondendo a um artefato institucional - da Solicitacao de Demanda ao Relatorio de Entregas e Beneficios.</w:t>
       </w:r>
     </w:p>
@@ -4295,7 +4314,6 @@
           <w:color w:val="1A1A1A"/>
           <w:sz w:val="22"/>
         </w:rPr>
-        <w:lastRenderedPageBreak/>
         <w:t>1 Ficha do Projeto, a visao consolidada de um unico projeto, aberta a partir do Painel Executivo e sem restricao por papel (secao 6.4.1).</w:t>
       </w:r>
     </w:p>
@@ -4344,17 +4362,18 @@
         <w:rPr>
           <w:noProof/>
         </w:rPr>
+        <w:lastRenderedPageBreak/>
         <w:drawing>
-          <wp:inline distT="0" distB="0" distL="0" distR="0" wp14:anchorId="66FF0CDF" wp14:editId="3C9BE6BB">
+          <wp:inline distT="0" distB="0" distL="0" distR="0" wp14:anchorId="4CF1C506" wp14:editId="4E9F0EE3">
             <wp:extent cx="5303520" cy="4792851"/>
             <wp:effectExtent l="19050" t="19050" r="11430" b="27305"/>
-            <wp:docPr id="2086195394" name="Imagem 1"/>
+            <wp:docPr id="1328082218" name="Imagem 1"/>
             <wp:cNvGraphicFramePr/>
             <a:graphic xmlns:a="http://schemas.openxmlformats.org/drawingml/2006/main">
               <a:graphicData uri="http://schemas.openxmlformats.org/drawingml/2006/picture">
                 <pic:pic xmlns:pic="http://schemas.openxmlformats.org/drawingml/2006/picture">
                   <pic:nvPicPr>
-                    <pic:cNvPr id="2086195394" name=""/>
+                    <pic:cNvPr id="1328082218" name=""/>
                     <pic:cNvPicPr/>
                   </pic:nvPicPr>
                   <pic:blipFill>
@@ -4422,7 +4441,7 @@
           <w:sz w:val="27"/>
         </w:rPr>
       </w:pPr>
-      <w:bookmarkStart w:id="3" w:name="_Toc239847882"/>
+      <w:bookmarkStart w:id="3" w:name="_Toc239864439"/>
       <w:r>
         <w:rPr>
           <w:rFonts w:ascii="Montserrat" w:hAnsi="Montserrat"/>
@@ -4430,7 +4449,6 @@
           <w:color w:val="B91D2E"/>
           <w:sz w:val="27"/>
         </w:rPr>
-        <w:lastRenderedPageBreak/>
         <w:t>1.3 Como acessar e fazer login</w:t>
       </w:r>
       <w:bookmarkEnd w:id="3"/>
@@ -4462,17 +4480,18 @@
         <w:rPr>
           <w:noProof/>
         </w:rPr>
+        <w:lastRenderedPageBreak/>
         <w:drawing>
-          <wp:inline distT="0" distB="0" distL="0" distR="0" wp14:anchorId="7367F033" wp14:editId="0E30D91A">
+          <wp:inline distT="0" distB="0" distL="0" distR="0" wp14:anchorId="2EB15002" wp14:editId="02ACF8EC">
             <wp:extent cx="4206240" cy="3801227"/>
             <wp:effectExtent l="19050" t="19050" r="22860" b="27940"/>
-            <wp:docPr id="10250532" name="Imagem 2"/>
+            <wp:docPr id="543401378" name="Imagem 2"/>
             <wp:cNvGraphicFramePr/>
             <a:graphic xmlns:a="http://schemas.openxmlformats.org/drawingml/2006/main">
               <a:graphicData uri="http://schemas.openxmlformats.org/drawingml/2006/picture">
                 <pic:pic xmlns:pic="http://schemas.openxmlformats.org/drawingml/2006/picture">
                   <pic:nvPicPr>
-                    <pic:cNvPr id="10250532" name=""/>
+                    <pic:cNvPr id="543401378" name=""/>
                     <pic:cNvPicPr/>
                   </pic:nvPicPr>
                   <pic:blipFill>
@@ -4645,7 +4664,7 @@
           <w:sz w:val="27"/>
         </w:rPr>
       </w:pPr>
-      <w:bookmarkStart w:id="4" w:name="_Toc239847883"/>
+      <w:bookmarkStart w:id="4" w:name="_Toc239864440"/>
       <w:r>
         <w:rPr>
           <w:rFonts w:ascii="Montserrat" w:hAnsi="Montserrat"/>
@@ -4653,7 +4672,6 @@
           <w:color w:val="B91D2E"/>
           <w:sz w:val="27"/>
         </w:rPr>
-        <w:lastRenderedPageBreak/>
         <w:t>1.4 Como a ferramenta se relaciona com as Diretrizes (D01-D07)</w:t>
       </w:r>
       <w:bookmarkEnd w:id="4"/>
@@ -4728,6 +4746,7 @@
                 <w:color w:val="FFFFFF"/>
                 <w:sz w:val="19"/>
               </w:rPr>
+              <w:lastRenderedPageBreak/>
               <w:t>Passo</w:t>
             </w:r>
           </w:p>
@@ -5884,7 +5903,7 @@
           <w:sz w:val="34"/>
         </w:rPr>
       </w:pPr>
-      <w:bookmarkStart w:id="5" w:name="_Toc239847884"/>
+      <w:bookmarkStart w:id="5" w:name="_Toc239864441"/>
       <w:r>
         <w:rPr>
           <w:rFonts w:ascii="Montserrat" w:hAnsi="Montserrat"/>
@@ -5908,7 +5927,7 @@
           <w:sz w:val="27"/>
         </w:rPr>
       </w:pPr>
-      <w:bookmarkStart w:id="6" w:name="_Toc239847885"/>
+      <w:bookmarkStart w:id="6" w:name="_Toc239864442"/>
       <w:r>
         <w:rPr>
           <w:rFonts w:ascii="Montserrat" w:hAnsi="Montserrat"/>
@@ -5949,7 +5968,7 @@
           <w:sz w:val="27"/>
         </w:rPr>
       </w:pPr>
-      <w:bookmarkStart w:id="7" w:name="_Toc239847886"/>
+      <w:bookmarkStart w:id="7" w:name="_Toc239864443"/>
       <w:r>
         <w:rPr>
           <w:rFonts w:ascii="Montserrat" w:hAnsi="Montserrat"/>
@@ -6068,7 +6087,7 @@
           <w:sz w:val="27"/>
         </w:rPr>
       </w:pPr>
-      <w:bookmarkStart w:id="8" w:name="_Toc239847887"/>
+      <w:bookmarkStart w:id="8" w:name="_Toc239864444"/>
       <w:r>
         <w:rPr>
           <w:rFonts w:ascii="Montserrat" w:hAnsi="Montserrat"/>
@@ -6681,7 +6700,7 @@
           <w:sz w:val="27"/>
         </w:rPr>
       </w:pPr>
-      <w:bookmarkStart w:id="9" w:name="_Toc239847888"/>
+      <w:bookmarkStart w:id="9" w:name="_Toc239864445"/>
       <w:r>
         <w:rPr>
           <w:rFonts w:ascii="Montserrat" w:hAnsi="Montserrat"/>
@@ -6770,16 +6789,16 @@
         </w:rPr>
         <w:lastRenderedPageBreak/>
         <w:drawing>
-          <wp:inline distT="0" distB="0" distL="0" distR="0" wp14:anchorId="06378603" wp14:editId="5F9F79D5">
+          <wp:inline distT="0" distB="0" distL="0" distR="0" wp14:anchorId="427BD35F" wp14:editId="1A5CB3AA">
             <wp:extent cx="4937760" cy="4462310"/>
             <wp:effectExtent l="19050" t="19050" r="15240" b="14605"/>
-            <wp:docPr id="1475015087" name="Imagem 3"/>
+            <wp:docPr id="1017586380" name="Imagem 3"/>
             <wp:cNvGraphicFramePr/>
             <a:graphic xmlns:a="http://schemas.openxmlformats.org/drawingml/2006/main">
               <a:graphicData uri="http://schemas.openxmlformats.org/drawingml/2006/picture">
                 <pic:pic xmlns:pic="http://schemas.openxmlformats.org/drawingml/2006/picture">
                   <pic:nvPicPr>
-                    <pic:cNvPr id="1475015087" name=""/>
+                    <pic:cNvPr id="1017586380" name=""/>
                     <pic:cNvPicPr/>
                   </pic:nvPicPr>
                   <pic:blipFill>
@@ -6847,7 +6866,7 @@
           <w:sz w:val="27"/>
         </w:rPr>
       </w:pPr>
-      <w:bookmarkStart w:id="10" w:name="_Toc239847889"/>
+      <w:bookmarkStart w:id="10" w:name="_Toc239864446"/>
       <w:r>
         <w:rPr>
           <w:rFonts w:ascii="Montserrat" w:hAnsi="Montserrat"/>
@@ -6888,16 +6907,16 @@
         </w:rPr>
         <w:lastRenderedPageBreak/>
         <w:drawing>
-          <wp:inline distT="0" distB="0" distL="0" distR="0" wp14:anchorId="4506FFAE" wp14:editId="79D003E0">
+          <wp:inline distT="0" distB="0" distL="0" distR="0" wp14:anchorId="39EBC1B7" wp14:editId="066D32C3">
             <wp:extent cx="5120640" cy="4627581"/>
             <wp:effectExtent l="19050" t="19050" r="22860" b="20955"/>
-            <wp:docPr id="1124612990" name="Imagem 4"/>
+            <wp:docPr id="1459397367" name="Imagem 4"/>
             <wp:cNvGraphicFramePr/>
             <a:graphic xmlns:a="http://schemas.openxmlformats.org/drawingml/2006/main">
               <a:graphicData uri="http://schemas.openxmlformats.org/drawingml/2006/picture">
                 <pic:pic xmlns:pic="http://schemas.openxmlformats.org/drawingml/2006/picture">
                   <pic:nvPicPr>
-                    <pic:cNvPr id="1124612990" name=""/>
+                    <pic:cNvPr id="1459397367" name=""/>
                     <pic:cNvPicPr/>
                   </pic:nvPicPr>
                   <pic:blipFill>
@@ -7065,7 +7084,7 @@
           <w:sz w:val="27"/>
         </w:rPr>
       </w:pPr>
-      <w:bookmarkStart w:id="11" w:name="_Toc239847890"/>
+      <w:bookmarkStart w:id="11" w:name="_Toc239864447"/>
       <w:r>
         <w:rPr>
           <w:rFonts w:ascii="Montserrat" w:hAnsi="Montserrat"/>
@@ -7105,16 +7124,16 @@
           <w:noProof/>
         </w:rPr>
         <w:drawing>
-          <wp:inline distT="0" distB="0" distL="0" distR="0" wp14:anchorId="0B74F693" wp14:editId="3658F80D">
+          <wp:inline distT="0" distB="0" distL="0" distR="0" wp14:anchorId="35256C33" wp14:editId="74768A85">
             <wp:extent cx="4206240" cy="3801227"/>
             <wp:effectExtent l="19050" t="19050" r="22860" b="27940"/>
-            <wp:docPr id="20739176" name="Imagem 5"/>
+            <wp:docPr id="129144051" name="Imagem 5"/>
             <wp:cNvGraphicFramePr/>
             <a:graphic xmlns:a="http://schemas.openxmlformats.org/drawingml/2006/main">
               <a:graphicData uri="http://schemas.openxmlformats.org/drawingml/2006/picture">
                 <pic:pic xmlns:pic="http://schemas.openxmlformats.org/drawingml/2006/picture">
                   <pic:nvPicPr>
-                    <pic:cNvPr id="20739176" name=""/>
+                    <pic:cNvPr id="129144051" name=""/>
                     <pic:cNvPicPr/>
                   </pic:nvPicPr>
                   <pic:blipFill>
@@ -7182,16 +7201,16 @@
         </w:rPr>
         <w:lastRenderedPageBreak/>
         <w:drawing>
-          <wp:inline distT="0" distB="0" distL="0" distR="0" wp14:anchorId="1BC72FCE" wp14:editId="5A2E1E9B">
+          <wp:inline distT="0" distB="0" distL="0" distR="0" wp14:anchorId="62BDBD93" wp14:editId="0ABC4A2E">
             <wp:extent cx="4206240" cy="3801227"/>
             <wp:effectExtent l="19050" t="19050" r="22860" b="27940"/>
-            <wp:docPr id="498508715" name="Imagem 6"/>
+            <wp:docPr id="289817007" name="Imagem 6"/>
             <wp:cNvGraphicFramePr/>
             <a:graphic xmlns:a="http://schemas.openxmlformats.org/drawingml/2006/main">
               <a:graphicData uri="http://schemas.openxmlformats.org/drawingml/2006/picture">
                 <pic:pic xmlns:pic="http://schemas.openxmlformats.org/drawingml/2006/picture">
                   <pic:nvPicPr>
-                    <pic:cNvPr id="498508715" name=""/>
+                    <pic:cNvPr id="289817007" name=""/>
                     <pic:cNvPicPr/>
                   </pic:nvPicPr>
                   <pic:blipFill>
@@ -7307,7 +7326,7 @@
           <w:sz w:val="27"/>
         </w:rPr>
       </w:pPr>
-      <w:bookmarkStart w:id="12" w:name="_Toc239847891"/>
+      <w:bookmarkStart w:id="12" w:name="_Toc239864448"/>
       <w:r>
         <w:rPr>
           <w:rFonts w:ascii="Montserrat" w:hAnsi="Montserrat"/>
@@ -7375,7 +7394,7 @@
           <w:sz w:val="27"/>
         </w:rPr>
       </w:pPr>
-      <w:bookmarkStart w:id="13" w:name="_Toc239847892"/>
+      <w:bookmarkStart w:id="13" w:name="_Toc239864449"/>
       <w:r>
         <w:rPr>
           <w:rFonts w:ascii="Montserrat" w:hAnsi="Montserrat"/>
@@ -7602,7 +7621,7 @@
           <w:sz w:val="27"/>
         </w:rPr>
       </w:pPr>
-      <w:bookmarkStart w:id="14" w:name="_Toc239847893"/>
+      <w:bookmarkStart w:id="14" w:name="_Toc239864450"/>
       <w:r>
         <w:rPr>
           <w:rFonts w:ascii="Montserrat" w:hAnsi="Montserrat"/>
@@ -7761,7 +7780,7 @@
           <w:sz w:val="27"/>
         </w:rPr>
       </w:pPr>
-      <w:bookmarkStart w:id="15" w:name="_Toc239847894"/>
+      <w:bookmarkStart w:id="15" w:name="_Toc239864451"/>
       <w:r>
         <w:rPr>
           <w:rFonts w:ascii="Montserrat" w:hAnsi="Montserrat"/>
@@ -7953,7 +7972,7 @@
           <w:sz w:val="27"/>
         </w:rPr>
       </w:pPr>
-      <w:bookmarkStart w:id="16" w:name="_Toc239847895"/>
+      <w:bookmarkStart w:id="16" w:name="_Toc239864452"/>
       <w:r>
         <w:rPr>
           <w:rFonts w:ascii="Montserrat" w:hAnsi="Montserrat"/>
@@ -8081,7 +8100,7 @@
           <w:sz w:val="27"/>
         </w:rPr>
       </w:pPr>
-      <w:bookmarkStart w:id="17" w:name="_Toc239847896"/>
+      <w:bookmarkStart w:id="17" w:name="_Toc239864453"/>
       <w:r>
         <w:rPr>
           <w:rFonts w:ascii="Montserrat" w:hAnsi="Montserrat"/>
@@ -8411,7 +8430,7 @@
           <w:sz w:val="27"/>
         </w:rPr>
       </w:pPr>
-      <w:bookmarkStart w:id="18" w:name="_Toc239847897"/>
+      <w:bookmarkStart w:id="18" w:name="_Toc239864454"/>
       <w:r>
         <w:rPr>
           <w:rFonts w:ascii="Montserrat" w:hAnsi="Montserrat"/>
@@ -8552,7 +8571,7 @@
           <w:sz w:val="34"/>
         </w:rPr>
       </w:pPr>
-      <w:bookmarkStart w:id="19" w:name="_Toc239847898"/>
+      <w:bookmarkStart w:id="19" w:name="_Toc239864455"/>
       <w:r>
         <w:rPr>
           <w:rFonts w:ascii="Montserrat" w:hAnsi="Montserrat"/>
@@ -8594,7 +8613,7 @@
           <w:sz w:val="27"/>
         </w:rPr>
       </w:pPr>
-      <w:bookmarkStart w:id="20" w:name="_Toc239847899"/>
+      <w:bookmarkStart w:id="20" w:name="_Toc239864456"/>
       <w:r>
         <w:rPr>
           <w:rFonts w:ascii="Montserrat" w:hAnsi="Montserrat"/>
@@ -9674,16 +9693,16 @@
         </w:rPr>
         <w:lastRenderedPageBreak/>
         <w:drawing>
-          <wp:inline distT="0" distB="0" distL="0" distR="0" wp14:anchorId="5033D07E" wp14:editId="011AD961">
+          <wp:inline distT="0" distB="0" distL="0" distR="0" wp14:anchorId="4F8B76C9" wp14:editId="47F584C5">
             <wp:extent cx="5120640" cy="4627581"/>
             <wp:effectExtent l="19050" t="19050" r="22860" b="20955"/>
-            <wp:docPr id="2013445599" name="Imagem 7"/>
+            <wp:docPr id="159790449" name="Imagem 7"/>
             <wp:cNvGraphicFramePr/>
             <a:graphic xmlns:a="http://schemas.openxmlformats.org/drawingml/2006/main">
               <a:graphicData uri="http://schemas.openxmlformats.org/drawingml/2006/picture">
                 <pic:pic xmlns:pic="http://schemas.openxmlformats.org/drawingml/2006/picture">
                   <pic:nvPicPr>
-                    <pic:cNvPr id="2013445599" name=""/>
+                    <pic:cNvPr id="159790449" name=""/>
                     <pic:cNvPicPr/>
                   </pic:nvPicPr>
                   <pic:blipFill>
@@ -9751,16 +9770,16 @@
         </w:rPr>
         <w:lastRenderedPageBreak/>
         <w:drawing>
-          <wp:inline distT="0" distB="0" distL="0" distR="0" wp14:anchorId="349C6276" wp14:editId="09CF6B58">
+          <wp:inline distT="0" distB="0" distL="0" distR="0" wp14:anchorId="7E5A6BB5" wp14:editId="22340F9F">
             <wp:extent cx="5120640" cy="4627581"/>
             <wp:effectExtent l="19050" t="19050" r="22860" b="20955"/>
-            <wp:docPr id="436130140" name="Imagem 8"/>
+            <wp:docPr id="856849006" name="Imagem 8"/>
             <wp:cNvGraphicFramePr/>
             <a:graphic xmlns:a="http://schemas.openxmlformats.org/drawingml/2006/main">
               <a:graphicData uri="http://schemas.openxmlformats.org/drawingml/2006/picture">
                 <pic:pic xmlns:pic="http://schemas.openxmlformats.org/drawingml/2006/picture">
                   <pic:nvPicPr>
-                    <pic:cNvPr id="436130140" name=""/>
+                    <pic:cNvPr id="856849006" name=""/>
                     <pic:cNvPicPr/>
                   </pic:nvPicPr>
                   <pic:blipFill>
@@ -9906,7 +9925,7 @@
           <w:sz w:val="22"/>
         </w:rPr>
         <w:lastRenderedPageBreak/>
-        <w:t>No rodape do painel de detalhes de uma demanda, os botoes Imprimir e Exportar Word geram o documento no formato oficial do FORALF00339, pronto para impressao ou para abrir no Word.</w:t>
+        <w:t>No rodape do painel de detalhes de uma demanda, os botoes Imprimir e Exportar Word geram o documento no formato oficial do FORALF00339, pronto para impressao ou para abrir no Word - incluindo, ao final, a secao 10 - Aprovacao, com linhas para assinatura do Gestor Responsavel e do Responsavel, e a data.</w:t>
       </w:r>
     </w:p>
     <w:p>
@@ -9968,7 +9987,7 @@
           <w:sz w:val="27"/>
         </w:rPr>
       </w:pPr>
-      <w:bookmarkStart w:id="21" w:name="_Toc239847900"/>
+      <w:bookmarkStart w:id="21" w:name="_Toc239864457"/>
       <w:r>
         <w:rPr>
           <w:rFonts w:ascii="Montserrat" w:hAnsi="Montserrat"/>
@@ -10892,18 +10911,17 @@
         <w:rPr>
           <w:noProof/>
         </w:rPr>
-        <w:lastRenderedPageBreak/>
         <w:drawing>
-          <wp:inline distT="0" distB="0" distL="0" distR="0" wp14:anchorId="3DF37AE2" wp14:editId="12972C52">
+          <wp:inline distT="0" distB="0" distL="0" distR="0" wp14:anchorId="6B71D884" wp14:editId="4F5A9DB6">
             <wp:extent cx="5120640" cy="4627581"/>
             <wp:effectExtent l="19050" t="19050" r="22860" b="20955"/>
-            <wp:docPr id="1386290952" name="Imagem 9"/>
+            <wp:docPr id="140639050" name="Imagem 9"/>
             <wp:cNvGraphicFramePr/>
             <a:graphic xmlns:a="http://schemas.openxmlformats.org/drawingml/2006/main">
               <a:graphicData uri="http://schemas.openxmlformats.org/drawingml/2006/picture">
                 <pic:pic xmlns:pic="http://schemas.openxmlformats.org/drawingml/2006/picture">
                   <pic:nvPicPr>
-                    <pic:cNvPr id="1386290952" name=""/>
+                    <pic:cNvPr id="140639050" name=""/>
                     <pic:cNvPicPr/>
                   </pic:nvPicPr>
                   <pic:blipFill>
@@ -10971,16 +10989,16 @@
         </w:rPr>
         <w:lastRenderedPageBreak/>
         <w:drawing>
-          <wp:inline distT="0" distB="0" distL="0" distR="0" wp14:anchorId="21412B95" wp14:editId="043F282D">
+          <wp:inline distT="0" distB="0" distL="0" distR="0" wp14:anchorId="0A79F833" wp14:editId="41B0AD3B">
             <wp:extent cx="5120640" cy="4627581"/>
             <wp:effectExtent l="19050" t="19050" r="22860" b="20955"/>
-            <wp:docPr id="994054140" name="Imagem 10"/>
+            <wp:docPr id="2090012347" name="Imagem 10"/>
             <wp:cNvGraphicFramePr/>
             <a:graphic xmlns:a="http://schemas.openxmlformats.org/drawingml/2006/main">
               <a:graphicData uri="http://schemas.openxmlformats.org/drawingml/2006/picture">
                 <pic:pic xmlns:pic="http://schemas.openxmlformats.org/drawingml/2006/picture">
                   <pic:nvPicPr>
-                    <pic:cNvPr id="994054140" name=""/>
+                    <pic:cNvPr id="2090012347" name=""/>
                     <pic:cNvPicPr/>
                   </pic:nvPicPr>
                   <pic:blipFill>
@@ -11114,7 +11132,7 @@
           <w:sz w:val="27"/>
         </w:rPr>
       </w:pPr>
-      <w:bookmarkStart w:id="22" w:name="_Toc239847901"/>
+      <w:bookmarkStart w:id="22" w:name="_Toc239864458"/>
       <w:r>
         <w:rPr>
           <w:rFonts w:ascii="Montserrat" w:hAnsi="Montserrat"/>
@@ -12170,16 +12188,16 @@
           <w:noProof/>
         </w:rPr>
         <w:drawing>
-          <wp:inline distT="0" distB="0" distL="0" distR="0" wp14:anchorId="1BAF7AE0" wp14:editId="35ADCA45">
+          <wp:inline distT="0" distB="0" distL="0" distR="0" wp14:anchorId="4A6C24CE" wp14:editId="16A64697">
             <wp:extent cx="5120640" cy="3338440"/>
             <wp:effectExtent l="19050" t="19050" r="22860" b="14605"/>
-            <wp:docPr id="1078874967" name="Imagem 11"/>
+            <wp:docPr id="2095650024" name="Imagem 11"/>
             <wp:cNvGraphicFramePr/>
             <a:graphic xmlns:a="http://schemas.openxmlformats.org/drawingml/2006/main">
               <a:graphicData uri="http://schemas.openxmlformats.org/drawingml/2006/picture">
                 <pic:pic xmlns:pic="http://schemas.openxmlformats.org/drawingml/2006/picture">
                   <pic:nvPicPr>
-                    <pic:cNvPr id="1078874967" name=""/>
+                    <pic:cNvPr id="2095650024" name=""/>
                     <pic:cNvPicPr/>
                   </pic:nvPicPr>
                   <pic:blipFill>
@@ -12247,16 +12265,16 @@
         </w:rPr>
         <w:lastRenderedPageBreak/>
         <w:drawing>
-          <wp:inline distT="0" distB="0" distL="0" distR="0" wp14:anchorId="65FDE61F" wp14:editId="05707958">
+          <wp:inline distT="0" distB="0" distL="0" distR="0" wp14:anchorId="425C8026" wp14:editId="7A9D5624">
             <wp:extent cx="5120640" cy="4627581"/>
             <wp:effectExtent l="19050" t="19050" r="22860" b="20955"/>
-            <wp:docPr id="779280650" name="Imagem 12"/>
+            <wp:docPr id="16029180" name="Imagem 12"/>
             <wp:cNvGraphicFramePr/>
             <a:graphic xmlns:a="http://schemas.openxmlformats.org/drawingml/2006/main">
               <a:graphicData uri="http://schemas.openxmlformats.org/drawingml/2006/picture">
                 <pic:pic xmlns:pic="http://schemas.openxmlformats.org/drawingml/2006/picture">
                   <pic:nvPicPr>
-                    <pic:cNvPr id="779280650" name=""/>
+                    <pic:cNvPr id="16029180" name=""/>
                     <pic:cNvPicPr/>
                   </pic:nvPicPr>
                   <pic:blipFill>
@@ -12390,7 +12408,7 @@
           <w:sz w:val="27"/>
         </w:rPr>
       </w:pPr>
-      <w:bookmarkStart w:id="23" w:name="_Toc239847902"/>
+      <w:bookmarkStart w:id="23" w:name="_Toc239864459"/>
       <w:r>
         <w:rPr>
           <w:rFonts w:ascii="Montserrat" w:hAnsi="Montserrat"/>
@@ -12952,16 +12970,16 @@
         </w:rPr>
         <w:lastRenderedPageBreak/>
         <w:drawing>
-          <wp:inline distT="0" distB="0" distL="0" distR="0" wp14:anchorId="12477B3B" wp14:editId="2AAB314B">
+          <wp:inline distT="0" distB="0" distL="0" distR="0" wp14:anchorId="68D9C49F" wp14:editId="156ADB3B">
             <wp:extent cx="5120640" cy="4627581"/>
             <wp:effectExtent l="19050" t="19050" r="22860" b="20955"/>
-            <wp:docPr id="1074800433" name="Imagem 13"/>
+            <wp:docPr id="1089019211" name="Imagem 13"/>
             <wp:cNvGraphicFramePr/>
             <a:graphic xmlns:a="http://schemas.openxmlformats.org/drawingml/2006/main">
               <a:graphicData uri="http://schemas.openxmlformats.org/drawingml/2006/picture">
                 <pic:pic xmlns:pic="http://schemas.openxmlformats.org/drawingml/2006/picture">
                   <pic:nvPicPr>
-                    <pic:cNvPr id="1074800433" name=""/>
+                    <pic:cNvPr id="1089019211" name=""/>
                     <pic:cNvPicPr/>
                   </pic:nvPicPr>
                   <pic:blipFill>
@@ -13029,16 +13047,16 @@
         </w:rPr>
         <w:lastRenderedPageBreak/>
         <w:drawing>
-          <wp:inline distT="0" distB="0" distL="0" distR="0" wp14:anchorId="2B159183" wp14:editId="0F01E9CC">
+          <wp:inline distT="0" distB="0" distL="0" distR="0" wp14:anchorId="703A3A2D" wp14:editId="486B184B">
             <wp:extent cx="5120640" cy="4627581"/>
             <wp:effectExtent l="19050" t="19050" r="22860" b="20955"/>
-            <wp:docPr id="1395329167" name="Imagem 14"/>
+            <wp:docPr id="1531944592" name="Imagem 14"/>
             <wp:cNvGraphicFramePr/>
             <a:graphic xmlns:a="http://schemas.openxmlformats.org/drawingml/2006/main">
               <a:graphicData uri="http://schemas.openxmlformats.org/drawingml/2006/picture">
                 <pic:pic xmlns:pic="http://schemas.openxmlformats.org/drawingml/2006/picture">
                   <pic:nvPicPr>
-                    <pic:cNvPr id="1395329167" name=""/>
+                    <pic:cNvPr id="1531944592" name=""/>
                     <pic:cNvPicPr/>
                   </pic:nvPicPr>
                   <pic:blipFill>
@@ -13172,7 +13190,7 @@
           <w:sz w:val="27"/>
         </w:rPr>
       </w:pPr>
-      <w:bookmarkStart w:id="24" w:name="_Toc239847903"/>
+      <w:bookmarkStart w:id="24" w:name="_Toc239864460"/>
       <w:r>
         <w:rPr>
           <w:rFonts w:ascii="Montserrat" w:hAnsi="Montserrat"/>
@@ -13213,16 +13231,16 @@
           <w:noProof/>
         </w:rPr>
         <w:drawing>
-          <wp:inline distT="0" distB="0" distL="0" distR="0" wp14:anchorId="0EF73ADA" wp14:editId="74731FF3">
+          <wp:inline distT="0" distB="0" distL="0" distR="0" wp14:anchorId="4A53A00B" wp14:editId="67E2FE45">
             <wp:extent cx="5120640" cy="4627581"/>
             <wp:effectExtent l="19050" t="19050" r="22860" b="20955"/>
-            <wp:docPr id="608946009" name="Imagem 15"/>
+            <wp:docPr id="544025760" name="Imagem 15"/>
             <wp:cNvGraphicFramePr/>
             <a:graphic xmlns:a="http://schemas.openxmlformats.org/drawingml/2006/main">
               <a:graphicData uri="http://schemas.openxmlformats.org/drawingml/2006/picture">
                 <pic:pic xmlns:pic="http://schemas.openxmlformats.org/drawingml/2006/picture">
                   <pic:nvPicPr>
-                    <pic:cNvPr id="608946009" name=""/>
+                    <pic:cNvPr id="544025760" name=""/>
                     <pic:cNvPicPr/>
                   </pic:nvPicPr>
                   <pic:blipFill>
@@ -13290,16 +13308,16 @@
         </w:rPr>
         <w:lastRenderedPageBreak/>
         <w:drawing>
-          <wp:inline distT="0" distB="0" distL="0" distR="0" wp14:anchorId="7C5BE655" wp14:editId="305AAE7F">
+          <wp:inline distT="0" distB="0" distL="0" distR="0" wp14:anchorId="402FA670" wp14:editId="5DBBC091">
             <wp:extent cx="5120640" cy="4627581"/>
             <wp:effectExtent l="19050" t="19050" r="22860" b="20955"/>
-            <wp:docPr id="1437238471" name="Imagem 16"/>
+            <wp:docPr id="321726291" name="Imagem 16"/>
             <wp:cNvGraphicFramePr/>
             <a:graphic xmlns:a="http://schemas.openxmlformats.org/drawingml/2006/main">
               <a:graphicData uri="http://schemas.openxmlformats.org/drawingml/2006/picture">
                 <pic:pic xmlns:pic="http://schemas.openxmlformats.org/drawingml/2006/picture">
                   <pic:nvPicPr>
-                    <pic:cNvPr id="1437238471" name=""/>
+                    <pic:cNvPr id="321726291" name=""/>
                     <pic:cNvPicPr/>
                   </pic:nvPicPr>
                   <pic:blipFill>
@@ -13463,16 +13481,16 @@
         </w:rPr>
         <w:lastRenderedPageBreak/>
         <w:drawing>
-          <wp:inline distT="0" distB="0" distL="0" distR="0" wp14:anchorId="45B4CEA2" wp14:editId="236EA277">
+          <wp:inline distT="0" distB="0" distL="0" distR="0" wp14:anchorId="76EA4677" wp14:editId="488F9595">
             <wp:extent cx="5120640" cy="3282818"/>
             <wp:effectExtent l="19050" t="19050" r="22860" b="13335"/>
-            <wp:docPr id="1026257946" name="Imagem 17"/>
+            <wp:docPr id="1315136103" name="Imagem 17"/>
             <wp:cNvGraphicFramePr/>
             <a:graphic xmlns:a="http://schemas.openxmlformats.org/drawingml/2006/main">
               <a:graphicData uri="http://schemas.openxmlformats.org/drawingml/2006/picture">
                 <pic:pic xmlns:pic="http://schemas.openxmlformats.org/drawingml/2006/picture">
                   <pic:nvPicPr>
-                    <pic:cNvPr id="1026257946" name=""/>
+                    <pic:cNvPr id="1315136103" name=""/>
                     <pic:cNvPicPr/>
                   </pic:nvPicPr>
                   <pic:blipFill>
@@ -13606,7 +13624,7 @@
           <w:sz w:val="27"/>
         </w:rPr>
       </w:pPr>
-      <w:bookmarkStart w:id="25" w:name="_Toc239847904"/>
+      <w:bookmarkStart w:id="25" w:name="_Toc239864461"/>
       <w:r>
         <w:rPr>
           <w:rFonts w:ascii="Montserrat" w:hAnsi="Montserrat"/>
@@ -13647,16 +13665,16 @@
         </w:rPr>
         <w:lastRenderedPageBreak/>
         <w:drawing>
-          <wp:inline distT="0" distB="0" distL="0" distR="0" wp14:anchorId="7ADC48E9" wp14:editId="0D09774B">
+          <wp:inline distT="0" distB="0" distL="0" distR="0" wp14:anchorId="4F303F05" wp14:editId="7BCF4B66">
             <wp:extent cx="5120640" cy="4627581"/>
             <wp:effectExtent l="19050" t="19050" r="22860" b="20955"/>
-            <wp:docPr id="2086808795" name="Imagem 18"/>
+            <wp:docPr id="301015028" name="Imagem 18"/>
             <wp:cNvGraphicFramePr/>
             <a:graphic xmlns:a="http://schemas.openxmlformats.org/drawingml/2006/main">
               <a:graphicData uri="http://schemas.openxmlformats.org/drawingml/2006/picture">
                 <pic:pic xmlns:pic="http://schemas.openxmlformats.org/drawingml/2006/picture">
                   <pic:nvPicPr>
-                    <pic:cNvPr id="2086808795" name=""/>
+                    <pic:cNvPr id="301015028" name=""/>
                     <pic:cNvPicPr/>
                   </pic:nvPicPr>
                   <pic:blipFill>
@@ -13724,16 +13742,16 @@
         </w:rPr>
         <w:lastRenderedPageBreak/>
         <w:drawing>
-          <wp:inline distT="0" distB="0" distL="0" distR="0" wp14:anchorId="6B143774" wp14:editId="675D157F">
+          <wp:inline distT="0" distB="0" distL="0" distR="0" wp14:anchorId="521FDDE4" wp14:editId="18378842">
             <wp:extent cx="5120640" cy="4627581"/>
             <wp:effectExtent l="19050" t="19050" r="22860" b="20955"/>
-            <wp:docPr id="1305222549" name="Imagem 19"/>
+            <wp:docPr id="2038498959" name="Imagem 19"/>
             <wp:cNvGraphicFramePr/>
             <a:graphic xmlns:a="http://schemas.openxmlformats.org/drawingml/2006/main">
               <a:graphicData uri="http://schemas.openxmlformats.org/drawingml/2006/picture">
                 <pic:pic xmlns:pic="http://schemas.openxmlformats.org/drawingml/2006/picture">
                   <pic:nvPicPr>
-                    <pic:cNvPr id="1305222549" name=""/>
+                    <pic:cNvPr id="2038498959" name=""/>
                     <pic:cNvPicPr/>
                   </pic:nvPicPr>
                   <pic:blipFill>
@@ -13916,7 +13934,7 @@
           <w:sz w:val="27"/>
         </w:rPr>
       </w:pPr>
-      <w:bookmarkStart w:id="26" w:name="_Toc239847905"/>
+      <w:bookmarkStart w:id="26" w:name="_Toc239864462"/>
       <w:r>
         <w:rPr>
           <w:rFonts w:ascii="Montserrat" w:hAnsi="Montserrat"/>
@@ -13956,16 +13974,16 @@
           <w:noProof/>
         </w:rPr>
         <w:drawing>
-          <wp:inline distT="0" distB="0" distL="0" distR="0" wp14:anchorId="6DDF730D" wp14:editId="357CDDAB">
+          <wp:inline distT="0" distB="0" distL="0" distR="0" wp14:anchorId="5E224E71" wp14:editId="0DDA7291">
             <wp:extent cx="5120640" cy="4627581"/>
             <wp:effectExtent l="19050" t="19050" r="22860" b="20955"/>
-            <wp:docPr id="994127746" name="Imagem 20"/>
+            <wp:docPr id="1018663164" name="Imagem 20"/>
             <wp:cNvGraphicFramePr/>
             <a:graphic xmlns:a="http://schemas.openxmlformats.org/drawingml/2006/main">
               <a:graphicData uri="http://schemas.openxmlformats.org/drawingml/2006/picture">
                 <pic:pic xmlns:pic="http://schemas.openxmlformats.org/drawingml/2006/picture">
                   <pic:nvPicPr>
-                    <pic:cNvPr id="994127746" name=""/>
+                    <pic:cNvPr id="1018663164" name=""/>
                     <pic:cNvPicPr/>
                   </pic:nvPicPr>
                   <pic:blipFill>
@@ -14033,16 +14051,16 @@
         </w:rPr>
         <w:lastRenderedPageBreak/>
         <w:drawing>
-          <wp:inline distT="0" distB="0" distL="0" distR="0" wp14:anchorId="476BF7C9" wp14:editId="79CE1C49">
+          <wp:inline distT="0" distB="0" distL="0" distR="0" wp14:anchorId="33242309" wp14:editId="7C72E5CF">
             <wp:extent cx="5120640" cy="4627581"/>
             <wp:effectExtent l="19050" t="19050" r="22860" b="20955"/>
-            <wp:docPr id="1351450997" name="Imagem 21"/>
+            <wp:docPr id="1061935086" name="Imagem 21"/>
             <wp:cNvGraphicFramePr/>
             <a:graphic xmlns:a="http://schemas.openxmlformats.org/drawingml/2006/main">
               <a:graphicData uri="http://schemas.openxmlformats.org/drawingml/2006/picture">
                 <pic:pic xmlns:pic="http://schemas.openxmlformats.org/drawingml/2006/picture">
                   <pic:nvPicPr>
-                    <pic:cNvPr id="1351450997" name=""/>
+                    <pic:cNvPr id="1061935086" name=""/>
                     <pic:cNvPicPr/>
                   </pic:nvPicPr>
                   <pic:blipFill>
@@ -14248,16 +14266,16 @@
           <w:noProof/>
         </w:rPr>
         <w:drawing>
-          <wp:inline distT="0" distB="0" distL="0" distR="0" wp14:anchorId="0B1B59A3" wp14:editId="6A4B1527">
+          <wp:inline distT="0" distB="0" distL="0" distR="0" wp14:anchorId="58F0DFCD" wp14:editId="34C006CD">
             <wp:extent cx="5120640" cy="1757287"/>
             <wp:effectExtent l="19050" t="19050" r="22860" b="14605"/>
-            <wp:docPr id="455716435" name="Imagem 22"/>
+            <wp:docPr id="931464732" name="Imagem 22"/>
             <wp:cNvGraphicFramePr/>
             <a:graphic xmlns:a="http://schemas.openxmlformats.org/drawingml/2006/main">
               <a:graphicData uri="http://schemas.openxmlformats.org/drawingml/2006/picture">
                 <pic:pic xmlns:pic="http://schemas.openxmlformats.org/drawingml/2006/picture">
                   <pic:nvPicPr>
-                    <pic:cNvPr id="455716435" name=""/>
+                    <pic:cNvPr id="931464732" name=""/>
                     <pic:cNvPicPr/>
                   </pic:nvPicPr>
                   <pic:blipFill>
@@ -14370,7 +14388,7 @@
           <w:sz w:val="27"/>
         </w:rPr>
       </w:pPr>
-      <w:bookmarkStart w:id="27" w:name="_Toc239847906"/>
+      <w:bookmarkStart w:id="27" w:name="_Toc239864463"/>
       <w:r>
         <w:rPr>
           <w:rFonts w:ascii="Montserrat" w:hAnsi="Montserrat"/>
@@ -14411,16 +14429,16 @@
         </w:rPr>
         <w:lastRenderedPageBreak/>
         <w:drawing>
-          <wp:inline distT="0" distB="0" distL="0" distR="0" wp14:anchorId="0F5140ED" wp14:editId="0187F646">
+          <wp:inline distT="0" distB="0" distL="0" distR="0" wp14:anchorId="52B9FC9A" wp14:editId="7EE295EC">
             <wp:extent cx="5120640" cy="4627581"/>
             <wp:effectExtent l="19050" t="19050" r="22860" b="20955"/>
-            <wp:docPr id="2027106703" name="Imagem 23"/>
+            <wp:docPr id="1404631724" name="Imagem 23"/>
             <wp:cNvGraphicFramePr/>
             <a:graphic xmlns:a="http://schemas.openxmlformats.org/drawingml/2006/main">
               <a:graphicData uri="http://schemas.openxmlformats.org/drawingml/2006/picture">
                 <pic:pic xmlns:pic="http://schemas.openxmlformats.org/drawingml/2006/picture">
                   <pic:nvPicPr>
-                    <pic:cNvPr id="2027106703" name=""/>
+                    <pic:cNvPr id="1404631724" name=""/>
                     <pic:cNvPicPr/>
                   </pic:nvPicPr>
                   <pic:blipFill>
@@ -14488,16 +14506,16 @@
         </w:rPr>
         <w:lastRenderedPageBreak/>
         <w:drawing>
-          <wp:inline distT="0" distB="0" distL="0" distR="0" wp14:anchorId="146E7160" wp14:editId="4A52D020">
+          <wp:inline distT="0" distB="0" distL="0" distR="0" wp14:anchorId="7A8A942A" wp14:editId="5A4C25FF">
             <wp:extent cx="5120640" cy="4627581"/>
             <wp:effectExtent l="19050" t="19050" r="22860" b="20955"/>
-            <wp:docPr id="1372930038" name="Imagem 24"/>
+            <wp:docPr id="1554674535" name="Imagem 24"/>
             <wp:cNvGraphicFramePr/>
             <a:graphic xmlns:a="http://schemas.openxmlformats.org/drawingml/2006/main">
               <a:graphicData uri="http://schemas.openxmlformats.org/drawingml/2006/picture">
                 <pic:pic xmlns:pic="http://schemas.openxmlformats.org/drawingml/2006/picture">
                   <pic:nvPicPr>
-                    <pic:cNvPr id="1372930038" name=""/>
+                    <pic:cNvPr id="1554674535" name=""/>
                     <pic:cNvPicPr/>
                   </pic:nvPicPr>
                   <pic:blipFill>
@@ -14734,7 +14752,7 @@
           <w:sz w:val="27"/>
         </w:rPr>
       </w:pPr>
-      <w:bookmarkStart w:id="28" w:name="_Toc239847907"/>
+      <w:bookmarkStart w:id="28" w:name="_Toc239864464"/>
       <w:r>
         <w:rPr>
           <w:rFonts w:ascii="Montserrat" w:hAnsi="Montserrat"/>
@@ -14774,16 +14792,16 @@
           <w:noProof/>
         </w:rPr>
         <w:drawing>
-          <wp:inline distT="0" distB="0" distL="0" distR="0" wp14:anchorId="7ADA413E" wp14:editId="23FF2F5D">
+          <wp:inline distT="0" distB="0" distL="0" distR="0" wp14:anchorId="78FB4BBA" wp14:editId="4084C186">
             <wp:extent cx="5120640" cy="4627581"/>
             <wp:effectExtent l="19050" t="19050" r="22860" b="20955"/>
-            <wp:docPr id="352772329" name="Imagem 25"/>
+            <wp:docPr id="488162850" name="Imagem 25"/>
             <wp:cNvGraphicFramePr/>
             <a:graphic xmlns:a="http://schemas.openxmlformats.org/drawingml/2006/main">
               <a:graphicData uri="http://schemas.openxmlformats.org/drawingml/2006/picture">
                 <pic:pic xmlns:pic="http://schemas.openxmlformats.org/drawingml/2006/picture">
                   <pic:nvPicPr>
-                    <pic:cNvPr id="352772329" name=""/>
+                    <pic:cNvPr id="488162850" name=""/>
                     <pic:cNvPicPr/>
                   </pic:nvPicPr>
                   <pic:blipFill>
@@ -14851,16 +14869,16 @@
         </w:rPr>
         <w:lastRenderedPageBreak/>
         <w:drawing>
-          <wp:inline distT="0" distB="0" distL="0" distR="0" wp14:anchorId="151A21EE" wp14:editId="313550E1">
+          <wp:inline distT="0" distB="0" distL="0" distR="0" wp14:anchorId="0B73CDA4" wp14:editId="263A812A">
             <wp:extent cx="5120640" cy="4627581"/>
             <wp:effectExtent l="19050" t="19050" r="22860" b="20955"/>
-            <wp:docPr id="965010347" name="Imagem 26"/>
+            <wp:docPr id="969899302" name="Imagem 26"/>
             <wp:cNvGraphicFramePr/>
             <a:graphic xmlns:a="http://schemas.openxmlformats.org/drawingml/2006/main">
               <a:graphicData uri="http://schemas.openxmlformats.org/drawingml/2006/picture">
                 <pic:pic xmlns:pic="http://schemas.openxmlformats.org/drawingml/2006/picture">
                   <pic:nvPicPr>
-                    <pic:cNvPr id="965010347" name=""/>
+                    <pic:cNvPr id="969899302" name=""/>
                     <pic:cNvPicPr/>
                   </pic:nvPicPr>
                   <pic:blipFill>
@@ -15051,7 +15069,7 @@
           <w:sz w:val="27"/>
         </w:rPr>
       </w:pPr>
-      <w:bookmarkStart w:id="29" w:name="_Toc239847908"/>
+      <w:bookmarkStart w:id="29" w:name="_Toc239864465"/>
       <w:r>
         <w:rPr>
           <w:rFonts w:ascii="Montserrat" w:hAnsi="Montserrat"/>
@@ -15091,16 +15109,16 @@
           <w:noProof/>
         </w:rPr>
         <w:drawing>
-          <wp:inline distT="0" distB="0" distL="0" distR="0" wp14:anchorId="5738B545" wp14:editId="79695D52">
+          <wp:inline distT="0" distB="0" distL="0" distR="0" wp14:anchorId="4AFECC80" wp14:editId="33BD92FA">
             <wp:extent cx="5120640" cy="4000682"/>
             <wp:effectExtent l="19050" t="19050" r="22860" b="19050"/>
-            <wp:docPr id="951888096" name="Imagem 27"/>
+            <wp:docPr id="355603535" name="Imagem 27"/>
             <wp:cNvGraphicFramePr/>
             <a:graphic xmlns:a="http://schemas.openxmlformats.org/drawingml/2006/main">
               <a:graphicData uri="http://schemas.openxmlformats.org/drawingml/2006/picture">
                 <pic:pic xmlns:pic="http://schemas.openxmlformats.org/drawingml/2006/picture">
                   <pic:nvPicPr>
-                    <pic:cNvPr id="951888096" name=""/>
+                    <pic:cNvPr id="355603535" name=""/>
                     <pic:cNvPicPr/>
                   </pic:nvPicPr>
                   <pic:blipFill>
@@ -15624,7 +15642,7 @@
           <w:sz w:val="34"/>
         </w:rPr>
       </w:pPr>
-      <w:bookmarkStart w:id="30" w:name="_Toc239847909"/>
+      <w:bookmarkStart w:id="30" w:name="_Toc239864466"/>
       <w:r>
         <w:rPr>
           <w:rFonts w:ascii="Montserrat" w:hAnsi="Montserrat"/>
@@ -15666,7 +15684,7 @@
           <w:sz w:val="27"/>
         </w:rPr>
       </w:pPr>
-      <w:bookmarkStart w:id="31" w:name="_Toc239847910"/>
+      <w:bookmarkStart w:id="31" w:name="_Toc239864467"/>
       <w:r>
         <w:rPr>
           <w:rFonts w:ascii="Montserrat" w:hAnsi="Montserrat"/>
@@ -15706,16 +15724,16 @@
           <w:noProof/>
         </w:rPr>
         <w:drawing>
-          <wp:inline distT="0" distB="0" distL="0" distR="0" wp14:anchorId="2899BF0B" wp14:editId="7C805621">
+          <wp:inline distT="0" distB="0" distL="0" distR="0" wp14:anchorId="1AF0BA6D" wp14:editId="28DD2244">
             <wp:extent cx="5120640" cy="4627581"/>
             <wp:effectExtent l="19050" t="19050" r="22860" b="20955"/>
-            <wp:docPr id="149025975" name="Imagem 28"/>
+            <wp:docPr id="1454083795" name="Imagem 28"/>
             <wp:cNvGraphicFramePr/>
             <a:graphic xmlns:a="http://schemas.openxmlformats.org/drawingml/2006/main">
               <a:graphicData uri="http://schemas.openxmlformats.org/drawingml/2006/picture">
                 <pic:pic xmlns:pic="http://schemas.openxmlformats.org/drawingml/2006/picture">
                   <pic:nvPicPr>
-                    <pic:cNvPr id="149025975" name=""/>
+                    <pic:cNvPr id="1454083795" name=""/>
                     <pic:cNvPicPr/>
                   </pic:nvPicPr>
                   <pic:blipFill>
@@ -15783,16 +15801,16 @@
         </w:rPr>
         <w:lastRenderedPageBreak/>
         <w:drawing>
-          <wp:inline distT="0" distB="0" distL="0" distR="0" wp14:anchorId="509D70F2" wp14:editId="6C749063">
+          <wp:inline distT="0" distB="0" distL="0" distR="0" wp14:anchorId="47DF1BA7" wp14:editId="7A52E89A">
             <wp:extent cx="5120640" cy="4627581"/>
             <wp:effectExtent l="19050" t="19050" r="22860" b="20955"/>
-            <wp:docPr id="505302073" name="Imagem 29"/>
+            <wp:docPr id="1965709205" name="Imagem 29"/>
             <wp:cNvGraphicFramePr/>
             <a:graphic xmlns:a="http://schemas.openxmlformats.org/drawingml/2006/main">
               <a:graphicData uri="http://schemas.openxmlformats.org/drawingml/2006/picture">
                 <pic:pic xmlns:pic="http://schemas.openxmlformats.org/drawingml/2006/picture">
                   <pic:nvPicPr>
-                    <pic:cNvPr id="505302073" name=""/>
+                    <pic:cNvPr id="1965709205" name=""/>
                     <pic:cNvPicPr/>
                   </pic:nvPicPr>
                   <pic:blipFill>
@@ -15860,16 +15878,16 @@
         </w:rPr>
         <w:lastRenderedPageBreak/>
         <w:drawing>
-          <wp:inline distT="0" distB="0" distL="0" distR="0" wp14:anchorId="0CAE40DC" wp14:editId="64072058">
+          <wp:inline distT="0" distB="0" distL="0" distR="0" wp14:anchorId="75A29A5C" wp14:editId="30FE15B7">
             <wp:extent cx="5120640" cy="4627581"/>
             <wp:effectExtent l="19050" t="19050" r="22860" b="20955"/>
-            <wp:docPr id="1624859002" name="Imagem 30"/>
+            <wp:docPr id="1390067783" name="Imagem 30"/>
             <wp:cNvGraphicFramePr/>
             <a:graphic xmlns:a="http://schemas.openxmlformats.org/drawingml/2006/main">
               <a:graphicData uri="http://schemas.openxmlformats.org/drawingml/2006/picture">
                 <pic:pic xmlns:pic="http://schemas.openxmlformats.org/drawingml/2006/picture">
                   <pic:nvPicPr>
-                    <pic:cNvPr id="1624859002" name=""/>
+                    <pic:cNvPr id="1390067783" name=""/>
                     <pic:cNvPicPr/>
                   </pic:nvPicPr>
                   <pic:blipFill>
@@ -15959,8 +15977,16 @@
         </w:numPr>
         <w:spacing w:after="80" w:line="260" w:lineRule="auto"/>
         <w:ind w:left="700"/>
-      </w:pPr>
-      <w:r>
+        <w:rPr>
+          <w:color w:val="1A1A1A"/>
+          <w:sz w:val="22"/>
+        </w:rPr>
+      </w:pPr>
+      <w:r>
+        <w:rPr>
+          <w:color w:val="1A1A1A"/>
+          <w:sz w:val="22"/>
+        </w:rPr>
         <w:t>Adicione cada projeto do portfolio, com status, % execucao, datas e os campos Merece atencao e Merece destaque.</w:t>
       </w:r>
     </w:p>
@@ -16053,16 +16079,16 @@
           <w:noProof/>
         </w:rPr>
         <w:drawing>
-          <wp:inline distT="0" distB="0" distL="0" distR="0" wp14:anchorId="578E0B31" wp14:editId="45617789">
+          <wp:inline distT="0" distB="0" distL="0" distR="0" wp14:anchorId="1864004F" wp14:editId="3208B60B">
             <wp:extent cx="5120640" cy="1715571"/>
             <wp:effectExtent l="19050" t="19050" r="22860" b="18415"/>
-            <wp:docPr id="290912084" name="Imagem 31"/>
+            <wp:docPr id="1615309175" name="Imagem 31"/>
             <wp:cNvGraphicFramePr/>
             <a:graphic xmlns:a="http://schemas.openxmlformats.org/drawingml/2006/main">
               <a:graphicData uri="http://schemas.openxmlformats.org/drawingml/2006/picture">
                 <pic:pic xmlns:pic="http://schemas.openxmlformats.org/drawingml/2006/picture">
                   <pic:nvPicPr>
-                    <pic:cNvPr id="290912084" name=""/>
+                    <pic:cNvPr id="1615309175" name=""/>
                     <pic:cNvPicPr/>
                   </pic:nvPicPr>
                   <pic:blipFill>
@@ -16208,16 +16234,16 @@
           <w:noProof/>
         </w:rPr>
         <w:drawing>
-          <wp:inline distT="0" distB="0" distL="0" distR="0" wp14:anchorId="4F9EB707" wp14:editId="7F2D05C0">
+          <wp:inline distT="0" distB="0" distL="0" distR="0" wp14:anchorId="1B67D93A" wp14:editId="12EA634D">
             <wp:extent cx="5120640" cy="3282818"/>
             <wp:effectExtent l="19050" t="19050" r="22860" b="13335"/>
-            <wp:docPr id="528327687" name="Imagem 32"/>
+            <wp:docPr id="1831625508" name="Imagem 32"/>
             <wp:cNvGraphicFramePr/>
             <a:graphic xmlns:a="http://schemas.openxmlformats.org/drawingml/2006/main">
               <a:graphicData uri="http://schemas.openxmlformats.org/drawingml/2006/picture">
                 <pic:pic xmlns:pic="http://schemas.openxmlformats.org/drawingml/2006/picture">
                   <pic:nvPicPr>
-                    <pic:cNvPr id="528327687" name=""/>
+                    <pic:cNvPr id="1831625508" name=""/>
                     <pic:cNvPicPr/>
                   </pic:nvPicPr>
                   <pic:blipFill>
@@ -16330,16 +16356,16 @@
         </w:rPr>
         <w:lastRenderedPageBreak/>
         <w:drawing>
-          <wp:inline distT="0" distB="0" distL="0" distR="0" wp14:anchorId="174363D0" wp14:editId="735313EC">
+          <wp:inline distT="0" distB="0" distL="0" distR="0" wp14:anchorId="088C3C42" wp14:editId="59F0561F">
             <wp:extent cx="5120640" cy="951357"/>
             <wp:effectExtent l="19050" t="19050" r="22860" b="20320"/>
-            <wp:docPr id="1887136683" name="Imagem 33"/>
+            <wp:docPr id="1530519355" name="Imagem 33"/>
             <wp:cNvGraphicFramePr/>
             <a:graphic xmlns:a="http://schemas.openxmlformats.org/drawingml/2006/main">
               <a:graphicData uri="http://schemas.openxmlformats.org/drawingml/2006/picture">
                 <pic:pic xmlns:pic="http://schemas.openxmlformats.org/drawingml/2006/picture">
                   <pic:nvPicPr>
-                    <pic:cNvPr id="1887136683" name=""/>
+                    <pic:cNvPr id="1530519355" name=""/>
                     <pic:cNvPicPr/>
                   </pic:nvPicPr>
                   <pic:blipFill>
@@ -16451,16 +16477,16 @@
           <w:noProof/>
         </w:rPr>
         <w:drawing>
-          <wp:inline distT="0" distB="0" distL="0" distR="0" wp14:anchorId="3603F623" wp14:editId="777C5056">
+          <wp:inline distT="0" distB="0" distL="0" distR="0" wp14:anchorId="1C85792C" wp14:editId="5D31A0F3">
             <wp:extent cx="5120640" cy="1515102"/>
             <wp:effectExtent l="19050" t="19050" r="22860" b="28575"/>
-            <wp:docPr id="212406431" name="Imagem 34"/>
+            <wp:docPr id="1728943997" name="Imagem 34"/>
             <wp:cNvGraphicFramePr/>
             <a:graphic xmlns:a="http://schemas.openxmlformats.org/drawingml/2006/main">
               <a:graphicData uri="http://schemas.openxmlformats.org/drawingml/2006/picture">
                 <pic:pic xmlns:pic="http://schemas.openxmlformats.org/drawingml/2006/picture">
                   <pic:nvPicPr>
-                    <pic:cNvPr id="212406431" name=""/>
+                    <pic:cNvPr id="1728943997" name=""/>
                     <pic:cNvPicPr/>
                   </pic:nvPicPr>
                   <pic:blipFill>
@@ -16582,16 +16608,16 @@
           <w:noProof/>
         </w:rPr>
         <w:drawing>
-          <wp:inline distT="0" distB="0" distL="0" distR="0" wp14:anchorId="55DE3A40" wp14:editId="667D7925">
+          <wp:inline distT="0" distB="0" distL="0" distR="0" wp14:anchorId="628FE9A1" wp14:editId="46517522">
             <wp:extent cx="5120640" cy="1391113"/>
             <wp:effectExtent l="19050" t="19050" r="22860" b="19050"/>
-            <wp:docPr id="1646904943" name="Imagem 35"/>
+            <wp:docPr id="1815584681" name="Imagem 35"/>
             <wp:cNvGraphicFramePr/>
             <a:graphic xmlns:a="http://schemas.openxmlformats.org/drawingml/2006/main">
               <a:graphicData uri="http://schemas.openxmlformats.org/drawingml/2006/picture">
                 <pic:pic xmlns:pic="http://schemas.openxmlformats.org/drawingml/2006/picture">
                   <pic:nvPicPr>
-                    <pic:cNvPr id="1646904943" name=""/>
+                    <pic:cNvPr id="1815584681" name=""/>
                     <pic:cNvPicPr/>
                   </pic:nvPicPr>
                   <pic:blipFill>
@@ -16703,16 +16729,16 @@
           <w:noProof/>
         </w:rPr>
         <w:drawing>
-          <wp:inline distT="0" distB="0" distL="0" distR="0" wp14:anchorId="03DB2AF9" wp14:editId="1CE09FAA">
+          <wp:inline distT="0" distB="0" distL="0" distR="0" wp14:anchorId="6E756ED0" wp14:editId="035819A9">
             <wp:extent cx="5120640" cy="1125174"/>
             <wp:effectExtent l="19050" t="19050" r="22860" b="18415"/>
-            <wp:docPr id="1265859384" name="Imagem 36"/>
+            <wp:docPr id="776104484" name="Imagem 36"/>
             <wp:cNvGraphicFramePr/>
             <a:graphic xmlns:a="http://schemas.openxmlformats.org/drawingml/2006/main">
               <a:graphicData uri="http://schemas.openxmlformats.org/drawingml/2006/picture">
                 <pic:pic xmlns:pic="http://schemas.openxmlformats.org/drawingml/2006/picture">
                   <pic:nvPicPr>
-                    <pic:cNvPr id="1265859384" name=""/>
+                    <pic:cNvPr id="776104484" name=""/>
                     <pic:cNvPicPr/>
                   </pic:nvPicPr>
                   <pic:blipFill>
@@ -16801,7 +16827,7 @@
           <w:sz w:val="27"/>
         </w:rPr>
       </w:pPr>
-      <w:bookmarkStart w:id="32" w:name="_Toc239847911"/>
+      <w:bookmarkStart w:id="32" w:name="_Toc239864468"/>
       <w:r>
         <w:rPr>
           <w:rFonts w:ascii="Montserrat" w:hAnsi="Montserrat"/>
@@ -16842,16 +16868,16 @@
           <w:noProof/>
         </w:rPr>
         <w:drawing>
-          <wp:inline distT="0" distB="0" distL="0" distR="0" wp14:anchorId="53F0B515" wp14:editId="0956FC0F">
+          <wp:inline distT="0" distB="0" distL="0" distR="0" wp14:anchorId="71AC9120" wp14:editId="7F399EBF">
             <wp:extent cx="5120640" cy="4627581"/>
             <wp:effectExtent l="19050" t="19050" r="22860" b="20955"/>
-            <wp:docPr id="102325349" name="Imagem 37"/>
+            <wp:docPr id="632722533" name="Imagem 37"/>
             <wp:cNvGraphicFramePr/>
             <a:graphic xmlns:a="http://schemas.openxmlformats.org/drawingml/2006/main">
               <a:graphicData uri="http://schemas.openxmlformats.org/drawingml/2006/picture">
                 <pic:pic xmlns:pic="http://schemas.openxmlformats.org/drawingml/2006/picture">
                   <pic:nvPicPr>
-                    <pic:cNvPr id="102325349" name=""/>
+                    <pic:cNvPr id="632722533" name=""/>
                     <pic:cNvPicPr/>
                   </pic:nvPicPr>
                   <pic:blipFill>
@@ -16919,16 +16945,16 @@
         </w:rPr>
         <w:lastRenderedPageBreak/>
         <w:drawing>
-          <wp:inline distT="0" distB="0" distL="0" distR="0" wp14:anchorId="7AE12763" wp14:editId="52C9246B">
+          <wp:inline distT="0" distB="0" distL="0" distR="0" wp14:anchorId="18ECB212" wp14:editId="65B4C734">
             <wp:extent cx="5120640" cy="4627581"/>
             <wp:effectExtent l="19050" t="19050" r="22860" b="20955"/>
-            <wp:docPr id="816520370" name="Imagem 38"/>
+            <wp:docPr id="1627980813" name="Imagem 38"/>
             <wp:cNvGraphicFramePr/>
             <a:graphic xmlns:a="http://schemas.openxmlformats.org/drawingml/2006/main">
               <a:graphicData uri="http://schemas.openxmlformats.org/drawingml/2006/picture">
                 <pic:pic xmlns:pic="http://schemas.openxmlformats.org/drawingml/2006/picture">
                   <pic:nvPicPr>
-                    <pic:cNvPr id="816520370" name=""/>
+                    <pic:cNvPr id="1627980813" name=""/>
                     <pic:cNvPicPr/>
                   </pic:nvPicPr>
                   <pic:blipFill>
@@ -17097,16 +17123,16 @@
           <w:noProof/>
         </w:rPr>
         <w:drawing>
-          <wp:inline distT="0" distB="0" distL="0" distR="0" wp14:anchorId="796668F6" wp14:editId="4B5EBA53">
+          <wp:inline distT="0" distB="0" distL="0" distR="0" wp14:anchorId="012AF451" wp14:editId="7FD98EB0">
             <wp:extent cx="5120640" cy="2144319"/>
             <wp:effectExtent l="19050" t="19050" r="22860" b="27940"/>
-            <wp:docPr id="1461527689" name="Imagem 39"/>
+            <wp:docPr id="1506353929" name="Imagem 39"/>
             <wp:cNvGraphicFramePr/>
             <a:graphic xmlns:a="http://schemas.openxmlformats.org/drawingml/2006/main">
               <a:graphicData uri="http://schemas.openxmlformats.org/drawingml/2006/picture">
                 <pic:pic xmlns:pic="http://schemas.openxmlformats.org/drawingml/2006/picture">
                   <pic:nvPicPr>
-                    <pic:cNvPr id="1461527689" name=""/>
+                    <pic:cNvPr id="1506353929" name=""/>
                     <pic:cNvPicPr/>
                   </pic:nvPicPr>
                   <pic:blipFill>
@@ -17194,16 +17220,16 @@
           <w:noProof/>
         </w:rPr>
         <w:drawing>
-          <wp:inline distT="0" distB="0" distL="0" distR="0" wp14:anchorId="0428DD72" wp14:editId="702C1C3A">
+          <wp:inline distT="0" distB="0" distL="0" distR="0" wp14:anchorId="17097B6E" wp14:editId="0138EC53">
             <wp:extent cx="5120640" cy="1055647"/>
             <wp:effectExtent l="19050" t="19050" r="22860" b="11430"/>
-            <wp:docPr id="1612904267" name="Imagem 40"/>
+            <wp:docPr id="1780819286" name="Imagem 40"/>
             <wp:cNvGraphicFramePr/>
             <a:graphic xmlns:a="http://schemas.openxmlformats.org/drawingml/2006/main">
               <a:graphicData uri="http://schemas.openxmlformats.org/drawingml/2006/picture">
                 <pic:pic xmlns:pic="http://schemas.openxmlformats.org/drawingml/2006/picture">
                   <pic:nvPicPr>
-                    <pic:cNvPr id="1612904267" name=""/>
+                    <pic:cNvPr id="1780819286" name=""/>
                     <pic:cNvPicPr/>
                   </pic:nvPicPr>
                   <pic:blipFill>
@@ -17325,16 +17351,16 @@
           <w:noProof/>
         </w:rPr>
         <w:drawing>
-          <wp:inline distT="0" distB="0" distL="0" distR="0" wp14:anchorId="7EC50279" wp14:editId="21EA3865">
+          <wp:inline distT="0" distB="0" distL="0" distR="0" wp14:anchorId="298F233F" wp14:editId="19B09FE2">
             <wp:extent cx="5120640" cy="3282818"/>
             <wp:effectExtent l="19050" t="19050" r="22860" b="13335"/>
-            <wp:docPr id="9981754" name="Imagem 41"/>
+            <wp:docPr id="1328025486" name="Imagem 41"/>
             <wp:cNvGraphicFramePr/>
             <a:graphic xmlns:a="http://schemas.openxmlformats.org/drawingml/2006/main">
               <a:graphicData uri="http://schemas.openxmlformats.org/drawingml/2006/picture">
                 <pic:pic xmlns:pic="http://schemas.openxmlformats.org/drawingml/2006/picture">
                   <pic:nvPicPr>
-                    <pic:cNvPr id="9981754" name=""/>
+                    <pic:cNvPr id="1328025486" name=""/>
                     <pic:cNvPicPr/>
                   </pic:nvPicPr>
                   <pic:blipFill>
@@ -17468,16 +17494,16 @@
         </w:rPr>
         <w:lastRenderedPageBreak/>
         <w:drawing>
-          <wp:inline distT="0" distB="0" distL="0" distR="0" wp14:anchorId="28333BF5" wp14:editId="09936974">
+          <wp:inline distT="0" distB="0" distL="0" distR="0" wp14:anchorId="08804B69" wp14:editId="5797F062">
             <wp:extent cx="5120640" cy="1978034"/>
             <wp:effectExtent l="19050" t="19050" r="22860" b="22225"/>
-            <wp:docPr id="1368370382" name="Imagem 42"/>
+            <wp:docPr id="1291274159" name="Imagem 42"/>
             <wp:cNvGraphicFramePr/>
             <a:graphic xmlns:a="http://schemas.openxmlformats.org/drawingml/2006/main">
               <a:graphicData uri="http://schemas.openxmlformats.org/drawingml/2006/picture">
                 <pic:pic xmlns:pic="http://schemas.openxmlformats.org/drawingml/2006/picture">
                   <pic:nvPicPr>
-                    <pic:cNvPr id="1368370382" name=""/>
+                    <pic:cNvPr id="1291274159" name=""/>
                     <pic:cNvPicPr/>
                   </pic:nvPicPr>
                   <pic:blipFill>
@@ -17549,7 +17575,7 @@
           <w:sz w:val="34"/>
         </w:rPr>
       </w:pPr>
-      <w:bookmarkStart w:id="33" w:name="_Toc239847912"/>
+      <w:bookmarkStart w:id="33" w:name="_Toc239864469"/>
       <w:r>
         <w:rPr>
           <w:rFonts w:ascii="Montserrat" w:hAnsi="Montserrat"/>
@@ -17609,7 +17635,7 @@
           <w:sz w:val="27"/>
         </w:rPr>
       </w:pPr>
-      <w:bookmarkStart w:id="34" w:name="_Toc239847913"/>
+      <w:bookmarkStart w:id="34" w:name="_Toc239864470"/>
       <w:r>
         <w:rPr>
           <w:rFonts w:ascii="Montserrat" w:hAnsi="Montserrat"/>
@@ -17649,16 +17675,16 @@
           <w:noProof/>
         </w:rPr>
         <w:drawing>
-          <wp:inline distT="0" distB="0" distL="0" distR="0" wp14:anchorId="60CDEA55" wp14:editId="37F9D223">
+          <wp:inline distT="0" distB="0" distL="0" distR="0" wp14:anchorId="44F42A3A" wp14:editId="134B3205">
             <wp:extent cx="5303520" cy="4792851"/>
             <wp:effectExtent l="19050" t="19050" r="11430" b="27305"/>
-            <wp:docPr id="342127375" name="Imagem 43"/>
+            <wp:docPr id="1981696990" name="Imagem 43"/>
             <wp:cNvGraphicFramePr/>
             <a:graphic xmlns:a="http://schemas.openxmlformats.org/drawingml/2006/main">
               <a:graphicData uri="http://schemas.openxmlformats.org/drawingml/2006/picture">
                 <pic:pic xmlns:pic="http://schemas.openxmlformats.org/drawingml/2006/picture">
                   <pic:nvPicPr>
-                    <pic:cNvPr id="342127375" name=""/>
+                    <pic:cNvPr id="1981696990" name=""/>
                     <pic:cNvPicPr/>
                   </pic:nvPicPr>
                   <pic:blipFill>
@@ -17727,7 +17753,7 @@
           <w:sz w:val="27"/>
         </w:rPr>
       </w:pPr>
-      <w:bookmarkStart w:id="35" w:name="_Toc239847914"/>
+      <w:bookmarkStart w:id="35" w:name="_Toc239864471"/>
       <w:r>
         <w:rPr>
           <w:rFonts w:ascii="Montserrat" w:hAnsi="Montserrat"/>
@@ -17767,16 +17793,16 @@
           <w:noProof/>
         </w:rPr>
         <w:drawing>
-          <wp:inline distT="0" distB="0" distL="0" distR="0" wp14:anchorId="4526A5E2" wp14:editId="4216979F">
+          <wp:inline distT="0" distB="0" distL="0" distR="0" wp14:anchorId="1D1892EA" wp14:editId="25961E65">
             <wp:extent cx="5303520" cy="4792851"/>
             <wp:effectExtent l="19050" t="19050" r="11430" b="27305"/>
-            <wp:docPr id="1024631369" name="Imagem 44"/>
+            <wp:docPr id="1848574821" name="Imagem 44"/>
             <wp:cNvGraphicFramePr/>
             <a:graphic xmlns:a="http://schemas.openxmlformats.org/drawingml/2006/main">
               <a:graphicData uri="http://schemas.openxmlformats.org/drawingml/2006/picture">
                 <pic:pic xmlns:pic="http://schemas.openxmlformats.org/drawingml/2006/picture">
                   <pic:nvPicPr>
-                    <pic:cNvPr id="1024631369" name=""/>
+                    <pic:cNvPr id="1848574821" name=""/>
                     <pic:cNvPicPr/>
                   </pic:nvPicPr>
                   <pic:blipFill>
@@ -17844,7 +17870,7 @@
           <w:sz w:val="27"/>
         </w:rPr>
       </w:pPr>
-      <w:bookmarkStart w:id="36" w:name="_Toc239847915"/>
+      <w:bookmarkStart w:id="36" w:name="_Toc239864472"/>
       <w:r>
         <w:rPr>
           <w:rFonts w:ascii="Montserrat" w:hAnsi="Montserrat"/>
@@ -17885,16 +17911,16 @@
         </w:rPr>
         <w:lastRenderedPageBreak/>
         <w:drawing>
-          <wp:inline distT="0" distB="0" distL="0" distR="0" wp14:anchorId="185B4787" wp14:editId="734A274C">
+          <wp:inline distT="0" distB="0" distL="0" distR="0" wp14:anchorId="44CF7A21" wp14:editId="1180F57C">
             <wp:extent cx="5303520" cy="4792851"/>
             <wp:effectExtent l="19050" t="19050" r="11430" b="27305"/>
-            <wp:docPr id="111536068" name="Imagem 45"/>
+            <wp:docPr id="1335949952" name="Imagem 45"/>
             <wp:cNvGraphicFramePr/>
             <a:graphic xmlns:a="http://schemas.openxmlformats.org/drawingml/2006/main">
               <a:graphicData uri="http://schemas.openxmlformats.org/drawingml/2006/picture">
                 <pic:pic xmlns:pic="http://schemas.openxmlformats.org/drawingml/2006/picture">
                   <pic:nvPicPr>
-                    <pic:cNvPr id="111536068" name=""/>
+                    <pic:cNvPr id="1335949952" name=""/>
                     <pic:cNvPicPr/>
                   </pic:nvPicPr>
                   <pic:blipFill>
@@ -17962,16 +17988,16 @@
         </w:rPr>
         <w:lastRenderedPageBreak/>
         <w:drawing>
-          <wp:inline distT="0" distB="0" distL="0" distR="0" wp14:anchorId="7B2F066C" wp14:editId="0506635E">
+          <wp:inline distT="0" distB="0" distL="0" distR="0" wp14:anchorId="3F1D5643" wp14:editId="6E63728E">
             <wp:extent cx="5303520" cy="4792851"/>
             <wp:effectExtent l="19050" t="19050" r="11430" b="27305"/>
-            <wp:docPr id="2074928968" name="Imagem 46"/>
+            <wp:docPr id="1358879477" name="Imagem 46"/>
             <wp:cNvGraphicFramePr/>
             <a:graphic xmlns:a="http://schemas.openxmlformats.org/drawingml/2006/main">
               <a:graphicData uri="http://schemas.openxmlformats.org/drawingml/2006/picture">
                 <pic:pic xmlns:pic="http://schemas.openxmlformats.org/drawingml/2006/picture">
                   <pic:nvPicPr>
-                    <pic:cNvPr id="2074928968" name=""/>
+                    <pic:cNvPr id="1358879477" name=""/>
                     <pic:cNvPicPr/>
                   </pic:nvPicPr>
                   <pic:blipFill>
@@ -18064,7 +18090,7 @@
           <w:sz w:val="34"/>
         </w:rPr>
       </w:pPr>
-      <w:bookmarkStart w:id="37" w:name="_Toc239847916"/>
+      <w:bookmarkStart w:id="37" w:name="_Toc239864473"/>
       <w:r>
         <w:rPr>
           <w:rFonts w:ascii="Montserrat" w:hAnsi="Montserrat"/>
@@ -18106,7 +18132,7 @@
           <w:sz w:val="27"/>
         </w:rPr>
       </w:pPr>
-      <w:bookmarkStart w:id="38" w:name="_Toc239847917"/>
+      <w:bookmarkStart w:id="38" w:name="_Toc239864474"/>
       <w:r>
         <w:rPr>
           <w:rFonts w:ascii="Montserrat" w:hAnsi="Montserrat"/>
@@ -18146,16 +18172,16 @@
           <w:noProof/>
         </w:rPr>
         <w:drawing>
-          <wp:inline distT="0" distB="0" distL="0" distR="0" wp14:anchorId="0EA24BC9" wp14:editId="623926F0">
+          <wp:inline distT="0" distB="0" distL="0" distR="0" wp14:anchorId="3477EE25" wp14:editId="1C83FBD7">
             <wp:extent cx="5303520" cy="4792851"/>
             <wp:effectExtent l="19050" t="19050" r="11430" b="27305"/>
-            <wp:docPr id="837089918" name="Imagem 47"/>
+            <wp:docPr id="2069038463" name="Imagem 47"/>
             <wp:cNvGraphicFramePr/>
             <a:graphic xmlns:a="http://schemas.openxmlformats.org/drawingml/2006/main">
               <a:graphicData uri="http://schemas.openxmlformats.org/drawingml/2006/picture">
                 <pic:pic xmlns:pic="http://schemas.openxmlformats.org/drawingml/2006/picture">
                   <pic:nvPicPr>
-                    <pic:cNvPr id="837089918" name=""/>
+                    <pic:cNvPr id="2069038463" name=""/>
                     <pic:cNvPicPr/>
                   </pic:nvPicPr>
                   <pic:blipFill>
@@ -18302,7 +18328,7 @@
           <w:sz w:val="27"/>
         </w:rPr>
       </w:pPr>
-      <w:bookmarkStart w:id="39" w:name="_Toc239847918"/>
+      <w:bookmarkStart w:id="39" w:name="_Toc239864475"/>
       <w:r>
         <w:rPr>
           <w:rFonts w:ascii="Montserrat" w:hAnsi="Montserrat"/>
@@ -18343,16 +18369,16 @@
         </w:rPr>
         <w:lastRenderedPageBreak/>
         <w:drawing>
-          <wp:inline distT="0" distB="0" distL="0" distR="0" wp14:anchorId="5327D5FA" wp14:editId="2F3924BC">
+          <wp:inline distT="0" distB="0" distL="0" distR="0" wp14:anchorId="11D55D1F" wp14:editId="0EACC99B">
             <wp:extent cx="5303520" cy="4792851"/>
             <wp:effectExtent l="19050" t="19050" r="11430" b="27305"/>
-            <wp:docPr id="1281866737" name="Imagem 48"/>
+            <wp:docPr id="397258434" name="Imagem 48"/>
             <wp:cNvGraphicFramePr/>
             <a:graphic xmlns:a="http://schemas.openxmlformats.org/drawingml/2006/main">
               <a:graphicData uri="http://schemas.openxmlformats.org/drawingml/2006/picture">
                 <pic:pic xmlns:pic="http://schemas.openxmlformats.org/drawingml/2006/picture">
                   <pic:nvPicPr>
-                    <pic:cNvPr id="1281866737" name=""/>
+                    <pic:cNvPr id="397258434" name=""/>
                     <pic:cNvPicPr/>
                   </pic:nvPicPr>
                   <pic:blipFill>
@@ -18420,7 +18446,7 @@
           <w:sz w:val="27"/>
         </w:rPr>
       </w:pPr>
-      <w:bookmarkStart w:id="40" w:name="_Toc239847919"/>
+      <w:bookmarkStart w:id="40" w:name="_Toc239864476"/>
       <w:r>
         <w:rPr>
           <w:rFonts w:ascii="Montserrat" w:hAnsi="Montserrat"/>
@@ -18461,16 +18487,16 @@
         </w:rPr>
         <w:lastRenderedPageBreak/>
         <w:drawing>
-          <wp:inline distT="0" distB="0" distL="0" distR="0" wp14:anchorId="4C9E1B99" wp14:editId="01332D04">
+          <wp:inline distT="0" distB="0" distL="0" distR="0" wp14:anchorId="44118AEC" wp14:editId="27B28FC0">
             <wp:extent cx="5303520" cy="4792851"/>
             <wp:effectExtent l="19050" t="19050" r="11430" b="27305"/>
-            <wp:docPr id="1588685247" name="Imagem 49"/>
+            <wp:docPr id="795305108" name="Imagem 49"/>
             <wp:cNvGraphicFramePr/>
             <a:graphic xmlns:a="http://schemas.openxmlformats.org/drawingml/2006/main">
               <a:graphicData uri="http://schemas.openxmlformats.org/drawingml/2006/picture">
                 <pic:pic xmlns:pic="http://schemas.openxmlformats.org/drawingml/2006/picture">
                   <pic:nvPicPr>
-                    <pic:cNvPr id="1588685247" name=""/>
+                    <pic:cNvPr id="795305108" name=""/>
                     <pic:cNvPicPr/>
                   </pic:nvPicPr>
                   <pic:blipFill>
@@ -18614,7 +18640,7 @@
           <w:sz w:val="27"/>
         </w:rPr>
       </w:pPr>
-      <w:bookmarkStart w:id="41" w:name="_Toc239847920"/>
+      <w:bookmarkStart w:id="41" w:name="_Toc239864477"/>
       <w:r>
         <w:rPr>
           <w:rFonts w:ascii="Montserrat" w:hAnsi="Montserrat"/>
@@ -18775,16 +18801,16 @@
         </w:rPr>
         <w:lastRenderedPageBreak/>
         <w:drawing>
-          <wp:inline distT="0" distB="0" distL="0" distR="0" wp14:anchorId="1284C54A" wp14:editId="634AF1BD">
+          <wp:inline distT="0" distB="0" distL="0" distR="0" wp14:anchorId="09F2D5DA" wp14:editId="3B68FF78">
             <wp:extent cx="5303520" cy="4267180"/>
             <wp:effectExtent l="19050" t="19050" r="11430" b="19685"/>
-            <wp:docPr id="181020006" name="Imagem 50"/>
+            <wp:docPr id="1257836078" name="Imagem 50"/>
             <wp:cNvGraphicFramePr/>
             <a:graphic xmlns:a="http://schemas.openxmlformats.org/drawingml/2006/main">
               <a:graphicData uri="http://schemas.openxmlformats.org/drawingml/2006/picture">
                 <pic:pic xmlns:pic="http://schemas.openxmlformats.org/drawingml/2006/picture">
                   <pic:nvPicPr>
-                    <pic:cNvPr id="181020006" name=""/>
+                    <pic:cNvPr id="1257836078" name=""/>
                     <pic:cNvPicPr/>
                   </pic:nvPicPr>
                   <pic:blipFill>
@@ -18852,16 +18878,16 @@
         </w:rPr>
         <w:lastRenderedPageBreak/>
         <w:drawing>
-          <wp:inline distT="0" distB="0" distL="0" distR="0" wp14:anchorId="56B0E415" wp14:editId="467993BC">
+          <wp:inline distT="0" distB="0" distL="0" distR="0" wp14:anchorId="7F43E9F8" wp14:editId="6A714A50">
             <wp:extent cx="5303520" cy="3382059"/>
             <wp:effectExtent l="19050" t="19050" r="11430" b="27940"/>
-            <wp:docPr id="1012287196" name="Imagem 51"/>
+            <wp:docPr id="401507006" name="Imagem 51"/>
             <wp:cNvGraphicFramePr/>
             <a:graphic xmlns:a="http://schemas.openxmlformats.org/drawingml/2006/main">
               <a:graphicData uri="http://schemas.openxmlformats.org/drawingml/2006/picture">
                 <pic:pic xmlns:pic="http://schemas.openxmlformats.org/drawingml/2006/picture">
                   <pic:nvPicPr>
-                    <pic:cNvPr id="1012287196" name=""/>
+                    <pic:cNvPr id="401507006" name=""/>
                     <pic:cNvPicPr/>
                   </pic:nvPicPr>
                   <pic:blipFill>
@@ -18929,16 +18955,16 @@
         </w:rPr>
         <w:lastRenderedPageBreak/>
         <w:drawing>
-          <wp:inline distT="0" distB="0" distL="0" distR="0" wp14:anchorId="5397F96C" wp14:editId="4F3DFC52">
+          <wp:inline distT="0" distB="0" distL="0" distR="0" wp14:anchorId="5354ACE2" wp14:editId="69D4F2B7">
             <wp:extent cx="5303520" cy="4417800"/>
             <wp:effectExtent l="19050" t="19050" r="11430" b="20955"/>
-            <wp:docPr id="691996541" name="Imagem 52"/>
+            <wp:docPr id="1765696027" name="Imagem 52"/>
             <wp:cNvGraphicFramePr/>
             <a:graphic xmlns:a="http://schemas.openxmlformats.org/drawingml/2006/main">
               <a:graphicData uri="http://schemas.openxmlformats.org/drawingml/2006/picture">
                 <pic:pic xmlns:pic="http://schemas.openxmlformats.org/drawingml/2006/picture">
                   <pic:nvPicPr>
-                    <pic:cNvPr id="691996541" name=""/>
+                    <pic:cNvPr id="1765696027" name=""/>
                     <pic:cNvPicPr/>
                   </pic:nvPicPr>
                   <pic:blipFill>
@@ -19048,7 +19074,7 @@
           <w:sz w:val="27"/>
         </w:rPr>
       </w:pPr>
-      <w:bookmarkStart w:id="42" w:name="_Toc239847921"/>
+      <w:bookmarkStart w:id="42" w:name="_Toc239864478"/>
       <w:r>
         <w:rPr>
           <w:rFonts w:ascii="Montserrat" w:hAnsi="Montserrat"/>
@@ -19266,16 +19292,16 @@
         </w:rPr>
         <w:lastRenderedPageBreak/>
         <w:drawing>
-          <wp:inline distT="0" distB="0" distL="0" distR="0" wp14:anchorId="61C969F7" wp14:editId="15F892E5">
+          <wp:inline distT="0" distB="0" distL="0" distR="0" wp14:anchorId="1CBD14C2" wp14:editId="7F635490">
             <wp:extent cx="5303520" cy="7628836"/>
             <wp:effectExtent l="19050" t="19050" r="11430" b="10795"/>
-            <wp:docPr id="269267044" name="Imagem 53"/>
+            <wp:docPr id="1657610886" name="Imagem 53"/>
             <wp:cNvGraphicFramePr/>
             <a:graphic xmlns:a="http://schemas.openxmlformats.org/drawingml/2006/main">
               <a:graphicData uri="http://schemas.openxmlformats.org/drawingml/2006/picture">
                 <pic:pic xmlns:pic="http://schemas.openxmlformats.org/drawingml/2006/picture">
                   <pic:nvPicPr>
-                    <pic:cNvPr id="269267044" name=""/>
+                    <pic:cNvPr id="1657610886" name=""/>
                     <pic:cNvPicPr/>
                   </pic:nvPicPr>
                   <pic:blipFill>
@@ -19386,7 +19412,7 @@
           <w:sz w:val="27"/>
         </w:rPr>
       </w:pPr>
-      <w:bookmarkStart w:id="43" w:name="_Toc239847922"/>
+      <w:bookmarkStart w:id="43" w:name="_Toc239864479"/>
       <w:r>
         <w:rPr>
           <w:rFonts w:ascii="Montserrat" w:hAnsi="Montserrat"/>
@@ -19539,7 +19565,7 @@
           <w:sz w:val="27"/>
         </w:rPr>
       </w:pPr>
-      <w:bookmarkStart w:id="44" w:name="_Toc239847923"/>
+      <w:bookmarkStart w:id="44" w:name="_Toc239864480"/>
       <w:r>
         <w:rPr>
           <w:rFonts w:ascii="Montserrat" w:hAnsi="Montserrat"/>
@@ -19832,16 +19858,16 @@
           <w:noProof/>
         </w:rPr>
         <w:drawing>
-          <wp:inline distT="0" distB="0" distL="0" distR="0" wp14:anchorId="132B5909" wp14:editId="17F3A9B2">
+          <wp:inline distT="0" distB="0" distL="0" distR="0" wp14:anchorId="6438CB9A" wp14:editId="16BD78C1">
             <wp:extent cx="5303520" cy="1351384"/>
             <wp:effectExtent l="19050" t="19050" r="11430" b="20320"/>
-            <wp:docPr id="1677006029" name="Imagem 54"/>
+            <wp:docPr id="1835351061" name="Imagem 54"/>
             <wp:cNvGraphicFramePr/>
             <a:graphic xmlns:a="http://schemas.openxmlformats.org/drawingml/2006/main">
               <a:graphicData uri="http://schemas.openxmlformats.org/drawingml/2006/picture">
                 <pic:pic xmlns:pic="http://schemas.openxmlformats.org/drawingml/2006/picture">
                   <pic:nvPicPr>
-                    <pic:cNvPr id="1677006029" name=""/>
+                    <pic:cNvPr id="1835351061" name=""/>
                     <pic:cNvPicPr/>
                   </pic:nvPicPr>
                   <pic:blipFill>
@@ -19909,7 +19935,7 @@
           <w:sz w:val="27"/>
         </w:rPr>
       </w:pPr>
-      <w:bookmarkStart w:id="45" w:name="_Toc239847924"/>
+      <w:bookmarkStart w:id="45" w:name="_Toc239864481"/>
       <w:r>
         <w:rPr>
           <w:rFonts w:ascii="Montserrat" w:hAnsi="Montserrat"/>
@@ -20021,16 +20047,16 @@
           <w:noProof/>
         </w:rPr>
         <w:drawing>
-          <wp:inline distT="0" distB="0" distL="0" distR="0" wp14:anchorId="5C2BF062" wp14:editId="03663994">
+          <wp:inline distT="0" distB="0" distL="0" distR="0" wp14:anchorId="2AED458F" wp14:editId="70225451">
             <wp:extent cx="5303520" cy="1422793"/>
             <wp:effectExtent l="19050" t="19050" r="11430" b="25400"/>
-            <wp:docPr id="1859223558" name="Imagem 55"/>
+            <wp:docPr id="1583520657" name="Imagem 55"/>
             <wp:cNvGraphicFramePr/>
             <a:graphic xmlns:a="http://schemas.openxmlformats.org/drawingml/2006/main">
               <a:graphicData uri="http://schemas.openxmlformats.org/drawingml/2006/picture">
                 <pic:pic xmlns:pic="http://schemas.openxmlformats.org/drawingml/2006/picture">
                   <pic:nvPicPr>
-                    <pic:cNvPr id="1859223558" name=""/>
+                    <pic:cNvPr id="1583520657" name=""/>
                     <pic:cNvPicPr/>
                   </pic:nvPicPr>
                   <pic:blipFill>
@@ -20185,16 +20211,16 @@
           <w:noProof/>
         </w:rPr>
         <w:drawing>
-          <wp:inline distT="0" distB="0" distL="0" distR="0" wp14:anchorId="25540D45" wp14:editId="498DD31B">
+          <wp:inline distT="0" distB="0" distL="0" distR="0" wp14:anchorId="4D356073" wp14:editId="2C6461AE">
             <wp:extent cx="5303520" cy="1841050"/>
             <wp:effectExtent l="19050" t="19050" r="11430" b="26035"/>
-            <wp:docPr id="2029845763" name="Imagem 56"/>
+            <wp:docPr id="1283012334" name="Imagem 56"/>
             <wp:cNvGraphicFramePr/>
             <a:graphic xmlns:a="http://schemas.openxmlformats.org/drawingml/2006/main">
               <a:graphicData uri="http://schemas.openxmlformats.org/drawingml/2006/picture">
                 <pic:pic xmlns:pic="http://schemas.openxmlformats.org/drawingml/2006/picture">
                   <pic:nvPicPr>
-                    <pic:cNvPr id="2029845763" name=""/>
+                    <pic:cNvPr id="1283012334" name=""/>
                     <pic:cNvPicPr/>
                   </pic:nvPicPr>
                   <pic:blipFill>
@@ -20357,16 +20383,16 @@
           <w:noProof/>
         </w:rPr>
         <w:drawing>
-          <wp:inline distT="0" distB="0" distL="0" distR="0" wp14:anchorId="77ED0144" wp14:editId="430B4DAD">
+          <wp:inline distT="0" distB="0" distL="0" distR="0" wp14:anchorId="645C9BC9" wp14:editId="0B0E7FAF">
             <wp:extent cx="5303520" cy="303041"/>
             <wp:effectExtent l="19050" t="19050" r="11430" b="20955"/>
-            <wp:docPr id="1105315126" name="Imagem 57"/>
+            <wp:docPr id="1151040752" name="Imagem 57"/>
             <wp:cNvGraphicFramePr/>
             <a:graphic xmlns:a="http://schemas.openxmlformats.org/drawingml/2006/main">
               <a:graphicData uri="http://schemas.openxmlformats.org/drawingml/2006/picture">
                 <pic:pic xmlns:pic="http://schemas.openxmlformats.org/drawingml/2006/picture">
                   <pic:nvPicPr>
-                    <pic:cNvPr id="1105315126" name=""/>
+                    <pic:cNvPr id="1151040752" name=""/>
                     <pic:cNvPicPr/>
                   </pic:nvPicPr>
                   <pic:blipFill>
@@ -20433,16 +20459,16 @@
           <w:noProof/>
         </w:rPr>
         <w:drawing>
-          <wp:inline distT="0" distB="0" distL="0" distR="0" wp14:anchorId="52B0F1EA" wp14:editId="3348581F">
+          <wp:inline distT="0" distB="0" distL="0" distR="0" wp14:anchorId="165AB997" wp14:editId="0287EDE1">
             <wp:extent cx="5303520" cy="2983005"/>
             <wp:effectExtent l="19050" t="19050" r="11430" b="27305"/>
-            <wp:docPr id="1405935389" name="Imagem 58"/>
+            <wp:docPr id="1474634244" name="Imagem 58"/>
             <wp:cNvGraphicFramePr/>
             <a:graphic xmlns:a="http://schemas.openxmlformats.org/drawingml/2006/main">
               <a:graphicData uri="http://schemas.openxmlformats.org/drawingml/2006/picture">
                 <pic:pic xmlns:pic="http://schemas.openxmlformats.org/drawingml/2006/picture">
                   <pic:nvPicPr>
-                    <pic:cNvPr id="1405935389" name=""/>
+                    <pic:cNvPr id="1474634244" name=""/>
                     <pic:cNvPicPr/>
                   </pic:nvPicPr>
                   <pic:blipFill>
@@ -20514,7 +20540,7 @@
           <w:sz w:val="34"/>
         </w:rPr>
       </w:pPr>
-      <w:bookmarkStart w:id="46" w:name="_Toc239847925"/>
+      <w:bookmarkStart w:id="46" w:name="_Toc239864482"/>
       <w:r>
         <w:rPr>
           <w:rFonts w:ascii="Montserrat" w:hAnsi="Montserrat"/>
@@ -20758,7 +20784,7 @@
           <w:sz w:val="34"/>
         </w:rPr>
       </w:pPr>
-      <w:bookmarkStart w:id="47" w:name="_Toc239847926"/>
+      <w:bookmarkStart w:id="47" w:name="_Toc239864483"/>
       <w:r>
         <w:rPr>
           <w:rFonts w:ascii="Montserrat" w:hAnsi="Montserrat"/>
@@ -22546,7 +22572,7 @@
 <file path=word/numbering.xml><?xml version="1.0" encoding="utf-8"?>
 <w:numbering xmlns:wpc="http://schemas.microsoft.com/office/word/2010/wordprocessingCanvas" xmlns:cx="http://schemas.microsoft.com/office/drawing/2014/chartex" xmlns:cx1="http://schemas.microsoft.com/office/drawing/2015/9/8/chartex" xmlns:cx2="http://schemas.microsoft.com/office/drawing/2015/10/21/chartex" xmlns:cx3="http://schemas.microsoft.com/office/drawing/2016/5/9/chartex" xmlns:cx4="http://schemas.microsoft.com/office/drawing/2016/5/10/chartex" xmlns:cx5="http://schemas.microsoft.com/office/drawing/2016/5/11/chartex" xmlns:cx6="http://schemas.microsoft.com/office/drawing/2016/5/12/chartex" xmlns:cx7="http://schemas.microsoft.com/office/drawing/2016/5/13/chartex" xmlns:cx8="http://schemas.microsoft.com/office/drawing/2016/5/14/chartex" xmlns:mc="http://schemas.openxmlformats.org/markup-compatibility/2006" xmlns:aink="http://schemas.microsoft.com/office/drawing/2016/ink" xmlns:am3d="http://schemas.microsoft.com/office/drawing/2017/model3d" xmlns:o="urn:schemas-microsoft-com:office:office" xmlns:oel="http://schemas.microsoft.com/office/2019/extlst" xmlns:r="http://schemas.openxmlformats.org/officeDocument/2006/relationships" xmlns:m="http://schemas.openxmlformats.org/officeDocument/2006/math" xmlns:v="urn:schemas-microsoft-com:vml" xmlns:wp14="http://schemas.microsoft.com/office/word/2010/wordprocessingDrawing" xmlns:wp="http://schemas.openxmlformats.org/drawingml/2006/wordprocessingDrawing" xmlns:w10="urn:schemas-microsoft-com:office:word" xmlns:w="http://schemas.openxmlformats.org/wordprocessingml/2006/main" xmlns:w14="http://schemas.microsoft.com/office/word/2010/wordml" xmlns:w15="http://schemas.microsoft.com/office/word/2012/wordml" xmlns:w16cex="http://schemas.microsoft.com/office/word/2018/wordml/cex" xmlns:w16cid="http://schemas.microsoft.com/office/word/2016/wordml/cid" xmlns:w16="http://schemas.microsoft.com/office/word/2018/wordml" xmlns:w16du="http://schemas.microsoft.com/office/word/2023/wordml/word16du" xmlns:w16sdtdh="http://schemas.microsoft.com/office/word/2020/wordml/sdtdatahash" xmlns:w16sdtfl="http://schemas.microsoft.com/office/word/2024/wordml/sdtformatlock" xmlns:w16se="http://schemas.microsoft.com/office/word/2015/wordml/symex" xmlns:wpg="http://schemas.microsoft.com/office/word/2010/wordprocessingGroup" xmlns:wpi="http://schemas.microsoft.com/office/word/2010/wordprocessingInk" xmlns:wne="http://schemas.microsoft.com/office/word/2006/wordml" xmlns:wps="http://schemas.microsoft.com/office/word/2010/wordprocessingShape" mc:Ignorable="w14 w15 w16se w16cid w16 w16cex w16sdtdh w16sdtfl w16du wp14">
   <w:abstractNum w:abstractNumId="0" w15:restartNumberingAfterBreak="0">
-    <w:nsid w:val="01B82D78"/>
+    <w:nsid w:val="0040382B"/>
     <w:multiLevelType w:val="singleLevel"/>
     <w:tmpl w:val="04160001"/>
     <w:lvl w:ilvl="0">
@@ -22563,7 +22589,7 @@
     </w:lvl>
   </w:abstractNum>
   <w:abstractNum w:abstractNumId="1" w15:restartNumberingAfterBreak="0">
-    <w:nsid w:val="02687251"/>
+    <w:nsid w:val="04A975FB"/>
     <w:multiLevelType w:val="singleLevel"/>
     <w:tmpl w:val="04160001"/>
     <w:lvl w:ilvl="0">
@@ -22580,7 +22606,7 @@
     </w:lvl>
   </w:abstractNum>
   <w:abstractNum w:abstractNumId="2" w15:restartNumberingAfterBreak="0">
-    <w:nsid w:val="031314AA"/>
+    <w:nsid w:val="074C0D50"/>
     <w:multiLevelType w:val="singleLevel"/>
     <w:tmpl w:val="04160001"/>
     <w:lvl w:ilvl="0">
@@ -22597,7 +22623,7 @@
     </w:lvl>
   </w:abstractNum>
   <w:abstractNum w:abstractNumId="3" w15:restartNumberingAfterBreak="0">
-    <w:nsid w:val="04137289"/>
+    <w:nsid w:val="0D6D4F65"/>
     <w:multiLevelType w:val="singleLevel"/>
     <w:tmpl w:val="04160001"/>
     <w:lvl w:ilvl="0">
@@ -22614,7 +22640,7 @@
     </w:lvl>
   </w:abstractNum>
   <w:abstractNum w:abstractNumId="4" w15:restartNumberingAfterBreak="0">
-    <w:nsid w:val="09623020"/>
+    <w:nsid w:val="0E592177"/>
     <w:multiLevelType w:val="singleLevel"/>
     <w:tmpl w:val="04160001"/>
     <w:lvl w:ilvl="0">
@@ -22631,7 +22657,7 @@
     </w:lvl>
   </w:abstractNum>
   <w:abstractNum w:abstractNumId="5" w15:restartNumberingAfterBreak="0">
-    <w:nsid w:val="0AB91DFF"/>
+    <w:nsid w:val="138335D5"/>
     <w:multiLevelType w:val="singleLevel"/>
     <w:tmpl w:val="04160001"/>
     <w:lvl w:ilvl="0">
@@ -22648,7 +22674,7 @@
     </w:lvl>
   </w:abstractNum>
   <w:abstractNum w:abstractNumId="6" w15:restartNumberingAfterBreak="0">
-    <w:nsid w:val="0BF024C0"/>
+    <w:nsid w:val="140548C8"/>
     <w:multiLevelType w:val="singleLevel"/>
     <w:tmpl w:val="04160001"/>
     <w:lvl w:ilvl="0">
@@ -22665,7 +22691,7 @@
     </w:lvl>
   </w:abstractNum>
   <w:abstractNum w:abstractNumId="7" w15:restartNumberingAfterBreak="0">
-    <w:nsid w:val="0D2865B2"/>
+    <w:nsid w:val="1BC64084"/>
     <w:multiLevelType w:val="singleLevel"/>
     <w:tmpl w:val="04160001"/>
     <w:lvl w:ilvl="0">
@@ -22682,7 +22708,7 @@
     </w:lvl>
   </w:abstractNum>
   <w:abstractNum w:abstractNumId="8" w15:restartNumberingAfterBreak="0">
-    <w:nsid w:val="163F22D2"/>
+    <w:nsid w:val="1DDB1558"/>
     <w:multiLevelType w:val="singleLevel"/>
     <w:tmpl w:val="04160001"/>
     <w:lvl w:ilvl="0">
@@ -22699,7 +22725,7 @@
     </w:lvl>
   </w:abstractNum>
   <w:abstractNum w:abstractNumId="9" w15:restartNumberingAfterBreak="0">
-    <w:nsid w:val="19A7419B"/>
+    <w:nsid w:val="277A31B9"/>
     <w:multiLevelType w:val="singleLevel"/>
     <w:tmpl w:val="04160001"/>
     <w:lvl w:ilvl="0">
@@ -22716,7 +22742,7 @@
     </w:lvl>
   </w:abstractNum>
   <w:abstractNum w:abstractNumId="10" w15:restartNumberingAfterBreak="0">
-    <w:nsid w:val="229E41D9"/>
+    <w:nsid w:val="2B1044D4"/>
     <w:multiLevelType w:val="singleLevel"/>
     <w:tmpl w:val="04160001"/>
     <w:lvl w:ilvl="0">
@@ -22733,7 +22759,7 @@
     </w:lvl>
   </w:abstractNum>
   <w:abstractNum w:abstractNumId="11" w15:restartNumberingAfterBreak="0">
-    <w:nsid w:val="23791F8F"/>
+    <w:nsid w:val="38182A88"/>
     <w:multiLevelType w:val="singleLevel"/>
     <w:tmpl w:val="04160001"/>
     <w:lvl w:ilvl="0">
@@ -22750,7 +22776,7 @@
     </w:lvl>
   </w:abstractNum>
   <w:abstractNum w:abstractNumId="12" w15:restartNumberingAfterBreak="0">
-    <w:nsid w:val="2A00773D"/>
+    <w:nsid w:val="3910541C"/>
     <w:multiLevelType w:val="singleLevel"/>
     <w:tmpl w:val="04160001"/>
     <w:lvl w:ilvl="0">
@@ -22767,7 +22793,7 @@
     </w:lvl>
   </w:abstractNum>
   <w:abstractNum w:abstractNumId="13" w15:restartNumberingAfterBreak="0">
-    <w:nsid w:val="2CE34908"/>
+    <w:nsid w:val="3F3F1458"/>
     <w:multiLevelType w:val="singleLevel"/>
     <w:tmpl w:val="04160001"/>
     <w:lvl w:ilvl="0">
@@ -22784,7 +22810,7 @@
     </w:lvl>
   </w:abstractNum>
   <w:abstractNum w:abstractNumId="14" w15:restartNumberingAfterBreak="0">
-    <w:nsid w:val="2F226546"/>
+    <w:nsid w:val="3F710667"/>
     <w:multiLevelType w:val="singleLevel"/>
     <w:tmpl w:val="04160001"/>
     <w:lvl w:ilvl="0">
@@ -22801,7 +22827,7 @@
     </w:lvl>
   </w:abstractNum>
   <w:abstractNum w:abstractNumId="15" w15:restartNumberingAfterBreak="0">
-    <w:nsid w:val="318D1A70"/>
+    <w:nsid w:val="47A54EFA"/>
     <w:multiLevelType w:val="singleLevel"/>
     <w:tmpl w:val="04160001"/>
     <w:lvl w:ilvl="0">
@@ -22818,7 +22844,7 @@
     </w:lvl>
   </w:abstractNum>
   <w:abstractNum w:abstractNumId="16" w15:restartNumberingAfterBreak="0">
-    <w:nsid w:val="327E5148"/>
+    <w:nsid w:val="4B3B5733"/>
     <w:multiLevelType w:val="singleLevel"/>
     <w:tmpl w:val="04160001"/>
     <w:lvl w:ilvl="0">
@@ -22835,7 +22861,7 @@
     </w:lvl>
   </w:abstractNum>
   <w:abstractNum w:abstractNumId="17" w15:restartNumberingAfterBreak="0">
-    <w:nsid w:val="367D0845"/>
+    <w:nsid w:val="4C7867CB"/>
     <w:multiLevelType w:val="singleLevel"/>
     <w:tmpl w:val="04160001"/>
     <w:lvl w:ilvl="0">
@@ -22852,7 +22878,7 @@
     </w:lvl>
   </w:abstractNum>
   <w:abstractNum w:abstractNumId="18" w15:restartNumberingAfterBreak="0">
-    <w:nsid w:val="3AFF15C4"/>
+    <w:nsid w:val="4D8E0A35"/>
     <w:multiLevelType w:val="singleLevel"/>
     <w:tmpl w:val="04160001"/>
     <w:lvl w:ilvl="0">
@@ -22869,7 +22895,7 @@
     </w:lvl>
   </w:abstractNum>
   <w:abstractNum w:abstractNumId="19" w15:restartNumberingAfterBreak="0">
-    <w:nsid w:val="3D401069"/>
+    <w:nsid w:val="50727A85"/>
     <w:multiLevelType w:val="singleLevel"/>
     <w:tmpl w:val="04160001"/>
     <w:lvl w:ilvl="0">
@@ -22886,7 +22912,7 @@
     </w:lvl>
   </w:abstractNum>
   <w:abstractNum w:abstractNumId="20" w15:restartNumberingAfterBreak="0">
-    <w:nsid w:val="48B625EF"/>
+    <w:nsid w:val="5596346E"/>
     <w:multiLevelType w:val="singleLevel"/>
     <w:tmpl w:val="04160001"/>
     <w:lvl w:ilvl="0">
@@ -22903,7 +22929,7 @@
     </w:lvl>
   </w:abstractNum>
   <w:abstractNum w:abstractNumId="21" w15:restartNumberingAfterBreak="0">
-    <w:nsid w:val="498D7120"/>
+    <w:nsid w:val="56E56831"/>
     <w:multiLevelType w:val="singleLevel"/>
     <w:tmpl w:val="04160001"/>
     <w:lvl w:ilvl="0">
@@ -22920,7 +22946,7 @@
     </w:lvl>
   </w:abstractNum>
   <w:abstractNum w:abstractNumId="22" w15:restartNumberingAfterBreak="0">
-    <w:nsid w:val="4CB44CB5"/>
+    <w:nsid w:val="58574E8F"/>
     <w:multiLevelType w:val="singleLevel"/>
     <w:tmpl w:val="04160001"/>
     <w:lvl w:ilvl="0">
@@ -22937,7 +22963,7 @@
     </w:lvl>
   </w:abstractNum>
   <w:abstractNum w:abstractNumId="23" w15:restartNumberingAfterBreak="0">
-    <w:nsid w:val="4D7D6CD3"/>
+    <w:nsid w:val="5B773734"/>
     <w:multiLevelType w:val="singleLevel"/>
     <w:tmpl w:val="04160001"/>
     <w:lvl w:ilvl="0">
@@ -22954,7 +22980,7 @@
     </w:lvl>
   </w:abstractNum>
   <w:abstractNum w:abstractNumId="24" w15:restartNumberingAfterBreak="0">
-    <w:nsid w:val="4D895659"/>
+    <w:nsid w:val="5B9B11CA"/>
     <w:multiLevelType w:val="singleLevel"/>
     <w:tmpl w:val="04160001"/>
     <w:lvl w:ilvl="0">
@@ -22971,7 +22997,7 @@
     </w:lvl>
   </w:abstractNum>
   <w:abstractNum w:abstractNumId="25" w15:restartNumberingAfterBreak="0">
-    <w:nsid w:val="4E5A2091"/>
+    <w:nsid w:val="5C794DA3"/>
     <w:multiLevelType w:val="singleLevel"/>
     <w:tmpl w:val="04160001"/>
     <w:lvl w:ilvl="0">
@@ -22988,7 +23014,7 @@
     </w:lvl>
   </w:abstractNum>
   <w:abstractNum w:abstractNumId="26" w15:restartNumberingAfterBreak="0">
-    <w:nsid w:val="4FC20B32"/>
+    <w:nsid w:val="5E070E69"/>
     <w:multiLevelType w:val="singleLevel"/>
     <w:tmpl w:val="04160001"/>
     <w:lvl w:ilvl="0">
@@ -23005,7 +23031,7 @@
     </w:lvl>
   </w:abstractNum>
   <w:abstractNum w:abstractNumId="27" w15:restartNumberingAfterBreak="0">
-    <w:nsid w:val="517A78AC"/>
+    <w:nsid w:val="65856046"/>
     <w:multiLevelType w:val="singleLevel"/>
     <w:tmpl w:val="04160001"/>
     <w:lvl w:ilvl="0">
@@ -23022,7 +23048,7 @@
     </w:lvl>
   </w:abstractNum>
   <w:abstractNum w:abstractNumId="28" w15:restartNumberingAfterBreak="0">
-    <w:nsid w:val="520C5A57"/>
+    <w:nsid w:val="664369DE"/>
     <w:multiLevelType w:val="singleLevel"/>
     <w:tmpl w:val="04160001"/>
     <w:lvl w:ilvl="0">
@@ -23039,7 +23065,7 @@
     </w:lvl>
   </w:abstractNum>
   <w:abstractNum w:abstractNumId="29" w15:restartNumberingAfterBreak="0">
-    <w:nsid w:val="58383435"/>
+    <w:nsid w:val="66545F33"/>
     <w:multiLevelType w:val="singleLevel"/>
     <w:tmpl w:val="04160001"/>
     <w:lvl w:ilvl="0">
@@ -23056,7 +23082,7 @@
     </w:lvl>
   </w:abstractNum>
   <w:abstractNum w:abstractNumId="30" w15:restartNumberingAfterBreak="0">
-    <w:nsid w:val="5F033EE5"/>
+    <w:nsid w:val="793A0B48"/>
     <w:multiLevelType w:val="singleLevel"/>
     <w:tmpl w:val="04160001"/>
     <w:lvl w:ilvl="0">
@@ -23073,7 +23099,7 @@
     </w:lvl>
   </w:abstractNum>
   <w:abstractNum w:abstractNumId="31" w15:restartNumberingAfterBreak="0">
-    <w:nsid w:val="73EC7450"/>
+    <w:nsid w:val="7B1B7B17"/>
     <w:multiLevelType w:val="singleLevel"/>
     <w:tmpl w:val="04160001"/>
     <w:lvl w:ilvl="0">
@@ -23090,7 +23116,7 @@
     </w:lvl>
   </w:abstractNum>
   <w:abstractNum w:abstractNumId="32" w15:restartNumberingAfterBreak="0">
-    <w:nsid w:val="78F644E4"/>
+    <w:nsid w:val="7F15226B"/>
     <w:multiLevelType w:val="singleLevel"/>
     <w:tmpl w:val="04160001"/>
     <w:lvl w:ilvl="0">
@@ -23106,104 +23132,104 @@
       </w:rPr>
     </w:lvl>
   </w:abstractNum>
-  <w:num w:numId="1" w16cid:durableId="1354267299">
+  <w:num w:numId="1" w16cid:durableId="332994639">
+    <w:abstractNumId w:val="17"/>
+  </w:num>
+  <w:num w:numId="2" w16cid:durableId="79255877">
+    <w:abstractNumId w:val="1"/>
+  </w:num>
+  <w:num w:numId="3" w16cid:durableId="634993923">
+    <w:abstractNumId w:val="21"/>
+  </w:num>
+  <w:num w:numId="4" w16cid:durableId="2077046154">
     <w:abstractNumId w:val="9"/>
   </w:num>
-  <w:num w:numId="2" w16cid:durableId="837889814">
+  <w:num w:numId="5" w16cid:durableId="1458334813">
+    <w:abstractNumId w:val="0"/>
+  </w:num>
+  <w:num w:numId="6" w16cid:durableId="1046904284">
+    <w:abstractNumId w:val="15"/>
+  </w:num>
+  <w:num w:numId="7" w16cid:durableId="1552614035">
+    <w:abstractNumId w:val="32"/>
+  </w:num>
+  <w:num w:numId="8" w16cid:durableId="1836143331">
     <w:abstractNumId w:val="8"/>
   </w:num>
-  <w:num w:numId="3" w16cid:durableId="465121983">
-    <w:abstractNumId w:val="32"/>
+  <w:num w:numId="9" w16cid:durableId="1346052249">
+    <w:abstractNumId w:val="16"/>
   </w:num>
-  <w:num w:numId="4" w16cid:durableId="40134757">
-    <w:abstractNumId w:val="21"/>
+  <w:num w:numId="10" w16cid:durableId="908075529">
+    <w:abstractNumId w:val="27"/>
   </w:num>
-  <w:num w:numId="5" w16cid:durableId="1023553367">
+  <w:num w:numId="11" w16cid:durableId="582179129">
+    <w:abstractNumId w:val="7"/>
+  </w:num>
+  <w:num w:numId="12" w16cid:durableId="709452553">
+    <w:abstractNumId w:val="3"/>
+  </w:num>
+  <w:num w:numId="13" w16cid:durableId="2032294930">
+    <w:abstractNumId w:val="20"/>
+  </w:num>
+  <w:num w:numId="14" w16cid:durableId="834615562">
+    <w:abstractNumId w:val="31"/>
+  </w:num>
+  <w:num w:numId="15" w16cid:durableId="1889342344">
+    <w:abstractNumId w:val="30"/>
+  </w:num>
+  <w:num w:numId="16" w16cid:durableId="2087679493">
+    <w:abstractNumId w:val="28"/>
+  </w:num>
+  <w:num w:numId="17" w16cid:durableId="1148475609">
+    <w:abstractNumId w:val="19"/>
+  </w:num>
+  <w:num w:numId="18" w16cid:durableId="1314800159">
+    <w:abstractNumId w:val="23"/>
+  </w:num>
+  <w:num w:numId="19" w16cid:durableId="1970891039">
+    <w:abstractNumId w:val="5"/>
+  </w:num>
+  <w:num w:numId="20" w16cid:durableId="687105087">
+    <w:abstractNumId w:val="2"/>
+  </w:num>
+  <w:num w:numId="21" w16cid:durableId="1061754001">
+    <w:abstractNumId w:val="14"/>
+  </w:num>
+  <w:num w:numId="22" w16cid:durableId="1986084195">
+    <w:abstractNumId w:val="11"/>
+  </w:num>
+  <w:num w:numId="23" w16cid:durableId="636492716">
+    <w:abstractNumId w:val="13"/>
+  </w:num>
+  <w:num w:numId="24" w16cid:durableId="771781022">
+    <w:abstractNumId w:val="4"/>
+  </w:num>
+  <w:num w:numId="25" w16cid:durableId="73943888">
+    <w:abstractNumId w:val="6"/>
+  </w:num>
+  <w:num w:numId="26" w16cid:durableId="1375885028">
+    <w:abstractNumId w:val="12"/>
+  </w:num>
+  <w:num w:numId="27" w16cid:durableId="1110130337">
     <w:abstractNumId w:val="29"/>
   </w:num>
-  <w:num w:numId="6" w16cid:durableId="502011823">
+  <w:num w:numId="28" w16cid:durableId="997807021">
+    <w:abstractNumId w:val="25"/>
+  </w:num>
+  <w:num w:numId="29" w16cid:durableId="697507239">
+    <w:abstractNumId w:val="18"/>
+  </w:num>
+  <w:num w:numId="30" w16cid:durableId="1486431012">
+    <w:abstractNumId w:val="22"/>
+  </w:num>
+  <w:num w:numId="31" w16cid:durableId="793518164">
     <w:abstractNumId w:val="26"/>
   </w:num>
-  <w:num w:numId="7" w16cid:durableId="136844400">
-    <w:abstractNumId w:val="20"/>
-  </w:num>
-  <w:num w:numId="8" w16cid:durableId="294795241">
-    <w:abstractNumId w:val="17"/>
-  </w:num>
-  <w:num w:numId="9" w16cid:durableId="202140412">
-    <w:abstractNumId w:val="2"/>
-  </w:num>
-  <w:num w:numId="10" w16cid:durableId="1425345269">
-    <w:abstractNumId w:val="6"/>
-  </w:num>
-  <w:num w:numId="11" w16cid:durableId="845246343">
-    <w:abstractNumId w:val="30"/>
-  </w:num>
-  <w:num w:numId="12" w16cid:durableId="657656173">
-    <w:abstractNumId w:val="27"/>
-  </w:num>
-  <w:num w:numId="13" w16cid:durableId="72701040">
-    <w:abstractNumId w:val="1"/>
-  </w:num>
-  <w:num w:numId="14" w16cid:durableId="1043023460">
-    <w:abstractNumId w:val="15"/>
-  </w:num>
-  <w:num w:numId="15" w16cid:durableId="353725654">
+  <w:num w:numId="32" w16cid:durableId="1459490180">
     <w:abstractNumId w:val="10"/>
   </w:num>
-  <w:num w:numId="16" w16cid:durableId="518205224">
-    <w:abstractNumId w:val="28"/>
-  </w:num>
-  <w:num w:numId="17" w16cid:durableId="1533416095">
-    <w:abstractNumId w:val="3"/>
-  </w:num>
-  <w:num w:numId="18" w16cid:durableId="1855876350">
-    <w:abstractNumId w:val="4"/>
-  </w:num>
-  <w:num w:numId="19" w16cid:durableId="366755166">
-    <w:abstractNumId w:val="5"/>
-  </w:num>
-  <w:num w:numId="20" w16cid:durableId="1267810729">
-    <w:abstractNumId w:val="16"/>
-  </w:num>
-  <w:num w:numId="21" w16cid:durableId="1044521835">
-    <w:abstractNumId w:val="31"/>
-  </w:num>
-  <w:num w:numId="22" w16cid:durableId="1492599630">
-    <w:abstractNumId w:val="19"/>
-  </w:num>
-  <w:num w:numId="23" w16cid:durableId="234584266">
-    <w:abstractNumId w:val="12"/>
-  </w:num>
-  <w:num w:numId="24" w16cid:durableId="558705844">
-    <w:abstractNumId w:val="11"/>
-  </w:num>
-  <w:num w:numId="25" w16cid:durableId="171141839">
-    <w:abstractNumId w:val="23"/>
-  </w:num>
-  <w:num w:numId="26" w16cid:durableId="229004348">
-    <w:abstractNumId w:val="22"/>
-  </w:num>
-  <w:num w:numId="27" w16cid:durableId="468473111">
-    <w:abstractNumId w:val="13"/>
-  </w:num>
-  <w:num w:numId="28" w16cid:durableId="1469401518">
+  <w:num w:numId="33" w16cid:durableId="631129825">
     <w:abstractNumId w:val="24"/>
-  </w:num>
-  <w:num w:numId="29" w16cid:durableId="437912676">
-    <w:abstractNumId w:val="7"/>
-  </w:num>
-  <w:num w:numId="30" w16cid:durableId="1292516360">
-    <w:abstractNumId w:val="25"/>
-  </w:num>
-  <w:num w:numId="31" w16cid:durableId="1956131032">
-    <w:abstractNumId w:val="0"/>
-  </w:num>
-  <w:num w:numId="32" w16cid:durableId="1888225975">
-    <w:abstractNumId w:val="14"/>
-  </w:num>
-  <w:num w:numId="33" w16cid:durableId="662053027">
-    <w:abstractNumId w:val="18"/>
   </w:num>
 </w:numbering>
 </file>
@@ -23616,7 +23642,7 @@
     <w:link w:val="Ttulo1Char"/>
     <w:uiPriority w:val="9"/>
     <w:qFormat/>
-    <w:rsid w:val="00452E99"/>
+    <w:rsid w:val="00426F2E"/>
     <w:pPr>
       <w:keepNext/>
       <w:keepLines/>
@@ -23638,7 +23664,7 @@
     <w:uiPriority w:val="9"/>
     <w:unhideWhenUsed/>
     <w:qFormat/>
-    <w:rsid w:val="00452E99"/>
+    <w:rsid w:val="00426F2E"/>
     <w:pPr>
       <w:keepNext/>
       <w:keepLines/>
@@ -23661,7 +23687,7 @@
     <w:semiHidden/>
     <w:unhideWhenUsed/>
     <w:qFormat/>
-    <w:rsid w:val="00452E99"/>
+    <w:rsid w:val="00426F2E"/>
     <w:pPr>
       <w:keepNext/>
       <w:keepLines/>
@@ -23684,7 +23710,7 @@
     <w:semiHidden/>
     <w:unhideWhenUsed/>
     <w:qFormat/>
-    <w:rsid w:val="00452E99"/>
+    <w:rsid w:val="00426F2E"/>
     <w:pPr>
       <w:keepNext/>
       <w:keepLines/>
@@ -23707,7 +23733,7 @@
     <w:semiHidden/>
     <w:unhideWhenUsed/>
     <w:qFormat/>
-    <w:rsid w:val="00452E99"/>
+    <w:rsid w:val="00426F2E"/>
     <w:pPr>
       <w:keepNext/>
       <w:keepLines/>
@@ -23728,7 +23754,7 @@
     <w:semiHidden/>
     <w:unhideWhenUsed/>
     <w:qFormat/>
-    <w:rsid w:val="00452E99"/>
+    <w:rsid w:val="00426F2E"/>
     <w:pPr>
       <w:keepNext/>
       <w:keepLines/>
@@ -23751,7 +23777,7 @@
     <w:semiHidden/>
     <w:unhideWhenUsed/>
     <w:qFormat/>
-    <w:rsid w:val="00452E99"/>
+    <w:rsid w:val="00426F2E"/>
     <w:pPr>
       <w:keepNext/>
       <w:keepLines/>
@@ -23772,7 +23798,7 @@
     <w:semiHidden/>
     <w:unhideWhenUsed/>
     <w:qFormat/>
-    <w:rsid w:val="00452E99"/>
+    <w:rsid w:val="00426F2E"/>
     <w:pPr>
       <w:keepNext/>
       <w:keepLines/>
@@ -23795,7 +23821,7 @@
     <w:semiHidden/>
     <w:unhideWhenUsed/>
     <w:qFormat/>
-    <w:rsid w:val="00452E99"/>
+    <w:rsid w:val="00426F2E"/>
     <w:pPr>
       <w:keepNext/>
       <w:keepLines/>
@@ -23839,7 +23865,7 @@
     <w:basedOn w:val="Fontepargpadro"/>
     <w:link w:val="Ttulo1"/>
     <w:uiPriority w:val="9"/>
-    <w:rsid w:val="00452E99"/>
+    <w:rsid w:val="00426F2E"/>
     <w:rPr>
       <w:rFonts w:asciiTheme="majorHAnsi" w:eastAsiaTheme="majorEastAsia" w:hAnsiTheme="majorHAnsi" w:cstheme="majorBidi"/>
       <w:color w:val="0F4761" w:themeColor="accent1" w:themeShade="BF"/>
@@ -23852,7 +23878,7 @@
     <w:basedOn w:val="Fontepargpadro"/>
     <w:link w:val="Ttulo2"/>
     <w:uiPriority w:val="9"/>
-    <w:rsid w:val="00452E99"/>
+    <w:rsid w:val="00426F2E"/>
     <w:rPr>
       <w:rFonts w:asciiTheme="majorHAnsi" w:eastAsiaTheme="majorEastAsia" w:hAnsiTheme="majorHAnsi" w:cstheme="majorBidi"/>
       <w:color w:val="0F4761" w:themeColor="accent1" w:themeShade="BF"/>
@@ -23866,7 +23892,7 @@
     <w:link w:val="Ttulo3"/>
     <w:uiPriority w:val="9"/>
     <w:semiHidden/>
-    <w:rsid w:val="00452E99"/>
+    <w:rsid w:val="00426F2E"/>
     <w:rPr>
       <w:rFonts w:eastAsiaTheme="majorEastAsia" w:cstheme="majorBidi"/>
       <w:color w:val="0F4761" w:themeColor="accent1" w:themeShade="BF"/>
@@ -23880,7 +23906,7 @@
     <w:link w:val="Ttulo4"/>
     <w:uiPriority w:val="9"/>
     <w:semiHidden/>
-    <w:rsid w:val="00452E99"/>
+    <w:rsid w:val="00426F2E"/>
     <w:rPr>
       <w:rFonts w:eastAsiaTheme="majorEastAsia" w:cstheme="majorBidi"/>
       <w:i/>
@@ -23894,7 +23920,7 @@
     <w:link w:val="Ttulo5"/>
     <w:uiPriority w:val="9"/>
     <w:semiHidden/>
-    <w:rsid w:val="00452E99"/>
+    <w:rsid w:val="00426F2E"/>
     <w:rPr>
       <w:rFonts w:eastAsiaTheme="majorEastAsia" w:cstheme="majorBidi"/>
       <w:color w:val="0F4761" w:themeColor="accent1" w:themeShade="BF"/>
@@ -23906,7 +23932,7 @@
     <w:link w:val="Ttulo6"/>
     <w:uiPriority w:val="9"/>
     <w:semiHidden/>
-    <w:rsid w:val="00452E99"/>
+    <w:rsid w:val="00426F2E"/>
     <w:rPr>
       <w:rFonts w:eastAsiaTheme="majorEastAsia" w:cstheme="majorBidi"/>
       <w:i/>
@@ -23920,7 +23946,7 @@
     <w:link w:val="Ttulo7"/>
     <w:uiPriority w:val="9"/>
     <w:semiHidden/>
-    <w:rsid w:val="00452E99"/>
+    <w:rsid w:val="00426F2E"/>
     <w:rPr>
       <w:rFonts w:eastAsiaTheme="majorEastAsia" w:cstheme="majorBidi"/>
       <w:color w:val="595959" w:themeColor="text1" w:themeTint="A6"/>
@@ -23932,7 +23958,7 @@
     <w:link w:val="Ttulo8"/>
     <w:uiPriority w:val="9"/>
     <w:semiHidden/>
-    <w:rsid w:val="00452E99"/>
+    <w:rsid w:val="00426F2E"/>
     <w:rPr>
       <w:rFonts w:eastAsiaTheme="majorEastAsia" w:cstheme="majorBidi"/>
       <w:i/>
@@ -23946,7 +23972,7 @@
     <w:link w:val="Ttulo9"/>
     <w:uiPriority w:val="9"/>
     <w:semiHidden/>
-    <w:rsid w:val="00452E99"/>
+    <w:rsid w:val="00426F2E"/>
     <w:rPr>
       <w:rFonts w:eastAsiaTheme="majorEastAsia" w:cstheme="majorBidi"/>
       <w:color w:val="272727" w:themeColor="text1" w:themeTint="D8"/>
@@ -23959,7 +23985,7 @@
     <w:link w:val="TtuloChar"/>
     <w:uiPriority w:val="10"/>
     <w:qFormat/>
-    <w:rsid w:val="00452E99"/>
+    <w:rsid w:val="00426F2E"/>
     <w:pPr>
       <w:spacing w:after="80" w:line="240" w:lineRule="auto"/>
       <w:contextualSpacing/>
@@ -23977,7 +24003,7 @@
     <w:basedOn w:val="Fontepargpadro"/>
     <w:link w:val="Ttulo"/>
     <w:uiPriority w:val="10"/>
-    <w:rsid w:val="00452E99"/>
+    <w:rsid w:val="00426F2E"/>
     <w:rPr>
       <w:rFonts w:asciiTheme="majorHAnsi" w:eastAsiaTheme="majorEastAsia" w:hAnsiTheme="majorHAnsi" w:cstheme="majorBidi"/>
       <w:spacing w:val="-10"/>
@@ -23993,7 +24019,7 @@
     <w:link w:val="SubttuloChar"/>
     <w:uiPriority w:val="11"/>
     <w:qFormat/>
-    <w:rsid w:val="00452E99"/>
+    <w:rsid w:val="00426F2E"/>
     <w:pPr>
       <w:numPr>
         <w:ilvl w:val="1"/>
@@ -24012,7 +24038,7 @@
     <w:basedOn w:val="Fontepargpadro"/>
     <w:link w:val="Subttulo"/>
     <w:uiPriority w:val="11"/>
-    <w:rsid w:val="00452E99"/>
+    <w:rsid w:val="00426F2E"/>
     <w:rPr>
       <w:rFonts w:eastAsiaTheme="majorEastAsia" w:cstheme="majorBidi"/>
       <w:color w:val="595959" w:themeColor="text1" w:themeTint="A6"/>
@@ -24028,7 +24054,7 @@
     <w:link w:val="CitaoChar"/>
     <w:uiPriority w:val="29"/>
     <w:qFormat/>
-    <w:rsid w:val="00452E99"/>
+    <w:rsid w:val="00426F2E"/>
     <w:pPr>
       <w:spacing w:before="160"/>
       <w:jc w:val="center"/>
@@ -24044,7 +24070,7 @@
     <w:basedOn w:val="Fontepargpadro"/>
     <w:link w:val="Citao"/>
     <w:uiPriority w:val="29"/>
-    <w:rsid w:val="00452E99"/>
+    <w:rsid w:val="00426F2E"/>
     <w:rPr>
       <w:i/>
       <w:iCs/>
@@ -24056,7 +24082,7 @@
     <w:basedOn w:val="Normal"/>
     <w:uiPriority w:val="34"/>
     <w:qFormat/>
-    <w:rsid w:val="00452E99"/>
+    <w:rsid w:val="00426F2E"/>
     <w:pPr>
       <w:ind w:left="720"/>
       <w:contextualSpacing/>
@@ -24067,7 +24093,7 @@
     <w:basedOn w:val="Fontepargpadro"/>
     <w:uiPriority w:val="21"/>
     <w:qFormat/>
-    <w:rsid w:val="00452E99"/>
+    <w:rsid w:val="00426F2E"/>
     <w:rPr>
       <w:i/>
       <w:iCs/>
@@ -24081,7 +24107,7 @@
     <w:link w:val="CitaoIntensaChar"/>
     <w:uiPriority w:val="30"/>
     <w:qFormat/>
-    <w:rsid w:val="00452E99"/>
+    <w:rsid w:val="00426F2E"/>
     <w:pPr>
       <w:pBdr>
         <w:top w:val="single" w:sz="4" w:space="10" w:color="0F4761" w:themeColor="accent1" w:themeShade="BF"/>
@@ -24102,7 +24128,7 @@
     <w:basedOn w:val="Fontepargpadro"/>
     <w:link w:val="CitaoIntensa"/>
     <w:uiPriority w:val="30"/>
-    <w:rsid w:val="00452E99"/>
+    <w:rsid w:val="00426F2E"/>
     <w:rPr>
       <w:i/>
       <w:iCs/>
@@ -24114,7 +24140,7 @@
     <w:basedOn w:val="Fontepargpadro"/>
     <w:uiPriority w:val="32"/>
     <w:qFormat/>
-    <w:rsid w:val="00452E99"/>
+    <w:rsid w:val="00426F2E"/>
     <w:rPr>
       <w:b/>
       <w:bCs/>
@@ -24129,7 +24155,7 @@
     <w:link w:val="CabealhoChar"/>
     <w:uiPriority w:val="99"/>
     <w:unhideWhenUsed/>
-    <w:rsid w:val="00452E99"/>
+    <w:rsid w:val="00426F2E"/>
     <w:pPr>
       <w:tabs>
         <w:tab w:val="center" w:pos="4252"/>
@@ -24143,7 +24169,7 @@
     <w:basedOn w:val="Fontepargpadro"/>
     <w:link w:val="Cabealho"/>
     <w:uiPriority w:val="99"/>
-    <w:rsid w:val="00452E99"/>
+    <w:rsid w:val="00426F2E"/>
   </w:style>
   <w:style w:type="paragraph" w:styleId="Rodap">
     <w:name w:val="footer"/>
@@ -24151,7 +24177,7 @@
     <w:link w:val="RodapChar"/>
     <w:uiPriority w:val="99"/>
     <w:unhideWhenUsed/>
-    <w:rsid w:val="00452E99"/>
+    <w:rsid w:val="00426F2E"/>
     <w:pPr>
       <w:tabs>
         <w:tab w:val="center" w:pos="4252"/>
@@ -24165,7 +24191,7 @@
     <w:basedOn w:val="Fontepargpadro"/>
     <w:link w:val="Rodap"/>
     <w:uiPriority w:val="99"/>
-    <w:rsid w:val="00452E99"/>
+    <w:rsid w:val="00426F2E"/>
   </w:style>
   <w:style w:type="paragraph" w:styleId="Sumrio1">
     <w:name w:val="toc 1"/>
@@ -24174,7 +24200,7 @@
     <w:autoRedefine/>
     <w:uiPriority w:val="39"/>
     <w:unhideWhenUsed/>
-    <w:rsid w:val="00452E99"/>
+    <w:rsid w:val="00426F2E"/>
     <w:pPr>
       <w:spacing w:after="100"/>
     </w:pPr>
@@ -24186,7 +24212,7 @@
     <w:autoRedefine/>
     <w:uiPriority w:val="39"/>
     <w:unhideWhenUsed/>
-    <w:rsid w:val="00452E99"/>
+    <w:rsid w:val="00426F2E"/>
     <w:pPr>
       <w:spacing w:after="100"/>
       <w:ind w:left="240"/>

</xml_diff>

<commit_message>
Sincroniza documentacao da unificacao do cronograma no Manual de Uso
Co-Authored-By: Claude Sonnet 5 <noreply@anthropic.com>
</commit_message>
<xml_diff>
--- a/Manual de Uso - Ferramenta de Gestao de Projetos.docx
+++ b/Manual de Uso - Ferramenta de Gestao de Projetos.docx
@@ -229,7 +229,7 @@
         <w:rPr>
           <w:noProof/>
         </w:rPr>
-        <w:instrText xml:space="preserve"> PAGEREF _Toc239864436 \h </w:instrText>
+        <w:instrText xml:space="preserve"> PAGEREF _Toc239952495 \h </w:instrText>
       </w:r>
       <w:r>
         <w:rPr>
@@ -290,7 +290,7 @@
         <w:rPr>
           <w:noProof/>
         </w:rPr>
-        <w:instrText xml:space="preserve"> PAGEREF _Toc239864437 \h </w:instrText>
+        <w:instrText xml:space="preserve"> PAGEREF _Toc239952496 \h </w:instrText>
       </w:r>
       <w:r>
         <w:rPr>
@@ -351,7 +351,7 @@
         <w:rPr>
           <w:noProof/>
         </w:rPr>
-        <w:instrText xml:space="preserve"> PAGEREF _Toc239864438 \h </w:instrText>
+        <w:instrText xml:space="preserve"> PAGEREF _Toc239952497 \h </w:instrText>
       </w:r>
       <w:r>
         <w:rPr>
@@ -368,7 +368,7 @@
         <w:rPr>
           <w:noProof/>
         </w:rPr>
-        <w:t>12</w:t>
+        <w:t>13</w:t>
       </w:r>
       <w:r>
         <w:rPr>
@@ -412,7 +412,7 @@
         <w:rPr>
           <w:noProof/>
         </w:rPr>
-        <w:instrText xml:space="preserve"> PAGEREF _Toc239864439 \h </w:instrText>
+        <w:instrText xml:space="preserve"> PAGEREF _Toc239952498 \h </w:instrText>
       </w:r>
       <w:r>
         <w:rPr>
@@ -473,7 +473,7 @@
         <w:rPr>
           <w:noProof/>
         </w:rPr>
-        <w:instrText xml:space="preserve"> PAGEREF _Toc239864440 \h </w:instrText>
+        <w:instrText xml:space="preserve"> PAGEREF _Toc239952499 \h </w:instrText>
       </w:r>
       <w:r>
         <w:rPr>
@@ -534,7 +534,7 @@
         <w:rPr>
           <w:noProof/>
         </w:rPr>
-        <w:instrText xml:space="preserve"> PAGEREF _Toc239864441 \h </w:instrText>
+        <w:instrText xml:space="preserve"> PAGEREF _Toc239952500 \h </w:instrText>
       </w:r>
       <w:r>
         <w:rPr>
@@ -595,7 +595,7 @@
         <w:rPr>
           <w:noProof/>
         </w:rPr>
-        <w:instrText xml:space="preserve"> PAGEREF _Toc239864442 \h </w:instrText>
+        <w:instrText xml:space="preserve"> PAGEREF _Toc239952501 \h </w:instrText>
       </w:r>
       <w:r>
         <w:rPr>
@@ -656,7 +656,7 @@
         <w:rPr>
           <w:noProof/>
         </w:rPr>
-        <w:instrText xml:space="preserve"> PAGEREF _Toc239864443 \h </w:instrText>
+        <w:instrText xml:space="preserve"> PAGEREF _Toc239952502 \h </w:instrText>
       </w:r>
       <w:r>
         <w:rPr>
@@ -717,7 +717,7 @@
         <w:rPr>
           <w:noProof/>
         </w:rPr>
-        <w:instrText xml:space="preserve"> PAGEREF _Toc239864444 \h </w:instrText>
+        <w:instrText xml:space="preserve"> PAGEREF _Toc239952503 \h </w:instrText>
       </w:r>
       <w:r>
         <w:rPr>
@@ -778,7 +778,7 @@
         <w:rPr>
           <w:noProof/>
         </w:rPr>
-        <w:instrText xml:space="preserve"> PAGEREF _Toc239864445 \h </w:instrText>
+        <w:instrText xml:space="preserve"> PAGEREF _Toc239952504 \h </w:instrText>
       </w:r>
       <w:r>
         <w:rPr>
@@ -839,7 +839,7 @@
         <w:rPr>
           <w:noProof/>
         </w:rPr>
-        <w:instrText xml:space="preserve"> PAGEREF _Toc239864446 \h </w:instrText>
+        <w:instrText xml:space="preserve"> PAGEREF _Toc239952505 \h </w:instrText>
       </w:r>
       <w:r>
         <w:rPr>
@@ -900,7 +900,7 @@
         <w:rPr>
           <w:noProof/>
         </w:rPr>
-        <w:instrText xml:space="preserve"> PAGEREF _Toc239864447 \h </w:instrText>
+        <w:instrText xml:space="preserve"> PAGEREF _Toc239952506 \h </w:instrText>
       </w:r>
       <w:r>
         <w:rPr>
@@ -961,7 +961,7 @@
         <w:rPr>
           <w:noProof/>
         </w:rPr>
-        <w:instrText xml:space="preserve"> PAGEREF _Toc239864448 \h </w:instrText>
+        <w:instrText xml:space="preserve"> PAGEREF _Toc239952507 \h </w:instrText>
       </w:r>
       <w:r>
         <w:rPr>
@@ -1022,7 +1022,7 @@
         <w:rPr>
           <w:noProof/>
         </w:rPr>
-        <w:instrText xml:space="preserve"> PAGEREF _Toc239864449 \h </w:instrText>
+        <w:instrText xml:space="preserve"> PAGEREF _Toc239952508 \h </w:instrText>
       </w:r>
       <w:r>
         <w:rPr>
@@ -1083,7 +1083,7 @@
         <w:rPr>
           <w:noProof/>
         </w:rPr>
-        <w:instrText xml:space="preserve"> PAGEREF _Toc239864450 \h </w:instrText>
+        <w:instrText xml:space="preserve"> PAGEREF _Toc239952509 \h </w:instrText>
       </w:r>
       <w:r>
         <w:rPr>
@@ -1144,7 +1144,7 @@
         <w:rPr>
           <w:noProof/>
         </w:rPr>
-        <w:instrText xml:space="preserve"> PAGEREF _Toc239864451 \h </w:instrText>
+        <w:instrText xml:space="preserve"> PAGEREF _Toc239952510 \h </w:instrText>
       </w:r>
       <w:r>
         <w:rPr>
@@ -1205,7 +1205,7 @@
         <w:rPr>
           <w:noProof/>
         </w:rPr>
-        <w:instrText xml:space="preserve"> PAGEREF _Toc239864452 \h </w:instrText>
+        <w:instrText xml:space="preserve"> PAGEREF _Toc239952511 \h </w:instrText>
       </w:r>
       <w:r>
         <w:rPr>
@@ -1266,7 +1266,7 @@
         <w:rPr>
           <w:noProof/>
         </w:rPr>
-        <w:instrText xml:space="preserve"> PAGEREF _Toc239864453 \h </w:instrText>
+        <w:instrText xml:space="preserve"> PAGEREF _Toc239952512 \h </w:instrText>
       </w:r>
       <w:r>
         <w:rPr>
@@ -1327,7 +1327,7 @@
         <w:rPr>
           <w:noProof/>
         </w:rPr>
-        <w:instrText xml:space="preserve"> PAGEREF _Toc239864454 \h </w:instrText>
+        <w:instrText xml:space="preserve"> PAGEREF _Toc239952513 \h </w:instrText>
       </w:r>
       <w:r>
         <w:rPr>
@@ -1388,7 +1388,7 @@
         <w:rPr>
           <w:noProof/>
         </w:rPr>
-        <w:instrText xml:space="preserve"> PAGEREF _Toc239864455 \h </w:instrText>
+        <w:instrText xml:space="preserve"> PAGEREF _Toc239952514 \h </w:instrText>
       </w:r>
       <w:r>
         <w:rPr>
@@ -1449,7 +1449,7 @@
         <w:rPr>
           <w:noProof/>
         </w:rPr>
-        <w:instrText xml:space="preserve"> PAGEREF _Toc239864456 \h </w:instrText>
+        <w:instrText xml:space="preserve"> PAGEREF _Toc239952515 \h </w:instrText>
       </w:r>
       <w:r>
         <w:rPr>
@@ -1510,7 +1510,7 @@
         <w:rPr>
           <w:noProof/>
         </w:rPr>
-        <w:instrText xml:space="preserve"> PAGEREF _Toc239864457 \h </w:instrText>
+        <w:instrText xml:space="preserve"> PAGEREF _Toc239952516 \h </w:instrText>
       </w:r>
       <w:r>
         <w:rPr>
@@ -1571,7 +1571,7 @@
         <w:rPr>
           <w:noProof/>
         </w:rPr>
-        <w:instrText xml:space="preserve"> PAGEREF _Toc239864458 \h </w:instrText>
+        <w:instrText xml:space="preserve"> PAGEREF _Toc239952517 \h </w:instrText>
       </w:r>
       <w:r>
         <w:rPr>
@@ -1632,7 +1632,7 @@
         <w:rPr>
           <w:noProof/>
         </w:rPr>
-        <w:instrText xml:space="preserve"> PAGEREF _Toc239864459 \h </w:instrText>
+        <w:instrText xml:space="preserve"> PAGEREF _Toc239952518 \h </w:instrText>
       </w:r>
       <w:r>
         <w:rPr>
@@ -1693,7 +1693,7 @@
         <w:rPr>
           <w:noProof/>
         </w:rPr>
-        <w:instrText xml:space="preserve"> PAGEREF _Toc239864460 \h </w:instrText>
+        <w:instrText xml:space="preserve"> PAGEREF _Toc239952519 \h </w:instrText>
       </w:r>
       <w:r>
         <w:rPr>
@@ -1755,7 +1755,7 @@
         <w:rPr>
           <w:noProof/>
         </w:rPr>
-        <w:instrText xml:space="preserve"> PAGEREF _Toc239864461 \h </w:instrText>
+        <w:instrText xml:space="preserve"> PAGEREF _Toc239952520 \h </w:instrText>
       </w:r>
       <w:r>
         <w:rPr>
@@ -1816,7 +1816,7 @@
         <w:rPr>
           <w:noProof/>
         </w:rPr>
-        <w:instrText xml:space="preserve"> PAGEREF _Toc239864462 \h </w:instrText>
+        <w:instrText xml:space="preserve"> PAGEREF _Toc239952521 \h </w:instrText>
       </w:r>
       <w:r>
         <w:rPr>
@@ -1877,7 +1877,7 @@
         <w:rPr>
           <w:noProof/>
         </w:rPr>
-        <w:instrText xml:space="preserve"> PAGEREF _Toc239864463 \h </w:instrText>
+        <w:instrText xml:space="preserve"> PAGEREF _Toc239952522 \h </w:instrText>
       </w:r>
       <w:r>
         <w:rPr>
@@ -1938,7 +1938,7 @@
         <w:rPr>
           <w:noProof/>
         </w:rPr>
-        <w:instrText xml:space="preserve"> PAGEREF _Toc239864464 \h </w:instrText>
+        <w:instrText xml:space="preserve"> PAGEREF _Toc239952523 \h </w:instrText>
       </w:r>
       <w:r>
         <w:rPr>
@@ -1999,7 +1999,7 @@
         <w:rPr>
           <w:noProof/>
         </w:rPr>
-        <w:instrText xml:space="preserve"> PAGEREF _Toc239864465 \h </w:instrText>
+        <w:instrText xml:space="preserve"> PAGEREF _Toc239952524 \h </w:instrText>
       </w:r>
       <w:r>
         <w:rPr>
@@ -2060,7 +2060,7 @@
         <w:rPr>
           <w:noProof/>
         </w:rPr>
-        <w:instrText xml:space="preserve"> PAGEREF _Toc239864466 \h </w:instrText>
+        <w:instrText xml:space="preserve"> PAGEREF _Toc239952525 \h </w:instrText>
       </w:r>
       <w:r>
         <w:rPr>
@@ -2121,7 +2121,7 @@
         <w:rPr>
           <w:noProof/>
         </w:rPr>
-        <w:instrText xml:space="preserve"> PAGEREF _Toc239864467 \h </w:instrText>
+        <w:instrText xml:space="preserve"> PAGEREF _Toc239952526 \h </w:instrText>
       </w:r>
       <w:r>
         <w:rPr>
@@ -2182,7 +2182,7 @@
         <w:rPr>
           <w:noProof/>
         </w:rPr>
-        <w:instrText xml:space="preserve"> PAGEREF _Toc239864468 \h </w:instrText>
+        <w:instrText xml:space="preserve"> PAGEREF _Toc239952527 \h </w:instrText>
       </w:r>
       <w:r>
         <w:rPr>
@@ -2243,7 +2243,7 @@
         <w:rPr>
           <w:noProof/>
         </w:rPr>
-        <w:instrText xml:space="preserve"> PAGEREF _Toc239864469 \h </w:instrText>
+        <w:instrText xml:space="preserve"> PAGEREF _Toc239952528 \h </w:instrText>
       </w:r>
       <w:r>
         <w:rPr>
@@ -2304,7 +2304,7 @@
         <w:rPr>
           <w:noProof/>
         </w:rPr>
-        <w:instrText xml:space="preserve"> PAGEREF _Toc239864470 \h </w:instrText>
+        <w:instrText xml:space="preserve"> PAGEREF _Toc239952529 \h </w:instrText>
       </w:r>
       <w:r>
         <w:rPr>
@@ -2365,7 +2365,7 @@
         <w:rPr>
           <w:noProof/>
         </w:rPr>
-        <w:instrText xml:space="preserve"> PAGEREF _Toc239864471 \h </w:instrText>
+        <w:instrText xml:space="preserve"> PAGEREF _Toc239952530 \h </w:instrText>
       </w:r>
       <w:r>
         <w:rPr>
@@ -2426,7 +2426,7 @@
         <w:rPr>
           <w:noProof/>
         </w:rPr>
-        <w:instrText xml:space="preserve"> PAGEREF _Toc239864472 \h </w:instrText>
+        <w:instrText xml:space="preserve"> PAGEREF _Toc239952531 \h </w:instrText>
       </w:r>
       <w:r>
         <w:rPr>
@@ -2487,7 +2487,7 @@
         <w:rPr>
           <w:noProof/>
         </w:rPr>
-        <w:instrText xml:space="preserve"> PAGEREF _Toc239864473 \h </w:instrText>
+        <w:instrText xml:space="preserve"> PAGEREF _Toc239952532 \h </w:instrText>
       </w:r>
       <w:r>
         <w:rPr>
@@ -2548,7 +2548,7 @@
         <w:rPr>
           <w:noProof/>
         </w:rPr>
-        <w:instrText xml:space="preserve"> PAGEREF _Toc239864474 \h </w:instrText>
+        <w:instrText xml:space="preserve"> PAGEREF _Toc239952533 \h </w:instrText>
       </w:r>
       <w:r>
         <w:rPr>
@@ -2609,7 +2609,7 @@
         <w:rPr>
           <w:noProof/>
         </w:rPr>
-        <w:instrText xml:space="preserve"> PAGEREF _Toc239864475 \h </w:instrText>
+        <w:instrText xml:space="preserve"> PAGEREF _Toc239952534 \h </w:instrText>
       </w:r>
       <w:r>
         <w:rPr>
@@ -2670,7 +2670,7 @@
         <w:rPr>
           <w:noProof/>
         </w:rPr>
-        <w:instrText xml:space="preserve"> PAGEREF _Toc239864476 \h </w:instrText>
+        <w:instrText xml:space="preserve"> PAGEREF _Toc239952535 \h </w:instrText>
       </w:r>
       <w:r>
         <w:rPr>
@@ -2731,7 +2731,7 @@
         <w:rPr>
           <w:noProof/>
         </w:rPr>
-        <w:instrText xml:space="preserve"> PAGEREF _Toc239864477 \h </w:instrText>
+        <w:instrText xml:space="preserve"> PAGEREF _Toc239952536 \h </w:instrText>
       </w:r>
       <w:r>
         <w:rPr>
@@ -2792,7 +2792,7 @@
         <w:rPr>
           <w:noProof/>
         </w:rPr>
-        <w:instrText xml:space="preserve"> PAGEREF _Toc239864478 \h </w:instrText>
+        <w:instrText xml:space="preserve"> PAGEREF _Toc239952537 \h </w:instrText>
       </w:r>
       <w:r>
         <w:rPr>
@@ -2853,7 +2853,7 @@
         <w:rPr>
           <w:noProof/>
         </w:rPr>
-        <w:instrText xml:space="preserve"> PAGEREF _Toc239864479 \h </w:instrText>
+        <w:instrText xml:space="preserve"> PAGEREF _Toc239952538 \h </w:instrText>
       </w:r>
       <w:r>
         <w:rPr>
@@ -2914,7 +2914,7 @@
         <w:rPr>
           <w:noProof/>
         </w:rPr>
-        <w:instrText xml:space="preserve"> PAGEREF _Toc239864480 \h </w:instrText>
+        <w:instrText xml:space="preserve"> PAGEREF _Toc239952539 \h </w:instrText>
       </w:r>
       <w:r>
         <w:rPr>
@@ -2975,7 +2975,7 @@
         <w:rPr>
           <w:noProof/>
         </w:rPr>
-        <w:instrText xml:space="preserve"> PAGEREF _Toc239864481 \h </w:instrText>
+        <w:instrText xml:space="preserve"> PAGEREF _Toc239952540 \h </w:instrText>
       </w:r>
       <w:r>
         <w:rPr>
@@ -3036,7 +3036,7 @@
         <w:rPr>
           <w:noProof/>
         </w:rPr>
-        <w:instrText xml:space="preserve"> PAGEREF _Toc239864482 \h </w:instrText>
+        <w:instrText xml:space="preserve"> PAGEREF _Toc239952541 \h </w:instrText>
       </w:r>
       <w:r>
         <w:rPr>
@@ -3097,7 +3097,7 @@
         <w:rPr>
           <w:noProof/>
         </w:rPr>
-        <w:instrText xml:space="preserve"> PAGEREF _Toc239864483 \h </w:instrText>
+        <w:instrText xml:space="preserve"> PAGEREF _Toc239952542 \h </w:instrText>
       </w:r>
       <w:r>
         <w:rPr>
@@ -3173,7 +3173,7 @@
           <w:sz w:val="34"/>
         </w:rPr>
       </w:pPr>
-      <w:bookmarkStart w:id="0" w:name="_Toc239864436"/>
+      <w:bookmarkStart w:id="0" w:name="_Toc239952495"/>
       <w:r>
         <w:rPr>
           <w:rFonts w:ascii="Montserrat" w:hAnsi="Montserrat"/>
@@ -3197,7 +3197,7 @@
           <w:sz w:val="27"/>
         </w:rPr>
       </w:pPr>
-      <w:bookmarkStart w:id="1" w:name="_Toc239864437"/>
+      <w:bookmarkStart w:id="1" w:name="_Toc239952496"/>
       <w:r>
         <w:rPr>
           <w:rFonts w:ascii="Montserrat" w:hAnsi="Montserrat"/>
@@ -4152,6 +4152,33 @@
           <w:color w:val="1A1A1A"/>
           <w:sz w:val="22"/>
         </w:rPr>
+        <w:t xml:space="preserve">Esta e a versao 2.47 do manual. Em relacao a versao 2.46 (09/09/2026), o cronograma de entregas macro do TAP (Passo 3, secao 10) passou a ser a fonte unica do cronograma do projeto: ganhou o campo Conclusao real em cada marco, e o Planejamento (Passo 4, aba Cronograma) e o Relatorio de Situacao (secao 4.1, secao Marcos) passaram a mostrar esses mesmos marcos sempre ao vivo, so leitura, em vez de manter copias proprias - o botao Importar marcos do TAP do Relatorio de Situacao foi removido por nao ser mais necessario. O calculo de Saude do projeto (secao 6.4.1) e o indicador Marcos no prazo (secao </w:t>
+      </w:r>
+      <w:r>
+        <w:rPr>
+          <w:rFonts w:ascii="Montserrat" w:hAnsi="Montserrat"/>
+          <w:color w:val="1A1A1A"/>
+          <w:sz w:val="22"/>
+        </w:rPr>
+        <w:lastRenderedPageBreak/>
+        <w:t>6.7) passaram a considerar a Conclusao real: um marco concluido no TAP nunca conta como atrasado, mesmo que o Termino previsto ja tenha passado.</w:t>
+      </w:r>
+    </w:p>
+    <w:p>
+      <w:pPr>
+        <w:spacing w:line="280" w:lineRule="auto"/>
+        <w:rPr>
+          <w:rFonts w:ascii="Montserrat" w:hAnsi="Montserrat"/>
+          <w:color w:val="1A1A1A"/>
+          <w:sz w:val="22"/>
+        </w:rPr>
+      </w:pPr>
+      <w:r>
+        <w:rPr>
+          <w:rFonts w:ascii="Montserrat" w:hAnsi="Montserrat"/>
+          <w:color w:val="1A1A1A"/>
+          <w:sz w:val="22"/>
+        </w:rPr>
         <w:t>O manual nao substitui as Diretrizes para a Gestao de Projetos da UNIALFA (documento institucional que define o framework D01 a D07) nem o documento Regras de Acesso e Permissoes (que detalha cada regra de controle de acesso); ele e o guia operacional de como usar cada ferramenta na pratica.</w:t>
       </w:r>
     </w:p>
@@ -4166,7 +4193,7 @@
           <w:sz w:val="27"/>
         </w:rPr>
       </w:pPr>
-      <w:bookmarkStart w:id="2" w:name="_Toc239864438"/>
+      <w:bookmarkStart w:id="2" w:name="_Toc239952497"/>
       <w:r>
         <w:rPr>
           <w:rFonts w:ascii="Montserrat" w:hAnsi="Montserrat"/>
@@ -4217,7 +4244,6 @@
           <w:color w:val="1A1A1A"/>
           <w:sz w:val="22"/>
         </w:rPr>
-        <w:lastRenderedPageBreak/>
         <w:t>12 formularios de registro (codigo FORALF), cada um correspondendo a um artefato institucional - da Solicitacao de Demanda ao Relatorio de Entregas e Beneficios.</w:t>
       </w:r>
     </w:p>
@@ -4364,16 +4390,16 @@
         </w:rPr>
         <w:lastRenderedPageBreak/>
         <w:drawing>
-          <wp:inline distT="0" distB="0" distL="0" distR="0" wp14:anchorId="4CF1C506" wp14:editId="4E9F0EE3">
+          <wp:inline distT="0" distB="0" distL="0" distR="0" wp14:anchorId="17A1D3A8" wp14:editId="19F23A7F">
             <wp:extent cx="5303520" cy="4792851"/>
             <wp:effectExtent l="19050" t="19050" r="11430" b="27305"/>
-            <wp:docPr id="1328082218" name="Imagem 1"/>
+            <wp:docPr id="1704833653" name="Imagem 1"/>
             <wp:cNvGraphicFramePr/>
             <a:graphic xmlns:a="http://schemas.openxmlformats.org/drawingml/2006/main">
               <a:graphicData uri="http://schemas.openxmlformats.org/drawingml/2006/picture">
                 <pic:pic xmlns:pic="http://schemas.openxmlformats.org/drawingml/2006/picture">
                   <pic:nvPicPr>
-                    <pic:cNvPr id="1328082218" name=""/>
+                    <pic:cNvPr id="1704833653" name=""/>
                     <pic:cNvPicPr/>
                   </pic:nvPicPr>
                   <pic:blipFill>
@@ -4441,7 +4467,7 @@
           <w:sz w:val="27"/>
         </w:rPr>
       </w:pPr>
-      <w:bookmarkStart w:id="3" w:name="_Toc239864439"/>
+      <w:bookmarkStart w:id="3" w:name="_Toc239952498"/>
       <w:r>
         <w:rPr>
           <w:rFonts w:ascii="Montserrat" w:hAnsi="Montserrat"/>
@@ -4482,16 +4508,16 @@
         </w:rPr>
         <w:lastRenderedPageBreak/>
         <w:drawing>
-          <wp:inline distT="0" distB="0" distL="0" distR="0" wp14:anchorId="2EB15002" wp14:editId="02ACF8EC">
+          <wp:inline distT="0" distB="0" distL="0" distR="0" wp14:anchorId="0C2E4716" wp14:editId="1820F6C6">
             <wp:extent cx="4206240" cy="3801227"/>
             <wp:effectExtent l="19050" t="19050" r="22860" b="27940"/>
-            <wp:docPr id="543401378" name="Imagem 2"/>
+            <wp:docPr id="1895961005" name="Imagem 2"/>
             <wp:cNvGraphicFramePr/>
             <a:graphic xmlns:a="http://schemas.openxmlformats.org/drawingml/2006/main">
               <a:graphicData uri="http://schemas.openxmlformats.org/drawingml/2006/picture">
                 <pic:pic xmlns:pic="http://schemas.openxmlformats.org/drawingml/2006/picture">
                   <pic:nvPicPr>
-                    <pic:cNvPr id="543401378" name=""/>
+                    <pic:cNvPr id="1895961005" name=""/>
                     <pic:cNvPicPr/>
                   </pic:nvPicPr>
                   <pic:blipFill>
@@ -4664,7 +4690,7 @@
           <w:sz w:val="27"/>
         </w:rPr>
       </w:pPr>
-      <w:bookmarkStart w:id="4" w:name="_Toc239864440"/>
+      <w:bookmarkStart w:id="4" w:name="_Toc239952499"/>
       <w:r>
         <w:rPr>
           <w:rFonts w:ascii="Montserrat" w:hAnsi="Montserrat"/>
@@ -5903,7 +5929,7 @@
           <w:sz w:val="34"/>
         </w:rPr>
       </w:pPr>
-      <w:bookmarkStart w:id="5" w:name="_Toc239864441"/>
+      <w:bookmarkStart w:id="5" w:name="_Toc239952500"/>
       <w:r>
         <w:rPr>
           <w:rFonts w:ascii="Montserrat" w:hAnsi="Montserrat"/>
@@ -5927,7 +5953,7 @@
           <w:sz w:val="27"/>
         </w:rPr>
       </w:pPr>
-      <w:bookmarkStart w:id="6" w:name="_Toc239864442"/>
+      <w:bookmarkStart w:id="6" w:name="_Toc239952501"/>
       <w:r>
         <w:rPr>
           <w:rFonts w:ascii="Montserrat" w:hAnsi="Montserrat"/>
@@ -5968,7 +5994,7 @@
           <w:sz w:val="27"/>
         </w:rPr>
       </w:pPr>
-      <w:bookmarkStart w:id="7" w:name="_Toc239864443"/>
+      <w:bookmarkStart w:id="7" w:name="_Toc239952502"/>
       <w:r>
         <w:rPr>
           <w:rFonts w:ascii="Montserrat" w:hAnsi="Montserrat"/>
@@ -6087,7 +6113,7 @@
           <w:sz w:val="27"/>
         </w:rPr>
       </w:pPr>
-      <w:bookmarkStart w:id="8" w:name="_Toc239864444"/>
+      <w:bookmarkStart w:id="8" w:name="_Toc239952503"/>
       <w:r>
         <w:rPr>
           <w:rFonts w:ascii="Montserrat" w:hAnsi="Montserrat"/>
@@ -6700,7 +6726,7 @@
           <w:sz w:val="27"/>
         </w:rPr>
       </w:pPr>
-      <w:bookmarkStart w:id="9" w:name="_Toc239864445"/>
+      <w:bookmarkStart w:id="9" w:name="_Toc239952504"/>
       <w:r>
         <w:rPr>
           <w:rFonts w:ascii="Montserrat" w:hAnsi="Montserrat"/>
@@ -6789,16 +6815,16 @@
         </w:rPr>
         <w:lastRenderedPageBreak/>
         <w:drawing>
-          <wp:inline distT="0" distB="0" distL="0" distR="0" wp14:anchorId="427BD35F" wp14:editId="1A5CB3AA">
+          <wp:inline distT="0" distB="0" distL="0" distR="0" wp14:anchorId="4217D141" wp14:editId="0B7BB028">
             <wp:extent cx="4937760" cy="4462310"/>
             <wp:effectExtent l="19050" t="19050" r="15240" b="14605"/>
-            <wp:docPr id="1017586380" name="Imagem 3"/>
+            <wp:docPr id="1906763559" name="Imagem 3"/>
             <wp:cNvGraphicFramePr/>
             <a:graphic xmlns:a="http://schemas.openxmlformats.org/drawingml/2006/main">
               <a:graphicData uri="http://schemas.openxmlformats.org/drawingml/2006/picture">
                 <pic:pic xmlns:pic="http://schemas.openxmlformats.org/drawingml/2006/picture">
                   <pic:nvPicPr>
-                    <pic:cNvPr id="1017586380" name=""/>
+                    <pic:cNvPr id="1906763559" name=""/>
                     <pic:cNvPicPr/>
                   </pic:nvPicPr>
                   <pic:blipFill>
@@ -6866,7 +6892,7 @@
           <w:sz w:val="27"/>
         </w:rPr>
       </w:pPr>
-      <w:bookmarkStart w:id="10" w:name="_Toc239864446"/>
+      <w:bookmarkStart w:id="10" w:name="_Toc239952505"/>
       <w:r>
         <w:rPr>
           <w:rFonts w:ascii="Montserrat" w:hAnsi="Montserrat"/>
@@ -6907,16 +6933,16 @@
         </w:rPr>
         <w:lastRenderedPageBreak/>
         <w:drawing>
-          <wp:inline distT="0" distB="0" distL="0" distR="0" wp14:anchorId="39EBC1B7" wp14:editId="066D32C3">
+          <wp:inline distT="0" distB="0" distL="0" distR="0" wp14:anchorId="2D368CD0" wp14:editId="45CD9DEE">
             <wp:extent cx="5120640" cy="4627581"/>
             <wp:effectExtent l="19050" t="19050" r="22860" b="20955"/>
-            <wp:docPr id="1459397367" name="Imagem 4"/>
+            <wp:docPr id="2021488833" name="Imagem 4"/>
             <wp:cNvGraphicFramePr/>
             <a:graphic xmlns:a="http://schemas.openxmlformats.org/drawingml/2006/main">
               <a:graphicData uri="http://schemas.openxmlformats.org/drawingml/2006/picture">
                 <pic:pic xmlns:pic="http://schemas.openxmlformats.org/drawingml/2006/picture">
                   <pic:nvPicPr>
-                    <pic:cNvPr id="1459397367" name=""/>
+                    <pic:cNvPr id="2021488833" name=""/>
                     <pic:cNvPicPr/>
                   </pic:nvPicPr>
                   <pic:blipFill>
@@ -7084,7 +7110,7 @@
           <w:sz w:val="27"/>
         </w:rPr>
       </w:pPr>
-      <w:bookmarkStart w:id="11" w:name="_Toc239864447"/>
+      <w:bookmarkStart w:id="11" w:name="_Toc239952506"/>
       <w:r>
         <w:rPr>
           <w:rFonts w:ascii="Montserrat" w:hAnsi="Montserrat"/>
@@ -7124,16 +7150,16 @@
           <w:noProof/>
         </w:rPr>
         <w:drawing>
-          <wp:inline distT="0" distB="0" distL="0" distR="0" wp14:anchorId="35256C33" wp14:editId="74768A85">
+          <wp:inline distT="0" distB="0" distL="0" distR="0" wp14:anchorId="0F4AA6BF" wp14:editId="0AC08E55">
             <wp:extent cx="4206240" cy="3801227"/>
             <wp:effectExtent l="19050" t="19050" r="22860" b="27940"/>
-            <wp:docPr id="129144051" name="Imagem 5"/>
+            <wp:docPr id="906971874" name="Imagem 5"/>
             <wp:cNvGraphicFramePr/>
             <a:graphic xmlns:a="http://schemas.openxmlformats.org/drawingml/2006/main">
               <a:graphicData uri="http://schemas.openxmlformats.org/drawingml/2006/picture">
                 <pic:pic xmlns:pic="http://schemas.openxmlformats.org/drawingml/2006/picture">
                   <pic:nvPicPr>
-                    <pic:cNvPr id="129144051" name=""/>
+                    <pic:cNvPr id="906971874" name=""/>
                     <pic:cNvPicPr/>
                   </pic:nvPicPr>
                   <pic:blipFill>
@@ -7201,16 +7227,16 @@
         </w:rPr>
         <w:lastRenderedPageBreak/>
         <w:drawing>
-          <wp:inline distT="0" distB="0" distL="0" distR="0" wp14:anchorId="62BDBD93" wp14:editId="0ABC4A2E">
+          <wp:inline distT="0" distB="0" distL="0" distR="0" wp14:anchorId="4C2BA9FC" wp14:editId="19707837">
             <wp:extent cx="4206240" cy="3801227"/>
             <wp:effectExtent l="19050" t="19050" r="22860" b="27940"/>
-            <wp:docPr id="289817007" name="Imagem 6"/>
+            <wp:docPr id="560416084" name="Imagem 6"/>
             <wp:cNvGraphicFramePr/>
             <a:graphic xmlns:a="http://schemas.openxmlformats.org/drawingml/2006/main">
               <a:graphicData uri="http://schemas.openxmlformats.org/drawingml/2006/picture">
                 <pic:pic xmlns:pic="http://schemas.openxmlformats.org/drawingml/2006/picture">
                   <pic:nvPicPr>
-                    <pic:cNvPr id="289817007" name=""/>
+                    <pic:cNvPr id="560416084" name=""/>
                     <pic:cNvPicPr/>
                   </pic:nvPicPr>
                   <pic:blipFill>
@@ -7326,7 +7352,7 @@
           <w:sz w:val="27"/>
         </w:rPr>
       </w:pPr>
-      <w:bookmarkStart w:id="12" w:name="_Toc239864448"/>
+      <w:bookmarkStart w:id="12" w:name="_Toc239952507"/>
       <w:r>
         <w:rPr>
           <w:rFonts w:ascii="Montserrat" w:hAnsi="Montserrat"/>
@@ -7394,7 +7420,7 @@
           <w:sz w:val="27"/>
         </w:rPr>
       </w:pPr>
-      <w:bookmarkStart w:id="13" w:name="_Toc239864449"/>
+      <w:bookmarkStart w:id="13" w:name="_Toc239952508"/>
       <w:r>
         <w:rPr>
           <w:rFonts w:ascii="Montserrat" w:hAnsi="Montserrat"/>
@@ -7621,7 +7647,7 @@
           <w:sz w:val="27"/>
         </w:rPr>
       </w:pPr>
-      <w:bookmarkStart w:id="14" w:name="_Toc239864450"/>
+      <w:bookmarkStart w:id="14" w:name="_Toc239952509"/>
       <w:r>
         <w:rPr>
           <w:rFonts w:ascii="Montserrat" w:hAnsi="Montserrat"/>
@@ -7780,7 +7806,7 @@
           <w:sz w:val="27"/>
         </w:rPr>
       </w:pPr>
-      <w:bookmarkStart w:id="15" w:name="_Toc239864451"/>
+      <w:bookmarkStart w:id="15" w:name="_Toc239952510"/>
       <w:r>
         <w:rPr>
           <w:rFonts w:ascii="Montserrat" w:hAnsi="Montserrat"/>
@@ -7972,7 +7998,7 @@
           <w:sz w:val="27"/>
         </w:rPr>
       </w:pPr>
-      <w:bookmarkStart w:id="16" w:name="_Toc239864452"/>
+      <w:bookmarkStart w:id="16" w:name="_Toc239952511"/>
       <w:r>
         <w:rPr>
           <w:rFonts w:ascii="Montserrat" w:hAnsi="Montserrat"/>
@@ -8011,18 +8037,8 @@
         </w:numPr>
         <w:spacing w:after="80" w:line="260" w:lineRule="auto"/>
         <w:ind w:left="700"/>
-        <w:rPr>
-          <w:rFonts w:ascii="Montserrat" w:hAnsi="Montserrat"/>
-          <w:color w:val="1A1A1A"/>
-          <w:sz w:val="22"/>
-        </w:rPr>
-      </w:pPr>
-      <w:r>
-        <w:rPr>
-          <w:rFonts w:ascii="Montserrat" w:hAnsi="Montserrat"/>
-          <w:color w:val="1A1A1A"/>
-          <w:sz w:val="22"/>
-        </w:rPr>
+      </w:pPr>
+      <w:r>
         <w:t>Se algum pedaco falhar (ex.: instabilidade de rede), aparece um botao Tentar novamente especifico para aquele pedaco - os pedacos ja transcritos com sucesso nao precisam ser refeitos.</w:t>
       </w:r>
     </w:p>
@@ -8100,7 +8116,7 @@
           <w:sz w:val="27"/>
         </w:rPr>
       </w:pPr>
-      <w:bookmarkStart w:id="17" w:name="_Toc239864453"/>
+      <w:bookmarkStart w:id="17" w:name="_Toc239952512"/>
       <w:r>
         <w:rPr>
           <w:rFonts w:ascii="Montserrat" w:hAnsi="Montserrat"/>
@@ -8430,7 +8446,7 @@
           <w:sz w:val="27"/>
         </w:rPr>
       </w:pPr>
-      <w:bookmarkStart w:id="18" w:name="_Toc239864454"/>
+      <w:bookmarkStart w:id="18" w:name="_Toc239952513"/>
       <w:r>
         <w:rPr>
           <w:rFonts w:ascii="Montserrat" w:hAnsi="Montserrat"/>
@@ -8571,7 +8587,7 @@
           <w:sz w:val="34"/>
         </w:rPr>
       </w:pPr>
-      <w:bookmarkStart w:id="19" w:name="_Toc239864455"/>
+      <w:bookmarkStart w:id="19" w:name="_Toc239952514"/>
       <w:r>
         <w:rPr>
           <w:rFonts w:ascii="Montserrat" w:hAnsi="Montserrat"/>
@@ -8613,7 +8629,7 @@
           <w:sz w:val="27"/>
         </w:rPr>
       </w:pPr>
-      <w:bookmarkStart w:id="20" w:name="_Toc239864456"/>
+      <w:bookmarkStart w:id="20" w:name="_Toc239952515"/>
       <w:r>
         <w:rPr>
           <w:rFonts w:ascii="Montserrat" w:hAnsi="Montserrat"/>
@@ -9693,16 +9709,16 @@
         </w:rPr>
         <w:lastRenderedPageBreak/>
         <w:drawing>
-          <wp:inline distT="0" distB="0" distL="0" distR="0" wp14:anchorId="4F8B76C9" wp14:editId="47F584C5">
+          <wp:inline distT="0" distB="0" distL="0" distR="0" wp14:anchorId="55E1B416" wp14:editId="20CEC16F">
             <wp:extent cx="5120640" cy="4627581"/>
             <wp:effectExtent l="19050" t="19050" r="22860" b="20955"/>
-            <wp:docPr id="159790449" name="Imagem 7"/>
+            <wp:docPr id="542599084" name="Imagem 7"/>
             <wp:cNvGraphicFramePr/>
             <a:graphic xmlns:a="http://schemas.openxmlformats.org/drawingml/2006/main">
               <a:graphicData uri="http://schemas.openxmlformats.org/drawingml/2006/picture">
                 <pic:pic xmlns:pic="http://schemas.openxmlformats.org/drawingml/2006/picture">
                   <pic:nvPicPr>
-                    <pic:cNvPr id="159790449" name=""/>
+                    <pic:cNvPr id="542599084" name=""/>
                     <pic:cNvPicPr/>
                   </pic:nvPicPr>
                   <pic:blipFill>
@@ -9770,16 +9786,16 @@
         </w:rPr>
         <w:lastRenderedPageBreak/>
         <w:drawing>
-          <wp:inline distT="0" distB="0" distL="0" distR="0" wp14:anchorId="7E5A6BB5" wp14:editId="22340F9F">
+          <wp:inline distT="0" distB="0" distL="0" distR="0" wp14:anchorId="3F3F90F7" wp14:editId="27364681">
             <wp:extent cx="5120640" cy="4627581"/>
             <wp:effectExtent l="19050" t="19050" r="22860" b="20955"/>
-            <wp:docPr id="856849006" name="Imagem 8"/>
+            <wp:docPr id="1571715858" name="Imagem 8"/>
             <wp:cNvGraphicFramePr/>
             <a:graphic xmlns:a="http://schemas.openxmlformats.org/drawingml/2006/main">
               <a:graphicData uri="http://schemas.openxmlformats.org/drawingml/2006/picture">
                 <pic:pic xmlns:pic="http://schemas.openxmlformats.org/drawingml/2006/picture">
                   <pic:nvPicPr>
-                    <pic:cNvPr id="856849006" name=""/>
+                    <pic:cNvPr id="1571715858" name=""/>
                     <pic:cNvPicPr/>
                   </pic:nvPicPr>
                   <pic:blipFill>
@@ -9987,7 +10003,7 @@
           <w:sz w:val="27"/>
         </w:rPr>
       </w:pPr>
-      <w:bookmarkStart w:id="21" w:name="_Toc239864457"/>
+      <w:bookmarkStart w:id="21" w:name="_Toc239952516"/>
       <w:r>
         <w:rPr>
           <w:rFonts w:ascii="Montserrat" w:hAnsi="Montserrat"/>
@@ -10912,16 +10928,16 @@
           <w:noProof/>
         </w:rPr>
         <w:drawing>
-          <wp:inline distT="0" distB="0" distL="0" distR="0" wp14:anchorId="6B71D884" wp14:editId="4F5A9DB6">
+          <wp:inline distT="0" distB="0" distL="0" distR="0" wp14:anchorId="5543E0EF" wp14:editId="6AF14628">
             <wp:extent cx="5120640" cy="4627581"/>
             <wp:effectExtent l="19050" t="19050" r="22860" b="20955"/>
-            <wp:docPr id="140639050" name="Imagem 9"/>
+            <wp:docPr id="511798699" name="Imagem 9"/>
             <wp:cNvGraphicFramePr/>
             <a:graphic xmlns:a="http://schemas.openxmlformats.org/drawingml/2006/main">
               <a:graphicData uri="http://schemas.openxmlformats.org/drawingml/2006/picture">
                 <pic:pic xmlns:pic="http://schemas.openxmlformats.org/drawingml/2006/picture">
                   <pic:nvPicPr>
-                    <pic:cNvPr id="140639050" name=""/>
+                    <pic:cNvPr id="511798699" name=""/>
                     <pic:cNvPicPr/>
                   </pic:nvPicPr>
                   <pic:blipFill>
@@ -10989,16 +11005,16 @@
         </w:rPr>
         <w:lastRenderedPageBreak/>
         <w:drawing>
-          <wp:inline distT="0" distB="0" distL="0" distR="0" wp14:anchorId="0A79F833" wp14:editId="41B0AD3B">
+          <wp:inline distT="0" distB="0" distL="0" distR="0" wp14:anchorId="3AEAA641" wp14:editId="145440AA">
             <wp:extent cx="5120640" cy="4627581"/>
             <wp:effectExtent l="19050" t="19050" r="22860" b="20955"/>
-            <wp:docPr id="2090012347" name="Imagem 10"/>
+            <wp:docPr id="1654818563" name="Imagem 10"/>
             <wp:cNvGraphicFramePr/>
             <a:graphic xmlns:a="http://schemas.openxmlformats.org/drawingml/2006/main">
               <a:graphicData uri="http://schemas.openxmlformats.org/drawingml/2006/picture">
                 <pic:pic xmlns:pic="http://schemas.openxmlformats.org/drawingml/2006/picture">
                   <pic:nvPicPr>
-                    <pic:cNvPr id="2090012347" name=""/>
+                    <pic:cNvPr id="1654818563" name=""/>
                     <pic:cNvPicPr/>
                   </pic:nvPicPr>
                   <pic:blipFill>
@@ -11132,7 +11148,7 @@
           <w:sz w:val="27"/>
         </w:rPr>
       </w:pPr>
-      <w:bookmarkStart w:id="22" w:name="_Toc239864458"/>
+      <w:bookmarkStart w:id="22" w:name="_Toc239952517"/>
       <w:r>
         <w:rPr>
           <w:rFonts w:ascii="Montserrat" w:hAnsi="Montserrat"/>
@@ -11891,7 +11907,7 @@
                 <w:color w:val="1A1A1A"/>
                 <w:sz w:val="19"/>
               </w:rPr>
-              <w:t>Marco, responsavel, inicio e termino previstos, custo</w:t>
+              <w:t>Marco, responsavel, inicio e termino previstos, conclusao real, custo - e o cronograma oficial do projeto (Passo 4 e secao 4.1 mostram este mesmo cronograma, so leitura)</w:t>
             </w:r>
           </w:p>
         </w:tc>
@@ -12166,16 +12182,8 @@
           <w:color w:val="1A1A1A"/>
           <w:sz w:val="22"/>
         </w:rPr>
-        <w:t xml:space="preserve">Sugestoes de riscos recorrentes: ao selecionar um Projeto vinculado, o formulario analisa automaticamente o campo Entraves de todas as Atas de </w:t>
-      </w:r>
-      <w:r>
-        <w:rPr>
-          <w:rFonts w:ascii="Montserrat" w:hAnsi="Montserrat"/>
-          <w:color w:val="1A1A1A"/>
-          <w:sz w:val="22"/>
-        </w:rPr>
         <w:lastRenderedPageBreak/>
-        <w:t>Reuniao ja registradas para aquele projeto e destaca, logo abaixo da tabela de riscos, qualquer entrave que se repita em 2 ou mais atas diferentes - com a contagem de atas e um botao + Adicionar ao registro que insere a sugestao direto na tabela (status Aberto, revisao com a data de hoje). E uma regra automatica de comparacao de texto, sem chamar nenhuma IA - ela so aproveita entraves ja registrados nas atas, inclusive os que tiverem sido preenchidos via Importar transcricao da reuniao (Passo 6, secao 2.10).</w:t>
+        <w:t>Sugestoes de riscos recorrentes: ao selecionar um Projeto vinculado, o formulario analisa automaticamente o campo Entraves de todas as Atas de Reuniao ja registradas para aquele projeto e destaca, logo abaixo da tabela de riscos, qualquer entrave que se repita em 2 ou mais atas diferentes - com a contagem de atas e um botao + Adicionar ao registro que insere a sugestao direto na tabela (status Aberto, revisao com a data de hoje). E uma regra automatica de comparacao de texto, sem chamar nenhuma IA - ela so aproveita entraves ja registrados nas atas, inclusive os que tiverem sido preenchidos via Importar transcricao da reuniao (Passo 6, secao 2.10).</w:t>
       </w:r>
     </w:p>
     <w:p>
@@ -12188,16 +12196,16 @@
           <w:noProof/>
         </w:rPr>
         <w:drawing>
-          <wp:inline distT="0" distB="0" distL="0" distR="0" wp14:anchorId="4A6C24CE" wp14:editId="16A64697">
+          <wp:inline distT="0" distB="0" distL="0" distR="0" wp14:anchorId="6EBD586F" wp14:editId="3728174D">
             <wp:extent cx="5120640" cy="3338440"/>
             <wp:effectExtent l="19050" t="19050" r="22860" b="14605"/>
-            <wp:docPr id="2095650024" name="Imagem 11"/>
+            <wp:docPr id="532644443" name="Imagem 11"/>
             <wp:cNvGraphicFramePr/>
             <a:graphic xmlns:a="http://schemas.openxmlformats.org/drawingml/2006/main">
               <a:graphicData uri="http://schemas.openxmlformats.org/drawingml/2006/picture">
                 <pic:pic xmlns:pic="http://schemas.openxmlformats.org/drawingml/2006/picture">
                   <pic:nvPicPr>
-                    <pic:cNvPr id="2095650024" name=""/>
+                    <pic:cNvPr id="532644443" name=""/>
                     <pic:cNvPicPr/>
                   </pic:nvPicPr>
                   <pic:blipFill>
@@ -12265,16 +12273,16 @@
         </w:rPr>
         <w:lastRenderedPageBreak/>
         <w:drawing>
-          <wp:inline distT="0" distB="0" distL="0" distR="0" wp14:anchorId="425C8026" wp14:editId="7A9D5624">
+          <wp:inline distT="0" distB="0" distL="0" distR="0" wp14:anchorId="20963269" wp14:editId="30A4F8EB">
             <wp:extent cx="5120640" cy="4627581"/>
             <wp:effectExtent l="19050" t="19050" r="22860" b="20955"/>
-            <wp:docPr id="16029180" name="Imagem 12"/>
+            <wp:docPr id="796350433" name="Imagem 12"/>
             <wp:cNvGraphicFramePr/>
             <a:graphic xmlns:a="http://schemas.openxmlformats.org/drawingml/2006/main">
               <a:graphicData uri="http://schemas.openxmlformats.org/drawingml/2006/picture">
                 <pic:pic xmlns:pic="http://schemas.openxmlformats.org/drawingml/2006/picture">
                   <pic:nvPicPr>
-                    <pic:cNvPr id="16029180" name=""/>
+                    <pic:cNvPr id="796350433" name=""/>
                     <pic:cNvPicPr/>
                   </pic:nvPicPr>
                   <pic:blipFill>
@@ -12346,6 +12354,41 @@
           <w:color w:val="1A1A1A"/>
           <w:sz w:val="22"/>
         </w:rPr>
+        <w:t xml:space="preserve">Cronograma de entregas macro (secao 10 do formulario): e o unico cronograma do projeto - o Planejamento (Passo 4) e o Relatorio de Situacao (secao 4.1) mostram estes mesmos marcos, sempre ao vivo e so leitura, sem manter copia propria. Alem de Inicio e Termino previstos, cada marco tem um campo Conclusao real, preenchido quando o marco de fato termina - e o que permite ao sistema distinguir um marco </w:t>
+      </w:r>
+      <w:r>
+        <w:rPr>
+          <w:rFonts w:ascii="Montserrat" w:hAnsi="Montserrat"/>
+          <w:color w:val="1A1A1A"/>
+          <w:sz w:val="22"/>
+        </w:rPr>
+        <w:t xml:space="preserve">trasado agora de um marco que </w:t>
+      </w:r>
+      <w:r>
+        <w:rPr>
+          <w:rFonts w:ascii="Montserrat" w:hAnsi="Montserrat"/>
+          <w:color w:val="1A1A1A"/>
+          <w:sz w:val="22"/>
+        </w:rPr>
+        <w:tab/>
+        <w:t>erminou atrasado: um marco com Conclusao real preenchida nunca conta como atrasado no calculo de Saude do projeto (secao 6.4.1) nem no indicador Marcos no prazo (secao 6.7), mesmo que o Termino previsto ja tenha passado.</w:t>
+      </w:r>
+    </w:p>
+    <w:p>
+      <w:pPr>
+        <w:spacing w:line="280" w:lineRule="auto"/>
+        <w:rPr>
+          <w:rFonts w:ascii="Montserrat" w:hAnsi="Montserrat"/>
+          <w:color w:val="1A1A1A"/>
+          <w:sz w:val="22"/>
+        </w:rPr>
+      </w:pPr>
+      <w:r>
+        <w:rPr>
+          <w:rFonts w:ascii="Montserrat" w:hAnsi="Montserrat"/>
+          <w:color w:val="1A1A1A"/>
+          <w:sz w:val="22"/>
+        </w:rPr>
         <w:t>Como salvar: clique em Registrar TAP. Um projeto sem TAP aprovado nao deve avancar para a execucao. Ao marcar Aprovado, um e-mail de notificacao e disparado automaticamente (secao 2.8).</w:t>
       </w:r>
     </w:p>
@@ -12370,6 +12413,7 @@
           <w:color w:val="1A1A1A"/>
           <w:sz w:val="22"/>
         </w:rPr>
+        <w:lastRenderedPageBreak/>
         <w:t>No rodape do painel de detalhes de um TAP, os botoes Imprimir e Exportar Word geram o documento no formato oficial do FORALF00338 (incluindo o registro de riscos e as tabelas de cronograma, custos, partes interessadas, equipe e indicadores), pronto para impressao ou para abrir no Word.</w:t>
       </w:r>
     </w:p>
@@ -12408,7 +12452,7 @@
           <w:sz w:val="27"/>
         </w:rPr>
       </w:pPr>
-      <w:bookmarkStart w:id="23" w:name="_Toc239864459"/>
+      <w:bookmarkStart w:id="23" w:name="_Toc239952518"/>
       <w:r>
         <w:rPr>
           <w:rFonts w:ascii="Montserrat" w:hAnsi="Montserrat"/>
@@ -12416,7 +12460,6 @@
           <w:color w:val="B91D2E"/>
           <w:sz w:val="27"/>
         </w:rPr>
-        <w:lastRenderedPageBreak/>
         <w:t>Passo 4 - Planejamento e Desenvolvimento de Projeto (FORALF00325)</w:t>
       </w:r>
       <w:bookmarkEnd w:id="23"/>
@@ -12678,7 +12721,7 @@
                 <w:color w:val="1A1A1A"/>
                 <w:sz w:val="19"/>
               </w:rPr>
-              <w:t>Tabela de marcos: nome, responsavel, duracao, data de entrega</w:t>
+              <w:t>So leitura: mostra o cronograma de entregas macro ja registrado no TAP do mesmo projeto (marco, responsavel, inicio, termino, conclusao real, custo) - para alterar um marco, edite o TAP</w:t>
             </w:r>
           </w:p>
         </w:tc>
@@ -12970,16 +13013,16 @@
         </w:rPr>
         <w:lastRenderedPageBreak/>
         <w:drawing>
-          <wp:inline distT="0" distB="0" distL="0" distR="0" wp14:anchorId="68D9C49F" wp14:editId="156ADB3B">
+          <wp:inline distT="0" distB="0" distL="0" distR="0" wp14:anchorId="6C0A7B61" wp14:editId="143AD1BD">
             <wp:extent cx="5120640" cy="4627581"/>
             <wp:effectExtent l="19050" t="19050" r="22860" b="20955"/>
-            <wp:docPr id="1089019211" name="Imagem 13"/>
+            <wp:docPr id="591924702" name="Imagem 13"/>
             <wp:cNvGraphicFramePr/>
             <a:graphic xmlns:a="http://schemas.openxmlformats.org/drawingml/2006/main">
               <a:graphicData uri="http://schemas.openxmlformats.org/drawingml/2006/picture">
                 <pic:pic xmlns:pic="http://schemas.openxmlformats.org/drawingml/2006/picture">
                   <pic:nvPicPr>
-                    <pic:cNvPr id="1089019211" name=""/>
+                    <pic:cNvPr id="591924702" name=""/>
                     <pic:cNvPicPr/>
                   </pic:nvPicPr>
                   <pic:blipFill>
@@ -13047,16 +13090,16 @@
         </w:rPr>
         <w:lastRenderedPageBreak/>
         <w:drawing>
-          <wp:inline distT="0" distB="0" distL="0" distR="0" wp14:anchorId="703A3A2D" wp14:editId="486B184B">
+          <wp:inline distT="0" distB="0" distL="0" distR="0" wp14:anchorId="14C43AF7" wp14:editId="3A5216DD">
             <wp:extent cx="5120640" cy="4627581"/>
             <wp:effectExtent l="19050" t="19050" r="22860" b="20955"/>
-            <wp:docPr id="1531944592" name="Imagem 14"/>
+            <wp:docPr id="126293685" name="Imagem 14"/>
             <wp:cNvGraphicFramePr/>
             <a:graphic xmlns:a="http://schemas.openxmlformats.org/drawingml/2006/main">
               <a:graphicData uri="http://schemas.openxmlformats.org/drawingml/2006/picture">
                 <pic:pic xmlns:pic="http://schemas.openxmlformats.org/drawingml/2006/picture">
                   <pic:nvPicPr>
-                    <pic:cNvPr id="1531944592" name=""/>
+                    <pic:cNvPr id="126293685" name=""/>
                     <pic:cNvPicPr/>
                   </pic:nvPicPr>
                   <pic:blipFill>
@@ -13176,7 +13219,7 @@
           <w:color w:val="1A1A1A"/>
           <w:sz w:val="22"/>
         </w:rPr>
-        <w:t>Assistente de preenchimento por IA: apos selecionar o Projeto vinculado, o botao Sugerir com IA le a Solicitacao de Demanda, o TAP, o Canvas e as Atas de Reuniao do projeto e sugere o Solicitante (capa), o preenchimento da aba Pre-projeto (incluindo Macro fases), a Introducao/Situacao atual/Proposta de mudanca/Beneficios na aba Viabilidade e marcos iniciais na aba Cronograma. O campo Negocio (capa) fica de fora, por nao ter fonte confiavel nos documentos (secao 2.12).</w:t>
+        <w:t>Assistente de preenchimento por IA: apos selecionar o Projeto vinculado, o botao Sugerir com IA le a Solicitacao de Demanda, o TAP, o Canvas e as Atas de Reuniao do projeto e sugere o Solicitante (capa), o preenchimento da aba Pre-projeto (incluindo Macro fases) e a Introducao/Situacao atual/Proposta de mudanca/Beneficios na aba Viabilidade. A aba Cronograma nao entra no assistente - ela ja mostra ao vivo o cronograma do TAP (secao 3 acima). O campo Negocio (capa) fica de fora, por nao ter fonte confiavel nos documentos (secao 2.12).</w:t>
       </w:r>
     </w:p>
     <w:p>
@@ -13190,7 +13233,7 @@
           <w:sz w:val="27"/>
         </w:rPr>
       </w:pPr>
-      <w:bookmarkStart w:id="24" w:name="_Toc239864460"/>
+      <w:bookmarkStart w:id="24" w:name="_Toc239952519"/>
       <w:r>
         <w:rPr>
           <w:rFonts w:ascii="Montserrat" w:hAnsi="Montserrat"/>
@@ -13231,16 +13274,16 @@
           <w:noProof/>
         </w:rPr>
         <w:drawing>
-          <wp:inline distT="0" distB="0" distL="0" distR="0" wp14:anchorId="4A53A00B" wp14:editId="67E2FE45">
+          <wp:inline distT="0" distB="0" distL="0" distR="0" wp14:anchorId="05064DDA" wp14:editId="7B06131E">
             <wp:extent cx="5120640" cy="4627581"/>
             <wp:effectExtent l="19050" t="19050" r="22860" b="20955"/>
-            <wp:docPr id="544025760" name="Imagem 15"/>
+            <wp:docPr id="429998992" name="Imagem 15"/>
             <wp:cNvGraphicFramePr/>
             <a:graphic xmlns:a="http://schemas.openxmlformats.org/drawingml/2006/main">
               <a:graphicData uri="http://schemas.openxmlformats.org/drawingml/2006/picture">
                 <pic:pic xmlns:pic="http://schemas.openxmlformats.org/drawingml/2006/picture">
                   <pic:nvPicPr>
-                    <pic:cNvPr id="544025760" name=""/>
+                    <pic:cNvPr id="429998992" name=""/>
                     <pic:cNvPicPr/>
                   </pic:nvPicPr>
                   <pic:blipFill>
@@ -13308,16 +13351,16 @@
         </w:rPr>
         <w:lastRenderedPageBreak/>
         <w:drawing>
-          <wp:inline distT="0" distB="0" distL="0" distR="0" wp14:anchorId="402FA670" wp14:editId="5DBBC091">
+          <wp:inline distT="0" distB="0" distL="0" distR="0" wp14:anchorId="7BE2DD68" wp14:editId="334530DE">
             <wp:extent cx="5120640" cy="4627581"/>
             <wp:effectExtent l="19050" t="19050" r="22860" b="20955"/>
-            <wp:docPr id="321726291" name="Imagem 16"/>
+            <wp:docPr id="1914413885" name="Imagem 16"/>
             <wp:cNvGraphicFramePr/>
             <a:graphic xmlns:a="http://schemas.openxmlformats.org/drawingml/2006/main">
               <a:graphicData uri="http://schemas.openxmlformats.org/drawingml/2006/picture">
                 <pic:pic xmlns:pic="http://schemas.openxmlformats.org/drawingml/2006/picture">
                   <pic:nvPicPr>
-                    <pic:cNvPr id="321726291" name=""/>
+                    <pic:cNvPr id="1914413885" name=""/>
                     <pic:cNvPicPr/>
                   </pic:nvPicPr>
                   <pic:blipFill>
@@ -13481,16 +13524,16 @@
         </w:rPr>
         <w:lastRenderedPageBreak/>
         <w:drawing>
-          <wp:inline distT="0" distB="0" distL="0" distR="0" wp14:anchorId="76EA4677" wp14:editId="488F9595">
+          <wp:inline distT="0" distB="0" distL="0" distR="0" wp14:anchorId="4A7B3A46" wp14:editId="056F61A9">
             <wp:extent cx="5120640" cy="3282818"/>
             <wp:effectExtent l="19050" t="19050" r="22860" b="13335"/>
-            <wp:docPr id="1315136103" name="Imagem 17"/>
+            <wp:docPr id="2042532154" name="Imagem 17"/>
             <wp:cNvGraphicFramePr/>
             <a:graphic xmlns:a="http://schemas.openxmlformats.org/drawingml/2006/main">
               <a:graphicData uri="http://schemas.openxmlformats.org/drawingml/2006/picture">
                 <pic:pic xmlns:pic="http://schemas.openxmlformats.org/drawingml/2006/picture">
                   <pic:nvPicPr>
-                    <pic:cNvPr id="1315136103" name=""/>
+                    <pic:cNvPr id="2042532154" name=""/>
                     <pic:cNvPicPr/>
                   </pic:nvPicPr>
                   <pic:blipFill>
@@ -13624,7 +13667,7 @@
           <w:sz w:val="27"/>
         </w:rPr>
       </w:pPr>
-      <w:bookmarkStart w:id="25" w:name="_Toc239864461"/>
+      <w:bookmarkStart w:id="25" w:name="_Toc239952520"/>
       <w:r>
         <w:rPr>
           <w:rFonts w:ascii="Montserrat" w:hAnsi="Montserrat"/>
@@ -13665,16 +13708,16 @@
         </w:rPr>
         <w:lastRenderedPageBreak/>
         <w:drawing>
-          <wp:inline distT="0" distB="0" distL="0" distR="0" wp14:anchorId="4F303F05" wp14:editId="7BCF4B66">
+          <wp:inline distT="0" distB="0" distL="0" distR="0" wp14:anchorId="34212E4D" wp14:editId="44D20E42">
             <wp:extent cx="5120640" cy="4627581"/>
             <wp:effectExtent l="19050" t="19050" r="22860" b="20955"/>
-            <wp:docPr id="301015028" name="Imagem 18"/>
+            <wp:docPr id="844261591" name="Imagem 18"/>
             <wp:cNvGraphicFramePr/>
             <a:graphic xmlns:a="http://schemas.openxmlformats.org/drawingml/2006/main">
               <a:graphicData uri="http://schemas.openxmlformats.org/drawingml/2006/picture">
                 <pic:pic xmlns:pic="http://schemas.openxmlformats.org/drawingml/2006/picture">
                   <pic:nvPicPr>
-                    <pic:cNvPr id="301015028" name=""/>
+                    <pic:cNvPr id="844261591" name=""/>
                     <pic:cNvPicPr/>
                   </pic:nvPicPr>
                   <pic:blipFill>
@@ -13742,16 +13785,16 @@
         </w:rPr>
         <w:lastRenderedPageBreak/>
         <w:drawing>
-          <wp:inline distT="0" distB="0" distL="0" distR="0" wp14:anchorId="521FDDE4" wp14:editId="18378842">
+          <wp:inline distT="0" distB="0" distL="0" distR="0" wp14:anchorId="0EE13667" wp14:editId="464F3BB6">
             <wp:extent cx="5120640" cy="4627581"/>
             <wp:effectExtent l="19050" t="19050" r="22860" b="20955"/>
-            <wp:docPr id="2038498959" name="Imagem 19"/>
+            <wp:docPr id="1571095393" name="Imagem 19"/>
             <wp:cNvGraphicFramePr/>
             <a:graphic xmlns:a="http://schemas.openxmlformats.org/drawingml/2006/main">
               <a:graphicData uri="http://schemas.openxmlformats.org/drawingml/2006/picture">
                 <pic:pic xmlns:pic="http://schemas.openxmlformats.org/drawingml/2006/picture">
                   <pic:nvPicPr>
-                    <pic:cNvPr id="2038498959" name=""/>
+                    <pic:cNvPr id="1571095393" name=""/>
                     <pic:cNvPicPr/>
                   </pic:nvPicPr>
                   <pic:blipFill>
@@ -13934,7 +13977,7 @@
           <w:sz w:val="27"/>
         </w:rPr>
       </w:pPr>
-      <w:bookmarkStart w:id="26" w:name="_Toc239864462"/>
+      <w:bookmarkStart w:id="26" w:name="_Toc239952521"/>
       <w:r>
         <w:rPr>
           <w:rFonts w:ascii="Montserrat" w:hAnsi="Montserrat"/>
@@ -13974,16 +14017,16 @@
           <w:noProof/>
         </w:rPr>
         <w:drawing>
-          <wp:inline distT="0" distB="0" distL="0" distR="0" wp14:anchorId="5E224E71" wp14:editId="0DDA7291">
+          <wp:inline distT="0" distB="0" distL="0" distR="0" wp14:anchorId="2C281C1B" wp14:editId="0922DCE7">
             <wp:extent cx="5120640" cy="4627581"/>
             <wp:effectExtent l="19050" t="19050" r="22860" b="20955"/>
-            <wp:docPr id="1018663164" name="Imagem 20"/>
+            <wp:docPr id="124512689" name="Imagem 20"/>
             <wp:cNvGraphicFramePr/>
             <a:graphic xmlns:a="http://schemas.openxmlformats.org/drawingml/2006/main">
               <a:graphicData uri="http://schemas.openxmlformats.org/drawingml/2006/picture">
                 <pic:pic xmlns:pic="http://schemas.openxmlformats.org/drawingml/2006/picture">
                   <pic:nvPicPr>
-                    <pic:cNvPr id="1018663164" name=""/>
+                    <pic:cNvPr id="124512689" name=""/>
                     <pic:cNvPicPr/>
                   </pic:nvPicPr>
                   <pic:blipFill>
@@ -14051,16 +14094,16 @@
         </w:rPr>
         <w:lastRenderedPageBreak/>
         <w:drawing>
-          <wp:inline distT="0" distB="0" distL="0" distR="0" wp14:anchorId="33242309" wp14:editId="7C72E5CF">
+          <wp:inline distT="0" distB="0" distL="0" distR="0" wp14:anchorId="41E2B73C" wp14:editId="3FCE6AFB">
             <wp:extent cx="5120640" cy="4627581"/>
             <wp:effectExtent l="19050" t="19050" r="22860" b="20955"/>
-            <wp:docPr id="1061935086" name="Imagem 21"/>
+            <wp:docPr id="2120662936" name="Imagem 21"/>
             <wp:cNvGraphicFramePr/>
             <a:graphic xmlns:a="http://schemas.openxmlformats.org/drawingml/2006/main">
               <a:graphicData uri="http://schemas.openxmlformats.org/drawingml/2006/picture">
                 <pic:pic xmlns:pic="http://schemas.openxmlformats.org/drawingml/2006/picture">
                   <pic:nvPicPr>
-                    <pic:cNvPr id="1061935086" name=""/>
+                    <pic:cNvPr id="2120662936" name=""/>
                     <pic:cNvPicPr/>
                   </pic:nvPicPr>
                   <pic:blipFill>
@@ -14266,16 +14309,16 @@
           <w:noProof/>
         </w:rPr>
         <w:drawing>
-          <wp:inline distT="0" distB="0" distL="0" distR="0" wp14:anchorId="58F0DFCD" wp14:editId="34C006CD">
+          <wp:inline distT="0" distB="0" distL="0" distR="0" wp14:anchorId="5CC4504A" wp14:editId="56DF9D2A">
             <wp:extent cx="5120640" cy="1757287"/>
             <wp:effectExtent l="19050" t="19050" r="22860" b="14605"/>
-            <wp:docPr id="931464732" name="Imagem 22"/>
+            <wp:docPr id="539009087" name="Imagem 22"/>
             <wp:cNvGraphicFramePr/>
             <a:graphic xmlns:a="http://schemas.openxmlformats.org/drawingml/2006/main">
               <a:graphicData uri="http://schemas.openxmlformats.org/drawingml/2006/picture">
                 <pic:pic xmlns:pic="http://schemas.openxmlformats.org/drawingml/2006/picture">
                   <pic:nvPicPr>
-                    <pic:cNvPr id="931464732" name=""/>
+                    <pic:cNvPr id="539009087" name=""/>
                     <pic:cNvPicPr/>
                   </pic:nvPicPr>
                   <pic:blipFill>
@@ -14388,7 +14431,7 @@
           <w:sz w:val="27"/>
         </w:rPr>
       </w:pPr>
-      <w:bookmarkStart w:id="27" w:name="_Toc239864463"/>
+      <w:bookmarkStart w:id="27" w:name="_Toc239952522"/>
       <w:r>
         <w:rPr>
           <w:rFonts w:ascii="Montserrat" w:hAnsi="Montserrat"/>
@@ -14429,16 +14472,16 @@
         </w:rPr>
         <w:lastRenderedPageBreak/>
         <w:drawing>
-          <wp:inline distT="0" distB="0" distL="0" distR="0" wp14:anchorId="52B9FC9A" wp14:editId="7EE295EC">
+          <wp:inline distT="0" distB="0" distL="0" distR="0" wp14:anchorId="6FAF06AF" wp14:editId="0ADCA116">
             <wp:extent cx="5120640" cy="4627581"/>
             <wp:effectExtent l="19050" t="19050" r="22860" b="20955"/>
-            <wp:docPr id="1404631724" name="Imagem 23"/>
+            <wp:docPr id="579667661" name="Imagem 23"/>
             <wp:cNvGraphicFramePr/>
             <a:graphic xmlns:a="http://schemas.openxmlformats.org/drawingml/2006/main">
               <a:graphicData uri="http://schemas.openxmlformats.org/drawingml/2006/picture">
                 <pic:pic xmlns:pic="http://schemas.openxmlformats.org/drawingml/2006/picture">
                   <pic:nvPicPr>
-                    <pic:cNvPr id="1404631724" name=""/>
+                    <pic:cNvPr id="579667661" name=""/>
                     <pic:cNvPicPr/>
                   </pic:nvPicPr>
                   <pic:blipFill>
@@ -14506,16 +14549,16 @@
         </w:rPr>
         <w:lastRenderedPageBreak/>
         <w:drawing>
-          <wp:inline distT="0" distB="0" distL="0" distR="0" wp14:anchorId="7A8A942A" wp14:editId="5A4C25FF">
+          <wp:inline distT="0" distB="0" distL="0" distR="0" wp14:anchorId="2DAE6701" wp14:editId="5AAB6C2B">
             <wp:extent cx="5120640" cy="4627581"/>
             <wp:effectExtent l="19050" t="19050" r="22860" b="20955"/>
-            <wp:docPr id="1554674535" name="Imagem 24"/>
+            <wp:docPr id="1293963581" name="Imagem 24"/>
             <wp:cNvGraphicFramePr/>
             <a:graphic xmlns:a="http://schemas.openxmlformats.org/drawingml/2006/main">
               <a:graphicData uri="http://schemas.openxmlformats.org/drawingml/2006/picture">
                 <pic:pic xmlns:pic="http://schemas.openxmlformats.org/drawingml/2006/picture">
                   <pic:nvPicPr>
-                    <pic:cNvPr id="1554674535" name=""/>
+                    <pic:cNvPr id="1293963581" name=""/>
                     <pic:cNvPicPr/>
                   </pic:nvPicPr>
                   <pic:blipFill>
@@ -14752,7 +14795,7 @@
           <w:sz w:val="27"/>
         </w:rPr>
       </w:pPr>
-      <w:bookmarkStart w:id="28" w:name="_Toc239864464"/>
+      <w:bookmarkStart w:id="28" w:name="_Toc239952523"/>
       <w:r>
         <w:rPr>
           <w:rFonts w:ascii="Montserrat" w:hAnsi="Montserrat"/>
@@ -14792,16 +14835,16 @@
           <w:noProof/>
         </w:rPr>
         <w:drawing>
-          <wp:inline distT="0" distB="0" distL="0" distR="0" wp14:anchorId="78FB4BBA" wp14:editId="4084C186">
+          <wp:inline distT="0" distB="0" distL="0" distR="0" wp14:anchorId="4F99F6CA" wp14:editId="31C4CFE3">
             <wp:extent cx="5120640" cy="4627581"/>
             <wp:effectExtent l="19050" t="19050" r="22860" b="20955"/>
-            <wp:docPr id="488162850" name="Imagem 25"/>
+            <wp:docPr id="435224327" name="Imagem 25"/>
             <wp:cNvGraphicFramePr/>
             <a:graphic xmlns:a="http://schemas.openxmlformats.org/drawingml/2006/main">
               <a:graphicData uri="http://schemas.openxmlformats.org/drawingml/2006/picture">
                 <pic:pic xmlns:pic="http://schemas.openxmlformats.org/drawingml/2006/picture">
                   <pic:nvPicPr>
-                    <pic:cNvPr id="488162850" name=""/>
+                    <pic:cNvPr id="435224327" name=""/>
                     <pic:cNvPicPr/>
                   </pic:nvPicPr>
                   <pic:blipFill>
@@ -14869,16 +14912,16 @@
         </w:rPr>
         <w:lastRenderedPageBreak/>
         <w:drawing>
-          <wp:inline distT="0" distB="0" distL="0" distR="0" wp14:anchorId="0B73CDA4" wp14:editId="263A812A">
+          <wp:inline distT="0" distB="0" distL="0" distR="0" wp14:anchorId="29A13F1C" wp14:editId="7EB58A45">
             <wp:extent cx="5120640" cy="4627581"/>
             <wp:effectExtent l="19050" t="19050" r="22860" b="20955"/>
-            <wp:docPr id="969899302" name="Imagem 26"/>
+            <wp:docPr id="1800055134" name="Imagem 26"/>
             <wp:cNvGraphicFramePr/>
             <a:graphic xmlns:a="http://schemas.openxmlformats.org/drawingml/2006/main">
               <a:graphicData uri="http://schemas.openxmlformats.org/drawingml/2006/picture">
                 <pic:pic xmlns:pic="http://schemas.openxmlformats.org/drawingml/2006/picture">
                   <pic:nvPicPr>
-                    <pic:cNvPr id="969899302" name=""/>
+                    <pic:cNvPr id="1800055134" name=""/>
                     <pic:cNvPicPr/>
                   </pic:nvPicPr>
                   <pic:blipFill>
@@ -15069,7 +15112,7 @@
           <w:sz w:val="27"/>
         </w:rPr>
       </w:pPr>
-      <w:bookmarkStart w:id="29" w:name="_Toc239864465"/>
+      <w:bookmarkStart w:id="29" w:name="_Toc239952524"/>
       <w:r>
         <w:rPr>
           <w:rFonts w:ascii="Montserrat" w:hAnsi="Montserrat"/>
@@ -15109,16 +15152,16 @@
           <w:noProof/>
         </w:rPr>
         <w:drawing>
-          <wp:inline distT="0" distB="0" distL="0" distR="0" wp14:anchorId="4AFECC80" wp14:editId="33BD92FA">
+          <wp:inline distT="0" distB="0" distL="0" distR="0" wp14:anchorId="450CAF26" wp14:editId="5A0F5659">
             <wp:extent cx="5120640" cy="4000682"/>
             <wp:effectExtent l="19050" t="19050" r="22860" b="19050"/>
-            <wp:docPr id="355603535" name="Imagem 27"/>
+            <wp:docPr id="8137043" name="Imagem 27"/>
             <wp:cNvGraphicFramePr/>
             <a:graphic xmlns:a="http://schemas.openxmlformats.org/drawingml/2006/main">
               <a:graphicData uri="http://schemas.openxmlformats.org/drawingml/2006/picture">
                 <pic:pic xmlns:pic="http://schemas.openxmlformats.org/drawingml/2006/picture">
                   <pic:nvPicPr>
-                    <pic:cNvPr id="355603535" name=""/>
+                    <pic:cNvPr id="8137043" name=""/>
                     <pic:cNvPicPr/>
                   </pic:nvPicPr>
                   <pic:blipFill>
@@ -15642,7 +15685,7 @@
           <w:sz w:val="34"/>
         </w:rPr>
       </w:pPr>
-      <w:bookmarkStart w:id="30" w:name="_Toc239864466"/>
+      <w:bookmarkStart w:id="30" w:name="_Toc239952525"/>
       <w:r>
         <w:rPr>
           <w:rFonts w:ascii="Montserrat" w:hAnsi="Montserrat"/>
@@ -15684,7 +15727,7 @@
           <w:sz w:val="27"/>
         </w:rPr>
       </w:pPr>
-      <w:bookmarkStart w:id="31" w:name="_Toc239864467"/>
+      <w:bookmarkStart w:id="31" w:name="_Toc239952526"/>
       <w:r>
         <w:rPr>
           <w:rFonts w:ascii="Montserrat" w:hAnsi="Montserrat"/>
@@ -15724,16 +15767,16 @@
           <w:noProof/>
         </w:rPr>
         <w:drawing>
-          <wp:inline distT="0" distB="0" distL="0" distR="0" wp14:anchorId="1AF0BA6D" wp14:editId="28DD2244">
+          <wp:inline distT="0" distB="0" distL="0" distR="0" wp14:anchorId="0205D998" wp14:editId="71035FCC">
             <wp:extent cx="5120640" cy="4627581"/>
             <wp:effectExtent l="19050" t="19050" r="22860" b="20955"/>
-            <wp:docPr id="1454083795" name="Imagem 28"/>
+            <wp:docPr id="1665855676" name="Imagem 28"/>
             <wp:cNvGraphicFramePr/>
             <a:graphic xmlns:a="http://schemas.openxmlformats.org/drawingml/2006/main">
               <a:graphicData uri="http://schemas.openxmlformats.org/drawingml/2006/picture">
                 <pic:pic xmlns:pic="http://schemas.openxmlformats.org/drawingml/2006/picture">
                   <pic:nvPicPr>
-                    <pic:cNvPr id="1454083795" name=""/>
+                    <pic:cNvPr id="1665855676" name=""/>
                     <pic:cNvPicPr/>
                   </pic:nvPicPr>
                   <pic:blipFill>
@@ -15801,16 +15844,16 @@
         </w:rPr>
         <w:lastRenderedPageBreak/>
         <w:drawing>
-          <wp:inline distT="0" distB="0" distL="0" distR="0" wp14:anchorId="47DF1BA7" wp14:editId="7A52E89A">
+          <wp:inline distT="0" distB="0" distL="0" distR="0" wp14:anchorId="4F9CBAA9" wp14:editId="0A938298">
             <wp:extent cx="5120640" cy="4627581"/>
             <wp:effectExtent l="19050" t="19050" r="22860" b="20955"/>
-            <wp:docPr id="1965709205" name="Imagem 29"/>
+            <wp:docPr id="28649278" name="Imagem 29"/>
             <wp:cNvGraphicFramePr/>
             <a:graphic xmlns:a="http://schemas.openxmlformats.org/drawingml/2006/main">
               <a:graphicData uri="http://schemas.openxmlformats.org/drawingml/2006/picture">
                 <pic:pic xmlns:pic="http://schemas.openxmlformats.org/drawingml/2006/picture">
                   <pic:nvPicPr>
-                    <pic:cNvPr id="1965709205" name=""/>
+                    <pic:cNvPr id="28649278" name=""/>
                     <pic:cNvPicPr/>
                   </pic:nvPicPr>
                   <pic:blipFill>
@@ -15878,16 +15921,16 @@
         </w:rPr>
         <w:lastRenderedPageBreak/>
         <w:drawing>
-          <wp:inline distT="0" distB="0" distL="0" distR="0" wp14:anchorId="75A29A5C" wp14:editId="30FE15B7">
+          <wp:inline distT="0" distB="0" distL="0" distR="0" wp14:anchorId="6C9A218C" wp14:editId="332006A1">
             <wp:extent cx="5120640" cy="4627581"/>
             <wp:effectExtent l="19050" t="19050" r="22860" b="20955"/>
-            <wp:docPr id="1390067783" name="Imagem 30"/>
+            <wp:docPr id="2038196746" name="Imagem 30"/>
             <wp:cNvGraphicFramePr/>
             <a:graphic xmlns:a="http://schemas.openxmlformats.org/drawingml/2006/main">
               <a:graphicData uri="http://schemas.openxmlformats.org/drawingml/2006/picture">
                 <pic:pic xmlns:pic="http://schemas.openxmlformats.org/drawingml/2006/picture">
                   <pic:nvPicPr>
-                    <pic:cNvPr id="1390067783" name=""/>
+                    <pic:cNvPr id="2038196746" name=""/>
                     <pic:cNvPicPr/>
                   </pic:nvPicPr>
                   <pic:blipFill>
@@ -15978,12 +16021,14 @@
         <w:spacing w:after="80" w:line="260" w:lineRule="auto"/>
         <w:ind w:left="700"/>
         <w:rPr>
-          <w:color w:val="1A1A1A"/>
-          <w:sz w:val="22"/>
-        </w:rPr>
-      </w:pPr>
-      <w:r>
-        <w:rPr>
+          <w:rFonts w:ascii="Montserrat" w:hAnsi="Montserrat"/>
+          <w:color w:val="1A1A1A"/>
+          <w:sz w:val="22"/>
+        </w:rPr>
+      </w:pPr>
+      <w:r>
+        <w:rPr>
+          <w:rFonts w:ascii="Montserrat" w:hAnsi="Montserrat"/>
           <w:color w:val="1A1A1A"/>
           <w:sz w:val="22"/>
         </w:rPr>
@@ -16066,7 +16111,7 @@
           <w:color w:val="1A1A1A"/>
           <w:sz w:val="22"/>
         </w:rPr>
-        <w:t>Importar marcos do TAP: na secao Marcos de cada linha, o botao Importar marcos do TAP (visivel com um Projeto vinculado selecionado) traz os marcos do cronograma de entregas macro do TAP daquele projeto - o nome do marco vira o Nome do marco aqui, o Termino previsto vira a Data, e o Status comeca sempre como A iniciar (o TAP nao registra se um marco ja foi concluido). Marcos com o mesmo nome que ja estiverem na lista nao sao duplicados - o botao pode ser clicado varias vezes com seguranca, assim como o Importar do TAP dos Indicadores (secao 4.2).</w:t>
+        <w:t>Marcos vem do TAP: a secao Marcos de cada linha de projeto mostra, automaticamente (sem botao de importar), os marcos do cronograma de entregas macro do TAP daquele projeto - nome, Inicio/Termino previsto e Conclusao real vem sempre ao vivo do TAP (para mudar um marco, edite o TAP). O unico campo proprio aqui e o Status de cada marco (A iniciar, No prazo, Atrasado, Paralisado, Concluido ou Cancelado), que continua sendo ajustado manualmente.</w:t>
       </w:r>
     </w:p>
     <w:p>
@@ -16079,16 +16124,16 @@
           <w:noProof/>
         </w:rPr>
         <w:drawing>
-          <wp:inline distT="0" distB="0" distL="0" distR="0" wp14:anchorId="1864004F" wp14:editId="3208B60B">
+          <wp:inline distT="0" distB="0" distL="0" distR="0" wp14:anchorId="55F2E1A7" wp14:editId="71CD58F6">
             <wp:extent cx="5120640" cy="1715571"/>
             <wp:effectExtent l="19050" t="19050" r="22860" b="18415"/>
-            <wp:docPr id="1615309175" name="Imagem 31"/>
+            <wp:docPr id="1218710796" name="Imagem 31"/>
             <wp:cNvGraphicFramePr/>
             <a:graphic xmlns:a="http://schemas.openxmlformats.org/drawingml/2006/main">
               <a:graphicData uri="http://schemas.openxmlformats.org/drawingml/2006/picture">
                 <pic:pic xmlns:pic="http://schemas.openxmlformats.org/drawingml/2006/picture">
                   <pic:nvPicPr>
-                    <pic:cNvPr id="1615309175" name=""/>
+                    <pic:cNvPr id="1218710796" name=""/>
                     <pic:cNvPicPr/>
                   </pic:nvPicPr>
                   <pic:blipFill>
@@ -16211,7 +16256,7 @@
           <w:color w:val="6A6A70"/>
           <w:sz w:val="21"/>
         </w:rPr>
-        <w:t xml:space="preserve">Sinalizacao automatica: a tabela de projetos do Painel ganhou a coluna Sinalizacao e o quadro de indicadores ganhou o card Em risco de atraso. E um calculo automatico, independente do campo Status manual: compara o % </w:t>
+        <w:t xml:space="preserve">Sinalizacao automatica: a tabela de projetos do Painel ganhou a coluna Sinalizacao e o quadro de indicadores ganhou o card Em risco de atraso. E um calculo automatico, independente do campo Status manual: compara o % Execucao informado com o % que seria esperado pelo tempo ja decorrido entre o Inicio previsto e o Termino previsto do projeto. Se a defasagem for de 15 pontos </w:t>
       </w:r>
       <w:r>
         <w:rPr>
@@ -16221,7 +16266,7 @@
           <w:sz w:val="21"/>
         </w:rPr>
         <w:lastRenderedPageBreak/>
-        <w:t>Execucao informado com o % que seria esperado pelo tempo ja decorrido entre o Inicio previsto e o Termino previsto do projeto. Se a defasagem for de 15 pontos percentuais ou mais, aparece Risco de atraso; se o Termino previsto ja passou e o projeto nao esta em 100%, aparece Prazo vencido. Projetos Concluido, Cancelado ou Paralisado ficam fora desse calculo. O resultado tambem sai no documento exportado.</w:t>
+        <w:t>percentuais ou mais, aparece Risco de atraso; se o Termino previsto ja passou e o projeto nao esta em 100%, aparece Prazo vencido. Projetos Concluido, Cancelado ou Paralisado ficam fora desse calculo. O resultado tambem sai no documento exportado.</w:t>
       </w:r>
     </w:p>
     <w:p>
@@ -16234,16 +16279,16 @@
           <w:noProof/>
         </w:rPr>
         <w:drawing>
-          <wp:inline distT="0" distB="0" distL="0" distR="0" wp14:anchorId="1B67D93A" wp14:editId="12EA634D">
+          <wp:inline distT="0" distB="0" distL="0" distR="0" wp14:anchorId="2D951D32" wp14:editId="1AC955CB">
             <wp:extent cx="5120640" cy="3282818"/>
             <wp:effectExtent l="19050" t="19050" r="22860" b="13335"/>
-            <wp:docPr id="1831625508" name="Imagem 32"/>
+            <wp:docPr id="1149066438" name="Imagem 32"/>
             <wp:cNvGraphicFramePr/>
             <a:graphic xmlns:a="http://schemas.openxmlformats.org/drawingml/2006/main">
               <a:graphicData uri="http://schemas.openxmlformats.org/drawingml/2006/picture">
                 <pic:pic xmlns:pic="http://schemas.openxmlformats.org/drawingml/2006/picture">
                   <pic:nvPicPr>
-                    <pic:cNvPr id="1831625508" name=""/>
+                    <pic:cNvPr id="1149066438" name=""/>
                     <pic:cNvPicPr/>
                   </pic:nvPicPr>
                   <pic:blipFill>
@@ -16342,7 +16387,7 @@
           <w:color w:val="6A6A70"/>
           <w:sz w:val="21"/>
         </w:rPr>
-        <w:t>Importar categorias do TAP: o botao Importar categorias do TAP (visivel com um Projeto vinculado selecionado) traz as mesmas categorias de custo estimado cadastradas no TAP daquele projeto - mesma logica do Importar marcos do TAP acima: so falta preencher o valor efetivamente gasto em cada categoria, e categorias repetidas nao sao duplicadas. O total gasto (soma de todas as categorias) e recalculado automaticamente a cada valor digitado.</w:t>
+        <w:t>Importar categorias do TAP: o botao Importar categorias do TAP (visivel com um Projeto vinculado selecionado) traz as mesmas categorias de custo estimado cadastradas no TAP daquele projeto - so falta preencher o valor efetivamente gasto em cada categoria, e categorias repetidas nao sao duplicadas. O total gasto (soma de todas as categorias) e recalculado automaticamente a cada valor digitado. Diferente dos Marcos acima (que agora vem sempre ao vivo do TAP, sem botao), os Custos realizados continuam sendo uma copia unica - o botao pode ser clicado de novo se o TAP ganhar novas categorias depois.</w:t>
       </w:r>
     </w:p>
     <w:p>
@@ -16356,16 +16401,16 @@
         </w:rPr>
         <w:lastRenderedPageBreak/>
         <w:drawing>
-          <wp:inline distT="0" distB="0" distL="0" distR="0" wp14:anchorId="088C3C42" wp14:editId="59F0561F">
+          <wp:inline distT="0" distB="0" distL="0" distR="0" wp14:anchorId="3673EFFC" wp14:editId="1CF730A5">
             <wp:extent cx="5120640" cy="951357"/>
             <wp:effectExtent l="19050" t="19050" r="22860" b="20320"/>
-            <wp:docPr id="1530519355" name="Imagem 33"/>
+            <wp:docPr id="518780335" name="Imagem 33"/>
             <wp:cNvGraphicFramePr/>
             <a:graphic xmlns:a="http://schemas.openxmlformats.org/drawingml/2006/main">
               <a:graphicData uri="http://schemas.openxmlformats.org/drawingml/2006/picture">
                 <pic:pic xmlns:pic="http://schemas.openxmlformats.org/drawingml/2006/picture">
                   <pic:nvPicPr>
-                    <pic:cNvPr id="1530519355" name=""/>
+                    <pic:cNvPr id="518780335" name=""/>
                     <pic:cNvPicPr/>
                   </pic:nvPicPr>
                   <pic:blipFill>
@@ -16477,16 +16522,16 @@
           <w:noProof/>
         </w:rPr>
         <w:drawing>
-          <wp:inline distT="0" distB="0" distL="0" distR="0" wp14:anchorId="1C85792C" wp14:editId="5D31A0F3">
+          <wp:inline distT="0" distB="0" distL="0" distR="0" wp14:anchorId="15B72092" wp14:editId="3730E59F">
             <wp:extent cx="5120640" cy="1515102"/>
             <wp:effectExtent l="19050" t="19050" r="22860" b="28575"/>
-            <wp:docPr id="1728943997" name="Imagem 34"/>
+            <wp:docPr id="890276465" name="Imagem 34"/>
             <wp:cNvGraphicFramePr/>
             <a:graphic xmlns:a="http://schemas.openxmlformats.org/drawingml/2006/main">
               <a:graphicData uri="http://schemas.openxmlformats.org/drawingml/2006/picture">
                 <pic:pic xmlns:pic="http://schemas.openxmlformats.org/drawingml/2006/picture">
                   <pic:nvPicPr>
-                    <pic:cNvPr id="1728943997" name=""/>
+                    <pic:cNvPr id="890276465" name=""/>
                     <pic:cNvPicPr/>
                   </pic:nvPicPr>
                   <pic:blipFill>
@@ -16608,16 +16653,16 @@
           <w:noProof/>
         </w:rPr>
         <w:drawing>
-          <wp:inline distT="0" distB="0" distL="0" distR="0" wp14:anchorId="628FE9A1" wp14:editId="46517522">
+          <wp:inline distT="0" distB="0" distL="0" distR="0" wp14:anchorId="320EF9E5" wp14:editId="5FF6D399">
             <wp:extent cx="5120640" cy="1391113"/>
             <wp:effectExtent l="19050" t="19050" r="22860" b="19050"/>
-            <wp:docPr id="1815584681" name="Imagem 35"/>
+            <wp:docPr id="2134791" name="Imagem 35"/>
             <wp:cNvGraphicFramePr/>
             <a:graphic xmlns:a="http://schemas.openxmlformats.org/drawingml/2006/main">
               <a:graphicData uri="http://schemas.openxmlformats.org/drawingml/2006/picture">
                 <pic:pic xmlns:pic="http://schemas.openxmlformats.org/drawingml/2006/picture">
                   <pic:nvPicPr>
-                    <pic:cNvPr id="1815584681" name=""/>
+                    <pic:cNvPr id="2134791" name=""/>
                     <pic:cNvPicPr/>
                   </pic:nvPicPr>
                   <pic:blipFill>
@@ -16729,16 +16774,16 @@
           <w:noProof/>
         </w:rPr>
         <w:drawing>
-          <wp:inline distT="0" distB="0" distL="0" distR="0" wp14:anchorId="6E756ED0" wp14:editId="035819A9">
+          <wp:inline distT="0" distB="0" distL="0" distR="0" wp14:anchorId="64FC1EE1" wp14:editId="1B7522B0">
             <wp:extent cx="5120640" cy="1125174"/>
             <wp:effectExtent l="19050" t="19050" r="22860" b="18415"/>
-            <wp:docPr id="776104484" name="Imagem 36"/>
+            <wp:docPr id="5935628" name="Imagem 36"/>
             <wp:cNvGraphicFramePr/>
             <a:graphic xmlns:a="http://schemas.openxmlformats.org/drawingml/2006/main">
               <a:graphicData uri="http://schemas.openxmlformats.org/drawingml/2006/picture">
                 <pic:pic xmlns:pic="http://schemas.openxmlformats.org/drawingml/2006/picture">
                   <pic:nvPicPr>
-                    <pic:cNvPr id="776104484" name=""/>
+                    <pic:cNvPr id="5935628" name=""/>
                     <pic:cNvPicPr/>
                   </pic:nvPicPr>
                   <pic:blipFill>
@@ -16827,7 +16872,7 @@
           <w:sz w:val="27"/>
         </w:rPr>
       </w:pPr>
-      <w:bookmarkStart w:id="32" w:name="_Toc239864468"/>
+      <w:bookmarkStart w:id="32" w:name="_Toc239952527"/>
       <w:r>
         <w:rPr>
           <w:rFonts w:ascii="Montserrat" w:hAnsi="Montserrat"/>
@@ -16868,16 +16913,16 @@
           <w:noProof/>
         </w:rPr>
         <w:drawing>
-          <wp:inline distT="0" distB="0" distL="0" distR="0" wp14:anchorId="71AC9120" wp14:editId="7F399EBF">
+          <wp:inline distT="0" distB="0" distL="0" distR="0" wp14:anchorId="7B4E0C9F" wp14:editId="1775021B">
             <wp:extent cx="5120640" cy="4627581"/>
             <wp:effectExtent l="19050" t="19050" r="22860" b="20955"/>
-            <wp:docPr id="632722533" name="Imagem 37"/>
+            <wp:docPr id="903025315" name="Imagem 37"/>
             <wp:cNvGraphicFramePr/>
             <a:graphic xmlns:a="http://schemas.openxmlformats.org/drawingml/2006/main">
               <a:graphicData uri="http://schemas.openxmlformats.org/drawingml/2006/picture">
                 <pic:pic xmlns:pic="http://schemas.openxmlformats.org/drawingml/2006/picture">
                   <pic:nvPicPr>
-                    <pic:cNvPr id="632722533" name=""/>
+                    <pic:cNvPr id="903025315" name=""/>
                     <pic:cNvPicPr/>
                   </pic:nvPicPr>
                   <pic:blipFill>
@@ -16945,16 +16990,16 @@
         </w:rPr>
         <w:lastRenderedPageBreak/>
         <w:drawing>
-          <wp:inline distT="0" distB="0" distL="0" distR="0" wp14:anchorId="18ECB212" wp14:editId="65B4C734">
+          <wp:inline distT="0" distB="0" distL="0" distR="0" wp14:anchorId="5F119600" wp14:editId="6183C7C7">
             <wp:extent cx="5120640" cy="4627581"/>
             <wp:effectExtent l="19050" t="19050" r="22860" b="20955"/>
-            <wp:docPr id="1627980813" name="Imagem 38"/>
+            <wp:docPr id="1465970327" name="Imagem 38"/>
             <wp:cNvGraphicFramePr/>
             <a:graphic xmlns:a="http://schemas.openxmlformats.org/drawingml/2006/main">
               <a:graphicData uri="http://schemas.openxmlformats.org/drawingml/2006/picture">
                 <pic:pic xmlns:pic="http://schemas.openxmlformats.org/drawingml/2006/picture">
                   <pic:nvPicPr>
-                    <pic:cNvPr id="1627980813" name=""/>
+                    <pic:cNvPr id="1465970327" name=""/>
                     <pic:cNvPicPr/>
                   </pic:nvPicPr>
                   <pic:blipFill>
@@ -17123,16 +17168,16 @@
           <w:noProof/>
         </w:rPr>
         <w:drawing>
-          <wp:inline distT="0" distB="0" distL="0" distR="0" wp14:anchorId="012AF451" wp14:editId="7FD98EB0">
+          <wp:inline distT="0" distB="0" distL="0" distR="0" wp14:anchorId="1A26D8D2" wp14:editId="1C42E474">
             <wp:extent cx="5120640" cy="2144319"/>
             <wp:effectExtent l="19050" t="19050" r="22860" b="27940"/>
-            <wp:docPr id="1506353929" name="Imagem 39"/>
+            <wp:docPr id="950707150" name="Imagem 39"/>
             <wp:cNvGraphicFramePr/>
             <a:graphic xmlns:a="http://schemas.openxmlformats.org/drawingml/2006/main">
               <a:graphicData uri="http://schemas.openxmlformats.org/drawingml/2006/picture">
                 <pic:pic xmlns:pic="http://schemas.openxmlformats.org/drawingml/2006/picture">
                   <pic:nvPicPr>
-                    <pic:cNvPr id="1506353929" name=""/>
+                    <pic:cNvPr id="950707150" name=""/>
                     <pic:cNvPicPr/>
                   </pic:nvPicPr>
                   <pic:blipFill>
@@ -17220,16 +17265,16 @@
           <w:noProof/>
         </w:rPr>
         <w:drawing>
-          <wp:inline distT="0" distB="0" distL="0" distR="0" wp14:anchorId="17097B6E" wp14:editId="0138EC53">
+          <wp:inline distT="0" distB="0" distL="0" distR="0" wp14:anchorId="09399EAF" wp14:editId="58151A13">
             <wp:extent cx="5120640" cy="1055647"/>
             <wp:effectExtent l="19050" t="19050" r="22860" b="11430"/>
-            <wp:docPr id="1780819286" name="Imagem 40"/>
+            <wp:docPr id="1682716721" name="Imagem 40"/>
             <wp:cNvGraphicFramePr/>
             <a:graphic xmlns:a="http://schemas.openxmlformats.org/drawingml/2006/main">
               <a:graphicData uri="http://schemas.openxmlformats.org/drawingml/2006/picture">
                 <pic:pic xmlns:pic="http://schemas.openxmlformats.org/drawingml/2006/picture">
                   <pic:nvPicPr>
-                    <pic:cNvPr id="1780819286" name=""/>
+                    <pic:cNvPr id="1682716721" name=""/>
                     <pic:cNvPicPr/>
                   </pic:nvPicPr>
                   <pic:blipFill>
@@ -17351,16 +17396,16 @@
           <w:noProof/>
         </w:rPr>
         <w:drawing>
-          <wp:inline distT="0" distB="0" distL="0" distR="0" wp14:anchorId="298F233F" wp14:editId="19B09FE2">
+          <wp:inline distT="0" distB="0" distL="0" distR="0" wp14:anchorId="73BD8A02" wp14:editId="45FCE99D">
             <wp:extent cx="5120640" cy="3282818"/>
             <wp:effectExtent l="19050" t="19050" r="22860" b="13335"/>
-            <wp:docPr id="1328025486" name="Imagem 41"/>
+            <wp:docPr id="689702420" name="Imagem 41"/>
             <wp:cNvGraphicFramePr/>
             <a:graphic xmlns:a="http://schemas.openxmlformats.org/drawingml/2006/main">
               <a:graphicData uri="http://schemas.openxmlformats.org/drawingml/2006/picture">
                 <pic:pic xmlns:pic="http://schemas.openxmlformats.org/drawingml/2006/picture">
                   <pic:nvPicPr>
-                    <pic:cNvPr id="1328025486" name=""/>
+                    <pic:cNvPr id="689702420" name=""/>
                     <pic:cNvPicPr/>
                   </pic:nvPicPr>
                   <pic:blipFill>
@@ -17494,16 +17539,16 @@
         </w:rPr>
         <w:lastRenderedPageBreak/>
         <w:drawing>
-          <wp:inline distT="0" distB="0" distL="0" distR="0" wp14:anchorId="08804B69" wp14:editId="5797F062">
+          <wp:inline distT="0" distB="0" distL="0" distR="0" wp14:anchorId="47B752E1" wp14:editId="162E919C">
             <wp:extent cx="5120640" cy="1978034"/>
             <wp:effectExtent l="19050" t="19050" r="22860" b="22225"/>
-            <wp:docPr id="1291274159" name="Imagem 42"/>
+            <wp:docPr id="683939763" name="Imagem 42"/>
             <wp:cNvGraphicFramePr/>
             <a:graphic xmlns:a="http://schemas.openxmlformats.org/drawingml/2006/main">
               <a:graphicData uri="http://schemas.openxmlformats.org/drawingml/2006/picture">
                 <pic:pic xmlns:pic="http://schemas.openxmlformats.org/drawingml/2006/picture">
                   <pic:nvPicPr>
-                    <pic:cNvPr id="1291274159" name=""/>
+                    <pic:cNvPr id="683939763" name=""/>
                     <pic:cNvPicPr/>
                   </pic:nvPicPr>
                   <pic:blipFill>
@@ -17575,7 +17620,7 @@
           <w:sz w:val="34"/>
         </w:rPr>
       </w:pPr>
-      <w:bookmarkStart w:id="33" w:name="_Toc239864469"/>
+      <w:bookmarkStart w:id="33" w:name="_Toc239952528"/>
       <w:r>
         <w:rPr>
           <w:rFonts w:ascii="Montserrat" w:hAnsi="Montserrat"/>
@@ -17635,7 +17680,7 @@
           <w:sz w:val="27"/>
         </w:rPr>
       </w:pPr>
-      <w:bookmarkStart w:id="34" w:name="_Toc239864470"/>
+      <w:bookmarkStart w:id="34" w:name="_Toc239952529"/>
       <w:r>
         <w:rPr>
           <w:rFonts w:ascii="Montserrat" w:hAnsi="Montserrat"/>
@@ -17675,16 +17720,16 @@
           <w:noProof/>
         </w:rPr>
         <w:drawing>
-          <wp:inline distT="0" distB="0" distL="0" distR="0" wp14:anchorId="44F42A3A" wp14:editId="134B3205">
+          <wp:inline distT="0" distB="0" distL="0" distR="0" wp14:anchorId="3A1CEF31" wp14:editId="0028FACD">
             <wp:extent cx="5303520" cy="4792851"/>
             <wp:effectExtent l="19050" t="19050" r="11430" b="27305"/>
-            <wp:docPr id="1981696990" name="Imagem 43"/>
+            <wp:docPr id="160769209" name="Imagem 43"/>
             <wp:cNvGraphicFramePr/>
             <a:graphic xmlns:a="http://schemas.openxmlformats.org/drawingml/2006/main">
               <a:graphicData uri="http://schemas.openxmlformats.org/drawingml/2006/picture">
                 <pic:pic xmlns:pic="http://schemas.openxmlformats.org/drawingml/2006/picture">
                   <pic:nvPicPr>
-                    <pic:cNvPr id="1981696990" name=""/>
+                    <pic:cNvPr id="160769209" name=""/>
                     <pic:cNvPicPr/>
                   </pic:nvPicPr>
                   <pic:blipFill>
@@ -17753,7 +17798,7 @@
           <w:sz w:val="27"/>
         </w:rPr>
       </w:pPr>
-      <w:bookmarkStart w:id="35" w:name="_Toc239864471"/>
+      <w:bookmarkStart w:id="35" w:name="_Toc239952530"/>
       <w:r>
         <w:rPr>
           <w:rFonts w:ascii="Montserrat" w:hAnsi="Montserrat"/>
@@ -17793,16 +17838,16 @@
           <w:noProof/>
         </w:rPr>
         <w:drawing>
-          <wp:inline distT="0" distB="0" distL="0" distR="0" wp14:anchorId="1D1892EA" wp14:editId="25961E65">
+          <wp:inline distT="0" distB="0" distL="0" distR="0" wp14:anchorId="5A006944" wp14:editId="46768456">
             <wp:extent cx="5303520" cy="4792851"/>
             <wp:effectExtent l="19050" t="19050" r="11430" b="27305"/>
-            <wp:docPr id="1848574821" name="Imagem 44"/>
+            <wp:docPr id="1020905393" name="Imagem 44"/>
             <wp:cNvGraphicFramePr/>
             <a:graphic xmlns:a="http://schemas.openxmlformats.org/drawingml/2006/main">
               <a:graphicData uri="http://schemas.openxmlformats.org/drawingml/2006/picture">
                 <pic:pic xmlns:pic="http://schemas.openxmlformats.org/drawingml/2006/picture">
                   <pic:nvPicPr>
-                    <pic:cNvPr id="1848574821" name=""/>
+                    <pic:cNvPr id="1020905393" name=""/>
                     <pic:cNvPicPr/>
                   </pic:nvPicPr>
                   <pic:blipFill>
@@ -17870,7 +17915,7 @@
           <w:sz w:val="27"/>
         </w:rPr>
       </w:pPr>
-      <w:bookmarkStart w:id="36" w:name="_Toc239864472"/>
+      <w:bookmarkStart w:id="36" w:name="_Toc239952531"/>
       <w:r>
         <w:rPr>
           <w:rFonts w:ascii="Montserrat" w:hAnsi="Montserrat"/>
@@ -17911,16 +17956,16 @@
         </w:rPr>
         <w:lastRenderedPageBreak/>
         <w:drawing>
-          <wp:inline distT="0" distB="0" distL="0" distR="0" wp14:anchorId="44CF7A21" wp14:editId="1180F57C">
+          <wp:inline distT="0" distB="0" distL="0" distR="0" wp14:anchorId="78917EB6" wp14:editId="63CB5231">
             <wp:extent cx="5303520" cy="4792851"/>
             <wp:effectExtent l="19050" t="19050" r="11430" b="27305"/>
-            <wp:docPr id="1335949952" name="Imagem 45"/>
+            <wp:docPr id="427080394" name="Imagem 45"/>
             <wp:cNvGraphicFramePr/>
             <a:graphic xmlns:a="http://schemas.openxmlformats.org/drawingml/2006/main">
               <a:graphicData uri="http://schemas.openxmlformats.org/drawingml/2006/picture">
                 <pic:pic xmlns:pic="http://schemas.openxmlformats.org/drawingml/2006/picture">
                   <pic:nvPicPr>
-                    <pic:cNvPr id="1335949952" name=""/>
+                    <pic:cNvPr id="427080394" name=""/>
                     <pic:cNvPicPr/>
                   </pic:nvPicPr>
                   <pic:blipFill>
@@ -17988,16 +18033,16 @@
         </w:rPr>
         <w:lastRenderedPageBreak/>
         <w:drawing>
-          <wp:inline distT="0" distB="0" distL="0" distR="0" wp14:anchorId="3F1D5643" wp14:editId="6E63728E">
+          <wp:inline distT="0" distB="0" distL="0" distR="0" wp14:anchorId="07516367" wp14:editId="0B97E902">
             <wp:extent cx="5303520" cy="4792851"/>
             <wp:effectExtent l="19050" t="19050" r="11430" b="27305"/>
-            <wp:docPr id="1358879477" name="Imagem 46"/>
+            <wp:docPr id="1906607606" name="Imagem 46"/>
             <wp:cNvGraphicFramePr/>
             <a:graphic xmlns:a="http://schemas.openxmlformats.org/drawingml/2006/main">
               <a:graphicData uri="http://schemas.openxmlformats.org/drawingml/2006/picture">
                 <pic:pic xmlns:pic="http://schemas.openxmlformats.org/drawingml/2006/picture">
                   <pic:nvPicPr>
-                    <pic:cNvPr id="1358879477" name=""/>
+                    <pic:cNvPr id="1906607606" name=""/>
                     <pic:cNvPicPr/>
                   </pic:nvPicPr>
                   <pic:blipFill>
@@ -18090,7 +18135,7 @@
           <w:sz w:val="34"/>
         </w:rPr>
       </w:pPr>
-      <w:bookmarkStart w:id="37" w:name="_Toc239864473"/>
+      <w:bookmarkStart w:id="37" w:name="_Toc239952532"/>
       <w:r>
         <w:rPr>
           <w:rFonts w:ascii="Montserrat" w:hAnsi="Montserrat"/>
@@ -18132,7 +18177,7 @@
           <w:sz w:val="27"/>
         </w:rPr>
       </w:pPr>
-      <w:bookmarkStart w:id="38" w:name="_Toc239864474"/>
+      <w:bookmarkStart w:id="38" w:name="_Toc239952533"/>
       <w:r>
         <w:rPr>
           <w:rFonts w:ascii="Montserrat" w:hAnsi="Montserrat"/>
@@ -18172,16 +18217,16 @@
           <w:noProof/>
         </w:rPr>
         <w:drawing>
-          <wp:inline distT="0" distB="0" distL="0" distR="0" wp14:anchorId="3477EE25" wp14:editId="1C83FBD7">
+          <wp:inline distT="0" distB="0" distL="0" distR="0" wp14:anchorId="7F205B7A" wp14:editId="0F628CA0">
             <wp:extent cx="5303520" cy="4792851"/>
             <wp:effectExtent l="19050" t="19050" r="11430" b="27305"/>
-            <wp:docPr id="2069038463" name="Imagem 47"/>
+            <wp:docPr id="1238919218" name="Imagem 47"/>
             <wp:cNvGraphicFramePr/>
             <a:graphic xmlns:a="http://schemas.openxmlformats.org/drawingml/2006/main">
               <a:graphicData uri="http://schemas.openxmlformats.org/drawingml/2006/picture">
                 <pic:pic xmlns:pic="http://schemas.openxmlformats.org/drawingml/2006/picture">
                   <pic:nvPicPr>
-                    <pic:cNvPr id="2069038463" name=""/>
+                    <pic:cNvPr id="1238919218" name=""/>
                     <pic:cNvPicPr/>
                   </pic:nvPicPr>
                   <pic:blipFill>
@@ -18328,7 +18373,7 @@
           <w:sz w:val="27"/>
         </w:rPr>
       </w:pPr>
-      <w:bookmarkStart w:id="39" w:name="_Toc239864475"/>
+      <w:bookmarkStart w:id="39" w:name="_Toc239952534"/>
       <w:r>
         <w:rPr>
           <w:rFonts w:ascii="Montserrat" w:hAnsi="Montserrat"/>
@@ -18369,16 +18414,16 @@
         </w:rPr>
         <w:lastRenderedPageBreak/>
         <w:drawing>
-          <wp:inline distT="0" distB="0" distL="0" distR="0" wp14:anchorId="11D55D1F" wp14:editId="0EACC99B">
+          <wp:inline distT="0" distB="0" distL="0" distR="0" wp14:anchorId="14426629" wp14:editId="169E50A7">
             <wp:extent cx="5303520" cy="4792851"/>
             <wp:effectExtent l="19050" t="19050" r="11430" b="27305"/>
-            <wp:docPr id="397258434" name="Imagem 48"/>
+            <wp:docPr id="310183527" name="Imagem 48"/>
             <wp:cNvGraphicFramePr/>
             <a:graphic xmlns:a="http://schemas.openxmlformats.org/drawingml/2006/main">
               <a:graphicData uri="http://schemas.openxmlformats.org/drawingml/2006/picture">
                 <pic:pic xmlns:pic="http://schemas.openxmlformats.org/drawingml/2006/picture">
                   <pic:nvPicPr>
-                    <pic:cNvPr id="397258434" name=""/>
+                    <pic:cNvPr id="310183527" name=""/>
                     <pic:cNvPicPr/>
                   </pic:nvPicPr>
                   <pic:blipFill>
@@ -18446,7 +18491,7 @@
           <w:sz w:val="27"/>
         </w:rPr>
       </w:pPr>
-      <w:bookmarkStart w:id="40" w:name="_Toc239864476"/>
+      <w:bookmarkStart w:id="40" w:name="_Toc239952535"/>
       <w:r>
         <w:rPr>
           <w:rFonts w:ascii="Montserrat" w:hAnsi="Montserrat"/>
@@ -18487,16 +18532,16 @@
         </w:rPr>
         <w:lastRenderedPageBreak/>
         <w:drawing>
-          <wp:inline distT="0" distB="0" distL="0" distR="0" wp14:anchorId="44118AEC" wp14:editId="27B28FC0">
+          <wp:inline distT="0" distB="0" distL="0" distR="0" wp14:anchorId="685E5EEC" wp14:editId="0646558E">
             <wp:extent cx="5303520" cy="4792851"/>
             <wp:effectExtent l="19050" t="19050" r="11430" b="27305"/>
-            <wp:docPr id="795305108" name="Imagem 49"/>
+            <wp:docPr id="566334177" name="Imagem 49"/>
             <wp:cNvGraphicFramePr/>
             <a:graphic xmlns:a="http://schemas.openxmlformats.org/drawingml/2006/main">
               <a:graphicData uri="http://schemas.openxmlformats.org/drawingml/2006/picture">
                 <pic:pic xmlns:pic="http://schemas.openxmlformats.org/drawingml/2006/picture">
                   <pic:nvPicPr>
-                    <pic:cNvPr id="795305108" name=""/>
+                    <pic:cNvPr id="566334177" name=""/>
                     <pic:cNvPicPr/>
                   </pic:nvPicPr>
                   <pic:blipFill>
@@ -18640,7 +18685,7 @@
           <w:sz w:val="27"/>
         </w:rPr>
       </w:pPr>
-      <w:bookmarkStart w:id="41" w:name="_Toc239864477"/>
+      <w:bookmarkStart w:id="41" w:name="_Toc239952536"/>
       <w:r>
         <w:rPr>
           <w:rFonts w:ascii="Montserrat" w:hAnsi="Montserrat"/>
@@ -18801,16 +18846,16 @@
         </w:rPr>
         <w:lastRenderedPageBreak/>
         <w:drawing>
-          <wp:inline distT="0" distB="0" distL="0" distR="0" wp14:anchorId="09F2D5DA" wp14:editId="3B68FF78">
+          <wp:inline distT="0" distB="0" distL="0" distR="0" wp14:anchorId="7DA35609" wp14:editId="6A181637">
             <wp:extent cx="5303520" cy="4267180"/>
             <wp:effectExtent l="19050" t="19050" r="11430" b="19685"/>
-            <wp:docPr id="1257836078" name="Imagem 50"/>
+            <wp:docPr id="858907096" name="Imagem 50"/>
             <wp:cNvGraphicFramePr/>
             <a:graphic xmlns:a="http://schemas.openxmlformats.org/drawingml/2006/main">
               <a:graphicData uri="http://schemas.openxmlformats.org/drawingml/2006/picture">
                 <pic:pic xmlns:pic="http://schemas.openxmlformats.org/drawingml/2006/picture">
                   <pic:nvPicPr>
-                    <pic:cNvPr id="1257836078" name=""/>
+                    <pic:cNvPr id="858907096" name=""/>
                     <pic:cNvPicPr/>
                   </pic:nvPicPr>
                   <pic:blipFill>
@@ -18878,16 +18923,16 @@
         </w:rPr>
         <w:lastRenderedPageBreak/>
         <w:drawing>
-          <wp:inline distT="0" distB="0" distL="0" distR="0" wp14:anchorId="7F43E9F8" wp14:editId="6A714A50">
+          <wp:inline distT="0" distB="0" distL="0" distR="0" wp14:anchorId="10938E4C" wp14:editId="6CC29F1B">
             <wp:extent cx="5303520" cy="3382059"/>
             <wp:effectExtent l="19050" t="19050" r="11430" b="27940"/>
-            <wp:docPr id="401507006" name="Imagem 51"/>
+            <wp:docPr id="2026313644" name="Imagem 51"/>
             <wp:cNvGraphicFramePr/>
             <a:graphic xmlns:a="http://schemas.openxmlformats.org/drawingml/2006/main">
               <a:graphicData uri="http://schemas.openxmlformats.org/drawingml/2006/picture">
                 <pic:pic xmlns:pic="http://schemas.openxmlformats.org/drawingml/2006/picture">
                   <pic:nvPicPr>
-                    <pic:cNvPr id="401507006" name=""/>
+                    <pic:cNvPr id="2026313644" name=""/>
                     <pic:cNvPicPr/>
                   </pic:nvPicPr>
                   <pic:blipFill>
@@ -18955,16 +19000,16 @@
         </w:rPr>
         <w:lastRenderedPageBreak/>
         <w:drawing>
-          <wp:inline distT="0" distB="0" distL="0" distR="0" wp14:anchorId="5354ACE2" wp14:editId="69D4F2B7">
+          <wp:inline distT="0" distB="0" distL="0" distR="0" wp14:anchorId="2EFAC880" wp14:editId="279B0D05">
             <wp:extent cx="5303520" cy="4417800"/>
             <wp:effectExtent l="19050" t="19050" r="11430" b="20955"/>
-            <wp:docPr id="1765696027" name="Imagem 52"/>
+            <wp:docPr id="820794037" name="Imagem 52"/>
             <wp:cNvGraphicFramePr/>
             <a:graphic xmlns:a="http://schemas.openxmlformats.org/drawingml/2006/main">
               <a:graphicData uri="http://schemas.openxmlformats.org/drawingml/2006/picture">
                 <pic:pic xmlns:pic="http://schemas.openxmlformats.org/drawingml/2006/picture">
                   <pic:nvPicPr>
-                    <pic:cNvPr id="1765696027" name=""/>
+                    <pic:cNvPr id="820794037" name=""/>
                     <pic:cNvPicPr/>
                   </pic:nvPicPr>
                   <pic:blipFill>
@@ -19074,7 +19119,7 @@
           <w:sz w:val="27"/>
         </w:rPr>
       </w:pPr>
-      <w:bookmarkStart w:id="42" w:name="_Toc239864478"/>
+      <w:bookmarkStart w:id="42" w:name="_Toc239952537"/>
       <w:r>
         <w:rPr>
           <w:rFonts w:ascii="Montserrat" w:hAnsi="Montserrat"/>
@@ -19292,16 +19337,16 @@
         </w:rPr>
         <w:lastRenderedPageBreak/>
         <w:drawing>
-          <wp:inline distT="0" distB="0" distL="0" distR="0" wp14:anchorId="1CBD14C2" wp14:editId="7F635490">
+          <wp:inline distT="0" distB="0" distL="0" distR="0" wp14:anchorId="18B57991" wp14:editId="47470214">
             <wp:extent cx="5303520" cy="7628836"/>
             <wp:effectExtent l="19050" t="19050" r="11430" b="10795"/>
-            <wp:docPr id="1657610886" name="Imagem 53"/>
+            <wp:docPr id="1893963080" name="Imagem 53"/>
             <wp:cNvGraphicFramePr/>
             <a:graphic xmlns:a="http://schemas.openxmlformats.org/drawingml/2006/main">
               <a:graphicData uri="http://schemas.openxmlformats.org/drawingml/2006/picture">
                 <pic:pic xmlns:pic="http://schemas.openxmlformats.org/drawingml/2006/picture">
                   <pic:nvPicPr>
-                    <pic:cNvPr id="1657610886" name=""/>
+                    <pic:cNvPr id="1893963080" name=""/>
                     <pic:cNvPicPr/>
                   </pic:nvPicPr>
                   <pic:blipFill>
@@ -19377,7 +19422,7 @@
           <w:sz w:val="21"/>
         </w:rPr>
         <w:lastRenderedPageBreak/>
-        <w:t>Como o selo de saude e calculado: compara tres sinais - a situacao do projeto esta Atrasado no Relatorio de Situacao; existe pelo menos um marco ativo (nao Concluido/Cancelado) cuja data-alvo ja passou (mesma definicao usada no indicador Marcos no prazo do Relatorio de Resultados, secao 6.7 - o que conta e a data-alvo, nao o status manual do marco); e o custo realizado ultrapassa o estimado no TAP. Dois ou mais sinais ruins = Critico; um sinal = Atencao; nenhum = Normal. Projetos Concluido/Cancelado mostram Encerrado, e projetos sem nenhuma linha no Relatorio de Situacao mostram Sem dados - nunca inventa um status a partir de dado ausente. A mesma coluna Saude aparece na tabela Visao atual por projeto do Painel Executivo (secao 6.4), com o mesmo calculo.</w:t>
+        <w:t>Como o selo de saude e calculado: compara tres sinais - a situacao do projeto esta Atrasado no Relatorio de Situacao; existe pelo menos um marco do cronograma do TAP, sem Conclusao real preenchida, cuja data-alvo ja passou (mesma definicao usada no indicador Marcos no prazo do Relatorio de Resultados, secao 6.7 - o que conta e a data-alvo e a conclusao real, nao o status manual do marco); e o custo realizado ultrapassa o estimado no TAP. Dois ou mais sinais ruins = Critico; um sinal = Atencao; nenhum = Normal. Projetos Concluido/Cancelado mostram Encerrado, e projetos sem nenhuma linha no Relatorio de Situacao mostram Sem dados - nunca inventa um status a partir de dado ausente. A mesma coluna Saude aparece na tabela Visao atual por projeto do Painel Executivo (secao 6.4), com o mesmo calculo.</w:t>
       </w:r>
     </w:p>
     <w:p>
@@ -19412,7 +19457,7 @@
           <w:sz w:val="27"/>
         </w:rPr>
       </w:pPr>
-      <w:bookmarkStart w:id="43" w:name="_Toc239864479"/>
+      <w:bookmarkStart w:id="43" w:name="_Toc239952538"/>
       <w:r>
         <w:rPr>
           <w:rFonts w:ascii="Montserrat" w:hAnsi="Montserrat"/>
@@ -19565,7 +19610,7 @@
           <w:sz w:val="27"/>
         </w:rPr>
       </w:pPr>
-      <w:bookmarkStart w:id="44" w:name="_Toc239864480"/>
+      <w:bookmarkStart w:id="44" w:name="_Toc239952539"/>
       <w:r>
         <w:rPr>
           <w:rFonts w:ascii="Montserrat" w:hAnsi="Montserrat"/>
@@ -19858,16 +19903,16 @@
           <w:noProof/>
         </w:rPr>
         <w:drawing>
-          <wp:inline distT="0" distB="0" distL="0" distR="0" wp14:anchorId="6438CB9A" wp14:editId="16BD78C1">
+          <wp:inline distT="0" distB="0" distL="0" distR="0" wp14:anchorId="1C33062C" wp14:editId="2D547730">
             <wp:extent cx="5303520" cy="1351384"/>
             <wp:effectExtent l="19050" t="19050" r="11430" b="20320"/>
-            <wp:docPr id="1835351061" name="Imagem 54"/>
+            <wp:docPr id="1370737309" name="Imagem 54"/>
             <wp:cNvGraphicFramePr/>
             <a:graphic xmlns:a="http://schemas.openxmlformats.org/drawingml/2006/main">
               <a:graphicData uri="http://schemas.openxmlformats.org/drawingml/2006/picture">
                 <pic:pic xmlns:pic="http://schemas.openxmlformats.org/drawingml/2006/picture">
                   <pic:nvPicPr>
-                    <pic:cNvPr id="1835351061" name=""/>
+                    <pic:cNvPr id="1370737309" name=""/>
                     <pic:cNvPicPr/>
                   </pic:nvPicPr>
                   <pic:blipFill>
@@ -19935,7 +19980,7 @@
           <w:sz w:val="27"/>
         </w:rPr>
       </w:pPr>
-      <w:bookmarkStart w:id="45" w:name="_Toc239864481"/>
+      <w:bookmarkStart w:id="45" w:name="_Toc239952540"/>
       <w:r>
         <w:rPr>
           <w:rFonts w:ascii="Montserrat" w:hAnsi="Montserrat"/>
@@ -19986,7 +20031,7 @@
           <w:color w:val="1A1A1A"/>
           <w:sz w:val="22"/>
         </w:rPr>
-        <w:t>Marcos no prazo: % dos marcos de projetos ainda ativos no Relatorio de Situacao (secao 4.1) que NAO estao atrasados (data-alvo ainda nao passou, ou o marco ja esta Concluido/Cancelado).</w:t>
+        <w:t>Marcos no prazo: % dos marcos de projetos ainda ativos no Relatorio de Situacao (secao 4.1) que NAO estao atrasados - a data-alvo (do cronograma do TAP) ainda nao passou, o marco ja tem Conclusao real preenchida no TAP, ou o marco esta marcado como Concluido/Cancelado.</w:t>
       </w:r>
     </w:p>
     <w:p>
@@ -20047,16 +20092,16 @@
           <w:noProof/>
         </w:rPr>
         <w:drawing>
-          <wp:inline distT="0" distB="0" distL="0" distR="0" wp14:anchorId="2AED458F" wp14:editId="70225451">
+          <wp:inline distT="0" distB="0" distL="0" distR="0" wp14:anchorId="36226F7E" wp14:editId="577AA712">
             <wp:extent cx="5303520" cy="1422793"/>
             <wp:effectExtent l="19050" t="19050" r="11430" b="25400"/>
-            <wp:docPr id="1583520657" name="Imagem 55"/>
+            <wp:docPr id="1656692156" name="Imagem 55"/>
             <wp:cNvGraphicFramePr/>
             <a:graphic xmlns:a="http://schemas.openxmlformats.org/drawingml/2006/main">
               <a:graphicData uri="http://schemas.openxmlformats.org/drawingml/2006/picture">
                 <pic:pic xmlns:pic="http://schemas.openxmlformats.org/drawingml/2006/picture">
                   <pic:nvPicPr>
-                    <pic:cNvPr id="1583520657" name=""/>
+                    <pic:cNvPr id="1656692156" name=""/>
                     <pic:cNvPicPr/>
                   </pic:nvPicPr>
                   <pic:blipFill>
@@ -20110,6 +20155,7 @@
           <w:color w:val="6A6A70"/>
           <w:sz w:val="19"/>
         </w:rPr>
+        <w:lastRenderedPageBreak/>
         <w:t>Os tres indicadores estrategicos do Relatorio de Resultados, com meta, barra de progresso, selo de status e tendencia.</w:t>
       </w:r>
     </w:p>
@@ -20131,7 +20177,6 @@
           <w:color w:val="6A6A70"/>
           <w:sz w:val="21"/>
         </w:rPr>
-        <w:lastRenderedPageBreak/>
         <w:t>Meta e selo de status (Normal/Atencao/Critico): cada indicador compara o realizado com a meta definida pelo Admin (secao 6.3). Sem meta definida, o cartao mostra Meta nao definida em vez de um selo - nunca inventa um status. Com meta definida: Normal na meta ou acima; Atencao ate 15 pontos percentuais abaixo da meta; Critico alem disso.</w:t>
       </w:r>
     </w:p>
@@ -20174,7 +20219,7 @@
           <w:color w:val="6A6A70"/>
           <w:sz w:val="21"/>
         </w:rPr>
-        <w:t>Marcos no prazo nao e o mesmo que concluido no prazo: o sistema guarda a data-alvo do marco, nao uma data separada de quando ele foi de fato concluido - por isso o indicador mede ausencia de atraso atual, o dado mais honesto disponivel hoje. Da mesma forma, Projetos dentro do orcamento e Entraves resolvidos aparecem como travessao (-) quando nao ha dado suficiente para calcular, em vez de mostrar um numero sem base.</w:t>
+        <w:t>O TAP guarda tanto a data-alvo (Termino previsto) quanto a Conclusao real de cada marco, entao o indicador ja distingue um marco que terminou no prazo de um que so ainda nao venceu. Projetos dentro do orcamento e Entraves resolvidos continuam aparecendo como travessao (-) quando nao ha dado suficiente para calcular, em vez de mostrar um numero sem base.</w:t>
       </w:r>
     </w:p>
     <w:p>
@@ -20211,16 +20256,16 @@
           <w:noProof/>
         </w:rPr>
         <w:drawing>
-          <wp:inline distT="0" distB="0" distL="0" distR="0" wp14:anchorId="4D356073" wp14:editId="2C6461AE">
+          <wp:inline distT="0" distB="0" distL="0" distR="0" wp14:anchorId="6AF6F5AC" wp14:editId="3FA71D94">
             <wp:extent cx="5303520" cy="1841050"/>
             <wp:effectExtent l="19050" t="19050" r="11430" b="26035"/>
-            <wp:docPr id="1283012334" name="Imagem 56"/>
+            <wp:docPr id="89387747" name="Imagem 56"/>
             <wp:cNvGraphicFramePr/>
             <a:graphic xmlns:a="http://schemas.openxmlformats.org/drawingml/2006/main">
               <a:graphicData uri="http://schemas.openxmlformats.org/drawingml/2006/picture">
                 <pic:pic xmlns:pic="http://schemas.openxmlformats.org/drawingml/2006/picture">
                   <pic:nvPicPr>
-                    <pic:cNvPr id="1283012334" name=""/>
+                    <pic:cNvPr id="89387747" name=""/>
                     <pic:cNvPicPr/>
                   </pic:nvPicPr>
                   <pic:blipFill>
@@ -20337,16 +20382,8 @@
           <w:color w:val="1A1A1A"/>
           <w:sz w:val="22"/>
         </w:rPr>
-        <w:t xml:space="preserve">Exportar PDF: abre a caixa de impressao do navegador com o conteudo da pagina pronto para salvar como PDF - mesmo mecanismo Imprimir ja </w:t>
-      </w:r>
-      <w:r>
-        <w:rPr>
-          <w:rFonts w:ascii="Montserrat" w:hAnsi="Montserrat"/>
-          <w:color w:val="1A1A1A"/>
-          <w:sz w:val="22"/>
-        </w:rPr>
         <w:lastRenderedPageBreak/>
-        <w:t>usado nos demais relatorios (esconde a barra de autenticacao e os botoes antes de imprimir).</w:t>
+        <w:t>Exportar PDF: abre a caixa de impressao do navegador com o conteudo da pagina pronto para salvar como PDF - mesmo mecanismo Imprimir ja usado nos demais relatorios (esconde a barra de autenticacao e os botoes antes de imprimir).</w:t>
       </w:r>
     </w:p>
     <w:p>
@@ -20383,16 +20420,16 @@
           <w:noProof/>
         </w:rPr>
         <w:drawing>
-          <wp:inline distT="0" distB="0" distL="0" distR="0" wp14:anchorId="645C9BC9" wp14:editId="0B0E7FAF">
+          <wp:inline distT="0" distB="0" distL="0" distR="0" wp14:anchorId="15EBB7C7" wp14:editId="0EA8C26E">
             <wp:extent cx="5303520" cy="303041"/>
             <wp:effectExtent l="19050" t="19050" r="11430" b="20955"/>
-            <wp:docPr id="1151040752" name="Imagem 57"/>
+            <wp:docPr id="2133132079" name="Imagem 57"/>
             <wp:cNvGraphicFramePr/>
             <a:graphic xmlns:a="http://schemas.openxmlformats.org/drawingml/2006/main">
               <a:graphicData uri="http://schemas.openxmlformats.org/drawingml/2006/picture">
                 <pic:pic xmlns:pic="http://schemas.openxmlformats.org/drawingml/2006/picture">
                   <pic:nvPicPr>
-                    <pic:cNvPr id="1151040752" name=""/>
+                    <pic:cNvPr id="2133132079" name=""/>
                     <pic:cNvPicPr/>
                   </pic:nvPicPr>
                   <pic:blipFill>
@@ -20459,16 +20496,16 @@
           <w:noProof/>
         </w:rPr>
         <w:drawing>
-          <wp:inline distT="0" distB="0" distL="0" distR="0" wp14:anchorId="165AB997" wp14:editId="0287EDE1">
+          <wp:inline distT="0" distB="0" distL="0" distR="0" wp14:anchorId="29F53DD8" wp14:editId="67EF1541">
             <wp:extent cx="5303520" cy="2983005"/>
             <wp:effectExtent l="19050" t="19050" r="11430" b="27305"/>
-            <wp:docPr id="1474634244" name="Imagem 58"/>
+            <wp:docPr id="50847021" name="Imagem 58"/>
             <wp:cNvGraphicFramePr/>
             <a:graphic xmlns:a="http://schemas.openxmlformats.org/drawingml/2006/main">
               <a:graphicData uri="http://schemas.openxmlformats.org/drawingml/2006/picture">
                 <pic:pic xmlns:pic="http://schemas.openxmlformats.org/drawingml/2006/picture">
                   <pic:nvPicPr>
-                    <pic:cNvPr id="1474634244" name=""/>
+                    <pic:cNvPr id="50847021" name=""/>
                     <pic:cNvPicPr/>
                   </pic:nvPicPr>
                   <pic:blipFill>
@@ -20540,7 +20577,7 @@
           <w:sz w:val="34"/>
         </w:rPr>
       </w:pPr>
-      <w:bookmarkStart w:id="46" w:name="_Toc239864482"/>
+      <w:bookmarkStart w:id="46" w:name="_Toc239952541"/>
       <w:r>
         <w:rPr>
           <w:rFonts w:ascii="Montserrat" w:hAnsi="Montserrat"/>
@@ -20784,7 +20821,7 @@
           <w:sz w:val="34"/>
         </w:rPr>
       </w:pPr>
-      <w:bookmarkStart w:id="47" w:name="_Toc239864483"/>
+      <w:bookmarkStart w:id="47" w:name="_Toc239952542"/>
       <w:r>
         <w:rPr>
           <w:rFonts w:ascii="Montserrat" w:hAnsi="Montserrat"/>
@@ -22572,7 +22609,7 @@
 <file path=word/numbering.xml><?xml version="1.0" encoding="utf-8"?>
 <w:numbering xmlns:wpc="http://schemas.microsoft.com/office/word/2010/wordprocessingCanvas" xmlns:cx="http://schemas.microsoft.com/office/drawing/2014/chartex" xmlns:cx1="http://schemas.microsoft.com/office/drawing/2015/9/8/chartex" xmlns:cx2="http://schemas.microsoft.com/office/drawing/2015/10/21/chartex" xmlns:cx3="http://schemas.microsoft.com/office/drawing/2016/5/9/chartex" xmlns:cx4="http://schemas.microsoft.com/office/drawing/2016/5/10/chartex" xmlns:cx5="http://schemas.microsoft.com/office/drawing/2016/5/11/chartex" xmlns:cx6="http://schemas.microsoft.com/office/drawing/2016/5/12/chartex" xmlns:cx7="http://schemas.microsoft.com/office/drawing/2016/5/13/chartex" xmlns:cx8="http://schemas.microsoft.com/office/drawing/2016/5/14/chartex" xmlns:mc="http://schemas.openxmlformats.org/markup-compatibility/2006" xmlns:aink="http://schemas.microsoft.com/office/drawing/2016/ink" xmlns:am3d="http://schemas.microsoft.com/office/drawing/2017/model3d" xmlns:o="urn:schemas-microsoft-com:office:office" xmlns:oel="http://schemas.microsoft.com/office/2019/extlst" xmlns:r="http://schemas.openxmlformats.org/officeDocument/2006/relationships" xmlns:m="http://schemas.openxmlformats.org/officeDocument/2006/math" xmlns:v="urn:schemas-microsoft-com:vml" xmlns:wp14="http://schemas.microsoft.com/office/word/2010/wordprocessingDrawing" xmlns:wp="http://schemas.openxmlformats.org/drawingml/2006/wordprocessingDrawing" xmlns:w10="urn:schemas-microsoft-com:office:word" xmlns:w="http://schemas.openxmlformats.org/wordprocessingml/2006/main" xmlns:w14="http://schemas.microsoft.com/office/word/2010/wordml" xmlns:w15="http://schemas.microsoft.com/office/word/2012/wordml" xmlns:w16cex="http://schemas.microsoft.com/office/word/2018/wordml/cex" xmlns:w16cid="http://schemas.microsoft.com/office/word/2016/wordml/cid" xmlns:w16="http://schemas.microsoft.com/office/word/2018/wordml" xmlns:w16du="http://schemas.microsoft.com/office/word/2023/wordml/word16du" xmlns:w16sdtdh="http://schemas.microsoft.com/office/word/2020/wordml/sdtdatahash" xmlns:w16sdtfl="http://schemas.microsoft.com/office/word/2024/wordml/sdtformatlock" xmlns:w16se="http://schemas.microsoft.com/office/word/2015/wordml/symex" xmlns:wpg="http://schemas.microsoft.com/office/word/2010/wordprocessingGroup" xmlns:wpi="http://schemas.microsoft.com/office/word/2010/wordprocessingInk" xmlns:wne="http://schemas.microsoft.com/office/word/2006/wordml" xmlns:wps="http://schemas.microsoft.com/office/word/2010/wordprocessingShape" mc:Ignorable="w14 w15 w16se w16cid w16 w16cex w16sdtdh w16sdtfl w16du wp14">
   <w:abstractNum w:abstractNumId="0" w15:restartNumberingAfterBreak="0">
-    <w:nsid w:val="0040382B"/>
+    <w:nsid w:val="075C06EC"/>
     <w:multiLevelType w:val="singleLevel"/>
     <w:tmpl w:val="04160001"/>
     <w:lvl w:ilvl="0">
@@ -22589,7 +22626,7 @@
     </w:lvl>
   </w:abstractNum>
   <w:abstractNum w:abstractNumId="1" w15:restartNumberingAfterBreak="0">
-    <w:nsid w:val="04A975FB"/>
+    <w:nsid w:val="088B7509"/>
     <w:multiLevelType w:val="singleLevel"/>
     <w:tmpl w:val="04160001"/>
     <w:lvl w:ilvl="0">
@@ -22606,7 +22643,7 @@
     </w:lvl>
   </w:abstractNum>
   <w:abstractNum w:abstractNumId="2" w15:restartNumberingAfterBreak="0">
-    <w:nsid w:val="074C0D50"/>
+    <w:nsid w:val="0D5471F8"/>
     <w:multiLevelType w:val="singleLevel"/>
     <w:tmpl w:val="04160001"/>
     <w:lvl w:ilvl="0">
@@ -22623,7 +22660,7 @@
     </w:lvl>
   </w:abstractNum>
   <w:abstractNum w:abstractNumId="3" w15:restartNumberingAfterBreak="0">
-    <w:nsid w:val="0D6D4F65"/>
+    <w:nsid w:val="123B0759"/>
     <w:multiLevelType w:val="singleLevel"/>
     <w:tmpl w:val="04160001"/>
     <w:lvl w:ilvl="0">
@@ -22640,7 +22677,7 @@
     </w:lvl>
   </w:abstractNum>
   <w:abstractNum w:abstractNumId="4" w15:restartNumberingAfterBreak="0">
-    <w:nsid w:val="0E592177"/>
+    <w:nsid w:val="15C0150D"/>
     <w:multiLevelType w:val="singleLevel"/>
     <w:tmpl w:val="04160001"/>
     <w:lvl w:ilvl="0">
@@ -22657,7 +22694,7 @@
     </w:lvl>
   </w:abstractNum>
   <w:abstractNum w:abstractNumId="5" w15:restartNumberingAfterBreak="0">
-    <w:nsid w:val="138335D5"/>
+    <w:nsid w:val="189C59BC"/>
     <w:multiLevelType w:val="singleLevel"/>
     <w:tmpl w:val="04160001"/>
     <w:lvl w:ilvl="0">
@@ -22674,7 +22711,7 @@
     </w:lvl>
   </w:abstractNum>
   <w:abstractNum w:abstractNumId="6" w15:restartNumberingAfterBreak="0">
-    <w:nsid w:val="140548C8"/>
+    <w:nsid w:val="21382324"/>
     <w:multiLevelType w:val="singleLevel"/>
     <w:tmpl w:val="04160001"/>
     <w:lvl w:ilvl="0">
@@ -22691,7 +22728,7 @@
     </w:lvl>
   </w:abstractNum>
   <w:abstractNum w:abstractNumId="7" w15:restartNumberingAfterBreak="0">
-    <w:nsid w:val="1BC64084"/>
+    <w:nsid w:val="24B27A3A"/>
     <w:multiLevelType w:val="singleLevel"/>
     <w:tmpl w:val="04160001"/>
     <w:lvl w:ilvl="0">
@@ -22708,7 +22745,7 @@
     </w:lvl>
   </w:abstractNum>
   <w:abstractNum w:abstractNumId="8" w15:restartNumberingAfterBreak="0">
-    <w:nsid w:val="1DDB1558"/>
+    <w:nsid w:val="28602051"/>
     <w:multiLevelType w:val="singleLevel"/>
     <w:tmpl w:val="04160001"/>
     <w:lvl w:ilvl="0">
@@ -22725,7 +22762,7 @@
     </w:lvl>
   </w:abstractNum>
   <w:abstractNum w:abstractNumId="9" w15:restartNumberingAfterBreak="0">
-    <w:nsid w:val="277A31B9"/>
+    <w:nsid w:val="2D14045B"/>
     <w:multiLevelType w:val="singleLevel"/>
     <w:tmpl w:val="04160001"/>
     <w:lvl w:ilvl="0">
@@ -22742,7 +22779,7 @@
     </w:lvl>
   </w:abstractNum>
   <w:abstractNum w:abstractNumId="10" w15:restartNumberingAfterBreak="0">
-    <w:nsid w:val="2B1044D4"/>
+    <w:nsid w:val="348F1307"/>
     <w:multiLevelType w:val="singleLevel"/>
     <w:tmpl w:val="04160001"/>
     <w:lvl w:ilvl="0">
@@ -22759,7 +22796,7 @@
     </w:lvl>
   </w:abstractNum>
   <w:abstractNum w:abstractNumId="11" w15:restartNumberingAfterBreak="0">
-    <w:nsid w:val="38182A88"/>
+    <w:nsid w:val="3B364891"/>
     <w:multiLevelType w:val="singleLevel"/>
     <w:tmpl w:val="04160001"/>
     <w:lvl w:ilvl="0">
@@ -22776,7 +22813,7 @@
     </w:lvl>
   </w:abstractNum>
   <w:abstractNum w:abstractNumId="12" w15:restartNumberingAfterBreak="0">
-    <w:nsid w:val="3910541C"/>
+    <w:nsid w:val="3B6126E0"/>
     <w:multiLevelType w:val="singleLevel"/>
     <w:tmpl w:val="04160001"/>
     <w:lvl w:ilvl="0">
@@ -22793,7 +22830,7 @@
     </w:lvl>
   </w:abstractNum>
   <w:abstractNum w:abstractNumId="13" w15:restartNumberingAfterBreak="0">
-    <w:nsid w:val="3F3F1458"/>
+    <w:nsid w:val="49A92E5D"/>
     <w:multiLevelType w:val="singleLevel"/>
     <w:tmpl w:val="04160001"/>
     <w:lvl w:ilvl="0">
@@ -22810,7 +22847,7 @@
     </w:lvl>
   </w:abstractNum>
   <w:abstractNum w:abstractNumId="14" w15:restartNumberingAfterBreak="0">
-    <w:nsid w:val="3F710667"/>
+    <w:nsid w:val="4B873405"/>
     <w:multiLevelType w:val="singleLevel"/>
     <w:tmpl w:val="04160001"/>
     <w:lvl w:ilvl="0">
@@ -22827,7 +22864,7 @@
     </w:lvl>
   </w:abstractNum>
   <w:abstractNum w:abstractNumId="15" w15:restartNumberingAfterBreak="0">
-    <w:nsid w:val="47A54EFA"/>
+    <w:nsid w:val="4E2F2364"/>
     <w:multiLevelType w:val="singleLevel"/>
     <w:tmpl w:val="04160001"/>
     <w:lvl w:ilvl="0">
@@ -22844,7 +22881,7 @@
     </w:lvl>
   </w:abstractNum>
   <w:abstractNum w:abstractNumId="16" w15:restartNumberingAfterBreak="0">
-    <w:nsid w:val="4B3B5733"/>
+    <w:nsid w:val="4E4F0299"/>
     <w:multiLevelType w:val="singleLevel"/>
     <w:tmpl w:val="04160001"/>
     <w:lvl w:ilvl="0">
@@ -22861,7 +22898,7 @@
     </w:lvl>
   </w:abstractNum>
   <w:abstractNum w:abstractNumId="17" w15:restartNumberingAfterBreak="0">
-    <w:nsid w:val="4C7867CB"/>
+    <w:nsid w:val="4FE8382B"/>
     <w:multiLevelType w:val="singleLevel"/>
     <w:tmpl w:val="04160001"/>
     <w:lvl w:ilvl="0">
@@ -22878,7 +22915,7 @@
     </w:lvl>
   </w:abstractNum>
   <w:abstractNum w:abstractNumId="18" w15:restartNumberingAfterBreak="0">
-    <w:nsid w:val="4D8E0A35"/>
+    <w:nsid w:val="52857BB6"/>
     <w:multiLevelType w:val="singleLevel"/>
     <w:tmpl w:val="04160001"/>
     <w:lvl w:ilvl="0">
@@ -22895,7 +22932,7 @@
     </w:lvl>
   </w:abstractNum>
   <w:abstractNum w:abstractNumId="19" w15:restartNumberingAfterBreak="0">
-    <w:nsid w:val="50727A85"/>
+    <w:nsid w:val="54A62088"/>
     <w:multiLevelType w:val="singleLevel"/>
     <w:tmpl w:val="04160001"/>
     <w:lvl w:ilvl="0">
@@ -22912,7 +22949,7 @@
     </w:lvl>
   </w:abstractNum>
   <w:abstractNum w:abstractNumId="20" w15:restartNumberingAfterBreak="0">
-    <w:nsid w:val="5596346E"/>
+    <w:nsid w:val="5A2216AB"/>
     <w:multiLevelType w:val="singleLevel"/>
     <w:tmpl w:val="04160001"/>
     <w:lvl w:ilvl="0">
@@ -22929,7 +22966,7 @@
     </w:lvl>
   </w:abstractNum>
   <w:abstractNum w:abstractNumId="21" w15:restartNumberingAfterBreak="0">
-    <w:nsid w:val="56E56831"/>
+    <w:nsid w:val="6251004E"/>
     <w:multiLevelType w:val="singleLevel"/>
     <w:tmpl w:val="04160001"/>
     <w:lvl w:ilvl="0">
@@ -22946,7 +22983,7 @@
     </w:lvl>
   </w:abstractNum>
   <w:abstractNum w:abstractNumId="22" w15:restartNumberingAfterBreak="0">
-    <w:nsid w:val="58574E8F"/>
+    <w:nsid w:val="657E60CC"/>
     <w:multiLevelType w:val="singleLevel"/>
     <w:tmpl w:val="04160001"/>
     <w:lvl w:ilvl="0">
@@ -22963,7 +23000,7 @@
     </w:lvl>
   </w:abstractNum>
   <w:abstractNum w:abstractNumId="23" w15:restartNumberingAfterBreak="0">
-    <w:nsid w:val="5B773734"/>
+    <w:nsid w:val="696D42C6"/>
     <w:multiLevelType w:val="singleLevel"/>
     <w:tmpl w:val="04160001"/>
     <w:lvl w:ilvl="0">
@@ -22980,7 +23017,7 @@
     </w:lvl>
   </w:abstractNum>
   <w:abstractNum w:abstractNumId="24" w15:restartNumberingAfterBreak="0">
-    <w:nsid w:val="5B9B11CA"/>
+    <w:nsid w:val="6C71048D"/>
     <w:multiLevelType w:val="singleLevel"/>
     <w:tmpl w:val="04160001"/>
     <w:lvl w:ilvl="0">
@@ -22997,7 +23034,7 @@
     </w:lvl>
   </w:abstractNum>
   <w:abstractNum w:abstractNumId="25" w15:restartNumberingAfterBreak="0">
-    <w:nsid w:val="5C794DA3"/>
+    <w:nsid w:val="70F12717"/>
     <w:multiLevelType w:val="singleLevel"/>
     <w:tmpl w:val="04160001"/>
     <w:lvl w:ilvl="0">
@@ -23014,7 +23051,7 @@
     </w:lvl>
   </w:abstractNum>
   <w:abstractNum w:abstractNumId="26" w15:restartNumberingAfterBreak="0">
-    <w:nsid w:val="5E070E69"/>
+    <w:nsid w:val="72893C62"/>
     <w:multiLevelType w:val="singleLevel"/>
     <w:tmpl w:val="04160001"/>
     <w:lvl w:ilvl="0">
@@ -23031,7 +23068,7 @@
     </w:lvl>
   </w:abstractNum>
   <w:abstractNum w:abstractNumId="27" w15:restartNumberingAfterBreak="0">
-    <w:nsid w:val="65856046"/>
+    <w:nsid w:val="72EC0BA2"/>
     <w:multiLevelType w:val="singleLevel"/>
     <w:tmpl w:val="04160001"/>
     <w:lvl w:ilvl="0">
@@ -23048,7 +23085,7 @@
     </w:lvl>
   </w:abstractNum>
   <w:abstractNum w:abstractNumId="28" w15:restartNumberingAfterBreak="0">
-    <w:nsid w:val="664369DE"/>
+    <w:nsid w:val="73D33B86"/>
     <w:multiLevelType w:val="singleLevel"/>
     <w:tmpl w:val="04160001"/>
     <w:lvl w:ilvl="0">
@@ -23065,7 +23102,7 @@
     </w:lvl>
   </w:abstractNum>
   <w:abstractNum w:abstractNumId="29" w15:restartNumberingAfterBreak="0">
-    <w:nsid w:val="66545F33"/>
+    <w:nsid w:val="74081EA6"/>
     <w:multiLevelType w:val="singleLevel"/>
     <w:tmpl w:val="04160001"/>
     <w:lvl w:ilvl="0">
@@ -23082,7 +23119,7 @@
     </w:lvl>
   </w:abstractNum>
   <w:abstractNum w:abstractNumId="30" w15:restartNumberingAfterBreak="0">
-    <w:nsid w:val="793A0B48"/>
+    <w:nsid w:val="7DCA11AD"/>
     <w:multiLevelType w:val="singleLevel"/>
     <w:tmpl w:val="04160001"/>
     <w:lvl w:ilvl="0">
@@ -23099,7 +23136,7 @@
     </w:lvl>
   </w:abstractNum>
   <w:abstractNum w:abstractNumId="31" w15:restartNumberingAfterBreak="0">
-    <w:nsid w:val="7B1B7B17"/>
+    <w:nsid w:val="7E4C72CA"/>
     <w:multiLevelType w:val="singleLevel"/>
     <w:tmpl w:val="04160001"/>
     <w:lvl w:ilvl="0">
@@ -23116,7 +23153,7 @@
     </w:lvl>
   </w:abstractNum>
   <w:abstractNum w:abstractNumId="32" w15:restartNumberingAfterBreak="0">
-    <w:nsid w:val="7F15226B"/>
+    <w:nsid w:val="7E5A141A"/>
     <w:multiLevelType w:val="singleLevel"/>
     <w:tmpl w:val="04160001"/>
     <w:lvl w:ilvl="0">
@@ -23132,104 +23169,104 @@
       </w:rPr>
     </w:lvl>
   </w:abstractNum>
-  <w:num w:numId="1" w16cid:durableId="332994639">
+  <w:num w:numId="1" w16cid:durableId="926695013">
+    <w:abstractNumId w:val="28"/>
+  </w:num>
+  <w:num w:numId="2" w16cid:durableId="340010427">
+    <w:abstractNumId w:val="9"/>
+  </w:num>
+  <w:num w:numId="3" w16cid:durableId="2096702771">
     <w:abstractNumId w:val="17"/>
   </w:num>
-  <w:num w:numId="2" w16cid:durableId="79255877">
+  <w:num w:numId="4" w16cid:durableId="319045261">
+    <w:abstractNumId w:val="20"/>
+  </w:num>
+  <w:num w:numId="5" w16cid:durableId="189343407">
+    <w:abstractNumId w:val="16"/>
+  </w:num>
+  <w:num w:numId="6" w16cid:durableId="1061295301">
+    <w:abstractNumId w:val="25"/>
+  </w:num>
+  <w:num w:numId="7" w16cid:durableId="1080712270">
+    <w:abstractNumId w:val="29"/>
+  </w:num>
+  <w:num w:numId="8" w16cid:durableId="1795561521">
+    <w:abstractNumId w:val="12"/>
+  </w:num>
+  <w:num w:numId="9" w16cid:durableId="1407024794">
+    <w:abstractNumId w:val="10"/>
+  </w:num>
+  <w:num w:numId="10" w16cid:durableId="687369308">
+    <w:abstractNumId w:val="22"/>
+  </w:num>
+  <w:num w:numId="11" w16cid:durableId="1042553141">
+    <w:abstractNumId w:val="13"/>
+  </w:num>
+  <w:num w:numId="12" w16cid:durableId="255990399">
+    <w:abstractNumId w:val="8"/>
+  </w:num>
+  <w:num w:numId="13" w16cid:durableId="1951234018">
+    <w:abstractNumId w:val="23"/>
+  </w:num>
+  <w:num w:numId="14" w16cid:durableId="1070277072">
+    <w:abstractNumId w:val="24"/>
+  </w:num>
+  <w:num w:numId="15" w16cid:durableId="1051071839">
     <w:abstractNumId w:val="1"/>
   </w:num>
-  <w:num w:numId="3" w16cid:durableId="634993923">
+  <w:num w:numId="16" w16cid:durableId="608048768">
     <w:abstractNumId w:val="21"/>
   </w:num>
-  <w:num w:numId="4" w16cid:durableId="2077046154">
-    <w:abstractNumId w:val="9"/>
+  <w:num w:numId="17" w16cid:durableId="1782333383">
+    <w:abstractNumId w:val="30"/>
   </w:num>
-  <w:num w:numId="5" w16cid:durableId="1458334813">
+  <w:num w:numId="18" w16cid:durableId="1799106306">
+    <w:abstractNumId w:val="5"/>
+  </w:num>
+  <w:num w:numId="19" w16cid:durableId="246578410">
+    <w:abstractNumId w:val="27"/>
+  </w:num>
+  <w:num w:numId="20" w16cid:durableId="1186165475">
+    <w:abstractNumId w:val="14"/>
+  </w:num>
+  <w:num w:numId="21" w16cid:durableId="1873372610">
+    <w:abstractNumId w:val="6"/>
+  </w:num>
+  <w:num w:numId="22" w16cid:durableId="1869023223">
+    <w:abstractNumId w:val="18"/>
+  </w:num>
+  <w:num w:numId="23" w16cid:durableId="963391107">
+    <w:abstractNumId w:val="3"/>
+  </w:num>
+  <w:num w:numId="24" w16cid:durableId="994727087">
+    <w:abstractNumId w:val="2"/>
+  </w:num>
+  <w:num w:numId="25" w16cid:durableId="823355322">
+    <w:abstractNumId w:val="7"/>
+  </w:num>
+  <w:num w:numId="26" w16cid:durableId="1187602181">
+    <w:abstractNumId w:val="31"/>
+  </w:num>
+  <w:num w:numId="27" w16cid:durableId="403574078">
+    <w:abstractNumId w:val="11"/>
+  </w:num>
+  <w:num w:numId="28" w16cid:durableId="1358121527">
+    <w:abstractNumId w:val="26"/>
+  </w:num>
+  <w:num w:numId="29" w16cid:durableId="126053182">
+    <w:abstractNumId w:val="32"/>
+  </w:num>
+  <w:num w:numId="30" w16cid:durableId="1399942303">
+    <w:abstractNumId w:val="19"/>
+  </w:num>
+  <w:num w:numId="31" w16cid:durableId="1435783640">
     <w:abstractNumId w:val="0"/>
   </w:num>
-  <w:num w:numId="6" w16cid:durableId="1046904284">
-    <w:abstractNumId w:val="15"/>
-  </w:num>
-  <w:num w:numId="7" w16cid:durableId="1552614035">
-    <w:abstractNumId w:val="32"/>
-  </w:num>
-  <w:num w:numId="8" w16cid:durableId="1836143331">
-    <w:abstractNumId w:val="8"/>
-  </w:num>
-  <w:num w:numId="9" w16cid:durableId="1346052249">
-    <w:abstractNumId w:val="16"/>
-  </w:num>
-  <w:num w:numId="10" w16cid:durableId="908075529">
-    <w:abstractNumId w:val="27"/>
-  </w:num>
-  <w:num w:numId="11" w16cid:durableId="582179129">
-    <w:abstractNumId w:val="7"/>
-  </w:num>
-  <w:num w:numId="12" w16cid:durableId="709452553">
-    <w:abstractNumId w:val="3"/>
-  </w:num>
-  <w:num w:numId="13" w16cid:durableId="2032294930">
-    <w:abstractNumId w:val="20"/>
-  </w:num>
-  <w:num w:numId="14" w16cid:durableId="834615562">
-    <w:abstractNumId w:val="31"/>
-  </w:num>
-  <w:num w:numId="15" w16cid:durableId="1889342344">
-    <w:abstractNumId w:val="30"/>
-  </w:num>
-  <w:num w:numId="16" w16cid:durableId="2087679493">
-    <w:abstractNumId w:val="28"/>
-  </w:num>
-  <w:num w:numId="17" w16cid:durableId="1148475609">
-    <w:abstractNumId w:val="19"/>
-  </w:num>
-  <w:num w:numId="18" w16cid:durableId="1314800159">
-    <w:abstractNumId w:val="23"/>
-  </w:num>
-  <w:num w:numId="19" w16cid:durableId="1970891039">
-    <w:abstractNumId w:val="5"/>
-  </w:num>
-  <w:num w:numId="20" w16cid:durableId="687105087">
-    <w:abstractNumId w:val="2"/>
-  </w:num>
-  <w:num w:numId="21" w16cid:durableId="1061754001">
-    <w:abstractNumId w:val="14"/>
-  </w:num>
-  <w:num w:numId="22" w16cid:durableId="1986084195">
-    <w:abstractNumId w:val="11"/>
-  </w:num>
-  <w:num w:numId="23" w16cid:durableId="636492716">
-    <w:abstractNumId w:val="13"/>
-  </w:num>
-  <w:num w:numId="24" w16cid:durableId="771781022">
+  <w:num w:numId="32" w16cid:durableId="169956317">
     <w:abstractNumId w:val="4"/>
   </w:num>
-  <w:num w:numId="25" w16cid:durableId="73943888">
-    <w:abstractNumId w:val="6"/>
-  </w:num>
-  <w:num w:numId="26" w16cid:durableId="1375885028">
-    <w:abstractNumId w:val="12"/>
-  </w:num>
-  <w:num w:numId="27" w16cid:durableId="1110130337">
-    <w:abstractNumId w:val="29"/>
-  </w:num>
-  <w:num w:numId="28" w16cid:durableId="997807021">
-    <w:abstractNumId w:val="25"/>
-  </w:num>
-  <w:num w:numId="29" w16cid:durableId="697507239">
-    <w:abstractNumId w:val="18"/>
-  </w:num>
-  <w:num w:numId="30" w16cid:durableId="1486431012">
-    <w:abstractNumId w:val="22"/>
-  </w:num>
-  <w:num w:numId="31" w16cid:durableId="793518164">
-    <w:abstractNumId w:val="26"/>
-  </w:num>
-  <w:num w:numId="32" w16cid:durableId="1459490180">
-    <w:abstractNumId w:val="10"/>
-  </w:num>
-  <w:num w:numId="33" w16cid:durableId="631129825">
-    <w:abstractNumId w:val="24"/>
+  <w:num w:numId="33" w16cid:durableId="1800342396">
+    <w:abstractNumId w:val="15"/>
   </w:num>
 </w:numbering>
 </file>
@@ -23642,7 +23679,7 @@
     <w:link w:val="Ttulo1Char"/>
     <w:uiPriority w:val="9"/>
     <w:qFormat/>
-    <w:rsid w:val="00426F2E"/>
+    <w:rsid w:val="006B7EDB"/>
     <w:pPr>
       <w:keepNext/>
       <w:keepLines/>
@@ -23664,7 +23701,7 @@
     <w:uiPriority w:val="9"/>
     <w:unhideWhenUsed/>
     <w:qFormat/>
-    <w:rsid w:val="00426F2E"/>
+    <w:rsid w:val="006B7EDB"/>
     <w:pPr>
       <w:keepNext/>
       <w:keepLines/>
@@ -23687,7 +23724,7 @@
     <w:semiHidden/>
     <w:unhideWhenUsed/>
     <w:qFormat/>
-    <w:rsid w:val="00426F2E"/>
+    <w:rsid w:val="006B7EDB"/>
     <w:pPr>
       <w:keepNext/>
       <w:keepLines/>
@@ -23710,7 +23747,7 @@
     <w:semiHidden/>
     <w:unhideWhenUsed/>
     <w:qFormat/>
-    <w:rsid w:val="00426F2E"/>
+    <w:rsid w:val="006B7EDB"/>
     <w:pPr>
       <w:keepNext/>
       <w:keepLines/>
@@ -23733,7 +23770,7 @@
     <w:semiHidden/>
     <w:unhideWhenUsed/>
     <w:qFormat/>
-    <w:rsid w:val="00426F2E"/>
+    <w:rsid w:val="006B7EDB"/>
     <w:pPr>
       <w:keepNext/>
       <w:keepLines/>
@@ -23754,7 +23791,7 @@
     <w:semiHidden/>
     <w:unhideWhenUsed/>
     <w:qFormat/>
-    <w:rsid w:val="00426F2E"/>
+    <w:rsid w:val="006B7EDB"/>
     <w:pPr>
       <w:keepNext/>
       <w:keepLines/>
@@ -23777,7 +23814,7 @@
     <w:semiHidden/>
     <w:unhideWhenUsed/>
     <w:qFormat/>
-    <w:rsid w:val="00426F2E"/>
+    <w:rsid w:val="006B7EDB"/>
     <w:pPr>
       <w:keepNext/>
       <w:keepLines/>
@@ -23798,7 +23835,7 @@
     <w:semiHidden/>
     <w:unhideWhenUsed/>
     <w:qFormat/>
-    <w:rsid w:val="00426F2E"/>
+    <w:rsid w:val="006B7EDB"/>
     <w:pPr>
       <w:keepNext/>
       <w:keepLines/>
@@ -23821,7 +23858,7 @@
     <w:semiHidden/>
     <w:unhideWhenUsed/>
     <w:qFormat/>
-    <w:rsid w:val="00426F2E"/>
+    <w:rsid w:val="006B7EDB"/>
     <w:pPr>
       <w:keepNext/>
       <w:keepLines/>
@@ -23865,7 +23902,7 @@
     <w:basedOn w:val="Fontepargpadro"/>
     <w:link w:val="Ttulo1"/>
     <w:uiPriority w:val="9"/>
-    <w:rsid w:val="00426F2E"/>
+    <w:rsid w:val="006B7EDB"/>
     <w:rPr>
       <w:rFonts w:asciiTheme="majorHAnsi" w:eastAsiaTheme="majorEastAsia" w:hAnsiTheme="majorHAnsi" w:cstheme="majorBidi"/>
       <w:color w:val="0F4761" w:themeColor="accent1" w:themeShade="BF"/>
@@ -23878,7 +23915,7 @@
     <w:basedOn w:val="Fontepargpadro"/>
     <w:link w:val="Ttulo2"/>
     <w:uiPriority w:val="9"/>
-    <w:rsid w:val="00426F2E"/>
+    <w:rsid w:val="006B7EDB"/>
     <w:rPr>
       <w:rFonts w:asciiTheme="majorHAnsi" w:eastAsiaTheme="majorEastAsia" w:hAnsiTheme="majorHAnsi" w:cstheme="majorBidi"/>
       <w:color w:val="0F4761" w:themeColor="accent1" w:themeShade="BF"/>
@@ -23892,7 +23929,7 @@
     <w:link w:val="Ttulo3"/>
     <w:uiPriority w:val="9"/>
     <w:semiHidden/>
-    <w:rsid w:val="00426F2E"/>
+    <w:rsid w:val="006B7EDB"/>
     <w:rPr>
       <w:rFonts w:eastAsiaTheme="majorEastAsia" w:cstheme="majorBidi"/>
       <w:color w:val="0F4761" w:themeColor="accent1" w:themeShade="BF"/>
@@ -23906,7 +23943,7 @@
     <w:link w:val="Ttulo4"/>
     <w:uiPriority w:val="9"/>
     <w:semiHidden/>
-    <w:rsid w:val="00426F2E"/>
+    <w:rsid w:val="006B7EDB"/>
     <w:rPr>
       <w:rFonts w:eastAsiaTheme="majorEastAsia" w:cstheme="majorBidi"/>
       <w:i/>
@@ -23920,7 +23957,7 @@
     <w:link w:val="Ttulo5"/>
     <w:uiPriority w:val="9"/>
     <w:semiHidden/>
-    <w:rsid w:val="00426F2E"/>
+    <w:rsid w:val="006B7EDB"/>
     <w:rPr>
       <w:rFonts w:eastAsiaTheme="majorEastAsia" w:cstheme="majorBidi"/>
       <w:color w:val="0F4761" w:themeColor="accent1" w:themeShade="BF"/>
@@ -23932,7 +23969,7 @@
     <w:link w:val="Ttulo6"/>
     <w:uiPriority w:val="9"/>
     <w:semiHidden/>
-    <w:rsid w:val="00426F2E"/>
+    <w:rsid w:val="006B7EDB"/>
     <w:rPr>
       <w:rFonts w:eastAsiaTheme="majorEastAsia" w:cstheme="majorBidi"/>
       <w:i/>
@@ -23946,7 +23983,7 @@
     <w:link w:val="Ttulo7"/>
     <w:uiPriority w:val="9"/>
     <w:semiHidden/>
-    <w:rsid w:val="00426F2E"/>
+    <w:rsid w:val="006B7EDB"/>
     <w:rPr>
       <w:rFonts w:eastAsiaTheme="majorEastAsia" w:cstheme="majorBidi"/>
       <w:color w:val="595959" w:themeColor="text1" w:themeTint="A6"/>
@@ -23958,7 +23995,7 @@
     <w:link w:val="Ttulo8"/>
     <w:uiPriority w:val="9"/>
     <w:semiHidden/>
-    <w:rsid w:val="00426F2E"/>
+    <w:rsid w:val="006B7EDB"/>
     <w:rPr>
       <w:rFonts w:eastAsiaTheme="majorEastAsia" w:cstheme="majorBidi"/>
       <w:i/>
@@ -23972,7 +24009,7 @@
     <w:link w:val="Ttulo9"/>
     <w:uiPriority w:val="9"/>
     <w:semiHidden/>
-    <w:rsid w:val="00426F2E"/>
+    <w:rsid w:val="006B7EDB"/>
     <w:rPr>
       <w:rFonts w:eastAsiaTheme="majorEastAsia" w:cstheme="majorBidi"/>
       <w:color w:val="272727" w:themeColor="text1" w:themeTint="D8"/>
@@ -23985,7 +24022,7 @@
     <w:link w:val="TtuloChar"/>
     <w:uiPriority w:val="10"/>
     <w:qFormat/>
-    <w:rsid w:val="00426F2E"/>
+    <w:rsid w:val="006B7EDB"/>
     <w:pPr>
       <w:spacing w:after="80" w:line="240" w:lineRule="auto"/>
       <w:contextualSpacing/>
@@ -24003,7 +24040,7 @@
     <w:basedOn w:val="Fontepargpadro"/>
     <w:link w:val="Ttulo"/>
     <w:uiPriority w:val="10"/>
-    <w:rsid w:val="00426F2E"/>
+    <w:rsid w:val="006B7EDB"/>
     <w:rPr>
       <w:rFonts w:asciiTheme="majorHAnsi" w:eastAsiaTheme="majorEastAsia" w:hAnsiTheme="majorHAnsi" w:cstheme="majorBidi"/>
       <w:spacing w:val="-10"/>
@@ -24019,7 +24056,7 @@
     <w:link w:val="SubttuloChar"/>
     <w:uiPriority w:val="11"/>
     <w:qFormat/>
-    <w:rsid w:val="00426F2E"/>
+    <w:rsid w:val="006B7EDB"/>
     <w:pPr>
       <w:numPr>
         <w:ilvl w:val="1"/>
@@ -24038,7 +24075,7 @@
     <w:basedOn w:val="Fontepargpadro"/>
     <w:link w:val="Subttulo"/>
     <w:uiPriority w:val="11"/>
-    <w:rsid w:val="00426F2E"/>
+    <w:rsid w:val="006B7EDB"/>
     <w:rPr>
       <w:rFonts w:eastAsiaTheme="majorEastAsia" w:cstheme="majorBidi"/>
       <w:color w:val="595959" w:themeColor="text1" w:themeTint="A6"/>
@@ -24054,7 +24091,7 @@
     <w:link w:val="CitaoChar"/>
     <w:uiPriority w:val="29"/>
     <w:qFormat/>
-    <w:rsid w:val="00426F2E"/>
+    <w:rsid w:val="006B7EDB"/>
     <w:pPr>
       <w:spacing w:before="160"/>
       <w:jc w:val="center"/>
@@ -24070,7 +24107,7 @@
     <w:basedOn w:val="Fontepargpadro"/>
     <w:link w:val="Citao"/>
     <w:uiPriority w:val="29"/>
-    <w:rsid w:val="00426F2E"/>
+    <w:rsid w:val="006B7EDB"/>
     <w:rPr>
       <w:i/>
       <w:iCs/>
@@ -24082,7 +24119,7 @@
     <w:basedOn w:val="Normal"/>
     <w:uiPriority w:val="34"/>
     <w:qFormat/>
-    <w:rsid w:val="00426F2E"/>
+    <w:rsid w:val="006B7EDB"/>
     <w:pPr>
       <w:ind w:left="720"/>
       <w:contextualSpacing/>
@@ -24093,7 +24130,7 @@
     <w:basedOn w:val="Fontepargpadro"/>
     <w:uiPriority w:val="21"/>
     <w:qFormat/>
-    <w:rsid w:val="00426F2E"/>
+    <w:rsid w:val="006B7EDB"/>
     <w:rPr>
       <w:i/>
       <w:iCs/>
@@ -24107,7 +24144,7 @@
     <w:link w:val="CitaoIntensaChar"/>
     <w:uiPriority w:val="30"/>
     <w:qFormat/>
-    <w:rsid w:val="00426F2E"/>
+    <w:rsid w:val="006B7EDB"/>
     <w:pPr>
       <w:pBdr>
         <w:top w:val="single" w:sz="4" w:space="10" w:color="0F4761" w:themeColor="accent1" w:themeShade="BF"/>
@@ -24128,7 +24165,7 @@
     <w:basedOn w:val="Fontepargpadro"/>
     <w:link w:val="CitaoIntensa"/>
     <w:uiPriority w:val="30"/>
-    <w:rsid w:val="00426F2E"/>
+    <w:rsid w:val="006B7EDB"/>
     <w:rPr>
       <w:i/>
       <w:iCs/>
@@ -24140,7 +24177,7 @@
     <w:basedOn w:val="Fontepargpadro"/>
     <w:uiPriority w:val="32"/>
     <w:qFormat/>
-    <w:rsid w:val="00426F2E"/>
+    <w:rsid w:val="006B7EDB"/>
     <w:rPr>
       <w:b/>
       <w:bCs/>
@@ -24155,7 +24192,7 @@
     <w:link w:val="CabealhoChar"/>
     <w:uiPriority w:val="99"/>
     <w:unhideWhenUsed/>
-    <w:rsid w:val="00426F2E"/>
+    <w:rsid w:val="006B7EDB"/>
     <w:pPr>
       <w:tabs>
         <w:tab w:val="center" w:pos="4252"/>
@@ -24169,7 +24206,7 @@
     <w:basedOn w:val="Fontepargpadro"/>
     <w:link w:val="Cabealho"/>
     <w:uiPriority w:val="99"/>
-    <w:rsid w:val="00426F2E"/>
+    <w:rsid w:val="006B7EDB"/>
   </w:style>
   <w:style w:type="paragraph" w:styleId="Rodap">
     <w:name w:val="footer"/>
@@ -24177,7 +24214,7 @@
     <w:link w:val="RodapChar"/>
     <w:uiPriority w:val="99"/>
     <w:unhideWhenUsed/>
-    <w:rsid w:val="00426F2E"/>
+    <w:rsid w:val="006B7EDB"/>
     <w:pPr>
       <w:tabs>
         <w:tab w:val="center" w:pos="4252"/>
@@ -24191,7 +24228,7 @@
     <w:basedOn w:val="Fontepargpadro"/>
     <w:link w:val="Rodap"/>
     <w:uiPriority w:val="99"/>
-    <w:rsid w:val="00426F2E"/>
+    <w:rsid w:val="006B7EDB"/>
   </w:style>
   <w:style w:type="paragraph" w:styleId="Sumrio1">
     <w:name w:val="toc 1"/>
@@ -24200,7 +24237,7 @@
     <w:autoRedefine/>
     <w:uiPriority w:val="39"/>
     <w:unhideWhenUsed/>
-    <w:rsid w:val="00426F2E"/>
+    <w:rsid w:val="006B7EDB"/>
     <w:pPr>
       <w:spacing w:after="100"/>
     </w:pPr>
@@ -24212,7 +24249,7 @@
     <w:autoRedefine/>
     <w:uiPriority w:val="39"/>
     <w:unhideWhenUsed/>
-    <w:rsid w:val="00426F2E"/>
+    <w:rsid w:val="006B7EDB"/>
     <w:pPr>
       <w:spacing w:after="100"/>
       <w:ind w:left="240"/>

</xml_diff>

<commit_message>
Sincroniza documentacao da dependencia entre marcos no Manual de Uso
Co-Authored-By: Claude Sonnet 5 <noreply@anthropic.com>
</commit_message>
<xml_diff>
--- a/Manual de Uso - Ferramenta de Gestao de Projetos.docx
+++ b/Manual de Uso - Ferramenta de Gestao de Projetos.docx
@@ -229,7 +229,7 @@
         <w:rPr>
           <w:noProof/>
         </w:rPr>
-        <w:instrText xml:space="preserve"> PAGEREF _Toc239952495 \h </w:instrText>
+        <w:instrText xml:space="preserve"> PAGEREF _Toc240009140 \h </w:instrText>
       </w:r>
       <w:r>
         <w:rPr>
@@ -290,7 +290,7 @@
         <w:rPr>
           <w:noProof/>
         </w:rPr>
-        <w:instrText xml:space="preserve"> PAGEREF _Toc239952496 \h </w:instrText>
+        <w:instrText xml:space="preserve"> PAGEREF _Toc240009141 \h </w:instrText>
       </w:r>
       <w:r>
         <w:rPr>
@@ -351,7 +351,7 @@
         <w:rPr>
           <w:noProof/>
         </w:rPr>
-        <w:instrText xml:space="preserve"> PAGEREF _Toc239952497 \h </w:instrText>
+        <w:instrText xml:space="preserve"> PAGEREF _Toc240009142 \h </w:instrText>
       </w:r>
       <w:r>
         <w:rPr>
@@ -412,7 +412,7 @@
         <w:rPr>
           <w:noProof/>
         </w:rPr>
-        <w:instrText xml:space="preserve"> PAGEREF _Toc239952498 \h </w:instrText>
+        <w:instrText xml:space="preserve"> PAGEREF _Toc240009143 \h </w:instrText>
       </w:r>
       <w:r>
         <w:rPr>
@@ -473,7 +473,7 @@
         <w:rPr>
           <w:noProof/>
         </w:rPr>
-        <w:instrText xml:space="preserve"> PAGEREF _Toc239952499 \h </w:instrText>
+        <w:instrText xml:space="preserve"> PAGEREF _Toc240009144 \h </w:instrText>
       </w:r>
       <w:r>
         <w:rPr>
@@ -534,7 +534,7 @@
         <w:rPr>
           <w:noProof/>
         </w:rPr>
-        <w:instrText xml:space="preserve"> PAGEREF _Toc239952500 \h </w:instrText>
+        <w:instrText xml:space="preserve"> PAGEREF _Toc240009145 \h </w:instrText>
       </w:r>
       <w:r>
         <w:rPr>
@@ -595,7 +595,7 @@
         <w:rPr>
           <w:noProof/>
         </w:rPr>
-        <w:instrText xml:space="preserve"> PAGEREF _Toc239952501 \h </w:instrText>
+        <w:instrText xml:space="preserve"> PAGEREF _Toc240009146 \h </w:instrText>
       </w:r>
       <w:r>
         <w:rPr>
@@ -656,7 +656,7 @@
         <w:rPr>
           <w:noProof/>
         </w:rPr>
-        <w:instrText xml:space="preserve"> PAGEREF _Toc239952502 \h </w:instrText>
+        <w:instrText xml:space="preserve"> PAGEREF _Toc240009147 \h </w:instrText>
       </w:r>
       <w:r>
         <w:rPr>
@@ -717,7 +717,7 @@
         <w:rPr>
           <w:noProof/>
         </w:rPr>
-        <w:instrText xml:space="preserve"> PAGEREF _Toc239952503 \h </w:instrText>
+        <w:instrText xml:space="preserve"> PAGEREF _Toc240009148 \h </w:instrText>
       </w:r>
       <w:r>
         <w:rPr>
@@ -778,7 +778,7 @@
         <w:rPr>
           <w:noProof/>
         </w:rPr>
-        <w:instrText xml:space="preserve"> PAGEREF _Toc239952504 \h </w:instrText>
+        <w:instrText xml:space="preserve"> PAGEREF _Toc240009149 \h </w:instrText>
       </w:r>
       <w:r>
         <w:rPr>
@@ -839,7 +839,7 @@
         <w:rPr>
           <w:noProof/>
         </w:rPr>
-        <w:instrText xml:space="preserve"> PAGEREF _Toc239952505 \h </w:instrText>
+        <w:instrText xml:space="preserve"> PAGEREF _Toc240009150 \h </w:instrText>
       </w:r>
       <w:r>
         <w:rPr>
@@ -900,7 +900,7 @@
         <w:rPr>
           <w:noProof/>
         </w:rPr>
-        <w:instrText xml:space="preserve"> PAGEREF _Toc239952506 \h </w:instrText>
+        <w:instrText xml:space="preserve"> PAGEREF _Toc240009151 \h </w:instrText>
       </w:r>
       <w:r>
         <w:rPr>
@@ -961,7 +961,7 @@
         <w:rPr>
           <w:noProof/>
         </w:rPr>
-        <w:instrText xml:space="preserve"> PAGEREF _Toc239952507 \h </w:instrText>
+        <w:instrText xml:space="preserve"> PAGEREF _Toc240009152 \h </w:instrText>
       </w:r>
       <w:r>
         <w:rPr>
@@ -1022,7 +1022,7 @@
         <w:rPr>
           <w:noProof/>
         </w:rPr>
-        <w:instrText xml:space="preserve"> PAGEREF _Toc239952508 \h </w:instrText>
+        <w:instrText xml:space="preserve"> PAGEREF _Toc240009153 \h </w:instrText>
       </w:r>
       <w:r>
         <w:rPr>
@@ -1083,7 +1083,7 @@
         <w:rPr>
           <w:noProof/>
         </w:rPr>
-        <w:instrText xml:space="preserve"> PAGEREF _Toc239952509 \h </w:instrText>
+        <w:instrText xml:space="preserve"> PAGEREF _Toc240009154 \h </w:instrText>
       </w:r>
       <w:r>
         <w:rPr>
@@ -1144,7 +1144,7 @@
         <w:rPr>
           <w:noProof/>
         </w:rPr>
-        <w:instrText xml:space="preserve"> PAGEREF _Toc239952510 \h </w:instrText>
+        <w:instrText xml:space="preserve"> PAGEREF _Toc240009155 \h </w:instrText>
       </w:r>
       <w:r>
         <w:rPr>
@@ -1205,7 +1205,7 @@
         <w:rPr>
           <w:noProof/>
         </w:rPr>
-        <w:instrText xml:space="preserve"> PAGEREF _Toc239952511 \h </w:instrText>
+        <w:instrText xml:space="preserve"> PAGEREF _Toc240009156 \h </w:instrText>
       </w:r>
       <w:r>
         <w:rPr>
@@ -1266,7 +1266,7 @@
         <w:rPr>
           <w:noProof/>
         </w:rPr>
-        <w:instrText xml:space="preserve"> PAGEREF _Toc239952512 \h </w:instrText>
+        <w:instrText xml:space="preserve"> PAGEREF _Toc240009157 \h </w:instrText>
       </w:r>
       <w:r>
         <w:rPr>
@@ -1327,7 +1327,7 @@
         <w:rPr>
           <w:noProof/>
         </w:rPr>
-        <w:instrText xml:space="preserve"> PAGEREF _Toc239952513 \h </w:instrText>
+        <w:instrText xml:space="preserve"> PAGEREF _Toc240009158 \h </w:instrText>
       </w:r>
       <w:r>
         <w:rPr>
@@ -1388,7 +1388,7 @@
         <w:rPr>
           <w:noProof/>
         </w:rPr>
-        <w:instrText xml:space="preserve"> PAGEREF _Toc239952514 \h </w:instrText>
+        <w:instrText xml:space="preserve"> PAGEREF _Toc240009159 \h </w:instrText>
       </w:r>
       <w:r>
         <w:rPr>
@@ -1449,7 +1449,7 @@
         <w:rPr>
           <w:noProof/>
         </w:rPr>
-        <w:instrText xml:space="preserve"> PAGEREF _Toc239952515 \h </w:instrText>
+        <w:instrText xml:space="preserve"> PAGEREF _Toc240009160 \h </w:instrText>
       </w:r>
       <w:r>
         <w:rPr>
@@ -1510,7 +1510,7 @@
         <w:rPr>
           <w:noProof/>
         </w:rPr>
-        <w:instrText xml:space="preserve"> PAGEREF _Toc239952516 \h </w:instrText>
+        <w:instrText xml:space="preserve"> PAGEREF _Toc240009161 \h </w:instrText>
       </w:r>
       <w:r>
         <w:rPr>
@@ -1571,7 +1571,7 @@
         <w:rPr>
           <w:noProof/>
         </w:rPr>
-        <w:instrText xml:space="preserve"> PAGEREF _Toc239952517 \h </w:instrText>
+        <w:instrText xml:space="preserve"> PAGEREF _Toc240009162 \h </w:instrText>
       </w:r>
       <w:r>
         <w:rPr>
@@ -1632,7 +1632,7 @@
         <w:rPr>
           <w:noProof/>
         </w:rPr>
-        <w:instrText xml:space="preserve"> PAGEREF _Toc239952518 \h </w:instrText>
+        <w:instrText xml:space="preserve"> PAGEREF _Toc240009163 \h </w:instrText>
       </w:r>
       <w:r>
         <w:rPr>
@@ -1693,7 +1693,7 @@
         <w:rPr>
           <w:noProof/>
         </w:rPr>
-        <w:instrText xml:space="preserve"> PAGEREF _Toc239952519 \h </w:instrText>
+        <w:instrText xml:space="preserve"> PAGEREF _Toc240009164 \h </w:instrText>
       </w:r>
       <w:r>
         <w:rPr>
@@ -1755,7 +1755,7 @@
         <w:rPr>
           <w:noProof/>
         </w:rPr>
-        <w:instrText xml:space="preserve"> PAGEREF _Toc239952520 \h </w:instrText>
+        <w:instrText xml:space="preserve"> PAGEREF _Toc240009165 \h </w:instrText>
       </w:r>
       <w:r>
         <w:rPr>
@@ -1816,7 +1816,7 @@
         <w:rPr>
           <w:noProof/>
         </w:rPr>
-        <w:instrText xml:space="preserve"> PAGEREF _Toc239952521 \h </w:instrText>
+        <w:instrText xml:space="preserve"> PAGEREF _Toc240009166 \h </w:instrText>
       </w:r>
       <w:r>
         <w:rPr>
@@ -1877,7 +1877,7 @@
         <w:rPr>
           <w:noProof/>
         </w:rPr>
-        <w:instrText xml:space="preserve"> PAGEREF _Toc239952522 \h </w:instrText>
+        <w:instrText xml:space="preserve"> PAGEREF _Toc240009167 \h </w:instrText>
       </w:r>
       <w:r>
         <w:rPr>
@@ -1938,7 +1938,7 @@
         <w:rPr>
           <w:noProof/>
         </w:rPr>
-        <w:instrText xml:space="preserve"> PAGEREF _Toc239952523 \h </w:instrText>
+        <w:instrText xml:space="preserve"> PAGEREF _Toc240009168 \h </w:instrText>
       </w:r>
       <w:r>
         <w:rPr>
@@ -1999,7 +1999,7 @@
         <w:rPr>
           <w:noProof/>
         </w:rPr>
-        <w:instrText xml:space="preserve"> PAGEREF _Toc239952524 \h </w:instrText>
+        <w:instrText xml:space="preserve"> PAGEREF _Toc240009169 \h </w:instrText>
       </w:r>
       <w:r>
         <w:rPr>
@@ -2060,7 +2060,7 @@
         <w:rPr>
           <w:noProof/>
         </w:rPr>
-        <w:instrText xml:space="preserve"> PAGEREF _Toc239952525 \h </w:instrText>
+        <w:instrText xml:space="preserve"> PAGEREF _Toc240009170 \h </w:instrText>
       </w:r>
       <w:r>
         <w:rPr>
@@ -2121,7 +2121,7 @@
         <w:rPr>
           <w:noProof/>
         </w:rPr>
-        <w:instrText xml:space="preserve"> PAGEREF _Toc239952526 \h </w:instrText>
+        <w:instrText xml:space="preserve"> PAGEREF _Toc240009171 \h </w:instrText>
       </w:r>
       <w:r>
         <w:rPr>
@@ -2182,7 +2182,7 @@
         <w:rPr>
           <w:noProof/>
         </w:rPr>
-        <w:instrText xml:space="preserve"> PAGEREF _Toc239952527 \h </w:instrText>
+        <w:instrText xml:space="preserve"> PAGEREF _Toc240009172 \h </w:instrText>
       </w:r>
       <w:r>
         <w:rPr>
@@ -2243,7 +2243,7 @@
         <w:rPr>
           <w:noProof/>
         </w:rPr>
-        <w:instrText xml:space="preserve"> PAGEREF _Toc239952528 \h </w:instrText>
+        <w:instrText xml:space="preserve"> PAGEREF _Toc240009173 \h </w:instrText>
       </w:r>
       <w:r>
         <w:rPr>
@@ -2304,7 +2304,7 @@
         <w:rPr>
           <w:noProof/>
         </w:rPr>
-        <w:instrText xml:space="preserve"> PAGEREF _Toc239952529 \h </w:instrText>
+        <w:instrText xml:space="preserve"> PAGEREF _Toc240009174 \h </w:instrText>
       </w:r>
       <w:r>
         <w:rPr>
@@ -2365,7 +2365,7 @@
         <w:rPr>
           <w:noProof/>
         </w:rPr>
-        <w:instrText xml:space="preserve"> PAGEREF _Toc239952530 \h </w:instrText>
+        <w:instrText xml:space="preserve"> PAGEREF _Toc240009175 \h </w:instrText>
       </w:r>
       <w:r>
         <w:rPr>
@@ -2426,7 +2426,7 @@
         <w:rPr>
           <w:noProof/>
         </w:rPr>
-        <w:instrText xml:space="preserve"> PAGEREF _Toc239952531 \h </w:instrText>
+        <w:instrText xml:space="preserve"> PAGEREF _Toc240009176 \h </w:instrText>
       </w:r>
       <w:r>
         <w:rPr>
@@ -2487,7 +2487,7 @@
         <w:rPr>
           <w:noProof/>
         </w:rPr>
-        <w:instrText xml:space="preserve"> PAGEREF _Toc239952532 \h </w:instrText>
+        <w:instrText xml:space="preserve"> PAGEREF _Toc240009177 \h </w:instrText>
       </w:r>
       <w:r>
         <w:rPr>
@@ -2548,7 +2548,7 @@
         <w:rPr>
           <w:noProof/>
         </w:rPr>
-        <w:instrText xml:space="preserve"> PAGEREF _Toc239952533 \h </w:instrText>
+        <w:instrText xml:space="preserve"> PAGEREF _Toc240009178 \h </w:instrText>
       </w:r>
       <w:r>
         <w:rPr>
@@ -2609,7 +2609,7 @@
         <w:rPr>
           <w:noProof/>
         </w:rPr>
-        <w:instrText xml:space="preserve"> PAGEREF _Toc239952534 \h </w:instrText>
+        <w:instrText xml:space="preserve"> PAGEREF _Toc240009179 \h </w:instrText>
       </w:r>
       <w:r>
         <w:rPr>
@@ -2670,7 +2670,7 @@
         <w:rPr>
           <w:noProof/>
         </w:rPr>
-        <w:instrText xml:space="preserve"> PAGEREF _Toc239952535 \h </w:instrText>
+        <w:instrText xml:space="preserve"> PAGEREF _Toc240009180 \h </w:instrText>
       </w:r>
       <w:r>
         <w:rPr>
@@ -2731,7 +2731,7 @@
         <w:rPr>
           <w:noProof/>
         </w:rPr>
-        <w:instrText xml:space="preserve"> PAGEREF _Toc239952536 \h </w:instrText>
+        <w:instrText xml:space="preserve"> PAGEREF _Toc240009181 \h </w:instrText>
       </w:r>
       <w:r>
         <w:rPr>
@@ -2792,7 +2792,7 @@
         <w:rPr>
           <w:noProof/>
         </w:rPr>
-        <w:instrText xml:space="preserve"> PAGEREF _Toc239952537 \h </w:instrText>
+        <w:instrText xml:space="preserve"> PAGEREF _Toc240009182 \h </w:instrText>
       </w:r>
       <w:r>
         <w:rPr>
@@ -2853,7 +2853,7 @@
         <w:rPr>
           <w:noProof/>
         </w:rPr>
-        <w:instrText xml:space="preserve"> PAGEREF _Toc239952538 \h </w:instrText>
+        <w:instrText xml:space="preserve"> PAGEREF _Toc240009183 \h </w:instrText>
       </w:r>
       <w:r>
         <w:rPr>
@@ -2914,7 +2914,7 @@
         <w:rPr>
           <w:noProof/>
         </w:rPr>
-        <w:instrText xml:space="preserve"> PAGEREF _Toc239952539 \h </w:instrText>
+        <w:instrText xml:space="preserve"> PAGEREF _Toc240009184 \h </w:instrText>
       </w:r>
       <w:r>
         <w:rPr>
@@ -2975,7 +2975,7 @@
         <w:rPr>
           <w:noProof/>
         </w:rPr>
-        <w:instrText xml:space="preserve"> PAGEREF _Toc239952540 \h </w:instrText>
+        <w:instrText xml:space="preserve"> PAGEREF _Toc240009185 \h </w:instrText>
       </w:r>
       <w:r>
         <w:rPr>
@@ -3013,10 +3013,7 @@
       </w:pPr>
       <w:r>
         <w:rPr>
-          <w:rFonts w:ascii="Montserrat" w:hAnsi="Montserrat"/>
-          <w:b/>
-          <w:noProof/>
-          <w:color w:val="1A1A1A"/>
+          <w:noProof/>
         </w:rPr>
         <w:t>7. Perguntas frequentes</w:t>
       </w:r>
@@ -3036,7 +3033,7 @@
         <w:rPr>
           <w:noProof/>
         </w:rPr>
-        <w:instrText xml:space="preserve"> PAGEREF _Toc239952541 \h </w:instrText>
+        <w:instrText xml:space="preserve"> PAGEREF _Toc240009186 \h </w:instrText>
       </w:r>
       <w:r>
         <w:rPr>
@@ -3097,7 +3094,7 @@
         <w:rPr>
           <w:noProof/>
         </w:rPr>
-        <w:instrText xml:space="preserve"> PAGEREF _Toc239952542 \h </w:instrText>
+        <w:instrText xml:space="preserve"> PAGEREF _Toc240009187 \h </w:instrText>
       </w:r>
       <w:r>
         <w:rPr>
@@ -3173,7 +3170,7 @@
           <w:sz w:val="34"/>
         </w:rPr>
       </w:pPr>
-      <w:bookmarkStart w:id="0" w:name="_Toc239952495"/>
+      <w:bookmarkStart w:id="0" w:name="_Toc240009140"/>
       <w:r>
         <w:rPr>
           <w:rFonts w:ascii="Montserrat" w:hAnsi="Montserrat"/>
@@ -3197,7 +3194,7 @@
           <w:sz w:val="27"/>
         </w:rPr>
       </w:pPr>
-      <w:bookmarkStart w:id="1" w:name="_Toc239952496"/>
+      <w:bookmarkStart w:id="1" w:name="_Toc240009141"/>
       <w:r>
         <w:rPr>
           <w:rFonts w:ascii="Montserrat" w:hAnsi="Montserrat"/>
@@ -4179,6 +4176,32 @@
           <w:color w:val="1A1A1A"/>
           <w:sz w:val="22"/>
         </w:rPr>
+        <w:t xml:space="preserve">Esta e a versao 2.48 do manual. Em relacao a versao 2.47 (10/09/2026), o cronograma de entregas macro do TAP (Passo 3, secao 10) ganhou o campo opcional Depende de em cada marco - uma dependencia simples, por nome, de outro marco do mesmo cronograma. Um marco cuja dependencia ainda nao tenha Conclusao real e ja tenha passado do Termino previsto ganha um aviso </w:t>
+      </w:r>
+      <w:r>
+        <w:rPr>
+          <w:rFonts w:ascii="Montserrat" w:hAnsi="Montserrat"/>
+          <w:color w:val="1A1A1A"/>
+          <w:sz w:val="22"/>
+        </w:rPr>
+        <w:t>loqueado, visivel em todo lugar que mostra o cronograma: o proprio TAP, o espelho do Planejamento (Passo 4) e os Marcos do Relatorio de Situacao (secao 4.1).</w:t>
+      </w:r>
+    </w:p>
+    <w:p>
+      <w:pPr>
+        <w:spacing w:line="280" w:lineRule="auto"/>
+        <w:rPr>
+          <w:rFonts w:ascii="Montserrat" w:hAnsi="Montserrat"/>
+          <w:color w:val="1A1A1A"/>
+          <w:sz w:val="22"/>
+        </w:rPr>
+      </w:pPr>
+      <w:r>
+        <w:rPr>
+          <w:rFonts w:ascii="Montserrat" w:hAnsi="Montserrat"/>
+          <w:color w:val="1A1A1A"/>
+          <w:sz w:val="22"/>
+        </w:rPr>
         <w:t>O manual nao substitui as Diretrizes para a Gestao de Projetos da UNIALFA (documento institucional que define o framework D01 a D07) nem o documento Regras de Acesso e Permissoes (que detalha cada regra de controle de acesso); ele e o guia operacional de como usar cada ferramenta na pratica.</w:t>
       </w:r>
     </w:p>
@@ -4193,7 +4216,7 @@
           <w:sz w:val="27"/>
         </w:rPr>
       </w:pPr>
-      <w:bookmarkStart w:id="2" w:name="_Toc239952497"/>
+      <w:bookmarkStart w:id="2" w:name="_Toc240009142"/>
       <w:r>
         <w:rPr>
           <w:rFonts w:ascii="Montserrat" w:hAnsi="Montserrat"/>
@@ -4390,16 +4413,16 @@
         </w:rPr>
         <w:lastRenderedPageBreak/>
         <w:drawing>
-          <wp:inline distT="0" distB="0" distL="0" distR="0" wp14:anchorId="17A1D3A8" wp14:editId="19F23A7F">
+          <wp:inline distT="0" distB="0" distL="0" distR="0" wp14:anchorId="68890BBB" wp14:editId="52290719">
             <wp:extent cx="5303520" cy="4792851"/>
             <wp:effectExtent l="19050" t="19050" r="11430" b="27305"/>
-            <wp:docPr id="1704833653" name="Imagem 1"/>
+            <wp:docPr id="229218287" name="Imagem 1"/>
             <wp:cNvGraphicFramePr/>
             <a:graphic xmlns:a="http://schemas.openxmlformats.org/drawingml/2006/main">
               <a:graphicData uri="http://schemas.openxmlformats.org/drawingml/2006/picture">
                 <pic:pic xmlns:pic="http://schemas.openxmlformats.org/drawingml/2006/picture">
                   <pic:nvPicPr>
-                    <pic:cNvPr id="1704833653" name=""/>
+                    <pic:cNvPr id="229218287" name=""/>
                     <pic:cNvPicPr/>
                   </pic:nvPicPr>
                   <pic:blipFill>
@@ -4467,7 +4490,7 @@
           <w:sz w:val="27"/>
         </w:rPr>
       </w:pPr>
-      <w:bookmarkStart w:id="3" w:name="_Toc239952498"/>
+      <w:bookmarkStart w:id="3" w:name="_Toc240009143"/>
       <w:r>
         <w:rPr>
           <w:rFonts w:ascii="Montserrat" w:hAnsi="Montserrat"/>
@@ -4508,16 +4531,16 @@
         </w:rPr>
         <w:lastRenderedPageBreak/>
         <w:drawing>
-          <wp:inline distT="0" distB="0" distL="0" distR="0" wp14:anchorId="0C2E4716" wp14:editId="1820F6C6">
+          <wp:inline distT="0" distB="0" distL="0" distR="0" wp14:anchorId="5EE0BF79" wp14:editId="62BA8E72">
             <wp:extent cx="4206240" cy="3801227"/>
             <wp:effectExtent l="19050" t="19050" r="22860" b="27940"/>
-            <wp:docPr id="1895961005" name="Imagem 2"/>
+            <wp:docPr id="796406588" name="Imagem 2"/>
             <wp:cNvGraphicFramePr/>
             <a:graphic xmlns:a="http://schemas.openxmlformats.org/drawingml/2006/main">
               <a:graphicData uri="http://schemas.openxmlformats.org/drawingml/2006/picture">
                 <pic:pic xmlns:pic="http://schemas.openxmlformats.org/drawingml/2006/picture">
                   <pic:nvPicPr>
-                    <pic:cNvPr id="1895961005" name=""/>
+                    <pic:cNvPr id="796406588" name=""/>
                     <pic:cNvPicPr/>
                   </pic:nvPicPr>
                   <pic:blipFill>
@@ -4690,7 +4713,7 @@
           <w:sz w:val="27"/>
         </w:rPr>
       </w:pPr>
-      <w:bookmarkStart w:id="4" w:name="_Toc239952499"/>
+      <w:bookmarkStart w:id="4" w:name="_Toc240009144"/>
       <w:r>
         <w:rPr>
           <w:rFonts w:ascii="Montserrat" w:hAnsi="Montserrat"/>
@@ -5929,7 +5952,7 @@
           <w:sz w:val="34"/>
         </w:rPr>
       </w:pPr>
-      <w:bookmarkStart w:id="5" w:name="_Toc239952500"/>
+      <w:bookmarkStart w:id="5" w:name="_Toc240009145"/>
       <w:r>
         <w:rPr>
           <w:rFonts w:ascii="Montserrat" w:hAnsi="Montserrat"/>
@@ -5953,7 +5976,7 @@
           <w:sz w:val="27"/>
         </w:rPr>
       </w:pPr>
-      <w:bookmarkStart w:id="6" w:name="_Toc239952501"/>
+      <w:bookmarkStart w:id="6" w:name="_Toc240009146"/>
       <w:r>
         <w:rPr>
           <w:rFonts w:ascii="Montserrat" w:hAnsi="Montserrat"/>
@@ -5994,7 +6017,7 @@
           <w:sz w:val="27"/>
         </w:rPr>
       </w:pPr>
-      <w:bookmarkStart w:id="7" w:name="_Toc239952502"/>
+      <w:bookmarkStart w:id="7" w:name="_Toc240009147"/>
       <w:r>
         <w:rPr>
           <w:rFonts w:ascii="Montserrat" w:hAnsi="Montserrat"/>
@@ -6113,7 +6136,7 @@
           <w:sz w:val="27"/>
         </w:rPr>
       </w:pPr>
-      <w:bookmarkStart w:id="8" w:name="_Toc239952503"/>
+      <w:bookmarkStart w:id="8" w:name="_Toc240009148"/>
       <w:r>
         <w:rPr>
           <w:rFonts w:ascii="Montserrat" w:hAnsi="Montserrat"/>
@@ -6726,7 +6749,7 @@
           <w:sz w:val="27"/>
         </w:rPr>
       </w:pPr>
-      <w:bookmarkStart w:id="9" w:name="_Toc239952504"/>
+      <w:bookmarkStart w:id="9" w:name="_Toc240009149"/>
       <w:r>
         <w:rPr>
           <w:rFonts w:ascii="Montserrat" w:hAnsi="Montserrat"/>
@@ -6815,16 +6838,16 @@
         </w:rPr>
         <w:lastRenderedPageBreak/>
         <w:drawing>
-          <wp:inline distT="0" distB="0" distL="0" distR="0" wp14:anchorId="4217D141" wp14:editId="0B7BB028">
+          <wp:inline distT="0" distB="0" distL="0" distR="0" wp14:anchorId="1B97B9E7" wp14:editId="4C27AFED">
             <wp:extent cx="4937760" cy="4462310"/>
             <wp:effectExtent l="19050" t="19050" r="15240" b="14605"/>
-            <wp:docPr id="1906763559" name="Imagem 3"/>
+            <wp:docPr id="633035228" name="Imagem 3"/>
             <wp:cNvGraphicFramePr/>
             <a:graphic xmlns:a="http://schemas.openxmlformats.org/drawingml/2006/main">
               <a:graphicData uri="http://schemas.openxmlformats.org/drawingml/2006/picture">
                 <pic:pic xmlns:pic="http://schemas.openxmlformats.org/drawingml/2006/picture">
                   <pic:nvPicPr>
-                    <pic:cNvPr id="1906763559" name=""/>
+                    <pic:cNvPr id="633035228" name=""/>
                     <pic:cNvPicPr/>
                   </pic:nvPicPr>
                   <pic:blipFill>
@@ -6892,7 +6915,7 @@
           <w:sz w:val="27"/>
         </w:rPr>
       </w:pPr>
-      <w:bookmarkStart w:id="10" w:name="_Toc239952505"/>
+      <w:bookmarkStart w:id="10" w:name="_Toc240009150"/>
       <w:r>
         <w:rPr>
           <w:rFonts w:ascii="Montserrat" w:hAnsi="Montserrat"/>
@@ -6933,16 +6956,16 @@
         </w:rPr>
         <w:lastRenderedPageBreak/>
         <w:drawing>
-          <wp:inline distT="0" distB="0" distL="0" distR="0" wp14:anchorId="2D368CD0" wp14:editId="45CD9DEE">
+          <wp:inline distT="0" distB="0" distL="0" distR="0" wp14:anchorId="267D6041" wp14:editId="5B62B1FD">
             <wp:extent cx="5120640" cy="4627581"/>
             <wp:effectExtent l="19050" t="19050" r="22860" b="20955"/>
-            <wp:docPr id="2021488833" name="Imagem 4"/>
+            <wp:docPr id="327926111" name="Imagem 4"/>
             <wp:cNvGraphicFramePr/>
             <a:graphic xmlns:a="http://schemas.openxmlformats.org/drawingml/2006/main">
               <a:graphicData uri="http://schemas.openxmlformats.org/drawingml/2006/picture">
                 <pic:pic xmlns:pic="http://schemas.openxmlformats.org/drawingml/2006/picture">
                   <pic:nvPicPr>
-                    <pic:cNvPr id="2021488833" name=""/>
+                    <pic:cNvPr id="327926111" name=""/>
                     <pic:cNvPicPr/>
                   </pic:nvPicPr>
                   <pic:blipFill>
@@ -7110,7 +7133,7 @@
           <w:sz w:val="27"/>
         </w:rPr>
       </w:pPr>
-      <w:bookmarkStart w:id="11" w:name="_Toc239952506"/>
+      <w:bookmarkStart w:id="11" w:name="_Toc240009151"/>
       <w:r>
         <w:rPr>
           <w:rFonts w:ascii="Montserrat" w:hAnsi="Montserrat"/>
@@ -7150,16 +7173,16 @@
           <w:noProof/>
         </w:rPr>
         <w:drawing>
-          <wp:inline distT="0" distB="0" distL="0" distR="0" wp14:anchorId="0F4AA6BF" wp14:editId="0AC08E55">
+          <wp:inline distT="0" distB="0" distL="0" distR="0" wp14:anchorId="4C292B22" wp14:editId="39AAA64C">
             <wp:extent cx="4206240" cy="3801227"/>
             <wp:effectExtent l="19050" t="19050" r="22860" b="27940"/>
-            <wp:docPr id="906971874" name="Imagem 5"/>
+            <wp:docPr id="1608827224" name="Imagem 5"/>
             <wp:cNvGraphicFramePr/>
             <a:graphic xmlns:a="http://schemas.openxmlformats.org/drawingml/2006/main">
               <a:graphicData uri="http://schemas.openxmlformats.org/drawingml/2006/picture">
                 <pic:pic xmlns:pic="http://schemas.openxmlformats.org/drawingml/2006/picture">
                   <pic:nvPicPr>
-                    <pic:cNvPr id="906971874" name=""/>
+                    <pic:cNvPr id="1608827224" name=""/>
                     <pic:cNvPicPr/>
                   </pic:nvPicPr>
                   <pic:blipFill>
@@ -7227,16 +7250,16 @@
         </w:rPr>
         <w:lastRenderedPageBreak/>
         <w:drawing>
-          <wp:inline distT="0" distB="0" distL="0" distR="0" wp14:anchorId="4C2BA9FC" wp14:editId="19707837">
+          <wp:inline distT="0" distB="0" distL="0" distR="0" wp14:anchorId="7542F005" wp14:editId="1FC3E811">
             <wp:extent cx="4206240" cy="3801227"/>
             <wp:effectExtent l="19050" t="19050" r="22860" b="27940"/>
-            <wp:docPr id="560416084" name="Imagem 6"/>
+            <wp:docPr id="1614571345" name="Imagem 6"/>
             <wp:cNvGraphicFramePr/>
             <a:graphic xmlns:a="http://schemas.openxmlformats.org/drawingml/2006/main">
               <a:graphicData uri="http://schemas.openxmlformats.org/drawingml/2006/picture">
                 <pic:pic xmlns:pic="http://schemas.openxmlformats.org/drawingml/2006/picture">
                   <pic:nvPicPr>
-                    <pic:cNvPr id="560416084" name=""/>
+                    <pic:cNvPr id="1614571345" name=""/>
                     <pic:cNvPicPr/>
                   </pic:nvPicPr>
                   <pic:blipFill>
@@ -7352,7 +7375,7 @@
           <w:sz w:val="27"/>
         </w:rPr>
       </w:pPr>
-      <w:bookmarkStart w:id="12" w:name="_Toc239952507"/>
+      <w:bookmarkStart w:id="12" w:name="_Toc240009152"/>
       <w:r>
         <w:rPr>
           <w:rFonts w:ascii="Montserrat" w:hAnsi="Montserrat"/>
@@ -7420,7 +7443,7 @@
           <w:sz w:val="27"/>
         </w:rPr>
       </w:pPr>
-      <w:bookmarkStart w:id="13" w:name="_Toc239952508"/>
+      <w:bookmarkStart w:id="13" w:name="_Toc240009153"/>
       <w:r>
         <w:rPr>
           <w:rFonts w:ascii="Montserrat" w:hAnsi="Montserrat"/>
@@ -7647,7 +7670,7 @@
           <w:sz w:val="27"/>
         </w:rPr>
       </w:pPr>
-      <w:bookmarkStart w:id="14" w:name="_Toc239952509"/>
+      <w:bookmarkStart w:id="14" w:name="_Toc240009154"/>
       <w:r>
         <w:rPr>
           <w:rFonts w:ascii="Montserrat" w:hAnsi="Montserrat"/>
@@ -7806,7 +7829,7 @@
           <w:sz w:val="27"/>
         </w:rPr>
       </w:pPr>
-      <w:bookmarkStart w:id="15" w:name="_Toc239952510"/>
+      <w:bookmarkStart w:id="15" w:name="_Toc240009155"/>
       <w:r>
         <w:rPr>
           <w:rFonts w:ascii="Montserrat" w:hAnsi="Montserrat"/>
@@ -7998,7 +8021,7 @@
           <w:sz w:val="27"/>
         </w:rPr>
       </w:pPr>
-      <w:bookmarkStart w:id="16" w:name="_Toc239952511"/>
+      <w:bookmarkStart w:id="16" w:name="_Toc240009156"/>
       <w:r>
         <w:rPr>
           <w:rFonts w:ascii="Montserrat" w:hAnsi="Montserrat"/>
@@ -8037,8 +8060,18 @@
         </w:numPr>
         <w:spacing w:after="80" w:line="260" w:lineRule="auto"/>
         <w:ind w:left="700"/>
-      </w:pPr>
-      <w:r>
+        <w:rPr>
+          <w:rFonts w:ascii="Montserrat" w:hAnsi="Montserrat"/>
+          <w:color w:val="1A1A1A"/>
+          <w:sz w:val="22"/>
+        </w:rPr>
+      </w:pPr>
+      <w:r>
+        <w:rPr>
+          <w:rFonts w:ascii="Montserrat" w:hAnsi="Montserrat"/>
+          <w:color w:val="1A1A1A"/>
+          <w:sz w:val="22"/>
+        </w:rPr>
         <w:t>Se algum pedaco falhar (ex.: instabilidade de rede), aparece um botao Tentar novamente especifico para aquele pedaco - os pedacos ja transcritos com sucesso nao precisam ser refeitos.</w:t>
       </w:r>
     </w:p>
@@ -8116,7 +8149,7 @@
           <w:sz w:val="27"/>
         </w:rPr>
       </w:pPr>
-      <w:bookmarkStart w:id="17" w:name="_Toc239952512"/>
+      <w:bookmarkStart w:id="17" w:name="_Toc240009157"/>
       <w:r>
         <w:rPr>
           <w:rFonts w:ascii="Montserrat" w:hAnsi="Montserrat"/>
@@ -8446,7 +8479,7 @@
           <w:sz w:val="27"/>
         </w:rPr>
       </w:pPr>
-      <w:bookmarkStart w:id="18" w:name="_Toc239952513"/>
+      <w:bookmarkStart w:id="18" w:name="_Toc240009158"/>
       <w:r>
         <w:rPr>
           <w:rFonts w:ascii="Montserrat" w:hAnsi="Montserrat"/>
@@ -8587,7 +8620,7 @@
           <w:sz w:val="34"/>
         </w:rPr>
       </w:pPr>
-      <w:bookmarkStart w:id="19" w:name="_Toc239952514"/>
+      <w:bookmarkStart w:id="19" w:name="_Toc240009159"/>
       <w:r>
         <w:rPr>
           <w:rFonts w:ascii="Montserrat" w:hAnsi="Montserrat"/>
@@ -8629,7 +8662,7 @@
           <w:sz w:val="27"/>
         </w:rPr>
       </w:pPr>
-      <w:bookmarkStart w:id="20" w:name="_Toc239952515"/>
+      <w:bookmarkStart w:id="20" w:name="_Toc240009160"/>
       <w:r>
         <w:rPr>
           <w:rFonts w:ascii="Montserrat" w:hAnsi="Montserrat"/>
@@ -9709,16 +9742,16 @@
         </w:rPr>
         <w:lastRenderedPageBreak/>
         <w:drawing>
-          <wp:inline distT="0" distB="0" distL="0" distR="0" wp14:anchorId="55E1B416" wp14:editId="20CEC16F">
+          <wp:inline distT="0" distB="0" distL="0" distR="0" wp14:anchorId="2D0EE889" wp14:editId="23E01371">
             <wp:extent cx="5120640" cy="4627581"/>
             <wp:effectExtent l="19050" t="19050" r="22860" b="20955"/>
-            <wp:docPr id="542599084" name="Imagem 7"/>
+            <wp:docPr id="236752331" name="Imagem 7"/>
             <wp:cNvGraphicFramePr/>
             <a:graphic xmlns:a="http://schemas.openxmlformats.org/drawingml/2006/main">
               <a:graphicData uri="http://schemas.openxmlformats.org/drawingml/2006/picture">
                 <pic:pic xmlns:pic="http://schemas.openxmlformats.org/drawingml/2006/picture">
                   <pic:nvPicPr>
-                    <pic:cNvPr id="542599084" name=""/>
+                    <pic:cNvPr id="236752331" name=""/>
                     <pic:cNvPicPr/>
                   </pic:nvPicPr>
                   <pic:blipFill>
@@ -9786,16 +9819,16 @@
         </w:rPr>
         <w:lastRenderedPageBreak/>
         <w:drawing>
-          <wp:inline distT="0" distB="0" distL="0" distR="0" wp14:anchorId="3F3F90F7" wp14:editId="27364681">
+          <wp:inline distT="0" distB="0" distL="0" distR="0" wp14:anchorId="32B424B0" wp14:editId="078D6010">
             <wp:extent cx="5120640" cy="4627581"/>
             <wp:effectExtent l="19050" t="19050" r="22860" b="20955"/>
-            <wp:docPr id="1571715858" name="Imagem 8"/>
+            <wp:docPr id="1781713373" name="Imagem 8"/>
             <wp:cNvGraphicFramePr/>
             <a:graphic xmlns:a="http://schemas.openxmlformats.org/drawingml/2006/main">
               <a:graphicData uri="http://schemas.openxmlformats.org/drawingml/2006/picture">
                 <pic:pic xmlns:pic="http://schemas.openxmlformats.org/drawingml/2006/picture">
                   <pic:nvPicPr>
-                    <pic:cNvPr id="1571715858" name=""/>
+                    <pic:cNvPr id="1781713373" name=""/>
                     <pic:cNvPicPr/>
                   </pic:nvPicPr>
                   <pic:blipFill>
@@ -10003,7 +10036,7 @@
           <w:sz w:val="27"/>
         </w:rPr>
       </w:pPr>
-      <w:bookmarkStart w:id="21" w:name="_Toc239952516"/>
+      <w:bookmarkStart w:id="21" w:name="_Toc240009161"/>
       <w:r>
         <w:rPr>
           <w:rFonts w:ascii="Montserrat" w:hAnsi="Montserrat"/>
@@ -10928,16 +10961,16 @@
           <w:noProof/>
         </w:rPr>
         <w:drawing>
-          <wp:inline distT="0" distB="0" distL="0" distR="0" wp14:anchorId="5543E0EF" wp14:editId="6AF14628">
+          <wp:inline distT="0" distB="0" distL="0" distR="0" wp14:anchorId="66C67953" wp14:editId="64C3D232">
             <wp:extent cx="5120640" cy="4627581"/>
             <wp:effectExtent l="19050" t="19050" r="22860" b="20955"/>
-            <wp:docPr id="511798699" name="Imagem 9"/>
+            <wp:docPr id="894724196" name="Imagem 9"/>
             <wp:cNvGraphicFramePr/>
             <a:graphic xmlns:a="http://schemas.openxmlformats.org/drawingml/2006/main">
               <a:graphicData uri="http://schemas.openxmlformats.org/drawingml/2006/picture">
                 <pic:pic xmlns:pic="http://schemas.openxmlformats.org/drawingml/2006/picture">
                   <pic:nvPicPr>
-                    <pic:cNvPr id="511798699" name=""/>
+                    <pic:cNvPr id="894724196" name=""/>
                     <pic:cNvPicPr/>
                   </pic:nvPicPr>
                   <pic:blipFill>
@@ -11005,16 +11038,16 @@
         </w:rPr>
         <w:lastRenderedPageBreak/>
         <w:drawing>
-          <wp:inline distT="0" distB="0" distL="0" distR="0" wp14:anchorId="3AEAA641" wp14:editId="145440AA">
+          <wp:inline distT="0" distB="0" distL="0" distR="0" wp14:anchorId="550AEC85" wp14:editId="321012DA">
             <wp:extent cx="5120640" cy="4627581"/>
             <wp:effectExtent l="19050" t="19050" r="22860" b="20955"/>
-            <wp:docPr id="1654818563" name="Imagem 10"/>
+            <wp:docPr id="985339991" name="Imagem 10"/>
             <wp:cNvGraphicFramePr/>
             <a:graphic xmlns:a="http://schemas.openxmlformats.org/drawingml/2006/main">
               <a:graphicData uri="http://schemas.openxmlformats.org/drawingml/2006/picture">
                 <pic:pic xmlns:pic="http://schemas.openxmlformats.org/drawingml/2006/picture">
                   <pic:nvPicPr>
-                    <pic:cNvPr id="1654818563" name=""/>
+                    <pic:cNvPr id="985339991" name=""/>
                     <pic:cNvPicPr/>
                   </pic:nvPicPr>
                   <pic:blipFill>
@@ -11148,7 +11181,7 @@
           <w:sz w:val="27"/>
         </w:rPr>
       </w:pPr>
-      <w:bookmarkStart w:id="22" w:name="_Toc239952517"/>
+      <w:bookmarkStart w:id="22" w:name="_Toc240009162"/>
       <w:r>
         <w:rPr>
           <w:rFonts w:ascii="Montserrat" w:hAnsi="Montserrat"/>
@@ -12196,16 +12229,16 @@
           <w:noProof/>
         </w:rPr>
         <w:drawing>
-          <wp:inline distT="0" distB="0" distL="0" distR="0" wp14:anchorId="6EBD586F" wp14:editId="3728174D">
+          <wp:inline distT="0" distB="0" distL="0" distR="0" wp14:anchorId="02B57F0A" wp14:editId="7862B561">
             <wp:extent cx="5120640" cy="3338440"/>
             <wp:effectExtent l="19050" t="19050" r="22860" b="14605"/>
-            <wp:docPr id="532644443" name="Imagem 11"/>
+            <wp:docPr id="1974179018" name="Imagem 11"/>
             <wp:cNvGraphicFramePr/>
             <a:graphic xmlns:a="http://schemas.openxmlformats.org/drawingml/2006/main">
               <a:graphicData uri="http://schemas.openxmlformats.org/drawingml/2006/picture">
                 <pic:pic xmlns:pic="http://schemas.openxmlformats.org/drawingml/2006/picture">
                   <pic:nvPicPr>
-                    <pic:cNvPr id="532644443" name=""/>
+                    <pic:cNvPr id="1974179018" name=""/>
                     <pic:cNvPicPr/>
                   </pic:nvPicPr>
                   <pic:blipFill>
@@ -12273,16 +12306,16 @@
         </w:rPr>
         <w:lastRenderedPageBreak/>
         <w:drawing>
-          <wp:inline distT="0" distB="0" distL="0" distR="0" wp14:anchorId="20963269" wp14:editId="30A4F8EB">
+          <wp:inline distT="0" distB="0" distL="0" distR="0" wp14:anchorId="51DF8B7E" wp14:editId="639517B2">
             <wp:extent cx="5120640" cy="4627581"/>
             <wp:effectExtent l="19050" t="19050" r="22860" b="20955"/>
-            <wp:docPr id="796350433" name="Imagem 12"/>
+            <wp:docPr id="1470592002" name="Imagem 12"/>
             <wp:cNvGraphicFramePr/>
             <a:graphic xmlns:a="http://schemas.openxmlformats.org/drawingml/2006/main">
               <a:graphicData uri="http://schemas.openxmlformats.org/drawingml/2006/picture">
                 <pic:pic xmlns:pic="http://schemas.openxmlformats.org/drawingml/2006/picture">
                   <pic:nvPicPr>
-                    <pic:cNvPr id="796350433" name=""/>
+                    <pic:cNvPr id="1470592002" name=""/>
                     <pic:cNvPicPr/>
                   </pic:nvPicPr>
                   <pic:blipFill>
@@ -12389,6 +12422,41 @@
           <w:color w:val="1A1A1A"/>
           <w:sz w:val="22"/>
         </w:rPr>
+        <w:t xml:space="preserve">Dependencia entre marcos: cada marco tambem tem um campo opcional Depende de, onde se digita o nome de outro marco do mesmo cronograma. Se o marco indicado ainda nao tiver Conclusao real e o Termino previsto ja tiver passado, o marco dependente ganha um aviso </w:t>
+      </w:r>
+      <w:r>
+        <w:rPr>
+          <w:rFonts w:ascii="Montserrat" w:hAnsi="Montserrat"/>
+          <w:color w:val="1A1A1A"/>
+          <w:sz w:val="22"/>
+        </w:rPr>
+        <w:t xml:space="preserve">loqueado - visivel no proprio TAP (edicao, detalhes e impressao/exportacao), no espelho do Planejamento e </w:t>
+      </w:r>
+      <w:r>
+        <w:rPr>
+          <w:rFonts w:ascii="Montserrat" w:hAnsi="Montserrat"/>
+          <w:color w:val="1A1A1A"/>
+          <w:sz w:val="22"/>
+        </w:rPr>
+        <w:lastRenderedPageBreak/>
+        <w:t>nos Marcos do Relatorio de Situacao. E uma verificacao simples, de um nivel so e por comparacao de nome - nao calcula um caminho critico completo nem cadeias de varios marcos.</w:t>
+      </w:r>
+    </w:p>
+    <w:p>
+      <w:pPr>
+        <w:spacing w:line="280" w:lineRule="auto"/>
+        <w:rPr>
+          <w:rFonts w:ascii="Montserrat" w:hAnsi="Montserrat"/>
+          <w:color w:val="1A1A1A"/>
+          <w:sz w:val="22"/>
+        </w:rPr>
+      </w:pPr>
+      <w:r>
+        <w:rPr>
+          <w:rFonts w:ascii="Montserrat" w:hAnsi="Montserrat"/>
+          <w:color w:val="1A1A1A"/>
+          <w:sz w:val="22"/>
+        </w:rPr>
         <w:t>Como salvar: clique em Registrar TAP. Um projeto sem TAP aprovado nao deve avancar para a execucao. Ao marcar Aprovado, um e-mail de notificacao e disparado automaticamente (secao 2.8).</w:t>
       </w:r>
     </w:p>
@@ -12413,7 +12481,6 @@
           <w:color w:val="1A1A1A"/>
           <w:sz w:val="22"/>
         </w:rPr>
-        <w:lastRenderedPageBreak/>
         <w:t>No rodape do painel de detalhes de um TAP, os botoes Imprimir e Exportar Word geram o documento no formato oficial do FORALF00338 (incluindo o registro de riscos e as tabelas de cronograma, custos, partes interessadas, equipe e indicadores), pronto para impressao ou para abrir no Word.</w:t>
       </w:r>
     </w:p>
@@ -12452,7 +12519,7 @@
           <w:sz w:val="27"/>
         </w:rPr>
       </w:pPr>
-      <w:bookmarkStart w:id="23" w:name="_Toc239952518"/>
+      <w:bookmarkStart w:id="23" w:name="_Toc240009163"/>
       <w:r>
         <w:rPr>
           <w:rFonts w:ascii="Montserrat" w:hAnsi="Montserrat"/>
@@ -12914,6 +12981,7 @@
                 <w:color w:val="1A1A1A"/>
                 <w:sz w:val="19"/>
               </w:rPr>
+              <w:lastRenderedPageBreak/>
               <w:t>7. Validacao</w:t>
             </w:r>
           </w:p>
@@ -13011,18 +13079,17 @@
         <w:rPr>
           <w:noProof/>
         </w:rPr>
-        <w:lastRenderedPageBreak/>
         <w:drawing>
-          <wp:inline distT="0" distB="0" distL="0" distR="0" wp14:anchorId="6C0A7B61" wp14:editId="143AD1BD">
+          <wp:inline distT="0" distB="0" distL="0" distR="0" wp14:anchorId="4D83CEDF" wp14:editId="11FE98CD">
             <wp:extent cx="5120640" cy="4627581"/>
             <wp:effectExtent l="19050" t="19050" r="22860" b="20955"/>
-            <wp:docPr id="591924702" name="Imagem 13"/>
+            <wp:docPr id="1408040906" name="Imagem 13"/>
             <wp:cNvGraphicFramePr/>
             <a:graphic xmlns:a="http://schemas.openxmlformats.org/drawingml/2006/main">
               <a:graphicData uri="http://schemas.openxmlformats.org/drawingml/2006/picture">
                 <pic:pic xmlns:pic="http://schemas.openxmlformats.org/drawingml/2006/picture">
                   <pic:nvPicPr>
-                    <pic:cNvPr id="591924702" name=""/>
+                    <pic:cNvPr id="1408040906" name=""/>
                     <pic:cNvPicPr/>
                   </pic:nvPicPr>
                   <pic:blipFill>
@@ -13090,16 +13157,16 @@
         </w:rPr>
         <w:lastRenderedPageBreak/>
         <w:drawing>
-          <wp:inline distT="0" distB="0" distL="0" distR="0" wp14:anchorId="14C43AF7" wp14:editId="3A5216DD">
+          <wp:inline distT="0" distB="0" distL="0" distR="0" wp14:anchorId="547E4475" wp14:editId="540432F7">
             <wp:extent cx="5120640" cy="4627581"/>
             <wp:effectExtent l="19050" t="19050" r="22860" b="20955"/>
-            <wp:docPr id="126293685" name="Imagem 14"/>
+            <wp:docPr id="1786403368" name="Imagem 14"/>
             <wp:cNvGraphicFramePr/>
             <a:graphic xmlns:a="http://schemas.openxmlformats.org/drawingml/2006/main">
               <a:graphicData uri="http://schemas.openxmlformats.org/drawingml/2006/picture">
                 <pic:pic xmlns:pic="http://schemas.openxmlformats.org/drawingml/2006/picture">
                   <pic:nvPicPr>
-                    <pic:cNvPr id="126293685" name=""/>
+                    <pic:cNvPr id="1786403368" name=""/>
                     <pic:cNvPicPr/>
                   </pic:nvPicPr>
                   <pic:blipFill>
@@ -13233,7 +13300,7 @@
           <w:sz w:val="27"/>
         </w:rPr>
       </w:pPr>
-      <w:bookmarkStart w:id="24" w:name="_Toc239952519"/>
+      <w:bookmarkStart w:id="24" w:name="_Toc240009164"/>
       <w:r>
         <w:rPr>
           <w:rFonts w:ascii="Montserrat" w:hAnsi="Montserrat"/>
@@ -13274,16 +13341,16 @@
           <w:noProof/>
         </w:rPr>
         <w:drawing>
-          <wp:inline distT="0" distB="0" distL="0" distR="0" wp14:anchorId="05064DDA" wp14:editId="7B06131E">
+          <wp:inline distT="0" distB="0" distL="0" distR="0" wp14:anchorId="07FCC1B1" wp14:editId="1256252F">
             <wp:extent cx="5120640" cy="4627581"/>
             <wp:effectExtent l="19050" t="19050" r="22860" b="20955"/>
-            <wp:docPr id="429998992" name="Imagem 15"/>
+            <wp:docPr id="1970611713" name="Imagem 15"/>
             <wp:cNvGraphicFramePr/>
             <a:graphic xmlns:a="http://schemas.openxmlformats.org/drawingml/2006/main">
               <a:graphicData uri="http://schemas.openxmlformats.org/drawingml/2006/picture">
                 <pic:pic xmlns:pic="http://schemas.openxmlformats.org/drawingml/2006/picture">
                   <pic:nvPicPr>
-                    <pic:cNvPr id="429998992" name=""/>
+                    <pic:cNvPr id="1970611713" name=""/>
                     <pic:cNvPicPr/>
                   </pic:nvPicPr>
                   <pic:blipFill>
@@ -13351,16 +13418,16 @@
         </w:rPr>
         <w:lastRenderedPageBreak/>
         <w:drawing>
-          <wp:inline distT="0" distB="0" distL="0" distR="0" wp14:anchorId="7BE2DD68" wp14:editId="334530DE">
+          <wp:inline distT="0" distB="0" distL="0" distR="0" wp14:anchorId="4865071B" wp14:editId="6E5F07CB">
             <wp:extent cx="5120640" cy="4627581"/>
             <wp:effectExtent l="19050" t="19050" r="22860" b="20955"/>
-            <wp:docPr id="1914413885" name="Imagem 16"/>
+            <wp:docPr id="538593480" name="Imagem 16"/>
             <wp:cNvGraphicFramePr/>
             <a:graphic xmlns:a="http://schemas.openxmlformats.org/drawingml/2006/main">
               <a:graphicData uri="http://schemas.openxmlformats.org/drawingml/2006/picture">
                 <pic:pic xmlns:pic="http://schemas.openxmlformats.org/drawingml/2006/picture">
                   <pic:nvPicPr>
-                    <pic:cNvPr id="1914413885" name=""/>
+                    <pic:cNvPr id="538593480" name=""/>
                     <pic:cNvPicPr/>
                   </pic:nvPicPr>
                   <pic:blipFill>
@@ -13524,16 +13591,16 @@
         </w:rPr>
         <w:lastRenderedPageBreak/>
         <w:drawing>
-          <wp:inline distT="0" distB="0" distL="0" distR="0" wp14:anchorId="4A7B3A46" wp14:editId="056F61A9">
+          <wp:inline distT="0" distB="0" distL="0" distR="0" wp14:anchorId="1FE390AD" wp14:editId="69BC68E3">
             <wp:extent cx="5120640" cy="3282818"/>
             <wp:effectExtent l="19050" t="19050" r="22860" b="13335"/>
-            <wp:docPr id="2042532154" name="Imagem 17"/>
+            <wp:docPr id="2027931060" name="Imagem 17"/>
             <wp:cNvGraphicFramePr/>
             <a:graphic xmlns:a="http://schemas.openxmlformats.org/drawingml/2006/main">
               <a:graphicData uri="http://schemas.openxmlformats.org/drawingml/2006/picture">
                 <pic:pic xmlns:pic="http://schemas.openxmlformats.org/drawingml/2006/picture">
                   <pic:nvPicPr>
-                    <pic:cNvPr id="2042532154" name=""/>
+                    <pic:cNvPr id="2027931060" name=""/>
                     <pic:cNvPicPr/>
                   </pic:nvPicPr>
                   <pic:blipFill>
@@ -13667,7 +13734,7 @@
           <w:sz w:val="27"/>
         </w:rPr>
       </w:pPr>
-      <w:bookmarkStart w:id="25" w:name="_Toc239952520"/>
+      <w:bookmarkStart w:id="25" w:name="_Toc240009165"/>
       <w:r>
         <w:rPr>
           <w:rFonts w:ascii="Montserrat" w:hAnsi="Montserrat"/>
@@ -13708,16 +13775,16 @@
         </w:rPr>
         <w:lastRenderedPageBreak/>
         <w:drawing>
-          <wp:inline distT="0" distB="0" distL="0" distR="0" wp14:anchorId="34212E4D" wp14:editId="44D20E42">
+          <wp:inline distT="0" distB="0" distL="0" distR="0" wp14:anchorId="304C32BA" wp14:editId="39F7A683">
             <wp:extent cx="5120640" cy="4627581"/>
             <wp:effectExtent l="19050" t="19050" r="22860" b="20955"/>
-            <wp:docPr id="844261591" name="Imagem 18"/>
+            <wp:docPr id="1576293567" name="Imagem 18"/>
             <wp:cNvGraphicFramePr/>
             <a:graphic xmlns:a="http://schemas.openxmlformats.org/drawingml/2006/main">
               <a:graphicData uri="http://schemas.openxmlformats.org/drawingml/2006/picture">
                 <pic:pic xmlns:pic="http://schemas.openxmlformats.org/drawingml/2006/picture">
                   <pic:nvPicPr>
-                    <pic:cNvPr id="844261591" name=""/>
+                    <pic:cNvPr id="1576293567" name=""/>
                     <pic:cNvPicPr/>
                   </pic:nvPicPr>
                   <pic:blipFill>
@@ -13785,16 +13852,16 @@
         </w:rPr>
         <w:lastRenderedPageBreak/>
         <w:drawing>
-          <wp:inline distT="0" distB="0" distL="0" distR="0" wp14:anchorId="0EE13667" wp14:editId="464F3BB6">
+          <wp:inline distT="0" distB="0" distL="0" distR="0" wp14:anchorId="1CA69B65" wp14:editId="680B595E">
             <wp:extent cx="5120640" cy="4627581"/>
             <wp:effectExtent l="19050" t="19050" r="22860" b="20955"/>
-            <wp:docPr id="1571095393" name="Imagem 19"/>
+            <wp:docPr id="1804777164" name="Imagem 19"/>
             <wp:cNvGraphicFramePr/>
             <a:graphic xmlns:a="http://schemas.openxmlformats.org/drawingml/2006/main">
               <a:graphicData uri="http://schemas.openxmlformats.org/drawingml/2006/picture">
                 <pic:pic xmlns:pic="http://schemas.openxmlformats.org/drawingml/2006/picture">
                   <pic:nvPicPr>
-                    <pic:cNvPr id="1571095393" name=""/>
+                    <pic:cNvPr id="1804777164" name=""/>
                     <pic:cNvPicPr/>
                   </pic:nvPicPr>
                   <pic:blipFill>
@@ -13977,7 +14044,7 @@
           <w:sz w:val="27"/>
         </w:rPr>
       </w:pPr>
-      <w:bookmarkStart w:id="26" w:name="_Toc239952521"/>
+      <w:bookmarkStart w:id="26" w:name="_Toc240009166"/>
       <w:r>
         <w:rPr>
           <w:rFonts w:ascii="Montserrat" w:hAnsi="Montserrat"/>
@@ -14017,16 +14084,16 @@
           <w:noProof/>
         </w:rPr>
         <w:drawing>
-          <wp:inline distT="0" distB="0" distL="0" distR="0" wp14:anchorId="2C281C1B" wp14:editId="0922DCE7">
+          <wp:inline distT="0" distB="0" distL="0" distR="0" wp14:anchorId="69CE246C" wp14:editId="17274876">
             <wp:extent cx="5120640" cy="4627581"/>
             <wp:effectExtent l="19050" t="19050" r="22860" b="20955"/>
-            <wp:docPr id="124512689" name="Imagem 20"/>
+            <wp:docPr id="1085526115" name="Imagem 20"/>
             <wp:cNvGraphicFramePr/>
             <a:graphic xmlns:a="http://schemas.openxmlformats.org/drawingml/2006/main">
               <a:graphicData uri="http://schemas.openxmlformats.org/drawingml/2006/picture">
                 <pic:pic xmlns:pic="http://schemas.openxmlformats.org/drawingml/2006/picture">
                   <pic:nvPicPr>
-                    <pic:cNvPr id="124512689" name=""/>
+                    <pic:cNvPr id="1085526115" name=""/>
                     <pic:cNvPicPr/>
                   </pic:nvPicPr>
                   <pic:blipFill>
@@ -14094,16 +14161,16 @@
         </w:rPr>
         <w:lastRenderedPageBreak/>
         <w:drawing>
-          <wp:inline distT="0" distB="0" distL="0" distR="0" wp14:anchorId="41E2B73C" wp14:editId="3FCE6AFB">
+          <wp:inline distT="0" distB="0" distL="0" distR="0" wp14:anchorId="29C9738F" wp14:editId="7CA99D21">
             <wp:extent cx="5120640" cy="4627581"/>
             <wp:effectExtent l="19050" t="19050" r="22860" b="20955"/>
-            <wp:docPr id="2120662936" name="Imagem 21"/>
+            <wp:docPr id="136698796" name="Imagem 21"/>
             <wp:cNvGraphicFramePr/>
             <a:graphic xmlns:a="http://schemas.openxmlformats.org/drawingml/2006/main">
               <a:graphicData uri="http://schemas.openxmlformats.org/drawingml/2006/picture">
                 <pic:pic xmlns:pic="http://schemas.openxmlformats.org/drawingml/2006/picture">
                   <pic:nvPicPr>
-                    <pic:cNvPr id="2120662936" name=""/>
+                    <pic:cNvPr id="136698796" name=""/>
                     <pic:cNvPicPr/>
                   </pic:nvPicPr>
                   <pic:blipFill>
@@ -14309,16 +14376,16 @@
           <w:noProof/>
         </w:rPr>
         <w:drawing>
-          <wp:inline distT="0" distB="0" distL="0" distR="0" wp14:anchorId="5CC4504A" wp14:editId="56DF9D2A">
+          <wp:inline distT="0" distB="0" distL="0" distR="0" wp14:anchorId="2FDB1202" wp14:editId="083DB380">
             <wp:extent cx="5120640" cy="1757287"/>
             <wp:effectExtent l="19050" t="19050" r="22860" b="14605"/>
-            <wp:docPr id="539009087" name="Imagem 22"/>
+            <wp:docPr id="1999059796" name="Imagem 22"/>
             <wp:cNvGraphicFramePr/>
             <a:graphic xmlns:a="http://schemas.openxmlformats.org/drawingml/2006/main">
               <a:graphicData uri="http://schemas.openxmlformats.org/drawingml/2006/picture">
                 <pic:pic xmlns:pic="http://schemas.openxmlformats.org/drawingml/2006/picture">
                   <pic:nvPicPr>
-                    <pic:cNvPr id="539009087" name=""/>
+                    <pic:cNvPr id="1999059796" name=""/>
                     <pic:cNvPicPr/>
                   </pic:nvPicPr>
                   <pic:blipFill>
@@ -14431,7 +14498,7 @@
           <w:sz w:val="27"/>
         </w:rPr>
       </w:pPr>
-      <w:bookmarkStart w:id="27" w:name="_Toc239952522"/>
+      <w:bookmarkStart w:id="27" w:name="_Toc240009167"/>
       <w:r>
         <w:rPr>
           <w:rFonts w:ascii="Montserrat" w:hAnsi="Montserrat"/>
@@ -14472,16 +14539,16 @@
         </w:rPr>
         <w:lastRenderedPageBreak/>
         <w:drawing>
-          <wp:inline distT="0" distB="0" distL="0" distR="0" wp14:anchorId="6FAF06AF" wp14:editId="0ADCA116">
+          <wp:inline distT="0" distB="0" distL="0" distR="0" wp14:anchorId="5214578C" wp14:editId="743BB70B">
             <wp:extent cx="5120640" cy="4627581"/>
             <wp:effectExtent l="19050" t="19050" r="22860" b="20955"/>
-            <wp:docPr id="579667661" name="Imagem 23"/>
+            <wp:docPr id="1406102484" name="Imagem 23"/>
             <wp:cNvGraphicFramePr/>
             <a:graphic xmlns:a="http://schemas.openxmlformats.org/drawingml/2006/main">
               <a:graphicData uri="http://schemas.openxmlformats.org/drawingml/2006/picture">
                 <pic:pic xmlns:pic="http://schemas.openxmlformats.org/drawingml/2006/picture">
                   <pic:nvPicPr>
-                    <pic:cNvPr id="579667661" name=""/>
+                    <pic:cNvPr id="1406102484" name=""/>
                     <pic:cNvPicPr/>
                   </pic:nvPicPr>
                   <pic:blipFill>
@@ -14549,16 +14616,16 @@
         </w:rPr>
         <w:lastRenderedPageBreak/>
         <w:drawing>
-          <wp:inline distT="0" distB="0" distL="0" distR="0" wp14:anchorId="2DAE6701" wp14:editId="5AAB6C2B">
+          <wp:inline distT="0" distB="0" distL="0" distR="0" wp14:anchorId="785957DC" wp14:editId="0C870050">
             <wp:extent cx="5120640" cy="4627581"/>
             <wp:effectExtent l="19050" t="19050" r="22860" b="20955"/>
-            <wp:docPr id="1293963581" name="Imagem 24"/>
+            <wp:docPr id="806883381" name="Imagem 24"/>
             <wp:cNvGraphicFramePr/>
             <a:graphic xmlns:a="http://schemas.openxmlformats.org/drawingml/2006/main">
               <a:graphicData uri="http://schemas.openxmlformats.org/drawingml/2006/picture">
                 <pic:pic xmlns:pic="http://schemas.openxmlformats.org/drawingml/2006/picture">
                   <pic:nvPicPr>
-                    <pic:cNvPr id="1293963581" name=""/>
+                    <pic:cNvPr id="806883381" name=""/>
                     <pic:cNvPicPr/>
                   </pic:nvPicPr>
                   <pic:blipFill>
@@ -14795,7 +14862,7 @@
           <w:sz w:val="27"/>
         </w:rPr>
       </w:pPr>
-      <w:bookmarkStart w:id="28" w:name="_Toc239952523"/>
+      <w:bookmarkStart w:id="28" w:name="_Toc240009168"/>
       <w:r>
         <w:rPr>
           <w:rFonts w:ascii="Montserrat" w:hAnsi="Montserrat"/>
@@ -14835,16 +14902,16 @@
           <w:noProof/>
         </w:rPr>
         <w:drawing>
-          <wp:inline distT="0" distB="0" distL="0" distR="0" wp14:anchorId="4F99F6CA" wp14:editId="31C4CFE3">
+          <wp:inline distT="0" distB="0" distL="0" distR="0" wp14:anchorId="13296403" wp14:editId="44A17143">
             <wp:extent cx="5120640" cy="4627581"/>
             <wp:effectExtent l="19050" t="19050" r="22860" b="20955"/>
-            <wp:docPr id="435224327" name="Imagem 25"/>
+            <wp:docPr id="722141524" name="Imagem 25"/>
             <wp:cNvGraphicFramePr/>
             <a:graphic xmlns:a="http://schemas.openxmlformats.org/drawingml/2006/main">
               <a:graphicData uri="http://schemas.openxmlformats.org/drawingml/2006/picture">
                 <pic:pic xmlns:pic="http://schemas.openxmlformats.org/drawingml/2006/picture">
                   <pic:nvPicPr>
-                    <pic:cNvPr id="435224327" name=""/>
+                    <pic:cNvPr id="722141524" name=""/>
                     <pic:cNvPicPr/>
                   </pic:nvPicPr>
                   <pic:blipFill>
@@ -14912,16 +14979,16 @@
         </w:rPr>
         <w:lastRenderedPageBreak/>
         <w:drawing>
-          <wp:inline distT="0" distB="0" distL="0" distR="0" wp14:anchorId="29A13F1C" wp14:editId="7EB58A45">
+          <wp:inline distT="0" distB="0" distL="0" distR="0" wp14:anchorId="0031318F" wp14:editId="44168EEB">
             <wp:extent cx="5120640" cy="4627581"/>
             <wp:effectExtent l="19050" t="19050" r="22860" b="20955"/>
-            <wp:docPr id="1800055134" name="Imagem 26"/>
+            <wp:docPr id="1446238286" name="Imagem 26"/>
             <wp:cNvGraphicFramePr/>
             <a:graphic xmlns:a="http://schemas.openxmlformats.org/drawingml/2006/main">
               <a:graphicData uri="http://schemas.openxmlformats.org/drawingml/2006/picture">
                 <pic:pic xmlns:pic="http://schemas.openxmlformats.org/drawingml/2006/picture">
                   <pic:nvPicPr>
-                    <pic:cNvPr id="1800055134" name=""/>
+                    <pic:cNvPr id="1446238286" name=""/>
                     <pic:cNvPicPr/>
                   </pic:nvPicPr>
                   <pic:blipFill>
@@ -15112,7 +15179,7 @@
           <w:sz w:val="27"/>
         </w:rPr>
       </w:pPr>
-      <w:bookmarkStart w:id="29" w:name="_Toc239952524"/>
+      <w:bookmarkStart w:id="29" w:name="_Toc240009169"/>
       <w:r>
         <w:rPr>
           <w:rFonts w:ascii="Montserrat" w:hAnsi="Montserrat"/>
@@ -15152,16 +15219,16 @@
           <w:noProof/>
         </w:rPr>
         <w:drawing>
-          <wp:inline distT="0" distB="0" distL="0" distR="0" wp14:anchorId="450CAF26" wp14:editId="5A0F5659">
+          <wp:inline distT="0" distB="0" distL="0" distR="0" wp14:anchorId="33152CCD" wp14:editId="2C6E551C">
             <wp:extent cx="5120640" cy="4000682"/>
             <wp:effectExtent l="19050" t="19050" r="22860" b="19050"/>
-            <wp:docPr id="8137043" name="Imagem 27"/>
+            <wp:docPr id="1222046057" name="Imagem 27"/>
             <wp:cNvGraphicFramePr/>
             <a:graphic xmlns:a="http://schemas.openxmlformats.org/drawingml/2006/main">
               <a:graphicData uri="http://schemas.openxmlformats.org/drawingml/2006/picture">
                 <pic:pic xmlns:pic="http://schemas.openxmlformats.org/drawingml/2006/picture">
                   <pic:nvPicPr>
-                    <pic:cNvPr id="8137043" name=""/>
+                    <pic:cNvPr id="1222046057" name=""/>
                     <pic:cNvPicPr/>
                   </pic:nvPicPr>
                   <pic:blipFill>
@@ -15685,7 +15752,7 @@
           <w:sz w:val="34"/>
         </w:rPr>
       </w:pPr>
-      <w:bookmarkStart w:id="30" w:name="_Toc239952525"/>
+      <w:bookmarkStart w:id="30" w:name="_Toc240009170"/>
       <w:r>
         <w:rPr>
           <w:rFonts w:ascii="Montserrat" w:hAnsi="Montserrat"/>
@@ -15727,7 +15794,7 @@
           <w:sz w:val="27"/>
         </w:rPr>
       </w:pPr>
-      <w:bookmarkStart w:id="31" w:name="_Toc239952526"/>
+      <w:bookmarkStart w:id="31" w:name="_Toc240009171"/>
       <w:r>
         <w:rPr>
           <w:rFonts w:ascii="Montserrat" w:hAnsi="Montserrat"/>
@@ -15767,16 +15834,16 @@
           <w:noProof/>
         </w:rPr>
         <w:drawing>
-          <wp:inline distT="0" distB="0" distL="0" distR="0" wp14:anchorId="0205D998" wp14:editId="71035FCC">
+          <wp:inline distT="0" distB="0" distL="0" distR="0" wp14:anchorId="443653E7" wp14:editId="78AB7347">
             <wp:extent cx="5120640" cy="4627581"/>
             <wp:effectExtent l="19050" t="19050" r="22860" b="20955"/>
-            <wp:docPr id="1665855676" name="Imagem 28"/>
+            <wp:docPr id="895761610" name="Imagem 28"/>
             <wp:cNvGraphicFramePr/>
             <a:graphic xmlns:a="http://schemas.openxmlformats.org/drawingml/2006/main">
               <a:graphicData uri="http://schemas.openxmlformats.org/drawingml/2006/picture">
                 <pic:pic xmlns:pic="http://schemas.openxmlformats.org/drawingml/2006/picture">
                   <pic:nvPicPr>
-                    <pic:cNvPr id="1665855676" name=""/>
+                    <pic:cNvPr id="895761610" name=""/>
                     <pic:cNvPicPr/>
                   </pic:nvPicPr>
                   <pic:blipFill>
@@ -15844,16 +15911,16 @@
         </w:rPr>
         <w:lastRenderedPageBreak/>
         <w:drawing>
-          <wp:inline distT="0" distB="0" distL="0" distR="0" wp14:anchorId="4F9CBAA9" wp14:editId="0A938298">
+          <wp:inline distT="0" distB="0" distL="0" distR="0" wp14:anchorId="3347BCBB" wp14:editId="63DD2073">
             <wp:extent cx="5120640" cy="4627581"/>
             <wp:effectExtent l="19050" t="19050" r="22860" b="20955"/>
-            <wp:docPr id="28649278" name="Imagem 29"/>
+            <wp:docPr id="1596216107" name="Imagem 29"/>
             <wp:cNvGraphicFramePr/>
             <a:graphic xmlns:a="http://schemas.openxmlformats.org/drawingml/2006/main">
               <a:graphicData uri="http://schemas.openxmlformats.org/drawingml/2006/picture">
                 <pic:pic xmlns:pic="http://schemas.openxmlformats.org/drawingml/2006/picture">
                   <pic:nvPicPr>
-                    <pic:cNvPr id="28649278" name=""/>
+                    <pic:cNvPr id="1596216107" name=""/>
                     <pic:cNvPicPr/>
                   </pic:nvPicPr>
                   <pic:blipFill>
@@ -15921,16 +15988,16 @@
         </w:rPr>
         <w:lastRenderedPageBreak/>
         <w:drawing>
-          <wp:inline distT="0" distB="0" distL="0" distR="0" wp14:anchorId="6C9A218C" wp14:editId="332006A1">
+          <wp:inline distT="0" distB="0" distL="0" distR="0" wp14:anchorId="3D2054C3" wp14:editId="11C8AE60">
             <wp:extent cx="5120640" cy="4627581"/>
             <wp:effectExtent l="19050" t="19050" r="22860" b="20955"/>
-            <wp:docPr id="2038196746" name="Imagem 30"/>
+            <wp:docPr id="715521706" name="Imagem 30"/>
             <wp:cNvGraphicFramePr/>
             <a:graphic xmlns:a="http://schemas.openxmlformats.org/drawingml/2006/main">
               <a:graphicData uri="http://schemas.openxmlformats.org/drawingml/2006/picture">
                 <pic:pic xmlns:pic="http://schemas.openxmlformats.org/drawingml/2006/picture">
                   <pic:nvPicPr>
-                    <pic:cNvPr id="2038196746" name=""/>
+                    <pic:cNvPr id="715521706" name=""/>
                     <pic:cNvPicPr/>
                   </pic:nvPicPr>
                   <pic:blipFill>
@@ -16124,16 +16191,16 @@
           <w:noProof/>
         </w:rPr>
         <w:drawing>
-          <wp:inline distT="0" distB="0" distL="0" distR="0" wp14:anchorId="55F2E1A7" wp14:editId="71CD58F6">
+          <wp:inline distT="0" distB="0" distL="0" distR="0" wp14:anchorId="78D61090" wp14:editId="2CAA75DA">
             <wp:extent cx="5120640" cy="1715571"/>
             <wp:effectExtent l="19050" t="19050" r="22860" b="18415"/>
-            <wp:docPr id="1218710796" name="Imagem 31"/>
+            <wp:docPr id="1317929067" name="Imagem 31"/>
             <wp:cNvGraphicFramePr/>
             <a:graphic xmlns:a="http://schemas.openxmlformats.org/drawingml/2006/main">
               <a:graphicData uri="http://schemas.openxmlformats.org/drawingml/2006/picture">
                 <pic:pic xmlns:pic="http://schemas.openxmlformats.org/drawingml/2006/picture">
                   <pic:nvPicPr>
-                    <pic:cNvPr id="1218710796" name=""/>
+                    <pic:cNvPr id="1317929067" name=""/>
                     <pic:cNvPicPr/>
                   </pic:nvPicPr>
                   <pic:blipFill>
@@ -16279,16 +16346,16 @@
           <w:noProof/>
         </w:rPr>
         <w:drawing>
-          <wp:inline distT="0" distB="0" distL="0" distR="0" wp14:anchorId="2D951D32" wp14:editId="1AC955CB">
+          <wp:inline distT="0" distB="0" distL="0" distR="0" wp14:anchorId="0C6A0C15" wp14:editId="00538E28">
             <wp:extent cx="5120640" cy="3282818"/>
             <wp:effectExtent l="19050" t="19050" r="22860" b="13335"/>
-            <wp:docPr id="1149066438" name="Imagem 32"/>
+            <wp:docPr id="595697664" name="Imagem 32"/>
             <wp:cNvGraphicFramePr/>
             <a:graphic xmlns:a="http://schemas.openxmlformats.org/drawingml/2006/main">
               <a:graphicData uri="http://schemas.openxmlformats.org/drawingml/2006/picture">
                 <pic:pic xmlns:pic="http://schemas.openxmlformats.org/drawingml/2006/picture">
                   <pic:nvPicPr>
-                    <pic:cNvPr id="1149066438" name=""/>
+                    <pic:cNvPr id="595697664" name=""/>
                     <pic:cNvPicPr/>
                   </pic:nvPicPr>
                   <pic:blipFill>
@@ -16401,16 +16468,16 @@
         </w:rPr>
         <w:lastRenderedPageBreak/>
         <w:drawing>
-          <wp:inline distT="0" distB="0" distL="0" distR="0" wp14:anchorId="3673EFFC" wp14:editId="1CF730A5">
+          <wp:inline distT="0" distB="0" distL="0" distR="0" wp14:anchorId="50430A5D" wp14:editId="1F32C3FF">
             <wp:extent cx="5120640" cy="951357"/>
             <wp:effectExtent l="19050" t="19050" r="22860" b="20320"/>
-            <wp:docPr id="518780335" name="Imagem 33"/>
+            <wp:docPr id="1979974" name="Imagem 33"/>
             <wp:cNvGraphicFramePr/>
             <a:graphic xmlns:a="http://schemas.openxmlformats.org/drawingml/2006/main">
               <a:graphicData uri="http://schemas.openxmlformats.org/drawingml/2006/picture">
                 <pic:pic xmlns:pic="http://schemas.openxmlformats.org/drawingml/2006/picture">
                   <pic:nvPicPr>
-                    <pic:cNvPr id="518780335" name=""/>
+                    <pic:cNvPr id="1979974" name=""/>
                     <pic:cNvPicPr/>
                   </pic:nvPicPr>
                   <pic:blipFill>
@@ -16522,16 +16589,16 @@
           <w:noProof/>
         </w:rPr>
         <w:drawing>
-          <wp:inline distT="0" distB="0" distL="0" distR="0" wp14:anchorId="15B72092" wp14:editId="3730E59F">
+          <wp:inline distT="0" distB="0" distL="0" distR="0" wp14:anchorId="70B88BAB" wp14:editId="683C28AD">
             <wp:extent cx="5120640" cy="1515102"/>
             <wp:effectExtent l="19050" t="19050" r="22860" b="28575"/>
-            <wp:docPr id="890276465" name="Imagem 34"/>
+            <wp:docPr id="2076534662" name="Imagem 34"/>
             <wp:cNvGraphicFramePr/>
             <a:graphic xmlns:a="http://schemas.openxmlformats.org/drawingml/2006/main">
               <a:graphicData uri="http://schemas.openxmlformats.org/drawingml/2006/picture">
                 <pic:pic xmlns:pic="http://schemas.openxmlformats.org/drawingml/2006/picture">
                   <pic:nvPicPr>
-                    <pic:cNvPr id="890276465" name=""/>
+                    <pic:cNvPr id="2076534662" name=""/>
                     <pic:cNvPicPr/>
                   </pic:nvPicPr>
                   <pic:blipFill>
@@ -16653,16 +16720,16 @@
           <w:noProof/>
         </w:rPr>
         <w:drawing>
-          <wp:inline distT="0" distB="0" distL="0" distR="0" wp14:anchorId="320EF9E5" wp14:editId="5FF6D399">
+          <wp:inline distT="0" distB="0" distL="0" distR="0" wp14:anchorId="110A47A0" wp14:editId="051D4416">
             <wp:extent cx="5120640" cy="1391113"/>
             <wp:effectExtent l="19050" t="19050" r="22860" b="19050"/>
-            <wp:docPr id="2134791" name="Imagem 35"/>
+            <wp:docPr id="1344638178" name="Imagem 35"/>
             <wp:cNvGraphicFramePr/>
             <a:graphic xmlns:a="http://schemas.openxmlformats.org/drawingml/2006/main">
               <a:graphicData uri="http://schemas.openxmlformats.org/drawingml/2006/picture">
                 <pic:pic xmlns:pic="http://schemas.openxmlformats.org/drawingml/2006/picture">
                   <pic:nvPicPr>
-                    <pic:cNvPr id="2134791" name=""/>
+                    <pic:cNvPr id="1344638178" name=""/>
                     <pic:cNvPicPr/>
                   </pic:nvPicPr>
                   <pic:blipFill>
@@ -16774,16 +16841,16 @@
           <w:noProof/>
         </w:rPr>
         <w:drawing>
-          <wp:inline distT="0" distB="0" distL="0" distR="0" wp14:anchorId="64FC1EE1" wp14:editId="1B7522B0">
+          <wp:inline distT="0" distB="0" distL="0" distR="0" wp14:anchorId="1ADBBA1F" wp14:editId="5EB7ADCC">
             <wp:extent cx="5120640" cy="1125174"/>
             <wp:effectExtent l="19050" t="19050" r="22860" b="18415"/>
-            <wp:docPr id="5935628" name="Imagem 36"/>
+            <wp:docPr id="1932427460" name="Imagem 36"/>
             <wp:cNvGraphicFramePr/>
             <a:graphic xmlns:a="http://schemas.openxmlformats.org/drawingml/2006/main">
               <a:graphicData uri="http://schemas.openxmlformats.org/drawingml/2006/picture">
                 <pic:pic xmlns:pic="http://schemas.openxmlformats.org/drawingml/2006/picture">
                   <pic:nvPicPr>
-                    <pic:cNvPr id="5935628" name=""/>
+                    <pic:cNvPr id="1932427460" name=""/>
                     <pic:cNvPicPr/>
                   </pic:nvPicPr>
                   <pic:blipFill>
@@ -16872,7 +16939,7 @@
           <w:sz w:val="27"/>
         </w:rPr>
       </w:pPr>
-      <w:bookmarkStart w:id="32" w:name="_Toc239952527"/>
+      <w:bookmarkStart w:id="32" w:name="_Toc240009172"/>
       <w:r>
         <w:rPr>
           <w:rFonts w:ascii="Montserrat" w:hAnsi="Montserrat"/>
@@ -16913,16 +16980,16 @@
           <w:noProof/>
         </w:rPr>
         <w:drawing>
-          <wp:inline distT="0" distB="0" distL="0" distR="0" wp14:anchorId="7B4E0C9F" wp14:editId="1775021B">
+          <wp:inline distT="0" distB="0" distL="0" distR="0" wp14:anchorId="1A87B755" wp14:editId="6750E169">
             <wp:extent cx="5120640" cy="4627581"/>
             <wp:effectExtent l="19050" t="19050" r="22860" b="20955"/>
-            <wp:docPr id="903025315" name="Imagem 37"/>
+            <wp:docPr id="526600239" name="Imagem 37"/>
             <wp:cNvGraphicFramePr/>
             <a:graphic xmlns:a="http://schemas.openxmlformats.org/drawingml/2006/main">
               <a:graphicData uri="http://schemas.openxmlformats.org/drawingml/2006/picture">
                 <pic:pic xmlns:pic="http://schemas.openxmlformats.org/drawingml/2006/picture">
                   <pic:nvPicPr>
-                    <pic:cNvPr id="903025315" name=""/>
+                    <pic:cNvPr id="526600239" name=""/>
                     <pic:cNvPicPr/>
                   </pic:nvPicPr>
                   <pic:blipFill>
@@ -16990,16 +17057,16 @@
         </w:rPr>
         <w:lastRenderedPageBreak/>
         <w:drawing>
-          <wp:inline distT="0" distB="0" distL="0" distR="0" wp14:anchorId="5F119600" wp14:editId="6183C7C7">
+          <wp:inline distT="0" distB="0" distL="0" distR="0" wp14:anchorId="43372C63" wp14:editId="1C917299">
             <wp:extent cx="5120640" cy="4627581"/>
             <wp:effectExtent l="19050" t="19050" r="22860" b="20955"/>
-            <wp:docPr id="1465970327" name="Imagem 38"/>
+            <wp:docPr id="1486225983" name="Imagem 38"/>
             <wp:cNvGraphicFramePr/>
             <a:graphic xmlns:a="http://schemas.openxmlformats.org/drawingml/2006/main">
               <a:graphicData uri="http://schemas.openxmlformats.org/drawingml/2006/picture">
                 <pic:pic xmlns:pic="http://schemas.openxmlformats.org/drawingml/2006/picture">
                   <pic:nvPicPr>
-                    <pic:cNvPr id="1465970327" name=""/>
+                    <pic:cNvPr id="1486225983" name=""/>
                     <pic:cNvPicPr/>
                   </pic:nvPicPr>
                   <pic:blipFill>
@@ -17168,16 +17235,16 @@
           <w:noProof/>
         </w:rPr>
         <w:drawing>
-          <wp:inline distT="0" distB="0" distL="0" distR="0" wp14:anchorId="1A26D8D2" wp14:editId="1C42E474">
+          <wp:inline distT="0" distB="0" distL="0" distR="0" wp14:anchorId="5680E9C0" wp14:editId="17521A87">
             <wp:extent cx="5120640" cy="2144319"/>
             <wp:effectExtent l="19050" t="19050" r="22860" b="27940"/>
-            <wp:docPr id="950707150" name="Imagem 39"/>
+            <wp:docPr id="797260135" name="Imagem 39"/>
             <wp:cNvGraphicFramePr/>
             <a:graphic xmlns:a="http://schemas.openxmlformats.org/drawingml/2006/main">
               <a:graphicData uri="http://schemas.openxmlformats.org/drawingml/2006/picture">
                 <pic:pic xmlns:pic="http://schemas.openxmlformats.org/drawingml/2006/picture">
                   <pic:nvPicPr>
-                    <pic:cNvPr id="950707150" name=""/>
+                    <pic:cNvPr id="797260135" name=""/>
                     <pic:cNvPicPr/>
                   </pic:nvPicPr>
                   <pic:blipFill>
@@ -17265,16 +17332,16 @@
           <w:noProof/>
         </w:rPr>
         <w:drawing>
-          <wp:inline distT="0" distB="0" distL="0" distR="0" wp14:anchorId="09399EAF" wp14:editId="58151A13">
+          <wp:inline distT="0" distB="0" distL="0" distR="0" wp14:anchorId="042C999B" wp14:editId="35D2AAB9">
             <wp:extent cx="5120640" cy="1055647"/>
             <wp:effectExtent l="19050" t="19050" r="22860" b="11430"/>
-            <wp:docPr id="1682716721" name="Imagem 40"/>
+            <wp:docPr id="2125868648" name="Imagem 40"/>
             <wp:cNvGraphicFramePr/>
             <a:graphic xmlns:a="http://schemas.openxmlformats.org/drawingml/2006/main">
               <a:graphicData uri="http://schemas.openxmlformats.org/drawingml/2006/picture">
                 <pic:pic xmlns:pic="http://schemas.openxmlformats.org/drawingml/2006/picture">
                   <pic:nvPicPr>
-                    <pic:cNvPr id="1682716721" name=""/>
+                    <pic:cNvPr id="2125868648" name=""/>
                     <pic:cNvPicPr/>
                   </pic:nvPicPr>
                   <pic:blipFill>
@@ -17396,16 +17463,16 @@
           <w:noProof/>
         </w:rPr>
         <w:drawing>
-          <wp:inline distT="0" distB="0" distL="0" distR="0" wp14:anchorId="73BD8A02" wp14:editId="45FCE99D">
+          <wp:inline distT="0" distB="0" distL="0" distR="0" wp14:anchorId="4D93972C" wp14:editId="33CEACA2">
             <wp:extent cx="5120640" cy="3282818"/>
             <wp:effectExtent l="19050" t="19050" r="22860" b="13335"/>
-            <wp:docPr id="689702420" name="Imagem 41"/>
+            <wp:docPr id="266089028" name="Imagem 41"/>
             <wp:cNvGraphicFramePr/>
             <a:graphic xmlns:a="http://schemas.openxmlformats.org/drawingml/2006/main">
               <a:graphicData uri="http://schemas.openxmlformats.org/drawingml/2006/picture">
                 <pic:pic xmlns:pic="http://schemas.openxmlformats.org/drawingml/2006/picture">
                   <pic:nvPicPr>
-                    <pic:cNvPr id="689702420" name=""/>
+                    <pic:cNvPr id="266089028" name=""/>
                     <pic:cNvPicPr/>
                   </pic:nvPicPr>
                   <pic:blipFill>
@@ -17539,16 +17606,16 @@
         </w:rPr>
         <w:lastRenderedPageBreak/>
         <w:drawing>
-          <wp:inline distT="0" distB="0" distL="0" distR="0" wp14:anchorId="47B752E1" wp14:editId="162E919C">
+          <wp:inline distT="0" distB="0" distL="0" distR="0" wp14:anchorId="07B6317C" wp14:editId="73A768A2">
             <wp:extent cx="5120640" cy="1978034"/>
             <wp:effectExtent l="19050" t="19050" r="22860" b="22225"/>
-            <wp:docPr id="683939763" name="Imagem 42"/>
+            <wp:docPr id="1831991956" name="Imagem 42"/>
             <wp:cNvGraphicFramePr/>
             <a:graphic xmlns:a="http://schemas.openxmlformats.org/drawingml/2006/main">
               <a:graphicData uri="http://schemas.openxmlformats.org/drawingml/2006/picture">
                 <pic:pic xmlns:pic="http://schemas.openxmlformats.org/drawingml/2006/picture">
                   <pic:nvPicPr>
-                    <pic:cNvPr id="683939763" name=""/>
+                    <pic:cNvPr id="1831991956" name=""/>
                     <pic:cNvPicPr/>
                   </pic:nvPicPr>
                   <pic:blipFill>
@@ -17620,7 +17687,7 @@
           <w:sz w:val="34"/>
         </w:rPr>
       </w:pPr>
-      <w:bookmarkStart w:id="33" w:name="_Toc239952528"/>
+      <w:bookmarkStart w:id="33" w:name="_Toc240009173"/>
       <w:r>
         <w:rPr>
           <w:rFonts w:ascii="Montserrat" w:hAnsi="Montserrat"/>
@@ -17680,7 +17747,7 @@
           <w:sz w:val="27"/>
         </w:rPr>
       </w:pPr>
-      <w:bookmarkStart w:id="34" w:name="_Toc239952529"/>
+      <w:bookmarkStart w:id="34" w:name="_Toc240009174"/>
       <w:r>
         <w:rPr>
           <w:rFonts w:ascii="Montserrat" w:hAnsi="Montserrat"/>
@@ -17720,16 +17787,16 @@
           <w:noProof/>
         </w:rPr>
         <w:drawing>
-          <wp:inline distT="0" distB="0" distL="0" distR="0" wp14:anchorId="3A1CEF31" wp14:editId="0028FACD">
+          <wp:inline distT="0" distB="0" distL="0" distR="0" wp14:anchorId="61EF1890" wp14:editId="725E0DBC">
             <wp:extent cx="5303520" cy="4792851"/>
             <wp:effectExtent l="19050" t="19050" r="11430" b="27305"/>
-            <wp:docPr id="160769209" name="Imagem 43"/>
+            <wp:docPr id="1757952291" name="Imagem 43"/>
             <wp:cNvGraphicFramePr/>
             <a:graphic xmlns:a="http://schemas.openxmlformats.org/drawingml/2006/main">
               <a:graphicData uri="http://schemas.openxmlformats.org/drawingml/2006/picture">
                 <pic:pic xmlns:pic="http://schemas.openxmlformats.org/drawingml/2006/picture">
                   <pic:nvPicPr>
-                    <pic:cNvPr id="160769209" name=""/>
+                    <pic:cNvPr id="1757952291" name=""/>
                     <pic:cNvPicPr/>
                   </pic:nvPicPr>
                   <pic:blipFill>
@@ -17798,7 +17865,7 @@
           <w:sz w:val="27"/>
         </w:rPr>
       </w:pPr>
-      <w:bookmarkStart w:id="35" w:name="_Toc239952530"/>
+      <w:bookmarkStart w:id="35" w:name="_Toc240009175"/>
       <w:r>
         <w:rPr>
           <w:rFonts w:ascii="Montserrat" w:hAnsi="Montserrat"/>
@@ -17838,16 +17905,16 @@
           <w:noProof/>
         </w:rPr>
         <w:drawing>
-          <wp:inline distT="0" distB="0" distL="0" distR="0" wp14:anchorId="5A006944" wp14:editId="46768456">
+          <wp:inline distT="0" distB="0" distL="0" distR="0" wp14:anchorId="50E6D3AA" wp14:editId="6B8A3DF5">
             <wp:extent cx="5303520" cy="4792851"/>
             <wp:effectExtent l="19050" t="19050" r="11430" b="27305"/>
-            <wp:docPr id="1020905393" name="Imagem 44"/>
+            <wp:docPr id="351894338" name="Imagem 44"/>
             <wp:cNvGraphicFramePr/>
             <a:graphic xmlns:a="http://schemas.openxmlformats.org/drawingml/2006/main">
               <a:graphicData uri="http://schemas.openxmlformats.org/drawingml/2006/picture">
                 <pic:pic xmlns:pic="http://schemas.openxmlformats.org/drawingml/2006/picture">
                   <pic:nvPicPr>
-                    <pic:cNvPr id="1020905393" name=""/>
+                    <pic:cNvPr id="351894338" name=""/>
                     <pic:cNvPicPr/>
                   </pic:nvPicPr>
                   <pic:blipFill>
@@ -17915,7 +17982,7 @@
           <w:sz w:val="27"/>
         </w:rPr>
       </w:pPr>
-      <w:bookmarkStart w:id="36" w:name="_Toc239952531"/>
+      <w:bookmarkStart w:id="36" w:name="_Toc240009176"/>
       <w:r>
         <w:rPr>
           <w:rFonts w:ascii="Montserrat" w:hAnsi="Montserrat"/>
@@ -17956,16 +18023,16 @@
         </w:rPr>
         <w:lastRenderedPageBreak/>
         <w:drawing>
-          <wp:inline distT="0" distB="0" distL="0" distR="0" wp14:anchorId="78917EB6" wp14:editId="63CB5231">
+          <wp:inline distT="0" distB="0" distL="0" distR="0" wp14:anchorId="11DA3612" wp14:editId="0620DCB1">
             <wp:extent cx="5303520" cy="4792851"/>
             <wp:effectExtent l="19050" t="19050" r="11430" b="27305"/>
-            <wp:docPr id="427080394" name="Imagem 45"/>
+            <wp:docPr id="1862917401" name="Imagem 45"/>
             <wp:cNvGraphicFramePr/>
             <a:graphic xmlns:a="http://schemas.openxmlformats.org/drawingml/2006/main">
               <a:graphicData uri="http://schemas.openxmlformats.org/drawingml/2006/picture">
                 <pic:pic xmlns:pic="http://schemas.openxmlformats.org/drawingml/2006/picture">
                   <pic:nvPicPr>
-                    <pic:cNvPr id="427080394" name=""/>
+                    <pic:cNvPr id="1862917401" name=""/>
                     <pic:cNvPicPr/>
                   </pic:nvPicPr>
                   <pic:blipFill>
@@ -18033,16 +18100,16 @@
         </w:rPr>
         <w:lastRenderedPageBreak/>
         <w:drawing>
-          <wp:inline distT="0" distB="0" distL="0" distR="0" wp14:anchorId="07516367" wp14:editId="0B97E902">
+          <wp:inline distT="0" distB="0" distL="0" distR="0" wp14:anchorId="26142C2F" wp14:editId="329247D1">
             <wp:extent cx="5303520" cy="4792851"/>
             <wp:effectExtent l="19050" t="19050" r="11430" b="27305"/>
-            <wp:docPr id="1906607606" name="Imagem 46"/>
+            <wp:docPr id="1137346184" name="Imagem 46"/>
             <wp:cNvGraphicFramePr/>
             <a:graphic xmlns:a="http://schemas.openxmlformats.org/drawingml/2006/main">
               <a:graphicData uri="http://schemas.openxmlformats.org/drawingml/2006/picture">
                 <pic:pic xmlns:pic="http://schemas.openxmlformats.org/drawingml/2006/picture">
                   <pic:nvPicPr>
-                    <pic:cNvPr id="1906607606" name=""/>
+                    <pic:cNvPr id="1137346184" name=""/>
                     <pic:cNvPicPr/>
                   </pic:nvPicPr>
                   <pic:blipFill>
@@ -18135,7 +18202,7 @@
           <w:sz w:val="34"/>
         </w:rPr>
       </w:pPr>
-      <w:bookmarkStart w:id="37" w:name="_Toc239952532"/>
+      <w:bookmarkStart w:id="37" w:name="_Toc240009177"/>
       <w:r>
         <w:rPr>
           <w:rFonts w:ascii="Montserrat" w:hAnsi="Montserrat"/>
@@ -18177,7 +18244,7 @@
           <w:sz w:val="27"/>
         </w:rPr>
       </w:pPr>
-      <w:bookmarkStart w:id="38" w:name="_Toc239952533"/>
+      <w:bookmarkStart w:id="38" w:name="_Toc240009178"/>
       <w:r>
         <w:rPr>
           <w:rFonts w:ascii="Montserrat" w:hAnsi="Montserrat"/>
@@ -18217,16 +18284,16 @@
           <w:noProof/>
         </w:rPr>
         <w:drawing>
-          <wp:inline distT="0" distB="0" distL="0" distR="0" wp14:anchorId="7F205B7A" wp14:editId="0F628CA0">
+          <wp:inline distT="0" distB="0" distL="0" distR="0" wp14:anchorId="6535983F" wp14:editId="250D1687">
             <wp:extent cx="5303520" cy="4792851"/>
             <wp:effectExtent l="19050" t="19050" r="11430" b="27305"/>
-            <wp:docPr id="1238919218" name="Imagem 47"/>
+            <wp:docPr id="1929900364" name="Imagem 47"/>
             <wp:cNvGraphicFramePr/>
             <a:graphic xmlns:a="http://schemas.openxmlformats.org/drawingml/2006/main">
               <a:graphicData uri="http://schemas.openxmlformats.org/drawingml/2006/picture">
                 <pic:pic xmlns:pic="http://schemas.openxmlformats.org/drawingml/2006/picture">
                   <pic:nvPicPr>
-                    <pic:cNvPr id="1238919218" name=""/>
+                    <pic:cNvPr id="1929900364" name=""/>
                     <pic:cNvPicPr/>
                   </pic:nvPicPr>
                   <pic:blipFill>
@@ -18373,7 +18440,7 @@
           <w:sz w:val="27"/>
         </w:rPr>
       </w:pPr>
-      <w:bookmarkStart w:id="39" w:name="_Toc239952534"/>
+      <w:bookmarkStart w:id="39" w:name="_Toc240009179"/>
       <w:r>
         <w:rPr>
           <w:rFonts w:ascii="Montserrat" w:hAnsi="Montserrat"/>
@@ -18414,16 +18481,16 @@
         </w:rPr>
         <w:lastRenderedPageBreak/>
         <w:drawing>
-          <wp:inline distT="0" distB="0" distL="0" distR="0" wp14:anchorId="14426629" wp14:editId="169E50A7">
+          <wp:inline distT="0" distB="0" distL="0" distR="0" wp14:anchorId="1A25338C" wp14:editId="22924588">
             <wp:extent cx="5303520" cy="4792851"/>
             <wp:effectExtent l="19050" t="19050" r="11430" b="27305"/>
-            <wp:docPr id="310183527" name="Imagem 48"/>
+            <wp:docPr id="106398513" name="Imagem 48"/>
             <wp:cNvGraphicFramePr/>
             <a:graphic xmlns:a="http://schemas.openxmlformats.org/drawingml/2006/main">
               <a:graphicData uri="http://schemas.openxmlformats.org/drawingml/2006/picture">
                 <pic:pic xmlns:pic="http://schemas.openxmlformats.org/drawingml/2006/picture">
                   <pic:nvPicPr>
-                    <pic:cNvPr id="310183527" name=""/>
+                    <pic:cNvPr id="106398513" name=""/>
                     <pic:cNvPicPr/>
                   </pic:nvPicPr>
                   <pic:blipFill>
@@ -18491,7 +18558,7 @@
           <w:sz w:val="27"/>
         </w:rPr>
       </w:pPr>
-      <w:bookmarkStart w:id="40" w:name="_Toc239952535"/>
+      <w:bookmarkStart w:id="40" w:name="_Toc240009180"/>
       <w:r>
         <w:rPr>
           <w:rFonts w:ascii="Montserrat" w:hAnsi="Montserrat"/>
@@ -18532,16 +18599,16 @@
         </w:rPr>
         <w:lastRenderedPageBreak/>
         <w:drawing>
-          <wp:inline distT="0" distB="0" distL="0" distR="0" wp14:anchorId="685E5EEC" wp14:editId="0646558E">
+          <wp:inline distT="0" distB="0" distL="0" distR="0" wp14:anchorId="260144FC" wp14:editId="79581B0D">
             <wp:extent cx="5303520" cy="4792851"/>
             <wp:effectExtent l="19050" t="19050" r="11430" b="27305"/>
-            <wp:docPr id="566334177" name="Imagem 49"/>
+            <wp:docPr id="795318914" name="Imagem 49"/>
             <wp:cNvGraphicFramePr/>
             <a:graphic xmlns:a="http://schemas.openxmlformats.org/drawingml/2006/main">
               <a:graphicData uri="http://schemas.openxmlformats.org/drawingml/2006/picture">
                 <pic:pic xmlns:pic="http://schemas.openxmlformats.org/drawingml/2006/picture">
                   <pic:nvPicPr>
-                    <pic:cNvPr id="566334177" name=""/>
+                    <pic:cNvPr id="795318914" name=""/>
                     <pic:cNvPicPr/>
                   </pic:nvPicPr>
                   <pic:blipFill>
@@ -18685,7 +18752,7 @@
           <w:sz w:val="27"/>
         </w:rPr>
       </w:pPr>
-      <w:bookmarkStart w:id="41" w:name="_Toc239952536"/>
+      <w:bookmarkStart w:id="41" w:name="_Toc240009181"/>
       <w:r>
         <w:rPr>
           <w:rFonts w:ascii="Montserrat" w:hAnsi="Montserrat"/>
@@ -18846,16 +18913,16 @@
         </w:rPr>
         <w:lastRenderedPageBreak/>
         <w:drawing>
-          <wp:inline distT="0" distB="0" distL="0" distR="0" wp14:anchorId="7DA35609" wp14:editId="6A181637">
+          <wp:inline distT="0" distB="0" distL="0" distR="0" wp14:anchorId="7FF91394" wp14:editId="045B5462">
             <wp:extent cx="5303520" cy="4267180"/>
             <wp:effectExtent l="19050" t="19050" r="11430" b="19685"/>
-            <wp:docPr id="858907096" name="Imagem 50"/>
+            <wp:docPr id="1434273942" name="Imagem 50"/>
             <wp:cNvGraphicFramePr/>
             <a:graphic xmlns:a="http://schemas.openxmlformats.org/drawingml/2006/main">
               <a:graphicData uri="http://schemas.openxmlformats.org/drawingml/2006/picture">
                 <pic:pic xmlns:pic="http://schemas.openxmlformats.org/drawingml/2006/picture">
                   <pic:nvPicPr>
-                    <pic:cNvPr id="858907096" name=""/>
+                    <pic:cNvPr id="1434273942" name=""/>
                     <pic:cNvPicPr/>
                   </pic:nvPicPr>
                   <pic:blipFill>
@@ -18923,16 +18990,16 @@
         </w:rPr>
         <w:lastRenderedPageBreak/>
         <w:drawing>
-          <wp:inline distT="0" distB="0" distL="0" distR="0" wp14:anchorId="10938E4C" wp14:editId="6CC29F1B">
+          <wp:inline distT="0" distB="0" distL="0" distR="0" wp14:anchorId="6B1C4B94" wp14:editId="5918245A">
             <wp:extent cx="5303520" cy="3382059"/>
             <wp:effectExtent l="19050" t="19050" r="11430" b="27940"/>
-            <wp:docPr id="2026313644" name="Imagem 51"/>
+            <wp:docPr id="2009964641" name="Imagem 51"/>
             <wp:cNvGraphicFramePr/>
             <a:graphic xmlns:a="http://schemas.openxmlformats.org/drawingml/2006/main">
               <a:graphicData uri="http://schemas.openxmlformats.org/drawingml/2006/picture">
                 <pic:pic xmlns:pic="http://schemas.openxmlformats.org/drawingml/2006/picture">
                   <pic:nvPicPr>
-                    <pic:cNvPr id="2026313644" name=""/>
+                    <pic:cNvPr id="2009964641" name=""/>
                     <pic:cNvPicPr/>
                   </pic:nvPicPr>
                   <pic:blipFill>
@@ -19000,16 +19067,16 @@
         </w:rPr>
         <w:lastRenderedPageBreak/>
         <w:drawing>
-          <wp:inline distT="0" distB="0" distL="0" distR="0" wp14:anchorId="2EFAC880" wp14:editId="279B0D05">
+          <wp:inline distT="0" distB="0" distL="0" distR="0" wp14:anchorId="695708F1" wp14:editId="37667063">
             <wp:extent cx="5303520" cy="4417800"/>
             <wp:effectExtent l="19050" t="19050" r="11430" b="20955"/>
-            <wp:docPr id="820794037" name="Imagem 52"/>
+            <wp:docPr id="1354464741" name="Imagem 52"/>
             <wp:cNvGraphicFramePr/>
             <a:graphic xmlns:a="http://schemas.openxmlformats.org/drawingml/2006/main">
               <a:graphicData uri="http://schemas.openxmlformats.org/drawingml/2006/picture">
                 <pic:pic xmlns:pic="http://schemas.openxmlformats.org/drawingml/2006/picture">
                   <pic:nvPicPr>
-                    <pic:cNvPr id="820794037" name=""/>
+                    <pic:cNvPr id="1354464741" name=""/>
                     <pic:cNvPicPr/>
                   </pic:nvPicPr>
                   <pic:blipFill>
@@ -19119,7 +19186,7 @@
           <w:sz w:val="27"/>
         </w:rPr>
       </w:pPr>
-      <w:bookmarkStart w:id="42" w:name="_Toc239952537"/>
+      <w:bookmarkStart w:id="42" w:name="_Toc240009182"/>
       <w:r>
         <w:rPr>
           <w:rFonts w:ascii="Montserrat" w:hAnsi="Montserrat"/>
@@ -19337,16 +19404,16 @@
         </w:rPr>
         <w:lastRenderedPageBreak/>
         <w:drawing>
-          <wp:inline distT="0" distB="0" distL="0" distR="0" wp14:anchorId="18B57991" wp14:editId="47470214">
+          <wp:inline distT="0" distB="0" distL="0" distR="0" wp14:anchorId="46190AF9" wp14:editId="655B8AB4">
             <wp:extent cx="5303520" cy="7628836"/>
             <wp:effectExtent l="19050" t="19050" r="11430" b="10795"/>
-            <wp:docPr id="1893963080" name="Imagem 53"/>
+            <wp:docPr id="205757862" name="Imagem 53"/>
             <wp:cNvGraphicFramePr/>
             <a:graphic xmlns:a="http://schemas.openxmlformats.org/drawingml/2006/main">
               <a:graphicData uri="http://schemas.openxmlformats.org/drawingml/2006/picture">
                 <pic:pic xmlns:pic="http://schemas.openxmlformats.org/drawingml/2006/picture">
                   <pic:nvPicPr>
-                    <pic:cNvPr id="1893963080" name=""/>
+                    <pic:cNvPr id="205757862" name=""/>
                     <pic:cNvPicPr/>
                   </pic:nvPicPr>
                   <pic:blipFill>
@@ -19457,7 +19524,7 @@
           <w:sz w:val="27"/>
         </w:rPr>
       </w:pPr>
-      <w:bookmarkStart w:id="43" w:name="_Toc239952538"/>
+      <w:bookmarkStart w:id="43" w:name="_Toc240009183"/>
       <w:r>
         <w:rPr>
           <w:rFonts w:ascii="Montserrat" w:hAnsi="Montserrat"/>
@@ -19610,7 +19677,7 @@
           <w:sz w:val="27"/>
         </w:rPr>
       </w:pPr>
-      <w:bookmarkStart w:id="44" w:name="_Toc239952539"/>
+      <w:bookmarkStart w:id="44" w:name="_Toc240009184"/>
       <w:r>
         <w:rPr>
           <w:rFonts w:ascii="Montserrat" w:hAnsi="Montserrat"/>
@@ -19903,16 +19970,16 @@
           <w:noProof/>
         </w:rPr>
         <w:drawing>
-          <wp:inline distT="0" distB="0" distL="0" distR="0" wp14:anchorId="1C33062C" wp14:editId="2D547730">
+          <wp:inline distT="0" distB="0" distL="0" distR="0" wp14:anchorId="39E7AA2D" wp14:editId="62414A91">
             <wp:extent cx="5303520" cy="1351384"/>
             <wp:effectExtent l="19050" t="19050" r="11430" b="20320"/>
-            <wp:docPr id="1370737309" name="Imagem 54"/>
+            <wp:docPr id="197832165" name="Imagem 54"/>
             <wp:cNvGraphicFramePr/>
             <a:graphic xmlns:a="http://schemas.openxmlformats.org/drawingml/2006/main">
               <a:graphicData uri="http://schemas.openxmlformats.org/drawingml/2006/picture">
                 <pic:pic xmlns:pic="http://schemas.openxmlformats.org/drawingml/2006/picture">
                   <pic:nvPicPr>
-                    <pic:cNvPr id="1370737309" name=""/>
+                    <pic:cNvPr id="197832165" name=""/>
                     <pic:cNvPicPr/>
                   </pic:nvPicPr>
                   <pic:blipFill>
@@ -19980,7 +20047,7 @@
           <w:sz w:val="27"/>
         </w:rPr>
       </w:pPr>
-      <w:bookmarkStart w:id="45" w:name="_Toc239952540"/>
+      <w:bookmarkStart w:id="45" w:name="_Toc240009185"/>
       <w:r>
         <w:rPr>
           <w:rFonts w:ascii="Montserrat" w:hAnsi="Montserrat"/>
@@ -20092,16 +20159,16 @@
           <w:noProof/>
         </w:rPr>
         <w:drawing>
-          <wp:inline distT="0" distB="0" distL="0" distR="0" wp14:anchorId="36226F7E" wp14:editId="577AA712">
+          <wp:inline distT="0" distB="0" distL="0" distR="0" wp14:anchorId="776FDFD2" wp14:editId="4A748E2B">
             <wp:extent cx="5303520" cy="1422793"/>
             <wp:effectExtent l="19050" t="19050" r="11430" b="25400"/>
-            <wp:docPr id="1656692156" name="Imagem 55"/>
+            <wp:docPr id="1609238806" name="Imagem 55"/>
             <wp:cNvGraphicFramePr/>
             <a:graphic xmlns:a="http://schemas.openxmlformats.org/drawingml/2006/main">
               <a:graphicData uri="http://schemas.openxmlformats.org/drawingml/2006/picture">
                 <pic:pic xmlns:pic="http://schemas.openxmlformats.org/drawingml/2006/picture">
                   <pic:nvPicPr>
-                    <pic:cNvPr id="1656692156" name=""/>
+                    <pic:cNvPr id="1609238806" name=""/>
                     <pic:cNvPicPr/>
                   </pic:nvPicPr>
                   <pic:blipFill>
@@ -20256,16 +20323,16 @@
           <w:noProof/>
         </w:rPr>
         <w:drawing>
-          <wp:inline distT="0" distB="0" distL="0" distR="0" wp14:anchorId="6AF6F5AC" wp14:editId="3FA71D94">
+          <wp:inline distT="0" distB="0" distL="0" distR="0" wp14:anchorId="6EF9FC3D" wp14:editId="3D131E6D">
             <wp:extent cx="5303520" cy="1841050"/>
             <wp:effectExtent l="19050" t="19050" r="11430" b="26035"/>
-            <wp:docPr id="89387747" name="Imagem 56"/>
+            <wp:docPr id="1855679856" name="Imagem 56"/>
             <wp:cNvGraphicFramePr/>
             <a:graphic xmlns:a="http://schemas.openxmlformats.org/drawingml/2006/main">
               <a:graphicData uri="http://schemas.openxmlformats.org/drawingml/2006/picture">
                 <pic:pic xmlns:pic="http://schemas.openxmlformats.org/drawingml/2006/picture">
                   <pic:nvPicPr>
-                    <pic:cNvPr id="89387747" name=""/>
+                    <pic:cNvPr id="1855679856" name=""/>
                     <pic:cNvPicPr/>
                   </pic:nvPicPr>
                   <pic:blipFill>
@@ -20420,16 +20487,16 @@
           <w:noProof/>
         </w:rPr>
         <w:drawing>
-          <wp:inline distT="0" distB="0" distL="0" distR="0" wp14:anchorId="15EBB7C7" wp14:editId="0EA8C26E">
+          <wp:inline distT="0" distB="0" distL="0" distR="0" wp14:anchorId="5B4FEB76" wp14:editId="6EB11C06">
             <wp:extent cx="5303520" cy="303041"/>
             <wp:effectExtent l="19050" t="19050" r="11430" b="20955"/>
-            <wp:docPr id="2133132079" name="Imagem 57"/>
+            <wp:docPr id="20552041" name="Imagem 57"/>
             <wp:cNvGraphicFramePr/>
             <a:graphic xmlns:a="http://schemas.openxmlformats.org/drawingml/2006/main">
               <a:graphicData uri="http://schemas.openxmlformats.org/drawingml/2006/picture">
                 <pic:pic xmlns:pic="http://schemas.openxmlformats.org/drawingml/2006/picture">
                   <pic:nvPicPr>
-                    <pic:cNvPr id="2133132079" name=""/>
+                    <pic:cNvPr id="20552041" name=""/>
                     <pic:cNvPicPr/>
                   </pic:nvPicPr>
                   <pic:blipFill>
@@ -20496,16 +20563,16 @@
           <w:noProof/>
         </w:rPr>
         <w:drawing>
-          <wp:inline distT="0" distB="0" distL="0" distR="0" wp14:anchorId="29F53DD8" wp14:editId="67EF1541">
+          <wp:inline distT="0" distB="0" distL="0" distR="0" wp14:anchorId="0F563F2A" wp14:editId="6866022D">
             <wp:extent cx="5303520" cy="2983005"/>
             <wp:effectExtent l="19050" t="19050" r="11430" b="27305"/>
-            <wp:docPr id="50847021" name="Imagem 58"/>
+            <wp:docPr id="2018845433" name="Imagem 58"/>
             <wp:cNvGraphicFramePr/>
             <a:graphic xmlns:a="http://schemas.openxmlformats.org/drawingml/2006/main">
               <a:graphicData uri="http://schemas.openxmlformats.org/drawingml/2006/picture">
                 <pic:pic xmlns:pic="http://schemas.openxmlformats.org/drawingml/2006/picture">
                   <pic:nvPicPr>
-                    <pic:cNvPr id="50847021" name=""/>
+                    <pic:cNvPr id="2018845433" name=""/>
                     <pic:cNvPicPr/>
                   </pic:nvPicPr>
                   <pic:blipFill>
@@ -20570,21 +20637,9 @@
           <w:bottom w:val="single" w:sz="4" w:space="0" w:color="E4E4E7"/>
         </w:pBdr>
         <w:spacing w:before="80" w:after="200"/>
-        <w:rPr>
-          <w:rFonts w:ascii="Montserrat" w:hAnsi="Montserrat"/>
-          <w:b/>
-          <w:color w:val="1A1A1A"/>
-          <w:sz w:val="34"/>
-        </w:rPr>
-      </w:pPr>
-      <w:bookmarkStart w:id="46" w:name="_Toc239952541"/>
-      <w:r>
-        <w:rPr>
-          <w:rFonts w:ascii="Montserrat" w:hAnsi="Montserrat"/>
-          <w:b/>
-          <w:color w:val="1A1A1A"/>
-          <w:sz w:val="34"/>
-        </w:rPr>
+      </w:pPr>
+      <w:bookmarkStart w:id="46" w:name="_Toc240009186"/>
+      <w:r>
         <w:lastRenderedPageBreak/>
         <w:t>7. Perguntas frequentes</w:t>
       </w:r>
@@ -20821,7 +20876,7 @@
           <w:sz w:val="34"/>
         </w:rPr>
       </w:pPr>
-      <w:bookmarkStart w:id="47" w:name="_Toc239952542"/>
+      <w:bookmarkStart w:id="47" w:name="_Toc240009187"/>
       <w:r>
         <w:rPr>
           <w:rFonts w:ascii="Montserrat" w:hAnsi="Montserrat"/>
@@ -22609,7 +22664,7 @@
 <file path=word/numbering.xml><?xml version="1.0" encoding="utf-8"?>
 <w:numbering xmlns:wpc="http://schemas.microsoft.com/office/word/2010/wordprocessingCanvas" xmlns:cx="http://schemas.microsoft.com/office/drawing/2014/chartex" xmlns:cx1="http://schemas.microsoft.com/office/drawing/2015/9/8/chartex" xmlns:cx2="http://schemas.microsoft.com/office/drawing/2015/10/21/chartex" xmlns:cx3="http://schemas.microsoft.com/office/drawing/2016/5/9/chartex" xmlns:cx4="http://schemas.microsoft.com/office/drawing/2016/5/10/chartex" xmlns:cx5="http://schemas.microsoft.com/office/drawing/2016/5/11/chartex" xmlns:cx6="http://schemas.microsoft.com/office/drawing/2016/5/12/chartex" xmlns:cx7="http://schemas.microsoft.com/office/drawing/2016/5/13/chartex" xmlns:cx8="http://schemas.microsoft.com/office/drawing/2016/5/14/chartex" xmlns:mc="http://schemas.openxmlformats.org/markup-compatibility/2006" xmlns:aink="http://schemas.microsoft.com/office/drawing/2016/ink" xmlns:am3d="http://schemas.microsoft.com/office/drawing/2017/model3d" xmlns:o="urn:schemas-microsoft-com:office:office" xmlns:oel="http://schemas.microsoft.com/office/2019/extlst" xmlns:r="http://schemas.openxmlformats.org/officeDocument/2006/relationships" xmlns:m="http://schemas.openxmlformats.org/officeDocument/2006/math" xmlns:v="urn:schemas-microsoft-com:vml" xmlns:wp14="http://schemas.microsoft.com/office/word/2010/wordprocessingDrawing" xmlns:wp="http://schemas.openxmlformats.org/drawingml/2006/wordprocessingDrawing" xmlns:w10="urn:schemas-microsoft-com:office:word" xmlns:w="http://schemas.openxmlformats.org/wordprocessingml/2006/main" xmlns:w14="http://schemas.microsoft.com/office/word/2010/wordml" xmlns:w15="http://schemas.microsoft.com/office/word/2012/wordml" xmlns:w16cex="http://schemas.microsoft.com/office/word/2018/wordml/cex" xmlns:w16cid="http://schemas.microsoft.com/office/word/2016/wordml/cid" xmlns:w16="http://schemas.microsoft.com/office/word/2018/wordml" xmlns:w16du="http://schemas.microsoft.com/office/word/2023/wordml/word16du" xmlns:w16sdtdh="http://schemas.microsoft.com/office/word/2020/wordml/sdtdatahash" xmlns:w16sdtfl="http://schemas.microsoft.com/office/word/2024/wordml/sdtformatlock" xmlns:w16se="http://schemas.microsoft.com/office/word/2015/wordml/symex" xmlns:wpg="http://schemas.microsoft.com/office/word/2010/wordprocessingGroup" xmlns:wpi="http://schemas.microsoft.com/office/word/2010/wordprocessingInk" xmlns:wne="http://schemas.microsoft.com/office/word/2006/wordml" xmlns:wps="http://schemas.microsoft.com/office/word/2010/wordprocessingShape" mc:Ignorable="w14 w15 w16se w16cid w16 w16cex w16sdtdh w16sdtfl w16du wp14">
   <w:abstractNum w:abstractNumId="0" w15:restartNumberingAfterBreak="0">
-    <w:nsid w:val="075C06EC"/>
+    <w:nsid w:val="003A5FF0"/>
     <w:multiLevelType w:val="singleLevel"/>
     <w:tmpl w:val="04160001"/>
     <w:lvl w:ilvl="0">
@@ -22626,7 +22681,7 @@
     </w:lvl>
   </w:abstractNum>
   <w:abstractNum w:abstractNumId="1" w15:restartNumberingAfterBreak="0">
-    <w:nsid w:val="088B7509"/>
+    <w:nsid w:val="042108F8"/>
     <w:multiLevelType w:val="singleLevel"/>
     <w:tmpl w:val="04160001"/>
     <w:lvl w:ilvl="0">
@@ -22643,7 +22698,7 @@
     </w:lvl>
   </w:abstractNum>
   <w:abstractNum w:abstractNumId="2" w15:restartNumberingAfterBreak="0">
-    <w:nsid w:val="0D5471F8"/>
+    <w:nsid w:val="07092755"/>
     <w:multiLevelType w:val="singleLevel"/>
     <w:tmpl w:val="04160001"/>
     <w:lvl w:ilvl="0">
@@ -22660,7 +22715,7 @@
     </w:lvl>
   </w:abstractNum>
   <w:abstractNum w:abstractNumId="3" w15:restartNumberingAfterBreak="0">
-    <w:nsid w:val="123B0759"/>
+    <w:nsid w:val="0BBD71C9"/>
     <w:multiLevelType w:val="singleLevel"/>
     <w:tmpl w:val="04160001"/>
     <w:lvl w:ilvl="0">
@@ -22677,7 +22732,7 @@
     </w:lvl>
   </w:abstractNum>
   <w:abstractNum w:abstractNumId="4" w15:restartNumberingAfterBreak="0">
-    <w:nsid w:val="15C0150D"/>
+    <w:nsid w:val="0C042747"/>
     <w:multiLevelType w:val="singleLevel"/>
     <w:tmpl w:val="04160001"/>
     <w:lvl w:ilvl="0">
@@ -22694,7 +22749,7 @@
     </w:lvl>
   </w:abstractNum>
   <w:abstractNum w:abstractNumId="5" w15:restartNumberingAfterBreak="0">
-    <w:nsid w:val="189C59BC"/>
+    <w:nsid w:val="0EA33525"/>
     <w:multiLevelType w:val="singleLevel"/>
     <w:tmpl w:val="04160001"/>
     <w:lvl w:ilvl="0">
@@ -22711,7 +22766,7 @@
     </w:lvl>
   </w:abstractNum>
   <w:abstractNum w:abstractNumId="6" w15:restartNumberingAfterBreak="0">
-    <w:nsid w:val="21382324"/>
+    <w:nsid w:val="1FA93FF0"/>
     <w:multiLevelType w:val="singleLevel"/>
     <w:tmpl w:val="04160001"/>
     <w:lvl w:ilvl="0">
@@ -22728,7 +22783,7 @@
     </w:lvl>
   </w:abstractNum>
   <w:abstractNum w:abstractNumId="7" w15:restartNumberingAfterBreak="0">
-    <w:nsid w:val="24B27A3A"/>
+    <w:nsid w:val="23413511"/>
     <w:multiLevelType w:val="singleLevel"/>
     <w:tmpl w:val="04160001"/>
     <w:lvl w:ilvl="0">
@@ -22745,7 +22800,7 @@
     </w:lvl>
   </w:abstractNum>
   <w:abstractNum w:abstractNumId="8" w15:restartNumberingAfterBreak="0">
-    <w:nsid w:val="28602051"/>
+    <w:nsid w:val="27C205A9"/>
     <w:multiLevelType w:val="singleLevel"/>
     <w:tmpl w:val="04160001"/>
     <w:lvl w:ilvl="0">
@@ -22762,7 +22817,7 @@
     </w:lvl>
   </w:abstractNum>
   <w:abstractNum w:abstractNumId="9" w15:restartNumberingAfterBreak="0">
-    <w:nsid w:val="2D14045B"/>
+    <w:nsid w:val="2AA40DA0"/>
     <w:multiLevelType w:val="singleLevel"/>
     <w:tmpl w:val="04160001"/>
     <w:lvl w:ilvl="0">
@@ -22779,7 +22834,7 @@
     </w:lvl>
   </w:abstractNum>
   <w:abstractNum w:abstractNumId="10" w15:restartNumberingAfterBreak="0">
-    <w:nsid w:val="348F1307"/>
+    <w:nsid w:val="42FE583C"/>
     <w:multiLevelType w:val="singleLevel"/>
     <w:tmpl w:val="04160001"/>
     <w:lvl w:ilvl="0">
@@ -22796,7 +22851,7 @@
     </w:lvl>
   </w:abstractNum>
   <w:abstractNum w:abstractNumId="11" w15:restartNumberingAfterBreak="0">
-    <w:nsid w:val="3B364891"/>
+    <w:nsid w:val="430E241D"/>
     <w:multiLevelType w:val="singleLevel"/>
     <w:tmpl w:val="04160001"/>
     <w:lvl w:ilvl="0">
@@ -22813,7 +22868,7 @@
     </w:lvl>
   </w:abstractNum>
   <w:abstractNum w:abstractNumId="12" w15:restartNumberingAfterBreak="0">
-    <w:nsid w:val="3B6126E0"/>
+    <w:nsid w:val="47C21666"/>
     <w:multiLevelType w:val="singleLevel"/>
     <w:tmpl w:val="04160001"/>
     <w:lvl w:ilvl="0">
@@ -22830,7 +22885,7 @@
     </w:lvl>
   </w:abstractNum>
   <w:abstractNum w:abstractNumId="13" w15:restartNumberingAfterBreak="0">
-    <w:nsid w:val="49A92E5D"/>
+    <w:nsid w:val="4A4635E7"/>
     <w:multiLevelType w:val="singleLevel"/>
     <w:tmpl w:val="04160001"/>
     <w:lvl w:ilvl="0">
@@ -22847,7 +22902,7 @@
     </w:lvl>
   </w:abstractNum>
   <w:abstractNum w:abstractNumId="14" w15:restartNumberingAfterBreak="0">
-    <w:nsid w:val="4B873405"/>
+    <w:nsid w:val="4B5D780E"/>
     <w:multiLevelType w:val="singleLevel"/>
     <w:tmpl w:val="04160001"/>
     <w:lvl w:ilvl="0">
@@ -22864,7 +22919,7 @@
     </w:lvl>
   </w:abstractNum>
   <w:abstractNum w:abstractNumId="15" w15:restartNumberingAfterBreak="0">
-    <w:nsid w:val="4E2F2364"/>
+    <w:nsid w:val="4BF42086"/>
     <w:multiLevelType w:val="singleLevel"/>
     <w:tmpl w:val="04160001"/>
     <w:lvl w:ilvl="0">
@@ -22881,7 +22936,7 @@
     </w:lvl>
   </w:abstractNum>
   <w:abstractNum w:abstractNumId="16" w15:restartNumberingAfterBreak="0">
-    <w:nsid w:val="4E4F0299"/>
+    <w:nsid w:val="4E22355A"/>
     <w:multiLevelType w:val="singleLevel"/>
     <w:tmpl w:val="04160001"/>
     <w:lvl w:ilvl="0">
@@ -22898,7 +22953,7 @@
     </w:lvl>
   </w:abstractNum>
   <w:abstractNum w:abstractNumId="17" w15:restartNumberingAfterBreak="0">
-    <w:nsid w:val="4FE8382B"/>
+    <w:nsid w:val="4F8273FC"/>
     <w:multiLevelType w:val="singleLevel"/>
     <w:tmpl w:val="04160001"/>
     <w:lvl w:ilvl="0">
@@ -22915,7 +22970,7 @@
     </w:lvl>
   </w:abstractNum>
   <w:abstractNum w:abstractNumId="18" w15:restartNumberingAfterBreak="0">
-    <w:nsid w:val="52857BB6"/>
+    <w:nsid w:val="502E475F"/>
     <w:multiLevelType w:val="singleLevel"/>
     <w:tmpl w:val="04160001"/>
     <w:lvl w:ilvl="0">
@@ -22932,7 +22987,7 @@
     </w:lvl>
   </w:abstractNum>
   <w:abstractNum w:abstractNumId="19" w15:restartNumberingAfterBreak="0">
-    <w:nsid w:val="54A62088"/>
+    <w:nsid w:val="5CF435D7"/>
     <w:multiLevelType w:val="singleLevel"/>
     <w:tmpl w:val="04160001"/>
     <w:lvl w:ilvl="0">
@@ -22949,7 +23004,7 @@
     </w:lvl>
   </w:abstractNum>
   <w:abstractNum w:abstractNumId="20" w15:restartNumberingAfterBreak="0">
-    <w:nsid w:val="5A2216AB"/>
+    <w:nsid w:val="5D334777"/>
     <w:multiLevelType w:val="singleLevel"/>
     <w:tmpl w:val="04160001"/>
     <w:lvl w:ilvl="0">
@@ -22966,7 +23021,7 @@
     </w:lvl>
   </w:abstractNum>
   <w:abstractNum w:abstractNumId="21" w15:restartNumberingAfterBreak="0">
-    <w:nsid w:val="6251004E"/>
+    <w:nsid w:val="636021EF"/>
     <w:multiLevelType w:val="singleLevel"/>
     <w:tmpl w:val="04160001"/>
     <w:lvl w:ilvl="0">
@@ -22983,7 +23038,7 @@
     </w:lvl>
   </w:abstractNum>
   <w:abstractNum w:abstractNumId="22" w15:restartNumberingAfterBreak="0">
-    <w:nsid w:val="657E60CC"/>
+    <w:nsid w:val="661A4CC4"/>
     <w:multiLevelType w:val="singleLevel"/>
     <w:tmpl w:val="04160001"/>
     <w:lvl w:ilvl="0">
@@ -23000,7 +23055,7 @@
     </w:lvl>
   </w:abstractNum>
   <w:abstractNum w:abstractNumId="23" w15:restartNumberingAfterBreak="0">
-    <w:nsid w:val="696D42C6"/>
+    <w:nsid w:val="66C0214F"/>
     <w:multiLevelType w:val="singleLevel"/>
     <w:tmpl w:val="04160001"/>
     <w:lvl w:ilvl="0">
@@ -23017,7 +23072,7 @@
     </w:lvl>
   </w:abstractNum>
   <w:abstractNum w:abstractNumId="24" w15:restartNumberingAfterBreak="0">
-    <w:nsid w:val="6C71048D"/>
+    <w:nsid w:val="6BF84C45"/>
     <w:multiLevelType w:val="singleLevel"/>
     <w:tmpl w:val="04160001"/>
     <w:lvl w:ilvl="0">
@@ -23034,7 +23089,7 @@
     </w:lvl>
   </w:abstractNum>
   <w:abstractNum w:abstractNumId="25" w15:restartNumberingAfterBreak="0">
-    <w:nsid w:val="70F12717"/>
+    <w:nsid w:val="6DE113E9"/>
     <w:multiLevelType w:val="singleLevel"/>
     <w:tmpl w:val="04160001"/>
     <w:lvl w:ilvl="0">
@@ -23051,7 +23106,7 @@
     </w:lvl>
   </w:abstractNum>
   <w:abstractNum w:abstractNumId="26" w15:restartNumberingAfterBreak="0">
-    <w:nsid w:val="72893C62"/>
+    <w:nsid w:val="70F10E98"/>
     <w:multiLevelType w:val="singleLevel"/>
     <w:tmpl w:val="04160001"/>
     <w:lvl w:ilvl="0">
@@ -23068,7 +23123,7 @@
     </w:lvl>
   </w:abstractNum>
   <w:abstractNum w:abstractNumId="27" w15:restartNumberingAfterBreak="0">
-    <w:nsid w:val="72EC0BA2"/>
+    <w:nsid w:val="713D0AF6"/>
     <w:multiLevelType w:val="singleLevel"/>
     <w:tmpl w:val="04160001"/>
     <w:lvl w:ilvl="0">
@@ -23085,7 +23140,7 @@
     </w:lvl>
   </w:abstractNum>
   <w:abstractNum w:abstractNumId="28" w15:restartNumberingAfterBreak="0">
-    <w:nsid w:val="73D33B86"/>
+    <w:nsid w:val="7185479F"/>
     <w:multiLevelType w:val="singleLevel"/>
     <w:tmpl w:val="04160001"/>
     <w:lvl w:ilvl="0">
@@ -23102,7 +23157,7 @@
     </w:lvl>
   </w:abstractNum>
   <w:abstractNum w:abstractNumId="29" w15:restartNumberingAfterBreak="0">
-    <w:nsid w:val="74081EA6"/>
+    <w:nsid w:val="7A6671C7"/>
     <w:multiLevelType w:val="singleLevel"/>
     <w:tmpl w:val="04160001"/>
     <w:lvl w:ilvl="0">
@@ -23119,7 +23174,7 @@
     </w:lvl>
   </w:abstractNum>
   <w:abstractNum w:abstractNumId="30" w15:restartNumberingAfterBreak="0">
-    <w:nsid w:val="7DCA11AD"/>
+    <w:nsid w:val="7BA239DE"/>
     <w:multiLevelType w:val="singleLevel"/>
     <w:tmpl w:val="04160001"/>
     <w:lvl w:ilvl="0">
@@ -23136,7 +23191,7 @@
     </w:lvl>
   </w:abstractNum>
   <w:abstractNum w:abstractNumId="31" w15:restartNumberingAfterBreak="0">
-    <w:nsid w:val="7E4C72CA"/>
+    <w:nsid w:val="7DC2545D"/>
     <w:multiLevelType w:val="singleLevel"/>
     <w:tmpl w:val="04160001"/>
     <w:lvl w:ilvl="0">
@@ -23153,7 +23208,7 @@
     </w:lvl>
   </w:abstractNum>
   <w:abstractNum w:abstractNumId="32" w15:restartNumberingAfterBreak="0">
-    <w:nsid w:val="7E5A141A"/>
+    <w:nsid w:val="7F7C0E4F"/>
     <w:multiLevelType w:val="singleLevel"/>
     <w:tmpl w:val="04160001"/>
     <w:lvl w:ilvl="0">
@@ -23169,104 +23224,104 @@
       </w:rPr>
     </w:lvl>
   </w:abstractNum>
-  <w:num w:numId="1" w16cid:durableId="926695013">
+  <w:num w:numId="1" w16cid:durableId="883761459">
+    <w:abstractNumId w:val="12"/>
+  </w:num>
+  <w:num w:numId="2" w16cid:durableId="1457404858">
+    <w:abstractNumId w:val="5"/>
+  </w:num>
+  <w:num w:numId="3" w16cid:durableId="1144814229">
+    <w:abstractNumId w:val="22"/>
+  </w:num>
+  <w:num w:numId="4" w16cid:durableId="107704760">
+    <w:abstractNumId w:val="0"/>
+  </w:num>
+  <w:num w:numId="5" w16cid:durableId="307363921">
+    <w:abstractNumId w:val="15"/>
+  </w:num>
+  <w:num w:numId="6" w16cid:durableId="691341578">
+    <w:abstractNumId w:val="31"/>
+  </w:num>
+  <w:num w:numId="7" w16cid:durableId="211968458">
+    <w:abstractNumId w:val="19"/>
+  </w:num>
+  <w:num w:numId="8" w16cid:durableId="336806918">
+    <w:abstractNumId w:val="18"/>
+  </w:num>
+  <w:num w:numId="9" w16cid:durableId="1721978185">
+    <w:abstractNumId w:val="9"/>
+  </w:num>
+  <w:num w:numId="10" w16cid:durableId="1124277238">
+    <w:abstractNumId w:val="20"/>
+  </w:num>
+  <w:num w:numId="11" w16cid:durableId="1223179420">
+    <w:abstractNumId w:val="25"/>
+  </w:num>
+  <w:num w:numId="12" w16cid:durableId="1895891882">
+    <w:abstractNumId w:val="17"/>
+  </w:num>
+  <w:num w:numId="13" w16cid:durableId="302348530">
+    <w:abstractNumId w:val="8"/>
+  </w:num>
+  <w:num w:numId="14" w16cid:durableId="1287008734">
+    <w:abstractNumId w:val="13"/>
+  </w:num>
+  <w:num w:numId="15" w16cid:durableId="1669552753">
+    <w:abstractNumId w:val="30"/>
+  </w:num>
+  <w:num w:numId="16" w16cid:durableId="1070805965">
+    <w:abstractNumId w:val="29"/>
+  </w:num>
+  <w:num w:numId="17" w16cid:durableId="6715302">
+    <w:abstractNumId w:val="24"/>
+  </w:num>
+  <w:num w:numId="18" w16cid:durableId="1337726756">
+    <w:abstractNumId w:val="1"/>
+  </w:num>
+  <w:num w:numId="19" w16cid:durableId="1197427179">
+    <w:abstractNumId w:val="4"/>
+  </w:num>
+  <w:num w:numId="20" w16cid:durableId="1879778893">
+    <w:abstractNumId w:val="3"/>
+  </w:num>
+  <w:num w:numId="21" w16cid:durableId="433943018">
+    <w:abstractNumId w:val="23"/>
+  </w:num>
+  <w:num w:numId="22" w16cid:durableId="285506950">
+    <w:abstractNumId w:val="16"/>
+  </w:num>
+  <w:num w:numId="23" w16cid:durableId="669677876">
+    <w:abstractNumId w:val="32"/>
+  </w:num>
+  <w:num w:numId="24" w16cid:durableId="178855912">
+    <w:abstractNumId w:val="11"/>
+  </w:num>
+  <w:num w:numId="25" w16cid:durableId="1271746160">
+    <w:abstractNumId w:val="21"/>
+  </w:num>
+  <w:num w:numId="26" w16cid:durableId="606929907">
+    <w:abstractNumId w:val="10"/>
+  </w:num>
+  <w:num w:numId="27" w16cid:durableId="1948387284">
     <w:abstractNumId w:val="28"/>
   </w:num>
-  <w:num w:numId="2" w16cid:durableId="340010427">
-    <w:abstractNumId w:val="9"/>
+  <w:num w:numId="28" w16cid:durableId="1334143969">
+    <w:abstractNumId w:val="26"/>
   </w:num>
-  <w:num w:numId="3" w16cid:durableId="2096702771">
-    <w:abstractNumId w:val="17"/>
+  <w:num w:numId="29" w16cid:durableId="171342879">
+    <w:abstractNumId w:val="2"/>
   </w:num>
-  <w:num w:numId="4" w16cid:durableId="319045261">
-    <w:abstractNumId w:val="20"/>
+  <w:num w:numId="30" w16cid:durableId="1902911130">
+    <w:abstractNumId w:val="7"/>
   </w:num>
-  <w:num w:numId="5" w16cid:durableId="189343407">
-    <w:abstractNumId w:val="16"/>
-  </w:num>
-  <w:num w:numId="6" w16cid:durableId="1061295301">
-    <w:abstractNumId w:val="25"/>
-  </w:num>
-  <w:num w:numId="7" w16cid:durableId="1080712270">
-    <w:abstractNumId w:val="29"/>
-  </w:num>
-  <w:num w:numId="8" w16cid:durableId="1795561521">
-    <w:abstractNumId w:val="12"/>
-  </w:num>
-  <w:num w:numId="9" w16cid:durableId="1407024794">
-    <w:abstractNumId w:val="10"/>
-  </w:num>
-  <w:num w:numId="10" w16cid:durableId="687369308">
-    <w:abstractNumId w:val="22"/>
-  </w:num>
-  <w:num w:numId="11" w16cid:durableId="1042553141">
-    <w:abstractNumId w:val="13"/>
-  </w:num>
-  <w:num w:numId="12" w16cid:durableId="255990399">
-    <w:abstractNumId w:val="8"/>
-  </w:num>
-  <w:num w:numId="13" w16cid:durableId="1951234018">
-    <w:abstractNumId w:val="23"/>
-  </w:num>
-  <w:num w:numId="14" w16cid:durableId="1070277072">
-    <w:abstractNumId w:val="24"/>
-  </w:num>
-  <w:num w:numId="15" w16cid:durableId="1051071839">
-    <w:abstractNumId w:val="1"/>
-  </w:num>
-  <w:num w:numId="16" w16cid:durableId="608048768">
-    <w:abstractNumId w:val="21"/>
-  </w:num>
-  <w:num w:numId="17" w16cid:durableId="1782333383">
-    <w:abstractNumId w:val="30"/>
-  </w:num>
-  <w:num w:numId="18" w16cid:durableId="1799106306">
-    <w:abstractNumId w:val="5"/>
-  </w:num>
-  <w:num w:numId="19" w16cid:durableId="246578410">
+  <w:num w:numId="31" w16cid:durableId="1235506444">
     <w:abstractNumId w:val="27"/>
   </w:num>
-  <w:num w:numId="20" w16cid:durableId="1186165475">
-    <w:abstractNumId w:val="14"/>
-  </w:num>
-  <w:num w:numId="21" w16cid:durableId="1873372610">
+  <w:num w:numId="32" w16cid:durableId="337318259">
     <w:abstractNumId w:val="6"/>
   </w:num>
-  <w:num w:numId="22" w16cid:durableId="1869023223">
-    <w:abstractNumId w:val="18"/>
-  </w:num>
-  <w:num w:numId="23" w16cid:durableId="963391107">
-    <w:abstractNumId w:val="3"/>
-  </w:num>
-  <w:num w:numId="24" w16cid:durableId="994727087">
-    <w:abstractNumId w:val="2"/>
-  </w:num>
-  <w:num w:numId="25" w16cid:durableId="823355322">
-    <w:abstractNumId w:val="7"/>
-  </w:num>
-  <w:num w:numId="26" w16cid:durableId="1187602181">
-    <w:abstractNumId w:val="31"/>
-  </w:num>
-  <w:num w:numId="27" w16cid:durableId="403574078">
-    <w:abstractNumId w:val="11"/>
-  </w:num>
-  <w:num w:numId="28" w16cid:durableId="1358121527">
-    <w:abstractNumId w:val="26"/>
-  </w:num>
-  <w:num w:numId="29" w16cid:durableId="126053182">
-    <w:abstractNumId w:val="32"/>
-  </w:num>
-  <w:num w:numId="30" w16cid:durableId="1399942303">
-    <w:abstractNumId w:val="19"/>
-  </w:num>
-  <w:num w:numId="31" w16cid:durableId="1435783640">
-    <w:abstractNumId w:val="0"/>
-  </w:num>
-  <w:num w:numId="32" w16cid:durableId="169956317">
-    <w:abstractNumId w:val="4"/>
-  </w:num>
-  <w:num w:numId="33" w16cid:durableId="1800342396">
-    <w:abstractNumId w:val="15"/>
+  <w:num w:numId="33" w16cid:durableId="152844179">
+    <w:abstractNumId w:val="14"/>
   </w:num>
 </w:numbering>
 </file>
@@ -23679,7 +23734,7 @@
     <w:link w:val="Ttulo1Char"/>
     <w:uiPriority w:val="9"/>
     <w:qFormat/>
-    <w:rsid w:val="006B7EDB"/>
+    <w:rsid w:val="0083466F"/>
     <w:pPr>
       <w:keepNext/>
       <w:keepLines/>
@@ -23701,7 +23756,7 @@
     <w:uiPriority w:val="9"/>
     <w:unhideWhenUsed/>
     <w:qFormat/>
-    <w:rsid w:val="006B7EDB"/>
+    <w:rsid w:val="0083466F"/>
     <w:pPr>
       <w:keepNext/>
       <w:keepLines/>
@@ -23724,7 +23779,7 @@
     <w:semiHidden/>
     <w:unhideWhenUsed/>
     <w:qFormat/>
-    <w:rsid w:val="006B7EDB"/>
+    <w:rsid w:val="0083466F"/>
     <w:pPr>
       <w:keepNext/>
       <w:keepLines/>
@@ -23747,7 +23802,7 @@
     <w:semiHidden/>
     <w:unhideWhenUsed/>
     <w:qFormat/>
-    <w:rsid w:val="006B7EDB"/>
+    <w:rsid w:val="0083466F"/>
     <w:pPr>
       <w:keepNext/>
       <w:keepLines/>
@@ -23770,7 +23825,7 @@
     <w:semiHidden/>
     <w:unhideWhenUsed/>
     <w:qFormat/>
-    <w:rsid w:val="006B7EDB"/>
+    <w:rsid w:val="0083466F"/>
     <w:pPr>
       <w:keepNext/>
       <w:keepLines/>
@@ -23791,7 +23846,7 @@
     <w:semiHidden/>
     <w:unhideWhenUsed/>
     <w:qFormat/>
-    <w:rsid w:val="006B7EDB"/>
+    <w:rsid w:val="0083466F"/>
     <w:pPr>
       <w:keepNext/>
       <w:keepLines/>
@@ -23814,7 +23869,7 @@
     <w:semiHidden/>
     <w:unhideWhenUsed/>
     <w:qFormat/>
-    <w:rsid w:val="006B7EDB"/>
+    <w:rsid w:val="0083466F"/>
     <w:pPr>
       <w:keepNext/>
       <w:keepLines/>
@@ -23835,7 +23890,7 @@
     <w:semiHidden/>
     <w:unhideWhenUsed/>
     <w:qFormat/>
-    <w:rsid w:val="006B7EDB"/>
+    <w:rsid w:val="0083466F"/>
     <w:pPr>
       <w:keepNext/>
       <w:keepLines/>
@@ -23858,7 +23913,7 @@
     <w:semiHidden/>
     <w:unhideWhenUsed/>
     <w:qFormat/>
-    <w:rsid w:val="006B7EDB"/>
+    <w:rsid w:val="0083466F"/>
     <w:pPr>
       <w:keepNext/>
       <w:keepLines/>
@@ -23902,7 +23957,7 @@
     <w:basedOn w:val="Fontepargpadro"/>
     <w:link w:val="Ttulo1"/>
     <w:uiPriority w:val="9"/>
-    <w:rsid w:val="006B7EDB"/>
+    <w:rsid w:val="0083466F"/>
     <w:rPr>
       <w:rFonts w:asciiTheme="majorHAnsi" w:eastAsiaTheme="majorEastAsia" w:hAnsiTheme="majorHAnsi" w:cstheme="majorBidi"/>
       <w:color w:val="0F4761" w:themeColor="accent1" w:themeShade="BF"/>
@@ -23915,7 +23970,7 @@
     <w:basedOn w:val="Fontepargpadro"/>
     <w:link w:val="Ttulo2"/>
     <w:uiPriority w:val="9"/>
-    <w:rsid w:val="006B7EDB"/>
+    <w:rsid w:val="0083466F"/>
     <w:rPr>
       <w:rFonts w:asciiTheme="majorHAnsi" w:eastAsiaTheme="majorEastAsia" w:hAnsiTheme="majorHAnsi" w:cstheme="majorBidi"/>
       <w:color w:val="0F4761" w:themeColor="accent1" w:themeShade="BF"/>
@@ -23929,7 +23984,7 @@
     <w:link w:val="Ttulo3"/>
     <w:uiPriority w:val="9"/>
     <w:semiHidden/>
-    <w:rsid w:val="006B7EDB"/>
+    <w:rsid w:val="0083466F"/>
     <w:rPr>
       <w:rFonts w:eastAsiaTheme="majorEastAsia" w:cstheme="majorBidi"/>
       <w:color w:val="0F4761" w:themeColor="accent1" w:themeShade="BF"/>
@@ -23943,7 +23998,7 @@
     <w:link w:val="Ttulo4"/>
     <w:uiPriority w:val="9"/>
     <w:semiHidden/>
-    <w:rsid w:val="006B7EDB"/>
+    <w:rsid w:val="0083466F"/>
     <w:rPr>
       <w:rFonts w:eastAsiaTheme="majorEastAsia" w:cstheme="majorBidi"/>
       <w:i/>
@@ -23957,7 +24012,7 @@
     <w:link w:val="Ttulo5"/>
     <w:uiPriority w:val="9"/>
     <w:semiHidden/>
-    <w:rsid w:val="006B7EDB"/>
+    <w:rsid w:val="0083466F"/>
     <w:rPr>
       <w:rFonts w:eastAsiaTheme="majorEastAsia" w:cstheme="majorBidi"/>
       <w:color w:val="0F4761" w:themeColor="accent1" w:themeShade="BF"/>
@@ -23969,7 +24024,7 @@
     <w:link w:val="Ttulo6"/>
     <w:uiPriority w:val="9"/>
     <w:semiHidden/>
-    <w:rsid w:val="006B7EDB"/>
+    <w:rsid w:val="0083466F"/>
     <w:rPr>
       <w:rFonts w:eastAsiaTheme="majorEastAsia" w:cstheme="majorBidi"/>
       <w:i/>
@@ -23983,7 +24038,7 @@
     <w:link w:val="Ttulo7"/>
     <w:uiPriority w:val="9"/>
     <w:semiHidden/>
-    <w:rsid w:val="006B7EDB"/>
+    <w:rsid w:val="0083466F"/>
     <w:rPr>
       <w:rFonts w:eastAsiaTheme="majorEastAsia" w:cstheme="majorBidi"/>
       <w:color w:val="595959" w:themeColor="text1" w:themeTint="A6"/>
@@ -23995,7 +24050,7 @@
     <w:link w:val="Ttulo8"/>
     <w:uiPriority w:val="9"/>
     <w:semiHidden/>
-    <w:rsid w:val="006B7EDB"/>
+    <w:rsid w:val="0083466F"/>
     <w:rPr>
       <w:rFonts w:eastAsiaTheme="majorEastAsia" w:cstheme="majorBidi"/>
       <w:i/>
@@ -24009,7 +24064,7 @@
     <w:link w:val="Ttulo9"/>
     <w:uiPriority w:val="9"/>
     <w:semiHidden/>
-    <w:rsid w:val="006B7EDB"/>
+    <w:rsid w:val="0083466F"/>
     <w:rPr>
       <w:rFonts w:eastAsiaTheme="majorEastAsia" w:cstheme="majorBidi"/>
       <w:color w:val="272727" w:themeColor="text1" w:themeTint="D8"/>
@@ -24022,7 +24077,7 @@
     <w:link w:val="TtuloChar"/>
     <w:uiPriority w:val="10"/>
     <w:qFormat/>
-    <w:rsid w:val="006B7EDB"/>
+    <w:rsid w:val="0083466F"/>
     <w:pPr>
       <w:spacing w:after="80" w:line="240" w:lineRule="auto"/>
       <w:contextualSpacing/>
@@ -24040,7 +24095,7 @@
     <w:basedOn w:val="Fontepargpadro"/>
     <w:link w:val="Ttulo"/>
     <w:uiPriority w:val="10"/>
-    <w:rsid w:val="006B7EDB"/>
+    <w:rsid w:val="0083466F"/>
     <w:rPr>
       <w:rFonts w:asciiTheme="majorHAnsi" w:eastAsiaTheme="majorEastAsia" w:hAnsiTheme="majorHAnsi" w:cstheme="majorBidi"/>
       <w:spacing w:val="-10"/>
@@ -24056,7 +24111,7 @@
     <w:link w:val="SubttuloChar"/>
     <w:uiPriority w:val="11"/>
     <w:qFormat/>
-    <w:rsid w:val="006B7EDB"/>
+    <w:rsid w:val="0083466F"/>
     <w:pPr>
       <w:numPr>
         <w:ilvl w:val="1"/>
@@ -24075,7 +24130,7 @@
     <w:basedOn w:val="Fontepargpadro"/>
     <w:link w:val="Subttulo"/>
     <w:uiPriority w:val="11"/>
-    <w:rsid w:val="006B7EDB"/>
+    <w:rsid w:val="0083466F"/>
     <w:rPr>
       <w:rFonts w:eastAsiaTheme="majorEastAsia" w:cstheme="majorBidi"/>
       <w:color w:val="595959" w:themeColor="text1" w:themeTint="A6"/>
@@ -24091,7 +24146,7 @@
     <w:link w:val="CitaoChar"/>
     <w:uiPriority w:val="29"/>
     <w:qFormat/>
-    <w:rsid w:val="006B7EDB"/>
+    <w:rsid w:val="0083466F"/>
     <w:pPr>
       <w:spacing w:before="160"/>
       <w:jc w:val="center"/>
@@ -24107,7 +24162,7 @@
     <w:basedOn w:val="Fontepargpadro"/>
     <w:link w:val="Citao"/>
     <w:uiPriority w:val="29"/>
-    <w:rsid w:val="006B7EDB"/>
+    <w:rsid w:val="0083466F"/>
     <w:rPr>
       <w:i/>
       <w:iCs/>
@@ -24119,7 +24174,7 @@
     <w:basedOn w:val="Normal"/>
     <w:uiPriority w:val="34"/>
     <w:qFormat/>
-    <w:rsid w:val="006B7EDB"/>
+    <w:rsid w:val="0083466F"/>
     <w:pPr>
       <w:ind w:left="720"/>
       <w:contextualSpacing/>
@@ -24130,7 +24185,7 @@
     <w:basedOn w:val="Fontepargpadro"/>
     <w:uiPriority w:val="21"/>
     <w:qFormat/>
-    <w:rsid w:val="006B7EDB"/>
+    <w:rsid w:val="0083466F"/>
     <w:rPr>
       <w:i/>
       <w:iCs/>
@@ -24144,7 +24199,7 @@
     <w:link w:val="CitaoIntensaChar"/>
     <w:uiPriority w:val="30"/>
     <w:qFormat/>
-    <w:rsid w:val="006B7EDB"/>
+    <w:rsid w:val="0083466F"/>
     <w:pPr>
       <w:pBdr>
         <w:top w:val="single" w:sz="4" w:space="10" w:color="0F4761" w:themeColor="accent1" w:themeShade="BF"/>
@@ -24165,7 +24220,7 @@
     <w:basedOn w:val="Fontepargpadro"/>
     <w:link w:val="CitaoIntensa"/>
     <w:uiPriority w:val="30"/>
-    <w:rsid w:val="006B7EDB"/>
+    <w:rsid w:val="0083466F"/>
     <w:rPr>
       <w:i/>
       <w:iCs/>
@@ -24177,7 +24232,7 @@
     <w:basedOn w:val="Fontepargpadro"/>
     <w:uiPriority w:val="32"/>
     <w:qFormat/>
-    <w:rsid w:val="006B7EDB"/>
+    <w:rsid w:val="0083466F"/>
     <w:rPr>
       <w:b/>
       <w:bCs/>
@@ -24192,7 +24247,7 @@
     <w:link w:val="CabealhoChar"/>
     <w:uiPriority w:val="99"/>
     <w:unhideWhenUsed/>
-    <w:rsid w:val="006B7EDB"/>
+    <w:rsid w:val="0083466F"/>
     <w:pPr>
       <w:tabs>
         <w:tab w:val="center" w:pos="4252"/>
@@ -24206,7 +24261,7 @@
     <w:basedOn w:val="Fontepargpadro"/>
     <w:link w:val="Cabealho"/>
     <w:uiPriority w:val="99"/>
-    <w:rsid w:val="006B7EDB"/>
+    <w:rsid w:val="0083466F"/>
   </w:style>
   <w:style w:type="paragraph" w:styleId="Rodap">
     <w:name w:val="footer"/>
@@ -24214,7 +24269,7 @@
     <w:link w:val="RodapChar"/>
     <w:uiPriority w:val="99"/>
     <w:unhideWhenUsed/>
-    <w:rsid w:val="006B7EDB"/>
+    <w:rsid w:val="0083466F"/>
     <w:pPr>
       <w:tabs>
         <w:tab w:val="center" w:pos="4252"/>
@@ -24228,7 +24283,7 @@
     <w:basedOn w:val="Fontepargpadro"/>
     <w:link w:val="Rodap"/>
     <w:uiPriority w:val="99"/>
-    <w:rsid w:val="006B7EDB"/>
+    <w:rsid w:val="0083466F"/>
   </w:style>
   <w:style w:type="paragraph" w:styleId="Sumrio1">
     <w:name w:val="toc 1"/>
@@ -24237,7 +24292,7 @@
     <w:autoRedefine/>
     <w:uiPriority w:val="39"/>
     <w:unhideWhenUsed/>
-    <w:rsid w:val="006B7EDB"/>
+    <w:rsid w:val="0083466F"/>
     <w:pPr>
       <w:spacing w:after="100"/>
     </w:pPr>
@@ -24249,7 +24304,7 @@
     <w:autoRedefine/>
     <w:uiPriority w:val="39"/>
     <w:unhideWhenUsed/>
-    <w:rsid w:val="006B7EDB"/>
+    <w:rsid w:val="0083466F"/>
     <w:pPr>
       <w:spacing w:after="100"/>
       <w:ind w:left="240"/>

</xml_diff>

<commit_message>
Adiciona tendência de risco ao Relatório de Resultados — Fase 3 (fecha a proposta)
Sincroniza com a produção: o Relatório de Resultados ganha um quarto
indicador estratégico, "Projetos sem risco alto/crítico", com meta
configurável, selo de status e tendência dos últimos salvamentos. O
Relatório de Situação passou a gravar, a cada salvamento, uma contagem
de risco por portfólio (já que o risco vive inteiramente no TAP, sem
campo próprio que mude entre salvamentos do relatório) para alimentar
essa tendência. A apresentação PPTX exportada foi reajustada para caber
os 4 indicadores lado a lado.

Documentação (Central de Ajuda v=43, Manual de Uso v2.56) atualizada.

Co-Authored-By: Claude Sonnet 5 <noreply@anthropic.com>
</commit_message>
<xml_diff>
--- a/Manual de Uso - Ferramenta de Gestao de Projetos.docx
+++ b/Manual de Uso - Ferramenta de Gestao de Projetos.docx
@@ -229,7 +229,7 @@
         <w:rPr>
           <w:noProof/>
         </w:rPr>
-        <w:instrText xml:space="preserve"> PAGEREF _Toc240032077 \h </w:instrText>
+        <w:instrText xml:space="preserve"> PAGEREF _Toc240033444 \h </w:instrText>
       </w:r>
       <w:r>
         <w:rPr>
@@ -290,7 +290,7 @@
         <w:rPr>
           <w:noProof/>
         </w:rPr>
-        <w:instrText xml:space="preserve"> PAGEREF _Toc240032078 \h </w:instrText>
+        <w:instrText xml:space="preserve"> PAGEREF _Toc240033445 \h </w:instrText>
       </w:r>
       <w:r>
         <w:rPr>
@@ -351,7 +351,7 @@
         <w:rPr>
           <w:noProof/>
         </w:rPr>
-        <w:instrText xml:space="preserve"> PAGEREF _Toc240032079 \h </w:instrText>
+        <w:instrText xml:space="preserve"> PAGEREF _Toc240033446 \h </w:instrText>
       </w:r>
       <w:r>
         <w:rPr>
@@ -412,7 +412,7 @@
         <w:rPr>
           <w:noProof/>
         </w:rPr>
-        <w:instrText xml:space="preserve"> PAGEREF _Toc240032080 \h </w:instrText>
+        <w:instrText xml:space="preserve"> PAGEREF _Toc240033447 \h </w:instrText>
       </w:r>
       <w:r>
         <w:rPr>
@@ -473,7 +473,7 @@
         <w:rPr>
           <w:noProof/>
         </w:rPr>
-        <w:instrText xml:space="preserve"> PAGEREF _Toc240032081 \h </w:instrText>
+        <w:instrText xml:space="preserve"> PAGEREF _Toc240033448 \h </w:instrText>
       </w:r>
       <w:r>
         <w:rPr>
@@ -534,7 +534,7 @@
         <w:rPr>
           <w:noProof/>
         </w:rPr>
-        <w:instrText xml:space="preserve"> PAGEREF _Toc240032082 \h </w:instrText>
+        <w:instrText xml:space="preserve"> PAGEREF _Toc240033449 \h </w:instrText>
       </w:r>
       <w:r>
         <w:rPr>
@@ -595,7 +595,7 @@
         <w:rPr>
           <w:noProof/>
         </w:rPr>
-        <w:instrText xml:space="preserve"> PAGEREF _Toc240032083 \h </w:instrText>
+        <w:instrText xml:space="preserve"> PAGEREF _Toc240033450 \h </w:instrText>
       </w:r>
       <w:r>
         <w:rPr>
@@ -656,7 +656,7 @@
         <w:rPr>
           <w:noProof/>
         </w:rPr>
-        <w:instrText xml:space="preserve"> PAGEREF _Toc240032084 \h </w:instrText>
+        <w:instrText xml:space="preserve"> PAGEREF _Toc240033451 \h </w:instrText>
       </w:r>
       <w:r>
         <w:rPr>
@@ -717,7 +717,7 @@
         <w:rPr>
           <w:noProof/>
         </w:rPr>
-        <w:instrText xml:space="preserve"> PAGEREF _Toc240032085 \h </w:instrText>
+        <w:instrText xml:space="preserve"> PAGEREF _Toc240033452 \h </w:instrText>
       </w:r>
       <w:r>
         <w:rPr>
@@ -778,7 +778,7 @@
         <w:rPr>
           <w:noProof/>
         </w:rPr>
-        <w:instrText xml:space="preserve"> PAGEREF _Toc240032086 \h </w:instrText>
+        <w:instrText xml:space="preserve"> PAGEREF _Toc240033453 \h </w:instrText>
       </w:r>
       <w:r>
         <w:rPr>
@@ -839,7 +839,7 @@
         <w:rPr>
           <w:noProof/>
         </w:rPr>
-        <w:instrText xml:space="preserve"> PAGEREF _Toc240032087 \h </w:instrText>
+        <w:instrText xml:space="preserve"> PAGEREF _Toc240033454 \h </w:instrText>
       </w:r>
       <w:r>
         <w:rPr>
@@ -900,7 +900,7 @@
         <w:rPr>
           <w:noProof/>
         </w:rPr>
-        <w:instrText xml:space="preserve"> PAGEREF _Toc240032088 \h </w:instrText>
+        <w:instrText xml:space="preserve"> PAGEREF _Toc240033455 \h </w:instrText>
       </w:r>
       <w:r>
         <w:rPr>
@@ -961,7 +961,7 @@
         <w:rPr>
           <w:noProof/>
         </w:rPr>
-        <w:instrText xml:space="preserve"> PAGEREF _Toc240032089 \h </w:instrText>
+        <w:instrText xml:space="preserve"> PAGEREF _Toc240033456 \h </w:instrText>
       </w:r>
       <w:r>
         <w:rPr>
@@ -1022,7 +1022,7 @@
         <w:rPr>
           <w:noProof/>
         </w:rPr>
-        <w:instrText xml:space="preserve"> PAGEREF _Toc240032090 \h </w:instrText>
+        <w:instrText xml:space="preserve"> PAGEREF _Toc240033457 \h </w:instrText>
       </w:r>
       <w:r>
         <w:rPr>
@@ -1083,7 +1083,7 @@
         <w:rPr>
           <w:noProof/>
         </w:rPr>
-        <w:instrText xml:space="preserve"> PAGEREF _Toc240032091 \h </w:instrText>
+        <w:instrText xml:space="preserve"> PAGEREF _Toc240033458 \h </w:instrText>
       </w:r>
       <w:r>
         <w:rPr>
@@ -1144,7 +1144,7 @@
         <w:rPr>
           <w:noProof/>
         </w:rPr>
-        <w:instrText xml:space="preserve"> PAGEREF _Toc240032092 \h </w:instrText>
+        <w:instrText xml:space="preserve"> PAGEREF _Toc240033459 \h </w:instrText>
       </w:r>
       <w:r>
         <w:rPr>
@@ -1205,7 +1205,7 @@
         <w:rPr>
           <w:noProof/>
         </w:rPr>
-        <w:instrText xml:space="preserve"> PAGEREF _Toc240032093 \h </w:instrText>
+        <w:instrText xml:space="preserve"> PAGEREF _Toc240033460 \h </w:instrText>
       </w:r>
       <w:r>
         <w:rPr>
@@ -1266,7 +1266,7 @@
         <w:rPr>
           <w:noProof/>
         </w:rPr>
-        <w:instrText xml:space="preserve"> PAGEREF _Toc240032094 \h </w:instrText>
+        <w:instrText xml:space="preserve"> PAGEREF _Toc240033461 \h </w:instrText>
       </w:r>
       <w:r>
         <w:rPr>
@@ -1327,7 +1327,7 @@
         <w:rPr>
           <w:noProof/>
         </w:rPr>
-        <w:instrText xml:space="preserve"> PAGEREF _Toc240032095 \h </w:instrText>
+        <w:instrText xml:space="preserve"> PAGEREF _Toc240033462 \h </w:instrText>
       </w:r>
       <w:r>
         <w:rPr>
@@ -1388,7 +1388,7 @@
         <w:rPr>
           <w:noProof/>
         </w:rPr>
-        <w:instrText xml:space="preserve"> PAGEREF _Toc240032096 \h </w:instrText>
+        <w:instrText xml:space="preserve"> PAGEREF _Toc240033463 \h </w:instrText>
       </w:r>
       <w:r>
         <w:rPr>
@@ -1449,7 +1449,7 @@
         <w:rPr>
           <w:noProof/>
         </w:rPr>
-        <w:instrText xml:space="preserve"> PAGEREF _Toc240032097 \h </w:instrText>
+        <w:instrText xml:space="preserve"> PAGEREF _Toc240033464 \h </w:instrText>
       </w:r>
       <w:r>
         <w:rPr>
@@ -1510,7 +1510,7 @@
         <w:rPr>
           <w:noProof/>
         </w:rPr>
-        <w:instrText xml:space="preserve"> PAGEREF _Toc240032098 \h </w:instrText>
+        <w:instrText xml:space="preserve"> PAGEREF _Toc240033465 \h </w:instrText>
       </w:r>
       <w:r>
         <w:rPr>
@@ -1571,7 +1571,7 @@
         <w:rPr>
           <w:noProof/>
         </w:rPr>
-        <w:instrText xml:space="preserve"> PAGEREF _Toc240032099 \h </w:instrText>
+        <w:instrText xml:space="preserve"> PAGEREF _Toc240033466 \h </w:instrText>
       </w:r>
       <w:r>
         <w:rPr>
@@ -1632,7 +1632,7 @@
         <w:rPr>
           <w:noProof/>
         </w:rPr>
-        <w:instrText xml:space="preserve"> PAGEREF _Toc240032100 \h </w:instrText>
+        <w:instrText xml:space="preserve"> PAGEREF _Toc240033467 \h </w:instrText>
       </w:r>
       <w:r>
         <w:rPr>
@@ -1693,7 +1693,7 @@
         <w:rPr>
           <w:noProof/>
         </w:rPr>
-        <w:instrText xml:space="preserve"> PAGEREF _Toc240032101 \h </w:instrText>
+        <w:instrText xml:space="preserve"> PAGEREF _Toc240033468 \h </w:instrText>
       </w:r>
       <w:r>
         <w:rPr>
@@ -1755,7 +1755,7 @@
         <w:rPr>
           <w:noProof/>
         </w:rPr>
-        <w:instrText xml:space="preserve"> PAGEREF _Toc240032102 \h </w:instrText>
+        <w:instrText xml:space="preserve"> PAGEREF _Toc240033469 \h </w:instrText>
       </w:r>
       <w:r>
         <w:rPr>
@@ -1816,7 +1816,7 @@
         <w:rPr>
           <w:noProof/>
         </w:rPr>
-        <w:instrText xml:space="preserve"> PAGEREF _Toc240032103 \h </w:instrText>
+        <w:instrText xml:space="preserve"> PAGEREF _Toc240033470 \h </w:instrText>
       </w:r>
       <w:r>
         <w:rPr>
@@ -1877,7 +1877,7 @@
         <w:rPr>
           <w:noProof/>
         </w:rPr>
-        <w:instrText xml:space="preserve"> PAGEREF _Toc240032104 \h </w:instrText>
+        <w:instrText xml:space="preserve"> PAGEREF _Toc240033471 \h </w:instrText>
       </w:r>
       <w:r>
         <w:rPr>
@@ -1938,7 +1938,7 @@
         <w:rPr>
           <w:noProof/>
         </w:rPr>
-        <w:instrText xml:space="preserve"> PAGEREF _Toc240032105 \h </w:instrText>
+        <w:instrText xml:space="preserve"> PAGEREF _Toc240033472 \h </w:instrText>
       </w:r>
       <w:r>
         <w:rPr>
@@ -1999,7 +1999,7 @@
         <w:rPr>
           <w:noProof/>
         </w:rPr>
-        <w:instrText xml:space="preserve"> PAGEREF _Toc240032106 \h </w:instrText>
+        <w:instrText xml:space="preserve"> PAGEREF _Toc240033473 \h </w:instrText>
       </w:r>
       <w:r>
         <w:rPr>
@@ -2060,7 +2060,7 @@
         <w:rPr>
           <w:noProof/>
         </w:rPr>
-        <w:instrText xml:space="preserve"> PAGEREF _Toc240032107 \h </w:instrText>
+        <w:instrText xml:space="preserve"> PAGEREF _Toc240033474 \h </w:instrText>
       </w:r>
       <w:r>
         <w:rPr>
@@ -2121,7 +2121,7 @@
         <w:rPr>
           <w:noProof/>
         </w:rPr>
-        <w:instrText xml:space="preserve"> PAGEREF _Toc240032108 \h </w:instrText>
+        <w:instrText xml:space="preserve"> PAGEREF _Toc240033475 \h </w:instrText>
       </w:r>
       <w:r>
         <w:rPr>
@@ -2182,7 +2182,7 @@
         <w:rPr>
           <w:noProof/>
         </w:rPr>
-        <w:instrText xml:space="preserve"> PAGEREF _Toc240032109 \h </w:instrText>
+        <w:instrText xml:space="preserve"> PAGEREF _Toc240033476 \h </w:instrText>
       </w:r>
       <w:r>
         <w:rPr>
@@ -2243,7 +2243,7 @@
         <w:rPr>
           <w:noProof/>
         </w:rPr>
-        <w:instrText xml:space="preserve"> PAGEREF _Toc240032110 \h </w:instrText>
+        <w:instrText xml:space="preserve"> PAGEREF _Toc240033477 \h </w:instrText>
       </w:r>
       <w:r>
         <w:rPr>
@@ -2304,7 +2304,7 @@
         <w:rPr>
           <w:noProof/>
         </w:rPr>
-        <w:instrText xml:space="preserve"> PAGEREF _Toc240032111 \h </w:instrText>
+        <w:instrText xml:space="preserve"> PAGEREF _Toc240033478 \h </w:instrText>
       </w:r>
       <w:r>
         <w:rPr>
@@ -2365,7 +2365,7 @@
         <w:rPr>
           <w:noProof/>
         </w:rPr>
-        <w:instrText xml:space="preserve"> PAGEREF _Toc240032112 \h </w:instrText>
+        <w:instrText xml:space="preserve"> PAGEREF _Toc240033479 \h </w:instrText>
       </w:r>
       <w:r>
         <w:rPr>
@@ -2426,7 +2426,7 @@
         <w:rPr>
           <w:noProof/>
         </w:rPr>
-        <w:instrText xml:space="preserve"> PAGEREF _Toc240032113 \h </w:instrText>
+        <w:instrText xml:space="preserve"> PAGEREF _Toc240033480 \h </w:instrText>
       </w:r>
       <w:r>
         <w:rPr>
@@ -2487,7 +2487,7 @@
         <w:rPr>
           <w:noProof/>
         </w:rPr>
-        <w:instrText xml:space="preserve"> PAGEREF _Toc240032114 \h </w:instrText>
+        <w:instrText xml:space="preserve"> PAGEREF _Toc240033481 \h </w:instrText>
       </w:r>
       <w:r>
         <w:rPr>
@@ -2548,7 +2548,7 @@
         <w:rPr>
           <w:noProof/>
         </w:rPr>
-        <w:instrText xml:space="preserve"> PAGEREF _Toc240032115 \h </w:instrText>
+        <w:instrText xml:space="preserve"> PAGEREF _Toc240033482 \h </w:instrText>
       </w:r>
       <w:r>
         <w:rPr>
@@ -2609,7 +2609,7 @@
         <w:rPr>
           <w:noProof/>
         </w:rPr>
-        <w:instrText xml:space="preserve"> PAGEREF _Toc240032116 \h </w:instrText>
+        <w:instrText xml:space="preserve"> PAGEREF _Toc240033483 \h </w:instrText>
       </w:r>
       <w:r>
         <w:rPr>
@@ -2670,7 +2670,7 @@
         <w:rPr>
           <w:noProof/>
         </w:rPr>
-        <w:instrText xml:space="preserve"> PAGEREF _Toc240032117 \h </w:instrText>
+        <w:instrText xml:space="preserve"> PAGEREF _Toc240033484 \h </w:instrText>
       </w:r>
       <w:r>
         <w:rPr>
@@ -2731,7 +2731,7 @@
         <w:rPr>
           <w:noProof/>
         </w:rPr>
-        <w:instrText xml:space="preserve"> PAGEREF _Toc240032118 \h </w:instrText>
+        <w:instrText xml:space="preserve"> PAGEREF _Toc240033485 \h </w:instrText>
       </w:r>
       <w:r>
         <w:rPr>
@@ -2792,7 +2792,7 @@
         <w:rPr>
           <w:noProof/>
         </w:rPr>
-        <w:instrText xml:space="preserve"> PAGEREF _Toc240032119 \h </w:instrText>
+        <w:instrText xml:space="preserve"> PAGEREF _Toc240033486 \h </w:instrText>
       </w:r>
       <w:r>
         <w:rPr>
@@ -2853,7 +2853,7 @@
         <w:rPr>
           <w:noProof/>
         </w:rPr>
-        <w:instrText xml:space="preserve"> PAGEREF _Toc240032120 \h </w:instrText>
+        <w:instrText xml:space="preserve"> PAGEREF _Toc240033487 \h </w:instrText>
       </w:r>
       <w:r>
         <w:rPr>
@@ -2914,7 +2914,7 @@
         <w:rPr>
           <w:noProof/>
         </w:rPr>
-        <w:instrText xml:space="preserve"> PAGEREF _Toc240032121 \h </w:instrText>
+        <w:instrText xml:space="preserve"> PAGEREF _Toc240033488 \h </w:instrText>
       </w:r>
       <w:r>
         <w:rPr>
@@ -2975,7 +2975,7 @@
         <w:rPr>
           <w:noProof/>
         </w:rPr>
-        <w:instrText xml:space="preserve"> PAGEREF _Toc240032122 \h </w:instrText>
+        <w:instrText xml:space="preserve"> PAGEREF _Toc240033489 \h </w:instrText>
       </w:r>
       <w:r>
         <w:rPr>
@@ -3036,7 +3036,7 @@
         <w:rPr>
           <w:noProof/>
         </w:rPr>
-        <w:instrText xml:space="preserve"> PAGEREF _Toc240032123 \h </w:instrText>
+        <w:instrText xml:space="preserve"> PAGEREF _Toc240033490 \h </w:instrText>
       </w:r>
       <w:r>
         <w:rPr>
@@ -3053,7 +3053,7 @@
         <w:rPr>
           <w:noProof/>
         </w:rPr>
-        <w:t>89</w:t>
+        <w:t>90</w:t>
       </w:r>
       <w:r>
         <w:rPr>
@@ -3097,7 +3097,7 @@
         <w:rPr>
           <w:noProof/>
         </w:rPr>
-        <w:instrText xml:space="preserve"> PAGEREF _Toc240032124 \h </w:instrText>
+        <w:instrText xml:space="preserve"> PAGEREF _Toc240033491 \h </w:instrText>
       </w:r>
       <w:r>
         <w:rPr>
@@ -3114,7 +3114,7 @@
         <w:rPr>
           <w:noProof/>
         </w:rPr>
-        <w:t>90</w:t>
+        <w:t>91</w:t>
       </w:r>
       <w:r>
         <w:rPr>
@@ -3173,7 +3173,7 @@
           <w:sz w:val="34"/>
         </w:rPr>
       </w:pPr>
-      <w:bookmarkStart w:id="0" w:name="_Toc240032077"/>
+      <w:bookmarkStart w:id="0" w:name="_Toc240033444"/>
       <w:r>
         <w:rPr>
           <w:rFonts w:ascii="Montserrat" w:hAnsi="Montserrat"/>
@@ -3197,7 +3197,7 @@
           <w:sz w:val="27"/>
         </w:rPr>
       </w:pPr>
-      <w:bookmarkStart w:id="1" w:name="_Toc240032078"/>
+      <w:bookmarkStart w:id="1" w:name="_Toc240033445"/>
       <w:r>
         <w:rPr>
           <w:rFonts w:ascii="Montserrat" w:hAnsi="Montserrat"/>
@@ -4349,6 +4349,24 @@
           <w:color w:val="1A1A1A"/>
           <w:sz w:val="22"/>
         </w:rPr>
+        <w:t>Esta e a versao 2.56 do manual. Em relacao a versao 2.55 (11/09/2026), a Fase 3 fecha a proposta de gestao de riscos: o Relatorio de Resultados (secao 6.7) ganhou um quarto indicador estrategico, Projetos sem risco alto/critico, com meta configuravel (Administracao &gt; Configuracoes, secao 6.3), selo de status e tendencia dos ultimos salvamentos - no mesmo padrao ja usado por Marcos no prazo e Projetos dentro do orcamento. Como o risco vive inteiramente no TAP e nao tem nenhum campo proprio no Relatorio de Situacao que mude entre salvamentos, o Relatorio de Situacao passou a gravar, a cada salvamento, uma contagem de quantos projetos com TAP estao sem risco alto/critico em aberto - e esse numero, congelado em cada versao salva, que alimenta a tendencia. A apresentacao PPTX exportada tambem foi ajustada para caber os 4 indicadores lado a lado no slide.</w:t>
+      </w:r>
+    </w:p>
+    <w:p>
+      <w:pPr>
+        <w:spacing w:line="280" w:lineRule="auto"/>
+        <w:rPr>
+          <w:rFonts w:ascii="Montserrat" w:hAnsi="Montserrat"/>
+          <w:color w:val="1A1A1A"/>
+          <w:sz w:val="22"/>
+        </w:rPr>
+      </w:pPr>
+      <w:r>
+        <w:rPr>
+          <w:rFonts w:ascii="Montserrat" w:hAnsi="Montserrat"/>
+          <w:color w:val="1A1A1A"/>
+          <w:sz w:val="22"/>
+        </w:rPr>
         <w:t>O manual nao substitui as Diretrizes para a Gestao de Projetos da UNIALFA (documento institucional que define o framework D01 a D07) nem o documento Regras de Acesso e Permissoes (que detalha cada regra de controle de acesso); ele e o guia operacional de como usar cada ferramenta na pratica.</w:t>
       </w:r>
     </w:p>
@@ -4363,7 +4381,7 @@
           <w:sz w:val="27"/>
         </w:rPr>
       </w:pPr>
-      <w:bookmarkStart w:id="2" w:name="_Toc240032079"/>
+      <w:bookmarkStart w:id="2" w:name="_Toc240033446"/>
       <w:r>
         <w:rPr>
           <w:rFonts w:ascii="Montserrat" w:hAnsi="Montserrat"/>
@@ -4546,7 +4564,16 @@
           <w:color w:val="1A1A1A"/>
           <w:sz w:val="22"/>
         </w:rPr>
-        <w:t>O Mapa de Diretrizes (pagina inicial) apresenta visualmente as 7 diretrizes (D01 a D07) e mostra, para cada etapa do processo, quais ferramentas usar. E o ponto de partida recomendado para quem quer entender o processo antes de preencher os formularios - e a unica pagina, junto com o Validador de Projetos, que nao exige login.</w:t>
+        <w:t xml:space="preserve">O Mapa de Diretrizes (pagina inicial) apresenta visualmente as 7 diretrizes (D01 a D07) e mostra, para cada etapa do processo, quais ferramentas usar. E o ponto </w:t>
+      </w:r>
+      <w:r>
+        <w:rPr>
+          <w:rFonts w:ascii="Montserrat" w:hAnsi="Montserrat"/>
+          <w:color w:val="1A1A1A"/>
+          <w:sz w:val="22"/>
+        </w:rPr>
+        <w:lastRenderedPageBreak/>
+        <w:t>de partida recomendado para quem quer entender o processo antes de preencher os formularios - e a unica pagina, junto com o Validador de Projetos, que nao exige login.</w:t>
       </w:r>
     </w:p>
     <w:p>
@@ -4558,18 +4585,17 @@
         <w:rPr>
           <w:noProof/>
         </w:rPr>
-        <w:lastRenderedPageBreak/>
         <w:drawing>
-          <wp:inline distT="0" distB="0" distL="0" distR="0" wp14:anchorId="32388CD8" wp14:editId="251A80B7">
+          <wp:inline distT="0" distB="0" distL="0" distR="0" wp14:anchorId="5B0E2A6B" wp14:editId="28BD186E">
             <wp:extent cx="5303520" cy="4792851"/>
             <wp:effectExtent l="19050" t="19050" r="11430" b="27305"/>
-            <wp:docPr id="396238746" name="Imagem 1"/>
+            <wp:docPr id="1590359349" name="Imagem 1"/>
             <wp:cNvGraphicFramePr/>
             <a:graphic xmlns:a="http://schemas.openxmlformats.org/drawingml/2006/main">
               <a:graphicData uri="http://schemas.openxmlformats.org/drawingml/2006/picture">
                 <pic:pic xmlns:pic="http://schemas.openxmlformats.org/drawingml/2006/picture">
                   <pic:nvPicPr>
-                    <pic:cNvPr id="396238746" name=""/>
+                    <pic:cNvPr id="1590359349" name=""/>
                     <pic:cNvPicPr/>
                   </pic:nvPicPr>
                   <pic:blipFill>
@@ -4637,7 +4663,7 @@
           <w:sz w:val="27"/>
         </w:rPr>
       </w:pPr>
-      <w:bookmarkStart w:id="3" w:name="_Toc240032080"/>
+      <w:bookmarkStart w:id="3" w:name="_Toc240033447"/>
       <w:r>
         <w:rPr>
           <w:rFonts w:ascii="Montserrat" w:hAnsi="Montserrat"/>
@@ -4678,16 +4704,16 @@
         </w:rPr>
         <w:lastRenderedPageBreak/>
         <w:drawing>
-          <wp:inline distT="0" distB="0" distL="0" distR="0" wp14:anchorId="3D4C5F03" wp14:editId="119B8B1C">
+          <wp:inline distT="0" distB="0" distL="0" distR="0" wp14:anchorId="3AFBB70B" wp14:editId="0D72C728">
             <wp:extent cx="4206240" cy="3801227"/>
             <wp:effectExtent l="19050" t="19050" r="22860" b="27940"/>
-            <wp:docPr id="871332771" name="Imagem 2"/>
+            <wp:docPr id="2045213349" name="Imagem 2"/>
             <wp:cNvGraphicFramePr/>
             <a:graphic xmlns:a="http://schemas.openxmlformats.org/drawingml/2006/main">
               <a:graphicData uri="http://schemas.openxmlformats.org/drawingml/2006/picture">
                 <pic:pic xmlns:pic="http://schemas.openxmlformats.org/drawingml/2006/picture">
                   <pic:nvPicPr>
-                    <pic:cNvPr id="871332771" name=""/>
+                    <pic:cNvPr id="2045213349" name=""/>
                     <pic:cNvPicPr/>
                   </pic:nvPicPr>
                   <pic:blipFill>
@@ -4860,7 +4886,7 @@
           <w:sz w:val="27"/>
         </w:rPr>
       </w:pPr>
-      <w:bookmarkStart w:id="4" w:name="_Toc240032081"/>
+      <w:bookmarkStart w:id="4" w:name="_Toc240033448"/>
       <w:r>
         <w:rPr>
           <w:rFonts w:ascii="Montserrat" w:hAnsi="Montserrat"/>
@@ -6099,7 +6125,7 @@
           <w:sz w:val="34"/>
         </w:rPr>
       </w:pPr>
-      <w:bookmarkStart w:id="5" w:name="_Toc240032082"/>
+      <w:bookmarkStart w:id="5" w:name="_Toc240033449"/>
       <w:r>
         <w:rPr>
           <w:rFonts w:ascii="Montserrat" w:hAnsi="Montserrat"/>
@@ -6123,7 +6149,7 @@
           <w:sz w:val="27"/>
         </w:rPr>
       </w:pPr>
-      <w:bookmarkStart w:id="6" w:name="_Toc240032083"/>
+      <w:bookmarkStart w:id="6" w:name="_Toc240033450"/>
       <w:r>
         <w:rPr>
           <w:rFonts w:ascii="Montserrat" w:hAnsi="Montserrat"/>
@@ -6164,7 +6190,7 @@
           <w:sz w:val="27"/>
         </w:rPr>
       </w:pPr>
-      <w:bookmarkStart w:id="7" w:name="_Toc240032084"/>
+      <w:bookmarkStart w:id="7" w:name="_Toc240033451"/>
       <w:r>
         <w:rPr>
           <w:rFonts w:ascii="Montserrat" w:hAnsi="Montserrat"/>
@@ -6283,7 +6309,7 @@
           <w:sz w:val="27"/>
         </w:rPr>
       </w:pPr>
-      <w:bookmarkStart w:id="8" w:name="_Toc240032085"/>
+      <w:bookmarkStart w:id="8" w:name="_Toc240033452"/>
       <w:r>
         <w:rPr>
           <w:rFonts w:ascii="Montserrat" w:hAnsi="Montserrat"/>
@@ -6896,7 +6922,7 @@
           <w:sz w:val="27"/>
         </w:rPr>
       </w:pPr>
-      <w:bookmarkStart w:id="9" w:name="_Toc240032086"/>
+      <w:bookmarkStart w:id="9" w:name="_Toc240033453"/>
       <w:r>
         <w:rPr>
           <w:rFonts w:ascii="Montserrat" w:hAnsi="Montserrat"/>
@@ -6985,16 +7011,16 @@
         </w:rPr>
         <w:lastRenderedPageBreak/>
         <w:drawing>
-          <wp:inline distT="0" distB="0" distL="0" distR="0" wp14:anchorId="2BA9C301" wp14:editId="3B277459">
+          <wp:inline distT="0" distB="0" distL="0" distR="0" wp14:anchorId="77C8297A" wp14:editId="4904C57E">
             <wp:extent cx="4937760" cy="4462310"/>
             <wp:effectExtent l="19050" t="19050" r="15240" b="14605"/>
-            <wp:docPr id="1610928980" name="Imagem 3"/>
+            <wp:docPr id="535291869" name="Imagem 3"/>
             <wp:cNvGraphicFramePr/>
             <a:graphic xmlns:a="http://schemas.openxmlformats.org/drawingml/2006/main">
               <a:graphicData uri="http://schemas.openxmlformats.org/drawingml/2006/picture">
                 <pic:pic xmlns:pic="http://schemas.openxmlformats.org/drawingml/2006/picture">
                   <pic:nvPicPr>
-                    <pic:cNvPr id="1610928980" name=""/>
+                    <pic:cNvPr id="535291869" name=""/>
                     <pic:cNvPicPr/>
                   </pic:nvPicPr>
                   <pic:blipFill>
@@ -7062,7 +7088,7 @@
           <w:sz w:val="27"/>
         </w:rPr>
       </w:pPr>
-      <w:bookmarkStart w:id="10" w:name="_Toc240032087"/>
+      <w:bookmarkStart w:id="10" w:name="_Toc240033454"/>
       <w:r>
         <w:rPr>
           <w:rFonts w:ascii="Montserrat" w:hAnsi="Montserrat"/>
@@ -7103,16 +7129,16 @@
         </w:rPr>
         <w:lastRenderedPageBreak/>
         <w:drawing>
-          <wp:inline distT="0" distB="0" distL="0" distR="0" wp14:anchorId="50E57B8A" wp14:editId="67248939">
+          <wp:inline distT="0" distB="0" distL="0" distR="0" wp14:anchorId="628EAECA" wp14:editId="6F762FD0">
             <wp:extent cx="5120640" cy="4627581"/>
             <wp:effectExtent l="19050" t="19050" r="22860" b="20955"/>
-            <wp:docPr id="1981436910" name="Imagem 4"/>
+            <wp:docPr id="2014646940" name="Imagem 4"/>
             <wp:cNvGraphicFramePr/>
             <a:graphic xmlns:a="http://schemas.openxmlformats.org/drawingml/2006/main">
               <a:graphicData uri="http://schemas.openxmlformats.org/drawingml/2006/picture">
                 <pic:pic xmlns:pic="http://schemas.openxmlformats.org/drawingml/2006/picture">
                   <pic:nvPicPr>
-                    <pic:cNvPr id="1981436910" name=""/>
+                    <pic:cNvPr id="2014646940" name=""/>
                     <pic:cNvPicPr/>
                   </pic:nvPicPr>
                   <pic:blipFill>
@@ -7280,7 +7306,7 @@
           <w:sz w:val="27"/>
         </w:rPr>
       </w:pPr>
-      <w:bookmarkStart w:id="11" w:name="_Toc240032088"/>
+      <w:bookmarkStart w:id="11" w:name="_Toc240033455"/>
       <w:r>
         <w:rPr>
           <w:rFonts w:ascii="Montserrat" w:hAnsi="Montserrat"/>
@@ -7320,16 +7346,16 @@
           <w:noProof/>
         </w:rPr>
         <w:drawing>
-          <wp:inline distT="0" distB="0" distL="0" distR="0" wp14:anchorId="53C491B0" wp14:editId="4E439442">
+          <wp:inline distT="0" distB="0" distL="0" distR="0" wp14:anchorId="351B2010" wp14:editId="020ED0F4">
             <wp:extent cx="4206240" cy="3801227"/>
             <wp:effectExtent l="19050" t="19050" r="22860" b="27940"/>
-            <wp:docPr id="1068442498" name="Imagem 5"/>
+            <wp:docPr id="1945587151" name="Imagem 5"/>
             <wp:cNvGraphicFramePr/>
             <a:graphic xmlns:a="http://schemas.openxmlformats.org/drawingml/2006/main">
               <a:graphicData uri="http://schemas.openxmlformats.org/drawingml/2006/picture">
                 <pic:pic xmlns:pic="http://schemas.openxmlformats.org/drawingml/2006/picture">
                   <pic:nvPicPr>
-                    <pic:cNvPr id="1068442498" name=""/>
+                    <pic:cNvPr id="1945587151" name=""/>
                     <pic:cNvPicPr/>
                   </pic:nvPicPr>
                   <pic:blipFill>
@@ -7397,16 +7423,16 @@
         </w:rPr>
         <w:lastRenderedPageBreak/>
         <w:drawing>
-          <wp:inline distT="0" distB="0" distL="0" distR="0" wp14:anchorId="2DE16E69" wp14:editId="4C8610E9">
+          <wp:inline distT="0" distB="0" distL="0" distR="0" wp14:anchorId="4C7C8E22" wp14:editId="40546E0D">
             <wp:extent cx="4206240" cy="3801227"/>
             <wp:effectExtent l="19050" t="19050" r="22860" b="27940"/>
-            <wp:docPr id="2108458026" name="Imagem 6"/>
+            <wp:docPr id="394831833" name="Imagem 6"/>
             <wp:cNvGraphicFramePr/>
             <a:graphic xmlns:a="http://schemas.openxmlformats.org/drawingml/2006/main">
               <a:graphicData uri="http://schemas.openxmlformats.org/drawingml/2006/picture">
                 <pic:pic xmlns:pic="http://schemas.openxmlformats.org/drawingml/2006/picture">
                   <pic:nvPicPr>
-                    <pic:cNvPr id="2108458026" name=""/>
+                    <pic:cNvPr id="394831833" name=""/>
                     <pic:cNvPicPr/>
                   </pic:nvPicPr>
                   <pic:blipFill>
@@ -7522,7 +7548,7 @@
           <w:sz w:val="27"/>
         </w:rPr>
       </w:pPr>
-      <w:bookmarkStart w:id="12" w:name="_Toc240032089"/>
+      <w:bookmarkStart w:id="12" w:name="_Toc240033456"/>
       <w:r>
         <w:rPr>
           <w:rFonts w:ascii="Montserrat" w:hAnsi="Montserrat"/>
@@ -7590,7 +7616,7 @@
           <w:sz w:val="27"/>
         </w:rPr>
       </w:pPr>
-      <w:bookmarkStart w:id="13" w:name="_Toc240032090"/>
+      <w:bookmarkStart w:id="13" w:name="_Toc240033457"/>
       <w:r>
         <w:rPr>
           <w:rFonts w:ascii="Montserrat" w:hAnsi="Montserrat"/>
@@ -7817,7 +7843,7 @@
           <w:sz w:val="27"/>
         </w:rPr>
       </w:pPr>
-      <w:bookmarkStart w:id="14" w:name="_Toc240032091"/>
+      <w:bookmarkStart w:id="14" w:name="_Toc240033458"/>
       <w:r>
         <w:rPr>
           <w:rFonts w:ascii="Montserrat" w:hAnsi="Montserrat"/>
@@ -7976,7 +8002,7 @@
           <w:sz w:val="27"/>
         </w:rPr>
       </w:pPr>
-      <w:bookmarkStart w:id="15" w:name="_Toc240032092"/>
+      <w:bookmarkStart w:id="15" w:name="_Toc240033459"/>
       <w:r>
         <w:rPr>
           <w:rFonts w:ascii="Montserrat" w:hAnsi="Montserrat"/>
@@ -8168,7 +8194,7 @@
           <w:sz w:val="27"/>
         </w:rPr>
       </w:pPr>
-      <w:bookmarkStart w:id="16" w:name="_Toc240032093"/>
+      <w:bookmarkStart w:id="16" w:name="_Toc240033460"/>
       <w:r>
         <w:rPr>
           <w:rFonts w:ascii="Montserrat" w:hAnsi="Montserrat"/>
@@ -8296,7 +8322,7 @@
           <w:sz w:val="27"/>
         </w:rPr>
       </w:pPr>
-      <w:bookmarkStart w:id="17" w:name="_Toc240032094"/>
+      <w:bookmarkStart w:id="17" w:name="_Toc240033461"/>
       <w:r>
         <w:rPr>
           <w:rFonts w:ascii="Montserrat" w:hAnsi="Montserrat"/>
@@ -8626,7 +8652,7 @@
           <w:sz w:val="27"/>
         </w:rPr>
       </w:pPr>
-      <w:bookmarkStart w:id="18" w:name="_Toc240032095"/>
+      <w:bookmarkStart w:id="18" w:name="_Toc240033462"/>
       <w:r>
         <w:rPr>
           <w:rFonts w:ascii="Montserrat" w:hAnsi="Montserrat"/>
@@ -8767,7 +8793,7 @@
           <w:sz w:val="34"/>
         </w:rPr>
       </w:pPr>
-      <w:bookmarkStart w:id="19" w:name="_Toc240032096"/>
+      <w:bookmarkStart w:id="19" w:name="_Toc240033463"/>
       <w:r>
         <w:rPr>
           <w:rFonts w:ascii="Montserrat" w:hAnsi="Montserrat"/>
@@ -8809,7 +8835,7 @@
           <w:sz w:val="27"/>
         </w:rPr>
       </w:pPr>
-      <w:bookmarkStart w:id="20" w:name="_Toc240032097"/>
+      <w:bookmarkStart w:id="20" w:name="_Toc240033464"/>
       <w:r>
         <w:rPr>
           <w:rFonts w:ascii="Montserrat" w:hAnsi="Montserrat"/>
@@ -9889,16 +9915,16 @@
         </w:rPr>
         <w:lastRenderedPageBreak/>
         <w:drawing>
-          <wp:inline distT="0" distB="0" distL="0" distR="0" wp14:anchorId="5AB4A94D" wp14:editId="5FE1F476">
+          <wp:inline distT="0" distB="0" distL="0" distR="0" wp14:anchorId="412709A1" wp14:editId="18286861">
             <wp:extent cx="5120640" cy="4627581"/>
             <wp:effectExtent l="19050" t="19050" r="22860" b="20955"/>
-            <wp:docPr id="828895634" name="Imagem 7"/>
+            <wp:docPr id="1822035681" name="Imagem 7"/>
             <wp:cNvGraphicFramePr/>
             <a:graphic xmlns:a="http://schemas.openxmlformats.org/drawingml/2006/main">
               <a:graphicData uri="http://schemas.openxmlformats.org/drawingml/2006/picture">
                 <pic:pic xmlns:pic="http://schemas.openxmlformats.org/drawingml/2006/picture">
                   <pic:nvPicPr>
-                    <pic:cNvPr id="828895634" name=""/>
+                    <pic:cNvPr id="1822035681" name=""/>
                     <pic:cNvPicPr/>
                   </pic:nvPicPr>
                   <pic:blipFill>
@@ -9966,16 +9992,16 @@
         </w:rPr>
         <w:lastRenderedPageBreak/>
         <w:drawing>
-          <wp:inline distT="0" distB="0" distL="0" distR="0" wp14:anchorId="2A02F914" wp14:editId="5438F4CF">
+          <wp:inline distT="0" distB="0" distL="0" distR="0" wp14:anchorId="0DB74546" wp14:editId="0EB2603D">
             <wp:extent cx="5120640" cy="4627581"/>
             <wp:effectExtent l="19050" t="19050" r="22860" b="20955"/>
-            <wp:docPr id="159094249" name="Imagem 8"/>
+            <wp:docPr id="491239795" name="Imagem 8"/>
             <wp:cNvGraphicFramePr/>
             <a:graphic xmlns:a="http://schemas.openxmlformats.org/drawingml/2006/main">
               <a:graphicData uri="http://schemas.openxmlformats.org/drawingml/2006/picture">
                 <pic:pic xmlns:pic="http://schemas.openxmlformats.org/drawingml/2006/picture">
                   <pic:nvPicPr>
-                    <pic:cNvPr id="159094249" name=""/>
+                    <pic:cNvPr id="491239795" name=""/>
                     <pic:cNvPicPr/>
                   </pic:nvPicPr>
                   <pic:blipFill>
@@ -10183,7 +10209,7 @@
           <w:sz w:val="27"/>
         </w:rPr>
       </w:pPr>
-      <w:bookmarkStart w:id="21" w:name="_Toc240032098"/>
+      <w:bookmarkStart w:id="21" w:name="_Toc240033465"/>
       <w:r>
         <w:rPr>
           <w:rFonts w:ascii="Montserrat" w:hAnsi="Montserrat"/>
@@ -11108,16 +11134,16 @@
           <w:noProof/>
         </w:rPr>
         <w:drawing>
-          <wp:inline distT="0" distB="0" distL="0" distR="0" wp14:anchorId="5832A263" wp14:editId="407620DF">
+          <wp:inline distT="0" distB="0" distL="0" distR="0" wp14:anchorId="349EC3B2" wp14:editId="585E1C70">
             <wp:extent cx="5120640" cy="4627581"/>
             <wp:effectExtent l="19050" t="19050" r="22860" b="20955"/>
-            <wp:docPr id="362918315" name="Imagem 9"/>
+            <wp:docPr id="1118296715" name="Imagem 9"/>
             <wp:cNvGraphicFramePr/>
             <a:graphic xmlns:a="http://schemas.openxmlformats.org/drawingml/2006/main">
               <a:graphicData uri="http://schemas.openxmlformats.org/drawingml/2006/picture">
                 <pic:pic xmlns:pic="http://schemas.openxmlformats.org/drawingml/2006/picture">
                   <pic:nvPicPr>
-                    <pic:cNvPr id="362918315" name=""/>
+                    <pic:cNvPr id="1118296715" name=""/>
                     <pic:cNvPicPr/>
                   </pic:nvPicPr>
                   <pic:blipFill>
@@ -11185,16 +11211,16 @@
         </w:rPr>
         <w:lastRenderedPageBreak/>
         <w:drawing>
-          <wp:inline distT="0" distB="0" distL="0" distR="0" wp14:anchorId="59B2C149" wp14:editId="6DCB3684">
+          <wp:inline distT="0" distB="0" distL="0" distR="0" wp14:anchorId="30B109F1" wp14:editId="7BDF8D7E">
             <wp:extent cx="5120640" cy="4627581"/>
             <wp:effectExtent l="19050" t="19050" r="22860" b="20955"/>
-            <wp:docPr id="1153382566" name="Imagem 10"/>
+            <wp:docPr id="485599995" name="Imagem 10"/>
             <wp:cNvGraphicFramePr/>
             <a:graphic xmlns:a="http://schemas.openxmlformats.org/drawingml/2006/main">
               <a:graphicData uri="http://schemas.openxmlformats.org/drawingml/2006/picture">
                 <pic:pic xmlns:pic="http://schemas.openxmlformats.org/drawingml/2006/picture">
                   <pic:nvPicPr>
-                    <pic:cNvPr id="1153382566" name=""/>
+                    <pic:cNvPr id="485599995" name=""/>
                     <pic:cNvPicPr/>
                   </pic:nvPicPr>
                   <pic:blipFill>
@@ -11328,7 +11354,7 @@
           <w:sz w:val="27"/>
         </w:rPr>
       </w:pPr>
-      <w:bookmarkStart w:id="22" w:name="_Toc240032099"/>
+      <w:bookmarkStart w:id="22" w:name="_Toc240033466"/>
       <w:r>
         <w:rPr>
           <w:rFonts w:ascii="Montserrat" w:hAnsi="Montserrat"/>
@@ -12394,16 +12420,16 @@
           <w:noProof/>
         </w:rPr>
         <w:drawing>
-          <wp:inline distT="0" distB="0" distL="0" distR="0" wp14:anchorId="1EB293E7" wp14:editId="1041FDAC">
+          <wp:inline distT="0" distB="0" distL="0" distR="0" wp14:anchorId="3D1AA120" wp14:editId="36ED5DDE">
             <wp:extent cx="5120640" cy="3338440"/>
             <wp:effectExtent l="19050" t="19050" r="22860" b="14605"/>
-            <wp:docPr id="1026812721" name="Imagem 11"/>
+            <wp:docPr id="628229879" name="Imagem 11"/>
             <wp:cNvGraphicFramePr/>
             <a:graphic xmlns:a="http://schemas.openxmlformats.org/drawingml/2006/main">
               <a:graphicData uri="http://schemas.openxmlformats.org/drawingml/2006/picture">
                 <pic:pic xmlns:pic="http://schemas.openxmlformats.org/drawingml/2006/picture">
                   <pic:nvPicPr>
-                    <pic:cNvPr id="1026812721" name=""/>
+                    <pic:cNvPr id="628229879" name=""/>
                     <pic:cNvPicPr/>
                   </pic:nvPicPr>
                   <pic:blipFill>
@@ -12471,16 +12497,16 @@
         </w:rPr>
         <w:lastRenderedPageBreak/>
         <w:drawing>
-          <wp:inline distT="0" distB="0" distL="0" distR="0" wp14:anchorId="07EF4767" wp14:editId="1B3F599C">
+          <wp:inline distT="0" distB="0" distL="0" distR="0" wp14:anchorId="7CE7F02F" wp14:editId="3A802768">
             <wp:extent cx="5120640" cy="4627581"/>
             <wp:effectExtent l="19050" t="19050" r="22860" b="20955"/>
-            <wp:docPr id="280206829" name="Imagem 12"/>
+            <wp:docPr id="1526978485" name="Imagem 12"/>
             <wp:cNvGraphicFramePr/>
             <a:graphic xmlns:a="http://schemas.openxmlformats.org/drawingml/2006/main">
               <a:graphicData uri="http://schemas.openxmlformats.org/drawingml/2006/picture">
                 <pic:pic xmlns:pic="http://schemas.openxmlformats.org/drawingml/2006/picture">
                   <pic:nvPicPr>
-                    <pic:cNvPr id="280206829" name=""/>
+                    <pic:cNvPr id="1526978485" name=""/>
                     <pic:cNvPicPr/>
                   </pic:nvPicPr>
                   <pic:blipFill>
@@ -12684,7 +12710,7 @@
           <w:sz w:val="27"/>
         </w:rPr>
       </w:pPr>
-      <w:bookmarkStart w:id="23" w:name="_Toc240032100"/>
+      <w:bookmarkStart w:id="23" w:name="_Toc240033467"/>
       <w:r>
         <w:rPr>
           <w:rFonts w:ascii="Montserrat" w:hAnsi="Montserrat"/>
@@ -13245,16 +13271,16 @@
           <w:noProof/>
         </w:rPr>
         <w:drawing>
-          <wp:inline distT="0" distB="0" distL="0" distR="0" wp14:anchorId="2B1C9F5B" wp14:editId="3BF00173">
+          <wp:inline distT="0" distB="0" distL="0" distR="0" wp14:anchorId="5661A6F3" wp14:editId="205EF492">
             <wp:extent cx="5120640" cy="4627581"/>
             <wp:effectExtent l="19050" t="19050" r="22860" b="20955"/>
-            <wp:docPr id="251098453" name="Imagem 13"/>
+            <wp:docPr id="201355388" name="Imagem 13"/>
             <wp:cNvGraphicFramePr/>
             <a:graphic xmlns:a="http://schemas.openxmlformats.org/drawingml/2006/main">
               <a:graphicData uri="http://schemas.openxmlformats.org/drawingml/2006/picture">
                 <pic:pic xmlns:pic="http://schemas.openxmlformats.org/drawingml/2006/picture">
                   <pic:nvPicPr>
-                    <pic:cNvPr id="251098453" name=""/>
+                    <pic:cNvPr id="201355388" name=""/>
                     <pic:cNvPicPr/>
                   </pic:nvPicPr>
                   <pic:blipFill>
@@ -13322,16 +13348,16 @@
         </w:rPr>
         <w:lastRenderedPageBreak/>
         <w:drawing>
-          <wp:inline distT="0" distB="0" distL="0" distR="0" wp14:anchorId="464FB70A" wp14:editId="074E5237">
+          <wp:inline distT="0" distB="0" distL="0" distR="0" wp14:anchorId="3C364C76" wp14:editId="27CD7DC1">
             <wp:extent cx="5120640" cy="4627581"/>
             <wp:effectExtent l="19050" t="19050" r="22860" b="20955"/>
-            <wp:docPr id="1811965838" name="Imagem 14"/>
+            <wp:docPr id="1608371705" name="Imagem 14"/>
             <wp:cNvGraphicFramePr/>
             <a:graphic xmlns:a="http://schemas.openxmlformats.org/drawingml/2006/main">
               <a:graphicData uri="http://schemas.openxmlformats.org/drawingml/2006/picture">
                 <pic:pic xmlns:pic="http://schemas.openxmlformats.org/drawingml/2006/picture">
                   <pic:nvPicPr>
-                    <pic:cNvPr id="1811965838" name=""/>
+                    <pic:cNvPr id="1608371705" name=""/>
                     <pic:cNvPicPr/>
                   </pic:nvPicPr>
                   <pic:blipFill>
@@ -13564,7 +13590,7 @@
           <w:sz w:val="27"/>
         </w:rPr>
       </w:pPr>
-      <w:bookmarkStart w:id="24" w:name="_Toc240032101"/>
+      <w:bookmarkStart w:id="24" w:name="_Toc240033468"/>
       <w:r>
         <w:rPr>
           <w:rFonts w:ascii="Montserrat" w:hAnsi="Montserrat"/>
@@ -13605,16 +13631,16 @@
           <w:noProof/>
         </w:rPr>
         <w:drawing>
-          <wp:inline distT="0" distB="0" distL="0" distR="0" wp14:anchorId="0203BFCE" wp14:editId="1DBF78A4">
+          <wp:inline distT="0" distB="0" distL="0" distR="0" wp14:anchorId="0C8033C0" wp14:editId="05A90B85">
             <wp:extent cx="5120640" cy="4627581"/>
             <wp:effectExtent l="19050" t="19050" r="22860" b="20955"/>
-            <wp:docPr id="1242215777" name="Imagem 15"/>
+            <wp:docPr id="1129938251" name="Imagem 15"/>
             <wp:cNvGraphicFramePr/>
             <a:graphic xmlns:a="http://schemas.openxmlformats.org/drawingml/2006/main">
               <a:graphicData uri="http://schemas.openxmlformats.org/drawingml/2006/picture">
                 <pic:pic xmlns:pic="http://schemas.openxmlformats.org/drawingml/2006/picture">
                   <pic:nvPicPr>
-                    <pic:cNvPr id="1242215777" name=""/>
+                    <pic:cNvPr id="1129938251" name=""/>
                     <pic:cNvPicPr/>
                   </pic:nvPicPr>
                   <pic:blipFill>
@@ -13682,16 +13708,16 @@
         </w:rPr>
         <w:lastRenderedPageBreak/>
         <w:drawing>
-          <wp:inline distT="0" distB="0" distL="0" distR="0" wp14:anchorId="35B41FBD" wp14:editId="4BA64A4B">
+          <wp:inline distT="0" distB="0" distL="0" distR="0" wp14:anchorId="3BBFE790" wp14:editId="346C12E8">
             <wp:extent cx="5120640" cy="4627581"/>
             <wp:effectExtent l="19050" t="19050" r="22860" b="20955"/>
-            <wp:docPr id="1922098866" name="Imagem 16"/>
+            <wp:docPr id="1304262443" name="Imagem 16"/>
             <wp:cNvGraphicFramePr/>
             <a:graphic xmlns:a="http://schemas.openxmlformats.org/drawingml/2006/main">
               <a:graphicData uri="http://schemas.openxmlformats.org/drawingml/2006/picture">
                 <pic:pic xmlns:pic="http://schemas.openxmlformats.org/drawingml/2006/picture">
                   <pic:nvPicPr>
-                    <pic:cNvPr id="1922098866" name=""/>
+                    <pic:cNvPr id="1304262443" name=""/>
                     <pic:cNvPicPr/>
                   </pic:nvPicPr>
                   <pic:blipFill>
@@ -13855,16 +13881,16 @@
         </w:rPr>
         <w:lastRenderedPageBreak/>
         <w:drawing>
-          <wp:inline distT="0" distB="0" distL="0" distR="0" wp14:anchorId="2D56B0B2" wp14:editId="0F3402D7">
+          <wp:inline distT="0" distB="0" distL="0" distR="0" wp14:anchorId="3423B32E" wp14:editId="7014AA8A">
             <wp:extent cx="5120640" cy="3282818"/>
             <wp:effectExtent l="19050" t="19050" r="22860" b="13335"/>
-            <wp:docPr id="1139869441" name="Imagem 17"/>
+            <wp:docPr id="1063812979" name="Imagem 17"/>
             <wp:cNvGraphicFramePr/>
             <a:graphic xmlns:a="http://schemas.openxmlformats.org/drawingml/2006/main">
               <a:graphicData uri="http://schemas.openxmlformats.org/drawingml/2006/picture">
                 <pic:pic xmlns:pic="http://schemas.openxmlformats.org/drawingml/2006/picture">
                   <pic:nvPicPr>
-                    <pic:cNvPr id="1139869441" name=""/>
+                    <pic:cNvPr id="1063812979" name=""/>
                     <pic:cNvPicPr/>
                   </pic:nvPicPr>
                   <pic:blipFill>
@@ -13998,7 +14024,7 @@
           <w:sz w:val="27"/>
         </w:rPr>
       </w:pPr>
-      <w:bookmarkStart w:id="25" w:name="_Toc240032102"/>
+      <w:bookmarkStart w:id="25" w:name="_Toc240033469"/>
       <w:r>
         <w:rPr>
           <w:rFonts w:ascii="Montserrat" w:hAnsi="Montserrat"/>
@@ -14039,16 +14065,16 @@
         </w:rPr>
         <w:lastRenderedPageBreak/>
         <w:drawing>
-          <wp:inline distT="0" distB="0" distL="0" distR="0" wp14:anchorId="4D526FC7" wp14:editId="3746ED57">
+          <wp:inline distT="0" distB="0" distL="0" distR="0" wp14:anchorId="2AEC4EA6" wp14:editId="4B896949">
             <wp:extent cx="5120640" cy="4627581"/>
             <wp:effectExtent l="19050" t="19050" r="22860" b="20955"/>
-            <wp:docPr id="1825462572" name="Imagem 18"/>
+            <wp:docPr id="1557964735" name="Imagem 18"/>
             <wp:cNvGraphicFramePr/>
             <a:graphic xmlns:a="http://schemas.openxmlformats.org/drawingml/2006/main">
               <a:graphicData uri="http://schemas.openxmlformats.org/drawingml/2006/picture">
                 <pic:pic xmlns:pic="http://schemas.openxmlformats.org/drawingml/2006/picture">
                   <pic:nvPicPr>
-                    <pic:cNvPr id="1825462572" name=""/>
+                    <pic:cNvPr id="1557964735" name=""/>
                     <pic:cNvPicPr/>
                   </pic:nvPicPr>
                   <pic:blipFill>
@@ -14116,16 +14142,16 @@
         </w:rPr>
         <w:lastRenderedPageBreak/>
         <w:drawing>
-          <wp:inline distT="0" distB="0" distL="0" distR="0" wp14:anchorId="039490C1" wp14:editId="35988DF2">
+          <wp:inline distT="0" distB="0" distL="0" distR="0" wp14:anchorId="2BE70613" wp14:editId="13128BD2">
             <wp:extent cx="5120640" cy="4627581"/>
             <wp:effectExtent l="19050" t="19050" r="22860" b="20955"/>
-            <wp:docPr id="776634291" name="Imagem 19"/>
+            <wp:docPr id="2122541996" name="Imagem 19"/>
             <wp:cNvGraphicFramePr/>
             <a:graphic xmlns:a="http://schemas.openxmlformats.org/drawingml/2006/main">
               <a:graphicData uri="http://schemas.openxmlformats.org/drawingml/2006/picture">
                 <pic:pic xmlns:pic="http://schemas.openxmlformats.org/drawingml/2006/picture">
                   <pic:nvPicPr>
-                    <pic:cNvPr id="776634291" name=""/>
+                    <pic:cNvPr id="2122541996" name=""/>
                     <pic:cNvPicPr/>
                   </pic:nvPicPr>
                   <pic:blipFill>
@@ -14308,7 +14334,7 @@
           <w:sz w:val="27"/>
         </w:rPr>
       </w:pPr>
-      <w:bookmarkStart w:id="26" w:name="_Toc240032103"/>
+      <w:bookmarkStart w:id="26" w:name="_Toc240033470"/>
       <w:r>
         <w:rPr>
           <w:rFonts w:ascii="Montserrat" w:hAnsi="Montserrat"/>
@@ -14348,16 +14374,16 @@
           <w:noProof/>
         </w:rPr>
         <w:drawing>
-          <wp:inline distT="0" distB="0" distL="0" distR="0" wp14:anchorId="440BF41E" wp14:editId="74B2E285">
+          <wp:inline distT="0" distB="0" distL="0" distR="0" wp14:anchorId="1F1231AE" wp14:editId="03ACFA97">
             <wp:extent cx="5120640" cy="4627581"/>
             <wp:effectExtent l="19050" t="19050" r="22860" b="20955"/>
-            <wp:docPr id="74701665" name="Imagem 20"/>
+            <wp:docPr id="475041896" name="Imagem 20"/>
             <wp:cNvGraphicFramePr/>
             <a:graphic xmlns:a="http://schemas.openxmlformats.org/drawingml/2006/main">
               <a:graphicData uri="http://schemas.openxmlformats.org/drawingml/2006/picture">
                 <pic:pic xmlns:pic="http://schemas.openxmlformats.org/drawingml/2006/picture">
                   <pic:nvPicPr>
-                    <pic:cNvPr id="74701665" name=""/>
+                    <pic:cNvPr id="475041896" name=""/>
                     <pic:cNvPicPr/>
                   </pic:nvPicPr>
                   <pic:blipFill>
@@ -14425,16 +14451,16 @@
         </w:rPr>
         <w:lastRenderedPageBreak/>
         <w:drawing>
-          <wp:inline distT="0" distB="0" distL="0" distR="0" wp14:anchorId="4773B341" wp14:editId="75A9956D">
+          <wp:inline distT="0" distB="0" distL="0" distR="0" wp14:anchorId="43F91D6E" wp14:editId="4822BEB5">
             <wp:extent cx="5120640" cy="4627581"/>
             <wp:effectExtent l="19050" t="19050" r="22860" b="20955"/>
-            <wp:docPr id="867872214" name="Imagem 21"/>
+            <wp:docPr id="449789210" name="Imagem 21"/>
             <wp:cNvGraphicFramePr/>
             <a:graphic xmlns:a="http://schemas.openxmlformats.org/drawingml/2006/main">
               <a:graphicData uri="http://schemas.openxmlformats.org/drawingml/2006/picture">
                 <pic:pic xmlns:pic="http://schemas.openxmlformats.org/drawingml/2006/picture">
                   <pic:nvPicPr>
-                    <pic:cNvPr id="867872214" name=""/>
+                    <pic:cNvPr id="449789210" name=""/>
                     <pic:cNvPicPr/>
                   </pic:nvPicPr>
                   <pic:blipFill>
@@ -14640,16 +14666,16 @@
           <w:noProof/>
         </w:rPr>
         <w:drawing>
-          <wp:inline distT="0" distB="0" distL="0" distR="0" wp14:anchorId="41D848FB" wp14:editId="5674D248">
+          <wp:inline distT="0" distB="0" distL="0" distR="0" wp14:anchorId="1918C2BE" wp14:editId="581FFFC3">
             <wp:extent cx="5120640" cy="1757287"/>
             <wp:effectExtent l="19050" t="19050" r="22860" b="14605"/>
-            <wp:docPr id="946759255" name="Imagem 22"/>
+            <wp:docPr id="1570573689" name="Imagem 22"/>
             <wp:cNvGraphicFramePr/>
             <a:graphic xmlns:a="http://schemas.openxmlformats.org/drawingml/2006/main">
               <a:graphicData uri="http://schemas.openxmlformats.org/drawingml/2006/picture">
                 <pic:pic xmlns:pic="http://schemas.openxmlformats.org/drawingml/2006/picture">
                   <pic:nvPicPr>
-                    <pic:cNvPr id="946759255" name=""/>
+                    <pic:cNvPr id="1570573689" name=""/>
                     <pic:cNvPicPr/>
                   </pic:nvPicPr>
                   <pic:blipFill>
@@ -14762,7 +14788,7 @@
           <w:sz w:val="27"/>
         </w:rPr>
       </w:pPr>
-      <w:bookmarkStart w:id="27" w:name="_Toc240032104"/>
+      <w:bookmarkStart w:id="27" w:name="_Toc240033471"/>
       <w:r>
         <w:rPr>
           <w:rFonts w:ascii="Montserrat" w:hAnsi="Montserrat"/>
@@ -14803,16 +14829,16 @@
         </w:rPr>
         <w:lastRenderedPageBreak/>
         <w:drawing>
-          <wp:inline distT="0" distB="0" distL="0" distR="0" wp14:anchorId="6A936FF6" wp14:editId="6163FBD5">
+          <wp:inline distT="0" distB="0" distL="0" distR="0" wp14:anchorId="27E776F9" wp14:editId="33DD5752">
             <wp:extent cx="5120640" cy="4627581"/>
             <wp:effectExtent l="19050" t="19050" r="22860" b="20955"/>
-            <wp:docPr id="1709390489" name="Imagem 23"/>
+            <wp:docPr id="1424927353" name="Imagem 23"/>
             <wp:cNvGraphicFramePr/>
             <a:graphic xmlns:a="http://schemas.openxmlformats.org/drawingml/2006/main">
               <a:graphicData uri="http://schemas.openxmlformats.org/drawingml/2006/picture">
                 <pic:pic xmlns:pic="http://schemas.openxmlformats.org/drawingml/2006/picture">
                   <pic:nvPicPr>
-                    <pic:cNvPr id="1709390489" name=""/>
+                    <pic:cNvPr id="1424927353" name=""/>
                     <pic:cNvPicPr/>
                   </pic:nvPicPr>
                   <pic:blipFill>
@@ -14880,16 +14906,16 @@
         </w:rPr>
         <w:lastRenderedPageBreak/>
         <w:drawing>
-          <wp:inline distT="0" distB="0" distL="0" distR="0" wp14:anchorId="231C9878" wp14:editId="4FD3BB7D">
+          <wp:inline distT="0" distB="0" distL="0" distR="0" wp14:anchorId="7FACC526" wp14:editId="6E1E64B6">
             <wp:extent cx="5120640" cy="4627581"/>
             <wp:effectExtent l="19050" t="19050" r="22860" b="20955"/>
-            <wp:docPr id="1597777378" name="Imagem 24"/>
+            <wp:docPr id="1964660576" name="Imagem 24"/>
             <wp:cNvGraphicFramePr/>
             <a:graphic xmlns:a="http://schemas.openxmlformats.org/drawingml/2006/main">
               <a:graphicData uri="http://schemas.openxmlformats.org/drawingml/2006/picture">
                 <pic:pic xmlns:pic="http://schemas.openxmlformats.org/drawingml/2006/picture">
                   <pic:nvPicPr>
-                    <pic:cNvPr id="1597777378" name=""/>
+                    <pic:cNvPr id="1964660576" name=""/>
                     <pic:cNvPicPr/>
                   </pic:nvPicPr>
                   <pic:blipFill>
@@ -15126,7 +15152,7 @@
           <w:sz w:val="27"/>
         </w:rPr>
       </w:pPr>
-      <w:bookmarkStart w:id="28" w:name="_Toc240032105"/>
+      <w:bookmarkStart w:id="28" w:name="_Toc240033472"/>
       <w:r>
         <w:rPr>
           <w:rFonts w:ascii="Montserrat" w:hAnsi="Montserrat"/>
@@ -15166,16 +15192,16 @@
           <w:noProof/>
         </w:rPr>
         <w:drawing>
-          <wp:inline distT="0" distB="0" distL="0" distR="0" wp14:anchorId="33DC4715" wp14:editId="5EDE560F">
+          <wp:inline distT="0" distB="0" distL="0" distR="0" wp14:anchorId="55AF36C8" wp14:editId="3B4CA91D">
             <wp:extent cx="5120640" cy="4627581"/>
             <wp:effectExtent l="19050" t="19050" r="22860" b="20955"/>
-            <wp:docPr id="1982537272" name="Imagem 25"/>
+            <wp:docPr id="185090291" name="Imagem 25"/>
             <wp:cNvGraphicFramePr/>
             <a:graphic xmlns:a="http://schemas.openxmlformats.org/drawingml/2006/main">
               <a:graphicData uri="http://schemas.openxmlformats.org/drawingml/2006/picture">
                 <pic:pic xmlns:pic="http://schemas.openxmlformats.org/drawingml/2006/picture">
                   <pic:nvPicPr>
-                    <pic:cNvPr id="1982537272" name=""/>
+                    <pic:cNvPr id="185090291" name=""/>
                     <pic:cNvPicPr/>
                   </pic:nvPicPr>
                   <pic:blipFill>
@@ -15243,16 +15269,16 @@
         </w:rPr>
         <w:lastRenderedPageBreak/>
         <w:drawing>
-          <wp:inline distT="0" distB="0" distL="0" distR="0" wp14:anchorId="462DC40F" wp14:editId="072B88CE">
+          <wp:inline distT="0" distB="0" distL="0" distR="0" wp14:anchorId="5D893047" wp14:editId="639CB20E">
             <wp:extent cx="5120640" cy="4627581"/>
             <wp:effectExtent l="19050" t="19050" r="22860" b="20955"/>
-            <wp:docPr id="1874554306" name="Imagem 26"/>
+            <wp:docPr id="1429715600" name="Imagem 26"/>
             <wp:cNvGraphicFramePr/>
             <a:graphic xmlns:a="http://schemas.openxmlformats.org/drawingml/2006/main">
               <a:graphicData uri="http://schemas.openxmlformats.org/drawingml/2006/picture">
                 <pic:pic xmlns:pic="http://schemas.openxmlformats.org/drawingml/2006/picture">
                   <pic:nvPicPr>
-                    <pic:cNvPr id="1874554306" name=""/>
+                    <pic:cNvPr id="1429715600" name=""/>
                     <pic:cNvPicPr/>
                   </pic:nvPicPr>
                   <pic:blipFill>
@@ -15443,7 +15469,7 @@
           <w:sz w:val="27"/>
         </w:rPr>
       </w:pPr>
-      <w:bookmarkStart w:id="29" w:name="_Toc240032106"/>
+      <w:bookmarkStart w:id="29" w:name="_Toc240033473"/>
       <w:r>
         <w:rPr>
           <w:rFonts w:ascii="Montserrat" w:hAnsi="Montserrat"/>
@@ -15483,16 +15509,16 @@
           <w:noProof/>
         </w:rPr>
         <w:drawing>
-          <wp:inline distT="0" distB="0" distL="0" distR="0" wp14:anchorId="7BED9C59" wp14:editId="49BC012E">
+          <wp:inline distT="0" distB="0" distL="0" distR="0" wp14:anchorId="69707A29" wp14:editId="1639BEAB">
             <wp:extent cx="5120640" cy="4000682"/>
             <wp:effectExtent l="19050" t="19050" r="22860" b="19050"/>
-            <wp:docPr id="964584566" name="Imagem 27"/>
+            <wp:docPr id="63655165" name="Imagem 27"/>
             <wp:cNvGraphicFramePr/>
             <a:graphic xmlns:a="http://schemas.openxmlformats.org/drawingml/2006/main">
               <a:graphicData uri="http://schemas.openxmlformats.org/drawingml/2006/picture">
                 <pic:pic xmlns:pic="http://schemas.openxmlformats.org/drawingml/2006/picture">
                   <pic:nvPicPr>
-                    <pic:cNvPr id="964584566" name=""/>
+                    <pic:cNvPr id="63655165" name=""/>
                     <pic:cNvPicPr/>
                   </pic:nvPicPr>
                   <pic:blipFill>
@@ -16016,7 +16042,7 @@
           <w:sz w:val="34"/>
         </w:rPr>
       </w:pPr>
-      <w:bookmarkStart w:id="30" w:name="_Toc240032107"/>
+      <w:bookmarkStart w:id="30" w:name="_Toc240033474"/>
       <w:r>
         <w:rPr>
           <w:rFonts w:ascii="Montserrat" w:hAnsi="Montserrat"/>
@@ -16058,7 +16084,7 @@
           <w:sz w:val="27"/>
         </w:rPr>
       </w:pPr>
-      <w:bookmarkStart w:id="31" w:name="_Toc240032108"/>
+      <w:bookmarkStart w:id="31" w:name="_Toc240033475"/>
       <w:r>
         <w:rPr>
           <w:rFonts w:ascii="Montserrat" w:hAnsi="Montserrat"/>
@@ -16098,16 +16124,16 @@
           <w:noProof/>
         </w:rPr>
         <w:drawing>
-          <wp:inline distT="0" distB="0" distL="0" distR="0" wp14:anchorId="1D7E990D" wp14:editId="2292CFEF">
+          <wp:inline distT="0" distB="0" distL="0" distR="0" wp14:anchorId="0B216221" wp14:editId="719CC755">
             <wp:extent cx="5120640" cy="4627581"/>
             <wp:effectExtent l="19050" t="19050" r="22860" b="20955"/>
-            <wp:docPr id="1834887098" name="Imagem 28"/>
+            <wp:docPr id="1192161959" name="Imagem 28"/>
             <wp:cNvGraphicFramePr/>
             <a:graphic xmlns:a="http://schemas.openxmlformats.org/drawingml/2006/main">
               <a:graphicData uri="http://schemas.openxmlformats.org/drawingml/2006/picture">
                 <pic:pic xmlns:pic="http://schemas.openxmlformats.org/drawingml/2006/picture">
                   <pic:nvPicPr>
-                    <pic:cNvPr id="1834887098" name=""/>
+                    <pic:cNvPr id="1192161959" name=""/>
                     <pic:cNvPicPr/>
                   </pic:nvPicPr>
                   <pic:blipFill>
@@ -16175,16 +16201,16 @@
         </w:rPr>
         <w:lastRenderedPageBreak/>
         <w:drawing>
-          <wp:inline distT="0" distB="0" distL="0" distR="0" wp14:anchorId="5A720262" wp14:editId="23B0E3F6">
+          <wp:inline distT="0" distB="0" distL="0" distR="0" wp14:anchorId="7CEE2F59" wp14:editId="12DF0B7A">
             <wp:extent cx="5120640" cy="4627581"/>
             <wp:effectExtent l="19050" t="19050" r="22860" b="20955"/>
-            <wp:docPr id="1671105025" name="Imagem 29"/>
+            <wp:docPr id="2089455995" name="Imagem 29"/>
             <wp:cNvGraphicFramePr/>
             <a:graphic xmlns:a="http://schemas.openxmlformats.org/drawingml/2006/main">
               <a:graphicData uri="http://schemas.openxmlformats.org/drawingml/2006/picture">
                 <pic:pic xmlns:pic="http://schemas.openxmlformats.org/drawingml/2006/picture">
                   <pic:nvPicPr>
-                    <pic:cNvPr id="1671105025" name=""/>
+                    <pic:cNvPr id="2089455995" name=""/>
                     <pic:cNvPicPr/>
                   </pic:nvPicPr>
                   <pic:blipFill>
@@ -16252,16 +16278,16 @@
         </w:rPr>
         <w:lastRenderedPageBreak/>
         <w:drawing>
-          <wp:inline distT="0" distB="0" distL="0" distR="0" wp14:anchorId="0A34E9B9" wp14:editId="5CF6C97D">
+          <wp:inline distT="0" distB="0" distL="0" distR="0" wp14:anchorId="35007FD5" wp14:editId="69790613">
             <wp:extent cx="5120640" cy="4627581"/>
             <wp:effectExtent l="19050" t="19050" r="22860" b="20955"/>
-            <wp:docPr id="282939010" name="Imagem 30"/>
+            <wp:docPr id="199507342" name="Imagem 30"/>
             <wp:cNvGraphicFramePr/>
             <a:graphic xmlns:a="http://schemas.openxmlformats.org/drawingml/2006/main">
               <a:graphicData uri="http://schemas.openxmlformats.org/drawingml/2006/picture">
                 <pic:pic xmlns:pic="http://schemas.openxmlformats.org/drawingml/2006/picture">
                   <pic:nvPicPr>
-                    <pic:cNvPr id="282939010" name=""/>
+                    <pic:cNvPr id="199507342" name=""/>
                     <pic:cNvPicPr/>
                   </pic:nvPicPr>
                   <pic:blipFill>
@@ -16463,16 +16489,16 @@
           <w:noProof/>
         </w:rPr>
         <w:drawing>
-          <wp:inline distT="0" distB="0" distL="0" distR="0" wp14:anchorId="1276D325" wp14:editId="1DFD9897">
+          <wp:inline distT="0" distB="0" distL="0" distR="0" wp14:anchorId="287ADEE8" wp14:editId="4E6C0DA6">
             <wp:extent cx="5120640" cy="1715571"/>
             <wp:effectExtent l="19050" t="19050" r="22860" b="18415"/>
-            <wp:docPr id="15546856" name="Imagem 31"/>
+            <wp:docPr id="624145486" name="Imagem 31"/>
             <wp:cNvGraphicFramePr/>
             <a:graphic xmlns:a="http://schemas.openxmlformats.org/drawingml/2006/main">
               <a:graphicData uri="http://schemas.openxmlformats.org/drawingml/2006/picture">
                 <pic:pic xmlns:pic="http://schemas.openxmlformats.org/drawingml/2006/picture">
                   <pic:nvPicPr>
-                    <pic:cNvPr id="15546856" name=""/>
+                    <pic:cNvPr id="624145486" name=""/>
                     <pic:cNvPicPr/>
                   </pic:nvPicPr>
                   <pic:blipFill>
@@ -16609,16 +16635,16 @@
           <w:noProof/>
         </w:rPr>
         <w:drawing>
-          <wp:inline distT="0" distB="0" distL="0" distR="0" wp14:anchorId="189D69D2" wp14:editId="0E079EF9">
+          <wp:inline distT="0" distB="0" distL="0" distR="0" wp14:anchorId="425264F0" wp14:editId="33CE0EB7">
             <wp:extent cx="5120640" cy="3282818"/>
             <wp:effectExtent l="19050" t="19050" r="22860" b="13335"/>
-            <wp:docPr id="1737505798" name="Imagem 32"/>
+            <wp:docPr id="162083709" name="Imagem 32"/>
             <wp:cNvGraphicFramePr/>
             <a:graphic xmlns:a="http://schemas.openxmlformats.org/drawingml/2006/main">
               <a:graphicData uri="http://schemas.openxmlformats.org/drawingml/2006/picture">
                 <pic:pic xmlns:pic="http://schemas.openxmlformats.org/drawingml/2006/picture">
                   <pic:nvPicPr>
-                    <pic:cNvPr id="1737505798" name=""/>
+                    <pic:cNvPr id="162083709" name=""/>
                     <pic:cNvPicPr/>
                   </pic:nvPicPr>
                   <pic:blipFill>
@@ -16731,16 +16757,16 @@
         </w:rPr>
         <w:lastRenderedPageBreak/>
         <w:drawing>
-          <wp:inline distT="0" distB="0" distL="0" distR="0" wp14:anchorId="72F7760B" wp14:editId="7AE77C39">
+          <wp:inline distT="0" distB="0" distL="0" distR="0" wp14:anchorId="1EA6ACD9" wp14:editId="6F146695">
             <wp:extent cx="5120640" cy="951357"/>
             <wp:effectExtent l="19050" t="19050" r="22860" b="20320"/>
-            <wp:docPr id="1802429617" name="Imagem 33"/>
+            <wp:docPr id="1239335308" name="Imagem 33"/>
             <wp:cNvGraphicFramePr/>
             <a:graphic xmlns:a="http://schemas.openxmlformats.org/drawingml/2006/main">
               <a:graphicData uri="http://schemas.openxmlformats.org/drawingml/2006/picture">
                 <pic:pic xmlns:pic="http://schemas.openxmlformats.org/drawingml/2006/picture">
                   <pic:nvPicPr>
-                    <pic:cNvPr id="1802429617" name=""/>
+                    <pic:cNvPr id="1239335308" name=""/>
                     <pic:cNvPicPr/>
                   </pic:nvPicPr>
                   <pic:blipFill>
@@ -16852,16 +16878,16 @@
           <w:noProof/>
         </w:rPr>
         <w:drawing>
-          <wp:inline distT="0" distB="0" distL="0" distR="0" wp14:anchorId="202FE0F0" wp14:editId="2B99866C">
+          <wp:inline distT="0" distB="0" distL="0" distR="0" wp14:anchorId="780BF66F" wp14:editId="33CEAA5F">
             <wp:extent cx="5120640" cy="1515102"/>
             <wp:effectExtent l="19050" t="19050" r="22860" b="28575"/>
-            <wp:docPr id="1708244739" name="Imagem 34"/>
+            <wp:docPr id="1468584684" name="Imagem 34"/>
             <wp:cNvGraphicFramePr/>
             <a:graphic xmlns:a="http://schemas.openxmlformats.org/drawingml/2006/main">
               <a:graphicData uri="http://schemas.openxmlformats.org/drawingml/2006/picture">
                 <pic:pic xmlns:pic="http://schemas.openxmlformats.org/drawingml/2006/picture">
                   <pic:nvPicPr>
-                    <pic:cNvPr id="1708244739" name=""/>
+                    <pic:cNvPr id="1468584684" name=""/>
                     <pic:cNvPicPr/>
                   </pic:nvPicPr>
                   <pic:blipFill>
@@ -16983,16 +17009,16 @@
           <w:noProof/>
         </w:rPr>
         <w:drawing>
-          <wp:inline distT="0" distB="0" distL="0" distR="0" wp14:anchorId="168D2A79" wp14:editId="1639AD82">
+          <wp:inline distT="0" distB="0" distL="0" distR="0" wp14:anchorId="425AB836" wp14:editId="55E19F7D">
             <wp:extent cx="5120640" cy="1391113"/>
             <wp:effectExtent l="19050" t="19050" r="22860" b="19050"/>
-            <wp:docPr id="550491511" name="Imagem 35"/>
+            <wp:docPr id="1978964932" name="Imagem 35"/>
             <wp:cNvGraphicFramePr/>
             <a:graphic xmlns:a="http://schemas.openxmlformats.org/drawingml/2006/main">
               <a:graphicData uri="http://schemas.openxmlformats.org/drawingml/2006/picture">
                 <pic:pic xmlns:pic="http://schemas.openxmlformats.org/drawingml/2006/picture">
                   <pic:nvPicPr>
-                    <pic:cNvPr id="550491511" name=""/>
+                    <pic:cNvPr id="1978964932" name=""/>
                     <pic:cNvPicPr/>
                   </pic:nvPicPr>
                   <pic:blipFill>
@@ -17104,16 +17130,16 @@
           <w:noProof/>
         </w:rPr>
         <w:drawing>
-          <wp:inline distT="0" distB="0" distL="0" distR="0" wp14:anchorId="2A40DCF3" wp14:editId="0B83EA46">
+          <wp:inline distT="0" distB="0" distL="0" distR="0" wp14:anchorId="113FA949" wp14:editId="3CB81875">
             <wp:extent cx="5120640" cy="1125174"/>
             <wp:effectExtent l="19050" t="19050" r="22860" b="18415"/>
-            <wp:docPr id="2065156179" name="Imagem 36"/>
+            <wp:docPr id="1444024442" name="Imagem 36"/>
             <wp:cNvGraphicFramePr/>
             <a:graphic xmlns:a="http://schemas.openxmlformats.org/drawingml/2006/main">
               <a:graphicData uri="http://schemas.openxmlformats.org/drawingml/2006/picture">
                 <pic:pic xmlns:pic="http://schemas.openxmlformats.org/drawingml/2006/picture">
                   <pic:nvPicPr>
-                    <pic:cNvPr id="2065156179" name=""/>
+                    <pic:cNvPr id="1444024442" name=""/>
                     <pic:cNvPicPr/>
                   </pic:nvPicPr>
                   <pic:blipFill>
@@ -17202,7 +17228,7 @@
           <w:sz w:val="27"/>
         </w:rPr>
       </w:pPr>
-      <w:bookmarkStart w:id="32" w:name="_Toc240032109"/>
+      <w:bookmarkStart w:id="32" w:name="_Toc240033476"/>
       <w:r>
         <w:rPr>
           <w:rFonts w:ascii="Montserrat" w:hAnsi="Montserrat"/>
@@ -17243,16 +17269,16 @@
           <w:noProof/>
         </w:rPr>
         <w:drawing>
-          <wp:inline distT="0" distB="0" distL="0" distR="0" wp14:anchorId="0A812912" wp14:editId="1789996C">
+          <wp:inline distT="0" distB="0" distL="0" distR="0" wp14:anchorId="7CA79B03" wp14:editId="0062E007">
             <wp:extent cx="5120640" cy="4627581"/>
             <wp:effectExtent l="19050" t="19050" r="22860" b="20955"/>
-            <wp:docPr id="1829506352" name="Imagem 37"/>
+            <wp:docPr id="1824881768" name="Imagem 37"/>
             <wp:cNvGraphicFramePr/>
             <a:graphic xmlns:a="http://schemas.openxmlformats.org/drawingml/2006/main">
               <a:graphicData uri="http://schemas.openxmlformats.org/drawingml/2006/picture">
                 <pic:pic xmlns:pic="http://schemas.openxmlformats.org/drawingml/2006/picture">
                   <pic:nvPicPr>
-                    <pic:cNvPr id="1829506352" name=""/>
+                    <pic:cNvPr id="1824881768" name=""/>
                     <pic:cNvPicPr/>
                   </pic:nvPicPr>
                   <pic:blipFill>
@@ -17320,16 +17346,16 @@
         </w:rPr>
         <w:lastRenderedPageBreak/>
         <w:drawing>
-          <wp:inline distT="0" distB="0" distL="0" distR="0" wp14:anchorId="018546BE" wp14:editId="524CDB04">
+          <wp:inline distT="0" distB="0" distL="0" distR="0" wp14:anchorId="6E3B50B2" wp14:editId="0361063C">
             <wp:extent cx="5120640" cy="4627581"/>
             <wp:effectExtent l="19050" t="19050" r="22860" b="20955"/>
-            <wp:docPr id="224321639" name="Imagem 38"/>
+            <wp:docPr id="1213639589" name="Imagem 38"/>
             <wp:cNvGraphicFramePr/>
             <a:graphic xmlns:a="http://schemas.openxmlformats.org/drawingml/2006/main">
               <a:graphicData uri="http://schemas.openxmlformats.org/drawingml/2006/picture">
                 <pic:pic xmlns:pic="http://schemas.openxmlformats.org/drawingml/2006/picture">
                   <pic:nvPicPr>
-                    <pic:cNvPr id="224321639" name=""/>
+                    <pic:cNvPr id="1213639589" name=""/>
                     <pic:cNvPicPr/>
                   </pic:nvPicPr>
                   <pic:blipFill>
@@ -17498,16 +17524,16 @@
           <w:noProof/>
         </w:rPr>
         <w:drawing>
-          <wp:inline distT="0" distB="0" distL="0" distR="0" wp14:anchorId="2ED0A4D8" wp14:editId="05C25C86">
+          <wp:inline distT="0" distB="0" distL="0" distR="0" wp14:anchorId="04A4ACC7" wp14:editId="26123E19">
             <wp:extent cx="5120640" cy="2144319"/>
             <wp:effectExtent l="19050" t="19050" r="22860" b="27940"/>
-            <wp:docPr id="280703244" name="Imagem 39"/>
+            <wp:docPr id="1340974171" name="Imagem 39"/>
             <wp:cNvGraphicFramePr/>
             <a:graphic xmlns:a="http://schemas.openxmlformats.org/drawingml/2006/main">
               <a:graphicData uri="http://schemas.openxmlformats.org/drawingml/2006/picture">
                 <pic:pic xmlns:pic="http://schemas.openxmlformats.org/drawingml/2006/picture">
                   <pic:nvPicPr>
-                    <pic:cNvPr id="280703244" name=""/>
+                    <pic:cNvPr id="1340974171" name=""/>
                     <pic:cNvPicPr/>
                   </pic:nvPicPr>
                   <pic:blipFill>
@@ -17595,16 +17621,16 @@
           <w:noProof/>
         </w:rPr>
         <w:drawing>
-          <wp:inline distT="0" distB="0" distL="0" distR="0" wp14:anchorId="5F0806F4" wp14:editId="330D7E3E">
+          <wp:inline distT="0" distB="0" distL="0" distR="0" wp14:anchorId="0B68A133" wp14:editId="2BCE28BA">
             <wp:extent cx="5120640" cy="1055647"/>
             <wp:effectExtent l="19050" t="19050" r="22860" b="11430"/>
-            <wp:docPr id="2002257961" name="Imagem 40"/>
+            <wp:docPr id="1553740687" name="Imagem 40"/>
             <wp:cNvGraphicFramePr/>
             <a:graphic xmlns:a="http://schemas.openxmlformats.org/drawingml/2006/main">
               <a:graphicData uri="http://schemas.openxmlformats.org/drawingml/2006/picture">
                 <pic:pic xmlns:pic="http://schemas.openxmlformats.org/drawingml/2006/picture">
                   <pic:nvPicPr>
-                    <pic:cNvPr id="2002257961" name=""/>
+                    <pic:cNvPr id="1553740687" name=""/>
                     <pic:cNvPicPr/>
                   </pic:nvPicPr>
                   <pic:blipFill>
@@ -17726,16 +17752,16 @@
           <w:noProof/>
         </w:rPr>
         <w:drawing>
-          <wp:inline distT="0" distB="0" distL="0" distR="0" wp14:anchorId="5B4F6AB6" wp14:editId="2AFE6E1F">
+          <wp:inline distT="0" distB="0" distL="0" distR="0" wp14:anchorId="5F9991F8" wp14:editId="6AF0608B">
             <wp:extent cx="5120640" cy="3282818"/>
             <wp:effectExtent l="19050" t="19050" r="22860" b="13335"/>
-            <wp:docPr id="1906933450" name="Imagem 41"/>
+            <wp:docPr id="104098770" name="Imagem 41"/>
             <wp:cNvGraphicFramePr/>
             <a:graphic xmlns:a="http://schemas.openxmlformats.org/drawingml/2006/main">
               <a:graphicData uri="http://schemas.openxmlformats.org/drawingml/2006/picture">
                 <pic:pic xmlns:pic="http://schemas.openxmlformats.org/drawingml/2006/picture">
                   <pic:nvPicPr>
-                    <pic:cNvPr id="1906933450" name=""/>
+                    <pic:cNvPr id="104098770" name=""/>
                     <pic:cNvPicPr/>
                   </pic:nvPicPr>
                   <pic:blipFill>
@@ -17869,16 +17895,16 @@
         </w:rPr>
         <w:lastRenderedPageBreak/>
         <w:drawing>
-          <wp:inline distT="0" distB="0" distL="0" distR="0" wp14:anchorId="0EA4BE53" wp14:editId="15F0EDC7">
+          <wp:inline distT="0" distB="0" distL="0" distR="0" wp14:anchorId="4BE37DAE" wp14:editId="7A18449C">
             <wp:extent cx="5120640" cy="1978034"/>
             <wp:effectExtent l="19050" t="19050" r="22860" b="22225"/>
-            <wp:docPr id="1199655337" name="Imagem 42"/>
+            <wp:docPr id="2036317279" name="Imagem 42"/>
             <wp:cNvGraphicFramePr/>
             <a:graphic xmlns:a="http://schemas.openxmlformats.org/drawingml/2006/main">
               <a:graphicData uri="http://schemas.openxmlformats.org/drawingml/2006/picture">
                 <pic:pic xmlns:pic="http://schemas.openxmlformats.org/drawingml/2006/picture">
                   <pic:nvPicPr>
-                    <pic:cNvPr id="1199655337" name=""/>
+                    <pic:cNvPr id="2036317279" name=""/>
                     <pic:cNvPicPr/>
                   </pic:nvPicPr>
                   <pic:blipFill>
@@ -17950,7 +17976,7 @@
           <w:sz w:val="34"/>
         </w:rPr>
       </w:pPr>
-      <w:bookmarkStart w:id="33" w:name="_Toc240032110"/>
+      <w:bookmarkStart w:id="33" w:name="_Toc240033477"/>
       <w:r>
         <w:rPr>
           <w:rFonts w:ascii="Montserrat" w:hAnsi="Montserrat"/>
@@ -18010,7 +18036,7 @@
           <w:sz w:val="27"/>
         </w:rPr>
       </w:pPr>
-      <w:bookmarkStart w:id="34" w:name="_Toc240032111"/>
+      <w:bookmarkStart w:id="34" w:name="_Toc240033478"/>
       <w:r>
         <w:rPr>
           <w:rFonts w:ascii="Montserrat" w:hAnsi="Montserrat"/>
@@ -18050,16 +18076,16 @@
           <w:noProof/>
         </w:rPr>
         <w:drawing>
-          <wp:inline distT="0" distB="0" distL="0" distR="0" wp14:anchorId="4DE819AE" wp14:editId="56FF4F87">
+          <wp:inline distT="0" distB="0" distL="0" distR="0" wp14:anchorId="22432A2F" wp14:editId="1CB93057">
             <wp:extent cx="5303520" cy="4792851"/>
             <wp:effectExtent l="19050" t="19050" r="11430" b="27305"/>
-            <wp:docPr id="2110308234" name="Imagem 43"/>
+            <wp:docPr id="451416566" name="Imagem 43"/>
             <wp:cNvGraphicFramePr/>
             <a:graphic xmlns:a="http://schemas.openxmlformats.org/drawingml/2006/main">
               <a:graphicData uri="http://schemas.openxmlformats.org/drawingml/2006/picture">
                 <pic:pic xmlns:pic="http://schemas.openxmlformats.org/drawingml/2006/picture">
                   <pic:nvPicPr>
-                    <pic:cNvPr id="2110308234" name=""/>
+                    <pic:cNvPr id="451416566" name=""/>
                     <pic:cNvPicPr/>
                   </pic:nvPicPr>
                   <pic:blipFill>
@@ -18128,7 +18154,7 @@
           <w:sz w:val="27"/>
         </w:rPr>
       </w:pPr>
-      <w:bookmarkStart w:id="35" w:name="_Toc240032112"/>
+      <w:bookmarkStart w:id="35" w:name="_Toc240033479"/>
       <w:r>
         <w:rPr>
           <w:rFonts w:ascii="Montserrat" w:hAnsi="Montserrat"/>
@@ -18168,16 +18194,16 @@
           <w:noProof/>
         </w:rPr>
         <w:drawing>
-          <wp:inline distT="0" distB="0" distL="0" distR="0" wp14:anchorId="04AD4407" wp14:editId="08294188">
+          <wp:inline distT="0" distB="0" distL="0" distR="0" wp14:anchorId="26C4E8C7" wp14:editId="6CF32078">
             <wp:extent cx="5303520" cy="4792851"/>
             <wp:effectExtent l="19050" t="19050" r="11430" b="27305"/>
-            <wp:docPr id="2127897181" name="Imagem 44"/>
+            <wp:docPr id="1055801028" name="Imagem 44"/>
             <wp:cNvGraphicFramePr/>
             <a:graphic xmlns:a="http://schemas.openxmlformats.org/drawingml/2006/main">
               <a:graphicData uri="http://schemas.openxmlformats.org/drawingml/2006/picture">
                 <pic:pic xmlns:pic="http://schemas.openxmlformats.org/drawingml/2006/picture">
                   <pic:nvPicPr>
-                    <pic:cNvPr id="2127897181" name=""/>
+                    <pic:cNvPr id="1055801028" name=""/>
                     <pic:cNvPicPr/>
                   </pic:nvPicPr>
                   <pic:blipFill>
@@ -18245,7 +18271,7 @@
           <w:sz w:val="27"/>
         </w:rPr>
       </w:pPr>
-      <w:bookmarkStart w:id="36" w:name="_Toc240032113"/>
+      <w:bookmarkStart w:id="36" w:name="_Toc240033480"/>
       <w:r>
         <w:rPr>
           <w:rFonts w:ascii="Montserrat" w:hAnsi="Montserrat"/>
@@ -18286,16 +18312,16 @@
         </w:rPr>
         <w:lastRenderedPageBreak/>
         <w:drawing>
-          <wp:inline distT="0" distB="0" distL="0" distR="0" wp14:anchorId="19671EFD" wp14:editId="63B11436">
+          <wp:inline distT="0" distB="0" distL="0" distR="0" wp14:anchorId="41AA6655" wp14:editId="4A1CCCBC">
             <wp:extent cx="5303520" cy="4792851"/>
             <wp:effectExtent l="19050" t="19050" r="11430" b="27305"/>
-            <wp:docPr id="1226317154" name="Imagem 45"/>
+            <wp:docPr id="1378687512" name="Imagem 45"/>
             <wp:cNvGraphicFramePr/>
             <a:graphic xmlns:a="http://schemas.openxmlformats.org/drawingml/2006/main">
               <a:graphicData uri="http://schemas.openxmlformats.org/drawingml/2006/picture">
                 <pic:pic xmlns:pic="http://schemas.openxmlformats.org/drawingml/2006/picture">
                   <pic:nvPicPr>
-                    <pic:cNvPr id="1226317154" name=""/>
+                    <pic:cNvPr id="1378687512" name=""/>
                     <pic:cNvPicPr/>
                   </pic:nvPicPr>
                   <pic:blipFill>
@@ -18363,16 +18389,16 @@
         </w:rPr>
         <w:lastRenderedPageBreak/>
         <w:drawing>
-          <wp:inline distT="0" distB="0" distL="0" distR="0" wp14:anchorId="4E7415A3" wp14:editId="12EE2CA8">
+          <wp:inline distT="0" distB="0" distL="0" distR="0" wp14:anchorId="4F3D7397" wp14:editId="25897980">
             <wp:extent cx="5303520" cy="4792851"/>
             <wp:effectExtent l="19050" t="19050" r="11430" b="27305"/>
-            <wp:docPr id="392846314" name="Imagem 46"/>
+            <wp:docPr id="761554502" name="Imagem 46"/>
             <wp:cNvGraphicFramePr/>
             <a:graphic xmlns:a="http://schemas.openxmlformats.org/drawingml/2006/main">
               <a:graphicData uri="http://schemas.openxmlformats.org/drawingml/2006/picture">
                 <pic:pic xmlns:pic="http://schemas.openxmlformats.org/drawingml/2006/picture">
                   <pic:nvPicPr>
-                    <pic:cNvPr id="392846314" name=""/>
+                    <pic:cNvPr id="761554502" name=""/>
                     <pic:cNvPicPr/>
                   </pic:nvPicPr>
                   <pic:blipFill>
@@ -18465,7 +18491,7 @@
           <w:sz w:val="34"/>
         </w:rPr>
       </w:pPr>
-      <w:bookmarkStart w:id="37" w:name="_Toc240032114"/>
+      <w:bookmarkStart w:id="37" w:name="_Toc240033481"/>
       <w:r>
         <w:rPr>
           <w:rFonts w:ascii="Montserrat" w:hAnsi="Montserrat"/>
@@ -18507,7 +18533,7 @@
           <w:sz w:val="27"/>
         </w:rPr>
       </w:pPr>
-      <w:bookmarkStart w:id="38" w:name="_Toc240032115"/>
+      <w:bookmarkStart w:id="38" w:name="_Toc240033482"/>
       <w:r>
         <w:rPr>
           <w:rFonts w:ascii="Montserrat" w:hAnsi="Montserrat"/>
@@ -18547,16 +18573,16 @@
           <w:noProof/>
         </w:rPr>
         <w:drawing>
-          <wp:inline distT="0" distB="0" distL="0" distR="0" wp14:anchorId="65CA9060" wp14:editId="2857B835">
+          <wp:inline distT="0" distB="0" distL="0" distR="0" wp14:anchorId="0BA95D9E" wp14:editId="2D1872DB">
             <wp:extent cx="5303520" cy="4792851"/>
             <wp:effectExtent l="19050" t="19050" r="11430" b="27305"/>
-            <wp:docPr id="1525071452" name="Imagem 47"/>
+            <wp:docPr id="2024097544" name="Imagem 47"/>
             <wp:cNvGraphicFramePr/>
             <a:graphic xmlns:a="http://schemas.openxmlformats.org/drawingml/2006/main">
               <a:graphicData uri="http://schemas.openxmlformats.org/drawingml/2006/picture">
                 <pic:pic xmlns:pic="http://schemas.openxmlformats.org/drawingml/2006/picture">
                   <pic:nvPicPr>
-                    <pic:cNvPr id="1525071452" name=""/>
+                    <pic:cNvPr id="2024097544" name=""/>
                     <pic:cNvPicPr/>
                   </pic:nvPicPr>
                   <pic:blipFill>
@@ -18703,7 +18729,7 @@
           <w:sz w:val="27"/>
         </w:rPr>
       </w:pPr>
-      <w:bookmarkStart w:id="39" w:name="_Toc240032116"/>
+      <w:bookmarkStart w:id="39" w:name="_Toc240033483"/>
       <w:r>
         <w:rPr>
           <w:rFonts w:ascii="Montserrat" w:hAnsi="Montserrat"/>
@@ -18744,16 +18770,16 @@
         </w:rPr>
         <w:lastRenderedPageBreak/>
         <w:drawing>
-          <wp:inline distT="0" distB="0" distL="0" distR="0" wp14:anchorId="7C16139E" wp14:editId="396C681F">
+          <wp:inline distT="0" distB="0" distL="0" distR="0" wp14:anchorId="2911A28A" wp14:editId="4368BCAE">
             <wp:extent cx="5303520" cy="4792851"/>
             <wp:effectExtent l="19050" t="19050" r="11430" b="27305"/>
-            <wp:docPr id="1717960582" name="Imagem 48"/>
+            <wp:docPr id="1284976806" name="Imagem 48"/>
             <wp:cNvGraphicFramePr/>
             <a:graphic xmlns:a="http://schemas.openxmlformats.org/drawingml/2006/main">
               <a:graphicData uri="http://schemas.openxmlformats.org/drawingml/2006/picture">
                 <pic:pic xmlns:pic="http://schemas.openxmlformats.org/drawingml/2006/picture">
                   <pic:nvPicPr>
-                    <pic:cNvPr id="1717960582" name=""/>
+                    <pic:cNvPr id="1284976806" name=""/>
                     <pic:cNvPicPr/>
                   </pic:nvPicPr>
                   <pic:blipFill>
@@ -18821,7 +18847,7 @@
           <w:sz w:val="27"/>
         </w:rPr>
       </w:pPr>
-      <w:bookmarkStart w:id="40" w:name="_Toc240032117"/>
+      <w:bookmarkStart w:id="40" w:name="_Toc240033484"/>
       <w:r>
         <w:rPr>
           <w:rFonts w:ascii="Montserrat" w:hAnsi="Montserrat"/>
@@ -18862,16 +18888,16 @@
         </w:rPr>
         <w:lastRenderedPageBreak/>
         <w:drawing>
-          <wp:inline distT="0" distB="0" distL="0" distR="0" wp14:anchorId="13A53DE7" wp14:editId="4E927315">
+          <wp:inline distT="0" distB="0" distL="0" distR="0" wp14:anchorId="4835EA54" wp14:editId="6050FF38">
             <wp:extent cx="5303520" cy="4792851"/>
             <wp:effectExtent l="19050" t="19050" r="11430" b="27305"/>
-            <wp:docPr id="697594974" name="Imagem 49"/>
+            <wp:docPr id="612189120" name="Imagem 49"/>
             <wp:cNvGraphicFramePr/>
             <a:graphic xmlns:a="http://schemas.openxmlformats.org/drawingml/2006/main">
               <a:graphicData uri="http://schemas.openxmlformats.org/drawingml/2006/picture">
                 <pic:pic xmlns:pic="http://schemas.openxmlformats.org/drawingml/2006/picture">
                   <pic:nvPicPr>
-                    <pic:cNvPr id="697594974" name=""/>
+                    <pic:cNvPr id="612189120" name=""/>
                     <pic:cNvPicPr/>
                   </pic:nvPicPr>
                   <pic:blipFill>
@@ -19015,7 +19041,7 @@
           <w:sz w:val="27"/>
         </w:rPr>
       </w:pPr>
-      <w:bookmarkStart w:id="41" w:name="_Toc240032118"/>
+      <w:bookmarkStart w:id="41" w:name="_Toc240033485"/>
       <w:r>
         <w:rPr>
           <w:rFonts w:ascii="Montserrat" w:hAnsi="Montserrat"/>
@@ -19208,16 +19234,16 @@
           <w:noProof/>
         </w:rPr>
         <w:drawing>
-          <wp:inline distT="0" distB="0" distL="0" distR="0" wp14:anchorId="71D676F2" wp14:editId="6FCEF83B">
+          <wp:inline distT="0" distB="0" distL="0" distR="0" wp14:anchorId="76B2B642" wp14:editId="5C57A047">
             <wp:extent cx="5303520" cy="4267180"/>
             <wp:effectExtent l="19050" t="19050" r="11430" b="19685"/>
-            <wp:docPr id="191589446" name="Imagem 50"/>
+            <wp:docPr id="266537042" name="Imagem 50"/>
             <wp:cNvGraphicFramePr/>
             <a:graphic xmlns:a="http://schemas.openxmlformats.org/drawingml/2006/main">
               <a:graphicData uri="http://schemas.openxmlformats.org/drawingml/2006/picture">
                 <pic:pic xmlns:pic="http://schemas.openxmlformats.org/drawingml/2006/picture">
                   <pic:nvPicPr>
-                    <pic:cNvPr id="191589446" name=""/>
+                    <pic:cNvPr id="266537042" name=""/>
                     <pic:cNvPicPr/>
                   </pic:nvPicPr>
                   <pic:blipFill>
@@ -19285,16 +19311,16 @@
         </w:rPr>
         <w:lastRenderedPageBreak/>
         <w:drawing>
-          <wp:inline distT="0" distB="0" distL="0" distR="0" wp14:anchorId="385C9787" wp14:editId="49376925">
+          <wp:inline distT="0" distB="0" distL="0" distR="0" wp14:anchorId="257207B1" wp14:editId="7409B4B1">
             <wp:extent cx="5303520" cy="3382059"/>
             <wp:effectExtent l="19050" t="19050" r="11430" b="27940"/>
-            <wp:docPr id="1307368685" name="Imagem 51"/>
+            <wp:docPr id="1593819787" name="Imagem 51"/>
             <wp:cNvGraphicFramePr/>
             <a:graphic xmlns:a="http://schemas.openxmlformats.org/drawingml/2006/main">
               <a:graphicData uri="http://schemas.openxmlformats.org/drawingml/2006/picture">
                 <pic:pic xmlns:pic="http://schemas.openxmlformats.org/drawingml/2006/picture">
                   <pic:nvPicPr>
-                    <pic:cNvPr id="1307368685" name=""/>
+                    <pic:cNvPr id="1593819787" name=""/>
                     <pic:cNvPicPr/>
                   </pic:nvPicPr>
                   <pic:blipFill>
@@ -19362,16 +19388,16 @@
         </w:rPr>
         <w:lastRenderedPageBreak/>
         <w:drawing>
-          <wp:inline distT="0" distB="0" distL="0" distR="0" wp14:anchorId="34D99360" wp14:editId="53BB3D26">
+          <wp:inline distT="0" distB="0" distL="0" distR="0" wp14:anchorId="16A55D80" wp14:editId="613F6250">
             <wp:extent cx="5303520" cy="4417800"/>
             <wp:effectExtent l="19050" t="19050" r="11430" b="20955"/>
-            <wp:docPr id="768657204" name="Imagem 52"/>
+            <wp:docPr id="1041716433" name="Imagem 52"/>
             <wp:cNvGraphicFramePr/>
             <a:graphic xmlns:a="http://schemas.openxmlformats.org/drawingml/2006/main">
               <a:graphicData uri="http://schemas.openxmlformats.org/drawingml/2006/picture">
                 <pic:pic xmlns:pic="http://schemas.openxmlformats.org/drawingml/2006/picture">
                   <pic:nvPicPr>
-                    <pic:cNvPr id="768657204" name=""/>
+                    <pic:cNvPr id="1041716433" name=""/>
                     <pic:cNvPicPr/>
                   </pic:nvPicPr>
                   <pic:blipFill>
@@ -19481,7 +19507,7 @@
           <w:sz w:val="27"/>
         </w:rPr>
       </w:pPr>
-      <w:bookmarkStart w:id="42" w:name="_Toc240032119"/>
+      <w:bookmarkStart w:id="42" w:name="_Toc240033486"/>
       <w:r>
         <w:rPr>
           <w:rFonts w:ascii="Montserrat" w:hAnsi="Montserrat"/>
@@ -19699,16 +19725,16 @@
         </w:rPr>
         <w:lastRenderedPageBreak/>
         <w:drawing>
-          <wp:inline distT="0" distB="0" distL="0" distR="0" wp14:anchorId="365A6F68" wp14:editId="5A8E2079">
+          <wp:inline distT="0" distB="0" distL="0" distR="0" wp14:anchorId="5642539D" wp14:editId="0781B144">
             <wp:extent cx="5303520" cy="7628836"/>
             <wp:effectExtent l="19050" t="19050" r="11430" b="10795"/>
-            <wp:docPr id="1276707231" name="Imagem 53"/>
+            <wp:docPr id="1747323059" name="Imagem 53"/>
             <wp:cNvGraphicFramePr/>
             <a:graphic xmlns:a="http://schemas.openxmlformats.org/drawingml/2006/main">
               <a:graphicData uri="http://schemas.openxmlformats.org/drawingml/2006/picture">
                 <pic:pic xmlns:pic="http://schemas.openxmlformats.org/drawingml/2006/picture">
                   <pic:nvPicPr>
-                    <pic:cNvPr id="1276707231" name=""/>
+                    <pic:cNvPr id="1747323059" name=""/>
                     <pic:cNvPicPr/>
                   </pic:nvPicPr>
                   <pic:blipFill>
@@ -19840,7 +19866,7 @@
           <w:sz w:val="27"/>
         </w:rPr>
       </w:pPr>
-      <w:bookmarkStart w:id="43" w:name="_Toc240032120"/>
+      <w:bookmarkStart w:id="43" w:name="_Toc240033487"/>
       <w:r>
         <w:rPr>
           <w:rFonts w:ascii="Montserrat" w:hAnsi="Montserrat"/>
@@ -19993,7 +20019,7 @@
           <w:sz w:val="27"/>
         </w:rPr>
       </w:pPr>
-      <w:bookmarkStart w:id="44" w:name="_Toc240032121"/>
+      <w:bookmarkStart w:id="44" w:name="_Toc240033488"/>
       <w:r>
         <w:rPr>
           <w:rFonts w:ascii="Montserrat" w:hAnsi="Montserrat"/>
@@ -20273,7 +20299,7 @@
           <w:color w:val="1A1A1A"/>
           <w:sz w:val="22"/>
         </w:rPr>
-        <w:t>Por ultimo, um bloco Metas dos indicadores estrategicos define a meta em % de cada um dos 3 indicadores do Relatorio de Resultados (secao 6.7) - Marcos no prazo, Projetos dentro do orcamento e Entraves resolvidos. Enquanto uma meta ficar vazia, o cartao correspondente mostra Meta nao definida em vez de um selo de status.</w:t>
+        <w:t>Por ultimo, um bloco Metas dos indicadores estrategicos define a meta em % de cada um dos 4 indicadores do Relatorio de Resultados (secao 6.7) - Marcos no prazo, Projetos dentro do orcamento, Entraves resolvidos e Projetos sem risco alto/critico. Enquanto uma meta ficar vazia, o cartao correspondente mostra Meta nao definida em vez de um selo de status.</w:t>
       </w:r>
     </w:p>
     <w:p>
@@ -20286,16 +20312,16 @@
           <w:noProof/>
         </w:rPr>
         <w:drawing>
-          <wp:inline distT="0" distB="0" distL="0" distR="0" wp14:anchorId="62476536" wp14:editId="31E7BCEE">
+          <wp:inline distT="0" distB="0" distL="0" distR="0" wp14:anchorId="6E37DA91" wp14:editId="69588FB6">
             <wp:extent cx="5303520" cy="1351384"/>
             <wp:effectExtent l="19050" t="19050" r="11430" b="20320"/>
-            <wp:docPr id="1875711508" name="Imagem 54"/>
+            <wp:docPr id="1568865881" name="Imagem 54"/>
             <wp:cNvGraphicFramePr/>
             <a:graphic xmlns:a="http://schemas.openxmlformats.org/drawingml/2006/main">
               <a:graphicData uri="http://schemas.openxmlformats.org/drawingml/2006/picture">
                 <pic:pic xmlns:pic="http://schemas.openxmlformats.org/drawingml/2006/picture">
                   <pic:nvPicPr>
-                    <pic:cNvPr id="1875711508" name=""/>
+                    <pic:cNvPr id="1568865881" name=""/>
                     <pic:cNvPicPr/>
                   </pic:nvPicPr>
                   <pic:blipFill>
@@ -20349,7 +20375,7 @@
           <w:color w:val="6A6A70"/>
           <w:sz w:val="19"/>
         </w:rPr>
-        <w:t>Bloco Metas dos indicadores estrategicos, com os 3 campos preenchidos.</w:t>
+        <w:t>Bloco Metas dos indicadores estrategicos, com os campos preenchidos.</w:t>
       </w:r>
     </w:p>
     <w:p>
@@ -20363,7 +20389,7 @@
           <w:sz w:val="27"/>
         </w:rPr>
       </w:pPr>
-      <w:bookmarkStart w:id="45" w:name="_Toc240032122"/>
+      <w:bookmarkStart w:id="45" w:name="_Toc240033489"/>
       <w:r>
         <w:rPr>
           <w:rFonts w:ascii="Montserrat" w:hAnsi="Montserrat"/>
@@ -20467,6 +20493,39 @@
     </w:p>
     <w:p>
       <w:pPr>
+        <w:pStyle w:val="PargrafodaLista"/>
+        <w:numPr>
+          <w:ilvl w:val="0"/>
+          <w:numId w:val="31"/>
+        </w:numPr>
+        <w:spacing w:after="80" w:line="260" w:lineRule="auto"/>
+        <w:ind w:left="700"/>
+        <w:rPr>
+          <w:rFonts w:ascii="Montserrat" w:hAnsi="Montserrat"/>
+          <w:color w:val="1A1A1A"/>
+          <w:sz w:val="22"/>
+        </w:rPr>
+      </w:pPr>
+      <w:r>
+        <w:rPr>
+          <w:rFonts w:ascii="Montserrat" w:hAnsi="Montserrat"/>
+          <w:color w:val="1A1A1A"/>
+          <w:sz w:val="22"/>
+        </w:rPr>
+        <w:t xml:space="preserve">Projetos sem risco alto/critico: % dos projetos com TAP registrado (com Projeto vinculado) que nao tem nenhum risco em aberto (Status diferente de Encerrado) com severidade Alto ou Critico - a mesma matriz </w:t>
+      </w:r>
+      <w:r>
+        <w:rPr>
+          <w:rFonts w:ascii="Montserrat" w:hAnsi="Montserrat"/>
+          <w:color w:val="1A1A1A"/>
+          <w:sz w:val="22"/>
+        </w:rPr>
+        <w:lastRenderedPageBreak/>
+        <w:t>de severidade da Matriz de risco do TAP (Passo 3, secao 9), agregada em nivel de portfolio.</w:t>
+      </w:r>
+    </w:p>
+    <w:p>
+      <w:pPr>
         <w:spacing w:before="120" w:after="40"/>
         <w:jc w:val="center"/>
       </w:pPr>
@@ -20474,18 +20533,17 @@
         <w:rPr>
           <w:noProof/>
         </w:rPr>
-        <w:lastRenderedPageBreak/>
         <w:drawing>
-          <wp:inline distT="0" distB="0" distL="0" distR="0" wp14:anchorId="57DB830C" wp14:editId="18B9502C">
+          <wp:inline distT="0" distB="0" distL="0" distR="0" wp14:anchorId="42129563" wp14:editId="6F4699CF">
             <wp:extent cx="5303520" cy="1422793"/>
             <wp:effectExtent l="19050" t="19050" r="11430" b="25400"/>
-            <wp:docPr id="570836262" name="Imagem 55"/>
+            <wp:docPr id="1753255353" name="Imagem 55"/>
             <wp:cNvGraphicFramePr/>
             <a:graphic xmlns:a="http://schemas.openxmlformats.org/drawingml/2006/main">
               <a:graphicData uri="http://schemas.openxmlformats.org/drawingml/2006/picture">
                 <pic:pic xmlns:pic="http://schemas.openxmlformats.org/drawingml/2006/picture">
                   <pic:nvPicPr>
-                    <pic:cNvPr id="570836262" name=""/>
+                    <pic:cNvPr id="1753255353" name=""/>
                     <pic:cNvPicPr/>
                   </pic:nvPicPr>
                   <pic:blipFill>
@@ -20539,7 +20597,7 @@
           <w:color w:val="6A6A70"/>
           <w:sz w:val="19"/>
         </w:rPr>
-        <w:t>Os tres indicadores estrategicos do Relatorio de Resultados, com meta, barra de progresso, selo de status e tendencia.</w:t>
+        <w:t>Os quatro indicadores estrategicos do Relatorio de Resultados, com meta, barra de progresso, selo de status e tendencia.</w:t>
       </w:r>
     </w:p>
     <w:p>
@@ -20581,7 +20639,7 @@
           <w:color w:val="6A6A70"/>
           <w:sz w:val="21"/>
         </w:rPr>
-        <w:t>Tendencia: Marcos no prazo e Projetos dentro do orcamento mostram a evolucao dos ultimos salvamentos do Relatorio de Situacao (ex.: 81% -&gt; 85% -&gt; 87%), recalculada a partir do historico de versoes que esse relatorio ja mantinha (secao 4.1) - nao e um fechamento de calendario mes a mes, e sim uma tendencia de ultimos salvamentos.</w:t>
+        <w:t>Tendencia: Marcos no prazo, Projetos dentro do orcamento e Projetos sem risco alto/critico mostram a evolucao dos ultimos salvamentos do Relatorio de Situacao (ex.: 81% -&gt; 85% -&gt; 87%), recalculada a partir do historico de versoes que esse relatorio ja mantinha (secao 4.1) - nao e um fechamento de calendario mes a mes, e sim uma tendencia de ultimos salvamentos. A tendencia de risco so existe a partir do primeiro salvamento feito depois que este indicador foi lancado - salvamentos anteriores nao tem esse numero registrado.</w:t>
       </w:r>
     </w:p>
     <w:p>
@@ -20638,17 +20696,18 @@
         <w:rPr>
           <w:noProof/>
         </w:rPr>
+        <w:lastRenderedPageBreak/>
         <w:drawing>
-          <wp:inline distT="0" distB="0" distL="0" distR="0" wp14:anchorId="556DB252" wp14:editId="213057E0">
+          <wp:inline distT="0" distB="0" distL="0" distR="0" wp14:anchorId="264F30BF" wp14:editId="1F2AD4AE">
             <wp:extent cx="5303520" cy="1841050"/>
             <wp:effectExtent l="19050" t="19050" r="11430" b="26035"/>
-            <wp:docPr id="1399172242" name="Imagem 56"/>
+            <wp:docPr id="1454199460" name="Imagem 56"/>
             <wp:cNvGraphicFramePr/>
             <a:graphic xmlns:a="http://schemas.openxmlformats.org/drawingml/2006/main">
               <a:graphicData uri="http://schemas.openxmlformats.org/drawingml/2006/picture">
                 <pic:pic xmlns:pic="http://schemas.openxmlformats.org/drawingml/2006/picture">
                   <pic:nvPicPr>
-                    <pic:cNvPr id="1399172242" name=""/>
+                    <pic:cNvPr id="1454199460" name=""/>
                     <pic:cNvPicPr/>
                   </pic:nvPicPr>
                   <pic:blipFill>
@@ -20723,7 +20782,6 @@
           <w:color w:val="6A6A70"/>
           <w:sz w:val="21"/>
         </w:rPr>
-        <w:lastRenderedPageBreak/>
         <w:t>O rotulo Atualizado em no topo da pagina mostra quando os dados foram lidos - esta pagina e uma foto em tempo real, assim como o Painel Executivo, nao um fechamento formal de mes.</w:t>
       </w:r>
     </w:p>
@@ -20803,16 +20861,16 @@
           <w:noProof/>
         </w:rPr>
         <w:drawing>
-          <wp:inline distT="0" distB="0" distL="0" distR="0" wp14:anchorId="46F84263" wp14:editId="753734D3">
+          <wp:inline distT="0" distB="0" distL="0" distR="0" wp14:anchorId="03C321E1" wp14:editId="1D34BD0F">
             <wp:extent cx="5303520" cy="303041"/>
             <wp:effectExtent l="19050" t="19050" r="11430" b="20955"/>
-            <wp:docPr id="1264678822" name="Imagem 57"/>
+            <wp:docPr id="1203487515" name="Imagem 57"/>
             <wp:cNvGraphicFramePr/>
             <a:graphic xmlns:a="http://schemas.openxmlformats.org/drawingml/2006/main">
               <a:graphicData uri="http://schemas.openxmlformats.org/drawingml/2006/picture">
                 <pic:pic xmlns:pic="http://schemas.openxmlformats.org/drawingml/2006/picture">
                   <pic:nvPicPr>
-                    <pic:cNvPr id="1264678822" name=""/>
+                    <pic:cNvPr id="1203487515" name=""/>
                     <pic:cNvPicPr/>
                   </pic:nvPicPr>
                   <pic:blipFill>
@@ -20878,17 +20936,18 @@
         <w:rPr>
           <w:noProof/>
         </w:rPr>
+        <w:lastRenderedPageBreak/>
         <w:drawing>
-          <wp:inline distT="0" distB="0" distL="0" distR="0" wp14:anchorId="73777F21" wp14:editId="7F7BC185">
+          <wp:inline distT="0" distB="0" distL="0" distR="0" wp14:anchorId="2710DE73" wp14:editId="2289A989">
             <wp:extent cx="5303520" cy="2983005"/>
             <wp:effectExtent l="19050" t="19050" r="11430" b="27305"/>
-            <wp:docPr id="205717149" name="Imagem 58"/>
+            <wp:docPr id="2064076357" name="Imagem 58"/>
             <wp:cNvGraphicFramePr/>
             <a:graphic xmlns:a="http://schemas.openxmlformats.org/drawingml/2006/main">
               <a:graphicData uri="http://schemas.openxmlformats.org/drawingml/2006/picture">
                 <pic:pic xmlns:pic="http://schemas.openxmlformats.org/drawingml/2006/picture">
                   <pic:nvPicPr>
-                    <pic:cNvPr id="205717149" name=""/>
+                    <pic:cNvPr id="2064076357" name=""/>
                     <pic:cNvPicPr/>
                   </pic:nvPicPr>
                   <pic:blipFill>
@@ -20960,7 +21019,7 @@
           <w:sz w:val="34"/>
         </w:rPr>
       </w:pPr>
-      <w:bookmarkStart w:id="46" w:name="_Toc240032123"/>
+      <w:bookmarkStart w:id="46" w:name="_Toc240033490"/>
       <w:r>
         <w:rPr>
           <w:rFonts w:ascii="Montserrat" w:hAnsi="Montserrat"/>
@@ -21204,7 +21263,7 @@
           <w:sz w:val="34"/>
         </w:rPr>
       </w:pPr>
-      <w:bookmarkStart w:id="47" w:name="_Toc240032124"/>
+      <w:bookmarkStart w:id="47" w:name="_Toc240033491"/>
       <w:r>
         <w:rPr>
           <w:rFonts w:ascii="Montserrat" w:hAnsi="Montserrat"/>
@@ -22992,7 +23051,7 @@
 <file path=word/numbering.xml><?xml version="1.0" encoding="utf-8"?>
 <w:numbering xmlns:wpc="http://schemas.microsoft.com/office/word/2010/wordprocessingCanvas" xmlns:cx="http://schemas.microsoft.com/office/drawing/2014/chartex" xmlns:cx1="http://schemas.microsoft.com/office/drawing/2015/9/8/chartex" xmlns:cx2="http://schemas.microsoft.com/office/drawing/2015/10/21/chartex" xmlns:cx3="http://schemas.microsoft.com/office/drawing/2016/5/9/chartex" xmlns:cx4="http://schemas.microsoft.com/office/drawing/2016/5/10/chartex" xmlns:cx5="http://schemas.microsoft.com/office/drawing/2016/5/11/chartex" xmlns:cx6="http://schemas.microsoft.com/office/drawing/2016/5/12/chartex" xmlns:cx7="http://schemas.microsoft.com/office/drawing/2016/5/13/chartex" xmlns:cx8="http://schemas.microsoft.com/office/drawing/2016/5/14/chartex" xmlns:mc="http://schemas.openxmlformats.org/markup-compatibility/2006" xmlns:aink="http://schemas.microsoft.com/office/drawing/2016/ink" xmlns:am3d="http://schemas.microsoft.com/office/drawing/2017/model3d" xmlns:o="urn:schemas-microsoft-com:office:office" xmlns:oel="http://schemas.microsoft.com/office/2019/extlst" xmlns:r="http://schemas.openxmlformats.org/officeDocument/2006/relationships" xmlns:m="http://schemas.openxmlformats.org/officeDocument/2006/math" xmlns:v="urn:schemas-microsoft-com:vml" xmlns:wp14="http://schemas.microsoft.com/office/word/2010/wordprocessingDrawing" xmlns:wp="http://schemas.openxmlformats.org/drawingml/2006/wordprocessingDrawing" xmlns:w10="urn:schemas-microsoft-com:office:word" xmlns:w="http://schemas.openxmlformats.org/wordprocessingml/2006/main" xmlns:w14="http://schemas.microsoft.com/office/word/2010/wordml" xmlns:w15="http://schemas.microsoft.com/office/word/2012/wordml" xmlns:w16cex="http://schemas.microsoft.com/office/word/2018/wordml/cex" xmlns:w16cid="http://schemas.microsoft.com/office/word/2016/wordml/cid" xmlns:w16="http://schemas.microsoft.com/office/word/2018/wordml" xmlns:w16du="http://schemas.microsoft.com/office/word/2023/wordml/word16du" xmlns:w16sdtdh="http://schemas.microsoft.com/office/word/2020/wordml/sdtdatahash" xmlns:w16sdtfl="http://schemas.microsoft.com/office/word/2024/wordml/sdtformatlock" xmlns:w16se="http://schemas.microsoft.com/office/word/2015/wordml/symex" xmlns:wpg="http://schemas.microsoft.com/office/word/2010/wordprocessingGroup" xmlns:wpi="http://schemas.microsoft.com/office/word/2010/wordprocessingInk" xmlns:wne="http://schemas.microsoft.com/office/word/2006/wordml" xmlns:wps="http://schemas.microsoft.com/office/word/2010/wordprocessingShape" mc:Ignorable="w14 w15 w16se w16cid w16 w16cex w16sdtdh w16sdtfl w16du wp14">
   <w:abstractNum w:abstractNumId="0" w15:restartNumberingAfterBreak="0">
-    <w:nsid w:val="0C746E01"/>
+    <w:nsid w:val="112D10A7"/>
     <w:multiLevelType w:val="singleLevel"/>
     <w:tmpl w:val="04160001"/>
     <w:lvl w:ilvl="0">
@@ -23009,7 +23068,7 @@
     </w:lvl>
   </w:abstractNum>
   <w:abstractNum w:abstractNumId="1" w15:restartNumberingAfterBreak="0">
-    <w:nsid w:val="0EB744D9"/>
+    <w:nsid w:val="12964705"/>
     <w:multiLevelType w:val="singleLevel"/>
     <w:tmpl w:val="04160001"/>
     <w:lvl w:ilvl="0">
@@ -23026,7 +23085,7 @@
     </w:lvl>
   </w:abstractNum>
   <w:abstractNum w:abstractNumId="2" w15:restartNumberingAfterBreak="0">
-    <w:nsid w:val="132D632F"/>
+    <w:nsid w:val="13BB12CE"/>
     <w:multiLevelType w:val="singleLevel"/>
     <w:tmpl w:val="04160001"/>
     <w:lvl w:ilvl="0">
@@ -23043,7 +23102,7 @@
     </w:lvl>
   </w:abstractNum>
   <w:abstractNum w:abstractNumId="3" w15:restartNumberingAfterBreak="0">
-    <w:nsid w:val="13FD729E"/>
+    <w:nsid w:val="15B3193B"/>
     <w:multiLevelType w:val="singleLevel"/>
     <w:tmpl w:val="04160001"/>
     <w:lvl w:ilvl="0">
@@ -23060,7 +23119,7 @@
     </w:lvl>
   </w:abstractNum>
   <w:abstractNum w:abstractNumId="4" w15:restartNumberingAfterBreak="0">
-    <w:nsid w:val="14205440"/>
+    <w:nsid w:val="175375D6"/>
     <w:multiLevelType w:val="singleLevel"/>
     <w:tmpl w:val="04160001"/>
     <w:lvl w:ilvl="0">
@@ -23077,7 +23136,7 @@
     </w:lvl>
   </w:abstractNum>
   <w:abstractNum w:abstractNumId="5" w15:restartNumberingAfterBreak="0">
-    <w:nsid w:val="172631E6"/>
+    <w:nsid w:val="1BFA7C84"/>
     <w:multiLevelType w:val="singleLevel"/>
     <w:tmpl w:val="04160001"/>
     <w:lvl w:ilvl="0">
@@ -23094,7 +23153,7 @@
     </w:lvl>
   </w:abstractNum>
   <w:abstractNum w:abstractNumId="6" w15:restartNumberingAfterBreak="0">
-    <w:nsid w:val="17A4331F"/>
+    <w:nsid w:val="1E9A24D0"/>
     <w:multiLevelType w:val="singleLevel"/>
     <w:tmpl w:val="04160001"/>
     <w:lvl w:ilvl="0">
@@ -23111,7 +23170,7 @@
     </w:lvl>
   </w:abstractNum>
   <w:abstractNum w:abstractNumId="7" w15:restartNumberingAfterBreak="0">
-    <w:nsid w:val="1D881FAB"/>
+    <w:nsid w:val="29C94F2E"/>
     <w:multiLevelType w:val="singleLevel"/>
     <w:tmpl w:val="04160001"/>
     <w:lvl w:ilvl="0">
@@ -23128,7 +23187,7 @@
     </w:lvl>
   </w:abstractNum>
   <w:abstractNum w:abstractNumId="8" w15:restartNumberingAfterBreak="0">
-    <w:nsid w:val="210B486C"/>
+    <w:nsid w:val="2E9076C8"/>
     <w:multiLevelType w:val="singleLevel"/>
     <w:tmpl w:val="04160001"/>
     <w:lvl w:ilvl="0">
@@ -23145,7 +23204,7 @@
     </w:lvl>
   </w:abstractNum>
   <w:abstractNum w:abstractNumId="9" w15:restartNumberingAfterBreak="0">
-    <w:nsid w:val="23756C2D"/>
+    <w:nsid w:val="2E9B26AA"/>
     <w:multiLevelType w:val="singleLevel"/>
     <w:tmpl w:val="04160001"/>
     <w:lvl w:ilvl="0">
@@ -23162,7 +23221,7 @@
     </w:lvl>
   </w:abstractNum>
   <w:abstractNum w:abstractNumId="10" w15:restartNumberingAfterBreak="0">
-    <w:nsid w:val="2BAF1D73"/>
+    <w:nsid w:val="3175105C"/>
     <w:multiLevelType w:val="singleLevel"/>
     <w:tmpl w:val="04160001"/>
     <w:lvl w:ilvl="0">
@@ -23179,7 +23238,7 @@
     </w:lvl>
   </w:abstractNum>
   <w:abstractNum w:abstractNumId="11" w15:restartNumberingAfterBreak="0">
-    <w:nsid w:val="32716703"/>
+    <w:nsid w:val="3ADF3033"/>
     <w:multiLevelType w:val="singleLevel"/>
     <w:tmpl w:val="04160001"/>
     <w:lvl w:ilvl="0">
@@ -23196,7 +23255,7 @@
     </w:lvl>
   </w:abstractNum>
   <w:abstractNum w:abstractNumId="12" w15:restartNumberingAfterBreak="0">
-    <w:nsid w:val="3380055F"/>
+    <w:nsid w:val="40554B9E"/>
     <w:multiLevelType w:val="singleLevel"/>
     <w:tmpl w:val="04160001"/>
     <w:lvl w:ilvl="0">
@@ -23213,7 +23272,7 @@
     </w:lvl>
   </w:abstractNum>
   <w:abstractNum w:abstractNumId="13" w15:restartNumberingAfterBreak="0">
-    <w:nsid w:val="3498711F"/>
+    <w:nsid w:val="413678E0"/>
     <w:multiLevelType w:val="singleLevel"/>
     <w:tmpl w:val="04160001"/>
     <w:lvl w:ilvl="0">
@@ -23230,7 +23289,7 @@
     </w:lvl>
   </w:abstractNum>
   <w:abstractNum w:abstractNumId="14" w15:restartNumberingAfterBreak="0">
-    <w:nsid w:val="375A33A1"/>
+    <w:nsid w:val="49725564"/>
     <w:multiLevelType w:val="singleLevel"/>
     <w:tmpl w:val="04160001"/>
     <w:lvl w:ilvl="0">
@@ -23247,7 +23306,7 @@
     </w:lvl>
   </w:abstractNum>
   <w:abstractNum w:abstractNumId="15" w15:restartNumberingAfterBreak="0">
-    <w:nsid w:val="3DC15471"/>
+    <w:nsid w:val="4AEE5758"/>
     <w:multiLevelType w:val="singleLevel"/>
     <w:tmpl w:val="04160001"/>
     <w:lvl w:ilvl="0">
@@ -23264,7 +23323,7 @@
     </w:lvl>
   </w:abstractNum>
   <w:abstractNum w:abstractNumId="16" w15:restartNumberingAfterBreak="0">
-    <w:nsid w:val="3E1E4F4A"/>
+    <w:nsid w:val="4B2E767A"/>
     <w:multiLevelType w:val="singleLevel"/>
     <w:tmpl w:val="04160001"/>
     <w:lvl w:ilvl="0">
@@ -23281,7 +23340,7 @@
     </w:lvl>
   </w:abstractNum>
   <w:abstractNum w:abstractNumId="17" w15:restartNumberingAfterBreak="0">
-    <w:nsid w:val="41A92034"/>
+    <w:nsid w:val="51B25FED"/>
     <w:multiLevelType w:val="singleLevel"/>
     <w:tmpl w:val="04160001"/>
     <w:lvl w:ilvl="0">
@@ -23298,7 +23357,7 @@
     </w:lvl>
   </w:abstractNum>
   <w:abstractNum w:abstractNumId="18" w15:restartNumberingAfterBreak="0">
-    <w:nsid w:val="43364220"/>
+    <w:nsid w:val="56140DF4"/>
     <w:multiLevelType w:val="singleLevel"/>
     <w:tmpl w:val="04160001"/>
     <w:lvl w:ilvl="0">
@@ -23315,7 +23374,7 @@
     </w:lvl>
   </w:abstractNum>
   <w:abstractNum w:abstractNumId="19" w15:restartNumberingAfterBreak="0">
-    <w:nsid w:val="4C017D11"/>
+    <w:nsid w:val="581E4DD6"/>
     <w:multiLevelType w:val="singleLevel"/>
     <w:tmpl w:val="04160001"/>
     <w:lvl w:ilvl="0">
@@ -23332,7 +23391,7 @@
     </w:lvl>
   </w:abstractNum>
   <w:abstractNum w:abstractNumId="20" w15:restartNumberingAfterBreak="0">
-    <w:nsid w:val="5224042F"/>
+    <w:nsid w:val="5A0656B0"/>
     <w:multiLevelType w:val="singleLevel"/>
     <w:tmpl w:val="04160001"/>
     <w:lvl w:ilvl="0">
@@ -23349,7 +23408,7 @@
     </w:lvl>
   </w:abstractNum>
   <w:abstractNum w:abstractNumId="21" w15:restartNumberingAfterBreak="0">
-    <w:nsid w:val="579F35C5"/>
+    <w:nsid w:val="5C28257F"/>
     <w:multiLevelType w:val="singleLevel"/>
     <w:tmpl w:val="04160001"/>
     <w:lvl w:ilvl="0">
@@ -23366,7 +23425,7 @@
     </w:lvl>
   </w:abstractNum>
   <w:abstractNum w:abstractNumId="22" w15:restartNumberingAfterBreak="0">
-    <w:nsid w:val="57AB0B7E"/>
+    <w:nsid w:val="686B2A4A"/>
     <w:multiLevelType w:val="singleLevel"/>
     <w:tmpl w:val="04160001"/>
     <w:lvl w:ilvl="0">
@@ -23383,7 +23442,7 @@
     </w:lvl>
   </w:abstractNum>
   <w:abstractNum w:abstractNumId="23" w15:restartNumberingAfterBreak="0">
-    <w:nsid w:val="5A3201FB"/>
+    <w:nsid w:val="69E37111"/>
     <w:multiLevelType w:val="singleLevel"/>
     <w:tmpl w:val="04160001"/>
     <w:lvl w:ilvl="0">
@@ -23400,7 +23459,7 @@
     </w:lvl>
   </w:abstractNum>
   <w:abstractNum w:abstractNumId="24" w15:restartNumberingAfterBreak="0">
-    <w:nsid w:val="5F0622C5"/>
+    <w:nsid w:val="6C037B9F"/>
     <w:multiLevelType w:val="singleLevel"/>
     <w:tmpl w:val="04160001"/>
     <w:lvl w:ilvl="0">
@@ -23417,7 +23476,7 @@
     </w:lvl>
   </w:abstractNum>
   <w:abstractNum w:abstractNumId="25" w15:restartNumberingAfterBreak="0">
-    <w:nsid w:val="608B6D07"/>
+    <w:nsid w:val="6E7A082C"/>
     <w:multiLevelType w:val="singleLevel"/>
     <w:tmpl w:val="04160001"/>
     <w:lvl w:ilvl="0">
@@ -23434,7 +23493,7 @@
     </w:lvl>
   </w:abstractNum>
   <w:abstractNum w:abstractNumId="26" w15:restartNumberingAfterBreak="0">
-    <w:nsid w:val="63724F8F"/>
+    <w:nsid w:val="6EE81308"/>
     <w:multiLevelType w:val="singleLevel"/>
     <w:tmpl w:val="04160001"/>
     <w:lvl w:ilvl="0">
@@ -23451,7 +23510,7 @@
     </w:lvl>
   </w:abstractNum>
   <w:abstractNum w:abstractNumId="27" w15:restartNumberingAfterBreak="0">
-    <w:nsid w:val="667D090C"/>
+    <w:nsid w:val="716A3DD9"/>
     <w:multiLevelType w:val="singleLevel"/>
     <w:tmpl w:val="04160001"/>
     <w:lvl w:ilvl="0">
@@ -23468,7 +23527,7 @@
     </w:lvl>
   </w:abstractNum>
   <w:abstractNum w:abstractNumId="28" w15:restartNumberingAfterBreak="0">
-    <w:nsid w:val="6B003528"/>
+    <w:nsid w:val="719A7177"/>
     <w:multiLevelType w:val="singleLevel"/>
     <w:tmpl w:val="04160001"/>
     <w:lvl w:ilvl="0">
@@ -23485,7 +23544,7 @@
     </w:lvl>
   </w:abstractNum>
   <w:abstractNum w:abstractNumId="29" w15:restartNumberingAfterBreak="0">
-    <w:nsid w:val="6B2F2903"/>
+    <w:nsid w:val="740B2634"/>
     <w:multiLevelType w:val="singleLevel"/>
     <w:tmpl w:val="04160001"/>
     <w:lvl w:ilvl="0">
@@ -23502,7 +23561,7 @@
     </w:lvl>
   </w:abstractNum>
   <w:abstractNum w:abstractNumId="30" w15:restartNumberingAfterBreak="0">
-    <w:nsid w:val="77D85E00"/>
+    <w:nsid w:val="75743FBB"/>
     <w:multiLevelType w:val="singleLevel"/>
     <w:tmpl w:val="04160001"/>
     <w:lvl w:ilvl="0">
@@ -23519,7 +23578,7 @@
     </w:lvl>
   </w:abstractNum>
   <w:abstractNum w:abstractNumId="31" w15:restartNumberingAfterBreak="0">
-    <w:nsid w:val="7EC468FD"/>
+    <w:nsid w:val="790C05D0"/>
     <w:multiLevelType w:val="singleLevel"/>
     <w:tmpl w:val="04160001"/>
     <w:lvl w:ilvl="0">
@@ -23535,101 +23594,101 @@
       </w:rPr>
     </w:lvl>
   </w:abstractNum>
-  <w:num w:numId="1" w16cid:durableId="365835363">
+  <w:num w:numId="1" w16cid:durableId="1706636385">
+    <w:abstractNumId w:val="10"/>
+  </w:num>
+  <w:num w:numId="2" w16cid:durableId="400444694">
+    <w:abstractNumId w:val="0"/>
+  </w:num>
+  <w:num w:numId="3" w16cid:durableId="1174414715">
+    <w:abstractNumId w:val="4"/>
+  </w:num>
+  <w:num w:numId="4" w16cid:durableId="1275135868">
+    <w:abstractNumId w:val="17"/>
+  </w:num>
+  <w:num w:numId="5" w16cid:durableId="1258514375">
     <w:abstractNumId w:val="31"/>
   </w:num>
-  <w:num w:numId="2" w16cid:durableId="561018280">
+  <w:num w:numId="6" w16cid:durableId="374475924">
+    <w:abstractNumId w:val="7"/>
+  </w:num>
+  <w:num w:numId="7" w16cid:durableId="1623724880">
+    <w:abstractNumId w:val="2"/>
+  </w:num>
+  <w:num w:numId="8" w16cid:durableId="1961565641">
+    <w:abstractNumId w:val="19"/>
+  </w:num>
+  <w:num w:numId="9" w16cid:durableId="233513987">
+    <w:abstractNumId w:val="13"/>
+  </w:num>
+  <w:num w:numId="10" w16cid:durableId="1725373432">
+    <w:abstractNumId w:val="9"/>
+  </w:num>
+  <w:num w:numId="11" w16cid:durableId="590822576">
+    <w:abstractNumId w:val="21"/>
+  </w:num>
+  <w:num w:numId="12" w16cid:durableId="981498390">
+    <w:abstractNumId w:val="22"/>
+  </w:num>
+  <w:num w:numId="13" w16cid:durableId="918174282">
+    <w:abstractNumId w:val="25"/>
+  </w:num>
+  <w:num w:numId="14" w16cid:durableId="921371174">
+    <w:abstractNumId w:val="5"/>
+  </w:num>
+  <w:num w:numId="15" w16cid:durableId="786891251">
+    <w:abstractNumId w:val="23"/>
+  </w:num>
+  <w:num w:numId="16" w16cid:durableId="974717082">
+    <w:abstractNumId w:val="14"/>
+  </w:num>
+  <w:num w:numId="17" w16cid:durableId="1483885980">
+    <w:abstractNumId w:val="3"/>
+  </w:num>
+  <w:num w:numId="18" w16cid:durableId="140197062">
+    <w:abstractNumId w:val="12"/>
+  </w:num>
+  <w:num w:numId="19" w16cid:durableId="905870593">
+    <w:abstractNumId w:val="18"/>
+  </w:num>
+  <w:num w:numId="20" w16cid:durableId="256602411">
+    <w:abstractNumId w:val="15"/>
+  </w:num>
+  <w:num w:numId="21" w16cid:durableId="530411509">
+    <w:abstractNumId w:val="16"/>
+  </w:num>
+  <w:num w:numId="22" w16cid:durableId="644509896">
+    <w:abstractNumId w:val="24"/>
+  </w:num>
+  <w:num w:numId="23" w16cid:durableId="1378314840">
+    <w:abstractNumId w:val="28"/>
+  </w:num>
+  <w:num w:numId="24" w16cid:durableId="1154488683">
+    <w:abstractNumId w:val="20"/>
+  </w:num>
+  <w:num w:numId="25" w16cid:durableId="26685169">
     <w:abstractNumId w:val="1"/>
   </w:num>
-  <w:num w:numId="3" w16cid:durableId="1333486308">
+  <w:num w:numId="26" w16cid:durableId="316882598">
     <w:abstractNumId w:val="6"/>
   </w:num>
-  <w:num w:numId="4" w16cid:durableId="319042450">
-    <w:abstractNumId w:val="2"/>
+  <w:num w:numId="27" w16cid:durableId="184835050">
+    <w:abstractNumId w:val="26"/>
   </w:num>
-  <w:num w:numId="5" w16cid:durableId="509417631">
+  <w:num w:numId="28" w16cid:durableId="2144689844">
+    <w:abstractNumId w:val="30"/>
+  </w:num>
+  <w:num w:numId="29" w16cid:durableId="1740400529">
+    <w:abstractNumId w:val="27"/>
+  </w:num>
+  <w:num w:numId="30" w16cid:durableId="1861895311">
+    <w:abstractNumId w:val="29"/>
+  </w:num>
+  <w:num w:numId="31" w16cid:durableId="1453358349">
     <w:abstractNumId w:val="11"/>
   </w:num>
-  <w:num w:numId="6" w16cid:durableId="640161391">
-    <w:abstractNumId w:val="24"/>
-  </w:num>
-  <w:num w:numId="7" w16cid:durableId="428041229">
-    <w:abstractNumId w:val="7"/>
-  </w:num>
-  <w:num w:numId="8" w16cid:durableId="1063211456">
-    <w:abstractNumId w:val="28"/>
-  </w:num>
-  <w:num w:numId="9" w16cid:durableId="27072300">
+  <w:num w:numId="32" w16cid:durableId="1175145504">
     <w:abstractNumId w:val="8"/>
-  </w:num>
-  <w:num w:numId="10" w16cid:durableId="1919629087">
-    <w:abstractNumId w:val="22"/>
-  </w:num>
-  <w:num w:numId="11" w16cid:durableId="2067877633">
-    <w:abstractNumId w:val="4"/>
-  </w:num>
-  <w:num w:numId="12" w16cid:durableId="488979124">
-    <w:abstractNumId w:val="23"/>
-  </w:num>
-  <w:num w:numId="13" w16cid:durableId="27419922">
-    <w:abstractNumId w:val="15"/>
-  </w:num>
-  <w:num w:numId="14" w16cid:durableId="1833181813">
-    <w:abstractNumId w:val="10"/>
-  </w:num>
-  <w:num w:numId="15" w16cid:durableId="821852151">
-    <w:abstractNumId w:val="0"/>
-  </w:num>
-  <w:num w:numId="16" w16cid:durableId="423962883">
-    <w:abstractNumId w:val="3"/>
-  </w:num>
-  <w:num w:numId="17" w16cid:durableId="1131169808">
-    <w:abstractNumId w:val="18"/>
-  </w:num>
-  <w:num w:numId="18" w16cid:durableId="633609119">
-    <w:abstractNumId w:val="19"/>
-  </w:num>
-  <w:num w:numId="19" w16cid:durableId="1863204249">
-    <w:abstractNumId w:val="26"/>
-  </w:num>
-  <w:num w:numId="20" w16cid:durableId="1230190407">
-    <w:abstractNumId w:val="20"/>
-  </w:num>
-  <w:num w:numId="21" w16cid:durableId="1846479302">
-    <w:abstractNumId w:val="13"/>
-  </w:num>
-  <w:num w:numId="22" w16cid:durableId="126436223">
-    <w:abstractNumId w:val="5"/>
-  </w:num>
-  <w:num w:numId="23" w16cid:durableId="778062293">
-    <w:abstractNumId w:val="17"/>
-  </w:num>
-  <w:num w:numId="24" w16cid:durableId="343747298">
-    <w:abstractNumId w:val="27"/>
-  </w:num>
-  <w:num w:numId="25" w16cid:durableId="313489504">
-    <w:abstractNumId w:val="21"/>
-  </w:num>
-  <w:num w:numId="26" w16cid:durableId="1358236094">
-    <w:abstractNumId w:val="29"/>
-  </w:num>
-  <w:num w:numId="27" w16cid:durableId="618801622">
-    <w:abstractNumId w:val="9"/>
-  </w:num>
-  <w:num w:numId="28" w16cid:durableId="1080252309">
-    <w:abstractNumId w:val="12"/>
-  </w:num>
-  <w:num w:numId="29" w16cid:durableId="1112045018">
-    <w:abstractNumId w:val="30"/>
-  </w:num>
-  <w:num w:numId="30" w16cid:durableId="1991401769">
-    <w:abstractNumId w:val="16"/>
-  </w:num>
-  <w:num w:numId="31" w16cid:durableId="951590045">
-    <w:abstractNumId w:val="25"/>
-  </w:num>
-  <w:num w:numId="32" w16cid:durableId="1547177899">
-    <w:abstractNumId w:val="14"/>
   </w:num>
 </w:numbering>
 </file>
@@ -24042,7 +24101,7 @@
     <w:link w:val="Ttulo1Char"/>
     <w:uiPriority w:val="9"/>
     <w:qFormat/>
-    <w:rsid w:val="00C53298"/>
+    <w:rsid w:val="00227946"/>
     <w:pPr>
       <w:keepNext/>
       <w:keepLines/>
@@ -24064,7 +24123,7 @@
     <w:uiPriority w:val="9"/>
     <w:unhideWhenUsed/>
     <w:qFormat/>
-    <w:rsid w:val="00C53298"/>
+    <w:rsid w:val="00227946"/>
     <w:pPr>
       <w:keepNext/>
       <w:keepLines/>
@@ -24087,7 +24146,7 @@
     <w:semiHidden/>
     <w:unhideWhenUsed/>
     <w:qFormat/>
-    <w:rsid w:val="00C53298"/>
+    <w:rsid w:val="00227946"/>
     <w:pPr>
       <w:keepNext/>
       <w:keepLines/>
@@ -24110,7 +24169,7 @@
     <w:semiHidden/>
     <w:unhideWhenUsed/>
     <w:qFormat/>
-    <w:rsid w:val="00C53298"/>
+    <w:rsid w:val="00227946"/>
     <w:pPr>
       <w:keepNext/>
       <w:keepLines/>
@@ -24133,7 +24192,7 @@
     <w:semiHidden/>
     <w:unhideWhenUsed/>
     <w:qFormat/>
-    <w:rsid w:val="00C53298"/>
+    <w:rsid w:val="00227946"/>
     <w:pPr>
       <w:keepNext/>
       <w:keepLines/>
@@ -24154,7 +24213,7 @@
     <w:semiHidden/>
     <w:unhideWhenUsed/>
     <w:qFormat/>
-    <w:rsid w:val="00C53298"/>
+    <w:rsid w:val="00227946"/>
     <w:pPr>
       <w:keepNext/>
       <w:keepLines/>
@@ -24177,7 +24236,7 @@
     <w:semiHidden/>
     <w:unhideWhenUsed/>
     <w:qFormat/>
-    <w:rsid w:val="00C53298"/>
+    <w:rsid w:val="00227946"/>
     <w:pPr>
       <w:keepNext/>
       <w:keepLines/>
@@ -24198,7 +24257,7 @@
     <w:semiHidden/>
     <w:unhideWhenUsed/>
     <w:qFormat/>
-    <w:rsid w:val="00C53298"/>
+    <w:rsid w:val="00227946"/>
     <w:pPr>
       <w:keepNext/>
       <w:keepLines/>
@@ -24221,7 +24280,7 @@
     <w:semiHidden/>
     <w:unhideWhenUsed/>
     <w:qFormat/>
-    <w:rsid w:val="00C53298"/>
+    <w:rsid w:val="00227946"/>
     <w:pPr>
       <w:keepNext/>
       <w:keepLines/>
@@ -24265,7 +24324,7 @@
     <w:basedOn w:val="Fontepargpadro"/>
     <w:link w:val="Ttulo1"/>
     <w:uiPriority w:val="9"/>
-    <w:rsid w:val="00C53298"/>
+    <w:rsid w:val="00227946"/>
     <w:rPr>
       <w:rFonts w:asciiTheme="majorHAnsi" w:eastAsiaTheme="majorEastAsia" w:hAnsiTheme="majorHAnsi" w:cstheme="majorBidi"/>
       <w:color w:val="0F4761" w:themeColor="accent1" w:themeShade="BF"/>
@@ -24278,7 +24337,7 @@
     <w:basedOn w:val="Fontepargpadro"/>
     <w:link w:val="Ttulo2"/>
     <w:uiPriority w:val="9"/>
-    <w:rsid w:val="00C53298"/>
+    <w:rsid w:val="00227946"/>
     <w:rPr>
       <w:rFonts w:asciiTheme="majorHAnsi" w:eastAsiaTheme="majorEastAsia" w:hAnsiTheme="majorHAnsi" w:cstheme="majorBidi"/>
       <w:color w:val="0F4761" w:themeColor="accent1" w:themeShade="BF"/>
@@ -24292,7 +24351,7 @@
     <w:link w:val="Ttulo3"/>
     <w:uiPriority w:val="9"/>
     <w:semiHidden/>
-    <w:rsid w:val="00C53298"/>
+    <w:rsid w:val="00227946"/>
     <w:rPr>
       <w:rFonts w:eastAsiaTheme="majorEastAsia" w:cstheme="majorBidi"/>
       <w:color w:val="0F4761" w:themeColor="accent1" w:themeShade="BF"/>
@@ -24306,7 +24365,7 @@
     <w:link w:val="Ttulo4"/>
     <w:uiPriority w:val="9"/>
     <w:semiHidden/>
-    <w:rsid w:val="00C53298"/>
+    <w:rsid w:val="00227946"/>
     <w:rPr>
       <w:rFonts w:eastAsiaTheme="majorEastAsia" w:cstheme="majorBidi"/>
       <w:i/>
@@ -24320,7 +24379,7 @@
     <w:link w:val="Ttulo5"/>
     <w:uiPriority w:val="9"/>
     <w:semiHidden/>
-    <w:rsid w:val="00C53298"/>
+    <w:rsid w:val="00227946"/>
     <w:rPr>
       <w:rFonts w:eastAsiaTheme="majorEastAsia" w:cstheme="majorBidi"/>
       <w:color w:val="0F4761" w:themeColor="accent1" w:themeShade="BF"/>
@@ -24332,7 +24391,7 @@
     <w:link w:val="Ttulo6"/>
     <w:uiPriority w:val="9"/>
     <w:semiHidden/>
-    <w:rsid w:val="00C53298"/>
+    <w:rsid w:val="00227946"/>
     <w:rPr>
       <w:rFonts w:eastAsiaTheme="majorEastAsia" w:cstheme="majorBidi"/>
       <w:i/>
@@ -24346,7 +24405,7 @@
     <w:link w:val="Ttulo7"/>
     <w:uiPriority w:val="9"/>
     <w:semiHidden/>
-    <w:rsid w:val="00C53298"/>
+    <w:rsid w:val="00227946"/>
     <w:rPr>
       <w:rFonts w:eastAsiaTheme="majorEastAsia" w:cstheme="majorBidi"/>
       <w:color w:val="595959" w:themeColor="text1" w:themeTint="A6"/>
@@ -24358,7 +24417,7 @@
     <w:link w:val="Ttulo8"/>
     <w:uiPriority w:val="9"/>
     <w:semiHidden/>
-    <w:rsid w:val="00C53298"/>
+    <w:rsid w:val="00227946"/>
     <w:rPr>
       <w:rFonts w:eastAsiaTheme="majorEastAsia" w:cstheme="majorBidi"/>
       <w:i/>
@@ -24372,7 +24431,7 @@
     <w:link w:val="Ttulo9"/>
     <w:uiPriority w:val="9"/>
     <w:semiHidden/>
-    <w:rsid w:val="00C53298"/>
+    <w:rsid w:val="00227946"/>
     <w:rPr>
       <w:rFonts w:eastAsiaTheme="majorEastAsia" w:cstheme="majorBidi"/>
       <w:color w:val="272727" w:themeColor="text1" w:themeTint="D8"/>
@@ -24385,7 +24444,7 @@
     <w:link w:val="TtuloChar"/>
     <w:uiPriority w:val="10"/>
     <w:qFormat/>
-    <w:rsid w:val="00C53298"/>
+    <w:rsid w:val="00227946"/>
     <w:pPr>
       <w:spacing w:after="80" w:line="240" w:lineRule="auto"/>
       <w:contextualSpacing/>
@@ -24403,7 +24462,7 @@
     <w:basedOn w:val="Fontepargpadro"/>
     <w:link w:val="Ttulo"/>
     <w:uiPriority w:val="10"/>
-    <w:rsid w:val="00C53298"/>
+    <w:rsid w:val="00227946"/>
     <w:rPr>
       <w:rFonts w:asciiTheme="majorHAnsi" w:eastAsiaTheme="majorEastAsia" w:hAnsiTheme="majorHAnsi" w:cstheme="majorBidi"/>
       <w:spacing w:val="-10"/>
@@ -24419,7 +24478,7 @@
     <w:link w:val="SubttuloChar"/>
     <w:uiPriority w:val="11"/>
     <w:qFormat/>
-    <w:rsid w:val="00C53298"/>
+    <w:rsid w:val="00227946"/>
     <w:pPr>
       <w:numPr>
         <w:ilvl w:val="1"/>
@@ -24438,7 +24497,7 @@
     <w:basedOn w:val="Fontepargpadro"/>
     <w:link w:val="Subttulo"/>
     <w:uiPriority w:val="11"/>
-    <w:rsid w:val="00C53298"/>
+    <w:rsid w:val="00227946"/>
     <w:rPr>
       <w:rFonts w:eastAsiaTheme="majorEastAsia" w:cstheme="majorBidi"/>
       <w:color w:val="595959" w:themeColor="text1" w:themeTint="A6"/>
@@ -24454,7 +24513,7 @@
     <w:link w:val="CitaoChar"/>
     <w:uiPriority w:val="29"/>
     <w:qFormat/>
-    <w:rsid w:val="00C53298"/>
+    <w:rsid w:val="00227946"/>
     <w:pPr>
       <w:spacing w:before="160"/>
       <w:jc w:val="center"/>
@@ -24470,7 +24529,7 @@
     <w:basedOn w:val="Fontepargpadro"/>
     <w:link w:val="Citao"/>
     <w:uiPriority w:val="29"/>
-    <w:rsid w:val="00C53298"/>
+    <w:rsid w:val="00227946"/>
     <w:rPr>
       <w:i/>
       <w:iCs/>
@@ -24482,7 +24541,7 @@
     <w:basedOn w:val="Normal"/>
     <w:uiPriority w:val="34"/>
     <w:qFormat/>
-    <w:rsid w:val="00C53298"/>
+    <w:rsid w:val="00227946"/>
     <w:pPr>
       <w:ind w:left="720"/>
       <w:contextualSpacing/>
@@ -24493,7 +24552,7 @@
     <w:basedOn w:val="Fontepargpadro"/>
     <w:uiPriority w:val="21"/>
     <w:qFormat/>
-    <w:rsid w:val="00C53298"/>
+    <w:rsid w:val="00227946"/>
     <w:rPr>
       <w:i/>
       <w:iCs/>
@@ -24507,7 +24566,7 @@
     <w:link w:val="CitaoIntensaChar"/>
     <w:uiPriority w:val="30"/>
     <w:qFormat/>
-    <w:rsid w:val="00C53298"/>
+    <w:rsid w:val="00227946"/>
     <w:pPr>
       <w:pBdr>
         <w:top w:val="single" w:sz="4" w:space="10" w:color="0F4761" w:themeColor="accent1" w:themeShade="BF"/>
@@ -24528,7 +24587,7 @@
     <w:basedOn w:val="Fontepargpadro"/>
     <w:link w:val="CitaoIntensa"/>
     <w:uiPriority w:val="30"/>
-    <w:rsid w:val="00C53298"/>
+    <w:rsid w:val="00227946"/>
     <w:rPr>
       <w:i/>
       <w:iCs/>
@@ -24540,7 +24599,7 @@
     <w:basedOn w:val="Fontepargpadro"/>
     <w:uiPriority w:val="32"/>
     <w:qFormat/>
-    <w:rsid w:val="00C53298"/>
+    <w:rsid w:val="00227946"/>
     <w:rPr>
       <w:b/>
       <w:bCs/>
@@ -24555,7 +24614,7 @@
     <w:link w:val="CabealhoChar"/>
     <w:uiPriority w:val="99"/>
     <w:unhideWhenUsed/>
-    <w:rsid w:val="00C53298"/>
+    <w:rsid w:val="00227946"/>
     <w:pPr>
       <w:tabs>
         <w:tab w:val="center" w:pos="4252"/>
@@ -24569,7 +24628,7 @@
     <w:basedOn w:val="Fontepargpadro"/>
     <w:link w:val="Cabealho"/>
     <w:uiPriority w:val="99"/>
-    <w:rsid w:val="00C53298"/>
+    <w:rsid w:val="00227946"/>
   </w:style>
   <w:style w:type="paragraph" w:styleId="Rodap">
     <w:name w:val="footer"/>
@@ -24577,7 +24636,7 @@
     <w:link w:val="RodapChar"/>
     <w:uiPriority w:val="99"/>
     <w:unhideWhenUsed/>
-    <w:rsid w:val="00C53298"/>
+    <w:rsid w:val="00227946"/>
     <w:pPr>
       <w:tabs>
         <w:tab w:val="center" w:pos="4252"/>
@@ -24591,7 +24650,7 @@
     <w:basedOn w:val="Fontepargpadro"/>
     <w:link w:val="Rodap"/>
     <w:uiPriority w:val="99"/>
-    <w:rsid w:val="00C53298"/>
+    <w:rsid w:val="00227946"/>
   </w:style>
   <w:style w:type="paragraph" w:styleId="Sumrio1">
     <w:name w:val="toc 1"/>
@@ -24600,7 +24659,7 @@
     <w:autoRedefine/>
     <w:uiPriority w:val="39"/>
     <w:unhideWhenUsed/>
-    <w:rsid w:val="00C53298"/>
+    <w:rsid w:val="00227946"/>
     <w:pPr>
       <w:spacing w:after="100"/>
     </w:pPr>
@@ -24612,7 +24671,7 @@
     <w:autoRedefine/>
     <w:uiPriority w:val="39"/>
     <w:unhideWhenUsed/>
-    <w:rsid w:val="00C53298"/>
+    <w:rsid w:val="00227946"/>
     <w:pPr>
       <w:spacing w:after="100"/>
       <w:ind w:left="240"/>

</xml_diff>

<commit_message>
Sincroniza com a produção — Fase 2 de custos por categoria no Painel Executivo
Co-Authored-By: Claude Sonnet 5 <noreply@anthropic.com>
</commit_message>
<xml_diff>
--- a/Manual de Uso - Ferramenta de Gestao de Projetos.docx
+++ b/Manual de Uso - Ferramenta de Gestao de Projetos.docx
@@ -229,7 +229,7 @@
         <w:rPr>
           <w:noProof/>
         </w:rPr>
-        <w:instrText xml:space="preserve"> PAGEREF _Toc240034004 \h </w:instrText>
+        <w:instrText xml:space="preserve"> PAGEREF _Toc240035145 \h </w:instrText>
       </w:r>
       <w:r>
         <w:rPr>
@@ -290,7 +290,7 @@
         <w:rPr>
           <w:noProof/>
         </w:rPr>
-        <w:instrText xml:space="preserve"> PAGEREF _Toc240034005 \h </w:instrText>
+        <w:instrText xml:space="preserve"> PAGEREF _Toc240035146 \h </w:instrText>
       </w:r>
       <w:r>
         <w:rPr>
@@ -351,7 +351,7 @@
         <w:rPr>
           <w:noProof/>
         </w:rPr>
-        <w:instrText xml:space="preserve"> PAGEREF _Toc240034006 \h </w:instrText>
+        <w:instrText xml:space="preserve"> PAGEREF _Toc240035147 \h </w:instrText>
       </w:r>
       <w:r>
         <w:rPr>
@@ -368,7 +368,7 @@
         <w:rPr>
           <w:noProof/>
         </w:rPr>
-        <w:t>15</w:t>
+        <w:t>16</w:t>
       </w:r>
       <w:r>
         <w:rPr>
@@ -412,7 +412,7 @@
         <w:rPr>
           <w:noProof/>
         </w:rPr>
-        <w:instrText xml:space="preserve"> PAGEREF _Toc240034007 \h </w:instrText>
+        <w:instrText xml:space="preserve"> PAGEREF _Toc240035148 \h </w:instrText>
       </w:r>
       <w:r>
         <w:rPr>
@@ -473,7 +473,7 @@
         <w:rPr>
           <w:noProof/>
         </w:rPr>
-        <w:instrText xml:space="preserve"> PAGEREF _Toc240034008 \h </w:instrText>
+        <w:instrText xml:space="preserve"> PAGEREF _Toc240035149 \h </w:instrText>
       </w:r>
       <w:r>
         <w:rPr>
@@ -534,7 +534,7 @@
         <w:rPr>
           <w:noProof/>
         </w:rPr>
-        <w:instrText xml:space="preserve"> PAGEREF _Toc240034009 \h </w:instrText>
+        <w:instrText xml:space="preserve"> PAGEREF _Toc240035150 \h </w:instrText>
       </w:r>
       <w:r>
         <w:rPr>
@@ -551,7 +551,7 @@
         <w:rPr>
           <w:noProof/>
         </w:rPr>
-        <w:t>19</w:t>
+        <w:t>20</w:t>
       </w:r>
       <w:r>
         <w:rPr>
@@ -595,7 +595,7 @@
         <w:rPr>
           <w:noProof/>
         </w:rPr>
-        <w:instrText xml:space="preserve"> PAGEREF _Toc240034010 \h </w:instrText>
+        <w:instrText xml:space="preserve"> PAGEREF _Toc240035151 \h </w:instrText>
       </w:r>
       <w:r>
         <w:rPr>
@@ -612,7 +612,7 @@
         <w:rPr>
           <w:noProof/>
         </w:rPr>
-        <w:t>19</w:t>
+        <w:t>20</w:t>
       </w:r>
       <w:r>
         <w:rPr>
@@ -656,7 +656,7 @@
         <w:rPr>
           <w:noProof/>
         </w:rPr>
-        <w:instrText xml:space="preserve"> PAGEREF _Toc240034011 \h </w:instrText>
+        <w:instrText xml:space="preserve"> PAGEREF _Toc240035152 \h </w:instrText>
       </w:r>
       <w:r>
         <w:rPr>
@@ -673,7 +673,7 @@
         <w:rPr>
           <w:noProof/>
         </w:rPr>
-        <w:t>19</w:t>
+        <w:t>20</w:t>
       </w:r>
       <w:r>
         <w:rPr>
@@ -717,7 +717,7 @@
         <w:rPr>
           <w:noProof/>
         </w:rPr>
-        <w:instrText xml:space="preserve"> PAGEREF _Toc240034012 \h </w:instrText>
+        <w:instrText xml:space="preserve"> PAGEREF _Toc240035153 \h </w:instrText>
       </w:r>
       <w:r>
         <w:rPr>
@@ -734,7 +734,7 @@
         <w:rPr>
           <w:noProof/>
         </w:rPr>
-        <w:t>19</w:t>
+        <w:t>20</w:t>
       </w:r>
       <w:r>
         <w:rPr>
@@ -778,7 +778,7 @@
         <w:rPr>
           <w:noProof/>
         </w:rPr>
-        <w:instrText xml:space="preserve"> PAGEREF _Toc240034013 \h </w:instrText>
+        <w:instrText xml:space="preserve"> PAGEREF _Toc240035154 \h </w:instrText>
       </w:r>
       <w:r>
         <w:rPr>
@@ -795,7 +795,7 @@
         <w:rPr>
           <w:noProof/>
         </w:rPr>
-        <w:t>20</w:t>
+        <w:t>21</w:t>
       </w:r>
       <w:r>
         <w:rPr>
@@ -839,7 +839,7 @@
         <w:rPr>
           <w:noProof/>
         </w:rPr>
-        <w:instrText xml:space="preserve"> PAGEREF _Toc240034014 \h </w:instrText>
+        <w:instrText xml:space="preserve"> PAGEREF _Toc240035155 \h </w:instrText>
       </w:r>
       <w:r>
         <w:rPr>
@@ -856,7 +856,7 @@
         <w:rPr>
           <w:noProof/>
         </w:rPr>
-        <w:t>21</w:t>
+        <w:t>22</w:t>
       </w:r>
       <w:r>
         <w:rPr>
@@ -900,7 +900,7 @@
         <w:rPr>
           <w:noProof/>
         </w:rPr>
-        <w:instrText xml:space="preserve"> PAGEREF _Toc240034015 \h </w:instrText>
+        <w:instrText xml:space="preserve"> PAGEREF _Toc240035156 \h </w:instrText>
       </w:r>
       <w:r>
         <w:rPr>
@@ -917,7 +917,7 @@
         <w:rPr>
           <w:noProof/>
         </w:rPr>
-        <w:t>23</w:t>
+        <w:t>24</w:t>
       </w:r>
       <w:r>
         <w:rPr>
@@ -961,7 +961,7 @@
         <w:rPr>
           <w:noProof/>
         </w:rPr>
-        <w:instrText xml:space="preserve"> PAGEREF _Toc240034016 \h </w:instrText>
+        <w:instrText xml:space="preserve"> PAGEREF _Toc240035157 \h </w:instrText>
       </w:r>
       <w:r>
         <w:rPr>
@@ -978,7 +978,7 @@
         <w:rPr>
           <w:noProof/>
         </w:rPr>
-        <w:t>24</w:t>
+        <w:t>25</w:t>
       </w:r>
       <w:r>
         <w:rPr>
@@ -1022,7 +1022,7 @@
         <w:rPr>
           <w:noProof/>
         </w:rPr>
-        <w:instrText xml:space="preserve"> PAGEREF _Toc240034017 \h </w:instrText>
+        <w:instrText xml:space="preserve"> PAGEREF _Toc240035158 \h </w:instrText>
       </w:r>
       <w:r>
         <w:rPr>
@@ -1039,7 +1039,7 @@
         <w:rPr>
           <w:noProof/>
         </w:rPr>
-        <w:t>25</w:t>
+        <w:t>26</w:t>
       </w:r>
       <w:r>
         <w:rPr>
@@ -1083,7 +1083,7 @@
         <w:rPr>
           <w:noProof/>
         </w:rPr>
-        <w:instrText xml:space="preserve"> PAGEREF _Toc240034018 \h </w:instrText>
+        <w:instrText xml:space="preserve"> PAGEREF _Toc240035159 \h </w:instrText>
       </w:r>
       <w:r>
         <w:rPr>
@@ -1100,7 +1100,7 @@
         <w:rPr>
           <w:noProof/>
         </w:rPr>
-        <w:t>25</w:t>
+        <w:t>26</w:t>
       </w:r>
       <w:r>
         <w:rPr>
@@ -1144,7 +1144,7 @@
         <w:rPr>
           <w:noProof/>
         </w:rPr>
-        <w:instrText xml:space="preserve"> PAGEREF _Toc240034019 \h </w:instrText>
+        <w:instrText xml:space="preserve"> PAGEREF _Toc240035160 \h </w:instrText>
       </w:r>
       <w:r>
         <w:rPr>
@@ -1161,7 +1161,7 @@
         <w:rPr>
           <w:noProof/>
         </w:rPr>
-        <w:t>26</w:t>
+        <w:t>27</w:t>
       </w:r>
       <w:r>
         <w:rPr>
@@ -1205,7 +1205,7 @@
         <w:rPr>
           <w:noProof/>
         </w:rPr>
-        <w:instrText xml:space="preserve"> PAGEREF _Toc240034020 \h </w:instrText>
+        <w:instrText xml:space="preserve"> PAGEREF _Toc240035161 \h </w:instrText>
       </w:r>
       <w:r>
         <w:rPr>
@@ -1222,7 +1222,7 @@
         <w:rPr>
           <w:noProof/>
         </w:rPr>
-        <w:t>27</w:t>
+        <w:t>28</w:t>
       </w:r>
       <w:r>
         <w:rPr>
@@ -1266,7 +1266,7 @@
         <w:rPr>
           <w:noProof/>
         </w:rPr>
-        <w:instrText xml:space="preserve"> PAGEREF _Toc240034021 \h </w:instrText>
+        <w:instrText xml:space="preserve"> PAGEREF _Toc240035162 \h </w:instrText>
       </w:r>
       <w:r>
         <w:rPr>
@@ -1283,7 +1283,7 @@
         <w:rPr>
           <w:noProof/>
         </w:rPr>
-        <w:t>27</w:t>
+        <w:t>28</w:t>
       </w:r>
       <w:r>
         <w:rPr>
@@ -1327,7 +1327,7 @@
         <w:rPr>
           <w:noProof/>
         </w:rPr>
-        <w:instrText xml:space="preserve"> PAGEREF _Toc240034022 \h </w:instrText>
+        <w:instrText xml:space="preserve"> PAGEREF _Toc240035163 \h </w:instrText>
       </w:r>
       <w:r>
         <w:rPr>
@@ -1344,7 +1344,7 @@
         <w:rPr>
           <w:noProof/>
         </w:rPr>
-        <w:t>29</w:t>
+        <w:t>30</w:t>
       </w:r>
       <w:r>
         <w:rPr>
@@ -1388,7 +1388,7 @@
         <w:rPr>
           <w:noProof/>
         </w:rPr>
-        <w:instrText xml:space="preserve"> PAGEREF _Toc240034023 \h </w:instrText>
+        <w:instrText xml:space="preserve"> PAGEREF _Toc240035164 \h </w:instrText>
       </w:r>
       <w:r>
         <w:rPr>
@@ -1405,7 +1405,7 @@
         <w:rPr>
           <w:noProof/>
         </w:rPr>
-        <w:t>31</w:t>
+        <w:t>32</w:t>
       </w:r>
       <w:r>
         <w:rPr>
@@ -1449,7 +1449,7 @@
         <w:rPr>
           <w:noProof/>
         </w:rPr>
-        <w:instrText xml:space="preserve"> PAGEREF _Toc240034024 \h </w:instrText>
+        <w:instrText xml:space="preserve"> PAGEREF _Toc240035165 \h </w:instrText>
       </w:r>
       <w:r>
         <w:rPr>
@@ -1466,7 +1466,7 @@
         <w:rPr>
           <w:noProof/>
         </w:rPr>
-        <w:t>31</w:t>
+        <w:t>32</w:t>
       </w:r>
       <w:r>
         <w:rPr>
@@ -1510,7 +1510,7 @@
         <w:rPr>
           <w:noProof/>
         </w:rPr>
-        <w:instrText xml:space="preserve"> PAGEREF _Toc240034025 \h </w:instrText>
+        <w:instrText xml:space="preserve"> PAGEREF _Toc240035166 \h </w:instrText>
       </w:r>
       <w:r>
         <w:rPr>
@@ -1527,7 +1527,7 @@
         <w:rPr>
           <w:noProof/>
         </w:rPr>
-        <w:t>34</w:t>
+        <w:t>35</w:t>
       </w:r>
       <w:r>
         <w:rPr>
@@ -1571,7 +1571,7 @@
         <w:rPr>
           <w:noProof/>
         </w:rPr>
-        <w:instrText xml:space="preserve"> PAGEREF _Toc240034026 \h </w:instrText>
+        <w:instrText xml:space="preserve"> PAGEREF _Toc240035167 \h </w:instrText>
       </w:r>
       <w:r>
         <w:rPr>
@@ -1588,7 +1588,7 @@
         <w:rPr>
           <w:noProof/>
         </w:rPr>
-        <w:t>36</w:t>
+        <w:t>37</w:t>
       </w:r>
       <w:r>
         <w:rPr>
@@ -1632,7 +1632,7 @@
         <w:rPr>
           <w:noProof/>
         </w:rPr>
-        <w:instrText xml:space="preserve"> PAGEREF _Toc240034027 \h </w:instrText>
+        <w:instrText xml:space="preserve"> PAGEREF _Toc240035168 \h </w:instrText>
       </w:r>
       <w:r>
         <w:rPr>
@@ -1649,7 +1649,7 @@
         <w:rPr>
           <w:noProof/>
         </w:rPr>
-        <w:t>40</w:t>
+        <w:t>41</w:t>
       </w:r>
       <w:r>
         <w:rPr>
@@ -1693,7 +1693,7 @@
         <w:rPr>
           <w:noProof/>
         </w:rPr>
-        <w:instrText xml:space="preserve"> PAGEREF _Toc240034028 \h </w:instrText>
+        <w:instrText xml:space="preserve"> PAGEREF _Toc240035169 \h </w:instrText>
       </w:r>
       <w:r>
         <w:rPr>
@@ -1710,7 +1710,7 @@
         <w:rPr>
           <w:noProof/>
         </w:rPr>
-        <w:t>44</w:t>
+        <w:t>45</w:t>
       </w:r>
       <w:r>
         <w:rPr>
@@ -1755,7 +1755,7 @@
         <w:rPr>
           <w:noProof/>
         </w:rPr>
-        <w:instrText xml:space="preserve"> PAGEREF _Toc240034029 \h </w:instrText>
+        <w:instrText xml:space="preserve"> PAGEREF _Toc240035170 \h </w:instrText>
       </w:r>
       <w:r>
         <w:rPr>
@@ -1772,7 +1772,7 @@
         <w:rPr>
           <w:noProof/>
         </w:rPr>
-        <w:t>46</w:t>
+        <w:t>47</w:t>
       </w:r>
       <w:r>
         <w:rPr>
@@ -1816,7 +1816,7 @@
         <w:rPr>
           <w:noProof/>
         </w:rPr>
-        <w:instrText xml:space="preserve"> PAGEREF _Toc240034030 \h </w:instrText>
+        <w:instrText xml:space="preserve"> PAGEREF _Toc240035171 \h </w:instrText>
       </w:r>
       <w:r>
         <w:rPr>
@@ -1833,7 +1833,7 @@
         <w:rPr>
           <w:noProof/>
         </w:rPr>
-        <w:t>49</w:t>
+        <w:t>50</w:t>
       </w:r>
       <w:r>
         <w:rPr>
@@ -1877,7 +1877,7 @@
         <w:rPr>
           <w:noProof/>
         </w:rPr>
-        <w:instrText xml:space="preserve"> PAGEREF _Toc240034031 \h </w:instrText>
+        <w:instrText xml:space="preserve"> PAGEREF _Toc240035172 \h </w:instrText>
       </w:r>
       <w:r>
         <w:rPr>
@@ -1894,7 +1894,7 @@
         <w:rPr>
           <w:noProof/>
         </w:rPr>
-        <w:t>51</w:t>
+        <w:t>52</w:t>
       </w:r>
       <w:r>
         <w:rPr>
@@ -1938,7 +1938,7 @@
         <w:rPr>
           <w:noProof/>
         </w:rPr>
-        <w:instrText xml:space="preserve"> PAGEREF _Toc240034032 \h </w:instrText>
+        <w:instrText xml:space="preserve"> PAGEREF _Toc240035173 \h </w:instrText>
       </w:r>
       <w:r>
         <w:rPr>
@@ -1955,7 +1955,7 @@
         <w:rPr>
           <w:noProof/>
         </w:rPr>
-        <w:t>54</w:t>
+        <w:t>55</w:t>
       </w:r>
       <w:r>
         <w:rPr>
@@ -1999,7 +1999,7 @@
         <w:rPr>
           <w:noProof/>
         </w:rPr>
-        <w:instrText xml:space="preserve"> PAGEREF _Toc240034033 \h </w:instrText>
+        <w:instrText xml:space="preserve"> PAGEREF _Toc240035174 \h </w:instrText>
       </w:r>
       <w:r>
         <w:rPr>
@@ -2016,7 +2016,7 @@
         <w:rPr>
           <w:noProof/>
         </w:rPr>
-        <w:t>56</w:t>
+        <w:t>57</w:t>
       </w:r>
       <w:r>
         <w:rPr>
@@ -2060,7 +2060,7 @@
         <w:rPr>
           <w:noProof/>
         </w:rPr>
-        <w:instrText xml:space="preserve"> PAGEREF _Toc240034034 \h </w:instrText>
+        <w:instrText xml:space="preserve"> PAGEREF _Toc240035175 \h </w:instrText>
       </w:r>
       <w:r>
         <w:rPr>
@@ -2077,7 +2077,7 @@
         <w:rPr>
           <w:noProof/>
         </w:rPr>
-        <w:t>58</w:t>
+        <w:t>59</w:t>
       </w:r>
       <w:r>
         <w:rPr>
@@ -2121,7 +2121,7 @@
         <w:rPr>
           <w:noProof/>
         </w:rPr>
-        <w:instrText xml:space="preserve"> PAGEREF _Toc240034035 \h </w:instrText>
+        <w:instrText xml:space="preserve"> PAGEREF _Toc240035176 \h </w:instrText>
       </w:r>
       <w:r>
         <w:rPr>
@@ -2138,7 +2138,7 @@
         <w:rPr>
           <w:noProof/>
         </w:rPr>
-        <w:t>58</w:t>
+        <w:t>59</w:t>
       </w:r>
       <w:r>
         <w:rPr>
@@ -2182,7 +2182,7 @@
         <w:rPr>
           <w:noProof/>
         </w:rPr>
-        <w:instrText xml:space="preserve"> PAGEREF _Toc240034036 \h </w:instrText>
+        <w:instrText xml:space="preserve"> PAGEREF _Toc240035177 \h </w:instrText>
       </w:r>
       <w:r>
         <w:rPr>
@@ -2199,7 +2199,7 @@
         <w:rPr>
           <w:noProof/>
         </w:rPr>
-        <w:t>65</w:t>
+        <w:t>66</w:t>
       </w:r>
       <w:r>
         <w:rPr>
@@ -2243,7 +2243,7 @@
         <w:rPr>
           <w:noProof/>
         </w:rPr>
-        <w:instrText xml:space="preserve"> PAGEREF _Toc240034037 \h </w:instrText>
+        <w:instrText xml:space="preserve"> PAGEREF _Toc240035178 \h </w:instrText>
       </w:r>
       <w:r>
         <w:rPr>
@@ -2260,7 +2260,7 @@
         <w:rPr>
           <w:noProof/>
         </w:rPr>
-        <w:t>70</w:t>
+        <w:t>71</w:t>
       </w:r>
       <w:r>
         <w:rPr>
@@ -2304,7 +2304,7 @@
         <w:rPr>
           <w:noProof/>
         </w:rPr>
-        <w:instrText xml:space="preserve"> PAGEREF _Toc240034038 \h </w:instrText>
+        <w:instrText xml:space="preserve"> PAGEREF _Toc240035179 \h </w:instrText>
       </w:r>
       <w:r>
         <w:rPr>
@@ -2321,7 +2321,7 @@
         <w:rPr>
           <w:noProof/>
         </w:rPr>
-        <w:t>70</w:t>
+        <w:t>71</w:t>
       </w:r>
       <w:r>
         <w:rPr>
@@ -2365,7 +2365,7 @@
         <w:rPr>
           <w:noProof/>
         </w:rPr>
-        <w:instrText xml:space="preserve"> PAGEREF _Toc240034039 \h </w:instrText>
+        <w:instrText xml:space="preserve"> PAGEREF _Toc240035180 \h </w:instrText>
       </w:r>
       <w:r>
         <w:rPr>
@@ -2382,7 +2382,7 @@
         <w:rPr>
           <w:noProof/>
         </w:rPr>
-        <w:t>71</w:t>
+        <w:t>72</w:t>
       </w:r>
       <w:r>
         <w:rPr>
@@ -2426,7 +2426,7 @@
         <w:rPr>
           <w:noProof/>
         </w:rPr>
-        <w:instrText xml:space="preserve"> PAGEREF _Toc240034040 \h </w:instrText>
+        <w:instrText xml:space="preserve"> PAGEREF _Toc240035181 \h </w:instrText>
       </w:r>
       <w:r>
         <w:rPr>
@@ -2443,7 +2443,7 @@
         <w:rPr>
           <w:noProof/>
         </w:rPr>
-        <w:t>71</w:t>
+        <w:t>72</w:t>
       </w:r>
       <w:r>
         <w:rPr>
@@ -2487,7 +2487,7 @@
         <w:rPr>
           <w:noProof/>
         </w:rPr>
-        <w:instrText xml:space="preserve"> PAGEREF _Toc240034041 \h </w:instrText>
+        <w:instrText xml:space="preserve"> PAGEREF _Toc240035182 \h </w:instrText>
       </w:r>
       <w:r>
         <w:rPr>
@@ -2504,7 +2504,7 @@
         <w:rPr>
           <w:noProof/>
         </w:rPr>
-        <w:t>74</w:t>
+        <w:t>75</w:t>
       </w:r>
       <w:r>
         <w:rPr>
@@ -2548,7 +2548,7 @@
         <w:rPr>
           <w:noProof/>
         </w:rPr>
-        <w:instrText xml:space="preserve"> PAGEREF _Toc240034042 \h </w:instrText>
+        <w:instrText xml:space="preserve"> PAGEREF _Toc240035183 \h </w:instrText>
       </w:r>
       <w:r>
         <w:rPr>
@@ -2565,7 +2565,7 @@
         <w:rPr>
           <w:noProof/>
         </w:rPr>
-        <w:t>74</w:t>
+        <w:t>75</w:t>
       </w:r>
       <w:r>
         <w:rPr>
@@ -2609,7 +2609,7 @@
         <w:rPr>
           <w:noProof/>
         </w:rPr>
-        <w:instrText xml:space="preserve"> PAGEREF _Toc240034043 \h </w:instrText>
+        <w:instrText xml:space="preserve"> PAGEREF _Toc240035184 \h </w:instrText>
       </w:r>
       <w:r>
         <w:rPr>
@@ -2626,7 +2626,7 @@
         <w:rPr>
           <w:noProof/>
         </w:rPr>
-        <w:t>75</w:t>
+        <w:t>76</w:t>
       </w:r>
       <w:r>
         <w:rPr>
@@ -2670,7 +2670,7 @@
         <w:rPr>
           <w:noProof/>
         </w:rPr>
-        <w:instrText xml:space="preserve"> PAGEREF _Toc240034044 \h </w:instrText>
+        <w:instrText xml:space="preserve"> PAGEREF _Toc240035185 \h </w:instrText>
       </w:r>
       <w:r>
         <w:rPr>
@@ -2687,7 +2687,7 @@
         <w:rPr>
           <w:noProof/>
         </w:rPr>
-        <w:t>76</w:t>
+        <w:t>77</w:t>
       </w:r>
       <w:r>
         <w:rPr>
@@ -2731,7 +2731,7 @@
         <w:rPr>
           <w:noProof/>
         </w:rPr>
-        <w:instrText xml:space="preserve"> PAGEREF _Toc240034045 \h </w:instrText>
+        <w:instrText xml:space="preserve"> PAGEREF _Toc240035186 \h </w:instrText>
       </w:r>
       <w:r>
         <w:rPr>
@@ -2748,7 +2748,7 @@
         <w:rPr>
           <w:noProof/>
         </w:rPr>
-        <w:t>78</w:t>
+        <w:t>79</w:t>
       </w:r>
       <w:r>
         <w:rPr>
@@ -2792,7 +2792,7 @@
         <w:rPr>
           <w:noProof/>
         </w:rPr>
-        <w:instrText xml:space="preserve"> PAGEREF _Toc240034046 \h </w:instrText>
+        <w:instrText xml:space="preserve"> PAGEREF _Toc240035187 \h </w:instrText>
       </w:r>
       <w:r>
         <w:rPr>
@@ -2809,7 +2809,7 @@
         <w:rPr>
           <w:noProof/>
         </w:rPr>
-        <w:t>81</w:t>
+        <w:t>82</w:t>
       </w:r>
       <w:r>
         <w:rPr>
@@ -2853,7 +2853,7 @@
         <w:rPr>
           <w:noProof/>
         </w:rPr>
-        <w:instrText xml:space="preserve"> PAGEREF _Toc240034047 \h </w:instrText>
+        <w:instrText xml:space="preserve"> PAGEREF _Toc240035188 \h </w:instrText>
       </w:r>
       <w:r>
         <w:rPr>
@@ -2870,7 +2870,7 @@
         <w:rPr>
           <w:noProof/>
         </w:rPr>
-        <w:t>84</w:t>
+        <w:t>85</w:t>
       </w:r>
       <w:r>
         <w:rPr>
@@ -2914,7 +2914,7 @@
         <w:rPr>
           <w:noProof/>
         </w:rPr>
-        <w:instrText xml:space="preserve"> PAGEREF _Toc240034048 \h </w:instrText>
+        <w:instrText xml:space="preserve"> PAGEREF _Toc240035189 \h </w:instrText>
       </w:r>
       <w:r>
         <w:rPr>
@@ -2931,7 +2931,7 @@
         <w:rPr>
           <w:noProof/>
         </w:rPr>
-        <w:t>85</w:t>
+        <w:t>86</w:t>
       </w:r>
       <w:r>
         <w:rPr>
@@ -2975,7 +2975,7 @@
         <w:rPr>
           <w:noProof/>
         </w:rPr>
-        <w:instrText xml:space="preserve"> PAGEREF _Toc240034049 \h </w:instrText>
+        <w:instrText xml:space="preserve"> PAGEREF _Toc240035190 \h </w:instrText>
       </w:r>
       <w:r>
         <w:rPr>
@@ -2992,7 +2992,7 @@
         <w:rPr>
           <w:noProof/>
         </w:rPr>
-        <w:t>86</w:t>
+        <w:t>87</w:t>
       </w:r>
       <w:r>
         <w:rPr>
@@ -3036,7 +3036,7 @@
         <w:rPr>
           <w:noProof/>
         </w:rPr>
-        <w:instrText xml:space="preserve"> PAGEREF _Toc240034050 \h </w:instrText>
+        <w:instrText xml:space="preserve"> PAGEREF _Toc240035191 \h </w:instrText>
       </w:r>
       <w:r>
         <w:rPr>
@@ -3053,7 +3053,7 @@
         <w:rPr>
           <w:noProof/>
         </w:rPr>
-        <w:t>90</w:t>
+        <w:t>91</w:t>
       </w:r>
       <w:r>
         <w:rPr>
@@ -3097,7 +3097,7 @@
         <w:rPr>
           <w:noProof/>
         </w:rPr>
-        <w:instrText xml:space="preserve"> PAGEREF _Toc240034051 \h </w:instrText>
+        <w:instrText xml:space="preserve"> PAGEREF _Toc240035192 \h </w:instrText>
       </w:r>
       <w:r>
         <w:rPr>
@@ -3114,7 +3114,7 @@
         <w:rPr>
           <w:noProof/>
         </w:rPr>
-        <w:t>91</w:t>
+        <w:t>92</w:t>
       </w:r>
       <w:r>
         <w:rPr>
@@ -3173,7 +3173,7 @@
           <w:sz w:val="34"/>
         </w:rPr>
       </w:pPr>
-      <w:bookmarkStart w:id="0" w:name="_Toc240034004"/>
+      <w:bookmarkStart w:id="0" w:name="_Toc240035145"/>
       <w:r>
         <w:rPr>
           <w:rFonts w:ascii="Montserrat" w:hAnsi="Montserrat"/>
@@ -3197,7 +3197,7 @@
           <w:sz w:val="27"/>
         </w:rPr>
       </w:pPr>
-      <w:bookmarkStart w:id="1" w:name="_Toc240034005"/>
+      <w:bookmarkStart w:id="1" w:name="_Toc240035146"/>
       <w:r>
         <w:rPr>
           <w:rFonts w:ascii="Montserrat" w:hAnsi="Montserrat"/>
@@ -4385,6 +4385,24 @@
           <w:color w:val="1A1A1A"/>
           <w:sz w:val="22"/>
         </w:rPr>
+        <w:t>Esta e a versao 2.58 do manual. Em relacao a versao 2.57 (11/09/2026), a Fase 2 da proposta de custos por categoria leva a comparacao Estimado x Realizado do Relatorio de Situacao (Fase 1) para o portfolio: o Painel Executivo (secao 6.4) ganhou a secao Custos por categoria (portfolio), com uma tabela listando cada categoria de custo, em quantos projetos ela tem estimativa no TAP e em quantos desses o Realizado ultrapassou o Estimado - mesmo casamento por nome ja usado no Comparativo por categoria e no botao Importar categorias do TAP, agora em nivel de portfolio.</w:t>
+      </w:r>
+    </w:p>
+    <w:p>
+      <w:pPr>
+        <w:spacing w:line="280" w:lineRule="auto"/>
+        <w:rPr>
+          <w:rFonts w:ascii="Montserrat" w:hAnsi="Montserrat"/>
+          <w:color w:val="1A1A1A"/>
+          <w:sz w:val="22"/>
+        </w:rPr>
+      </w:pPr>
+      <w:r>
+        <w:rPr>
+          <w:rFonts w:ascii="Montserrat" w:hAnsi="Montserrat"/>
+          <w:color w:val="1A1A1A"/>
+          <w:sz w:val="22"/>
+        </w:rPr>
         <w:t>O manual nao substitui as Diretrizes para a Gestao de Projetos da UNIALFA (documento institucional que define o framework D01 a D07) nem o documento Regras de Acesso e Permissoes (que detalha cada regra de controle de acesso); ele e o guia operacional de como usar cada ferramenta na pratica.</w:t>
       </w:r>
     </w:p>
@@ -4399,7 +4417,7 @@
           <w:sz w:val="27"/>
         </w:rPr>
       </w:pPr>
-      <w:bookmarkStart w:id="2" w:name="_Toc240034006"/>
+      <w:bookmarkStart w:id="2" w:name="_Toc240035147"/>
       <w:r>
         <w:rPr>
           <w:rFonts w:ascii="Montserrat" w:hAnsi="Montserrat"/>
@@ -4407,6 +4425,7 @@
           <w:color w:val="B91D2E"/>
           <w:sz w:val="27"/>
         </w:rPr>
+        <w:lastRenderedPageBreak/>
         <w:t>1.2 Visao geral da ferramenta</w:t>
       </w:r>
       <w:bookmarkEnd w:id="2"/>
@@ -4522,7 +4541,6 @@
           <w:color w:val="1A1A1A"/>
           <w:sz w:val="22"/>
         </w:rPr>
-        <w:lastRenderedPageBreak/>
         <w:t>1 Painel Executivo, tambem restrito a Admin, com a visao agregada de todo o sistema (secao 6.4).</w:t>
       </w:r>
     </w:p>
@@ -4595,17 +4613,18 @@
         <w:rPr>
           <w:noProof/>
         </w:rPr>
+        <w:lastRenderedPageBreak/>
         <w:drawing>
-          <wp:inline distT="0" distB="0" distL="0" distR="0" wp14:anchorId="074F5B89" wp14:editId="53CCD220">
+          <wp:inline distT="0" distB="0" distL="0" distR="0" wp14:anchorId="39E91D6F" wp14:editId="272568F0">
             <wp:extent cx="5303520" cy="4792851"/>
             <wp:effectExtent l="19050" t="19050" r="11430" b="27305"/>
-            <wp:docPr id="128138633" name="Imagem 1"/>
+            <wp:docPr id="1003791119" name="Imagem 1"/>
             <wp:cNvGraphicFramePr/>
             <a:graphic xmlns:a="http://schemas.openxmlformats.org/drawingml/2006/main">
               <a:graphicData uri="http://schemas.openxmlformats.org/drawingml/2006/picture">
                 <pic:pic xmlns:pic="http://schemas.openxmlformats.org/drawingml/2006/picture">
                   <pic:nvPicPr>
-                    <pic:cNvPr id="128138633" name=""/>
+                    <pic:cNvPr id="1003791119" name=""/>
                     <pic:cNvPicPr/>
                   </pic:nvPicPr>
                   <pic:blipFill>
@@ -4673,7 +4692,7 @@
           <w:sz w:val="27"/>
         </w:rPr>
       </w:pPr>
-      <w:bookmarkStart w:id="3" w:name="_Toc240034007"/>
+      <w:bookmarkStart w:id="3" w:name="_Toc240035148"/>
       <w:r>
         <w:rPr>
           <w:rFonts w:ascii="Montserrat" w:hAnsi="Montserrat"/>
@@ -4681,7 +4700,6 @@
           <w:color w:val="B91D2E"/>
           <w:sz w:val="27"/>
         </w:rPr>
-        <w:lastRenderedPageBreak/>
         <w:t>1.3 Como acessar e fazer login</w:t>
       </w:r>
       <w:bookmarkEnd w:id="3"/>
@@ -4713,17 +4731,18 @@
         <w:rPr>
           <w:noProof/>
         </w:rPr>
+        <w:lastRenderedPageBreak/>
         <w:drawing>
-          <wp:inline distT="0" distB="0" distL="0" distR="0" wp14:anchorId="52BD4F05" wp14:editId="536A7689">
+          <wp:inline distT="0" distB="0" distL="0" distR="0" wp14:anchorId="75A087B4" wp14:editId="321D2D95">
             <wp:extent cx="4206240" cy="3801227"/>
             <wp:effectExtent l="19050" t="19050" r="22860" b="27940"/>
-            <wp:docPr id="701957843" name="Imagem 2"/>
+            <wp:docPr id="566222747" name="Imagem 2"/>
             <wp:cNvGraphicFramePr/>
             <a:graphic xmlns:a="http://schemas.openxmlformats.org/drawingml/2006/main">
               <a:graphicData uri="http://schemas.openxmlformats.org/drawingml/2006/picture">
                 <pic:pic xmlns:pic="http://schemas.openxmlformats.org/drawingml/2006/picture">
                   <pic:nvPicPr>
-                    <pic:cNvPr id="701957843" name=""/>
+                    <pic:cNvPr id="566222747" name=""/>
                     <pic:cNvPicPr/>
                   </pic:nvPicPr>
                   <pic:blipFill>
@@ -4896,7 +4915,7 @@
           <w:sz w:val="27"/>
         </w:rPr>
       </w:pPr>
-      <w:bookmarkStart w:id="4" w:name="_Toc240034008"/>
+      <w:bookmarkStart w:id="4" w:name="_Toc240035149"/>
       <w:r>
         <w:rPr>
           <w:rFonts w:ascii="Montserrat" w:hAnsi="Montserrat"/>
@@ -4904,7 +4923,6 @@
           <w:color w:val="B91D2E"/>
           <w:sz w:val="27"/>
         </w:rPr>
-        <w:lastRenderedPageBreak/>
         <w:t>1.4 Como a ferramenta se relaciona com as Diretrizes (D01-D07)</w:t>
       </w:r>
       <w:bookmarkEnd w:id="4"/>
@@ -4979,6 +4997,7 @@
                 <w:color w:val="FFFFFF"/>
                 <w:sz w:val="19"/>
               </w:rPr>
+              <w:lastRenderedPageBreak/>
               <w:t>Passo</w:t>
             </w:r>
           </w:p>
@@ -6135,7 +6154,7 @@
           <w:sz w:val="34"/>
         </w:rPr>
       </w:pPr>
-      <w:bookmarkStart w:id="5" w:name="_Toc240034009"/>
+      <w:bookmarkStart w:id="5" w:name="_Toc240035150"/>
       <w:r>
         <w:rPr>
           <w:rFonts w:ascii="Montserrat" w:hAnsi="Montserrat"/>
@@ -6159,7 +6178,7 @@
           <w:sz w:val="27"/>
         </w:rPr>
       </w:pPr>
-      <w:bookmarkStart w:id="6" w:name="_Toc240034010"/>
+      <w:bookmarkStart w:id="6" w:name="_Toc240035151"/>
       <w:r>
         <w:rPr>
           <w:rFonts w:ascii="Montserrat" w:hAnsi="Montserrat"/>
@@ -6200,7 +6219,7 @@
           <w:sz w:val="27"/>
         </w:rPr>
       </w:pPr>
-      <w:bookmarkStart w:id="7" w:name="_Toc240034011"/>
+      <w:bookmarkStart w:id="7" w:name="_Toc240035152"/>
       <w:r>
         <w:rPr>
           <w:rFonts w:ascii="Montserrat" w:hAnsi="Montserrat"/>
@@ -6319,7 +6338,7 @@
           <w:sz w:val="27"/>
         </w:rPr>
       </w:pPr>
-      <w:bookmarkStart w:id="8" w:name="_Toc240034012"/>
+      <w:bookmarkStart w:id="8" w:name="_Toc240035153"/>
       <w:r>
         <w:rPr>
           <w:rFonts w:ascii="Montserrat" w:hAnsi="Montserrat"/>
@@ -6932,7 +6951,7 @@
           <w:sz w:val="27"/>
         </w:rPr>
       </w:pPr>
-      <w:bookmarkStart w:id="9" w:name="_Toc240034013"/>
+      <w:bookmarkStart w:id="9" w:name="_Toc240035154"/>
       <w:r>
         <w:rPr>
           <w:rFonts w:ascii="Montserrat" w:hAnsi="Montserrat"/>
@@ -7021,16 +7040,16 @@
         </w:rPr>
         <w:lastRenderedPageBreak/>
         <w:drawing>
-          <wp:inline distT="0" distB="0" distL="0" distR="0" wp14:anchorId="39D3B511" wp14:editId="6529B310">
+          <wp:inline distT="0" distB="0" distL="0" distR="0" wp14:anchorId="1E306D88" wp14:editId="7572D2CB">
             <wp:extent cx="4937760" cy="4462310"/>
             <wp:effectExtent l="19050" t="19050" r="15240" b="14605"/>
-            <wp:docPr id="886424055" name="Imagem 3"/>
+            <wp:docPr id="1935104332" name="Imagem 3"/>
             <wp:cNvGraphicFramePr/>
             <a:graphic xmlns:a="http://schemas.openxmlformats.org/drawingml/2006/main">
               <a:graphicData uri="http://schemas.openxmlformats.org/drawingml/2006/picture">
                 <pic:pic xmlns:pic="http://schemas.openxmlformats.org/drawingml/2006/picture">
                   <pic:nvPicPr>
-                    <pic:cNvPr id="886424055" name=""/>
+                    <pic:cNvPr id="1935104332" name=""/>
                     <pic:cNvPicPr/>
                   </pic:nvPicPr>
                   <pic:blipFill>
@@ -7098,7 +7117,7 @@
           <w:sz w:val="27"/>
         </w:rPr>
       </w:pPr>
-      <w:bookmarkStart w:id="10" w:name="_Toc240034014"/>
+      <w:bookmarkStart w:id="10" w:name="_Toc240035155"/>
       <w:r>
         <w:rPr>
           <w:rFonts w:ascii="Montserrat" w:hAnsi="Montserrat"/>
@@ -7139,16 +7158,16 @@
         </w:rPr>
         <w:lastRenderedPageBreak/>
         <w:drawing>
-          <wp:inline distT="0" distB="0" distL="0" distR="0" wp14:anchorId="54BB00D0" wp14:editId="34A13655">
+          <wp:inline distT="0" distB="0" distL="0" distR="0" wp14:anchorId="5B7A9330" wp14:editId="78A67C75">
             <wp:extent cx="5120640" cy="4627581"/>
             <wp:effectExtent l="19050" t="19050" r="22860" b="20955"/>
-            <wp:docPr id="321459244" name="Imagem 4"/>
+            <wp:docPr id="663818583" name="Imagem 4"/>
             <wp:cNvGraphicFramePr/>
             <a:graphic xmlns:a="http://schemas.openxmlformats.org/drawingml/2006/main">
               <a:graphicData uri="http://schemas.openxmlformats.org/drawingml/2006/picture">
                 <pic:pic xmlns:pic="http://schemas.openxmlformats.org/drawingml/2006/picture">
                   <pic:nvPicPr>
-                    <pic:cNvPr id="321459244" name=""/>
+                    <pic:cNvPr id="663818583" name=""/>
                     <pic:cNvPicPr/>
                   </pic:nvPicPr>
                   <pic:blipFill>
@@ -7316,7 +7335,7 @@
           <w:sz w:val="27"/>
         </w:rPr>
       </w:pPr>
-      <w:bookmarkStart w:id="11" w:name="_Toc240034015"/>
+      <w:bookmarkStart w:id="11" w:name="_Toc240035156"/>
       <w:r>
         <w:rPr>
           <w:rFonts w:ascii="Montserrat" w:hAnsi="Montserrat"/>
@@ -7356,16 +7375,16 @@
           <w:noProof/>
         </w:rPr>
         <w:drawing>
-          <wp:inline distT="0" distB="0" distL="0" distR="0" wp14:anchorId="375CD9DB" wp14:editId="41361904">
+          <wp:inline distT="0" distB="0" distL="0" distR="0" wp14:anchorId="565A3825" wp14:editId="0BBECF23">
             <wp:extent cx="4206240" cy="3801227"/>
             <wp:effectExtent l="19050" t="19050" r="22860" b="27940"/>
-            <wp:docPr id="1420985867" name="Imagem 5"/>
+            <wp:docPr id="1413775506" name="Imagem 5"/>
             <wp:cNvGraphicFramePr/>
             <a:graphic xmlns:a="http://schemas.openxmlformats.org/drawingml/2006/main">
               <a:graphicData uri="http://schemas.openxmlformats.org/drawingml/2006/picture">
                 <pic:pic xmlns:pic="http://schemas.openxmlformats.org/drawingml/2006/picture">
                   <pic:nvPicPr>
-                    <pic:cNvPr id="1420985867" name=""/>
+                    <pic:cNvPr id="1413775506" name=""/>
                     <pic:cNvPicPr/>
                   </pic:nvPicPr>
                   <pic:blipFill>
@@ -7433,16 +7452,16 @@
         </w:rPr>
         <w:lastRenderedPageBreak/>
         <w:drawing>
-          <wp:inline distT="0" distB="0" distL="0" distR="0" wp14:anchorId="4E0027CD" wp14:editId="2997D794">
+          <wp:inline distT="0" distB="0" distL="0" distR="0" wp14:anchorId="7E8832FD" wp14:editId="3E317E15">
             <wp:extent cx="4206240" cy="3801227"/>
             <wp:effectExtent l="19050" t="19050" r="22860" b="27940"/>
-            <wp:docPr id="1984600572" name="Imagem 6"/>
+            <wp:docPr id="1948461065" name="Imagem 6"/>
             <wp:cNvGraphicFramePr/>
             <a:graphic xmlns:a="http://schemas.openxmlformats.org/drawingml/2006/main">
               <a:graphicData uri="http://schemas.openxmlformats.org/drawingml/2006/picture">
                 <pic:pic xmlns:pic="http://schemas.openxmlformats.org/drawingml/2006/picture">
                   <pic:nvPicPr>
-                    <pic:cNvPr id="1984600572" name=""/>
+                    <pic:cNvPr id="1948461065" name=""/>
                     <pic:cNvPicPr/>
                   </pic:nvPicPr>
                   <pic:blipFill>
@@ -7558,7 +7577,7 @@
           <w:sz w:val="27"/>
         </w:rPr>
       </w:pPr>
-      <w:bookmarkStart w:id="12" w:name="_Toc240034016"/>
+      <w:bookmarkStart w:id="12" w:name="_Toc240035157"/>
       <w:r>
         <w:rPr>
           <w:rFonts w:ascii="Montserrat" w:hAnsi="Montserrat"/>
@@ -7626,7 +7645,7 @@
           <w:sz w:val="27"/>
         </w:rPr>
       </w:pPr>
-      <w:bookmarkStart w:id="13" w:name="_Toc240034017"/>
+      <w:bookmarkStart w:id="13" w:name="_Toc240035158"/>
       <w:r>
         <w:rPr>
           <w:rFonts w:ascii="Montserrat" w:hAnsi="Montserrat"/>
@@ -7853,7 +7872,7 @@
           <w:sz w:val="27"/>
         </w:rPr>
       </w:pPr>
-      <w:bookmarkStart w:id="14" w:name="_Toc240034018"/>
+      <w:bookmarkStart w:id="14" w:name="_Toc240035159"/>
       <w:r>
         <w:rPr>
           <w:rFonts w:ascii="Montserrat" w:hAnsi="Montserrat"/>
@@ -8012,7 +8031,7 @@
           <w:sz w:val="27"/>
         </w:rPr>
       </w:pPr>
-      <w:bookmarkStart w:id="15" w:name="_Toc240034019"/>
+      <w:bookmarkStart w:id="15" w:name="_Toc240035160"/>
       <w:r>
         <w:rPr>
           <w:rFonts w:ascii="Montserrat" w:hAnsi="Montserrat"/>
@@ -8108,18 +8127,8 @@
         </w:numPr>
         <w:spacing w:after="80" w:line="260" w:lineRule="auto"/>
         <w:ind w:left="700"/>
-        <w:rPr>
-          <w:rFonts w:ascii="Montserrat" w:hAnsi="Montserrat"/>
-          <w:color w:val="1A1A1A"/>
-          <w:sz w:val="22"/>
-        </w:rPr>
-      </w:pPr>
-      <w:r>
-        <w:rPr>
-          <w:rFonts w:ascii="Montserrat" w:hAnsi="Montserrat"/>
-          <w:color w:val="1A1A1A"/>
-          <w:sz w:val="22"/>
-        </w:rPr>
+      </w:pPr>
+      <w:r>
         <w:t>Liga ou desliga a importacao para o sistema inteiro - desligada, ninguem tem acesso ao painel, nem o proprio Admin.</w:t>
       </w:r>
     </w:p>
@@ -8204,7 +8213,7 @@
           <w:sz w:val="27"/>
         </w:rPr>
       </w:pPr>
-      <w:bookmarkStart w:id="16" w:name="_Toc240034020"/>
+      <w:bookmarkStart w:id="16" w:name="_Toc240035161"/>
       <w:r>
         <w:rPr>
           <w:rFonts w:ascii="Montserrat" w:hAnsi="Montserrat"/>
@@ -8332,7 +8341,7 @@
           <w:sz w:val="27"/>
         </w:rPr>
       </w:pPr>
-      <w:bookmarkStart w:id="17" w:name="_Toc240034021"/>
+      <w:bookmarkStart w:id="17" w:name="_Toc240035162"/>
       <w:r>
         <w:rPr>
           <w:rFonts w:ascii="Montserrat" w:hAnsi="Montserrat"/>
@@ -8662,7 +8671,7 @@
           <w:sz w:val="27"/>
         </w:rPr>
       </w:pPr>
-      <w:bookmarkStart w:id="18" w:name="_Toc240034022"/>
+      <w:bookmarkStart w:id="18" w:name="_Toc240035163"/>
       <w:r>
         <w:rPr>
           <w:rFonts w:ascii="Montserrat" w:hAnsi="Montserrat"/>
@@ -8803,7 +8812,7 @@
           <w:sz w:val="34"/>
         </w:rPr>
       </w:pPr>
-      <w:bookmarkStart w:id="19" w:name="_Toc240034023"/>
+      <w:bookmarkStart w:id="19" w:name="_Toc240035164"/>
       <w:r>
         <w:rPr>
           <w:rFonts w:ascii="Montserrat" w:hAnsi="Montserrat"/>
@@ -8845,7 +8854,7 @@
           <w:sz w:val="27"/>
         </w:rPr>
       </w:pPr>
-      <w:bookmarkStart w:id="20" w:name="_Toc240034024"/>
+      <w:bookmarkStart w:id="20" w:name="_Toc240035165"/>
       <w:r>
         <w:rPr>
           <w:rFonts w:ascii="Montserrat" w:hAnsi="Montserrat"/>
@@ -9925,16 +9934,16 @@
         </w:rPr>
         <w:lastRenderedPageBreak/>
         <w:drawing>
-          <wp:inline distT="0" distB="0" distL="0" distR="0" wp14:anchorId="0B9DBA44" wp14:editId="322EC4DC">
+          <wp:inline distT="0" distB="0" distL="0" distR="0" wp14:anchorId="1C3E466E" wp14:editId="44289A91">
             <wp:extent cx="5120640" cy="4627581"/>
             <wp:effectExtent l="19050" t="19050" r="22860" b="20955"/>
-            <wp:docPr id="238896383" name="Imagem 7"/>
+            <wp:docPr id="235778498" name="Imagem 7"/>
             <wp:cNvGraphicFramePr/>
             <a:graphic xmlns:a="http://schemas.openxmlformats.org/drawingml/2006/main">
               <a:graphicData uri="http://schemas.openxmlformats.org/drawingml/2006/picture">
                 <pic:pic xmlns:pic="http://schemas.openxmlformats.org/drawingml/2006/picture">
                   <pic:nvPicPr>
-                    <pic:cNvPr id="238896383" name=""/>
+                    <pic:cNvPr id="235778498" name=""/>
                     <pic:cNvPicPr/>
                   </pic:nvPicPr>
                   <pic:blipFill>
@@ -10002,16 +10011,16 @@
         </w:rPr>
         <w:lastRenderedPageBreak/>
         <w:drawing>
-          <wp:inline distT="0" distB="0" distL="0" distR="0" wp14:anchorId="257C6850" wp14:editId="2566C4CD">
+          <wp:inline distT="0" distB="0" distL="0" distR="0" wp14:anchorId="0014AA68" wp14:editId="4823BBB2">
             <wp:extent cx="5120640" cy="4627581"/>
             <wp:effectExtent l="19050" t="19050" r="22860" b="20955"/>
-            <wp:docPr id="1983657559" name="Imagem 8"/>
+            <wp:docPr id="500230680" name="Imagem 8"/>
             <wp:cNvGraphicFramePr/>
             <a:graphic xmlns:a="http://schemas.openxmlformats.org/drawingml/2006/main">
               <a:graphicData uri="http://schemas.openxmlformats.org/drawingml/2006/picture">
                 <pic:pic xmlns:pic="http://schemas.openxmlformats.org/drawingml/2006/picture">
                   <pic:nvPicPr>
-                    <pic:cNvPr id="1983657559" name=""/>
+                    <pic:cNvPr id="500230680" name=""/>
                     <pic:cNvPicPr/>
                   </pic:nvPicPr>
                   <pic:blipFill>
@@ -10219,7 +10228,7 @@
           <w:sz w:val="27"/>
         </w:rPr>
       </w:pPr>
-      <w:bookmarkStart w:id="21" w:name="_Toc240034025"/>
+      <w:bookmarkStart w:id="21" w:name="_Toc240035166"/>
       <w:r>
         <w:rPr>
           <w:rFonts w:ascii="Montserrat" w:hAnsi="Montserrat"/>
@@ -11144,16 +11153,16 @@
           <w:noProof/>
         </w:rPr>
         <w:drawing>
-          <wp:inline distT="0" distB="0" distL="0" distR="0" wp14:anchorId="78AB3123" wp14:editId="423BCB5E">
+          <wp:inline distT="0" distB="0" distL="0" distR="0" wp14:anchorId="193A16C5" wp14:editId="2673AF39">
             <wp:extent cx="5120640" cy="4627581"/>
             <wp:effectExtent l="19050" t="19050" r="22860" b="20955"/>
-            <wp:docPr id="368716868" name="Imagem 9"/>
+            <wp:docPr id="1595984938" name="Imagem 9"/>
             <wp:cNvGraphicFramePr/>
             <a:graphic xmlns:a="http://schemas.openxmlformats.org/drawingml/2006/main">
               <a:graphicData uri="http://schemas.openxmlformats.org/drawingml/2006/picture">
                 <pic:pic xmlns:pic="http://schemas.openxmlformats.org/drawingml/2006/picture">
                   <pic:nvPicPr>
-                    <pic:cNvPr id="368716868" name=""/>
+                    <pic:cNvPr id="1595984938" name=""/>
                     <pic:cNvPicPr/>
                   </pic:nvPicPr>
                   <pic:blipFill>
@@ -11221,16 +11230,16 @@
         </w:rPr>
         <w:lastRenderedPageBreak/>
         <w:drawing>
-          <wp:inline distT="0" distB="0" distL="0" distR="0" wp14:anchorId="27B12C63" wp14:editId="74AA89C2">
+          <wp:inline distT="0" distB="0" distL="0" distR="0" wp14:anchorId="72CB67C1" wp14:editId="6E6BB686">
             <wp:extent cx="5120640" cy="4627581"/>
             <wp:effectExtent l="19050" t="19050" r="22860" b="20955"/>
-            <wp:docPr id="1260232292" name="Imagem 10"/>
+            <wp:docPr id="1337003452" name="Imagem 10"/>
             <wp:cNvGraphicFramePr/>
             <a:graphic xmlns:a="http://schemas.openxmlformats.org/drawingml/2006/main">
               <a:graphicData uri="http://schemas.openxmlformats.org/drawingml/2006/picture">
                 <pic:pic xmlns:pic="http://schemas.openxmlformats.org/drawingml/2006/picture">
                   <pic:nvPicPr>
-                    <pic:cNvPr id="1260232292" name=""/>
+                    <pic:cNvPr id="1337003452" name=""/>
                     <pic:cNvPicPr/>
                   </pic:nvPicPr>
                   <pic:blipFill>
@@ -11364,7 +11373,7 @@
           <w:sz w:val="27"/>
         </w:rPr>
       </w:pPr>
-      <w:bookmarkStart w:id="22" w:name="_Toc240034026"/>
+      <w:bookmarkStart w:id="22" w:name="_Toc240035167"/>
       <w:r>
         <w:rPr>
           <w:rFonts w:ascii="Montserrat" w:hAnsi="Montserrat"/>
@@ -12430,16 +12439,16 @@
           <w:noProof/>
         </w:rPr>
         <w:drawing>
-          <wp:inline distT="0" distB="0" distL="0" distR="0" wp14:anchorId="37A182D4" wp14:editId="6E887637">
+          <wp:inline distT="0" distB="0" distL="0" distR="0" wp14:anchorId="0E671C50" wp14:editId="3D10C1F9">
             <wp:extent cx="5120640" cy="3338440"/>
             <wp:effectExtent l="19050" t="19050" r="22860" b="14605"/>
-            <wp:docPr id="472450694" name="Imagem 11"/>
+            <wp:docPr id="495544103" name="Imagem 11"/>
             <wp:cNvGraphicFramePr/>
             <a:graphic xmlns:a="http://schemas.openxmlformats.org/drawingml/2006/main">
               <a:graphicData uri="http://schemas.openxmlformats.org/drawingml/2006/picture">
                 <pic:pic xmlns:pic="http://schemas.openxmlformats.org/drawingml/2006/picture">
                   <pic:nvPicPr>
-                    <pic:cNvPr id="472450694" name=""/>
+                    <pic:cNvPr id="495544103" name=""/>
                     <pic:cNvPicPr/>
                   </pic:nvPicPr>
                   <pic:blipFill>
@@ -12507,16 +12516,16 @@
         </w:rPr>
         <w:lastRenderedPageBreak/>
         <w:drawing>
-          <wp:inline distT="0" distB="0" distL="0" distR="0" wp14:anchorId="65DA43C9" wp14:editId="2AB27FFF">
+          <wp:inline distT="0" distB="0" distL="0" distR="0" wp14:anchorId="7F245F4E" wp14:editId="7E0DCF57">
             <wp:extent cx="5120640" cy="4627581"/>
             <wp:effectExtent l="19050" t="19050" r="22860" b="20955"/>
-            <wp:docPr id="1937718574" name="Imagem 12"/>
+            <wp:docPr id="1147122374" name="Imagem 12"/>
             <wp:cNvGraphicFramePr/>
             <a:graphic xmlns:a="http://schemas.openxmlformats.org/drawingml/2006/main">
               <a:graphicData uri="http://schemas.openxmlformats.org/drawingml/2006/picture">
                 <pic:pic xmlns:pic="http://schemas.openxmlformats.org/drawingml/2006/picture">
                   <pic:nvPicPr>
-                    <pic:cNvPr id="1937718574" name=""/>
+                    <pic:cNvPr id="1147122374" name=""/>
                     <pic:cNvPicPr/>
                   </pic:nvPicPr>
                   <pic:blipFill>
@@ -12720,7 +12729,7 @@
           <w:sz w:val="27"/>
         </w:rPr>
       </w:pPr>
-      <w:bookmarkStart w:id="23" w:name="_Toc240034027"/>
+      <w:bookmarkStart w:id="23" w:name="_Toc240035168"/>
       <w:r>
         <w:rPr>
           <w:rFonts w:ascii="Montserrat" w:hAnsi="Montserrat"/>
@@ -13281,16 +13290,16 @@
           <w:noProof/>
         </w:rPr>
         <w:drawing>
-          <wp:inline distT="0" distB="0" distL="0" distR="0" wp14:anchorId="49B4D5A6" wp14:editId="464869FE">
+          <wp:inline distT="0" distB="0" distL="0" distR="0" wp14:anchorId="55EFBA86" wp14:editId="0509D44E">
             <wp:extent cx="5120640" cy="4627581"/>
             <wp:effectExtent l="19050" t="19050" r="22860" b="20955"/>
-            <wp:docPr id="782521875" name="Imagem 13"/>
+            <wp:docPr id="1788411633" name="Imagem 13"/>
             <wp:cNvGraphicFramePr/>
             <a:graphic xmlns:a="http://schemas.openxmlformats.org/drawingml/2006/main">
               <a:graphicData uri="http://schemas.openxmlformats.org/drawingml/2006/picture">
                 <pic:pic xmlns:pic="http://schemas.openxmlformats.org/drawingml/2006/picture">
                   <pic:nvPicPr>
-                    <pic:cNvPr id="782521875" name=""/>
+                    <pic:cNvPr id="1788411633" name=""/>
                     <pic:cNvPicPr/>
                   </pic:nvPicPr>
                   <pic:blipFill>
@@ -13358,16 +13367,16 @@
         </w:rPr>
         <w:lastRenderedPageBreak/>
         <w:drawing>
-          <wp:inline distT="0" distB="0" distL="0" distR="0" wp14:anchorId="247BC53F" wp14:editId="24E2E6F4">
+          <wp:inline distT="0" distB="0" distL="0" distR="0" wp14:anchorId="3681E2B0" wp14:editId="67C30AD2">
             <wp:extent cx="5120640" cy="4627581"/>
             <wp:effectExtent l="19050" t="19050" r="22860" b="20955"/>
-            <wp:docPr id="496825526" name="Imagem 14"/>
+            <wp:docPr id="340002035" name="Imagem 14"/>
             <wp:cNvGraphicFramePr/>
             <a:graphic xmlns:a="http://schemas.openxmlformats.org/drawingml/2006/main">
               <a:graphicData uri="http://schemas.openxmlformats.org/drawingml/2006/picture">
                 <pic:pic xmlns:pic="http://schemas.openxmlformats.org/drawingml/2006/picture">
                   <pic:nvPicPr>
-                    <pic:cNvPr id="496825526" name=""/>
+                    <pic:cNvPr id="340002035" name=""/>
                     <pic:cNvPicPr/>
                   </pic:nvPicPr>
                   <pic:blipFill>
@@ -13600,7 +13609,7 @@
           <w:sz w:val="27"/>
         </w:rPr>
       </w:pPr>
-      <w:bookmarkStart w:id="24" w:name="_Toc240034028"/>
+      <w:bookmarkStart w:id="24" w:name="_Toc240035169"/>
       <w:r>
         <w:rPr>
           <w:rFonts w:ascii="Montserrat" w:hAnsi="Montserrat"/>
@@ -13641,16 +13650,16 @@
           <w:noProof/>
         </w:rPr>
         <w:drawing>
-          <wp:inline distT="0" distB="0" distL="0" distR="0" wp14:anchorId="1B0FBC24" wp14:editId="3A8C29A3">
+          <wp:inline distT="0" distB="0" distL="0" distR="0" wp14:anchorId="24E652C2" wp14:editId="2D26F682">
             <wp:extent cx="5120640" cy="4627581"/>
             <wp:effectExtent l="19050" t="19050" r="22860" b="20955"/>
-            <wp:docPr id="1386361597" name="Imagem 15"/>
+            <wp:docPr id="1440240569" name="Imagem 15"/>
             <wp:cNvGraphicFramePr/>
             <a:graphic xmlns:a="http://schemas.openxmlformats.org/drawingml/2006/main">
               <a:graphicData uri="http://schemas.openxmlformats.org/drawingml/2006/picture">
                 <pic:pic xmlns:pic="http://schemas.openxmlformats.org/drawingml/2006/picture">
                   <pic:nvPicPr>
-                    <pic:cNvPr id="1386361597" name=""/>
+                    <pic:cNvPr id="1440240569" name=""/>
                     <pic:cNvPicPr/>
                   </pic:nvPicPr>
                   <pic:blipFill>
@@ -13718,16 +13727,16 @@
         </w:rPr>
         <w:lastRenderedPageBreak/>
         <w:drawing>
-          <wp:inline distT="0" distB="0" distL="0" distR="0" wp14:anchorId="4AAEB678" wp14:editId="46A2E97D">
+          <wp:inline distT="0" distB="0" distL="0" distR="0" wp14:anchorId="23C3F7A7" wp14:editId="13B0C195">
             <wp:extent cx="5120640" cy="4627581"/>
             <wp:effectExtent l="19050" t="19050" r="22860" b="20955"/>
-            <wp:docPr id="1593723626" name="Imagem 16"/>
+            <wp:docPr id="1112580351" name="Imagem 16"/>
             <wp:cNvGraphicFramePr/>
             <a:graphic xmlns:a="http://schemas.openxmlformats.org/drawingml/2006/main">
               <a:graphicData uri="http://schemas.openxmlformats.org/drawingml/2006/picture">
                 <pic:pic xmlns:pic="http://schemas.openxmlformats.org/drawingml/2006/picture">
                   <pic:nvPicPr>
-                    <pic:cNvPr id="1593723626" name=""/>
+                    <pic:cNvPr id="1112580351" name=""/>
                     <pic:cNvPicPr/>
                   </pic:nvPicPr>
                   <pic:blipFill>
@@ -13891,16 +13900,16 @@
         </w:rPr>
         <w:lastRenderedPageBreak/>
         <w:drawing>
-          <wp:inline distT="0" distB="0" distL="0" distR="0" wp14:anchorId="231F2FC3" wp14:editId="1C8A8CD6">
+          <wp:inline distT="0" distB="0" distL="0" distR="0" wp14:anchorId="194CD03A" wp14:editId="58142B79">
             <wp:extent cx="5120640" cy="3282818"/>
             <wp:effectExtent l="19050" t="19050" r="22860" b="13335"/>
-            <wp:docPr id="207993997" name="Imagem 17"/>
+            <wp:docPr id="819328150" name="Imagem 17"/>
             <wp:cNvGraphicFramePr/>
             <a:graphic xmlns:a="http://schemas.openxmlformats.org/drawingml/2006/main">
               <a:graphicData uri="http://schemas.openxmlformats.org/drawingml/2006/picture">
                 <pic:pic xmlns:pic="http://schemas.openxmlformats.org/drawingml/2006/picture">
                   <pic:nvPicPr>
-                    <pic:cNvPr id="207993997" name=""/>
+                    <pic:cNvPr id="819328150" name=""/>
                     <pic:cNvPicPr/>
                   </pic:nvPicPr>
                   <pic:blipFill>
@@ -14034,7 +14043,7 @@
           <w:sz w:val="27"/>
         </w:rPr>
       </w:pPr>
-      <w:bookmarkStart w:id="25" w:name="_Toc240034029"/>
+      <w:bookmarkStart w:id="25" w:name="_Toc240035170"/>
       <w:r>
         <w:rPr>
           <w:rFonts w:ascii="Montserrat" w:hAnsi="Montserrat"/>
@@ -14075,16 +14084,16 @@
         </w:rPr>
         <w:lastRenderedPageBreak/>
         <w:drawing>
-          <wp:inline distT="0" distB="0" distL="0" distR="0" wp14:anchorId="1EA72D07" wp14:editId="76C41FB2">
+          <wp:inline distT="0" distB="0" distL="0" distR="0" wp14:anchorId="42636378" wp14:editId="71573535">
             <wp:extent cx="5120640" cy="4627581"/>
             <wp:effectExtent l="19050" t="19050" r="22860" b="20955"/>
-            <wp:docPr id="1165010250" name="Imagem 18"/>
+            <wp:docPr id="1332011445" name="Imagem 18"/>
             <wp:cNvGraphicFramePr/>
             <a:graphic xmlns:a="http://schemas.openxmlformats.org/drawingml/2006/main">
               <a:graphicData uri="http://schemas.openxmlformats.org/drawingml/2006/picture">
                 <pic:pic xmlns:pic="http://schemas.openxmlformats.org/drawingml/2006/picture">
                   <pic:nvPicPr>
-                    <pic:cNvPr id="1165010250" name=""/>
+                    <pic:cNvPr id="1332011445" name=""/>
                     <pic:cNvPicPr/>
                   </pic:nvPicPr>
                   <pic:blipFill>
@@ -14152,16 +14161,16 @@
         </w:rPr>
         <w:lastRenderedPageBreak/>
         <w:drawing>
-          <wp:inline distT="0" distB="0" distL="0" distR="0" wp14:anchorId="0DD9A076" wp14:editId="67B76923">
+          <wp:inline distT="0" distB="0" distL="0" distR="0" wp14:anchorId="3262D8E6" wp14:editId="5BE35589">
             <wp:extent cx="5120640" cy="4627581"/>
             <wp:effectExtent l="19050" t="19050" r="22860" b="20955"/>
-            <wp:docPr id="169452567" name="Imagem 19"/>
+            <wp:docPr id="501659762" name="Imagem 19"/>
             <wp:cNvGraphicFramePr/>
             <a:graphic xmlns:a="http://schemas.openxmlformats.org/drawingml/2006/main">
               <a:graphicData uri="http://schemas.openxmlformats.org/drawingml/2006/picture">
                 <pic:pic xmlns:pic="http://schemas.openxmlformats.org/drawingml/2006/picture">
                   <pic:nvPicPr>
-                    <pic:cNvPr id="169452567" name=""/>
+                    <pic:cNvPr id="501659762" name=""/>
                     <pic:cNvPicPr/>
                   </pic:nvPicPr>
                   <pic:blipFill>
@@ -14344,7 +14353,7 @@
           <w:sz w:val="27"/>
         </w:rPr>
       </w:pPr>
-      <w:bookmarkStart w:id="26" w:name="_Toc240034030"/>
+      <w:bookmarkStart w:id="26" w:name="_Toc240035171"/>
       <w:r>
         <w:rPr>
           <w:rFonts w:ascii="Montserrat" w:hAnsi="Montserrat"/>
@@ -14384,16 +14393,16 @@
           <w:noProof/>
         </w:rPr>
         <w:drawing>
-          <wp:inline distT="0" distB="0" distL="0" distR="0" wp14:anchorId="431B1423" wp14:editId="701CCAF7">
+          <wp:inline distT="0" distB="0" distL="0" distR="0" wp14:anchorId="679B08E0" wp14:editId="7FC96B41">
             <wp:extent cx="5120640" cy="4627581"/>
             <wp:effectExtent l="19050" t="19050" r="22860" b="20955"/>
-            <wp:docPr id="949677579" name="Imagem 20"/>
+            <wp:docPr id="637101353" name="Imagem 20"/>
             <wp:cNvGraphicFramePr/>
             <a:graphic xmlns:a="http://schemas.openxmlformats.org/drawingml/2006/main">
               <a:graphicData uri="http://schemas.openxmlformats.org/drawingml/2006/picture">
                 <pic:pic xmlns:pic="http://schemas.openxmlformats.org/drawingml/2006/picture">
                   <pic:nvPicPr>
-                    <pic:cNvPr id="949677579" name=""/>
+                    <pic:cNvPr id="637101353" name=""/>
                     <pic:cNvPicPr/>
                   </pic:nvPicPr>
                   <pic:blipFill>
@@ -14461,16 +14470,16 @@
         </w:rPr>
         <w:lastRenderedPageBreak/>
         <w:drawing>
-          <wp:inline distT="0" distB="0" distL="0" distR="0" wp14:anchorId="0485E6DC" wp14:editId="35B67CB4">
+          <wp:inline distT="0" distB="0" distL="0" distR="0" wp14:anchorId="3B4075FE" wp14:editId="5E086BF2">
             <wp:extent cx="5120640" cy="4627581"/>
             <wp:effectExtent l="19050" t="19050" r="22860" b="20955"/>
-            <wp:docPr id="160396158" name="Imagem 21"/>
+            <wp:docPr id="1409470578" name="Imagem 21"/>
             <wp:cNvGraphicFramePr/>
             <a:graphic xmlns:a="http://schemas.openxmlformats.org/drawingml/2006/main">
               <a:graphicData uri="http://schemas.openxmlformats.org/drawingml/2006/picture">
                 <pic:pic xmlns:pic="http://schemas.openxmlformats.org/drawingml/2006/picture">
                   <pic:nvPicPr>
-                    <pic:cNvPr id="160396158" name=""/>
+                    <pic:cNvPr id="1409470578" name=""/>
                     <pic:cNvPicPr/>
                   </pic:nvPicPr>
                   <pic:blipFill>
@@ -14676,16 +14685,16 @@
           <w:noProof/>
         </w:rPr>
         <w:drawing>
-          <wp:inline distT="0" distB="0" distL="0" distR="0" wp14:anchorId="275B1FF8" wp14:editId="4F985387">
+          <wp:inline distT="0" distB="0" distL="0" distR="0" wp14:anchorId="3C325BB3" wp14:editId="179F7E57">
             <wp:extent cx="5120640" cy="1757287"/>
             <wp:effectExtent l="19050" t="19050" r="22860" b="14605"/>
-            <wp:docPr id="1027622607" name="Imagem 22"/>
+            <wp:docPr id="255469244" name="Imagem 22"/>
             <wp:cNvGraphicFramePr/>
             <a:graphic xmlns:a="http://schemas.openxmlformats.org/drawingml/2006/main">
               <a:graphicData uri="http://schemas.openxmlformats.org/drawingml/2006/picture">
                 <pic:pic xmlns:pic="http://schemas.openxmlformats.org/drawingml/2006/picture">
                   <pic:nvPicPr>
-                    <pic:cNvPr id="1027622607" name=""/>
+                    <pic:cNvPr id="255469244" name=""/>
                     <pic:cNvPicPr/>
                   </pic:nvPicPr>
                   <pic:blipFill>
@@ -14798,7 +14807,7 @@
           <w:sz w:val="27"/>
         </w:rPr>
       </w:pPr>
-      <w:bookmarkStart w:id="27" w:name="_Toc240034031"/>
+      <w:bookmarkStart w:id="27" w:name="_Toc240035172"/>
       <w:r>
         <w:rPr>
           <w:rFonts w:ascii="Montserrat" w:hAnsi="Montserrat"/>
@@ -14839,16 +14848,16 @@
         </w:rPr>
         <w:lastRenderedPageBreak/>
         <w:drawing>
-          <wp:inline distT="0" distB="0" distL="0" distR="0" wp14:anchorId="298D8501" wp14:editId="1715519E">
+          <wp:inline distT="0" distB="0" distL="0" distR="0" wp14:anchorId="3488100A" wp14:editId="02E0C70D">
             <wp:extent cx="5120640" cy="4627581"/>
             <wp:effectExtent l="19050" t="19050" r="22860" b="20955"/>
-            <wp:docPr id="690232045" name="Imagem 23"/>
+            <wp:docPr id="1354685548" name="Imagem 23"/>
             <wp:cNvGraphicFramePr/>
             <a:graphic xmlns:a="http://schemas.openxmlformats.org/drawingml/2006/main">
               <a:graphicData uri="http://schemas.openxmlformats.org/drawingml/2006/picture">
                 <pic:pic xmlns:pic="http://schemas.openxmlformats.org/drawingml/2006/picture">
                   <pic:nvPicPr>
-                    <pic:cNvPr id="690232045" name=""/>
+                    <pic:cNvPr id="1354685548" name=""/>
                     <pic:cNvPicPr/>
                   </pic:nvPicPr>
                   <pic:blipFill>
@@ -14916,16 +14925,16 @@
         </w:rPr>
         <w:lastRenderedPageBreak/>
         <w:drawing>
-          <wp:inline distT="0" distB="0" distL="0" distR="0" wp14:anchorId="0F71F02C" wp14:editId="238C501A">
+          <wp:inline distT="0" distB="0" distL="0" distR="0" wp14:anchorId="61E0B073" wp14:editId="50E46515">
             <wp:extent cx="5120640" cy="4627581"/>
             <wp:effectExtent l="19050" t="19050" r="22860" b="20955"/>
-            <wp:docPr id="581774097" name="Imagem 24"/>
+            <wp:docPr id="1733035024" name="Imagem 24"/>
             <wp:cNvGraphicFramePr/>
             <a:graphic xmlns:a="http://schemas.openxmlformats.org/drawingml/2006/main">
               <a:graphicData uri="http://schemas.openxmlformats.org/drawingml/2006/picture">
                 <pic:pic xmlns:pic="http://schemas.openxmlformats.org/drawingml/2006/picture">
                   <pic:nvPicPr>
-                    <pic:cNvPr id="581774097" name=""/>
+                    <pic:cNvPr id="1733035024" name=""/>
                     <pic:cNvPicPr/>
                   </pic:nvPicPr>
                   <pic:blipFill>
@@ -15162,7 +15171,7 @@
           <w:sz w:val="27"/>
         </w:rPr>
       </w:pPr>
-      <w:bookmarkStart w:id="28" w:name="_Toc240034032"/>
+      <w:bookmarkStart w:id="28" w:name="_Toc240035173"/>
       <w:r>
         <w:rPr>
           <w:rFonts w:ascii="Montserrat" w:hAnsi="Montserrat"/>
@@ -15202,16 +15211,16 @@
           <w:noProof/>
         </w:rPr>
         <w:drawing>
-          <wp:inline distT="0" distB="0" distL="0" distR="0" wp14:anchorId="0883B881" wp14:editId="0384425D">
+          <wp:inline distT="0" distB="0" distL="0" distR="0" wp14:anchorId="4A7EA117" wp14:editId="65259476">
             <wp:extent cx="5120640" cy="4627581"/>
             <wp:effectExtent l="19050" t="19050" r="22860" b="20955"/>
-            <wp:docPr id="1822403013" name="Imagem 25"/>
+            <wp:docPr id="1664760049" name="Imagem 25"/>
             <wp:cNvGraphicFramePr/>
             <a:graphic xmlns:a="http://schemas.openxmlformats.org/drawingml/2006/main">
               <a:graphicData uri="http://schemas.openxmlformats.org/drawingml/2006/picture">
                 <pic:pic xmlns:pic="http://schemas.openxmlformats.org/drawingml/2006/picture">
                   <pic:nvPicPr>
-                    <pic:cNvPr id="1822403013" name=""/>
+                    <pic:cNvPr id="1664760049" name=""/>
                     <pic:cNvPicPr/>
                   </pic:nvPicPr>
                   <pic:blipFill>
@@ -15279,16 +15288,16 @@
         </w:rPr>
         <w:lastRenderedPageBreak/>
         <w:drawing>
-          <wp:inline distT="0" distB="0" distL="0" distR="0" wp14:anchorId="3ECEFAD2" wp14:editId="4D2402FD">
+          <wp:inline distT="0" distB="0" distL="0" distR="0" wp14:anchorId="4D435197" wp14:editId="5FA37386">
             <wp:extent cx="5120640" cy="4627581"/>
             <wp:effectExtent l="19050" t="19050" r="22860" b="20955"/>
-            <wp:docPr id="1741618214" name="Imagem 26"/>
+            <wp:docPr id="415852123" name="Imagem 26"/>
             <wp:cNvGraphicFramePr/>
             <a:graphic xmlns:a="http://schemas.openxmlformats.org/drawingml/2006/main">
               <a:graphicData uri="http://schemas.openxmlformats.org/drawingml/2006/picture">
                 <pic:pic xmlns:pic="http://schemas.openxmlformats.org/drawingml/2006/picture">
                   <pic:nvPicPr>
-                    <pic:cNvPr id="1741618214" name=""/>
+                    <pic:cNvPr id="415852123" name=""/>
                     <pic:cNvPicPr/>
                   </pic:nvPicPr>
                   <pic:blipFill>
@@ -15479,7 +15488,7 @@
           <w:sz w:val="27"/>
         </w:rPr>
       </w:pPr>
-      <w:bookmarkStart w:id="29" w:name="_Toc240034033"/>
+      <w:bookmarkStart w:id="29" w:name="_Toc240035174"/>
       <w:r>
         <w:rPr>
           <w:rFonts w:ascii="Montserrat" w:hAnsi="Montserrat"/>
@@ -15519,16 +15528,16 @@
           <w:noProof/>
         </w:rPr>
         <w:drawing>
-          <wp:inline distT="0" distB="0" distL="0" distR="0" wp14:anchorId="1A91A27B" wp14:editId="72E72C35">
+          <wp:inline distT="0" distB="0" distL="0" distR="0" wp14:anchorId="54528CA6" wp14:editId="6956B382">
             <wp:extent cx="5120640" cy="4000682"/>
             <wp:effectExtent l="19050" t="19050" r="22860" b="19050"/>
-            <wp:docPr id="1745138168" name="Imagem 27"/>
+            <wp:docPr id="1177845908" name="Imagem 27"/>
             <wp:cNvGraphicFramePr/>
             <a:graphic xmlns:a="http://schemas.openxmlformats.org/drawingml/2006/main">
               <a:graphicData uri="http://schemas.openxmlformats.org/drawingml/2006/picture">
                 <pic:pic xmlns:pic="http://schemas.openxmlformats.org/drawingml/2006/picture">
                   <pic:nvPicPr>
-                    <pic:cNvPr id="1745138168" name=""/>
+                    <pic:cNvPr id="1177845908" name=""/>
                     <pic:cNvPicPr/>
                   </pic:nvPicPr>
                   <pic:blipFill>
@@ -16052,7 +16061,7 @@
           <w:sz w:val="34"/>
         </w:rPr>
       </w:pPr>
-      <w:bookmarkStart w:id="30" w:name="_Toc240034034"/>
+      <w:bookmarkStart w:id="30" w:name="_Toc240035175"/>
       <w:r>
         <w:rPr>
           <w:rFonts w:ascii="Montserrat" w:hAnsi="Montserrat"/>
@@ -16094,7 +16103,7 @@
           <w:sz w:val="27"/>
         </w:rPr>
       </w:pPr>
-      <w:bookmarkStart w:id="31" w:name="_Toc240034035"/>
+      <w:bookmarkStart w:id="31" w:name="_Toc240035176"/>
       <w:r>
         <w:rPr>
           <w:rFonts w:ascii="Montserrat" w:hAnsi="Montserrat"/>
@@ -16134,16 +16143,16 @@
           <w:noProof/>
         </w:rPr>
         <w:drawing>
-          <wp:inline distT="0" distB="0" distL="0" distR="0" wp14:anchorId="08280C58" wp14:editId="1AFFE178">
+          <wp:inline distT="0" distB="0" distL="0" distR="0" wp14:anchorId="28DAA701" wp14:editId="760E4B44">
             <wp:extent cx="5120640" cy="4627581"/>
             <wp:effectExtent l="19050" t="19050" r="22860" b="20955"/>
-            <wp:docPr id="2092401392" name="Imagem 28"/>
+            <wp:docPr id="1587206896" name="Imagem 28"/>
             <wp:cNvGraphicFramePr/>
             <a:graphic xmlns:a="http://schemas.openxmlformats.org/drawingml/2006/main">
               <a:graphicData uri="http://schemas.openxmlformats.org/drawingml/2006/picture">
                 <pic:pic xmlns:pic="http://schemas.openxmlformats.org/drawingml/2006/picture">
                   <pic:nvPicPr>
-                    <pic:cNvPr id="2092401392" name=""/>
+                    <pic:cNvPr id="1587206896" name=""/>
                     <pic:cNvPicPr/>
                   </pic:nvPicPr>
                   <pic:blipFill>
@@ -16211,16 +16220,16 @@
         </w:rPr>
         <w:lastRenderedPageBreak/>
         <w:drawing>
-          <wp:inline distT="0" distB="0" distL="0" distR="0" wp14:anchorId="10857520" wp14:editId="1BE46FE3">
+          <wp:inline distT="0" distB="0" distL="0" distR="0" wp14:anchorId="0BB92B17" wp14:editId="29F3DDF3">
             <wp:extent cx="5120640" cy="4627581"/>
             <wp:effectExtent l="19050" t="19050" r="22860" b="20955"/>
-            <wp:docPr id="1010473400" name="Imagem 29"/>
+            <wp:docPr id="1490814685" name="Imagem 29"/>
             <wp:cNvGraphicFramePr/>
             <a:graphic xmlns:a="http://schemas.openxmlformats.org/drawingml/2006/main">
               <a:graphicData uri="http://schemas.openxmlformats.org/drawingml/2006/picture">
                 <pic:pic xmlns:pic="http://schemas.openxmlformats.org/drawingml/2006/picture">
                   <pic:nvPicPr>
-                    <pic:cNvPr id="1010473400" name=""/>
+                    <pic:cNvPr id="1490814685" name=""/>
                     <pic:cNvPicPr/>
                   </pic:nvPicPr>
                   <pic:blipFill>
@@ -16288,16 +16297,16 @@
         </w:rPr>
         <w:lastRenderedPageBreak/>
         <w:drawing>
-          <wp:inline distT="0" distB="0" distL="0" distR="0" wp14:anchorId="62C392CC" wp14:editId="1C6AFD04">
+          <wp:inline distT="0" distB="0" distL="0" distR="0" wp14:anchorId="4781C065" wp14:editId="0ACC4B03">
             <wp:extent cx="5120640" cy="4627581"/>
             <wp:effectExtent l="19050" t="19050" r="22860" b="20955"/>
-            <wp:docPr id="1796976802" name="Imagem 30"/>
+            <wp:docPr id="581221914" name="Imagem 30"/>
             <wp:cNvGraphicFramePr/>
             <a:graphic xmlns:a="http://schemas.openxmlformats.org/drawingml/2006/main">
               <a:graphicData uri="http://schemas.openxmlformats.org/drawingml/2006/picture">
                 <pic:pic xmlns:pic="http://schemas.openxmlformats.org/drawingml/2006/picture">
                   <pic:nvPicPr>
-                    <pic:cNvPr id="1796976802" name=""/>
+                    <pic:cNvPr id="581221914" name=""/>
                     <pic:cNvPicPr/>
                   </pic:nvPicPr>
                   <pic:blipFill>
@@ -16499,16 +16508,16 @@
           <w:noProof/>
         </w:rPr>
         <w:drawing>
-          <wp:inline distT="0" distB="0" distL="0" distR="0" wp14:anchorId="7451E575" wp14:editId="010D8D2A">
+          <wp:inline distT="0" distB="0" distL="0" distR="0" wp14:anchorId="0E0A704A" wp14:editId="01CC7E09">
             <wp:extent cx="5120640" cy="1715571"/>
             <wp:effectExtent l="19050" t="19050" r="22860" b="18415"/>
-            <wp:docPr id="196636988" name="Imagem 31"/>
+            <wp:docPr id="26579223" name="Imagem 31"/>
             <wp:cNvGraphicFramePr/>
             <a:graphic xmlns:a="http://schemas.openxmlformats.org/drawingml/2006/main">
               <a:graphicData uri="http://schemas.openxmlformats.org/drawingml/2006/picture">
                 <pic:pic xmlns:pic="http://schemas.openxmlformats.org/drawingml/2006/picture">
                   <pic:nvPicPr>
-                    <pic:cNvPr id="196636988" name=""/>
+                    <pic:cNvPr id="26579223" name=""/>
                     <pic:cNvPicPr/>
                   </pic:nvPicPr>
                   <pic:blipFill>
@@ -16645,16 +16654,16 @@
           <w:noProof/>
         </w:rPr>
         <w:drawing>
-          <wp:inline distT="0" distB="0" distL="0" distR="0" wp14:anchorId="0BDC082C" wp14:editId="5B9BCB83">
+          <wp:inline distT="0" distB="0" distL="0" distR="0" wp14:anchorId="21EAE8F8" wp14:editId="585DF202">
             <wp:extent cx="5120640" cy="3282818"/>
             <wp:effectExtent l="19050" t="19050" r="22860" b="13335"/>
-            <wp:docPr id="1037821626" name="Imagem 32"/>
+            <wp:docPr id="1381737326" name="Imagem 32"/>
             <wp:cNvGraphicFramePr/>
             <a:graphic xmlns:a="http://schemas.openxmlformats.org/drawingml/2006/main">
               <a:graphicData uri="http://schemas.openxmlformats.org/drawingml/2006/picture">
                 <pic:pic xmlns:pic="http://schemas.openxmlformats.org/drawingml/2006/picture">
                   <pic:nvPicPr>
-                    <pic:cNvPr id="1037821626" name=""/>
+                    <pic:cNvPr id="1381737326" name=""/>
                     <pic:cNvPicPr/>
                   </pic:nvPicPr>
                   <pic:blipFill>
@@ -16788,16 +16797,16 @@
           <w:noProof/>
         </w:rPr>
         <w:drawing>
-          <wp:inline distT="0" distB="0" distL="0" distR="0" wp14:anchorId="0ABAE032" wp14:editId="3D078FEF">
+          <wp:inline distT="0" distB="0" distL="0" distR="0" wp14:anchorId="510243BD" wp14:editId="71D8D556">
             <wp:extent cx="5120640" cy="951357"/>
             <wp:effectExtent l="19050" t="19050" r="22860" b="20320"/>
-            <wp:docPr id="318076052" name="Imagem 33"/>
+            <wp:docPr id="1085715149" name="Imagem 33"/>
             <wp:cNvGraphicFramePr/>
             <a:graphic xmlns:a="http://schemas.openxmlformats.org/drawingml/2006/main">
               <a:graphicData uri="http://schemas.openxmlformats.org/drawingml/2006/picture">
                 <pic:pic xmlns:pic="http://schemas.openxmlformats.org/drawingml/2006/picture">
                   <pic:nvPicPr>
-                    <pic:cNvPr id="318076052" name=""/>
+                    <pic:cNvPr id="1085715149" name=""/>
                     <pic:cNvPicPr/>
                   </pic:nvPicPr>
                   <pic:blipFill>
@@ -16909,16 +16918,16 @@
           <w:noProof/>
         </w:rPr>
         <w:drawing>
-          <wp:inline distT="0" distB="0" distL="0" distR="0" wp14:anchorId="5D81EAF9" wp14:editId="5A3FDBEA">
+          <wp:inline distT="0" distB="0" distL="0" distR="0" wp14:anchorId="2AFCAFEC" wp14:editId="09E467D4">
             <wp:extent cx="5120640" cy="1515102"/>
             <wp:effectExtent l="19050" t="19050" r="22860" b="28575"/>
-            <wp:docPr id="1648639830" name="Imagem 34"/>
+            <wp:docPr id="653604005" name="Imagem 34"/>
             <wp:cNvGraphicFramePr/>
             <a:graphic xmlns:a="http://schemas.openxmlformats.org/drawingml/2006/main">
               <a:graphicData uri="http://schemas.openxmlformats.org/drawingml/2006/picture">
                 <pic:pic xmlns:pic="http://schemas.openxmlformats.org/drawingml/2006/picture">
                   <pic:nvPicPr>
-                    <pic:cNvPr id="1648639830" name=""/>
+                    <pic:cNvPr id="653604005" name=""/>
                     <pic:cNvPicPr/>
                   </pic:nvPicPr>
                   <pic:blipFill>
@@ -17031,16 +17040,16 @@
           <w:noProof/>
         </w:rPr>
         <w:drawing>
-          <wp:inline distT="0" distB="0" distL="0" distR="0" wp14:anchorId="611655C3" wp14:editId="13BC0861">
+          <wp:inline distT="0" distB="0" distL="0" distR="0" wp14:anchorId="131CB6BF" wp14:editId="1C536815">
             <wp:extent cx="5120640" cy="1391113"/>
             <wp:effectExtent l="19050" t="19050" r="22860" b="19050"/>
-            <wp:docPr id="479549102" name="Imagem 35"/>
+            <wp:docPr id="1868618847" name="Imagem 35"/>
             <wp:cNvGraphicFramePr/>
             <a:graphic xmlns:a="http://schemas.openxmlformats.org/drawingml/2006/main">
               <a:graphicData uri="http://schemas.openxmlformats.org/drawingml/2006/picture">
                 <pic:pic xmlns:pic="http://schemas.openxmlformats.org/drawingml/2006/picture">
                   <pic:nvPicPr>
-                    <pic:cNvPr id="479549102" name=""/>
+                    <pic:cNvPr id="1868618847" name=""/>
                     <pic:cNvPicPr/>
                   </pic:nvPicPr>
                   <pic:blipFill>
@@ -17152,16 +17161,16 @@
           <w:noProof/>
         </w:rPr>
         <w:drawing>
-          <wp:inline distT="0" distB="0" distL="0" distR="0" wp14:anchorId="2452E561" wp14:editId="13661522">
+          <wp:inline distT="0" distB="0" distL="0" distR="0" wp14:anchorId="6419DF2E" wp14:editId="3CF24F1A">
             <wp:extent cx="5120640" cy="1125174"/>
             <wp:effectExtent l="19050" t="19050" r="22860" b="18415"/>
-            <wp:docPr id="1827240642" name="Imagem 36"/>
+            <wp:docPr id="247186622" name="Imagem 36"/>
             <wp:cNvGraphicFramePr/>
             <a:graphic xmlns:a="http://schemas.openxmlformats.org/drawingml/2006/main">
               <a:graphicData uri="http://schemas.openxmlformats.org/drawingml/2006/picture">
                 <pic:pic xmlns:pic="http://schemas.openxmlformats.org/drawingml/2006/picture">
                   <pic:nvPicPr>
-                    <pic:cNvPr id="1827240642" name=""/>
+                    <pic:cNvPr id="247186622" name=""/>
                     <pic:cNvPicPr/>
                   </pic:nvPicPr>
                   <pic:blipFill>
@@ -17251,7 +17260,7 @@
           <w:sz w:val="27"/>
         </w:rPr>
       </w:pPr>
-      <w:bookmarkStart w:id="32" w:name="_Toc240034036"/>
+      <w:bookmarkStart w:id="32" w:name="_Toc240035177"/>
       <w:r>
         <w:rPr>
           <w:rFonts w:ascii="Montserrat" w:hAnsi="Montserrat"/>
@@ -17291,16 +17300,16 @@
           <w:noProof/>
         </w:rPr>
         <w:drawing>
-          <wp:inline distT="0" distB="0" distL="0" distR="0" wp14:anchorId="5EFBFBF4" wp14:editId="255DDC43">
+          <wp:inline distT="0" distB="0" distL="0" distR="0" wp14:anchorId="62C2EACA" wp14:editId="682A5CA6">
             <wp:extent cx="5120640" cy="4627581"/>
             <wp:effectExtent l="19050" t="19050" r="22860" b="20955"/>
-            <wp:docPr id="1772629228" name="Imagem 37"/>
+            <wp:docPr id="1733960264" name="Imagem 37"/>
             <wp:cNvGraphicFramePr/>
             <a:graphic xmlns:a="http://schemas.openxmlformats.org/drawingml/2006/main">
               <a:graphicData uri="http://schemas.openxmlformats.org/drawingml/2006/picture">
                 <pic:pic xmlns:pic="http://schemas.openxmlformats.org/drawingml/2006/picture">
                   <pic:nvPicPr>
-                    <pic:cNvPr id="1772629228" name=""/>
+                    <pic:cNvPr id="1733960264" name=""/>
                     <pic:cNvPicPr/>
                   </pic:nvPicPr>
                   <pic:blipFill>
@@ -17368,16 +17377,16 @@
         </w:rPr>
         <w:lastRenderedPageBreak/>
         <w:drawing>
-          <wp:inline distT="0" distB="0" distL="0" distR="0" wp14:anchorId="750E4F86" wp14:editId="491D160A">
+          <wp:inline distT="0" distB="0" distL="0" distR="0" wp14:anchorId="0AE5F2B0" wp14:editId="64750969">
             <wp:extent cx="5120640" cy="4627581"/>
             <wp:effectExtent l="19050" t="19050" r="22860" b="20955"/>
-            <wp:docPr id="2078935728" name="Imagem 38"/>
+            <wp:docPr id="1259810" name="Imagem 38"/>
             <wp:cNvGraphicFramePr/>
             <a:graphic xmlns:a="http://schemas.openxmlformats.org/drawingml/2006/main">
               <a:graphicData uri="http://schemas.openxmlformats.org/drawingml/2006/picture">
                 <pic:pic xmlns:pic="http://schemas.openxmlformats.org/drawingml/2006/picture">
                   <pic:nvPicPr>
-                    <pic:cNvPr id="2078935728" name=""/>
+                    <pic:cNvPr id="1259810" name=""/>
                     <pic:cNvPicPr/>
                   </pic:nvPicPr>
                   <pic:blipFill>
@@ -17546,16 +17555,16 @@
           <w:noProof/>
         </w:rPr>
         <w:drawing>
-          <wp:inline distT="0" distB="0" distL="0" distR="0" wp14:anchorId="2CD98ED6" wp14:editId="627C6F21">
+          <wp:inline distT="0" distB="0" distL="0" distR="0" wp14:anchorId="19F61914" wp14:editId="768B98C9">
             <wp:extent cx="5120640" cy="2144319"/>
             <wp:effectExtent l="19050" t="19050" r="22860" b="27940"/>
-            <wp:docPr id="1363464281" name="Imagem 39"/>
+            <wp:docPr id="829603843" name="Imagem 39"/>
             <wp:cNvGraphicFramePr/>
             <a:graphic xmlns:a="http://schemas.openxmlformats.org/drawingml/2006/main">
               <a:graphicData uri="http://schemas.openxmlformats.org/drawingml/2006/picture">
                 <pic:pic xmlns:pic="http://schemas.openxmlformats.org/drawingml/2006/picture">
                   <pic:nvPicPr>
-                    <pic:cNvPr id="1363464281" name=""/>
+                    <pic:cNvPr id="829603843" name=""/>
                     <pic:cNvPicPr/>
                   </pic:nvPicPr>
                   <pic:blipFill>
@@ -17643,16 +17652,16 @@
           <w:noProof/>
         </w:rPr>
         <w:drawing>
-          <wp:inline distT="0" distB="0" distL="0" distR="0" wp14:anchorId="1F2C26CF" wp14:editId="29F54349">
+          <wp:inline distT="0" distB="0" distL="0" distR="0" wp14:anchorId="1A05AA08" wp14:editId="50A43F0E">
             <wp:extent cx="5120640" cy="1055647"/>
             <wp:effectExtent l="19050" t="19050" r="22860" b="11430"/>
-            <wp:docPr id="1772449918" name="Imagem 40"/>
+            <wp:docPr id="658019692" name="Imagem 40"/>
             <wp:cNvGraphicFramePr/>
             <a:graphic xmlns:a="http://schemas.openxmlformats.org/drawingml/2006/main">
               <a:graphicData uri="http://schemas.openxmlformats.org/drawingml/2006/picture">
                 <pic:pic xmlns:pic="http://schemas.openxmlformats.org/drawingml/2006/picture">
                   <pic:nvPicPr>
-                    <pic:cNvPr id="1772449918" name=""/>
+                    <pic:cNvPr id="658019692" name=""/>
                     <pic:cNvPicPr/>
                   </pic:nvPicPr>
                   <pic:blipFill>
@@ -17774,16 +17783,16 @@
           <w:noProof/>
         </w:rPr>
         <w:drawing>
-          <wp:inline distT="0" distB="0" distL="0" distR="0" wp14:anchorId="5AE3F3C4" wp14:editId="4C5685C9">
+          <wp:inline distT="0" distB="0" distL="0" distR="0" wp14:anchorId="0DB04D7A" wp14:editId="23099018">
             <wp:extent cx="5120640" cy="3282818"/>
             <wp:effectExtent l="19050" t="19050" r="22860" b="13335"/>
-            <wp:docPr id="980008565" name="Imagem 41"/>
+            <wp:docPr id="469899625" name="Imagem 41"/>
             <wp:cNvGraphicFramePr/>
             <a:graphic xmlns:a="http://schemas.openxmlformats.org/drawingml/2006/main">
               <a:graphicData uri="http://schemas.openxmlformats.org/drawingml/2006/picture">
                 <pic:pic xmlns:pic="http://schemas.openxmlformats.org/drawingml/2006/picture">
                   <pic:nvPicPr>
-                    <pic:cNvPr id="980008565" name=""/>
+                    <pic:cNvPr id="469899625" name=""/>
                     <pic:cNvPicPr/>
                   </pic:nvPicPr>
                   <pic:blipFill>
@@ -17917,16 +17926,16 @@
         </w:rPr>
         <w:lastRenderedPageBreak/>
         <w:drawing>
-          <wp:inline distT="0" distB="0" distL="0" distR="0" wp14:anchorId="06AB502A" wp14:editId="50291265">
+          <wp:inline distT="0" distB="0" distL="0" distR="0" wp14:anchorId="5677AEF4" wp14:editId="4314A18C">
             <wp:extent cx="5120640" cy="1978034"/>
             <wp:effectExtent l="19050" t="19050" r="22860" b="22225"/>
-            <wp:docPr id="1977856660" name="Imagem 42"/>
+            <wp:docPr id="53049441" name="Imagem 42"/>
             <wp:cNvGraphicFramePr/>
             <a:graphic xmlns:a="http://schemas.openxmlformats.org/drawingml/2006/main">
               <a:graphicData uri="http://schemas.openxmlformats.org/drawingml/2006/picture">
                 <pic:pic xmlns:pic="http://schemas.openxmlformats.org/drawingml/2006/picture">
                   <pic:nvPicPr>
-                    <pic:cNvPr id="1977856660" name=""/>
+                    <pic:cNvPr id="53049441" name=""/>
                     <pic:cNvPicPr/>
                   </pic:nvPicPr>
                   <pic:blipFill>
@@ -17998,7 +18007,7 @@
           <w:sz w:val="34"/>
         </w:rPr>
       </w:pPr>
-      <w:bookmarkStart w:id="33" w:name="_Toc240034037"/>
+      <w:bookmarkStart w:id="33" w:name="_Toc240035178"/>
       <w:r>
         <w:rPr>
           <w:rFonts w:ascii="Montserrat" w:hAnsi="Montserrat"/>
@@ -18058,7 +18067,7 @@
           <w:sz w:val="27"/>
         </w:rPr>
       </w:pPr>
-      <w:bookmarkStart w:id="34" w:name="_Toc240034038"/>
+      <w:bookmarkStart w:id="34" w:name="_Toc240035179"/>
       <w:r>
         <w:rPr>
           <w:rFonts w:ascii="Montserrat" w:hAnsi="Montserrat"/>
@@ -18098,16 +18107,16 @@
           <w:noProof/>
         </w:rPr>
         <w:drawing>
-          <wp:inline distT="0" distB="0" distL="0" distR="0" wp14:anchorId="4AC9FF02" wp14:editId="0B8B04B9">
+          <wp:inline distT="0" distB="0" distL="0" distR="0" wp14:anchorId="114FE96C" wp14:editId="648EE47A">
             <wp:extent cx="5303520" cy="4792851"/>
             <wp:effectExtent l="19050" t="19050" r="11430" b="27305"/>
-            <wp:docPr id="510505574" name="Imagem 43"/>
+            <wp:docPr id="1113003508" name="Imagem 43"/>
             <wp:cNvGraphicFramePr/>
             <a:graphic xmlns:a="http://schemas.openxmlformats.org/drawingml/2006/main">
               <a:graphicData uri="http://schemas.openxmlformats.org/drawingml/2006/picture">
                 <pic:pic xmlns:pic="http://schemas.openxmlformats.org/drawingml/2006/picture">
                   <pic:nvPicPr>
-                    <pic:cNvPr id="510505574" name=""/>
+                    <pic:cNvPr id="1113003508" name=""/>
                     <pic:cNvPicPr/>
                   </pic:nvPicPr>
                   <pic:blipFill>
@@ -18176,7 +18185,7 @@
           <w:sz w:val="27"/>
         </w:rPr>
       </w:pPr>
-      <w:bookmarkStart w:id="35" w:name="_Toc240034039"/>
+      <w:bookmarkStart w:id="35" w:name="_Toc240035180"/>
       <w:r>
         <w:rPr>
           <w:rFonts w:ascii="Montserrat" w:hAnsi="Montserrat"/>
@@ -18216,16 +18225,16 @@
           <w:noProof/>
         </w:rPr>
         <w:drawing>
-          <wp:inline distT="0" distB="0" distL="0" distR="0" wp14:anchorId="679D9FE6" wp14:editId="1C60352C">
+          <wp:inline distT="0" distB="0" distL="0" distR="0" wp14:anchorId="21DAD6F3" wp14:editId="6A2477D1">
             <wp:extent cx="5303520" cy="4792851"/>
             <wp:effectExtent l="19050" t="19050" r="11430" b="27305"/>
-            <wp:docPr id="1558477473" name="Imagem 44"/>
+            <wp:docPr id="1147471198" name="Imagem 44"/>
             <wp:cNvGraphicFramePr/>
             <a:graphic xmlns:a="http://schemas.openxmlformats.org/drawingml/2006/main">
               <a:graphicData uri="http://schemas.openxmlformats.org/drawingml/2006/picture">
                 <pic:pic xmlns:pic="http://schemas.openxmlformats.org/drawingml/2006/picture">
                   <pic:nvPicPr>
-                    <pic:cNvPr id="1558477473" name=""/>
+                    <pic:cNvPr id="1147471198" name=""/>
                     <pic:cNvPicPr/>
                   </pic:nvPicPr>
                   <pic:blipFill>
@@ -18293,7 +18302,7 @@
           <w:sz w:val="27"/>
         </w:rPr>
       </w:pPr>
-      <w:bookmarkStart w:id="36" w:name="_Toc240034040"/>
+      <w:bookmarkStart w:id="36" w:name="_Toc240035181"/>
       <w:r>
         <w:rPr>
           <w:rFonts w:ascii="Montserrat" w:hAnsi="Montserrat"/>
@@ -18334,16 +18343,16 @@
         </w:rPr>
         <w:lastRenderedPageBreak/>
         <w:drawing>
-          <wp:inline distT="0" distB="0" distL="0" distR="0" wp14:anchorId="67793CCB" wp14:editId="7A223F27">
+          <wp:inline distT="0" distB="0" distL="0" distR="0" wp14:anchorId="2BA5A82B" wp14:editId="112E1DCE">
             <wp:extent cx="5303520" cy="4792851"/>
             <wp:effectExtent l="19050" t="19050" r="11430" b="27305"/>
-            <wp:docPr id="1459841954" name="Imagem 45"/>
+            <wp:docPr id="1979638144" name="Imagem 45"/>
             <wp:cNvGraphicFramePr/>
             <a:graphic xmlns:a="http://schemas.openxmlformats.org/drawingml/2006/main">
               <a:graphicData uri="http://schemas.openxmlformats.org/drawingml/2006/picture">
                 <pic:pic xmlns:pic="http://schemas.openxmlformats.org/drawingml/2006/picture">
                   <pic:nvPicPr>
-                    <pic:cNvPr id="1459841954" name=""/>
+                    <pic:cNvPr id="1979638144" name=""/>
                     <pic:cNvPicPr/>
                   </pic:nvPicPr>
                   <pic:blipFill>
@@ -18411,16 +18420,16 @@
         </w:rPr>
         <w:lastRenderedPageBreak/>
         <w:drawing>
-          <wp:inline distT="0" distB="0" distL="0" distR="0" wp14:anchorId="71FF6E94" wp14:editId="57B8AD46">
+          <wp:inline distT="0" distB="0" distL="0" distR="0" wp14:anchorId="27470B0D" wp14:editId="13C39452">
             <wp:extent cx="5303520" cy="4792851"/>
             <wp:effectExtent l="19050" t="19050" r="11430" b="27305"/>
-            <wp:docPr id="301768636" name="Imagem 46"/>
+            <wp:docPr id="809917914" name="Imagem 46"/>
             <wp:cNvGraphicFramePr/>
             <a:graphic xmlns:a="http://schemas.openxmlformats.org/drawingml/2006/main">
               <a:graphicData uri="http://schemas.openxmlformats.org/drawingml/2006/picture">
                 <pic:pic xmlns:pic="http://schemas.openxmlformats.org/drawingml/2006/picture">
                   <pic:nvPicPr>
-                    <pic:cNvPr id="301768636" name=""/>
+                    <pic:cNvPr id="809917914" name=""/>
                     <pic:cNvPicPr/>
                   </pic:nvPicPr>
                   <pic:blipFill>
@@ -18513,7 +18522,7 @@
           <w:sz w:val="34"/>
         </w:rPr>
       </w:pPr>
-      <w:bookmarkStart w:id="37" w:name="_Toc240034041"/>
+      <w:bookmarkStart w:id="37" w:name="_Toc240035182"/>
       <w:r>
         <w:rPr>
           <w:rFonts w:ascii="Montserrat" w:hAnsi="Montserrat"/>
@@ -18555,7 +18564,7 @@
           <w:sz w:val="27"/>
         </w:rPr>
       </w:pPr>
-      <w:bookmarkStart w:id="38" w:name="_Toc240034042"/>
+      <w:bookmarkStart w:id="38" w:name="_Toc240035183"/>
       <w:r>
         <w:rPr>
           <w:rFonts w:ascii="Montserrat" w:hAnsi="Montserrat"/>
@@ -18595,16 +18604,16 @@
           <w:noProof/>
         </w:rPr>
         <w:drawing>
-          <wp:inline distT="0" distB="0" distL="0" distR="0" wp14:anchorId="20CC567B" wp14:editId="25104D81">
+          <wp:inline distT="0" distB="0" distL="0" distR="0" wp14:anchorId="39B620D8" wp14:editId="005F97CE">
             <wp:extent cx="5303520" cy="4792851"/>
             <wp:effectExtent l="19050" t="19050" r="11430" b="27305"/>
-            <wp:docPr id="367474220" name="Imagem 47"/>
+            <wp:docPr id="1560284440" name="Imagem 47"/>
             <wp:cNvGraphicFramePr/>
             <a:graphic xmlns:a="http://schemas.openxmlformats.org/drawingml/2006/main">
               <a:graphicData uri="http://schemas.openxmlformats.org/drawingml/2006/picture">
                 <pic:pic xmlns:pic="http://schemas.openxmlformats.org/drawingml/2006/picture">
                   <pic:nvPicPr>
-                    <pic:cNvPr id="367474220" name=""/>
+                    <pic:cNvPr id="1560284440" name=""/>
                     <pic:cNvPicPr/>
                   </pic:nvPicPr>
                   <pic:blipFill>
@@ -18751,7 +18760,7 @@
           <w:sz w:val="27"/>
         </w:rPr>
       </w:pPr>
-      <w:bookmarkStart w:id="39" w:name="_Toc240034043"/>
+      <w:bookmarkStart w:id="39" w:name="_Toc240035184"/>
       <w:r>
         <w:rPr>
           <w:rFonts w:ascii="Montserrat" w:hAnsi="Montserrat"/>
@@ -18792,16 +18801,16 @@
         </w:rPr>
         <w:lastRenderedPageBreak/>
         <w:drawing>
-          <wp:inline distT="0" distB="0" distL="0" distR="0" wp14:anchorId="73EA56FD" wp14:editId="116256A3">
+          <wp:inline distT="0" distB="0" distL="0" distR="0" wp14:anchorId="63E5099D" wp14:editId="1E39C96B">
             <wp:extent cx="5303520" cy="4792851"/>
             <wp:effectExtent l="19050" t="19050" r="11430" b="27305"/>
-            <wp:docPr id="244810347" name="Imagem 48"/>
+            <wp:docPr id="1993849180" name="Imagem 48"/>
             <wp:cNvGraphicFramePr/>
             <a:graphic xmlns:a="http://schemas.openxmlformats.org/drawingml/2006/main">
               <a:graphicData uri="http://schemas.openxmlformats.org/drawingml/2006/picture">
                 <pic:pic xmlns:pic="http://schemas.openxmlformats.org/drawingml/2006/picture">
                   <pic:nvPicPr>
-                    <pic:cNvPr id="244810347" name=""/>
+                    <pic:cNvPr id="1993849180" name=""/>
                     <pic:cNvPicPr/>
                   </pic:nvPicPr>
                   <pic:blipFill>
@@ -18869,7 +18878,7 @@
           <w:sz w:val="27"/>
         </w:rPr>
       </w:pPr>
-      <w:bookmarkStart w:id="40" w:name="_Toc240034044"/>
+      <w:bookmarkStart w:id="40" w:name="_Toc240035185"/>
       <w:r>
         <w:rPr>
           <w:rFonts w:ascii="Montserrat" w:hAnsi="Montserrat"/>
@@ -18910,16 +18919,16 @@
         </w:rPr>
         <w:lastRenderedPageBreak/>
         <w:drawing>
-          <wp:inline distT="0" distB="0" distL="0" distR="0" wp14:anchorId="36221197" wp14:editId="6529D4B1">
+          <wp:inline distT="0" distB="0" distL="0" distR="0" wp14:anchorId="2A5C1A6E" wp14:editId="2FFA0B7E">
             <wp:extent cx="5303520" cy="4792851"/>
             <wp:effectExtent l="19050" t="19050" r="11430" b="27305"/>
-            <wp:docPr id="1425418375" name="Imagem 49"/>
+            <wp:docPr id="1319512932" name="Imagem 49"/>
             <wp:cNvGraphicFramePr/>
             <a:graphic xmlns:a="http://schemas.openxmlformats.org/drawingml/2006/main">
               <a:graphicData uri="http://schemas.openxmlformats.org/drawingml/2006/picture">
                 <pic:pic xmlns:pic="http://schemas.openxmlformats.org/drawingml/2006/picture">
                   <pic:nvPicPr>
-                    <pic:cNvPr id="1425418375" name=""/>
+                    <pic:cNvPr id="1319512932" name=""/>
                     <pic:cNvPicPr/>
                   </pic:nvPicPr>
                   <pic:blipFill>
@@ -19063,7 +19072,7 @@
           <w:sz w:val="27"/>
         </w:rPr>
       </w:pPr>
-      <w:bookmarkStart w:id="41" w:name="_Toc240034045"/>
+      <w:bookmarkStart w:id="41" w:name="_Toc240035186"/>
       <w:r>
         <w:rPr>
           <w:rFonts w:ascii="Montserrat" w:hAnsi="Montserrat"/>
@@ -19186,7 +19195,7 @@
           <w:color w:val="1A1A1A"/>
           <w:sz w:val="22"/>
         </w:rPr>
-        <w:t>Registros por formulario: uma linha por artefato (Canvas, TAP, Planejamento, EAP, SMP, Ata de Reuniao, TEP, RLA, alem da propria Solicitacao de Demanda), com o total e a contagem por status de cada um.</w:t>
+        <w:t>Custos por categoria (portfolio): tabela listando cada categoria de custo (casada pelo nome, o mesmo casamento do Comparativo por categoria do Relatorio de Situacao, secao 4.1) com em quantos projetos do portfolio ela tem estimativa no TAP e em quantos desses o Realizado ultrapassou o Estimado - para achar categorias que estouram o orcamento de forma sistematica, nao so num projeto isolado. So entram projetos com Projeto vinculado, custo estimado no TAP e custo realizado registrado.</w:t>
       </w:r>
     </w:p>
     <w:p>
@@ -19210,7 +19219,7 @@
           <w:color w:val="1A1A1A"/>
           <w:sz w:val="22"/>
         </w:rPr>
-        <w:t>Portfolio de projetos: contagem de projetos Aprovados, Encerrados (Concluido/Paralisado/Cancelado, via TEP), Reprovados e em avaliacao no Gate 1, a partir do cadastro compartilhado (secao 2.5).</w:t>
+        <w:t>Registros por formulario: uma linha por artefato (Canvas, TAP, Planejamento, EAP, SMP, Ata de Reuniao, TEP, RLA, alem da propria Solicitacao de Demanda), com o total e a contagem por status de cada um.</w:t>
       </w:r>
     </w:p>
     <w:p>
@@ -19234,16 +19243,32 @@
           <w:color w:val="1A1A1A"/>
           <w:sz w:val="22"/>
         </w:rPr>
-        <w:t xml:space="preserve">Visao atual por projeto: uma linha por projeto do cadastro compartilhado, com Status do cadastro, Situacao mais recente do Relatorio de Situacao (secao 4.1, com o percentual concluido quando ja reportado), Saude do projeto (secao 6.4.1) e Progresso do ciclo de vida - quantos dos 9 </w:t>
-      </w:r>
-      <w:r>
-        <w:rPr>
-          <w:rFonts w:ascii="Montserrat" w:hAnsi="Montserrat"/>
-          <w:color w:val="1A1A1A"/>
-          <w:sz w:val="22"/>
-        </w:rPr>
         <w:lastRenderedPageBreak/>
-        <w:t>formularios (Demanda a RLA) ja tem registro vinculado aquele projeto, com a lista do que ainda falta.</w:t>
+        <w:t>Portfolio de projetos: contagem de projetos Aprovados, Encerrados (Concluido/Paralisado/Cancelado, via TEP), Reprovados e em avaliacao no Gate 1, a partir do cadastro compartilhado (secao 2.5).</w:t>
+      </w:r>
+    </w:p>
+    <w:p>
+      <w:pPr>
+        <w:pStyle w:val="PargrafodaLista"/>
+        <w:numPr>
+          <w:ilvl w:val="0"/>
+          <w:numId w:val="27"/>
+        </w:numPr>
+        <w:spacing w:after="80" w:line="260" w:lineRule="auto"/>
+        <w:ind w:left="700"/>
+        <w:rPr>
+          <w:rFonts w:ascii="Montserrat" w:hAnsi="Montserrat"/>
+          <w:color w:val="1A1A1A"/>
+          <w:sz w:val="22"/>
+        </w:rPr>
+      </w:pPr>
+      <w:r>
+        <w:rPr>
+          <w:rFonts w:ascii="Montserrat" w:hAnsi="Montserrat"/>
+          <w:color w:val="1A1A1A"/>
+          <w:sz w:val="22"/>
+        </w:rPr>
+        <w:t>Visao atual por projeto: uma linha por projeto do cadastro compartilhado, com Status do cadastro, Situacao mais recente do Relatorio de Situacao (secao 4.1, com o percentual concluido quando ja reportado), Saude do projeto (secao 6.4.1) e Progresso do ciclo de vida - quantos dos 9 formularios (Demanda a RLA) ja tem registro vinculado aquele projeto, com a lista do que ainda falta.</w:t>
       </w:r>
     </w:p>
     <w:p>
@@ -19256,16 +19281,16 @@
           <w:noProof/>
         </w:rPr>
         <w:drawing>
-          <wp:inline distT="0" distB="0" distL="0" distR="0" wp14:anchorId="0094AF20" wp14:editId="7CF93C5D">
+          <wp:inline distT="0" distB="0" distL="0" distR="0" wp14:anchorId="463201AB" wp14:editId="4AAF29C7">
             <wp:extent cx="5303520" cy="4267180"/>
             <wp:effectExtent l="19050" t="19050" r="11430" b="19685"/>
-            <wp:docPr id="1845079203" name="Imagem 50"/>
+            <wp:docPr id="1779189776" name="Imagem 50"/>
             <wp:cNvGraphicFramePr/>
             <a:graphic xmlns:a="http://schemas.openxmlformats.org/drawingml/2006/main">
               <a:graphicData uri="http://schemas.openxmlformats.org/drawingml/2006/picture">
                 <pic:pic xmlns:pic="http://schemas.openxmlformats.org/drawingml/2006/picture">
                   <pic:nvPicPr>
-                    <pic:cNvPr id="1845079203" name=""/>
+                    <pic:cNvPr id="1779189776" name=""/>
                     <pic:cNvPicPr/>
                   </pic:nvPicPr>
                   <pic:blipFill>
@@ -19333,16 +19358,16 @@
         </w:rPr>
         <w:lastRenderedPageBreak/>
         <w:drawing>
-          <wp:inline distT="0" distB="0" distL="0" distR="0" wp14:anchorId="0048A0D9" wp14:editId="6047BC80">
+          <wp:inline distT="0" distB="0" distL="0" distR="0" wp14:anchorId="6D4349E7" wp14:editId="3E1729CD">
             <wp:extent cx="5303520" cy="3382059"/>
             <wp:effectExtent l="19050" t="19050" r="11430" b="27940"/>
-            <wp:docPr id="1786750469" name="Imagem 51"/>
+            <wp:docPr id="1632836271" name="Imagem 51"/>
             <wp:cNvGraphicFramePr/>
             <a:graphic xmlns:a="http://schemas.openxmlformats.org/drawingml/2006/main">
               <a:graphicData uri="http://schemas.openxmlformats.org/drawingml/2006/picture">
                 <pic:pic xmlns:pic="http://schemas.openxmlformats.org/drawingml/2006/picture">
                   <pic:nvPicPr>
-                    <pic:cNvPr id="1786750469" name=""/>
+                    <pic:cNvPr id="1632836271" name=""/>
                     <pic:cNvPicPr/>
                   </pic:nvPicPr>
                   <pic:blipFill>
@@ -19410,16 +19435,16 @@
         </w:rPr>
         <w:lastRenderedPageBreak/>
         <w:drawing>
-          <wp:inline distT="0" distB="0" distL="0" distR="0" wp14:anchorId="60B4CF15" wp14:editId="00CAAE3F">
+          <wp:inline distT="0" distB="0" distL="0" distR="0" wp14:anchorId="30B00978" wp14:editId="0CC14710">
             <wp:extent cx="5303520" cy="4417800"/>
             <wp:effectExtent l="19050" t="19050" r="11430" b="20955"/>
-            <wp:docPr id="1705330348" name="Imagem 52"/>
+            <wp:docPr id="662571132" name="Imagem 52"/>
             <wp:cNvGraphicFramePr/>
             <a:graphic xmlns:a="http://schemas.openxmlformats.org/drawingml/2006/main">
               <a:graphicData uri="http://schemas.openxmlformats.org/drawingml/2006/picture">
                 <pic:pic xmlns:pic="http://schemas.openxmlformats.org/drawingml/2006/picture">
                   <pic:nvPicPr>
-                    <pic:cNvPr id="1705330348" name=""/>
+                    <pic:cNvPr id="662571132" name=""/>
                     <pic:cNvPicPr/>
                   </pic:nvPicPr>
                   <pic:blipFill>
@@ -19529,7 +19554,7 @@
           <w:sz w:val="27"/>
         </w:rPr>
       </w:pPr>
-      <w:bookmarkStart w:id="42" w:name="_Toc240034046"/>
+      <w:bookmarkStart w:id="42" w:name="_Toc240035187"/>
       <w:r>
         <w:rPr>
           <w:rFonts w:ascii="Montserrat" w:hAnsi="Montserrat"/>
@@ -19747,16 +19772,16 @@
         </w:rPr>
         <w:lastRenderedPageBreak/>
         <w:drawing>
-          <wp:inline distT="0" distB="0" distL="0" distR="0" wp14:anchorId="239CC423" wp14:editId="72EC4BC3">
+          <wp:inline distT="0" distB="0" distL="0" distR="0" wp14:anchorId="65141FAC" wp14:editId="4CBBA449">
             <wp:extent cx="5303520" cy="7628836"/>
             <wp:effectExtent l="19050" t="19050" r="11430" b="10795"/>
-            <wp:docPr id="406104541" name="Imagem 53"/>
+            <wp:docPr id="1717165530" name="Imagem 53"/>
             <wp:cNvGraphicFramePr/>
             <a:graphic xmlns:a="http://schemas.openxmlformats.org/drawingml/2006/main">
               <a:graphicData uri="http://schemas.openxmlformats.org/drawingml/2006/picture">
                 <pic:pic xmlns:pic="http://schemas.openxmlformats.org/drawingml/2006/picture">
                   <pic:nvPicPr>
-                    <pic:cNvPr id="406104541" name=""/>
+                    <pic:cNvPr id="1717165530" name=""/>
                     <pic:cNvPicPr/>
                   </pic:nvPicPr>
                   <pic:blipFill>
@@ -19888,7 +19913,7 @@
           <w:sz w:val="27"/>
         </w:rPr>
       </w:pPr>
-      <w:bookmarkStart w:id="43" w:name="_Toc240034047"/>
+      <w:bookmarkStart w:id="43" w:name="_Toc240035188"/>
       <w:r>
         <w:rPr>
           <w:rFonts w:ascii="Montserrat" w:hAnsi="Montserrat"/>
@@ -20041,7 +20066,7 @@
           <w:sz w:val="27"/>
         </w:rPr>
       </w:pPr>
-      <w:bookmarkStart w:id="44" w:name="_Toc240034048"/>
+      <w:bookmarkStart w:id="44" w:name="_Toc240035189"/>
       <w:r>
         <w:rPr>
           <w:rFonts w:ascii="Montserrat" w:hAnsi="Montserrat"/>
@@ -20334,16 +20359,16 @@
           <w:noProof/>
         </w:rPr>
         <w:drawing>
-          <wp:inline distT="0" distB="0" distL="0" distR="0" wp14:anchorId="5EA0A497" wp14:editId="2064493F">
+          <wp:inline distT="0" distB="0" distL="0" distR="0" wp14:anchorId="5FB8E69F" wp14:editId="6E152CBF">
             <wp:extent cx="5303520" cy="1351384"/>
             <wp:effectExtent l="19050" t="19050" r="11430" b="20320"/>
-            <wp:docPr id="1318196983" name="Imagem 54"/>
+            <wp:docPr id="517837223" name="Imagem 54"/>
             <wp:cNvGraphicFramePr/>
             <a:graphic xmlns:a="http://schemas.openxmlformats.org/drawingml/2006/main">
               <a:graphicData uri="http://schemas.openxmlformats.org/drawingml/2006/picture">
                 <pic:pic xmlns:pic="http://schemas.openxmlformats.org/drawingml/2006/picture">
                   <pic:nvPicPr>
-                    <pic:cNvPr id="1318196983" name=""/>
+                    <pic:cNvPr id="517837223" name=""/>
                     <pic:cNvPicPr/>
                   </pic:nvPicPr>
                   <pic:blipFill>
@@ -20411,7 +20436,7 @@
           <w:sz w:val="27"/>
         </w:rPr>
       </w:pPr>
-      <w:bookmarkStart w:id="45" w:name="_Toc240034049"/>
+      <w:bookmarkStart w:id="45" w:name="_Toc240035190"/>
       <w:r>
         <w:rPr>
           <w:rFonts w:ascii="Montserrat" w:hAnsi="Montserrat"/>
@@ -20556,16 +20581,16 @@
           <w:noProof/>
         </w:rPr>
         <w:drawing>
-          <wp:inline distT="0" distB="0" distL="0" distR="0" wp14:anchorId="07DF6074" wp14:editId="36D10469">
+          <wp:inline distT="0" distB="0" distL="0" distR="0" wp14:anchorId="717507FE" wp14:editId="7CA0DD03">
             <wp:extent cx="5303520" cy="1422793"/>
             <wp:effectExtent l="19050" t="19050" r="11430" b="25400"/>
-            <wp:docPr id="777519880" name="Imagem 55"/>
+            <wp:docPr id="669134427" name="Imagem 55"/>
             <wp:cNvGraphicFramePr/>
             <a:graphic xmlns:a="http://schemas.openxmlformats.org/drawingml/2006/main">
               <a:graphicData uri="http://schemas.openxmlformats.org/drawingml/2006/picture">
                 <pic:pic xmlns:pic="http://schemas.openxmlformats.org/drawingml/2006/picture">
                   <pic:nvPicPr>
-                    <pic:cNvPr id="777519880" name=""/>
+                    <pic:cNvPr id="669134427" name=""/>
                     <pic:cNvPicPr/>
                   </pic:nvPicPr>
                   <pic:blipFill>
@@ -20720,16 +20745,16 @@
         </w:rPr>
         <w:lastRenderedPageBreak/>
         <w:drawing>
-          <wp:inline distT="0" distB="0" distL="0" distR="0" wp14:anchorId="77B51F7A" wp14:editId="69BF405A">
+          <wp:inline distT="0" distB="0" distL="0" distR="0" wp14:anchorId="28D62616" wp14:editId="0BC3CEA5">
             <wp:extent cx="5303520" cy="1841050"/>
             <wp:effectExtent l="19050" t="19050" r="11430" b="26035"/>
-            <wp:docPr id="16788684" name="Imagem 56"/>
+            <wp:docPr id="371853468" name="Imagem 56"/>
             <wp:cNvGraphicFramePr/>
             <a:graphic xmlns:a="http://schemas.openxmlformats.org/drawingml/2006/main">
               <a:graphicData uri="http://schemas.openxmlformats.org/drawingml/2006/picture">
                 <pic:pic xmlns:pic="http://schemas.openxmlformats.org/drawingml/2006/picture">
                   <pic:nvPicPr>
-                    <pic:cNvPr id="16788684" name=""/>
+                    <pic:cNvPr id="371853468" name=""/>
                     <pic:cNvPicPr/>
                   </pic:nvPicPr>
                   <pic:blipFill>
@@ -20883,16 +20908,16 @@
           <w:noProof/>
         </w:rPr>
         <w:drawing>
-          <wp:inline distT="0" distB="0" distL="0" distR="0" wp14:anchorId="0CDFA434" wp14:editId="3944D1D3">
+          <wp:inline distT="0" distB="0" distL="0" distR="0" wp14:anchorId="64301AF1" wp14:editId="510727F6">
             <wp:extent cx="5303520" cy="303041"/>
             <wp:effectExtent l="19050" t="19050" r="11430" b="20955"/>
-            <wp:docPr id="1896747884" name="Imagem 57"/>
+            <wp:docPr id="636375061" name="Imagem 57"/>
             <wp:cNvGraphicFramePr/>
             <a:graphic xmlns:a="http://schemas.openxmlformats.org/drawingml/2006/main">
               <a:graphicData uri="http://schemas.openxmlformats.org/drawingml/2006/picture">
                 <pic:pic xmlns:pic="http://schemas.openxmlformats.org/drawingml/2006/picture">
                   <pic:nvPicPr>
-                    <pic:cNvPr id="1896747884" name=""/>
+                    <pic:cNvPr id="636375061" name=""/>
                     <pic:cNvPicPr/>
                   </pic:nvPicPr>
                   <pic:blipFill>
@@ -20960,16 +20985,16 @@
         </w:rPr>
         <w:lastRenderedPageBreak/>
         <w:drawing>
-          <wp:inline distT="0" distB="0" distL="0" distR="0" wp14:anchorId="0776BD13" wp14:editId="7966AC26">
+          <wp:inline distT="0" distB="0" distL="0" distR="0" wp14:anchorId="71DD86C0" wp14:editId="431DCD38">
             <wp:extent cx="5303520" cy="2983005"/>
             <wp:effectExtent l="19050" t="19050" r="11430" b="27305"/>
-            <wp:docPr id="1040923277" name="Imagem 58"/>
+            <wp:docPr id="426354368" name="Imagem 58"/>
             <wp:cNvGraphicFramePr/>
             <a:graphic xmlns:a="http://schemas.openxmlformats.org/drawingml/2006/main">
               <a:graphicData uri="http://schemas.openxmlformats.org/drawingml/2006/picture">
                 <pic:pic xmlns:pic="http://schemas.openxmlformats.org/drawingml/2006/picture">
                   <pic:nvPicPr>
-                    <pic:cNvPr id="1040923277" name=""/>
+                    <pic:cNvPr id="426354368" name=""/>
                     <pic:cNvPicPr/>
                   </pic:nvPicPr>
                   <pic:blipFill>
@@ -21041,7 +21066,7 @@
           <w:sz w:val="34"/>
         </w:rPr>
       </w:pPr>
-      <w:bookmarkStart w:id="46" w:name="_Toc240034050"/>
+      <w:bookmarkStart w:id="46" w:name="_Toc240035191"/>
       <w:r>
         <w:rPr>
           <w:rFonts w:ascii="Montserrat" w:hAnsi="Montserrat"/>
@@ -21285,7 +21310,7 @@
           <w:sz w:val="34"/>
         </w:rPr>
       </w:pPr>
-      <w:bookmarkStart w:id="47" w:name="_Toc240034051"/>
+      <w:bookmarkStart w:id="47" w:name="_Toc240035192"/>
       <w:r>
         <w:rPr>
           <w:rFonts w:ascii="Montserrat" w:hAnsi="Montserrat"/>
@@ -23073,7 +23098,7 @@
 <file path=word/numbering.xml><?xml version="1.0" encoding="utf-8"?>
 <w:numbering xmlns:wpc="http://schemas.microsoft.com/office/word/2010/wordprocessingCanvas" xmlns:cx="http://schemas.microsoft.com/office/drawing/2014/chartex" xmlns:cx1="http://schemas.microsoft.com/office/drawing/2015/9/8/chartex" xmlns:cx2="http://schemas.microsoft.com/office/drawing/2015/10/21/chartex" xmlns:cx3="http://schemas.microsoft.com/office/drawing/2016/5/9/chartex" xmlns:cx4="http://schemas.microsoft.com/office/drawing/2016/5/10/chartex" xmlns:cx5="http://schemas.microsoft.com/office/drawing/2016/5/11/chartex" xmlns:cx6="http://schemas.microsoft.com/office/drawing/2016/5/12/chartex" xmlns:cx7="http://schemas.microsoft.com/office/drawing/2016/5/13/chartex" xmlns:cx8="http://schemas.microsoft.com/office/drawing/2016/5/14/chartex" xmlns:mc="http://schemas.openxmlformats.org/markup-compatibility/2006" xmlns:aink="http://schemas.microsoft.com/office/drawing/2016/ink" xmlns:am3d="http://schemas.microsoft.com/office/drawing/2017/model3d" xmlns:o="urn:schemas-microsoft-com:office:office" xmlns:oel="http://schemas.microsoft.com/office/2019/extlst" xmlns:r="http://schemas.openxmlformats.org/officeDocument/2006/relationships" xmlns:m="http://schemas.openxmlformats.org/officeDocument/2006/math" xmlns:v="urn:schemas-microsoft-com:vml" xmlns:wp14="http://schemas.microsoft.com/office/word/2010/wordprocessingDrawing" xmlns:wp="http://schemas.openxmlformats.org/drawingml/2006/wordprocessingDrawing" xmlns:w10="urn:schemas-microsoft-com:office:word" xmlns:w="http://schemas.openxmlformats.org/wordprocessingml/2006/main" xmlns:w14="http://schemas.microsoft.com/office/word/2010/wordml" xmlns:w15="http://schemas.microsoft.com/office/word/2012/wordml" xmlns:w16cex="http://schemas.microsoft.com/office/word/2018/wordml/cex" xmlns:w16cid="http://schemas.microsoft.com/office/word/2016/wordml/cid" xmlns:w16="http://schemas.microsoft.com/office/word/2018/wordml" xmlns:w16du="http://schemas.microsoft.com/office/word/2023/wordml/word16du" xmlns:w16sdtdh="http://schemas.microsoft.com/office/word/2020/wordml/sdtdatahash" xmlns:w16sdtfl="http://schemas.microsoft.com/office/word/2024/wordml/sdtformatlock" xmlns:w16se="http://schemas.microsoft.com/office/word/2015/wordml/symex" xmlns:wpg="http://schemas.microsoft.com/office/word/2010/wordprocessingGroup" xmlns:wpi="http://schemas.microsoft.com/office/word/2010/wordprocessingInk" xmlns:wne="http://schemas.microsoft.com/office/word/2006/wordml" xmlns:wps="http://schemas.microsoft.com/office/word/2010/wordprocessingShape" mc:Ignorable="w14 w15 w16se w16cid w16 w16cex w16sdtdh w16sdtfl w16du wp14">
   <w:abstractNum w:abstractNumId="0" w15:restartNumberingAfterBreak="0">
-    <w:nsid w:val="01402404"/>
+    <w:nsid w:val="00427F45"/>
     <w:multiLevelType w:val="singleLevel"/>
     <w:tmpl w:val="04160001"/>
     <w:lvl w:ilvl="0">
@@ -23090,7 +23115,7 @@
     </w:lvl>
   </w:abstractNum>
   <w:abstractNum w:abstractNumId="1" w15:restartNumberingAfterBreak="0">
-    <w:nsid w:val="01F304AE"/>
+    <w:nsid w:val="07FB6089"/>
     <w:multiLevelType w:val="singleLevel"/>
     <w:tmpl w:val="04160001"/>
     <w:lvl w:ilvl="0">
@@ -23107,7 +23132,7 @@
     </w:lvl>
   </w:abstractNum>
   <w:abstractNum w:abstractNumId="2" w15:restartNumberingAfterBreak="0">
-    <w:nsid w:val="07672507"/>
+    <w:nsid w:val="08402921"/>
     <w:multiLevelType w:val="singleLevel"/>
     <w:tmpl w:val="04160001"/>
     <w:lvl w:ilvl="0">
@@ -23124,7 +23149,7 @@
     </w:lvl>
   </w:abstractNum>
   <w:abstractNum w:abstractNumId="3" w15:restartNumberingAfterBreak="0">
-    <w:nsid w:val="08265CE4"/>
+    <w:nsid w:val="085B2FFB"/>
     <w:multiLevelType w:val="singleLevel"/>
     <w:tmpl w:val="04160001"/>
     <w:lvl w:ilvl="0">
@@ -23141,7 +23166,7 @@
     </w:lvl>
   </w:abstractNum>
   <w:abstractNum w:abstractNumId="4" w15:restartNumberingAfterBreak="0">
-    <w:nsid w:val="0D3E446A"/>
+    <w:nsid w:val="0DCC0449"/>
     <w:multiLevelType w:val="singleLevel"/>
     <w:tmpl w:val="04160001"/>
     <w:lvl w:ilvl="0">
@@ -23158,7 +23183,7 @@
     </w:lvl>
   </w:abstractNum>
   <w:abstractNum w:abstractNumId="5" w15:restartNumberingAfterBreak="0">
-    <w:nsid w:val="22BA6AF9"/>
+    <w:nsid w:val="105F3747"/>
     <w:multiLevelType w:val="singleLevel"/>
     <w:tmpl w:val="04160001"/>
     <w:lvl w:ilvl="0">
@@ -23175,7 +23200,7 @@
     </w:lvl>
   </w:abstractNum>
   <w:abstractNum w:abstractNumId="6" w15:restartNumberingAfterBreak="0">
-    <w:nsid w:val="2422662C"/>
+    <w:nsid w:val="12E45F35"/>
     <w:multiLevelType w:val="singleLevel"/>
     <w:tmpl w:val="04160001"/>
     <w:lvl w:ilvl="0">
@@ -23192,7 +23217,7 @@
     </w:lvl>
   </w:abstractNum>
   <w:abstractNum w:abstractNumId="7" w15:restartNumberingAfterBreak="0">
-    <w:nsid w:val="2422752A"/>
+    <w:nsid w:val="161B43ED"/>
     <w:multiLevelType w:val="singleLevel"/>
     <w:tmpl w:val="04160001"/>
     <w:lvl w:ilvl="0">
@@ -23209,7 +23234,7 @@
     </w:lvl>
   </w:abstractNum>
   <w:abstractNum w:abstractNumId="8" w15:restartNumberingAfterBreak="0">
-    <w:nsid w:val="28FA4102"/>
+    <w:nsid w:val="1A097177"/>
     <w:multiLevelType w:val="singleLevel"/>
     <w:tmpl w:val="04160001"/>
     <w:lvl w:ilvl="0">
@@ -23226,7 +23251,7 @@
     </w:lvl>
   </w:abstractNum>
   <w:abstractNum w:abstractNumId="9" w15:restartNumberingAfterBreak="0">
-    <w:nsid w:val="29CD4725"/>
+    <w:nsid w:val="1DED55FA"/>
     <w:multiLevelType w:val="singleLevel"/>
     <w:tmpl w:val="04160001"/>
     <w:lvl w:ilvl="0">
@@ -23243,7 +23268,7 @@
     </w:lvl>
   </w:abstractNum>
   <w:abstractNum w:abstractNumId="10" w15:restartNumberingAfterBreak="0">
-    <w:nsid w:val="309D4047"/>
+    <w:nsid w:val="20120E84"/>
     <w:multiLevelType w:val="singleLevel"/>
     <w:tmpl w:val="04160001"/>
     <w:lvl w:ilvl="0">
@@ -23260,7 +23285,7 @@
     </w:lvl>
   </w:abstractNum>
   <w:abstractNum w:abstractNumId="11" w15:restartNumberingAfterBreak="0">
-    <w:nsid w:val="3219320A"/>
+    <w:nsid w:val="21E04818"/>
     <w:multiLevelType w:val="singleLevel"/>
     <w:tmpl w:val="04160001"/>
     <w:lvl w:ilvl="0">
@@ -23277,7 +23302,7 @@
     </w:lvl>
   </w:abstractNum>
   <w:abstractNum w:abstractNumId="12" w15:restartNumberingAfterBreak="0">
-    <w:nsid w:val="33156355"/>
+    <w:nsid w:val="24F056F4"/>
     <w:multiLevelType w:val="singleLevel"/>
     <w:tmpl w:val="04160001"/>
     <w:lvl w:ilvl="0">
@@ -23294,7 +23319,7 @@
     </w:lvl>
   </w:abstractNum>
   <w:abstractNum w:abstractNumId="13" w15:restartNumberingAfterBreak="0">
-    <w:nsid w:val="34FA1EC4"/>
+    <w:nsid w:val="26026038"/>
     <w:multiLevelType w:val="singleLevel"/>
     <w:tmpl w:val="04160001"/>
     <w:lvl w:ilvl="0">
@@ -23311,7 +23336,7 @@
     </w:lvl>
   </w:abstractNum>
   <w:abstractNum w:abstractNumId="14" w15:restartNumberingAfterBreak="0">
-    <w:nsid w:val="382A55BC"/>
+    <w:nsid w:val="2A99775D"/>
     <w:multiLevelType w:val="singleLevel"/>
     <w:tmpl w:val="04160001"/>
     <w:lvl w:ilvl="0">
@@ -23328,7 +23353,7 @@
     </w:lvl>
   </w:abstractNum>
   <w:abstractNum w:abstractNumId="15" w15:restartNumberingAfterBreak="0">
-    <w:nsid w:val="387114DE"/>
+    <w:nsid w:val="30597B71"/>
     <w:multiLevelType w:val="singleLevel"/>
     <w:tmpl w:val="04160001"/>
     <w:lvl w:ilvl="0">
@@ -23345,7 +23370,7 @@
     </w:lvl>
   </w:abstractNum>
   <w:abstractNum w:abstractNumId="16" w15:restartNumberingAfterBreak="0">
-    <w:nsid w:val="3A5C2729"/>
+    <w:nsid w:val="37C70A6B"/>
     <w:multiLevelType w:val="singleLevel"/>
     <w:tmpl w:val="04160001"/>
     <w:lvl w:ilvl="0">
@@ -23362,7 +23387,7 @@
     </w:lvl>
   </w:abstractNum>
   <w:abstractNum w:abstractNumId="17" w15:restartNumberingAfterBreak="0">
-    <w:nsid w:val="42091D10"/>
+    <w:nsid w:val="3A5052E0"/>
     <w:multiLevelType w:val="singleLevel"/>
     <w:tmpl w:val="04160001"/>
     <w:lvl w:ilvl="0">
@@ -23379,7 +23404,7 @@
     </w:lvl>
   </w:abstractNum>
   <w:abstractNum w:abstractNumId="18" w15:restartNumberingAfterBreak="0">
-    <w:nsid w:val="42160247"/>
+    <w:nsid w:val="3D5F394E"/>
     <w:multiLevelType w:val="singleLevel"/>
     <w:tmpl w:val="04160001"/>
     <w:lvl w:ilvl="0">
@@ -23396,7 +23421,7 @@
     </w:lvl>
   </w:abstractNum>
   <w:abstractNum w:abstractNumId="19" w15:restartNumberingAfterBreak="0">
-    <w:nsid w:val="45C31EF9"/>
+    <w:nsid w:val="44453FE9"/>
     <w:multiLevelType w:val="singleLevel"/>
     <w:tmpl w:val="04160001"/>
     <w:lvl w:ilvl="0">
@@ -23413,7 +23438,7 @@
     </w:lvl>
   </w:abstractNum>
   <w:abstractNum w:abstractNumId="20" w15:restartNumberingAfterBreak="0">
-    <w:nsid w:val="4CD7076F"/>
+    <w:nsid w:val="47AB1E19"/>
     <w:multiLevelType w:val="singleLevel"/>
     <w:tmpl w:val="04160001"/>
     <w:lvl w:ilvl="0">
@@ -23430,7 +23455,7 @@
     </w:lvl>
   </w:abstractNum>
   <w:abstractNum w:abstractNumId="21" w15:restartNumberingAfterBreak="0">
-    <w:nsid w:val="4D2E157A"/>
+    <w:nsid w:val="490C0CBA"/>
     <w:multiLevelType w:val="singleLevel"/>
     <w:tmpl w:val="04160001"/>
     <w:lvl w:ilvl="0">
@@ -23447,7 +23472,7 @@
     </w:lvl>
   </w:abstractNum>
   <w:abstractNum w:abstractNumId="22" w15:restartNumberingAfterBreak="0">
-    <w:nsid w:val="4EDE65FC"/>
+    <w:nsid w:val="5421467B"/>
     <w:multiLevelType w:val="singleLevel"/>
     <w:tmpl w:val="04160001"/>
     <w:lvl w:ilvl="0">
@@ -23464,7 +23489,7 @@
     </w:lvl>
   </w:abstractNum>
   <w:abstractNum w:abstractNumId="23" w15:restartNumberingAfterBreak="0">
-    <w:nsid w:val="52AC54FE"/>
+    <w:nsid w:val="58416FDB"/>
     <w:multiLevelType w:val="singleLevel"/>
     <w:tmpl w:val="04160001"/>
     <w:lvl w:ilvl="0">
@@ -23481,7 +23506,7 @@
     </w:lvl>
   </w:abstractNum>
   <w:abstractNum w:abstractNumId="24" w15:restartNumberingAfterBreak="0">
-    <w:nsid w:val="536174A5"/>
+    <w:nsid w:val="5F841CA1"/>
     <w:multiLevelType w:val="singleLevel"/>
     <w:tmpl w:val="04160001"/>
     <w:lvl w:ilvl="0">
@@ -23498,7 +23523,7 @@
     </w:lvl>
   </w:abstractNum>
   <w:abstractNum w:abstractNumId="25" w15:restartNumberingAfterBreak="0">
-    <w:nsid w:val="540340BD"/>
+    <w:nsid w:val="62BF01B4"/>
     <w:multiLevelType w:val="singleLevel"/>
     <w:tmpl w:val="04160001"/>
     <w:lvl w:ilvl="0">
@@ -23515,7 +23540,7 @@
     </w:lvl>
   </w:abstractNum>
   <w:abstractNum w:abstractNumId="26" w15:restartNumberingAfterBreak="0">
-    <w:nsid w:val="584763EA"/>
+    <w:nsid w:val="6AFF1686"/>
     <w:multiLevelType w:val="singleLevel"/>
     <w:tmpl w:val="04160001"/>
     <w:lvl w:ilvl="0">
@@ -23532,7 +23557,7 @@
     </w:lvl>
   </w:abstractNum>
   <w:abstractNum w:abstractNumId="27" w15:restartNumberingAfterBreak="0">
-    <w:nsid w:val="59270047"/>
+    <w:nsid w:val="6EE8031C"/>
     <w:multiLevelType w:val="singleLevel"/>
     <w:tmpl w:val="04160001"/>
     <w:lvl w:ilvl="0">
@@ -23549,7 +23574,7 @@
     </w:lvl>
   </w:abstractNum>
   <w:abstractNum w:abstractNumId="28" w15:restartNumberingAfterBreak="0">
-    <w:nsid w:val="5BC85604"/>
+    <w:nsid w:val="70720642"/>
     <w:multiLevelType w:val="singleLevel"/>
     <w:tmpl w:val="04160001"/>
     <w:lvl w:ilvl="0">
@@ -23566,7 +23591,7 @@
     </w:lvl>
   </w:abstractNum>
   <w:abstractNum w:abstractNumId="29" w15:restartNumberingAfterBreak="0">
-    <w:nsid w:val="66A62C40"/>
+    <w:nsid w:val="73D90BDF"/>
     <w:multiLevelType w:val="singleLevel"/>
     <w:tmpl w:val="04160001"/>
     <w:lvl w:ilvl="0">
@@ -23583,7 +23608,7 @@
     </w:lvl>
   </w:abstractNum>
   <w:abstractNum w:abstractNumId="30" w15:restartNumberingAfterBreak="0">
-    <w:nsid w:val="775671DB"/>
+    <w:nsid w:val="76381109"/>
     <w:multiLevelType w:val="singleLevel"/>
     <w:tmpl w:val="04160001"/>
     <w:lvl w:ilvl="0">
@@ -23600,7 +23625,7 @@
     </w:lvl>
   </w:abstractNum>
   <w:abstractNum w:abstractNumId="31" w15:restartNumberingAfterBreak="0">
-    <w:nsid w:val="7F3E38AF"/>
+    <w:nsid w:val="77A83226"/>
     <w:multiLevelType w:val="singleLevel"/>
     <w:tmpl w:val="04160001"/>
     <w:lvl w:ilvl="0">
@@ -23616,101 +23641,101 @@
       </w:rPr>
     </w:lvl>
   </w:abstractNum>
-  <w:num w:numId="1" w16cid:durableId="1684668505">
+  <w:num w:numId="1" w16cid:durableId="1908763494">
+    <w:abstractNumId w:val="30"/>
+  </w:num>
+  <w:num w:numId="2" w16cid:durableId="2052488505">
+    <w:abstractNumId w:val="21"/>
+  </w:num>
+  <w:num w:numId="3" w16cid:durableId="735516781">
+    <w:abstractNumId w:val="18"/>
+  </w:num>
+  <w:num w:numId="4" w16cid:durableId="274288064">
+    <w:abstractNumId w:val="0"/>
+  </w:num>
+  <w:num w:numId="5" w16cid:durableId="2120445034">
+    <w:abstractNumId w:val="24"/>
+  </w:num>
+  <w:num w:numId="6" w16cid:durableId="1195926510">
+    <w:abstractNumId w:val="26"/>
+  </w:num>
+  <w:num w:numId="7" w16cid:durableId="149102572">
+    <w:abstractNumId w:val="23"/>
+  </w:num>
+  <w:num w:numId="8" w16cid:durableId="160854999">
+    <w:abstractNumId w:val="19"/>
+  </w:num>
+  <w:num w:numId="9" w16cid:durableId="154036351">
+    <w:abstractNumId w:val="5"/>
+  </w:num>
+  <w:num w:numId="10" w16cid:durableId="1836415211">
+    <w:abstractNumId w:val="8"/>
+  </w:num>
+  <w:num w:numId="11" w16cid:durableId="832915197">
+    <w:abstractNumId w:val="6"/>
+  </w:num>
+  <w:num w:numId="12" w16cid:durableId="1646202265">
+    <w:abstractNumId w:val="20"/>
+  </w:num>
+  <w:num w:numId="13" w16cid:durableId="439497695">
+    <w:abstractNumId w:val="9"/>
+  </w:num>
+  <w:num w:numId="14" w16cid:durableId="446389754">
+    <w:abstractNumId w:val="7"/>
+  </w:num>
+  <w:num w:numId="15" w16cid:durableId="455683898">
+    <w:abstractNumId w:val="3"/>
+  </w:num>
+  <w:num w:numId="16" w16cid:durableId="785004401">
+    <w:abstractNumId w:val="12"/>
+  </w:num>
+  <w:num w:numId="17" w16cid:durableId="1345743574">
+    <w:abstractNumId w:val="27"/>
+  </w:num>
+  <w:num w:numId="18" w16cid:durableId="52124547">
+    <w:abstractNumId w:val="31"/>
+  </w:num>
+  <w:num w:numId="19" w16cid:durableId="1396859101">
+    <w:abstractNumId w:val="17"/>
+  </w:num>
+  <w:num w:numId="20" w16cid:durableId="939338053">
     <w:abstractNumId w:val="1"/>
   </w:num>
-  <w:num w:numId="2" w16cid:durableId="1623614060">
-    <w:abstractNumId w:val="5"/>
+  <w:num w:numId="21" w16cid:durableId="548416958">
+    <w:abstractNumId w:val="2"/>
   </w:num>
-  <w:num w:numId="3" w16cid:durableId="1312365163">
-    <w:abstractNumId w:val="9"/>
+  <w:num w:numId="22" w16cid:durableId="181941081">
+    <w:abstractNumId w:val="11"/>
   </w:num>
-  <w:num w:numId="4" w16cid:durableId="1231159821">
-    <w:abstractNumId w:val="23"/>
+  <w:num w:numId="23" w16cid:durableId="1700815942">
+    <w:abstractNumId w:val="13"/>
   </w:num>
-  <w:num w:numId="5" w16cid:durableId="1289240309">
+  <w:num w:numId="24" w16cid:durableId="1814448548">
+    <w:abstractNumId w:val="22"/>
+  </w:num>
+  <w:num w:numId="25" w16cid:durableId="646209658">
+    <w:abstractNumId w:val="25"/>
+  </w:num>
+  <w:num w:numId="26" w16cid:durableId="63452361">
+    <w:abstractNumId w:val="16"/>
+  </w:num>
+  <w:num w:numId="27" w16cid:durableId="672684352">
+    <w:abstractNumId w:val="15"/>
+  </w:num>
+  <w:num w:numId="28" w16cid:durableId="1812549894">
     <w:abstractNumId w:val="4"/>
   </w:num>
-  <w:num w:numId="6" w16cid:durableId="1304194114">
-    <w:abstractNumId w:val="0"/>
+  <w:num w:numId="29" w16cid:durableId="1732270558">
+    <w:abstractNumId w:val="29"/>
   </w:num>
-  <w:num w:numId="7" w16cid:durableId="134177109">
-    <w:abstractNumId w:val="21"/>
-  </w:num>
-  <w:num w:numId="8" w16cid:durableId="1903787648">
+  <w:num w:numId="30" w16cid:durableId="1644506582">
     <w:abstractNumId w:val="14"/>
   </w:num>
-  <w:num w:numId="9" w16cid:durableId="1460536711">
-    <w:abstractNumId w:val="15"/>
-  </w:num>
-  <w:num w:numId="10" w16cid:durableId="1701004965">
-    <w:abstractNumId w:val="30"/>
-  </w:num>
-  <w:num w:numId="11" w16cid:durableId="866873105">
-    <w:abstractNumId w:val="8"/>
-  </w:num>
-  <w:num w:numId="12" w16cid:durableId="401030948">
-    <w:abstractNumId w:val="2"/>
-  </w:num>
-  <w:num w:numId="13" w16cid:durableId="932906405">
-    <w:abstractNumId w:val="16"/>
-  </w:num>
-  <w:num w:numId="14" w16cid:durableId="1212115513">
-    <w:abstractNumId w:val="25"/>
-  </w:num>
-  <w:num w:numId="15" w16cid:durableId="777680561">
-    <w:abstractNumId w:val="11"/>
-  </w:num>
-  <w:num w:numId="16" w16cid:durableId="1390687948">
-    <w:abstractNumId w:val="29"/>
-  </w:num>
-  <w:num w:numId="17" w16cid:durableId="1327443020">
-    <w:abstractNumId w:val="6"/>
-  </w:num>
-  <w:num w:numId="18" w16cid:durableId="1313021962">
-    <w:abstractNumId w:val="20"/>
-  </w:num>
-  <w:num w:numId="19" w16cid:durableId="498814881">
-    <w:abstractNumId w:val="3"/>
-  </w:num>
-  <w:num w:numId="20" w16cid:durableId="301158066">
-    <w:abstractNumId w:val="26"/>
-  </w:num>
-  <w:num w:numId="21" w16cid:durableId="812989284">
-    <w:abstractNumId w:val="13"/>
-  </w:num>
-  <w:num w:numId="22" w16cid:durableId="1505394664">
-    <w:abstractNumId w:val="17"/>
-  </w:num>
-  <w:num w:numId="23" w16cid:durableId="882911669">
-    <w:abstractNumId w:val="19"/>
-  </w:num>
-  <w:num w:numId="24" w16cid:durableId="1730496004">
-    <w:abstractNumId w:val="22"/>
-  </w:num>
-  <w:num w:numId="25" w16cid:durableId="1250458045">
-    <w:abstractNumId w:val="7"/>
-  </w:num>
-  <w:num w:numId="26" w16cid:durableId="1711566299">
-    <w:abstractNumId w:val="12"/>
-  </w:num>
-  <w:num w:numId="27" w16cid:durableId="988708389">
+  <w:num w:numId="31" w16cid:durableId="1588341923">
     <w:abstractNumId w:val="10"/>
   </w:num>
-  <w:num w:numId="28" w16cid:durableId="519394262">
-    <w:abstractNumId w:val="31"/>
-  </w:num>
-  <w:num w:numId="29" w16cid:durableId="1216576261">
-    <w:abstractNumId w:val="24"/>
-  </w:num>
-  <w:num w:numId="30" w16cid:durableId="547839080">
-    <w:abstractNumId w:val="27"/>
-  </w:num>
-  <w:num w:numId="31" w16cid:durableId="1397583554">
+  <w:num w:numId="32" w16cid:durableId="1066034578">
     <w:abstractNumId w:val="28"/>
-  </w:num>
-  <w:num w:numId="32" w16cid:durableId="46268844">
-    <w:abstractNumId w:val="18"/>
   </w:num>
 </w:numbering>
 </file>
@@ -24123,7 +24148,7 @@
     <w:link w:val="Ttulo1Char"/>
     <w:uiPriority w:val="9"/>
     <w:qFormat/>
-    <w:rsid w:val="005D024C"/>
+    <w:rsid w:val="00C1140E"/>
     <w:pPr>
       <w:keepNext/>
       <w:keepLines/>
@@ -24145,7 +24170,7 @@
     <w:uiPriority w:val="9"/>
     <w:unhideWhenUsed/>
     <w:qFormat/>
-    <w:rsid w:val="005D024C"/>
+    <w:rsid w:val="00C1140E"/>
     <w:pPr>
       <w:keepNext/>
       <w:keepLines/>
@@ -24168,7 +24193,7 @@
     <w:semiHidden/>
     <w:unhideWhenUsed/>
     <w:qFormat/>
-    <w:rsid w:val="005D024C"/>
+    <w:rsid w:val="00C1140E"/>
     <w:pPr>
       <w:keepNext/>
       <w:keepLines/>
@@ -24191,7 +24216,7 @@
     <w:semiHidden/>
     <w:unhideWhenUsed/>
     <w:qFormat/>
-    <w:rsid w:val="005D024C"/>
+    <w:rsid w:val="00C1140E"/>
     <w:pPr>
       <w:keepNext/>
       <w:keepLines/>
@@ -24214,7 +24239,7 @@
     <w:semiHidden/>
     <w:unhideWhenUsed/>
     <w:qFormat/>
-    <w:rsid w:val="005D024C"/>
+    <w:rsid w:val="00C1140E"/>
     <w:pPr>
       <w:keepNext/>
       <w:keepLines/>
@@ -24235,7 +24260,7 @@
     <w:semiHidden/>
     <w:unhideWhenUsed/>
     <w:qFormat/>
-    <w:rsid w:val="005D024C"/>
+    <w:rsid w:val="00C1140E"/>
     <w:pPr>
       <w:keepNext/>
       <w:keepLines/>
@@ -24258,7 +24283,7 @@
     <w:semiHidden/>
     <w:unhideWhenUsed/>
     <w:qFormat/>
-    <w:rsid w:val="005D024C"/>
+    <w:rsid w:val="00C1140E"/>
     <w:pPr>
       <w:keepNext/>
       <w:keepLines/>
@@ -24279,7 +24304,7 @@
     <w:semiHidden/>
     <w:unhideWhenUsed/>
     <w:qFormat/>
-    <w:rsid w:val="005D024C"/>
+    <w:rsid w:val="00C1140E"/>
     <w:pPr>
       <w:keepNext/>
       <w:keepLines/>
@@ -24302,7 +24327,7 @@
     <w:semiHidden/>
     <w:unhideWhenUsed/>
     <w:qFormat/>
-    <w:rsid w:val="005D024C"/>
+    <w:rsid w:val="00C1140E"/>
     <w:pPr>
       <w:keepNext/>
       <w:keepLines/>
@@ -24346,7 +24371,7 @@
     <w:basedOn w:val="Fontepargpadro"/>
     <w:link w:val="Ttulo1"/>
     <w:uiPriority w:val="9"/>
-    <w:rsid w:val="005D024C"/>
+    <w:rsid w:val="00C1140E"/>
     <w:rPr>
       <w:rFonts w:asciiTheme="majorHAnsi" w:eastAsiaTheme="majorEastAsia" w:hAnsiTheme="majorHAnsi" w:cstheme="majorBidi"/>
       <w:color w:val="0F4761" w:themeColor="accent1" w:themeShade="BF"/>
@@ -24359,7 +24384,7 @@
     <w:basedOn w:val="Fontepargpadro"/>
     <w:link w:val="Ttulo2"/>
     <w:uiPriority w:val="9"/>
-    <w:rsid w:val="005D024C"/>
+    <w:rsid w:val="00C1140E"/>
     <w:rPr>
       <w:rFonts w:asciiTheme="majorHAnsi" w:eastAsiaTheme="majorEastAsia" w:hAnsiTheme="majorHAnsi" w:cstheme="majorBidi"/>
       <w:color w:val="0F4761" w:themeColor="accent1" w:themeShade="BF"/>
@@ -24373,7 +24398,7 @@
     <w:link w:val="Ttulo3"/>
     <w:uiPriority w:val="9"/>
     <w:semiHidden/>
-    <w:rsid w:val="005D024C"/>
+    <w:rsid w:val="00C1140E"/>
     <w:rPr>
       <w:rFonts w:eastAsiaTheme="majorEastAsia" w:cstheme="majorBidi"/>
       <w:color w:val="0F4761" w:themeColor="accent1" w:themeShade="BF"/>
@@ -24387,7 +24412,7 @@
     <w:link w:val="Ttulo4"/>
     <w:uiPriority w:val="9"/>
     <w:semiHidden/>
-    <w:rsid w:val="005D024C"/>
+    <w:rsid w:val="00C1140E"/>
     <w:rPr>
       <w:rFonts w:eastAsiaTheme="majorEastAsia" w:cstheme="majorBidi"/>
       <w:i/>
@@ -24401,7 +24426,7 @@
     <w:link w:val="Ttulo5"/>
     <w:uiPriority w:val="9"/>
     <w:semiHidden/>
-    <w:rsid w:val="005D024C"/>
+    <w:rsid w:val="00C1140E"/>
     <w:rPr>
       <w:rFonts w:eastAsiaTheme="majorEastAsia" w:cstheme="majorBidi"/>
       <w:color w:val="0F4761" w:themeColor="accent1" w:themeShade="BF"/>
@@ -24413,7 +24438,7 @@
     <w:link w:val="Ttulo6"/>
     <w:uiPriority w:val="9"/>
     <w:semiHidden/>
-    <w:rsid w:val="005D024C"/>
+    <w:rsid w:val="00C1140E"/>
     <w:rPr>
       <w:rFonts w:eastAsiaTheme="majorEastAsia" w:cstheme="majorBidi"/>
       <w:i/>
@@ -24427,7 +24452,7 @@
     <w:link w:val="Ttulo7"/>
     <w:uiPriority w:val="9"/>
     <w:semiHidden/>
-    <w:rsid w:val="005D024C"/>
+    <w:rsid w:val="00C1140E"/>
     <w:rPr>
       <w:rFonts w:eastAsiaTheme="majorEastAsia" w:cstheme="majorBidi"/>
       <w:color w:val="595959" w:themeColor="text1" w:themeTint="A6"/>
@@ -24439,7 +24464,7 @@
     <w:link w:val="Ttulo8"/>
     <w:uiPriority w:val="9"/>
     <w:semiHidden/>
-    <w:rsid w:val="005D024C"/>
+    <w:rsid w:val="00C1140E"/>
     <w:rPr>
       <w:rFonts w:eastAsiaTheme="majorEastAsia" w:cstheme="majorBidi"/>
       <w:i/>
@@ -24453,7 +24478,7 @@
     <w:link w:val="Ttulo9"/>
     <w:uiPriority w:val="9"/>
     <w:semiHidden/>
-    <w:rsid w:val="005D024C"/>
+    <w:rsid w:val="00C1140E"/>
     <w:rPr>
       <w:rFonts w:eastAsiaTheme="majorEastAsia" w:cstheme="majorBidi"/>
       <w:color w:val="272727" w:themeColor="text1" w:themeTint="D8"/>
@@ -24466,7 +24491,7 @@
     <w:link w:val="TtuloChar"/>
     <w:uiPriority w:val="10"/>
     <w:qFormat/>
-    <w:rsid w:val="005D024C"/>
+    <w:rsid w:val="00C1140E"/>
     <w:pPr>
       <w:spacing w:after="80" w:line="240" w:lineRule="auto"/>
       <w:contextualSpacing/>
@@ -24484,7 +24509,7 @@
     <w:basedOn w:val="Fontepargpadro"/>
     <w:link w:val="Ttulo"/>
     <w:uiPriority w:val="10"/>
-    <w:rsid w:val="005D024C"/>
+    <w:rsid w:val="00C1140E"/>
     <w:rPr>
       <w:rFonts w:asciiTheme="majorHAnsi" w:eastAsiaTheme="majorEastAsia" w:hAnsiTheme="majorHAnsi" w:cstheme="majorBidi"/>
       <w:spacing w:val="-10"/>
@@ -24500,7 +24525,7 @@
     <w:link w:val="SubttuloChar"/>
     <w:uiPriority w:val="11"/>
     <w:qFormat/>
-    <w:rsid w:val="005D024C"/>
+    <w:rsid w:val="00C1140E"/>
     <w:pPr>
       <w:numPr>
         <w:ilvl w:val="1"/>
@@ -24519,7 +24544,7 @@
     <w:basedOn w:val="Fontepargpadro"/>
     <w:link w:val="Subttulo"/>
     <w:uiPriority w:val="11"/>
-    <w:rsid w:val="005D024C"/>
+    <w:rsid w:val="00C1140E"/>
     <w:rPr>
       <w:rFonts w:eastAsiaTheme="majorEastAsia" w:cstheme="majorBidi"/>
       <w:color w:val="595959" w:themeColor="text1" w:themeTint="A6"/>
@@ -24535,7 +24560,7 @@
     <w:link w:val="CitaoChar"/>
     <w:uiPriority w:val="29"/>
     <w:qFormat/>
-    <w:rsid w:val="005D024C"/>
+    <w:rsid w:val="00C1140E"/>
     <w:pPr>
       <w:spacing w:before="160"/>
       <w:jc w:val="center"/>
@@ -24551,7 +24576,7 @@
     <w:basedOn w:val="Fontepargpadro"/>
     <w:link w:val="Citao"/>
     <w:uiPriority w:val="29"/>
-    <w:rsid w:val="005D024C"/>
+    <w:rsid w:val="00C1140E"/>
     <w:rPr>
       <w:i/>
       <w:iCs/>
@@ -24563,7 +24588,7 @@
     <w:basedOn w:val="Normal"/>
     <w:uiPriority w:val="34"/>
     <w:qFormat/>
-    <w:rsid w:val="005D024C"/>
+    <w:rsid w:val="00C1140E"/>
     <w:pPr>
       <w:ind w:left="720"/>
       <w:contextualSpacing/>
@@ -24574,7 +24599,7 @@
     <w:basedOn w:val="Fontepargpadro"/>
     <w:uiPriority w:val="21"/>
     <w:qFormat/>
-    <w:rsid w:val="005D024C"/>
+    <w:rsid w:val="00C1140E"/>
     <w:rPr>
       <w:i/>
       <w:iCs/>
@@ -24588,7 +24613,7 @@
     <w:link w:val="CitaoIntensaChar"/>
     <w:uiPriority w:val="30"/>
     <w:qFormat/>
-    <w:rsid w:val="005D024C"/>
+    <w:rsid w:val="00C1140E"/>
     <w:pPr>
       <w:pBdr>
         <w:top w:val="single" w:sz="4" w:space="10" w:color="0F4761" w:themeColor="accent1" w:themeShade="BF"/>
@@ -24609,7 +24634,7 @@
     <w:basedOn w:val="Fontepargpadro"/>
     <w:link w:val="CitaoIntensa"/>
     <w:uiPriority w:val="30"/>
-    <w:rsid w:val="005D024C"/>
+    <w:rsid w:val="00C1140E"/>
     <w:rPr>
       <w:i/>
       <w:iCs/>
@@ -24621,7 +24646,7 @@
     <w:basedOn w:val="Fontepargpadro"/>
     <w:uiPriority w:val="32"/>
     <w:qFormat/>
-    <w:rsid w:val="005D024C"/>
+    <w:rsid w:val="00C1140E"/>
     <w:rPr>
       <w:b/>
       <w:bCs/>
@@ -24636,7 +24661,7 @@
     <w:link w:val="CabealhoChar"/>
     <w:uiPriority w:val="99"/>
     <w:unhideWhenUsed/>
-    <w:rsid w:val="005D024C"/>
+    <w:rsid w:val="00C1140E"/>
     <w:pPr>
       <w:tabs>
         <w:tab w:val="center" w:pos="4252"/>
@@ -24650,7 +24675,7 @@
     <w:basedOn w:val="Fontepargpadro"/>
     <w:link w:val="Cabealho"/>
     <w:uiPriority w:val="99"/>
-    <w:rsid w:val="005D024C"/>
+    <w:rsid w:val="00C1140E"/>
   </w:style>
   <w:style w:type="paragraph" w:styleId="Rodap">
     <w:name w:val="footer"/>
@@ -24658,7 +24683,7 @@
     <w:link w:val="RodapChar"/>
     <w:uiPriority w:val="99"/>
     <w:unhideWhenUsed/>
-    <w:rsid w:val="005D024C"/>
+    <w:rsid w:val="00C1140E"/>
     <w:pPr>
       <w:tabs>
         <w:tab w:val="center" w:pos="4252"/>
@@ -24672,7 +24697,7 @@
     <w:basedOn w:val="Fontepargpadro"/>
     <w:link w:val="Rodap"/>
     <w:uiPriority w:val="99"/>
-    <w:rsid w:val="005D024C"/>
+    <w:rsid w:val="00C1140E"/>
   </w:style>
   <w:style w:type="paragraph" w:styleId="Sumrio1">
     <w:name w:val="toc 1"/>
@@ -24681,7 +24706,7 @@
     <w:autoRedefine/>
     <w:uiPriority w:val="39"/>
     <w:unhideWhenUsed/>
-    <w:rsid w:val="005D024C"/>
+    <w:rsid w:val="00C1140E"/>
     <w:pPr>
       <w:spacing w:after="100"/>
     </w:pPr>
@@ -24693,7 +24718,7 @@
     <w:autoRedefine/>
     <w:uiPriority w:val="39"/>
     <w:unhideWhenUsed/>
-    <w:rsid w:val="005D024C"/>
+    <w:rsid w:val="00C1140E"/>
     <w:pPr>
       <w:spacing w:after="100"/>
       <w:ind w:left="240"/>

</xml_diff>

<commit_message>
Sincroniza com a produção — Fase 3 de custos por categoria na Ficha do Projeto (fecha a proposta)
Co-Authored-By: Claude Sonnet 5 <noreply@anthropic.com>
</commit_message>
<xml_diff>
--- a/Manual de Uso - Ferramenta de Gestao de Projetos.docx
+++ b/Manual de Uso - Ferramenta de Gestao de Projetos.docx
@@ -229,7 +229,7 @@
         <w:rPr>
           <w:noProof/>
         </w:rPr>
-        <w:instrText xml:space="preserve"> PAGEREF _Toc240035145 \h </w:instrText>
+        <w:instrText xml:space="preserve"> PAGEREF _Toc240036044 \h </w:instrText>
       </w:r>
       <w:r>
         <w:rPr>
@@ -290,7 +290,7 @@
         <w:rPr>
           <w:noProof/>
         </w:rPr>
-        <w:instrText xml:space="preserve"> PAGEREF _Toc240035146 \h </w:instrText>
+        <w:instrText xml:space="preserve"> PAGEREF _Toc240036045 \h </w:instrText>
       </w:r>
       <w:r>
         <w:rPr>
@@ -351,7 +351,7 @@
         <w:rPr>
           <w:noProof/>
         </w:rPr>
-        <w:instrText xml:space="preserve"> PAGEREF _Toc240035147 \h </w:instrText>
+        <w:instrText xml:space="preserve"> PAGEREF _Toc240036046 \h </w:instrText>
       </w:r>
       <w:r>
         <w:rPr>
@@ -412,7 +412,7 @@
         <w:rPr>
           <w:noProof/>
         </w:rPr>
-        <w:instrText xml:space="preserve"> PAGEREF _Toc240035148 \h </w:instrText>
+        <w:instrText xml:space="preserve"> PAGEREF _Toc240036047 \h </w:instrText>
       </w:r>
       <w:r>
         <w:rPr>
@@ -473,7 +473,7 @@
         <w:rPr>
           <w:noProof/>
         </w:rPr>
-        <w:instrText xml:space="preserve"> PAGEREF _Toc240035149 \h </w:instrText>
+        <w:instrText xml:space="preserve"> PAGEREF _Toc240036048 \h </w:instrText>
       </w:r>
       <w:r>
         <w:rPr>
@@ -534,7 +534,7 @@
         <w:rPr>
           <w:noProof/>
         </w:rPr>
-        <w:instrText xml:space="preserve"> PAGEREF _Toc240035150 \h </w:instrText>
+        <w:instrText xml:space="preserve"> PAGEREF _Toc240036049 \h </w:instrText>
       </w:r>
       <w:r>
         <w:rPr>
@@ -595,7 +595,7 @@
         <w:rPr>
           <w:noProof/>
         </w:rPr>
-        <w:instrText xml:space="preserve"> PAGEREF _Toc240035151 \h </w:instrText>
+        <w:instrText xml:space="preserve"> PAGEREF _Toc240036050 \h </w:instrText>
       </w:r>
       <w:r>
         <w:rPr>
@@ -656,7 +656,7 @@
         <w:rPr>
           <w:noProof/>
         </w:rPr>
-        <w:instrText xml:space="preserve"> PAGEREF _Toc240035152 \h </w:instrText>
+        <w:instrText xml:space="preserve"> PAGEREF _Toc240036051 \h </w:instrText>
       </w:r>
       <w:r>
         <w:rPr>
@@ -717,7 +717,7 @@
         <w:rPr>
           <w:noProof/>
         </w:rPr>
-        <w:instrText xml:space="preserve"> PAGEREF _Toc240035153 \h </w:instrText>
+        <w:instrText xml:space="preserve"> PAGEREF _Toc240036052 \h </w:instrText>
       </w:r>
       <w:r>
         <w:rPr>
@@ -778,7 +778,7 @@
         <w:rPr>
           <w:noProof/>
         </w:rPr>
-        <w:instrText xml:space="preserve"> PAGEREF _Toc240035154 \h </w:instrText>
+        <w:instrText xml:space="preserve"> PAGEREF _Toc240036053 \h </w:instrText>
       </w:r>
       <w:r>
         <w:rPr>
@@ -839,7 +839,7 @@
         <w:rPr>
           <w:noProof/>
         </w:rPr>
-        <w:instrText xml:space="preserve"> PAGEREF _Toc240035155 \h </w:instrText>
+        <w:instrText xml:space="preserve"> PAGEREF _Toc240036054 \h </w:instrText>
       </w:r>
       <w:r>
         <w:rPr>
@@ -900,7 +900,7 @@
         <w:rPr>
           <w:noProof/>
         </w:rPr>
-        <w:instrText xml:space="preserve"> PAGEREF _Toc240035156 \h </w:instrText>
+        <w:instrText xml:space="preserve"> PAGEREF _Toc240036055 \h </w:instrText>
       </w:r>
       <w:r>
         <w:rPr>
@@ -961,7 +961,7 @@
         <w:rPr>
           <w:noProof/>
         </w:rPr>
-        <w:instrText xml:space="preserve"> PAGEREF _Toc240035157 \h </w:instrText>
+        <w:instrText xml:space="preserve"> PAGEREF _Toc240036056 \h </w:instrText>
       </w:r>
       <w:r>
         <w:rPr>
@@ -1022,7 +1022,7 @@
         <w:rPr>
           <w:noProof/>
         </w:rPr>
-        <w:instrText xml:space="preserve"> PAGEREF _Toc240035158 \h </w:instrText>
+        <w:instrText xml:space="preserve"> PAGEREF _Toc240036057 \h </w:instrText>
       </w:r>
       <w:r>
         <w:rPr>
@@ -1083,7 +1083,7 @@
         <w:rPr>
           <w:noProof/>
         </w:rPr>
-        <w:instrText xml:space="preserve"> PAGEREF _Toc240035159 \h </w:instrText>
+        <w:instrText xml:space="preserve"> PAGEREF _Toc240036058 \h </w:instrText>
       </w:r>
       <w:r>
         <w:rPr>
@@ -1144,7 +1144,7 @@
         <w:rPr>
           <w:noProof/>
         </w:rPr>
-        <w:instrText xml:space="preserve"> PAGEREF _Toc240035160 \h </w:instrText>
+        <w:instrText xml:space="preserve"> PAGEREF _Toc240036059 \h </w:instrText>
       </w:r>
       <w:r>
         <w:rPr>
@@ -1205,7 +1205,7 @@
         <w:rPr>
           <w:noProof/>
         </w:rPr>
-        <w:instrText xml:space="preserve"> PAGEREF _Toc240035161 \h </w:instrText>
+        <w:instrText xml:space="preserve"> PAGEREF _Toc240036060 \h </w:instrText>
       </w:r>
       <w:r>
         <w:rPr>
@@ -1266,7 +1266,7 @@
         <w:rPr>
           <w:noProof/>
         </w:rPr>
-        <w:instrText xml:space="preserve"> PAGEREF _Toc240035162 \h </w:instrText>
+        <w:instrText xml:space="preserve"> PAGEREF _Toc240036061 \h </w:instrText>
       </w:r>
       <w:r>
         <w:rPr>
@@ -1327,7 +1327,7 @@
         <w:rPr>
           <w:noProof/>
         </w:rPr>
-        <w:instrText xml:space="preserve"> PAGEREF _Toc240035163 \h </w:instrText>
+        <w:instrText xml:space="preserve"> PAGEREF _Toc240036062 \h </w:instrText>
       </w:r>
       <w:r>
         <w:rPr>
@@ -1388,7 +1388,7 @@
         <w:rPr>
           <w:noProof/>
         </w:rPr>
-        <w:instrText xml:space="preserve"> PAGEREF _Toc240035164 \h </w:instrText>
+        <w:instrText xml:space="preserve"> PAGEREF _Toc240036063 \h </w:instrText>
       </w:r>
       <w:r>
         <w:rPr>
@@ -1449,7 +1449,7 @@
         <w:rPr>
           <w:noProof/>
         </w:rPr>
-        <w:instrText xml:space="preserve"> PAGEREF _Toc240035165 \h </w:instrText>
+        <w:instrText xml:space="preserve"> PAGEREF _Toc240036064 \h </w:instrText>
       </w:r>
       <w:r>
         <w:rPr>
@@ -1510,7 +1510,7 @@
         <w:rPr>
           <w:noProof/>
         </w:rPr>
-        <w:instrText xml:space="preserve"> PAGEREF _Toc240035166 \h </w:instrText>
+        <w:instrText xml:space="preserve"> PAGEREF _Toc240036065 \h </w:instrText>
       </w:r>
       <w:r>
         <w:rPr>
@@ -1571,7 +1571,7 @@
         <w:rPr>
           <w:noProof/>
         </w:rPr>
-        <w:instrText xml:space="preserve"> PAGEREF _Toc240035167 \h </w:instrText>
+        <w:instrText xml:space="preserve"> PAGEREF _Toc240036066 \h </w:instrText>
       </w:r>
       <w:r>
         <w:rPr>
@@ -1632,7 +1632,7 @@
         <w:rPr>
           <w:noProof/>
         </w:rPr>
-        <w:instrText xml:space="preserve"> PAGEREF _Toc240035168 \h </w:instrText>
+        <w:instrText xml:space="preserve"> PAGEREF _Toc240036067 \h </w:instrText>
       </w:r>
       <w:r>
         <w:rPr>
@@ -1693,7 +1693,7 @@
         <w:rPr>
           <w:noProof/>
         </w:rPr>
-        <w:instrText xml:space="preserve"> PAGEREF _Toc240035169 \h </w:instrText>
+        <w:instrText xml:space="preserve"> PAGEREF _Toc240036068 \h </w:instrText>
       </w:r>
       <w:r>
         <w:rPr>
@@ -1755,7 +1755,7 @@
         <w:rPr>
           <w:noProof/>
         </w:rPr>
-        <w:instrText xml:space="preserve"> PAGEREF _Toc240035170 \h </w:instrText>
+        <w:instrText xml:space="preserve"> PAGEREF _Toc240036069 \h </w:instrText>
       </w:r>
       <w:r>
         <w:rPr>
@@ -1816,7 +1816,7 @@
         <w:rPr>
           <w:noProof/>
         </w:rPr>
-        <w:instrText xml:space="preserve"> PAGEREF _Toc240035171 \h </w:instrText>
+        <w:instrText xml:space="preserve"> PAGEREF _Toc240036070 \h </w:instrText>
       </w:r>
       <w:r>
         <w:rPr>
@@ -1877,7 +1877,7 @@
         <w:rPr>
           <w:noProof/>
         </w:rPr>
-        <w:instrText xml:space="preserve"> PAGEREF _Toc240035172 \h </w:instrText>
+        <w:instrText xml:space="preserve"> PAGEREF _Toc240036071 \h </w:instrText>
       </w:r>
       <w:r>
         <w:rPr>
@@ -1938,7 +1938,7 @@
         <w:rPr>
           <w:noProof/>
         </w:rPr>
-        <w:instrText xml:space="preserve"> PAGEREF _Toc240035173 \h </w:instrText>
+        <w:instrText xml:space="preserve"> PAGEREF _Toc240036072 \h </w:instrText>
       </w:r>
       <w:r>
         <w:rPr>
@@ -1999,7 +1999,7 @@
         <w:rPr>
           <w:noProof/>
         </w:rPr>
-        <w:instrText xml:space="preserve"> PAGEREF _Toc240035174 \h </w:instrText>
+        <w:instrText xml:space="preserve"> PAGEREF _Toc240036073 \h </w:instrText>
       </w:r>
       <w:r>
         <w:rPr>
@@ -2060,7 +2060,7 @@
         <w:rPr>
           <w:noProof/>
         </w:rPr>
-        <w:instrText xml:space="preserve"> PAGEREF _Toc240035175 \h </w:instrText>
+        <w:instrText xml:space="preserve"> PAGEREF _Toc240036074 \h </w:instrText>
       </w:r>
       <w:r>
         <w:rPr>
@@ -2121,7 +2121,7 @@
         <w:rPr>
           <w:noProof/>
         </w:rPr>
-        <w:instrText xml:space="preserve"> PAGEREF _Toc240035176 \h </w:instrText>
+        <w:instrText xml:space="preserve"> PAGEREF _Toc240036075 \h </w:instrText>
       </w:r>
       <w:r>
         <w:rPr>
@@ -2182,7 +2182,7 @@
         <w:rPr>
           <w:noProof/>
         </w:rPr>
-        <w:instrText xml:space="preserve"> PAGEREF _Toc240035177 \h </w:instrText>
+        <w:instrText xml:space="preserve"> PAGEREF _Toc240036076 \h </w:instrText>
       </w:r>
       <w:r>
         <w:rPr>
@@ -2243,7 +2243,7 @@
         <w:rPr>
           <w:noProof/>
         </w:rPr>
-        <w:instrText xml:space="preserve"> PAGEREF _Toc240035178 \h </w:instrText>
+        <w:instrText xml:space="preserve"> PAGEREF _Toc240036077 \h </w:instrText>
       </w:r>
       <w:r>
         <w:rPr>
@@ -2304,7 +2304,7 @@
         <w:rPr>
           <w:noProof/>
         </w:rPr>
-        <w:instrText xml:space="preserve"> PAGEREF _Toc240035179 \h </w:instrText>
+        <w:instrText xml:space="preserve"> PAGEREF _Toc240036078 \h </w:instrText>
       </w:r>
       <w:r>
         <w:rPr>
@@ -2365,7 +2365,7 @@
         <w:rPr>
           <w:noProof/>
         </w:rPr>
-        <w:instrText xml:space="preserve"> PAGEREF _Toc240035180 \h </w:instrText>
+        <w:instrText xml:space="preserve"> PAGEREF _Toc240036079 \h </w:instrText>
       </w:r>
       <w:r>
         <w:rPr>
@@ -2426,7 +2426,7 @@
         <w:rPr>
           <w:noProof/>
         </w:rPr>
-        <w:instrText xml:space="preserve"> PAGEREF _Toc240035181 \h </w:instrText>
+        <w:instrText xml:space="preserve"> PAGEREF _Toc240036080 \h </w:instrText>
       </w:r>
       <w:r>
         <w:rPr>
@@ -2487,7 +2487,7 @@
         <w:rPr>
           <w:noProof/>
         </w:rPr>
-        <w:instrText xml:space="preserve"> PAGEREF _Toc240035182 \h </w:instrText>
+        <w:instrText xml:space="preserve"> PAGEREF _Toc240036081 \h </w:instrText>
       </w:r>
       <w:r>
         <w:rPr>
@@ -2548,7 +2548,7 @@
         <w:rPr>
           <w:noProof/>
         </w:rPr>
-        <w:instrText xml:space="preserve"> PAGEREF _Toc240035183 \h </w:instrText>
+        <w:instrText xml:space="preserve"> PAGEREF _Toc240036082 \h </w:instrText>
       </w:r>
       <w:r>
         <w:rPr>
@@ -2609,7 +2609,7 @@
         <w:rPr>
           <w:noProof/>
         </w:rPr>
-        <w:instrText xml:space="preserve"> PAGEREF _Toc240035184 \h </w:instrText>
+        <w:instrText xml:space="preserve"> PAGEREF _Toc240036083 \h </w:instrText>
       </w:r>
       <w:r>
         <w:rPr>
@@ -2670,7 +2670,7 @@
         <w:rPr>
           <w:noProof/>
         </w:rPr>
-        <w:instrText xml:space="preserve"> PAGEREF _Toc240035185 \h </w:instrText>
+        <w:instrText xml:space="preserve"> PAGEREF _Toc240036084 \h </w:instrText>
       </w:r>
       <w:r>
         <w:rPr>
@@ -2731,7 +2731,7 @@
         <w:rPr>
           <w:noProof/>
         </w:rPr>
-        <w:instrText xml:space="preserve"> PAGEREF _Toc240035186 \h </w:instrText>
+        <w:instrText xml:space="preserve"> PAGEREF _Toc240036085 \h </w:instrText>
       </w:r>
       <w:r>
         <w:rPr>
@@ -2792,7 +2792,7 @@
         <w:rPr>
           <w:noProof/>
         </w:rPr>
-        <w:instrText xml:space="preserve"> PAGEREF _Toc240035187 \h </w:instrText>
+        <w:instrText xml:space="preserve"> PAGEREF _Toc240036086 \h </w:instrText>
       </w:r>
       <w:r>
         <w:rPr>
@@ -2853,7 +2853,7 @@
         <w:rPr>
           <w:noProof/>
         </w:rPr>
-        <w:instrText xml:space="preserve"> PAGEREF _Toc240035188 \h </w:instrText>
+        <w:instrText xml:space="preserve"> PAGEREF _Toc240036087 \h </w:instrText>
       </w:r>
       <w:r>
         <w:rPr>
@@ -2914,7 +2914,7 @@
         <w:rPr>
           <w:noProof/>
         </w:rPr>
-        <w:instrText xml:space="preserve"> PAGEREF _Toc240035189 \h </w:instrText>
+        <w:instrText xml:space="preserve"> PAGEREF _Toc240036088 \h </w:instrText>
       </w:r>
       <w:r>
         <w:rPr>
@@ -2975,7 +2975,7 @@
         <w:rPr>
           <w:noProof/>
         </w:rPr>
-        <w:instrText xml:space="preserve"> PAGEREF _Toc240035190 \h </w:instrText>
+        <w:instrText xml:space="preserve"> PAGEREF _Toc240036089 \h </w:instrText>
       </w:r>
       <w:r>
         <w:rPr>
@@ -3036,7 +3036,7 @@
         <w:rPr>
           <w:noProof/>
         </w:rPr>
-        <w:instrText xml:space="preserve"> PAGEREF _Toc240035191 \h </w:instrText>
+        <w:instrText xml:space="preserve"> PAGEREF _Toc240036090 \h </w:instrText>
       </w:r>
       <w:r>
         <w:rPr>
@@ -3097,7 +3097,7 @@
         <w:rPr>
           <w:noProof/>
         </w:rPr>
-        <w:instrText xml:space="preserve"> PAGEREF _Toc240035192 \h </w:instrText>
+        <w:instrText xml:space="preserve"> PAGEREF _Toc240036091 \h </w:instrText>
       </w:r>
       <w:r>
         <w:rPr>
@@ -3173,7 +3173,7 @@
           <w:sz w:val="34"/>
         </w:rPr>
       </w:pPr>
-      <w:bookmarkStart w:id="0" w:name="_Toc240035145"/>
+      <w:bookmarkStart w:id="0" w:name="_Toc240036044"/>
       <w:r>
         <w:rPr>
           <w:rFonts w:ascii="Montserrat" w:hAnsi="Montserrat"/>
@@ -3197,7 +3197,7 @@
           <w:sz w:val="27"/>
         </w:rPr>
       </w:pPr>
-      <w:bookmarkStart w:id="1" w:name="_Toc240035146"/>
+      <w:bookmarkStart w:id="1" w:name="_Toc240036045"/>
       <w:r>
         <w:rPr>
           <w:rFonts w:ascii="Montserrat" w:hAnsi="Montserrat"/>
@@ -4403,6 +4403,25 @@
           <w:color w:val="1A1A1A"/>
           <w:sz w:val="22"/>
         </w:rPr>
+        <w:t>Esta e a versao 2.59 do manual. Em relacao a versao 2.58 (11/09/2026), a Fase 3 fecha a proposta de custos por categoria: a Ficha do Projeto (secao 6.4.1) ganhou a secao Custos: Estimado (TAP) x Realizado, um drill-down do cartao de Orcamento da Saude do projeto - a mesma tabela do Comparativo por categoria do Relatorio de Situacao, agora consolidada na visao de projeto unico, sem precisar abrir os dois formularios separadamente para comparar.</w:t>
+      </w:r>
+    </w:p>
+    <w:p>
+      <w:pPr>
+        <w:spacing w:line="280" w:lineRule="auto"/>
+        <w:rPr>
+          <w:rFonts w:ascii="Montserrat" w:hAnsi="Montserrat"/>
+          <w:color w:val="1A1A1A"/>
+          <w:sz w:val="22"/>
+        </w:rPr>
+      </w:pPr>
+      <w:r>
+        <w:rPr>
+          <w:rFonts w:ascii="Montserrat" w:hAnsi="Montserrat"/>
+          <w:color w:val="1A1A1A"/>
+          <w:sz w:val="22"/>
+        </w:rPr>
+        <w:lastRenderedPageBreak/>
         <w:t>O manual nao substitui as Diretrizes para a Gestao de Projetos da UNIALFA (documento institucional que define o framework D01 a D07) nem o documento Regras de Acesso e Permissoes (que detalha cada regra de controle de acesso); ele e o guia operacional de como usar cada ferramenta na pratica.</w:t>
       </w:r>
     </w:p>
@@ -4417,7 +4436,7 @@
           <w:sz w:val="27"/>
         </w:rPr>
       </w:pPr>
-      <w:bookmarkStart w:id="2" w:name="_Toc240035147"/>
+      <w:bookmarkStart w:id="2" w:name="_Toc240036046"/>
       <w:r>
         <w:rPr>
           <w:rFonts w:ascii="Montserrat" w:hAnsi="Montserrat"/>
@@ -4425,7 +4444,6 @@
           <w:color w:val="B91D2E"/>
           <w:sz w:val="27"/>
         </w:rPr>
-        <w:lastRenderedPageBreak/>
         <w:t>1.2 Visao geral da ferramenta</w:t>
       </w:r>
       <w:bookmarkEnd w:id="2"/>
@@ -4615,16 +4633,16 @@
         </w:rPr>
         <w:lastRenderedPageBreak/>
         <w:drawing>
-          <wp:inline distT="0" distB="0" distL="0" distR="0" wp14:anchorId="39E91D6F" wp14:editId="272568F0">
+          <wp:inline distT="0" distB="0" distL="0" distR="0" wp14:anchorId="0F89095A" wp14:editId="127DBC56">
             <wp:extent cx="5303520" cy="4792851"/>
             <wp:effectExtent l="19050" t="19050" r="11430" b="27305"/>
-            <wp:docPr id="1003791119" name="Imagem 1"/>
+            <wp:docPr id="325608181" name="Imagem 1"/>
             <wp:cNvGraphicFramePr/>
             <a:graphic xmlns:a="http://schemas.openxmlformats.org/drawingml/2006/main">
               <a:graphicData uri="http://schemas.openxmlformats.org/drawingml/2006/picture">
                 <pic:pic xmlns:pic="http://schemas.openxmlformats.org/drawingml/2006/picture">
                   <pic:nvPicPr>
-                    <pic:cNvPr id="1003791119" name=""/>
+                    <pic:cNvPr id="325608181" name=""/>
                     <pic:cNvPicPr/>
                   </pic:nvPicPr>
                   <pic:blipFill>
@@ -4692,7 +4710,7 @@
           <w:sz w:val="27"/>
         </w:rPr>
       </w:pPr>
-      <w:bookmarkStart w:id="3" w:name="_Toc240035148"/>
+      <w:bookmarkStart w:id="3" w:name="_Toc240036047"/>
       <w:r>
         <w:rPr>
           <w:rFonts w:ascii="Montserrat" w:hAnsi="Montserrat"/>
@@ -4733,16 +4751,16 @@
         </w:rPr>
         <w:lastRenderedPageBreak/>
         <w:drawing>
-          <wp:inline distT="0" distB="0" distL="0" distR="0" wp14:anchorId="75A087B4" wp14:editId="321D2D95">
+          <wp:inline distT="0" distB="0" distL="0" distR="0" wp14:anchorId="39BCF97B" wp14:editId="79E24F0B">
             <wp:extent cx="4206240" cy="3801227"/>
             <wp:effectExtent l="19050" t="19050" r="22860" b="27940"/>
-            <wp:docPr id="566222747" name="Imagem 2"/>
+            <wp:docPr id="2078573891" name="Imagem 2"/>
             <wp:cNvGraphicFramePr/>
             <a:graphic xmlns:a="http://schemas.openxmlformats.org/drawingml/2006/main">
               <a:graphicData uri="http://schemas.openxmlformats.org/drawingml/2006/picture">
                 <pic:pic xmlns:pic="http://schemas.openxmlformats.org/drawingml/2006/picture">
                   <pic:nvPicPr>
-                    <pic:cNvPr id="566222747" name=""/>
+                    <pic:cNvPr id="2078573891" name=""/>
                     <pic:cNvPicPr/>
                   </pic:nvPicPr>
                   <pic:blipFill>
@@ -4915,7 +4933,7 @@
           <w:sz w:val="27"/>
         </w:rPr>
       </w:pPr>
-      <w:bookmarkStart w:id="4" w:name="_Toc240035149"/>
+      <w:bookmarkStart w:id="4" w:name="_Toc240036048"/>
       <w:r>
         <w:rPr>
           <w:rFonts w:ascii="Montserrat" w:hAnsi="Montserrat"/>
@@ -6154,7 +6172,7 @@
           <w:sz w:val="34"/>
         </w:rPr>
       </w:pPr>
-      <w:bookmarkStart w:id="5" w:name="_Toc240035150"/>
+      <w:bookmarkStart w:id="5" w:name="_Toc240036049"/>
       <w:r>
         <w:rPr>
           <w:rFonts w:ascii="Montserrat" w:hAnsi="Montserrat"/>
@@ -6178,7 +6196,7 @@
           <w:sz w:val="27"/>
         </w:rPr>
       </w:pPr>
-      <w:bookmarkStart w:id="6" w:name="_Toc240035151"/>
+      <w:bookmarkStart w:id="6" w:name="_Toc240036050"/>
       <w:r>
         <w:rPr>
           <w:rFonts w:ascii="Montserrat" w:hAnsi="Montserrat"/>
@@ -6219,7 +6237,7 @@
           <w:sz w:val="27"/>
         </w:rPr>
       </w:pPr>
-      <w:bookmarkStart w:id="7" w:name="_Toc240035152"/>
+      <w:bookmarkStart w:id="7" w:name="_Toc240036051"/>
       <w:r>
         <w:rPr>
           <w:rFonts w:ascii="Montserrat" w:hAnsi="Montserrat"/>
@@ -6338,7 +6356,7 @@
           <w:sz w:val="27"/>
         </w:rPr>
       </w:pPr>
-      <w:bookmarkStart w:id="8" w:name="_Toc240035153"/>
+      <w:bookmarkStart w:id="8" w:name="_Toc240036052"/>
       <w:r>
         <w:rPr>
           <w:rFonts w:ascii="Montserrat" w:hAnsi="Montserrat"/>
@@ -6951,7 +6969,7 @@
           <w:sz w:val="27"/>
         </w:rPr>
       </w:pPr>
-      <w:bookmarkStart w:id="9" w:name="_Toc240035154"/>
+      <w:bookmarkStart w:id="9" w:name="_Toc240036053"/>
       <w:r>
         <w:rPr>
           <w:rFonts w:ascii="Montserrat" w:hAnsi="Montserrat"/>
@@ -7040,16 +7058,16 @@
         </w:rPr>
         <w:lastRenderedPageBreak/>
         <w:drawing>
-          <wp:inline distT="0" distB="0" distL="0" distR="0" wp14:anchorId="1E306D88" wp14:editId="7572D2CB">
+          <wp:inline distT="0" distB="0" distL="0" distR="0" wp14:anchorId="5DAD1294" wp14:editId="18835626">
             <wp:extent cx="4937760" cy="4462310"/>
             <wp:effectExtent l="19050" t="19050" r="15240" b="14605"/>
-            <wp:docPr id="1935104332" name="Imagem 3"/>
+            <wp:docPr id="535153231" name="Imagem 3"/>
             <wp:cNvGraphicFramePr/>
             <a:graphic xmlns:a="http://schemas.openxmlformats.org/drawingml/2006/main">
               <a:graphicData uri="http://schemas.openxmlformats.org/drawingml/2006/picture">
                 <pic:pic xmlns:pic="http://schemas.openxmlformats.org/drawingml/2006/picture">
                   <pic:nvPicPr>
-                    <pic:cNvPr id="1935104332" name=""/>
+                    <pic:cNvPr id="535153231" name=""/>
                     <pic:cNvPicPr/>
                   </pic:nvPicPr>
                   <pic:blipFill>
@@ -7117,7 +7135,7 @@
           <w:sz w:val="27"/>
         </w:rPr>
       </w:pPr>
-      <w:bookmarkStart w:id="10" w:name="_Toc240035155"/>
+      <w:bookmarkStart w:id="10" w:name="_Toc240036054"/>
       <w:r>
         <w:rPr>
           <w:rFonts w:ascii="Montserrat" w:hAnsi="Montserrat"/>
@@ -7158,16 +7176,16 @@
         </w:rPr>
         <w:lastRenderedPageBreak/>
         <w:drawing>
-          <wp:inline distT="0" distB="0" distL="0" distR="0" wp14:anchorId="5B7A9330" wp14:editId="78A67C75">
+          <wp:inline distT="0" distB="0" distL="0" distR="0" wp14:anchorId="363CC2F2" wp14:editId="541DA9C4">
             <wp:extent cx="5120640" cy="4627581"/>
             <wp:effectExtent l="19050" t="19050" r="22860" b="20955"/>
-            <wp:docPr id="663818583" name="Imagem 4"/>
+            <wp:docPr id="1930532760" name="Imagem 4"/>
             <wp:cNvGraphicFramePr/>
             <a:graphic xmlns:a="http://schemas.openxmlformats.org/drawingml/2006/main">
               <a:graphicData uri="http://schemas.openxmlformats.org/drawingml/2006/picture">
                 <pic:pic xmlns:pic="http://schemas.openxmlformats.org/drawingml/2006/picture">
                   <pic:nvPicPr>
-                    <pic:cNvPr id="663818583" name=""/>
+                    <pic:cNvPr id="1930532760" name=""/>
                     <pic:cNvPicPr/>
                   </pic:nvPicPr>
                   <pic:blipFill>
@@ -7335,7 +7353,7 @@
           <w:sz w:val="27"/>
         </w:rPr>
       </w:pPr>
-      <w:bookmarkStart w:id="11" w:name="_Toc240035156"/>
+      <w:bookmarkStart w:id="11" w:name="_Toc240036055"/>
       <w:r>
         <w:rPr>
           <w:rFonts w:ascii="Montserrat" w:hAnsi="Montserrat"/>
@@ -7375,16 +7393,16 @@
           <w:noProof/>
         </w:rPr>
         <w:drawing>
-          <wp:inline distT="0" distB="0" distL="0" distR="0" wp14:anchorId="565A3825" wp14:editId="0BBECF23">
+          <wp:inline distT="0" distB="0" distL="0" distR="0" wp14:anchorId="4F195B69" wp14:editId="5E1F829B">
             <wp:extent cx="4206240" cy="3801227"/>
             <wp:effectExtent l="19050" t="19050" r="22860" b="27940"/>
-            <wp:docPr id="1413775506" name="Imagem 5"/>
+            <wp:docPr id="34173016" name="Imagem 5"/>
             <wp:cNvGraphicFramePr/>
             <a:graphic xmlns:a="http://schemas.openxmlformats.org/drawingml/2006/main">
               <a:graphicData uri="http://schemas.openxmlformats.org/drawingml/2006/picture">
                 <pic:pic xmlns:pic="http://schemas.openxmlformats.org/drawingml/2006/picture">
                   <pic:nvPicPr>
-                    <pic:cNvPr id="1413775506" name=""/>
+                    <pic:cNvPr id="34173016" name=""/>
                     <pic:cNvPicPr/>
                   </pic:nvPicPr>
                   <pic:blipFill>
@@ -7452,16 +7470,16 @@
         </w:rPr>
         <w:lastRenderedPageBreak/>
         <w:drawing>
-          <wp:inline distT="0" distB="0" distL="0" distR="0" wp14:anchorId="7E8832FD" wp14:editId="3E317E15">
+          <wp:inline distT="0" distB="0" distL="0" distR="0" wp14:anchorId="5D5871BB" wp14:editId="4BA39888">
             <wp:extent cx="4206240" cy="3801227"/>
             <wp:effectExtent l="19050" t="19050" r="22860" b="27940"/>
-            <wp:docPr id="1948461065" name="Imagem 6"/>
+            <wp:docPr id="1691067200" name="Imagem 6"/>
             <wp:cNvGraphicFramePr/>
             <a:graphic xmlns:a="http://schemas.openxmlformats.org/drawingml/2006/main">
               <a:graphicData uri="http://schemas.openxmlformats.org/drawingml/2006/picture">
                 <pic:pic xmlns:pic="http://schemas.openxmlformats.org/drawingml/2006/picture">
                   <pic:nvPicPr>
-                    <pic:cNvPr id="1948461065" name=""/>
+                    <pic:cNvPr id="1691067200" name=""/>
                     <pic:cNvPicPr/>
                   </pic:nvPicPr>
                   <pic:blipFill>
@@ -7577,7 +7595,7 @@
           <w:sz w:val="27"/>
         </w:rPr>
       </w:pPr>
-      <w:bookmarkStart w:id="12" w:name="_Toc240035157"/>
+      <w:bookmarkStart w:id="12" w:name="_Toc240036056"/>
       <w:r>
         <w:rPr>
           <w:rFonts w:ascii="Montserrat" w:hAnsi="Montserrat"/>
@@ -7645,7 +7663,7 @@
           <w:sz w:val="27"/>
         </w:rPr>
       </w:pPr>
-      <w:bookmarkStart w:id="13" w:name="_Toc240035158"/>
+      <w:bookmarkStart w:id="13" w:name="_Toc240036057"/>
       <w:r>
         <w:rPr>
           <w:rFonts w:ascii="Montserrat" w:hAnsi="Montserrat"/>
@@ -7872,7 +7890,7 @@
           <w:sz w:val="27"/>
         </w:rPr>
       </w:pPr>
-      <w:bookmarkStart w:id="14" w:name="_Toc240035159"/>
+      <w:bookmarkStart w:id="14" w:name="_Toc240036058"/>
       <w:r>
         <w:rPr>
           <w:rFonts w:ascii="Montserrat" w:hAnsi="Montserrat"/>
@@ -8031,7 +8049,7 @@
           <w:sz w:val="27"/>
         </w:rPr>
       </w:pPr>
-      <w:bookmarkStart w:id="15" w:name="_Toc240035160"/>
+      <w:bookmarkStart w:id="15" w:name="_Toc240036059"/>
       <w:r>
         <w:rPr>
           <w:rFonts w:ascii="Montserrat" w:hAnsi="Montserrat"/>
@@ -8213,7 +8231,7 @@
           <w:sz w:val="27"/>
         </w:rPr>
       </w:pPr>
-      <w:bookmarkStart w:id="16" w:name="_Toc240035161"/>
+      <w:bookmarkStart w:id="16" w:name="_Toc240036060"/>
       <w:r>
         <w:rPr>
           <w:rFonts w:ascii="Montserrat" w:hAnsi="Montserrat"/>
@@ -8341,7 +8359,7 @@
           <w:sz w:val="27"/>
         </w:rPr>
       </w:pPr>
-      <w:bookmarkStart w:id="17" w:name="_Toc240035162"/>
+      <w:bookmarkStart w:id="17" w:name="_Toc240036061"/>
       <w:r>
         <w:rPr>
           <w:rFonts w:ascii="Montserrat" w:hAnsi="Montserrat"/>
@@ -8671,7 +8689,7 @@
           <w:sz w:val="27"/>
         </w:rPr>
       </w:pPr>
-      <w:bookmarkStart w:id="18" w:name="_Toc240035163"/>
+      <w:bookmarkStart w:id="18" w:name="_Toc240036062"/>
       <w:r>
         <w:rPr>
           <w:rFonts w:ascii="Montserrat" w:hAnsi="Montserrat"/>
@@ -8812,7 +8830,7 @@
           <w:sz w:val="34"/>
         </w:rPr>
       </w:pPr>
-      <w:bookmarkStart w:id="19" w:name="_Toc240035164"/>
+      <w:bookmarkStart w:id="19" w:name="_Toc240036063"/>
       <w:r>
         <w:rPr>
           <w:rFonts w:ascii="Montserrat" w:hAnsi="Montserrat"/>
@@ -8854,7 +8872,7 @@
           <w:sz w:val="27"/>
         </w:rPr>
       </w:pPr>
-      <w:bookmarkStart w:id="20" w:name="_Toc240035165"/>
+      <w:bookmarkStart w:id="20" w:name="_Toc240036064"/>
       <w:r>
         <w:rPr>
           <w:rFonts w:ascii="Montserrat" w:hAnsi="Montserrat"/>
@@ -9934,16 +9952,16 @@
         </w:rPr>
         <w:lastRenderedPageBreak/>
         <w:drawing>
-          <wp:inline distT="0" distB="0" distL="0" distR="0" wp14:anchorId="1C3E466E" wp14:editId="44289A91">
+          <wp:inline distT="0" distB="0" distL="0" distR="0" wp14:anchorId="7E8737CD" wp14:editId="42917A18">
             <wp:extent cx="5120640" cy="4627581"/>
             <wp:effectExtent l="19050" t="19050" r="22860" b="20955"/>
-            <wp:docPr id="235778498" name="Imagem 7"/>
+            <wp:docPr id="325185815" name="Imagem 7"/>
             <wp:cNvGraphicFramePr/>
             <a:graphic xmlns:a="http://schemas.openxmlformats.org/drawingml/2006/main">
               <a:graphicData uri="http://schemas.openxmlformats.org/drawingml/2006/picture">
                 <pic:pic xmlns:pic="http://schemas.openxmlformats.org/drawingml/2006/picture">
                   <pic:nvPicPr>
-                    <pic:cNvPr id="235778498" name=""/>
+                    <pic:cNvPr id="325185815" name=""/>
                     <pic:cNvPicPr/>
                   </pic:nvPicPr>
                   <pic:blipFill>
@@ -10011,16 +10029,16 @@
         </w:rPr>
         <w:lastRenderedPageBreak/>
         <w:drawing>
-          <wp:inline distT="0" distB="0" distL="0" distR="0" wp14:anchorId="0014AA68" wp14:editId="4823BBB2">
+          <wp:inline distT="0" distB="0" distL="0" distR="0" wp14:anchorId="56A4BA09" wp14:editId="4F6EC0ED">
             <wp:extent cx="5120640" cy="4627581"/>
             <wp:effectExtent l="19050" t="19050" r="22860" b="20955"/>
-            <wp:docPr id="500230680" name="Imagem 8"/>
+            <wp:docPr id="746405082" name="Imagem 8"/>
             <wp:cNvGraphicFramePr/>
             <a:graphic xmlns:a="http://schemas.openxmlformats.org/drawingml/2006/main">
               <a:graphicData uri="http://schemas.openxmlformats.org/drawingml/2006/picture">
                 <pic:pic xmlns:pic="http://schemas.openxmlformats.org/drawingml/2006/picture">
                   <pic:nvPicPr>
-                    <pic:cNvPr id="500230680" name=""/>
+                    <pic:cNvPr id="746405082" name=""/>
                     <pic:cNvPicPr/>
                   </pic:nvPicPr>
                   <pic:blipFill>
@@ -10228,7 +10246,7 @@
           <w:sz w:val="27"/>
         </w:rPr>
       </w:pPr>
-      <w:bookmarkStart w:id="21" w:name="_Toc240035166"/>
+      <w:bookmarkStart w:id="21" w:name="_Toc240036065"/>
       <w:r>
         <w:rPr>
           <w:rFonts w:ascii="Montserrat" w:hAnsi="Montserrat"/>
@@ -11153,16 +11171,16 @@
           <w:noProof/>
         </w:rPr>
         <w:drawing>
-          <wp:inline distT="0" distB="0" distL="0" distR="0" wp14:anchorId="193A16C5" wp14:editId="2673AF39">
+          <wp:inline distT="0" distB="0" distL="0" distR="0" wp14:anchorId="556C49FA" wp14:editId="21B54C8F">
             <wp:extent cx="5120640" cy="4627581"/>
             <wp:effectExtent l="19050" t="19050" r="22860" b="20955"/>
-            <wp:docPr id="1595984938" name="Imagem 9"/>
+            <wp:docPr id="213404758" name="Imagem 9"/>
             <wp:cNvGraphicFramePr/>
             <a:graphic xmlns:a="http://schemas.openxmlformats.org/drawingml/2006/main">
               <a:graphicData uri="http://schemas.openxmlformats.org/drawingml/2006/picture">
                 <pic:pic xmlns:pic="http://schemas.openxmlformats.org/drawingml/2006/picture">
                   <pic:nvPicPr>
-                    <pic:cNvPr id="1595984938" name=""/>
+                    <pic:cNvPr id="213404758" name=""/>
                     <pic:cNvPicPr/>
                   </pic:nvPicPr>
                   <pic:blipFill>
@@ -11230,16 +11248,16 @@
         </w:rPr>
         <w:lastRenderedPageBreak/>
         <w:drawing>
-          <wp:inline distT="0" distB="0" distL="0" distR="0" wp14:anchorId="72CB67C1" wp14:editId="6E6BB686">
+          <wp:inline distT="0" distB="0" distL="0" distR="0" wp14:anchorId="798DCF58" wp14:editId="42628F38">
             <wp:extent cx="5120640" cy="4627581"/>
             <wp:effectExtent l="19050" t="19050" r="22860" b="20955"/>
-            <wp:docPr id="1337003452" name="Imagem 10"/>
+            <wp:docPr id="100847262" name="Imagem 10"/>
             <wp:cNvGraphicFramePr/>
             <a:graphic xmlns:a="http://schemas.openxmlformats.org/drawingml/2006/main">
               <a:graphicData uri="http://schemas.openxmlformats.org/drawingml/2006/picture">
                 <pic:pic xmlns:pic="http://schemas.openxmlformats.org/drawingml/2006/picture">
                   <pic:nvPicPr>
-                    <pic:cNvPr id="1337003452" name=""/>
+                    <pic:cNvPr id="100847262" name=""/>
                     <pic:cNvPicPr/>
                   </pic:nvPicPr>
                   <pic:blipFill>
@@ -11373,7 +11391,7 @@
           <w:sz w:val="27"/>
         </w:rPr>
       </w:pPr>
-      <w:bookmarkStart w:id="22" w:name="_Toc240035167"/>
+      <w:bookmarkStart w:id="22" w:name="_Toc240036066"/>
       <w:r>
         <w:rPr>
           <w:rFonts w:ascii="Montserrat" w:hAnsi="Montserrat"/>
@@ -12439,16 +12457,16 @@
           <w:noProof/>
         </w:rPr>
         <w:drawing>
-          <wp:inline distT="0" distB="0" distL="0" distR="0" wp14:anchorId="0E671C50" wp14:editId="3D10C1F9">
+          <wp:inline distT="0" distB="0" distL="0" distR="0" wp14:anchorId="3B861EE0" wp14:editId="7D11EA3F">
             <wp:extent cx="5120640" cy="3338440"/>
             <wp:effectExtent l="19050" t="19050" r="22860" b="14605"/>
-            <wp:docPr id="495544103" name="Imagem 11"/>
+            <wp:docPr id="734946004" name="Imagem 11"/>
             <wp:cNvGraphicFramePr/>
             <a:graphic xmlns:a="http://schemas.openxmlformats.org/drawingml/2006/main">
               <a:graphicData uri="http://schemas.openxmlformats.org/drawingml/2006/picture">
                 <pic:pic xmlns:pic="http://schemas.openxmlformats.org/drawingml/2006/picture">
                   <pic:nvPicPr>
-                    <pic:cNvPr id="495544103" name=""/>
+                    <pic:cNvPr id="734946004" name=""/>
                     <pic:cNvPicPr/>
                   </pic:nvPicPr>
                   <pic:blipFill>
@@ -12516,16 +12534,16 @@
         </w:rPr>
         <w:lastRenderedPageBreak/>
         <w:drawing>
-          <wp:inline distT="0" distB="0" distL="0" distR="0" wp14:anchorId="7F245F4E" wp14:editId="7E0DCF57">
+          <wp:inline distT="0" distB="0" distL="0" distR="0" wp14:anchorId="388DD4FC" wp14:editId="3906768F">
             <wp:extent cx="5120640" cy="4627581"/>
             <wp:effectExtent l="19050" t="19050" r="22860" b="20955"/>
-            <wp:docPr id="1147122374" name="Imagem 12"/>
+            <wp:docPr id="1824853848" name="Imagem 12"/>
             <wp:cNvGraphicFramePr/>
             <a:graphic xmlns:a="http://schemas.openxmlformats.org/drawingml/2006/main">
               <a:graphicData uri="http://schemas.openxmlformats.org/drawingml/2006/picture">
                 <pic:pic xmlns:pic="http://schemas.openxmlformats.org/drawingml/2006/picture">
                   <pic:nvPicPr>
-                    <pic:cNvPr id="1147122374" name=""/>
+                    <pic:cNvPr id="1824853848" name=""/>
                     <pic:cNvPicPr/>
                   </pic:nvPicPr>
                   <pic:blipFill>
@@ -12729,7 +12747,7 @@
           <w:sz w:val="27"/>
         </w:rPr>
       </w:pPr>
-      <w:bookmarkStart w:id="23" w:name="_Toc240035168"/>
+      <w:bookmarkStart w:id="23" w:name="_Toc240036067"/>
       <w:r>
         <w:rPr>
           <w:rFonts w:ascii="Montserrat" w:hAnsi="Montserrat"/>
@@ -13290,16 +13308,16 @@
           <w:noProof/>
         </w:rPr>
         <w:drawing>
-          <wp:inline distT="0" distB="0" distL="0" distR="0" wp14:anchorId="55EFBA86" wp14:editId="0509D44E">
+          <wp:inline distT="0" distB="0" distL="0" distR="0" wp14:anchorId="1FCC77F6" wp14:editId="79F89F8B">
             <wp:extent cx="5120640" cy="4627581"/>
             <wp:effectExtent l="19050" t="19050" r="22860" b="20955"/>
-            <wp:docPr id="1788411633" name="Imagem 13"/>
+            <wp:docPr id="1817659568" name="Imagem 13"/>
             <wp:cNvGraphicFramePr/>
             <a:graphic xmlns:a="http://schemas.openxmlformats.org/drawingml/2006/main">
               <a:graphicData uri="http://schemas.openxmlformats.org/drawingml/2006/picture">
                 <pic:pic xmlns:pic="http://schemas.openxmlformats.org/drawingml/2006/picture">
                   <pic:nvPicPr>
-                    <pic:cNvPr id="1788411633" name=""/>
+                    <pic:cNvPr id="1817659568" name=""/>
                     <pic:cNvPicPr/>
                   </pic:nvPicPr>
                   <pic:blipFill>
@@ -13367,16 +13385,16 @@
         </w:rPr>
         <w:lastRenderedPageBreak/>
         <w:drawing>
-          <wp:inline distT="0" distB="0" distL="0" distR="0" wp14:anchorId="3681E2B0" wp14:editId="67C30AD2">
+          <wp:inline distT="0" distB="0" distL="0" distR="0" wp14:anchorId="7DB6B3A1" wp14:editId="6A81F50B">
             <wp:extent cx="5120640" cy="4627581"/>
             <wp:effectExtent l="19050" t="19050" r="22860" b="20955"/>
-            <wp:docPr id="340002035" name="Imagem 14"/>
+            <wp:docPr id="528887340" name="Imagem 14"/>
             <wp:cNvGraphicFramePr/>
             <a:graphic xmlns:a="http://schemas.openxmlformats.org/drawingml/2006/main">
               <a:graphicData uri="http://schemas.openxmlformats.org/drawingml/2006/picture">
                 <pic:pic xmlns:pic="http://schemas.openxmlformats.org/drawingml/2006/picture">
                   <pic:nvPicPr>
-                    <pic:cNvPr id="340002035" name=""/>
+                    <pic:cNvPr id="528887340" name=""/>
                     <pic:cNvPicPr/>
                   </pic:nvPicPr>
                   <pic:blipFill>
@@ -13609,7 +13627,7 @@
           <w:sz w:val="27"/>
         </w:rPr>
       </w:pPr>
-      <w:bookmarkStart w:id="24" w:name="_Toc240035169"/>
+      <w:bookmarkStart w:id="24" w:name="_Toc240036068"/>
       <w:r>
         <w:rPr>
           <w:rFonts w:ascii="Montserrat" w:hAnsi="Montserrat"/>
@@ -13650,16 +13668,16 @@
           <w:noProof/>
         </w:rPr>
         <w:drawing>
-          <wp:inline distT="0" distB="0" distL="0" distR="0" wp14:anchorId="24E652C2" wp14:editId="2D26F682">
+          <wp:inline distT="0" distB="0" distL="0" distR="0" wp14:anchorId="30E5F877" wp14:editId="5FC797C5">
             <wp:extent cx="5120640" cy="4627581"/>
             <wp:effectExtent l="19050" t="19050" r="22860" b="20955"/>
-            <wp:docPr id="1440240569" name="Imagem 15"/>
+            <wp:docPr id="231719027" name="Imagem 15"/>
             <wp:cNvGraphicFramePr/>
             <a:graphic xmlns:a="http://schemas.openxmlformats.org/drawingml/2006/main">
               <a:graphicData uri="http://schemas.openxmlformats.org/drawingml/2006/picture">
                 <pic:pic xmlns:pic="http://schemas.openxmlformats.org/drawingml/2006/picture">
                   <pic:nvPicPr>
-                    <pic:cNvPr id="1440240569" name=""/>
+                    <pic:cNvPr id="231719027" name=""/>
                     <pic:cNvPicPr/>
                   </pic:nvPicPr>
                   <pic:blipFill>
@@ -13727,16 +13745,16 @@
         </w:rPr>
         <w:lastRenderedPageBreak/>
         <w:drawing>
-          <wp:inline distT="0" distB="0" distL="0" distR="0" wp14:anchorId="23C3F7A7" wp14:editId="13B0C195">
+          <wp:inline distT="0" distB="0" distL="0" distR="0" wp14:anchorId="114727F3" wp14:editId="56C6F976">
             <wp:extent cx="5120640" cy="4627581"/>
             <wp:effectExtent l="19050" t="19050" r="22860" b="20955"/>
-            <wp:docPr id="1112580351" name="Imagem 16"/>
+            <wp:docPr id="894720998" name="Imagem 16"/>
             <wp:cNvGraphicFramePr/>
             <a:graphic xmlns:a="http://schemas.openxmlformats.org/drawingml/2006/main">
               <a:graphicData uri="http://schemas.openxmlformats.org/drawingml/2006/picture">
                 <pic:pic xmlns:pic="http://schemas.openxmlformats.org/drawingml/2006/picture">
                   <pic:nvPicPr>
-                    <pic:cNvPr id="1112580351" name=""/>
+                    <pic:cNvPr id="894720998" name=""/>
                     <pic:cNvPicPr/>
                   </pic:nvPicPr>
                   <pic:blipFill>
@@ -13900,16 +13918,16 @@
         </w:rPr>
         <w:lastRenderedPageBreak/>
         <w:drawing>
-          <wp:inline distT="0" distB="0" distL="0" distR="0" wp14:anchorId="194CD03A" wp14:editId="58142B79">
+          <wp:inline distT="0" distB="0" distL="0" distR="0" wp14:anchorId="79887B54" wp14:editId="195A5D25">
             <wp:extent cx="5120640" cy="3282818"/>
             <wp:effectExtent l="19050" t="19050" r="22860" b="13335"/>
-            <wp:docPr id="819328150" name="Imagem 17"/>
+            <wp:docPr id="1543605700" name="Imagem 17"/>
             <wp:cNvGraphicFramePr/>
             <a:graphic xmlns:a="http://schemas.openxmlformats.org/drawingml/2006/main">
               <a:graphicData uri="http://schemas.openxmlformats.org/drawingml/2006/picture">
                 <pic:pic xmlns:pic="http://schemas.openxmlformats.org/drawingml/2006/picture">
                   <pic:nvPicPr>
-                    <pic:cNvPr id="819328150" name=""/>
+                    <pic:cNvPr id="1543605700" name=""/>
                     <pic:cNvPicPr/>
                   </pic:nvPicPr>
                   <pic:blipFill>
@@ -14043,7 +14061,7 @@
           <w:sz w:val="27"/>
         </w:rPr>
       </w:pPr>
-      <w:bookmarkStart w:id="25" w:name="_Toc240035170"/>
+      <w:bookmarkStart w:id="25" w:name="_Toc240036069"/>
       <w:r>
         <w:rPr>
           <w:rFonts w:ascii="Montserrat" w:hAnsi="Montserrat"/>
@@ -14084,16 +14102,16 @@
         </w:rPr>
         <w:lastRenderedPageBreak/>
         <w:drawing>
-          <wp:inline distT="0" distB="0" distL="0" distR="0" wp14:anchorId="42636378" wp14:editId="71573535">
+          <wp:inline distT="0" distB="0" distL="0" distR="0" wp14:anchorId="2419140F" wp14:editId="0B7F8B09">
             <wp:extent cx="5120640" cy="4627581"/>
             <wp:effectExtent l="19050" t="19050" r="22860" b="20955"/>
-            <wp:docPr id="1332011445" name="Imagem 18"/>
+            <wp:docPr id="1006326445" name="Imagem 18"/>
             <wp:cNvGraphicFramePr/>
             <a:graphic xmlns:a="http://schemas.openxmlformats.org/drawingml/2006/main">
               <a:graphicData uri="http://schemas.openxmlformats.org/drawingml/2006/picture">
                 <pic:pic xmlns:pic="http://schemas.openxmlformats.org/drawingml/2006/picture">
                   <pic:nvPicPr>
-                    <pic:cNvPr id="1332011445" name=""/>
+                    <pic:cNvPr id="1006326445" name=""/>
                     <pic:cNvPicPr/>
                   </pic:nvPicPr>
                   <pic:blipFill>
@@ -14161,16 +14179,16 @@
         </w:rPr>
         <w:lastRenderedPageBreak/>
         <w:drawing>
-          <wp:inline distT="0" distB="0" distL="0" distR="0" wp14:anchorId="3262D8E6" wp14:editId="5BE35589">
+          <wp:inline distT="0" distB="0" distL="0" distR="0" wp14:anchorId="73F9CDC2" wp14:editId="1FCB528B">
             <wp:extent cx="5120640" cy="4627581"/>
             <wp:effectExtent l="19050" t="19050" r="22860" b="20955"/>
-            <wp:docPr id="501659762" name="Imagem 19"/>
+            <wp:docPr id="665768860" name="Imagem 19"/>
             <wp:cNvGraphicFramePr/>
             <a:graphic xmlns:a="http://schemas.openxmlformats.org/drawingml/2006/main">
               <a:graphicData uri="http://schemas.openxmlformats.org/drawingml/2006/picture">
                 <pic:pic xmlns:pic="http://schemas.openxmlformats.org/drawingml/2006/picture">
                   <pic:nvPicPr>
-                    <pic:cNvPr id="501659762" name=""/>
+                    <pic:cNvPr id="665768860" name=""/>
                     <pic:cNvPicPr/>
                   </pic:nvPicPr>
                   <pic:blipFill>
@@ -14353,7 +14371,7 @@
           <w:sz w:val="27"/>
         </w:rPr>
       </w:pPr>
-      <w:bookmarkStart w:id="26" w:name="_Toc240035171"/>
+      <w:bookmarkStart w:id="26" w:name="_Toc240036070"/>
       <w:r>
         <w:rPr>
           <w:rFonts w:ascii="Montserrat" w:hAnsi="Montserrat"/>
@@ -14393,16 +14411,16 @@
           <w:noProof/>
         </w:rPr>
         <w:drawing>
-          <wp:inline distT="0" distB="0" distL="0" distR="0" wp14:anchorId="679B08E0" wp14:editId="7FC96B41">
+          <wp:inline distT="0" distB="0" distL="0" distR="0" wp14:anchorId="5A7E5932" wp14:editId="31E9FA45">
             <wp:extent cx="5120640" cy="4627581"/>
             <wp:effectExtent l="19050" t="19050" r="22860" b="20955"/>
-            <wp:docPr id="637101353" name="Imagem 20"/>
+            <wp:docPr id="1328774409" name="Imagem 20"/>
             <wp:cNvGraphicFramePr/>
             <a:graphic xmlns:a="http://schemas.openxmlformats.org/drawingml/2006/main">
               <a:graphicData uri="http://schemas.openxmlformats.org/drawingml/2006/picture">
                 <pic:pic xmlns:pic="http://schemas.openxmlformats.org/drawingml/2006/picture">
                   <pic:nvPicPr>
-                    <pic:cNvPr id="637101353" name=""/>
+                    <pic:cNvPr id="1328774409" name=""/>
                     <pic:cNvPicPr/>
                   </pic:nvPicPr>
                   <pic:blipFill>
@@ -14470,16 +14488,16 @@
         </w:rPr>
         <w:lastRenderedPageBreak/>
         <w:drawing>
-          <wp:inline distT="0" distB="0" distL="0" distR="0" wp14:anchorId="3B4075FE" wp14:editId="5E086BF2">
+          <wp:inline distT="0" distB="0" distL="0" distR="0" wp14:anchorId="014E8AB6" wp14:editId="68CE1450">
             <wp:extent cx="5120640" cy="4627581"/>
             <wp:effectExtent l="19050" t="19050" r="22860" b="20955"/>
-            <wp:docPr id="1409470578" name="Imagem 21"/>
+            <wp:docPr id="60891544" name="Imagem 21"/>
             <wp:cNvGraphicFramePr/>
             <a:graphic xmlns:a="http://schemas.openxmlformats.org/drawingml/2006/main">
               <a:graphicData uri="http://schemas.openxmlformats.org/drawingml/2006/picture">
                 <pic:pic xmlns:pic="http://schemas.openxmlformats.org/drawingml/2006/picture">
                   <pic:nvPicPr>
-                    <pic:cNvPr id="1409470578" name=""/>
+                    <pic:cNvPr id="60891544" name=""/>
                     <pic:cNvPicPr/>
                   </pic:nvPicPr>
                   <pic:blipFill>
@@ -14685,16 +14703,16 @@
           <w:noProof/>
         </w:rPr>
         <w:drawing>
-          <wp:inline distT="0" distB="0" distL="0" distR="0" wp14:anchorId="3C325BB3" wp14:editId="179F7E57">
+          <wp:inline distT="0" distB="0" distL="0" distR="0" wp14:anchorId="53E9E455" wp14:editId="3C8100E9">
             <wp:extent cx="5120640" cy="1757287"/>
             <wp:effectExtent l="19050" t="19050" r="22860" b="14605"/>
-            <wp:docPr id="255469244" name="Imagem 22"/>
+            <wp:docPr id="477291456" name="Imagem 22"/>
             <wp:cNvGraphicFramePr/>
             <a:graphic xmlns:a="http://schemas.openxmlformats.org/drawingml/2006/main">
               <a:graphicData uri="http://schemas.openxmlformats.org/drawingml/2006/picture">
                 <pic:pic xmlns:pic="http://schemas.openxmlformats.org/drawingml/2006/picture">
                   <pic:nvPicPr>
-                    <pic:cNvPr id="255469244" name=""/>
+                    <pic:cNvPr id="477291456" name=""/>
                     <pic:cNvPicPr/>
                   </pic:nvPicPr>
                   <pic:blipFill>
@@ -14807,7 +14825,7 @@
           <w:sz w:val="27"/>
         </w:rPr>
       </w:pPr>
-      <w:bookmarkStart w:id="27" w:name="_Toc240035172"/>
+      <w:bookmarkStart w:id="27" w:name="_Toc240036071"/>
       <w:r>
         <w:rPr>
           <w:rFonts w:ascii="Montserrat" w:hAnsi="Montserrat"/>
@@ -14848,16 +14866,16 @@
         </w:rPr>
         <w:lastRenderedPageBreak/>
         <w:drawing>
-          <wp:inline distT="0" distB="0" distL="0" distR="0" wp14:anchorId="3488100A" wp14:editId="02E0C70D">
+          <wp:inline distT="0" distB="0" distL="0" distR="0" wp14:anchorId="0967DD02" wp14:editId="0E14165A">
             <wp:extent cx="5120640" cy="4627581"/>
             <wp:effectExtent l="19050" t="19050" r="22860" b="20955"/>
-            <wp:docPr id="1354685548" name="Imagem 23"/>
+            <wp:docPr id="1779287884" name="Imagem 23"/>
             <wp:cNvGraphicFramePr/>
             <a:graphic xmlns:a="http://schemas.openxmlformats.org/drawingml/2006/main">
               <a:graphicData uri="http://schemas.openxmlformats.org/drawingml/2006/picture">
                 <pic:pic xmlns:pic="http://schemas.openxmlformats.org/drawingml/2006/picture">
                   <pic:nvPicPr>
-                    <pic:cNvPr id="1354685548" name=""/>
+                    <pic:cNvPr id="1779287884" name=""/>
                     <pic:cNvPicPr/>
                   </pic:nvPicPr>
                   <pic:blipFill>
@@ -14925,16 +14943,16 @@
         </w:rPr>
         <w:lastRenderedPageBreak/>
         <w:drawing>
-          <wp:inline distT="0" distB="0" distL="0" distR="0" wp14:anchorId="61E0B073" wp14:editId="50E46515">
+          <wp:inline distT="0" distB="0" distL="0" distR="0" wp14:anchorId="2C3B5BE3" wp14:editId="311B4D5B">
             <wp:extent cx="5120640" cy="4627581"/>
             <wp:effectExtent l="19050" t="19050" r="22860" b="20955"/>
-            <wp:docPr id="1733035024" name="Imagem 24"/>
+            <wp:docPr id="743506088" name="Imagem 24"/>
             <wp:cNvGraphicFramePr/>
             <a:graphic xmlns:a="http://schemas.openxmlformats.org/drawingml/2006/main">
               <a:graphicData uri="http://schemas.openxmlformats.org/drawingml/2006/picture">
                 <pic:pic xmlns:pic="http://schemas.openxmlformats.org/drawingml/2006/picture">
                   <pic:nvPicPr>
-                    <pic:cNvPr id="1733035024" name=""/>
+                    <pic:cNvPr id="743506088" name=""/>
                     <pic:cNvPicPr/>
                   </pic:nvPicPr>
                   <pic:blipFill>
@@ -15171,7 +15189,7 @@
           <w:sz w:val="27"/>
         </w:rPr>
       </w:pPr>
-      <w:bookmarkStart w:id="28" w:name="_Toc240035173"/>
+      <w:bookmarkStart w:id="28" w:name="_Toc240036072"/>
       <w:r>
         <w:rPr>
           <w:rFonts w:ascii="Montserrat" w:hAnsi="Montserrat"/>
@@ -15211,16 +15229,16 @@
           <w:noProof/>
         </w:rPr>
         <w:drawing>
-          <wp:inline distT="0" distB="0" distL="0" distR="0" wp14:anchorId="4A7EA117" wp14:editId="65259476">
+          <wp:inline distT="0" distB="0" distL="0" distR="0" wp14:anchorId="0127A134" wp14:editId="7C522537">
             <wp:extent cx="5120640" cy="4627581"/>
             <wp:effectExtent l="19050" t="19050" r="22860" b="20955"/>
-            <wp:docPr id="1664760049" name="Imagem 25"/>
+            <wp:docPr id="50274255" name="Imagem 25"/>
             <wp:cNvGraphicFramePr/>
             <a:graphic xmlns:a="http://schemas.openxmlformats.org/drawingml/2006/main">
               <a:graphicData uri="http://schemas.openxmlformats.org/drawingml/2006/picture">
                 <pic:pic xmlns:pic="http://schemas.openxmlformats.org/drawingml/2006/picture">
                   <pic:nvPicPr>
-                    <pic:cNvPr id="1664760049" name=""/>
+                    <pic:cNvPr id="50274255" name=""/>
                     <pic:cNvPicPr/>
                   </pic:nvPicPr>
                   <pic:blipFill>
@@ -15288,16 +15306,16 @@
         </w:rPr>
         <w:lastRenderedPageBreak/>
         <w:drawing>
-          <wp:inline distT="0" distB="0" distL="0" distR="0" wp14:anchorId="4D435197" wp14:editId="5FA37386">
+          <wp:inline distT="0" distB="0" distL="0" distR="0" wp14:anchorId="21F38C29" wp14:editId="22BAA40C">
             <wp:extent cx="5120640" cy="4627581"/>
             <wp:effectExtent l="19050" t="19050" r="22860" b="20955"/>
-            <wp:docPr id="415852123" name="Imagem 26"/>
+            <wp:docPr id="1121470665" name="Imagem 26"/>
             <wp:cNvGraphicFramePr/>
             <a:graphic xmlns:a="http://schemas.openxmlformats.org/drawingml/2006/main">
               <a:graphicData uri="http://schemas.openxmlformats.org/drawingml/2006/picture">
                 <pic:pic xmlns:pic="http://schemas.openxmlformats.org/drawingml/2006/picture">
                   <pic:nvPicPr>
-                    <pic:cNvPr id="415852123" name=""/>
+                    <pic:cNvPr id="1121470665" name=""/>
                     <pic:cNvPicPr/>
                   </pic:nvPicPr>
                   <pic:blipFill>
@@ -15488,7 +15506,7 @@
           <w:sz w:val="27"/>
         </w:rPr>
       </w:pPr>
-      <w:bookmarkStart w:id="29" w:name="_Toc240035174"/>
+      <w:bookmarkStart w:id="29" w:name="_Toc240036073"/>
       <w:r>
         <w:rPr>
           <w:rFonts w:ascii="Montserrat" w:hAnsi="Montserrat"/>
@@ -15528,16 +15546,16 @@
           <w:noProof/>
         </w:rPr>
         <w:drawing>
-          <wp:inline distT="0" distB="0" distL="0" distR="0" wp14:anchorId="54528CA6" wp14:editId="6956B382">
+          <wp:inline distT="0" distB="0" distL="0" distR="0" wp14:anchorId="02F386C6" wp14:editId="40E5D184">
             <wp:extent cx="5120640" cy="4000682"/>
             <wp:effectExtent l="19050" t="19050" r="22860" b="19050"/>
-            <wp:docPr id="1177845908" name="Imagem 27"/>
+            <wp:docPr id="549559650" name="Imagem 27"/>
             <wp:cNvGraphicFramePr/>
             <a:graphic xmlns:a="http://schemas.openxmlformats.org/drawingml/2006/main">
               <a:graphicData uri="http://schemas.openxmlformats.org/drawingml/2006/picture">
                 <pic:pic xmlns:pic="http://schemas.openxmlformats.org/drawingml/2006/picture">
                   <pic:nvPicPr>
-                    <pic:cNvPr id="1177845908" name=""/>
+                    <pic:cNvPr id="549559650" name=""/>
                     <pic:cNvPicPr/>
                   </pic:nvPicPr>
                   <pic:blipFill>
@@ -16061,7 +16079,7 @@
           <w:sz w:val="34"/>
         </w:rPr>
       </w:pPr>
-      <w:bookmarkStart w:id="30" w:name="_Toc240035175"/>
+      <w:bookmarkStart w:id="30" w:name="_Toc240036074"/>
       <w:r>
         <w:rPr>
           <w:rFonts w:ascii="Montserrat" w:hAnsi="Montserrat"/>
@@ -16103,7 +16121,7 @@
           <w:sz w:val="27"/>
         </w:rPr>
       </w:pPr>
-      <w:bookmarkStart w:id="31" w:name="_Toc240035176"/>
+      <w:bookmarkStart w:id="31" w:name="_Toc240036075"/>
       <w:r>
         <w:rPr>
           <w:rFonts w:ascii="Montserrat" w:hAnsi="Montserrat"/>
@@ -16143,16 +16161,16 @@
           <w:noProof/>
         </w:rPr>
         <w:drawing>
-          <wp:inline distT="0" distB="0" distL="0" distR="0" wp14:anchorId="28DAA701" wp14:editId="760E4B44">
+          <wp:inline distT="0" distB="0" distL="0" distR="0" wp14:anchorId="0A4BB844" wp14:editId="15F1C53A">
             <wp:extent cx="5120640" cy="4627581"/>
             <wp:effectExtent l="19050" t="19050" r="22860" b="20955"/>
-            <wp:docPr id="1587206896" name="Imagem 28"/>
+            <wp:docPr id="669134662" name="Imagem 28"/>
             <wp:cNvGraphicFramePr/>
             <a:graphic xmlns:a="http://schemas.openxmlformats.org/drawingml/2006/main">
               <a:graphicData uri="http://schemas.openxmlformats.org/drawingml/2006/picture">
                 <pic:pic xmlns:pic="http://schemas.openxmlformats.org/drawingml/2006/picture">
                   <pic:nvPicPr>
-                    <pic:cNvPr id="1587206896" name=""/>
+                    <pic:cNvPr id="669134662" name=""/>
                     <pic:cNvPicPr/>
                   </pic:nvPicPr>
                   <pic:blipFill>
@@ -16220,16 +16238,16 @@
         </w:rPr>
         <w:lastRenderedPageBreak/>
         <w:drawing>
-          <wp:inline distT="0" distB="0" distL="0" distR="0" wp14:anchorId="0BB92B17" wp14:editId="29F3DDF3">
+          <wp:inline distT="0" distB="0" distL="0" distR="0" wp14:anchorId="42E401DB" wp14:editId="58951CC2">
             <wp:extent cx="5120640" cy="4627581"/>
             <wp:effectExtent l="19050" t="19050" r="22860" b="20955"/>
-            <wp:docPr id="1490814685" name="Imagem 29"/>
+            <wp:docPr id="1423136007" name="Imagem 29"/>
             <wp:cNvGraphicFramePr/>
             <a:graphic xmlns:a="http://schemas.openxmlformats.org/drawingml/2006/main">
               <a:graphicData uri="http://schemas.openxmlformats.org/drawingml/2006/picture">
                 <pic:pic xmlns:pic="http://schemas.openxmlformats.org/drawingml/2006/picture">
                   <pic:nvPicPr>
-                    <pic:cNvPr id="1490814685" name=""/>
+                    <pic:cNvPr id="1423136007" name=""/>
                     <pic:cNvPicPr/>
                   </pic:nvPicPr>
                   <pic:blipFill>
@@ -16297,16 +16315,16 @@
         </w:rPr>
         <w:lastRenderedPageBreak/>
         <w:drawing>
-          <wp:inline distT="0" distB="0" distL="0" distR="0" wp14:anchorId="4781C065" wp14:editId="0ACC4B03">
+          <wp:inline distT="0" distB="0" distL="0" distR="0" wp14:anchorId="2D08F247" wp14:editId="224701AD">
             <wp:extent cx="5120640" cy="4627581"/>
             <wp:effectExtent l="19050" t="19050" r="22860" b="20955"/>
-            <wp:docPr id="581221914" name="Imagem 30"/>
+            <wp:docPr id="1074103620" name="Imagem 30"/>
             <wp:cNvGraphicFramePr/>
             <a:graphic xmlns:a="http://schemas.openxmlformats.org/drawingml/2006/main">
               <a:graphicData uri="http://schemas.openxmlformats.org/drawingml/2006/picture">
                 <pic:pic xmlns:pic="http://schemas.openxmlformats.org/drawingml/2006/picture">
                   <pic:nvPicPr>
-                    <pic:cNvPr id="581221914" name=""/>
+                    <pic:cNvPr id="1074103620" name=""/>
                     <pic:cNvPicPr/>
                   </pic:nvPicPr>
                   <pic:blipFill>
@@ -16508,16 +16526,16 @@
           <w:noProof/>
         </w:rPr>
         <w:drawing>
-          <wp:inline distT="0" distB="0" distL="0" distR="0" wp14:anchorId="0E0A704A" wp14:editId="01CC7E09">
+          <wp:inline distT="0" distB="0" distL="0" distR="0" wp14:anchorId="54288088" wp14:editId="7F1C0794">
             <wp:extent cx="5120640" cy="1715571"/>
             <wp:effectExtent l="19050" t="19050" r="22860" b="18415"/>
-            <wp:docPr id="26579223" name="Imagem 31"/>
+            <wp:docPr id="586026301" name="Imagem 31"/>
             <wp:cNvGraphicFramePr/>
             <a:graphic xmlns:a="http://schemas.openxmlformats.org/drawingml/2006/main">
               <a:graphicData uri="http://schemas.openxmlformats.org/drawingml/2006/picture">
                 <pic:pic xmlns:pic="http://schemas.openxmlformats.org/drawingml/2006/picture">
                   <pic:nvPicPr>
-                    <pic:cNvPr id="26579223" name=""/>
+                    <pic:cNvPr id="586026301" name=""/>
                     <pic:cNvPicPr/>
                   </pic:nvPicPr>
                   <pic:blipFill>
@@ -16654,16 +16672,16 @@
           <w:noProof/>
         </w:rPr>
         <w:drawing>
-          <wp:inline distT="0" distB="0" distL="0" distR="0" wp14:anchorId="21EAE8F8" wp14:editId="585DF202">
+          <wp:inline distT="0" distB="0" distL="0" distR="0" wp14:anchorId="7B23BDB0" wp14:editId="1C2A31FA">
             <wp:extent cx="5120640" cy="3282818"/>
             <wp:effectExtent l="19050" t="19050" r="22860" b="13335"/>
-            <wp:docPr id="1381737326" name="Imagem 32"/>
+            <wp:docPr id="1110915520" name="Imagem 32"/>
             <wp:cNvGraphicFramePr/>
             <a:graphic xmlns:a="http://schemas.openxmlformats.org/drawingml/2006/main">
               <a:graphicData uri="http://schemas.openxmlformats.org/drawingml/2006/picture">
                 <pic:pic xmlns:pic="http://schemas.openxmlformats.org/drawingml/2006/picture">
                   <pic:nvPicPr>
-                    <pic:cNvPr id="1381737326" name=""/>
+                    <pic:cNvPr id="1110915520" name=""/>
                     <pic:cNvPicPr/>
                   </pic:nvPicPr>
                   <pic:blipFill>
@@ -16797,16 +16815,16 @@
           <w:noProof/>
         </w:rPr>
         <w:drawing>
-          <wp:inline distT="0" distB="0" distL="0" distR="0" wp14:anchorId="510243BD" wp14:editId="71D8D556">
+          <wp:inline distT="0" distB="0" distL="0" distR="0" wp14:anchorId="40118E82" wp14:editId="407106E2">
             <wp:extent cx="5120640" cy="951357"/>
             <wp:effectExtent l="19050" t="19050" r="22860" b="20320"/>
-            <wp:docPr id="1085715149" name="Imagem 33"/>
+            <wp:docPr id="193696566" name="Imagem 33"/>
             <wp:cNvGraphicFramePr/>
             <a:graphic xmlns:a="http://schemas.openxmlformats.org/drawingml/2006/main">
               <a:graphicData uri="http://schemas.openxmlformats.org/drawingml/2006/picture">
                 <pic:pic xmlns:pic="http://schemas.openxmlformats.org/drawingml/2006/picture">
                   <pic:nvPicPr>
-                    <pic:cNvPr id="1085715149" name=""/>
+                    <pic:cNvPr id="193696566" name=""/>
                     <pic:cNvPicPr/>
                   </pic:nvPicPr>
                   <pic:blipFill>
@@ -16918,16 +16936,16 @@
           <w:noProof/>
         </w:rPr>
         <w:drawing>
-          <wp:inline distT="0" distB="0" distL="0" distR="0" wp14:anchorId="2AFCAFEC" wp14:editId="09E467D4">
+          <wp:inline distT="0" distB="0" distL="0" distR="0" wp14:anchorId="0ADBD9DF" wp14:editId="73B8A42E">
             <wp:extent cx="5120640" cy="1515102"/>
             <wp:effectExtent l="19050" t="19050" r="22860" b="28575"/>
-            <wp:docPr id="653604005" name="Imagem 34"/>
+            <wp:docPr id="1684334981" name="Imagem 34"/>
             <wp:cNvGraphicFramePr/>
             <a:graphic xmlns:a="http://schemas.openxmlformats.org/drawingml/2006/main">
               <a:graphicData uri="http://schemas.openxmlformats.org/drawingml/2006/picture">
                 <pic:pic xmlns:pic="http://schemas.openxmlformats.org/drawingml/2006/picture">
                   <pic:nvPicPr>
-                    <pic:cNvPr id="653604005" name=""/>
+                    <pic:cNvPr id="1684334981" name=""/>
                     <pic:cNvPicPr/>
                   </pic:nvPicPr>
                   <pic:blipFill>
@@ -17040,16 +17058,16 @@
           <w:noProof/>
         </w:rPr>
         <w:drawing>
-          <wp:inline distT="0" distB="0" distL="0" distR="0" wp14:anchorId="131CB6BF" wp14:editId="1C536815">
+          <wp:inline distT="0" distB="0" distL="0" distR="0" wp14:anchorId="775E31B7" wp14:editId="4981477A">
             <wp:extent cx="5120640" cy="1391113"/>
             <wp:effectExtent l="19050" t="19050" r="22860" b="19050"/>
-            <wp:docPr id="1868618847" name="Imagem 35"/>
+            <wp:docPr id="790576567" name="Imagem 35"/>
             <wp:cNvGraphicFramePr/>
             <a:graphic xmlns:a="http://schemas.openxmlformats.org/drawingml/2006/main">
               <a:graphicData uri="http://schemas.openxmlformats.org/drawingml/2006/picture">
                 <pic:pic xmlns:pic="http://schemas.openxmlformats.org/drawingml/2006/picture">
                   <pic:nvPicPr>
-                    <pic:cNvPr id="1868618847" name=""/>
+                    <pic:cNvPr id="790576567" name=""/>
                     <pic:cNvPicPr/>
                   </pic:nvPicPr>
                   <pic:blipFill>
@@ -17161,16 +17179,16 @@
           <w:noProof/>
         </w:rPr>
         <w:drawing>
-          <wp:inline distT="0" distB="0" distL="0" distR="0" wp14:anchorId="6419DF2E" wp14:editId="3CF24F1A">
+          <wp:inline distT="0" distB="0" distL="0" distR="0" wp14:anchorId="3F7AECBA" wp14:editId="54456588">
             <wp:extent cx="5120640" cy="1125174"/>
             <wp:effectExtent l="19050" t="19050" r="22860" b="18415"/>
-            <wp:docPr id="247186622" name="Imagem 36"/>
+            <wp:docPr id="444270864" name="Imagem 36"/>
             <wp:cNvGraphicFramePr/>
             <a:graphic xmlns:a="http://schemas.openxmlformats.org/drawingml/2006/main">
               <a:graphicData uri="http://schemas.openxmlformats.org/drawingml/2006/picture">
                 <pic:pic xmlns:pic="http://schemas.openxmlformats.org/drawingml/2006/picture">
                   <pic:nvPicPr>
-                    <pic:cNvPr id="247186622" name=""/>
+                    <pic:cNvPr id="444270864" name=""/>
                     <pic:cNvPicPr/>
                   </pic:nvPicPr>
                   <pic:blipFill>
@@ -17260,7 +17278,7 @@
           <w:sz w:val="27"/>
         </w:rPr>
       </w:pPr>
-      <w:bookmarkStart w:id="32" w:name="_Toc240035177"/>
+      <w:bookmarkStart w:id="32" w:name="_Toc240036076"/>
       <w:r>
         <w:rPr>
           <w:rFonts w:ascii="Montserrat" w:hAnsi="Montserrat"/>
@@ -17300,16 +17318,16 @@
           <w:noProof/>
         </w:rPr>
         <w:drawing>
-          <wp:inline distT="0" distB="0" distL="0" distR="0" wp14:anchorId="62C2EACA" wp14:editId="682A5CA6">
+          <wp:inline distT="0" distB="0" distL="0" distR="0" wp14:anchorId="676A792B" wp14:editId="288606C8">
             <wp:extent cx="5120640" cy="4627581"/>
             <wp:effectExtent l="19050" t="19050" r="22860" b="20955"/>
-            <wp:docPr id="1733960264" name="Imagem 37"/>
+            <wp:docPr id="1466186639" name="Imagem 37"/>
             <wp:cNvGraphicFramePr/>
             <a:graphic xmlns:a="http://schemas.openxmlformats.org/drawingml/2006/main">
               <a:graphicData uri="http://schemas.openxmlformats.org/drawingml/2006/picture">
                 <pic:pic xmlns:pic="http://schemas.openxmlformats.org/drawingml/2006/picture">
                   <pic:nvPicPr>
-                    <pic:cNvPr id="1733960264" name=""/>
+                    <pic:cNvPr id="1466186639" name=""/>
                     <pic:cNvPicPr/>
                   </pic:nvPicPr>
                   <pic:blipFill>
@@ -17377,16 +17395,16 @@
         </w:rPr>
         <w:lastRenderedPageBreak/>
         <w:drawing>
-          <wp:inline distT="0" distB="0" distL="0" distR="0" wp14:anchorId="0AE5F2B0" wp14:editId="64750969">
+          <wp:inline distT="0" distB="0" distL="0" distR="0" wp14:anchorId="3E474E5C" wp14:editId="492D4033">
             <wp:extent cx="5120640" cy="4627581"/>
             <wp:effectExtent l="19050" t="19050" r="22860" b="20955"/>
-            <wp:docPr id="1259810" name="Imagem 38"/>
+            <wp:docPr id="138421280" name="Imagem 38"/>
             <wp:cNvGraphicFramePr/>
             <a:graphic xmlns:a="http://schemas.openxmlformats.org/drawingml/2006/main">
               <a:graphicData uri="http://schemas.openxmlformats.org/drawingml/2006/picture">
                 <pic:pic xmlns:pic="http://schemas.openxmlformats.org/drawingml/2006/picture">
                   <pic:nvPicPr>
-                    <pic:cNvPr id="1259810" name=""/>
+                    <pic:cNvPr id="138421280" name=""/>
                     <pic:cNvPicPr/>
                   </pic:nvPicPr>
                   <pic:blipFill>
@@ -17555,16 +17573,16 @@
           <w:noProof/>
         </w:rPr>
         <w:drawing>
-          <wp:inline distT="0" distB="0" distL="0" distR="0" wp14:anchorId="19F61914" wp14:editId="768B98C9">
+          <wp:inline distT="0" distB="0" distL="0" distR="0" wp14:anchorId="54FC7BA3" wp14:editId="0B412890">
             <wp:extent cx="5120640" cy="2144319"/>
             <wp:effectExtent l="19050" t="19050" r="22860" b="27940"/>
-            <wp:docPr id="829603843" name="Imagem 39"/>
+            <wp:docPr id="1182316874" name="Imagem 39"/>
             <wp:cNvGraphicFramePr/>
             <a:graphic xmlns:a="http://schemas.openxmlformats.org/drawingml/2006/main">
               <a:graphicData uri="http://schemas.openxmlformats.org/drawingml/2006/picture">
                 <pic:pic xmlns:pic="http://schemas.openxmlformats.org/drawingml/2006/picture">
                   <pic:nvPicPr>
-                    <pic:cNvPr id="829603843" name=""/>
+                    <pic:cNvPr id="1182316874" name=""/>
                     <pic:cNvPicPr/>
                   </pic:nvPicPr>
                   <pic:blipFill>
@@ -17652,16 +17670,16 @@
           <w:noProof/>
         </w:rPr>
         <w:drawing>
-          <wp:inline distT="0" distB="0" distL="0" distR="0" wp14:anchorId="1A05AA08" wp14:editId="50A43F0E">
+          <wp:inline distT="0" distB="0" distL="0" distR="0" wp14:anchorId="45B2F273" wp14:editId="207B091B">
             <wp:extent cx="5120640" cy="1055647"/>
             <wp:effectExtent l="19050" t="19050" r="22860" b="11430"/>
-            <wp:docPr id="658019692" name="Imagem 40"/>
+            <wp:docPr id="556903764" name="Imagem 40"/>
             <wp:cNvGraphicFramePr/>
             <a:graphic xmlns:a="http://schemas.openxmlformats.org/drawingml/2006/main">
               <a:graphicData uri="http://schemas.openxmlformats.org/drawingml/2006/picture">
                 <pic:pic xmlns:pic="http://schemas.openxmlformats.org/drawingml/2006/picture">
                   <pic:nvPicPr>
-                    <pic:cNvPr id="658019692" name=""/>
+                    <pic:cNvPr id="556903764" name=""/>
                     <pic:cNvPicPr/>
                   </pic:nvPicPr>
                   <pic:blipFill>
@@ -17783,16 +17801,16 @@
           <w:noProof/>
         </w:rPr>
         <w:drawing>
-          <wp:inline distT="0" distB="0" distL="0" distR="0" wp14:anchorId="0DB04D7A" wp14:editId="23099018">
+          <wp:inline distT="0" distB="0" distL="0" distR="0" wp14:anchorId="4C6996C9" wp14:editId="773B251B">
             <wp:extent cx="5120640" cy="3282818"/>
             <wp:effectExtent l="19050" t="19050" r="22860" b="13335"/>
-            <wp:docPr id="469899625" name="Imagem 41"/>
+            <wp:docPr id="272062536" name="Imagem 41"/>
             <wp:cNvGraphicFramePr/>
             <a:graphic xmlns:a="http://schemas.openxmlformats.org/drawingml/2006/main">
               <a:graphicData uri="http://schemas.openxmlformats.org/drawingml/2006/picture">
                 <pic:pic xmlns:pic="http://schemas.openxmlformats.org/drawingml/2006/picture">
                   <pic:nvPicPr>
-                    <pic:cNvPr id="469899625" name=""/>
+                    <pic:cNvPr id="272062536" name=""/>
                     <pic:cNvPicPr/>
                   </pic:nvPicPr>
                   <pic:blipFill>
@@ -17926,16 +17944,16 @@
         </w:rPr>
         <w:lastRenderedPageBreak/>
         <w:drawing>
-          <wp:inline distT="0" distB="0" distL="0" distR="0" wp14:anchorId="5677AEF4" wp14:editId="4314A18C">
+          <wp:inline distT="0" distB="0" distL="0" distR="0" wp14:anchorId="5E20A70F" wp14:editId="60DCC94D">
             <wp:extent cx="5120640" cy="1978034"/>
             <wp:effectExtent l="19050" t="19050" r="22860" b="22225"/>
-            <wp:docPr id="53049441" name="Imagem 42"/>
+            <wp:docPr id="356376413" name="Imagem 42"/>
             <wp:cNvGraphicFramePr/>
             <a:graphic xmlns:a="http://schemas.openxmlformats.org/drawingml/2006/main">
               <a:graphicData uri="http://schemas.openxmlformats.org/drawingml/2006/picture">
                 <pic:pic xmlns:pic="http://schemas.openxmlformats.org/drawingml/2006/picture">
                   <pic:nvPicPr>
-                    <pic:cNvPr id="53049441" name=""/>
+                    <pic:cNvPr id="356376413" name=""/>
                     <pic:cNvPicPr/>
                   </pic:nvPicPr>
                   <pic:blipFill>
@@ -18007,7 +18025,7 @@
           <w:sz w:val="34"/>
         </w:rPr>
       </w:pPr>
-      <w:bookmarkStart w:id="33" w:name="_Toc240035178"/>
+      <w:bookmarkStart w:id="33" w:name="_Toc240036077"/>
       <w:r>
         <w:rPr>
           <w:rFonts w:ascii="Montserrat" w:hAnsi="Montserrat"/>
@@ -18067,7 +18085,7 @@
           <w:sz w:val="27"/>
         </w:rPr>
       </w:pPr>
-      <w:bookmarkStart w:id="34" w:name="_Toc240035179"/>
+      <w:bookmarkStart w:id="34" w:name="_Toc240036078"/>
       <w:r>
         <w:rPr>
           <w:rFonts w:ascii="Montserrat" w:hAnsi="Montserrat"/>
@@ -18107,16 +18125,16 @@
           <w:noProof/>
         </w:rPr>
         <w:drawing>
-          <wp:inline distT="0" distB="0" distL="0" distR="0" wp14:anchorId="114FE96C" wp14:editId="648EE47A">
+          <wp:inline distT="0" distB="0" distL="0" distR="0" wp14:anchorId="6BC93EC8" wp14:editId="48C67071">
             <wp:extent cx="5303520" cy="4792851"/>
             <wp:effectExtent l="19050" t="19050" r="11430" b="27305"/>
-            <wp:docPr id="1113003508" name="Imagem 43"/>
+            <wp:docPr id="696886969" name="Imagem 43"/>
             <wp:cNvGraphicFramePr/>
             <a:graphic xmlns:a="http://schemas.openxmlformats.org/drawingml/2006/main">
               <a:graphicData uri="http://schemas.openxmlformats.org/drawingml/2006/picture">
                 <pic:pic xmlns:pic="http://schemas.openxmlformats.org/drawingml/2006/picture">
                   <pic:nvPicPr>
-                    <pic:cNvPr id="1113003508" name=""/>
+                    <pic:cNvPr id="696886969" name=""/>
                     <pic:cNvPicPr/>
                   </pic:nvPicPr>
                   <pic:blipFill>
@@ -18185,7 +18203,7 @@
           <w:sz w:val="27"/>
         </w:rPr>
       </w:pPr>
-      <w:bookmarkStart w:id="35" w:name="_Toc240035180"/>
+      <w:bookmarkStart w:id="35" w:name="_Toc240036079"/>
       <w:r>
         <w:rPr>
           <w:rFonts w:ascii="Montserrat" w:hAnsi="Montserrat"/>
@@ -18225,16 +18243,16 @@
           <w:noProof/>
         </w:rPr>
         <w:drawing>
-          <wp:inline distT="0" distB="0" distL="0" distR="0" wp14:anchorId="21DAD6F3" wp14:editId="6A2477D1">
+          <wp:inline distT="0" distB="0" distL="0" distR="0" wp14:anchorId="553E6365" wp14:editId="5500C011">
             <wp:extent cx="5303520" cy="4792851"/>
             <wp:effectExtent l="19050" t="19050" r="11430" b="27305"/>
-            <wp:docPr id="1147471198" name="Imagem 44"/>
+            <wp:docPr id="1549828468" name="Imagem 44"/>
             <wp:cNvGraphicFramePr/>
             <a:graphic xmlns:a="http://schemas.openxmlformats.org/drawingml/2006/main">
               <a:graphicData uri="http://schemas.openxmlformats.org/drawingml/2006/picture">
                 <pic:pic xmlns:pic="http://schemas.openxmlformats.org/drawingml/2006/picture">
                   <pic:nvPicPr>
-                    <pic:cNvPr id="1147471198" name=""/>
+                    <pic:cNvPr id="1549828468" name=""/>
                     <pic:cNvPicPr/>
                   </pic:nvPicPr>
                   <pic:blipFill>
@@ -18302,7 +18320,7 @@
           <w:sz w:val="27"/>
         </w:rPr>
       </w:pPr>
-      <w:bookmarkStart w:id="36" w:name="_Toc240035181"/>
+      <w:bookmarkStart w:id="36" w:name="_Toc240036080"/>
       <w:r>
         <w:rPr>
           <w:rFonts w:ascii="Montserrat" w:hAnsi="Montserrat"/>
@@ -18343,16 +18361,16 @@
         </w:rPr>
         <w:lastRenderedPageBreak/>
         <w:drawing>
-          <wp:inline distT="0" distB="0" distL="0" distR="0" wp14:anchorId="2BA5A82B" wp14:editId="112E1DCE">
+          <wp:inline distT="0" distB="0" distL="0" distR="0" wp14:anchorId="6E3A7A1C" wp14:editId="4948C587">
             <wp:extent cx="5303520" cy="4792851"/>
             <wp:effectExtent l="19050" t="19050" r="11430" b="27305"/>
-            <wp:docPr id="1979638144" name="Imagem 45"/>
+            <wp:docPr id="2117693415" name="Imagem 45"/>
             <wp:cNvGraphicFramePr/>
             <a:graphic xmlns:a="http://schemas.openxmlformats.org/drawingml/2006/main">
               <a:graphicData uri="http://schemas.openxmlformats.org/drawingml/2006/picture">
                 <pic:pic xmlns:pic="http://schemas.openxmlformats.org/drawingml/2006/picture">
                   <pic:nvPicPr>
-                    <pic:cNvPr id="1979638144" name=""/>
+                    <pic:cNvPr id="2117693415" name=""/>
                     <pic:cNvPicPr/>
                   </pic:nvPicPr>
                   <pic:blipFill>
@@ -18420,16 +18438,16 @@
         </w:rPr>
         <w:lastRenderedPageBreak/>
         <w:drawing>
-          <wp:inline distT="0" distB="0" distL="0" distR="0" wp14:anchorId="27470B0D" wp14:editId="13C39452">
+          <wp:inline distT="0" distB="0" distL="0" distR="0" wp14:anchorId="0739447D" wp14:editId="59F411DC">
             <wp:extent cx="5303520" cy="4792851"/>
             <wp:effectExtent l="19050" t="19050" r="11430" b="27305"/>
-            <wp:docPr id="809917914" name="Imagem 46"/>
+            <wp:docPr id="859778841" name="Imagem 46"/>
             <wp:cNvGraphicFramePr/>
             <a:graphic xmlns:a="http://schemas.openxmlformats.org/drawingml/2006/main">
               <a:graphicData uri="http://schemas.openxmlformats.org/drawingml/2006/picture">
                 <pic:pic xmlns:pic="http://schemas.openxmlformats.org/drawingml/2006/picture">
                   <pic:nvPicPr>
-                    <pic:cNvPr id="809917914" name=""/>
+                    <pic:cNvPr id="859778841" name=""/>
                     <pic:cNvPicPr/>
                   </pic:nvPicPr>
                   <pic:blipFill>
@@ -18522,7 +18540,7 @@
           <w:sz w:val="34"/>
         </w:rPr>
       </w:pPr>
-      <w:bookmarkStart w:id="37" w:name="_Toc240035182"/>
+      <w:bookmarkStart w:id="37" w:name="_Toc240036081"/>
       <w:r>
         <w:rPr>
           <w:rFonts w:ascii="Montserrat" w:hAnsi="Montserrat"/>
@@ -18564,7 +18582,7 @@
           <w:sz w:val="27"/>
         </w:rPr>
       </w:pPr>
-      <w:bookmarkStart w:id="38" w:name="_Toc240035183"/>
+      <w:bookmarkStart w:id="38" w:name="_Toc240036082"/>
       <w:r>
         <w:rPr>
           <w:rFonts w:ascii="Montserrat" w:hAnsi="Montserrat"/>
@@ -18604,16 +18622,16 @@
           <w:noProof/>
         </w:rPr>
         <w:drawing>
-          <wp:inline distT="0" distB="0" distL="0" distR="0" wp14:anchorId="39B620D8" wp14:editId="005F97CE">
+          <wp:inline distT="0" distB="0" distL="0" distR="0" wp14:anchorId="24A09D56" wp14:editId="76CB223E">
             <wp:extent cx="5303520" cy="4792851"/>
             <wp:effectExtent l="19050" t="19050" r="11430" b="27305"/>
-            <wp:docPr id="1560284440" name="Imagem 47"/>
+            <wp:docPr id="971469503" name="Imagem 47"/>
             <wp:cNvGraphicFramePr/>
             <a:graphic xmlns:a="http://schemas.openxmlformats.org/drawingml/2006/main">
               <a:graphicData uri="http://schemas.openxmlformats.org/drawingml/2006/picture">
                 <pic:pic xmlns:pic="http://schemas.openxmlformats.org/drawingml/2006/picture">
                   <pic:nvPicPr>
-                    <pic:cNvPr id="1560284440" name=""/>
+                    <pic:cNvPr id="971469503" name=""/>
                     <pic:cNvPicPr/>
                   </pic:nvPicPr>
                   <pic:blipFill>
@@ -18760,7 +18778,7 @@
           <w:sz w:val="27"/>
         </w:rPr>
       </w:pPr>
-      <w:bookmarkStart w:id="39" w:name="_Toc240035184"/>
+      <w:bookmarkStart w:id="39" w:name="_Toc240036083"/>
       <w:r>
         <w:rPr>
           <w:rFonts w:ascii="Montserrat" w:hAnsi="Montserrat"/>
@@ -18801,16 +18819,16 @@
         </w:rPr>
         <w:lastRenderedPageBreak/>
         <w:drawing>
-          <wp:inline distT="0" distB="0" distL="0" distR="0" wp14:anchorId="63E5099D" wp14:editId="1E39C96B">
+          <wp:inline distT="0" distB="0" distL="0" distR="0" wp14:anchorId="12385383" wp14:editId="57391D84">
             <wp:extent cx="5303520" cy="4792851"/>
             <wp:effectExtent l="19050" t="19050" r="11430" b="27305"/>
-            <wp:docPr id="1993849180" name="Imagem 48"/>
+            <wp:docPr id="723404146" name="Imagem 48"/>
             <wp:cNvGraphicFramePr/>
             <a:graphic xmlns:a="http://schemas.openxmlformats.org/drawingml/2006/main">
               <a:graphicData uri="http://schemas.openxmlformats.org/drawingml/2006/picture">
                 <pic:pic xmlns:pic="http://schemas.openxmlformats.org/drawingml/2006/picture">
                   <pic:nvPicPr>
-                    <pic:cNvPr id="1993849180" name=""/>
+                    <pic:cNvPr id="723404146" name=""/>
                     <pic:cNvPicPr/>
                   </pic:nvPicPr>
                   <pic:blipFill>
@@ -18878,7 +18896,7 @@
           <w:sz w:val="27"/>
         </w:rPr>
       </w:pPr>
-      <w:bookmarkStart w:id="40" w:name="_Toc240035185"/>
+      <w:bookmarkStart w:id="40" w:name="_Toc240036084"/>
       <w:r>
         <w:rPr>
           <w:rFonts w:ascii="Montserrat" w:hAnsi="Montserrat"/>
@@ -18919,16 +18937,16 @@
         </w:rPr>
         <w:lastRenderedPageBreak/>
         <w:drawing>
-          <wp:inline distT="0" distB="0" distL="0" distR="0" wp14:anchorId="2A5C1A6E" wp14:editId="2FFA0B7E">
+          <wp:inline distT="0" distB="0" distL="0" distR="0" wp14:anchorId="21BC9943" wp14:editId="0E1E8327">
             <wp:extent cx="5303520" cy="4792851"/>
             <wp:effectExtent l="19050" t="19050" r="11430" b="27305"/>
-            <wp:docPr id="1319512932" name="Imagem 49"/>
+            <wp:docPr id="1037875114" name="Imagem 49"/>
             <wp:cNvGraphicFramePr/>
             <a:graphic xmlns:a="http://schemas.openxmlformats.org/drawingml/2006/main">
               <a:graphicData uri="http://schemas.openxmlformats.org/drawingml/2006/picture">
                 <pic:pic xmlns:pic="http://schemas.openxmlformats.org/drawingml/2006/picture">
                   <pic:nvPicPr>
-                    <pic:cNvPr id="1319512932" name=""/>
+                    <pic:cNvPr id="1037875114" name=""/>
                     <pic:cNvPicPr/>
                   </pic:nvPicPr>
                   <pic:blipFill>
@@ -19072,7 +19090,7 @@
           <w:sz w:val="27"/>
         </w:rPr>
       </w:pPr>
-      <w:bookmarkStart w:id="41" w:name="_Toc240035186"/>
+      <w:bookmarkStart w:id="41" w:name="_Toc240036085"/>
       <w:r>
         <w:rPr>
           <w:rFonts w:ascii="Montserrat" w:hAnsi="Montserrat"/>
@@ -19281,16 +19299,16 @@
           <w:noProof/>
         </w:rPr>
         <w:drawing>
-          <wp:inline distT="0" distB="0" distL="0" distR="0" wp14:anchorId="463201AB" wp14:editId="4AAF29C7">
+          <wp:inline distT="0" distB="0" distL="0" distR="0" wp14:anchorId="77DE68B2" wp14:editId="5117CAEA">
             <wp:extent cx="5303520" cy="4267180"/>
             <wp:effectExtent l="19050" t="19050" r="11430" b="19685"/>
-            <wp:docPr id="1779189776" name="Imagem 50"/>
+            <wp:docPr id="950749589" name="Imagem 50"/>
             <wp:cNvGraphicFramePr/>
             <a:graphic xmlns:a="http://schemas.openxmlformats.org/drawingml/2006/main">
               <a:graphicData uri="http://schemas.openxmlformats.org/drawingml/2006/picture">
                 <pic:pic xmlns:pic="http://schemas.openxmlformats.org/drawingml/2006/picture">
                   <pic:nvPicPr>
-                    <pic:cNvPr id="1779189776" name=""/>
+                    <pic:cNvPr id="950749589" name=""/>
                     <pic:cNvPicPr/>
                   </pic:nvPicPr>
                   <pic:blipFill>
@@ -19358,16 +19376,16 @@
         </w:rPr>
         <w:lastRenderedPageBreak/>
         <w:drawing>
-          <wp:inline distT="0" distB="0" distL="0" distR="0" wp14:anchorId="6D4349E7" wp14:editId="3E1729CD">
+          <wp:inline distT="0" distB="0" distL="0" distR="0" wp14:anchorId="208E7106" wp14:editId="23DC0A5B">
             <wp:extent cx="5303520" cy="3382059"/>
             <wp:effectExtent l="19050" t="19050" r="11430" b="27940"/>
-            <wp:docPr id="1632836271" name="Imagem 51"/>
+            <wp:docPr id="886921178" name="Imagem 51"/>
             <wp:cNvGraphicFramePr/>
             <a:graphic xmlns:a="http://schemas.openxmlformats.org/drawingml/2006/main">
               <a:graphicData uri="http://schemas.openxmlformats.org/drawingml/2006/picture">
                 <pic:pic xmlns:pic="http://schemas.openxmlformats.org/drawingml/2006/picture">
                   <pic:nvPicPr>
-                    <pic:cNvPr id="1632836271" name=""/>
+                    <pic:cNvPr id="886921178" name=""/>
                     <pic:cNvPicPr/>
                   </pic:nvPicPr>
                   <pic:blipFill>
@@ -19435,16 +19453,16 @@
         </w:rPr>
         <w:lastRenderedPageBreak/>
         <w:drawing>
-          <wp:inline distT="0" distB="0" distL="0" distR="0" wp14:anchorId="30B00978" wp14:editId="0CC14710">
+          <wp:inline distT="0" distB="0" distL="0" distR="0" wp14:anchorId="065DD52D" wp14:editId="16438795">
             <wp:extent cx="5303520" cy="4417800"/>
             <wp:effectExtent l="19050" t="19050" r="11430" b="20955"/>
-            <wp:docPr id="662571132" name="Imagem 52"/>
+            <wp:docPr id="355557621" name="Imagem 52"/>
             <wp:cNvGraphicFramePr/>
             <a:graphic xmlns:a="http://schemas.openxmlformats.org/drawingml/2006/main">
               <a:graphicData uri="http://schemas.openxmlformats.org/drawingml/2006/picture">
                 <pic:pic xmlns:pic="http://schemas.openxmlformats.org/drawingml/2006/picture">
                   <pic:nvPicPr>
-                    <pic:cNvPr id="662571132" name=""/>
+                    <pic:cNvPr id="355557621" name=""/>
                     <pic:cNvPicPr/>
                   </pic:nvPicPr>
                   <pic:blipFill>
@@ -19554,7 +19572,7 @@
           <w:sz w:val="27"/>
         </w:rPr>
       </w:pPr>
-      <w:bookmarkStart w:id="42" w:name="_Toc240035187"/>
+      <w:bookmarkStart w:id="42" w:name="_Toc240036086"/>
       <w:r>
         <w:rPr>
           <w:rFonts w:ascii="Montserrat" w:hAnsi="Montserrat"/>
@@ -19662,7 +19680,7 @@
           <w:color w:val="1A1A1A"/>
           <w:sz w:val="22"/>
         </w:rPr>
-        <w:t>Situacao atual: a linha desse projeto no Relatorio de Situacao - status, % concluido, datas previstas, marcos, custos realizados e os campos Merece destaque/Merece atencao, quando preenchidos.</w:t>
+        <w:t>Custos: Estimado (TAP) x Realizado: drill-down do cartao de Orcamento acima - tabela cruzando, categoria por categoria, o custo Estimado no TAP com o Realizado no Relatorio de Situacao, mesmo casamento por nome ja usado pelo Comparativo por categoria do Relatorio de Situacao (secao 4.1). Cada categoria ganha um selo Dentro do estimado, Acima do estimado ou Sem estimativa no TAP.</w:t>
       </w:r>
     </w:p>
     <w:p>
@@ -19686,7 +19704,7 @@
           <w:color w:val="1A1A1A"/>
           <w:sz w:val="22"/>
         </w:rPr>
-        <w:t>Progresso do ciclo de vida: quantos registros existem em cada um dos 9 formularios (Demanda a RLA) para esse projeto, com o status de cada um e um link para abrir o formulario correspondente.</w:t>
+        <w:t>Situacao atual: a linha desse projeto no Relatorio de Situacao - status, % concluido, datas previstas, marcos, custos realizados e os campos Merece destaque/Merece atencao, quando preenchidos.</w:t>
       </w:r>
     </w:p>
     <w:p>
@@ -19710,7 +19728,7 @@
           <w:color w:val="1A1A1A"/>
           <w:sz w:val="22"/>
         </w:rPr>
-        <w:t>Cronograma (Planejamento) e custos planejados (TAP): o cronograma de entregas macro do Planejamento e Desenvolvimento de Projeto e o custo total estimado do TAP desse projeto, para comparar com os custos realizados do Relatorio de Situacao.</w:t>
+        <w:t>Progresso do ciclo de vida: quantos registros existem em cada um dos 9 formularios (Demanda a RLA) para esse projeto, com o status de cada um e um link para abrir o formulario correspondente.</w:t>
       </w:r>
     </w:p>
     <w:p>
@@ -19734,7 +19752,7 @@
           <w:color w:val="1A1A1A"/>
           <w:sz w:val="22"/>
         </w:rPr>
-        <w:t>Equipe do projeto: mesma lista de Administracao &gt; Equipes (secao 6.2), com o papel de cada membro vindo do cadastro global de usuarios.</w:t>
+        <w:t>Cronograma (Planejamento) e custos planejados (TAP): o cronograma de entregas macro do Planejamento e Desenvolvimento de Projeto e o custo total estimado do TAP desse projeto, para comparar com os custos realizados do Relatorio de Situacao.</w:t>
       </w:r>
     </w:p>
     <w:p>
@@ -19758,6 +19776,30 @@
           <w:color w:val="1A1A1A"/>
           <w:sz w:val="22"/>
         </w:rPr>
+        <w:t>Equipe do projeto: mesma lista de Administracao &gt; Equipes (secao 6.2), com o papel de cada membro vindo do cadastro global de usuarios.</w:t>
+      </w:r>
+    </w:p>
+    <w:p>
+      <w:pPr>
+        <w:pStyle w:val="PargrafodaLista"/>
+        <w:numPr>
+          <w:ilvl w:val="0"/>
+          <w:numId w:val="28"/>
+        </w:numPr>
+        <w:spacing w:after="80" w:line="260" w:lineRule="auto"/>
+        <w:ind w:left="700"/>
+        <w:rPr>
+          <w:rFonts w:ascii="Montserrat" w:hAnsi="Montserrat"/>
+          <w:color w:val="1A1A1A"/>
+          <w:sz w:val="22"/>
+        </w:rPr>
+      </w:pPr>
+      <w:r>
+        <w:rPr>
+          <w:rFonts w:ascii="Montserrat" w:hAnsi="Montserrat"/>
+          <w:color w:val="1A1A1A"/>
+          <w:sz w:val="22"/>
+        </w:rPr>
         <w:t>Historico de alteracoes: o mesmo Ver historico ja disponivel em cada formulario vinculado a esse projeto.</w:t>
       </w:r>
     </w:p>
@@ -19772,16 +19814,16 @@
         </w:rPr>
         <w:lastRenderedPageBreak/>
         <w:drawing>
-          <wp:inline distT="0" distB="0" distL="0" distR="0" wp14:anchorId="65141FAC" wp14:editId="4CBBA449">
+          <wp:inline distT="0" distB="0" distL="0" distR="0" wp14:anchorId="64ECCF75" wp14:editId="42E20A0F">
             <wp:extent cx="5303520" cy="7628836"/>
             <wp:effectExtent l="19050" t="19050" r="11430" b="10795"/>
-            <wp:docPr id="1717165530" name="Imagem 53"/>
+            <wp:docPr id="1170824785" name="Imagem 53"/>
             <wp:cNvGraphicFramePr/>
             <a:graphic xmlns:a="http://schemas.openxmlformats.org/drawingml/2006/main">
               <a:graphicData uri="http://schemas.openxmlformats.org/drawingml/2006/picture">
                 <pic:pic xmlns:pic="http://schemas.openxmlformats.org/drawingml/2006/picture">
                   <pic:nvPicPr>
-                    <pic:cNvPr id="1717165530" name=""/>
+                    <pic:cNvPr id="1170824785" name=""/>
                     <pic:cNvPicPr/>
                   </pic:nvPicPr>
                   <pic:blipFill>
@@ -19913,7 +19955,7 @@
           <w:sz w:val="27"/>
         </w:rPr>
       </w:pPr>
-      <w:bookmarkStart w:id="43" w:name="_Toc240035188"/>
+      <w:bookmarkStart w:id="43" w:name="_Toc240036087"/>
       <w:r>
         <w:rPr>
           <w:rFonts w:ascii="Montserrat" w:hAnsi="Montserrat"/>
@@ -20066,7 +20108,7 @@
           <w:sz w:val="27"/>
         </w:rPr>
       </w:pPr>
-      <w:bookmarkStart w:id="44" w:name="_Toc240035189"/>
+      <w:bookmarkStart w:id="44" w:name="_Toc240036088"/>
       <w:r>
         <w:rPr>
           <w:rFonts w:ascii="Montserrat" w:hAnsi="Montserrat"/>
@@ -20359,16 +20401,16 @@
           <w:noProof/>
         </w:rPr>
         <w:drawing>
-          <wp:inline distT="0" distB="0" distL="0" distR="0" wp14:anchorId="5FB8E69F" wp14:editId="6E152CBF">
+          <wp:inline distT="0" distB="0" distL="0" distR="0" wp14:anchorId="6914FA43" wp14:editId="69B5A6E0">
             <wp:extent cx="5303520" cy="1351384"/>
             <wp:effectExtent l="19050" t="19050" r="11430" b="20320"/>
-            <wp:docPr id="517837223" name="Imagem 54"/>
+            <wp:docPr id="221074713" name="Imagem 54"/>
             <wp:cNvGraphicFramePr/>
             <a:graphic xmlns:a="http://schemas.openxmlformats.org/drawingml/2006/main">
               <a:graphicData uri="http://schemas.openxmlformats.org/drawingml/2006/picture">
                 <pic:pic xmlns:pic="http://schemas.openxmlformats.org/drawingml/2006/picture">
                   <pic:nvPicPr>
-                    <pic:cNvPr id="517837223" name=""/>
+                    <pic:cNvPr id="221074713" name=""/>
                     <pic:cNvPicPr/>
                   </pic:nvPicPr>
                   <pic:blipFill>
@@ -20436,7 +20478,7 @@
           <w:sz w:val="27"/>
         </w:rPr>
       </w:pPr>
-      <w:bookmarkStart w:id="45" w:name="_Toc240035190"/>
+      <w:bookmarkStart w:id="45" w:name="_Toc240036089"/>
       <w:r>
         <w:rPr>
           <w:rFonts w:ascii="Montserrat" w:hAnsi="Montserrat"/>
@@ -20581,16 +20623,16 @@
           <w:noProof/>
         </w:rPr>
         <w:drawing>
-          <wp:inline distT="0" distB="0" distL="0" distR="0" wp14:anchorId="717507FE" wp14:editId="7CA0DD03">
+          <wp:inline distT="0" distB="0" distL="0" distR="0" wp14:anchorId="22017B79" wp14:editId="6C21F459">
             <wp:extent cx="5303520" cy="1422793"/>
             <wp:effectExtent l="19050" t="19050" r="11430" b="25400"/>
-            <wp:docPr id="669134427" name="Imagem 55"/>
+            <wp:docPr id="1117203421" name="Imagem 55"/>
             <wp:cNvGraphicFramePr/>
             <a:graphic xmlns:a="http://schemas.openxmlformats.org/drawingml/2006/main">
               <a:graphicData uri="http://schemas.openxmlformats.org/drawingml/2006/picture">
                 <pic:pic xmlns:pic="http://schemas.openxmlformats.org/drawingml/2006/picture">
                   <pic:nvPicPr>
-                    <pic:cNvPr id="669134427" name=""/>
+                    <pic:cNvPr id="1117203421" name=""/>
                     <pic:cNvPicPr/>
                   </pic:nvPicPr>
                   <pic:blipFill>
@@ -20745,16 +20787,16 @@
         </w:rPr>
         <w:lastRenderedPageBreak/>
         <w:drawing>
-          <wp:inline distT="0" distB="0" distL="0" distR="0" wp14:anchorId="28D62616" wp14:editId="0BC3CEA5">
+          <wp:inline distT="0" distB="0" distL="0" distR="0" wp14:anchorId="503C7BAC" wp14:editId="4CE465F2">
             <wp:extent cx="5303520" cy="1841050"/>
             <wp:effectExtent l="19050" t="19050" r="11430" b="26035"/>
-            <wp:docPr id="371853468" name="Imagem 56"/>
+            <wp:docPr id="729080839" name="Imagem 56"/>
             <wp:cNvGraphicFramePr/>
             <a:graphic xmlns:a="http://schemas.openxmlformats.org/drawingml/2006/main">
               <a:graphicData uri="http://schemas.openxmlformats.org/drawingml/2006/picture">
                 <pic:pic xmlns:pic="http://schemas.openxmlformats.org/drawingml/2006/picture">
                   <pic:nvPicPr>
-                    <pic:cNvPr id="371853468" name=""/>
+                    <pic:cNvPr id="729080839" name=""/>
                     <pic:cNvPicPr/>
                   </pic:nvPicPr>
                   <pic:blipFill>
@@ -20908,16 +20950,16 @@
           <w:noProof/>
         </w:rPr>
         <w:drawing>
-          <wp:inline distT="0" distB="0" distL="0" distR="0" wp14:anchorId="64301AF1" wp14:editId="510727F6">
+          <wp:inline distT="0" distB="0" distL="0" distR="0" wp14:anchorId="1D87A89A" wp14:editId="75FCEBE6">
             <wp:extent cx="5303520" cy="303041"/>
             <wp:effectExtent l="19050" t="19050" r="11430" b="20955"/>
-            <wp:docPr id="636375061" name="Imagem 57"/>
+            <wp:docPr id="1930459627" name="Imagem 57"/>
             <wp:cNvGraphicFramePr/>
             <a:graphic xmlns:a="http://schemas.openxmlformats.org/drawingml/2006/main">
               <a:graphicData uri="http://schemas.openxmlformats.org/drawingml/2006/picture">
                 <pic:pic xmlns:pic="http://schemas.openxmlformats.org/drawingml/2006/picture">
                   <pic:nvPicPr>
-                    <pic:cNvPr id="636375061" name=""/>
+                    <pic:cNvPr id="1930459627" name=""/>
                     <pic:cNvPicPr/>
                   </pic:nvPicPr>
                   <pic:blipFill>
@@ -20985,16 +21027,16 @@
         </w:rPr>
         <w:lastRenderedPageBreak/>
         <w:drawing>
-          <wp:inline distT="0" distB="0" distL="0" distR="0" wp14:anchorId="71DD86C0" wp14:editId="431DCD38">
+          <wp:inline distT="0" distB="0" distL="0" distR="0" wp14:anchorId="3376585E" wp14:editId="7D805FBD">
             <wp:extent cx="5303520" cy="2983005"/>
             <wp:effectExtent l="19050" t="19050" r="11430" b="27305"/>
-            <wp:docPr id="426354368" name="Imagem 58"/>
+            <wp:docPr id="1159722231" name="Imagem 58"/>
             <wp:cNvGraphicFramePr/>
             <a:graphic xmlns:a="http://schemas.openxmlformats.org/drawingml/2006/main">
               <a:graphicData uri="http://schemas.openxmlformats.org/drawingml/2006/picture">
                 <pic:pic xmlns:pic="http://schemas.openxmlformats.org/drawingml/2006/picture">
                   <pic:nvPicPr>
-                    <pic:cNvPr id="426354368" name=""/>
+                    <pic:cNvPr id="1159722231" name=""/>
                     <pic:cNvPicPr/>
                   </pic:nvPicPr>
                   <pic:blipFill>
@@ -21066,7 +21108,7 @@
           <w:sz w:val="34"/>
         </w:rPr>
       </w:pPr>
-      <w:bookmarkStart w:id="46" w:name="_Toc240035191"/>
+      <w:bookmarkStart w:id="46" w:name="_Toc240036090"/>
       <w:r>
         <w:rPr>
           <w:rFonts w:ascii="Montserrat" w:hAnsi="Montserrat"/>
@@ -21310,7 +21352,7 @@
           <w:sz w:val="34"/>
         </w:rPr>
       </w:pPr>
-      <w:bookmarkStart w:id="47" w:name="_Toc240035192"/>
+      <w:bookmarkStart w:id="47" w:name="_Toc240036091"/>
       <w:r>
         <w:rPr>
           <w:rFonts w:ascii="Montserrat" w:hAnsi="Montserrat"/>
@@ -23098,7 +23140,7 @@
 <file path=word/numbering.xml><?xml version="1.0" encoding="utf-8"?>
 <w:numbering xmlns:wpc="http://schemas.microsoft.com/office/word/2010/wordprocessingCanvas" xmlns:cx="http://schemas.microsoft.com/office/drawing/2014/chartex" xmlns:cx1="http://schemas.microsoft.com/office/drawing/2015/9/8/chartex" xmlns:cx2="http://schemas.microsoft.com/office/drawing/2015/10/21/chartex" xmlns:cx3="http://schemas.microsoft.com/office/drawing/2016/5/9/chartex" xmlns:cx4="http://schemas.microsoft.com/office/drawing/2016/5/10/chartex" xmlns:cx5="http://schemas.microsoft.com/office/drawing/2016/5/11/chartex" xmlns:cx6="http://schemas.microsoft.com/office/drawing/2016/5/12/chartex" xmlns:cx7="http://schemas.microsoft.com/office/drawing/2016/5/13/chartex" xmlns:cx8="http://schemas.microsoft.com/office/drawing/2016/5/14/chartex" xmlns:mc="http://schemas.openxmlformats.org/markup-compatibility/2006" xmlns:aink="http://schemas.microsoft.com/office/drawing/2016/ink" xmlns:am3d="http://schemas.microsoft.com/office/drawing/2017/model3d" xmlns:o="urn:schemas-microsoft-com:office:office" xmlns:oel="http://schemas.microsoft.com/office/2019/extlst" xmlns:r="http://schemas.openxmlformats.org/officeDocument/2006/relationships" xmlns:m="http://schemas.openxmlformats.org/officeDocument/2006/math" xmlns:v="urn:schemas-microsoft-com:vml" xmlns:wp14="http://schemas.microsoft.com/office/word/2010/wordprocessingDrawing" xmlns:wp="http://schemas.openxmlformats.org/drawingml/2006/wordprocessingDrawing" xmlns:w10="urn:schemas-microsoft-com:office:word" xmlns:w="http://schemas.openxmlformats.org/wordprocessingml/2006/main" xmlns:w14="http://schemas.microsoft.com/office/word/2010/wordml" xmlns:w15="http://schemas.microsoft.com/office/word/2012/wordml" xmlns:w16cex="http://schemas.microsoft.com/office/word/2018/wordml/cex" xmlns:w16cid="http://schemas.microsoft.com/office/word/2016/wordml/cid" xmlns:w16="http://schemas.microsoft.com/office/word/2018/wordml" xmlns:w16du="http://schemas.microsoft.com/office/word/2023/wordml/word16du" xmlns:w16sdtdh="http://schemas.microsoft.com/office/word/2020/wordml/sdtdatahash" xmlns:w16sdtfl="http://schemas.microsoft.com/office/word/2024/wordml/sdtformatlock" xmlns:w16se="http://schemas.microsoft.com/office/word/2015/wordml/symex" xmlns:wpg="http://schemas.microsoft.com/office/word/2010/wordprocessingGroup" xmlns:wpi="http://schemas.microsoft.com/office/word/2010/wordprocessingInk" xmlns:wne="http://schemas.microsoft.com/office/word/2006/wordml" xmlns:wps="http://schemas.microsoft.com/office/word/2010/wordprocessingShape" mc:Ignorable="w14 w15 w16se w16cid w16 w16cex w16sdtdh w16sdtfl w16du wp14">
   <w:abstractNum w:abstractNumId="0" w15:restartNumberingAfterBreak="0">
-    <w:nsid w:val="00427F45"/>
+    <w:nsid w:val="020C4558"/>
     <w:multiLevelType w:val="singleLevel"/>
     <w:tmpl w:val="04160001"/>
     <w:lvl w:ilvl="0">
@@ -23115,7 +23157,7 @@
     </w:lvl>
   </w:abstractNum>
   <w:abstractNum w:abstractNumId="1" w15:restartNumberingAfterBreak="0">
-    <w:nsid w:val="07FB6089"/>
+    <w:nsid w:val="05DA2E8A"/>
     <w:multiLevelType w:val="singleLevel"/>
     <w:tmpl w:val="04160001"/>
     <w:lvl w:ilvl="0">
@@ -23132,7 +23174,7 @@
     </w:lvl>
   </w:abstractNum>
   <w:abstractNum w:abstractNumId="2" w15:restartNumberingAfterBreak="0">
-    <w:nsid w:val="08402921"/>
+    <w:nsid w:val="0D1876A5"/>
     <w:multiLevelType w:val="singleLevel"/>
     <w:tmpl w:val="04160001"/>
     <w:lvl w:ilvl="0">
@@ -23149,7 +23191,7 @@
     </w:lvl>
   </w:abstractNum>
   <w:abstractNum w:abstractNumId="3" w15:restartNumberingAfterBreak="0">
-    <w:nsid w:val="085B2FFB"/>
+    <w:nsid w:val="105D73F5"/>
     <w:multiLevelType w:val="singleLevel"/>
     <w:tmpl w:val="04160001"/>
     <w:lvl w:ilvl="0">
@@ -23166,7 +23208,7 @@
     </w:lvl>
   </w:abstractNum>
   <w:abstractNum w:abstractNumId="4" w15:restartNumberingAfterBreak="0">
-    <w:nsid w:val="0DCC0449"/>
+    <w:nsid w:val="12685678"/>
     <w:multiLevelType w:val="singleLevel"/>
     <w:tmpl w:val="04160001"/>
     <w:lvl w:ilvl="0">
@@ -23183,7 +23225,7 @@
     </w:lvl>
   </w:abstractNum>
   <w:abstractNum w:abstractNumId="5" w15:restartNumberingAfterBreak="0">
-    <w:nsid w:val="105F3747"/>
+    <w:nsid w:val="127B3A0C"/>
     <w:multiLevelType w:val="singleLevel"/>
     <w:tmpl w:val="04160001"/>
     <w:lvl w:ilvl="0">
@@ -23200,7 +23242,7 @@
     </w:lvl>
   </w:abstractNum>
   <w:abstractNum w:abstractNumId="6" w15:restartNumberingAfterBreak="0">
-    <w:nsid w:val="12E45F35"/>
+    <w:nsid w:val="14D7376A"/>
     <w:multiLevelType w:val="singleLevel"/>
     <w:tmpl w:val="04160001"/>
     <w:lvl w:ilvl="0">
@@ -23217,7 +23259,7 @@
     </w:lvl>
   </w:abstractNum>
   <w:abstractNum w:abstractNumId="7" w15:restartNumberingAfterBreak="0">
-    <w:nsid w:val="161B43ED"/>
+    <w:nsid w:val="1A184E7E"/>
     <w:multiLevelType w:val="singleLevel"/>
     <w:tmpl w:val="04160001"/>
     <w:lvl w:ilvl="0">
@@ -23234,7 +23276,7 @@
     </w:lvl>
   </w:abstractNum>
   <w:abstractNum w:abstractNumId="8" w15:restartNumberingAfterBreak="0">
-    <w:nsid w:val="1A097177"/>
+    <w:nsid w:val="1CD01198"/>
     <w:multiLevelType w:val="singleLevel"/>
     <w:tmpl w:val="04160001"/>
     <w:lvl w:ilvl="0">
@@ -23251,7 +23293,7 @@
     </w:lvl>
   </w:abstractNum>
   <w:abstractNum w:abstractNumId="9" w15:restartNumberingAfterBreak="0">
-    <w:nsid w:val="1DED55FA"/>
+    <w:nsid w:val="263D191D"/>
     <w:multiLevelType w:val="singleLevel"/>
     <w:tmpl w:val="04160001"/>
     <w:lvl w:ilvl="0">
@@ -23268,7 +23310,7 @@
     </w:lvl>
   </w:abstractNum>
   <w:abstractNum w:abstractNumId="10" w15:restartNumberingAfterBreak="0">
-    <w:nsid w:val="20120E84"/>
+    <w:nsid w:val="31C807CB"/>
     <w:multiLevelType w:val="singleLevel"/>
     <w:tmpl w:val="04160001"/>
     <w:lvl w:ilvl="0">
@@ -23285,7 +23327,7 @@
     </w:lvl>
   </w:abstractNum>
   <w:abstractNum w:abstractNumId="11" w15:restartNumberingAfterBreak="0">
-    <w:nsid w:val="21E04818"/>
+    <w:nsid w:val="33410DEE"/>
     <w:multiLevelType w:val="singleLevel"/>
     <w:tmpl w:val="04160001"/>
     <w:lvl w:ilvl="0">
@@ -23302,7 +23344,7 @@
     </w:lvl>
   </w:abstractNum>
   <w:abstractNum w:abstractNumId="12" w15:restartNumberingAfterBreak="0">
-    <w:nsid w:val="24F056F4"/>
+    <w:nsid w:val="34FD0424"/>
     <w:multiLevelType w:val="singleLevel"/>
     <w:tmpl w:val="04160001"/>
     <w:lvl w:ilvl="0">
@@ -23319,7 +23361,7 @@
     </w:lvl>
   </w:abstractNum>
   <w:abstractNum w:abstractNumId="13" w15:restartNumberingAfterBreak="0">
-    <w:nsid w:val="26026038"/>
+    <w:nsid w:val="378E0FE8"/>
     <w:multiLevelType w:val="singleLevel"/>
     <w:tmpl w:val="04160001"/>
     <w:lvl w:ilvl="0">
@@ -23336,7 +23378,7 @@
     </w:lvl>
   </w:abstractNum>
   <w:abstractNum w:abstractNumId="14" w15:restartNumberingAfterBreak="0">
-    <w:nsid w:val="2A99775D"/>
+    <w:nsid w:val="3C2D3990"/>
     <w:multiLevelType w:val="singleLevel"/>
     <w:tmpl w:val="04160001"/>
     <w:lvl w:ilvl="0">
@@ -23353,7 +23395,7 @@
     </w:lvl>
   </w:abstractNum>
   <w:abstractNum w:abstractNumId="15" w15:restartNumberingAfterBreak="0">
-    <w:nsid w:val="30597B71"/>
+    <w:nsid w:val="408D34E1"/>
     <w:multiLevelType w:val="singleLevel"/>
     <w:tmpl w:val="04160001"/>
     <w:lvl w:ilvl="0">
@@ -23370,7 +23412,7 @@
     </w:lvl>
   </w:abstractNum>
   <w:abstractNum w:abstractNumId="16" w15:restartNumberingAfterBreak="0">
-    <w:nsid w:val="37C70A6B"/>
+    <w:nsid w:val="474C7D1E"/>
     <w:multiLevelType w:val="singleLevel"/>
     <w:tmpl w:val="04160001"/>
     <w:lvl w:ilvl="0">
@@ -23387,7 +23429,7 @@
     </w:lvl>
   </w:abstractNum>
   <w:abstractNum w:abstractNumId="17" w15:restartNumberingAfterBreak="0">
-    <w:nsid w:val="3A5052E0"/>
+    <w:nsid w:val="4C604DA4"/>
     <w:multiLevelType w:val="singleLevel"/>
     <w:tmpl w:val="04160001"/>
     <w:lvl w:ilvl="0">
@@ -23404,7 +23446,7 @@
     </w:lvl>
   </w:abstractNum>
   <w:abstractNum w:abstractNumId="18" w15:restartNumberingAfterBreak="0">
-    <w:nsid w:val="3D5F394E"/>
+    <w:nsid w:val="509D5789"/>
     <w:multiLevelType w:val="singleLevel"/>
     <w:tmpl w:val="04160001"/>
     <w:lvl w:ilvl="0">
@@ -23421,7 +23463,7 @@
     </w:lvl>
   </w:abstractNum>
   <w:abstractNum w:abstractNumId="19" w15:restartNumberingAfterBreak="0">
-    <w:nsid w:val="44453FE9"/>
+    <w:nsid w:val="51F8704B"/>
     <w:multiLevelType w:val="singleLevel"/>
     <w:tmpl w:val="04160001"/>
     <w:lvl w:ilvl="0">
@@ -23438,7 +23480,7 @@
     </w:lvl>
   </w:abstractNum>
   <w:abstractNum w:abstractNumId="20" w15:restartNumberingAfterBreak="0">
-    <w:nsid w:val="47AB1E19"/>
+    <w:nsid w:val="565F4498"/>
     <w:multiLevelType w:val="singleLevel"/>
     <w:tmpl w:val="04160001"/>
     <w:lvl w:ilvl="0">
@@ -23455,7 +23497,7 @@
     </w:lvl>
   </w:abstractNum>
   <w:abstractNum w:abstractNumId="21" w15:restartNumberingAfterBreak="0">
-    <w:nsid w:val="490C0CBA"/>
+    <w:nsid w:val="62662C0B"/>
     <w:multiLevelType w:val="singleLevel"/>
     <w:tmpl w:val="04160001"/>
     <w:lvl w:ilvl="0">
@@ -23472,7 +23514,7 @@
     </w:lvl>
   </w:abstractNum>
   <w:abstractNum w:abstractNumId="22" w15:restartNumberingAfterBreak="0">
-    <w:nsid w:val="5421467B"/>
+    <w:nsid w:val="63212662"/>
     <w:multiLevelType w:val="singleLevel"/>
     <w:tmpl w:val="04160001"/>
     <w:lvl w:ilvl="0">
@@ -23489,7 +23531,7 @@
     </w:lvl>
   </w:abstractNum>
   <w:abstractNum w:abstractNumId="23" w15:restartNumberingAfterBreak="0">
-    <w:nsid w:val="58416FDB"/>
+    <w:nsid w:val="64BA7C68"/>
     <w:multiLevelType w:val="singleLevel"/>
     <w:tmpl w:val="04160001"/>
     <w:lvl w:ilvl="0">
@@ -23506,7 +23548,7 @@
     </w:lvl>
   </w:abstractNum>
   <w:abstractNum w:abstractNumId="24" w15:restartNumberingAfterBreak="0">
-    <w:nsid w:val="5F841CA1"/>
+    <w:nsid w:val="65360CF2"/>
     <w:multiLevelType w:val="singleLevel"/>
     <w:tmpl w:val="04160001"/>
     <w:lvl w:ilvl="0">
@@ -23523,7 +23565,7 @@
     </w:lvl>
   </w:abstractNum>
   <w:abstractNum w:abstractNumId="25" w15:restartNumberingAfterBreak="0">
-    <w:nsid w:val="62BF01B4"/>
+    <w:nsid w:val="6676019A"/>
     <w:multiLevelType w:val="singleLevel"/>
     <w:tmpl w:val="04160001"/>
     <w:lvl w:ilvl="0">
@@ -23540,7 +23582,7 @@
     </w:lvl>
   </w:abstractNum>
   <w:abstractNum w:abstractNumId="26" w15:restartNumberingAfterBreak="0">
-    <w:nsid w:val="6AFF1686"/>
+    <w:nsid w:val="70552E23"/>
     <w:multiLevelType w:val="singleLevel"/>
     <w:tmpl w:val="04160001"/>
     <w:lvl w:ilvl="0">
@@ -23557,7 +23599,7 @@
     </w:lvl>
   </w:abstractNum>
   <w:abstractNum w:abstractNumId="27" w15:restartNumberingAfterBreak="0">
-    <w:nsid w:val="6EE8031C"/>
+    <w:nsid w:val="71982D3D"/>
     <w:multiLevelType w:val="singleLevel"/>
     <w:tmpl w:val="04160001"/>
     <w:lvl w:ilvl="0">
@@ -23574,7 +23616,7 @@
     </w:lvl>
   </w:abstractNum>
   <w:abstractNum w:abstractNumId="28" w15:restartNumberingAfterBreak="0">
-    <w:nsid w:val="70720642"/>
+    <w:nsid w:val="735726A6"/>
     <w:multiLevelType w:val="singleLevel"/>
     <w:tmpl w:val="04160001"/>
     <w:lvl w:ilvl="0">
@@ -23591,7 +23633,7 @@
     </w:lvl>
   </w:abstractNum>
   <w:abstractNum w:abstractNumId="29" w15:restartNumberingAfterBreak="0">
-    <w:nsid w:val="73D90BDF"/>
+    <w:nsid w:val="742C1907"/>
     <w:multiLevelType w:val="singleLevel"/>
     <w:tmpl w:val="04160001"/>
     <w:lvl w:ilvl="0">
@@ -23608,7 +23650,7 @@
     </w:lvl>
   </w:abstractNum>
   <w:abstractNum w:abstractNumId="30" w15:restartNumberingAfterBreak="0">
-    <w:nsid w:val="76381109"/>
+    <w:nsid w:val="7ADE74B6"/>
     <w:multiLevelType w:val="singleLevel"/>
     <w:tmpl w:val="04160001"/>
     <w:lvl w:ilvl="0">
@@ -23625,7 +23667,7 @@
     </w:lvl>
   </w:abstractNum>
   <w:abstractNum w:abstractNumId="31" w15:restartNumberingAfterBreak="0">
-    <w:nsid w:val="77A83226"/>
+    <w:nsid w:val="7B595F0D"/>
     <w:multiLevelType w:val="singleLevel"/>
     <w:tmpl w:val="04160001"/>
     <w:lvl w:ilvl="0">
@@ -23641,101 +23683,101 @@
       </w:rPr>
     </w:lvl>
   </w:abstractNum>
-  <w:num w:numId="1" w16cid:durableId="1908763494">
+  <w:num w:numId="1" w16cid:durableId="1159883656">
+    <w:abstractNumId w:val="4"/>
+  </w:num>
+  <w:num w:numId="2" w16cid:durableId="1808863069">
+    <w:abstractNumId w:val="1"/>
+  </w:num>
+  <w:num w:numId="3" w16cid:durableId="1711152332">
+    <w:abstractNumId w:val="25"/>
+  </w:num>
+  <w:num w:numId="4" w16cid:durableId="38013996">
+    <w:abstractNumId w:val="8"/>
+  </w:num>
+  <w:num w:numId="5" w16cid:durableId="491259833">
+    <w:abstractNumId w:val="29"/>
+  </w:num>
+  <w:num w:numId="6" w16cid:durableId="1941255774">
+    <w:abstractNumId w:val="31"/>
+  </w:num>
+  <w:num w:numId="7" w16cid:durableId="609511053">
     <w:abstractNumId w:val="30"/>
   </w:num>
-  <w:num w:numId="2" w16cid:durableId="2052488505">
+  <w:num w:numId="8" w16cid:durableId="18437992">
+    <w:abstractNumId w:val="27"/>
+  </w:num>
+  <w:num w:numId="9" w16cid:durableId="401684352">
+    <w:abstractNumId w:val="26"/>
+  </w:num>
+  <w:num w:numId="10" w16cid:durableId="1691909503">
+    <w:abstractNumId w:val="16"/>
+  </w:num>
+  <w:num w:numId="11" w16cid:durableId="2142262316">
+    <w:abstractNumId w:val="19"/>
+  </w:num>
+  <w:num w:numId="12" w16cid:durableId="2147232999">
+    <w:abstractNumId w:val="20"/>
+  </w:num>
+  <w:num w:numId="13" w16cid:durableId="1449079230">
+    <w:abstractNumId w:val="3"/>
+  </w:num>
+  <w:num w:numId="14" w16cid:durableId="1803691514">
+    <w:abstractNumId w:val="10"/>
+  </w:num>
+  <w:num w:numId="15" w16cid:durableId="638847767">
+    <w:abstractNumId w:val="7"/>
+  </w:num>
+  <w:num w:numId="16" w16cid:durableId="1902472425">
+    <w:abstractNumId w:val="0"/>
+  </w:num>
+  <w:num w:numId="17" w16cid:durableId="1348291953">
+    <w:abstractNumId w:val="14"/>
+  </w:num>
+  <w:num w:numId="18" w16cid:durableId="1777482579">
+    <w:abstractNumId w:val="5"/>
+  </w:num>
+  <w:num w:numId="19" w16cid:durableId="1815022890">
+    <w:abstractNumId w:val="15"/>
+  </w:num>
+  <w:num w:numId="20" w16cid:durableId="137111676">
     <w:abstractNumId w:val="21"/>
   </w:num>
-  <w:num w:numId="3" w16cid:durableId="735516781">
+  <w:num w:numId="21" w16cid:durableId="2143376194">
     <w:abstractNumId w:val="18"/>
   </w:num>
-  <w:num w:numId="4" w16cid:durableId="274288064">
-    <w:abstractNumId w:val="0"/>
-  </w:num>
-  <w:num w:numId="5" w16cid:durableId="2120445034">
+  <w:num w:numId="22" w16cid:durableId="1783258734">
     <w:abstractNumId w:val="24"/>
   </w:num>
-  <w:num w:numId="6" w16cid:durableId="1195926510">
-    <w:abstractNumId w:val="26"/>
+  <w:num w:numId="23" w16cid:durableId="68693639">
+    <w:abstractNumId w:val="13"/>
   </w:num>
-  <w:num w:numId="7" w16cid:durableId="149102572">
+  <w:num w:numId="24" w16cid:durableId="655770033">
+    <w:abstractNumId w:val="28"/>
+  </w:num>
+  <w:num w:numId="25" w16cid:durableId="1442726421">
+    <w:abstractNumId w:val="22"/>
+  </w:num>
+  <w:num w:numId="26" w16cid:durableId="886722001">
+    <w:abstractNumId w:val="6"/>
+  </w:num>
+  <w:num w:numId="27" w16cid:durableId="1328746878">
+    <w:abstractNumId w:val="12"/>
+  </w:num>
+  <w:num w:numId="28" w16cid:durableId="1867476724">
     <w:abstractNumId w:val="23"/>
   </w:num>
-  <w:num w:numId="8" w16cid:durableId="160854999">
-    <w:abstractNumId w:val="19"/>
-  </w:num>
-  <w:num w:numId="9" w16cid:durableId="154036351">
-    <w:abstractNumId w:val="5"/>
-  </w:num>
-  <w:num w:numId="10" w16cid:durableId="1836415211">
-    <w:abstractNumId w:val="8"/>
-  </w:num>
-  <w:num w:numId="11" w16cid:durableId="832915197">
-    <w:abstractNumId w:val="6"/>
-  </w:num>
-  <w:num w:numId="12" w16cid:durableId="1646202265">
-    <w:abstractNumId w:val="20"/>
-  </w:num>
-  <w:num w:numId="13" w16cid:durableId="439497695">
+  <w:num w:numId="29" w16cid:durableId="83765237">
     <w:abstractNumId w:val="9"/>
   </w:num>
-  <w:num w:numId="14" w16cid:durableId="446389754">
-    <w:abstractNumId w:val="7"/>
+  <w:num w:numId="30" w16cid:durableId="1864397435">
+    <w:abstractNumId w:val="11"/>
   </w:num>
-  <w:num w:numId="15" w16cid:durableId="455683898">
-    <w:abstractNumId w:val="3"/>
-  </w:num>
-  <w:num w:numId="16" w16cid:durableId="785004401">
-    <w:abstractNumId w:val="12"/>
-  </w:num>
-  <w:num w:numId="17" w16cid:durableId="1345743574">
-    <w:abstractNumId w:val="27"/>
-  </w:num>
-  <w:num w:numId="18" w16cid:durableId="52124547">
-    <w:abstractNumId w:val="31"/>
-  </w:num>
-  <w:num w:numId="19" w16cid:durableId="1396859101">
-    <w:abstractNumId w:val="17"/>
-  </w:num>
-  <w:num w:numId="20" w16cid:durableId="939338053">
-    <w:abstractNumId w:val="1"/>
-  </w:num>
-  <w:num w:numId="21" w16cid:durableId="548416958">
+  <w:num w:numId="31" w16cid:durableId="1646465338">
     <w:abstractNumId w:val="2"/>
   </w:num>
-  <w:num w:numId="22" w16cid:durableId="181941081">
-    <w:abstractNumId w:val="11"/>
-  </w:num>
-  <w:num w:numId="23" w16cid:durableId="1700815942">
-    <w:abstractNumId w:val="13"/>
-  </w:num>
-  <w:num w:numId="24" w16cid:durableId="1814448548">
-    <w:abstractNumId w:val="22"/>
-  </w:num>
-  <w:num w:numId="25" w16cid:durableId="646209658">
-    <w:abstractNumId w:val="25"/>
-  </w:num>
-  <w:num w:numId="26" w16cid:durableId="63452361">
-    <w:abstractNumId w:val="16"/>
-  </w:num>
-  <w:num w:numId="27" w16cid:durableId="672684352">
-    <w:abstractNumId w:val="15"/>
-  </w:num>
-  <w:num w:numId="28" w16cid:durableId="1812549894">
-    <w:abstractNumId w:val="4"/>
-  </w:num>
-  <w:num w:numId="29" w16cid:durableId="1732270558">
-    <w:abstractNumId w:val="29"/>
-  </w:num>
-  <w:num w:numId="30" w16cid:durableId="1644506582">
-    <w:abstractNumId w:val="14"/>
-  </w:num>
-  <w:num w:numId="31" w16cid:durableId="1588341923">
-    <w:abstractNumId w:val="10"/>
-  </w:num>
-  <w:num w:numId="32" w16cid:durableId="1066034578">
-    <w:abstractNumId w:val="28"/>
+  <w:num w:numId="32" w16cid:durableId="1792431171">
+    <w:abstractNumId w:val="17"/>
   </w:num>
 </w:numbering>
 </file>
@@ -24148,7 +24190,7 @@
     <w:link w:val="Ttulo1Char"/>
     <w:uiPriority w:val="9"/>
     <w:qFormat/>
-    <w:rsid w:val="00C1140E"/>
+    <w:rsid w:val="00582B7F"/>
     <w:pPr>
       <w:keepNext/>
       <w:keepLines/>
@@ -24170,7 +24212,7 @@
     <w:uiPriority w:val="9"/>
     <w:unhideWhenUsed/>
     <w:qFormat/>
-    <w:rsid w:val="00C1140E"/>
+    <w:rsid w:val="00582B7F"/>
     <w:pPr>
       <w:keepNext/>
       <w:keepLines/>
@@ -24193,7 +24235,7 @@
     <w:semiHidden/>
     <w:unhideWhenUsed/>
     <w:qFormat/>
-    <w:rsid w:val="00C1140E"/>
+    <w:rsid w:val="00582B7F"/>
     <w:pPr>
       <w:keepNext/>
       <w:keepLines/>
@@ -24216,7 +24258,7 @@
     <w:semiHidden/>
     <w:unhideWhenUsed/>
     <w:qFormat/>
-    <w:rsid w:val="00C1140E"/>
+    <w:rsid w:val="00582B7F"/>
     <w:pPr>
       <w:keepNext/>
       <w:keepLines/>
@@ -24239,7 +24281,7 @@
     <w:semiHidden/>
     <w:unhideWhenUsed/>
     <w:qFormat/>
-    <w:rsid w:val="00C1140E"/>
+    <w:rsid w:val="00582B7F"/>
     <w:pPr>
       <w:keepNext/>
       <w:keepLines/>
@@ -24260,7 +24302,7 @@
     <w:semiHidden/>
     <w:unhideWhenUsed/>
     <w:qFormat/>
-    <w:rsid w:val="00C1140E"/>
+    <w:rsid w:val="00582B7F"/>
     <w:pPr>
       <w:keepNext/>
       <w:keepLines/>
@@ -24283,7 +24325,7 @@
     <w:semiHidden/>
     <w:unhideWhenUsed/>
     <w:qFormat/>
-    <w:rsid w:val="00C1140E"/>
+    <w:rsid w:val="00582B7F"/>
     <w:pPr>
       <w:keepNext/>
       <w:keepLines/>
@@ -24304,7 +24346,7 @@
     <w:semiHidden/>
     <w:unhideWhenUsed/>
     <w:qFormat/>
-    <w:rsid w:val="00C1140E"/>
+    <w:rsid w:val="00582B7F"/>
     <w:pPr>
       <w:keepNext/>
       <w:keepLines/>
@@ -24327,7 +24369,7 @@
     <w:semiHidden/>
     <w:unhideWhenUsed/>
     <w:qFormat/>
-    <w:rsid w:val="00C1140E"/>
+    <w:rsid w:val="00582B7F"/>
     <w:pPr>
       <w:keepNext/>
       <w:keepLines/>
@@ -24371,7 +24413,7 @@
     <w:basedOn w:val="Fontepargpadro"/>
     <w:link w:val="Ttulo1"/>
     <w:uiPriority w:val="9"/>
-    <w:rsid w:val="00C1140E"/>
+    <w:rsid w:val="00582B7F"/>
     <w:rPr>
       <w:rFonts w:asciiTheme="majorHAnsi" w:eastAsiaTheme="majorEastAsia" w:hAnsiTheme="majorHAnsi" w:cstheme="majorBidi"/>
       <w:color w:val="0F4761" w:themeColor="accent1" w:themeShade="BF"/>
@@ -24384,7 +24426,7 @@
     <w:basedOn w:val="Fontepargpadro"/>
     <w:link w:val="Ttulo2"/>
     <w:uiPriority w:val="9"/>
-    <w:rsid w:val="00C1140E"/>
+    <w:rsid w:val="00582B7F"/>
     <w:rPr>
       <w:rFonts w:asciiTheme="majorHAnsi" w:eastAsiaTheme="majorEastAsia" w:hAnsiTheme="majorHAnsi" w:cstheme="majorBidi"/>
       <w:color w:val="0F4761" w:themeColor="accent1" w:themeShade="BF"/>
@@ -24398,7 +24440,7 @@
     <w:link w:val="Ttulo3"/>
     <w:uiPriority w:val="9"/>
     <w:semiHidden/>
-    <w:rsid w:val="00C1140E"/>
+    <w:rsid w:val="00582B7F"/>
     <w:rPr>
       <w:rFonts w:eastAsiaTheme="majorEastAsia" w:cstheme="majorBidi"/>
       <w:color w:val="0F4761" w:themeColor="accent1" w:themeShade="BF"/>
@@ -24412,7 +24454,7 @@
     <w:link w:val="Ttulo4"/>
     <w:uiPriority w:val="9"/>
     <w:semiHidden/>
-    <w:rsid w:val="00C1140E"/>
+    <w:rsid w:val="00582B7F"/>
     <w:rPr>
       <w:rFonts w:eastAsiaTheme="majorEastAsia" w:cstheme="majorBidi"/>
       <w:i/>
@@ -24426,7 +24468,7 @@
     <w:link w:val="Ttulo5"/>
     <w:uiPriority w:val="9"/>
     <w:semiHidden/>
-    <w:rsid w:val="00C1140E"/>
+    <w:rsid w:val="00582B7F"/>
     <w:rPr>
       <w:rFonts w:eastAsiaTheme="majorEastAsia" w:cstheme="majorBidi"/>
       <w:color w:val="0F4761" w:themeColor="accent1" w:themeShade="BF"/>
@@ -24438,7 +24480,7 @@
     <w:link w:val="Ttulo6"/>
     <w:uiPriority w:val="9"/>
     <w:semiHidden/>
-    <w:rsid w:val="00C1140E"/>
+    <w:rsid w:val="00582B7F"/>
     <w:rPr>
       <w:rFonts w:eastAsiaTheme="majorEastAsia" w:cstheme="majorBidi"/>
       <w:i/>
@@ -24452,7 +24494,7 @@
     <w:link w:val="Ttulo7"/>
     <w:uiPriority w:val="9"/>
     <w:semiHidden/>
-    <w:rsid w:val="00C1140E"/>
+    <w:rsid w:val="00582B7F"/>
     <w:rPr>
       <w:rFonts w:eastAsiaTheme="majorEastAsia" w:cstheme="majorBidi"/>
       <w:color w:val="595959" w:themeColor="text1" w:themeTint="A6"/>
@@ -24464,7 +24506,7 @@
     <w:link w:val="Ttulo8"/>
     <w:uiPriority w:val="9"/>
     <w:semiHidden/>
-    <w:rsid w:val="00C1140E"/>
+    <w:rsid w:val="00582B7F"/>
     <w:rPr>
       <w:rFonts w:eastAsiaTheme="majorEastAsia" w:cstheme="majorBidi"/>
       <w:i/>
@@ -24478,7 +24520,7 @@
     <w:link w:val="Ttulo9"/>
     <w:uiPriority w:val="9"/>
     <w:semiHidden/>
-    <w:rsid w:val="00C1140E"/>
+    <w:rsid w:val="00582B7F"/>
     <w:rPr>
       <w:rFonts w:eastAsiaTheme="majorEastAsia" w:cstheme="majorBidi"/>
       <w:color w:val="272727" w:themeColor="text1" w:themeTint="D8"/>
@@ -24491,7 +24533,7 @@
     <w:link w:val="TtuloChar"/>
     <w:uiPriority w:val="10"/>
     <w:qFormat/>
-    <w:rsid w:val="00C1140E"/>
+    <w:rsid w:val="00582B7F"/>
     <w:pPr>
       <w:spacing w:after="80" w:line="240" w:lineRule="auto"/>
       <w:contextualSpacing/>
@@ -24509,7 +24551,7 @@
     <w:basedOn w:val="Fontepargpadro"/>
     <w:link w:val="Ttulo"/>
     <w:uiPriority w:val="10"/>
-    <w:rsid w:val="00C1140E"/>
+    <w:rsid w:val="00582B7F"/>
     <w:rPr>
       <w:rFonts w:asciiTheme="majorHAnsi" w:eastAsiaTheme="majorEastAsia" w:hAnsiTheme="majorHAnsi" w:cstheme="majorBidi"/>
       <w:spacing w:val="-10"/>
@@ -24525,7 +24567,7 @@
     <w:link w:val="SubttuloChar"/>
     <w:uiPriority w:val="11"/>
     <w:qFormat/>
-    <w:rsid w:val="00C1140E"/>
+    <w:rsid w:val="00582B7F"/>
     <w:pPr>
       <w:numPr>
         <w:ilvl w:val="1"/>
@@ -24544,7 +24586,7 @@
     <w:basedOn w:val="Fontepargpadro"/>
     <w:link w:val="Subttulo"/>
     <w:uiPriority w:val="11"/>
-    <w:rsid w:val="00C1140E"/>
+    <w:rsid w:val="00582B7F"/>
     <w:rPr>
       <w:rFonts w:eastAsiaTheme="majorEastAsia" w:cstheme="majorBidi"/>
       <w:color w:val="595959" w:themeColor="text1" w:themeTint="A6"/>
@@ -24560,7 +24602,7 @@
     <w:link w:val="CitaoChar"/>
     <w:uiPriority w:val="29"/>
     <w:qFormat/>
-    <w:rsid w:val="00C1140E"/>
+    <w:rsid w:val="00582B7F"/>
     <w:pPr>
       <w:spacing w:before="160"/>
       <w:jc w:val="center"/>
@@ -24576,7 +24618,7 @@
     <w:basedOn w:val="Fontepargpadro"/>
     <w:link w:val="Citao"/>
     <w:uiPriority w:val="29"/>
-    <w:rsid w:val="00C1140E"/>
+    <w:rsid w:val="00582B7F"/>
     <w:rPr>
       <w:i/>
       <w:iCs/>
@@ -24588,7 +24630,7 @@
     <w:basedOn w:val="Normal"/>
     <w:uiPriority w:val="34"/>
     <w:qFormat/>
-    <w:rsid w:val="00C1140E"/>
+    <w:rsid w:val="00582B7F"/>
     <w:pPr>
       <w:ind w:left="720"/>
       <w:contextualSpacing/>
@@ -24599,7 +24641,7 @@
     <w:basedOn w:val="Fontepargpadro"/>
     <w:uiPriority w:val="21"/>
     <w:qFormat/>
-    <w:rsid w:val="00C1140E"/>
+    <w:rsid w:val="00582B7F"/>
     <w:rPr>
       <w:i/>
       <w:iCs/>
@@ -24613,7 +24655,7 @@
     <w:link w:val="CitaoIntensaChar"/>
     <w:uiPriority w:val="30"/>
     <w:qFormat/>
-    <w:rsid w:val="00C1140E"/>
+    <w:rsid w:val="00582B7F"/>
     <w:pPr>
       <w:pBdr>
         <w:top w:val="single" w:sz="4" w:space="10" w:color="0F4761" w:themeColor="accent1" w:themeShade="BF"/>
@@ -24634,7 +24676,7 @@
     <w:basedOn w:val="Fontepargpadro"/>
     <w:link w:val="CitaoIntensa"/>
     <w:uiPriority w:val="30"/>
-    <w:rsid w:val="00C1140E"/>
+    <w:rsid w:val="00582B7F"/>
     <w:rPr>
       <w:i/>
       <w:iCs/>
@@ -24646,7 +24688,7 @@
     <w:basedOn w:val="Fontepargpadro"/>
     <w:uiPriority w:val="32"/>
     <w:qFormat/>
-    <w:rsid w:val="00C1140E"/>
+    <w:rsid w:val="00582B7F"/>
     <w:rPr>
       <w:b/>
       <w:bCs/>
@@ -24661,7 +24703,7 @@
     <w:link w:val="CabealhoChar"/>
     <w:uiPriority w:val="99"/>
     <w:unhideWhenUsed/>
-    <w:rsid w:val="00C1140E"/>
+    <w:rsid w:val="00582B7F"/>
     <w:pPr>
       <w:tabs>
         <w:tab w:val="center" w:pos="4252"/>
@@ -24675,7 +24717,7 @@
     <w:basedOn w:val="Fontepargpadro"/>
     <w:link w:val="Cabealho"/>
     <w:uiPriority w:val="99"/>
-    <w:rsid w:val="00C1140E"/>
+    <w:rsid w:val="00582B7F"/>
   </w:style>
   <w:style w:type="paragraph" w:styleId="Rodap">
     <w:name w:val="footer"/>
@@ -24683,7 +24725,7 @@
     <w:link w:val="RodapChar"/>
     <w:uiPriority w:val="99"/>
     <w:unhideWhenUsed/>
-    <w:rsid w:val="00C1140E"/>
+    <w:rsid w:val="00582B7F"/>
     <w:pPr>
       <w:tabs>
         <w:tab w:val="center" w:pos="4252"/>
@@ -24697,7 +24739,7 @@
     <w:basedOn w:val="Fontepargpadro"/>
     <w:link w:val="Rodap"/>
     <w:uiPriority w:val="99"/>
-    <w:rsid w:val="00C1140E"/>
+    <w:rsid w:val="00582B7F"/>
   </w:style>
   <w:style w:type="paragraph" w:styleId="Sumrio1">
     <w:name w:val="toc 1"/>
@@ -24706,7 +24748,7 @@
     <w:autoRedefine/>
     <w:uiPriority w:val="39"/>
     <w:unhideWhenUsed/>
-    <w:rsid w:val="00C1140E"/>
+    <w:rsid w:val="00582B7F"/>
     <w:pPr>
       <w:spacing w:after="100"/>
     </w:pPr>
@@ -24718,7 +24760,7 @@
     <w:autoRedefine/>
     <w:uiPriority w:val="39"/>
     <w:unhideWhenUsed/>
-    <w:rsid w:val="00C1140E"/>
+    <w:rsid w:val="00582B7F"/>
     <w:pPr>
       <w:spacing w:after="100"/>
       <w:ind w:left="240"/>

</xml_diff>

<commit_message>
Sincroniza com a produção — Fase 1 de acompanhamento de execução da EAP (status automático de entrega)
Co-Authored-By: Claude Sonnet 5 <noreply@anthropic.com>
</commit_message>
<xml_diff>
--- a/Manual de Uso - Ferramenta de Gestao de Projetos.docx
+++ b/Manual de Uso - Ferramenta de Gestao de Projetos.docx
@@ -229,7 +229,7 @@
         <w:rPr>
           <w:noProof/>
         </w:rPr>
-        <w:instrText xml:space="preserve"> PAGEREF _Toc240036044 \h </w:instrText>
+        <w:instrText xml:space="preserve"> PAGEREF _Toc240037435 \h </w:instrText>
       </w:r>
       <w:r>
         <w:rPr>
@@ -290,7 +290,7 @@
         <w:rPr>
           <w:noProof/>
         </w:rPr>
-        <w:instrText xml:space="preserve"> PAGEREF _Toc240036045 \h </w:instrText>
+        <w:instrText xml:space="preserve"> PAGEREF _Toc240037436 \h </w:instrText>
       </w:r>
       <w:r>
         <w:rPr>
@@ -351,7 +351,7 @@
         <w:rPr>
           <w:noProof/>
         </w:rPr>
-        <w:instrText xml:space="preserve"> PAGEREF _Toc240036046 \h </w:instrText>
+        <w:instrText xml:space="preserve"> PAGEREF _Toc240037437 \h </w:instrText>
       </w:r>
       <w:r>
         <w:rPr>
@@ -412,7 +412,7 @@
         <w:rPr>
           <w:noProof/>
         </w:rPr>
-        <w:instrText xml:space="preserve"> PAGEREF _Toc240036047 \h </w:instrText>
+        <w:instrText xml:space="preserve"> PAGEREF _Toc240037438 \h </w:instrText>
       </w:r>
       <w:r>
         <w:rPr>
@@ -473,7 +473,7 @@
         <w:rPr>
           <w:noProof/>
         </w:rPr>
-        <w:instrText xml:space="preserve"> PAGEREF _Toc240036048 \h </w:instrText>
+        <w:instrText xml:space="preserve"> PAGEREF _Toc240037439 \h </w:instrText>
       </w:r>
       <w:r>
         <w:rPr>
@@ -534,7 +534,7 @@
         <w:rPr>
           <w:noProof/>
         </w:rPr>
-        <w:instrText xml:space="preserve"> PAGEREF _Toc240036049 \h </w:instrText>
+        <w:instrText xml:space="preserve"> PAGEREF _Toc240037440 \h </w:instrText>
       </w:r>
       <w:r>
         <w:rPr>
@@ -595,7 +595,7 @@
         <w:rPr>
           <w:noProof/>
         </w:rPr>
-        <w:instrText xml:space="preserve"> PAGEREF _Toc240036050 \h </w:instrText>
+        <w:instrText xml:space="preserve"> PAGEREF _Toc240037441 \h </w:instrText>
       </w:r>
       <w:r>
         <w:rPr>
@@ -656,7 +656,7 @@
         <w:rPr>
           <w:noProof/>
         </w:rPr>
-        <w:instrText xml:space="preserve"> PAGEREF _Toc240036051 \h </w:instrText>
+        <w:instrText xml:space="preserve"> PAGEREF _Toc240037442 \h </w:instrText>
       </w:r>
       <w:r>
         <w:rPr>
@@ -717,7 +717,7 @@
         <w:rPr>
           <w:noProof/>
         </w:rPr>
-        <w:instrText xml:space="preserve"> PAGEREF _Toc240036052 \h </w:instrText>
+        <w:instrText xml:space="preserve"> PAGEREF _Toc240037443 \h </w:instrText>
       </w:r>
       <w:r>
         <w:rPr>
@@ -778,7 +778,7 @@
         <w:rPr>
           <w:noProof/>
         </w:rPr>
-        <w:instrText xml:space="preserve"> PAGEREF _Toc240036053 \h </w:instrText>
+        <w:instrText xml:space="preserve"> PAGEREF _Toc240037444 \h </w:instrText>
       </w:r>
       <w:r>
         <w:rPr>
@@ -839,7 +839,7 @@
         <w:rPr>
           <w:noProof/>
         </w:rPr>
-        <w:instrText xml:space="preserve"> PAGEREF _Toc240036054 \h </w:instrText>
+        <w:instrText xml:space="preserve"> PAGEREF _Toc240037445 \h </w:instrText>
       </w:r>
       <w:r>
         <w:rPr>
@@ -900,7 +900,7 @@
         <w:rPr>
           <w:noProof/>
         </w:rPr>
-        <w:instrText xml:space="preserve"> PAGEREF _Toc240036055 \h </w:instrText>
+        <w:instrText xml:space="preserve"> PAGEREF _Toc240037446 \h </w:instrText>
       </w:r>
       <w:r>
         <w:rPr>
@@ -961,7 +961,7 @@
         <w:rPr>
           <w:noProof/>
         </w:rPr>
-        <w:instrText xml:space="preserve"> PAGEREF _Toc240036056 \h </w:instrText>
+        <w:instrText xml:space="preserve"> PAGEREF _Toc240037447 \h </w:instrText>
       </w:r>
       <w:r>
         <w:rPr>
@@ -1022,7 +1022,7 @@
         <w:rPr>
           <w:noProof/>
         </w:rPr>
-        <w:instrText xml:space="preserve"> PAGEREF _Toc240036057 \h </w:instrText>
+        <w:instrText xml:space="preserve"> PAGEREF _Toc240037448 \h </w:instrText>
       </w:r>
       <w:r>
         <w:rPr>
@@ -1083,7 +1083,7 @@
         <w:rPr>
           <w:noProof/>
         </w:rPr>
-        <w:instrText xml:space="preserve"> PAGEREF _Toc240036058 \h </w:instrText>
+        <w:instrText xml:space="preserve"> PAGEREF _Toc240037449 \h </w:instrText>
       </w:r>
       <w:r>
         <w:rPr>
@@ -1144,7 +1144,7 @@
         <w:rPr>
           <w:noProof/>
         </w:rPr>
-        <w:instrText xml:space="preserve"> PAGEREF _Toc240036059 \h </w:instrText>
+        <w:instrText xml:space="preserve"> PAGEREF _Toc240037450 \h </w:instrText>
       </w:r>
       <w:r>
         <w:rPr>
@@ -1205,7 +1205,7 @@
         <w:rPr>
           <w:noProof/>
         </w:rPr>
-        <w:instrText xml:space="preserve"> PAGEREF _Toc240036060 \h </w:instrText>
+        <w:instrText xml:space="preserve"> PAGEREF _Toc240037451 \h </w:instrText>
       </w:r>
       <w:r>
         <w:rPr>
@@ -1266,7 +1266,7 @@
         <w:rPr>
           <w:noProof/>
         </w:rPr>
-        <w:instrText xml:space="preserve"> PAGEREF _Toc240036061 \h </w:instrText>
+        <w:instrText xml:space="preserve"> PAGEREF _Toc240037452 \h </w:instrText>
       </w:r>
       <w:r>
         <w:rPr>
@@ -1327,7 +1327,7 @@
         <w:rPr>
           <w:noProof/>
         </w:rPr>
-        <w:instrText xml:space="preserve"> PAGEREF _Toc240036062 \h </w:instrText>
+        <w:instrText xml:space="preserve"> PAGEREF _Toc240037453 \h </w:instrText>
       </w:r>
       <w:r>
         <w:rPr>
@@ -1388,7 +1388,7 @@
         <w:rPr>
           <w:noProof/>
         </w:rPr>
-        <w:instrText xml:space="preserve"> PAGEREF _Toc240036063 \h </w:instrText>
+        <w:instrText xml:space="preserve"> PAGEREF _Toc240037454 \h </w:instrText>
       </w:r>
       <w:r>
         <w:rPr>
@@ -1449,7 +1449,7 @@
         <w:rPr>
           <w:noProof/>
         </w:rPr>
-        <w:instrText xml:space="preserve"> PAGEREF _Toc240036064 \h </w:instrText>
+        <w:instrText xml:space="preserve"> PAGEREF _Toc240037455 \h </w:instrText>
       </w:r>
       <w:r>
         <w:rPr>
@@ -1510,7 +1510,7 @@
         <w:rPr>
           <w:noProof/>
         </w:rPr>
-        <w:instrText xml:space="preserve"> PAGEREF _Toc240036065 \h </w:instrText>
+        <w:instrText xml:space="preserve"> PAGEREF _Toc240037456 \h </w:instrText>
       </w:r>
       <w:r>
         <w:rPr>
@@ -1571,7 +1571,7 @@
         <w:rPr>
           <w:noProof/>
         </w:rPr>
-        <w:instrText xml:space="preserve"> PAGEREF _Toc240036066 \h </w:instrText>
+        <w:instrText xml:space="preserve"> PAGEREF _Toc240037457 \h </w:instrText>
       </w:r>
       <w:r>
         <w:rPr>
@@ -1632,7 +1632,7 @@
         <w:rPr>
           <w:noProof/>
         </w:rPr>
-        <w:instrText xml:space="preserve"> PAGEREF _Toc240036067 \h </w:instrText>
+        <w:instrText xml:space="preserve"> PAGEREF _Toc240037458 \h </w:instrText>
       </w:r>
       <w:r>
         <w:rPr>
@@ -1693,7 +1693,7 @@
         <w:rPr>
           <w:noProof/>
         </w:rPr>
-        <w:instrText xml:space="preserve"> PAGEREF _Toc240036068 \h </w:instrText>
+        <w:instrText xml:space="preserve"> PAGEREF _Toc240037459 \h </w:instrText>
       </w:r>
       <w:r>
         <w:rPr>
@@ -1755,7 +1755,7 @@
         <w:rPr>
           <w:noProof/>
         </w:rPr>
-        <w:instrText xml:space="preserve"> PAGEREF _Toc240036069 \h </w:instrText>
+        <w:instrText xml:space="preserve"> PAGEREF _Toc240037460 \h </w:instrText>
       </w:r>
       <w:r>
         <w:rPr>
@@ -1772,7 +1772,7 @@
         <w:rPr>
           <w:noProof/>
         </w:rPr>
-        <w:t>47</w:t>
+        <w:t>48</w:t>
       </w:r>
       <w:r>
         <w:rPr>
@@ -1816,7 +1816,7 @@
         <w:rPr>
           <w:noProof/>
         </w:rPr>
-        <w:instrText xml:space="preserve"> PAGEREF _Toc240036070 \h </w:instrText>
+        <w:instrText xml:space="preserve"> PAGEREF _Toc240037461 \h </w:instrText>
       </w:r>
       <w:r>
         <w:rPr>
@@ -1877,7 +1877,7 @@
         <w:rPr>
           <w:noProof/>
         </w:rPr>
-        <w:instrText xml:space="preserve"> PAGEREF _Toc240036071 \h </w:instrText>
+        <w:instrText xml:space="preserve"> PAGEREF _Toc240037462 \h </w:instrText>
       </w:r>
       <w:r>
         <w:rPr>
@@ -1938,7 +1938,7 @@
         <w:rPr>
           <w:noProof/>
         </w:rPr>
-        <w:instrText xml:space="preserve"> PAGEREF _Toc240036072 \h </w:instrText>
+        <w:instrText xml:space="preserve"> PAGEREF _Toc240037463 \h </w:instrText>
       </w:r>
       <w:r>
         <w:rPr>
@@ -1999,7 +1999,7 @@
         <w:rPr>
           <w:noProof/>
         </w:rPr>
-        <w:instrText xml:space="preserve"> PAGEREF _Toc240036073 \h </w:instrText>
+        <w:instrText xml:space="preserve"> PAGEREF _Toc240037464 \h </w:instrText>
       </w:r>
       <w:r>
         <w:rPr>
@@ -2060,7 +2060,7 @@
         <w:rPr>
           <w:noProof/>
         </w:rPr>
-        <w:instrText xml:space="preserve"> PAGEREF _Toc240036074 \h </w:instrText>
+        <w:instrText xml:space="preserve"> PAGEREF _Toc240037465 \h </w:instrText>
       </w:r>
       <w:r>
         <w:rPr>
@@ -2121,7 +2121,7 @@
         <w:rPr>
           <w:noProof/>
         </w:rPr>
-        <w:instrText xml:space="preserve"> PAGEREF _Toc240036075 \h </w:instrText>
+        <w:instrText xml:space="preserve"> PAGEREF _Toc240037466 \h </w:instrText>
       </w:r>
       <w:r>
         <w:rPr>
@@ -2182,7 +2182,7 @@
         <w:rPr>
           <w:noProof/>
         </w:rPr>
-        <w:instrText xml:space="preserve"> PAGEREF _Toc240036076 \h </w:instrText>
+        <w:instrText xml:space="preserve"> PAGEREF _Toc240037467 \h </w:instrText>
       </w:r>
       <w:r>
         <w:rPr>
@@ -2243,7 +2243,7 @@
         <w:rPr>
           <w:noProof/>
         </w:rPr>
-        <w:instrText xml:space="preserve"> PAGEREF _Toc240036077 \h </w:instrText>
+        <w:instrText xml:space="preserve"> PAGEREF _Toc240037468 \h </w:instrText>
       </w:r>
       <w:r>
         <w:rPr>
@@ -2304,7 +2304,7 @@
         <w:rPr>
           <w:noProof/>
         </w:rPr>
-        <w:instrText xml:space="preserve"> PAGEREF _Toc240036078 \h </w:instrText>
+        <w:instrText xml:space="preserve"> PAGEREF _Toc240037469 \h </w:instrText>
       </w:r>
       <w:r>
         <w:rPr>
@@ -2365,7 +2365,7 @@
         <w:rPr>
           <w:noProof/>
         </w:rPr>
-        <w:instrText xml:space="preserve"> PAGEREF _Toc240036079 \h </w:instrText>
+        <w:instrText xml:space="preserve"> PAGEREF _Toc240037470 \h </w:instrText>
       </w:r>
       <w:r>
         <w:rPr>
@@ -2426,7 +2426,7 @@
         <w:rPr>
           <w:noProof/>
         </w:rPr>
-        <w:instrText xml:space="preserve"> PAGEREF _Toc240036080 \h </w:instrText>
+        <w:instrText xml:space="preserve"> PAGEREF _Toc240037471 \h </w:instrText>
       </w:r>
       <w:r>
         <w:rPr>
@@ -2487,7 +2487,7 @@
         <w:rPr>
           <w:noProof/>
         </w:rPr>
-        <w:instrText xml:space="preserve"> PAGEREF _Toc240036081 \h </w:instrText>
+        <w:instrText xml:space="preserve"> PAGEREF _Toc240037472 \h </w:instrText>
       </w:r>
       <w:r>
         <w:rPr>
@@ -2548,7 +2548,7 @@
         <w:rPr>
           <w:noProof/>
         </w:rPr>
-        <w:instrText xml:space="preserve"> PAGEREF _Toc240036082 \h </w:instrText>
+        <w:instrText xml:space="preserve"> PAGEREF _Toc240037473 \h </w:instrText>
       </w:r>
       <w:r>
         <w:rPr>
@@ -2609,7 +2609,7 @@
         <w:rPr>
           <w:noProof/>
         </w:rPr>
-        <w:instrText xml:space="preserve"> PAGEREF _Toc240036083 \h </w:instrText>
+        <w:instrText xml:space="preserve"> PAGEREF _Toc240037474 \h </w:instrText>
       </w:r>
       <w:r>
         <w:rPr>
@@ -2670,7 +2670,7 @@
         <w:rPr>
           <w:noProof/>
         </w:rPr>
-        <w:instrText xml:space="preserve"> PAGEREF _Toc240036084 \h </w:instrText>
+        <w:instrText xml:space="preserve"> PAGEREF _Toc240037475 \h </w:instrText>
       </w:r>
       <w:r>
         <w:rPr>
@@ -2731,7 +2731,7 @@
         <w:rPr>
           <w:noProof/>
         </w:rPr>
-        <w:instrText xml:space="preserve"> PAGEREF _Toc240036085 \h </w:instrText>
+        <w:instrText xml:space="preserve"> PAGEREF _Toc240037476 \h </w:instrText>
       </w:r>
       <w:r>
         <w:rPr>
@@ -2792,7 +2792,7 @@
         <w:rPr>
           <w:noProof/>
         </w:rPr>
-        <w:instrText xml:space="preserve"> PAGEREF _Toc240036086 \h </w:instrText>
+        <w:instrText xml:space="preserve"> PAGEREF _Toc240037477 \h </w:instrText>
       </w:r>
       <w:r>
         <w:rPr>
@@ -2853,7 +2853,7 @@
         <w:rPr>
           <w:noProof/>
         </w:rPr>
-        <w:instrText xml:space="preserve"> PAGEREF _Toc240036087 \h </w:instrText>
+        <w:instrText xml:space="preserve"> PAGEREF _Toc240037478 \h </w:instrText>
       </w:r>
       <w:r>
         <w:rPr>
@@ -2914,7 +2914,7 @@
         <w:rPr>
           <w:noProof/>
         </w:rPr>
-        <w:instrText xml:space="preserve"> PAGEREF _Toc240036088 \h </w:instrText>
+        <w:instrText xml:space="preserve"> PAGEREF _Toc240037479 \h </w:instrText>
       </w:r>
       <w:r>
         <w:rPr>
@@ -2975,7 +2975,7 @@
         <w:rPr>
           <w:noProof/>
         </w:rPr>
-        <w:instrText xml:space="preserve"> PAGEREF _Toc240036089 \h </w:instrText>
+        <w:instrText xml:space="preserve"> PAGEREF _Toc240037480 \h </w:instrText>
       </w:r>
       <w:r>
         <w:rPr>
@@ -3036,7 +3036,7 @@
         <w:rPr>
           <w:noProof/>
         </w:rPr>
-        <w:instrText xml:space="preserve"> PAGEREF _Toc240036090 \h </w:instrText>
+        <w:instrText xml:space="preserve"> PAGEREF _Toc240037481 \h </w:instrText>
       </w:r>
       <w:r>
         <w:rPr>
@@ -3097,7 +3097,7 @@
         <w:rPr>
           <w:noProof/>
         </w:rPr>
-        <w:instrText xml:space="preserve"> PAGEREF _Toc240036091 \h </w:instrText>
+        <w:instrText xml:space="preserve"> PAGEREF _Toc240037482 \h </w:instrText>
       </w:r>
       <w:r>
         <w:rPr>
@@ -3173,7 +3173,7 @@
           <w:sz w:val="34"/>
         </w:rPr>
       </w:pPr>
-      <w:bookmarkStart w:id="0" w:name="_Toc240036044"/>
+      <w:bookmarkStart w:id="0" w:name="_Toc240037435"/>
       <w:r>
         <w:rPr>
           <w:rFonts w:ascii="Montserrat" w:hAnsi="Montserrat"/>
@@ -3197,7 +3197,7 @@
           <w:sz w:val="27"/>
         </w:rPr>
       </w:pPr>
-      <w:bookmarkStart w:id="1" w:name="_Toc240036045"/>
+      <w:bookmarkStart w:id="1" w:name="_Toc240037436"/>
       <w:r>
         <w:rPr>
           <w:rFonts w:ascii="Montserrat" w:hAnsi="Montserrat"/>
@@ -4422,6 +4422,24 @@
           <w:sz w:val="22"/>
         </w:rPr>
         <w:lastRenderedPageBreak/>
+        <w:t>Esta e a versao 2.60 do manual. Em relacao a versao 2.59 (11/09/2026), a EAP (Passo 5) ganhou a Fase 1 de uma nova proposta de melhoria, desta vez em acompanhamento de execucao: cada Entrega (nivel 2) passou a exibir um status automatico - Concluida, Atrasada, No prazo ou Sem cronograma vinculado - casando pelo nome com o marco correspondente no cronograma do Planejamento (Passo 4), sem nenhum campo novo para preencher na propria EAP. Um resumo no topo da arvore mostra o percentual de entregas concluidas do projeto.</w:t>
+      </w:r>
+    </w:p>
+    <w:p>
+      <w:pPr>
+        <w:spacing w:line="280" w:lineRule="auto"/>
+        <w:rPr>
+          <w:rFonts w:ascii="Montserrat" w:hAnsi="Montserrat"/>
+          <w:color w:val="1A1A1A"/>
+          <w:sz w:val="22"/>
+        </w:rPr>
+      </w:pPr>
+      <w:r>
+        <w:rPr>
+          <w:rFonts w:ascii="Montserrat" w:hAnsi="Montserrat"/>
+          <w:color w:val="1A1A1A"/>
+          <w:sz w:val="22"/>
+        </w:rPr>
         <w:t>O manual nao substitui as Diretrizes para a Gestao de Projetos da UNIALFA (documento institucional que define o framework D01 a D07) nem o documento Regras de Acesso e Permissoes (que detalha cada regra de controle de acesso); ele e o guia operacional de como usar cada ferramenta na pratica.</w:t>
       </w:r>
     </w:p>
@@ -4436,7 +4454,7 @@
           <w:sz w:val="27"/>
         </w:rPr>
       </w:pPr>
-      <w:bookmarkStart w:id="2" w:name="_Toc240036046"/>
+      <w:bookmarkStart w:id="2" w:name="_Toc240037437"/>
       <w:r>
         <w:rPr>
           <w:rFonts w:ascii="Montserrat" w:hAnsi="Montserrat"/>
@@ -4633,16 +4651,16 @@
         </w:rPr>
         <w:lastRenderedPageBreak/>
         <w:drawing>
-          <wp:inline distT="0" distB="0" distL="0" distR="0" wp14:anchorId="0F89095A" wp14:editId="127DBC56">
+          <wp:inline distT="0" distB="0" distL="0" distR="0" wp14:anchorId="016A0C60" wp14:editId="3A47E4D7">
             <wp:extent cx="5303520" cy="4792851"/>
             <wp:effectExtent l="19050" t="19050" r="11430" b="27305"/>
-            <wp:docPr id="325608181" name="Imagem 1"/>
+            <wp:docPr id="179711419" name="Imagem 1"/>
             <wp:cNvGraphicFramePr/>
             <a:graphic xmlns:a="http://schemas.openxmlformats.org/drawingml/2006/main">
               <a:graphicData uri="http://schemas.openxmlformats.org/drawingml/2006/picture">
                 <pic:pic xmlns:pic="http://schemas.openxmlformats.org/drawingml/2006/picture">
                   <pic:nvPicPr>
-                    <pic:cNvPr id="325608181" name=""/>
+                    <pic:cNvPr id="179711419" name=""/>
                     <pic:cNvPicPr/>
                   </pic:nvPicPr>
                   <pic:blipFill>
@@ -4710,7 +4728,7 @@
           <w:sz w:val="27"/>
         </w:rPr>
       </w:pPr>
-      <w:bookmarkStart w:id="3" w:name="_Toc240036047"/>
+      <w:bookmarkStart w:id="3" w:name="_Toc240037438"/>
       <w:r>
         <w:rPr>
           <w:rFonts w:ascii="Montserrat" w:hAnsi="Montserrat"/>
@@ -4751,16 +4769,16 @@
         </w:rPr>
         <w:lastRenderedPageBreak/>
         <w:drawing>
-          <wp:inline distT="0" distB="0" distL="0" distR="0" wp14:anchorId="39BCF97B" wp14:editId="79E24F0B">
+          <wp:inline distT="0" distB="0" distL="0" distR="0" wp14:anchorId="7751EC39" wp14:editId="4EFC4303">
             <wp:extent cx="4206240" cy="3801227"/>
             <wp:effectExtent l="19050" t="19050" r="22860" b="27940"/>
-            <wp:docPr id="2078573891" name="Imagem 2"/>
+            <wp:docPr id="1864827596" name="Imagem 2"/>
             <wp:cNvGraphicFramePr/>
             <a:graphic xmlns:a="http://schemas.openxmlformats.org/drawingml/2006/main">
               <a:graphicData uri="http://schemas.openxmlformats.org/drawingml/2006/picture">
                 <pic:pic xmlns:pic="http://schemas.openxmlformats.org/drawingml/2006/picture">
                   <pic:nvPicPr>
-                    <pic:cNvPr id="2078573891" name=""/>
+                    <pic:cNvPr id="1864827596" name=""/>
                     <pic:cNvPicPr/>
                   </pic:nvPicPr>
                   <pic:blipFill>
@@ -4933,7 +4951,7 @@
           <w:sz w:val="27"/>
         </w:rPr>
       </w:pPr>
-      <w:bookmarkStart w:id="4" w:name="_Toc240036048"/>
+      <w:bookmarkStart w:id="4" w:name="_Toc240037439"/>
       <w:r>
         <w:rPr>
           <w:rFonts w:ascii="Montserrat" w:hAnsi="Montserrat"/>
@@ -6172,7 +6190,7 @@
           <w:sz w:val="34"/>
         </w:rPr>
       </w:pPr>
-      <w:bookmarkStart w:id="5" w:name="_Toc240036049"/>
+      <w:bookmarkStart w:id="5" w:name="_Toc240037440"/>
       <w:r>
         <w:rPr>
           <w:rFonts w:ascii="Montserrat" w:hAnsi="Montserrat"/>
@@ -6196,7 +6214,7 @@
           <w:sz w:val="27"/>
         </w:rPr>
       </w:pPr>
-      <w:bookmarkStart w:id="6" w:name="_Toc240036050"/>
+      <w:bookmarkStart w:id="6" w:name="_Toc240037441"/>
       <w:r>
         <w:rPr>
           <w:rFonts w:ascii="Montserrat" w:hAnsi="Montserrat"/>
@@ -6237,7 +6255,7 @@
           <w:sz w:val="27"/>
         </w:rPr>
       </w:pPr>
-      <w:bookmarkStart w:id="7" w:name="_Toc240036051"/>
+      <w:bookmarkStart w:id="7" w:name="_Toc240037442"/>
       <w:r>
         <w:rPr>
           <w:rFonts w:ascii="Montserrat" w:hAnsi="Montserrat"/>
@@ -6356,7 +6374,7 @@
           <w:sz w:val="27"/>
         </w:rPr>
       </w:pPr>
-      <w:bookmarkStart w:id="8" w:name="_Toc240036052"/>
+      <w:bookmarkStart w:id="8" w:name="_Toc240037443"/>
       <w:r>
         <w:rPr>
           <w:rFonts w:ascii="Montserrat" w:hAnsi="Montserrat"/>
@@ -6969,7 +6987,7 @@
           <w:sz w:val="27"/>
         </w:rPr>
       </w:pPr>
-      <w:bookmarkStart w:id="9" w:name="_Toc240036053"/>
+      <w:bookmarkStart w:id="9" w:name="_Toc240037444"/>
       <w:r>
         <w:rPr>
           <w:rFonts w:ascii="Montserrat" w:hAnsi="Montserrat"/>
@@ -7058,16 +7076,16 @@
         </w:rPr>
         <w:lastRenderedPageBreak/>
         <w:drawing>
-          <wp:inline distT="0" distB="0" distL="0" distR="0" wp14:anchorId="5DAD1294" wp14:editId="18835626">
+          <wp:inline distT="0" distB="0" distL="0" distR="0" wp14:anchorId="18A2F0B4" wp14:editId="01589E53">
             <wp:extent cx="4937760" cy="4462310"/>
             <wp:effectExtent l="19050" t="19050" r="15240" b="14605"/>
-            <wp:docPr id="535153231" name="Imagem 3"/>
+            <wp:docPr id="655325790" name="Imagem 3"/>
             <wp:cNvGraphicFramePr/>
             <a:graphic xmlns:a="http://schemas.openxmlformats.org/drawingml/2006/main">
               <a:graphicData uri="http://schemas.openxmlformats.org/drawingml/2006/picture">
                 <pic:pic xmlns:pic="http://schemas.openxmlformats.org/drawingml/2006/picture">
                   <pic:nvPicPr>
-                    <pic:cNvPr id="535153231" name=""/>
+                    <pic:cNvPr id="655325790" name=""/>
                     <pic:cNvPicPr/>
                   </pic:nvPicPr>
                   <pic:blipFill>
@@ -7135,7 +7153,7 @@
           <w:sz w:val="27"/>
         </w:rPr>
       </w:pPr>
-      <w:bookmarkStart w:id="10" w:name="_Toc240036054"/>
+      <w:bookmarkStart w:id="10" w:name="_Toc240037445"/>
       <w:r>
         <w:rPr>
           <w:rFonts w:ascii="Montserrat" w:hAnsi="Montserrat"/>
@@ -7176,16 +7194,16 @@
         </w:rPr>
         <w:lastRenderedPageBreak/>
         <w:drawing>
-          <wp:inline distT="0" distB="0" distL="0" distR="0" wp14:anchorId="363CC2F2" wp14:editId="541DA9C4">
+          <wp:inline distT="0" distB="0" distL="0" distR="0" wp14:anchorId="295DF830" wp14:editId="3C7D47D2">
             <wp:extent cx="5120640" cy="4627581"/>
             <wp:effectExtent l="19050" t="19050" r="22860" b="20955"/>
-            <wp:docPr id="1930532760" name="Imagem 4"/>
+            <wp:docPr id="1384540296" name="Imagem 4"/>
             <wp:cNvGraphicFramePr/>
             <a:graphic xmlns:a="http://schemas.openxmlformats.org/drawingml/2006/main">
               <a:graphicData uri="http://schemas.openxmlformats.org/drawingml/2006/picture">
                 <pic:pic xmlns:pic="http://schemas.openxmlformats.org/drawingml/2006/picture">
                   <pic:nvPicPr>
-                    <pic:cNvPr id="1930532760" name=""/>
+                    <pic:cNvPr id="1384540296" name=""/>
                     <pic:cNvPicPr/>
                   </pic:nvPicPr>
                   <pic:blipFill>
@@ -7353,7 +7371,7 @@
           <w:sz w:val="27"/>
         </w:rPr>
       </w:pPr>
-      <w:bookmarkStart w:id="11" w:name="_Toc240036055"/>
+      <w:bookmarkStart w:id="11" w:name="_Toc240037446"/>
       <w:r>
         <w:rPr>
           <w:rFonts w:ascii="Montserrat" w:hAnsi="Montserrat"/>
@@ -7393,16 +7411,16 @@
           <w:noProof/>
         </w:rPr>
         <w:drawing>
-          <wp:inline distT="0" distB="0" distL="0" distR="0" wp14:anchorId="4F195B69" wp14:editId="5E1F829B">
+          <wp:inline distT="0" distB="0" distL="0" distR="0" wp14:anchorId="7F2F5606" wp14:editId="220FB0BF">
             <wp:extent cx="4206240" cy="3801227"/>
             <wp:effectExtent l="19050" t="19050" r="22860" b="27940"/>
-            <wp:docPr id="34173016" name="Imagem 5"/>
+            <wp:docPr id="855199354" name="Imagem 5"/>
             <wp:cNvGraphicFramePr/>
             <a:graphic xmlns:a="http://schemas.openxmlformats.org/drawingml/2006/main">
               <a:graphicData uri="http://schemas.openxmlformats.org/drawingml/2006/picture">
                 <pic:pic xmlns:pic="http://schemas.openxmlformats.org/drawingml/2006/picture">
                   <pic:nvPicPr>
-                    <pic:cNvPr id="34173016" name=""/>
+                    <pic:cNvPr id="855199354" name=""/>
                     <pic:cNvPicPr/>
                   </pic:nvPicPr>
                   <pic:blipFill>
@@ -7470,16 +7488,16 @@
         </w:rPr>
         <w:lastRenderedPageBreak/>
         <w:drawing>
-          <wp:inline distT="0" distB="0" distL="0" distR="0" wp14:anchorId="5D5871BB" wp14:editId="4BA39888">
+          <wp:inline distT="0" distB="0" distL="0" distR="0" wp14:anchorId="13BEB502" wp14:editId="2E738DB2">
             <wp:extent cx="4206240" cy="3801227"/>
             <wp:effectExtent l="19050" t="19050" r="22860" b="27940"/>
-            <wp:docPr id="1691067200" name="Imagem 6"/>
+            <wp:docPr id="884034605" name="Imagem 6"/>
             <wp:cNvGraphicFramePr/>
             <a:graphic xmlns:a="http://schemas.openxmlformats.org/drawingml/2006/main">
               <a:graphicData uri="http://schemas.openxmlformats.org/drawingml/2006/picture">
                 <pic:pic xmlns:pic="http://schemas.openxmlformats.org/drawingml/2006/picture">
                   <pic:nvPicPr>
-                    <pic:cNvPr id="1691067200" name=""/>
+                    <pic:cNvPr id="884034605" name=""/>
                     <pic:cNvPicPr/>
                   </pic:nvPicPr>
                   <pic:blipFill>
@@ -7595,7 +7613,7 @@
           <w:sz w:val="27"/>
         </w:rPr>
       </w:pPr>
-      <w:bookmarkStart w:id="12" w:name="_Toc240036056"/>
+      <w:bookmarkStart w:id="12" w:name="_Toc240037447"/>
       <w:r>
         <w:rPr>
           <w:rFonts w:ascii="Montserrat" w:hAnsi="Montserrat"/>
@@ -7663,7 +7681,7 @@
           <w:sz w:val="27"/>
         </w:rPr>
       </w:pPr>
-      <w:bookmarkStart w:id="13" w:name="_Toc240036057"/>
+      <w:bookmarkStart w:id="13" w:name="_Toc240037448"/>
       <w:r>
         <w:rPr>
           <w:rFonts w:ascii="Montserrat" w:hAnsi="Montserrat"/>
@@ -7890,7 +7908,7 @@
           <w:sz w:val="27"/>
         </w:rPr>
       </w:pPr>
-      <w:bookmarkStart w:id="14" w:name="_Toc240036058"/>
+      <w:bookmarkStart w:id="14" w:name="_Toc240037449"/>
       <w:r>
         <w:rPr>
           <w:rFonts w:ascii="Montserrat" w:hAnsi="Montserrat"/>
@@ -8049,7 +8067,7 @@
           <w:sz w:val="27"/>
         </w:rPr>
       </w:pPr>
-      <w:bookmarkStart w:id="15" w:name="_Toc240036059"/>
+      <w:bookmarkStart w:id="15" w:name="_Toc240037450"/>
       <w:r>
         <w:rPr>
           <w:rFonts w:ascii="Montserrat" w:hAnsi="Montserrat"/>
@@ -8145,8 +8163,18 @@
         </w:numPr>
         <w:spacing w:after="80" w:line="260" w:lineRule="auto"/>
         <w:ind w:left="700"/>
-      </w:pPr>
-      <w:r>
+        <w:rPr>
+          <w:rFonts w:ascii="Montserrat" w:hAnsi="Montserrat"/>
+          <w:color w:val="1A1A1A"/>
+          <w:sz w:val="22"/>
+        </w:rPr>
+      </w:pPr>
+      <w:r>
+        <w:rPr>
+          <w:rFonts w:ascii="Montserrat" w:hAnsi="Montserrat"/>
+          <w:color w:val="1A1A1A"/>
+          <w:sz w:val="22"/>
+        </w:rPr>
         <w:t>Liga ou desliga a importacao para o sistema inteiro - desligada, ninguem tem acesso ao painel, nem o proprio Admin.</w:t>
       </w:r>
     </w:p>
@@ -8231,7 +8259,7 @@
           <w:sz w:val="27"/>
         </w:rPr>
       </w:pPr>
-      <w:bookmarkStart w:id="16" w:name="_Toc240036060"/>
+      <w:bookmarkStart w:id="16" w:name="_Toc240037451"/>
       <w:r>
         <w:rPr>
           <w:rFonts w:ascii="Montserrat" w:hAnsi="Montserrat"/>
@@ -8359,7 +8387,7 @@
           <w:sz w:val="27"/>
         </w:rPr>
       </w:pPr>
-      <w:bookmarkStart w:id="17" w:name="_Toc240036061"/>
+      <w:bookmarkStart w:id="17" w:name="_Toc240037452"/>
       <w:r>
         <w:rPr>
           <w:rFonts w:ascii="Montserrat" w:hAnsi="Montserrat"/>
@@ -8689,7 +8717,7 @@
           <w:sz w:val="27"/>
         </w:rPr>
       </w:pPr>
-      <w:bookmarkStart w:id="18" w:name="_Toc240036062"/>
+      <w:bookmarkStart w:id="18" w:name="_Toc240037453"/>
       <w:r>
         <w:rPr>
           <w:rFonts w:ascii="Montserrat" w:hAnsi="Montserrat"/>
@@ -8830,7 +8858,7 @@
           <w:sz w:val="34"/>
         </w:rPr>
       </w:pPr>
-      <w:bookmarkStart w:id="19" w:name="_Toc240036063"/>
+      <w:bookmarkStart w:id="19" w:name="_Toc240037454"/>
       <w:r>
         <w:rPr>
           <w:rFonts w:ascii="Montserrat" w:hAnsi="Montserrat"/>
@@ -8872,7 +8900,7 @@
           <w:sz w:val="27"/>
         </w:rPr>
       </w:pPr>
-      <w:bookmarkStart w:id="20" w:name="_Toc240036064"/>
+      <w:bookmarkStart w:id="20" w:name="_Toc240037455"/>
       <w:r>
         <w:rPr>
           <w:rFonts w:ascii="Montserrat" w:hAnsi="Montserrat"/>
@@ -9952,16 +9980,16 @@
         </w:rPr>
         <w:lastRenderedPageBreak/>
         <w:drawing>
-          <wp:inline distT="0" distB="0" distL="0" distR="0" wp14:anchorId="7E8737CD" wp14:editId="42917A18">
+          <wp:inline distT="0" distB="0" distL="0" distR="0" wp14:anchorId="3F432429" wp14:editId="763FD5F7">
             <wp:extent cx="5120640" cy="4627581"/>
             <wp:effectExtent l="19050" t="19050" r="22860" b="20955"/>
-            <wp:docPr id="325185815" name="Imagem 7"/>
+            <wp:docPr id="975920136" name="Imagem 7"/>
             <wp:cNvGraphicFramePr/>
             <a:graphic xmlns:a="http://schemas.openxmlformats.org/drawingml/2006/main">
               <a:graphicData uri="http://schemas.openxmlformats.org/drawingml/2006/picture">
                 <pic:pic xmlns:pic="http://schemas.openxmlformats.org/drawingml/2006/picture">
                   <pic:nvPicPr>
-                    <pic:cNvPr id="325185815" name=""/>
+                    <pic:cNvPr id="975920136" name=""/>
                     <pic:cNvPicPr/>
                   </pic:nvPicPr>
                   <pic:blipFill>
@@ -10029,16 +10057,16 @@
         </w:rPr>
         <w:lastRenderedPageBreak/>
         <w:drawing>
-          <wp:inline distT="0" distB="0" distL="0" distR="0" wp14:anchorId="56A4BA09" wp14:editId="4F6EC0ED">
+          <wp:inline distT="0" distB="0" distL="0" distR="0" wp14:anchorId="24E1F82C" wp14:editId="1813BB64">
             <wp:extent cx="5120640" cy="4627581"/>
             <wp:effectExtent l="19050" t="19050" r="22860" b="20955"/>
-            <wp:docPr id="746405082" name="Imagem 8"/>
+            <wp:docPr id="1304270575" name="Imagem 8"/>
             <wp:cNvGraphicFramePr/>
             <a:graphic xmlns:a="http://schemas.openxmlformats.org/drawingml/2006/main">
               <a:graphicData uri="http://schemas.openxmlformats.org/drawingml/2006/picture">
                 <pic:pic xmlns:pic="http://schemas.openxmlformats.org/drawingml/2006/picture">
                   <pic:nvPicPr>
-                    <pic:cNvPr id="746405082" name=""/>
+                    <pic:cNvPr id="1304270575" name=""/>
                     <pic:cNvPicPr/>
                   </pic:nvPicPr>
                   <pic:blipFill>
@@ -10246,7 +10274,7 @@
           <w:sz w:val="27"/>
         </w:rPr>
       </w:pPr>
-      <w:bookmarkStart w:id="21" w:name="_Toc240036065"/>
+      <w:bookmarkStart w:id="21" w:name="_Toc240037456"/>
       <w:r>
         <w:rPr>
           <w:rFonts w:ascii="Montserrat" w:hAnsi="Montserrat"/>
@@ -11171,16 +11199,16 @@
           <w:noProof/>
         </w:rPr>
         <w:drawing>
-          <wp:inline distT="0" distB="0" distL="0" distR="0" wp14:anchorId="556C49FA" wp14:editId="21B54C8F">
+          <wp:inline distT="0" distB="0" distL="0" distR="0" wp14:anchorId="42804D6B" wp14:editId="35BDCC43">
             <wp:extent cx="5120640" cy="4627581"/>
             <wp:effectExtent l="19050" t="19050" r="22860" b="20955"/>
-            <wp:docPr id="213404758" name="Imagem 9"/>
+            <wp:docPr id="824461455" name="Imagem 9"/>
             <wp:cNvGraphicFramePr/>
             <a:graphic xmlns:a="http://schemas.openxmlformats.org/drawingml/2006/main">
               <a:graphicData uri="http://schemas.openxmlformats.org/drawingml/2006/picture">
                 <pic:pic xmlns:pic="http://schemas.openxmlformats.org/drawingml/2006/picture">
                   <pic:nvPicPr>
-                    <pic:cNvPr id="213404758" name=""/>
+                    <pic:cNvPr id="824461455" name=""/>
                     <pic:cNvPicPr/>
                   </pic:nvPicPr>
                   <pic:blipFill>
@@ -11248,16 +11276,16 @@
         </w:rPr>
         <w:lastRenderedPageBreak/>
         <w:drawing>
-          <wp:inline distT="0" distB="0" distL="0" distR="0" wp14:anchorId="798DCF58" wp14:editId="42628F38">
+          <wp:inline distT="0" distB="0" distL="0" distR="0" wp14:anchorId="69B2FF7C" wp14:editId="48B10545">
             <wp:extent cx="5120640" cy="4627581"/>
             <wp:effectExtent l="19050" t="19050" r="22860" b="20955"/>
-            <wp:docPr id="100847262" name="Imagem 10"/>
+            <wp:docPr id="894080040" name="Imagem 10"/>
             <wp:cNvGraphicFramePr/>
             <a:graphic xmlns:a="http://schemas.openxmlformats.org/drawingml/2006/main">
               <a:graphicData uri="http://schemas.openxmlformats.org/drawingml/2006/picture">
                 <pic:pic xmlns:pic="http://schemas.openxmlformats.org/drawingml/2006/picture">
                   <pic:nvPicPr>
-                    <pic:cNvPr id="100847262" name=""/>
+                    <pic:cNvPr id="894080040" name=""/>
                     <pic:cNvPicPr/>
                   </pic:nvPicPr>
                   <pic:blipFill>
@@ -11391,7 +11419,7 @@
           <w:sz w:val="27"/>
         </w:rPr>
       </w:pPr>
-      <w:bookmarkStart w:id="22" w:name="_Toc240036066"/>
+      <w:bookmarkStart w:id="22" w:name="_Toc240037457"/>
       <w:r>
         <w:rPr>
           <w:rFonts w:ascii="Montserrat" w:hAnsi="Montserrat"/>
@@ -12457,16 +12485,16 @@
           <w:noProof/>
         </w:rPr>
         <w:drawing>
-          <wp:inline distT="0" distB="0" distL="0" distR="0" wp14:anchorId="3B861EE0" wp14:editId="7D11EA3F">
+          <wp:inline distT="0" distB="0" distL="0" distR="0" wp14:anchorId="4478BD5E" wp14:editId="4AFCF179">
             <wp:extent cx="5120640" cy="3338440"/>
             <wp:effectExtent l="19050" t="19050" r="22860" b="14605"/>
-            <wp:docPr id="734946004" name="Imagem 11"/>
+            <wp:docPr id="2069255353" name="Imagem 11"/>
             <wp:cNvGraphicFramePr/>
             <a:graphic xmlns:a="http://schemas.openxmlformats.org/drawingml/2006/main">
               <a:graphicData uri="http://schemas.openxmlformats.org/drawingml/2006/picture">
                 <pic:pic xmlns:pic="http://schemas.openxmlformats.org/drawingml/2006/picture">
                   <pic:nvPicPr>
-                    <pic:cNvPr id="734946004" name=""/>
+                    <pic:cNvPr id="2069255353" name=""/>
                     <pic:cNvPicPr/>
                   </pic:nvPicPr>
                   <pic:blipFill>
@@ -12534,16 +12562,16 @@
         </w:rPr>
         <w:lastRenderedPageBreak/>
         <w:drawing>
-          <wp:inline distT="0" distB="0" distL="0" distR="0" wp14:anchorId="388DD4FC" wp14:editId="3906768F">
+          <wp:inline distT="0" distB="0" distL="0" distR="0" wp14:anchorId="05180D3A" wp14:editId="02E1D1C3">
             <wp:extent cx="5120640" cy="4627581"/>
             <wp:effectExtent l="19050" t="19050" r="22860" b="20955"/>
-            <wp:docPr id="1824853848" name="Imagem 12"/>
+            <wp:docPr id="498481073" name="Imagem 12"/>
             <wp:cNvGraphicFramePr/>
             <a:graphic xmlns:a="http://schemas.openxmlformats.org/drawingml/2006/main">
               <a:graphicData uri="http://schemas.openxmlformats.org/drawingml/2006/picture">
                 <pic:pic xmlns:pic="http://schemas.openxmlformats.org/drawingml/2006/picture">
                   <pic:nvPicPr>
-                    <pic:cNvPr id="1824853848" name=""/>
+                    <pic:cNvPr id="498481073" name=""/>
                     <pic:cNvPicPr/>
                   </pic:nvPicPr>
                   <pic:blipFill>
@@ -12747,7 +12775,7 @@
           <w:sz w:val="27"/>
         </w:rPr>
       </w:pPr>
-      <w:bookmarkStart w:id="23" w:name="_Toc240036067"/>
+      <w:bookmarkStart w:id="23" w:name="_Toc240037458"/>
       <w:r>
         <w:rPr>
           <w:rFonts w:ascii="Montserrat" w:hAnsi="Montserrat"/>
@@ -13308,16 +13336,16 @@
           <w:noProof/>
         </w:rPr>
         <w:drawing>
-          <wp:inline distT="0" distB="0" distL="0" distR="0" wp14:anchorId="1FCC77F6" wp14:editId="79F89F8B">
+          <wp:inline distT="0" distB="0" distL="0" distR="0" wp14:anchorId="77E94CFE" wp14:editId="66042190">
             <wp:extent cx="5120640" cy="4627581"/>
             <wp:effectExtent l="19050" t="19050" r="22860" b="20955"/>
-            <wp:docPr id="1817659568" name="Imagem 13"/>
+            <wp:docPr id="1543063073" name="Imagem 13"/>
             <wp:cNvGraphicFramePr/>
             <a:graphic xmlns:a="http://schemas.openxmlformats.org/drawingml/2006/main">
               <a:graphicData uri="http://schemas.openxmlformats.org/drawingml/2006/picture">
                 <pic:pic xmlns:pic="http://schemas.openxmlformats.org/drawingml/2006/picture">
                   <pic:nvPicPr>
-                    <pic:cNvPr id="1817659568" name=""/>
+                    <pic:cNvPr id="1543063073" name=""/>
                     <pic:cNvPicPr/>
                   </pic:nvPicPr>
                   <pic:blipFill>
@@ -13385,16 +13413,16 @@
         </w:rPr>
         <w:lastRenderedPageBreak/>
         <w:drawing>
-          <wp:inline distT="0" distB="0" distL="0" distR="0" wp14:anchorId="7DB6B3A1" wp14:editId="6A81F50B">
+          <wp:inline distT="0" distB="0" distL="0" distR="0" wp14:anchorId="06889AC3" wp14:editId="7011BE33">
             <wp:extent cx="5120640" cy="4627581"/>
             <wp:effectExtent l="19050" t="19050" r="22860" b="20955"/>
-            <wp:docPr id="528887340" name="Imagem 14"/>
+            <wp:docPr id="716301428" name="Imagem 14"/>
             <wp:cNvGraphicFramePr/>
             <a:graphic xmlns:a="http://schemas.openxmlformats.org/drawingml/2006/main">
               <a:graphicData uri="http://schemas.openxmlformats.org/drawingml/2006/picture">
                 <pic:pic xmlns:pic="http://schemas.openxmlformats.org/drawingml/2006/picture">
                   <pic:nvPicPr>
-                    <pic:cNvPr id="528887340" name=""/>
+                    <pic:cNvPr id="716301428" name=""/>
                     <pic:cNvPicPr/>
                   </pic:nvPicPr>
                   <pic:blipFill>
@@ -13627,7 +13655,7 @@
           <w:sz w:val="27"/>
         </w:rPr>
       </w:pPr>
-      <w:bookmarkStart w:id="24" w:name="_Toc240036068"/>
+      <w:bookmarkStart w:id="24" w:name="_Toc240037459"/>
       <w:r>
         <w:rPr>
           <w:rFonts w:ascii="Montserrat" w:hAnsi="Montserrat"/>
@@ -13668,16 +13696,16 @@
           <w:noProof/>
         </w:rPr>
         <w:drawing>
-          <wp:inline distT="0" distB="0" distL="0" distR="0" wp14:anchorId="30E5F877" wp14:editId="5FC797C5">
+          <wp:inline distT="0" distB="0" distL="0" distR="0" wp14:anchorId="244F9262" wp14:editId="350D242E">
             <wp:extent cx="5120640" cy="4627581"/>
             <wp:effectExtent l="19050" t="19050" r="22860" b="20955"/>
-            <wp:docPr id="231719027" name="Imagem 15"/>
+            <wp:docPr id="1290512741" name="Imagem 15"/>
             <wp:cNvGraphicFramePr/>
             <a:graphic xmlns:a="http://schemas.openxmlformats.org/drawingml/2006/main">
               <a:graphicData uri="http://schemas.openxmlformats.org/drawingml/2006/picture">
                 <pic:pic xmlns:pic="http://schemas.openxmlformats.org/drawingml/2006/picture">
                   <pic:nvPicPr>
-                    <pic:cNvPr id="231719027" name=""/>
+                    <pic:cNvPr id="1290512741" name=""/>
                     <pic:cNvPicPr/>
                   </pic:nvPicPr>
                   <pic:blipFill>
@@ -13745,16 +13773,16 @@
         </w:rPr>
         <w:lastRenderedPageBreak/>
         <w:drawing>
-          <wp:inline distT="0" distB="0" distL="0" distR="0" wp14:anchorId="114727F3" wp14:editId="56C6F976">
+          <wp:inline distT="0" distB="0" distL="0" distR="0" wp14:anchorId="3BFD11D0" wp14:editId="5C9548BD">
             <wp:extent cx="5120640" cy="4627581"/>
             <wp:effectExtent l="19050" t="19050" r="22860" b="20955"/>
-            <wp:docPr id="894720998" name="Imagem 16"/>
+            <wp:docPr id="1723606790" name="Imagem 16"/>
             <wp:cNvGraphicFramePr/>
             <a:graphic xmlns:a="http://schemas.openxmlformats.org/drawingml/2006/main">
               <a:graphicData uri="http://schemas.openxmlformats.org/drawingml/2006/picture">
                 <pic:pic xmlns:pic="http://schemas.openxmlformats.org/drawingml/2006/picture">
                   <pic:nvPicPr>
-                    <pic:cNvPr id="894720998" name=""/>
+                    <pic:cNvPr id="1723606790" name=""/>
                     <pic:cNvPicPr/>
                   </pic:nvPicPr>
                   <pic:blipFill>
@@ -13918,16 +13946,16 @@
         </w:rPr>
         <w:lastRenderedPageBreak/>
         <w:drawing>
-          <wp:inline distT="0" distB="0" distL="0" distR="0" wp14:anchorId="79887B54" wp14:editId="195A5D25">
+          <wp:inline distT="0" distB="0" distL="0" distR="0" wp14:anchorId="7D9C597B" wp14:editId="1B3AA4CC">
             <wp:extent cx="5120640" cy="3282818"/>
             <wp:effectExtent l="19050" t="19050" r="22860" b="13335"/>
-            <wp:docPr id="1543605700" name="Imagem 17"/>
+            <wp:docPr id="763678820" name="Imagem 17"/>
             <wp:cNvGraphicFramePr/>
             <a:graphic xmlns:a="http://schemas.openxmlformats.org/drawingml/2006/main">
               <a:graphicData uri="http://schemas.openxmlformats.org/drawingml/2006/picture">
                 <pic:pic xmlns:pic="http://schemas.openxmlformats.org/drawingml/2006/picture">
                   <pic:nvPicPr>
-                    <pic:cNvPr id="1543605700" name=""/>
+                    <pic:cNvPr id="763678820" name=""/>
                     <pic:cNvPicPr/>
                   </pic:nvPicPr>
                   <pic:blipFill>
@@ -13986,24 +14014,6 @@
     </w:p>
     <w:p>
       <w:pPr>
-        <w:spacing w:line="280" w:lineRule="auto"/>
-        <w:rPr>
-          <w:rFonts w:ascii="Montserrat" w:hAnsi="Montserrat"/>
-          <w:color w:val="1A1A1A"/>
-          <w:sz w:val="22"/>
-        </w:rPr>
-      </w:pPr>
-      <w:r>
-        <w:rPr>
-          <w:rFonts w:ascii="Montserrat" w:hAnsi="Montserrat"/>
-          <w:color w:val="1A1A1A"/>
-          <w:sz w:val="22"/>
-        </w:rPr>
-        <w:t>Clique em Registrar EAP para gerar o protocolo.</w:t>
-      </w:r>
-    </w:p>
-    <w:p>
-      <w:pPr>
         <w:pStyle w:val="PargrafodaLista"/>
         <w:numPr>
           <w:ilvl w:val="0"/>
@@ -14023,7 +14033,25 @@
           <w:color w:val="1A1A1A"/>
           <w:sz w:val="22"/>
         </w:rPr>
-        <w:t>No rodape do painel de detalhes de uma EAP, os botoes Imprimir e Exportar Word geram um documento com a arvore hierarquica completa (pacotes, entregas e atividades, com a prioridade de cada uma), pronto para impressao ou para abrir no Word. Este artefato nao tem um FORALF oficial - o layout segue o padrao visual dos demais documentos gerados pelo sistema.</w:t>
+        <w:t>Status automatico da entrega: ao clicar em Visualizar arvore (ou ao abrir uma EAP ja registrada), cada Entrega (nivel 2) ganha um selo - Concluida, Atrasada, No prazo ou Sem cronograma vinculado - calculado automaticamente a partir do cronograma do Planejamento (Passo 4), casando pelo nome da entrega com o nome do marco. Nao ha nenhum campo novo para preencher na EAP: uma entrega fica Concluida se o marco correspondente tiver Conclusao real preenchida no cronograma, Atrasada se nao tiver conclusao e o Termino previsto ja tiver passado, e Sem cronograma vinculado se nao houver marco com o mesmo nome. Um resumo no topo da arvore mostra o percentual de entregas concluidas do projeto. So o nivel 2 (Entrega) recebe esse status - o nivel 3 (Atividade) nao tem hoje nenhuma outra fonte de dado no sistema que permita calcular automaticamente.</w:t>
+      </w:r>
+    </w:p>
+    <w:p>
+      <w:pPr>
+        <w:spacing w:line="280" w:lineRule="auto"/>
+        <w:rPr>
+          <w:rFonts w:ascii="Montserrat" w:hAnsi="Montserrat"/>
+          <w:color w:val="1A1A1A"/>
+          <w:sz w:val="22"/>
+        </w:rPr>
+      </w:pPr>
+      <w:r>
+        <w:rPr>
+          <w:rFonts w:ascii="Montserrat" w:hAnsi="Montserrat"/>
+          <w:color w:val="1A1A1A"/>
+          <w:sz w:val="22"/>
+        </w:rPr>
+        <w:t>Clique em Registrar EAP para gerar o protocolo.</w:t>
       </w:r>
     </w:p>
     <w:p>
@@ -14047,7 +14075,40 @@
           <w:color w:val="1A1A1A"/>
           <w:sz w:val="22"/>
         </w:rPr>
-        <w:t>Assistente de preenchimento por IA: apos selecionar o Projeto vinculado, o botao Sugerir com IA le o Planejamento e o TAP do projeto e sugere pacotes de trabalho (nivel 1) e entregas (nivel 2) - nunca atividades (nivel 3). So funciona se a arvore estiver totalmente vazia; se ja houver qualquer pacote ou entrega digitado, a sugestao e recusada (secao 2.12).</w:t>
+        <w:t>No rodape do painel de detalhes de uma EAP, os botoes Imprimir e Exportar Word geram um documento com a arvore hierarquica completa (pacotes, entregas e atividades, com a prioridade de cada uma), pronto para impressao ou para abrir no Word. Este artefato nao tem um FORALF oficial - o layout segue o padrao visual dos demais documentos gerados pelo sistema.</w:t>
+      </w:r>
+    </w:p>
+    <w:p>
+      <w:pPr>
+        <w:pStyle w:val="PargrafodaLista"/>
+        <w:numPr>
+          <w:ilvl w:val="0"/>
+          <w:numId w:val="18"/>
+        </w:numPr>
+        <w:spacing w:after="80" w:line="260" w:lineRule="auto"/>
+        <w:ind w:left="700"/>
+        <w:rPr>
+          <w:rFonts w:ascii="Montserrat" w:hAnsi="Montserrat"/>
+          <w:color w:val="1A1A1A"/>
+          <w:sz w:val="22"/>
+        </w:rPr>
+      </w:pPr>
+      <w:r>
+        <w:rPr>
+          <w:rFonts w:ascii="Montserrat" w:hAnsi="Montserrat"/>
+          <w:color w:val="1A1A1A"/>
+          <w:sz w:val="22"/>
+        </w:rPr>
+        <w:t xml:space="preserve">Assistente de preenchimento por IA: apos selecionar o Projeto vinculado, o botao Sugerir com IA le o Planejamento e o TAP do projeto e sugere </w:t>
+      </w:r>
+      <w:r>
+        <w:rPr>
+          <w:rFonts w:ascii="Montserrat" w:hAnsi="Montserrat"/>
+          <w:color w:val="1A1A1A"/>
+          <w:sz w:val="22"/>
+        </w:rPr>
+        <w:lastRenderedPageBreak/>
+        <w:t>pacotes de trabalho (nivel 1) e entregas (nivel 2) - nunca atividades (nivel 3). So funciona se a arvore estiver totalmente vazia; se ja houver qualquer pacote ou entrega digitado, a sugestao e recusada (secao 2.12).</w:t>
       </w:r>
     </w:p>
     <w:p>
@@ -14061,7 +14122,7 @@
           <w:sz w:val="27"/>
         </w:rPr>
       </w:pPr>
-      <w:bookmarkStart w:id="25" w:name="_Toc240036069"/>
+      <w:bookmarkStart w:id="25" w:name="_Toc240037460"/>
       <w:r>
         <w:rPr>
           <w:rFonts w:ascii="Montserrat" w:hAnsi="Montserrat"/>
@@ -14100,18 +14161,17 @@
         <w:rPr>
           <w:noProof/>
         </w:rPr>
-        <w:lastRenderedPageBreak/>
         <w:drawing>
-          <wp:inline distT="0" distB="0" distL="0" distR="0" wp14:anchorId="2419140F" wp14:editId="0B7F8B09">
+          <wp:inline distT="0" distB="0" distL="0" distR="0" wp14:anchorId="74F9BA15" wp14:editId="140A3A76">
             <wp:extent cx="5120640" cy="4627581"/>
             <wp:effectExtent l="19050" t="19050" r="22860" b="20955"/>
-            <wp:docPr id="1006326445" name="Imagem 18"/>
+            <wp:docPr id="161494036" name="Imagem 18"/>
             <wp:cNvGraphicFramePr/>
             <a:graphic xmlns:a="http://schemas.openxmlformats.org/drawingml/2006/main">
               <a:graphicData uri="http://schemas.openxmlformats.org/drawingml/2006/picture">
                 <pic:pic xmlns:pic="http://schemas.openxmlformats.org/drawingml/2006/picture">
                   <pic:nvPicPr>
-                    <pic:cNvPr id="1006326445" name=""/>
+                    <pic:cNvPr id="161494036" name=""/>
                     <pic:cNvPicPr/>
                   </pic:nvPicPr>
                   <pic:blipFill>
@@ -14179,16 +14239,16 @@
         </w:rPr>
         <w:lastRenderedPageBreak/>
         <w:drawing>
-          <wp:inline distT="0" distB="0" distL="0" distR="0" wp14:anchorId="73F9CDC2" wp14:editId="1FCB528B">
+          <wp:inline distT="0" distB="0" distL="0" distR="0" wp14:anchorId="601AF624" wp14:editId="2851E58D">
             <wp:extent cx="5120640" cy="4627581"/>
             <wp:effectExtent l="19050" t="19050" r="22860" b="20955"/>
-            <wp:docPr id="665768860" name="Imagem 19"/>
+            <wp:docPr id="342717881" name="Imagem 19"/>
             <wp:cNvGraphicFramePr/>
             <a:graphic xmlns:a="http://schemas.openxmlformats.org/drawingml/2006/main">
               <a:graphicData uri="http://schemas.openxmlformats.org/drawingml/2006/picture">
                 <pic:pic xmlns:pic="http://schemas.openxmlformats.org/drawingml/2006/picture">
                   <pic:nvPicPr>
-                    <pic:cNvPr id="665768860" name=""/>
+                    <pic:cNvPr id="342717881" name=""/>
                     <pic:cNvPicPr/>
                   </pic:nvPicPr>
                   <pic:blipFill>
@@ -14371,7 +14431,7 @@
           <w:sz w:val="27"/>
         </w:rPr>
       </w:pPr>
-      <w:bookmarkStart w:id="26" w:name="_Toc240036070"/>
+      <w:bookmarkStart w:id="26" w:name="_Toc240037461"/>
       <w:r>
         <w:rPr>
           <w:rFonts w:ascii="Montserrat" w:hAnsi="Montserrat"/>
@@ -14411,16 +14471,16 @@
           <w:noProof/>
         </w:rPr>
         <w:drawing>
-          <wp:inline distT="0" distB="0" distL="0" distR="0" wp14:anchorId="5A7E5932" wp14:editId="31E9FA45">
+          <wp:inline distT="0" distB="0" distL="0" distR="0" wp14:anchorId="6D8449C8" wp14:editId="72056626">
             <wp:extent cx="5120640" cy="4627581"/>
             <wp:effectExtent l="19050" t="19050" r="22860" b="20955"/>
-            <wp:docPr id="1328774409" name="Imagem 20"/>
+            <wp:docPr id="370631813" name="Imagem 20"/>
             <wp:cNvGraphicFramePr/>
             <a:graphic xmlns:a="http://schemas.openxmlformats.org/drawingml/2006/main">
               <a:graphicData uri="http://schemas.openxmlformats.org/drawingml/2006/picture">
                 <pic:pic xmlns:pic="http://schemas.openxmlformats.org/drawingml/2006/picture">
                   <pic:nvPicPr>
-                    <pic:cNvPr id="1328774409" name=""/>
+                    <pic:cNvPr id="370631813" name=""/>
                     <pic:cNvPicPr/>
                   </pic:nvPicPr>
                   <pic:blipFill>
@@ -14488,16 +14548,16 @@
         </w:rPr>
         <w:lastRenderedPageBreak/>
         <w:drawing>
-          <wp:inline distT="0" distB="0" distL="0" distR="0" wp14:anchorId="014E8AB6" wp14:editId="68CE1450">
+          <wp:inline distT="0" distB="0" distL="0" distR="0" wp14:anchorId="04FB4943" wp14:editId="2036F32A">
             <wp:extent cx="5120640" cy="4627581"/>
             <wp:effectExtent l="19050" t="19050" r="22860" b="20955"/>
-            <wp:docPr id="60891544" name="Imagem 21"/>
+            <wp:docPr id="505720996" name="Imagem 21"/>
             <wp:cNvGraphicFramePr/>
             <a:graphic xmlns:a="http://schemas.openxmlformats.org/drawingml/2006/main">
               <a:graphicData uri="http://schemas.openxmlformats.org/drawingml/2006/picture">
                 <pic:pic xmlns:pic="http://schemas.openxmlformats.org/drawingml/2006/picture">
                   <pic:nvPicPr>
-                    <pic:cNvPr id="60891544" name=""/>
+                    <pic:cNvPr id="505720996" name=""/>
                     <pic:cNvPicPr/>
                   </pic:nvPicPr>
                   <pic:blipFill>
@@ -14703,16 +14763,16 @@
           <w:noProof/>
         </w:rPr>
         <w:drawing>
-          <wp:inline distT="0" distB="0" distL="0" distR="0" wp14:anchorId="53E9E455" wp14:editId="3C8100E9">
+          <wp:inline distT="0" distB="0" distL="0" distR="0" wp14:anchorId="3A6DC831" wp14:editId="72853829">
             <wp:extent cx="5120640" cy="1757287"/>
             <wp:effectExtent l="19050" t="19050" r="22860" b="14605"/>
-            <wp:docPr id="477291456" name="Imagem 22"/>
+            <wp:docPr id="1334203714" name="Imagem 22"/>
             <wp:cNvGraphicFramePr/>
             <a:graphic xmlns:a="http://schemas.openxmlformats.org/drawingml/2006/main">
               <a:graphicData uri="http://schemas.openxmlformats.org/drawingml/2006/picture">
                 <pic:pic xmlns:pic="http://schemas.openxmlformats.org/drawingml/2006/picture">
                   <pic:nvPicPr>
-                    <pic:cNvPr id="477291456" name=""/>
+                    <pic:cNvPr id="1334203714" name=""/>
                     <pic:cNvPicPr/>
                   </pic:nvPicPr>
                   <pic:blipFill>
@@ -14825,7 +14885,7 @@
           <w:sz w:val="27"/>
         </w:rPr>
       </w:pPr>
-      <w:bookmarkStart w:id="27" w:name="_Toc240036071"/>
+      <w:bookmarkStart w:id="27" w:name="_Toc240037462"/>
       <w:r>
         <w:rPr>
           <w:rFonts w:ascii="Montserrat" w:hAnsi="Montserrat"/>
@@ -14866,16 +14926,16 @@
         </w:rPr>
         <w:lastRenderedPageBreak/>
         <w:drawing>
-          <wp:inline distT="0" distB="0" distL="0" distR="0" wp14:anchorId="0967DD02" wp14:editId="0E14165A">
+          <wp:inline distT="0" distB="0" distL="0" distR="0" wp14:anchorId="4E6DEFC3" wp14:editId="5807B790">
             <wp:extent cx="5120640" cy="4627581"/>
             <wp:effectExtent l="19050" t="19050" r="22860" b="20955"/>
-            <wp:docPr id="1779287884" name="Imagem 23"/>
+            <wp:docPr id="2038360850" name="Imagem 23"/>
             <wp:cNvGraphicFramePr/>
             <a:graphic xmlns:a="http://schemas.openxmlformats.org/drawingml/2006/main">
               <a:graphicData uri="http://schemas.openxmlformats.org/drawingml/2006/picture">
                 <pic:pic xmlns:pic="http://schemas.openxmlformats.org/drawingml/2006/picture">
                   <pic:nvPicPr>
-                    <pic:cNvPr id="1779287884" name=""/>
+                    <pic:cNvPr id="2038360850" name=""/>
                     <pic:cNvPicPr/>
                   </pic:nvPicPr>
                   <pic:blipFill>
@@ -14943,16 +15003,16 @@
         </w:rPr>
         <w:lastRenderedPageBreak/>
         <w:drawing>
-          <wp:inline distT="0" distB="0" distL="0" distR="0" wp14:anchorId="2C3B5BE3" wp14:editId="311B4D5B">
+          <wp:inline distT="0" distB="0" distL="0" distR="0" wp14:anchorId="3ECA4FCE" wp14:editId="3FBFE625">
             <wp:extent cx="5120640" cy="4627581"/>
             <wp:effectExtent l="19050" t="19050" r="22860" b="20955"/>
-            <wp:docPr id="743506088" name="Imagem 24"/>
+            <wp:docPr id="132680937" name="Imagem 24"/>
             <wp:cNvGraphicFramePr/>
             <a:graphic xmlns:a="http://schemas.openxmlformats.org/drawingml/2006/main">
               <a:graphicData uri="http://schemas.openxmlformats.org/drawingml/2006/picture">
                 <pic:pic xmlns:pic="http://schemas.openxmlformats.org/drawingml/2006/picture">
                   <pic:nvPicPr>
-                    <pic:cNvPr id="743506088" name=""/>
+                    <pic:cNvPr id="132680937" name=""/>
                     <pic:cNvPicPr/>
                   </pic:nvPicPr>
                   <pic:blipFill>
@@ -15189,7 +15249,7 @@
           <w:sz w:val="27"/>
         </w:rPr>
       </w:pPr>
-      <w:bookmarkStart w:id="28" w:name="_Toc240036072"/>
+      <w:bookmarkStart w:id="28" w:name="_Toc240037463"/>
       <w:r>
         <w:rPr>
           <w:rFonts w:ascii="Montserrat" w:hAnsi="Montserrat"/>
@@ -15229,16 +15289,16 @@
           <w:noProof/>
         </w:rPr>
         <w:drawing>
-          <wp:inline distT="0" distB="0" distL="0" distR="0" wp14:anchorId="0127A134" wp14:editId="7C522537">
+          <wp:inline distT="0" distB="0" distL="0" distR="0" wp14:anchorId="6818F6DA" wp14:editId="7351239D">
             <wp:extent cx="5120640" cy="4627581"/>
             <wp:effectExtent l="19050" t="19050" r="22860" b="20955"/>
-            <wp:docPr id="50274255" name="Imagem 25"/>
+            <wp:docPr id="469837021" name="Imagem 25"/>
             <wp:cNvGraphicFramePr/>
             <a:graphic xmlns:a="http://schemas.openxmlformats.org/drawingml/2006/main">
               <a:graphicData uri="http://schemas.openxmlformats.org/drawingml/2006/picture">
                 <pic:pic xmlns:pic="http://schemas.openxmlformats.org/drawingml/2006/picture">
                   <pic:nvPicPr>
-                    <pic:cNvPr id="50274255" name=""/>
+                    <pic:cNvPr id="469837021" name=""/>
                     <pic:cNvPicPr/>
                   </pic:nvPicPr>
                   <pic:blipFill>
@@ -15306,16 +15366,16 @@
         </w:rPr>
         <w:lastRenderedPageBreak/>
         <w:drawing>
-          <wp:inline distT="0" distB="0" distL="0" distR="0" wp14:anchorId="21F38C29" wp14:editId="22BAA40C">
+          <wp:inline distT="0" distB="0" distL="0" distR="0" wp14:anchorId="3769A59E" wp14:editId="79293C5B">
             <wp:extent cx="5120640" cy="4627581"/>
             <wp:effectExtent l="19050" t="19050" r="22860" b="20955"/>
-            <wp:docPr id="1121470665" name="Imagem 26"/>
+            <wp:docPr id="783806627" name="Imagem 26"/>
             <wp:cNvGraphicFramePr/>
             <a:graphic xmlns:a="http://schemas.openxmlformats.org/drawingml/2006/main">
               <a:graphicData uri="http://schemas.openxmlformats.org/drawingml/2006/picture">
                 <pic:pic xmlns:pic="http://schemas.openxmlformats.org/drawingml/2006/picture">
                   <pic:nvPicPr>
-                    <pic:cNvPr id="1121470665" name=""/>
+                    <pic:cNvPr id="783806627" name=""/>
                     <pic:cNvPicPr/>
                   </pic:nvPicPr>
                   <pic:blipFill>
@@ -15506,7 +15566,7 @@
           <w:sz w:val="27"/>
         </w:rPr>
       </w:pPr>
-      <w:bookmarkStart w:id="29" w:name="_Toc240036073"/>
+      <w:bookmarkStart w:id="29" w:name="_Toc240037464"/>
       <w:r>
         <w:rPr>
           <w:rFonts w:ascii="Montserrat" w:hAnsi="Montserrat"/>
@@ -15546,16 +15606,16 @@
           <w:noProof/>
         </w:rPr>
         <w:drawing>
-          <wp:inline distT="0" distB="0" distL="0" distR="0" wp14:anchorId="02F386C6" wp14:editId="40E5D184">
+          <wp:inline distT="0" distB="0" distL="0" distR="0" wp14:anchorId="5E151AA2" wp14:editId="389E5D71">
             <wp:extent cx="5120640" cy="4000682"/>
             <wp:effectExtent l="19050" t="19050" r="22860" b="19050"/>
-            <wp:docPr id="549559650" name="Imagem 27"/>
+            <wp:docPr id="475595359" name="Imagem 27"/>
             <wp:cNvGraphicFramePr/>
             <a:graphic xmlns:a="http://schemas.openxmlformats.org/drawingml/2006/main">
               <a:graphicData uri="http://schemas.openxmlformats.org/drawingml/2006/picture">
                 <pic:pic xmlns:pic="http://schemas.openxmlformats.org/drawingml/2006/picture">
                   <pic:nvPicPr>
-                    <pic:cNvPr id="549559650" name=""/>
+                    <pic:cNvPr id="475595359" name=""/>
                     <pic:cNvPicPr/>
                   </pic:nvPicPr>
                   <pic:blipFill>
@@ -16079,7 +16139,7 @@
           <w:sz w:val="34"/>
         </w:rPr>
       </w:pPr>
-      <w:bookmarkStart w:id="30" w:name="_Toc240036074"/>
+      <w:bookmarkStart w:id="30" w:name="_Toc240037465"/>
       <w:r>
         <w:rPr>
           <w:rFonts w:ascii="Montserrat" w:hAnsi="Montserrat"/>
@@ -16121,7 +16181,7 @@
           <w:sz w:val="27"/>
         </w:rPr>
       </w:pPr>
-      <w:bookmarkStart w:id="31" w:name="_Toc240036075"/>
+      <w:bookmarkStart w:id="31" w:name="_Toc240037466"/>
       <w:r>
         <w:rPr>
           <w:rFonts w:ascii="Montserrat" w:hAnsi="Montserrat"/>
@@ -16161,16 +16221,16 @@
           <w:noProof/>
         </w:rPr>
         <w:drawing>
-          <wp:inline distT="0" distB="0" distL="0" distR="0" wp14:anchorId="0A4BB844" wp14:editId="15F1C53A">
+          <wp:inline distT="0" distB="0" distL="0" distR="0" wp14:anchorId="2FA91C6D" wp14:editId="3D2F6263">
             <wp:extent cx="5120640" cy="4627581"/>
             <wp:effectExtent l="19050" t="19050" r="22860" b="20955"/>
-            <wp:docPr id="669134662" name="Imagem 28"/>
+            <wp:docPr id="1095430529" name="Imagem 28"/>
             <wp:cNvGraphicFramePr/>
             <a:graphic xmlns:a="http://schemas.openxmlformats.org/drawingml/2006/main">
               <a:graphicData uri="http://schemas.openxmlformats.org/drawingml/2006/picture">
                 <pic:pic xmlns:pic="http://schemas.openxmlformats.org/drawingml/2006/picture">
                   <pic:nvPicPr>
-                    <pic:cNvPr id="669134662" name=""/>
+                    <pic:cNvPr id="1095430529" name=""/>
                     <pic:cNvPicPr/>
                   </pic:nvPicPr>
                   <pic:blipFill>
@@ -16238,16 +16298,16 @@
         </w:rPr>
         <w:lastRenderedPageBreak/>
         <w:drawing>
-          <wp:inline distT="0" distB="0" distL="0" distR="0" wp14:anchorId="42E401DB" wp14:editId="58951CC2">
+          <wp:inline distT="0" distB="0" distL="0" distR="0" wp14:anchorId="0BFFEBA8" wp14:editId="3D09B1E3">
             <wp:extent cx="5120640" cy="4627581"/>
             <wp:effectExtent l="19050" t="19050" r="22860" b="20955"/>
-            <wp:docPr id="1423136007" name="Imagem 29"/>
+            <wp:docPr id="2143788710" name="Imagem 29"/>
             <wp:cNvGraphicFramePr/>
             <a:graphic xmlns:a="http://schemas.openxmlformats.org/drawingml/2006/main">
               <a:graphicData uri="http://schemas.openxmlformats.org/drawingml/2006/picture">
                 <pic:pic xmlns:pic="http://schemas.openxmlformats.org/drawingml/2006/picture">
                   <pic:nvPicPr>
-                    <pic:cNvPr id="1423136007" name=""/>
+                    <pic:cNvPr id="2143788710" name=""/>
                     <pic:cNvPicPr/>
                   </pic:nvPicPr>
                   <pic:blipFill>
@@ -16315,16 +16375,16 @@
         </w:rPr>
         <w:lastRenderedPageBreak/>
         <w:drawing>
-          <wp:inline distT="0" distB="0" distL="0" distR="0" wp14:anchorId="2D08F247" wp14:editId="224701AD">
+          <wp:inline distT="0" distB="0" distL="0" distR="0" wp14:anchorId="510BD11C" wp14:editId="712D9E66">
             <wp:extent cx="5120640" cy="4627581"/>
             <wp:effectExtent l="19050" t="19050" r="22860" b="20955"/>
-            <wp:docPr id="1074103620" name="Imagem 30"/>
+            <wp:docPr id="2133908846" name="Imagem 30"/>
             <wp:cNvGraphicFramePr/>
             <a:graphic xmlns:a="http://schemas.openxmlformats.org/drawingml/2006/main">
               <a:graphicData uri="http://schemas.openxmlformats.org/drawingml/2006/picture">
                 <pic:pic xmlns:pic="http://schemas.openxmlformats.org/drawingml/2006/picture">
                   <pic:nvPicPr>
-                    <pic:cNvPr id="1074103620" name=""/>
+                    <pic:cNvPr id="2133908846" name=""/>
                     <pic:cNvPicPr/>
                   </pic:nvPicPr>
                   <pic:blipFill>
@@ -16526,16 +16586,16 @@
           <w:noProof/>
         </w:rPr>
         <w:drawing>
-          <wp:inline distT="0" distB="0" distL="0" distR="0" wp14:anchorId="54288088" wp14:editId="7F1C0794">
+          <wp:inline distT="0" distB="0" distL="0" distR="0" wp14:anchorId="4F12763E" wp14:editId="6D27D3CD">
             <wp:extent cx="5120640" cy="1715571"/>
             <wp:effectExtent l="19050" t="19050" r="22860" b="18415"/>
-            <wp:docPr id="586026301" name="Imagem 31"/>
+            <wp:docPr id="994930880" name="Imagem 31"/>
             <wp:cNvGraphicFramePr/>
             <a:graphic xmlns:a="http://schemas.openxmlformats.org/drawingml/2006/main">
               <a:graphicData uri="http://schemas.openxmlformats.org/drawingml/2006/picture">
                 <pic:pic xmlns:pic="http://schemas.openxmlformats.org/drawingml/2006/picture">
                   <pic:nvPicPr>
-                    <pic:cNvPr id="586026301" name=""/>
+                    <pic:cNvPr id="994930880" name=""/>
                     <pic:cNvPicPr/>
                   </pic:nvPicPr>
                   <pic:blipFill>
@@ -16672,16 +16732,16 @@
           <w:noProof/>
         </w:rPr>
         <w:drawing>
-          <wp:inline distT="0" distB="0" distL="0" distR="0" wp14:anchorId="7B23BDB0" wp14:editId="1C2A31FA">
+          <wp:inline distT="0" distB="0" distL="0" distR="0" wp14:anchorId="319013F6" wp14:editId="0D570256">
             <wp:extent cx="5120640" cy="3282818"/>
             <wp:effectExtent l="19050" t="19050" r="22860" b="13335"/>
-            <wp:docPr id="1110915520" name="Imagem 32"/>
+            <wp:docPr id="1579487774" name="Imagem 32"/>
             <wp:cNvGraphicFramePr/>
             <a:graphic xmlns:a="http://schemas.openxmlformats.org/drawingml/2006/main">
               <a:graphicData uri="http://schemas.openxmlformats.org/drawingml/2006/picture">
                 <pic:pic xmlns:pic="http://schemas.openxmlformats.org/drawingml/2006/picture">
                   <pic:nvPicPr>
-                    <pic:cNvPr id="1110915520" name=""/>
+                    <pic:cNvPr id="1579487774" name=""/>
                     <pic:cNvPicPr/>
                   </pic:nvPicPr>
                   <pic:blipFill>
@@ -16815,16 +16875,16 @@
           <w:noProof/>
         </w:rPr>
         <w:drawing>
-          <wp:inline distT="0" distB="0" distL="0" distR="0" wp14:anchorId="40118E82" wp14:editId="407106E2">
+          <wp:inline distT="0" distB="0" distL="0" distR="0" wp14:anchorId="7698CB37" wp14:editId="399FF004">
             <wp:extent cx="5120640" cy="951357"/>
             <wp:effectExtent l="19050" t="19050" r="22860" b="20320"/>
-            <wp:docPr id="193696566" name="Imagem 33"/>
+            <wp:docPr id="1775981505" name="Imagem 33"/>
             <wp:cNvGraphicFramePr/>
             <a:graphic xmlns:a="http://schemas.openxmlformats.org/drawingml/2006/main">
               <a:graphicData uri="http://schemas.openxmlformats.org/drawingml/2006/picture">
                 <pic:pic xmlns:pic="http://schemas.openxmlformats.org/drawingml/2006/picture">
                   <pic:nvPicPr>
-                    <pic:cNvPr id="193696566" name=""/>
+                    <pic:cNvPr id="1775981505" name=""/>
                     <pic:cNvPicPr/>
                   </pic:nvPicPr>
                   <pic:blipFill>
@@ -16936,16 +16996,16 @@
           <w:noProof/>
         </w:rPr>
         <w:drawing>
-          <wp:inline distT="0" distB="0" distL="0" distR="0" wp14:anchorId="0ADBD9DF" wp14:editId="73B8A42E">
+          <wp:inline distT="0" distB="0" distL="0" distR="0" wp14:anchorId="0B2B745D" wp14:editId="6AD18BA5">
             <wp:extent cx="5120640" cy="1515102"/>
             <wp:effectExtent l="19050" t="19050" r="22860" b="28575"/>
-            <wp:docPr id="1684334981" name="Imagem 34"/>
+            <wp:docPr id="158303332" name="Imagem 34"/>
             <wp:cNvGraphicFramePr/>
             <a:graphic xmlns:a="http://schemas.openxmlformats.org/drawingml/2006/main">
               <a:graphicData uri="http://schemas.openxmlformats.org/drawingml/2006/picture">
                 <pic:pic xmlns:pic="http://schemas.openxmlformats.org/drawingml/2006/picture">
                   <pic:nvPicPr>
-                    <pic:cNvPr id="1684334981" name=""/>
+                    <pic:cNvPr id="158303332" name=""/>
                     <pic:cNvPicPr/>
                   </pic:nvPicPr>
                   <pic:blipFill>
@@ -17058,16 +17118,16 @@
           <w:noProof/>
         </w:rPr>
         <w:drawing>
-          <wp:inline distT="0" distB="0" distL="0" distR="0" wp14:anchorId="775E31B7" wp14:editId="4981477A">
+          <wp:inline distT="0" distB="0" distL="0" distR="0" wp14:anchorId="6CA810CE" wp14:editId="7DC83510">
             <wp:extent cx="5120640" cy="1391113"/>
             <wp:effectExtent l="19050" t="19050" r="22860" b="19050"/>
-            <wp:docPr id="790576567" name="Imagem 35"/>
+            <wp:docPr id="1515040859" name="Imagem 35"/>
             <wp:cNvGraphicFramePr/>
             <a:graphic xmlns:a="http://schemas.openxmlformats.org/drawingml/2006/main">
               <a:graphicData uri="http://schemas.openxmlformats.org/drawingml/2006/picture">
                 <pic:pic xmlns:pic="http://schemas.openxmlformats.org/drawingml/2006/picture">
                   <pic:nvPicPr>
-                    <pic:cNvPr id="790576567" name=""/>
+                    <pic:cNvPr id="1515040859" name=""/>
                     <pic:cNvPicPr/>
                   </pic:nvPicPr>
                   <pic:blipFill>
@@ -17179,16 +17239,16 @@
           <w:noProof/>
         </w:rPr>
         <w:drawing>
-          <wp:inline distT="0" distB="0" distL="0" distR="0" wp14:anchorId="3F7AECBA" wp14:editId="54456588">
+          <wp:inline distT="0" distB="0" distL="0" distR="0" wp14:anchorId="3B887CDC" wp14:editId="68CC1422">
             <wp:extent cx="5120640" cy="1125174"/>
             <wp:effectExtent l="19050" t="19050" r="22860" b="18415"/>
-            <wp:docPr id="444270864" name="Imagem 36"/>
+            <wp:docPr id="590347076" name="Imagem 36"/>
             <wp:cNvGraphicFramePr/>
             <a:graphic xmlns:a="http://schemas.openxmlformats.org/drawingml/2006/main">
               <a:graphicData uri="http://schemas.openxmlformats.org/drawingml/2006/picture">
                 <pic:pic xmlns:pic="http://schemas.openxmlformats.org/drawingml/2006/picture">
                   <pic:nvPicPr>
-                    <pic:cNvPr id="444270864" name=""/>
+                    <pic:cNvPr id="590347076" name=""/>
                     <pic:cNvPicPr/>
                   </pic:nvPicPr>
                   <pic:blipFill>
@@ -17278,7 +17338,7 @@
           <w:sz w:val="27"/>
         </w:rPr>
       </w:pPr>
-      <w:bookmarkStart w:id="32" w:name="_Toc240036076"/>
+      <w:bookmarkStart w:id="32" w:name="_Toc240037467"/>
       <w:r>
         <w:rPr>
           <w:rFonts w:ascii="Montserrat" w:hAnsi="Montserrat"/>
@@ -17318,16 +17378,16 @@
           <w:noProof/>
         </w:rPr>
         <w:drawing>
-          <wp:inline distT="0" distB="0" distL="0" distR="0" wp14:anchorId="676A792B" wp14:editId="288606C8">
+          <wp:inline distT="0" distB="0" distL="0" distR="0" wp14:anchorId="42F84368" wp14:editId="4BED641E">
             <wp:extent cx="5120640" cy="4627581"/>
             <wp:effectExtent l="19050" t="19050" r="22860" b="20955"/>
-            <wp:docPr id="1466186639" name="Imagem 37"/>
+            <wp:docPr id="1441242387" name="Imagem 37"/>
             <wp:cNvGraphicFramePr/>
             <a:graphic xmlns:a="http://schemas.openxmlformats.org/drawingml/2006/main">
               <a:graphicData uri="http://schemas.openxmlformats.org/drawingml/2006/picture">
                 <pic:pic xmlns:pic="http://schemas.openxmlformats.org/drawingml/2006/picture">
                   <pic:nvPicPr>
-                    <pic:cNvPr id="1466186639" name=""/>
+                    <pic:cNvPr id="1441242387" name=""/>
                     <pic:cNvPicPr/>
                   </pic:nvPicPr>
                   <pic:blipFill>
@@ -17395,16 +17455,16 @@
         </w:rPr>
         <w:lastRenderedPageBreak/>
         <w:drawing>
-          <wp:inline distT="0" distB="0" distL="0" distR="0" wp14:anchorId="3E474E5C" wp14:editId="492D4033">
+          <wp:inline distT="0" distB="0" distL="0" distR="0" wp14:anchorId="7B8BD754" wp14:editId="38AACF7D">
             <wp:extent cx="5120640" cy="4627581"/>
             <wp:effectExtent l="19050" t="19050" r="22860" b="20955"/>
-            <wp:docPr id="138421280" name="Imagem 38"/>
+            <wp:docPr id="732868162" name="Imagem 38"/>
             <wp:cNvGraphicFramePr/>
             <a:graphic xmlns:a="http://schemas.openxmlformats.org/drawingml/2006/main">
               <a:graphicData uri="http://schemas.openxmlformats.org/drawingml/2006/picture">
                 <pic:pic xmlns:pic="http://schemas.openxmlformats.org/drawingml/2006/picture">
                   <pic:nvPicPr>
-                    <pic:cNvPr id="138421280" name=""/>
+                    <pic:cNvPr id="732868162" name=""/>
                     <pic:cNvPicPr/>
                   </pic:nvPicPr>
                   <pic:blipFill>
@@ -17573,16 +17633,16 @@
           <w:noProof/>
         </w:rPr>
         <w:drawing>
-          <wp:inline distT="0" distB="0" distL="0" distR="0" wp14:anchorId="54FC7BA3" wp14:editId="0B412890">
+          <wp:inline distT="0" distB="0" distL="0" distR="0" wp14:anchorId="5D437D17" wp14:editId="441B934C">
             <wp:extent cx="5120640" cy="2144319"/>
             <wp:effectExtent l="19050" t="19050" r="22860" b="27940"/>
-            <wp:docPr id="1182316874" name="Imagem 39"/>
+            <wp:docPr id="1956703425" name="Imagem 39"/>
             <wp:cNvGraphicFramePr/>
             <a:graphic xmlns:a="http://schemas.openxmlformats.org/drawingml/2006/main">
               <a:graphicData uri="http://schemas.openxmlformats.org/drawingml/2006/picture">
                 <pic:pic xmlns:pic="http://schemas.openxmlformats.org/drawingml/2006/picture">
                   <pic:nvPicPr>
-                    <pic:cNvPr id="1182316874" name=""/>
+                    <pic:cNvPr id="1956703425" name=""/>
                     <pic:cNvPicPr/>
                   </pic:nvPicPr>
                   <pic:blipFill>
@@ -17670,16 +17730,16 @@
           <w:noProof/>
         </w:rPr>
         <w:drawing>
-          <wp:inline distT="0" distB="0" distL="0" distR="0" wp14:anchorId="45B2F273" wp14:editId="207B091B">
+          <wp:inline distT="0" distB="0" distL="0" distR="0" wp14:anchorId="0D00D832" wp14:editId="1AE5679C">
             <wp:extent cx="5120640" cy="1055647"/>
             <wp:effectExtent l="19050" t="19050" r="22860" b="11430"/>
-            <wp:docPr id="556903764" name="Imagem 40"/>
+            <wp:docPr id="56030859" name="Imagem 40"/>
             <wp:cNvGraphicFramePr/>
             <a:graphic xmlns:a="http://schemas.openxmlformats.org/drawingml/2006/main">
               <a:graphicData uri="http://schemas.openxmlformats.org/drawingml/2006/picture">
                 <pic:pic xmlns:pic="http://schemas.openxmlformats.org/drawingml/2006/picture">
                   <pic:nvPicPr>
-                    <pic:cNvPr id="556903764" name=""/>
+                    <pic:cNvPr id="56030859" name=""/>
                     <pic:cNvPicPr/>
                   </pic:nvPicPr>
                   <pic:blipFill>
@@ -17801,16 +17861,16 @@
           <w:noProof/>
         </w:rPr>
         <w:drawing>
-          <wp:inline distT="0" distB="0" distL="0" distR="0" wp14:anchorId="4C6996C9" wp14:editId="773B251B">
+          <wp:inline distT="0" distB="0" distL="0" distR="0" wp14:anchorId="357555EF" wp14:editId="1F21350C">
             <wp:extent cx="5120640" cy="3282818"/>
             <wp:effectExtent l="19050" t="19050" r="22860" b="13335"/>
-            <wp:docPr id="272062536" name="Imagem 41"/>
+            <wp:docPr id="801289954" name="Imagem 41"/>
             <wp:cNvGraphicFramePr/>
             <a:graphic xmlns:a="http://schemas.openxmlformats.org/drawingml/2006/main">
               <a:graphicData uri="http://schemas.openxmlformats.org/drawingml/2006/picture">
                 <pic:pic xmlns:pic="http://schemas.openxmlformats.org/drawingml/2006/picture">
                   <pic:nvPicPr>
-                    <pic:cNvPr id="272062536" name=""/>
+                    <pic:cNvPr id="801289954" name=""/>
                     <pic:cNvPicPr/>
                   </pic:nvPicPr>
                   <pic:blipFill>
@@ -17944,16 +18004,16 @@
         </w:rPr>
         <w:lastRenderedPageBreak/>
         <w:drawing>
-          <wp:inline distT="0" distB="0" distL="0" distR="0" wp14:anchorId="5E20A70F" wp14:editId="60DCC94D">
+          <wp:inline distT="0" distB="0" distL="0" distR="0" wp14:anchorId="75724656" wp14:editId="5E68D2FB">
             <wp:extent cx="5120640" cy="1978034"/>
             <wp:effectExtent l="19050" t="19050" r="22860" b="22225"/>
-            <wp:docPr id="356376413" name="Imagem 42"/>
+            <wp:docPr id="1229680334" name="Imagem 42"/>
             <wp:cNvGraphicFramePr/>
             <a:graphic xmlns:a="http://schemas.openxmlformats.org/drawingml/2006/main">
               <a:graphicData uri="http://schemas.openxmlformats.org/drawingml/2006/picture">
                 <pic:pic xmlns:pic="http://schemas.openxmlformats.org/drawingml/2006/picture">
                   <pic:nvPicPr>
-                    <pic:cNvPr id="356376413" name=""/>
+                    <pic:cNvPr id="1229680334" name=""/>
                     <pic:cNvPicPr/>
                   </pic:nvPicPr>
                   <pic:blipFill>
@@ -18025,7 +18085,7 @@
           <w:sz w:val="34"/>
         </w:rPr>
       </w:pPr>
-      <w:bookmarkStart w:id="33" w:name="_Toc240036077"/>
+      <w:bookmarkStart w:id="33" w:name="_Toc240037468"/>
       <w:r>
         <w:rPr>
           <w:rFonts w:ascii="Montserrat" w:hAnsi="Montserrat"/>
@@ -18085,7 +18145,7 @@
           <w:sz w:val="27"/>
         </w:rPr>
       </w:pPr>
-      <w:bookmarkStart w:id="34" w:name="_Toc240036078"/>
+      <w:bookmarkStart w:id="34" w:name="_Toc240037469"/>
       <w:r>
         <w:rPr>
           <w:rFonts w:ascii="Montserrat" w:hAnsi="Montserrat"/>
@@ -18125,16 +18185,16 @@
           <w:noProof/>
         </w:rPr>
         <w:drawing>
-          <wp:inline distT="0" distB="0" distL="0" distR="0" wp14:anchorId="6BC93EC8" wp14:editId="48C67071">
+          <wp:inline distT="0" distB="0" distL="0" distR="0" wp14:anchorId="34D50EF4" wp14:editId="6803F372">
             <wp:extent cx="5303520" cy="4792851"/>
             <wp:effectExtent l="19050" t="19050" r="11430" b="27305"/>
-            <wp:docPr id="696886969" name="Imagem 43"/>
+            <wp:docPr id="495434637" name="Imagem 43"/>
             <wp:cNvGraphicFramePr/>
             <a:graphic xmlns:a="http://schemas.openxmlformats.org/drawingml/2006/main">
               <a:graphicData uri="http://schemas.openxmlformats.org/drawingml/2006/picture">
                 <pic:pic xmlns:pic="http://schemas.openxmlformats.org/drawingml/2006/picture">
                   <pic:nvPicPr>
-                    <pic:cNvPr id="696886969" name=""/>
+                    <pic:cNvPr id="495434637" name=""/>
                     <pic:cNvPicPr/>
                   </pic:nvPicPr>
                   <pic:blipFill>
@@ -18203,7 +18263,7 @@
           <w:sz w:val="27"/>
         </w:rPr>
       </w:pPr>
-      <w:bookmarkStart w:id="35" w:name="_Toc240036079"/>
+      <w:bookmarkStart w:id="35" w:name="_Toc240037470"/>
       <w:r>
         <w:rPr>
           <w:rFonts w:ascii="Montserrat" w:hAnsi="Montserrat"/>
@@ -18243,16 +18303,16 @@
           <w:noProof/>
         </w:rPr>
         <w:drawing>
-          <wp:inline distT="0" distB="0" distL="0" distR="0" wp14:anchorId="553E6365" wp14:editId="5500C011">
+          <wp:inline distT="0" distB="0" distL="0" distR="0" wp14:anchorId="1D14E50F" wp14:editId="54860C37">
             <wp:extent cx="5303520" cy="4792851"/>
             <wp:effectExtent l="19050" t="19050" r="11430" b="27305"/>
-            <wp:docPr id="1549828468" name="Imagem 44"/>
+            <wp:docPr id="196826229" name="Imagem 44"/>
             <wp:cNvGraphicFramePr/>
             <a:graphic xmlns:a="http://schemas.openxmlformats.org/drawingml/2006/main">
               <a:graphicData uri="http://schemas.openxmlformats.org/drawingml/2006/picture">
                 <pic:pic xmlns:pic="http://schemas.openxmlformats.org/drawingml/2006/picture">
                   <pic:nvPicPr>
-                    <pic:cNvPr id="1549828468" name=""/>
+                    <pic:cNvPr id="196826229" name=""/>
                     <pic:cNvPicPr/>
                   </pic:nvPicPr>
                   <pic:blipFill>
@@ -18320,7 +18380,7 @@
           <w:sz w:val="27"/>
         </w:rPr>
       </w:pPr>
-      <w:bookmarkStart w:id="36" w:name="_Toc240036080"/>
+      <w:bookmarkStart w:id="36" w:name="_Toc240037471"/>
       <w:r>
         <w:rPr>
           <w:rFonts w:ascii="Montserrat" w:hAnsi="Montserrat"/>
@@ -18361,16 +18421,16 @@
         </w:rPr>
         <w:lastRenderedPageBreak/>
         <w:drawing>
-          <wp:inline distT="0" distB="0" distL="0" distR="0" wp14:anchorId="6E3A7A1C" wp14:editId="4948C587">
+          <wp:inline distT="0" distB="0" distL="0" distR="0" wp14:anchorId="25EE9129" wp14:editId="606B92BE">
             <wp:extent cx="5303520" cy="4792851"/>
             <wp:effectExtent l="19050" t="19050" r="11430" b="27305"/>
-            <wp:docPr id="2117693415" name="Imagem 45"/>
+            <wp:docPr id="1412316809" name="Imagem 45"/>
             <wp:cNvGraphicFramePr/>
             <a:graphic xmlns:a="http://schemas.openxmlformats.org/drawingml/2006/main">
               <a:graphicData uri="http://schemas.openxmlformats.org/drawingml/2006/picture">
                 <pic:pic xmlns:pic="http://schemas.openxmlformats.org/drawingml/2006/picture">
                   <pic:nvPicPr>
-                    <pic:cNvPr id="2117693415" name=""/>
+                    <pic:cNvPr id="1412316809" name=""/>
                     <pic:cNvPicPr/>
                   </pic:nvPicPr>
                   <pic:blipFill>
@@ -18438,16 +18498,16 @@
         </w:rPr>
         <w:lastRenderedPageBreak/>
         <w:drawing>
-          <wp:inline distT="0" distB="0" distL="0" distR="0" wp14:anchorId="0739447D" wp14:editId="59F411DC">
+          <wp:inline distT="0" distB="0" distL="0" distR="0" wp14:anchorId="1F527415" wp14:editId="17BF94CF">
             <wp:extent cx="5303520" cy="4792851"/>
             <wp:effectExtent l="19050" t="19050" r="11430" b="27305"/>
-            <wp:docPr id="859778841" name="Imagem 46"/>
+            <wp:docPr id="1256090475" name="Imagem 46"/>
             <wp:cNvGraphicFramePr/>
             <a:graphic xmlns:a="http://schemas.openxmlformats.org/drawingml/2006/main">
               <a:graphicData uri="http://schemas.openxmlformats.org/drawingml/2006/picture">
                 <pic:pic xmlns:pic="http://schemas.openxmlformats.org/drawingml/2006/picture">
                   <pic:nvPicPr>
-                    <pic:cNvPr id="859778841" name=""/>
+                    <pic:cNvPr id="1256090475" name=""/>
                     <pic:cNvPicPr/>
                   </pic:nvPicPr>
                   <pic:blipFill>
@@ -18540,7 +18600,7 @@
           <w:sz w:val="34"/>
         </w:rPr>
       </w:pPr>
-      <w:bookmarkStart w:id="37" w:name="_Toc240036081"/>
+      <w:bookmarkStart w:id="37" w:name="_Toc240037472"/>
       <w:r>
         <w:rPr>
           <w:rFonts w:ascii="Montserrat" w:hAnsi="Montserrat"/>
@@ -18582,7 +18642,7 @@
           <w:sz w:val="27"/>
         </w:rPr>
       </w:pPr>
-      <w:bookmarkStart w:id="38" w:name="_Toc240036082"/>
+      <w:bookmarkStart w:id="38" w:name="_Toc240037473"/>
       <w:r>
         <w:rPr>
           <w:rFonts w:ascii="Montserrat" w:hAnsi="Montserrat"/>
@@ -18622,16 +18682,16 @@
           <w:noProof/>
         </w:rPr>
         <w:drawing>
-          <wp:inline distT="0" distB="0" distL="0" distR="0" wp14:anchorId="24A09D56" wp14:editId="76CB223E">
+          <wp:inline distT="0" distB="0" distL="0" distR="0" wp14:anchorId="326F6F08" wp14:editId="56081C6E">
             <wp:extent cx="5303520" cy="4792851"/>
             <wp:effectExtent l="19050" t="19050" r="11430" b="27305"/>
-            <wp:docPr id="971469503" name="Imagem 47"/>
+            <wp:docPr id="1337936856" name="Imagem 47"/>
             <wp:cNvGraphicFramePr/>
             <a:graphic xmlns:a="http://schemas.openxmlformats.org/drawingml/2006/main">
               <a:graphicData uri="http://schemas.openxmlformats.org/drawingml/2006/picture">
                 <pic:pic xmlns:pic="http://schemas.openxmlformats.org/drawingml/2006/picture">
                   <pic:nvPicPr>
-                    <pic:cNvPr id="971469503" name=""/>
+                    <pic:cNvPr id="1337936856" name=""/>
                     <pic:cNvPicPr/>
                   </pic:nvPicPr>
                   <pic:blipFill>
@@ -18778,7 +18838,7 @@
           <w:sz w:val="27"/>
         </w:rPr>
       </w:pPr>
-      <w:bookmarkStart w:id="39" w:name="_Toc240036083"/>
+      <w:bookmarkStart w:id="39" w:name="_Toc240037474"/>
       <w:r>
         <w:rPr>
           <w:rFonts w:ascii="Montserrat" w:hAnsi="Montserrat"/>
@@ -18819,16 +18879,16 @@
         </w:rPr>
         <w:lastRenderedPageBreak/>
         <w:drawing>
-          <wp:inline distT="0" distB="0" distL="0" distR="0" wp14:anchorId="12385383" wp14:editId="57391D84">
+          <wp:inline distT="0" distB="0" distL="0" distR="0" wp14:anchorId="4311B200" wp14:editId="6865E987">
             <wp:extent cx="5303520" cy="4792851"/>
             <wp:effectExtent l="19050" t="19050" r="11430" b="27305"/>
-            <wp:docPr id="723404146" name="Imagem 48"/>
+            <wp:docPr id="1468179932" name="Imagem 48"/>
             <wp:cNvGraphicFramePr/>
             <a:graphic xmlns:a="http://schemas.openxmlformats.org/drawingml/2006/main">
               <a:graphicData uri="http://schemas.openxmlformats.org/drawingml/2006/picture">
                 <pic:pic xmlns:pic="http://schemas.openxmlformats.org/drawingml/2006/picture">
                   <pic:nvPicPr>
-                    <pic:cNvPr id="723404146" name=""/>
+                    <pic:cNvPr id="1468179932" name=""/>
                     <pic:cNvPicPr/>
                   </pic:nvPicPr>
                   <pic:blipFill>
@@ -18896,7 +18956,7 @@
           <w:sz w:val="27"/>
         </w:rPr>
       </w:pPr>
-      <w:bookmarkStart w:id="40" w:name="_Toc240036084"/>
+      <w:bookmarkStart w:id="40" w:name="_Toc240037475"/>
       <w:r>
         <w:rPr>
           <w:rFonts w:ascii="Montserrat" w:hAnsi="Montserrat"/>
@@ -18937,16 +18997,16 @@
         </w:rPr>
         <w:lastRenderedPageBreak/>
         <w:drawing>
-          <wp:inline distT="0" distB="0" distL="0" distR="0" wp14:anchorId="21BC9943" wp14:editId="0E1E8327">
+          <wp:inline distT="0" distB="0" distL="0" distR="0" wp14:anchorId="5011B278" wp14:editId="33F7973A">
             <wp:extent cx="5303520" cy="4792851"/>
             <wp:effectExtent l="19050" t="19050" r="11430" b="27305"/>
-            <wp:docPr id="1037875114" name="Imagem 49"/>
+            <wp:docPr id="191461942" name="Imagem 49"/>
             <wp:cNvGraphicFramePr/>
             <a:graphic xmlns:a="http://schemas.openxmlformats.org/drawingml/2006/main">
               <a:graphicData uri="http://schemas.openxmlformats.org/drawingml/2006/picture">
                 <pic:pic xmlns:pic="http://schemas.openxmlformats.org/drawingml/2006/picture">
                   <pic:nvPicPr>
-                    <pic:cNvPr id="1037875114" name=""/>
+                    <pic:cNvPr id="191461942" name=""/>
                     <pic:cNvPicPr/>
                   </pic:nvPicPr>
                   <pic:blipFill>
@@ -19090,7 +19150,7 @@
           <w:sz w:val="27"/>
         </w:rPr>
       </w:pPr>
-      <w:bookmarkStart w:id="41" w:name="_Toc240036085"/>
+      <w:bookmarkStart w:id="41" w:name="_Toc240037476"/>
       <w:r>
         <w:rPr>
           <w:rFonts w:ascii="Montserrat" w:hAnsi="Montserrat"/>
@@ -19299,16 +19359,16 @@
           <w:noProof/>
         </w:rPr>
         <w:drawing>
-          <wp:inline distT="0" distB="0" distL="0" distR="0" wp14:anchorId="77DE68B2" wp14:editId="5117CAEA">
+          <wp:inline distT="0" distB="0" distL="0" distR="0" wp14:anchorId="4BB26699" wp14:editId="2C4F319F">
             <wp:extent cx="5303520" cy="4267180"/>
             <wp:effectExtent l="19050" t="19050" r="11430" b="19685"/>
-            <wp:docPr id="950749589" name="Imagem 50"/>
+            <wp:docPr id="418925326" name="Imagem 50"/>
             <wp:cNvGraphicFramePr/>
             <a:graphic xmlns:a="http://schemas.openxmlformats.org/drawingml/2006/main">
               <a:graphicData uri="http://schemas.openxmlformats.org/drawingml/2006/picture">
                 <pic:pic xmlns:pic="http://schemas.openxmlformats.org/drawingml/2006/picture">
                   <pic:nvPicPr>
-                    <pic:cNvPr id="950749589" name=""/>
+                    <pic:cNvPr id="418925326" name=""/>
                     <pic:cNvPicPr/>
                   </pic:nvPicPr>
                   <pic:blipFill>
@@ -19376,16 +19436,16 @@
         </w:rPr>
         <w:lastRenderedPageBreak/>
         <w:drawing>
-          <wp:inline distT="0" distB="0" distL="0" distR="0" wp14:anchorId="208E7106" wp14:editId="23DC0A5B">
+          <wp:inline distT="0" distB="0" distL="0" distR="0" wp14:anchorId="03478359" wp14:editId="32198FA5">
             <wp:extent cx="5303520" cy="3382059"/>
             <wp:effectExtent l="19050" t="19050" r="11430" b="27940"/>
-            <wp:docPr id="886921178" name="Imagem 51"/>
+            <wp:docPr id="987409278" name="Imagem 51"/>
             <wp:cNvGraphicFramePr/>
             <a:graphic xmlns:a="http://schemas.openxmlformats.org/drawingml/2006/main">
               <a:graphicData uri="http://schemas.openxmlformats.org/drawingml/2006/picture">
                 <pic:pic xmlns:pic="http://schemas.openxmlformats.org/drawingml/2006/picture">
                   <pic:nvPicPr>
-                    <pic:cNvPr id="886921178" name=""/>
+                    <pic:cNvPr id="987409278" name=""/>
                     <pic:cNvPicPr/>
                   </pic:nvPicPr>
                   <pic:blipFill>
@@ -19453,16 +19513,16 @@
         </w:rPr>
         <w:lastRenderedPageBreak/>
         <w:drawing>
-          <wp:inline distT="0" distB="0" distL="0" distR="0" wp14:anchorId="065DD52D" wp14:editId="16438795">
+          <wp:inline distT="0" distB="0" distL="0" distR="0" wp14:anchorId="09DAA59F" wp14:editId="309FC81C">
             <wp:extent cx="5303520" cy="4417800"/>
             <wp:effectExtent l="19050" t="19050" r="11430" b="20955"/>
-            <wp:docPr id="355557621" name="Imagem 52"/>
+            <wp:docPr id="1472062140" name="Imagem 52"/>
             <wp:cNvGraphicFramePr/>
             <a:graphic xmlns:a="http://schemas.openxmlformats.org/drawingml/2006/main">
               <a:graphicData uri="http://schemas.openxmlformats.org/drawingml/2006/picture">
                 <pic:pic xmlns:pic="http://schemas.openxmlformats.org/drawingml/2006/picture">
                   <pic:nvPicPr>
-                    <pic:cNvPr id="355557621" name=""/>
+                    <pic:cNvPr id="1472062140" name=""/>
                     <pic:cNvPicPr/>
                   </pic:nvPicPr>
                   <pic:blipFill>
@@ -19572,7 +19632,7 @@
           <w:sz w:val="27"/>
         </w:rPr>
       </w:pPr>
-      <w:bookmarkStart w:id="42" w:name="_Toc240036086"/>
+      <w:bookmarkStart w:id="42" w:name="_Toc240037477"/>
       <w:r>
         <w:rPr>
           <w:rFonts w:ascii="Montserrat" w:hAnsi="Montserrat"/>
@@ -19814,16 +19874,16 @@
         </w:rPr>
         <w:lastRenderedPageBreak/>
         <w:drawing>
-          <wp:inline distT="0" distB="0" distL="0" distR="0" wp14:anchorId="64ECCF75" wp14:editId="42E20A0F">
+          <wp:inline distT="0" distB="0" distL="0" distR="0" wp14:anchorId="1254A711" wp14:editId="327D27B1">
             <wp:extent cx="5303520" cy="7628836"/>
             <wp:effectExtent l="19050" t="19050" r="11430" b="10795"/>
-            <wp:docPr id="1170824785" name="Imagem 53"/>
+            <wp:docPr id="2100827140" name="Imagem 53"/>
             <wp:cNvGraphicFramePr/>
             <a:graphic xmlns:a="http://schemas.openxmlformats.org/drawingml/2006/main">
               <a:graphicData uri="http://schemas.openxmlformats.org/drawingml/2006/picture">
                 <pic:pic xmlns:pic="http://schemas.openxmlformats.org/drawingml/2006/picture">
                   <pic:nvPicPr>
-                    <pic:cNvPr id="1170824785" name=""/>
+                    <pic:cNvPr id="2100827140" name=""/>
                     <pic:cNvPicPr/>
                   </pic:nvPicPr>
                   <pic:blipFill>
@@ -19955,7 +20015,7 @@
           <w:sz w:val="27"/>
         </w:rPr>
       </w:pPr>
-      <w:bookmarkStart w:id="43" w:name="_Toc240036087"/>
+      <w:bookmarkStart w:id="43" w:name="_Toc240037478"/>
       <w:r>
         <w:rPr>
           <w:rFonts w:ascii="Montserrat" w:hAnsi="Montserrat"/>
@@ -20108,7 +20168,7 @@
           <w:sz w:val="27"/>
         </w:rPr>
       </w:pPr>
-      <w:bookmarkStart w:id="44" w:name="_Toc240036088"/>
+      <w:bookmarkStart w:id="44" w:name="_Toc240037479"/>
       <w:r>
         <w:rPr>
           <w:rFonts w:ascii="Montserrat" w:hAnsi="Montserrat"/>
@@ -20401,16 +20461,16 @@
           <w:noProof/>
         </w:rPr>
         <w:drawing>
-          <wp:inline distT="0" distB="0" distL="0" distR="0" wp14:anchorId="6914FA43" wp14:editId="69B5A6E0">
+          <wp:inline distT="0" distB="0" distL="0" distR="0" wp14:anchorId="4013D51D" wp14:editId="0A80C0FB">
             <wp:extent cx="5303520" cy="1351384"/>
             <wp:effectExtent l="19050" t="19050" r="11430" b="20320"/>
-            <wp:docPr id="221074713" name="Imagem 54"/>
+            <wp:docPr id="500635250" name="Imagem 54"/>
             <wp:cNvGraphicFramePr/>
             <a:graphic xmlns:a="http://schemas.openxmlformats.org/drawingml/2006/main">
               <a:graphicData uri="http://schemas.openxmlformats.org/drawingml/2006/picture">
                 <pic:pic xmlns:pic="http://schemas.openxmlformats.org/drawingml/2006/picture">
                   <pic:nvPicPr>
-                    <pic:cNvPr id="221074713" name=""/>
+                    <pic:cNvPr id="500635250" name=""/>
                     <pic:cNvPicPr/>
                   </pic:nvPicPr>
                   <pic:blipFill>
@@ -20478,7 +20538,7 @@
           <w:sz w:val="27"/>
         </w:rPr>
       </w:pPr>
-      <w:bookmarkStart w:id="45" w:name="_Toc240036089"/>
+      <w:bookmarkStart w:id="45" w:name="_Toc240037480"/>
       <w:r>
         <w:rPr>
           <w:rFonts w:ascii="Montserrat" w:hAnsi="Montserrat"/>
@@ -20623,16 +20683,16 @@
           <w:noProof/>
         </w:rPr>
         <w:drawing>
-          <wp:inline distT="0" distB="0" distL="0" distR="0" wp14:anchorId="22017B79" wp14:editId="6C21F459">
+          <wp:inline distT="0" distB="0" distL="0" distR="0" wp14:anchorId="6E6ED2BB" wp14:editId="167B9BD2">
             <wp:extent cx="5303520" cy="1422793"/>
             <wp:effectExtent l="19050" t="19050" r="11430" b="25400"/>
-            <wp:docPr id="1117203421" name="Imagem 55"/>
+            <wp:docPr id="1242569175" name="Imagem 55"/>
             <wp:cNvGraphicFramePr/>
             <a:graphic xmlns:a="http://schemas.openxmlformats.org/drawingml/2006/main">
               <a:graphicData uri="http://schemas.openxmlformats.org/drawingml/2006/picture">
                 <pic:pic xmlns:pic="http://schemas.openxmlformats.org/drawingml/2006/picture">
                   <pic:nvPicPr>
-                    <pic:cNvPr id="1117203421" name=""/>
+                    <pic:cNvPr id="1242569175" name=""/>
                     <pic:cNvPicPr/>
                   </pic:nvPicPr>
                   <pic:blipFill>
@@ -20787,16 +20847,16 @@
         </w:rPr>
         <w:lastRenderedPageBreak/>
         <w:drawing>
-          <wp:inline distT="0" distB="0" distL="0" distR="0" wp14:anchorId="503C7BAC" wp14:editId="4CE465F2">
+          <wp:inline distT="0" distB="0" distL="0" distR="0" wp14:anchorId="48214D17" wp14:editId="0AF009B8">
             <wp:extent cx="5303520" cy="1841050"/>
             <wp:effectExtent l="19050" t="19050" r="11430" b="26035"/>
-            <wp:docPr id="729080839" name="Imagem 56"/>
+            <wp:docPr id="1765232131" name="Imagem 56"/>
             <wp:cNvGraphicFramePr/>
             <a:graphic xmlns:a="http://schemas.openxmlformats.org/drawingml/2006/main">
               <a:graphicData uri="http://schemas.openxmlformats.org/drawingml/2006/picture">
                 <pic:pic xmlns:pic="http://schemas.openxmlformats.org/drawingml/2006/picture">
                   <pic:nvPicPr>
-                    <pic:cNvPr id="729080839" name=""/>
+                    <pic:cNvPr id="1765232131" name=""/>
                     <pic:cNvPicPr/>
                   </pic:nvPicPr>
                   <pic:blipFill>
@@ -20950,16 +21010,16 @@
           <w:noProof/>
         </w:rPr>
         <w:drawing>
-          <wp:inline distT="0" distB="0" distL="0" distR="0" wp14:anchorId="1D87A89A" wp14:editId="75FCEBE6">
+          <wp:inline distT="0" distB="0" distL="0" distR="0" wp14:anchorId="0E587E4B" wp14:editId="4D64EBFC">
             <wp:extent cx="5303520" cy="303041"/>
             <wp:effectExtent l="19050" t="19050" r="11430" b="20955"/>
-            <wp:docPr id="1930459627" name="Imagem 57"/>
+            <wp:docPr id="1480619899" name="Imagem 57"/>
             <wp:cNvGraphicFramePr/>
             <a:graphic xmlns:a="http://schemas.openxmlformats.org/drawingml/2006/main">
               <a:graphicData uri="http://schemas.openxmlformats.org/drawingml/2006/picture">
                 <pic:pic xmlns:pic="http://schemas.openxmlformats.org/drawingml/2006/picture">
                   <pic:nvPicPr>
-                    <pic:cNvPr id="1930459627" name=""/>
+                    <pic:cNvPr id="1480619899" name=""/>
                     <pic:cNvPicPr/>
                   </pic:nvPicPr>
                   <pic:blipFill>
@@ -21027,16 +21087,16 @@
         </w:rPr>
         <w:lastRenderedPageBreak/>
         <w:drawing>
-          <wp:inline distT="0" distB="0" distL="0" distR="0" wp14:anchorId="3376585E" wp14:editId="7D805FBD">
+          <wp:inline distT="0" distB="0" distL="0" distR="0" wp14:anchorId="638AC70F" wp14:editId="4AE7C5DC">
             <wp:extent cx="5303520" cy="2983005"/>
             <wp:effectExtent l="19050" t="19050" r="11430" b="27305"/>
-            <wp:docPr id="1159722231" name="Imagem 58"/>
+            <wp:docPr id="2104534540" name="Imagem 58"/>
             <wp:cNvGraphicFramePr/>
             <a:graphic xmlns:a="http://schemas.openxmlformats.org/drawingml/2006/main">
               <a:graphicData uri="http://schemas.openxmlformats.org/drawingml/2006/picture">
                 <pic:pic xmlns:pic="http://schemas.openxmlformats.org/drawingml/2006/picture">
                   <pic:nvPicPr>
-                    <pic:cNvPr id="1159722231" name=""/>
+                    <pic:cNvPr id="2104534540" name=""/>
                     <pic:cNvPicPr/>
                   </pic:nvPicPr>
                   <pic:blipFill>
@@ -21108,7 +21168,7 @@
           <w:sz w:val="34"/>
         </w:rPr>
       </w:pPr>
-      <w:bookmarkStart w:id="46" w:name="_Toc240036090"/>
+      <w:bookmarkStart w:id="46" w:name="_Toc240037481"/>
       <w:r>
         <w:rPr>
           <w:rFonts w:ascii="Montserrat" w:hAnsi="Montserrat"/>
@@ -21352,7 +21412,7 @@
           <w:sz w:val="34"/>
         </w:rPr>
       </w:pPr>
-      <w:bookmarkStart w:id="47" w:name="_Toc240036091"/>
+      <w:bookmarkStart w:id="47" w:name="_Toc240037482"/>
       <w:r>
         <w:rPr>
           <w:rFonts w:ascii="Montserrat" w:hAnsi="Montserrat"/>
@@ -23140,7 +23200,7 @@
 <file path=word/numbering.xml><?xml version="1.0" encoding="utf-8"?>
 <w:numbering xmlns:wpc="http://schemas.microsoft.com/office/word/2010/wordprocessingCanvas" xmlns:cx="http://schemas.microsoft.com/office/drawing/2014/chartex" xmlns:cx1="http://schemas.microsoft.com/office/drawing/2015/9/8/chartex" xmlns:cx2="http://schemas.microsoft.com/office/drawing/2015/10/21/chartex" xmlns:cx3="http://schemas.microsoft.com/office/drawing/2016/5/9/chartex" xmlns:cx4="http://schemas.microsoft.com/office/drawing/2016/5/10/chartex" xmlns:cx5="http://schemas.microsoft.com/office/drawing/2016/5/11/chartex" xmlns:cx6="http://schemas.microsoft.com/office/drawing/2016/5/12/chartex" xmlns:cx7="http://schemas.microsoft.com/office/drawing/2016/5/13/chartex" xmlns:cx8="http://schemas.microsoft.com/office/drawing/2016/5/14/chartex" xmlns:mc="http://schemas.openxmlformats.org/markup-compatibility/2006" xmlns:aink="http://schemas.microsoft.com/office/drawing/2016/ink" xmlns:am3d="http://schemas.microsoft.com/office/drawing/2017/model3d" xmlns:o="urn:schemas-microsoft-com:office:office" xmlns:oel="http://schemas.microsoft.com/office/2019/extlst" xmlns:r="http://schemas.openxmlformats.org/officeDocument/2006/relationships" xmlns:m="http://schemas.openxmlformats.org/officeDocument/2006/math" xmlns:v="urn:schemas-microsoft-com:vml" xmlns:wp14="http://schemas.microsoft.com/office/word/2010/wordprocessingDrawing" xmlns:wp="http://schemas.openxmlformats.org/drawingml/2006/wordprocessingDrawing" xmlns:w10="urn:schemas-microsoft-com:office:word" xmlns:w="http://schemas.openxmlformats.org/wordprocessingml/2006/main" xmlns:w14="http://schemas.microsoft.com/office/word/2010/wordml" xmlns:w15="http://schemas.microsoft.com/office/word/2012/wordml" xmlns:w16cex="http://schemas.microsoft.com/office/word/2018/wordml/cex" xmlns:w16cid="http://schemas.microsoft.com/office/word/2016/wordml/cid" xmlns:w16="http://schemas.microsoft.com/office/word/2018/wordml" xmlns:w16du="http://schemas.microsoft.com/office/word/2023/wordml/word16du" xmlns:w16sdtdh="http://schemas.microsoft.com/office/word/2020/wordml/sdtdatahash" xmlns:w16sdtfl="http://schemas.microsoft.com/office/word/2024/wordml/sdtformatlock" xmlns:w16se="http://schemas.microsoft.com/office/word/2015/wordml/symex" xmlns:wpg="http://schemas.microsoft.com/office/word/2010/wordprocessingGroup" xmlns:wpi="http://schemas.microsoft.com/office/word/2010/wordprocessingInk" xmlns:wne="http://schemas.microsoft.com/office/word/2006/wordml" xmlns:wps="http://schemas.microsoft.com/office/word/2010/wordprocessingShape" mc:Ignorable="w14 w15 w16se w16cid w16 w16cex w16sdtdh w16sdtfl w16du wp14">
   <w:abstractNum w:abstractNumId="0" w15:restartNumberingAfterBreak="0">
-    <w:nsid w:val="020C4558"/>
+    <w:nsid w:val="02EC4E8E"/>
     <w:multiLevelType w:val="singleLevel"/>
     <w:tmpl w:val="04160001"/>
     <w:lvl w:ilvl="0">
@@ -23157,7 +23217,7 @@
     </w:lvl>
   </w:abstractNum>
   <w:abstractNum w:abstractNumId="1" w15:restartNumberingAfterBreak="0">
-    <w:nsid w:val="05DA2E8A"/>
+    <w:nsid w:val="07B4407C"/>
     <w:multiLevelType w:val="singleLevel"/>
     <w:tmpl w:val="04160001"/>
     <w:lvl w:ilvl="0">
@@ -23174,7 +23234,7 @@
     </w:lvl>
   </w:abstractNum>
   <w:abstractNum w:abstractNumId="2" w15:restartNumberingAfterBreak="0">
-    <w:nsid w:val="0D1876A5"/>
+    <w:nsid w:val="0ACC7143"/>
     <w:multiLevelType w:val="singleLevel"/>
     <w:tmpl w:val="04160001"/>
     <w:lvl w:ilvl="0">
@@ -23191,7 +23251,7 @@
     </w:lvl>
   </w:abstractNum>
   <w:abstractNum w:abstractNumId="3" w15:restartNumberingAfterBreak="0">
-    <w:nsid w:val="105D73F5"/>
+    <w:nsid w:val="0C54242E"/>
     <w:multiLevelType w:val="singleLevel"/>
     <w:tmpl w:val="04160001"/>
     <w:lvl w:ilvl="0">
@@ -23208,7 +23268,7 @@
     </w:lvl>
   </w:abstractNum>
   <w:abstractNum w:abstractNumId="4" w15:restartNumberingAfterBreak="0">
-    <w:nsid w:val="12685678"/>
+    <w:nsid w:val="0D953E34"/>
     <w:multiLevelType w:val="singleLevel"/>
     <w:tmpl w:val="04160001"/>
     <w:lvl w:ilvl="0">
@@ -23225,7 +23285,7 @@
     </w:lvl>
   </w:abstractNum>
   <w:abstractNum w:abstractNumId="5" w15:restartNumberingAfterBreak="0">
-    <w:nsid w:val="127B3A0C"/>
+    <w:nsid w:val="1C3837A4"/>
     <w:multiLevelType w:val="singleLevel"/>
     <w:tmpl w:val="04160001"/>
     <w:lvl w:ilvl="0">
@@ -23242,7 +23302,7 @@
     </w:lvl>
   </w:abstractNum>
   <w:abstractNum w:abstractNumId="6" w15:restartNumberingAfterBreak="0">
-    <w:nsid w:val="14D7376A"/>
+    <w:nsid w:val="1F693A17"/>
     <w:multiLevelType w:val="singleLevel"/>
     <w:tmpl w:val="04160001"/>
     <w:lvl w:ilvl="0">
@@ -23259,7 +23319,7 @@
     </w:lvl>
   </w:abstractNum>
   <w:abstractNum w:abstractNumId="7" w15:restartNumberingAfterBreak="0">
-    <w:nsid w:val="1A184E7E"/>
+    <w:nsid w:val="2A4547DA"/>
     <w:multiLevelType w:val="singleLevel"/>
     <w:tmpl w:val="04160001"/>
     <w:lvl w:ilvl="0">
@@ -23276,7 +23336,7 @@
     </w:lvl>
   </w:abstractNum>
   <w:abstractNum w:abstractNumId="8" w15:restartNumberingAfterBreak="0">
-    <w:nsid w:val="1CD01198"/>
+    <w:nsid w:val="2A5407B8"/>
     <w:multiLevelType w:val="singleLevel"/>
     <w:tmpl w:val="04160001"/>
     <w:lvl w:ilvl="0">
@@ -23293,7 +23353,7 @@
     </w:lvl>
   </w:abstractNum>
   <w:abstractNum w:abstractNumId="9" w15:restartNumberingAfterBreak="0">
-    <w:nsid w:val="263D191D"/>
+    <w:nsid w:val="2E720FA0"/>
     <w:multiLevelType w:val="singleLevel"/>
     <w:tmpl w:val="04160001"/>
     <w:lvl w:ilvl="0">
@@ -23310,7 +23370,7 @@
     </w:lvl>
   </w:abstractNum>
   <w:abstractNum w:abstractNumId="10" w15:restartNumberingAfterBreak="0">
-    <w:nsid w:val="31C807CB"/>
+    <w:nsid w:val="326F0BDB"/>
     <w:multiLevelType w:val="singleLevel"/>
     <w:tmpl w:val="04160001"/>
     <w:lvl w:ilvl="0">
@@ -23327,7 +23387,7 @@
     </w:lvl>
   </w:abstractNum>
   <w:abstractNum w:abstractNumId="11" w15:restartNumberingAfterBreak="0">
-    <w:nsid w:val="33410DEE"/>
+    <w:nsid w:val="38DF06F7"/>
     <w:multiLevelType w:val="singleLevel"/>
     <w:tmpl w:val="04160001"/>
     <w:lvl w:ilvl="0">
@@ -23344,7 +23404,7 @@
     </w:lvl>
   </w:abstractNum>
   <w:abstractNum w:abstractNumId="12" w15:restartNumberingAfterBreak="0">
-    <w:nsid w:val="34FD0424"/>
+    <w:nsid w:val="39D42B93"/>
     <w:multiLevelType w:val="singleLevel"/>
     <w:tmpl w:val="04160001"/>
     <w:lvl w:ilvl="0">
@@ -23361,7 +23421,7 @@
     </w:lvl>
   </w:abstractNum>
   <w:abstractNum w:abstractNumId="13" w15:restartNumberingAfterBreak="0">
-    <w:nsid w:val="378E0FE8"/>
+    <w:nsid w:val="3CCB6C63"/>
     <w:multiLevelType w:val="singleLevel"/>
     <w:tmpl w:val="04160001"/>
     <w:lvl w:ilvl="0">
@@ -23378,7 +23438,7 @@
     </w:lvl>
   </w:abstractNum>
   <w:abstractNum w:abstractNumId="14" w15:restartNumberingAfterBreak="0">
-    <w:nsid w:val="3C2D3990"/>
+    <w:nsid w:val="40720E56"/>
     <w:multiLevelType w:val="singleLevel"/>
     <w:tmpl w:val="04160001"/>
     <w:lvl w:ilvl="0">
@@ -23395,7 +23455,7 @@
     </w:lvl>
   </w:abstractNum>
   <w:abstractNum w:abstractNumId="15" w15:restartNumberingAfterBreak="0">
-    <w:nsid w:val="408D34E1"/>
+    <w:nsid w:val="468408AF"/>
     <w:multiLevelType w:val="singleLevel"/>
     <w:tmpl w:val="04160001"/>
     <w:lvl w:ilvl="0">
@@ -23412,7 +23472,7 @@
     </w:lvl>
   </w:abstractNum>
   <w:abstractNum w:abstractNumId="16" w15:restartNumberingAfterBreak="0">
-    <w:nsid w:val="474C7D1E"/>
+    <w:nsid w:val="475E1555"/>
     <w:multiLevelType w:val="singleLevel"/>
     <w:tmpl w:val="04160001"/>
     <w:lvl w:ilvl="0">
@@ -23429,7 +23489,7 @@
     </w:lvl>
   </w:abstractNum>
   <w:abstractNum w:abstractNumId="17" w15:restartNumberingAfterBreak="0">
-    <w:nsid w:val="4C604DA4"/>
+    <w:nsid w:val="495454CA"/>
     <w:multiLevelType w:val="singleLevel"/>
     <w:tmpl w:val="04160001"/>
     <w:lvl w:ilvl="0">
@@ -23446,7 +23506,7 @@
     </w:lvl>
   </w:abstractNum>
   <w:abstractNum w:abstractNumId="18" w15:restartNumberingAfterBreak="0">
-    <w:nsid w:val="509D5789"/>
+    <w:nsid w:val="4A086764"/>
     <w:multiLevelType w:val="singleLevel"/>
     <w:tmpl w:val="04160001"/>
     <w:lvl w:ilvl="0">
@@ -23463,7 +23523,7 @@
     </w:lvl>
   </w:abstractNum>
   <w:abstractNum w:abstractNumId="19" w15:restartNumberingAfterBreak="0">
-    <w:nsid w:val="51F8704B"/>
+    <w:nsid w:val="55060F2D"/>
     <w:multiLevelType w:val="singleLevel"/>
     <w:tmpl w:val="04160001"/>
     <w:lvl w:ilvl="0">
@@ -23480,7 +23540,7 @@
     </w:lvl>
   </w:abstractNum>
   <w:abstractNum w:abstractNumId="20" w15:restartNumberingAfterBreak="0">
-    <w:nsid w:val="565F4498"/>
+    <w:nsid w:val="56401388"/>
     <w:multiLevelType w:val="singleLevel"/>
     <w:tmpl w:val="04160001"/>
     <w:lvl w:ilvl="0">
@@ -23497,7 +23557,7 @@
     </w:lvl>
   </w:abstractNum>
   <w:abstractNum w:abstractNumId="21" w15:restartNumberingAfterBreak="0">
-    <w:nsid w:val="62662C0B"/>
+    <w:nsid w:val="585338DD"/>
     <w:multiLevelType w:val="singleLevel"/>
     <w:tmpl w:val="04160001"/>
     <w:lvl w:ilvl="0">
@@ -23514,7 +23574,7 @@
     </w:lvl>
   </w:abstractNum>
   <w:abstractNum w:abstractNumId="22" w15:restartNumberingAfterBreak="0">
-    <w:nsid w:val="63212662"/>
+    <w:nsid w:val="59085EFC"/>
     <w:multiLevelType w:val="singleLevel"/>
     <w:tmpl w:val="04160001"/>
     <w:lvl w:ilvl="0">
@@ -23531,7 +23591,7 @@
     </w:lvl>
   </w:abstractNum>
   <w:abstractNum w:abstractNumId="23" w15:restartNumberingAfterBreak="0">
-    <w:nsid w:val="64BA7C68"/>
+    <w:nsid w:val="5A9B2B95"/>
     <w:multiLevelType w:val="singleLevel"/>
     <w:tmpl w:val="04160001"/>
     <w:lvl w:ilvl="0">
@@ -23548,7 +23608,7 @@
     </w:lvl>
   </w:abstractNum>
   <w:abstractNum w:abstractNumId="24" w15:restartNumberingAfterBreak="0">
-    <w:nsid w:val="65360CF2"/>
+    <w:nsid w:val="5C19716C"/>
     <w:multiLevelType w:val="singleLevel"/>
     <w:tmpl w:val="04160001"/>
     <w:lvl w:ilvl="0">
@@ -23565,7 +23625,7 @@
     </w:lvl>
   </w:abstractNum>
   <w:abstractNum w:abstractNumId="25" w15:restartNumberingAfterBreak="0">
-    <w:nsid w:val="6676019A"/>
+    <w:nsid w:val="5D8618A5"/>
     <w:multiLevelType w:val="singleLevel"/>
     <w:tmpl w:val="04160001"/>
     <w:lvl w:ilvl="0">
@@ -23582,7 +23642,7 @@
     </w:lvl>
   </w:abstractNum>
   <w:abstractNum w:abstractNumId="26" w15:restartNumberingAfterBreak="0">
-    <w:nsid w:val="70552E23"/>
+    <w:nsid w:val="5E1D3CEE"/>
     <w:multiLevelType w:val="singleLevel"/>
     <w:tmpl w:val="04160001"/>
     <w:lvl w:ilvl="0">
@@ -23599,7 +23659,7 @@
     </w:lvl>
   </w:abstractNum>
   <w:abstractNum w:abstractNumId="27" w15:restartNumberingAfterBreak="0">
-    <w:nsid w:val="71982D3D"/>
+    <w:nsid w:val="6BE32776"/>
     <w:multiLevelType w:val="singleLevel"/>
     <w:tmpl w:val="04160001"/>
     <w:lvl w:ilvl="0">
@@ -23616,7 +23676,7 @@
     </w:lvl>
   </w:abstractNum>
   <w:abstractNum w:abstractNumId="28" w15:restartNumberingAfterBreak="0">
-    <w:nsid w:val="735726A6"/>
+    <w:nsid w:val="6CA12276"/>
     <w:multiLevelType w:val="singleLevel"/>
     <w:tmpl w:val="04160001"/>
     <w:lvl w:ilvl="0">
@@ -23633,7 +23693,7 @@
     </w:lvl>
   </w:abstractNum>
   <w:abstractNum w:abstractNumId="29" w15:restartNumberingAfterBreak="0">
-    <w:nsid w:val="742C1907"/>
+    <w:nsid w:val="731A0CBF"/>
     <w:multiLevelType w:val="singleLevel"/>
     <w:tmpl w:val="04160001"/>
     <w:lvl w:ilvl="0">
@@ -23650,7 +23710,7 @@
     </w:lvl>
   </w:abstractNum>
   <w:abstractNum w:abstractNumId="30" w15:restartNumberingAfterBreak="0">
-    <w:nsid w:val="7ADE74B6"/>
+    <w:nsid w:val="79A74CAD"/>
     <w:multiLevelType w:val="singleLevel"/>
     <w:tmpl w:val="04160001"/>
     <w:lvl w:ilvl="0">
@@ -23667,7 +23727,7 @@
     </w:lvl>
   </w:abstractNum>
   <w:abstractNum w:abstractNumId="31" w15:restartNumberingAfterBreak="0">
-    <w:nsid w:val="7B595F0D"/>
+    <w:nsid w:val="7EA01EE7"/>
     <w:multiLevelType w:val="singleLevel"/>
     <w:tmpl w:val="04160001"/>
     <w:lvl w:ilvl="0">
@@ -23683,101 +23743,101 @@
       </w:rPr>
     </w:lvl>
   </w:abstractNum>
-  <w:num w:numId="1" w16cid:durableId="1159883656">
+  <w:num w:numId="1" w16cid:durableId="1168520629">
+    <w:abstractNumId w:val="9"/>
+  </w:num>
+  <w:num w:numId="2" w16cid:durableId="1956977721">
+    <w:abstractNumId w:val="25"/>
+  </w:num>
+  <w:num w:numId="3" w16cid:durableId="1464615611">
+    <w:abstractNumId w:val="17"/>
+  </w:num>
+  <w:num w:numId="4" w16cid:durableId="756705782">
+    <w:abstractNumId w:val="16"/>
+  </w:num>
+  <w:num w:numId="5" w16cid:durableId="1713070837">
+    <w:abstractNumId w:val="6"/>
+  </w:num>
+  <w:num w:numId="6" w16cid:durableId="1296058554">
+    <w:abstractNumId w:val="21"/>
+  </w:num>
+  <w:num w:numId="7" w16cid:durableId="2135054965">
+    <w:abstractNumId w:val="29"/>
+  </w:num>
+  <w:num w:numId="8" w16cid:durableId="1769815408">
+    <w:abstractNumId w:val="11"/>
+  </w:num>
+  <w:num w:numId="9" w16cid:durableId="938752276">
+    <w:abstractNumId w:val="27"/>
+  </w:num>
+  <w:num w:numId="10" w16cid:durableId="2019577023">
+    <w:abstractNumId w:val="2"/>
+  </w:num>
+  <w:num w:numId="11" w16cid:durableId="798643376">
+    <w:abstractNumId w:val="8"/>
+  </w:num>
+  <w:num w:numId="12" w16cid:durableId="2141259986">
+    <w:abstractNumId w:val="0"/>
+  </w:num>
+  <w:num w:numId="13" w16cid:durableId="1344476593">
+    <w:abstractNumId w:val="26"/>
+  </w:num>
+  <w:num w:numId="14" w16cid:durableId="290551700">
+    <w:abstractNumId w:val="18"/>
+  </w:num>
+  <w:num w:numId="15" w16cid:durableId="556433171">
+    <w:abstractNumId w:val="23"/>
+  </w:num>
+  <w:num w:numId="16" w16cid:durableId="306135393">
+    <w:abstractNumId w:val="28"/>
+  </w:num>
+  <w:num w:numId="17" w16cid:durableId="915437993">
+    <w:abstractNumId w:val="7"/>
+  </w:num>
+  <w:num w:numId="18" w16cid:durableId="1291672468">
+    <w:abstractNumId w:val="3"/>
+  </w:num>
+  <w:num w:numId="19" w16cid:durableId="598564765">
+    <w:abstractNumId w:val="22"/>
+  </w:num>
+  <w:num w:numId="20" w16cid:durableId="1104376484">
+    <w:abstractNumId w:val="13"/>
+  </w:num>
+  <w:num w:numId="21" w16cid:durableId="375159629">
+    <w:abstractNumId w:val="1"/>
+  </w:num>
+  <w:num w:numId="22" w16cid:durableId="1158808031">
+    <w:abstractNumId w:val="30"/>
+  </w:num>
+  <w:num w:numId="23" w16cid:durableId="1932229444">
+    <w:abstractNumId w:val="12"/>
+  </w:num>
+  <w:num w:numId="24" w16cid:durableId="1762794839">
+    <w:abstractNumId w:val="15"/>
+  </w:num>
+  <w:num w:numId="25" w16cid:durableId="1646624726">
+    <w:abstractNumId w:val="31"/>
+  </w:num>
+  <w:num w:numId="26" w16cid:durableId="1956205675">
+    <w:abstractNumId w:val="24"/>
+  </w:num>
+  <w:num w:numId="27" w16cid:durableId="1043748135">
     <w:abstractNumId w:val="4"/>
   </w:num>
-  <w:num w:numId="2" w16cid:durableId="1808863069">
-    <w:abstractNumId w:val="1"/>
+  <w:num w:numId="28" w16cid:durableId="516886906">
+    <w:abstractNumId w:val="5"/>
   </w:num>
-  <w:num w:numId="3" w16cid:durableId="1711152332">
-    <w:abstractNumId w:val="25"/>
-  </w:num>
-  <w:num w:numId="4" w16cid:durableId="38013996">
-    <w:abstractNumId w:val="8"/>
-  </w:num>
-  <w:num w:numId="5" w16cid:durableId="491259833">
-    <w:abstractNumId w:val="29"/>
-  </w:num>
-  <w:num w:numId="6" w16cid:durableId="1941255774">
-    <w:abstractNumId w:val="31"/>
-  </w:num>
-  <w:num w:numId="7" w16cid:durableId="609511053">
-    <w:abstractNumId w:val="30"/>
-  </w:num>
-  <w:num w:numId="8" w16cid:durableId="18437992">
-    <w:abstractNumId w:val="27"/>
-  </w:num>
-  <w:num w:numId="9" w16cid:durableId="401684352">
-    <w:abstractNumId w:val="26"/>
-  </w:num>
-  <w:num w:numId="10" w16cid:durableId="1691909503">
-    <w:abstractNumId w:val="16"/>
-  </w:num>
-  <w:num w:numId="11" w16cid:durableId="2142262316">
+  <w:num w:numId="29" w16cid:durableId="310865111">
     <w:abstractNumId w:val="19"/>
   </w:num>
-  <w:num w:numId="12" w16cid:durableId="2147232999">
+  <w:num w:numId="30" w16cid:durableId="1853839754">
     <w:abstractNumId w:val="20"/>
   </w:num>
-  <w:num w:numId="13" w16cid:durableId="1449079230">
-    <w:abstractNumId w:val="3"/>
-  </w:num>
-  <w:num w:numId="14" w16cid:durableId="1803691514">
-    <w:abstractNumId w:val="10"/>
-  </w:num>
-  <w:num w:numId="15" w16cid:durableId="638847767">
-    <w:abstractNumId w:val="7"/>
-  </w:num>
-  <w:num w:numId="16" w16cid:durableId="1902472425">
-    <w:abstractNumId w:val="0"/>
-  </w:num>
-  <w:num w:numId="17" w16cid:durableId="1348291953">
+  <w:num w:numId="31" w16cid:durableId="2060468249">
     <w:abstractNumId w:val="14"/>
   </w:num>
-  <w:num w:numId="18" w16cid:durableId="1777482579">
-    <w:abstractNumId w:val="5"/>
-  </w:num>
-  <w:num w:numId="19" w16cid:durableId="1815022890">
-    <w:abstractNumId w:val="15"/>
-  </w:num>
-  <w:num w:numId="20" w16cid:durableId="137111676">
-    <w:abstractNumId w:val="21"/>
-  </w:num>
-  <w:num w:numId="21" w16cid:durableId="2143376194">
-    <w:abstractNumId w:val="18"/>
-  </w:num>
-  <w:num w:numId="22" w16cid:durableId="1783258734">
-    <w:abstractNumId w:val="24"/>
-  </w:num>
-  <w:num w:numId="23" w16cid:durableId="68693639">
-    <w:abstractNumId w:val="13"/>
-  </w:num>
-  <w:num w:numId="24" w16cid:durableId="655770033">
-    <w:abstractNumId w:val="28"/>
-  </w:num>
-  <w:num w:numId="25" w16cid:durableId="1442726421">
-    <w:abstractNumId w:val="22"/>
-  </w:num>
-  <w:num w:numId="26" w16cid:durableId="886722001">
-    <w:abstractNumId w:val="6"/>
-  </w:num>
-  <w:num w:numId="27" w16cid:durableId="1328746878">
-    <w:abstractNumId w:val="12"/>
-  </w:num>
-  <w:num w:numId="28" w16cid:durableId="1867476724">
-    <w:abstractNumId w:val="23"/>
-  </w:num>
-  <w:num w:numId="29" w16cid:durableId="83765237">
-    <w:abstractNumId w:val="9"/>
-  </w:num>
-  <w:num w:numId="30" w16cid:durableId="1864397435">
-    <w:abstractNumId w:val="11"/>
-  </w:num>
-  <w:num w:numId="31" w16cid:durableId="1646465338">
-    <w:abstractNumId w:val="2"/>
-  </w:num>
-  <w:num w:numId="32" w16cid:durableId="1792431171">
-    <w:abstractNumId w:val="17"/>
+  <w:num w:numId="32" w16cid:durableId="1679304527">
+    <w:abstractNumId w:val="10"/>
   </w:num>
 </w:numbering>
 </file>
@@ -24190,7 +24250,7 @@
     <w:link w:val="Ttulo1Char"/>
     <w:uiPriority w:val="9"/>
     <w:qFormat/>
-    <w:rsid w:val="00582B7F"/>
+    <w:rsid w:val="00491F60"/>
     <w:pPr>
       <w:keepNext/>
       <w:keepLines/>
@@ -24212,7 +24272,7 @@
     <w:uiPriority w:val="9"/>
     <w:unhideWhenUsed/>
     <w:qFormat/>
-    <w:rsid w:val="00582B7F"/>
+    <w:rsid w:val="00491F60"/>
     <w:pPr>
       <w:keepNext/>
       <w:keepLines/>
@@ -24235,7 +24295,7 @@
     <w:semiHidden/>
     <w:unhideWhenUsed/>
     <w:qFormat/>
-    <w:rsid w:val="00582B7F"/>
+    <w:rsid w:val="00491F60"/>
     <w:pPr>
       <w:keepNext/>
       <w:keepLines/>
@@ -24258,7 +24318,7 @@
     <w:semiHidden/>
     <w:unhideWhenUsed/>
     <w:qFormat/>
-    <w:rsid w:val="00582B7F"/>
+    <w:rsid w:val="00491F60"/>
     <w:pPr>
       <w:keepNext/>
       <w:keepLines/>
@@ -24281,7 +24341,7 @@
     <w:semiHidden/>
     <w:unhideWhenUsed/>
     <w:qFormat/>
-    <w:rsid w:val="00582B7F"/>
+    <w:rsid w:val="00491F60"/>
     <w:pPr>
       <w:keepNext/>
       <w:keepLines/>
@@ -24302,7 +24362,7 @@
     <w:semiHidden/>
     <w:unhideWhenUsed/>
     <w:qFormat/>
-    <w:rsid w:val="00582B7F"/>
+    <w:rsid w:val="00491F60"/>
     <w:pPr>
       <w:keepNext/>
       <w:keepLines/>
@@ -24325,7 +24385,7 @@
     <w:semiHidden/>
     <w:unhideWhenUsed/>
     <w:qFormat/>
-    <w:rsid w:val="00582B7F"/>
+    <w:rsid w:val="00491F60"/>
     <w:pPr>
       <w:keepNext/>
       <w:keepLines/>
@@ -24346,7 +24406,7 @@
     <w:semiHidden/>
     <w:unhideWhenUsed/>
     <w:qFormat/>
-    <w:rsid w:val="00582B7F"/>
+    <w:rsid w:val="00491F60"/>
     <w:pPr>
       <w:keepNext/>
       <w:keepLines/>
@@ -24369,7 +24429,7 @@
     <w:semiHidden/>
     <w:unhideWhenUsed/>
     <w:qFormat/>
-    <w:rsid w:val="00582B7F"/>
+    <w:rsid w:val="00491F60"/>
     <w:pPr>
       <w:keepNext/>
       <w:keepLines/>
@@ -24413,7 +24473,7 @@
     <w:basedOn w:val="Fontepargpadro"/>
     <w:link w:val="Ttulo1"/>
     <w:uiPriority w:val="9"/>
-    <w:rsid w:val="00582B7F"/>
+    <w:rsid w:val="00491F60"/>
     <w:rPr>
       <w:rFonts w:asciiTheme="majorHAnsi" w:eastAsiaTheme="majorEastAsia" w:hAnsiTheme="majorHAnsi" w:cstheme="majorBidi"/>
       <w:color w:val="0F4761" w:themeColor="accent1" w:themeShade="BF"/>
@@ -24426,7 +24486,7 @@
     <w:basedOn w:val="Fontepargpadro"/>
     <w:link w:val="Ttulo2"/>
     <w:uiPriority w:val="9"/>
-    <w:rsid w:val="00582B7F"/>
+    <w:rsid w:val="00491F60"/>
     <w:rPr>
       <w:rFonts w:asciiTheme="majorHAnsi" w:eastAsiaTheme="majorEastAsia" w:hAnsiTheme="majorHAnsi" w:cstheme="majorBidi"/>
       <w:color w:val="0F4761" w:themeColor="accent1" w:themeShade="BF"/>
@@ -24440,7 +24500,7 @@
     <w:link w:val="Ttulo3"/>
     <w:uiPriority w:val="9"/>
     <w:semiHidden/>
-    <w:rsid w:val="00582B7F"/>
+    <w:rsid w:val="00491F60"/>
     <w:rPr>
       <w:rFonts w:eastAsiaTheme="majorEastAsia" w:cstheme="majorBidi"/>
       <w:color w:val="0F4761" w:themeColor="accent1" w:themeShade="BF"/>
@@ -24454,7 +24514,7 @@
     <w:link w:val="Ttulo4"/>
     <w:uiPriority w:val="9"/>
     <w:semiHidden/>
-    <w:rsid w:val="00582B7F"/>
+    <w:rsid w:val="00491F60"/>
     <w:rPr>
       <w:rFonts w:eastAsiaTheme="majorEastAsia" w:cstheme="majorBidi"/>
       <w:i/>
@@ -24468,7 +24528,7 @@
     <w:link w:val="Ttulo5"/>
     <w:uiPriority w:val="9"/>
     <w:semiHidden/>
-    <w:rsid w:val="00582B7F"/>
+    <w:rsid w:val="00491F60"/>
     <w:rPr>
       <w:rFonts w:eastAsiaTheme="majorEastAsia" w:cstheme="majorBidi"/>
       <w:color w:val="0F4761" w:themeColor="accent1" w:themeShade="BF"/>
@@ -24480,7 +24540,7 @@
     <w:link w:val="Ttulo6"/>
     <w:uiPriority w:val="9"/>
     <w:semiHidden/>
-    <w:rsid w:val="00582B7F"/>
+    <w:rsid w:val="00491F60"/>
     <w:rPr>
       <w:rFonts w:eastAsiaTheme="majorEastAsia" w:cstheme="majorBidi"/>
       <w:i/>
@@ -24494,7 +24554,7 @@
     <w:link w:val="Ttulo7"/>
     <w:uiPriority w:val="9"/>
     <w:semiHidden/>
-    <w:rsid w:val="00582B7F"/>
+    <w:rsid w:val="00491F60"/>
     <w:rPr>
       <w:rFonts w:eastAsiaTheme="majorEastAsia" w:cstheme="majorBidi"/>
       <w:color w:val="595959" w:themeColor="text1" w:themeTint="A6"/>
@@ -24506,7 +24566,7 @@
     <w:link w:val="Ttulo8"/>
     <w:uiPriority w:val="9"/>
     <w:semiHidden/>
-    <w:rsid w:val="00582B7F"/>
+    <w:rsid w:val="00491F60"/>
     <w:rPr>
       <w:rFonts w:eastAsiaTheme="majorEastAsia" w:cstheme="majorBidi"/>
       <w:i/>
@@ -24520,7 +24580,7 @@
     <w:link w:val="Ttulo9"/>
     <w:uiPriority w:val="9"/>
     <w:semiHidden/>
-    <w:rsid w:val="00582B7F"/>
+    <w:rsid w:val="00491F60"/>
     <w:rPr>
       <w:rFonts w:eastAsiaTheme="majorEastAsia" w:cstheme="majorBidi"/>
       <w:color w:val="272727" w:themeColor="text1" w:themeTint="D8"/>
@@ -24533,7 +24593,7 @@
     <w:link w:val="TtuloChar"/>
     <w:uiPriority w:val="10"/>
     <w:qFormat/>
-    <w:rsid w:val="00582B7F"/>
+    <w:rsid w:val="00491F60"/>
     <w:pPr>
       <w:spacing w:after="80" w:line="240" w:lineRule="auto"/>
       <w:contextualSpacing/>
@@ -24551,7 +24611,7 @@
     <w:basedOn w:val="Fontepargpadro"/>
     <w:link w:val="Ttulo"/>
     <w:uiPriority w:val="10"/>
-    <w:rsid w:val="00582B7F"/>
+    <w:rsid w:val="00491F60"/>
     <w:rPr>
       <w:rFonts w:asciiTheme="majorHAnsi" w:eastAsiaTheme="majorEastAsia" w:hAnsiTheme="majorHAnsi" w:cstheme="majorBidi"/>
       <w:spacing w:val="-10"/>
@@ -24567,7 +24627,7 @@
     <w:link w:val="SubttuloChar"/>
     <w:uiPriority w:val="11"/>
     <w:qFormat/>
-    <w:rsid w:val="00582B7F"/>
+    <w:rsid w:val="00491F60"/>
     <w:pPr>
       <w:numPr>
         <w:ilvl w:val="1"/>
@@ -24586,7 +24646,7 @@
     <w:basedOn w:val="Fontepargpadro"/>
     <w:link w:val="Subttulo"/>
     <w:uiPriority w:val="11"/>
-    <w:rsid w:val="00582B7F"/>
+    <w:rsid w:val="00491F60"/>
     <w:rPr>
       <w:rFonts w:eastAsiaTheme="majorEastAsia" w:cstheme="majorBidi"/>
       <w:color w:val="595959" w:themeColor="text1" w:themeTint="A6"/>
@@ -24602,7 +24662,7 @@
     <w:link w:val="CitaoChar"/>
     <w:uiPriority w:val="29"/>
     <w:qFormat/>
-    <w:rsid w:val="00582B7F"/>
+    <w:rsid w:val="00491F60"/>
     <w:pPr>
       <w:spacing w:before="160"/>
       <w:jc w:val="center"/>
@@ -24618,7 +24678,7 @@
     <w:basedOn w:val="Fontepargpadro"/>
     <w:link w:val="Citao"/>
     <w:uiPriority w:val="29"/>
-    <w:rsid w:val="00582B7F"/>
+    <w:rsid w:val="00491F60"/>
     <w:rPr>
       <w:i/>
       <w:iCs/>
@@ -24630,7 +24690,7 @@
     <w:basedOn w:val="Normal"/>
     <w:uiPriority w:val="34"/>
     <w:qFormat/>
-    <w:rsid w:val="00582B7F"/>
+    <w:rsid w:val="00491F60"/>
     <w:pPr>
       <w:ind w:left="720"/>
       <w:contextualSpacing/>
@@ -24641,7 +24701,7 @@
     <w:basedOn w:val="Fontepargpadro"/>
     <w:uiPriority w:val="21"/>
     <w:qFormat/>
-    <w:rsid w:val="00582B7F"/>
+    <w:rsid w:val="00491F60"/>
     <w:rPr>
       <w:i/>
       <w:iCs/>
@@ -24655,7 +24715,7 @@
     <w:link w:val="CitaoIntensaChar"/>
     <w:uiPriority w:val="30"/>
     <w:qFormat/>
-    <w:rsid w:val="00582B7F"/>
+    <w:rsid w:val="00491F60"/>
     <w:pPr>
       <w:pBdr>
         <w:top w:val="single" w:sz="4" w:space="10" w:color="0F4761" w:themeColor="accent1" w:themeShade="BF"/>
@@ -24676,7 +24736,7 @@
     <w:basedOn w:val="Fontepargpadro"/>
     <w:link w:val="CitaoIntensa"/>
     <w:uiPriority w:val="30"/>
-    <w:rsid w:val="00582B7F"/>
+    <w:rsid w:val="00491F60"/>
     <w:rPr>
       <w:i/>
       <w:iCs/>
@@ -24688,7 +24748,7 @@
     <w:basedOn w:val="Fontepargpadro"/>
     <w:uiPriority w:val="32"/>
     <w:qFormat/>
-    <w:rsid w:val="00582B7F"/>
+    <w:rsid w:val="00491F60"/>
     <w:rPr>
       <w:b/>
       <w:bCs/>
@@ -24703,7 +24763,7 @@
     <w:link w:val="CabealhoChar"/>
     <w:uiPriority w:val="99"/>
     <w:unhideWhenUsed/>
-    <w:rsid w:val="00582B7F"/>
+    <w:rsid w:val="00491F60"/>
     <w:pPr>
       <w:tabs>
         <w:tab w:val="center" w:pos="4252"/>
@@ -24717,7 +24777,7 @@
     <w:basedOn w:val="Fontepargpadro"/>
     <w:link w:val="Cabealho"/>
     <w:uiPriority w:val="99"/>
-    <w:rsid w:val="00582B7F"/>
+    <w:rsid w:val="00491F60"/>
   </w:style>
   <w:style w:type="paragraph" w:styleId="Rodap">
     <w:name w:val="footer"/>
@@ -24725,7 +24785,7 @@
     <w:link w:val="RodapChar"/>
     <w:uiPriority w:val="99"/>
     <w:unhideWhenUsed/>
-    <w:rsid w:val="00582B7F"/>
+    <w:rsid w:val="00491F60"/>
     <w:pPr>
       <w:tabs>
         <w:tab w:val="center" w:pos="4252"/>
@@ -24739,7 +24799,7 @@
     <w:basedOn w:val="Fontepargpadro"/>
     <w:link w:val="Rodap"/>
     <w:uiPriority w:val="99"/>
-    <w:rsid w:val="00582B7F"/>
+    <w:rsid w:val="00491F60"/>
   </w:style>
   <w:style w:type="paragraph" w:styleId="Sumrio1">
     <w:name w:val="toc 1"/>
@@ -24748,7 +24808,7 @@
     <w:autoRedefine/>
     <w:uiPriority w:val="39"/>
     <w:unhideWhenUsed/>
-    <w:rsid w:val="00582B7F"/>
+    <w:rsid w:val="00491F60"/>
     <w:pPr>
       <w:spacing w:after="100"/>
     </w:pPr>
@@ -24760,7 +24820,7 @@
     <w:autoRedefine/>
     <w:uiPriority w:val="39"/>
     <w:unhideWhenUsed/>
-    <w:rsid w:val="00582B7F"/>
+    <w:rsid w:val="00491F60"/>
     <w:pPr>
       <w:spacing w:after="100"/>
       <w:ind w:left="240"/>

</xml_diff>

<commit_message>
Sincroniza com a produção — Fase 2 de acompanhamento de execução da EAP (fecha a proposta)
Co-Authored-By: Claude Sonnet 5 <noreply@anthropic.com>
</commit_message>
<xml_diff>
--- a/Manual de Uso - Ferramenta de Gestao de Projetos.docx
+++ b/Manual de Uso - Ferramenta de Gestao de Projetos.docx
@@ -229,7 +229,7 @@
         <w:rPr>
           <w:noProof/>
         </w:rPr>
-        <w:instrText xml:space="preserve"> PAGEREF _Toc240037435 \h </w:instrText>
+        <w:instrText xml:space="preserve"> PAGEREF _Toc240038263 \h </w:instrText>
       </w:r>
       <w:r>
         <w:rPr>
@@ -290,7 +290,7 @@
         <w:rPr>
           <w:noProof/>
         </w:rPr>
-        <w:instrText xml:space="preserve"> PAGEREF _Toc240037436 \h </w:instrText>
+        <w:instrText xml:space="preserve"> PAGEREF _Toc240038264 \h </w:instrText>
       </w:r>
       <w:r>
         <w:rPr>
@@ -351,7 +351,7 @@
         <w:rPr>
           <w:noProof/>
         </w:rPr>
-        <w:instrText xml:space="preserve"> PAGEREF _Toc240037437 \h </w:instrText>
+        <w:instrText xml:space="preserve"> PAGEREF _Toc240038265 \h </w:instrText>
       </w:r>
       <w:r>
         <w:rPr>
@@ -412,7 +412,7 @@
         <w:rPr>
           <w:noProof/>
         </w:rPr>
-        <w:instrText xml:space="preserve"> PAGEREF _Toc240037438 \h </w:instrText>
+        <w:instrText xml:space="preserve"> PAGEREF _Toc240038266 \h </w:instrText>
       </w:r>
       <w:r>
         <w:rPr>
@@ -473,7 +473,7 @@
         <w:rPr>
           <w:noProof/>
         </w:rPr>
-        <w:instrText xml:space="preserve"> PAGEREF _Toc240037439 \h </w:instrText>
+        <w:instrText xml:space="preserve"> PAGEREF _Toc240038267 \h </w:instrText>
       </w:r>
       <w:r>
         <w:rPr>
@@ -534,7 +534,7 @@
         <w:rPr>
           <w:noProof/>
         </w:rPr>
-        <w:instrText xml:space="preserve"> PAGEREF _Toc240037440 \h </w:instrText>
+        <w:instrText xml:space="preserve"> PAGEREF _Toc240038268 \h </w:instrText>
       </w:r>
       <w:r>
         <w:rPr>
@@ -595,7 +595,7 @@
         <w:rPr>
           <w:noProof/>
         </w:rPr>
-        <w:instrText xml:space="preserve"> PAGEREF _Toc240037441 \h </w:instrText>
+        <w:instrText xml:space="preserve"> PAGEREF _Toc240038269 \h </w:instrText>
       </w:r>
       <w:r>
         <w:rPr>
@@ -656,7 +656,7 @@
         <w:rPr>
           <w:noProof/>
         </w:rPr>
-        <w:instrText xml:space="preserve"> PAGEREF _Toc240037442 \h </w:instrText>
+        <w:instrText xml:space="preserve"> PAGEREF _Toc240038270 \h </w:instrText>
       </w:r>
       <w:r>
         <w:rPr>
@@ -717,7 +717,7 @@
         <w:rPr>
           <w:noProof/>
         </w:rPr>
-        <w:instrText xml:space="preserve"> PAGEREF _Toc240037443 \h </w:instrText>
+        <w:instrText xml:space="preserve"> PAGEREF _Toc240038271 \h </w:instrText>
       </w:r>
       <w:r>
         <w:rPr>
@@ -778,7 +778,7 @@
         <w:rPr>
           <w:noProof/>
         </w:rPr>
-        <w:instrText xml:space="preserve"> PAGEREF _Toc240037444 \h </w:instrText>
+        <w:instrText xml:space="preserve"> PAGEREF _Toc240038272 \h </w:instrText>
       </w:r>
       <w:r>
         <w:rPr>
@@ -839,7 +839,7 @@
         <w:rPr>
           <w:noProof/>
         </w:rPr>
-        <w:instrText xml:space="preserve"> PAGEREF _Toc240037445 \h </w:instrText>
+        <w:instrText xml:space="preserve"> PAGEREF _Toc240038273 \h </w:instrText>
       </w:r>
       <w:r>
         <w:rPr>
@@ -900,7 +900,7 @@
         <w:rPr>
           <w:noProof/>
         </w:rPr>
-        <w:instrText xml:space="preserve"> PAGEREF _Toc240037446 \h </w:instrText>
+        <w:instrText xml:space="preserve"> PAGEREF _Toc240038274 \h </w:instrText>
       </w:r>
       <w:r>
         <w:rPr>
@@ -961,7 +961,7 @@
         <w:rPr>
           <w:noProof/>
         </w:rPr>
-        <w:instrText xml:space="preserve"> PAGEREF _Toc240037447 \h </w:instrText>
+        <w:instrText xml:space="preserve"> PAGEREF _Toc240038275 \h </w:instrText>
       </w:r>
       <w:r>
         <w:rPr>
@@ -1022,7 +1022,7 @@
         <w:rPr>
           <w:noProof/>
         </w:rPr>
-        <w:instrText xml:space="preserve"> PAGEREF _Toc240037448 \h </w:instrText>
+        <w:instrText xml:space="preserve"> PAGEREF _Toc240038276 \h </w:instrText>
       </w:r>
       <w:r>
         <w:rPr>
@@ -1083,7 +1083,7 @@
         <w:rPr>
           <w:noProof/>
         </w:rPr>
-        <w:instrText xml:space="preserve"> PAGEREF _Toc240037449 \h </w:instrText>
+        <w:instrText xml:space="preserve"> PAGEREF _Toc240038277 \h </w:instrText>
       </w:r>
       <w:r>
         <w:rPr>
@@ -1144,7 +1144,7 @@
         <w:rPr>
           <w:noProof/>
         </w:rPr>
-        <w:instrText xml:space="preserve"> PAGEREF _Toc240037450 \h </w:instrText>
+        <w:instrText xml:space="preserve"> PAGEREF _Toc240038278 \h </w:instrText>
       </w:r>
       <w:r>
         <w:rPr>
@@ -1205,7 +1205,7 @@
         <w:rPr>
           <w:noProof/>
         </w:rPr>
-        <w:instrText xml:space="preserve"> PAGEREF _Toc240037451 \h </w:instrText>
+        <w:instrText xml:space="preserve"> PAGEREF _Toc240038279 \h </w:instrText>
       </w:r>
       <w:r>
         <w:rPr>
@@ -1266,7 +1266,7 @@
         <w:rPr>
           <w:noProof/>
         </w:rPr>
-        <w:instrText xml:space="preserve"> PAGEREF _Toc240037452 \h </w:instrText>
+        <w:instrText xml:space="preserve"> PAGEREF _Toc240038280 \h </w:instrText>
       </w:r>
       <w:r>
         <w:rPr>
@@ -1327,7 +1327,7 @@
         <w:rPr>
           <w:noProof/>
         </w:rPr>
-        <w:instrText xml:space="preserve"> PAGEREF _Toc240037453 \h </w:instrText>
+        <w:instrText xml:space="preserve"> PAGEREF _Toc240038281 \h </w:instrText>
       </w:r>
       <w:r>
         <w:rPr>
@@ -1388,7 +1388,7 @@
         <w:rPr>
           <w:noProof/>
         </w:rPr>
-        <w:instrText xml:space="preserve"> PAGEREF _Toc240037454 \h </w:instrText>
+        <w:instrText xml:space="preserve"> PAGEREF _Toc240038282 \h </w:instrText>
       </w:r>
       <w:r>
         <w:rPr>
@@ -1449,7 +1449,7 @@
         <w:rPr>
           <w:noProof/>
         </w:rPr>
-        <w:instrText xml:space="preserve"> PAGEREF _Toc240037455 \h </w:instrText>
+        <w:instrText xml:space="preserve"> PAGEREF _Toc240038283 \h </w:instrText>
       </w:r>
       <w:r>
         <w:rPr>
@@ -1510,7 +1510,7 @@
         <w:rPr>
           <w:noProof/>
         </w:rPr>
-        <w:instrText xml:space="preserve"> PAGEREF _Toc240037456 \h </w:instrText>
+        <w:instrText xml:space="preserve"> PAGEREF _Toc240038284 \h </w:instrText>
       </w:r>
       <w:r>
         <w:rPr>
@@ -1571,7 +1571,7 @@
         <w:rPr>
           <w:noProof/>
         </w:rPr>
-        <w:instrText xml:space="preserve"> PAGEREF _Toc240037457 \h </w:instrText>
+        <w:instrText xml:space="preserve"> PAGEREF _Toc240038285 \h </w:instrText>
       </w:r>
       <w:r>
         <w:rPr>
@@ -1632,7 +1632,7 @@
         <w:rPr>
           <w:noProof/>
         </w:rPr>
-        <w:instrText xml:space="preserve"> PAGEREF _Toc240037458 \h </w:instrText>
+        <w:instrText xml:space="preserve"> PAGEREF _Toc240038286 \h </w:instrText>
       </w:r>
       <w:r>
         <w:rPr>
@@ -1693,7 +1693,7 @@
         <w:rPr>
           <w:noProof/>
         </w:rPr>
-        <w:instrText xml:space="preserve"> PAGEREF _Toc240037459 \h </w:instrText>
+        <w:instrText xml:space="preserve"> PAGEREF _Toc240038287 \h </w:instrText>
       </w:r>
       <w:r>
         <w:rPr>
@@ -1755,7 +1755,7 @@
         <w:rPr>
           <w:noProof/>
         </w:rPr>
-        <w:instrText xml:space="preserve"> PAGEREF _Toc240037460 \h </w:instrText>
+        <w:instrText xml:space="preserve"> PAGEREF _Toc240038288 \h </w:instrText>
       </w:r>
       <w:r>
         <w:rPr>
@@ -1816,7 +1816,7 @@
         <w:rPr>
           <w:noProof/>
         </w:rPr>
-        <w:instrText xml:space="preserve"> PAGEREF _Toc240037461 \h </w:instrText>
+        <w:instrText xml:space="preserve"> PAGEREF _Toc240038289 \h </w:instrText>
       </w:r>
       <w:r>
         <w:rPr>
@@ -1877,7 +1877,7 @@
         <w:rPr>
           <w:noProof/>
         </w:rPr>
-        <w:instrText xml:space="preserve"> PAGEREF _Toc240037462 \h </w:instrText>
+        <w:instrText xml:space="preserve"> PAGEREF _Toc240038290 \h </w:instrText>
       </w:r>
       <w:r>
         <w:rPr>
@@ -1938,7 +1938,7 @@
         <w:rPr>
           <w:noProof/>
         </w:rPr>
-        <w:instrText xml:space="preserve"> PAGEREF _Toc240037463 \h </w:instrText>
+        <w:instrText xml:space="preserve"> PAGEREF _Toc240038291 \h </w:instrText>
       </w:r>
       <w:r>
         <w:rPr>
@@ -1999,7 +1999,7 @@
         <w:rPr>
           <w:noProof/>
         </w:rPr>
-        <w:instrText xml:space="preserve"> PAGEREF _Toc240037464 \h </w:instrText>
+        <w:instrText xml:space="preserve"> PAGEREF _Toc240038292 \h </w:instrText>
       </w:r>
       <w:r>
         <w:rPr>
@@ -2060,7 +2060,7 @@
         <w:rPr>
           <w:noProof/>
         </w:rPr>
-        <w:instrText xml:space="preserve"> PAGEREF _Toc240037465 \h </w:instrText>
+        <w:instrText xml:space="preserve"> PAGEREF _Toc240038293 \h </w:instrText>
       </w:r>
       <w:r>
         <w:rPr>
@@ -2121,7 +2121,7 @@
         <w:rPr>
           <w:noProof/>
         </w:rPr>
-        <w:instrText xml:space="preserve"> PAGEREF _Toc240037466 \h </w:instrText>
+        <w:instrText xml:space="preserve"> PAGEREF _Toc240038294 \h </w:instrText>
       </w:r>
       <w:r>
         <w:rPr>
@@ -2182,7 +2182,7 @@
         <w:rPr>
           <w:noProof/>
         </w:rPr>
-        <w:instrText xml:space="preserve"> PAGEREF _Toc240037467 \h </w:instrText>
+        <w:instrText xml:space="preserve"> PAGEREF _Toc240038295 \h </w:instrText>
       </w:r>
       <w:r>
         <w:rPr>
@@ -2243,7 +2243,7 @@
         <w:rPr>
           <w:noProof/>
         </w:rPr>
-        <w:instrText xml:space="preserve"> PAGEREF _Toc240037468 \h </w:instrText>
+        <w:instrText xml:space="preserve"> PAGEREF _Toc240038296 \h </w:instrText>
       </w:r>
       <w:r>
         <w:rPr>
@@ -2304,7 +2304,7 @@
         <w:rPr>
           <w:noProof/>
         </w:rPr>
-        <w:instrText xml:space="preserve"> PAGEREF _Toc240037469 \h </w:instrText>
+        <w:instrText xml:space="preserve"> PAGEREF _Toc240038297 \h </w:instrText>
       </w:r>
       <w:r>
         <w:rPr>
@@ -2365,7 +2365,7 @@
         <w:rPr>
           <w:noProof/>
         </w:rPr>
-        <w:instrText xml:space="preserve"> PAGEREF _Toc240037470 \h </w:instrText>
+        <w:instrText xml:space="preserve"> PAGEREF _Toc240038298 \h </w:instrText>
       </w:r>
       <w:r>
         <w:rPr>
@@ -2426,7 +2426,7 @@
         <w:rPr>
           <w:noProof/>
         </w:rPr>
-        <w:instrText xml:space="preserve"> PAGEREF _Toc240037471 \h </w:instrText>
+        <w:instrText xml:space="preserve"> PAGEREF _Toc240038299 \h </w:instrText>
       </w:r>
       <w:r>
         <w:rPr>
@@ -2487,7 +2487,7 @@
         <w:rPr>
           <w:noProof/>
         </w:rPr>
-        <w:instrText xml:space="preserve"> PAGEREF _Toc240037472 \h </w:instrText>
+        <w:instrText xml:space="preserve"> PAGEREF _Toc240038300 \h </w:instrText>
       </w:r>
       <w:r>
         <w:rPr>
@@ -2548,7 +2548,7 @@
         <w:rPr>
           <w:noProof/>
         </w:rPr>
-        <w:instrText xml:space="preserve"> PAGEREF _Toc240037473 \h </w:instrText>
+        <w:instrText xml:space="preserve"> PAGEREF _Toc240038301 \h </w:instrText>
       </w:r>
       <w:r>
         <w:rPr>
@@ -2609,7 +2609,7 @@
         <w:rPr>
           <w:noProof/>
         </w:rPr>
-        <w:instrText xml:space="preserve"> PAGEREF _Toc240037474 \h </w:instrText>
+        <w:instrText xml:space="preserve"> PAGEREF _Toc240038302 \h </w:instrText>
       </w:r>
       <w:r>
         <w:rPr>
@@ -2670,7 +2670,7 @@
         <w:rPr>
           <w:noProof/>
         </w:rPr>
-        <w:instrText xml:space="preserve"> PAGEREF _Toc240037475 \h </w:instrText>
+        <w:instrText xml:space="preserve"> PAGEREF _Toc240038303 \h </w:instrText>
       </w:r>
       <w:r>
         <w:rPr>
@@ -2731,7 +2731,7 @@
         <w:rPr>
           <w:noProof/>
         </w:rPr>
-        <w:instrText xml:space="preserve"> PAGEREF _Toc240037476 \h </w:instrText>
+        <w:instrText xml:space="preserve"> PAGEREF _Toc240038304 \h </w:instrText>
       </w:r>
       <w:r>
         <w:rPr>
@@ -2792,7 +2792,7 @@
         <w:rPr>
           <w:noProof/>
         </w:rPr>
-        <w:instrText xml:space="preserve"> PAGEREF _Toc240037477 \h </w:instrText>
+        <w:instrText xml:space="preserve"> PAGEREF _Toc240038305 \h </w:instrText>
       </w:r>
       <w:r>
         <w:rPr>
@@ -2853,7 +2853,7 @@
         <w:rPr>
           <w:noProof/>
         </w:rPr>
-        <w:instrText xml:space="preserve"> PAGEREF _Toc240037478 \h </w:instrText>
+        <w:instrText xml:space="preserve"> PAGEREF _Toc240038306 \h </w:instrText>
       </w:r>
       <w:r>
         <w:rPr>
@@ -2914,7 +2914,7 @@
         <w:rPr>
           <w:noProof/>
         </w:rPr>
-        <w:instrText xml:space="preserve"> PAGEREF _Toc240037479 \h </w:instrText>
+        <w:instrText xml:space="preserve"> PAGEREF _Toc240038307 \h </w:instrText>
       </w:r>
       <w:r>
         <w:rPr>
@@ -2975,7 +2975,7 @@
         <w:rPr>
           <w:noProof/>
         </w:rPr>
-        <w:instrText xml:space="preserve"> PAGEREF _Toc240037480 \h </w:instrText>
+        <w:instrText xml:space="preserve"> PAGEREF _Toc240038308 \h </w:instrText>
       </w:r>
       <w:r>
         <w:rPr>
@@ -3036,7 +3036,7 @@
         <w:rPr>
           <w:noProof/>
         </w:rPr>
-        <w:instrText xml:space="preserve"> PAGEREF _Toc240037481 \h </w:instrText>
+        <w:instrText xml:space="preserve"> PAGEREF _Toc240038309 \h </w:instrText>
       </w:r>
       <w:r>
         <w:rPr>
@@ -3097,7 +3097,7 @@
         <w:rPr>
           <w:noProof/>
         </w:rPr>
-        <w:instrText xml:space="preserve"> PAGEREF _Toc240037482 \h </w:instrText>
+        <w:instrText xml:space="preserve"> PAGEREF _Toc240038310 \h </w:instrText>
       </w:r>
       <w:r>
         <w:rPr>
@@ -3173,7 +3173,7 @@
           <w:sz w:val="34"/>
         </w:rPr>
       </w:pPr>
-      <w:bookmarkStart w:id="0" w:name="_Toc240037435"/>
+      <w:bookmarkStart w:id="0" w:name="_Toc240038263"/>
       <w:r>
         <w:rPr>
           <w:rFonts w:ascii="Montserrat" w:hAnsi="Montserrat"/>
@@ -3197,7 +3197,7 @@
           <w:sz w:val="27"/>
         </w:rPr>
       </w:pPr>
-      <w:bookmarkStart w:id="1" w:name="_Toc240037436"/>
+      <w:bookmarkStart w:id="1" w:name="_Toc240038264"/>
       <w:r>
         <w:rPr>
           <w:rFonts w:ascii="Montserrat" w:hAnsi="Montserrat"/>
@@ -4440,6 +4440,24 @@
           <w:color w:val="1A1A1A"/>
           <w:sz w:val="22"/>
         </w:rPr>
+        <w:t>Esta e a versao 2.61 do manual. Em relacao a versao 2.60 (11/09/2026), a Fase 2 fecha a proposta de acompanhamento de execucao da EAP: o Painel Executivo (secao 6.4) ganhou a secao Entregas da EAP (portfolio), com o percentual de entregas concluidas de todas as EAPs e quantos projetos tem entrega atrasada, e a Ficha do Projeto (secao 6.4.1) ganhou a secao Entregas da EAP: status automatico, listando cada entrega do projeto com seu selo de status - ambas usando o mesmo casamento automatico pelo nome com o cronograma do Planejamento introduzido na Fase 1, sem nenhum campo novo para preencher em nenhum dos tres lugares.</w:t>
+      </w:r>
+    </w:p>
+    <w:p>
+      <w:pPr>
+        <w:spacing w:line="280" w:lineRule="auto"/>
+        <w:rPr>
+          <w:rFonts w:ascii="Montserrat" w:hAnsi="Montserrat"/>
+          <w:color w:val="1A1A1A"/>
+          <w:sz w:val="22"/>
+        </w:rPr>
+      </w:pPr>
+      <w:r>
+        <w:rPr>
+          <w:rFonts w:ascii="Montserrat" w:hAnsi="Montserrat"/>
+          <w:color w:val="1A1A1A"/>
+          <w:sz w:val="22"/>
+        </w:rPr>
         <w:t>O manual nao substitui as Diretrizes para a Gestao de Projetos da UNIALFA (documento institucional que define o framework D01 a D07) nem o documento Regras de Acesso e Permissoes (que detalha cada regra de controle de acesso); ele e o guia operacional de como usar cada ferramenta na pratica.</w:t>
       </w:r>
     </w:p>
@@ -4454,7 +4472,7 @@
           <w:sz w:val="27"/>
         </w:rPr>
       </w:pPr>
-      <w:bookmarkStart w:id="2" w:name="_Toc240037437"/>
+      <w:bookmarkStart w:id="2" w:name="_Toc240038265"/>
       <w:r>
         <w:rPr>
           <w:rFonts w:ascii="Montserrat" w:hAnsi="Montserrat"/>
@@ -4637,6 +4655,7 @@
           <w:color w:val="1A1A1A"/>
           <w:sz w:val="22"/>
         </w:rPr>
+        <w:lastRenderedPageBreak/>
         <w:t>O Mapa de Diretrizes (pagina inicial) apresenta visualmente as 7 diretrizes (D01 a D07) e mostra, para cada etapa do processo, quais ferramentas usar. E o ponto de partida recomendado para quem quer entender o processo antes de preencher os formularios - e a unica pagina, junto com o Validador de Projetos, que nao exige login.</w:t>
       </w:r>
     </w:p>
@@ -4649,18 +4668,17 @@
         <w:rPr>
           <w:noProof/>
         </w:rPr>
-        <w:lastRenderedPageBreak/>
         <w:drawing>
-          <wp:inline distT="0" distB="0" distL="0" distR="0" wp14:anchorId="016A0C60" wp14:editId="3A47E4D7">
+          <wp:inline distT="0" distB="0" distL="0" distR="0" wp14:anchorId="1B1C96AF" wp14:editId="04E6D719">
             <wp:extent cx="5303520" cy="4792851"/>
             <wp:effectExtent l="19050" t="19050" r="11430" b="27305"/>
-            <wp:docPr id="179711419" name="Imagem 1"/>
+            <wp:docPr id="1987296880" name="Imagem 1"/>
             <wp:cNvGraphicFramePr/>
             <a:graphic xmlns:a="http://schemas.openxmlformats.org/drawingml/2006/main">
               <a:graphicData uri="http://schemas.openxmlformats.org/drawingml/2006/picture">
                 <pic:pic xmlns:pic="http://schemas.openxmlformats.org/drawingml/2006/picture">
                   <pic:nvPicPr>
-                    <pic:cNvPr id="179711419" name=""/>
+                    <pic:cNvPr id="1987296880" name=""/>
                     <pic:cNvPicPr/>
                   </pic:nvPicPr>
                   <pic:blipFill>
@@ -4728,7 +4746,7 @@
           <w:sz w:val="27"/>
         </w:rPr>
       </w:pPr>
-      <w:bookmarkStart w:id="3" w:name="_Toc240037438"/>
+      <w:bookmarkStart w:id="3" w:name="_Toc240038266"/>
       <w:r>
         <w:rPr>
           <w:rFonts w:ascii="Montserrat" w:hAnsi="Montserrat"/>
@@ -4769,16 +4787,16 @@
         </w:rPr>
         <w:lastRenderedPageBreak/>
         <w:drawing>
-          <wp:inline distT="0" distB="0" distL="0" distR="0" wp14:anchorId="7751EC39" wp14:editId="4EFC4303">
+          <wp:inline distT="0" distB="0" distL="0" distR="0" wp14:anchorId="2795551F" wp14:editId="6D9CF709">
             <wp:extent cx="4206240" cy="3801227"/>
             <wp:effectExtent l="19050" t="19050" r="22860" b="27940"/>
-            <wp:docPr id="1864827596" name="Imagem 2"/>
+            <wp:docPr id="2126230516" name="Imagem 2"/>
             <wp:cNvGraphicFramePr/>
             <a:graphic xmlns:a="http://schemas.openxmlformats.org/drawingml/2006/main">
               <a:graphicData uri="http://schemas.openxmlformats.org/drawingml/2006/picture">
                 <pic:pic xmlns:pic="http://schemas.openxmlformats.org/drawingml/2006/picture">
                   <pic:nvPicPr>
-                    <pic:cNvPr id="1864827596" name=""/>
+                    <pic:cNvPr id="2126230516" name=""/>
                     <pic:cNvPicPr/>
                   </pic:nvPicPr>
                   <pic:blipFill>
@@ -4951,7 +4969,7 @@
           <w:sz w:val="27"/>
         </w:rPr>
       </w:pPr>
-      <w:bookmarkStart w:id="4" w:name="_Toc240037439"/>
+      <w:bookmarkStart w:id="4" w:name="_Toc240038267"/>
       <w:r>
         <w:rPr>
           <w:rFonts w:ascii="Montserrat" w:hAnsi="Montserrat"/>
@@ -6190,7 +6208,7 @@
           <w:sz w:val="34"/>
         </w:rPr>
       </w:pPr>
-      <w:bookmarkStart w:id="5" w:name="_Toc240037440"/>
+      <w:bookmarkStart w:id="5" w:name="_Toc240038268"/>
       <w:r>
         <w:rPr>
           <w:rFonts w:ascii="Montserrat" w:hAnsi="Montserrat"/>
@@ -6214,7 +6232,7 @@
           <w:sz w:val="27"/>
         </w:rPr>
       </w:pPr>
-      <w:bookmarkStart w:id="6" w:name="_Toc240037441"/>
+      <w:bookmarkStart w:id="6" w:name="_Toc240038269"/>
       <w:r>
         <w:rPr>
           <w:rFonts w:ascii="Montserrat" w:hAnsi="Montserrat"/>
@@ -6255,7 +6273,7 @@
           <w:sz w:val="27"/>
         </w:rPr>
       </w:pPr>
-      <w:bookmarkStart w:id="7" w:name="_Toc240037442"/>
+      <w:bookmarkStart w:id="7" w:name="_Toc240038270"/>
       <w:r>
         <w:rPr>
           <w:rFonts w:ascii="Montserrat" w:hAnsi="Montserrat"/>
@@ -6374,7 +6392,7 @@
           <w:sz w:val="27"/>
         </w:rPr>
       </w:pPr>
-      <w:bookmarkStart w:id="8" w:name="_Toc240037443"/>
+      <w:bookmarkStart w:id="8" w:name="_Toc240038271"/>
       <w:r>
         <w:rPr>
           <w:rFonts w:ascii="Montserrat" w:hAnsi="Montserrat"/>
@@ -6987,7 +7005,7 @@
           <w:sz w:val="27"/>
         </w:rPr>
       </w:pPr>
-      <w:bookmarkStart w:id="9" w:name="_Toc240037444"/>
+      <w:bookmarkStart w:id="9" w:name="_Toc240038272"/>
       <w:r>
         <w:rPr>
           <w:rFonts w:ascii="Montserrat" w:hAnsi="Montserrat"/>
@@ -7076,16 +7094,16 @@
         </w:rPr>
         <w:lastRenderedPageBreak/>
         <w:drawing>
-          <wp:inline distT="0" distB="0" distL="0" distR="0" wp14:anchorId="18A2F0B4" wp14:editId="01589E53">
+          <wp:inline distT="0" distB="0" distL="0" distR="0" wp14:anchorId="1BB0ADDE" wp14:editId="0184803E">
             <wp:extent cx="4937760" cy="4462310"/>
             <wp:effectExtent l="19050" t="19050" r="15240" b="14605"/>
-            <wp:docPr id="655325790" name="Imagem 3"/>
+            <wp:docPr id="114309947" name="Imagem 3"/>
             <wp:cNvGraphicFramePr/>
             <a:graphic xmlns:a="http://schemas.openxmlformats.org/drawingml/2006/main">
               <a:graphicData uri="http://schemas.openxmlformats.org/drawingml/2006/picture">
                 <pic:pic xmlns:pic="http://schemas.openxmlformats.org/drawingml/2006/picture">
                   <pic:nvPicPr>
-                    <pic:cNvPr id="655325790" name=""/>
+                    <pic:cNvPr id="114309947" name=""/>
                     <pic:cNvPicPr/>
                   </pic:nvPicPr>
                   <pic:blipFill>
@@ -7153,7 +7171,7 @@
           <w:sz w:val="27"/>
         </w:rPr>
       </w:pPr>
-      <w:bookmarkStart w:id="10" w:name="_Toc240037445"/>
+      <w:bookmarkStart w:id="10" w:name="_Toc240038273"/>
       <w:r>
         <w:rPr>
           <w:rFonts w:ascii="Montserrat" w:hAnsi="Montserrat"/>
@@ -7194,16 +7212,16 @@
         </w:rPr>
         <w:lastRenderedPageBreak/>
         <w:drawing>
-          <wp:inline distT="0" distB="0" distL="0" distR="0" wp14:anchorId="295DF830" wp14:editId="3C7D47D2">
+          <wp:inline distT="0" distB="0" distL="0" distR="0" wp14:anchorId="317E1F9C" wp14:editId="42A3C6AC">
             <wp:extent cx="5120640" cy="4627581"/>
             <wp:effectExtent l="19050" t="19050" r="22860" b="20955"/>
-            <wp:docPr id="1384540296" name="Imagem 4"/>
+            <wp:docPr id="85678744" name="Imagem 4"/>
             <wp:cNvGraphicFramePr/>
             <a:graphic xmlns:a="http://schemas.openxmlformats.org/drawingml/2006/main">
               <a:graphicData uri="http://schemas.openxmlformats.org/drawingml/2006/picture">
                 <pic:pic xmlns:pic="http://schemas.openxmlformats.org/drawingml/2006/picture">
                   <pic:nvPicPr>
-                    <pic:cNvPr id="1384540296" name=""/>
+                    <pic:cNvPr id="85678744" name=""/>
                     <pic:cNvPicPr/>
                   </pic:nvPicPr>
                   <pic:blipFill>
@@ -7371,7 +7389,7 @@
           <w:sz w:val="27"/>
         </w:rPr>
       </w:pPr>
-      <w:bookmarkStart w:id="11" w:name="_Toc240037446"/>
+      <w:bookmarkStart w:id="11" w:name="_Toc240038274"/>
       <w:r>
         <w:rPr>
           <w:rFonts w:ascii="Montserrat" w:hAnsi="Montserrat"/>
@@ -7411,16 +7429,16 @@
           <w:noProof/>
         </w:rPr>
         <w:drawing>
-          <wp:inline distT="0" distB="0" distL="0" distR="0" wp14:anchorId="7F2F5606" wp14:editId="220FB0BF">
+          <wp:inline distT="0" distB="0" distL="0" distR="0" wp14:anchorId="19FA1CF1" wp14:editId="1A2A8E2C">
             <wp:extent cx="4206240" cy="3801227"/>
             <wp:effectExtent l="19050" t="19050" r="22860" b="27940"/>
-            <wp:docPr id="855199354" name="Imagem 5"/>
+            <wp:docPr id="982038874" name="Imagem 5"/>
             <wp:cNvGraphicFramePr/>
             <a:graphic xmlns:a="http://schemas.openxmlformats.org/drawingml/2006/main">
               <a:graphicData uri="http://schemas.openxmlformats.org/drawingml/2006/picture">
                 <pic:pic xmlns:pic="http://schemas.openxmlformats.org/drawingml/2006/picture">
                   <pic:nvPicPr>
-                    <pic:cNvPr id="855199354" name=""/>
+                    <pic:cNvPr id="982038874" name=""/>
                     <pic:cNvPicPr/>
                   </pic:nvPicPr>
                   <pic:blipFill>
@@ -7488,16 +7506,16 @@
         </w:rPr>
         <w:lastRenderedPageBreak/>
         <w:drawing>
-          <wp:inline distT="0" distB="0" distL="0" distR="0" wp14:anchorId="13BEB502" wp14:editId="2E738DB2">
+          <wp:inline distT="0" distB="0" distL="0" distR="0" wp14:anchorId="5C008385" wp14:editId="6ACECA0F">
             <wp:extent cx="4206240" cy="3801227"/>
             <wp:effectExtent l="19050" t="19050" r="22860" b="27940"/>
-            <wp:docPr id="884034605" name="Imagem 6"/>
+            <wp:docPr id="525296025" name="Imagem 6"/>
             <wp:cNvGraphicFramePr/>
             <a:graphic xmlns:a="http://schemas.openxmlformats.org/drawingml/2006/main">
               <a:graphicData uri="http://schemas.openxmlformats.org/drawingml/2006/picture">
                 <pic:pic xmlns:pic="http://schemas.openxmlformats.org/drawingml/2006/picture">
                   <pic:nvPicPr>
-                    <pic:cNvPr id="884034605" name=""/>
+                    <pic:cNvPr id="525296025" name=""/>
                     <pic:cNvPicPr/>
                   </pic:nvPicPr>
                   <pic:blipFill>
@@ -7613,7 +7631,7 @@
           <w:sz w:val="27"/>
         </w:rPr>
       </w:pPr>
-      <w:bookmarkStart w:id="12" w:name="_Toc240037447"/>
+      <w:bookmarkStart w:id="12" w:name="_Toc240038275"/>
       <w:r>
         <w:rPr>
           <w:rFonts w:ascii="Montserrat" w:hAnsi="Montserrat"/>
@@ -7681,7 +7699,7 @@
           <w:sz w:val="27"/>
         </w:rPr>
       </w:pPr>
-      <w:bookmarkStart w:id="13" w:name="_Toc240037448"/>
+      <w:bookmarkStart w:id="13" w:name="_Toc240038276"/>
       <w:r>
         <w:rPr>
           <w:rFonts w:ascii="Montserrat" w:hAnsi="Montserrat"/>
@@ -7908,7 +7926,7 @@
           <w:sz w:val="27"/>
         </w:rPr>
       </w:pPr>
-      <w:bookmarkStart w:id="14" w:name="_Toc240037449"/>
+      <w:bookmarkStart w:id="14" w:name="_Toc240038277"/>
       <w:r>
         <w:rPr>
           <w:rFonts w:ascii="Montserrat" w:hAnsi="Montserrat"/>
@@ -8067,7 +8085,7 @@
           <w:sz w:val="27"/>
         </w:rPr>
       </w:pPr>
-      <w:bookmarkStart w:id="15" w:name="_Toc240037450"/>
+      <w:bookmarkStart w:id="15" w:name="_Toc240038278"/>
       <w:r>
         <w:rPr>
           <w:rFonts w:ascii="Montserrat" w:hAnsi="Montserrat"/>
@@ -8259,7 +8277,7 @@
           <w:sz w:val="27"/>
         </w:rPr>
       </w:pPr>
-      <w:bookmarkStart w:id="16" w:name="_Toc240037451"/>
+      <w:bookmarkStart w:id="16" w:name="_Toc240038279"/>
       <w:r>
         <w:rPr>
           <w:rFonts w:ascii="Montserrat" w:hAnsi="Montserrat"/>
@@ -8387,7 +8405,7 @@
           <w:sz w:val="27"/>
         </w:rPr>
       </w:pPr>
-      <w:bookmarkStart w:id="17" w:name="_Toc240037452"/>
+      <w:bookmarkStart w:id="17" w:name="_Toc240038280"/>
       <w:r>
         <w:rPr>
           <w:rFonts w:ascii="Montserrat" w:hAnsi="Montserrat"/>
@@ -8717,7 +8735,7 @@
           <w:sz w:val="27"/>
         </w:rPr>
       </w:pPr>
-      <w:bookmarkStart w:id="18" w:name="_Toc240037453"/>
+      <w:bookmarkStart w:id="18" w:name="_Toc240038281"/>
       <w:r>
         <w:rPr>
           <w:rFonts w:ascii="Montserrat" w:hAnsi="Montserrat"/>
@@ -8858,7 +8876,7 @@
           <w:sz w:val="34"/>
         </w:rPr>
       </w:pPr>
-      <w:bookmarkStart w:id="19" w:name="_Toc240037454"/>
+      <w:bookmarkStart w:id="19" w:name="_Toc240038282"/>
       <w:r>
         <w:rPr>
           <w:rFonts w:ascii="Montserrat" w:hAnsi="Montserrat"/>
@@ -8900,7 +8918,7 @@
           <w:sz w:val="27"/>
         </w:rPr>
       </w:pPr>
-      <w:bookmarkStart w:id="20" w:name="_Toc240037455"/>
+      <w:bookmarkStart w:id="20" w:name="_Toc240038283"/>
       <w:r>
         <w:rPr>
           <w:rFonts w:ascii="Montserrat" w:hAnsi="Montserrat"/>
@@ -9980,16 +9998,16 @@
         </w:rPr>
         <w:lastRenderedPageBreak/>
         <w:drawing>
-          <wp:inline distT="0" distB="0" distL="0" distR="0" wp14:anchorId="3F432429" wp14:editId="763FD5F7">
+          <wp:inline distT="0" distB="0" distL="0" distR="0" wp14:anchorId="7E0ECA56" wp14:editId="5F41FFC2">
             <wp:extent cx="5120640" cy="4627581"/>
             <wp:effectExtent l="19050" t="19050" r="22860" b="20955"/>
-            <wp:docPr id="975920136" name="Imagem 7"/>
+            <wp:docPr id="2136174337" name="Imagem 7"/>
             <wp:cNvGraphicFramePr/>
             <a:graphic xmlns:a="http://schemas.openxmlformats.org/drawingml/2006/main">
               <a:graphicData uri="http://schemas.openxmlformats.org/drawingml/2006/picture">
                 <pic:pic xmlns:pic="http://schemas.openxmlformats.org/drawingml/2006/picture">
                   <pic:nvPicPr>
-                    <pic:cNvPr id="975920136" name=""/>
+                    <pic:cNvPr id="2136174337" name=""/>
                     <pic:cNvPicPr/>
                   </pic:nvPicPr>
                   <pic:blipFill>
@@ -10057,16 +10075,16 @@
         </w:rPr>
         <w:lastRenderedPageBreak/>
         <w:drawing>
-          <wp:inline distT="0" distB="0" distL="0" distR="0" wp14:anchorId="24E1F82C" wp14:editId="1813BB64">
+          <wp:inline distT="0" distB="0" distL="0" distR="0" wp14:anchorId="2196883D" wp14:editId="1C1AC770">
             <wp:extent cx="5120640" cy="4627581"/>
             <wp:effectExtent l="19050" t="19050" r="22860" b="20955"/>
-            <wp:docPr id="1304270575" name="Imagem 8"/>
+            <wp:docPr id="1718043362" name="Imagem 8"/>
             <wp:cNvGraphicFramePr/>
             <a:graphic xmlns:a="http://schemas.openxmlformats.org/drawingml/2006/main">
               <a:graphicData uri="http://schemas.openxmlformats.org/drawingml/2006/picture">
                 <pic:pic xmlns:pic="http://schemas.openxmlformats.org/drawingml/2006/picture">
                   <pic:nvPicPr>
-                    <pic:cNvPr id="1304270575" name=""/>
+                    <pic:cNvPr id="1718043362" name=""/>
                     <pic:cNvPicPr/>
                   </pic:nvPicPr>
                   <pic:blipFill>
@@ -10274,7 +10292,7 @@
           <w:sz w:val="27"/>
         </w:rPr>
       </w:pPr>
-      <w:bookmarkStart w:id="21" w:name="_Toc240037456"/>
+      <w:bookmarkStart w:id="21" w:name="_Toc240038284"/>
       <w:r>
         <w:rPr>
           <w:rFonts w:ascii="Montserrat" w:hAnsi="Montserrat"/>
@@ -11199,16 +11217,16 @@
           <w:noProof/>
         </w:rPr>
         <w:drawing>
-          <wp:inline distT="0" distB="0" distL="0" distR="0" wp14:anchorId="42804D6B" wp14:editId="35BDCC43">
+          <wp:inline distT="0" distB="0" distL="0" distR="0" wp14:anchorId="2EF8A5FF" wp14:editId="655D0306">
             <wp:extent cx="5120640" cy="4627581"/>
             <wp:effectExtent l="19050" t="19050" r="22860" b="20955"/>
-            <wp:docPr id="824461455" name="Imagem 9"/>
+            <wp:docPr id="706658115" name="Imagem 9"/>
             <wp:cNvGraphicFramePr/>
             <a:graphic xmlns:a="http://schemas.openxmlformats.org/drawingml/2006/main">
               <a:graphicData uri="http://schemas.openxmlformats.org/drawingml/2006/picture">
                 <pic:pic xmlns:pic="http://schemas.openxmlformats.org/drawingml/2006/picture">
                   <pic:nvPicPr>
-                    <pic:cNvPr id="824461455" name=""/>
+                    <pic:cNvPr id="706658115" name=""/>
                     <pic:cNvPicPr/>
                   </pic:nvPicPr>
                   <pic:blipFill>
@@ -11276,16 +11294,16 @@
         </w:rPr>
         <w:lastRenderedPageBreak/>
         <w:drawing>
-          <wp:inline distT="0" distB="0" distL="0" distR="0" wp14:anchorId="69B2FF7C" wp14:editId="48B10545">
+          <wp:inline distT="0" distB="0" distL="0" distR="0" wp14:anchorId="2C396A6C" wp14:editId="4229ED60">
             <wp:extent cx="5120640" cy="4627581"/>
             <wp:effectExtent l="19050" t="19050" r="22860" b="20955"/>
-            <wp:docPr id="894080040" name="Imagem 10"/>
+            <wp:docPr id="2133611293" name="Imagem 10"/>
             <wp:cNvGraphicFramePr/>
             <a:graphic xmlns:a="http://schemas.openxmlformats.org/drawingml/2006/main">
               <a:graphicData uri="http://schemas.openxmlformats.org/drawingml/2006/picture">
                 <pic:pic xmlns:pic="http://schemas.openxmlformats.org/drawingml/2006/picture">
                   <pic:nvPicPr>
-                    <pic:cNvPr id="894080040" name=""/>
+                    <pic:cNvPr id="2133611293" name=""/>
                     <pic:cNvPicPr/>
                   </pic:nvPicPr>
                   <pic:blipFill>
@@ -11419,7 +11437,7 @@
           <w:sz w:val="27"/>
         </w:rPr>
       </w:pPr>
-      <w:bookmarkStart w:id="22" w:name="_Toc240037457"/>
+      <w:bookmarkStart w:id="22" w:name="_Toc240038285"/>
       <w:r>
         <w:rPr>
           <w:rFonts w:ascii="Montserrat" w:hAnsi="Montserrat"/>
@@ -12485,16 +12503,16 @@
           <w:noProof/>
         </w:rPr>
         <w:drawing>
-          <wp:inline distT="0" distB="0" distL="0" distR="0" wp14:anchorId="4478BD5E" wp14:editId="4AFCF179">
+          <wp:inline distT="0" distB="0" distL="0" distR="0" wp14:anchorId="4DC3D063" wp14:editId="6674D79C">
             <wp:extent cx="5120640" cy="3338440"/>
             <wp:effectExtent l="19050" t="19050" r="22860" b="14605"/>
-            <wp:docPr id="2069255353" name="Imagem 11"/>
+            <wp:docPr id="31070811" name="Imagem 11"/>
             <wp:cNvGraphicFramePr/>
             <a:graphic xmlns:a="http://schemas.openxmlformats.org/drawingml/2006/main">
               <a:graphicData uri="http://schemas.openxmlformats.org/drawingml/2006/picture">
                 <pic:pic xmlns:pic="http://schemas.openxmlformats.org/drawingml/2006/picture">
                   <pic:nvPicPr>
-                    <pic:cNvPr id="2069255353" name=""/>
+                    <pic:cNvPr id="31070811" name=""/>
                     <pic:cNvPicPr/>
                   </pic:nvPicPr>
                   <pic:blipFill>
@@ -12562,16 +12580,16 @@
         </w:rPr>
         <w:lastRenderedPageBreak/>
         <w:drawing>
-          <wp:inline distT="0" distB="0" distL="0" distR="0" wp14:anchorId="05180D3A" wp14:editId="02E1D1C3">
+          <wp:inline distT="0" distB="0" distL="0" distR="0" wp14:anchorId="2FA16BE4" wp14:editId="30BB48D2">
             <wp:extent cx="5120640" cy="4627581"/>
             <wp:effectExtent l="19050" t="19050" r="22860" b="20955"/>
-            <wp:docPr id="498481073" name="Imagem 12"/>
+            <wp:docPr id="839888337" name="Imagem 12"/>
             <wp:cNvGraphicFramePr/>
             <a:graphic xmlns:a="http://schemas.openxmlformats.org/drawingml/2006/main">
               <a:graphicData uri="http://schemas.openxmlformats.org/drawingml/2006/picture">
                 <pic:pic xmlns:pic="http://schemas.openxmlformats.org/drawingml/2006/picture">
                   <pic:nvPicPr>
-                    <pic:cNvPr id="498481073" name=""/>
+                    <pic:cNvPr id="839888337" name=""/>
                     <pic:cNvPicPr/>
                   </pic:nvPicPr>
                   <pic:blipFill>
@@ -12775,7 +12793,7 @@
           <w:sz w:val="27"/>
         </w:rPr>
       </w:pPr>
-      <w:bookmarkStart w:id="23" w:name="_Toc240037458"/>
+      <w:bookmarkStart w:id="23" w:name="_Toc240038286"/>
       <w:r>
         <w:rPr>
           <w:rFonts w:ascii="Montserrat" w:hAnsi="Montserrat"/>
@@ -13336,16 +13354,16 @@
           <w:noProof/>
         </w:rPr>
         <w:drawing>
-          <wp:inline distT="0" distB="0" distL="0" distR="0" wp14:anchorId="77E94CFE" wp14:editId="66042190">
+          <wp:inline distT="0" distB="0" distL="0" distR="0" wp14:anchorId="60B0A33D" wp14:editId="64682457">
             <wp:extent cx="5120640" cy="4627581"/>
             <wp:effectExtent l="19050" t="19050" r="22860" b="20955"/>
-            <wp:docPr id="1543063073" name="Imagem 13"/>
+            <wp:docPr id="829211802" name="Imagem 13"/>
             <wp:cNvGraphicFramePr/>
             <a:graphic xmlns:a="http://schemas.openxmlformats.org/drawingml/2006/main">
               <a:graphicData uri="http://schemas.openxmlformats.org/drawingml/2006/picture">
                 <pic:pic xmlns:pic="http://schemas.openxmlformats.org/drawingml/2006/picture">
                   <pic:nvPicPr>
-                    <pic:cNvPr id="1543063073" name=""/>
+                    <pic:cNvPr id="829211802" name=""/>
                     <pic:cNvPicPr/>
                   </pic:nvPicPr>
                   <pic:blipFill>
@@ -13413,16 +13431,16 @@
         </w:rPr>
         <w:lastRenderedPageBreak/>
         <w:drawing>
-          <wp:inline distT="0" distB="0" distL="0" distR="0" wp14:anchorId="06889AC3" wp14:editId="7011BE33">
+          <wp:inline distT="0" distB="0" distL="0" distR="0" wp14:anchorId="54A1A325" wp14:editId="020C3F4E">
             <wp:extent cx="5120640" cy="4627581"/>
             <wp:effectExtent l="19050" t="19050" r="22860" b="20955"/>
-            <wp:docPr id="716301428" name="Imagem 14"/>
+            <wp:docPr id="1569359869" name="Imagem 14"/>
             <wp:cNvGraphicFramePr/>
             <a:graphic xmlns:a="http://schemas.openxmlformats.org/drawingml/2006/main">
               <a:graphicData uri="http://schemas.openxmlformats.org/drawingml/2006/picture">
                 <pic:pic xmlns:pic="http://schemas.openxmlformats.org/drawingml/2006/picture">
                   <pic:nvPicPr>
-                    <pic:cNvPr id="716301428" name=""/>
+                    <pic:cNvPr id="1569359869" name=""/>
                     <pic:cNvPicPr/>
                   </pic:nvPicPr>
                   <pic:blipFill>
@@ -13655,7 +13673,7 @@
           <w:sz w:val="27"/>
         </w:rPr>
       </w:pPr>
-      <w:bookmarkStart w:id="24" w:name="_Toc240037459"/>
+      <w:bookmarkStart w:id="24" w:name="_Toc240038287"/>
       <w:r>
         <w:rPr>
           <w:rFonts w:ascii="Montserrat" w:hAnsi="Montserrat"/>
@@ -13696,16 +13714,16 @@
           <w:noProof/>
         </w:rPr>
         <w:drawing>
-          <wp:inline distT="0" distB="0" distL="0" distR="0" wp14:anchorId="244F9262" wp14:editId="350D242E">
+          <wp:inline distT="0" distB="0" distL="0" distR="0" wp14:anchorId="425562DF" wp14:editId="795BD4DA">
             <wp:extent cx="5120640" cy="4627581"/>
             <wp:effectExtent l="19050" t="19050" r="22860" b="20955"/>
-            <wp:docPr id="1290512741" name="Imagem 15"/>
+            <wp:docPr id="500164090" name="Imagem 15"/>
             <wp:cNvGraphicFramePr/>
             <a:graphic xmlns:a="http://schemas.openxmlformats.org/drawingml/2006/main">
               <a:graphicData uri="http://schemas.openxmlformats.org/drawingml/2006/picture">
                 <pic:pic xmlns:pic="http://schemas.openxmlformats.org/drawingml/2006/picture">
                   <pic:nvPicPr>
-                    <pic:cNvPr id="1290512741" name=""/>
+                    <pic:cNvPr id="500164090" name=""/>
                     <pic:cNvPicPr/>
                   </pic:nvPicPr>
                   <pic:blipFill>
@@ -13773,16 +13791,16 @@
         </w:rPr>
         <w:lastRenderedPageBreak/>
         <w:drawing>
-          <wp:inline distT="0" distB="0" distL="0" distR="0" wp14:anchorId="3BFD11D0" wp14:editId="5C9548BD">
+          <wp:inline distT="0" distB="0" distL="0" distR="0" wp14:anchorId="30452F55" wp14:editId="4684B65F">
             <wp:extent cx="5120640" cy="4627581"/>
             <wp:effectExtent l="19050" t="19050" r="22860" b="20955"/>
-            <wp:docPr id="1723606790" name="Imagem 16"/>
+            <wp:docPr id="1283681074" name="Imagem 16"/>
             <wp:cNvGraphicFramePr/>
             <a:graphic xmlns:a="http://schemas.openxmlformats.org/drawingml/2006/main">
               <a:graphicData uri="http://schemas.openxmlformats.org/drawingml/2006/picture">
                 <pic:pic xmlns:pic="http://schemas.openxmlformats.org/drawingml/2006/picture">
                   <pic:nvPicPr>
-                    <pic:cNvPr id="1723606790" name=""/>
+                    <pic:cNvPr id="1283681074" name=""/>
                     <pic:cNvPicPr/>
                   </pic:nvPicPr>
                   <pic:blipFill>
@@ -13946,16 +13964,16 @@
         </w:rPr>
         <w:lastRenderedPageBreak/>
         <w:drawing>
-          <wp:inline distT="0" distB="0" distL="0" distR="0" wp14:anchorId="7D9C597B" wp14:editId="1B3AA4CC">
+          <wp:inline distT="0" distB="0" distL="0" distR="0" wp14:anchorId="11E9E107" wp14:editId="2EA8A670">
             <wp:extent cx="5120640" cy="3282818"/>
             <wp:effectExtent l="19050" t="19050" r="22860" b="13335"/>
-            <wp:docPr id="763678820" name="Imagem 17"/>
+            <wp:docPr id="46676554" name="Imagem 17"/>
             <wp:cNvGraphicFramePr/>
             <a:graphic xmlns:a="http://schemas.openxmlformats.org/drawingml/2006/main">
               <a:graphicData uri="http://schemas.openxmlformats.org/drawingml/2006/picture">
                 <pic:pic xmlns:pic="http://schemas.openxmlformats.org/drawingml/2006/picture">
                   <pic:nvPicPr>
-                    <pic:cNvPr id="763678820" name=""/>
+                    <pic:cNvPr id="46676554" name=""/>
                     <pic:cNvPicPr/>
                   </pic:nvPicPr>
                   <pic:blipFill>
@@ -14122,7 +14140,7 @@
           <w:sz w:val="27"/>
         </w:rPr>
       </w:pPr>
-      <w:bookmarkStart w:id="25" w:name="_Toc240037460"/>
+      <w:bookmarkStart w:id="25" w:name="_Toc240038288"/>
       <w:r>
         <w:rPr>
           <w:rFonts w:ascii="Montserrat" w:hAnsi="Montserrat"/>
@@ -14162,16 +14180,16 @@
           <w:noProof/>
         </w:rPr>
         <w:drawing>
-          <wp:inline distT="0" distB="0" distL="0" distR="0" wp14:anchorId="74F9BA15" wp14:editId="140A3A76">
+          <wp:inline distT="0" distB="0" distL="0" distR="0" wp14:anchorId="1C03FADC" wp14:editId="2DDB37DD">
             <wp:extent cx="5120640" cy="4627581"/>
             <wp:effectExtent l="19050" t="19050" r="22860" b="20955"/>
-            <wp:docPr id="161494036" name="Imagem 18"/>
+            <wp:docPr id="1256261148" name="Imagem 18"/>
             <wp:cNvGraphicFramePr/>
             <a:graphic xmlns:a="http://schemas.openxmlformats.org/drawingml/2006/main">
               <a:graphicData uri="http://schemas.openxmlformats.org/drawingml/2006/picture">
                 <pic:pic xmlns:pic="http://schemas.openxmlformats.org/drawingml/2006/picture">
                   <pic:nvPicPr>
-                    <pic:cNvPr id="161494036" name=""/>
+                    <pic:cNvPr id="1256261148" name=""/>
                     <pic:cNvPicPr/>
                   </pic:nvPicPr>
                   <pic:blipFill>
@@ -14239,16 +14257,16 @@
         </w:rPr>
         <w:lastRenderedPageBreak/>
         <w:drawing>
-          <wp:inline distT="0" distB="0" distL="0" distR="0" wp14:anchorId="601AF624" wp14:editId="2851E58D">
+          <wp:inline distT="0" distB="0" distL="0" distR="0" wp14:anchorId="66F86D02" wp14:editId="612DFB23">
             <wp:extent cx="5120640" cy="4627581"/>
             <wp:effectExtent l="19050" t="19050" r="22860" b="20955"/>
-            <wp:docPr id="342717881" name="Imagem 19"/>
+            <wp:docPr id="638374559" name="Imagem 19"/>
             <wp:cNvGraphicFramePr/>
             <a:graphic xmlns:a="http://schemas.openxmlformats.org/drawingml/2006/main">
               <a:graphicData uri="http://schemas.openxmlformats.org/drawingml/2006/picture">
                 <pic:pic xmlns:pic="http://schemas.openxmlformats.org/drawingml/2006/picture">
                   <pic:nvPicPr>
-                    <pic:cNvPr id="342717881" name=""/>
+                    <pic:cNvPr id="638374559" name=""/>
                     <pic:cNvPicPr/>
                   </pic:nvPicPr>
                   <pic:blipFill>
@@ -14431,7 +14449,7 @@
           <w:sz w:val="27"/>
         </w:rPr>
       </w:pPr>
-      <w:bookmarkStart w:id="26" w:name="_Toc240037461"/>
+      <w:bookmarkStart w:id="26" w:name="_Toc240038289"/>
       <w:r>
         <w:rPr>
           <w:rFonts w:ascii="Montserrat" w:hAnsi="Montserrat"/>
@@ -14471,16 +14489,16 @@
           <w:noProof/>
         </w:rPr>
         <w:drawing>
-          <wp:inline distT="0" distB="0" distL="0" distR="0" wp14:anchorId="6D8449C8" wp14:editId="72056626">
+          <wp:inline distT="0" distB="0" distL="0" distR="0" wp14:anchorId="48EC1793" wp14:editId="7E0C564F">
             <wp:extent cx="5120640" cy="4627581"/>
             <wp:effectExtent l="19050" t="19050" r="22860" b="20955"/>
-            <wp:docPr id="370631813" name="Imagem 20"/>
+            <wp:docPr id="1666126496" name="Imagem 20"/>
             <wp:cNvGraphicFramePr/>
             <a:graphic xmlns:a="http://schemas.openxmlformats.org/drawingml/2006/main">
               <a:graphicData uri="http://schemas.openxmlformats.org/drawin